<commit_message>
addition of the conduction module and its test in TAeZoSysPro.HeatTransfer.BasesClasses + mistakes fix in HTML description of other modules
</commit_message>
<xml_diff>
--- a/Information/script for equations.docx
+++ b/Information/script for equations.docx
@@ -269,19 +269,7 @@
             <w:rPr>
               <w:rFonts w:ascii="Cambria Math" w:eastAsiaTheme="minorEastAsia" w:hAnsi="Cambria Math"/>
             </w:rPr>
-            <m:t>Q_flow=add_on</m:t>
-          </m:r>
-          <m:r>
-            <w:rPr>
-              <w:rFonts w:ascii="Cambria Math" w:eastAsiaTheme="minorEastAsia" w:hAnsi="Cambria Math"/>
-            </w:rPr>
-            <m:t>×h_cv</m:t>
-          </m:r>
-          <m:r>
-            <w:rPr>
-              <w:rFonts w:ascii="Cambria Math" w:eastAsiaTheme="minorEastAsia" w:hAnsi="Cambria Math"/>
-            </w:rPr>
-            <m:t>×A×</m:t>
+            <m:t>Q_flow=add_on×h_cv×A×</m:t>
           </m:r>
           <m:r>
             <w:rPr>
@@ -293,6 +281,235 @@
           </m:r>
         </m:oMath>
       </m:oMathPara>
+    </w:p>
+    <w:p>
+      <w:pPr>
+        <w:rPr>
+          <w:rFonts w:eastAsiaTheme="minorEastAsia"/>
+          <w:sz w:val="24"/>
+          <w:szCs w:val="24"/>
+        </w:rPr>
+      </w:pPr>
+    </w:p>
+    <w:p>
+      <w:pPr>
+        <w:rPr>
+          <w:rFonts w:eastAsiaTheme="minorEastAsia"/>
+          <w:b/>
+        </w:rPr>
+      </w:pPr>
+      <w:r>
+        <w:rPr>
+          <w:rFonts w:eastAsiaTheme="minorEastAsia"/>
+          <w:b/>
+        </w:rPr>
+        <w:t>Linear conduction</w:t>
+      </w:r>
+    </w:p>
+    <w:p>
+      <w:pPr>
+        <w:rPr>
+          <w:rFonts w:eastAsiaTheme="minorEastAsia"/>
+        </w:rPr>
+      </w:pPr>
+      <m:oMathPara>
+        <m:oMath>
+          <m:r>
+            <w:rPr>
+              <w:rFonts w:ascii="Cambria Math" w:eastAsiaTheme="minorEastAsia" w:hAnsi="Cambria Math"/>
+            </w:rPr>
+            <m:t>Q_flow=add_on×A×</m:t>
+          </m:r>
+          <m:f>
+            <m:fPr>
+              <m:ctrlPr>
+                <w:rPr>
+                  <w:rFonts w:ascii="Cambria Math" w:eastAsiaTheme="minorEastAsia" w:hAnsi="Cambria Math"/>
+                  <w:i/>
+                </w:rPr>
+              </m:ctrlPr>
+            </m:fPr>
+            <m:num>
+              <m:r>
+                <w:rPr>
+                  <w:rFonts w:ascii="Cambria Math" w:hAnsi="Cambria Math"/>
+                </w:rPr>
+                <m:t>dT</m:t>
+              </m:r>
+            </m:num>
+            <m:den>
+              <m:f>
+                <m:fPr>
+                  <m:ctrlPr>
+                    <w:rPr>
+                      <w:rFonts w:ascii="Cambria Math" w:hAnsi="Cambria Math"/>
+                      <w:i/>
+                    </w:rPr>
+                  </m:ctrlPr>
+                </m:fPr>
+                <m:num>
+                  <m:r>
+                    <w:rPr>
+                      <w:rFonts w:ascii="Cambria Math" w:hAnsi="Cambria Math"/>
+                    </w:rPr>
+                    <m:t>e</m:t>
+                  </m:r>
+                </m:num>
+                <m:den>
+                  <m:r>
+                    <w:rPr>
+                      <w:rFonts w:ascii="Cambria Math" w:hAnsi="Cambria Math"/>
+                    </w:rPr>
+                    <m:t>k</m:t>
+                  </m:r>
+                </m:den>
+              </m:f>
+            </m:den>
+          </m:f>
+        </m:oMath>
+      </m:oMathPara>
+    </w:p>
+    <w:p>
+      <w:pPr>
+        <w:rPr>
+          <w:rFonts w:eastAsiaTheme="minorEastAsia"/>
+          <w:b/>
+        </w:rPr>
+      </w:pPr>
+      <w:r>
+        <w:rPr>
+          <w:rFonts w:eastAsiaTheme="minorEastAsia"/>
+          <w:b/>
+        </w:rPr>
+        <w:t>Cylindrical conduction</w:t>
+      </w:r>
+    </w:p>
+    <w:p>
+      <w:pPr>
+        <w:rPr>
+          <w:rFonts w:eastAsiaTheme="minorEastAsia"/>
+        </w:rPr>
+      </w:pPr>
+    </w:p>
+    <w:p>
+      <w:pPr>
+        <w:rPr>
+          <w:rFonts w:eastAsiaTheme="minorEastAsia"/>
+        </w:rPr>
+      </w:pPr>
+      <m:oMathPara>
+        <m:oMath>
+          <m:r>
+            <w:rPr>
+              <w:rFonts w:ascii="Cambria Math" w:eastAsiaTheme="minorEastAsia" w:hAnsi="Cambria Math"/>
+            </w:rPr>
+            <m:t>Q_flow=add_on×</m:t>
+          </m:r>
+          <m:f>
+            <m:fPr>
+              <m:ctrlPr>
+                <w:rPr>
+                  <w:rFonts w:ascii="Cambria Math" w:eastAsiaTheme="minorEastAsia" w:hAnsi="Cambria Math"/>
+                  <w:i/>
+                </w:rPr>
+              </m:ctrlPr>
+            </m:fPr>
+            <m:num>
+              <m:r>
+                <w:rPr>
+                  <w:rFonts w:ascii="Cambria Math" w:hAnsi="Cambria Math"/>
+                </w:rPr>
+                <m:t>dT</m:t>
+              </m:r>
+            </m:num>
+            <m:den>
+              <m:f>
+                <m:fPr>
+                  <m:ctrlPr>
+                    <w:rPr>
+                      <w:rFonts w:ascii="Cambria Math" w:eastAsiaTheme="minorEastAsia" w:hAnsi="Cambria Math"/>
+                      <w:i/>
+                    </w:rPr>
+                  </m:ctrlPr>
+                </m:fPr>
+                <m:num>
+                  <m:r>
+                    <m:rPr>
+                      <m:sty m:val="p"/>
+                    </m:rPr>
+                    <w:rPr>
+                      <w:rFonts w:ascii="Cambria Math" w:eastAsiaTheme="minorEastAsia" w:hAnsi="Cambria Math"/>
+                    </w:rPr>
+                    <m:t>ln⁡</m:t>
+                  </m:r>
+                  <m:r>
+                    <w:rPr>
+                      <w:rFonts w:ascii="Cambria Math" w:eastAsiaTheme="minorEastAsia" w:hAnsi="Cambria Math"/>
+                    </w:rPr>
+                    <m:t>(</m:t>
+                  </m:r>
+                  <m:f>
+                    <m:fPr>
+                      <m:ctrlPr>
+                        <w:rPr>
+                          <w:rFonts w:ascii="Cambria Math" w:eastAsiaTheme="minorEastAsia" w:hAnsi="Cambria Math"/>
+                          <w:i/>
+                        </w:rPr>
+                      </m:ctrlPr>
+                    </m:fPr>
+                    <m:num>
+                      <m:r>
+                        <w:rPr>
+                          <w:rFonts w:ascii="Cambria Math" w:eastAsiaTheme="minorEastAsia" w:hAnsi="Cambria Math"/>
+                        </w:rPr>
+                        <m:t>Ri+e</m:t>
+                      </m:r>
+                    </m:num>
+                    <m:den>
+                      <m:r>
+                        <w:rPr>
+                          <w:rFonts w:ascii="Cambria Math" w:eastAsiaTheme="minorEastAsia" w:hAnsi="Cambria Math"/>
+                        </w:rPr>
+                        <m:t>Ri</m:t>
+                      </m:r>
+                    </m:den>
+                  </m:f>
+                  <m:r>
+                    <w:rPr>
+                      <w:rFonts w:ascii="Cambria Math" w:eastAsiaTheme="minorEastAsia" w:hAnsi="Cambria Math"/>
+                    </w:rPr>
+                    <m:t>)</m:t>
+                  </m:r>
+                </m:num>
+                <m:den>
+                  <m:r>
+                    <w:rPr>
+                      <w:rFonts w:ascii="Cambria Math" w:eastAsiaTheme="minorEastAsia" w:hAnsi="Cambria Math"/>
+                    </w:rPr>
+                    <m:t>Angle×L×k</m:t>
+                  </m:r>
+                </m:den>
+              </m:f>
+            </m:den>
+          </m:f>
+        </m:oMath>
+      </m:oMathPara>
+    </w:p>
+    <w:p>
+      <w:pPr>
+        <w:rPr>
+          <w:rFonts w:eastAsiaTheme="minorEastAsia"/>
+        </w:rPr>
+      </w:pPr>
+    </w:p>
+    <w:p>
+      <w:pPr>
+        <w:rPr>
+          <w:rFonts w:eastAsiaTheme="minorEastAsia"/>
+          <w:sz w:val="24"/>
+          <w:szCs w:val="24"/>
+        </w:rPr>
+      </w:pPr>
       <w:bookmarkStart w:id="0" w:name="_GoBack"/>
       <w:bookmarkEnd w:id="0"/>
     </w:p>
@@ -1021,7 +1238,7 @@
   <a:extraClrSchemeLst/>
   <a:extLst>
     <a:ext uri="{05A4C25C-085E-4340-85A3-A5531E510DB2}">
-      <thm15:themeFamily xmlns:thm15="http://schemas.microsoft.com/office/thememl/2012/main" xmlns="" name="Office Theme" id="{62F939B6-93AF-4DB8-9C6B-D6C7DFDC589F}" vid="{4A3C46E8-61CC-4603-A589-7422A47A8E4A}"/>
+      <thm15:themeFamily xmlns="" xmlns:thm15="http://schemas.microsoft.com/office/thememl/2012/main" name="Office Theme" id="{62F939B6-93AF-4DB8-9C6B-D6C7DFDC589F}" vid="{4A3C46E8-61CC-4603-A589-7422A47A8E4A}"/>
     </a:ext>
   </a:extLst>
 </a:theme>
@@ -1032,7 +1249,7 @@
 </file>
 
 <file path=customXml/itemProps1.xml><?xml version="1.0" encoding="utf-8"?>
-<ds:datastoreItem xmlns:ds="http://schemas.openxmlformats.org/officeDocument/2006/customXml" ds:itemID="{E6D9132C-DEF6-4FBE-97E2-99865DD719FD}">
+<ds:datastoreItem xmlns:ds="http://schemas.openxmlformats.org/officeDocument/2006/customXml" ds:itemID="{5C05FEF2-C7A5-43EB-8A65-2F4B4A0A2C0D}">
   <ds:schemaRefs>
     <ds:schemaRef ds:uri="http://schemas.openxmlformats.org/officeDocument/2006/bibliography"/>
   </ds:schemaRefs>

</xml_diff>

<commit_message>
addition of the HeatCapacitor module and its test in TAeZoSysPro.HeatTransfer.BasesClasses
</commit_message>
<xml_diff>
--- a/Information/script for equations.docx
+++ b/Information/script for equations.docx
@@ -499,8 +499,75 @@
       <w:pPr>
         <w:rPr>
           <w:rFonts w:eastAsiaTheme="minorEastAsia"/>
-        </w:rPr>
-      </w:pPr>
+          <w:b/>
+        </w:rPr>
+      </w:pPr>
+      <w:proofErr w:type="spellStart"/>
+      <w:r>
+        <w:rPr>
+          <w:rFonts w:eastAsiaTheme="minorEastAsia"/>
+          <w:b/>
+        </w:rPr>
+        <w:t>HeatCapacitor</w:t>
+      </w:r>
+      <w:bookmarkStart w:id="0" w:name="_GoBack"/>
+      <w:bookmarkEnd w:id="0"/>
+      <w:proofErr w:type="spellEnd"/>
+    </w:p>
+    <w:p>
+      <w:pPr>
+        <w:rPr>
+          <w:rFonts w:eastAsiaTheme="minorEastAsia"/>
+        </w:rPr>
+      </w:pPr>
+      <m:oMathPara>
+        <m:oMath>
+          <m:r>
+            <w:rPr>
+              <w:rFonts w:ascii="Cambria Math" w:eastAsiaTheme="minorEastAsia" w:hAnsi="Cambria Math"/>
+            </w:rPr>
+            <m:t>Mass ×cp×</m:t>
+          </m:r>
+          <m:f>
+            <m:fPr>
+              <m:ctrlPr>
+                <w:rPr>
+                  <w:rFonts w:ascii="Cambria Math" w:eastAsiaTheme="minorEastAsia" w:hAnsi="Cambria Math"/>
+                  <w:i/>
+                </w:rPr>
+              </m:ctrlPr>
+            </m:fPr>
+            <m:num>
+              <m:r>
+                <w:rPr>
+                  <w:rFonts w:ascii="Cambria Math" w:eastAsiaTheme="minorEastAsia" w:hAnsi="Cambria Math"/>
+                </w:rPr>
+                <m:t>dT</m:t>
+              </m:r>
+            </m:num>
+            <m:den>
+              <m:r>
+                <w:rPr>
+                  <w:rFonts w:ascii="Cambria Math" w:eastAsiaTheme="minorEastAsia" w:hAnsi="Cambria Math"/>
+                </w:rPr>
+                <m:t>dt</m:t>
+              </m:r>
+            </m:den>
+          </m:f>
+          <m:r>
+            <w:rPr>
+              <w:rFonts w:ascii="Cambria Math" w:eastAsiaTheme="minorEastAsia" w:hAnsi="Cambria Math"/>
+            </w:rPr>
+            <m:t>=</m:t>
+          </m:r>
+          <m:r>
+            <w:rPr>
+              <w:rFonts w:ascii="Cambria Math" w:eastAsiaTheme="minorEastAsia" w:hAnsi="Cambria Math"/>
+            </w:rPr>
+            <m:t>port.Q_flow</m:t>
+          </m:r>
+        </m:oMath>
+      </m:oMathPara>
     </w:p>
     <w:p>
       <w:pPr>
@@ -510,8 +577,6 @@
           <w:szCs w:val="24"/>
         </w:rPr>
       </w:pPr>
-      <w:bookmarkStart w:id="0" w:name="_GoBack"/>
-      <w:bookmarkEnd w:id="0"/>
     </w:p>
     <w:sectPr>
       <w:pgSz w:w="11906" w:h="16838"/>
@@ -1238,7 +1303,7 @@
   <a:extraClrSchemeLst/>
   <a:extLst>
     <a:ext uri="{05A4C25C-085E-4340-85A3-A5531E510DB2}">
-      <thm15:themeFamily xmlns="" xmlns:thm15="http://schemas.microsoft.com/office/thememl/2012/main" name="Office Theme" id="{62F939B6-93AF-4DB8-9C6B-D6C7DFDC589F}" vid="{4A3C46E8-61CC-4603-A589-7422A47A8E4A}"/>
+      <thm15:themeFamily xmlns:thm15="http://schemas.microsoft.com/office/thememl/2012/main" xmlns="" name="Office Theme" id="{62F939B6-93AF-4DB8-9C6B-D6C7DFDC589F}" vid="{4A3C46E8-61CC-4603-A589-7422A47A8E4A}"/>
     </a:ext>
   </a:extLst>
 </a:theme>
@@ -1249,7 +1314,7 @@
 </file>
 
 <file path=customXml/itemProps1.xml><?xml version="1.0" encoding="utf-8"?>
-<ds:datastoreItem xmlns:ds="http://schemas.openxmlformats.org/officeDocument/2006/customXml" ds:itemID="{5C05FEF2-C7A5-43EB-8A65-2F4B4A0A2C0D}">
+<ds:datastoreItem xmlns:ds="http://schemas.openxmlformats.org/officeDocument/2006/customXml" ds:itemID="{C14F03C0-9453-43FD-9A8D-26F704401BA2}">
   <ds:schemaRefs>
     <ds:schemaRef ds:uri="http://schemas.openxmlformats.org/officeDocument/2006/bibliography"/>
   </ds:schemaRefs>

</xml_diff>

<commit_message>
Updating the description of the CarrollRadiation module
</commit_message>
<xml_diff>
--- a/Information/script for equations.docx
+++ b/Information/script for equations.docx
@@ -502,6 +502,510 @@
           <w:b/>
         </w:rPr>
       </w:pPr>
+      <w:r>
+        <w:rPr>
+          <w:rFonts w:eastAsiaTheme="minorEastAsia"/>
+          <w:b/>
+        </w:rPr>
+        <w:t>Carroll radiation</w:t>
+      </w:r>
+    </w:p>
+    <w:p>
+      <w:pPr>
+        <w:rPr>
+          <w:rFonts w:eastAsiaTheme="minorEastAsia"/>
+        </w:rPr>
+      </w:pPr>
+    </w:p>
+    <w:p>
+      <w:pPr>
+        <w:rPr>
+          <w:rFonts w:eastAsiaTheme="minorEastAsia"/>
+        </w:rPr>
+      </w:pPr>
+      <m:oMathPara>
+        <m:oMath>
+          <m:sSub>
+            <m:sSubPr>
+              <m:ctrlPr>
+                <w:rPr>
+                  <w:rFonts w:ascii="Cambria Math" w:hAnsi="Cambria Math"/>
+                  <w:i/>
+                </w:rPr>
+              </m:ctrlPr>
+            </m:sSubPr>
+            <m:e>
+              <m:r>
+                <w:rPr>
+                  <w:rFonts w:ascii="Cambria Math" w:hAnsi="Cambria Math"/>
+                </w:rPr>
+                <m:t>Q_flow</m:t>
+              </m:r>
+            </m:e>
+            <m:sub>
+              <m:r>
+                <w:rPr>
+                  <w:rFonts w:ascii="Cambria Math" w:hAnsi="Cambria Math"/>
+                </w:rPr>
+                <m:t>i→MRT</m:t>
+              </m:r>
+            </m:sub>
+          </m:sSub>
+          <m:r>
+            <w:rPr>
+              <w:rFonts w:ascii="Cambria Math" w:hAnsi="Cambria Math"/>
+            </w:rPr>
+            <m:t>=</m:t>
+          </m:r>
+          <m:f>
+            <m:fPr>
+              <m:ctrlPr>
+                <w:rPr>
+                  <w:rFonts w:ascii="Cambria Math" w:hAnsi="Cambria Math"/>
+                  <w:i/>
+                </w:rPr>
+              </m:ctrlPr>
+            </m:fPr>
+            <m:num>
+              <m:r>
+                <w:rPr>
+                  <w:rFonts w:ascii="Cambria Math" w:hAnsi="Cambria Math"/>
+                </w:rPr>
+                <m:t>σ×</m:t>
+              </m:r>
+              <m:r>
+                <w:rPr>
+                  <w:rFonts w:ascii="Cambria Math" w:hAnsi="Cambria Math"/>
+                </w:rPr>
+                <m:t>A</m:t>
+              </m:r>
+              <m:r>
+                <w:rPr>
+                  <w:rFonts w:ascii="Cambria Math" w:hAnsi="Cambria Math"/>
+                </w:rPr>
+                <m:t>×(</m:t>
+              </m:r>
+              <m:sSubSup>
+                <m:sSubSupPr>
+                  <m:ctrlPr>
+                    <w:rPr>
+                      <w:rFonts w:ascii="Cambria Math" w:hAnsi="Cambria Math"/>
+                      <w:i/>
+                    </w:rPr>
+                  </m:ctrlPr>
+                </m:sSubSupPr>
+                <m:e>
+                  <m:r>
+                    <w:rPr>
+                      <w:rFonts w:ascii="Cambria Math" w:hAnsi="Cambria Math"/>
+                    </w:rPr>
+                    <m:t>T</m:t>
+                  </m:r>
+                </m:e>
+                <m:sub>
+                  <m:r>
+                    <w:rPr>
+                      <w:rFonts w:ascii="Cambria Math" w:hAnsi="Cambria Math"/>
+                    </w:rPr>
+                    <m:t>i</m:t>
+                  </m:r>
+                </m:sub>
+                <m:sup>
+                  <m:r>
+                    <w:rPr>
+                      <w:rFonts w:ascii="Cambria Math" w:hAnsi="Cambria Math"/>
+                    </w:rPr>
+                    <m:t>4</m:t>
+                  </m:r>
+                </m:sup>
+              </m:sSubSup>
+              <m:r>
+                <w:rPr>
+                  <w:rFonts w:ascii="Cambria Math" w:hAnsi="Cambria Math"/>
+                </w:rPr>
+                <m:t>-</m:t>
+              </m:r>
+              <m:sSubSup>
+                <m:sSubSupPr>
+                  <m:ctrlPr>
+                    <w:rPr>
+                      <w:rFonts w:ascii="Cambria Math" w:hAnsi="Cambria Math"/>
+                      <w:i/>
+                    </w:rPr>
+                  </m:ctrlPr>
+                </m:sSubSupPr>
+                <m:e>
+                  <m:r>
+                    <w:rPr>
+                      <w:rFonts w:ascii="Cambria Math" w:hAnsi="Cambria Math"/>
+                    </w:rPr>
+                    <m:t>T</m:t>
+                  </m:r>
+                </m:e>
+                <m:sub>
+                  <m:r>
+                    <w:rPr>
+                      <w:rFonts w:ascii="Cambria Math" w:hAnsi="Cambria Math"/>
+                    </w:rPr>
+                    <m:t>MRT</m:t>
+                  </m:r>
+                </m:sub>
+                <m:sup>
+                  <m:r>
+                    <w:rPr>
+                      <w:rFonts w:ascii="Cambria Math" w:hAnsi="Cambria Math"/>
+                    </w:rPr>
+                    <m:t>4</m:t>
+                  </m:r>
+                </m:sup>
+              </m:sSubSup>
+              <m:r>
+                <w:rPr>
+                  <w:rFonts w:ascii="Cambria Math" w:hAnsi="Cambria Math"/>
+                </w:rPr>
+                <m:t>)</m:t>
+              </m:r>
+            </m:num>
+            <m:den>
+              <m:f>
+                <m:fPr>
+                  <m:ctrlPr>
+                    <w:rPr>
+                      <w:rFonts w:ascii="Cambria Math" w:hAnsi="Cambria Math"/>
+                      <w:i/>
+                    </w:rPr>
+                  </m:ctrlPr>
+                </m:fPr>
+                <m:num>
+                  <m:r>
+                    <w:rPr>
+                      <w:rFonts w:ascii="Cambria Math" w:hAnsi="Cambria Math"/>
+                    </w:rPr>
+                    <m:t>1-</m:t>
+                  </m:r>
+                  <m:sSub>
+                    <m:sSubPr>
+                      <m:ctrlPr>
+                        <w:rPr>
+                          <w:rFonts w:ascii="Cambria Math" w:hAnsi="Cambria Math"/>
+                          <w:i/>
+                        </w:rPr>
+                      </m:ctrlPr>
+                    </m:sSubPr>
+                    <m:e>
+                      <m:r>
+                        <w:rPr>
+                          <w:rFonts w:ascii="Cambria Math" w:hAnsi="Cambria Math"/>
+                        </w:rPr>
+                        <m:t>ε</m:t>
+                      </m:r>
+                    </m:e>
+                    <m:sub>
+                      <m:r>
+                        <w:rPr>
+                          <w:rFonts w:ascii="Cambria Math" w:hAnsi="Cambria Math"/>
+                        </w:rPr>
+                        <m:t>i</m:t>
+                      </m:r>
+                    </m:sub>
+                  </m:sSub>
+                </m:num>
+                <m:den>
+                  <m:sSub>
+                    <m:sSubPr>
+                      <m:ctrlPr>
+                        <w:rPr>
+                          <w:rFonts w:ascii="Cambria Math" w:hAnsi="Cambria Math"/>
+                          <w:i/>
+                        </w:rPr>
+                      </m:ctrlPr>
+                    </m:sSubPr>
+                    <m:e>
+                      <m:r>
+                        <w:rPr>
+                          <w:rFonts w:ascii="Cambria Math" w:hAnsi="Cambria Math"/>
+                        </w:rPr>
+                        <m:t>ε</m:t>
+                      </m:r>
+                    </m:e>
+                    <m:sub>
+                      <m:r>
+                        <w:rPr>
+                          <w:rFonts w:ascii="Cambria Math" w:hAnsi="Cambria Math"/>
+                        </w:rPr>
+                        <m:t>i</m:t>
+                      </m:r>
+                    </m:sub>
+                  </m:sSub>
+                </m:den>
+              </m:f>
+              <m:r>
+                <w:rPr>
+                  <w:rFonts w:ascii="Cambria Math" w:hAnsi="Cambria Math"/>
+                </w:rPr>
+                <m:t>+</m:t>
+              </m:r>
+              <m:f>
+                <m:fPr>
+                  <m:ctrlPr>
+                    <w:rPr>
+                      <w:rFonts w:ascii="Cambria Math" w:hAnsi="Cambria Math"/>
+                      <w:i/>
+                    </w:rPr>
+                  </m:ctrlPr>
+                </m:fPr>
+                <m:num>
+                  <m:r>
+                    <w:rPr>
+                      <w:rFonts w:ascii="Cambria Math" w:hAnsi="Cambria Math"/>
+                    </w:rPr>
+                    <m:t>1</m:t>
+                  </m:r>
+                </m:num>
+                <m:den>
+                  <m:sSub>
+                    <m:sSubPr>
+                      <m:ctrlPr>
+                        <w:rPr>
+                          <w:rFonts w:ascii="Cambria Math" w:hAnsi="Cambria Math"/>
+                          <w:i/>
+                        </w:rPr>
+                      </m:ctrlPr>
+                    </m:sSubPr>
+                    <m:e>
+                      <m:r>
+                        <w:rPr>
+                          <w:rFonts w:ascii="Cambria Math" w:hAnsi="Cambria Math"/>
+                        </w:rPr>
+                        <m:t>F</m:t>
+                      </m:r>
+                    </m:e>
+                    <m:sub>
+                      <m:r>
+                        <w:rPr>
+                          <w:rFonts w:ascii="Cambria Math" w:hAnsi="Cambria Math"/>
+                        </w:rPr>
+                        <m:t>i→MRT</m:t>
+                      </m:r>
+                    </m:sub>
+                  </m:sSub>
+                </m:den>
+              </m:f>
+            </m:den>
+          </m:f>
+        </m:oMath>
+      </m:oMathPara>
+    </w:p>
+    <w:p>
+      <w:pPr>
+        <w:rPr>
+          <w:rFonts w:eastAsiaTheme="minorEastAsia"/>
+        </w:rPr>
+      </w:pPr>
+      <m:oMathPara>
+        <m:oMath>
+          <m:r>
+            <w:rPr>
+              <w:rFonts w:ascii="Cambria Math" w:hAnsi="Cambria Math"/>
+            </w:rPr>
+            <m:t>R_th</m:t>
+          </m:r>
+          <m:r>
+            <w:rPr>
+              <w:rFonts w:ascii="Cambria Math" w:hAnsi="Cambria Math"/>
+            </w:rPr>
+            <m:t>=</m:t>
+          </m:r>
+          <m:f>
+            <m:fPr>
+              <m:ctrlPr>
+                <w:rPr>
+                  <w:rFonts w:ascii="Cambria Math" w:hAnsi="Cambria Math"/>
+                  <w:i/>
+                </w:rPr>
+              </m:ctrlPr>
+            </m:fPr>
+            <m:num>
+              <m:r>
+                <w:rPr>
+                  <w:rFonts w:ascii="Cambria Math" w:hAnsi="Cambria Math"/>
+                </w:rPr>
+                <m:t>1-</m:t>
+              </m:r>
+              <m:sSub>
+                <m:sSubPr>
+                  <m:ctrlPr>
+                    <w:rPr>
+                      <w:rFonts w:ascii="Cambria Math" w:hAnsi="Cambria Math"/>
+                      <w:i/>
+                    </w:rPr>
+                  </m:ctrlPr>
+                </m:sSubPr>
+                <m:e>
+                  <m:r>
+                    <w:rPr>
+                      <w:rFonts w:ascii="Cambria Math" w:hAnsi="Cambria Math"/>
+                    </w:rPr>
+                    <m:t>ε</m:t>
+                  </m:r>
+                </m:e>
+                <m:sub>
+                  <m:r>
+                    <w:rPr>
+                      <w:rFonts w:ascii="Cambria Math" w:hAnsi="Cambria Math"/>
+                    </w:rPr>
+                    <m:t>i</m:t>
+                  </m:r>
+                </m:sub>
+              </m:sSub>
+            </m:num>
+            <m:den>
+              <m:sSub>
+                <m:sSubPr>
+                  <m:ctrlPr>
+                    <w:rPr>
+                      <w:rFonts w:ascii="Cambria Math" w:hAnsi="Cambria Math"/>
+                      <w:i/>
+                    </w:rPr>
+                  </m:ctrlPr>
+                </m:sSubPr>
+                <m:e>
+                  <m:r>
+                    <w:rPr>
+                      <w:rFonts w:ascii="Cambria Math" w:hAnsi="Cambria Math"/>
+                    </w:rPr>
+                    <m:t>ε</m:t>
+                  </m:r>
+                </m:e>
+                <m:sub>
+                  <m:r>
+                    <w:rPr>
+                      <w:rFonts w:ascii="Cambria Math" w:hAnsi="Cambria Math"/>
+                    </w:rPr>
+                    <m:t>i</m:t>
+                  </m:r>
+                </m:sub>
+              </m:sSub>
+            </m:den>
+          </m:f>
+          <m:r>
+            <w:rPr>
+              <w:rFonts w:ascii="Cambria Math" w:hAnsi="Cambria Math"/>
+            </w:rPr>
+            <m:t>+</m:t>
+          </m:r>
+          <m:f>
+            <m:fPr>
+              <m:ctrlPr>
+                <w:rPr>
+                  <w:rFonts w:ascii="Cambria Math" w:hAnsi="Cambria Math"/>
+                  <w:i/>
+                </w:rPr>
+              </m:ctrlPr>
+            </m:fPr>
+            <m:num>
+              <m:r>
+                <w:rPr>
+                  <w:rFonts w:ascii="Cambria Math" w:hAnsi="Cambria Math"/>
+                </w:rPr>
+                <m:t>1</m:t>
+              </m:r>
+            </m:num>
+            <m:den>
+              <m:sSub>
+                <m:sSubPr>
+                  <m:ctrlPr>
+                    <w:rPr>
+                      <w:rFonts w:ascii="Cambria Math" w:hAnsi="Cambria Math"/>
+                      <w:i/>
+                    </w:rPr>
+                  </m:ctrlPr>
+                </m:sSubPr>
+                <m:e>
+                  <m:r>
+                    <w:rPr>
+                      <w:rFonts w:ascii="Cambria Math" w:hAnsi="Cambria Math"/>
+                    </w:rPr>
+                    <m:t>F</m:t>
+                  </m:r>
+                </m:e>
+                <m:sub>
+                  <m:r>
+                    <w:rPr>
+                      <w:rFonts w:ascii="Cambria Math" w:hAnsi="Cambria Math"/>
+                    </w:rPr>
+                    <m:t>i→MRT</m:t>
+                  </m:r>
+                </m:sub>
+              </m:sSub>
+            </m:den>
+          </m:f>
+        </m:oMath>
+      </m:oMathPara>
+    </w:p>
+    <w:p>
+      <w:pPr>
+        <w:rPr>
+          <w:rFonts w:eastAsiaTheme="minorEastAsia"/>
+        </w:rPr>
+      </w:pPr>
+      <m:oMathPara>
+        <m:oMath>
+          <m:sSub>
+            <m:sSubPr>
+              <m:ctrlPr>
+                <w:rPr>
+                  <w:rFonts w:ascii="Cambria Math" w:hAnsi="Cambria Math"/>
+                  <w:i/>
+                </w:rPr>
+              </m:ctrlPr>
+            </m:sSubPr>
+            <m:e>
+              <m:r>
+                <w:rPr>
+                  <w:rFonts w:ascii="Cambria Math" w:hAnsi="Cambria Math"/>
+                </w:rPr>
+                <m:t>Q_flow</m:t>
+              </m:r>
+            </m:e>
+            <m:sub>
+              <m:r>
+                <w:rPr>
+                  <w:rFonts w:ascii="Cambria Math" w:hAnsi="Cambria Math"/>
+                </w:rPr>
+                <m:t>i→MRT</m:t>
+              </m:r>
+            </m:sub>
+          </m:sSub>
+          <m:r>
+            <w:rPr>
+              <w:rFonts w:ascii="Cambria Math" w:hAnsi="Cambria Math"/>
+            </w:rPr>
+            <m:t>=</m:t>
+          </m:r>
+          <m:r>
+            <w:rPr>
+              <w:rFonts w:ascii="Cambria Math" w:hAnsi="Cambria Math"/>
+            </w:rPr>
+            <m:t>h_rad×A×dT</m:t>
+          </m:r>
+        </m:oMath>
+      </m:oMathPara>
+    </w:p>
+    <w:p>
+      <w:pPr>
+        <w:rPr>
+          <w:rFonts w:eastAsiaTheme="minorEastAsia"/>
+        </w:rPr>
+      </w:pPr>
+    </w:p>
+    <w:p>
+      <w:pPr>
+        <w:rPr>
+          <w:rFonts w:eastAsiaTheme="minorEastAsia"/>
+          <w:b/>
+        </w:rPr>
+      </w:pPr>
       <w:proofErr w:type="spellStart"/>
       <w:r>
         <w:rPr>
@@ -510,8 +1014,6 @@
         </w:rPr>
         <w:t>HeatCapacitor</w:t>
       </w:r>
-      <w:bookmarkStart w:id="0" w:name="_GoBack"/>
-      <w:bookmarkEnd w:id="0"/>
       <w:proofErr w:type="spellEnd"/>
     </w:p>
     <w:p>
@@ -558,16 +1060,12 @@
             <w:rPr>
               <w:rFonts w:ascii="Cambria Math" w:eastAsiaTheme="minorEastAsia" w:hAnsi="Cambria Math"/>
             </w:rPr>
-            <m:t>=</m:t>
-          </m:r>
-          <m:r>
-            <w:rPr>
-              <w:rFonts w:ascii="Cambria Math" w:eastAsiaTheme="minorEastAsia" w:hAnsi="Cambria Math"/>
-            </w:rPr>
-            <m:t>port.Q_flow</m:t>
+            <m:t>=port.Q_flow</m:t>
           </m:r>
         </m:oMath>
       </m:oMathPara>
+      <w:bookmarkStart w:id="0" w:name="_GoBack"/>
+      <w:bookmarkEnd w:id="0"/>
     </w:p>
     <w:p>
       <w:pPr>
@@ -1303,7 +1801,7 @@
   <a:extraClrSchemeLst/>
   <a:extLst>
     <a:ext uri="{05A4C25C-085E-4340-85A3-A5531E510DB2}">
-      <thm15:themeFamily xmlns:thm15="http://schemas.microsoft.com/office/thememl/2012/main" xmlns="" name="Office Theme" id="{62F939B6-93AF-4DB8-9C6B-D6C7DFDC589F}" vid="{4A3C46E8-61CC-4603-A589-7422A47A8E4A}"/>
+      <thm15:themeFamily xmlns="" xmlns:thm15="http://schemas.microsoft.com/office/thememl/2012/main" name="Office Theme" id="{62F939B6-93AF-4DB8-9C6B-D6C7DFDC589F}" vid="{4A3C46E8-61CC-4603-A589-7422A47A8E4A}"/>
     </a:ext>
   </a:extLst>
 </a:theme>
@@ -1314,7 +1812,7 @@
 </file>
 
 <file path=customXml/itemProps1.xml><?xml version="1.0" encoding="utf-8"?>
-<ds:datastoreItem xmlns:ds="http://schemas.openxmlformats.org/officeDocument/2006/customXml" ds:itemID="{C14F03C0-9453-43FD-9A8D-26F704401BA2}">
+<ds:datastoreItem xmlns:ds="http://schemas.openxmlformats.org/officeDocument/2006/customXml" ds:itemID="{1BC19F85-0F3F-459C-8948-033C3A9A242B}">
   <ds:schemaRefs>
     <ds:schemaRef ds:uri="http://schemas.openxmlformats.org/officeDocument/2006/bibliography"/>
   </ds:schemaRefs>

</xml_diff>

<commit_message>
Addition of the PartialWall module and its test in TAeZoSysPro.HeatTransfer.BasesClasses
</commit_message>
<xml_diff>
--- a/Information/script for equations.docx
+++ b/Information/script for equations.docx
@@ -1064,8 +1064,2439 @@
           </m:r>
         </m:oMath>
       </m:oMathPara>
+    </w:p>
+    <w:p>
+      <w:pPr>
+        <w:rPr>
+          <w:rFonts w:eastAsiaTheme="minorEastAsia"/>
+        </w:rPr>
+      </w:pPr>
+    </w:p>
+    <w:p>
+      <w:pPr>
+        <w:rPr>
+          <w:rFonts w:eastAsiaTheme="minorEastAsia"/>
+        </w:rPr>
+      </w:pPr>
+    </w:p>
+    <w:p>
+      <w:pPr>
+        <w:rPr>
+          <w:rFonts w:eastAsiaTheme="minorEastAsia"/>
+        </w:rPr>
+      </w:pPr>
+    </w:p>
+    <w:p>
+      <w:pPr>
+        <w:rPr>
+          <w:rFonts w:eastAsiaTheme="minorEastAsia"/>
+        </w:rPr>
+      </w:pPr>
+    </w:p>
+    <w:p>
+      <w:pPr>
+        <w:rPr>
+          <w:b/>
+        </w:rPr>
+      </w:pPr>
+      <w:r>
+        <w:rPr>
+          <w:b/>
+        </w:rPr>
+        <w:lastRenderedPageBreak/>
+        <w:t>Second order central</w:t>
+      </w:r>
+    </w:p>
+    <w:p>
+      <w:pPr>
+        <w:rPr>
+          <w:rFonts w:eastAsiaTheme="minorEastAsia"/>
+          <w:sz w:val="18"/>
+        </w:rPr>
+      </w:pPr>
+      <m:oMathPara>
+        <m:oMath>
+          <m:sSub>
+            <m:sSubPr>
+              <m:ctrlPr>
+                <w:rPr>
+                  <w:rFonts w:ascii="Cambria Math" w:hAnsi="Cambria Math"/>
+                  <w:i/>
+                  <w:sz w:val="18"/>
+                </w:rPr>
+              </m:ctrlPr>
+            </m:sSubPr>
+            <m:e>
+              <m:d>
+                <m:dPr>
+                  <m:begChr m:val=""/>
+                  <m:endChr m:val="⌋"/>
+                  <m:ctrlPr>
+                    <w:rPr>
+                      <w:rFonts w:ascii="Cambria Math" w:hAnsi="Cambria Math"/>
+                      <w:i/>
+                      <w:sz w:val="18"/>
+                    </w:rPr>
+                  </m:ctrlPr>
+                </m:dPr>
+                <m:e>
+                  <m:f>
+                    <m:fPr>
+                      <m:ctrlPr>
+                        <w:rPr>
+                          <w:rFonts w:ascii="Cambria Math" w:hAnsi="Cambria Math"/>
+                          <w:i/>
+                          <w:sz w:val="18"/>
+                        </w:rPr>
+                      </m:ctrlPr>
+                    </m:fPr>
+                    <m:num>
+                      <m:r>
+                        <w:rPr>
+                          <w:rFonts w:ascii="Cambria Math" w:hAnsi="Cambria Math"/>
+                          <w:sz w:val="18"/>
+                        </w:rPr>
+                        <m:t>∂u</m:t>
+                      </m:r>
+                    </m:num>
+                    <m:den>
+                      <m:r>
+                        <w:rPr>
+                          <w:rFonts w:ascii="Cambria Math" w:hAnsi="Cambria Math"/>
+                          <w:sz w:val="18"/>
+                        </w:rPr>
+                        <m:t>∂x</m:t>
+                      </m:r>
+                    </m:den>
+                  </m:f>
+                </m:e>
+              </m:d>
+            </m:e>
+            <m:sub>
+              <m:r>
+                <w:rPr>
+                  <w:rFonts w:ascii="Cambria Math" w:hAnsi="Cambria Math"/>
+                  <w:sz w:val="18"/>
+                </w:rPr>
+                <m:t>i-</m:t>
+              </m:r>
+              <m:f>
+                <m:fPr>
+                  <m:ctrlPr>
+                    <w:rPr>
+                      <w:rFonts w:ascii="Cambria Math" w:hAnsi="Cambria Math"/>
+                      <w:i/>
+                      <w:sz w:val="18"/>
+                    </w:rPr>
+                  </m:ctrlPr>
+                </m:fPr>
+                <m:num>
+                  <m:r>
+                    <w:rPr>
+                      <w:rFonts w:ascii="Cambria Math" w:hAnsi="Cambria Math"/>
+                      <w:sz w:val="18"/>
+                    </w:rPr>
+                    <m:t>1</m:t>
+                  </m:r>
+                </m:num>
+                <m:den>
+                  <m:r>
+                    <w:rPr>
+                      <w:rFonts w:ascii="Cambria Math" w:hAnsi="Cambria Math"/>
+                      <w:sz w:val="18"/>
+                    </w:rPr>
+                    <m:t>2</m:t>
+                  </m:r>
+                </m:den>
+              </m:f>
+            </m:sub>
+          </m:sSub>
+          <m:r>
+            <w:rPr>
+              <w:rFonts w:ascii="Cambria Math" w:hAnsi="Cambria Math"/>
+              <w:sz w:val="18"/>
+            </w:rPr>
+            <m:t>≈</m:t>
+          </m:r>
+          <m:f>
+            <m:fPr>
+              <m:ctrlPr>
+                <w:rPr>
+                  <w:rFonts w:ascii="Cambria Math" w:hAnsi="Cambria Math"/>
+                  <w:i/>
+                  <w:sz w:val="18"/>
+                </w:rPr>
+              </m:ctrlPr>
+            </m:fPr>
+            <m:num>
+              <m:sSub>
+                <m:sSubPr>
+                  <m:ctrlPr>
+                    <w:rPr>
+                      <w:rFonts w:ascii="Cambria Math" w:hAnsi="Cambria Math"/>
+                      <w:i/>
+                      <w:sz w:val="18"/>
+                    </w:rPr>
+                  </m:ctrlPr>
+                </m:sSubPr>
+                <m:e>
+                  <m:r>
+                    <w:rPr>
+                      <w:rFonts w:ascii="Cambria Math" w:hAnsi="Cambria Math"/>
+                      <w:sz w:val="18"/>
+                    </w:rPr>
+                    <m:t>u</m:t>
+                  </m:r>
+                </m:e>
+                <m:sub>
+                  <m:r>
+                    <w:rPr>
+                      <w:rFonts w:ascii="Cambria Math" w:hAnsi="Cambria Math"/>
+                      <w:sz w:val="18"/>
+                    </w:rPr>
+                    <m:t>i</m:t>
+                  </m:r>
+                </m:sub>
+              </m:sSub>
+              <m:r>
+                <w:rPr>
+                  <w:rFonts w:ascii="Cambria Math" w:hAnsi="Cambria Math"/>
+                  <w:sz w:val="18"/>
+                </w:rPr>
+                <m:t>-</m:t>
+              </m:r>
+              <m:sSub>
+                <m:sSubPr>
+                  <m:ctrlPr>
+                    <w:rPr>
+                      <w:rFonts w:ascii="Cambria Math" w:hAnsi="Cambria Math"/>
+                      <w:i/>
+                      <w:sz w:val="18"/>
+                    </w:rPr>
+                  </m:ctrlPr>
+                </m:sSubPr>
+                <m:e>
+                  <m:r>
+                    <w:rPr>
+                      <w:rFonts w:ascii="Cambria Math" w:hAnsi="Cambria Math"/>
+                      <w:sz w:val="18"/>
+                    </w:rPr>
+                    <m:t>u</m:t>
+                  </m:r>
+                </m:e>
+                <m:sub>
+                  <m:r>
+                    <w:rPr>
+                      <w:rFonts w:ascii="Cambria Math" w:hAnsi="Cambria Math"/>
+                      <w:sz w:val="18"/>
+                    </w:rPr>
+                    <m:t>i-1</m:t>
+                  </m:r>
+                </m:sub>
+              </m:sSub>
+            </m:num>
+            <m:den>
+              <m:f>
+                <m:fPr>
+                  <m:ctrlPr>
+                    <w:rPr>
+                      <w:rFonts w:ascii="Cambria Math" w:hAnsi="Cambria Math"/>
+                      <w:i/>
+                      <w:sz w:val="18"/>
+                    </w:rPr>
+                  </m:ctrlPr>
+                </m:fPr>
+                <m:num>
+                  <m:sSub>
+                    <m:sSubPr>
+                      <m:ctrlPr>
+                        <w:rPr>
+                          <w:rFonts w:ascii="Cambria Math" w:hAnsi="Cambria Math"/>
+                          <w:i/>
+                          <w:sz w:val="18"/>
+                        </w:rPr>
+                      </m:ctrlPr>
+                    </m:sSubPr>
+                    <m:e>
+                      <m:r>
+                        <w:rPr>
+                          <w:rFonts w:ascii="Cambria Math" w:hAnsi="Cambria Math"/>
+                          <w:sz w:val="18"/>
+                        </w:rPr>
+                        <m:t>x</m:t>
+                      </m:r>
+                    </m:e>
+                    <m:sub>
+                      <m:r>
+                        <w:rPr>
+                          <w:rFonts w:ascii="Cambria Math" w:hAnsi="Cambria Math"/>
+                          <w:sz w:val="18"/>
+                        </w:rPr>
+                        <m:t>i</m:t>
+                      </m:r>
+                    </m:sub>
+                  </m:sSub>
+                  <m:r>
+                    <w:rPr>
+                      <w:rFonts w:ascii="Cambria Math" w:hAnsi="Cambria Math"/>
+                      <w:sz w:val="18"/>
+                    </w:rPr>
+                    <m:t>-</m:t>
+                  </m:r>
+                  <m:sSub>
+                    <m:sSubPr>
+                      <m:ctrlPr>
+                        <w:rPr>
+                          <w:rFonts w:ascii="Cambria Math" w:hAnsi="Cambria Math"/>
+                          <w:i/>
+                          <w:sz w:val="18"/>
+                        </w:rPr>
+                      </m:ctrlPr>
+                    </m:sSubPr>
+                    <m:e>
+                      <m:r>
+                        <w:rPr>
+                          <w:rFonts w:ascii="Cambria Math" w:hAnsi="Cambria Math"/>
+                          <w:sz w:val="18"/>
+                        </w:rPr>
+                        <m:t>x</m:t>
+                      </m:r>
+                    </m:e>
+                    <m:sub>
+                      <m:r>
+                        <w:rPr>
+                          <w:rFonts w:ascii="Cambria Math" w:hAnsi="Cambria Math"/>
+                          <w:sz w:val="18"/>
+                        </w:rPr>
+                        <m:t>i-2</m:t>
+                      </m:r>
+                    </m:sub>
+                  </m:sSub>
+                </m:num>
+                <m:den>
+                  <m:r>
+                    <w:rPr>
+                      <w:rFonts w:ascii="Cambria Math" w:hAnsi="Cambria Math"/>
+                      <w:sz w:val="18"/>
+                    </w:rPr>
+                    <m:t>2</m:t>
+                  </m:r>
+                </m:den>
+              </m:f>
+            </m:den>
+          </m:f>
+          <m:r>
+            <w:rPr>
+              <w:rFonts w:ascii="Cambria Math" w:hAnsi="Cambria Math"/>
+              <w:sz w:val="18"/>
+            </w:rPr>
+            <m:t>=</m:t>
+          </m:r>
+          <m:f>
+            <m:fPr>
+              <m:ctrlPr>
+                <w:rPr>
+                  <w:rFonts w:ascii="Cambria Math" w:hAnsi="Cambria Math"/>
+                  <w:i/>
+                  <w:sz w:val="18"/>
+                </w:rPr>
+              </m:ctrlPr>
+            </m:fPr>
+            <m:num>
+              <m:r>
+                <w:rPr>
+                  <w:rFonts w:ascii="Cambria Math" w:hAnsi="Cambria Math"/>
+                  <w:sz w:val="18"/>
+                </w:rPr>
+                <m:t>2×</m:t>
+              </m:r>
+              <m:d>
+                <m:dPr>
+                  <m:ctrlPr>
+                    <w:rPr>
+                      <w:rFonts w:ascii="Cambria Math" w:hAnsi="Cambria Math"/>
+                      <w:i/>
+                      <w:sz w:val="18"/>
+                    </w:rPr>
+                  </m:ctrlPr>
+                </m:dPr>
+                <m:e>
+                  <m:sSub>
+                    <m:sSubPr>
+                      <m:ctrlPr>
+                        <w:rPr>
+                          <w:rFonts w:ascii="Cambria Math" w:hAnsi="Cambria Math"/>
+                          <w:i/>
+                          <w:sz w:val="18"/>
+                        </w:rPr>
+                      </m:ctrlPr>
+                    </m:sSubPr>
+                    <m:e>
+                      <m:r>
+                        <w:rPr>
+                          <w:rFonts w:ascii="Cambria Math" w:hAnsi="Cambria Math"/>
+                          <w:sz w:val="18"/>
+                        </w:rPr>
+                        <m:t>u</m:t>
+                      </m:r>
+                    </m:e>
+                    <m:sub>
+                      <m:r>
+                        <w:rPr>
+                          <w:rFonts w:ascii="Cambria Math" w:hAnsi="Cambria Math"/>
+                          <w:sz w:val="18"/>
+                        </w:rPr>
+                        <m:t>i</m:t>
+                      </m:r>
+                    </m:sub>
+                  </m:sSub>
+                  <m:r>
+                    <w:rPr>
+                      <w:rFonts w:ascii="Cambria Math" w:hAnsi="Cambria Math"/>
+                      <w:sz w:val="18"/>
+                    </w:rPr>
+                    <m:t>-</m:t>
+                  </m:r>
+                  <m:sSub>
+                    <m:sSubPr>
+                      <m:ctrlPr>
+                        <w:rPr>
+                          <w:rFonts w:ascii="Cambria Math" w:hAnsi="Cambria Math"/>
+                          <w:i/>
+                          <w:sz w:val="18"/>
+                        </w:rPr>
+                      </m:ctrlPr>
+                    </m:sSubPr>
+                    <m:e>
+                      <m:r>
+                        <w:rPr>
+                          <w:rFonts w:ascii="Cambria Math" w:hAnsi="Cambria Math"/>
+                          <w:sz w:val="18"/>
+                        </w:rPr>
+                        <m:t>u</m:t>
+                      </m:r>
+                    </m:e>
+                    <m:sub>
+                      <m:r>
+                        <w:rPr>
+                          <w:rFonts w:ascii="Cambria Math" w:hAnsi="Cambria Math"/>
+                          <w:sz w:val="18"/>
+                        </w:rPr>
+                        <m:t>i-1</m:t>
+                      </m:r>
+                    </m:sub>
+                  </m:sSub>
+                </m:e>
+              </m:d>
+            </m:num>
+            <m:den>
+              <m:sSub>
+                <m:sSubPr>
+                  <m:ctrlPr>
+                    <w:rPr>
+                      <w:rFonts w:ascii="Cambria Math" w:hAnsi="Cambria Math"/>
+                      <w:i/>
+                      <w:sz w:val="18"/>
+                    </w:rPr>
+                  </m:ctrlPr>
+                </m:sSubPr>
+                <m:e>
+                  <m:r>
+                    <w:rPr>
+                      <w:rFonts w:ascii="Cambria Math" w:hAnsi="Cambria Math"/>
+                      <w:sz w:val="18"/>
+                    </w:rPr>
+                    <m:t>x</m:t>
+                  </m:r>
+                </m:e>
+                <m:sub>
+                  <m:r>
+                    <w:rPr>
+                      <w:rFonts w:ascii="Cambria Math" w:hAnsi="Cambria Math"/>
+                      <w:sz w:val="18"/>
+                    </w:rPr>
+                    <m:t>i</m:t>
+                  </m:r>
+                </m:sub>
+              </m:sSub>
+              <m:r>
+                <w:rPr>
+                  <w:rFonts w:ascii="Cambria Math" w:hAnsi="Cambria Math"/>
+                  <w:sz w:val="18"/>
+                </w:rPr>
+                <m:t>-</m:t>
+              </m:r>
+              <m:sSub>
+                <m:sSubPr>
+                  <m:ctrlPr>
+                    <w:rPr>
+                      <w:rFonts w:ascii="Cambria Math" w:hAnsi="Cambria Math"/>
+                      <w:i/>
+                      <w:sz w:val="18"/>
+                    </w:rPr>
+                  </m:ctrlPr>
+                </m:sSubPr>
+                <m:e>
+                  <m:r>
+                    <w:rPr>
+                      <w:rFonts w:ascii="Cambria Math" w:hAnsi="Cambria Math"/>
+                      <w:sz w:val="18"/>
+                    </w:rPr>
+                    <m:t>x</m:t>
+                  </m:r>
+                </m:e>
+                <m:sub>
+                  <m:r>
+                    <w:rPr>
+                      <w:rFonts w:ascii="Cambria Math" w:hAnsi="Cambria Math"/>
+                      <w:sz w:val="18"/>
+                    </w:rPr>
+                    <m:t>i-2</m:t>
+                  </m:r>
+                </m:sub>
+              </m:sSub>
+            </m:den>
+          </m:f>
+        </m:oMath>
+      </m:oMathPara>
+    </w:p>
+    <w:p>
+      <w:pPr>
+        <w:rPr>
+          <w:rFonts w:eastAsiaTheme="minorEastAsia"/>
+          <w:sz w:val="18"/>
+        </w:rPr>
+      </w:pPr>
+      <m:oMathPara>
+        <m:oMath>
+          <m:sSub>
+            <m:sSubPr>
+              <m:ctrlPr>
+                <w:rPr>
+                  <w:rFonts w:ascii="Cambria Math" w:hAnsi="Cambria Math"/>
+                  <w:i/>
+                  <w:sz w:val="18"/>
+                </w:rPr>
+              </m:ctrlPr>
+            </m:sSubPr>
+            <m:e>
+              <m:d>
+                <m:dPr>
+                  <m:begChr m:val=""/>
+                  <m:endChr m:val="⌋"/>
+                  <m:ctrlPr>
+                    <w:rPr>
+                      <w:rFonts w:ascii="Cambria Math" w:hAnsi="Cambria Math"/>
+                      <w:i/>
+                      <w:sz w:val="18"/>
+                    </w:rPr>
+                  </m:ctrlPr>
+                </m:dPr>
+                <m:e>
+                  <m:f>
+                    <m:fPr>
+                      <m:ctrlPr>
+                        <w:rPr>
+                          <w:rFonts w:ascii="Cambria Math" w:hAnsi="Cambria Math"/>
+                          <w:i/>
+                          <w:sz w:val="18"/>
+                        </w:rPr>
+                      </m:ctrlPr>
+                    </m:fPr>
+                    <m:num>
+                      <m:r>
+                        <w:rPr>
+                          <w:rFonts w:ascii="Cambria Math" w:hAnsi="Cambria Math"/>
+                          <w:sz w:val="18"/>
+                        </w:rPr>
+                        <m:t>∂u</m:t>
+                      </m:r>
+                    </m:num>
+                    <m:den>
+                      <m:r>
+                        <w:rPr>
+                          <w:rFonts w:ascii="Cambria Math" w:hAnsi="Cambria Math"/>
+                          <w:sz w:val="18"/>
+                        </w:rPr>
+                        <m:t>∂x</m:t>
+                      </m:r>
+                    </m:den>
+                  </m:f>
+                </m:e>
+              </m:d>
+            </m:e>
+            <m:sub>
+              <m:r>
+                <w:rPr>
+                  <w:rFonts w:ascii="Cambria Math" w:hAnsi="Cambria Math"/>
+                  <w:sz w:val="18"/>
+                </w:rPr>
+                <m:t>i+</m:t>
+              </m:r>
+              <m:f>
+                <m:fPr>
+                  <m:ctrlPr>
+                    <w:rPr>
+                      <w:rFonts w:ascii="Cambria Math" w:hAnsi="Cambria Math"/>
+                      <w:i/>
+                      <w:sz w:val="18"/>
+                    </w:rPr>
+                  </m:ctrlPr>
+                </m:fPr>
+                <m:num>
+                  <m:r>
+                    <w:rPr>
+                      <w:rFonts w:ascii="Cambria Math" w:hAnsi="Cambria Math"/>
+                      <w:sz w:val="18"/>
+                    </w:rPr>
+                    <m:t>1</m:t>
+                  </m:r>
+                </m:num>
+                <m:den>
+                  <m:r>
+                    <w:rPr>
+                      <w:rFonts w:ascii="Cambria Math" w:hAnsi="Cambria Math"/>
+                      <w:sz w:val="18"/>
+                    </w:rPr>
+                    <m:t>2</m:t>
+                  </m:r>
+                </m:den>
+              </m:f>
+            </m:sub>
+          </m:sSub>
+          <m:r>
+            <w:rPr>
+              <w:rFonts w:ascii="Cambria Math" w:hAnsi="Cambria Math"/>
+              <w:sz w:val="18"/>
+            </w:rPr>
+            <m:t>≈</m:t>
+          </m:r>
+          <m:f>
+            <m:fPr>
+              <m:ctrlPr>
+                <w:rPr>
+                  <w:rFonts w:ascii="Cambria Math" w:hAnsi="Cambria Math"/>
+                  <w:i/>
+                  <w:sz w:val="18"/>
+                </w:rPr>
+              </m:ctrlPr>
+            </m:fPr>
+            <m:num>
+              <m:sSub>
+                <m:sSubPr>
+                  <m:ctrlPr>
+                    <w:rPr>
+                      <w:rFonts w:ascii="Cambria Math" w:hAnsi="Cambria Math"/>
+                      <w:i/>
+                      <w:sz w:val="18"/>
+                    </w:rPr>
+                  </m:ctrlPr>
+                </m:sSubPr>
+                <m:e>
+                  <m:r>
+                    <w:rPr>
+                      <w:rFonts w:ascii="Cambria Math" w:hAnsi="Cambria Math"/>
+                      <w:sz w:val="18"/>
+                    </w:rPr>
+                    <m:t>u</m:t>
+                  </m:r>
+                </m:e>
+                <m:sub>
+                  <m:r>
+                    <w:rPr>
+                      <w:rFonts w:ascii="Cambria Math" w:hAnsi="Cambria Math"/>
+                      <w:sz w:val="18"/>
+                    </w:rPr>
+                    <m:t>i+1</m:t>
+                  </m:r>
+                </m:sub>
+              </m:sSub>
+              <m:r>
+                <w:rPr>
+                  <w:rFonts w:ascii="Cambria Math" w:hAnsi="Cambria Math"/>
+                  <w:sz w:val="18"/>
+                </w:rPr>
+                <m:t>-</m:t>
+              </m:r>
+              <m:sSub>
+                <m:sSubPr>
+                  <m:ctrlPr>
+                    <w:rPr>
+                      <w:rFonts w:ascii="Cambria Math" w:hAnsi="Cambria Math"/>
+                      <w:i/>
+                      <w:sz w:val="18"/>
+                    </w:rPr>
+                  </m:ctrlPr>
+                </m:sSubPr>
+                <m:e>
+                  <m:r>
+                    <w:rPr>
+                      <w:rFonts w:ascii="Cambria Math" w:hAnsi="Cambria Math"/>
+                      <w:sz w:val="18"/>
+                    </w:rPr>
+                    <m:t>u</m:t>
+                  </m:r>
+                </m:e>
+                <m:sub>
+                  <m:r>
+                    <w:rPr>
+                      <w:rFonts w:ascii="Cambria Math" w:hAnsi="Cambria Math"/>
+                      <w:sz w:val="18"/>
+                    </w:rPr>
+                    <m:t>i</m:t>
+                  </m:r>
+                </m:sub>
+              </m:sSub>
+            </m:num>
+            <m:den>
+              <m:f>
+                <m:fPr>
+                  <m:ctrlPr>
+                    <w:rPr>
+                      <w:rFonts w:ascii="Cambria Math" w:hAnsi="Cambria Math"/>
+                      <w:i/>
+                      <w:sz w:val="18"/>
+                    </w:rPr>
+                  </m:ctrlPr>
+                </m:fPr>
+                <m:num>
+                  <m:sSub>
+                    <m:sSubPr>
+                      <m:ctrlPr>
+                        <w:rPr>
+                          <w:rFonts w:ascii="Cambria Math" w:hAnsi="Cambria Math"/>
+                          <w:i/>
+                          <w:sz w:val="18"/>
+                        </w:rPr>
+                      </m:ctrlPr>
+                    </m:sSubPr>
+                    <m:e>
+                      <m:r>
+                        <w:rPr>
+                          <w:rFonts w:ascii="Cambria Math" w:hAnsi="Cambria Math"/>
+                          <w:sz w:val="18"/>
+                        </w:rPr>
+                        <m:t>x</m:t>
+                      </m:r>
+                    </m:e>
+                    <m:sub>
+                      <m:r>
+                        <w:rPr>
+                          <w:rFonts w:ascii="Cambria Math" w:hAnsi="Cambria Math"/>
+                          <w:sz w:val="18"/>
+                        </w:rPr>
+                        <m:t>i+1</m:t>
+                      </m:r>
+                    </m:sub>
+                  </m:sSub>
+                  <m:r>
+                    <w:rPr>
+                      <w:rFonts w:ascii="Cambria Math" w:hAnsi="Cambria Math"/>
+                      <w:sz w:val="18"/>
+                    </w:rPr>
+                    <m:t>-</m:t>
+                  </m:r>
+                  <m:sSub>
+                    <m:sSubPr>
+                      <m:ctrlPr>
+                        <w:rPr>
+                          <w:rFonts w:ascii="Cambria Math" w:hAnsi="Cambria Math"/>
+                          <w:i/>
+                          <w:sz w:val="18"/>
+                        </w:rPr>
+                      </m:ctrlPr>
+                    </m:sSubPr>
+                    <m:e>
+                      <m:r>
+                        <w:rPr>
+                          <w:rFonts w:ascii="Cambria Math" w:hAnsi="Cambria Math"/>
+                          <w:sz w:val="18"/>
+                        </w:rPr>
+                        <m:t>x</m:t>
+                      </m:r>
+                    </m:e>
+                    <m:sub>
+                      <m:r>
+                        <w:rPr>
+                          <w:rFonts w:ascii="Cambria Math" w:hAnsi="Cambria Math"/>
+                          <w:sz w:val="18"/>
+                        </w:rPr>
+                        <m:t>i-1</m:t>
+                      </m:r>
+                    </m:sub>
+                  </m:sSub>
+                </m:num>
+                <m:den>
+                  <m:r>
+                    <w:rPr>
+                      <w:rFonts w:ascii="Cambria Math" w:hAnsi="Cambria Math"/>
+                      <w:sz w:val="18"/>
+                    </w:rPr>
+                    <m:t>2</m:t>
+                  </m:r>
+                </m:den>
+              </m:f>
+            </m:den>
+          </m:f>
+          <m:r>
+            <w:rPr>
+              <w:rFonts w:ascii="Cambria Math" w:hAnsi="Cambria Math"/>
+              <w:sz w:val="18"/>
+            </w:rPr>
+            <m:t>=</m:t>
+          </m:r>
+          <m:f>
+            <m:fPr>
+              <m:ctrlPr>
+                <w:rPr>
+                  <w:rFonts w:ascii="Cambria Math" w:hAnsi="Cambria Math"/>
+                  <w:i/>
+                  <w:sz w:val="18"/>
+                </w:rPr>
+              </m:ctrlPr>
+            </m:fPr>
+            <m:num>
+              <m:r>
+                <w:rPr>
+                  <w:rFonts w:ascii="Cambria Math" w:hAnsi="Cambria Math"/>
+                  <w:sz w:val="18"/>
+                </w:rPr>
+                <m:t>2×</m:t>
+              </m:r>
+              <m:d>
+                <m:dPr>
+                  <m:ctrlPr>
+                    <w:rPr>
+                      <w:rFonts w:ascii="Cambria Math" w:hAnsi="Cambria Math"/>
+                      <w:i/>
+                      <w:sz w:val="18"/>
+                    </w:rPr>
+                  </m:ctrlPr>
+                </m:dPr>
+                <m:e>
+                  <m:sSub>
+                    <m:sSubPr>
+                      <m:ctrlPr>
+                        <w:rPr>
+                          <w:rFonts w:ascii="Cambria Math" w:hAnsi="Cambria Math"/>
+                          <w:i/>
+                          <w:sz w:val="18"/>
+                        </w:rPr>
+                      </m:ctrlPr>
+                    </m:sSubPr>
+                    <m:e>
+                      <m:r>
+                        <w:rPr>
+                          <w:rFonts w:ascii="Cambria Math" w:hAnsi="Cambria Math"/>
+                          <w:sz w:val="18"/>
+                        </w:rPr>
+                        <m:t>u</m:t>
+                      </m:r>
+                    </m:e>
+                    <m:sub>
+                      <m:r>
+                        <w:rPr>
+                          <w:rFonts w:ascii="Cambria Math" w:hAnsi="Cambria Math"/>
+                          <w:sz w:val="18"/>
+                        </w:rPr>
+                        <m:t>i+1</m:t>
+                      </m:r>
+                    </m:sub>
+                  </m:sSub>
+                  <m:r>
+                    <w:rPr>
+                      <w:rFonts w:ascii="Cambria Math" w:hAnsi="Cambria Math"/>
+                      <w:sz w:val="18"/>
+                    </w:rPr>
+                    <m:t>-</m:t>
+                  </m:r>
+                  <m:sSub>
+                    <m:sSubPr>
+                      <m:ctrlPr>
+                        <w:rPr>
+                          <w:rFonts w:ascii="Cambria Math" w:hAnsi="Cambria Math"/>
+                          <w:i/>
+                          <w:sz w:val="18"/>
+                        </w:rPr>
+                      </m:ctrlPr>
+                    </m:sSubPr>
+                    <m:e>
+                      <m:r>
+                        <w:rPr>
+                          <w:rFonts w:ascii="Cambria Math" w:hAnsi="Cambria Math"/>
+                          <w:sz w:val="18"/>
+                        </w:rPr>
+                        <m:t>u</m:t>
+                      </m:r>
+                    </m:e>
+                    <m:sub>
+                      <m:r>
+                        <w:rPr>
+                          <w:rFonts w:ascii="Cambria Math" w:hAnsi="Cambria Math"/>
+                          <w:sz w:val="18"/>
+                        </w:rPr>
+                        <m:t>i</m:t>
+                      </m:r>
+                    </m:sub>
+                  </m:sSub>
+                </m:e>
+              </m:d>
+            </m:num>
+            <m:den>
+              <m:sSub>
+                <m:sSubPr>
+                  <m:ctrlPr>
+                    <w:rPr>
+                      <w:rFonts w:ascii="Cambria Math" w:hAnsi="Cambria Math"/>
+                      <w:i/>
+                      <w:sz w:val="18"/>
+                    </w:rPr>
+                  </m:ctrlPr>
+                </m:sSubPr>
+                <m:e>
+                  <m:r>
+                    <w:rPr>
+                      <w:rFonts w:ascii="Cambria Math" w:hAnsi="Cambria Math"/>
+                      <w:sz w:val="18"/>
+                    </w:rPr>
+                    <m:t>x</m:t>
+                  </m:r>
+                </m:e>
+                <m:sub>
+                  <m:r>
+                    <w:rPr>
+                      <w:rFonts w:ascii="Cambria Math" w:hAnsi="Cambria Math"/>
+                      <w:sz w:val="18"/>
+                    </w:rPr>
+                    <m:t>i+1</m:t>
+                  </m:r>
+                </m:sub>
+              </m:sSub>
+              <m:r>
+                <w:rPr>
+                  <w:rFonts w:ascii="Cambria Math" w:hAnsi="Cambria Math"/>
+                  <w:sz w:val="18"/>
+                </w:rPr>
+                <m:t>-</m:t>
+              </m:r>
+              <m:sSub>
+                <m:sSubPr>
+                  <m:ctrlPr>
+                    <w:rPr>
+                      <w:rFonts w:ascii="Cambria Math" w:hAnsi="Cambria Math"/>
+                      <w:i/>
+                      <w:sz w:val="18"/>
+                    </w:rPr>
+                  </m:ctrlPr>
+                </m:sSubPr>
+                <m:e>
+                  <m:r>
+                    <w:rPr>
+                      <w:rFonts w:ascii="Cambria Math" w:hAnsi="Cambria Math"/>
+                      <w:sz w:val="18"/>
+                    </w:rPr>
+                    <m:t>x</m:t>
+                  </m:r>
+                </m:e>
+                <m:sub>
+                  <m:r>
+                    <w:rPr>
+                      <w:rFonts w:ascii="Cambria Math" w:hAnsi="Cambria Math"/>
+                      <w:sz w:val="18"/>
+                    </w:rPr>
+                    <m:t>i-1</m:t>
+                  </m:r>
+                </m:sub>
+              </m:sSub>
+            </m:den>
+          </m:f>
+        </m:oMath>
+      </m:oMathPara>
+    </w:p>
+    <w:p>
+      <w:pPr>
+        <w:rPr>
+          <w:rFonts w:eastAsiaTheme="minorEastAsia"/>
+          <w:sz w:val="18"/>
+        </w:rPr>
+      </w:pPr>
+      <m:oMathPara>
+        <m:oMath>
+          <m:sSub>
+            <m:sSubPr>
+              <m:ctrlPr>
+                <w:rPr>
+                  <w:rFonts w:ascii="Cambria Math" w:hAnsi="Cambria Math"/>
+                  <w:i/>
+                  <w:sz w:val="18"/>
+                </w:rPr>
+              </m:ctrlPr>
+            </m:sSubPr>
+            <m:e>
+              <m:d>
+                <m:dPr>
+                  <m:begChr m:val=""/>
+                  <m:endChr m:val="⌋"/>
+                  <m:ctrlPr>
+                    <w:rPr>
+                      <w:rFonts w:ascii="Cambria Math" w:hAnsi="Cambria Math"/>
+                      <w:i/>
+                      <w:sz w:val="18"/>
+                    </w:rPr>
+                  </m:ctrlPr>
+                </m:dPr>
+                <m:e>
+                  <m:f>
+                    <m:fPr>
+                      <m:ctrlPr>
+                        <w:rPr>
+                          <w:rFonts w:ascii="Cambria Math" w:hAnsi="Cambria Math"/>
+                          <w:i/>
+                          <w:sz w:val="18"/>
+                        </w:rPr>
+                      </m:ctrlPr>
+                    </m:fPr>
+                    <m:num>
+                      <m:r>
+                        <w:rPr>
+                          <w:rFonts w:ascii="Cambria Math" w:hAnsi="Cambria Math"/>
+                          <w:sz w:val="18"/>
+                        </w:rPr>
+                        <m:t>∂u</m:t>
+                      </m:r>
+                    </m:num>
+                    <m:den>
+                      <m:r>
+                        <w:rPr>
+                          <w:rFonts w:ascii="Cambria Math" w:hAnsi="Cambria Math"/>
+                          <w:sz w:val="18"/>
+                        </w:rPr>
+                        <m:t>∂x</m:t>
+                      </m:r>
+                    </m:den>
+                  </m:f>
+                </m:e>
+              </m:d>
+            </m:e>
+            <m:sub>
+              <m:r>
+                <w:rPr>
+                  <w:rFonts w:ascii="Cambria Math" w:hAnsi="Cambria Math"/>
+                  <w:sz w:val="18"/>
+                </w:rPr>
+                <m:t>i-</m:t>
+              </m:r>
+              <m:f>
+                <m:fPr>
+                  <m:ctrlPr>
+                    <w:rPr>
+                      <w:rFonts w:ascii="Cambria Math" w:hAnsi="Cambria Math"/>
+                      <w:i/>
+                      <w:sz w:val="18"/>
+                    </w:rPr>
+                  </m:ctrlPr>
+                </m:fPr>
+                <m:num>
+                  <m:r>
+                    <w:rPr>
+                      <w:rFonts w:ascii="Cambria Math" w:hAnsi="Cambria Math"/>
+                      <w:sz w:val="18"/>
+                    </w:rPr>
+                    <m:t>1</m:t>
+                  </m:r>
+                </m:num>
+                <m:den>
+                  <m:r>
+                    <w:rPr>
+                      <w:rFonts w:ascii="Cambria Math" w:hAnsi="Cambria Math"/>
+                      <w:sz w:val="18"/>
+                    </w:rPr>
+                    <m:t>2</m:t>
+                  </m:r>
+                </m:den>
+              </m:f>
+            </m:sub>
+          </m:sSub>
+          <m:r>
+            <w:rPr>
+              <w:rFonts w:ascii="Cambria Math" w:hAnsi="Cambria Math"/>
+              <w:sz w:val="18"/>
+            </w:rPr>
+            <m:t>≈</m:t>
+          </m:r>
+          <m:f>
+            <m:fPr>
+              <m:ctrlPr>
+                <w:rPr>
+                  <w:rFonts w:ascii="Cambria Math" w:hAnsi="Cambria Math"/>
+                  <w:i/>
+                  <w:sz w:val="18"/>
+                </w:rPr>
+              </m:ctrlPr>
+            </m:fPr>
+            <m:num>
+              <m:sSub>
+                <m:sSubPr>
+                  <m:ctrlPr>
+                    <w:rPr>
+                      <w:rFonts w:ascii="Cambria Math" w:hAnsi="Cambria Math"/>
+                      <w:i/>
+                      <w:sz w:val="18"/>
+                    </w:rPr>
+                  </m:ctrlPr>
+                </m:sSubPr>
+                <m:e>
+                  <m:r>
+                    <w:rPr>
+                      <w:rFonts w:ascii="Cambria Math" w:hAnsi="Cambria Math"/>
+                      <w:sz w:val="18"/>
+                    </w:rPr>
+                    <m:t>u</m:t>
+                  </m:r>
+                </m:e>
+                <m:sub>
+                  <m:r>
+                    <w:rPr>
+                      <w:rFonts w:ascii="Cambria Math" w:hAnsi="Cambria Math"/>
+                      <w:sz w:val="18"/>
+                    </w:rPr>
+                    <m:t>i</m:t>
+                  </m:r>
+                </m:sub>
+              </m:sSub>
+              <m:r>
+                <w:rPr>
+                  <w:rFonts w:ascii="Cambria Math" w:hAnsi="Cambria Math"/>
+                  <w:sz w:val="18"/>
+                </w:rPr>
+                <m:t>-</m:t>
+              </m:r>
+              <m:sSub>
+                <m:sSubPr>
+                  <m:ctrlPr>
+                    <w:rPr>
+                      <w:rFonts w:ascii="Cambria Math" w:hAnsi="Cambria Math"/>
+                      <w:i/>
+                      <w:sz w:val="18"/>
+                    </w:rPr>
+                  </m:ctrlPr>
+                </m:sSubPr>
+                <m:e>
+                  <m:r>
+                    <w:rPr>
+                      <w:rFonts w:ascii="Cambria Math" w:hAnsi="Cambria Math"/>
+                      <w:sz w:val="18"/>
+                    </w:rPr>
+                    <m:t>u</m:t>
+                  </m:r>
+                </m:e>
+                <m:sub>
+                  <m:r>
+                    <w:rPr>
+                      <w:rFonts w:ascii="Cambria Math" w:hAnsi="Cambria Math"/>
+                      <w:sz w:val="18"/>
+                    </w:rPr>
+                    <m:t>i-1</m:t>
+                  </m:r>
+                </m:sub>
+              </m:sSub>
+            </m:num>
+            <m:den>
+              <m:f>
+                <m:fPr>
+                  <m:ctrlPr>
+                    <w:rPr>
+                      <w:rFonts w:ascii="Cambria Math" w:hAnsi="Cambria Math"/>
+                      <w:i/>
+                      <w:sz w:val="18"/>
+                    </w:rPr>
+                  </m:ctrlPr>
+                </m:fPr>
+                <m:num>
+                  <m:sSub>
+                    <m:sSubPr>
+                      <m:ctrlPr>
+                        <w:rPr>
+                          <w:rFonts w:ascii="Cambria Math" w:hAnsi="Cambria Math"/>
+                          <w:i/>
+                          <w:sz w:val="18"/>
+                        </w:rPr>
+                      </m:ctrlPr>
+                    </m:sSubPr>
+                    <m:e>
+                      <m:r>
+                        <w:rPr>
+                          <w:rFonts w:ascii="Cambria Math" w:hAnsi="Cambria Math"/>
+                          <w:sz w:val="18"/>
+                        </w:rPr>
+                        <m:t>x</m:t>
+                      </m:r>
+                    </m:e>
+                    <m:sub>
+                      <m:r>
+                        <w:rPr>
+                          <w:rFonts w:ascii="Cambria Math" w:hAnsi="Cambria Math"/>
+                          <w:sz w:val="18"/>
+                        </w:rPr>
+                        <m:t>i</m:t>
+                      </m:r>
+                    </m:sub>
+                  </m:sSub>
+                  <m:r>
+                    <w:rPr>
+                      <w:rFonts w:ascii="Cambria Math" w:hAnsi="Cambria Math"/>
+                      <w:sz w:val="18"/>
+                    </w:rPr>
+                    <m:t>-</m:t>
+                  </m:r>
+                  <m:sSub>
+                    <m:sSubPr>
+                      <m:ctrlPr>
+                        <w:rPr>
+                          <w:rFonts w:ascii="Cambria Math" w:hAnsi="Cambria Math"/>
+                          <w:i/>
+                          <w:sz w:val="18"/>
+                        </w:rPr>
+                      </m:ctrlPr>
+                    </m:sSubPr>
+                    <m:e>
+                      <m:r>
+                        <w:rPr>
+                          <w:rFonts w:ascii="Cambria Math" w:hAnsi="Cambria Math"/>
+                          <w:sz w:val="18"/>
+                        </w:rPr>
+                        <m:t>x</m:t>
+                      </m:r>
+                    </m:e>
+                    <m:sub>
+                      <m:r>
+                        <w:rPr>
+                          <w:rFonts w:ascii="Cambria Math" w:hAnsi="Cambria Math"/>
+                          <w:sz w:val="18"/>
+                        </w:rPr>
+                        <m:t>i-1</m:t>
+                      </m:r>
+                    </m:sub>
+                  </m:sSub>
+                </m:num>
+                <m:den>
+                  <m:r>
+                    <w:rPr>
+                      <w:rFonts w:ascii="Cambria Math" w:hAnsi="Cambria Math"/>
+                      <w:sz w:val="18"/>
+                    </w:rPr>
+                    <m:t>2</m:t>
+                  </m:r>
+                </m:den>
+              </m:f>
+            </m:den>
+          </m:f>
+          <m:r>
+            <w:rPr>
+              <w:rFonts w:ascii="Cambria Math" w:hAnsi="Cambria Math"/>
+              <w:sz w:val="18"/>
+            </w:rPr>
+            <m:t>=</m:t>
+          </m:r>
+          <m:f>
+            <m:fPr>
+              <m:ctrlPr>
+                <w:rPr>
+                  <w:rFonts w:ascii="Cambria Math" w:hAnsi="Cambria Math"/>
+                  <w:i/>
+                  <w:sz w:val="18"/>
+                </w:rPr>
+              </m:ctrlPr>
+            </m:fPr>
+            <m:num>
+              <m:r>
+                <w:rPr>
+                  <w:rFonts w:ascii="Cambria Math" w:hAnsi="Cambria Math"/>
+                  <w:sz w:val="18"/>
+                </w:rPr>
+                <m:t>2×</m:t>
+              </m:r>
+              <m:d>
+                <m:dPr>
+                  <m:ctrlPr>
+                    <w:rPr>
+                      <w:rFonts w:ascii="Cambria Math" w:hAnsi="Cambria Math"/>
+                      <w:i/>
+                      <w:sz w:val="18"/>
+                    </w:rPr>
+                  </m:ctrlPr>
+                </m:dPr>
+                <m:e>
+                  <m:sSub>
+                    <m:sSubPr>
+                      <m:ctrlPr>
+                        <w:rPr>
+                          <w:rFonts w:ascii="Cambria Math" w:hAnsi="Cambria Math"/>
+                          <w:i/>
+                          <w:sz w:val="18"/>
+                        </w:rPr>
+                      </m:ctrlPr>
+                    </m:sSubPr>
+                    <m:e>
+                      <m:r>
+                        <w:rPr>
+                          <w:rFonts w:ascii="Cambria Math" w:hAnsi="Cambria Math"/>
+                          <w:sz w:val="18"/>
+                        </w:rPr>
+                        <m:t>u</m:t>
+                      </m:r>
+                    </m:e>
+                    <m:sub>
+                      <m:r>
+                        <w:rPr>
+                          <w:rFonts w:ascii="Cambria Math" w:hAnsi="Cambria Math"/>
+                          <w:sz w:val="18"/>
+                        </w:rPr>
+                        <m:t>i</m:t>
+                      </m:r>
+                    </m:sub>
+                  </m:sSub>
+                  <m:r>
+                    <w:rPr>
+                      <w:rFonts w:ascii="Cambria Math" w:hAnsi="Cambria Math"/>
+                      <w:sz w:val="18"/>
+                    </w:rPr>
+                    <m:t>-</m:t>
+                  </m:r>
+                  <m:sSub>
+                    <m:sSubPr>
+                      <m:ctrlPr>
+                        <w:rPr>
+                          <w:rFonts w:ascii="Cambria Math" w:hAnsi="Cambria Math"/>
+                          <w:i/>
+                          <w:sz w:val="18"/>
+                        </w:rPr>
+                      </m:ctrlPr>
+                    </m:sSubPr>
+                    <m:e>
+                      <m:r>
+                        <w:rPr>
+                          <w:rFonts w:ascii="Cambria Math" w:hAnsi="Cambria Math"/>
+                          <w:sz w:val="18"/>
+                        </w:rPr>
+                        <m:t>u</m:t>
+                      </m:r>
+                    </m:e>
+                    <m:sub>
+                      <m:r>
+                        <w:rPr>
+                          <w:rFonts w:ascii="Cambria Math" w:hAnsi="Cambria Math"/>
+                          <w:sz w:val="18"/>
+                        </w:rPr>
+                        <m:t>i-1</m:t>
+                      </m:r>
+                    </m:sub>
+                  </m:sSub>
+                </m:e>
+              </m:d>
+            </m:num>
+            <m:den>
+              <m:sSub>
+                <m:sSubPr>
+                  <m:ctrlPr>
+                    <w:rPr>
+                      <w:rFonts w:ascii="Cambria Math" w:hAnsi="Cambria Math"/>
+                      <w:i/>
+                      <w:sz w:val="18"/>
+                    </w:rPr>
+                  </m:ctrlPr>
+                </m:sSubPr>
+                <m:e>
+                  <m:r>
+                    <w:rPr>
+                      <w:rFonts w:ascii="Cambria Math" w:hAnsi="Cambria Math"/>
+                      <w:sz w:val="18"/>
+                    </w:rPr>
+                    <m:t>x</m:t>
+                  </m:r>
+                </m:e>
+                <m:sub>
+                  <m:r>
+                    <w:rPr>
+                      <w:rFonts w:ascii="Cambria Math" w:hAnsi="Cambria Math"/>
+                      <w:sz w:val="18"/>
+                    </w:rPr>
+                    <m:t>i</m:t>
+                  </m:r>
+                </m:sub>
+              </m:sSub>
+              <m:r>
+                <w:rPr>
+                  <w:rFonts w:ascii="Cambria Math" w:hAnsi="Cambria Math"/>
+                  <w:sz w:val="18"/>
+                </w:rPr>
+                <m:t>-</m:t>
+              </m:r>
+              <m:sSub>
+                <m:sSubPr>
+                  <m:ctrlPr>
+                    <w:rPr>
+                      <w:rFonts w:ascii="Cambria Math" w:hAnsi="Cambria Math"/>
+                      <w:i/>
+                      <w:sz w:val="18"/>
+                    </w:rPr>
+                  </m:ctrlPr>
+                </m:sSubPr>
+                <m:e>
+                  <m:r>
+                    <w:rPr>
+                      <w:rFonts w:ascii="Cambria Math" w:hAnsi="Cambria Math"/>
+                      <w:sz w:val="18"/>
+                    </w:rPr>
+                    <m:t>x</m:t>
+                  </m:r>
+                </m:e>
+                <m:sub>
+                  <m:r>
+                    <w:rPr>
+                      <w:rFonts w:ascii="Cambria Math" w:hAnsi="Cambria Math"/>
+                      <w:sz w:val="18"/>
+                    </w:rPr>
+                    <m:t>i-1</m:t>
+                  </m:r>
+                </m:sub>
+              </m:sSub>
+            </m:den>
+          </m:f>
+          <m:r>
+            <w:rPr>
+              <w:rFonts w:ascii="Cambria Math" w:hAnsi="Cambria Math"/>
+              <w:sz w:val="18"/>
+            </w:rPr>
+            <m:t xml:space="preserve"> for i=2</m:t>
+          </m:r>
+        </m:oMath>
+      </m:oMathPara>
+    </w:p>
+    <w:p>
+      <m:oMathPara>
+        <m:oMath>
+          <m:sSub>
+            <m:sSubPr>
+              <m:ctrlPr>
+                <w:rPr>
+                  <w:rFonts w:ascii="Cambria Math" w:hAnsi="Cambria Math"/>
+                  <w:i/>
+                  <w:sz w:val="18"/>
+                </w:rPr>
+              </m:ctrlPr>
+            </m:sSubPr>
+            <m:e>
+              <m:d>
+                <m:dPr>
+                  <m:begChr m:val=""/>
+                  <m:endChr m:val="⌋"/>
+                  <m:ctrlPr>
+                    <w:rPr>
+                      <w:rFonts w:ascii="Cambria Math" w:hAnsi="Cambria Math"/>
+                      <w:i/>
+                      <w:sz w:val="18"/>
+                    </w:rPr>
+                  </m:ctrlPr>
+                </m:dPr>
+                <m:e>
+                  <m:f>
+                    <m:fPr>
+                      <m:ctrlPr>
+                        <w:rPr>
+                          <w:rFonts w:ascii="Cambria Math" w:hAnsi="Cambria Math"/>
+                          <w:i/>
+                          <w:sz w:val="18"/>
+                        </w:rPr>
+                      </m:ctrlPr>
+                    </m:fPr>
+                    <m:num>
+                      <m:r>
+                        <w:rPr>
+                          <w:rFonts w:ascii="Cambria Math" w:hAnsi="Cambria Math"/>
+                          <w:sz w:val="18"/>
+                        </w:rPr>
+                        <m:t>∂u</m:t>
+                      </m:r>
+                    </m:num>
+                    <m:den>
+                      <m:r>
+                        <w:rPr>
+                          <w:rFonts w:ascii="Cambria Math" w:hAnsi="Cambria Math"/>
+                          <w:sz w:val="18"/>
+                        </w:rPr>
+                        <m:t>∂x</m:t>
+                      </m:r>
+                    </m:den>
+                  </m:f>
+                </m:e>
+              </m:d>
+            </m:e>
+            <m:sub>
+              <m:r>
+                <w:rPr>
+                  <w:rFonts w:ascii="Cambria Math" w:hAnsi="Cambria Math"/>
+                  <w:sz w:val="18"/>
+                </w:rPr>
+                <m:t>i+</m:t>
+              </m:r>
+              <m:f>
+                <m:fPr>
+                  <m:ctrlPr>
+                    <w:rPr>
+                      <w:rFonts w:ascii="Cambria Math" w:hAnsi="Cambria Math"/>
+                      <w:i/>
+                      <w:sz w:val="18"/>
+                    </w:rPr>
+                  </m:ctrlPr>
+                </m:fPr>
+                <m:num>
+                  <m:r>
+                    <w:rPr>
+                      <w:rFonts w:ascii="Cambria Math" w:hAnsi="Cambria Math"/>
+                      <w:sz w:val="18"/>
+                    </w:rPr>
+                    <m:t>1</m:t>
+                  </m:r>
+                </m:num>
+                <m:den>
+                  <m:r>
+                    <w:rPr>
+                      <w:rFonts w:ascii="Cambria Math" w:hAnsi="Cambria Math"/>
+                      <w:sz w:val="18"/>
+                    </w:rPr>
+                    <m:t>2</m:t>
+                  </m:r>
+                </m:den>
+              </m:f>
+            </m:sub>
+          </m:sSub>
+          <m:r>
+            <w:rPr>
+              <w:rFonts w:ascii="Cambria Math" w:hAnsi="Cambria Math"/>
+              <w:sz w:val="18"/>
+            </w:rPr>
+            <m:t>≈</m:t>
+          </m:r>
+          <m:f>
+            <m:fPr>
+              <m:ctrlPr>
+                <w:rPr>
+                  <w:rFonts w:ascii="Cambria Math" w:hAnsi="Cambria Math"/>
+                  <w:i/>
+                  <w:sz w:val="18"/>
+                </w:rPr>
+              </m:ctrlPr>
+            </m:fPr>
+            <m:num>
+              <m:sSub>
+                <m:sSubPr>
+                  <m:ctrlPr>
+                    <w:rPr>
+                      <w:rFonts w:ascii="Cambria Math" w:hAnsi="Cambria Math"/>
+                      <w:i/>
+                      <w:sz w:val="18"/>
+                    </w:rPr>
+                  </m:ctrlPr>
+                </m:sSubPr>
+                <m:e>
+                  <m:r>
+                    <w:rPr>
+                      <w:rFonts w:ascii="Cambria Math" w:hAnsi="Cambria Math"/>
+                      <w:sz w:val="18"/>
+                    </w:rPr>
+                    <m:t>u</m:t>
+                  </m:r>
+                </m:e>
+                <m:sub>
+                  <m:r>
+                    <w:rPr>
+                      <w:rFonts w:ascii="Cambria Math" w:hAnsi="Cambria Math"/>
+                      <w:sz w:val="18"/>
+                    </w:rPr>
+                    <m:t>i+1</m:t>
+                  </m:r>
+                </m:sub>
+              </m:sSub>
+              <m:r>
+                <w:rPr>
+                  <w:rFonts w:ascii="Cambria Math" w:hAnsi="Cambria Math"/>
+                  <w:sz w:val="18"/>
+                </w:rPr>
+                <m:t>-</m:t>
+              </m:r>
+              <m:sSub>
+                <m:sSubPr>
+                  <m:ctrlPr>
+                    <w:rPr>
+                      <w:rFonts w:ascii="Cambria Math" w:hAnsi="Cambria Math"/>
+                      <w:i/>
+                      <w:sz w:val="18"/>
+                    </w:rPr>
+                  </m:ctrlPr>
+                </m:sSubPr>
+                <m:e>
+                  <m:r>
+                    <w:rPr>
+                      <w:rFonts w:ascii="Cambria Math" w:hAnsi="Cambria Math"/>
+                      <w:sz w:val="18"/>
+                    </w:rPr>
+                    <m:t>u</m:t>
+                  </m:r>
+                </m:e>
+                <m:sub>
+                  <m:r>
+                    <w:rPr>
+                      <w:rFonts w:ascii="Cambria Math" w:hAnsi="Cambria Math"/>
+                      <w:sz w:val="18"/>
+                    </w:rPr>
+                    <m:t>i</m:t>
+                  </m:r>
+                </m:sub>
+              </m:sSub>
+            </m:num>
+            <m:den>
+              <m:f>
+                <m:fPr>
+                  <m:ctrlPr>
+                    <w:rPr>
+                      <w:rFonts w:ascii="Cambria Math" w:hAnsi="Cambria Math"/>
+                      <w:i/>
+                      <w:sz w:val="18"/>
+                    </w:rPr>
+                  </m:ctrlPr>
+                </m:fPr>
+                <m:num>
+                  <m:sSub>
+                    <m:sSubPr>
+                      <m:ctrlPr>
+                        <w:rPr>
+                          <w:rFonts w:ascii="Cambria Math" w:hAnsi="Cambria Math"/>
+                          <w:i/>
+                          <w:sz w:val="18"/>
+                        </w:rPr>
+                      </m:ctrlPr>
+                    </m:sSubPr>
+                    <m:e>
+                      <m:r>
+                        <w:rPr>
+                          <w:rFonts w:ascii="Cambria Math" w:hAnsi="Cambria Math"/>
+                          <w:sz w:val="18"/>
+                        </w:rPr>
+                        <m:t>x</m:t>
+                      </m:r>
+                    </m:e>
+                    <m:sub>
+                      <m:r>
+                        <w:rPr>
+                          <w:rFonts w:ascii="Cambria Math" w:hAnsi="Cambria Math"/>
+                          <w:sz w:val="18"/>
+                        </w:rPr>
+                        <m:t>i</m:t>
+                      </m:r>
+                    </m:sub>
+                  </m:sSub>
+                  <m:r>
+                    <w:rPr>
+                      <w:rFonts w:ascii="Cambria Math" w:hAnsi="Cambria Math"/>
+                      <w:sz w:val="18"/>
+                    </w:rPr>
+                    <m:t>-</m:t>
+                  </m:r>
+                  <m:sSub>
+                    <m:sSubPr>
+                      <m:ctrlPr>
+                        <w:rPr>
+                          <w:rFonts w:ascii="Cambria Math" w:hAnsi="Cambria Math"/>
+                          <w:i/>
+                          <w:sz w:val="18"/>
+                        </w:rPr>
+                      </m:ctrlPr>
+                    </m:sSubPr>
+                    <m:e>
+                      <m:r>
+                        <w:rPr>
+                          <w:rFonts w:ascii="Cambria Math" w:hAnsi="Cambria Math"/>
+                          <w:sz w:val="18"/>
+                        </w:rPr>
+                        <m:t>x</m:t>
+                      </m:r>
+                    </m:e>
+                    <m:sub>
+                      <m:r>
+                        <w:rPr>
+                          <w:rFonts w:ascii="Cambria Math" w:hAnsi="Cambria Math"/>
+                          <w:sz w:val="18"/>
+                        </w:rPr>
+                        <m:t>i-1</m:t>
+                      </m:r>
+                    </m:sub>
+                  </m:sSub>
+                </m:num>
+                <m:den>
+                  <m:r>
+                    <w:rPr>
+                      <w:rFonts w:ascii="Cambria Math" w:hAnsi="Cambria Math"/>
+                      <w:sz w:val="18"/>
+                    </w:rPr>
+                    <m:t>2</m:t>
+                  </m:r>
+                </m:den>
+              </m:f>
+            </m:den>
+          </m:f>
+          <m:r>
+            <w:rPr>
+              <w:rFonts w:ascii="Cambria Math" w:hAnsi="Cambria Math"/>
+              <w:sz w:val="18"/>
+            </w:rPr>
+            <m:t>=</m:t>
+          </m:r>
+          <m:f>
+            <m:fPr>
+              <m:ctrlPr>
+                <w:rPr>
+                  <w:rFonts w:ascii="Cambria Math" w:hAnsi="Cambria Math"/>
+                  <w:i/>
+                  <w:sz w:val="18"/>
+                </w:rPr>
+              </m:ctrlPr>
+            </m:fPr>
+            <m:num>
+              <m:r>
+                <w:rPr>
+                  <w:rFonts w:ascii="Cambria Math" w:hAnsi="Cambria Math"/>
+                  <w:sz w:val="18"/>
+                </w:rPr>
+                <m:t>2×</m:t>
+              </m:r>
+              <m:d>
+                <m:dPr>
+                  <m:ctrlPr>
+                    <w:rPr>
+                      <w:rFonts w:ascii="Cambria Math" w:hAnsi="Cambria Math"/>
+                      <w:i/>
+                      <w:sz w:val="18"/>
+                    </w:rPr>
+                  </m:ctrlPr>
+                </m:dPr>
+                <m:e>
+                  <m:sSub>
+                    <m:sSubPr>
+                      <m:ctrlPr>
+                        <w:rPr>
+                          <w:rFonts w:ascii="Cambria Math" w:hAnsi="Cambria Math"/>
+                          <w:i/>
+                          <w:sz w:val="18"/>
+                        </w:rPr>
+                      </m:ctrlPr>
+                    </m:sSubPr>
+                    <m:e>
+                      <m:r>
+                        <w:rPr>
+                          <w:rFonts w:ascii="Cambria Math" w:hAnsi="Cambria Math"/>
+                          <w:sz w:val="18"/>
+                        </w:rPr>
+                        <m:t>u</m:t>
+                      </m:r>
+                    </m:e>
+                    <m:sub>
+                      <m:r>
+                        <w:rPr>
+                          <w:rFonts w:ascii="Cambria Math" w:hAnsi="Cambria Math"/>
+                          <w:sz w:val="18"/>
+                        </w:rPr>
+                        <m:t>i+1</m:t>
+                      </m:r>
+                    </m:sub>
+                  </m:sSub>
+                  <m:r>
+                    <w:rPr>
+                      <w:rFonts w:ascii="Cambria Math" w:hAnsi="Cambria Math"/>
+                      <w:sz w:val="18"/>
+                    </w:rPr>
+                    <m:t>-</m:t>
+                  </m:r>
+                  <m:sSub>
+                    <m:sSubPr>
+                      <m:ctrlPr>
+                        <w:rPr>
+                          <w:rFonts w:ascii="Cambria Math" w:hAnsi="Cambria Math"/>
+                          <w:i/>
+                          <w:sz w:val="18"/>
+                        </w:rPr>
+                      </m:ctrlPr>
+                    </m:sSubPr>
+                    <m:e>
+                      <m:r>
+                        <w:rPr>
+                          <w:rFonts w:ascii="Cambria Math" w:hAnsi="Cambria Math"/>
+                          <w:sz w:val="18"/>
+                        </w:rPr>
+                        <m:t>u</m:t>
+                      </m:r>
+                    </m:e>
+                    <m:sub>
+                      <m:r>
+                        <w:rPr>
+                          <w:rFonts w:ascii="Cambria Math" w:hAnsi="Cambria Math"/>
+                          <w:sz w:val="18"/>
+                        </w:rPr>
+                        <m:t>i</m:t>
+                      </m:r>
+                    </m:sub>
+                  </m:sSub>
+                </m:e>
+              </m:d>
+            </m:num>
+            <m:den>
+              <m:sSub>
+                <m:sSubPr>
+                  <m:ctrlPr>
+                    <w:rPr>
+                      <w:rFonts w:ascii="Cambria Math" w:hAnsi="Cambria Math"/>
+                      <w:i/>
+                      <w:sz w:val="18"/>
+                    </w:rPr>
+                  </m:ctrlPr>
+                </m:sSubPr>
+                <m:e>
+                  <m:r>
+                    <w:rPr>
+                      <w:rFonts w:ascii="Cambria Math" w:hAnsi="Cambria Math"/>
+                      <w:sz w:val="18"/>
+                    </w:rPr>
+                    <m:t>x</m:t>
+                  </m:r>
+                </m:e>
+                <m:sub>
+                  <m:r>
+                    <w:rPr>
+                      <w:rFonts w:ascii="Cambria Math" w:hAnsi="Cambria Math"/>
+                      <w:sz w:val="18"/>
+                    </w:rPr>
+                    <m:t>i</m:t>
+                  </m:r>
+                </m:sub>
+              </m:sSub>
+              <m:r>
+                <w:rPr>
+                  <w:rFonts w:ascii="Cambria Math" w:hAnsi="Cambria Math"/>
+                  <w:sz w:val="18"/>
+                </w:rPr>
+                <m:t>-</m:t>
+              </m:r>
+              <m:sSub>
+                <m:sSubPr>
+                  <m:ctrlPr>
+                    <w:rPr>
+                      <w:rFonts w:ascii="Cambria Math" w:hAnsi="Cambria Math"/>
+                      <w:i/>
+                      <w:sz w:val="18"/>
+                    </w:rPr>
+                  </m:ctrlPr>
+                </m:sSubPr>
+                <m:e>
+                  <m:r>
+                    <w:rPr>
+                      <w:rFonts w:ascii="Cambria Math" w:hAnsi="Cambria Math"/>
+                      <w:sz w:val="18"/>
+                    </w:rPr>
+                    <m:t>x</m:t>
+                  </m:r>
+                </m:e>
+                <m:sub>
+                  <m:r>
+                    <w:rPr>
+                      <w:rFonts w:ascii="Cambria Math" w:hAnsi="Cambria Math"/>
+                      <w:sz w:val="18"/>
+                    </w:rPr>
+                    <m:t>i-1</m:t>
+                  </m:r>
+                </m:sub>
+              </m:sSub>
+            </m:den>
+          </m:f>
+          <m:r>
+            <w:rPr>
+              <w:rFonts w:ascii="Cambria Math" w:hAnsi="Cambria Math"/>
+              <w:sz w:val="18"/>
+            </w:rPr>
+            <m:t>for i=N+1</m:t>
+          </m:r>
+        </m:oMath>
+      </m:oMathPara>
+    </w:p>
+    <w:p>
       <w:bookmarkStart w:id="0" w:name="_GoBack"/>
       <w:bookmarkEnd w:id="0"/>
+    </w:p>
+    <w:p>
+      <m:oMathPara>
+        <m:oMath>
+          <m:r>
+            <w:rPr>
+              <w:rFonts w:ascii="Cambria Math" w:hAnsi="Cambria Math"/>
+              <w:sz w:val="18"/>
+            </w:rPr>
+            <m:t>CoeffTimeDer×der</m:t>
+          </m:r>
+          <m:d>
+            <m:dPr>
+              <m:ctrlPr>
+                <w:rPr>
+                  <w:rFonts w:ascii="Cambria Math" w:hAnsi="Cambria Math"/>
+                  <w:i/>
+                  <w:sz w:val="18"/>
+                </w:rPr>
+              </m:ctrlPr>
+            </m:dPr>
+            <m:e>
+              <m:sSub>
+                <m:sSubPr>
+                  <m:ctrlPr>
+                    <w:rPr>
+                      <w:rFonts w:ascii="Cambria Math" w:hAnsi="Cambria Math"/>
+                      <w:i/>
+                      <w:sz w:val="18"/>
+                    </w:rPr>
+                  </m:ctrlPr>
+                </m:sSubPr>
+                <m:e>
+                  <m:r>
+                    <w:rPr>
+                      <w:rFonts w:ascii="Cambria Math" w:hAnsi="Cambria Math"/>
+                      <w:sz w:val="18"/>
+                    </w:rPr>
+                    <m:t>u</m:t>
+                  </m:r>
+                </m:e>
+                <m:sub>
+                  <m:r>
+                    <w:rPr>
+                      <w:rFonts w:ascii="Cambria Math" w:hAnsi="Cambria Math"/>
+                      <w:sz w:val="18"/>
+                    </w:rPr>
+                    <m:t>i</m:t>
+                  </m:r>
+                </m:sub>
+              </m:sSub>
+            </m:e>
+          </m:d>
+          <m:r>
+            <w:rPr>
+              <w:rFonts w:ascii="Cambria Math" w:hAnsi="Cambria Math"/>
+              <w:sz w:val="18"/>
+            </w:rPr>
+            <m:t>+CoeffSpaceDer</m:t>
+          </m:r>
+          <m:d>
+            <m:dPr>
+              <m:begChr m:val="["/>
+              <m:endChr m:val="]"/>
+              <m:ctrlPr>
+                <w:rPr>
+                  <w:rFonts w:ascii="Cambria Math" w:hAnsi="Cambria Math"/>
+                  <w:i/>
+                  <w:sz w:val="18"/>
+                </w:rPr>
+              </m:ctrlPr>
+            </m:dPr>
+            <m:e>
+              <m:f>
+                <m:fPr>
+                  <m:ctrlPr>
+                    <w:rPr>
+                      <w:rFonts w:ascii="Cambria Math" w:hAnsi="Cambria Math"/>
+                      <w:i/>
+                      <w:sz w:val="18"/>
+                    </w:rPr>
+                  </m:ctrlPr>
+                </m:fPr>
+                <m:num>
+                  <m:f>
+                    <m:fPr>
+                      <m:ctrlPr>
+                        <w:rPr>
+                          <w:rFonts w:ascii="Cambria Math" w:hAnsi="Cambria Math"/>
+                          <w:i/>
+                          <w:sz w:val="18"/>
+                        </w:rPr>
+                      </m:ctrlPr>
+                    </m:fPr>
+                    <m:num>
+                      <m:d>
+                        <m:dPr>
+                          <m:ctrlPr>
+                            <w:rPr>
+                              <w:rFonts w:ascii="Cambria Math" w:hAnsi="Cambria Math"/>
+                              <w:i/>
+                              <w:sz w:val="18"/>
+                            </w:rPr>
+                          </m:ctrlPr>
+                        </m:dPr>
+                        <m:e>
+                          <m:sSub>
+                            <m:sSubPr>
+                              <m:ctrlPr>
+                                <w:rPr>
+                                  <w:rFonts w:ascii="Cambria Math" w:hAnsi="Cambria Math"/>
+                                  <w:i/>
+                                  <w:sz w:val="18"/>
+                                </w:rPr>
+                              </m:ctrlPr>
+                            </m:sSubPr>
+                            <m:e>
+                              <m:r>
+                                <w:rPr>
+                                  <w:rFonts w:ascii="Cambria Math" w:hAnsi="Cambria Math"/>
+                                  <w:sz w:val="18"/>
+                                </w:rPr>
+                                <m:t>u</m:t>
+                              </m:r>
+                            </m:e>
+                            <m:sub>
+                              <m:r>
+                                <w:rPr>
+                                  <w:rFonts w:ascii="Cambria Math" w:hAnsi="Cambria Math"/>
+                                  <w:sz w:val="18"/>
+                                </w:rPr>
+                                <m:t>i+1</m:t>
+                              </m:r>
+                            </m:sub>
+                          </m:sSub>
+                          <m:r>
+                            <w:rPr>
+                              <w:rFonts w:ascii="Cambria Math" w:hAnsi="Cambria Math"/>
+                              <w:sz w:val="18"/>
+                            </w:rPr>
+                            <m:t>-</m:t>
+                          </m:r>
+                          <m:sSub>
+                            <m:sSubPr>
+                              <m:ctrlPr>
+                                <w:rPr>
+                                  <w:rFonts w:ascii="Cambria Math" w:hAnsi="Cambria Math"/>
+                                  <w:i/>
+                                  <w:sz w:val="18"/>
+                                </w:rPr>
+                              </m:ctrlPr>
+                            </m:sSubPr>
+                            <m:e>
+                              <m:r>
+                                <w:rPr>
+                                  <w:rFonts w:ascii="Cambria Math" w:hAnsi="Cambria Math"/>
+                                  <w:sz w:val="18"/>
+                                </w:rPr>
+                                <m:t>u</m:t>
+                              </m:r>
+                            </m:e>
+                            <m:sub>
+                              <m:r>
+                                <w:rPr>
+                                  <w:rFonts w:ascii="Cambria Math" w:hAnsi="Cambria Math"/>
+                                  <w:sz w:val="18"/>
+                                </w:rPr>
+                                <m:t>i</m:t>
+                              </m:r>
+                            </m:sub>
+                          </m:sSub>
+                        </m:e>
+                      </m:d>
+                    </m:num>
+                    <m:den>
+                      <m:f>
+                        <m:fPr>
+                          <m:ctrlPr>
+                            <w:rPr>
+                              <w:rFonts w:ascii="Cambria Math" w:hAnsi="Cambria Math"/>
+                              <w:i/>
+                              <w:sz w:val="18"/>
+                            </w:rPr>
+                          </m:ctrlPr>
+                        </m:fPr>
+                        <m:num>
+                          <m:sSub>
+                            <m:sSubPr>
+                              <m:ctrlPr>
+                                <w:rPr>
+                                  <w:rFonts w:ascii="Cambria Math" w:hAnsi="Cambria Math"/>
+                                  <w:i/>
+                                  <w:sz w:val="18"/>
+                                </w:rPr>
+                              </m:ctrlPr>
+                            </m:sSubPr>
+                            <m:e>
+                              <m:r>
+                                <w:rPr>
+                                  <w:rFonts w:ascii="Cambria Math" w:hAnsi="Cambria Math"/>
+                                  <w:sz w:val="18"/>
+                                </w:rPr>
+                                <m:t>x</m:t>
+                              </m:r>
+                            </m:e>
+                            <m:sub>
+                              <m:r>
+                                <w:rPr>
+                                  <w:rFonts w:ascii="Cambria Math" w:hAnsi="Cambria Math"/>
+                                  <w:sz w:val="18"/>
+                                </w:rPr>
+                                <m:t>i+1</m:t>
+                              </m:r>
+                            </m:sub>
+                          </m:sSub>
+                          <m:r>
+                            <w:rPr>
+                              <w:rFonts w:ascii="Cambria Math" w:hAnsi="Cambria Math"/>
+                              <w:sz w:val="18"/>
+                            </w:rPr>
+                            <m:t>-</m:t>
+                          </m:r>
+                          <m:sSub>
+                            <m:sSubPr>
+                              <m:ctrlPr>
+                                <w:rPr>
+                                  <w:rFonts w:ascii="Cambria Math" w:hAnsi="Cambria Math"/>
+                                  <w:i/>
+                                  <w:sz w:val="18"/>
+                                </w:rPr>
+                              </m:ctrlPr>
+                            </m:sSubPr>
+                            <m:e>
+                              <m:r>
+                                <w:rPr>
+                                  <w:rFonts w:ascii="Cambria Math" w:hAnsi="Cambria Math"/>
+                                  <w:sz w:val="18"/>
+                                </w:rPr>
+                                <m:t>x</m:t>
+                              </m:r>
+                            </m:e>
+                            <m:sub>
+                              <m:r>
+                                <w:rPr>
+                                  <w:rFonts w:ascii="Cambria Math" w:hAnsi="Cambria Math"/>
+                                  <w:sz w:val="18"/>
+                                </w:rPr>
+                                <m:t>i-1</m:t>
+                              </m:r>
+                            </m:sub>
+                          </m:sSub>
+                        </m:num>
+                        <m:den>
+                          <m:r>
+                            <w:rPr>
+                              <w:rFonts w:ascii="Cambria Math" w:hAnsi="Cambria Math"/>
+                              <w:sz w:val="18"/>
+                            </w:rPr>
+                            <m:t>2</m:t>
+                          </m:r>
+                        </m:den>
+                      </m:f>
+                    </m:den>
+                  </m:f>
+                  <m:r>
+                    <w:rPr>
+                      <w:rFonts w:ascii="Cambria Math" w:hAnsi="Cambria Math"/>
+                      <w:sz w:val="18"/>
+                    </w:rPr>
+                    <m:t>-</m:t>
+                  </m:r>
+                  <m:f>
+                    <m:fPr>
+                      <m:ctrlPr>
+                        <w:rPr>
+                          <w:rFonts w:ascii="Cambria Math" w:hAnsi="Cambria Math"/>
+                          <w:i/>
+                          <w:sz w:val="18"/>
+                        </w:rPr>
+                      </m:ctrlPr>
+                    </m:fPr>
+                    <m:num>
+                      <m:d>
+                        <m:dPr>
+                          <m:ctrlPr>
+                            <w:rPr>
+                              <w:rFonts w:ascii="Cambria Math" w:hAnsi="Cambria Math"/>
+                              <w:i/>
+                              <w:sz w:val="18"/>
+                            </w:rPr>
+                          </m:ctrlPr>
+                        </m:dPr>
+                        <m:e>
+                          <m:sSub>
+                            <m:sSubPr>
+                              <m:ctrlPr>
+                                <w:rPr>
+                                  <w:rFonts w:ascii="Cambria Math" w:hAnsi="Cambria Math"/>
+                                  <w:i/>
+                                  <w:sz w:val="18"/>
+                                </w:rPr>
+                              </m:ctrlPr>
+                            </m:sSubPr>
+                            <m:e>
+                              <m:r>
+                                <w:rPr>
+                                  <w:rFonts w:ascii="Cambria Math" w:hAnsi="Cambria Math"/>
+                                  <w:sz w:val="18"/>
+                                </w:rPr>
+                                <m:t>u</m:t>
+                              </m:r>
+                            </m:e>
+                            <m:sub>
+                              <m:r>
+                                <w:rPr>
+                                  <w:rFonts w:ascii="Cambria Math" w:hAnsi="Cambria Math"/>
+                                  <w:sz w:val="18"/>
+                                </w:rPr>
+                                <m:t>i</m:t>
+                              </m:r>
+                            </m:sub>
+                          </m:sSub>
+                          <m:r>
+                            <w:rPr>
+                              <w:rFonts w:ascii="Cambria Math" w:hAnsi="Cambria Math"/>
+                              <w:sz w:val="18"/>
+                            </w:rPr>
+                            <m:t>-</m:t>
+                          </m:r>
+                          <m:sSub>
+                            <m:sSubPr>
+                              <m:ctrlPr>
+                                <w:rPr>
+                                  <w:rFonts w:ascii="Cambria Math" w:hAnsi="Cambria Math"/>
+                                  <w:i/>
+                                  <w:sz w:val="18"/>
+                                </w:rPr>
+                              </m:ctrlPr>
+                            </m:sSubPr>
+                            <m:e>
+                              <m:r>
+                                <w:rPr>
+                                  <w:rFonts w:ascii="Cambria Math" w:hAnsi="Cambria Math"/>
+                                  <w:sz w:val="18"/>
+                                </w:rPr>
+                                <m:t>u</m:t>
+                              </m:r>
+                            </m:e>
+                            <m:sub>
+                              <m:r>
+                                <w:rPr>
+                                  <w:rFonts w:ascii="Cambria Math" w:hAnsi="Cambria Math"/>
+                                  <w:sz w:val="18"/>
+                                </w:rPr>
+                                <m:t>i-1</m:t>
+                              </m:r>
+                            </m:sub>
+                          </m:sSub>
+                        </m:e>
+                      </m:d>
+                    </m:num>
+                    <m:den>
+                      <m:f>
+                        <m:fPr>
+                          <m:ctrlPr>
+                            <w:rPr>
+                              <w:rFonts w:ascii="Cambria Math" w:hAnsi="Cambria Math"/>
+                              <w:i/>
+                              <w:sz w:val="18"/>
+                            </w:rPr>
+                          </m:ctrlPr>
+                        </m:fPr>
+                        <m:num>
+                          <m:sSub>
+                            <m:sSubPr>
+                              <m:ctrlPr>
+                                <w:rPr>
+                                  <w:rFonts w:ascii="Cambria Math" w:hAnsi="Cambria Math"/>
+                                  <w:i/>
+                                  <w:sz w:val="18"/>
+                                </w:rPr>
+                              </m:ctrlPr>
+                            </m:sSubPr>
+                            <m:e>
+                              <m:r>
+                                <w:rPr>
+                                  <w:rFonts w:ascii="Cambria Math" w:hAnsi="Cambria Math"/>
+                                  <w:sz w:val="18"/>
+                                </w:rPr>
+                                <m:t>x</m:t>
+                              </m:r>
+                            </m:e>
+                            <m:sub>
+                              <m:r>
+                                <w:rPr>
+                                  <w:rFonts w:ascii="Cambria Math" w:hAnsi="Cambria Math"/>
+                                  <w:sz w:val="18"/>
+                                </w:rPr>
+                                <m:t>i</m:t>
+                              </m:r>
+                            </m:sub>
+                          </m:sSub>
+                          <m:r>
+                            <w:rPr>
+                              <w:rFonts w:ascii="Cambria Math" w:hAnsi="Cambria Math"/>
+                              <w:sz w:val="18"/>
+                            </w:rPr>
+                            <m:t>-</m:t>
+                          </m:r>
+                          <m:sSub>
+                            <m:sSubPr>
+                              <m:ctrlPr>
+                                <w:rPr>
+                                  <w:rFonts w:ascii="Cambria Math" w:hAnsi="Cambria Math"/>
+                                  <w:i/>
+                                  <w:sz w:val="18"/>
+                                </w:rPr>
+                              </m:ctrlPr>
+                            </m:sSubPr>
+                            <m:e>
+                              <m:r>
+                                <w:rPr>
+                                  <w:rFonts w:ascii="Cambria Math" w:hAnsi="Cambria Math"/>
+                                  <w:sz w:val="18"/>
+                                </w:rPr>
+                                <m:t>x</m:t>
+                              </m:r>
+                            </m:e>
+                            <m:sub>
+                              <m:r>
+                                <w:rPr>
+                                  <w:rFonts w:ascii="Cambria Math" w:hAnsi="Cambria Math"/>
+                                  <w:sz w:val="18"/>
+                                </w:rPr>
+                                <m:t>i-2</m:t>
+                              </m:r>
+                            </m:sub>
+                          </m:sSub>
+                        </m:num>
+                        <m:den>
+                          <m:r>
+                            <w:rPr>
+                              <w:rFonts w:ascii="Cambria Math" w:hAnsi="Cambria Math"/>
+                              <w:sz w:val="18"/>
+                            </w:rPr>
+                            <m:t>2</m:t>
+                          </m:r>
+                        </m:den>
+                      </m:f>
+                    </m:den>
+                  </m:f>
+                </m:num>
+                <m:den>
+                  <m:sSub>
+                    <m:sSubPr>
+                      <m:ctrlPr>
+                        <w:rPr>
+                          <w:rFonts w:ascii="Cambria Math" w:hAnsi="Cambria Math"/>
+                          <w:i/>
+                          <w:sz w:val="18"/>
+                        </w:rPr>
+                      </m:ctrlPr>
+                    </m:sSubPr>
+                    <m:e>
+                      <m:r>
+                        <w:rPr>
+                          <w:rFonts w:ascii="Cambria Math" w:hAnsi="Cambria Math"/>
+                          <w:sz w:val="18"/>
+                        </w:rPr>
+                        <m:t>x</m:t>
+                      </m:r>
+                    </m:e>
+                    <m:sub>
+                      <m:r>
+                        <w:rPr>
+                          <w:rFonts w:ascii="Cambria Math" w:hAnsi="Cambria Math"/>
+                          <w:sz w:val="18"/>
+                        </w:rPr>
+                        <m:t>i</m:t>
+                      </m:r>
+                    </m:sub>
+                  </m:sSub>
+                  <m:r>
+                    <w:rPr>
+                      <w:rFonts w:ascii="Cambria Math" w:hAnsi="Cambria Math"/>
+                      <w:sz w:val="18"/>
+                    </w:rPr>
+                    <m:t>-</m:t>
+                  </m:r>
+                  <m:sSub>
+                    <m:sSubPr>
+                      <m:ctrlPr>
+                        <w:rPr>
+                          <w:rFonts w:ascii="Cambria Math" w:hAnsi="Cambria Math"/>
+                          <w:i/>
+                          <w:sz w:val="18"/>
+                        </w:rPr>
+                      </m:ctrlPr>
+                    </m:sSubPr>
+                    <m:e>
+                      <m:r>
+                        <w:rPr>
+                          <w:rFonts w:ascii="Cambria Math" w:hAnsi="Cambria Math"/>
+                          <w:sz w:val="18"/>
+                        </w:rPr>
+                        <m:t>x</m:t>
+                      </m:r>
+                    </m:e>
+                    <m:sub>
+                      <m:r>
+                        <w:rPr>
+                          <w:rFonts w:ascii="Cambria Math" w:hAnsi="Cambria Math"/>
+                          <w:sz w:val="18"/>
+                        </w:rPr>
+                        <m:t>i-1</m:t>
+                      </m:r>
+                    </m:sub>
+                  </m:sSub>
+                </m:den>
+              </m:f>
+            </m:e>
+          </m:d>
+          <m:r>
+            <w:rPr>
+              <w:rFonts w:ascii="Cambria Math" w:hAnsi="Cambria Math"/>
+              <w:sz w:val="18"/>
+            </w:rPr>
+            <m:t>=</m:t>
+          </m:r>
+          <m:sSub>
+            <m:sSubPr>
+              <m:ctrlPr>
+                <w:rPr>
+                  <w:rFonts w:ascii="Cambria Math" w:hAnsi="Cambria Math"/>
+                  <w:i/>
+                  <w:sz w:val="18"/>
+                </w:rPr>
+              </m:ctrlPr>
+            </m:sSubPr>
+            <m:e>
+              <m:r>
+                <w:rPr>
+                  <w:rFonts w:ascii="Cambria Math" w:hAnsi="Cambria Math"/>
+                  <w:sz w:val="18"/>
+                </w:rPr>
+                <m:t>sourceTerm</m:t>
+              </m:r>
+            </m:e>
+            <m:sub>
+              <m:r>
+                <w:rPr>
+                  <w:rFonts w:ascii="Cambria Math" w:hAnsi="Cambria Math"/>
+                  <w:sz w:val="18"/>
+                </w:rPr>
+                <m:t>i</m:t>
+              </m:r>
+            </m:sub>
+          </m:sSub>
+        </m:oMath>
+      </m:oMathPara>
+    </w:p>
+    <w:p>
+      <w:pPr>
+        <w:rPr>
+          <w:rFonts w:eastAsiaTheme="minorEastAsia"/>
+        </w:rPr>
+      </w:pPr>
     </w:p>
     <w:p>
       <w:pPr>
@@ -1812,7 +4243,7 @@
 </file>
 
 <file path=customXml/itemProps1.xml><?xml version="1.0" encoding="utf-8"?>
-<ds:datastoreItem xmlns:ds="http://schemas.openxmlformats.org/officeDocument/2006/customXml" ds:itemID="{1BC19F85-0F3F-459C-8948-033C3A9A242B}">
+<ds:datastoreItem xmlns:ds="http://schemas.openxmlformats.org/officeDocument/2006/customXml" ds:itemID="{527EAAF9-BE31-4576-8EAD-E6D2F118DE3E}">
   <ds:schemaRefs>
     <ds:schemaRef ds:uri="http://schemas.openxmlformats.org/officeDocument/2006/bibliography"/>
   </ds:schemaRefs>

</xml_diff>

<commit_message>
Change the variable name for mass from Mass to m
</commit_message>
<xml_diff>
--- a/Information/script for equations.docx
+++ b/Information/script for equations.docx
@@ -571,19 +571,7 @@
                 <w:rPr>
                   <w:rFonts w:ascii="Cambria Math" w:hAnsi="Cambria Math"/>
                 </w:rPr>
-                <m:t>σ×</m:t>
-              </m:r>
-              <m:r>
-                <w:rPr>
-                  <w:rFonts w:ascii="Cambria Math" w:hAnsi="Cambria Math"/>
-                </w:rPr>
-                <m:t>A</m:t>
-              </m:r>
-              <m:r>
-                <w:rPr>
-                  <w:rFonts w:ascii="Cambria Math" w:hAnsi="Cambria Math"/>
-                </w:rPr>
-                <m:t>×(</m:t>
+                <m:t>σ×A×(</m:t>
               </m:r>
               <m:sSubSup>
                 <m:sSubSupPr>
@@ -808,13 +796,7 @@
             <w:rPr>
               <w:rFonts w:ascii="Cambria Math" w:hAnsi="Cambria Math"/>
             </w:rPr>
-            <m:t>R_th</m:t>
-          </m:r>
-          <m:r>
-            <w:rPr>
-              <w:rFonts w:ascii="Cambria Math" w:hAnsi="Cambria Math"/>
-            </w:rPr>
-            <m:t>=</m:t>
+            <m:t>R_th=</m:t>
           </m:r>
           <m:f>
             <m:fPr>
@@ -981,13 +963,7 @@
             <w:rPr>
               <w:rFonts w:ascii="Cambria Math" w:hAnsi="Cambria Math"/>
             </w:rPr>
-            <m:t>=</m:t>
-          </m:r>
-          <m:r>
-            <w:rPr>
-              <w:rFonts w:ascii="Cambria Math" w:hAnsi="Cambria Math"/>
-            </w:rPr>
-            <m:t>h_rad×A×dT</m:t>
+            <m:t>=h_rad×A×dT</m:t>
           </m:r>
         </m:oMath>
       </m:oMathPara>
@@ -1028,7 +1004,13 @@
             <w:rPr>
               <w:rFonts w:ascii="Cambria Math" w:eastAsiaTheme="minorEastAsia" w:hAnsi="Cambria Math"/>
             </w:rPr>
-            <m:t>Mass ×cp×</m:t>
+            <m:t>m</m:t>
+          </m:r>
+          <m:r>
+            <w:rPr>
+              <w:rFonts w:ascii="Cambria Math" w:eastAsiaTheme="minorEastAsia" w:hAnsi="Cambria Math"/>
+            </w:rPr>
+            <m:t xml:space="preserve"> ×cp×</m:t>
           </m:r>
           <m:f>
             <m:fPr>
@@ -1064,6 +1046,8 @@
           </m:r>
         </m:oMath>
       </m:oMathPara>
+      <w:bookmarkStart w:id="0" w:name="_GoBack"/>
+      <w:bookmarkEnd w:id="0"/>
     </w:p>
     <w:p>
       <w:pPr>
@@ -2927,10 +2911,7 @@
         </m:oMath>
       </m:oMathPara>
     </w:p>
-    <w:p>
-      <w:bookmarkStart w:id="0" w:name="_GoBack"/>
-      <w:bookmarkEnd w:id="0"/>
-    </w:p>
+    <w:p/>
     <w:p>
       <m:oMathPara>
         <m:oMath>
@@ -4232,7 +4213,7 @@
   <a:extraClrSchemeLst/>
   <a:extLst>
     <a:ext uri="{05A4C25C-085E-4340-85A3-A5531E510DB2}">
-      <thm15:themeFamily xmlns="" xmlns:thm15="http://schemas.microsoft.com/office/thememl/2012/main" name="Office Theme" id="{62F939B6-93AF-4DB8-9C6B-D6C7DFDC589F}" vid="{4A3C46E8-61CC-4603-A589-7422A47A8E4A}"/>
+      <thm15:themeFamily xmlns:thm15="http://schemas.microsoft.com/office/thememl/2012/main" xmlns="" name="Office Theme" id="{62F939B6-93AF-4DB8-9C6B-D6C7DFDC589F}" vid="{4A3C46E8-61CC-4603-A589-7422A47A8E4A}"/>
     </a:ext>
   </a:extLst>
 </a:theme>
@@ -4243,7 +4224,7 @@
 </file>
 
 <file path=customXml/itemProps1.xml><?xml version="1.0" encoding="utf-8"?>
-<ds:datastoreItem xmlns:ds="http://schemas.openxmlformats.org/officeDocument/2006/customXml" ds:itemID="{527EAAF9-BE31-4576-8EAD-E6D2F118DE3E}">
+<ds:datastoreItem xmlns:ds="http://schemas.openxmlformats.org/officeDocument/2006/customXml" ds:itemID="{405C4D4C-1281-41FA-84FA-4C7B75437757}">
   <ds:schemaRefs>
     <ds:schemaRef ds:uri="http://schemas.openxmlformats.org/officeDocument/2006/bibliography"/>
   </ds:schemaRefs>

</xml_diff>

<commit_message>
Addition of the LumpVolume and CarrollNode modules and the test of the LumpVolume in TAeZoSysPro.HeatTransfer.BasesClasses
</commit_message>
<xml_diff>
--- a/Information/script for equations.docx
+++ b/Information/script for equations.docx
@@ -1004,13 +1004,7 @@
             <w:rPr>
               <w:rFonts w:ascii="Cambria Math" w:eastAsiaTheme="minorEastAsia" w:hAnsi="Cambria Math"/>
             </w:rPr>
-            <m:t>m</m:t>
-          </m:r>
-          <m:r>
-            <w:rPr>
-              <w:rFonts w:ascii="Cambria Math" w:eastAsiaTheme="minorEastAsia" w:hAnsi="Cambria Math"/>
-            </w:rPr>
-            <m:t xml:space="preserve"> ×cp×</m:t>
+            <m:t>m ×cp×</m:t>
           </m:r>
           <m:f>
             <m:fPr>
@@ -1026,7 +1020,13 @@
                 <w:rPr>
                   <w:rFonts w:ascii="Cambria Math" w:eastAsiaTheme="minorEastAsia" w:hAnsi="Cambria Math"/>
                 </w:rPr>
-                <m:t>dT</m:t>
+                <m:t>d</m:t>
+              </m:r>
+              <m:r>
+                <w:rPr>
+                  <w:rFonts w:ascii="Cambria Math" w:eastAsiaTheme="minorEastAsia" w:hAnsi="Cambria Math"/>
+                </w:rPr>
+                <m:t>T</m:t>
               </m:r>
             </m:num>
             <m:den>
@@ -1046,8 +1046,6 @@
           </m:r>
         </m:oMath>
       </m:oMathPara>
-      <w:bookmarkStart w:id="0" w:name="_GoBack"/>
-      <w:bookmarkEnd w:id="0"/>
     </w:p>
     <w:p>
       <w:pPr>
@@ -3476,8 +3474,129 @@
       <w:pPr>
         <w:rPr>
           <w:rFonts w:eastAsiaTheme="minorEastAsia"/>
+          <w:b/>
         </w:rPr>
       </w:pPr>
+      <w:proofErr w:type="spellStart"/>
+      <w:r>
+        <w:rPr>
+          <w:rFonts w:eastAsiaTheme="minorEastAsia"/>
+          <w:b/>
+        </w:rPr>
+        <w:t>LumpVolume</w:t>
+      </w:r>
+      <w:proofErr w:type="spellEnd"/>
+    </w:p>
+    <w:p>
+      <w:pPr>
+        <w:rPr>
+          <w:rFonts w:eastAsiaTheme="minorEastAsia"/>
+        </w:rPr>
+      </w:pPr>
+      <m:oMathPara>
+        <m:oMath>
+          <m:r>
+            <w:rPr>
+              <w:rFonts w:ascii="Cambria Math" w:eastAsiaTheme="minorEastAsia" w:hAnsi="Cambria Math"/>
+            </w:rPr>
+            <m:t>m</m:t>
+          </m:r>
+          <m:r>
+            <w:rPr>
+              <w:rFonts w:ascii="Cambria Math" w:eastAsiaTheme="minorEastAsia" w:hAnsi="Cambria Math"/>
+            </w:rPr>
+            <m:t xml:space="preserve"> </m:t>
+          </m:r>
+          <m:r>
+            <w:rPr>
+              <w:rFonts w:ascii="Cambria Math" w:eastAsiaTheme="minorEastAsia" w:hAnsi="Cambria Math"/>
+            </w:rPr>
+            <m:t>×</m:t>
+          </m:r>
+          <m:f>
+            <m:fPr>
+              <m:ctrlPr>
+                <w:rPr>
+                  <w:rFonts w:ascii="Cambria Math" w:eastAsiaTheme="minorEastAsia" w:hAnsi="Cambria Math"/>
+                  <w:i/>
+                </w:rPr>
+              </m:ctrlPr>
+            </m:fPr>
+            <m:num>
+              <m:r>
+                <w:rPr>
+                  <w:rFonts w:ascii="Cambria Math" w:eastAsiaTheme="minorEastAsia" w:hAnsi="Cambria Math"/>
+                </w:rPr>
+                <m:t>d</m:t>
+              </m:r>
+              <m:r>
+                <w:rPr>
+                  <w:rFonts w:ascii="Cambria Math" w:eastAsiaTheme="minorEastAsia" w:hAnsi="Cambria Math"/>
+                </w:rPr>
+                <m:t>h</m:t>
+              </m:r>
+            </m:num>
+            <m:den>
+              <m:r>
+                <w:rPr>
+                  <w:rFonts w:ascii="Cambria Math" w:eastAsiaTheme="minorEastAsia" w:hAnsi="Cambria Math"/>
+                </w:rPr>
+                <m:t>dt</m:t>
+              </m:r>
+            </m:den>
+          </m:f>
+          <m:r>
+            <w:rPr>
+              <w:rFonts w:ascii="Cambria Math" w:eastAsiaTheme="minorEastAsia" w:hAnsi="Cambria Math"/>
+            </w:rPr>
+            <m:t>=port.Q_flow</m:t>
+          </m:r>
+          <m:r>
+            <w:rPr>
+              <w:rFonts w:ascii="Cambria Math" w:eastAsiaTheme="minorEastAsia" w:hAnsi="Cambria Math"/>
+            </w:rPr>
+            <m:t xml:space="preserve">  </m:t>
+          </m:r>
+          <m:d>
+            <m:dPr>
+              <m:ctrlPr>
+                <w:rPr>
+                  <w:rFonts w:ascii="Cambria Math" w:eastAsiaTheme="minorEastAsia" w:hAnsi="Cambria Math"/>
+                  <w:i/>
+                </w:rPr>
+              </m:ctrlPr>
+            </m:dPr>
+            <m:e>
+              <m:nary>
+                <m:naryPr>
+                  <m:chr m:val="∑"/>
+                  <m:limLoc m:val="undOvr"/>
+                  <m:subHide m:val="1"/>
+                  <m:supHide m:val="1"/>
+                  <m:ctrlPr>
+                    <w:rPr>
+                      <w:rFonts w:ascii="Cambria Math" w:eastAsiaTheme="minorEastAsia" w:hAnsi="Cambria Math"/>
+                      <w:i/>
+                    </w:rPr>
+                  </m:ctrlPr>
+                </m:naryPr>
+                <m:sub/>
+                <m:sup/>
+                <m:e>
+                  <m:r>
+                    <w:rPr>
+                      <w:rFonts w:ascii="Cambria Math" w:eastAsiaTheme="minorEastAsia" w:hAnsi="Cambria Math"/>
+                    </w:rPr>
+                    <m:t>Q_flow</m:t>
+                  </m:r>
+                </m:e>
+              </m:nary>
+            </m:e>
+          </m:d>
+        </m:oMath>
+      </m:oMathPara>
+      <w:bookmarkStart w:id="0" w:name="_GoBack"/>
+      <w:bookmarkEnd w:id="0"/>
     </w:p>
     <w:p>
       <w:pPr>
@@ -4213,7 +4332,7 @@
   <a:extraClrSchemeLst/>
   <a:extLst>
     <a:ext uri="{05A4C25C-085E-4340-85A3-A5531E510DB2}">
-      <thm15:themeFamily xmlns:thm15="http://schemas.microsoft.com/office/thememl/2012/main" xmlns="" name="Office Theme" id="{62F939B6-93AF-4DB8-9C6B-D6C7DFDC589F}" vid="{4A3C46E8-61CC-4603-A589-7422A47A8E4A}"/>
+      <thm15:themeFamily xmlns="" xmlns:thm15="http://schemas.microsoft.com/office/thememl/2012/main" name="Office Theme" id="{62F939B6-93AF-4DB8-9C6B-D6C7DFDC589F}" vid="{4A3C46E8-61CC-4603-A589-7422A47A8E4A}"/>
     </a:ext>
   </a:extLst>
 </a:theme>
@@ -4224,7 +4343,7 @@
 </file>
 
 <file path=customXml/itemProps1.xml><?xml version="1.0" encoding="utf-8"?>
-<ds:datastoreItem xmlns:ds="http://schemas.openxmlformats.org/officeDocument/2006/customXml" ds:itemID="{405C4D4C-1281-41FA-84FA-4C7B75437757}">
+<ds:datastoreItem xmlns:ds="http://schemas.openxmlformats.org/officeDocument/2006/customXml" ds:itemID="{A87C1578-AE34-4281-BDBA-DD09F0AB576C}">
   <ds:schemaRefs>
     <ds:schemaRef ds:uri="http://schemas.openxmlformats.org/officeDocument/2006/bibliography"/>
   </ds:schemaRefs>

</xml_diff>

<commit_message>
Addition of the PartialHeatExchanger module in TAeZoSysPro.HeatTransfer.BasesClasses
</commit_message>
<xml_diff>
--- a/Information/script for equations.docx
+++ b/Information/script for equations.docx
@@ -3499,19 +3499,7 @@
             <w:rPr>
               <w:rFonts w:ascii="Cambria Math" w:eastAsiaTheme="minorEastAsia" w:hAnsi="Cambria Math"/>
             </w:rPr>
-            <m:t>m</m:t>
-          </m:r>
-          <m:r>
-            <w:rPr>
-              <w:rFonts w:ascii="Cambria Math" w:eastAsiaTheme="minorEastAsia" w:hAnsi="Cambria Math"/>
-            </w:rPr>
-            <m:t xml:space="preserve"> </m:t>
-          </m:r>
-          <m:r>
-            <w:rPr>
-              <w:rFonts w:ascii="Cambria Math" w:eastAsiaTheme="minorEastAsia" w:hAnsi="Cambria Math"/>
-            </w:rPr>
-            <m:t>×</m:t>
+            <m:t>m ×</m:t>
           </m:r>
           <m:f>
             <m:fPr>
@@ -3527,13 +3515,7 @@
                 <w:rPr>
                   <w:rFonts w:ascii="Cambria Math" w:eastAsiaTheme="minorEastAsia" w:hAnsi="Cambria Math"/>
                 </w:rPr>
-                <m:t>d</m:t>
-              </m:r>
-              <m:r>
-                <w:rPr>
-                  <w:rFonts w:ascii="Cambria Math" w:eastAsiaTheme="minorEastAsia" w:hAnsi="Cambria Math"/>
-                </w:rPr>
-                <m:t>h</m:t>
+                <m:t>dh</m:t>
               </m:r>
             </m:num>
             <m:den>
@@ -3549,13 +3531,7 @@
             <w:rPr>
               <w:rFonts w:ascii="Cambria Math" w:eastAsiaTheme="minorEastAsia" w:hAnsi="Cambria Math"/>
             </w:rPr>
-            <m:t>=port.Q_flow</m:t>
-          </m:r>
-          <m:r>
-            <w:rPr>
-              <w:rFonts w:ascii="Cambria Math" w:eastAsiaTheme="minorEastAsia" w:hAnsi="Cambria Math"/>
-            </w:rPr>
-            <m:t xml:space="preserve">  </m:t>
+            <m:t xml:space="preserve">=port.Q_flow  </m:t>
           </m:r>
           <m:d>
             <m:dPr>
@@ -3595,8 +3571,6 @@
           </m:d>
         </m:oMath>
       </m:oMathPara>
-      <w:bookmarkStart w:id="0" w:name="_GoBack"/>
-      <w:bookmarkEnd w:id="0"/>
     </w:p>
     <w:p>
       <w:pPr>
@@ -3606,6 +3580,799 @@
           <w:szCs w:val="24"/>
         </w:rPr>
       </w:pPr>
+    </w:p>
+    <w:p>
+      <w:pPr>
+        <w:rPr>
+          <w:rFonts w:eastAsiaTheme="minorEastAsia"/>
+          <w:b/>
+        </w:rPr>
+      </w:pPr>
+      <w:r>
+        <w:rPr>
+          <w:rFonts w:eastAsiaTheme="minorEastAsia"/>
+          <w:b/>
+        </w:rPr>
+        <w:t>Heat Exchanger</w:t>
+      </w:r>
+    </w:p>
+    <w:p>
+      <w:pPr>
+        <w:rPr>
+          <w:rFonts w:eastAsiaTheme="minorEastAsia"/>
+        </w:rPr>
+      </w:pPr>
+      <m:oMathPara>
+        <m:oMath>
+          <m:r>
+            <w:rPr>
+              <w:rFonts w:ascii="Cambria Math" w:hAnsi="Cambria Math"/>
+            </w:rPr>
+            <m:t>Qc=m_flow</m:t>
+          </m:r>
+          <m:r>
+            <w:rPr>
+              <w:rFonts w:ascii="Cambria Math" w:eastAsiaTheme="minorEastAsia" w:hAnsi="Cambria Math"/>
+            </w:rPr>
+            <m:t>×cp</m:t>
+          </m:r>
+        </m:oMath>
+      </m:oMathPara>
+    </w:p>
+    <w:p>
+      <w:pPr>
+        <w:rPr>
+          <w:rFonts w:eastAsiaTheme="minorEastAsia"/>
+        </w:rPr>
+      </w:pPr>
+      <m:oMathPara>
+        <m:oMath>
+          <m:r>
+            <w:rPr>
+              <w:rFonts w:ascii="Cambria Math" w:hAnsi="Cambria Math"/>
+            </w:rPr>
+            <m:t>Cr=</m:t>
+          </m:r>
+          <m:f>
+            <m:fPr>
+              <m:ctrlPr>
+                <w:rPr>
+                  <w:rFonts w:ascii="Cambria Math" w:hAnsi="Cambria Math"/>
+                  <w:i/>
+                </w:rPr>
+              </m:ctrlPr>
+            </m:fPr>
+            <m:num>
+              <m:r>
+                <m:rPr>
+                  <m:sty m:val="p"/>
+                </m:rPr>
+                <w:rPr>
+                  <w:rFonts w:ascii="Cambria Math" w:hAnsi="Cambria Math"/>
+                </w:rPr>
+                <m:t>min⁡</m:t>
+              </m:r>
+              <m:r>
+                <w:rPr>
+                  <w:rFonts w:ascii="Cambria Math" w:hAnsi="Cambria Math"/>
+                </w:rPr>
+                <m:t>(Qc</m:t>
+              </m:r>
+              <m:r>
+                <w:rPr>
+                  <w:rFonts w:ascii="Cambria Math" w:hAnsi="Cambria Math"/>
+                </w:rPr>
+                <m:t>_</m:t>
+              </m:r>
+              <m:r>
+                <w:rPr>
+                  <w:rFonts w:ascii="Cambria Math" w:hAnsi="Cambria Math"/>
+                </w:rPr>
+                <m:t>A, Qc</m:t>
+              </m:r>
+              <m:r>
+                <w:rPr>
+                  <w:rFonts w:ascii="Cambria Math" w:hAnsi="Cambria Math"/>
+                </w:rPr>
+                <m:t>_</m:t>
+              </m:r>
+              <m:r>
+                <w:rPr>
+                  <w:rFonts w:ascii="Cambria Math" w:hAnsi="Cambria Math"/>
+                </w:rPr>
+                <m:t>B)</m:t>
+              </m:r>
+            </m:num>
+            <m:den>
+              <m:r>
+                <m:rPr>
+                  <m:sty m:val="p"/>
+                </m:rPr>
+                <w:rPr>
+                  <w:rFonts w:ascii="Cambria Math" w:hAnsi="Cambria Math"/>
+                </w:rPr>
+                <m:t>max⁡</m:t>
+              </m:r>
+              <m:r>
+                <w:rPr>
+                  <w:rFonts w:ascii="Cambria Math" w:hAnsi="Cambria Math"/>
+                </w:rPr>
+                <m:t>(Qc</m:t>
+              </m:r>
+              <m:r>
+                <w:rPr>
+                  <w:rFonts w:ascii="Cambria Math" w:hAnsi="Cambria Math"/>
+                </w:rPr>
+                <m:t>_</m:t>
+              </m:r>
+              <m:r>
+                <w:rPr>
+                  <w:rFonts w:ascii="Cambria Math" w:hAnsi="Cambria Math"/>
+                </w:rPr>
+                <m:t>A, Qc</m:t>
+              </m:r>
+              <m:r>
+                <w:rPr>
+                  <w:rFonts w:ascii="Cambria Math" w:hAnsi="Cambria Math"/>
+                </w:rPr>
+                <m:t>_</m:t>
+              </m:r>
+              <m:r>
+                <w:rPr>
+                  <w:rFonts w:ascii="Cambria Math" w:hAnsi="Cambria Math"/>
+                </w:rPr>
+                <m:t>B)</m:t>
+              </m:r>
+            </m:den>
+          </m:f>
+        </m:oMath>
+      </m:oMathPara>
+    </w:p>
+    <w:p>
+      <w:pPr>
+        <w:rPr>
+          <w:rFonts w:eastAsiaTheme="minorEastAsia"/>
+        </w:rPr>
+      </w:pPr>
+      <m:oMathPara>
+        <m:oMath>
+          <m:r>
+            <w:rPr>
+              <w:rFonts w:ascii="Cambria Math" w:hAnsi="Cambria Math"/>
+            </w:rPr>
+            <m:t>NTU=</m:t>
+          </m:r>
+          <m:f>
+            <m:fPr>
+              <m:ctrlPr>
+                <w:rPr>
+                  <w:rFonts w:ascii="Cambria Math" w:hAnsi="Cambria Math"/>
+                  <w:i/>
+                </w:rPr>
+              </m:ctrlPr>
+            </m:fPr>
+            <m:num>
+              <m:r>
+                <m:rPr>
+                  <m:sty m:val="p"/>
+                </m:rPr>
+                <w:rPr>
+                  <w:rFonts w:ascii="Cambria Math" w:hAnsi="Cambria Math"/>
+                </w:rPr>
+                <m:t>h_global×A</m:t>
+              </m:r>
+            </m:num>
+            <m:den>
+              <m:r>
+                <m:rPr>
+                  <m:sty m:val="p"/>
+                </m:rPr>
+                <w:rPr>
+                  <w:rFonts w:ascii="Cambria Math" w:hAnsi="Cambria Math"/>
+                </w:rPr>
+                <m:t>min⁡</m:t>
+              </m:r>
+              <m:r>
+                <w:rPr>
+                  <w:rFonts w:ascii="Cambria Math" w:hAnsi="Cambria Math"/>
+                </w:rPr>
+                <m:t>(Qc</m:t>
+              </m:r>
+              <m:r>
+                <w:rPr>
+                  <w:rFonts w:ascii="Cambria Math" w:hAnsi="Cambria Math"/>
+                </w:rPr>
+                <m:t>_</m:t>
+              </m:r>
+              <m:r>
+                <w:rPr>
+                  <w:rFonts w:ascii="Cambria Math" w:hAnsi="Cambria Math"/>
+                </w:rPr>
+                <m:t>A, Qc</m:t>
+              </m:r>
+              <m:r>
+                <w:rPr>
+                  <w:rFonts w:ascii="Cambria Math" w:hAnsi="Cambria Math"/>
+                </w:rPr>
+                <m:t>_</m:t>
+              </m:r>
+              <m:r>
+                <w:rPr>
+                  <w:rFonts w:ascii="Cambria Math" w:hAnsi="Cambria Math"/>
+                </w:rPr>
+                <m:t>B)</m:t>
+              </m:r>
+            </m:den>
+          </m:f>
+        </m:oMath>
+      </m:oMathPara>
+    </w:p>
+    <w:p>
+      <w:pPr>
+        <w:rPr>
+          <w:rFonts w:eastAsiaTheme="minorEastAsia"/>
+        </w:rPr>
+      </w:pPr>
+      <m:oMathPara>
+        <m:oMath>
+          <m:r>
+            <w:rPr>
+              <w:rFonts w:ascii="Cambria Math" w:hAnsi="Cambria Math"/>
+            </w:rPr>
+            <m:t>Eff=</m:t>
+          </m:r>
+          <m:f>
+            <m:fPr>
+              <m:ctrlPr>
+                <w:rPr>
+                  <w:rFonts w:ascii="Cambria Math" w:hAnsi="Cambria Math"/>
+                  <w:i/>
+                </w:rPr>
+              </m:ctrlPr>
+            </m:fPr>
+            <m:num>
+              <m:r>
+                <w:rPr>
+                  <w:rFonts w:ascii="Cambria Math" w:hAnsi="Cambria Math"/>
+                </w:rPr>
+                <m:t>Q_flow</m:t>
+              </m:r>
+            </m:num>
+            <m:den>
+              <m:r>
+                <w:rPr>
+                  <w:rFonts w:ascii="Cambria Math" w:hAnsi="Cambria Math"/>
+                </w:rPr>
+                <m:t>Q_flow_max</m:t>
+              </m:r>
+            </m:den>
+          </m:f>
+          <m:r>
+            <w:rPr>
+              <w:rFonts w:ascii="Cambria Math" w:hAnsi="Cambria Math"/>
+            </w:rPr>
+            <m:t>=</m:t>
+          </m:r>
+          <m:f>
+            <m:fPr>
+              <m:ctrlPr>
+                <w:rPr>
+                  <w:rFonts w:ascii="Cambria Math" w:hAnsi="Cambria Math"/>
+                  <w:i/>
+                </w:rPr>
+              </m:ctrlPr>
+            </m:fPr>
+            <m:num>
+              <m:r>
+                <w:rPr>
+                  <w:rFonts w:ascii="Cambria Math" w:hAnsi="Cambria Math"/>
+                </w:rPr>
+                <m:t>Q_flow</m:t>
+              </m:r>
+            </m:num>
+            <m:den>
+              <m:r>
+                <m:rPr>
+                  <m:sty m:val="p"/>
+                </m:rPr>
+                <w:rPr>
+                  <w:rFonts w:ascii="Cambria Math" w:hAnsi="Cambria Math"/>
+                </w:rPr>
+                <m:t>min⁡</m:t>
+              </m:r>
+              <m:r>
+                <w:rPr>
+                  <w:rFonts w:ascii="Cambria Math" w:hAnsi="Cambria Math"/>
+                </w:rPr>
+                <m:t>(Qc</m:t>
+              </m:r>
+              <m:r>
+                <w:rPr>
+                  <w:rFonts w:ascii="Cambria Math" w:hAnsi="Cambria Math"/>
+                </w:rPr>
+                <m:t>_</m:t>
+              </m:r>
+              <m:r>
+                <w:rPr>
+                  <w:rFonts w:ascii="Cambria Math" w:hAnsi="Cambria Math"/>
+                </w:rPr>
+                <m:t>A, Qc</m:t>
+              </m:r>
+              <m:r>
+                <w:rPr>
+                  <w:rFonts w:ascii="Cambria Math" w:hAnsi="Cambria Math"/>
+                </w:rPr>
+                <m:t>_</m:t>
+              </m:r>
+              <m:r>
+                <w:rPr>
+                  <w:rFonts w:ascii="Cambria Math" w:hAnsi="Cambria Math"/>
+                </w:rPr>
+                <m:t>B)×(</m:t>
+              </m:r>
+              <m:sSub>
+                <m:sSubPr>
+                  <m:ctrlPr>
+                    <w:rPr>
+                      <w:rFonts w:ascii="Cambria Math" w:hAnsi="Cambria Math"/>
+                      <w:i/>
+                    </w:rPr>
+                  </m:ctrlPr>
+                </m:sSubPr>
+                <m:e>
+                  <m:r>
+                    <w:rPr>
+                      <w:rFonts w:ascii="Cambria Math" w:hAnsi="Cambria Math"/>
+                    </w:rPr>
+                    <m:t>T_A</m:t>
+                  </m:r>
+                </m:e>
+                <m:sub>
+                  <m:r>
+                    <w:rPr>
+                      <w:rFonts w:ascii="Cambria Math" w:hAnsi="Cambria Math"/>
+                    </w:rPr>
+                    <m:t>in</m:t>
+                  </m:r>
+                </m:sub>
+              </m:sSub>
+              <m:r>
+                <w:rPr>
+                  <w:rFonts w:ascii="Cambria Math" w:hAnsi="Cambria Math"/>
+                </w:rPr>
+                <m:t>-</m:t>
+              </m:r>
+              <m:sSub>
+                <m:sSubPr>
+                  <m:ctrlPr>
+                    <w:rPr>
+                      <w:rFonts w:ascii="Cambria Math" w:hAnsi="Cambria Math"/>
+                      <w:i/>
+                    </w:rPr>
+                  </m:ctrlPr>
+                </m:sSubPr>
+                <m:e>
+                  <m:r>
+                    <w:rPr>
+                      <w:rFonts w:ascii="Cambria Math" w:hAnsi="Cambria Math"/>
+                    </w:rPr>
+                    <m:t>T_B</m:t>
+                  </m:r>
+                </m:e>
+                <m:sub>
+                  <m:r>
+                    <w:rPr>
+                      <w:rFonts w:ascii="Cambria Math" w:hAnsi="Cambria Math"/>
+                    </w:rPr>
+                    <m:t>in</m:t>
+                  </m:r>
+                </m:sub>
+              </m:sSub>
+              <m:r>
+                <w:rPr>
+                  <w:rFonts w:ascii="Cambria Math" w:hAnsi="Cambria Math"/>
+                </w:rPr>
+                <m:t>)</m:t>
+              </m:r>
+            </m:den>
+          </m:f>
+        </m:oMath>
+      </m:oMathPara>
+    </w:p>
+    <w:p>
+      <w:pPr>
+        <w:rPr>
+          <w:rFonts w:eastAsiaTheme="minorEastAsia"/>
+        </w:rPr>
+      </w:pPr>
+      <m:oMathPara>
+        <m:oMath>
+          <m:r>
+            <w:rPr>
+              <w:rFonts w:ascii="Cambria Math" w:hAnsi="Cambria Math"/>
+            </w:rPr>
+            <m:t>Eff=f(Cr, NTU, others parameter)</m:t>
+          </m:r>
+        </m:oMath>
+      </m:oMathPara>
+    </w:p>
+    <w:p>
+      <w:pPr>
+        <w:rPr>
+          <w:rFonts w:eastAsiaTheme="minorEastAsia"/>
+        </w:rPr>
+      </w:pPr>
+      <m:oMathPara>
+        <m:oMath>
+          <m:r>
+            <w:rPr>
+              <w:rFonts w:ascii="Cambria Math" w:hAnsi="Cambria Math"/>
+            </w:rPr>
+            <m:t>Q_flow=Qc</m:t>
+          </m:r>
+          <m:r>
+            <w:rPr>
+              <w:rFonts w:ascii="Cambria Math" w:hAnsi="Cambria Math"/>
+            </w:rPr>
+            <m:t>_</m:t>
+          </m:r>
+          <m:r>
+            <w:rPr>
+              <w:rFonts w:ascii="Cambria Math" w:hAnsi="Cambria Math"/>
+            </w:rPr>
+            <m:t>A×(</m:t>
+          </m:r>
+          <m:sSub>
+            <m:sSubPr>
+              <m:ctrlPr>
+                <w:rPr>
+                  <w:rFonts w:ascii="Cambria Math" w:hAnsi="Cambria Math"/>
+                  <w:i/>
+                </w:rPr>
+              </m:ctrlPr>
+            </m:sSubPr>
+            <m:e>
+              <m:r>
+                <w:rPr>
+                  <w:rFonts w:ascii="Cambria Math" w:hAnsi="Cambria Math"/>
+                </w:rPr>
+                <m:t>T</m:t>
+              </m:r>
+              <m:r>
+                <w:rPr>
+                  <w:rFonts w:ascii="Cambria Math" w:hAnsi="Cambria Math"/>
+                </w:rPr>
+                <m:t>_</m:t>
+              </m:r>
+              <m:r>
+                <w:rPr>
+                  <w:rFonts w:ascii="Cambria Math" w:hAnsi="Cambria Math"/>
+                </w:rPr>
+                <m:t>A</m:t>
+              </m:r>
+            </m:e>
+            <m:sub>
+              <m:r>
+                <w:rPr>
+                  <w:rFonts w:ascii="Cambria Math" w:hAnsi="Cambria Math"/>
+                </w:rPr>
+                <m:t>in</m:t>
+              </m:r>
+            </m:sub>
+          </m:sSub>
+          <m:r>
+            <w:rPr>
+              <w:rFonts w:ascii="Cambria Math" w:hAnsi="Cambria Math"/>
+            </w:rPr>
+            <m:t>-</m:t>
+          </m:r>
+          <m:sSub>
+            <m:sSubPr>
+              <m:ctrlPr>
+                <w:rPr>
+                  <w:rFonts w:ascii="Cambria Math" w:hAnsi="Cambria Math"/>
+                  <w:i/>
+                </w:rPr>
+              </m:ctrlPr>
+            </m:sSubPr>
+            <m:e>
+              <m:r>
+                <w:rPr>
+                  <w:rFonts w:ascii="Cambria Math" w:hAnsi="Cambria Math"/>
+                </w:rPr>
+                <m:t>T</m:t>
+              </m:r>
+              <m:r>
+                <w:rPr>
+                  <w:rFonts w:ascii="Cambria Math" w:hAnsi="Cambria Math"/>
+                </w:rPr>
+                <m:t>_</m:t>
+              </m:r>
+              <m:r>
+                <w:rPr>
+                  <w:rFonts w:ascii="Cambria Math" w:hAnsi="Cambria Math"/>
+                </w:rPr>
+                <m:t>A</m:t>
+              </m:r>
+            </m:e>
+            <m:sub>
+              <m:r>
+                <w:rPr>
+                  <w:rFonts w:ascii="Cambria Math" w:hAnsi="Cambria Math"/>
+                </w:rPr>
+                <m:t>out</m:t>
+              </m:r>
+            </m:sub>
+          </m:sSub>
+          <m:r>
+            <w:rPr>
+              <w:rFonts w:ascii="Cambria Math" w:hAnsi="Cambria Math"/>
+            </w:rPr>
+            <m:t>)</m:t>
+          </m:r>
+        </m:oMath>
+      </m:oMathPara>
+    </w:p>
+    <w:p>
+      <w:pPr>
+        <w:rPr>
+          <w:rFonts w:eastAsiaTheme="minorEastAsia"/>
+        </w:rPr>
+      </w:pPr>
+      <m:oMathPara>
+        <m:oMath>
+          <m:r>
+            <w:rPr>
+              <w:rFonts w:ascii="Cambria Math" w:hAnsi="Cambria Math"/>
+            </w:rPr>
+            <m:t>Qc</m:t>
+          </m:r>
+          <m:r>
+            <w:rPr>
+              <w:rFonts w:ascii="Cambria Math" w:hAnsi="Cambria Math"/>
+            </w:rPr>
+            <m:t>_</m:t>
+          </m:r>
+          <m:r>
+            <w:rPr>
+              <w:rFonts w:ascii="Cambria Math" w:hAnsi="Cambria Math"/>
+            </w:rPr>
+            <m:t>A×</m:t>
+          </m:r>
+          <m:d>
+            <m:dPr>
+              <m:ctrlPr>
+                <w:rPr>
+                  <w:rFonts w:ascii="Cambria Math" w:hAnsi="Cambria Math"/>
+                  <w:i/>
+                </w:rPr>
+              </m:ctrlPr>
+            </m:dPr>
+            <m:e>
+              <m:sSub>
+                <m:sSubPr>
+                  <m:ctrlPr>
+                    <w:rPr>
+                      <w:rFonts w:ascii="Cambria Math" w:hAnsi="Cambria Math"/>
+                      <w:i/>
+                    </w:rPr>
+                  </m:ctrlPr>
+                </m:sSubPr>
+                <m:e>
+                  <m:r>
+                    <w:rPr>
+                      <w:rFonts w:ascii="Cambria Math" w:hAnsi="Cambria Math"/>
+                    </w:rPr>
+                    <m:t>T</m:t>
+                  </m:r>
+                  <m:r>
+                    <w:rPr>
+                      <w:rFonts w:ascii="Cambria Math" w:hAnsi="Cambria Math"/>
+                    </w:rPr>
+                    <m:t>_</m:t>
+                  </m:r>
+                  <m:r>
+                    <w:rPr>
+                      <w:rFonts w:ascii="Cambria Math" w:hAnsi="Cambria Math"/>
+                    </w:rPr>
+                    <m:t>A</m:t>
+                  </m:r>
+                </m:e>
+                <m:sub>
+                  <m:r>
+                    <w:rPr>
+                      <w:rFonts w:ascii="Cambria Math" w:hAnsi="Cambria Math"/>
+                    </w:rPr>
+                    <m:t>in</m:t>
+                  </m:r>
+                </m:sub>
+              </m:sSub>
+              <m:r>
+                <w:rPr>
+                  <w:rFonts w:ascii="Cambria Math" w:hAnsi="Cambria Math"/>
+                </w:rPr>
+                <m:t>-</m:t>
+              </m:r>
+              <m:sSub>
+                <m:sSubPr>
+                  <m:ctrlPr>
+                    <w:rPr>
+                      <w:rFonts w:ascii="Cambria Math" w:hAnsi="Cambria Math"/>
+                      <w:i/>
+                    </w:rPr>
+                  </m:ctrlPr>
+                </m:sSubPr>
+                <m:e>
+                  <m:r>
+                    <w:rPr>
+                      <w:rFonts w:ascii="Cambria Math" w:hAnsi="Cambria Math"/>
+                    </w:rPr>
+                    <m:t>T</m:t>
+                  </m:r>
+                  <m:r>
+                    <w:rPr>
+                      <w:rFonts w:ascii="Cambria Math" w:hAnsi="Cambria Math"/>
+                    </w:rPr>
+                    <m:t>_</m:t>
+                  </m:r>
+                  <m:r>
+                    <w:rPr>
+                      <w:rFonts w:ascii="Cambria Math" w:hAnsi="Cambria Math"/>
+                    </w:rPr>
+                    <m:t>A</m:t>
+                  </m:r>
+                </m:e>
+                <m:sub>
+                  <m:r>
+                    <w:rPr>
+                      <w:rFonts w:ascii="Cambria Math" w:hAnsi="Cambria Math"/>
+                    </w:rPr>
+                    <m:t>out</m:t>
+                  </m:r>
+                </m:sub>
+              </m:sSub>
+            </m:e>
+          </m:d>
+          <m:r>
+            <w:rPr>
+              <w:rFonts w:ascii="Cambria Math" w:hAnsi="Cambria Math"/>
+            </w:rPr>
+            <m:t>+Qc</m:t>
+          </m:r>
+          <m:r>
+            <w:rPr>
+              <w:rFonts w:ascii="Cambria Math" w:hAnsi="Cambria Math"/>
+            </w:rPr>
+            <m:t>_</m:t>
+          </m:r>
+          <m:r>
+            <w:rPr>
+              <w:rFonts w:ascii="Cambria Math" w:hAnsi="Cambria Math"/>
+            </w:rPr>
+            <m:t>B×</m:t>
+          </m:r>
+          <m:d>
+            <m:dPr>
+              <m:ctrlPr>
+                <w:rPr>
+                  <w:rFonts w:ascii="Cambria Math" w:hAnsi="Cambria Math"/>
+                  <w:i/>
+                </w:rPr>
+              </m:ctrlPr>
+            </m:dPr>
+            <m:e>
+              <m:sSub>
+                <m:sSubPr>
+                  <m:ctrlPr>
+                    <w:rPr>
+                      <w:rFonts w:ascii="Cambria Math" w:hAnsi="Cambria Math"/>
+                      <w:i/>
+                    </w:rPr>
+                  </m:ctrlPr>
+                </m:sSubPr>
+                <m:e>
+                  <m:r>
+                    <w:rPr>
+                      <w:rFonts w:ascii="Cambria Math" w:hAnsi="Cambria Math"/>
+                    </w:rPr>
+                    <m:t>T</m:t>
+                  </m:r>
+                  <m:r>
+                    <w:rPr>
+                      <w:rFonts w:ascii="Cambria Math" w:hAnsi="Cambria Math"/>
+                    </w:rPr>
+                    <m:t>_</m:t>
+                  </m:r>
+                  <m:r>
+                    <w:rPr>
+                      <w:rFonts w:ascii="Cambria Math" w:hAnsi="Cambria Math"/>
+                    </w:rPr>
+                    <m:t>B</m:t>
+                  </m:r>
+                </m:e>
+                <m:sub>
+                  <m:r>
+                    <w:rPr>
+                      <w:rFonts w:ascii="Cambria Math" w:hAnsi="Cambria Math"/>
+                    </w:rPr>
+                    <m:t>in</m:t>
+                  </m:r>
+                </m:sub>
+              </m:sSub>
+              <m:r>
+                <w:rPr>
+                  <w:rFonts w:ascii="Cambria Math" w:hAnsi="Cambria Math"/>
+                </w:rPr>
+                <m:t>-</m:t>
+              </m:r>
+              <m:sSub>
+                <m:sSubPr>
+                  <m:ctrlPr>
+                    <w:rPr>
+                      <w:rFonts w:ascii="Cambria Math" w:hAnsi="Cambria Math"/>
+                      <w:i/>
+                    </w:rPr>
+                  </m:ctrlPr>
+                </m:sSubPr>
+                <m:e>
+                  <m:r>
+                    <w:rPr>
+                      <w:rFonts w:ascii="Cambria Math" w:hAnsi="Cambria Math"/>
+                    </w:rPr>
+                    <m:t>T</m:t>
+                  </m:r>
+                  <m:r>
+                    <w:rPr>
+                      <w:rFonts w:ascii="Cambria Math" w:hAnsi="Cambria Math"/>
+                    </w:rPr>
+                    <m:t>_</m:t>
+                  </m:r>
+                  <m:r>
+                    <w:rPr>
+                      <w:rFonts w:ascii="Cambria Math" w:hAnsi="Cambria Math"/>
+                    </w:rPr>
+                    <m:t>B</m:t>
+                  </m:r>
+                </m:e>
+                <m:sub>
+                  <m:r>
+                    <w:rPr>
+                      <w:rFonts w:ascii="Cambria Math" w:hAnsi="Cambria Math"/>
+                    </w:rPr>
+                    <m:t>out</m:t>
+                  </m:r>
+                </m:sub>
+              </m:sSub>
+            </m:e>
+          </m:d>
+          <m:r>
+            <w:rPr>
+              <w:rFonts w:ascii="Cambria Math" w:eastAsiaTheme="minorEastAsia" w:hAnsi="Cambria Math"/>
+            </w:rPr>
+            <m:t>=0</m:t>
+          </m:r>
+        </m:oMath>
+      </m:oMathPara>
+    </w:p>
+    <w:p>
+      <w:pPr>
+        <w:rPr>
+          <w:rFonts w:eastAsiaTheme="minorEastAsia"/>
+          <w:sz w:val="24"/>
+          <w:szCs w:val="24"/>
+        </w:rPr>
+      </w:pPr>
+    </w:p>
+    <w:p>
+      <w:pPr>
+        <w:rPr>
+          <w:rFonts w:eastAsiaTheme="minorEastAsia"/>
+          <w:sz w:val="24"/>
+          <w:szCs w:val="24"/>
+        </w:rPr>
+      </w:pPr>
+      <w:bookmarkStart w:id="0" w:name="_GoBack"/>
+      <w:bookmarkEnd w:id="0"/>
     </w:p>
     <w:sectPr>
       <w:pgSz w:w="11906" w:h="16838"/>
@@ -4332,7 +5099,7 @@
   <a:extraClrSchemeLst/>
   <a:extLst>
     <a:ext uri="{05A4C25C-085E-4340-85A3-A5531E510DB2}">
-      <thm15:themeFamily xmlns="" xmlns:thm15="http://schemas.microsoft.com/office/thememl/2012/main" name="Office Theme" id="{62F939B6-93AF-4DB8-9C6B-D6C7DFDC589F}" vid="{4A3C46E8-61CC-4603-A589-7422A47A8E4A}"/>
+      <thm15:themeFamily xmlns:thm15="http://schemas.microsoft.com/office/thememl/2012/main" xmlns="" name="Office Theme" id="{62F939B6-93AF-4DB8-9C6B-D6C7DFDC589F}" vid="{4A3C46E8-61CC-4603-A589-7422A47A8E4A}"/>
     </a:ext>
   </a:extLst>
 </a:theme>
@@ -4343,7 +5110,7 @@
 </file>
 
 <file path=customXml/itemProps1.xml><?xml version="1.0" encoding="utf-8"?>
-<ds:datastoreItem xmlns:ds="http://schemas.openxmlformats.org/officeDocument/2006/customXml" ds:itemID="{A87C1578-AE34-4281-BDBA-DD09F0AB576C}">
+<ds:datastoreItem xmlns:ds="http://schemas.openxmlformats.org/officeDocument/2006/customXml" ds:itemID="{A6DC7036-D722-4C18-B78D-97C1686D959D}">
   <ds:schemaRefs>
     <ds:schemaRef ds:uri="http://schemas.openxmlformats.org/officeDocument/2006/bibliography"/>
   </ds:schemaRefs>

</xml_diff>

<commit_message>
Addition of the uniformGrid function in TAeZoSysPro.HeatTransfer.Functions.MeshGrid + modification of the PartialWall module in consequence
</commit_message>
<xml_diff>
--- a/Information/script for equations.docx
+++ b/Information/script for equations.docx
@@ -3656,31 +3656,7 @@
                 <w:rPr>
                   <w:rFonts w:ascii="Cambria Math" w:hAnsi="Cambria Math"/>
                 </w:rPr>
-                <m:t>(Qc</m:t>
-              </m:r>
-              <m:r>
-                <w:rPr>
-                  <w:rFonts w:ascii="Cambria Math" w:hAnsi="Cambria Math"/>
-                </w:rPr>
-                <m:t>_</m:t>
-              </m:r>
-              <m:r>
-                <w:rPr>
-                  <w:rFonts w:ascii="Cambria Math" w:hAnsi="Cambria Math"/>
-                </w:rPr>
-                <m:t>A, Qc</m:t>
-              </m:r>
-              <m:r>
-                <w:rPr>
-                  <w:rFonts w:ascii="Cambria Math" w:hAnsi="Cambria Math"/>
-                </w:rPr>
-                <m:t>_</m:t>
-              </m:r>
-              <m:r>
-                <w:rPr>
-                  <w:rFonts w:ascii="Cambria Math" w:hAnsi="Cambria Math"/>
-                </w:rPr>
-                <m:t>B)</m:t>
+                <m:t>(Qc_A, Qc_B)</m:t>
               </m:r>
             </m:num>
             <m:den>
@@ -3697,31 +3673,7 @@
                 <w:rPr>
                   <w:rFonts w:ascii="Cambria Math" w:hAnsi="Cambria Math"/>
                 </w:rPr>
-                <m:t>(Qc</m:t>
-              </m:r>
-              <m:r>
-                <w:rPr>
-                  <w:rFonts w:ascii="Cambria Math" w:hAnsi="Cambria Math"/>
-                </w:rPr>
-                <m:t>_</m:t>
-              </m:r>
-              <m:r>
-                <w:rPr>
-                  <w:rFonts w:ascii="Cambria Math" w:hAnsi="Cambria Math"/>
-                </w:rPr>
-                <m:t>A, Qc</m:t>
-              </m:r>
-              <m:r>
-                <w:rPr>
-                  <w:rFonts w:ascii="Cambria Math" w:hAnsi="Cambria Math"/>
-                </w:rPr>
-                <m:t>_</m:t>
-              </m:r>
-              <m:r>
-                <w:rPr>
-                  <w:rFonts w:ascii="Cambria Math" w:hAnsi="Cambria Math"/>
-                </w:rPr>
-                <m:t>B)</m:t>
+                <m:t>(Qc_A, Qc_B)</m:t>
               </m:r>
             </m:den>
           </m:f>
@@ -3776,31 +3728,7 @@
                 <w:rPr>
                   <w:rFonts w:ascii="Cambria Math" w:hAnsi="Cambria Math"/>
                 </w:rPr>
-                <m:t>(Qc</m:t>
-              </m:r>
-              <m:r>
-                <w:rPr>
-                  <w:rFonts w:ascii="Cambria Math" w:hAnsi="Cambria Math"/>
-                </w:rPr>
-                <m:t>_</m:t>
-              </m:r>
-              <m:r>
-                <w:rPr>
-                  <w:rFonts w:ascii="Cambria Math" w:hAnsi="Cambria Math"/>
-                </w:rPr>
-                <m:t>A, Qc</m:t>
-              </m:r>
-              <m:r>
-                <w:rPr>
-                  <w:rFonts w:ascii="Cambria Math" w:hAnsi="Cambria Math"/>
-                </w:rPr>
-                <m:t>_</m:t>
-              </m:r>
-              <m:r>
-                <w:rPr>
-                  <w:rFonts w:ascii="Cambria Math" w:hAnsi="Cambria Math"/>
-                </w:rPr>
-                <m:t>B)</m:t>
+                <m:t>(Qc_A, Qc_B)</m:t>
               </m:r>
             </m:den>
           </m:f>
@@ -3884,31 +3812,7 @@
                 <w:rPr>
                   <w:rFonts w:ascii="Cambria Math" w:hAnsi="Cambria Math"/>
                 </w:rPr>
-                <m:t>(Qc</m:t>
-              </m:r>
-              <m:r>
-                <w:rPr>
-                  <w:rFonts w:ascii="Cambria Math" w:hAnsi="Cambria Math"/>
-                </w:rPr>
-                <m:t>_</m:t>
-              </m:r>
-              <m:r>
-                <w:rPr>
-                  <w:rFonts w:ascii="Cambria Math" w:hAnsi="Cambria Math"/>
-                </w:rPr>
-                <m:t>A, Qc</m:t>
-              </m:r>
-              <m:r>
-                <w:rPr>
-                  <w:rFonts w:ascii="Cambria Math" w:hAnsi="Cambria Math"/>
-                </w:rPr>
-                <m:t>_</m:t>
-              </m:r>
-              <m:r>
-                <w:rPr>
-                  <w:rFonts w:ascii="Cambria Math" w:hAnsi="Cambria Math"/>
-                </w:rPr>
-                <m:t>B)×(</m:t>
+                <m:t>(Qc_A, Qc_B)×(</m:t>
               </m:r>
               <m:sSub>
                 <m:sSubPr>
@@ -4008,19 +3912,7 @@
             <w:rPr>
               <w:rFonts w:ascii="Cambria Math" w:hAnsi="Cambria Math"/>
             </w:rPr>
-            <m:t>Q_flow=Qc</m:t>
-          </m:r>
-          <m:r>
-            <w:rPr>
-              <w:rFonts w:ascii="Cambria Math" w:hAnsi="Cambria Math"/>
-            </w:rPr>
-            <m:t>_</m:t>
-          </m:r>
-          <m:r>
-            <w:rPr>
-              <w:rFonts w:ascii="Cambria Math" w:hAnsi="Cambria Math"/>
-            </w:rPr>
-            <m:t>A×(</m:t>
+            <m:t>Q_flow=Qc_A×(</m:t>
           </m:r>
           <m:sSub>
             <m:sSubPr>
@@ -4036,19 +3928,7 @@
                 <w:rPr>
                   <w:rFonts w:ascii="Cambria Math" w:hAnsi="Cambria Math"/>
                 </w:rPr>
-                <m:t>T</m:t>
-              </m:r>
-              <m:r>
-                <w:rPr>
-                  <w:rFonts w:ascii="Cambria Math" w:hAnsi="Cambria Math"/>
-                </w:rPr>
-                <m:t>_</m:t>
-              </m:r>
-              <m:r>
-                <w:rPr>
-                  <w:rFonts w:ascii="Cambria Math" w:hAnsi="Cambria Math"/>
-                </w:rPr>
-                <m:t>A</m:t>
+                <m:t>T_A</m:t>
               </m:r>
             </m:e>
             <m:sub>
@@ -4080,19 +3960,7 @@
                 <w:rPr>
                   <w:rFonts w:ascii="Cambria Math" w:hAnsi="Cambria Math"/>
                 </w:rPr>
-                <m:t>T</m:t>
-              </m:r>
-              <m:r>
-                <w:rPr>
-                  <w:rFonts w:ascii="Cambria Math" w:hAnsi="Cambria Math"/>
-                </w:rPr>
-                <m:t>_</m:t>
-              </m:r>
-              <m:r>
-                <w:rPr>
-                  <w:rFonts w:ascii="Cambria Math" w:hAnsi="Cambria Math"/>
-                </w:rPr>
-                <m:t>A</m:t>
+                <m:t>T_A</m:t>
               </m:r>
             </m:e>
             <m:sub>
@@ -4125,19 +3993,7 @@
             <w:rPr>
               <w:rFonts w:ascii="Cambria Math" w:hAnsi="Cambria Math"/>
             </w:rPr>
-            <m:t>Qc</m:t>
-          </m:r>
-          <m:r>
-            <w:rPr>
-              <w:rFonts w:ascii="Cambria Math" w:hAnsi="Cambria Math"/>
-            </w:rPr>
-            <m:t>_</m:t>
-          </m:r>
-          <m:r>
-            <w:rPr>
-              <w:rFonts w:ascii="Cambria Math" w:hAnsi="Cambria Math"/>
-            </w:rPr>
-            <m:t>A×</m:t>
+            <m:t>Qc_A×</m:t>
           </m:r>
           <m:d>
             <m:dPr>
@@ -4163,19 +4019,7 @@
                     <w:rPr>
                       <w:rFonts w:ascii="Cambria Math" w:hAnsi="Cambria Math"/>
                     </w:rPr>
-                    <m:t>T</m:t>
-                  </m:r>
-                  <m:r>
-                    <w:rPr>
-                      <w:rFonts w:ascii="Cambria Math" w:hAnsi="Cambria Math"/>
-                    </w:rPr>
-                    <m:t>_</m:t>
-                  </m:r>
-                  <m:r>
-                    <w:rPr>
-                      <w:rFonts w:ascii="Cambria Math" w:hAnsi="Cambria Math"/>
-                    </w:rPr>
-                    <m:t>A</m:t>
+                    <m:t>T_A</m:t>
                   </m:r>
                 </m:e>
                 <m:sub>
@@ -4207,19 +4051,7 @@
                     <w:rPr>
                       <w:rFonts w:ascii="Cambria Math" w:hAnsi="Cambria Math"/>
                     </w:rPr>
-                    <m:t>T</m:t>
-                  </m:r>
-                  <m:r>
-                    <w:rPr>
-                      <w:rFonts w:ascii="Cambria Math" w:hAnsi="Cambria Math"/>
-                    </w:rPr>
-                    <m:t>_</m:t>
-                  </m:r>
-                  <m:r>
-                    <w:rPr>
-                      <w:rFonts w:ascii="Cambria Math" w:hAnsi="Cambria Math"/>
-                    </w:rPr>
-                    <m:t>A</m:t>
+                    <m:t>T_A</m:t>
                   </m:r>
                 </m:e>
                 <m:sub>
@@ -4237,19 +4069,7 @@
             <w:rPr>
               <w:rFonts w:ascii="Cambria Math" w:hAnsi="Cambria Math"/>
             </w:rPr>
-            <m:t>+Qc</m:t>
-          </m:r>
-          <m:r>
-            <w:rPr>
-              <w:rFonts w:ascii="Cambria Math" w:hAnsi="Cambria Math"/>
-            </w:rPr>
-            <m:t>_</m:t>
-          </m:r>
-          <m:r>
-            <w:rPr>
-              <w:rFonts w:ascii="Cambria Math" w:hAnsi="Cambria Math"/>
-            </w:rPr>
-            <m:t>B×</m:t>
+            <m:t>+Qc_B×</m:t>
           </m:r>
           <m:d>
             <m:dPr>
@@ -4275,19 +4095,7 @@
                     <w:rPr>
                       <w:rFonts w:ascii="Cambria Math" w:hAnsi="Cambria Math"/>
                     </w:rPr>
-                    <m:t>T</m:t>
-                  </m:r>
-                  <m:r>
-                    <w:rPr>
-                      <w:rFonts w:ascii="Cambria Math" w:hAnsi="Cambria Math"/>
-                    </w:rPr>
-                    <m:t>_</m:t>
-                  </m:r>
-                  <m:r>
-                    <w:rPr>
-                      <w:rFonts w:ascii="Cambria Math" w:hAnsi="Cambria Math"/>
-                    </w:rPr>
-                    <m:t>B</m:t>
+                    <m:t>T_B</m:t>
                   </m:r>
                 </m:e>
                 <m:sub>
@@ -4319,19 +4127,7 @@
                     <w:rPr>
                       <w:rFonts w:ascii="Cambria Math" w:hAnsi="Cambria Math"/>
                     </w:rPr>
-                    <m:t>T</m:t>
-                  </m:r>
-                  <m:r>
-                    <w:rPr>
-                      <w:rFonts w:ascii="Cambria Math" w:hAnsi="Cambria Math"/>
-                    </w:rPr>
-                    <m:t>_</m:t>
-                  </m:r>
-                  <m:r>
-                    <w:rPr>
-                      <w:rFonts w:ascii="Cambria Math" w:hAnsi="Cambria Math"/>
-                    </w:rPr>
-                    <m:t>B</m:t>
+                    <m:t>T_B</m:t>
                   </m:r>
                 </m:e>
                 <m:sub>
@@ -4358,8 +4154,6 @@
       <w:pPr>
         <w:rPr>
           <w:rFonts w:eastAsiaTheme="minorEastAsia"/>
-          <w:sz w:val="24"/>
-          <w:szCs w:val="24"/>
         </w:rPr>
       </w:pPr>
     </w:p>
@@ -4367,12 +4161,176 @@
       <w:pPr>
         <w:rPr>
           <w:rFonts w:eastAsiaTheme="minorEastAsia"/>
+          <w:b/>
+        </w:rPr>
+      </w:pPr>
+      <w:proofErr w:type="spellStart"/>
+      <w:proofErr w:type="gramStart"/>
+      <w:r>
+        <w:rPr>
+          <w:rFonts w:eastAsiaTheme="minorEastAsia"/>
+          <w:b/>
+        </w:rPr>
+        <w:t>uniformGrid</w:t>
+      </w:r>
+      <w:proofErr w:type="spellEnd"/>
+      <w:proofErr w:type="gramEnd"/>
+    </w:p>
+    <w:p>
+      <w:pPr>
+        <w:rPr>
+          <w:rFonts w:eastAsiaTheme="minorEastAsia"/>
+        </w:rPr>
+      </w:pPr>
+      <m:oMathPara>
+        <m:oMath>
+          <m:r>
+            <w:rPr>
+              <w:rFonts w:ascii="Cambria Math" w:eastAsiaTheme="minorEastAsia" w:hAnsi="Cambria Math"/>
+            </w:rPr>
+            <m:t xml:space="preserve"> x</m:t>
+          </m:r>
+          <m:d>
+            <m:dPr>
+              <m:begChr m:val="["/>
+              <m:endChr m:val="]"/>
+              <m:ctrlPr>
+                <w:rPr>
+                  <w:rFonts w:ascii="Cambria Math" w:eastAsiaTheme="minorEastAsia" w:hAnsi="Cambria Math"/>
+                  <w:i/>
+                </w:rPr>
+              </m:ctrlPr>
+            </m:dPr>
+            <m:e>
+              <m:r>
+                <w:rPr>
+                  <w:rFonts w:ascii="Cambria Math" w:eastAsiaTheme="minorEastAsia" w:hAnsi="Cambria Math"/>
+                </w:rPr>
+                <m:t>i+1</m:t>
+              </m:r>
+            </m:e>
+          </m:d>
+          <m:r>
+            <w:rPr>
+              <w:rFonts w:ascii="Cambria Math" w:eastAsiaTheme="minorEastAsia" w:hAnsi="Cambria Math"/>
+            </w:rPr>
+            <m:t>-</m:t>
+          </m:r>
+          <m:r>
+            <w:rPr>
+              <w:rFonts w:ascii="Cambria Math" w:eastAsiaTheme="minorEastAsia" w:hAnsi="Cambria Math"/>
+            </w:rPr>
+            <m:t>x</m:t>
+          </m:r>
+          <m:d>
+            <m:dPr>
+              <m:begChr m:val="["/>
+              <m:endChr m:val="]"/>
+              <m:ctrlPr>
+                <w:rPr>
+                  <w:rFonts w:ascii="Cambria Math" w:eastAsiaTheme="minorEastAsia" w:hAnsi="Cambria Math"/>
+                  <w:i/>
+                </w:rPr>
+              </m:ctrlPr>
+            </m:dPr>
+            <m:e>
+              <m:r>
+                <w:rPr>
+                  <w:rFonts w:ascii="Cambria Math" w:eastAsiaTheme="minorEastAsia" w:hAnsi="Cambria Math"/>
+                </w:rPr>
+                <m:t>i</m:t>
+              </m:r>
+            </m:e>
+          </m:d>
+          <m:r>
+            <w:rPr>
+              <w:rFonts w:ascii="Cambria Math" w:eastAsiaTheme="minorEastAsia" w:hAnsi="Cambria Math"/>
+            </w:rPr>
+            <m:t>=</m:t>
+          </m:r>
+          <m:f>
+            <m:fPr>
+              <m:ctrlPr>
+                <w:rPr>
+                  <w:rFonts w:ascii="Cambria Math" w:eastAsiaTheme="minorEastAsia" w:hAnsi="Cambria Math"/>
+                  <w:i/>
+                </w:rPr>
+              </m:ctrlPr>
+            </m:fPr>
+            <m:num>
+              <m:r>
+                <w:rPr>
+                  <w:rFonts w:ascii="Cambria Math" w:eastAsiaTheme="minorEastAsia" w:hAnsi="Cambria Math"/>
+                </w:rPr>
+                <m:t>L</m:t>
+              </m:r>
+            </m:num>
+            <m:den>
+              <m:r>
+                <w:rPr>
+                  <w:rFonts w:ascii="Cambria Math" w:eastAsiaTheme="minorEastAsia" w:hAnsi="Cambria Math"/>
+                </w:rPr>
+                <m:t>N</m:t>
+              </m:r>
+            </m:den>
+          </m:f>
+          <m:r>
+            <w:rPr>
+              <w:rFonts w:ascii="Cambria Math" w:eastAsiaTheme="minorEastAsia" w:hAnsi="Cambria Math"/>
+            </w:rPr>
+            <m:t xml:space="preserve"> for i from 1 to N</m:t>
+          </m:r>
+        </m:oMath>
+      </m:oMathPara>
+    </w:p>
+    <w:p>
+      <w:pPr>
+        <w:rPr>
+          <w:rFonts w:eastAsiaTheme="minorEastAsia"/>
+        </w:rPr>
+      </w:pPr>
+      <m:oMathPara>
+        <m:oMath>
+          <m:r>
+            <w:rPr>
+              <w:rFonts w:ascii="Cambria Math" w:eastAsiaTheme="minorEastAsia" w:hAnsi="Cambria Math"/>
+            </w:rPr>
+            <m:t>x[1]</m:t>
+          </m:r>
+          <m:r>
+            <w:rPr>
+              <w:rFonts w:ascii="Cambria Math" w:eastAsiaTheme="minorEastAsia" w:hAnsi="Cambria Math"/>
+            </w:rPr>
+            <m:t>=</m:t>
+          </m:r>
+          <m:r>
+            <w:rPr>
+              <w:rFonts w:ascii="Cambria Math" w:eastAsiaTheme="minorEastAsia" w:hAnsi="Cambria Math"/>
+            </w:rPr>
+            <m:t>0</m:t>
+          </m:r>
+        </m:oMath>
+      </m:oMathPara>
+    </w:p>
+    <w:p>
+      <w:pPr>
+        <w:rPr>
+          <w:rFonts w:eastAsiaTheme="minorEastAsia"/>
           <w:sz w:val="24"/>
           <w:szCs w:val="24"/>
         </w:rPr>
       </w:pPr>
       <w:bookmarkStart w:id="0" w:name="_GoBack"/>
       <w:bookmarkEnd w:id="0"/>
+    </w:p>
+    <w:p>
+      <w:pPr>
+        <w:rPr>
+          <w:rFonts w:eastAsiaTheme="minorEastAsia"/>
+          <w:sz w:val="24"/>
+          <w:szCs w:val="24"/>
+        </w:rPr>
+      </w:pPr>
     </w:p>
     <w:sectPr>
       <w:pgSz w:w="11906" w:h="16838"/>
@@ -5099,7 +5057,7 @@
   <a:extraClrSchemeLst/>
   <a:extLst>
     <a:ext uri="{05A4C25C-085E-4340-85A3-A5531E510DB2}">
-      <thm15:themeFamily xmlns:thm15="http://schemas.microsoft.com/office/thememl/2012/main" xmlns="" name="Office Theme" id="{62F939B6-93AF-4DB8-9C6B-D6C7DFDC589F}" vid="{4A3C46E8-61CC-4603-A589-7422A47A8E4A}"/>
+      <thm15:themeFamily xmlns="" xmlns:thm15="http://schemas.microsoft.com/office/thememl/2012/main" name="Office Theme" id="{62F939B6-93AF-4DB8-9C6B-D6C7DFDC589F}" vid="{4A3C46E8-61CC-4603-A589-7422A47A8E4A}"/>
     </a:ext>
   </a:extLst>
 </a:theme>
@@ -5110,7 +5068,7 @@
 </file>
 
 <file path=customXml/itemProps1.xml><?xml version="1.0" encoding="utf-8"?>
-<ds:datastoreItem xmlns:ds="http://schemas.openxmlformats.org/officeDocument/2006/customXml" ds:itemID="{A6DC7036-D722-4C18-B78D-97C1686D959D}">
+<ds:datastoreItem xmlns:ds="http://schemas.openxmlformats.org/officeDocument/2006/customXml" ds:itemID="{CF5B44C3-2F81-4636-84B5-D5578B8B6337}">
   <ds:schemaRefs>
     <ds:schemaRef ds:uri="http://schemas.openxmlformats.org/officeDocument/2006/bibliography"/>
   </ds:schemaRefs>

</xml_diff>

<commit_message>
Addition of the geometricalGrowthGrid + biotAndUniformGrid + biotAnsGeometricalGrowthGrid functions and their test in TAeZoSysPro.HeatTransfer.Functions.MeshGrid
</commit_message>
<xml_diff>
--- a/Information/script for equations.docx
+++ b/Information/script for equations.docx
@@ -4214,13 +4214,7 @@
             <w:rPr>
               <w:rFonts w:ascii="Cambria Math" w:eastAsiaTheme="minorEastAsia" w:hAnsi="Cambria Math"/>
             </w:rPr>
-            <m:t>-</m:t>
-          </m:r>
-          <m:r>
-            <w:rPr>
-              <w:rFonts w:ascii="Cambria Math" w:eastAsiaTheme="minorEastAsia" w:hAnsi="Cambria Math"/>
-            </w:rPr>
-            <m:t>x</m:t>
+            <m:t>-x</m:t>
           </m:r>
           <m:d>
             <m:dPr>
@@ -4295,19 +4289,7 @@
             <w:rPr>
               <w:rFonts w:ascii="Cambria Math" w:eastAsiaTheme="minorEastAsia" w:hAnsi="Cambria Math"/>
             </w:rPr>
-            <m:t>x[1]</m:t>
-          </m:r>
-          <m:r>
-            <w:rPr>
-              <w:rFonts w:ascii="Cambria Math" w:eastAsiaTheme="minorEastAsia" w:hAnsi="Cambria Math"/>
-            </w:rPr>
-            <m:t>=</m:t>
-          </m:r>
-          <m:r>
-            <w:rPr>
-              <w:rFonts w:ascii="Cambria Math" w:eastAsiaTheme="minorEastAsia" w:hAnsi="Cambria Math"/>
-            </w:rPr>
-            <m:t>0</m:t>
+            <m:t>x[1]=0</m:t>
           </m:r>
         </m:oMath>
       </m:oMathPara>
@@ -4316,12 +4298,1354 @@
       <w:pPr>
         <w:rPr>
           <w:rFonts w:eastAsiaTheme="minorEastAsia"/>
+        </w:rPr>
+      </w:pPr>
+    </w:p>
+    <w:p>
+      <w:pPr>
+        <w:rPr>
+          <w:rFonts w:eastAsiaTheme="minorEastAsia"/>
+          <w:b/>
+        </w:rPr>
+      </w:pPr>
+      <w:proofErr w:type="spellStart"/>
+      <w:proofErr w:type="gramStart"/>
+      <w:r>
+        <w:rPr>
+          <w:rFonts w:eastAsiaTheme="minorEastAsia"/>
+          <w:b/>
+        </w:rPr>
+        <w:t>geometricalGrowthG</w:t>
+      </w:r>
+      <w:r>
+        <w:rPr>
+          <w:rFonts w:eastAsiaTheme="minorEastAsia"/>
+          <w:b/>
+        </w:rPr>
+        <w:t>rid</w:t>
+      </w:r>
+      <w:proofErr w:type="spellEnd"/>
+      <w:proofErr w:type="gramEnd"/>
+    </w:p>
+    <w:p>
+      <w:pPr>
+        <w:rPr>
+          <w:rFonts w:eastAsiaTheme="minorEastAsia"/>
+          <w:b/>
+        </w:rPr>
+      </w:pPr>
+      <w:r>
+        <w:rPr>
+          <w:rFonts w:eastAsiaTheme="minorEastAsia"/>
+          <w:b/>
+        </w:rPr>
+        <w:lastRenderedPageBreak/>
+        <w:tab/>
+      </w:r>
+      <w:r>
+        <w:rPr>
+          <w:rFonts w:eastAsiaTheme="minorEastAsia"/>
+          <w:b/>
+        </w:rPr>
+        <w:t>Odd</w:t>
+      </w:r>
+      <w:r>
+        <w:rPr>
+          <w:rFonts w:eastAsiaTheme="minorEastAsia"/>
+          <w:b/>
+        </w:rPr>
+        <w:t xml:space="preserve"> number of segments</w:t>
+      </w:r>
+    </w:p>
+    <w:p>
+      <w:pPr>
+        <w:rPr>
+          <w:rFonts w:eastAsiaTheme="minorEastAsia"/>
+        </w:rPr>
+      </w:pPr>
+      <m:oMathPara>
+        <m:oMath>
+          <m:r>
+            <w:rPr>
+              <w:rFonts w:ascii="Cambria Math" w:eastAsiaTheme="minorEastAsia" w:hAnsi="Cambria Math"/>
+            </w:rPr>
+            <m:t>n=</m:t>
+          </m:r>
+          <m:d>
+            <m:dPr>
+              <m:begChr m:val="⌊"/>
+              <m:endChr m:val="⌋"/>
+              <m:ctrlPr>
+                <w:rPr>
+                  <w:rFonts w:ascii="Cambria Math" w:eastAsiaTheme="minorEastAsia" w:hAnsi="Cambria Math"/>
+                  <w:i/>
+                </w:rPr>
+              </m:ctrlPr>
+            </m:dPr>
+            <m:e>
+              <m:r>
+                <w:rPr>
+                  <w:rFonts w:ascii="Cambria Math" w:eastAsiaTheme="minorEastAsia" w:hAnsi="Cambria Math"/>
+                </w:rPr>
+                <m:t>N/2</m:t>
+              </m:r>
+            </m:e>
+          </m:d>
+        </m:oMath>
+      </m:oMathPara>
+    </w:p>
+    <w:p>
+      <w:pPr>
+        <w:rPr>
+          <w:rFonts w:eastAsiaTheme="minorEastAsia"/>
+        </w:rPr>
+      </w:pPr>
+      <m:oMathPara>
+        <m:oMath>
+          <m:r>
+            <w:rPr>
+              <w:rFonts w:ascii="Cambria Math" w:eastAsiaTheme="minorEastAsia" w:hAnsi="Cambria Math"/>
+            </w:rPr>
+            <m:t xml:space="preserve">dx= </m:t>
+          </m:r>
+          <m:f>
+            <m:fPr>
+              <m:ctrlPr>
+                <w:rPr>
+                  <w:rFonts w:ascii="Cambria Math" w:eastAsiaTheme="minorEastAsia" w:hAnsi="Cambria Math"/>
+                  <w:i/>
+                </w:rPr>
+              </m:ctrlPr>
+            </m:fPr>
+            <m:num>
+              <m:r>
+                <w:rPr>
+                  <w:rFonts w:ascii="Cambria Math" w:eastAsiaTheme="minorEastAsia" w:hAnsi="Cambria Math"/>
+                </w:rPr>
+                <m:t>L</m:t>
+              </m:r>
+            </m:num>
+            <m:den>
+              <m:r>
+                <w:rPr>
+                  <w:rFonts w:ascii="Cambria Math" w:eastAsiaTheme="minorEastAsia" w:hAnsi="Cambria Math"/>
+                </w:rPr>
+                <m:t>2×</m:t>
+              </m:r>
+              <m:d>
+                <m:dPr>
+                  <m:ctrlPr>
+                    <w:rPr>
+                      <w:rFonts w:ascii="Cambria Math" w:eastAsiaTheme="minorEastAsia" w:hAnsi="Cambria Math"/>
+                      <w:i/>
+                    </w:rPr>
+                  </m:ctrlPr>
+                </m:dPr>
+                <m:e>
+                  <m:f>
+                    <m:fPr>
+                      <m:ctrlPr>
+                        <w:rPr>
+                          <w:rFonts w:ascii="Cambria Math" w:eastAsiaTheme="minorEastAsia" w:hAnsi="Cambria Math"/>
+                          <w:i/>
+                        </w:rPr>
+                      </m:ctrlPr>
+                    </m:fPr>
+                    <m:num>
+                      <m:r>
+                        <w:rPr>
+                          <w:rFonts w:ascii="Cambria Math" w:eastAsiaTheme="minorEastAsia" w:hAnsi="Cambria Math"/>
+                        </w:rPr>
+                        <m:t>1-</m:t>
+                      </m:r>
+                      <m:sSup>
+                        <m:sSupPr>
+                          <m:ctrlPr>
+                            <w:rPr>
+                              <w:rFonts w:ascii="Cambria Math" w:eastAsiaTheme="minorEastAsia" w:hAnsi="Cambria Math"/>
+                              <w:i/>
+                            </w:rPr>
+                          </m:ctrlPr>
+                        </m:sSupPr>
+                        <m:e>
+                          <m:r>
+                            <w:rPr>
+                              <w:rFonts w:ascii="Cambria Math" w:eastAsiaTheme="minorEastAsia" w:hAnsi="Cambria Math"/>
+                            </w:rPr>
+                            <m:t>q</m:t>
+                          </m:r>
+                        </m:e>
+                        <m:sup>
+                          <m:r>
+                            <w:rPr>
+                              <w:rFonts w:ascii="Cambria Math" w:eastAsiaTheme="minorEastAsia" w:hAnsi="Cambria Math"/>
+                            </w:rPr>
+                            <m:t>n</m:t>
+                          </m:r>
+                        </m:sup>
+                      </m:sSup>
+                    </m:num>
+                    <m:den>
+                      <m:r>
+                        <w:rPr>
+                          <w:rFonts w:ascii="Cambria Math" w:eastAsiaTheme="minorEastAsia" w:hAnsi="Cambria Math"/>
+                        </w:rPr>
+                        <m:t>1-q</m:t>
+                      </m:r>
+                    </m:den>
+                  </m:f>
+                </m:e>
+              </m:d>
+              <m:r>
+                <w:rPr>
+                  <w:rFonts w:ascii="Cambria Math" w:eastAsiaTheme="minorEastAsia" w:hAnsi="Cambria Math"/>
+                </w:rPr>
+                <m:t>+</m:t>
+              </m:r>
+              <m:sSup>
+                <m:sSupPr>
+                  <m:ctrlPr>
+                    <w:rPr>
+                      <w:rFonts w:ascii="Cambria Math" w:eastAsiaTheme="minorEastAsia" w:hAnsi="Cambria Math"/>
+                      <w:i/>
+                    </w:rPr>
+                  </m:ctrlPr>
+                </m:sSupPr>
+                <m:e>
+                  <m:r>
+                    <w:rPr>
+                      <w:rFonts w:ascii="Cambria Math" w:eastAsiaTheme="minorEastAsia" w:hAnsi="Cambria Math"/>
+                    </w:rPr>
+                    <m:t>q</m:t>
+                  </m:r>
+                </m:e>
+                <m:sup>
+                  <m:r>
+                    <w:rPr>
+                      <w:rFonts w:ascii="Cambria Math" w:eastAsiaTheme="minorEastAsia" w:hAnsi="Cambria Math"/>
+                    </w:rPr>
+                    <m:t>n</m:t>
+                  </m:r>
+                </m:sup>
+              </m:sSup>
+            </m:den>
+          </m:f>
+        </m:oMath>
+      </m:oMathPara>
+    </w:p>
+    <w:p>
+      <w:pPr>
+        <w:rPr>
+          <w:rFonts w:eastAsiaTheme="minorEastAsia"/>
+        </w:rPr>
+      </w:pPr>
+      <m:oMathPara>
+        <m:oMath>
+          <m:r>
+            <w:rPr>
+              <w:rFonts w:ascii="Cambria Math" w:eastAsiaTheme="minorEastAsia" w:hAnsi="Cambria Math"/>
+            </w:rPr>
+            <m:t>x</m:t>
+          </m:r>
+          <m:d>
+            <m:dPr>
+              <m:begChr m:val="["/>
+              <m:endChr m:val="]"/>
+              <m:ctrlPr>
+                <w:rPr>
+                  <w:rFonts w:ascii="Cambria Math" w:eastAsiaTheme="minorEastAsia" w:hAnsi="Cambria Math"/>
+                  <w:i/>
+                </w:rPr>
+              </m:ctrlPr>
+            </m:dPr>
+            <m:e>
+              <m:r>
+                <w:rPr>
+                  <w:rFonts w:ascii="Cambria Math" w:eastAsiaTheme="minorEastAsia" w:hAnsi="Cambria Math"/>
+                </w:rPr>
+                <m:t>i+1</m:t>
+              </m:r>
+            </m:e>
+          </m:d>
+          <m:r>
+            <w:rPr>
+              <w:rFonts w:ascii="Cambria Math" w:eastAsiaTheme="minorEastAsia" w:hAnsi="Cambria Math"/>
+            </w:rPr>
+            <m:t>-x</m:t>
+          </m:r>
+          <m:d>
+            <m:dPr>
+              <m:begChr m:val="["/>
+              <m:endChr m:val="]"/>
+              <m:ctrlPr>
+                <w:rPr>
+                  <w:rFonts w:ascii="Cambria Math" w:eastAsiaTheme="minorEastAsia" w:hAnsi="Cambria Math"/>
+                  <w:i/>
+                </w:rPr>
+              </m:ctrlPr>
+            </m:dPr>
+            <m:e>
+              <m:r>
+                <w:rPr>
+                  <w:rFonts w:ascii="Cambria Math" w:eastAsiaTheme="minorEastAsia" w:hAnsi="Cambria Math"/>
+                </w:rPr>
+                <m:t>i</m:t>
+              </m:r>
+            </m:e>
+          </m:d>
+          <m:r>
+            <w:rPr>
+              <w:rFonts w:ascii="Cambria Math" w:eastAsiaTheme="minorEastAsia" w:hAnsi="Cambria Math"/>
+            </w:rPr>
+            <m:t>=</m:t>
+          </m:r>
+          <m:sSup>
+            <m:sSupPr>
+              <m:ctrlPr>
+                <w:rPr>
+                  <w:rFonts w:ascii="Cambria Math" w:eastAsiaTheme="minorEastAsia" w:hAnsi="Cambria Math"/>
+                  <w:i/>
+                </w:rPr>
+              </m:ctrlPr>
+            </m:sSupPr>
+            <m:e>
+              <m:r>
+                <w:rPr>
+                  <w:rFonts w:ascii="Cambria Math" w:eastAsiaTheme="minorEastAsia" w:hAnsi="Cambria Math"/>
+                </w:rPr>
+                <m:t>dx×q</m:t>
+              </m:r>
+            </m:e>
+            <m:sup>
+              <m:r>
+                <w:rPr>
+                  <w:rFonts w:ascii="Cambria Math" w:eastAsiaTheme="minorEastAsia" w:hAnsi="Cambria Math"/>
+                </w:rPr>
+                <m:t>i-1</m:t>
+              </m:r>
+            </m:sup>
+          </m:sSup>
+          <m:r>
+            <w:rPr>
+              <w:rFonts w:ascii="Cambria Math" w:eastAsiaTheme="minorEastAsia" w:hAnsi="Cambria Math"/>
+            </w:rPr>
+            <m:t xml:space="preserve"> for i from 1 to n</m:t>
+          </m:r>
+        </m:oMath>
+      </m:oMathPara>
+    </w:p>
+    <w:p>
+      <w:pPr>
+        <w:rPr>
+          <w:rFonts w:eastAsiaTheme="minorEastAsia"/>
+        </w:rPr>
+      </w:pPr>
+      <m:oMathPara>
+        <m:oMath>
+          <m:r>
+            <w:rPr>
+              <w:rFonts w:ascii="Cambria Math" w:eastAsiaTheme="minorEastAsia" w:hAnsi="Cambria Math"/>
+            </w:rPr>
+            <m:t>x</m:t>
+          </m:r>
+          <m:d>
+            <m:dPr>
+              <m:begChr m:val="["/>
+              <m:endChr m:val="]"/>
+              <m:ctrlPr>
+                <w:rPr>
+                  <w:rFonts w:ascii="Cambria Math" w:eastAsiaTheme="minorEastAsia" w:hAnsi="Cambria Math"/>
+                  <w:i/>
+                </w:rPr>
+              </m:ctrlPr>
+            </m:dPr>
+            <m:e>
+              <m:r>
+                <w:rPr>
+                  <w:rFonts w:ascii="Cambria Math" w:eastAsiaTheme="minorEastAsia" w:hAnsi="Cambria Math"/>
+                </w:rPr>
+                <m:t>i</m:t>
+              </m:r>
+            </m:e>
+          </m:d>
+          <m:r>
+            <w:rPr>
+              <w:rFonts w:ascii="Cambria Math" w:eastAsiaTheme="minorEastAsia" w:hAnsi="Cambria Math"/>
+            </w:rPr>
+            <m:t>=L-x</m:t>
+          </m:r>
+          <m:d>
+            <m:dPr>
+              <m:begChr m:val="["/>
+              <m:endChr m:val="]"/>
+              <m:ctrlPr>
+                <w:rPr>
+                  <w:rFonts w:ascii="Cambria Math" w:eastAsiaTheme="minorEastAsia" w:hAnsi="Cambria Math"/>
+                  <w:i/>
+                </w:rPr>
+              </m:ctrlPr>
+            </m:dPr>
+            <m:e>
+              <m:r>
+                <w:rPr>
+                  <w:rFonts w:ascii="Cambria Math" w:eastAsiaTheme="minorEastAsia" w:hAnsi="Cambria Math"/>
+                </w:rPr>
+                <m:t>N+1-i+1</m:t>
+              </m:r>
+            </m:e>
+          </m:d>
+          <m:r>
+            <w:rPr>
+              <w:rFonts w:ascii="Cambria Math" w:eastAsiaTheme="minorEastAsia" w:hAnsi="Cambria Math"/>
+            </w:rPr>
+            <m:t xml:space="preserve"> for i from n+2 to N+1</m:t>
+          </m:r>
+        </m:oMath>
+      </m:oMathPara>
+    </w:p>
+    <w:p>
+      <w:pPr>
+        <w:rPr>
+          <w:rFonts w:eastAsiaTheme="minorEastAsia"/>
+          <w:b/>
+        </w:rPr>
+      </w:pPr>
+      <m:oMathPara>
+        <m:oMath>
+          <m:r>
+            <w:rPr>
+              <w:rFonts w:ascii="Cambria Math" w:eastAsiaTheme="minorEastAsia" w:hAnsi="Cambria Math"/>
+            </w:rPr>
+            <m:t>x[1]=0</m:t>
+          </m:r>
+        </m:oMath>
+      </m:oMathPara>
+    </w:p>
+    <w:p>
+      <w:pPr>
+        <w:rPr>
+          <w:rFonts w:eastAsiaTheme="minorEastAsia"/>
+        </w:rPr>
+      </w:pPr>
+    </w:p>
+    <w:p>
+      <w:pPr>
+        <w:rPr>
+          <w:rFonts w:eastAsiaTheme="minorEastAsia"/>
+          <w:b/>
+        </w:rPr>
+      </w:pPr>
+      <w:r>
+        <w:rPr>
+          <w:rFonts w:eastAsiaTheme="minorEastAsia"/>
+          <w:b/>
+        </w:rPr>
+        <w:tab/>
+        <w:t>Even</w:t>
+      </w:r>
+      <w:r>
+        <w:rPr>
+          <w:rFonts w:eastAsiaTheme="minorEastAsia"/>
+          <w:b/>
+        </w:rPr>
+        <w:t xml:space="preserve"> number of segments</w:t>
+      </w:r>
+    </w:p>
+    <w:p>
+      <w:pPr>
+        <w:rPr>
+          <w:rFonts w:eastAsiaTheme="minorEastAsia"/>
+        </w:rPr>
+      </w:pPr>
+      <m:oMathPara>
+        <m:oMath>
+          <m:r>
+            <w:rPr>
+              <w:rFonts w:ascii="Cambria Math" w:eastAsiaTheme="minorEastAsia" w:hAnsi="Cambria Math"/>
+            </w:rPr>
+            <m:t>n=</m:t>
+          </m:r>
+          <m:d>
+            <m:dPr>
+              <m:begChr m:val="⌊"/>
+              <m:endChr m:val="⌋"/>
+              <m:ctrlPr>
+                <w:rPr>
+                  <w:rFonts w:ascii="Cambria Math" w:eastAsiaTheme="minorEastAsia" w:hAnsi="Cambria Math"/>
+                  <w:i/>
+                </w:rPr>
+              </m:ctrlPr>
+            </m:dPr>
+            <m:e>
+              <m:r>
+                <w:rPr>
+                  <w:rFonts w:ascii="Cambria Math" w:eastAsiaTheme="minorEastAsia" w:hAnsi="Cambria Math"/>
+                </w:rPr>
+                <m:t>N/2</m:t>
+              </m:r>
+            </m:e>
+          </m:d>
+        </m:oMath>
+      </m:oMathPara>
+    </w:p>
+    <w:p>
+      <w:pPr>
+        <w:rPr>
+          <w:rFonts w:eastAsiaTheme="minorEastAsia"/>
+        </w:rPr>
+      </w:pPr>
+      <m:oMathPara>
+        <m:oMath>
+          <m:r>
+            <w:rPr>
+              <w:rFonts w:ascii="Cambria Math" w:eastAsiaTheme="minorEastAsia" w:hAnsi="Cambria Math"/>
+            </w:rPr>
+            <m:t xml:space="preserve">dx= </m:t>
+          </m:r>
+          <m:f>
+            <m:fPr>
+              <m:ctrlPr>
+                <w:rPr>
+                  <w:rFonts w:ascii="Cambria Math" w:eastAsiaTheme="minorEastAsia" w:hAnsi="Cambria Math"/>
+                  <w:i/>
+                </w:rPr>
+              </m:ctrlPr>
+            </m:fPr>
+            <m:num>
+              <m:f>
+                <m:fPr>
+                  <m:ctrlPr>
+                    <w:rPr>
+                      <w:rFonts w:ascii="Cambria Math" w:eastAsiaTheme="minorEastAsia" w:hAnsi="Cambria Math"/>
+                      <w:i/>
+                    </w:rPr>
+                  </m:ctrlPr>
+                </m:fPr>
+                <m:num>
+                  <m:r>
+                    <w:rPr>
+                      <w:rFonts w:ascii="Cambria Math" w:eastAsiaTheme="minorEastAsia" w:hAnsi="Cambria Math"/>
+                    </w:rPr>
+                    <m:t>L</m:t>
+                  </m:r>
+                </m:num>
+                <m:den>
+                  <m:r>
+                    <w:rPr>
+                      <w:rFonts w:ascii="Cambria Math" w:eastAsiaTheme="minorEastAsia" w:hAnsi="Cambria Math"/>
+                    </w:rPr>
+                    <m:t>2</m:t>
+                  </m:r>
+                </m:den>
+              </m:f>
+            </m:num>
+            <m:den>
+              <m:d>
+                <m:dPr>
+                  <m:ctrlPr>
+                    <w:rPr>
+                      <w:rFonts w:ascii="Cambria Math" w:eastAsiaTheme="minorEastAsia" w:hAnsi="Cambria Math"/>
+                      <w:i/>
+                    </w:rPr>
+                  </m:ctrlPr>
+                </m:dPr>
+                <m:e>
+                  <m:f>
+                    <m:fPr>
+                      <m:ctrlPr>
+                        <w:rPr>
+                          <w:rFonts w:ascii="Cambria Math" w:eastAsiaTheme="minorEastAsia" w:hAnsi="Cambria Math"/>
+                          <w:i/>
+                        </w:rPr>
+                      </m:ctrlPr>
+                    </m:fPr>
+                    <m:num>
+                      <m:r>
+                        <w:rPr>
+                          <w:rFonts w:ascii="Cambria Math" w:eastAsiaTheme="minorEastAsia" w:hAnsi="Cambria Math"/>
+                        </w:rPr>
+                        <m:t>1-</m:t>
+                      </m:r>
+                      <m:sSup>
+                        <m:sSupPr>
+                          <m:ctrlPr>
+                            <w:rPr>
+                              <w:rFonts w:ascii="Cambria Math" w:eastAsiaTheme="minorEastAsia" w:hAnsi="Cambria Math"/>
+                              <w:i/>
+                            </w:rPr>
+                          </m:ctrlPr>
+                        </m:sSupPr>
+                        <m:e>
+                          <m:r>
+                            <w:rPr>
+                              <w:rFonts w:ascii="Cambria Math" w:eastAsiaTheme="minorEastAsia" w:hAnsi="Cambria Math"/>
+                            </w:rPr>
+                            <m:t>q</m:t>
+                          </m:r>
+                        </m:e>
+                        <m:sup>
+                          <m:r>
+                            <w:rPr>
+                              <w:rFonts w:ascii="Cambria Math" w:eastAsiaTheme="minorEastAsia" w:hAnsi="Cambria Math"/>
+                            </w:rPr>
+                            <m:t>n</m:t>
+                          </m:r>
+                        </m:sup>
+                      </m:sSup>
+                    </m:num>
+                    <m:den>
+                      <m:r>
+                        <w:rPr>
+                          <w:rFonts w:ascii="Cambria Math" w:eastAsiaTheme="minorEastAsia" w:hAnsi="Cambria Math"/>
+                        </w:rPr>
+                        <m:t>1-q</m:t>
+                      </m:r>
+                    </m:den>
+                  </m:f>
+                </m:e>
+              </m:d>
+            </m:den>
+          </m:f>
+        </m:oMath>
+      </m:oMathPara>
+    </w:p>
+    <w:p>
+      <w:pPr>
+        <w:rPr>
+          <w:rFonts w:eastAsiaTheme="minorEastAsia"/>
+        </w:rPr>
+      </w:pPr>
+      <m:oMathPara>
+        <m:oMath>
+          <m:r>
+            <w:rPr>
+              <w:rFonts w:ascii="Cambria Math" w:eastAsiaTheme="minorEastAsia" w:hAnsi="Cambria Math"/>
+            </w:rPr>
+            <m:t>x</m:t>
+          </m:r>
+          <m:d>
+            <m:dPr>
+              <m:begChr m:val="["/>
+              <m:endChr m:val="]"/>
+              <m:ctrlPr>
+                <w:rPr>
+                  <w:rFonts w:ascii="Cambria Math" w:eastAsiaTheme="minorEastAsia" w:hAnsi="Cambria Math"/>
+                  <w:i/>
+                </w:rPr>
+              </m:ctrlPr>
+            </m:dPr>
+            <m:e>
+              <m:r>
+                <w:rPr>
+                  <w:rFonts w:ascii="Cambria Math" w:eastAsiaTheme="minorEastAsia" w:hAnsi="Cambria Math"/>
+                </w:rPr>
+                <m:t>i+1</m:t>
+              </m:r>
+            </m:e>
+          </m:d>
+          <m:r>
+            <w:rPr>
+              <w:rFonts w:ascii="Cambria Math" w:eastAsiaTheme="minorEastAsia" w:hAnsi="Cambria Math"/>
+            </w:rPr>
+            <m:t>-x</m:t>
+          </m:r>
+          <m:d>
+            <m:dPr>
+              <m:begChr m:val="["/>
+              <m:endChr m:val="]"/>
+              <m:ctrlPr>
+                <w:rPr>
+                  <w:rFonts w:ascii="Cambria Math" w:eastAsiaTheme="minorEastAsia" w:hAnsi="Cambria Math"/>
+                  <w:i/>
+                </w:rPr>
+              </m:ctrlPr>
+            </m:dPr>
+            <m:e>
+              <m:r>
+                <w:rPr>
+                  <w:rFonts w:ascii="Cambria Math" w:eastAsiaTheme="minorEastAsia" w:hAnsi="Cambria Math"/>
+                </w:rPr>
+                <m:t>i</m:t>
+              </m:r>
+            </m:e>
+          </m:d>
+          <m:r>
+            <w:rPr>
+              <w:rFonts w:ascii="Cambria Math" w:eastAsiaTheme="minorEastAsia" w:hAnsi="Cambria Math"/>
+            </w:rPr>
+            <m:t>=</m:t>
+          </m:r>
+          <m:sSup>
+            <m:sSupPr>
+              <m:ctrlPr>
+                <w:rPr>
+                  <w:rFonts w:ascii="Cambria Math" w:eastAsiaTheme="minorEastAsia" w:hAnsi="Cambria Math"/>
+                  <w:i/>
+                </w:rPr>
+              </m:ctrlPr>
+            </m:sSupPr>
+            <m:e>
+              <m:r>
+                <w:rPr>
+                  <w:rFonts w:ascii="Cambria Math" w:eastAsiaTheme="minorEastAsia" w:hAnsi="Cambria Math"/>
+                </w:rPr>
+                <m:t>dx×q</m:t>
+              </m:r>
+            </m:e>
+            <m:sup>
+              <m:r>
+                <w:rPr>
+                  <w:rFonts w:ascii="Cambria Math" w:eastAsiaTheme="minorEastAsia" w:hAnsi="Cambria Math"/>
+                </w:rPr>
+                <m:t>i-1</m:t>
+              </m:r>
+            </m:sup>
+          </m:sSup>
+          <m:r>
+            <w:rPr>
+              <w:rFonts w:ascii="Cambria Math" w:eastAsiaTheme="minorEastAsia" w:hAnsi="Cambria Math"/>
+            </w:rPr>
+            <m:t xml:space="preserve"> for i from 1 to n</m:t>
+          </m:r>
+        </m:oMath>
+      </m:oMathPara>
+    </w:p>
+    <w:p>
+      <w:pPr>
+        <w:rPr>
+          <w:rFonts w:eastAsiaTheme="minorEastAsia"/>
+        </w:rPr>
+      </w:pPr>
+      <m:oMathPara>
+        <m:oMath>
+          <m:r>
+            <w:rPr>
+              <w:rFonts w:ascii="Cambria Math" w:eastAsiaTheme="minorEastAsia" w:hAnsi="Cambria Math"/>
+            </w:rPr>
+            <m:t>x</m:t>
+          </m:r>
+          <m:d>
+            <m:dPr>
+              <m:begChr m:val="["/>
+              <m:endChr m:val="]"/>
+              <m:ctrlPr>
+                <w:rPr>
+                  <w:rFonts w:ascii="Cambria Math" w:eastAsiaTheme="minorEastAsia" w:hAnsi="Cambria Math"/>
+                  <w:i/>
+                </w:rPr>
+              </m:ctrlPr>
+            </m:dPr>
+            <m:e>
+              <m:r>
+                <w:rPr>
+                  <w:rFonts w:ascii="Cambria Math" w:eastAsiaTheme="minorEastAsia" w:hAnsi="Cambria Math"/>
+                </w:rPr>
+                <m:t>i+1</m:t>
+              </m:r>
+            </m:e>
+          </m:d>
+          <m:r>
+            <w:rPr>
+              <w:rFonts w:ascii="Cambria Math" w:eastAsiaTheme="minorEastAsia" w:hAnsi="Cambria Math"/>
+            </w:rPr>
+            <m:t>=L-x</m:t>
+          </m:r>
+          <m:d>
+            <m:dPr>
+              <m:begChr m:val="["/>
+              <m:endChr m:val="]"/>
+              <m:ctrlPr>
+                <w:rPr>
+                  <w:rFonts w:ascii="Cambria Math" w:eastAsiaTheme="minorEastAsia" w:hAnsi="Cambria Math"/>
+                  <w:i/>
+                </w:rPr>
+              </m:ctrlPr>
+            </m:dPr>
+            <m:e>
+              <m:r>
+                <w:rPr>
+                  <w:rFonts w:ascii="Cambria Math" w:eastAsiaTheme="minorEastAsia" w:hAnsi="Cambria Math"/>
+                </w:rPr>
+                <m:t>N-i+1</m:t>
+              </m:r>
+            </m:e>
+          </m:d>
+          <m:r>
+            <w:rPr>
+              <w:rFonts w:ascii="Cambria Math" w:eastAsiaTheme="minorEastAsia" w:hAnsi="Cambria Math"/>
+            </w:rPr>
+            <m:t xml:space="preserve"> for i from n+1 to N</m:t>
+          </m:r>
+        </m:oMath>
+      </m:oMathPara>
+    </w:p>
+    <w:p>
+      <w:pPr>
+        <w:rPr>
+          <w:rFonts w:eastAsiaTheme="minorEastAsia"/>
+          <w:b/>
+        </w:rPr>
+      </w:pPr>
+      <m:oMathPara>
+        <m:oMath>
+          <m:r>
+            <w:rPr>
+              <w:rFonts w:ascii="Cambria Math" w:eastAsiaTheme="minorEastAsia" w:hAnsi="Cambria Math"/>
+            </w:rPr>
+            <m:t>x[1]=0</m:t>
+          </m:r>
+        </m:oMath>
+      </m:oMathPara>
+    </w:p>
+    <w:p>
+      <w:pPr>
+        <w:rPr>
+          <w:rFonts w:eastAsiaTheme="minorEastAsia"/>
+        </w:rPr>
+      </w:pPr>
+    </w:p>
+    <w:p>
+      <w:pPr>
+        <w:rPr>
+          <w:rFonts w:eastAsiaTheme="minorEastAsia"/>
+          <w:b/>
+        </w:rPr>
+      </w:pPr>
+      <w:r>
+        <w:rPr>
+          <w:rFonts w:eastAsiaTheme="minorEastAsia"/>
+          <w:b/>
+        </w:rPr>
+        <w:tab/>
+        <w:t>Non symmetrical</w:t>
+      </w:r>
+      <w:r>
+        <w:rPr>
+          <w:rFonts w:eastAsiaTheme="minorEastAsia"/>
+          <w:b/>
+        </w:rPr>
+        <w:t xml:space="preserve"> number of segments</w:t>
+      </w:r>
+    </w:p>
+    <w:p>
+      <w:pPr>
+        <w:rPr>
+          <w:rFonts w:eastAsiaTheme="minorEastAsia"/>
+        </w:rPr>
+      </w:pPr>
+      <m:oMathPara>
+        <m:oMath>
+          <m:r>
+            <w:rPr>
+              <w:rFonts w:ascii="Cambria Math" w:eastAsiaTheme="minorEastAsia" w:hAnsi="Cambria Math"/>
+            </w:rPr>
+            <m:t xml:space="preserve">dx= </m:t>
+          </m:r>
+          <m:f>
+            <m:fPr>
+              <m:ctrlPr>
+                <w:rPr>
+                  <w:rFonts w:ascii="Cambria Math" w:eastAsiaTheme="minorEastAsia" w:hAnsi="Cambria Math"/>
+                  <w:i/>
+                </w:rPr>
+              </m:ctrlPr>
+            </m:fPr>
+            <m:num>
+              <m:r>
+                <w:rPr>
+                  <w:rFonts w:ascii="Cambria Math" w:eastAsiaTheme="minorEastAsia" w:hAnsi="Cambria Math"/>
+                </w:rPr>
+                <m:t>L</m:t>
+              </m:r>
+            </m:num>
+            <m:den>
+              <m:d>
+                <m:dPr>
+                  <m:ctrlPr>
+                    <w:rPr>
+                      <w:rFonts w:ascii="Cambria Math" w:eastAsiaTheme="minorEastAsia" w:hAnsi="Cambria Math"/>
+                      <w:i/>
+                    </w:rPr>
+                  </m:ctrlPr>
+                </m:dPr>
+                <m:e>
+                  <m:f>
+                    <m:fPr>
+                      <m:ctrlPr>
+                        <w:rPr>
+                          <w:rFonts w:ascii="Cambria Math" w:eastAsiaTheme="minorEastAsia" w:hAnsi="Cambria Math"/>
+                          <w:i/>
+                        </w:rPr>
+                      </m:ctrlPr>
+                    </m:fPr>
+                    <m:num>
+                      <m:r>
+                        <w:rPr>
+                          <w:rFonts w:ascii="Cambria Math" w:eastAsiaTheme="minorEastAsia" w:hAnsi="Cambria Math"/>
+                        </w:rPr>
+                        <m:t>1-</m:t>
+                      </m:r>
+                      <m:sSup>
+                        <m:sSupPr>
+                          <m:ctrlPr>
+                            <w:rPr>
+                              <w:rFonts w:ascii="Cambria Math" w:eastAsiaTheme="minorEastAsia" w:hAnsi="Cambria Math"/>
+                              <w:i/>
+                            </w:rPr>
+                          </m:ctrlPr>
+                        </m:sSupPr>
+                        <m:e>
+                          <m:r>
+                            <w:rPr>
+                              <w:rFonts w:ascii="Cambria Math" w:eastAsiaTheme="minorEastAsia" w:hAnsi="Cambria Math"/>
+                            </w:rPr>
+                            <m:t>q</m:t>
+                          </m:r>
+                        </m:e>
+                        <m:sup>
+                          <m:r>
+                            <w:rPr>
+                              <w:rFonts w:ascii="Cambria Math" w:eastAsiaTheme="minorEastAsia" w:hAnsi="Cambria Math"/>
+                            </w:rPr>
+                            <m:t>N</m:t>
+                          </m:r>
+                        </m:sup>
+                      </m:sSup>
+                    </m:num>
+                    <m:den>
+                      <m:r>
+                        <w:rPr>
+                          <w:rFonts w:ascii="Cambria Math" w:eastAsiaTheme="minorEastAsia" w:hAnsi="Cambria Math"/>
+                        </w:rPr>
+                        <m:t>1-q</m:t>
+                      </m:r>
+                    </m:den>
+                  </m:f>
+                </m:e>
+              </m:d>
+            </m:den>
+          </m:f>
+        </m:oMath>
+      </m:oMathPara>
+    </w:p>
+    <w:p>
+      <w:pPr>
+        <w:rPr>
+          <w:rFonts w:eastAsiaTheme="minorEastAsia"/>
+        </w:rPr>
+      </w:pPr>
+      <m:oMathPara>
+        <m:oMath>
+          <m:r>
+            <w:rPr>
+              <w:rFonts w:ascii="Cambria Math" w:eastAsiaTheme="minorEastAsia" w:hAnsi="Cambria Math"/>
+            </w:rPr>
+            <m:t>x</m:t>
+          </m:r>
+          <m:d>
+            <m:dPr>
+              <m:begChr m:val="["/>
+              <m:endChr m:val="]"/>
+              <m:ctrlPr>
+                <w:rPr>
+                  <w:rFonts w:ascii="Cambria Math" w:eastAsiaTheme="minorEastAsia" w:hAnsi="Cambria Math"/>
+                  <w:i/>
+                </w:rPr>
+              </m:ctrlPr>
+            </m:dPr>
+            <m:e>
+              <m:r>
+                <w:rPr>
+                  <w:rFonts w:ascii="Cambria Math" w:eastAsiaTheme="minorEastAsia" w:hAnsi="Cambria Math"/>
+                </w:rPr>
+                <m:t>i+1</m:t>
+              </m:r>
+            </m:e>
+          </m:d>
+          <m:r>
+            <w:rPr>
+              <w:rFonts w:ascii="Cambria Math" w:eastAsiaTheme="minorEastAsia" w:hAnsi="Cambria Math"/>
+            </w:rPr>
+            <m:t>-x</m:t>
+          </m:r>
+          <m:d>
+            <m:dPr>
+              <m:begChr m:val="["/>
+              <m:endChr m:val="]"/>
+              <m:ctrlPr>
+                <w:rPr>
+                  <w:rFonts w:ascii="Cambria Math" w:eastAsiaTheme="minorEastAsia" w:hAnsi="Cambria Math"/>
+                  <w:i/>
+                </w:rPr>
+              </m:ctrlPr>
+            </m:dPr>
+            <m:e>
+              <m:r>
+                <w:rPr>
+                  <w:rFonts w:ascii="Cambria Math" w:eastAsiaTheme="minorEastAsia" w:hAnsi="Cambria Math"/>
+                </w:rPr>
+                <m:t>i</m:t>
+              </m:r>
+            </m:e>
+          </m:d>
+          <m:r>
+            <w:rPr>
+              <w:rFonts w:ascii="Cambria Math" w:eastAsiaTheme="minorEastAsia" w:hAnsi="Cambria Math"/>
+            </w:rPr>
+            <m:t>=</m:t>
+          </m:r>
+          <m:sSup>
+            <m:sSupPr>
+              <m:ctrlPr>
+                <w:rPr>
+                  <w:rFonts w:ascii="Cambria Math" w:eastAsiaTheme="minorEastAsia" w:hAnsi="Cambria Math"/>
+                  <w:i/>
+                </w:rPr>
+              </m:ctrlPr>
+            </m:sSupPr>
+            <m:e>
+              <m:r>
+                <w:rPr>
+                  <w:rFonts w:ascii="Cambria Math" w:eastAsiaTheme="minorEastAsia" w:hAnsi="Cambria Math"/>
+                </w:rPr>
+                <m:t>dx×q</m:t>
+              </m:r>
+            </m:e>
+            <m:sup>
+              <m:r>
+                <w:rPr>
+                  <w:rFonts w:ascii="Cambria Math" w:eastAsiaTheme="minorEastAsia" w:hAnsi="Cambria Math"/>
+                </w:rPr>
+                <m:t>i-1</m:t>
+              </m:r>
+            </m:sup>
+          </m:sSup>
+          <m:r>
+            <w:rPr>
+              <w:rFonts w:ascii="Cambria Math" w:eastAsiaTheme="minorEastAsia" w:hAnsi="Cambria Math"/>
+            </w:rPr>
+            <m:t xml:space="preserve"> for i from 1 to N</m:t>
+          </m:r>
+        </m:oMath>
+      </m:oMathPara>
+    </w:p>
+    <w:p>
+      <w:pPr>
+        <w:rPr>
+          <w:rFonts w:eastAsiaTheme="minorEastAsia"/>
+          <w:b/>
+        </w:rPr>
+      </w:pPr>
+      <m:oMathPara>
+        <m:oMath>
+          <m:r>
+            <w:rPr>
+              <w:rFonts w:ascii="Cambria Math" w:eastAsiaTheme="minorEastAsia" w:hAnsi="Cambria Math"/>
+            </w:rPr>
+            <m:t>x[1]=0</m:t>
+          </m:r>
+        </m:oMath>
+      </m:oMathPara>
+    </w:p>
+    <w:p>
+      <w:pPr>
+        <w:rPr>
+          <w:rFonts w:eastAsiaTheme="minorEastAsia"/>
+          <w:b/>
+        </w:rPr>
+      </w:pPr>
+      <w:proofErr w:type="spellStart"/>
+      <w:proofErr w:type="gramStart"/>
+      <w:r>
+        <w:rPr>
+          <w:rFonts w:eastAsiaTheme="minorEastAsia"/>
+          <w:b/>
+        </w:rPr>
+        <w:t>biotAndU</w:t>
+      </w:r>
+      <w:r>
+        <w:rPr>
+          <w:rFonts w:eastAsiaTheme="minorEastAsia"/>
+          <w:b/>
+        </w:rPr>
+        <w:t>niformGrid</w:t>
+      </w:r>
+      <w:proofErr w:type="spellEnd"/>
+      <w:proofErr w:type="gramEnd"/>
+    </w:p>
+    <w:p>
+      <w:pPr>
+        <w:rPr>
+          <w:rFonts w:eastAsiaTheme="minorEastAsia"/>
+        </w:rPr>
+      </w:pPr>
+      <m:oMathPara>
+        <m:oMath>
+          <m:r>
+            <w:rPr>
+              <w:rFonts w:ascii="Cambria Math" w:eastAsiaTheme="minorEastAsia" w:hAnsi="Cambria Math"/>
+            </w:rPr>
+            <m:t xml:space="preserve">dx= </m:t>
+          </m:r>
+          <m:r>
+            <w:rPr>
+              <w:rFonts w:ascii="Cambria Math" w:eastAsiaTheme="minorEastAsia" w:hAnsi="Cambria Math"/>
+            </w:rPr>
+            <m:t>Biot×</m:t>
+          </m:r>
+          <m:f>
+            <m:fPr>
+              <m:ctrlPr>
+                <w:rPr>
+                  <w:rFonts w:ascii="Cambria Math" w:eastAsiaTheme="minorEastAsia" w:hAnsi="Cambria Math"/>
+                  <w:i/>
+                </w:rPr>
+              </m:ctrlPr>
+            </m:fPr>
+            <m:num>
+              <m:r>
+                <w:rPr>
+                  <w:rFonts w:ascii="Cambria Math" w:eastAsiaTheme="minorEastAsia" w:hAnsi="Cambria Math"/>
+                </w:rPr>
+                <m:t>λ</m:t>
+              </m:r>
+            </m:num>
+            <m:den>
+              <m:r>
+                <w:rPr>
+                  <w:rFonts w:ascii="Cambria Math" w:eastAsiaTheme="minorEastAsia" w:hAnsi="Cambria Math"/>
+                </w:rPr>
+                <m:t>h</m:t>
+              </m:r>
+            </m:den>
+          </m:f>
+        </m:oMath>
+      </m:oMathPara>
+    </w:p>
+    <w:p>
+      <w:pPr>
+        <w:rPr>
+          <w:rFonts w:eastAsiaTheme="minorEastAsia"/>
+        </w:rPr>
+      </w:pPr>
+      <m:oMathPara>
+        <m:oMath>
+          <m:r>
+            <w:rPr>
+              <w:rFonts w:ascii="Cambria Math" w:eastAsiaTheme="minorEastAsia" w:hAnsi="Cambria Math"/>
+            </w:rPr>
+            <m:t>x[1]=0</m:t>
+          </m:r>
+        </m:oMath>
+      </m:oMathPara>
+    </w:p>
+    <w:p>
+      <w:pPr>
+        <w:rPr>
+          <w:rFonts w:eastAsiaTheme="minorEastAsia"/>
+        </w:rPr>
+      </w:pPr>
+      <m:oMathPara>
+        <m:oMath>
+          <m:r>
+            <w:rPr>
+              <w:rFonts w:ascii="Cambria Math" w:eastAsiaTheme="minorEastAsia" w:hAnsi="Cambria Math"/>
+            </w:rPr>
+            <m:t>x</m:t>
+          </m:r>
+          <m:r>
+            <w:rPr>
+              <w:rFonts w:ascii="Cambria Math" w:eastAsiaTheme="minorEastAsia" w:hAnsi="Cambria Math"/>
+            </w:rPr>
+            <m:t>[2]=dx</m:t>
+          </m:r>
+        </m:oMath>
+      </m:oMathPara>
+    </w:p>
+    <w:p>
+      <w:pPr>
+        <w:rPr>
+          <w:rFonts w:eastAsiaTheme="minorEastAsia"/>
+        </w:rPr>
+      </w:pPr>
+      <m:oMathPara>
+        <m:oMath>
+          <m:r>
+            <w:rPr>
+              <w:rFonts w:ascii="Cambria Math" w:eastAsiaTheme="minorEastAsia" w:hAnsi="Cambria Math"/>
+            </w:rPr>
+            <m:t>x</m:t>
+          </m:r>
+          <m:d>
+            <m:dPr>
+              <m:begChr m:val="["/>
+              <m:endChr m:val="]"/>
+              <m:ctrlPr>
+                <w:rPr>
+                  <w:rFonts w:ascii="Cambria Math" w:eastAsiaTheme="minorEastAsia" w:hAnsi="Cambria Math"/>
+                  <w:i/>
+                </w:rPr>
+              </m:ctrlPr>
+            </m:dPr>
+            <m:e>
+              <m:r>
+                <w:rPr>
+                  <w:rFonts w:ascii="Cambria Math" w:eastAsiaTheme="minorEastAsia" w:hAnsi="Cambria Math"/>
+                </w:rPr>
+                <m:t>N+1</m:t>
+              </m:r>
+            </m:e>
+          </m:d>
+          <m:r>
+            <w:rPr>
+              <w:rFonts w:ascii="Cambria Math" w:eastAsiaTheme="minorEastAsia" w:hAnsi="Cambria Math"/>
+            </w:rPr>
+            <m:t>=</m:t>
+          </m:r>
+          <m:r>
+            <w:rPr>
+              <w:rFonts w:ascii="Cambria Math" w:eastAsiaTheme="minorEastAsia" w:hAnsi="Cambria Math"/>
+            </w:rPr>
+            <m:t>L-dx</m:t>
+          </m:r>
+        </m:oMath>
+      </m:oMathPara>
+    </w:p>
+    <w:p>
+      <w:pPr>
+        <w:rPr>
+          <w:rFonts w:eastAsiaTheme="minorEastAsia"/>
+        </w:rPr>
+      </w:pPr>
+      <w:bookmarkStart w:id="0" w:name="_GoBack"/>
+      <w:bookmarkEnd w:id="0"/>
+      <m:oMathPara>
+        <m:oMath>
+          <m:r>
+            <w:rPr>
+              <w:rFonts w:ascii="Cambria Math" w:eastAsiaTheme="minorEastAsia" w:hAnsi="Cambria Math"/>
+            </w:rPr>
+            <m:t xml:space="preserve"> x</m:t>
+          </m:r>
+          <m:d>
+            <m:dPr>
+              <m:begChr m:val="["/>
+              <m:endChr m:val="]"/>
+              <m:ctrlPr>
+                <w:rPr>
+                  <w:rFonts w:ascii="Cambria Math" w:eastAsiaTheme="minorEastAsia" w:hAnsi="Cambria Math"/>
+                  <w:i/>
+                </w:rPr>
+              </m:ctrlPr>
+            </m:dPr>
+            <m:e>
+              <m:r>
+                <w:rPr>
+                  <w:rFonts w:ascii="Cambria Math" w:eastAsiaTheme="minorEastAsia" w:hAnsi="Cambria Math"/>
+                </w:rPr>
+                <m:t>i+1</m:t>
+              </m:r>
+            </m:e>
+          </m:d>
+          <m:r>
+            <w:rPr>
+              <w:rFonts w:ascii="Cambria Math" w:eastAsiaTheme="minorEastAsia" w:hAnsi="Cambria Math"/>
+            </w:rPr>
+            <m:t>-x</m:t>
+          </m:r>
+          <m:d>
+            <m:dPr>
+              <m:begChr m:val="["/>
+              <m:endChr m:val="]"/>
+              <m:ctrlPr>
+                <w:rPr>
+                  <w:rFonts w:ascii="Cambria Math" w:eastAsiaTheme="minorEastAsia" w:hAnsi="Cambria Math"/>
+                  <w:i/>
+                </w:rPr>
+              </m:ctrlPr>
+            </m:dPr>
+            <m:e>
+              <m:r>
+                <w:rPr>
+                  <w:rFonts w:ascii="Cambria Math" w:eastAsiaTheme="minorEastAsia" w:hAnsi="Cambria Math"/>
+                </w:rPr>
+                <m:t>i</m:t>
+              </m:r>
+            </m:e>
+          </m:d>
+          <m:r>
+            <w:rPr>
+              <w:rFonts w:ascii="Cambria Math" w:eastAsiaTheme="minorEastAsia" w:hAnsi="Cambria Math"/>
+            </w:rPr>
+            <m:t>=</m:t>
+          </m:r>
+          <m:f>
+            <m:fPr>
+              <m:ctrlPr>
+                <w:rPr>
+                  <w:rFonts w:ascii="Cambria Math" w:eastAsiaTheme="minorEastAsia" w:hAnsi="Cambria Math"/>
+                  <w:i/>
+                </w:rPr>
+              </m:ctrlPr>
+            </m:fPr>
+            <m:num>
+              <m:r>
+                <w:rPr>
+                  <w:rFonts w:ascii="Cambria Math" w:eastAsiaTheme="minorEastAsia" w:hAnsi="Cambria Math"/>
+                </w:rPr>
+                <m:t>L</m:t>
+              </m:r>
+              <m:r>
+                <w:rPr>
+                  <w:rFonts w:ascii="Cambria Math" w:eastAsiaTheme="minorEastAsia" w:hAnsi="Cambria Math"/>
+                </w:rPr>
+                <m:t>-2×dx</m:t>
+              </m:r>
+            </m:num>
+            <m:den>
+              <m:r>
+                <w:rPr>
+                  <w:rFonts w:ascii="Cambria Math" w:eastAsiaTheme="minorEastAsia" w:hAnsi="Cambria Math"/>
+                </w:rPr>
+                <m:t>N</m:t>
+              </m:r>
+            </m:den>
+          </m:f>
+          <m:r>
+            <w:rPr>
+              <w:rFonts w:ascii="Cambria Math" w:eastAsiaTheme="minorEastAsia" w:hAnsi="Cambria Math"/>
+            </w:rPr>
+            <m:t xml:space="preserve"> for i from</m:t>
+          </m:r>
+          <m:r>
+            <w:rPr>
+              <w:rFonts w:ascii="Cambria Math" w:eastAsiaTheme="minorEastAsia" w:hAnsi="Cambria Math"/>
+            </w:rPr>
+            <m:t xml:space="preserve"> 2</m:t>
+          </m:r>
+          <m:r>
+            <w:rPr>
+              <w:rFonts w:ascii="Cambria Math" w:eastAsiaTheme="minorEastAsia" w:hAnsi="Cambria Math"/>
+            </w:rPr>
+            <m:t xml:space="preserve"> to N</m:t>
+          </m:r>
+          <m:r>
+            <w:rPr>
+              <w:rFonts w:ascii="Cambria Math" w:eastAsiaTheme="minorEastAsia" w:hAnsi="Cambria Math"/>
+            </w:rPr>
+            <m:t>-1</m:t>
+          </m:r>
+        </m:oMath>
+      </m:oMathPara>
+    </w:p>
+    <w:p>
+      <w:pPr>
+        <w:rPr>
+          <w:rFonts w:eastAsiaTheme="minorEastAsia"/>
           <w:sz w:val="24"/>
           <w:szCs w:val="24"/>
         </w:rPr>
       </w:pPr>
-      <w:bookmarkStart w:id="0" w:name="_GoBack"/>
-      <w:bookmarkEnd w:id="0"/>
     </w:p>
     <w:p>
       <w:pPr>
@@ -5057,7 +6381,7 @@
   <a:extraClrSchemeLst/>
   <a:extLst>
     <a:ext uri="{05A4C25C-085E-4340-85A3-A5531E510DB2}">
-      <thm15:themeFamily xmlns="" xmlns:thm15="http://schemas.microsoft.com/office/thememl/2012/main" name="Office Theme" id="{62F939B6-93AF-4DB8-9C6B-D6C7DFDC589F}" vid="{4A3C46E8-61CC-4603-A589-7422A47A8E4A}"/>
+      <thm15:themeFamily xmlns:thm15="http://schemas.microsoft.com/office/thememl/2012/main" xmlns="" name="Office Theme" id="{62F939B6-93AF-4DB8-9C6B-D6C7DFDC589F}" vid="{4A3C46E8-61CC-4603-A589-7422A47A8E4A}"/>
     </a:ext>
   </a:extLst>
 </a:theme>
@@ -5068,7 +6392,7 @@
 </file>
 
 <file path=customXml/itemProps1.xml><?xml version="1.0" encoding="utf-8"?>
-<ds:datastoreItem xmlns:ds="http://schemas.openxmlformats.org/officeDocument/2006/customXml" ds:itemID="{CF5B44C3-2F81-4636-84B5-D5578B8B6337}">
+<ds:datastoreItem xmlns:ds="http://schemas.openxmlformats.org/officeDocument/2006/customXml" ds:itemID="{75891CC6-2B04-4447-8229-B06553295C55}">
   <ds:schemaRefs>
     <ds:schemaRef ds:uri="http://schemas.openxmlformats.org/officeDocument/2006/bibliography"/>
   </ds:schemaRefs>

</xml_diff>

<commit_message>
Addition of the HeatExchanger module in HeatTransfer.Components + addition of counterCurrent function in HeatTransfer.Functions.ExchangerEffectiveness + addition of the NTU_counterCurrent function that is used as the inverse of the counterCurrent
</commit_message>
<xml_diff>
--- a/Information/script for equations.docx
+++ b/Information/script for equations.docx
@@ -1958,7 +1958,13 @@
             <w:rPr>
               <w:rFonts w:ascii="Cambria Math" w:eastAsiaTheme="minorEastAsia" w:hAnsi="Cambria Math"/>
             </w:rPr>
-            <m:t>Q_flow=add_on×</m:t>
+            <m:t>Q_flow=ad</m:t>
+          </m:r>
+          <m:r>
+            <w:rPr>
+              <w:rFonts w:ascii="Cambria Math" w:eastAsiaTheme="minorEastAsia" w:hAnsi="Cambria Math"/>
+            </w:rPr>
+            <m:t>d_on×</m:t>
           </m:r>
           <m:f>
             <m:fPr>
@@ -3448,8 +3454,6 @@
           <w:rFonts w:eastAsiaTheme="minorEastAsia"/>
         </w:rPr>
       </w:pPr>
-      <w:bookmarkStart w:id="9" w:name="_GoBack"/>
-      <w:bookmarkEnd w:id="9"/>
     </w:p>
     <w:p>
       <w:pPr>
@@ -3480,13 +3484,7 @@
             <w:rPr>
               <w:rFonts w:ascii="Cambria Math" w:eastAsiaTheme="minorEastAsia" w:hAnsi="Cambria Math"/>
             </w:rPr>
-            <m:t>N=</m:t>
-          </m:r>
-          <m:r>
-            <w:rPr>
-              <w:rFonts w:ascii="Cambria Math" w:eastAsiaTheme="minorEastAsia" w:hAnsi="Cambria Math"/>
-            </w:rPr>
-            <m:t>min</m:t>
+            <m:t>N=min</m:t>
           </m:r>
           <m:d>
             <m:dPr>
@@ -3502,13 +3500,7 @@
                 <w:rPr>
                   <w:rFonts w:ascii="Cambria Math" w:eastAsiaTheme="minorEastAsia" w:hAnsi="Cambria Math"/>
                 </w:rPr>
-                <m:t xml:space="preserve">2, </m:t>
-              </m:r>
-              <m:r>
-                <w:rPr>
-                  <w:rFonts w:ascii="Cambria Math" w:eastAsiaTheme="minorEastAsia" w:hAnsi="Cambria Math"/>
-                </w:rPr>
-                <m:t>5×</m:t>
+                <m:t>2, 5×</m:t>
               </m:r>
               <m:f>
                 <m:fPr>
@@ -3627,7 +3619,7 @@
           <w:lang w:val="fr-FR"/>
         </w:rPr>
       </w:pPr>
-      <w:bookmarkStart w:id="10" w:name="_Toc37080182"/>
+      <w:bookmarkStart w:id="9" w:name="_Toc37080182"/>
       <w:proofErr w:type="spellStart"/>
       <w:r>
         <w:rPr>
@@ -3637,7 +3629,7 @@
         <w:lastRenderedPageBreak/>
         <w:t>Functions</w:t>
       </w:r>
-      <w:bookmarkEnd w:id="10"/>
+      <w:bookmarkEnd w:id="9"/>
       <w:proofErr w:type="spellEnd"/>
     </w:p>
     <w:p>
@@ -3654,7 +3646,7 @@
           <w:rFonts w:eastAsiaTheme="minorEastAsia"/>
         </w:rPr>
       </w:pPr>
-      <w:bookmarkStart w:id="11" w:name="_Toc37080183"/>
+      <w:bookmarkStart w:id="10" w:name="_Toc37080183"/>
       <w:proofErr w:type="spellStart"/>
       <w:r>
         <w:rPr>
@@ -3662,7 +3654,7 @@
         </w:rPr>
         <w:t>Flat_plate_ASHRAE</w:t>
       </w:r>
-      <w:bookmarkEnd w:id="11"/>
+      <w:bookmarkEnd w:id="10"/>
       <w:proofErr w:type="spellEnd"/>
     </w:p>
     <w:p>
@@ -3776,7 +3768,7 @@
           <w:rFonts w:eastAsiaTheme="minorEastAsia"/>
         </w:rPr>
       </w:pPr>
-      <w:bookmarkStart w:id="12" w:name="_Toc37080184"/>
+      <w:bookmarkStart w:id="11" w:name="_Toc37080184"/>
       <w:proofErr w:type="spellStart"/>
       <w:r>
         <w:rPr>
@@ -3784,7 +3776,7 @@
         </w:rPr>
         <w:t>h_rad</w:t>
       </w:r>
-      <w:bookmarkEnd w:id="12"/>
+      <w:bookmarkEnd w:id="11"/>
       <w:proofErr w:type="spellEnd"/>
     </w:p>
     <w:p>
@@ -3899,7 +3891,7 @@
           <w:rFonts w:eastAsiaTheme="minorEastAsia"/>
         </w:rPr>
       </w:pPr>
-      <w:bookmarkStart w:id="13" w:name="_Toc37080185"/>
+      <w:bookmarkStart w:id="12" w:name="_Toc37080185"/>
       <w:proofErr w:type="spellStart"/>
       <w:proofErr w:type="gramStart"/>
       <w:r>
@@ -3908,7 +3900,7 @@
         </w:rPr>
         <w:t>uniformGrid</w:t>
       </w:r>
-      <w:bookmarkEnd w:id="13"/>
+      <w:bookmarkEnd w:id="12"/>
       <w:proofErr w:type="spellEnd"/>
       <w:proofErr w:type="gramEnd"/>
     </w:p>
@@ -4044,7 +4036,7 @@
           <w:rFonts w:eastAsiaTheme="minorEastAsia"/>
         </w:rPr>
       </w:pPr>
-      <w:bookmarkStart w:id="14" w:name="_Toc37080186"/>
+      <w:bookmarkStart w:id="13" w:name="_Toc37080186"/>
       <w:proofErr w:type="spellStart"/>
       <w:proofErr w:type="gramStart"/>
       <w:r>
@@ -4053,7 +4045,7 @@
         </w:rPr>
         <w:t>geometricalGrowthGrid</w:t>
       </w:r>
-      <w:bookmarkEnd w:id="14"/>
+      <w:bookmarkEnd w:id="13"/>
       <w:proofErr w:type="spellEnd"/>
       <w:proofErr w:type="gramEnd"/>
     </w:p>
@@ -5058,7 +5050,7 @@
           <w:rFonts w:eastAsiaTheme="minorEastAsia"/>
         </w:rPr>
       </w:pPr>
-      <w:bookmarkStart w:id="15" w:name="_Toc37080187"/>
+      <w:bookmarkStart w:id="14" w:name="_Toc37080187"/>
       <w:proofErr w:type="spellStart"/>
       <w:proofErr w:type="gramStart"/>
       <w:r>
@@ -5067,7 +5059,7 @@
         </w:rPr>
         <w:t>biotAndUniformGrid</w:t>
       </w:r>
-      <w:bookmarkEnd w:id="15"/>
+      <w:bookmarkEnd w:id="14"/>
       <w:proofErr w:type="spellEnd"/>
       <w:proofErr w:type="gramEnd"/>
     </w:p>
@@ -5306,7 +5298,7 @@
           <w:rFonts w:eastAsiaTheme="minorEastAsia"/>
         </w:rPr>
       </w:pPr>
-      <w:bookmarkStart w:id="16" w:name="_Toc37080188"/>
+      <w:bookmarkStart w:id="15" w:name="_Toc37080188"/>
       <w:proofErr w:type="spellStart"/>
       <w:proofErr w:type="gramStart"/>
       <w:r>
@@ -5315,7 +5307,7 @@
         </w:rPr>
         <w:t>biotAndGeometricalGrowthGrid</w:t>
       </w:r>
-      <w:bookmarkEnd w:id="16"/>
+      <w:bookmarkEnd w:id="15"/>
       <w:proofErr w:type="spellEnd"/>
       <w:proofErr w:type="gramEnd"/>
     </w:p>
@@ -6348,6 +6340,507 @@
               <w:rFonts w:ascii="Cambria Math" w:eastAsiaTheme="minorEastAsia" w:hAnsi="Cambria Math"/>
             </w:rPr>
             <m:t xml:space="preserve"> for i from 2 to N</m:t>
+          </m:r>
+        </m:oMath>
+      </m:oMathPara>
+    </w:p>
+    <w:p>
+      <w:pPr>
+        <w:rPr>
+          <w:rFonts w:eastAsiaTheme="minorEastAsia"/>
+        </w:rPr>
+      </w:pPr>
+    </w:p>
+    <w:p>
+      <w:pPr>
+        <w:pStyle w:val="Titre3"/>
+        <w:rPr>
+          <w:rFonts w:eastAsiaTheme="minorEastAsia"/>
+        </w:rPr>
+      </w:pPr>
+      <w:proofErr w:type="spellStart"/>
+      <w:proofErr w:type="gramStart"/>
+      <w:r>
+        <w:rPr>
+          <w:rFonts w:eastAsiaTheme="minorEastAsia"/>
+        </w:rPr>
+        <w:t>counterCurrent</w:t>
+      </w:r>
+      <w:proofErr w:type="spellEnd"/>
+      <w:proofErr w:type="gramEnd"/>
+    </w:p>
+    <w:p>
+      <w:pPr>
+        <w:rPr>
+          <w:rFonts w:eastAsiaTheme="minorEastAsia"/>
+        </w:rPr>
+      </w:pPr>
+    </w:p>
+    <w:p>
+      <w:pPr>
+        <w:rPr>
+          <w:rFonts w:eastAsiaTheme="minorEastAsia"/>
+        </w:rPr>
+      </w:pPr>
+      <m:oMathPara>
+        <m:oMath>
+          <m:r>
+            <w:rPr>
+              <w:rFonts w:ascii="Cambria Math" w:eastAsiaTheme="minorEastAsia" w:hAnsi="Cambria Math"/>
+            </w:rPr>
+            <m:t>Eff=</m:t>
+          </m:r>
+          <m:f>
+            <m:fPr>
+              <m:ctrlPr>
+                <w:rPr>
+                  <w:rFonts w:ascii="Cambria Math" w:eastAsiaTheme="minorEastAsia" w:hAnsi="Cambria Math"/>
+                  <w:i/>
+                </w:rPr>
+              </m:ctrlPr>
+            </m:fPr>
+            <m:num>
+              <m:r>
+                <w:rPr>
+                  <w:rFonts w:ascii="Cambria Math" w:eastAsiaTheme="minorEastAsia" w:hAnsi="Cambria Math"/>
+                </w:rPr>
+                <m:t>1-</m:t>
+              </m:r>
+              <m:r>
+                <m:rPr>
+                  <m:sty m:val="p"/>
+                </m:rPr>
+                <w:rPr>
+                  <w:rFonts w:ascii="Cambria Math" w:eastAsiaTheme="minorEastAsia" w:hAnsi="Cambria Math"/>
+                </w:rPr>
+                <m:t>exp⁡</m:t>
+              </m:r>
+              <m:r>
+                <w:rPr>
+                  <w:rFonts w:ascii="Cambria Math" w:eastAsiaTheme="minorEastAsia" w:hAnsi="Cambria Math"/>
+                </w:rPr>
+                <m:t>(-NTU×(1-Cr))</m:t>
+              </m:r>
+            </m:num>
+            <m:den>
+              <m:r>
+                <w:rPr>
+                  <w:rFonts w:ascii="Cambria Math" w:eastAsiaTheme="minorEastAsia" w:hAnsi="Cambria Math"/>
+                </w:rPr>
+                <m:t>1-Cr×</m:t>
+              </m:r>
+              <m:r>
+                <m:rPr>
+                  <m:sty m:val="p"/>
+                </m:rPr>
+                <w:rPr>
+                  <w:rFonts w:ascii="Cambria Math" w:eastAsiaTheme="minorEastAsia" w:hAnsi="Cambria Math"/>
+                </w:rPr>
+                <m:t>exp⁡</m:t>
+              </m:r>
+              <m:r>
+                <w:rPr>
+                  <w:rFonts w:ascii="Cambria Math" w:eastAsiaTheme="minorEastAsia" w:hAnsi="Cambria Math"/>
+                </w:rPr>
+                <m:t>(-NTU×(1-Cr))</m:t>
+              </m:r>
+            </m:den>
+          </m:f>
+          <m:r>
+            <w:rPr>
+              <w:rFonts w:ascii="Cambria Math" w:eastAsiaTheme="minorEastAsia" w:hAnsi="Cambria Math"/>
+            </w:rPr>
+            <m:t xml:space="preserve"> For Cr≤0.98</m:t>
+          </m:r>
+        </m:oMath>
+      </m:oMathPara>
+    </w:p>
+    <w:p>
+      <w:pPr>
+        <w:rPr>
+          <w:rFonts w:eastAsiaTheme="minorEastAsia"/>
+        </w:rPr>
+      </w:pPr>
+      <m:oMathPara>
+        <m:oMath>
+          <m:r>
+            <w:rPr>
+              <w:rFonts w:ascii="Cambria Math" w:eastAsiaTheme="minorEastAsia" w:hAnsi="Cambria Math"/>
+            </w:rPr>
+            <m:t>Eff(Cr=1)=</m:t>
+          </m:r>
+          <m:f>
+            <m:fPr>
+              <m:ctrlPr>
+                <w:rPr>
+                  <w:rFonts w:ascii="Cambria Math" w:eastAsiaTheme="minorEastAsia" w:hAnsi="Cambria Math"/>
+                  <w:i/>
+                </w:rPr>
+              </m:ctrlPr>
+            </m:fPr>
+            <m:num>
+              <m:r>
+                <w:rPr>
+                  <w:rFonts w:ascii="Cambria Math" w:eastAsiaTheme="minorEastAsia" w:hAnsi="Cambria Math"/>
+                </w:rPr>
+                <m:t>NTU</m:t>
+              </m:r>
+            </m:num>
+            <m:den>
+              <m:r>
+                <w:rPr>
+                  <w:rFonts w:ascii="Cambria Math" w:eastAsiaTheme="minorEastAsia" w:hAnsi="Cambria Math"/>
+                </w:rPr>
+                <m:t>NTU+1</m:t>
+              </m:r>
+            </m:den>
+          </m:f>
+          <m:r>
+            <w:rPr>
+              <w:rFonts w:ascii="Cambria Math" w:eastAsiaTheme="minorEastAsia" w:hAnsi="Cambria Math"/>
+            </w:rPr>
+            <m:t xml:space="preserve"> </m:t>
+          </m:r>
+          <m:r>
+            <w:rPr>
+              <w:rFonts w:ascii="Cambria Math" w:eastAsiaTheme="minorEastAsia" w:hAnsi="Cambria Math"/>
+            </w:rPr>
+            <m:t>For Cr≥0.99</m:t>
+          </m:r>
+        </m:oMath>
+      </m:oMathPara>
+    </w:p>
+    <w:p>
+      <w:pPr>
+        <w:rPr>
+          <w:rFonts w:eastAsiaTheme="minorEastAsia"/>
+        </w:rPr>
+      </w:pPr>
+      <m:oMathPara>
+        <m:oMath>
+          <m:r>
+            <w:rPr>
+              <w:rFonts w:ascii="Cambria Math" w:eastAsiaTheme="minorEastAsia" w:hAnsi="Cambria Math"/>
+            </w:rPr>
+            <m:t>Eff=polynomial interpolation(Eff, Eff(Cr=1))</m:t>
+          </m:r>
+          <m:r>
+            <w:rPr>
+              <w:rFonts w:ascii="Cambria Math" w:eastAsiaTheme="minorEastAsia" w:hAnsi="Cambria Math"/>
+            </w:rPr>
+            <m:t xml:space="preserve"> </m:t>
+          </m:r>
+          <m:r>
+            <w:rPr>
+              <w:rFonts w:ascii="Cambria Math" w:eastAsiaTheme="minorEastAsia" w:hAnsi="Cambria Math"/>
+            </w:rPr>
+            <m:t>For 0.98&lt;Cr&lt;0.99</m:t>
+          </m:r>
+        </m:oMath>
+      </m:oMathPara>
+    </w:p>
+    <w:p>
+      <w:pPr>
+        <w:rPr>
+          <w:rFonts w:eastAsiaTheme="minorEastAsia"/>
+        </w:rPr>
+      </w:pPr>
+    </w:p>
+    <w:p>
+      <w:pPr>
+        <w:pStyle w:val="Titre3"/>
+        <w:numPr>
+          <w:ilvl w:val="2"/>
+          <w:numId w:val="5"/>
+        </w:numPr>
+        <w:rPr>
+          <w:rFonts w:eastAsiaTheme="minorEastAsia"/>
+        </w:rPr>
+      </w:pPr>
+      <w:proofErr w:type="spellStart"/>
+      <w:r>
+        <w:rPr>
+          <w:rFonts w:eastAsiaTheme="minorEastAsia"/>
+        </w:rPr>
+        <w:t>NTU_</w:t>
+      </w:r>
+      <w:r>
+        <w:rPr>
+          <w:rFonts w:eastAsiaTheme="minorEastAsia"/>
+        </w:rPr>
+        <w:t>counterCurrent</w:t>
+      </w:r>
+      <w:proofErr w:type="spellEnd"/>
+    </w:p>
+    <w:p>
+      <w:pPr>
+        <w:rPr>
+          <w:rFonts w:eastAsiaTheme="minorEastAsia"/>
+        </w:rPr>
+      </w:pPr>
+    </w:p>
+    <w:p>
+      <w:pPr>
+        <w:rPr>
+          <w:rFonts w:eastAsiaTheme="minorEastAsia"/>
+        </w:rPr>
+      </w:pPr>
+      <m:oMathPara>
+        <m:oMath>
+          <m:r>
+            <w:rPr>
+              <w:rFonts w:ascii="Cambria Math" w:eastAsiaTheme="minorEastAsia" w:hAnsi="Cambria Math"/>
+            </w:rPr>
+            <m:t>NTU</m:t>
+          </m:r>
+          <m:r>
+            <w:rPr>
+              <w:rFonts w:ascii="Cambria Math" w:eastAsiaTheme="minorEastAsia" w:hAnsi="Cambria Math"/>
+            </w:rPr>
+            <m:t>=</m:t>
+          </m:r>
+          <m:f>
+            <m:fPr>
+              <m:ctrlPr>
+                <w:rPr>
+                  <w:rFonts w:ascii="Cambria Math" w:eastAsiaTheme="minorEastAsia" w:hAnsi="Cambria Math"/>
+                  <w:i/>
+                </w:rPr>
+              </m:ctrlPr>
+            </m:fPr>
+            <m:num>
+              <m:r>
+                <w:rPr>
+                  <w:rFonts w:ascii="Cambria Math" w:eastAsiaTheme="minorEastAsia" w:hAnsi="Cambria Math"/>
+                </w:rPr>
+                <m:t>1</m:t>
+              </m:r>
+            </m:num>
+            <m:den>
+              <m:r>
+                <w:rPr>
+                  <w:rFonts w:ascii="Cambria Math" w:eastAsiaTheme="minorEastAsia" w:hAnsi="Cambria Math"/>
+                </w:rPr>
+                <m:t>1-Cr</m:t>
+              </m:r>
+            </m:den>
+          </m:f>
+          <m:r>
+            <w:rPr>
+              <w:rFonts w:ascii="Cambria Math" w:eastAsiaTheme="minorEastAsia" w:hAnsi="Cambria Math"/>
+            </w:rPr>
+            <m:t>×</m:t>
+          </m:r>
+          <m:r>
+            <m:rPr>
+              <m:sty m:val="p"/>
+            </m:rPr>
+            <w:rPr>
+              <w:rFonts w:ascii="Cambria Math" w:eastAsiaTheme="minorEastAsia" w:hAnsi="Cambria Math"/>
+            </w:rPr>
+            <m:t>ln⁡</m:t>
+          </m:r>
+          <m:d>
+            <m:dPr>
+              <m:ctrlPr>
+                <w:rPr>
+                  <w:rFonts w:ascii="Cambria Math" w:eastAsiaTheme="minorEastAsia" w:hAnsi="Cambria Math"/>
+                  <w:i/>
+                </w:rPr>
+              </m:ctrlPr>
+            </m:dPr>
+            <m:e>
+              <m:f>
+                <m:fPr>
+                  <m:ctrlPr>
+                    <w:rPr>
+                      <w:rFonts w:ascii="Cambria Math" w:eastAsiaTheme="minorEastAsia" w:hAnsi="Cambria Math"/>
+                      <w:i/>
+                    </w:rPr>
+                  </m:ctrlPr>
+                </m:fPr>
+                <m:num>
+                  <m:r>
+                    <w:rPr>
+                      <w:rFonts w:ascii="Cambria Math" w:eastAsiaTheme="minorEastAsia" w:hAnsi="Cambria Math"/>
+                    </w:rPr>
+                    <m:t>1-Eff×Cr</m:t>
+                  </m:r>
+                </m:num>
+                <m:den>
+                  <m:r>
+                    <w:rPr>
+                      <w:rFonts w:ascii="Cambria Math" w:eastAsiaTheme="minorEastAsia" w:hAnsi="Cambria Math"/>
+                    </w:rPr>
+                    <m:t>1-</m:t>
+                  </m:r>
+                  <m:r>
+                    <m:rPr>
+                      <m:sty m:val="p"/>
+                    </m:rPr>
+                    <w:rPr>
+                      <w:rFonts w:ascii="Cambria Math" w:eastAsiaTheme="minorEastAsia" w:hAnsi="Cambria Math"/>
+                    </w:rPr>
+                    <m:t>min</m:t>
+                  </m:r>
+                  <m:r>
+                    <w:rPr>
+                      <w:rFonts w:ascii="Cambria Math" w:eastAsiaTheme="minorEastAsia" w:hAnsi="Cambria Math"/>
+                    </w:rPr>
+                    <m:t>(</m:t>
+                  </m:r>
+                  <m:r>
+                    <w:rPr>
+                      <w:rFonts w:ascii="Cambria Math" w:eastAsiaTheme="minorEastAsia" w:hAnsi="Cambria Math"/>
+                    </w:rPr>
+                    <m:t>Eff</m:t>
+                  </m:r>
+                  <m:r>
+                    <w:rPr>
+                      <w:rFonts w:ascii="Cambria Math" w:eastAsiaTheme="minorEastAsia" w:hAnsi="Cambria Math"/>
+                    </w:rPr>
+                    <m:t>,0.999)</m:t>
+                  </m:r>
+                </m:den>
+              </m:f>
+            </m:e>
+          </m:d>
+          <m:r>
+            <w:rPr>
+              <w:rFonts w:ascii="Cambria Math" w:eastAsiaTheme="minorEastAsia" w:hAnsi="Cambria Math"/>
+            </w:rPr>
+            <m:t xml:space="preserve"> For Cr≤0.98</m:t>
+          </m:r>
+        </m:oMath>
+      </m:oMathPara>
+    </w:p>
+    <w:p>
+      <w:pPr>
+        <w:rPr>
+          <w:rFonts w:eastAsiaTheme="minorEastAsia"/>
+        </w:rPr>
+      </w:pPr>
+      <m:oMathPara>
+        <m:oMath>
+          <m:r>
+            <w:rPr>
+              <w:rFonts w:ascii="Cambria Math" w:eastAsiaTheme="minorEastAsia" w:hAnsi="Cambria Math"/>
+            </w:rPr>
+            <m:t>NTU</m:t>
+          </m:r>
+          <m:r>
+            <w:rPr>
+              <w:rFonts w:ascii="Cambria Math" w:eastAsiaTheme="minorEastAsia" w:hAnsi="Cambria Math"/>
+            </w:rPr>
+            <m:t>(Cr=1)=</m:t>
+          </m:r>
+          <m:f>
+            <m:fPr>
+              <m:ctrlPr>
+                <w:rPr>
+                  <w:rFonts w:ascii="Cambria Math" w:eastAsiaTheme="minorEastAsia" w:hAnsi="Cambria Math"/>
+                  <w:i/>
+                </w:rPr>
+              </m:ctrlPr>
+            </m:fPr>
+            <m:num>
+              <m:r>
+                <w:rPr>
+                  <w:rFonts w:ascii="Cambria Math" w:eastAsiaTheme="minorEastAsia" w:hAnsi="Cambria Math"/>
+                </w:rPr>
+                <m:t>Eff</m:t>
+              </m:r>
+            </m:num>
+            <m:den>
+              <m:r>
+                <w:rPr>
+                  <w:rFonts w:ascii="Cambria Math" w:eastAsiaTheme="minorEastAsia" w:hAnsi="Cambria Math"/>
+                </w:rPr>
+                <m:t>1-</m:t>
+              </m:r>
+              <m:r>
+                <m:rPr>
+                  <m:sty m:val="p"/>
+                </m:rPr>
+                <w:rPr>
+                  <w:rFonts w:ascii="Cambria Math" w:eastAsiaTheme="minorEastAsia" w:hAnsi="Cambria Math"/>
+                </w:rPr>
+                <m:t>min</m:t>
+              </m:r>
+              <m:r>
+                <w:rPr>
+                  <w:rFonts w:ascii="Cambria Math" w:eastAsiaTheme="minorEastAsia" w:hAnsi="Cambria Math"/>
+                </w:rPr>
+                <m:t>(Eff,0.999)</m:t>
+              </m:r>
+              <w:bookmarkStart w:id="16" w:name="_GoBack"/>
+              <w:bookmarkEnd w:id="16"/>
+            </m:den>
+          </m:f>
+          <m:r>
+            <w:rPr>
+              <w:rFonts w:ascii="Cambria Math" w:eastAsiaTheme="minorEastAsia" w:hAnsi="Cambria Math"/>
+            </w:rPr>
+            <m:t xml:space="preserve"> </m:t>
+          </m:r>
+          <m:r>
+            <w:rPr>
+              <w:rFonts w:ascii="Cambria Math" w:eastAsiaTheme="minorEastAsia" w:hAnsi="Cambria Math"/>
+            </w:rPr>
+            <m:t>For Cr≥0.99</m:t>
+          </m:r>
+        </m:oMath>
+      </m:oMathPara>
+    </w:p>
+    <w:p>
+      <w:pPr>
+        <w:rPr>
+          <w:rFonts w:eastAsiaTheme="minorEastAsia"/>
+        </w:rPr>
+      </w:pPr>
+      <m:oMathPara>
+        <m:oMath>
+          <m:r>
+            <w:rPr>
+              <w:rFonts w:ascii="Cambria Math" w:eastAsiaTheme="minorEastAsia" w:hAnsi="Cambria Math"/>
+            </w:rPr>
+            <m:t>Eff=polynomial interpolation(</m:t>
+          </m:r>
+          <m:r>
+            <w:rPr>
+              <w:rFonts w:ascii="Cambria Math" w:eastAsiaTheme="minorEastAsia" w:hAnsi="Cambria Math"/>
+            </w:rPr>
+            <m:t>NTU</m:t>
+          </m:r>
+          <m:r>
+            <w:rPr>
+              <w:rFonts w:ascii="Cambria Math" w:eastAsiaTheme="minorEastAsia" w:hAnsi="Cambria Math"/>
+            </w:rPr>
+            <m:t xml:space="preserve">, </m:t>
+          </m:r>
+          <m:r>
+            <w:rPr>
+              <w:rFonts w:ascii="Cambria Math" w:eastAsiaTheme="minorEastAsia" w:hAnsi="Cambria Math"/>
+            </w:rPr>
+            <m:t>NTU</m:t>
+          </m:r>
+          <m:r>
+            <w:rPr>
+              <w:rFonts w:ascii="Cambria Math" w:eastAsiaTheme="minorEastAsia" w:hAnsi="Cambria Math"/>
+            </w:rPr>
+            <m:t>(Cr=1))</m:t>
+          </m:r>
+          <m:r>
+            <w:rPr>
+              <w:rFonts w:ascii="Cambria Math" w:eastAsiaTheme="minorEastAsia" w:hAnsi="Cambria Math"/>
+            </w:rPr>
+            <m:t xml:space="preserve"> </m:t>
+          </m:r>
+          <m:r>
+            <w:rPr>
+              <w:rFonts w:ascii="Cambria Math" w:eastAsiaTheme="minorEastAsia" w:hAnsi="Cambria Math"/>
+            </w:rPr>
+            <m:t>For 0.98&lt;Cr&lt;0.99</m:t>
           </m:r>
         </m:oMath>
       </m:oMathPara>
@@ -9023,6 +9516,66 @@
     <w:abstractNumId w:val="1"/>
   </w:num>
   <w:num w:numId="3">
+    <w:abstractNumId w:val="1"/>
+    <w:lvlOverride w:ilvl="0">
+      <w:startOverride w:val="1"/>
+    </w:lvlOverride>
+    <w:lvlOverride w:ilvl="1">
+      <w:startOverride w:val="1"/>
+    </w:lvlOverride>
+    <w:lvlOverride w:ilvl="2">
+      <w:startOverride w:val="1"/>
+    </w:lvlOverride>
+    <w:lvlOverride w:ilvl="3">
+      <w:startOverride w:val="1"/>
+    </w:lvlOverride>
+    <w:lvlOverride w:ilvl="4">
+      <w:startOverride w:val="1"/>
+    </w:lvlOverride>
+    <w:lvlOverride w:ilvl="5">
+      <w:startOverride w:val="1"/>
+    </w:lvlOverride>
+    <w:lvlOverride w:ilvl="6">
+      <w:startOverride w:val="1"/>
+    </w:lvlOverride>
+    <w:lvlOverride w:ilvl="7">
+      <w:startOverride w:val="1"/>
+    </w:lvlOverride>
+    <w:lvlOverride w:ilvl="8">
+      <w:startOverride w:val="1"/>
+    </w:lvlOverride>
+  </w:num>
+  <w:num w:numId="4">
+    <w:abstractNumId w:val="1"/>
+    <w:lvlOverride w:ilvl="0">
+      <w:startOverride w:val="1"/>
+    </w:lvlOverride>
+    <w:lvlOverride w:ilvl="1">
+      <w:startOverride w:val="1"/>
+    </w:lvlOverride>
+    <w:lvlOverride w:ilvl="2">
+      <w:startOverride w:val="1"/>
+    </w:lvlOverride>
+    <w:lvlOverride w:ilvl="3">
+      <w:startOverride w:val="1"/>
+    </w:lvlOverride>
+    <w:lvlOverride w:ilvl="4">
+      <w:startOverride w:val="1"/>
+    </w:lvlOverride>
+    <w:lvlOverride w:ilvl="5">
+      <w:startOverride w:val="1"/>
+    </w:lvlOverride>
+    <w:lvlOverride w:ilvl="6">
+      <w:startOverride w:val="1"/>
+    </w:lvlOverride>
+    <w:lvlOverride w:ilvl="7">
+      <w:startOverride w:val="1"/>
+    </w:lvlOverride>
+    <w:lvlOverride w:ilvl="8">
+      <w:startOverride w:val="1"/>
+    </w:lvlOverride>
+  </w:num>
+  <w:num w:numId="5">
     <w:abstractNumId w:val="1"/>
     <w:lvlOverride w:ilvl="0">
       <w:startOverride w:val="1"/>
@@ -10644,7 +11197,7 @@
   <a:extraClrSchemeLst/>
   <a:extLst>
     <a:ext uri="{05A4C25C-085E-4340-85A3-A5531E510DB2}">
-      <thm15:themeFamily xmlns="" xmlns:thm15="http://schemas.microsoft.com/office/thememl/2012/main" name="Office Theme" id="{62F939B6-93AF-4DB8-9C6B-D6C7DFDC589F}" vid="{4A3C46E8-61CC-4603-A589-7422A47A8E4A}"/>
+      <thm15:themeFamily xmlns:thm15="http://schemas.microsoft.com/office/thememl/2012/main" xmlns="" name="Office Theme" id="{62F939B6-93AF-4DB8-9C6B-D6C7DFDC589F}" vid="{4A3C46E8-61CC-4603-A589-7422A47A8E4A}"/>
     </a:ext>
   </a:extLst>
 </a:theme>
@@ -10655,7 +11208,7 @@
 </file>
 
 <file path=customXml/itemProps1.xml><?xml version="1.0" encoding="utf-8"?>
-<ds:datastoreItem xmlns:ds="http://schemas.openxmlformats.org/officeDocument/2006/customXml" ds:itemID="{B391BA10-DE12-47DF-9DBE-F27612EE780A}">
+<ds:datastoreItem xmlns:ds="http://schemas.openxmlformats.org/officeDocument/2006/customXml" ds:itemID="{93005CAA-1F25-4924-B73C-79640B1248CF}">
   <ds:schemaRefs>
     <ds:schemaRef ds:uri="http://schemas.openxmlformats.org/officeDocument/2006/bibliography"/>
   </ds:schemaRefs>

</xml_diff>

<commit_message>
Addition of the Ventilation module in HeatTransfer.Components
</commit_message>
<xml_diff>
--- a/Information/script for equations.docx
+++ b/Information/script for equations.docx
@@ -19,6 +19,7 @@
           <w:docPartUnique/>
         </w:docPartObj>
       </w:sdtPr>
+      <w:sdtEndPr/>
       <w:sdtContent>
         <w:p>
           <w:pPr>
@@ -1756,6 +1757,610 @@
     </w:p>
     <w:p>
       <w:pPr>
+        <w:rPr>
+          <w:lang w:val="fr-FR"/>
+        </w:rPr>
+      </w:pPr>
+    </w:p>
+    <w:p>
+      <w:pPr>
+        <w:pStyle w:val="Titre2"/>
+        <w:rPr>
+          <w:lang w:val="fr-FR"/>
+        </w:rPr>
+      </w:pPr>
+      <w:r>
+        <w:rPr>
+          <w:lang w:val="fr-FR"/>
+        </w:rPr>
+        <w:t>Components</w:t>
+      </w:r>
+    </w:p>
+    <w:p>
+      <w:pPr>
+        <w:rPr>
+          <w:lang w:val="fr-FR"/>
+        </w:rPr>
+      </w:pPr>
+    </w:p>
+    <w:p>
+      <w:pPr>
+        <w:pStyle w:val="Titre3"/>
+        <w:rPr>
+          <w:rFonts w:eastAsiaTheme="minorEastAsia"/>
+        </w:rPr>
+      </w:pPr>
+      <w:r>
+        <w:rPr>
+          <w:rFonts w:eastAsiaTheme="minorEastAsia"/>
+        </w:rPr>
+        <w:t>Ventilation</w:t>
+      </w:r>
+    </w:p>
+    <w:p/>
+    <w:p>
+      <w:pPr>
+        <w:rPr>
+          <w:rFonts w:eastAsiaTheme="minorEastAsia"/>
+        </w:rPr>
+      </w:pPr>
+      <m:oMathPara>
+        <m:oMath>
+          <m:r>
+            <w:rPr>
+              <w:rFonts w:ascii="Cambria Math" w:hAnsi="Cambria Math"/>
+            </w:rPr>
+            <m:t xml:space="preserve">supply: </m:t>
+          </m:r>
+          <m:r>
+            <w:rPr>
+              <w:rFonts w:ascii="Cambria Math" w:hAnsi="Cambria Math"/>
+            </w:rPr>
+            <m:t>H</m:t>
+          </m:r>
+          <m:r>
+            <w:rPr>
+              <w:rFonts w:ascii="Cambria Math" w:hAnsi="Cambria Math"/>
+            </w:rPr>
+            <m:t>_flow=m_flow×(</m:t>
+          </m:r>
+          <m:sSub>
+            <m:sSubPr>
+              <m:ctrlPr>
+                <w:rPr>
+                  <w:rFonts w:ascii="Cambria Math" w:hAnsi="Cambria Math"/>
+                  <w:i/>
+                </w:rPr>
+              </m:ctrlPr>
+            </m:sSubPr>
+            <m:e>
+              <m:r>
+                <w:rPr>
+                  <w:rFonts w:ascii="Cambria Math" w:hAnsi="Cambria Math"/>
+                </w:rPr>
+                <m:t>h</m:t>
+              </m:r>
+            </m:e>
+            <m:sub>
+              <m:r>
+                <w:rPr>
+                  <w:rFonts w:ascii="Cambria Math" w:hAnsi="Cambria Math"/>
+                </w:rPr>
+                <m:t>supply</m:t>
+              </m:r>
+            </m:sub>
+          </m:sSub>
+          <m:r>
+            <w:rPr>
+              <w:rFonts w:ascii="Cambria Math" w:hAnsi="Cambria Math"/>
+            </w:rPr>
+            <m:t>-</m:t>
+          </m:r>
+          <m:sSub>
+            <m:sSubPr>
+              <m:ctrlPr>
+                <w:rPr>
+                  <w:rFonts w:ascii="Cambria Math" w:hAnsi="Cambria Math"/>
+                  <w:i/>
+                </w:rPr>
+              </m:ctrlPr>
+            </m:sSubPr>
+            <m:e>
+              <m:r>
+                <w:rPr>
+                  <w:rFonts w:ascii="Cambria Math" w:hAnsi="Cambria Math"/>
+                </w:rPr>
+                <m:t>h</m:t>
+              </m:r>
+            </m:e>
+            <m:sub>
+              <m:r>
+                <w:rPr>
+                  <w:rFonts w:ascii="Cambria Math" w:hAnsi="Cambria Math"/>
+                </w:rPr>
+                <m:t>ref</m:t>
+              </m:r>
+            </m:sub>
+          </m:sSub>
+          <m:r>
+            <w:rPr>
+              <w:rFonts w:ascii="Cambria Math" w:hAnsi="Cambria Math"/>
+            </w:rPr>
+            <m:t>)=m_flow×</m:t>
+          </m:r>
+          <m:sSub>
+            <m:sSubPr>
+              <m:ctrlPr>
+                <w:rPr>
+                  <w:rFonts w:ascii="Cambria Math" w:hAnsi="Cambria Math"/>
+                  <w:i/>
+                </w:rPr>
+              </m:ctrlPr>
+            </m:sSubPr>
+            <m:e>
+              <m:r>
+                <w:rPr>
+                  <w:rFonts w:ascii="Cambria Math" w:hAnsi="Cambria Math"/>
+                </w:rPr>
+                <m:t>cp</m:t>
+              </m:r>
+            </m:e>
+            <m:sub>
+              <m:r>
+                <w:rPr>
+                  <w:rFonts w:ascii="Cambria Math" w:hAnsi="Cambria Math"/>
+                </w:rPr>
+                <m:t>supply</m:t>
+              </m:r>
+            </m:sub>
+          </m:sSub>
+          <m:r>
+            <w:rPr>
+              <w:rFonts w:ascii="Cambria Math" w:hAnsi="Cambria Math"/>
+            </w:rPr>
+            <m:t>×(</m:t>
+          </m:r>
+          <m:sSub>
+            <m:sSubPr>
+              <m:ctrlPr>
+                <w:rPr>
+                  <w:rFonts w:ascii="Cambria Math" w:hAnsi="Cambria Math"/>
+                  <w:i/>
+                </w:rPr>
+              </m:ctrlPr>
+            </m:sSubPr>
+            <m:e>
+              <m:r>
+                <w:rPr>
+                  <w:rFonts w:ascii="Cambria Math" w:hAnsi="Cambria Math"/>
+                </w:rPr>
+                <m:t>T</m:t>
+              </m:r>
+            </m:e>
+            <m:sub>
+              <m:r>
+                <w:rPr>
+                  <w:rFonts w:ascii="Cambria Math" w:hAnsi="Cambria Math"/>
+                </w:rPr>
+                <m:t>supply</m:t>
+              </m:r>
+            </m:sub>
+          </m:sSub>
+          <m:r>
+            <w:rPr>
+              <w:rFonts w:ascii="Cambria Math" w:hAnsi="Cambria Math"/>
+            </w:rPr>
+            <m:t>-</m:t>
+          </m:r>
+          <m:sSub>
+            <m:sSubPr>
+              <m:ctrlPr>
+                <w:rPr>
+                  <w:rFonts w:ascii="Cambria Math" w:hAnsi="Cambria Math"/>
+                  <w:i/>
+                </w:rPr>
+              </m:ctrlPr>
+            </m:sSubPr>
+            <m:e>
+              <m:r>
+                <w:rPr>
+                  <w:rFonts w:ascii="Cambria Math" w:hAnsi="Cambria Math"/>
+                </w:rPr>
+                <m:t>T</m:t>
+              </m:r>
+            </m:e>
+            <m:sub>
+              <m:r>
+                <w:rPr>
+                  <w:rFonts w:ascii="Cambria Math" w:hAnsi="Cambria Math"/>
+                </w:rPr>
+                <m:t>ref</m:t>
+              </m:r>
+            </m:sub>
+          </m:sSub>
+          <m:r>
+            <w:rPr>
+              <w:rFonts w:ascii="Cambria Math" w:hAnsi="Cambria Math"/>
+            </w:rPr>
+            <m:t>)</m:t>
+          </m:r>
+        </m:oMath>
+      </m:oMathPara>
+    </w:p>
+    <w:p>
+      <w:pPr>
+        <w:rPr>
+          <w:rFonts w:eastAsiaTheme="minorEastAsia"/>
+        </w:rPr>
+      </w:pPr>
+      <m:oMathPara>
+        <m:oMath>
+          <m:r>
+            <w:rPr>
+              <w:rFonts w:ascii="Cambria Math" w:hAnsi="Cambria Math"/>
+            </w:rPr>
+            <m:t xml:space="preserve">exhaust: </m:t>
+          </m:r>
+          <m:r>
+            <w:rPr>
+              <w:rFonts w:ascii="Cambria Math" w:hAnsi="Cambria Math"/>
+            </w:rPr>
+            <m:t>H</m:t>
+          </m:r>
+          <m:r>
+            <w:rPr>
+              <w:rFonts w:ascii="Cambria Math" w:hAnsi="Cambria Math"/>
+            </w:rPr>
+            <m:t>_flow=-m_flow×</m:t>
+          </m:r>
+          <m:d>
+            <m:dPr>
+              <m:ctrlPr>
+                <w:rPr>
+                  <w:rFonts w:ascii="Cambria Math" w:hAnsi="Cambria Math"/>
+                  <w:i/>
+                </w:rPr>
+              </m:ctrlPr>
+            </m:dPr>
+            <m:e>
+              <m:sSub>
+                <m:sSubPr>
+                  <m:ctrlPr>
+                    <w:rPr>
+                      <w:rFonts w:ascii="Cambria Math" w:hAnsi="Cambria Math"/>
+                      <w:i/>
+                    </w:rPr>
+                  </m:ctrlPr>
+                </m:sSubPr>
+                <m:e>
+                  <m:r>
+                    <w:rPr>
+                      <w:rFonts w:ascii="Cambria Math" w:hAnsi="Cambria Math"/>
+                    </w:rPr>
+                    <m:t>h</m:t>
+                  </m:r>
+                </m:e>
+                <m:sub>
+                  <m:r>
+                    <w:rPr>
+                      <w:rFonts w:ascii="Cambria Math" w:hAnsi="Cambria Math"/>
+                    </w:rPr>
+                    <m:t>exhaust</m:t>
+                  </m:r>
+                </m:sub>
+              </m:sSub>
+              <m:r>
+                <w:rPr>
+                  <w:rFonts w:ascii="Cambria Math" w:hAnsi="Cambria Math"/>
+                </w:rPr>
+                <m:t>-</m:t>
+              </m:r>
+              <m:sSub>
+                <m:sSubPr>
+                  <m:ctrlPr>
+                    <w:rPr>
+                      <w:rFonts w:ascii="Cambria Math" w:hAnsi="Cambria Math"/>
+                      <w:i/>
+                    </w:rPr>
+                  </m:ctrlPr>
+                </m:sSubPr>
+                <m:e>
+                  <m:r>
+                    <w:rPr>
+                      <w:rFonts w:ascii="Cambria Math" w:hAnsi="Cambria Math"/>
+                    </w:rPr>
+                    <m:t>h</m:t>
+                  </m:r>
+                </m:e>
+                <m:sub>
+                  <m:r>
+                    <w:rPr>
+                      <w:rFonts w:ascii="Cambria Math" w:hAnsi="Cambria Math"/>
+                    </w:rPr>
+                    <m:t>ref</m:t>
+                  </m:r>
+                </m:sub>
+              </m:sSub>
+            </m:e>
+          </m:d>
+          <m:r>
+            <w:rPr>
+              <w:rFonts w:ascii="Cambria Math" w:hAnsi="Cambria Math"/>
+            </w:rPr>
+            <m:t>=-m_flow×</m:t>
+          </m:r>
+          <m:sSub>
+            <m:sSubPr>
+              <m:ctrlPr>
+                <w:rPr>
+                  <w:rFonts w:ascii="Cambria Math" w:hAnsi="Cambria Math"/>
+                  <w:i/>
+                </w:rPr>
+              </m:ctrlPr>
+            </m:sSubPr>
+            <m:e>
+              <m:r>
+                <w:rPr>
+                  <w:rFonts w:ascii="Cambria Math" w:hAnsi="Cambria Math"/>
+                </w:rPr>
+                <m:t>cp</m:t>
+              </m:r>
+            </m:e>
+            <m:sub>
+              <m:r>
+                <w:rPr>
+                  <w:rFonts w:ascii="Cambria Math" w:hAnsi="Cambria Math"/>
+                </w:rPr>
+                <m:t>exhaust</m:t>
+              </m:r>
+            </m:sub>
+          </m:sSub>
+          <m:r>
+            <w:rPr>
+              <w:rFonts w:ascii="Cambria Math" w:hAnsi="Cambria Math"/>
+            </w:rPr>
+            <m:t>×(</m:t>
+          </m:r>
+          <m:sSub>
+            <m:sSubPr>
+              <m:ctrlPr>
+                <w:rPr>
+                  <w:rFonts w:ascii="Cambria Math" w:hAnsi="Cambria Math"/>
+                  <w:i/>
+                </w:rPr>
+              </m:ctrlPr>
+            </m:sSubPr>
+            <m:e>
+              <m:r>
+                <w:rPr>
+                  <w:rFonts w:ascii="Cambria Math" w:hAnsi="Cambria Math"/>
+                </w:rPr>
+                <m:t>T</m:t>
+              </m:r>
+            </m:e>
+            <m:sub>
+              <m:r>
+                <w:rPr>
+                  <w:rFonts w:ascii="Cambria Math" w:hAnsi="Cambria Math"/>
+                </w:rPr>
+                <m:t>exhaust</m:t>
+              </m:r>
+            </m:sub>
+          </m:sSub>
+          <m:r>
+            <w:rPr>
+              <w:rFonts w:ascii="Cambria Math" w:hAnsi="Cambria Math"/>
+            </w:rPr>
+            <m:t>-</m:t>
+          </m:r>
+          <m:sSub>
+            <m:sSubPr>
+              <m:ctrlPr>
+                <w:rPr>
+                  <w:rFonts w:ascii="Cambria Math" w:hAnsi="Cambria Math"/>
+                  <w:i/>
+                </w:rPr>
+              </m:ctrlPr>
+            </m:sSubPr>
+            <m:e>
+              <m:r>
+                <w:rPr>
+                  <w:rFonts w:ascii="Cambria Math" w:hAnsi="Cambria Math"/>
+                </w:rPr>
+                <m:t>T</m:t>
+              </m:r>
+            </m:e>
+            <m:sub>
+              <m:r>
+                <w:rPr>
+                  <w:rFonts w:ascii="Cambria Math" w:hAnsi="Cambria Math"/>
+                </w:rPr>
+                <m:t>ref</m:t>
+              </m:r>
+            </m:sub>
+          </m:sSub>
+          <m:r>
+            <w:rPr>
+              <w:rFonts w:ascii="Cambria Math" w:hAnsi="Cambria Math"/>
+            </w:rPr>
+            <m:t>)</m:t>
+          </m:r>
+        </m:oMath>
+      </m:oMathPara>
+    </w:p>
+    <w:p>
+      <w:pPr>
+        <w:ind w:left="-567" w:right="-567"/>
+        <w:rPr>
+          <w:rFonts w:eastAsiaTheme="minorEastAsia"/>
+        </w:rPr>
+      </w:pPr>
+      <m:oMathPara>
+        <m:oMath>
+          <m:r>
+            <w:rPr>
+              <w:rFonts w:ascii="Cambria Math" w:hAnsi="Cambria Math"/>
+            </w:rPr>
+            <m:t>por</m:t>
+          </m:r>
+          <m:r>
+            <w:rPr>
+              <w:rFonts w:ascii="Cambria Math" w:hAnsi="Cambria Math"/>
+            </w:rPr>
+            <m:t>t_b</m:t>
+          </m:r>
+          <m:r>
+            <w:rPr>
+              <w:rFonts w:ascii="Cambria Math" w:hAnsi="Cambria Math"/>
+            </w:rPr>
+            <m:t>.</m:t>
+          </m:r>
+          <m:r>
+            <w:rPr>
+              <w:rFonts w:ascii="Cambria Math" w:hAnsi="Cambria Math"/>
+            </w:rPr>
+            <m:t>Q_flow</m:t>
+          </m:r>
+          <m:r>
+            <w:rPr>
+              <w:rFonts w:ascii="Cambria Math" w:hAnsi="Cambria Math"/>
+            </w:rPr>
+            <m:t>=</m:t>
+          </m:r>
+          <m:r>
+            <w:rPr>
+              <w:rFonts w:ascii="Cambria Math" w:hAnsi="Cambria Math"/>
+            </w:rPr>
+            <m:t>m_flow</m:t>
+          </m:r>
+          <m:r>
+            <w:rPr>
+              <w:rFonts w:ascii="Cambria Math" w:hAnsi="Cambria Math"/>
+            </w:rPr>
+            <m:t>×cp</m:t>
+          </m:r>
+          <m:d>
+            <m:dPr>
+              <m:ctrlPr>
+                <w:rPr>
+                  <w:rFonts w:ascii="Cambria Math" w:hAnsi="Cambria Math"/>
+                  <w:i/>
+                </w:rPr>
+              </m:ctrlPr>
+            </m:dPr>
+            <m:e>
+              <m:f>
+                <m:fPr>
+                  <m:ctrlPr>
+                    <w:rPr>
+                      <w:rFonts w:ascii="Cambria Math" w:hAnsi="Cambria Math"/>
+                      <w:i/>
+                    </w:rPr>
+                  </m:ctrlPr>
+                </m:fPr>
+                <m:num>
+                  <m:r>
+                    <w:rPr>
+                      <w:rFonts w:ascii="Cambria Math" w:hAnsi="Cambria Math"/>
+                    </w:rPr>
+                    <m:t>por</m:t>
+                  </m:r>
+                  <m:r>
+                    <w:rPr>
+                      <w:rFonts w:ascii="Cambria Math" w:hAnsi="Cambria Math"/>
+                    </w:rPr>
+                    <m:t>t_a</m:t>
+                  </m:r>
+                  <m:r>
+                    <w:rPr>
+                      <w:rFonts w:ascii="Cambria Math" w:hAnsi="Cambria Math"/>
+                    </w:rPr>
+                    <m:t>.T+por</m:t>
+                  </m:r>
+                  <m:r>
+                    <w:rPr>
+                      <w:rFonts w:ascii="Cambria Math" w:hAnsi="Cambria Math"/>
+                    </w:rPr>
+                    <m:t>t_b</m:t>
+                  </m:r>
+                  <m:r>
+                    <w:rPr>
+                      <w:rFonts w:ascii="Cambria Math" w:hAnsi="Cambria Math"/>
+                    </w:rPr>
+                    <m:t>.T</m:t>
+                  </m:r>
+                </m:num>
+                <m:den>
+                  <m:r>
+                    <w:rPr>
+                      <w:rFonts w:ascii="Cambria Math" w:hAnsi="Cambria Math"/>
+                    </w:rPr>
+                    <m:t>2</m:t>
+                  </m:r>
+                </m:den>
+              </m:f>
+            </m:e>
+          </m:d>
+          <m:r>
+            <w:rPr>
+              <w:rFonts w:ascii="Cambria Math" w:hAnsi="Cambria Math"/>
+            </w:rPr>
+            <m:t>×</m:t>
+          </m:r>
+          <m:d>
+            <m:dPr>
+              <m:ctrlPr>
+                <w:rPr>
+                  <w:rFonts w:ascii="Cambria Math" w:hAnsi="Cambria Math"/>
+                  <w:i/>
+                </w:rPr>
+              </m:ctrlPr>
+            </m:dPr>
+            <m:e>
+              <m:r>
+                <w:rPr>
+                  <w:rFonts w:ascii="Cambria Math" w:hAnsi="Cambria Math"/>
+                </w:rPr>
+                <m:t>por</m:t>
+              </m:r>
+              <m:r>
+                <w:rPr>
+                  <w:rFonts w:ascii="Cambria Math" w:hAnsi="Cambria Math"/>
+                </w:rPr>
+                <m:t>t_b</m:t>
+              </m:r>
+              <m:r>
+                <w:rPr>
+                  <w:rFonts w:ascii="Cambria Math" w:hAnsi="Cambria Math"/>
+                </w:rPr>
+                <m:t>.T-por</m:t>
+              </m:r>
+              <m:r>
+                <w:rPr>
+                  <w:rFonts w:ascii="Cambria Math" w:hAnsi="Cambria Math"/>
+                </w:rPr>
+                <m:t>t_a</m:t>
+              </m:r>
+              <m:r>
+                <w:rPr>
+                  <w:rFonts w:ascii="Cambria Math" w:hAnsi="Cambria Math"/>
+                </w:rPr>
+                <m:t>.T</m:t>
+              </m:r>
+            </m:e>
+          </m:d>
+        </m:oMath>
+      </m:oMathPara>
+    </w:p>
+    <w:p>
+      <w:pPr>
+        <w:rPr>
+          <w:lang w:val="fr-FR"/>
+        </w:rPr>
+      </w:pPr>
+    </w:p>
+    <w:p>
+      <w:pPr>
         <w:pStyle w:val="Titre2"/>
         <w:rPr>
           <w:rFonts w:eastAsiaTheme="minorEastAsia"/>
@@ -1780,6 +2385,8 @@
           <w:lang w:val="fr-FR"/>
         </w:rPr>
       </w:pPr>
+      <w:bookmarkStart w:id="2" w:name="_GoBack"/>
+      <w:bookmarkEnd w:id="2"/>
     </w:p>
     <w:p>
       <w:pPr>
@@ -1788,7 +2395,7 @@
           <w:rFonts w:eastAsiaTheme="minorEastAsia"/>
         </w:rPr>
       </w:pPr>
-      <w:bookmarkStart w:id="2" w:name="_Toc37080175"/>
+      <w:bookmarkStart w:id="3" w:name="_Toc37080175"/>
       <w:proofErr w:type="spellStart"/>
       <w:r>
         <w:rPr>
@@ -1796,7 +2403,7 @@
         </w:rPr>
         <w:t>FreeConvection</w:t>
       </w:r>
-      <w:bookmarkEnd w:id="2"/>
+      <w:bookmarkEnd w:id="3"/>
       <w:proofErr w:type="spellEnd"/>
     </w:p>
     <w:p/>
@@ -1843,14 +2450,14 @@
           <w:rFonts w:eastAsiaTheme="minorEastAsia"/>
         </w:rPr>
       </w:pPr>
-      <w:bookmarkStart w:id="3" w:name="_Toc37080176"/>
+      <w:bookmarkStart w:id="4" w:name="_Toc37080176"/>
       <w:r>
         <w:rPr>
           <w:rFonts w:eastAsiaTheme="minorEastAsia"/>
         </w:rPr>
         <w:t>Linear conduction</w:t>
       </w:r>
-      <w:bookmarkEnd w:id="3"/>
+      <w:bookmarkEnd w:id="4"/>
     </w:p>
     <w:p/>
     <w:p>
@@ -1930,14 +2537,14 @@
           <w:rFonts w:eastAsiaTheme="minorEastAsia"/>
         </w:rPr>
       </w:pPr>
-      <w:bookmarkStart w:id="4" w:name="_Toc37080177"/>
+      <w:bookmarkStart w:id="5" w:name="_Toc37080177"/>
       <w:r>
         <w:rPr>
           <w:rFonts w:eastAsiaTheme="minorEastAsia"/>
         </w:rPr>
         <w:t>Cylindrical conduction</w:t>
       </w:r>
-      <w:bookmarkEnd w:id="4"/>
+      <w:bookmarkEnd w:id="5"/>
     </w:p>
     <w:p>
       <w:pPr>
@@ -1958,13 +2565,7 @@
             <w:rPr>
               <w:rFonts w:ascii="Cambria Math" w:eastAsiaTheme="minorEastAsia" w:hAnsi="Cambria Math"/>
             </w:rPr>
-            <m:t>Q_flow=ad</m:t>
-          </m:r>
-          <m:r>
-            <w:rPr>
-              <w:rFonts w:ascii="Cambria Math" w:eastAsiaTheme="minorEastAsia" w:hAnsi="Cambria Math"/>
-            </w:rPr>
-            <m:t>d_on×</m:t>
+            <m:t>Q_flow=add_on×</m:t>
           </m:r>
           <m:f>
             <m:fPr>
@@ -2070,14 +2671,14 @@
           <w:rFonts w:eastAsiaTheme="minorEastAsia"/>
         </w:rPr>
       </w:pPr>
-      <w:bookmarkStart w:id="5" w:name="_Toc37080178"/>
+      <w:bookmarkStart w:id="6" w:name="_Toc37080178"/>
       <w:r>
         <w:rPr>
           <w:rFonts w:eastAsiaTheme="minorEastAsia"/>
         </w:rPr>
         <w:t>Carroll radiation</w:t>
       </w:r>
-      <w:bookmarkEnd w:id="5"/>
+      <w:bookmarkEnd w:id="6"/>
     </w:p>
     <w:p>
       <w:pPr>
@@ -2551,7 +3152,7 @@
           <w:rFonts w:eastAsiaTheme="minorEastAsia"/>
         </w:rPr>
       </w:pPr>
-      <w:bookmarkStart w:id="6" w:name="_Toc37080179"/>
+      <w:bookmarkStart w:id="7" w:name="_Toc37080179"/>
       <w:proofErr w:type="spellStart"/>
       <w:r>
         <w:rPr>
@@ -2559,7 +3160,7 @@
         </w:rPr>
         <w:t>HeatCapacitor</w:t>
       </w:r>
-      <w:bookmarkEnd w:id="6"/>
+      <w:bookmarkEnd w:id="7"/>
       <w:proofErr w:type="spellEnd"/>
     </w:p>
     <w:p/>
@@ -2626,7 +3227,7 @@
           <w:rFonts w:eastAsiaTheme="minorEastAsia"/>
         </w:rPr>
       </w:pPr>
-      <w:bookmarkStart w:id="7" w:name="_Toc37080180"/>
+      <w:bookmarkStart w:id="8" w:name="_Toc37080180"/>
       <w:proofErr w:type="spellStart"/>
       <w:r>
         <w:rPr>
@@ -2634,7 +3235,7 @@
         </w:rPr>
         <w:t>LumpVolume</w:t>
       </w:r>
-      <w:bookmarkEnd w:id="7"/>
+      <w:bookmarkEnd w:id="8"/>
       <w:proofErr w:type="spellEnd"/>
     </w:p>
     <w:p/>
@@ -2650,7 +3251,6 @@
             <w:rPr>
               <w:rFonts w:ascii="Cambria Math" w:eastAsiaTheme="minorEastAsia" w:hAnsi="Cambria Math"/>
             </w:rPr>
-            <w:lastRenderedPageBreak/>
             <m:t>m ×</m:t>
           </m:r>
           <m:f>
@@ -2740,14 +3340,14 @@
           <w:rFonts w:eastAsiaTheme="minorEastAsia"/>
         </w:rPr>
       </w:pPr>
-      <w:bookmarkStart w:id="8" w:name="_Toc37080181"/>
+      <w:bookmarkStart w:id="9" w:name="_Toc37080181"/>
       <w:r>
         <w:rPr>
           <w:rFonts w:eastAsiaTheme="minorEastAsia"/>
         </w:rPr>
         <w:t>Heat Exchanger</w:t>
       </w:r>
-      <w:bookmarkEnd w:id="8"/>
+      <w:bookmarkEnd w:id="9"/>
     </w:p>
     <w:p/>
     <w:p>
@@ -3619,7 +4219,7 @@
           <w:lang w:val="fr-FR"/>
         </w:rPr>
       </w:pPr>
-      <w:bookmarkStart w:id="9" w:name="_Toc37080182"/>
+      <w:bookmarkStart w:id="10" w:name="_Toc37080182"/>
       <w:proofErr w:type="spellStart"/>
       <w:r>
         <w:rPr>
@@ -3629,7 +4229,7 @@
         <w:lastRenderedPageBreak/>
         <w:t>Functions</w:t>
       </w:r>
-      <w:bookmarkEnd w:id="9"/>
+      <w:bookmarkEnd w:id="10"/>
       <w:proofErr w:type="spellEnd"/>
     </w:p>
     <w:p>
@@ -3646,7 +4246,7 @@
           <w:rFonts w:eastAsiaTheme="minorEastAsia"/>
         </w:rPr>
       </w:pPr>
-      <w:bookmarkStart w:id="10" w:name="_Toc37080183"/>
+      <w:bookmarkStart w:id="11" w:name="_Toc37080183"/>
       <w:proofErr w:type="spellStart"/>
       <w:r>
         <w:rPr>
@@ -3654,7 +4254,7 @@
         </w:rPr>
         <w:t>Flat_plate_ASHRAE</w:t>
       </w:r>
-      <w:bookmarkEnd w:id="10"/>
+      <w:bookmarkEnd w:id="11"/>
       <w:proofErr w:type="spellEnd"/>
     </w:p>
     <w:p>
@@ -3768,7 +4368,7 @@
           <w:rFonts w:eastAsiaTheme="minorEastAsia"/>
         </w:rPr>
       </w:pPr>
-      <w:bookmarkStart w:id="11" w:name="_Toc37080184"/>
+      <w:bookmarkStart w:id="12" w:name="_Toc37080184"/>
       <w:proofErr w:type="spellStart"/>
       <w:r>
         <w:rPr>
@@ -3776,7 +4376,7 @@
         </w:rPr>
         <w:t>h_rad</w:t>
       </w:r>
-      <w:bookmarkEnd w:id="11"/>
+      <w:bookmarkEnd w:id="12"/>
       <w:proofErr w:type="spellEnd"/>
     </w:p>
     <w:p>
@@ -3891,7 +4491,7 @@
           <w:rFonts w:eastAsiaTheme="minorEastAsia"/>
         </w:rPr>
       </w:pPr>
-      <w:bookmarkStart w:id="12" w:name="_Toc37080185"/>
+      <w:bookmarkStart w:id="13" w:name="_Toc37080185"/>
       <w:proofErr w:type="spellStart"/>
       <w:proofErr w:type="gramStart"/>
       <w:r>
@@ -3900,7 +4500,7 @@
         </w:rPr>
         <w:t>uniformGrid</w:t>
       </w:r>
-      <w:bookmarkEnd w:id="12"/>
+      <w:bookmarkEnd w:id="13"/>
       <w:proofErr w:type="spellEnd"/>
       <w:proofErr w:type="gramEnd"/>
     </w:p>
@@ -4036,7 +4636,7 @@
           <w:rFonts w:eastAsiaTheme="minorEastAsia"/>
         </w:rPr>
       </w:pPr>
-      <w:bookmarkStart w:id="13" w:name="_Toc37080186"/>
+      <w:bookmarkStart w:id="14" w:name="_Toc37080186"/>
       <w:proofErr w:type="spellStart"/>
       <w:proofErr w:type="gramStart"/>
       <w:r>
@@ -4045,7 +4645,7 @@
         </w:rPr>
         <w:t>geometricalGrowthGrid</w:t>
       </w:r>
-      <w:bookmarkEnd w:id="13"/>
+      <w:bookmarkEnd w:id="14"/>
       <w:proofErr w:type="spellEnd"/>
       <w:proofErr w:type="gramEnd"/>
     </w:p>
@@ -5050,7 +5650,7 @@
           <w:rFonts w:eastAsiaTheme="minorEastAsia"/>
         </w:rPr>
       </w:pPr>
-      <w:bookmarkStart w:id="14" w:name="_Toc37080187"/>
+      <w:bookmarkStart w:id="15" w:name="_Toc37080187"/>
       <w:proofErr w:type="spellStart"/>
       <w:proofErr w:type="gramStart"/>
       <w:r>
@@ -5059,7 +5659,7 @@
         </w:rPr>
         <w:t>biotAndUniformGrid</w:t>
       </w:r>
-      <w:bookmarkEnd w:id="14"/>
+      <w:bookmarkEnd w:id="15"/>
       <w:proofErr w:type="spellEnd"/>
       <w:proofErr w:type="gramEnd"/>
     </w:p>
@@ -5298,7 +5898,7 @@
           <w:rFonts w:eastAsiaTheme="minorEastAsia"/>
         </w:rPr>
       </w:pPr>
-      <w:bookmarkStart w:id="15" w:name="_Toc37080188"/>
+      <w:bookmarkStart w:id="16" w:name="_Toc37080188"/>
       <w:proofErr w:type="spellStart"/>
       <w:proofErr w:type="gramStart"/>
       <w:r>
@@ -5307,7 +5907,7 @@
         </w:rPr>
         <w:t>biotAndGeometricalGrowthGrid</w:t>
       </w:r>
-      <w:bookmarkEnd w:id="15"/>
+      <w:bookmarkEnd w:id="16"/>
       <w:proofErr w:type="spellEnd"/>
       <w:proofErr w:type="gramEnd"/>
     </w:p>
@@ -6499,13 +7099,7 @@
             <w:rPr>
               <w:rFonts w:ascii="Cambria Math" w:eastAsiaTheme="minorEastAsia" w:hAnsi="Cambria Math"/>
             </w:rPr>
-            <m:t xml:space="preserve"> </m:t>
-          </m:r>
-          <m:r>
-            <w:rPr>
-              <w:rFonts w:ascii="Cambria Math" w:eastAsiaTheme="minorEastAsia" w:hAnsi="Cambria Math"/>
-            </w:rPr>
-            <m:t>For Cr≥0.99</m:t>
+            <m:t xml:space="preserve"> For Cr≥0.99</m:t>
           </m:r>
         </m:oMath>
       </m:oMathPara>
@@ -6522,19 +7116,7 @@
             <w:rPr>
               <w:rFonts w:ascii="Cambria Math" w:eastAsiaTheme="minorEastAsia" w:hAnsi="Cambria Math"/>
             </w:rPr>
-            <m:t>Eff=polynomial interpolation(Eff, Eff(Cr=1))</m:t>
-          </m:r>
-          <m:r>
-            <w:rPr>
-              <w:rFonts w:ascii="Cambria Math" w:eastAsiaTheme="minorEastAsia" w:hAnsi="Cambria Math"/>
-            </w:rPr>
-            <m:t xml:space="preserve"> </m:t>
-          </m:r>
-          <m:r>
-            <w:rPr>
-              <w:rFonts w:ascii="Cambria Math" w:eastAsiaTheme="minorEastAsia" w:hAnsi="Cambria Math"/>
-            </w:rPr>
-            <m:t>For 0.98&lt;Cr&lt;0.99</m:t>
+            <m:t>Eff=polynomial interpolation(Eff, Eff(Cr=1)) For 0.98&lt;Cr&lt;0.99</m:t>
           </m:r>
         </m:oMath>
       </m:oMathPara>
@@ -6591,13 +7173,7 @@
             <w:rPr>
               <w:rFonts w:ascii="Cambria Math" w:eastAsiaTheme="minorEastAsia" w:hAnsi="Cambria Math"/>
             </w:rPr>
-            <m:t>NTU</m:t>
-          </m:r>
-          <m:r>
-            <w:rPr>
-              <w:rFonts w:ascii="Cambria Math" w:eastAsiaTheme="minorEastAsia" w:hAnsi="Cambria Math"/>
-            </w:rPr>
-            <m:t>=</m:t>
+            <m:t>NTU=</m:t>
           </m:r>
           <m:f>
             <m:fPr>
@@ -6687,19 +7263,7 @@
                     <w:rPr>
                       <w:rFonts w:ascii="Cambria Math" w:eastAsiaTheme="minorEastAsia" w:hAnsi="Cambria Math"/>
                     </w:rPr>
-                    <m:t>(</m:t>
-                  </m:r>
-                  <m:r>
-                    <w:rPr>
-                      <w:rFonts w:ascii="Cambria Math" w:eastAsiaTheme="minorEastAsia" w:hAnsi="Cambria Math"/>
-                    </w:rPr>
-                    <m:t>Eff</m:t>
-                  </m:r>
-                  <m:r>
-                    <w:rPr>
-                      <w:rFonts w:ascii="Cambria Math" w:eastAsiaTheme="minorEastAsia" w:hAnsi="Cambria Math"/>
-                    </w:rPr>
-                    <m:t>,0.999)</m:t>
+                    <m:t>(Eff,0.999)</m:t>
                   </m:r>
                 </m:den>
               </m:f>
@@ -6726,13 +7290,7 @@
             <w:rPr>
               <w:rFonts w:ascii="Cambria Math" w:eastAsiaTheme="minorEastAsia" w:hAnsi="Cambria Math"/>
             </w:rPr>
-            <m:t>NTU</m:t>
-          </m:r>
-          <m:r>
-            <w:rPr>
-              <w:rFonts w:ascii="Cambria Math" w:eastAsiaTheme="minorEastAsia" w:hAnsi="Cambria Math"/>
-            </w:rPr>
-            <m:t>(Cr=1)=</m:t>
+            <m:t>NTU(Cr=1)=</m:t>
           </m:r>
           <m:f>
             <m:fPr>
@@ -6773,21 +7331,13 @@
                 </w:rPr>
                 <m:t>(Eff,0.999)</m:t>
               </m:r>
-              <w:bookmarkStart w:id="16" w:name="_GoBack"/>
-              <w:bookmarkEnd w:id="16"/>
             </m:den>
           </m:f>
           <m:r>
             <w:rPr>
               <w:rFonts w:ascii="Cambria Math" w:eastAsiaTheme="minorEastAsia" w:hAnsi="Cambria Math"/>
             </w:rPr>
-            <m:t xml:space="preserve"> </m:t>
-          </m:r>
-          <m:r>
-            <w:rPr>
-              <w:rFonts w:ascii="Cambria Math" w:eastAsiaTheme="minorEastAsia" w:hAnsi="Cambria Math"/>
-            </w:rPr>
-            <m:t>For Cr≥0.99</m:t>
+            <m:t xml:space="preserve"> For Cr≥0.99</m:t>
           </m:r>
         </m:oMath>
       </m:oMathPara>
@@ -6804,43 +7354,7 @@
             <w:rPr>
               <w:rFonts w:ascii="Cambria Math" w:eastAsiaTheme="minorEastAsia" w:hAnsi="Cambria Math"/>
             </w:rPr>
-            <m:t>Eff=polynomial interpolation(</m:t>
-          </m:r>
-          <m:r>
-            <w:rPr>
-              <w:rFonts w:ascii="Cambria Math" w:eastAsiaTheme="minorEastAsia" w:hAnsi="Cambria Math"/>
-            </w:rPr>
-            <m:t>NTU</m:t>
-          </m:r>
-          <m:r>
-            <w:rPr>
-              <w:rFonts w:ascii="Cambria Math" w:eastAsiaTheme="minorEastAsia" w:hAnsi="Cambria Math"/>
-            </w:rPr>
-            <m:t xml:space="preserve">, </m:t>
-          </m:r>
-          <m:r>
-            <w:rPr>
-              <w:rFonts w:ascii="Cambria Math" w:eastAsiaTheme="minorEastAsia" w:hAnsi="Cambria Math"/>
-            </w:rPr>
-            <m:t>NTU</m:t>
-          </m:r>
-          <m:r>
-            <w:rPr>
-              <w:rFonts w:ascii="Cambria Math" w:eastAsiaTheme="minorEastAsia" w:hAnsi="Cambria Math"/>
-            </w:rPr>
-            <m:t>(Cr=1))</m:t>
-          </m:r>
-          <m:r>
-            <w:rPr>
-              <w:rFonts w:ascii="Cambria Math" w:eastAsiaTheme="minorEastAsia" w:hAnsi="Cambria Math"/>
-            </w:rPr>
-            <m:t xml:space="preserve"> </m:t>
-          </m:r>
-          <m:r>
-            <w:rPr>
-              <w:rFonts w:ascii="Cambria Math" w:eastAsiaTheme="minorEastAsia" w:hAnsi="Cambria Math"/>
-            </w:rPr>
-            <m:t>For 0.98&lt;Cr&lt;0.99</m:t>
+            <m:t>Eff=polynomial interpolation(NTU, NTU(Cr=1)) For 0.98&lt;Cr&lt;0.99</m:t>
           </m:r>
         </m:oMath>
       </m:oMathPara>
@@ -11197,7 +11711,7 @@
   <a:extraClrSchemeLst/>
   <a:extLst>
     <a:ext uri="{05A4C25C-085E-4340-85A3-A5531E510DB2}">
-      <thm15:themeFamily xmlns:thm15="http://schemas.microsoft.com/office/thememl/2012/main" xmlns="" name="Office Theme" id="{62F939B6-93AF-4DB8-9C6B-D6C7DFDC589F}" vid="{4A3C46E8-61CC-4603-A589-7422A47A8E4A}"/>
+      <thm15:themeFamily xmlns="" xmlns:thm15="http://schemas.microsoft.com/office/thememl/2012/main" name="Office Theme" id="{62F939B6-93AF-4DB8-9C6B-D6C7DFDC589F}" vid="{4A3C46E8-61CC-4603-A589-7422A47A8E4A}"/>
     </a:ext>
   </a:extLst>
 </a:theme>
@@ -11208,7 +11722,7 @@
 </file>
 
 <file path=customXml/itemProps1.xml><?xml version="1.0" encoding="utf-8"?>
-<ds:datastoreItem xmlns:ds="http://schemas.openxmlformats.org/officeDocument/2006/customXml" ds:itemID="{93005CAA-1F25-4924-B73C-79640B1248CF}">
+<ds:datastoreItem xmlns:ds="http://schemas.openxmlformats.org/officeDocument/2006/customXml" ds:itemID="{8E31ABD0-1773-42D6-B028-7954C1BCD82F}">
   <ds:schemaRefs>
     <ds:schemaRef ds:uri="http://schemas.openxmlformats.org/officeDocument/2006/bibliography"/>
   </ds:schemaRefs>

</xml_diff>

<commit_message>
Addition of the FanVentilation module and its test in HeatTransfer.Components
</commit_message>
<xml_diff>
--- a/Information/script for equations.docx
+++ b/Information/script for equations.docx
@@ -19,7 +19,6 @@
           <w:docPartUnique/>
         </w:docPartObj>
       </w:sdtPr>
-      <w:sdtEndPr/>
       <w:sdtContent>
         <w:p>
           <w:pPr>
@@ -60,7 +59,7 @@
           <w:r>
             <w:fldChar w:fldCharType="separate"/>
           </w:r>
-          <w:hyperlink w:anchor="_Toc37080173" w:history="1">
+          <w:hyperlink w:anchor="_Toc37234514" w:history="1">
             <w:r>
               <w:rPr>
                 <w:rStyle w:val="Lienhypertexte"/>
@@ -104,7 +103,7 @@
                 <w:noProof/>
                 <w:webHidden/>
               </w:rPr>
-              <w:instrText xml:space="preserve"> PAGEREF _Toc37080173 \h </w:instrText>
+              <w:instrText xml:space="preserve"> PAGEREF _Toc37234514 \h </w:instrText>
             </w:r>
             <w:r>
               <w:rPr>
@@ -148,7 +147,7 @@
               <w:lang w:eastAsia="en-GB"/>
             </w:rPr>
           </w:pPr>
-          <w:hyperlink w:anchor="_Toc37080174" w:history="1">
+          <w:hyperlink w:anchor="_Toc37234515" w:history="1">
             <w:r>
               <w:rPr>
                 <w:rStyle w:val="Lienhypertexte"/>
@@ -171,7 +170,7 @@
                 <w:noProof/>
                 <w:lang w:val="fr-FR"/>
               </w:rPr>
-              <w:t>BasesClasses</w:t>
+              <w:t>Components</w:t>
             </w:r>
             <w:r>
               <w:rPr>
@@ -192,7 +191,7 @@
                 <w:noProof/>
                 <w:webHidden/>
               </w:rPr>
-              <w:instrText xml:space="preserve"> PAGEREF _Toc37080174 \h </w:instrText>
+              <w:instrText xml:space="preserve"> PAGEREF _Toc37234515 \h </w:instrText>
             </w:r>
             <w:r>
               <w:rPr>
@@ -236,7 +235,7 @@
               <w:lang w:eastAsia="en-GB"/>
             </w:rPr>
           </w:pPr>
-          <w:hyperlink w:anchor="_Toc37080175" w:history="1">
+          <w:hyperlink w:anchor="_Toc37234516" w:history="1">
             <w:r>
               <w:rPr>
                 <w:rStyle w:val="Lienhypertexte"/>
@@ -257,7 +256,7 @@
                 <w:rStyle w:val="Lienhypertexte"/>
                 <w:noProof/>
               </w:rPr>
-              <w:t>FreeConvection</w:t>
+              <w:t>Ventilation</w:t>
             </w:r>
             <w:r>
               <w:rPr>
@@ -278,7 +277,95 @@
                 <w:noProof/>
                 <w:webHidden/>
               </w:rPr>
-              <w:instrText xml:space="preserve"> PAGEREF _Toc37080175 \h </w:instrText>
+              <w:instrText xml:space="preserve"> PAGEREF _Toc37234516 \h </w:instrText>
+            </w:r>
+            <w:r>
+              <w:rPr>
+                <w:noProof/>
+                <w:webHidden/>
+              </w:rPr>
+            </w:r>
+            <w:r>
+              <w:rPr>
+                <w:noProof/>
+                <w:webHidden/>
+              </w:rPr>
+              <w:fldChar w:fldCharType="separate"/>
+            </w:r>
+            <w:r>
+              <w:rPr>
+                <w:noProof/>
+                <w:webHidden/>
+              </w:rPr>
+              <w:t>2</w:t>
+            </w:r>
+            <w:r>
+              <w:rPr>
+                <w:noProof/>
+                <w:webHidden/>
+              </w:rPr>
+              <w:fldChar w:fldCharType="end"/>
+            </w:r>
+          </w:hyperlink>
+        </w:p>
+        <w:p>
+          <w:pPr>
+            <w:pStyle w:val="TM2"/>
+            <w:tabs>
+              <w:tab w:val="left" w:pos="660"/>
+              <w:tab w:val="right" w:leader="dot" w:pos="9062"/>
+            </w:tabs>
+            <w:rPr>
+              <w:rFonts w:eastAsiaTheme="minorEastAsia"/>
+              <w:noProof/>
+              <w:lang w:eastAsia="en-GB"/>
+            </w:rPr>
+          </w:pPr>
+          <w:hyperlink w:anchor="_Toc37234517" w:history="1">
+            <w:r>
+              <w:rPr>
+                <w:rStyle w:val="Lienhypertexte"/>
+                <w:noProof/>
+                <w:lang w:val="fr-FR"/>
+              </w:rPr>
+              <w:t>B.</w:t>
+            </w:r>
+            <w:r>
+              <w:rPr>
+                <w:rFonts w:eastAsiaTheme="minorEastAsia"/>
+                <w:noProof/>
+                <w:lang w:eastAsia="en-GB"/>
+              </w:rPr>
+              <w:tab/>
+            </w:r>
+            <w:r>
+              <w:rPr>
+                <w:rStyle w:val="Lienhypertexte"/>
+                <w:noProof/>
+                <w:lang w:val="fr-FR"/>
+              </w:rPr>
+              <w:t>BasesClasses</w:t>
+            </w:r>
+            <w:r>
+              <w:rPr>
+                <w:noProof/>
+                <w:webHidden/>
+              </w:rPr>
+              <w:tab/>
+            </w:r>
+            <w:r>
+              <w:rPr>
+                <w:noProof/>
+                <w:webHidden/>
+              </w:rPr>
+              <w:fldChar w:fldCharType="begin"/>
+            </w:r>
+            <w:r>
+              <w:rPr>
+                <w:noProof/>
+                <w:webHidden/>
+              </w:rPr>
+              <w:instrText xml:space="preserve"> PAGEREF _Toc37234517 \h </w:instrText>
             </w:r>
             <w:r>
               <w:rPr>
@@ -322,13 +409,13 @@
               <w:lang w:eastAsia="en-GB"/>
             </w:rPr>
           </w:pPr>
-          <w:hyperlink w:anchor="_Toc37080176" w:history="1">
+          <w:hyperlink w:anchor="_Toc37234518" w:history="1">
             <w:r>
               <w:rPr>
                 <w:rStyle w:val="Lienhypertexte"/>
                 <w:noProof/>
               </w:rPr>
-              <w:t>2.</w:t>
+              <w:t>1.</w:t>
             </w:r>
             <w:r>
               <w:rPr>
@@ -343,7 +430,7 @@
                 <w:rStyle w:val="Lienhypertexte"/>
                 <w:noProof/>
               </w:rPr>
-              <w:t>Linear conduction</w:t>
+              <w:t>FreeConvection</w:t>
             </w:r>
             <w:r>
               <w:rPr>
@@ -364,7 +451,7 @@
                 <w:noProof/>
                 <w:webHidden/>
               </w:rPr>
-              <w:instrText xml:space="preserve"> PAGEREF _Toc37080176 \h </w:instrText>
+              <w:instrText xml:space="preserve"> PAGEREF _Toc37234518 \h </w:instrText>
             </w:r>
             <w:r>
               <w:rPr>
@@ -408,13 +495,13 @@
               <w:lang w:eastAsia="en-GB"/>
             </w:rPr>
           </w:pPr>
-          <w:hyperlink w:anchor="_Toc37080177" w:history="1">
+          <w:hyperlink w:anchor="_Toc37234519" w:history="1">
             <w:r>
               <w:rPr>
                 <w:rStyle w:val="Lienhypertexte"/>
                 <w:noProof/>
               </w:rPr>
-              <w:t>3.</w:t>
+              <w:t>2.</w:t>
             </w:r>
             <w:r>
               <w:rPr>
@@ -429,7 +516,7 @@
                 <w:rStyle w:val="Lienhypertexte"/>
                 <w:noProof/>
               </w:rPr>
-              <w:t>Cylindrical conduction</w:t>
+              <w:t>Linear conduction</w:t>
             </w:r>
             <w:r>
               <w:rPr>
@@ -450,7 +537,7 @@
                 <w:noProof/>
                 <w:webHidden/>
               </w:rPr>
-              <w:instrText xml:space="preserve"> PAGEREF _Toc37080177 \h </w:instrText>
+              <w:instrText xml:space="preserve"> PAGEREF _Toc37234519 \h </w:instrText>
             </w:r>
             <w:r>
               <w:rPr>
@@ -494,13 +581,13 @@
               <w:lang w:eastAsia="en-GB"/>
             </w:rPr>
           </w:pPr>
-          <w:hyperlink w:anchor="_Toc37080178" w:history="1">
+          <w:hyperlink w:anchor="_Toc37234520" w:history="1">
             <w:r>
               <w:rPr>
                 <w:rStyle w:val="Lienhypertexte"/>
                 <w:noProof/>
               </w:rPr>
-              <w:t>4.</w:t>
+              <w:t>3.</w:t>
             </w:r>
             <w:r>
               <w:rPr>
@@ -515,7 +602,7 @@
                 <w:rStyle w:val="Lienhypertexte"/>
                 <w:noProof/>
               </w:rPr>
-              <w:t>Carroll radiation</w:t>
+              <w:t>Cylindrical conduction</w:t>
             </w:r>
             <w:r>
               <w:rPr>
@@ -536,7 +623,7 @@
                 <w:noProof/>
                 <w:webHidden/>
               </w:rPr>
-              <w:instrText xml:space="preserve"> PAGEREF _Toc37080178 \h </w:instrText>
+              <w:instrText xml:space="preserve"> PAGEREF _Toc37234520 \h </w:instrText>
             </w:r>
             <w:r>
               <w:rPr>
@@ -580,13 +667,13 @@
               <w:lang w:eastAsia="en-GB"/>
             </w:rPr>
           </w:pPr>
-          <w:hyperlink w:anchor="_Toc37080179" w:history="1">
+          <w:hyperlink w:anchor="_Toc37234521" w:history="1">
             <w:r>
               <w:rPr>
                 <w:rStyle w:val="Lienhypertexte"/>
                 <w:noProof/>
               </w:rPr>
-              <w:t>5.</w:t>
+              <w:t>4.</w:t>
             </w:r>
             <w:r>
               <w:rPr>
@@ -601,7 +688,7 @@
                 <w:rStyle w:val="Lienhypertexte"/>
                 <w:noProof/>
               </w:rPr>
-              <w:t>HeatCapacitor</w:t>
+              <w:t>Carroll radiation</w:t>
             </w:r>
             <w:r>
               <w:rPr>
@@ -622,7 +709,7 @@
                 <w:noProof/>
                 <w:webHidden/>
               </w:rPr>
-              <w:instrText xml:space="preserve"> PAGEREF _Toc37080179 \h </w:instrText>
+              <w:instrText xml:space="preserve"> PAGEREF _Toc37234521 \h </w:instrText>
             </w:r>
             <w:r>
               <w:rPr>
@@ -666,13 +753,13 @@
               <w:lang w:eastAsia="en-GB"/>
             </w:rPr>
           </w:pPr>
-          <w:hyperlink w:anchor="_Toc37080180" w:history="1">
+          <w:hyperlink w:anchor="_Toc37234522" w:history="1">
             <w:r>
               <w:rPr>
                 <w:rStyle w:val="Lienhypertexte"/>
                 <w:noProof/>
               </w:rPr>
-              <w:t>6.</w:t>
+              <w:t>5.</w:t>
             </w:r>
             <w:r>
               <w:rPr>
@@ -687,7 +774,7 @@
                 <w:rStyle w:val="Lienhypertexte"/>
                 <w:noProof/>
               </w:rPr>
-              <w:t>LumpVolume</w:t>
+              <w:t>HeatCapacitor</w:t>
             </w:r>
             <w:r>
               <w:rPr>
@@ -708,7 +795,7 @@
                 <w:noProof/>
                 <w:webHidden/>
               </w:rPr>
-              <w:instrText xml:space="preserve"> PAGEREF _Toc37080180 \h </w:instrText>
+              <w:instrText xml:space="preserve"> PAGEREF _Toc37234522 \h </w:instrText>
             </w:r>
             <w:r>
               <w:rPr>
@@ -728,7 +815,7 @@
                 <w:noProof/>
                 <w:webHidden/>
               </w:rPr>
-              <w:t>2</w:t>
+              <w:t>3</w:t>
             </w:r>
             <w:r>
               <w:rPr>
@@ -752,12 +839,98 @@
               <w:lang w:eastAsia="en-GB"/>
             </w:rPr>
           </w:pPr>
-          <w:hyperlink w:anchor="_Toc37080181" w:history="1">
+          <w:hyperlink w:anchor="_Toc37234523" w:history="1">
             <w:r>
               <w:rPr>
                 <w:rStyle w:val="Lienhypertexte"/>
                 <w:noProof/>
               </w:rPr>
+              <w:t>6.</w:t>
+            </w:r>
+            <w:r>
+              <w:rPr>
+                <w:rFonts w:eastAsiaTheme="minorEastAsia"/>
+                <w:noProof/>
+                <w:lang w:eastAsia="en-GB"/>
+              </w:rPr>
+              <w:tab/>
+            </w:r>
+            <w:r>
+              <w:rPr>
+                <w:rStyle w:val="Lienhypertexte"/>
+                <w:noProof/>
+              </w:rPr>
+              <w:t>LumpVolume</w:t>
+            </w:r>
+            <w:r>
+              <w:rPr>
+                <w:noProof/>
+                <w:webHidden/>
+              </w:rPr>
+              <w:tab/>
+            </w:r>
+            <w:r>
+              <w:rPr>
+                <w:noProof/>
+                <w:webHidden/>
+              </w:rPr>
+              <w:fldChar w:fldCharType="begin"/>
+            </w:r>
+            <w:r>
+              <w:rPr>
+                <w:noProof/>
+                <w:webHidden/>
+              </w:rPr>
+              <w:instrText xml:space="preserve"> PAGEREF _Toc37234523 \h </w:instrText>
+            </w:r>
+            <w:r>
+              <w:rPr>
+                <w:noProof/>
+                <w:webHidden/>
+              </w:rPr>
+            </w:r>
+            <w:r>
+              <w:rPr>
+                <w:noProof/>
+                <w:webHidden/>
+              </w:rPr>
+              <w:fldChar w:fldCharType="separate"/>
+            </w:r>
+            <w:r>
+              <w:rPr>
+                <w:noProof/>
+                <w:webHidden/>
+              </w:rPr>
+              <w:t>3</w:t>
+            </w:r>
+            <w:r>
+              <w:rPr>
+                <w:noProof/>
+                <w:webHidden/>
+              </w:rPr>
+              <w:fldChar w:fldCharType="end"/>
+            </w:r>
+          </w:hyperlink>
+        </w:p>
+        <w:p>
+          <w:pPr>
+            <w:pStyle w:val="TM3"/>
+            <w:tabs>
+              <w:tab w:val="left" w:pos="880"/>
+              <w:tab w:val="right" w:leader="dot" w:pos="9062"/>
+            </w:tabs>
+            <w:rPr>
+              <w:rFonts w:eastAsiaTheme="minorEastAsia"/>
+              <w:noProof/>
+              <w:lang w:eastAsia="en-GB"/>
+            </w:rPr>
+          </w:pPr>
+          <w:hyperlink w:anchor="_Toc37234524" w:history="1">
+            <w:r>
+              <w:rPr>
+                <w:rStyle w:val="Lienhypertexte"/>
+                <w:noProof/>
+              </w:rPr>
               <w:t>7.</w:t>
             </w:r>
             <w:r>
@@ -794,7 +967,7 @@
                 <w:noProof/>
                 <w:webHidden/>
               </w:rPr>
-              <w:instrText xml:space="preserve"> PAGEREF _Toc37080181 \h </w:instrText>
+              <w:instrText xml:space="preserve"> PAGEREF _Toc37234524 \h </w:instrText>
             </w:r>
             <w:r>
               <w:rPr>
@@ -814,7 +987,93 @@
                 <w:noProof/>
                 <w:webHidden/>
               </w:rPr>
-              <w:t>2</w:t>
+              <w:t>3</w:t>
+            </w:r>
+            <w:r>
+              <w:rPr>
+                <w:noProof/>
+                <w:webHidden/>
+              </w:rPr>
+              <w:fldChar w:fldCharType="end"/>
+            </w:r>
+          </w:hyperlink>
+        </w:p>
+        <w:p>
+          <w:pPr>
+            <w:pStyle w:val="TM3"/>
+            <w:tabs>
+              <w:tab w:val="left" w:pos="880"/>
+              <w:tab w:val="right" w:leader="dot" w:pos="9062"/>
+            </w:tabs>
+            <w:rPr>
+              <w:rFonts w:eastAsiaTheme="minorEastAsia"/>
+              <w:noProof/>
+              <w:lang w:eastAsia="en-GB"/>
+            </w:rPr>
+          </w:pPr>
+          <w:hyperlink w:anchor="_Toc37234525" w:history="1">
+            <w:r>
+              <w:rPr>
+                <w:rStyle w:val="Lienhypertexte"/>
+                <w:noProof/>
+              </w:rPr>
+              <w:t>8.</w:t>
+            </w:r>
+            <w:r>
+              <w:rPr>
+                <w:rFonts w:eastAsiaTheme="minorEastAsia"/>
+                <w:noProof/>
+                <w:lang w:eastAsia="en-GB"/>
+              </w:rPr>
+              <w:tab/>
+            </w:r>
+            <w:r>
+              <w:rPr>
+                <w:rStyle w:val="Lienhypertexte"/>
+                <w:noProof/>
+              </w:rPr>
+              <w:t>PartialWall</w:t>
+            </w:r>
+            <w:r>
+              <w:rPr>
+                <w:noProof/>
+                <w:webHidden/>
+              </w:rPr>
+              <w:tab/>
+            </w:r>
+            <w:r>
+              <w:rPr>
+                <w:noProof/>
+                <w:webHidden/>
+              </w:rPr>
+              <w:fldChar w:fldCharType="begin"/>
+            </w:r>
+            <w:r>
+              <w:rPr>
+                <w:noProof/>
+                <w:webHidden/>
+              </w:rPr>
+              <w:instrText xml:space="preserve"> PAGEREF _Toc37234525 \h </w:instrText>
+            </w:r>
+            <w:r>
+              <w:rPr>
+                <w:noProof/>
+                <w:webHidden/>
+              </w:rPr>
+            </w:r>
+            <w:r>
+              <w:rPr>
+                <w:noProof/>
+                <w:webHidden/>
+              </w:rPr>
+              <w:fldChar w:fldCharType="separate"/>
+            </w:r>
+            <w:r>
+              <w:rPr>
+                <w:noProof/>
+                <w:webHidden/>
+              </w:rPr>
+              <w:t>3</w:t>
             </w:r>
             <w:r>
               <w:rPr>
@@ -838,14 +1097,14 @@
               <w:lang w:eastAsia="en-GB"/>
             </w:rPr>
           </w:pPr>
-          <w:hyperlink w:anchor="_Toc37080182" w:history="1">
+          <w:hyperlink w:anchor="_Toc37234526" w:history="1">
             <w:r>
               <w:rPr>
                 <w:rStyle w:val="Lienhypertexte"/>
                 <w:noProof/>
                 <w:lang w:val="fr-FR"/>
               </w:rPr>
-              <w:t>B.</w:t>
+              <w:t>C.</w:t>
             </w:r>
             <w:r>
               <w:rPr>
@@ -882,7 +1141,7 @@
                 <w:noProof/>
                 <w:webHidden/>
               </w:rPr>
-              <w:instrText xml:space="preserve"> PAGEREF _Toc37080182 \h </w:instrText>
+              <w:instrText xml:space="preserve"> PAGEREF _Toc37234526 \h </w:instrText>
             </w:r>
             <w:r>
               <w:rPr>
@@ -926,7 +1185,7 @@
               <w:lang w:eastAsia="en-GB"/>
             </w:rPr>
           </w:pPr>
-          <w:hyperlink w:anchor="_Toc37080183" w:history="1">
+          <w:hyperlink w:anchor="_Toc37234527" w:history="1">
             <w:r>
               <w:rPr>
                 <w:rStyle w:val="Lienhypertexte"/>
@@ -968,7 +1227,7 @@
                 <w:noProof/>
                 <w:webHidden/>
               </w:rPr>
-              <w:instrText xml:space="preserve"> PAGEREF _Toc37080183 \h </w:instrText>
+              <w:instrText xml:space="preserve"> PAGEREF _Toc37234527 \h </w:instrText>
             </w:r>
             <w:r>
               <w:rPr>
@@ -1012,7 +1271,7 @@
               <w:lang w:eastAsia="en-GB"/>
             </w:rPr>
           </w:pPr>
-          <w:hyperlink w:anchor="_Toc37080184" w:history="1">
+          <w:hyperlink w:anchor="_Toc37234528" w:history="1">
             <w:r>
               <w:rPr>
                 <w:rStyle w:val="Lienhypertexte"/>
@@ -1054,7 +1313,7 @@
                 <w:noProof/>
                 <w:webHidden/>
               </w:rPr>
-              <w:instrText xml:space="preserve"> PAGEREF _Toc37080184 \h </w:instrText>
+              <w:instrText xml:space="preserve"> PAGEREF _Toc37234528 \h </w:instrText>
             </w:r>
             <w:r>
               <w:rPr>
@@ -1098,7 +1357,7 @@
               <w:lang w:eastAsia="en-GB"/>
             </w:rPr>
           </w:pPr>
-          <w:hyperlink w:anchor="_Toc37080185" w:history="1">
+          <w:hyperlink w:anchor="_Toc37234529" w:history="1">
             <w:r>
               <w:rPr>
                 <w:rStyle w:val="Lienhypertexte"/>
@@ -1140,7 +1399,7 @@
                 <w:noProof/>
                 <w:webHidden/>
               </w:rPr>
-              <w:instrText xml:space="preserve"> PAGEREF _Toc37080185 \h </w:instrText>
+              <w:instrText xml:space="preserve"> PAGEREF _Toc37234529 \h </w:instrText>
             </w:r>
             <w:r>
               <w:rPr>
@@ -1184,7 +1443,7 @@
               <w:lang w:eastAsia="en-GB"/>
             </w:rPr>
           </w:pPr>
-          <w:hyperlink w:anchor="_Toc37080186" w:history="1">
+          <w:hyperlink w:anchor="_Toc37234530" w:history="1">
             <w:r>
               <w:rPr>
                 <w:rStyle w:val="Lienhypertexte"/>
@@ -1226,7 +1485,7 @@
                 <w:noProof/>
                 <w:webHidden/>
               </w:rPr>
-              <w:instrText xml:space="preserve"> PAGEREF _Toc37080186 \h </w:instrText>
+              <w:instrText xml:space="preserve"> PAGEREF _Toc37234530 \h </w:instrText>
             </w:r>
             <w:r>
               <w:rPr>
@@ -1270,7 +1529,7 @@
               <w:lang w:eastAsia="en-GB"/>
             </w:rPr>
           </w:pPr>
-          <w:hyperlink w:anchor="_Toc37080187" w:history="1">
+          <w:hyperlink w:anchor="_Toc37234531" w:history="1">
             <w:r>
               <w:rPr>
                 <w:rStyle w:val="Lienhypertexte"/>
@@ -1312,7 +1571,7 @@
                 <w:noProof/>
                 <w:webHidden/>
               </w:rPr>
-              <w:instrText xml:space="preserve"> PAGEREF _Toc37080187 \h </w:instrText>
+              <w:instrText xml:space="preserve"> PAGEREF _Toc37234531 \h </w:instrText>
             </w:r>
             <w:r>
               <w:rPr>
@@ -1356,7 +1615,7 @@
               <w:lang w:eastAsia="en-GB"/>
             </w:rPr>
           </w:pPr>
-          <w:hyperlink w:anchor="_Toc37080188" w:history="1">
+          <w:hyperlink w:anchor="_Toc37234532" w:history="1">
             <w:r>
               <w:rPr>
                 <w:rStyle w:val="Lienhypertexte"/>
@@ -1398,7 +1657,7 @@
                 <w:noProof/>
                 <w:webHidden/>
               </w:rPr>
-              <w:instrText xml:space="preserve"> PAGEREF _Toc37080188 \h </w:instrText>
+              <w:instrText xml:space="preserve"> PAGEREF _Toc37234532 \h </w:instrText>
             </w:r>
             <w:r>
               <w:rPr>
@@ -1419,6 +1678,178 @@
                 <w:webHidden/>
               </w:rPr>
               <w:t>5</w:t>
+            </w:r>
+            <w:r>
+              <w:rPr>
+                <w:noProof/>
+                <w:webHidden/>
+              </w:rPr>
+              <w:fldChar w:fldCharType="end"/>
+            </w:r>
+          </w:hyperlink>
+        </w:p>
+        <w:p>
+          <w:pPr>
+            <w:pStyle w:val="TM3"/>
+            <w:tabs>
+              <w:tab w:val="left" w:pos="880"/>
+              <w:tab w:val="right" w:leader="dot" w:pos="9062"/>
+            </w:tabs>
+            <w:rPr>
+              <w:rFonts w:eastAsiaTheme="minorEastAsia"/>
+              <w:noProof/>
+              <w:lang w:eastAsia="en-GB"/>
+            </w:rPr>
+          </w:pPr>
+          <w:hyperlink w:anchor="_Toc37234533" w:history="1">
+            <w:r>
+              <w:rPr>
+                <w:rStyle w:val="Lienhypertexte"/>
+                <w:noProof/>
+              </w:rPr>
+              <w:t>7.</w:t>
+            </w:r>
+            <w:r>
+              <w:rPr>
+                <w:rFonts w:eastAsiaTheme="minorEastAsia"/>
+                <w:noProof/>
+                <w:lang w:eastAsia="en-GB"/>
+              </w:rPr>
+              <w:tab/>
+            </w:r>
+            <w:r>
+              <w:rPr>
+                <w:rStyle w:val="Lienhypertexte"/>
+                <w:noProof/>
+              </w:rPr>
+              <w:t>counterCurrent</w:t>
+            </w:r>
+            <w:r>
+              <w:rPr>
+                <w:noProof/>
+                <w:webHidden/>
+              </w:rPr>
+              <w:tab/>
+            </w:r>
+            <w:r>
+              <w:rPr>
+                <w:noProof/>
+                <w:webHidden/>
+              </w:rPr>
+              <w:fldChar w:fldCharType="begin"/>
+            </w:r>
+            <w:r>
+              <w:rPr>
+                <w:noProof/>
+                <w:webHidden/>
+              </w:rPr>
+              <w:instrText xml:space="preserve"> PAGEREF _Toc37234533 \h </w:instrText>
+            </w:r>
+            <w:r>
+              <w:rPr>
+                <w:noProof/>
+                <w:webHidden/>
+              </w:rPr>
+            </w:r>
+            <w:r>
+              <w:rPr>
+                <w:noProof/>
+                <w:webHidden/>
+              </w:rPr>
+              <w:fldChar w:fldCharType="separate"/>
+            </w:r>
+            <w:r>
+              <w:rPr>
+                <w:noProof/>
+                <w:webHidden/>
+              </w:rPr>
+              <w:t>6</w:t>
+            </w:r>
+            <w:r>
+              <w:rPr>
+                <w:noProof/>
+                <w:webHidden/>
+              </w:rPr>
+              <w:fldChar w:fldCharType="end"/>
+            </w:r>
+          </w:hyperlink>
+        </w:p>
+        <w:p>
+          <w:pPr>
+            <w:pStyle w:val="TM3"/>
+            <w:tabs>
+              <w:tab w:val="left" w:pos="880"/>
+              <w:tab w:val="right" w:leader="dot" w:pos="9062"/>
+            </w:tabs>
+            <w:rPr>
+              <w:rFonts w:eastAsiaTheme="minorEastAsia"/>
+              <w:noProof/>
+              <w:lang w:eastAsia="en-GB"/>
+            </w:rPr>
+          </w:pPr>
+          <w:hyperlink w:anchor="_Toc37234534" w:history="1">
+            <w:r>
+              <w:rPr>
+                <w:rStyle w:val="Lienhypertexte"/>
+                <w:noProof/>
+              </w:rPr>
+              <w:t>1.</w:t>
+            </w:r>
+            <w:r>
+              <w:rPr>
+                <w:rFonts w:eastAsiaTheme="minorEastAsia"/>
+                <w:noProof/>
+                <w:lang w:eastAsia="en-GB"/>
+              </w:rPr>
+              <w:tab/>
+            </w:r>
+            <w:r>
+              <w:rPr>
+                <w:rStyle w:val="Lienhypertexte"/>
+                <w:noProof/>
+              </w:rPr>
+              <w:t>NTU_counterCurrent</w:t>
+            </w:r>
+            <w:r>
+              <w:rPr>
+                <w:noProof/>
+                <w:webHidden/>
+              </w:rPr>
+              <w:tab/>
+            </w:r>
+            <w:r>
+              <w:rPr>
+                <w:noProof/>
+                <w:webHidden/>
+              </w:rPr>
+              <w:fldChar w:fldCharType="begin"/>
+            </w:r>
+            <w:r>
+              <w:rPr>
+                <w:noProof/>
+                <w:webHidden/>
+              </w:rPr>
+              <w:instrText xml:space="preserve"> PAGEREF _Toc37234534 \h </w:instrText>
+            </w:r>
+            <w:r>
+              <w:rPr>
+                <w:noProof/>
+                <w:webHidden/>
+              </w:rPr>
+            </w:r>
+            <w:r>
+              <w:rPr>
+                <w:noProof/>
+                <w:webHidden/>
+              </w:rPr>
+              <w:fldChar w:fldCharType="separate"/>
+            </w:r>
+            <w:r>
+              <w:rPr>
+                <w:noProof/>
+                <w:webHidden/>
+              </w:rPr>
+              <w:t>6</w:t>
             </w:r>
             <w:r>
               <w:rPr>
@@ -1442,7 +1873,7 @@
               <w:lang w:eastAsia="en-GB"/>
             </w:rPr>
           </w:pPr>
-          <w:hyperlink w:anchor="_Toc37080189" w:history="1">
+          <w:hyperlink w:anchor="_Toc37234535" w:history="1">
             <w:r>
               <w:rPr>
                 <w:rStyle w:val="Lienhypertexte"/>
@@ -1486,7 +1917,7 @@
                 <w:noProof/>
                 <w:webHidden/>
               </w:rPr>
-              <w:instrText xml:space="preserve"> PAGEREF _Toc37080189 \h </w:instrText>
+              <w:instrText xml:space="preserve"> PAGEREF _Toc37234535 \h </w:instrText>
             </w:r>
             <w:r>
               <w:rPr>
@@ -1530,7 +1961,7 @@
               <w:lang w:eastAsia="en-GB"/>
             </w:rPr>
           </w:pPr>
-          <w:hyperlink w:anchor="_Toc37080190" w:history="1">
+          <w:hyperlink w:anchor="_Toc37234536" w:history="1">
             <w:r>
               <w:rPr>
                 <w:rStyle w:val="Lienhypertexte"/>
@@ -1574,7 +2005,7 @@
                 <w:noProof/>
                 <w:webHidden/>
               </w:rPr>
-              <w:instrText xml:space="preserve"> PAGEREF _Toc37080190 \h </w:instrText>
+              <w:instrText xml:space="preserve"> PAGEREF _Toc37234536 \h </w:instrText>
             </w:r>
             <w:r>
               <w:rPr>
@@ -1618,7 +2049,7 @@
               <w:lang w:eastAsia="en-GB"/>
             </w:rPr>
           </w:pPr>
-          <w:hyperlink w:anchor="_Toc37080191" w:history="1">
+          <w:hyperlink w:anchor="_Toc37234537" w:history="1">
             <w:r>
               <w:rPr>
                 <w:rStyle w:val="Lienhypertexte"/>
@@ -1660,7 +2091,7 @@
                 <w:noProof/>
                 <w:webHidden/>
               </w:rPr>
-              <w:instrText xml:space="preserve"> PAGEREF _Toc37080191 \h </w:instrText>
+              <w:instrText xml:space="preserve"> PAGEREF _Toc37234537 \h </w:instrText>
             </w:r>
             <w:r>
               <w:rPr>
@@ -1742,7 +2173,7 @@
           <w:lang w:val="fr-FR"/>
         </w:rPr>
       </w:pPr>
-      <w:bookmarkStart w:id="0" w:name="_Toc37080173"/>
+      <w:bookmarkStart w:id="0" w:name="_Toc37234514"/>
       <w:proofErr w:type="spellStart"/>
       <w:r>
         <w:rPr>
@@ -1769,12 +2200,14 @@
           <w:lang w:val="fr-FR"/>
         </w:rPr>
       </w:pPr>
+      <w:bookmarkStart w:id="1" w:name="_Toc37234515"/>
       <w:r>
         <w:rPr>
           <w:lang w:val="fr-FR"/>
         </w:rPr>
         <w:t>Components</w:t>
       </w:r>
+      <w:bookmarkEnd w:id="1"/>
     </w:p>
     <w:p>
       <w:pPr>
@@ -1790,12 +2223,14 @@
           <w:rFonts w:eastAsiaTheme="minorEastAsia"/>
         </w:rPr>
       </w:pPr>
+      <w:bookmarkStart w:id="2" w:name="_Toc37234516"/>
       <w:r>
         <w:rPr>
           <w:rFonts w:eastAsiaTheme="minorEastAsia"/>
         </w:rPr>
         <w:t>Ventilation</w:t>
       </w:r>
+      <w:bookmarkEnd w:id="2"/>
     </w:p>
     <w:p/>
     <w:p>
@@ -1810,19 +2245,7 @@
             <w:rPr>
               <w:rFonts w:ascii="Cambria Math" w:hAnsi="Cambria Math"/>
             </w:rPr>
-            <m:t xml:space="preserve">supply: </m:t>
-          </m:r>
-          <m:r>
-            <w:rPr>
-              <w:rFonts w:ascii="Cambria Math" w:hAnsi="Cambria Math"/>
-            </w:rPr>
-            <m:t>H</m:t>
-          </m:r>
-          <m:r>
-            <w:rPr>
-              <w:rFonts w:ascii="Cambria Math" w:hAnsi="Cambria Math"/>
-            </w:rPr>
-            <m:t>_flow=m_flow×(</m:t>
+            <m:t>supply: H_flow=m_flow×(</m:t>
           </m:r>
           <m:sSub>
             <m:sSubPr>
@@ -1999,19 +2422,7 @@
             <w:rPr>
               <w:rFonts w:ascii="Cambria Math" w:hAnsi="Cambria Math"/>
             </w:rPr>
-            <m:t xml:space="preserve">exhaust: </m:t>
-          </m:r>
-          <m:r>
-            <w:rPr>
-              <w:rFonts w:ascii="Cambria Math" w:hAnsi="Cambria Math"/>
-            </w:rPr>
-            <m:t>H</m:t>
-          </m:r>
-          <m:r>
-            <w:rPr>
-              <w:rFonts w:ascii="Cambria Math" w:hAnsi="Cambria Math"/>
-            </w:rPr>
-            <m:t>_flow=-m_flow×</m:t>
+            <m:t>exhaust: H_flow=-m_flow×</m:t>
           </m:r>
           <m:d>
             <m:dPr>
@@ -2201,43 +2612,7 @@
             <w:rPr>
               <w:rFonts w:ascii="Cambria Math" w:hAnsi="Cambria Math"/>
             </w:rPr>
-            <m:t>por</m:t>
-          </m:r>
-          <m:r>
-            <w:rPr>
-              <w:rFonts w:ascii="Cambria Math" w:hAnsi="Cambria Math"/>
-            </w:rPr>
-            <m:t>t_b</m:t>
-          </m:r>
-          <m:r>
-            <w:rPr>
-              <w:rFonts w:ascii="Cambria Math" w:hAnsi="Cambria Math"/>
-            </w:rPr>
-            <m:t>.</m:t>
-          </m:r>
-          <m:r>
-            <w:rPr>
-              <w:rFonts w:ascii="Cambria Math" w:hAnsi="Cambria Math"/>
-            </w:rPr>
-            <m:t>Q_flow</m:t>
-          </m:r>
-          <m:r>
-            <w:rPr>
-              <w:rFonts w:ascii="Cambria Math" w:hAnsi="Cambria Math"/>
-            </w:rPr>
-            <m:t>=</m:t>
-          </m:r>
-          <m:r>
-            <w:rPr>
-              <w:rFonts w:ascii="Cambria Math" w:hAnsi="Cambria Math"/>
-            </w:rPr>
-            <m:t>m_flow</m:t>
-          </m:r>
-          <m:r>
-            <w:rPr>
-              <w:rFonts w:ascii="Cambria Math" w:hAnsi="Cambria Math"/>
-            </w:rPr>
-            <m:t>×cp</m:t>
+            <m:t>port_b.Q_flow=m_flow×cp</m:t>
           </m:r>
           <m:d>
             <m:dPr>
@@ -2263,31 +2638,7 @@
                     <w:rPr>
                       <w:rFonts w:ascii="Cambria Math" w:hAnsi="Cambria Math"/>
                     </w:rPr>
-                    <m:t>por</m:t>
-                  </m:r>
-                  <m:r>
-                    <w:rPr>
-                      <w:rFonts w:ascii="Cambria Math" w:hAnsi="Cambria Math"/>
-                    </w:rPr>
-                    <m:t>t_a</m:t>
-                  </m:r>
-                  <m:r>
-                    <w:rPr>
-                      <w:rFonts w:ascii="Cambria Math" w:hAnsi="Cambria Math"/>
-                    </w:rPr>
-                    <m:t>.T+por</m:t>
-                  </m:r>
-                  <m:r>
-                    <w:rPr>
-                      <w:rFonts w:ascii="Cambria Math" w:hAnsi="Cambria Math"/>
-                    </w:rPr>
-                    <m:t>t_b</m:t>
-                  </m:r>
-                  <m:r>
-                    <w:rPr>
-                      <w:rFonts w:ascii="Cambria Math" w:hAnsi="Cambria Math"/>
-                    </w:rPr>
-                    <m:t>.T</m:t>
+                    <m:t>port_a.T+port_b.T</m:t>
                   </m:r>
                 </m:num>
                 <m:den>
@@ -2321,31 +2672,7 @@
                 <w:rPr>
                   <w:rFonts w:ascii="Cambria Math" w:hAnsi="Cambria Math"/>
                 </w:rPr>
-                <m:t>por</m:t>
-              </m:r>
-              <m:r>
-                <w:rPr>
-                  <w:rFonts w:ascii="Cambria Math" w:hAnsi="Cambria Math"/>
-                </w:rPr>
-                <m:t>t_b</m:t>
-              </m:r>
-              <m:r>
-                <w:rPr>
-                  <w:rFonts w:ascii="Cambria Math" w:hAnsi="Cambria Math"/>
-                </w:rPr>
-                <m:t>.T-por</m:t>
-              </m:r>
-              <m:r>
-                <w:rPr>
-                  <w:rFonts w:ascii="Cambria Math" w:hAnsi="Cambria Math"/>
-                </w:rPr>
-                <m:t>t_a</m:t>
-              </m:r>
-              <m:r>
-                <w:rPr>
-                  <w:rFonts w:ascii="Cambria Math" w:hAnsi="Cambria Math"/>
-                </w:rPr>
-                <m:t>.T</m:t>
+                <m:t>port_b.T-port_a.T</m:t>
               </m:r>
             </m:e>
           </m:d>
@@ -2354,29 +2681,1006 @@
     </w:p>
     <w:p>
       <w:pPr>
-        <w:rPr>
-          <w:lang w:val="fr-FR"/>
-        </w:rPr>
-      </w:pPr>
-    </w:p>
-    <w:p>
-      <w:pPr>
-        <w:pStyle w:val="Titre2"/>
-        <w:rPr>
-          <w:rFonts w:eastAsiaTheme="minorEastAsia"/>
-          <w:lang w:val="fr-FR"/>
-        </w:rPr>
-      </w:pPr>
-      <w:bookmarkStart w:id="1" w:name="_Toc37080174"/>
+        <w:pStyle w:val="Titre3"/>
+        <w:numPr>
+          <w:ilvl w:val="2"/>
+          <w:numId w:val="6"/>
+        </w:numPr>
+        <w:rPr>
+          <w:rFonts w:eastAsiaTheme="minorEastAsia"/>
+        </w:rPr>
+      </w:pPr>
       <w:proofErr w:type="spellStart"/>
       <w:r>
         <w:rPr>
           <w:rFonts w:eastAsiaTheme="minorEastAsia"/>
+        </w:rPr>
+        <w:t>Fan</w:t>
+      </w:r>
+      <w:r>
+        <w:rPr>
+          <w:rFonts w:eastAsiaTheme="minorEastAsia"/>
+        </w:rPr>
+        <w:t>Ventilation</w:t>
+      </w:r>
+      <w:proofErr w:type="spellEnd"/>
+    </w:p>
+    <w:p/>
+    <w:p>
+      <w:pPr>
+        <w:rPr>
+          <w:rFonts w:eastAsiaTheme="minorEastAsia"/>
+        </w:rPr>
+      </w:pPr>
+      <w:bookmarkStart w:id="3" w:name="_GoBack"/>
+      <w:bookmarkEnd w:id="3"/>
+      <m:oMathPara>
+        <m:oMath>
+          <m:r>
+            <w:rPr>
+              <w:rFonts w:ascii="Cambria Math" w:hAnsi="Cambria Math"/>
+            </w:rPr>
+            <m:t>∆</m:t>
+          </m:r>
+          <m:sSub>
+            <m:sSubPr>
+              <m:ctrlPr>
+                <w:rPr>
+                  <w:rFonts w:ascii="Cambria Math" w:hAnsi="Cambria Math"/>
+                  <w:i/>
+                </w:rPr>
+              </m:ctrlPr>
+            </m:sSubPr>
+            <m:e>
+              <m:r>
+                <w:rPr>
+                  <w:rFonts w:ascii="Cambria Math" w:hAnsi="Cambria Math"/>
+                </w:rPr>
+                <m:t>p</m:t>
+              </m:r>
+            </m:e>
+            <m:sub>
+              <m:r>
+                <w:rPr>
+                  <w:rFonts w:ascii="Cambria Math" w:hAnsi="Cambria Math"/>
+                </w:rPr>
+                <m:t>fan</m:t>
+              </m:r>
+            </m:sub>
+          </m:sSub>
+          <m:r>
+            <w:rPr>
+              <w:rFonts w:ascii="Cambria Math" w:hAnsi="Cambria Math"/>
+            </w:rPr>
+            <m:t>=a×V_flow</m:t>
+          </m:r>
+        </m:oMath>
+      </m:oMathPara>
+    </w:p>
+    <w:p>
+      <w:pPr>
+        <w:rPr>
+          <w:rFonts w:eastAsiaTheme="minorEastAsia"/>
+        </w:rPr>
+      </w:pPr>
+      <m:oMathPara>
+        <m:oMath>
+          <m:r>
+            <w:rPr>
+              <w:rFonts w:ascii="Cambria Math" w:hAnsi="Cambria Math"/>
+            </w:rPr>
+            <m:t>Q_flow_aero=∆</m:t>
+          </m:r>
+          <m:sSub>
+            <m:sSubPr>
+              <m:ctrlPr>
+                <w:rPr>
+                  <w:rFonts w:ascii="Cambria Math" w:hAnsi="Cambria Math"/>
+                  <w:i/>
+                </w:rPr>
+              </m:ctrlPr>
+            </m:sSubPr>
+            <m:e>
+              <m:r>
+                <w:rPr>
+                  <w:rFonts w:ascii="Cambria Math" w:hAnsi="Cambria Math"/>
+                </w:rPr>
+                <m:t>p</m:t>
+              </m:r>
+            </m:e>
+            <m:sub>
+              <m:r>
+                <w:rPr>
+                  <w:rFonts w:ascii="Cambria Math" w:hAnsi="Cambria Math"/>
+                </w:rPr>
+                <m:t>fan</m:t>
+              </m:r>
+            </m:sub>
+          </m:sSub>
+          <m:r>
+            <w:rPr>
+              <w:rFonts w:ascii="Cambria Math" w:hAnsi="Cambria Math"/>
+            </w:rPr>
+            <m:t>×V_flow</m:t>
+          </m:r>
+        </m:oMath>
+      </m:oMathPara>
+    </w:p>
+    <w:p>
+      <m:oMathPara>
+        <m:oMath>
+          <m:f>
+            <m:fPr>
+              <m:ctrlPr>
+                <w:rPr>
+                  <w:rFonts w:ascii="Cambria Math" w:hAnsi="Cambria Math"/>
+                  <w:i/>
+                </w:rPr>
+              </m:ctrlPr>
+            </m:fPr>
+            <m:num>
+              <m:r>
+                <w:rPr>
+                  <w:rFonts w:ascii="Cambria Math" w:hAnsi="Cambria Math"/>
+                </w:rPr>
+                <m:t>Q_flow_aero</m:t>
+              </m:r>
+            </m:num>
+            <m:den>
+              <m:r>
+                <w:rPr>
+                  <w:rFonts w:ascii="Cambria Math" w:hAnsi="Cambria Math"/>
+                </w:rPr>
+                <m:t>Q_flow_aer</m:t>
+              </m:r>
+              <m:sSub>
+                <m:sSubPr>
+                  <m:ctrlPr>
+                    <w:rPr>
+                      <w:rFonts w:ascii="Cambria Math" w:hAnsi="Cambria Math"/>
+                      <w:i/>
+                    </w:rPr>
+                  </m:ctrlPr>
+                </m:sSubPr>
+                <m:e>
+                  <m:r>
+                    <w:rPr>
+                      <w:rFonts w:ascii="Cambria Math" w:hAnsi="Cambria Math"/>
+                    </w:rPr>
+                    <m:t>o</m:t>
+                  </m:r>
+                </m:e>
+                <m:sub>
+                  <m:r>
+                    <w:rPr>
+                      <w:rFonts w:ascii="Cambria Math" w:hAnsi="Cambria Math"/>
+                    </w:rPr>
+                    <m:t>nominal</m:t>
+                  </m:r>
+                </m:sub>
+              </m:sSub>
+            </m:den>
+          </m:f>
+          <m:r>
+            <w:rPr>
+              <w:rFonts w:ascii="Cambria Math" w:hAnsi="Cambria Math"/>
+            </w:rPr>
+            <m:t>=</m:t>
+          </m:r>
+          <m:sSup>
+            <m:sSupPr>
+              <m:ctrlPr>
+                <w:rPr>
+                  <w:rFonts w:ascii="Cambria Math" w:hAnsi="Cambria Math"/>
+                  <w:i/>
+                </w:rPr>
+              </m:ctrlPr>
+            </m:sSupPr>
+            <m:e>
+              <m:d>
+                <m:dPr>
+                  <m:ctrlPr>
+                    <w:rPr>
+                      <w:rFonts w:ascii="Cambria Math" w:hAnsi="Cambria Math"/>
+                      <w:i/>
+                    </w:rPr>
+                  </m:ctrlPr>
+                </m:dPr>
+                <m:e>
+                  <m:f>
+                    <m:fPr>
+                      <m:ctrlPr>
+                        <w:rPr>
+                          <w:rFonts w:ascii="Cambria Math" w:hAnsi="Cambria Math"/>
+                          <w:i/>
+                        </w:rPr>
+                      </m:ctrlPr>
+                    </m:fPr>
+                    <m:num>
+                      <m:r>
+                        <w:rPr>
+                          <w:rFonts w:ascii="Cambria Math" w:hAnsi="Cambria Math"/>
+                        </w:rPr>
+                        <m:t>V_flow</m:t>
+                      </m:r>
+                    </m:num>
+                    <m:den>
+                      <m:r>
+                        <w:rPr>
+                          <w:rFonts w:ascii="Cambria Math" w:hAnsi="Cambria Math"/>
+                        </w:rPr>
+                        <m:t>V_flo</m:t>
+                      </m:r>
+                      <m:sSub>
+                        <m:sSubPr>
+                          <m:ctrlPr>
+                            <w:rPr>
+                              <w:rFonts w:ascii="Cambria Math" w:hAnsi="Cambria Math"/>
+                              <w:i/>
+                            </w:rPr>
+                          </m:ctrlPr>
+                        </m:sSubPr>
+                        <m:e>
+                          <m:r>
+                            <w:rPr>
+                              <w:rFonts w:ascii="Cambria Math" w:hAnsi="Cambria Math"/>
+                            </w:rPr>
+                            <m:t>w</m:t>
+                          </m:r>
+                        </m:e>
+                        <m:sub>
+                          <m:r>
+                            <w:rPr>
+                              <w:rFonts w:ascii="Cambria Math" w:hAnsi="Cambria Math"/>
+                            </w:rPr>
+                            <m:t>nominal</m:t>
+                          </m:r>
+                        </m:sub>
+                      </m:sSub>
+                    </m:den>
+                  </m:f>
+                </m:e>
+              </m:d>
+            </m:e>
+            <m:sup>
+              <m:r>
+                <w:rPr>
+                  <w:rFonts w:ascii="Cambria Math" w:hAnsi="Cambria Math"/>
+                </w:rPr>
+                <m:t>2</m:t>
+              </m:r>
+            </m:sup>
+          </m:sSup>
+        </m:oMath>
+      </m:oMathPara>
+    </w:p>
+    <w:p>
+      <w:pPr>
+        <w:rPr>
+          <w:rFonts w:eastAsiaTheme="minorEastAsia"/>
+        </w:rPr>
+      </w:pPr>
+      <m:oMathPara>
+        <m:oMath>
+          <m:r>
+            <w:rPr>
+              <w:rFonts w:ascii="Cambria Math" w:hAnsi="Cambria Math"/>
+            </w:rPr>
+            <m:t>supply: H_flow=m_flow×(</m:t>
+          </m:r>
+          <m:sSub>
+            <m:sSubPr>
+              <m:ctrlPr>
+                <w:rPr>
+                  <w:rFonts w:ascii="Cambria Math" w:hAnsi="Cambria Math"/>
+                  <w:i/>
+                </w:rPr>
+              </m:ctrlPr>
+            </m:sSubPr>
+            <m:e>
+              <m:r>
+                <w:rPr>
+                  <w:rFonts w:ascii="Cambria Math" w:hAnsi="Cambria Math"/>
+                </w:rPr>
+                <m:t>h</m:t>
+              </m:r>
+            </m:e>
+            <m:sub>
+              <m:r>
+                <w:rPr>
+                  <w:rFonts w:ascii="Cambria Math" w:hAnsi="Cambria Math"/>
+                </w:rPr>
+                <m:t>supply</m:t>
+              </m:r>
+            </m:sub>
+          </m:sSub>
+          <m:r>
+            <w:rPr>
+              <w:rFonts w:ascii="Cambria Math" w:hAnsi="Cambria Math"/>
+            </w:rPr>
+            <m:t>-</m:t>
+          </m:r>
+          <m:sSub>
+            <m:sSubPr>
+              <m:ctrlPr>
+                <w:rPr>
+                  <w:rFonts w:ascii="Cambria Math" w:hAnsi="Cambria Math"/>
+                  <w:i/>
+                </w:rPr>
+              </m:ctrlPr>
+            </m:sSubPr>
+            <m:e>
+              <m:r>
+                <w:rPr>
+                  <w:rFonts w:ascii="Cambria Math" w:hAnsi="Cambria Math"/>
+                </w:rPr>
+                <m:t>h</m:t>
+              </m:r>
+            </m:e>
+            <m:sub>
+              <m:r>
+                <w:rPr>
+                  <w:rFonts w:ascii="Cambria Math" w:hAnsi="Cambria Math"/>
+                </w:rPr>
+                <m:t>ref</m:t>
+              </m:r>
+            </m:sub>
+          </m:sSub>
+          <m:r>
+            <w:rPr>
+              <w:rFonts w:ascii="Cambria Math" w:hAnsi="Cambria Math"/>
+            </w:rPr>
+            <m:t>)=m_flow×</m:t>
+          </m:r>
+          <m:sSub>
+            <m:sSubPr>
+              <m:ctrlPr>
+                <w:rPr>
+                  <w:rFonts w:ascii="Cambria Math" w:hAnsi="Cambria Math"/>
+                  <w:i/>
+                </w:rPr>
+              </m:ctrlPr>
+            </m:sSubPr>
+            <m:e>
+              <m:r>
+                <w:rPr>
+                  <w:rFonts w:ascii="Cambria Math" w:hAnsi="Cambria Math"/>
+                </w:rPr>
+                <m:t>cp</m:t>
+              </m:r>
+            </m:e>
+            <m:sub>
+              <m:r>
+                <w:rPr>
+                  <w:rFonts w:ascii="Cambria Math" w:hAnsi="Cambria Math"/>
+                </w:rPr>
+                <m:t>supply</m:t>
+              </m:r>
+            </m:sub>
+          </m:sSub>
+          <m:r>
+            <w:rPr>
+              <w:rFonts w:ascii="Cambria Math" w:hAnsi="Cambria Math"/>
+            </w:rPr>
+            <m:t>×(</m:t>
+          </m:r>
+          <m:sSub>
+            <m:sSubPr>
+              <m:ctrlPr>
+                <w:rPr>
+                  <w:rFonts w:ascii="Cambria Math" w:hAnsi="Cambria Math"/>
+                  <w:i/>
+                </w:rPr>
+              </m:ctrlPr>
+            </m:sSubPr>
+            <m:e>
+              <m:r>
+                <w:rPr>
+                  <w:rFonts w:ascii="Cambria Math" w:hAnsi="Cambria Math"/>
+                </w:rPr>
+                <m:t>T</m:t>
+              </m:r>
+            </m:e>
+            <m:sub>
+              <m:r>
+                <w:rPr>
+                  <w:rFonts w:ascii="Cambria Math" w:hAnsi="Cambria Math"/>
+                </w:rPr>
+                <m:t>supply</m:t>
+              </m:r>
+            </m:sub>
+          </m:sSub>
+          <m:r>
+            <w:rPr>
+              <w:rFonts w:ascii="Cambria Math" w:hAnsi="Cambria Math"/>
+            </w:rPr>
+            <m:t>-</m:t>
+          </m:r>
+          <m:sSub>
+            <m:sSubPr>
+              <m:ctrlPr>
+                <w:rPr>
+                  <w:rFonts w:ascii="Cambria Math" w:hAnsi="Cambria Math"/>
+                  <w:i/>
+                </w:rPr>
+              </m:ctrlPr>
+            </m:sSubPr>
+            <m:e>
+              <m:r>
+                <w:rPr>
+                  <w:rFonts w:ascii="Cambria Math" w:hAnsi="Cambria Math"/>
+                </w:rPr>
+                <m:t>T</m:t>
+              </m:r>
+            </m:e>
+            <m:sub>
+              <m:r>
+                <w:rPr>
+                  <w:rFonts w:ascii="Cambria Math" w:hAnsi="Cambria Math"/>
+                </w:rPr>
+                <m:t>ref</m:t>
+              </m:r>
+            </m:sub>
+          </m:sSub>
+          <m:r>
+            <w:rPr>
+              <w:rFonts w:ascii="Cambria Math" w:hAnsi="Cambria Math"/>
+            </w:rPr>
+            <m:t>)</m:t>
+          </m:r>
+        </m:oMath>
+      </m:oMathPara>
+    </w:p>
+    <w:p>
+      <w:pPr>
+        <w:rPr>
+          <w:rFonts w:eastAsiaTheme="minorEastAsia"/>
+        </w:rPr>
+      </w:pPr>
+      <m:oMathPara>
+        <m:oMath>
+          <m:r>
+            <w:rPr>
+              <w:rFonts w:ascii="Cambria Math" w:hAnsi="Cambria Math"/>
+            </w:rPr>
+            <m:t>exhaust: H_flow=-m_flo</m:t>
+          </m:r>
+          <m:r>
+            <w:rPr>
+              <w:rFonts w:ascii="Cambria Math" w:hAnsi="Cambria Math"/>
+            </w:rPr>
+            <m:t>w×</m:t>
+          </m:r>
+          <m:d>
+            <m:dPr>
+              <m:ctrlPr>
+                <w:rPr>
+                  <w:rFonts w:ascii="Cambria Math" w:hAnsi="Cambria Math"/>
+                  <w:i/>
+                </w:rPr>
+              </m:ctrlPr>
+            </m:dPr>
+            <m:e>
+              <m:sSub>
+                <m:sSubPr>
+                  <m:ctrlPr>
+                    <w:rPr>
+                      <w:rFonts w:ascii="Cambria Math" w:hAnsi="Cambria Math"/>
+                      <w:i/>
+                    </w:rPr>
+                  </m:ctrlPr>
+                </m:sSubPr>
+                <m:e>
+                  <m:r>
+                    <w:rPr>
+                      <w:rFonts w:ascii="Cambria Math" w:hAnsi="Cambria Math"/>
+                    </w:rPr>
+                    <m:t>h</m:t>
+                  </m:r>
+                </m:e>
+                <m:sub>
+                  <m:r>
+                    <w:rPr>
+                      <w:rFonts w:ascii="Cambria Math" w:hAnsi="Cambria Math"/>
+                    </w:rPr>
+                    <m:t>exhaust</m:t>
+                  </m:r>
+                </m:sub>
+              </m:sSub>
+              <m:r>
+                <w:rPr>
+                  <w:rFonts w:ascii="Cambria Math" w:hAnsi="Cambria Math"/>
+                </w:rPr>
+                <m:t>-</m:t>
+              </m:r>
+              <m:sSub>
+                <m:sSubPr>
+                  <m:ctrlPr>
+                    <w:rPr>
+                      <w:rFonts w:ascii="Cambria Math" w:hAnsi="Cambria Math"/>
+                      <w:i/>
+                    </w:rPr>
+                  </m:ctrlPr>
+                </m:sSubPr>
+                <m:e>
+                  <m:r>
+                    <w:rPr>
+                      <w:rFonts w:ascii="Cambria Math" w:hAnsi="Cambria Math"/>
+                    </w:rPr>
+                    <m:t>h</m:t>
+                  </m:r>
+                </m:e>
+                <m:sub>
+                  <m:r>
+                    <w:rPr>
+                      <w:rFonts w:ascii="Cambria Math" w:hAnsi="Cambria Math"/>
+                    </w:rPr>
+                    <m:t>ref</m:t>
+                  </m:r>
+                </m:sub>
+              </m:sSub>
+            </m:e>
+          </m:d>
+          <m:r>
+            <w:rPr>
+              <w:rFonts w:ascii="Cambria Math" w:hAnsi="Cambria Math"/>
+            </w:rPr>
+            <m:t>=-m_flow×</m:t>
+          </m:r>
+          <m:sSub>
+            <m:sSubPr>
+              <m:ctrlPr>
+                <w:rPr>
+                  <w:rFonts w:ascii="Cambria Math" w:hAnsi="Cambria Math"/>
+                  <w:i/>
+                </w:rPr>
+              </m:ctrlPr>
+            </m:sSubPr>
+            <m:e>
+              <m:r>
+                <w:rPr>
+                  <w:rFonts w:ascii="Cambria Math" w:hAnsi="Cambria Math"/>
+                </w:rPr>
+                <m:t>cp</m:t>
+              </m:r>
+            </m:e>
+            <m:sub>
+              <m:r>
+                <w:rPr>
+                  <w:rFonts w:ascii="Cambria Math" w:hAnsi="Cambria Math"/>
+                </w:rPr>
+                <m:t>exhaust</m:t>
+              </m:r>
+            </m:sub>
+          </m:sSub>
+          <m:r>
+            <w:rPr>
+              <w:rFonts w:ascii="Cambria Math" w:hAnsi="Cambria Math"/>
+            </w:rPr>
+            <m:t>×(</m:t>
+          </m:r>
+          <m:sSub>
+            <m:sSubPr>
+              <m:ctrlPr>
+                <w:rPr>
+                  <w:rFonts w:ascii="Cambria Math" w:hAnsi="Cambria Math"/>
+                  <w:i/>
+                </w:rPr>
+              </m:ctrlPr>
+            </m:sSubPr>
+            <m:e>
+              <m:r>
+                <w:rPr>
+                  <w:rFonts w:ascii="Cambria Math" w:hAnsi="Cambria Math"/>
+                </w:rPr>
+                <m:t>T</m:t>
+              </m:r>
+            </m:e>
+            <m:sub>
+              <m:r>
+                <w:rPr>
+                  <w:rFonts w:ascii="Cambria Math" w:hAnsi="Cambria Math"/>
+                </w:rPr>
+                <m:t>exhaust</m:t>
+              </m:r>
+            </m:sub>
+          </m:sSub>
+          <m:r>
+            <w:rPr>
+              <w:rFonts w:ascii="Cambria Math" w:hAnsi="Cambria Math"/>
+            </w:rPr>
+            <m:t>-</m:t>
+          </m:r>
+          <m:sSub>
+            <m:sSubPr>
+              <m:ctrlPr>
+                <w:rPr>
+                  <w:rFonts w:ascii="Cambria Math" w:hAnsi="Cambria Math"/>
+                  <w:i/>
+                </w:rPr>
+              </m:ctrlPr>
+            </m:sSubPr>
+            <m:e>
+              <m:r>
+                <w:rPr>
+                  <w:rFonts w:ascii="Cambria Math" w:hAnsi="Cambria Math"/>
+                </w:rPr>
+                <m:t>T</m:t>
+              </m:r>
+            </m:e>
+            <m:sub>
+              <m:r>
+                <w:rPr>
+                  <w:rFonts w:ascii="Cambria Math" w:hAnsi="Cambria Math"/>
+                </w:rPr>
+                <m:t>ref</m:t>
+              </m:r>
+            </m:sub>
+          </m:sSub>
+          <m:r>
+            <w:rPr>
+              <w:rFonts w:ascii="Cambria Math" w:hAnsi="Cambria Math"/>
+            </w:rPr>
+            <m:t>)</m:t>
+          </m:r>
+        </m:oMath>
+      </m:oMathPara>
+    </w:p>
+    <w:p>
+      <w:pPr>
+        <w:ind w:left="-567" w:right="-567"/>
+        <w:rPr>
+          <w:rFonts w:eastAsiaTheme="minorEastAsia"/>
+        </w:rPr>
+      </w:pPr>
+      <m:oMathPara>
+        <m:oMath>
+          <m:r>
+            <w:rPr>
+              <w:rFonts w:ascii="Cambria Math" w:hAnsi="Cambria Math"/>
+            </w:rPr>
+            <m:t>por</m:t>
+          </m:r>
+          <m:sSub>
+            <m:sSubPr>
+              <m:ctrlPr>
+                <w:rPr>
+                  <w:rFonts w:ascii="Cambria Math" w:hAnsi="Cambria Math"/>
+                  <w:i/>
+                </w:rPr>
+              </m:ctrlPr>
+            </m:sSubPr>
+            <m:e>
+              <m:r>
+                <w:rPr>
+                  <w:rFonts w:ascii="Cambria Math" w:hAnsi="Cambria Math"/>
+                </w:rPr>
+                <m:t>t</m:t>
+              </m:r>
+            </m:e>
+            <m:sub>
+              <m:r>
+                <w:rPr>
+                  <w:rFonts w:ascii="Cambria Math" w:hAnsi="Cambria Math"/>
+                </w:rPr>
+                <m:t>b</m:t>
+              </m:r>
+            </m:sub>
+          </m:sSub>
+          <m:r>
+            <w:rPr>
+              <w:rFonts w:ascii="Cambria Math" w:hAnsi="Cambria Math"/>
+            </w:rPr>
+            <m:t>.</m:t>
+          </m:r>
+          <m:sSub>
+            <m:sSubPr>
+              <m:ctrlPr>
+                <w:rPr>
+                  <w:rFonts w:ascii="Cambria Math" w:hAnsi="Cambria Math"/>
+                  <w:i/>
+                </w:rPr>
+              </m:ctrlPr>
+            </m:sSubPr>
+            <m:e>
+              <m:r>
+                <w:rPr>
+                  <w:rFonts w:ascii="Cambria Math" w:hAnsi="Cambria Math"/>
+                </w:rPr>
+                <m:t>Q</m:t>
+              </m:r>
+            </m:e>
+            <m:sub>
+              <m:r>
+                <w:rPr>
+                  <w:rFonts w:ascii="Cambria Math" w:hAnsi="Cambria Math"/>
+                </w:rPr>
+                <m:t>flow</m:t>
+              </m:r>
+            </m:sub>
+          </m:sSub>
+          <m:r>
+            <w:rPr>
+              <w:rFonts w:ascii="Cambria Math" w:hAnsi="Cambria Math"/>
+            </w:rPr>
+            <m:t>=</m:t>
+          </m:r>
+          <m:sSub>
+            <m:sSubPr>
+              <m:ctrlPr>
+                <w:rPr>
+                  <w:rFonts w:ascii="Cambria Math" w:hAnsi="Cambria Math"/>
+                  <w:i/>
+                </w:rPr>
+              </m:ctrlPr>
+            </m:sSubPr>
+            <m:e>
+              <m:r>
+                <w:rPr>
+                  <w:rFonts w:ascii="Cambria Math" w:hAnsi="Cambria Math"/>
+                </w:rPr>
+                <m:t>m</m:t>
+              </m:r>
+            </m:e>
+            <m:sub>
+              <m:r>
+                <w:rPr>
+                  <w:rFonts w:ascii="Cambria Math" w:hAnsi="Cambria Math"/>
+                </w:rPr>
+                <m:t>flow</m:t>
+              </m:r>
+            </m:sub>
+          </m:sSub>
+          <m:r>
+            <w:rPr>
+              <w:rFonts w:ascii="Cambria Math" w:hAnsi="Cambria Math"/>
+            </w:rPr>
+            <m:t>×cp</m:t>
+          </m:r>
+          <m:d>
+            <m:dPr>
+              <m:ctrlPr>
+                <w:rPr>
+                  <w:rFonts w:ascii="Cambria Math" w:hAnsi="Cambria Math"/>
+                  <w:i/>
+                </w:rPr>
+              </m:ctrlPr>
+            </m:dPr>
+            <m:e>
+              <m:f>
+                <m:fPr>
+                  <m:ctrlPr>
+                    <w:rPr>
+                      <w:rFonts w:ascii="Cambria Math" w:hAnsi="Cambria Math"/>
+                      <w:i/>
+                    </w:rPr>
+                  </m:ctrlPr>
+                </m:fPr>
+                <m:num>
+                  <m:r>
+                    <w:rPr>
+                      <w:rFonts w:ascii="Cambria Math" w:hAnsi="Cambria Math"/>
+                    </w:rPr>
+                    <m:t>por</m:t>
+                  </m:r>
+                  <m:sSub>
+                    <m:sSubPr>
+                      <m:ctrlPr>
+                        <w:rPr>
+                          <w:rFonts w:ascii="Cambria Math" w:hAnsi="Cambria Math"/>
+                          <w:i/>
+                        </w:rPr>
+                      </m:ctrlPr>
+                    </m:sSubPr>
+                    <m:e>
+                      <m:r>
+                        <w:rPr>
+                          <w:rFonts w:ascii="Cambria Math" w:hAnsi="Cambria Math"/>
+                        </w:rPr>
+                        <m:t>t</m:t>
+                      </m:r>
+                    </m:e>
+                    <m:sub>
+                      <m:r>
+                        <w:rPr>
+                          <w:rFonts w:ascii="Cambria Math" w:hAnsi="Cambria Math"/>
+                        </w:rPr>
+                        <m:t>a</m:t>
+                      </m:r>
+                    </m:sub>
+                  </m:sSub>
+                  <m:r>
+                    <w:rPr>
+                      <w:rFonts w:ascii="Cambria Math" w:hAnsi="Cambria Math"/>
+                    </w:rPr>
+                    <m:t>.T+por</m:t>
+                  </m:r>
+                  <m:sSub>
+                    <m:sSubPr>
+                      <m:ctrlPr>
+                        <w:rPr>
+                          <w:rFonts w:ascii="Cambria Math" w:hAnsi="Cambria Math"/>
+                          <w:i/>
+                        </w:rPr>
+                      </m:ctrlPr>
+                    </m:sSubPr>
+                    <m:e>
+                      <m:r>
+                        <w:rPr>
+                          <w:rFonts w:ascii="Cambria Math" w:hAnsi="Cambria Math"/>
+                        </w:rPr>
+                        <m:t>t</m:t>
+                      </m:r>
+                    </m:e>
+                    <m:sub>
+                      <m:r>
+                        <w:rPr>
+                          <w:rFonts w:ascii="Cambria Math" w:hAnsi="Cambria Math"/>
+                        </w:rPr>
+                        <m:t>b</m:t>
+                      </m:r>
+                    </m:sub>
+                  </m:sSub>
+                  <m:r>
+                    <w:rPr>
+                      <w:rFonts w:ascii="Cambria Math" w:hAnsi="Cambria Math"/>
+                    </w:rPr>
+                    <m:t>.T</m:t>
+                  </m:r>
+                </m:num>
+                <m:den>
+                  <m:r>
+                    <w:rPr>
+                      <w:rFonts w:ascii="Cambria Math" w:hAnsi="Cambria Math"/>
+                    </w:rPr>
+                    <m:t>2</m:t>
+                  </m:r>
+                </m:den>
+              </m:f>
+            </m:e>
+          </m:d>
+          <m:r>
+            <w:rPr>
+              <w:rFonts w:ascii="Cambria Math" w:hAnsi="Cambria Math"/>
+            </w:rPr>
+            <m:t>×</m:t>
+          </m:r>
+          <m:d>
+            <m:dPr>
+              <m:ctrlPr>
+                <w:rPr>
+                  <w:rFonts w:ascii="Cambria Math" w:hAnsi="Cambria Math"/>
+                  <w:i/>
+                </w:rPr>
+              </m:ctrlPr>
+            </m:dPr>
+            <m:e>
+              <m:r>
+                <w:rPr>
+                  <w:rFonts w:ascii="Cambria Math" w:hAnsi="Cambria Math"/>
+                </w:rPr>
+                <m:t>por</m:t>
+              </m:r>
+              <m:sSub>
+                <m:sSubPr>
+                  <m:ctrlPr>
+                    <w:rPr>
+                      <w:rFonts w:ascii="Cambria Math" w:hAnsi="Cambria Math"/>
+                      <w:i/>
+                    </w:rPr>
+                  </m:ctrlPr>
+                </m:sSubPr>
+                <m:e>
+                  <m:r>
+                    <w:rPr>
+                      <w:rFonts w:ascii="Cambria Math" w:hAnsi="Cambria Math"/>
+                    </w:rPr>
+                    <m:t>t</m:t>
+                  </m:r>
+                </m:e>
+                <m:sub>
+                  <m:r>
+                    <w:rPr>
+                      <w:rFonts w:ascii="Cambria Math" w:hAnsi="Cambria Math"/>
+                    </w:rPr>
+                    <m:t>b</m:t>
+                  </m:r>
+                </m:sub>
+              </m:sSub>
+              <m:r>
+                <w:rPr>
+                  <w:rFonts w:ascii="Cambria Math" w:hAnsi="Cambria Math"/>
+                </w:rPr>
+                <m:t>.T-por</m:t>
+              </m:r>
+              <m:sSub>
+                <m:sSubPr>
+                  <m:ctrlPr>
+                    <w:rPr>
+                      <w:rFonts w:ascii="Cambria Math" w:hAnsi="Cambria Math"/>
+                      <w:i/>
+                    </w:rPr>
+                  </m:ctrlPr>
+                </m:sSubPr>
+                <m:e>
+                  <m:r>
+                    <w:rPr>
+                      <w:rFonts w:ascii="Cambria Math" w:hAnsi="Cambria Math"/>
+                    </w:rPr>
+                    <m:t>t</m:t>
+                  </m:r>
+                </m:e>
+                <m:sub>
+                  <m:r>
+                    <w:rPr>
+                      <w:rFonts w:ascii="Cambria Math" w:hAnsi="Cambria Math"/>
+                    </w:rPr>
+                    <m:t>a</m:t>
+                  </m:r>
+                </m:sub>
+              </m:sSub>
+              <m:r>
+                <w:rPr>
+                  <w:rFonts w:ascii="Cambria Math" w:hAnsi="Cambria Math"/>
+                </w:rPr>
+                <m:t>.T</m:t>
+              </m:r>
+            </m:e>
+          </m:d>
+          <m:r>
+            <w:rPr>
+              <w:rFonts w:ascii="Cambria Math" w:eastAsiaTheme="minorEastAsia" w:hAnsi="Cambria Math"/>
+            </w:rPr>
+            <m:t>+</m:t>
+          </m:r>
+          <m:r>
+            <w:rPr>
+              <w:rFonts w:ascii="Cambria Math" w:hAnsi="Cambria Math"/>
+            </w:rPr>
+            <m:t xml:space="preserve"> </m:t>
+          </m:r>
+          <m:r>
+            <w:rPr>
+              <w:rFonts w:ascii="Cambria Math" w:hAnsi="Cambria Math"/>
+            </w:rPr>
+            <m:t>Q_flow_aero</m:t>
+          </m:r>
+        </m:oMath>
+      </m:oMathPara>
+    </w:p>
+    <w:p>
+      <w:pPr>
+        <w:ind w:left="-567" w:right="-567"/>
+        <w:rPr>
+          <w:rFonts w:eastAsiaTheme="minorEastAsia"/>
+        </w:rPr>
+      </w:pPr>
+    </w:p>
+    <w:p>
+      <w:pPr>
+        <w:rPr>
+          <w:lang w:val="fr-FR"/>
+        </w:rPr>
+      </w:pPr>
+    </w:p>
+    <w:p>
+      <w:pPr>
+        <w:pStyle w:val="Titre2"/>
+        <w:rPr>
+          <w:rFonts w:eastAsiaTheme="minorEastAsia"/>
+          <w:lang w:val="fr-FR"/>
+        </w:rPr>
+      </w:pPr>
+      <w:bookmarkStart w:id="4" w:name="_Toc37234517"/>
+      <w:proofErr w:type="spellStart"/>
+      <w:r>
+        <w:rPr>
+          <w:rFonts w:eastAsiaTheme="minorEastAsia"/>
           <w:lang w:val="fr-FR"/>
         </w:rPr>
         <w:t>BasesClasses</w:t>
       </w:r>
-      <w:bookmarkEnd w:id="1"/>
+      <w:bookmarkEnd w:id="4"/>
       <w:proofErr w:type="spellEnd"/>
     </w:p>
     <w:p>
@@ -2385,8 +3689,6 @@
           <w:lang w:val="fr-FR"/>
         </w:rPr>
       </w:pPr>
-      <w:bookmarkStart w:id="2" w:name="_GoBack"/>
-      <w:bookmarkEnd w:id="2"/>
     </w:p>
     <w:p>
       <w:pPr>
@@ -2395,7 +3697,7 @@
           <w:rFonts w:eastAsiaTheme="minorEastAsia"/>
         </w:rPr>
       </w:pPr>
-      <w:bookmarkStart w:id="3" w:name="_Toc37080175"/>
+      <w:bookmarkStart w:id="5" w:name="_Toc37234518"/>
       <w:proofErr w:type="spellStart"/>
       <w:r>
         <w:rPr>
@@ -2403,7 +3705,7 @@
         </w:rPr>
         <w:t>FreeConvection</w:t>
       </w:r>
-      <w:bookmarkEnd w:id="3"/>
+      <w:bookmarkEnd w:id="5"/>
       <w:proofErr w:type="spellEnd"/>
     </w:p>
     <w:p/>
@@ -2450,14 +3752,14 @@
           <w:rFonts w:eastAsiaTheme="minorEastAsia"/>
         </w:rPr>
       </w:pPr>
-      <w:bookmarkStart w:id="4" w:name="_Toc37080176"/>
+      <w:bookmarkStart w:id="6" w:name="_Toc37234519"/>
       <w:r>
         <w:rPr>
           <w:rFonts w:eastAsiaTheme="minorEastAsia"/>
         </w:rPr>
         <w:t>Linear conduction</w:t>
       </w:r>
-      <w:bookmarkEnd w:id="4"/>
+      <w:bookmarkEnd w:id="6"/>
     </w:p>
     <w:p/>
     <w:p>
@@ -2537,14 +3839,15 @@
           <w:rFonts w:eastAsiaTheme="minorEastAsia"/>
         </w:rPr>
       </w:pPr>
-      <w:bookmarkStart w:id="5" w:name="_Toc37080177"/>
+      <w:bookmarkStart w:id="7" w:name="_Toc37234520"/>
       <w:r>
         <w:rPr>
           <w:rFonts w:eastAsiaTheme="minorEastAsia"/>
         </w:rPr>
+        <w:lastRenderedPageBreak/>
         <w:t>Cylindrical conduction</w:t>
       </w:r>
-      <w:bookmarkEnd w:id="5"/>
+      <w:bookmarkEnd w:id="7"/>
     </w:p>
     <w:p>
       <w:pPr>
@@ -2671,14 +3974,14 @@
           <w:rFonts w:eastAsiaTheme="minorEastAsia"/>
         </w:rPr>
       </w:pPr>
-      <w:bookmarkStart w:id="6" w:name="_Toc37080178"/>
+      <w:bookmarkStart w:id="8" w:name="_Toc37234521"/>
       <w:r>
         <w:rPr>
           <w:rFonts w:eastAsiaTheme="minorEastAsia"/>
         </w:rPr>
         <w:t>Carroll radiation</w:t>
       </w:r>
-      <w:bookmarkEnd w:id="6"/>
+      <w:bookmarkEnd w:id="8"/>
     </w:p>
     <w:p>
       <w:pPr>
@@ -3152,7 +4455,7 @@
           <w:rFonts w:eastAsiaTheme="minorEastAsia"/>
         </w:rPr>
       </w:pPr>
-      <w:bookmarkStart w:id="7" w:name="_Toc37080179"/>
+      <w:bookmarkStart w:id="9" w:name="_Toc37234522"/>
       <w:proofErr w:type="spellStart"/>
       <w:r>
         <w:rPr>
@@ -3160,7 +4463,7 @@
         </w:rPr>
         <w:t>HeatCapacitor</w:t>
       </w:r>
-      <w:bookmarkEnd w:id="7"/>
+      <w:bookmarkEnd w:id="9"/>
       <w:proofErr w:type="spellEnd"/>
     </w:p>
     <w:p/>
@@ -3227,7 +4530,7 @@
           <w:rFonts w:eastAsiaTheme="minorEastAsia"/>
         </w:rPr>
       </w:pPr>
-      <w:bookmarkStart w:id="8" w:name="_Toc37080180"/>
+      <w:bookmarkStart w:id="10" w:name="_Toc37234523"/>
       <w:proofErr w:type="spellStart"/>
       <w:r>
         <w:rPr>
@@ -3235,7 +4538,7 @@
         </w:rPr>
         <w:t>LumpVolume</w:t>
       </w:r>
-      <w:bookmarkEnd w:id="8"/>
+      <w:bookmarkEnd w:id="10"/>
       <w:proofErr w:type="spellEnd"/>
     </w:p>
     <w:p/>
@@ -3340,14 +4643,14 @@
           <w:rFonts w:eastAsiaTheme="minorEastAsia"/>
         </w:rPr>
       </w:pPr>
-      <w:bookmarkStart w:id="9" w:name="_Toc37080181"/>
+      <w:bookmarkStart w:id="11" w:name="_Toc37234524"/>
       <w:r>
         <w:rPr>
           <w:rFonts w:eastAsiaTheme="minorEastAsia"/>
         </w:rPr>
         <w:t>Heat Exchanger</w:t>
       </w:r>
-      <w:bookmarkEnd w:id="9"/>
+      <w:bookmarkEnd w:id="11"/>
     </w:p>
     <w:p/>
     <w:p>
@@ -3590,7 +4893,13 @@
                     <w:rPr>
                       <w:rFonts w:ascii="Cambria Math" w:hAnsi="Cambria Math"/>
                     </w:rPr>
-                    <m:t>in</m:t>
+                    <m:t>i</m:t>
+                  </m:r>
+                  <m:r>
+                    <w:rPr>
+                      <w:rFonts w:ascii="Cambria Math" w:hAnsi="Cambria Math"/>
+                    </w:rPr>
+                    <m:t>n</m:t>
                   </m:r>
                 </m:sub>
               </m:sSub>
@@ -3747,6 +5056,7 @@
             <w:rPr>
               <w:rFonts w:ascii="Cambria Math" w:hAnsi="Cambria Math"/>
             </w:rPr>
+            <w:lastRenderedPageBreak/>
             <m:t>Q</m:t>
           </m:r>
           <m:sSub>
@@ -4062,6 +5372,7 @@
           <w:rFonts w:eastAsiaTheme="minorEastAsia"/>
         </w:rPr>
       </w:pPr>
+      <w:bookmarkStart w:id="12" w:name="_Toc37234525"/>
       <w:proofErr w:type="spellStart"/>
       <w:r>
         <w:rPr>
@@ -4069,6 +5380,7 @@
         </w:rPr>
         <w:t>PartialWall</w:t>
       </w:r>
+      <w:bookmarkEnd w:id="12"/>
       <w:proofErr w:type="spellEnd"/>
     </w:p>
     <w:p/>
@@ -4219,7 +5531,7 @@
           <w:lang w:val="fr-FR"/>
         </w:rPr>
       </w:pPr>
-      <w:bookmarkStart w:id="10" w:name="_Toc37080182"/>
+      <w:bookmarkStart w:id="13" w:name="_Toc37234526"/>
       <w:proofErr w:type="spellStart"/>
       <w:r>
         <w:rPr>
@@ -4229,7 +5541,7 @@
         <w:lastRenderedPageBreak/>
         <w:t>Functions</w:t>
       </w:r>
-      <w:bookmarkEnd w:id="10"/>
+      <w:bookmarkEnd w:id="13"/>
       <w:proofErr w:type="spellEnd"/>
     </w:p>
     <w:p>
@@ -4246,7 +5558,7 @@
           <w:rFonts w:eastAsiaTheme="minorEastAsia"/>
         </w:rPr>
       </w:pPr>
-      <w:bookmarkStart w:id="11" w:name="_Toc37080183"/>
+      <w:bookmarkStart w:id="14" w:name="_Toc37234527"/>
       <w:proofErr w:type="spellStart"/>
       <w:r>
         <w:rPr>
@@ -4254,7 +5566,7 @@
         </w:rPr>
         <w:t>Flat_plate_ASHRAE</w:t>
       </w:r>
-      <w:bookmarkEnd w:id="11"/>
+      <w:bookmarkEnd w:id="14"/>
       <w:proofErr w:type="spellEnd"/>
     </w:p>
     <w:p>
@@ -4368,7 +5680,7 @@
           <w:rFonts w:eastAsiaTheme="minorEastAsia"/>
         </w:rPr>
       </w:pPr>
-      <w:bookmarkStart w:id="12" w:name="_Toc37080184"/>
+      <w:bookmarkStart w:id="15" w:name="_Toc37234528"/>
       <w:proofErr w:type="spellStart"/>
       <w:r>
         <w:rPr>
@@ -4376,7 +5688,7 @@
         </w:rPr>
         <w:t>h_rad</w:t>
       </w:r>
-      <w:bookmarkEnd w:id="12"/>
+      <w:bookmarkEnd w:id="15"/>
       <w:proofErr w:type="spellEnd"/>
     </w:p>
     <w:p>
@@ -4491,7 +5803,7 @@
           <w:rFonts w:eastAsiaTheme="minorEastAsia"/>
         </w:rPr>
       </w:pPr>
-      <w:bookmarkStart w:id="13" w:name="_Toc37080185"/>
+      <w:bookmarkStart w:id="16" w:name="_Toc37234529"/>
       <w:proofErr w:type="spellStart"/>
       <w:proofErr w:type="gramStart"/>
       <w:r>
@@ -4500,7 +5812,7 @@
         </w:rPr>
         <w:t>uniformGrid</w:t>
       </w:r>
-      <w:bookmarkEnd w:id="13"/>
+      <w:bookmarkEnd w:id="16"/>
       <w:proofErr w:type="spellEnd"/>
       <w:proofErr w:type="gramEnd"/>
     </w:p>
@@ -4636,7 +5948,7 @@
           <w:rFonts w:eastAsiaTheme="minorEastAsia"/>
         </w:rPr>
       </w:pPr>
-      <w:bookmarkStart w:id="14" w:name="_Toc37080186"/>
+      <w:bookmarkStart w:id="17" w:name="_Toc37234530"/>
       <w:proofErr w:type="spellStart"/>
       <w:proofErr w:type="gramStart"/>
       <w:r>
@@ -4645,7 +5957,7 @@
         </w:rPr>
         <w:t>geometricalGrowthGrid</w:t>
       </w:r>
-      <w:bookmarkEnd w:id="14"/>
+      <w:bookmarkEnd w:id="17"/>
       <w:proofErr w:type="spellEnd"/>
       <w:proofErr w:type="gramEnd"/>
     </w:p>
@@ -5650,7 +6962,7 @@
           <w:rFonts w:eastAsiaTheme="minorEastAsia"/>
         </w:rPr>
       </w:pPr>
-      <w:bookmarkStart w:id="15" w:name="_Toc37080187"/>
+      <w:bookmarkStart w:id="18" w:name="_Toc37234531"/>
       <w:proofErr w:type="spellStart"/>
       <w:proofErr w:type="gramStart"/>
       <w:r>
@@ -5659,7 +6971,7 @@
         </w:rPr>
         <w:t>biotAndUniformGrid</w:t>
       </w:r>
-      <w:bookmarkEnd w:id="15"/>
+      <w:bookmarkEnd w:id="18"/>
       <w:proofErr w:type="spellEnd"/>
       <w:proofErr w:type="gramEnd"/>
     </w:p>
@@ -5898,7 +7210,7 @@
           <w:rFonts w:eastAsiaTheme="minorEastAsia"/>
         </w:rPr>
       </w:pPr>
-      <w:bookmarkStart w:id="16" w:name="_Toc37080188"/>
+      <w:bookmarkStart w:id="19" w:name="_Toc37234532"/>
       <w:proofErr w:type="spellStart"/>
       <w:proofErr w:type="gramStart"/>
       <w:r>
@@ -5907,7 +7219,7 @@
         </w:rPr>
         <w:t>biotAndGeometricalGrowthGrid</w:t>
       </w:r>
-      <w:bookmarkEnd w:id="16"/>
+      <w:bookmarkEnd w:id="19"/>
       <w:proofErr w:type="spellEnd"/>
       <w:proofErr w:type="gramEnd"/>
     </w:p>
@@ -6958,6 +8270,7 @@
           <w:rFonts w:eastAsiaTheme="minorEastAsia"/>
         </w:rPr>
       </w:pPr>
+      <w:bookmarkStart w:id="20" w:name="_Toc37234533"/>
       <w:proofErr w:type="spellStart"/>
       <w:proofErr w:type="gramStart"/>
       <w:r>
@@ -6966,6 +8279,7 @@
         </w:rPr>
         <w:t>counterCurrent</w:t>
       </w:r>
+      <w:bookmarkEnd w:id="20"/>
       <w:proofErr w:type="spellEnd"/>
       <w:proofErr w:type="gramEnd"/>
     </w:p>
@@ -7139,6 +8453,7 @@
           <w:rFonts w:eastAsiaTheme="minorEastAsia"/>
         </w:rPr>
       </w:pPr>
+      <w:bookmarkStart w:id="21" w:name="_Toc37234534"/>
       <w:proofErr w:type="spellStart"/>
       <w:r>
         <w:rPr>
@@ -7152,6 +8467,7 @@
         </w:rPr>
         <w:t>counterCurrent</w:t>
       </w:r>
+      <w:bookmarkEnd w:id="21"/>
       <w:proofErr w:type="spellEnd"/>
     </w:p>
     <w:p>
@@ -7354,7 +8670,13 @@
             <w:rPr>
               <w:rFonts w:ascii="Cambria Math" w:eastAsiaTheme="minorEastAsia" w:hAnsi="Cambria Math"/>
             </w:rPr>
-            <m:t>Eff=polynomial interpolation(NTU, NTU(Cr=1)) For 0.98&lt;Cr&lt;0.99</m:t>
+            <m:t>Eff=polynomial interpolation(N</m:t>
+          </m:r>
+          <m:r>
+            <w:rPr>
+              <w:rFonts w:ascii="Cambria Math" w:eastAsiaTheme="minorEastAsia" w:hAnsi="Cambria Math"/>
+            </w:rPr>
+            <m:t>TU, NTU(Cr=1)) For 0.98&lt;Cr&lt;0.99</m:t>
           </m:r>
         </m:oMath>
       </m:oMathPara>
@@ -7387,7 +8709,7 @@
           <w:lang w:val="fr-FR"/>
         </w:rPr>
       </w:pPr>
-      <w:bookmarkStart w:id="17" w:name="_Toc37080189"/>
+      <w:bookmarkStart w:id="22" w:name="_Toc37234535"/>
       <w:r>
         <w:rPr>
           <w:rFonts w:eastAsiaTheme="minorEastAsia"/>
@@ -7396,7 +8718,7 @@
         <w:lastRenderedPageBreak/>
         <w:t>PDE</w:t>
       </w:r>
-      <w:bookmarkEnd w:id="17"/>
+      <w:bookmarkEnd w:id="22"/>
     </w:p>
     <w:p>
       <w:pPr>
@@ -7412,7 +8734,7 @@
           <w:lang w:val="fr-FR"/>
         </w:rPr>
       </w:pPr>
-      <w:bookmarkStart w:id="18" w:name="_Toc37080190"/>
+      <w:bookmarkStart w:id="23" w:name="_Toc37234536"/>
       <w:proofErr w:type="spellStart"/>
       <w:r>
         <w:rPr>
@@ -7420,18 +8742,18 @@
         </w:rPr>
         <w:t>ThermalDiffusion</w:t>
       </w:r>
-      <w:bookmarkEnd w:id="18"/>
+      <w:bookmarkEnd w:id="23"/>
       <w:proofErr w:type="spellEnd"/>
     </w:p>
     <w:p>
       <w:pPr>
         <w:pStyle w:val="Titre3"/>
       </w:pPr>
-      <w:bookmarkStart w:id="19" w:name="_Toc37080191"/>
+      <w:bookmarkStart w:id="24" w:name="_Toc37234537"/>
       <w:r>
         <w:t>Second order central</w:t>
       </w:r>
-      <w:bookmarkEnd w:id="19"/>
+      <w:bookmarkEnd w:id="24"/>
     </w:p>
     <w:p>
       <w:pPr>
@@ -10090,6 +11412,36 @@
     </w:lvlOverride>
   </w:num>
   <w:num w:numId="5">
+    <w:abstractNumId w:val="1"/>
+    <w:lvlOverride w:ilvl="0">
+      <w:startOverride w:val="1"/>
+    </w:lvlOverride>
+    <w:lvlOverride w:ilvl="1">
+      <w:startOverride w:val="1"/>
+    </w:lvlOverride>
+    <w:lvlOverride w:ilvl="2">
+      <w:startOverride w:val="1"/>
+    </w:lvlOverride>
+    <w:lvlOverride w:ilvl="3">
+      <w:startOverride w:val="1"/>
+    </w:lvlOverride>
+    <w:lvlOverride w:ilvl="4">
+      <w:startOverride w:val="1"/>
+    </w:lvlOverride>
+    <w:lvlOverride w:ilvl="5">
+      <w:startOverride w:val="1"/>
+    </w:lvlOverride>
+    <w:lvlOverride w:ilvl="6">
+      <w:startOverride w:val="1"/>
+    </w:lvlOverride>
+    <w:lvlOverride w:ilvl="7">
+      <w:startOverride w:val="1"/>
+    </w:lvlOverride>
+    <w:lvlOverride w:ilvl="8">
+      <w:startOverride w:val="1"/>
+    </w:lvlOverride>
+  </w:num>
+  <w:num w:numId="6">
     <w:abstractNumId w:val="1"/>
     <w:lvlOverride w:ilvl="0">
       <w:startOverride w:val="1"/>
@@ -11711,7 +13063,7 @@
   <a:extraClrSchemeLst/>
   <a:extLst>
     <a:ext uri="{05A4C25C-085E-4340-85A3-A5531E510DB2}">
-      <thm15:themeFamily xmlns="" xmlns:thm15="http://schemas.microsoft.com/office/thememl/2012/main" name="Office Theme" id="{62F939B6-93AF-4DB8-9C6B-D6C7DFDC589F}" vid="{4A3C46E8-61CC-4603-A589-7422A47A8E4A}"/>
+      <thm15:themeFamily xmlns:thm15="http://schemas.microsoft.com/office/thememl/2012/main" xmlns="" name="Office Theme" id="{62F939B6-93AF-4DB8-9C6B-D6C7DFDC589F}" vid="{4A3C46E8-61CC-4603-A589-7422A47A8E4A}"/>
     </a:ext>
   </a:extLst>
 </a:theme>
@@ -11722,7 +13074,7 @@
 </file>
 
 <file path=customXml/itemProps1.xml><?xml version="1.0" encoding="utf-8"?>
-<ds:datastoreItem xmlns:ds="http://schemas.openxmlformats.org/officeDocument/2006/customXml" ds:itemID="{8E31ABD0-1773-42D6-B028-7954C1BCD82F}">
+<ds:datastoreItem xmlns:ds="http://schemas.openxmlformats.org/officeDocument/2006/customXml" ds:itemID="{6892813E-AA0F-44CC-A730-3FFA0096D347}">
   <ds:schemaRefs>
     <ds:schemaRef ds:uri="http://schemas.openxmlformats.org/officeDocument/2006/bibliography"/>
   </ds:schemaRefs>

</xml_diff>

<commit_message>
Addition of the FviewCalculator module and its test in HeatTransfer.Components + addition of the fviewFunction in HeatTransfer.Functions
</commit_message>
<xml_diff>
--- a/Information/script for equations.docx
+++ b/Information/script for equations.docx
@@ -19,6 +19,7 @@
           <w:docPartUnique/>
         </w:docPartObj>
       </w:sdtPr>
+      <w:sdtEndPr/>
       <w:sdtContent>
         <w:p>
           <w:pPr>
@@ -2712,8 +2713,6 @@
           <w:rFonts w:eastAsiaTheme="minorEastAsia"/>
         </w:rPr>
       </w:pPr>
-      <w:bookmarkStart w:id="3" w:name="_GoBack"/>
-      <w:bookmarkEnd w:id="3"/>
       <m:oMathPara>
         <m:oMath>
           <m:r>
@@ -3143,13 +3142,7 @@
             <w:rPr>
               <w:rFonts w:ascii="Cambria Math" w:hAnsi="Cambria Math"/>
             </w:rPr>
-            <m:t>exhaust: H_flow=-m_flo</m:t>
-          </m:r>
-          <m:r>
-            <w:rPr>
-              <w:rFonts w:ascii="Cambria Math" w:hAnsi="Cambria Math"/>
-            </w:rPr>
-            <m:t>w×</m:t>
+            <m:t>exhaust: H_flow=-m_flow×</m:t>
           </m:r>
           <m:d>
             <m:dPr>
@@ -3637,13 +3630,7 @@
             <w:rPr>
               <w:rFonts w:ascii="Cambria Math" w:hAnsi="Cambria Math"/>
             </w:rPr>
-            <m:t xml:space="preserve"> </m:t>
-          </m:r>
-          <m:r>
-            <w:rPr>
-              <w:rFonts w:ascii="Cambria Math" w:hAnsi="Cambria Math"/>
-            </w:rPr>
-            <m:t>Q_flow_aero</m:t>
+            <m:t xml:space="preserve"> Q_flow_aero</m:t>
           </m:r>
         </m:oMath>
       </m:oMathPara>
@@ -3655,6 +3642,564 @@
           <w:rFonts w:eastAsiaTheme="minorEastAsia"/>
         </w:rPr>
       </w:pPr>
+    </w:p>
+    <w:p>
+      <w:pPr>
+        <w:pStyle w:val="Titre3"/>
+        <w:rPr>
+          <w:rFonts w:eastAsiaTheme="minorEastAsia"/>
+        </w:rPr>
+      </w:pPr>
+      <w:proofErr w:type="spellStart"/>
+      <w:r>
+        <w:rPr>
+          <w:rFonts w:eastAsiaTheme="minorEastAsia"/>
+        </w:rPr>
+        <w:t>FviewCalculator</w:t>
+      </w:r>
+      <w:proofErr w:type="spellEnd"/>
+    </w:p>
+    <w:p/>
+    <w:p>
+      <w:pPr>
+        <w:rPr>
+          <w:rFonts w:eastAsiaTheme="minorEastAsia"/>
+        </w:rPr>
+      </w:pPr>
+      <m:oMathPara>
+        <m:oMath>
+          <m:sSub>
+            <m:sSubPr>
+              <m:ctrlPr>
+                <w:rPr>
+                  <w:rFonts w:ascii="Cambria Math" w:hAnsi="Cambria Math"/>
+                  <w:i/>
+                </w:rPr>
+              </m:ctrlPr>
+            </m:sSubPr>
+            <m:e>
+              <m:r>
+                <w:rPr>
+                  <w:rFonts w:ascii="Cambria Math" w:hAnsi="Cambria Math"/>
+                </w:rPr>
+                <m:t>F</m:t>
+              </m:r>
+              <m:r>
+                <w:rPr>
+                  <w:rFonts w:ascii="Cambria Math" w:hAnsi="Cambria Math"/>
+                </w:rPr>
+                <m:t>_</m:t>
+              </m:r>
+              <m:r>
+                <w:rPr>
+                  <w:rFonts w:ascii="Cambria Math" w:hAnsi="Cambria Math"/>
+                </w:rPr>
+                <m:t>view</m:t>
+              </m:r>
+            </m:e>
+            <m:sub>
+              <m:r>
+                <w:rPr>
+                  <w:rFonts w:ascii="Cambria Math" w:hAnsi="Cambria Math"/>
+                </w:rPr>
+                <m:t>i</m:t>
+              </m:r>
+            </m:sub>
+          </m:sSub>
+          <m:r>
+            <w:rPr>
+              <w:rFonts w:ascii="Cambria Math" w:hAnsi="Cambria Math"/>
+            </w:rPr>
+            <m:t>=</m:t>
+          </m:r>
+          <m:f>
+            <m:fPr>
+              <m:ctrlPr>
+                <w:rPr>
+                  <w:rFonts w:ascii="Cambria Math" w:hAnsi="Cambria Math"/>
+                  <w:i/>
+                </w:rPr>
+              </m:ctrlPr>
+            </m:fPr>
+            <m:num>
+              <m:r>
+                <w:rPr>
+                  <w:rFonts w:ascii="Cambria Math" w:hAnsi="Cambria Math"/>
+                </w:rPr>
+                <m:t>1</m:t>
+              </m:r>
+            </m:num>
+            <m:den>
+              <m:r>
+                <w:rPr>
+                  <w:rFonts w:ascii="Cambria Math" w:hAnsi="Cambria Math"/>
+                </w:rPr>
+                <m:t>1-</m:t>
+              </m:r>
+              <m:f>
+                <m:fPr>
+                  <m:ctrlPr>
+                    <w:rPr>
+                      <w:rFonts w:ascii="Cambria Math" w:hAnsi="Cambria Math"/>
+                      <w:i/>
+                    </w:rPr>
+                  </m:ctrlPr>
+                </m:fPr>
+                <m:num>
+                  <m:sSub>
+                    <m:sSubPr>
+                      <m:ctrlPr>
+                        <w:rPr>
+                          <w:rFonts w:ascii="Cambria Math" w:hAnsi="Cambria Math"/>
+                          <w:i/>
+                        </w:rPr>
+                      </m:ctrlPr>
+                    </m:sSubPr>
+                    <m:e>
+                      <m:r>
+                        <w:rPr>
+                          <w:rFonts w:ascii="Cambria Math" w:hAnsi="Cambria Math"/>
+                        </w:rPr>
+                        <m:t>A</m:t>
+                      </m:r>
+                      <m:r>
+                        <w:rPr>
+                          <w:rFonts w:ascii="Cambria Math" w:hAnsi="Cambria Math"/>
+                        </w:rPr>
+                        <m:t>_</m:t>
+                      </m:r>
+                      <m:r>
+                        <w:rPr>
+                          <w:rFonts w:ascii="Cambria Math" w:hAnsi="Cambria Math"/>
+                        </w:rPr>
+                        <m:t>wall</m:t>
+                      </m:r>
+                    </m:e>
+                    <m:sub>
+                      <m:r>
+                        <w:rPr>
+                          <w:rFonts w:ascii="Cambria Math" w:hAnsi="Cambria Math"/>
+                        </w:rPr>
+                        <m:t>i</m:t>
+                      </m:r>
+                    </m:sub>
+                  </m:sSub>
+                  <m:r>
+                    <w:rPr>
+                      <w:rFonts w:ascii="Cambria Math" w:hAnsi="Cambria Math"/>
+                    </w:rPr>
+                    <m:t>×</m:t>
+                  </m:r>
+                  <m:sSub>
+                    <m:sSubPr>
+                      <m:ctrlPr>
+                        <w:rPr>
+                          <w:rFonts w:ascii="Cambria Math" w:hAnsi="Cambria Math"/>
+                          <w:i/>
+                        </w:rPr>
+                      </m:ctrlPr>
+                    </m:sSubPr>
+                    <m:e>
+                      <m:r>
+                        <w:rPr>
+                          <w:rFonts w:ascii="Cambria Math" w:hAnsi="Cambria Math"/>
+                        </w:rPr>
+                        <m:t>F</m:t>
+                      </m:r>
+                      <m:r>
+                        <w:rPr>
+                          <w:rFonts w:ascii="Cambria Math" w:hAnsi="Cambria Math"/>
+                        </w:rPr>
+                        <m:t>_</m:t>
+                      </m:r>
+                      <m:r>
+                        <w:rPr>
+                          <w:rFonts w:ascii="Cambria Math" w:hAnsi="Cambria Math"/>
+                        </w:rPr>
+                        <m:t>view</m:t>
+                      </m:r>
+                    </m:e>
+                    <m:sub>
+                      <m:r>
+                        <w:rPr>
+                          <w:rFonts w:ascii="Cambria Math" w:hAnsi="Cambria Math"/>
+                        </w:rPr>
+                        <m:t>i</m:t>
+                      </m:r>
+                    </m:sub>
+                  </m:sSub>
+                </m:num>
+                <m:den>
+                  <m:nary>
+                    <m:naryPr>
+                      <m:chr m:val="∑"/>
+                      <m:limLoc m:val="undOvr"/>
+                      <m:supHide m:val="1"/>
+                      <m:ctrlPr>
+                        <w:rPr>
+                          <w:rFonts w:ascii="Cambria Math" w:hAnsi="Cambria Math"/>
+                          <w:i/>
+                        </w:rPr>
+                      </m:ctrlPr>
+                    </m:naryPr>
+                    <m:sub>
+                      <m:r>
+                        <w:rPr>
+                          <w:rFonts w:ascii="Cambria Math" w:hAnsi="Cambria Math"/>
+                        </w:rPr>
+                        <m:t>k</m:t>
+                      </m:r>
+                    </m:sub>
+                    <m:sup/>
+                    <m:e>
+                      <m:sSub>
+                        <m:sSubPr>
+                          <m:ctrlPr>
+                            <w:rPr>
+                              <w:rFonts w:ascii="Cambria Math" w:hAnsi="Cambria Math"/>
+                              <w:i/>
+                            </w:rPr>
+                          </m:ctrlPr>
+                        </m:sSubPr>
+                        <m:e>
+                          <m:r>
+                            <w:rPr>
+                              <w:rFonts w:ascii="Cambria Math" w:hAnsi="Cambria Math"/>
+                            </w:rPr>
+                            <m:t>A</m:t>
+                          </m:r>
+                          <m:r>
+                            <w:rPr>
+                              <w:rFonts w:ascii="Cambria Math" w:hAnsi="Cambria Math"/>
+                            </w:rPr>
+                            <m:t>_</m:t>
+                          </m:r>
+                          <m:r>
+                            <w:rPr>
+                              <w:rFonts w:ascii="Cambria Math" w:hAnsi="Cambria Math"/>
+                            </w:rPr>
+                            <m:t>wall</m:t>
+                          </m:r>
+                        </m:e>
+                        <m:sub>
+                          <m:r>
+                            <w:rPr>
+                              <w:rFonts w:ascii="Cambria Math" w:hAnsi="Cambria Math"/>
+                            </w:rPr>
+                            <m:t>k</m:t>
+                          </m:r>
+                        </m:sub>
+                      </m:sSub>
+                      <m:r>
+                        <w:rPr>
+                          <w:rFonts w:ascii="Cambria Math" w:hAnsi="Cambria Math"/>
+                        </w:rPr>
+                        <m:t>×</m:t>
+                      </m:r>
+                      <m:sSub>
+                        <m:sSubPr>
+                          <m:ctrlPr>
+                            <w:rPr>
+                              <w:rFonts w:ascii="Cambria Math" w:hAnsi="Cambria Math"/>
+                              <w:i/>
+                            </w:rPr>
+                          </m:ctrlPr>
+                        </m:sSubPr>
+                        <m:e>
+                          <m:r>
+                            <w:rPr>
+                              <w:rFonts w:ascii="Cambria Math" w:hAnsi="Cambria Math"/>
+                            </w:rPr>
+                            <m:t>F</m:t>
+                          </m:r>
+                          <m:r>
+                            <w:rPr>
+                              <w:rFonts w:ascii="Cambria Math" w:hAnsi="Cambria Math"/>
+                            </w:rPr>
+                            <m:t>_</m:t>
+                          </m:r>
+                          <m:r>
+                            <w:rPr>
+                              <w:rFonts w:ascii="Cambria Math" w:hAnsi="Cambria Math"/>
+                            </w:rPr>
+                            <m:t>view</m:t>
+                          </m:r>
+                        </m:e>
+                        <m:sub>
+                          <m:r>
+                            <w:rPr>
+                              <w:rFonts w:ascii="Cambria Math" w:hAnsi="Cambria Math"/>
+                            </w:rPr>
+                            <m:t>k</m:t>
+                          </m:r>
+                        </m:sub>
+                      </m:sSub>
+                    </m:e>
+                  </m:nary>
+                </m:den>
+              </m:f>
+            </m:den>
+          </m:f>
+        </m:oMath>
+      </m:oMathPara>
+    </w:p>
+    <w:p>
+      <w:pPr>
+        <w:rPr>
+          <w:rFonts w:eastAsiaTheme="minorEastAsia"/>
+        </w:rPr>
+      </w:pPr>
+      <m:oMathPara>
+        <m:oMath>
+          <m:sSub>
+            <m:sSubPr>
+              <m:ctrlPr>
+                <w:rPr>
+                  <w:rFonts w:ascii="Cambria Math" w:hAnsi="Cambria Math"/>
+                  <w:i/>
+                </w:rPr>
+              </m:ctrlPr>
+            </m:sSubPr>
+            <m:e>
+              <m:r>
+                <w:rPr>
+                  <w:rFonts w:ascii="Cambria Math" w:hAnsi="Cambria Math"/>
+                </w:rPr>
+                <m:t>F</m:t>
+              </m:r>
+              <m:r>
+                <w:rPr>
+                  <w:rFonts w:ascii="Cambria Math" w:hAnsi="Cambria Math"/>
+                </w:rPr>
+                <m:t>_</m:t>
+              </m:r>
+              <m:r>
+                <w:rPr>
+                  <w:rFonts w:ascii="Cambria Math" w:hAnsi="Cambria Math"/>
+                </w:rPr>
+                <m:t>view</m:t>
+              </m:r>
+            </m:e>
+            <m:sub>
+              <m:r>
+                <w:rPr>
+                  <w:rFonts w:ascii="Cambria Math" w:hAnsi="Cambria Math"/>
+                </w:rPr>
+                <m:t>i</m:t>
+              </m:r>
+            </m:sub>
+          </m:sSub>
+          <m:r>
+            <w:rPr>
+              <w:rFonts w:ascii="Cambria Math" w:hAnsi="Cambria Math"/>
+            </w:rPr>
+            <m:t>=</m:t>
+          </m:r>
+          <m:sSub>
+            <m:sSubPr>
+              <m:ctrlPr>
+                <w:rPr>
+                  <w:rFonts w:ascii="Cambria Math" w:hAnsi="Cambria Math"/>
+                  <w:i/>
+                </w:rPr>
+              </m:ctrlPr>
+            </m:sSubPr>
+            <m:e>
+              <m:r>
+                <w:rPr>
+                  <w:rFonts w:ascii="Cambria Math" w:hAnsi="Cambria Math"/>
+                </w:rPr>
+                <m:t>F</m:t>
+              </m:r>
+              <m:r>
+                <w:rPr>
+                  <w:rFonts w:ascii="Cambria Math" w:hAnsi="Cambria Math"/>
+                </w:rPr>
+                <m:t>_</m:t>
+              </m:r>
+              <m:r>
+                <w:rPr>
+                  <w:rFonts w:ascii="Cambria Math" w:hAnsi="Cambria Math"/>
+                </w:rPr>
+                <m:t>view</m:t>
+              </m:r>
+            </m:e>
+            <m:sub>
+              <m:r>
+                <w:rPr>
+                  <w:rFonts w:ascii="Cambria Math" w:hAnsi="Cambria Math"/>
+                </w:rPr>
+                <m:t>j</m:t>
+              </m:r>
+            </m:sub>
+          </m:sSub>
+          <m:r>
+            <w:rPr>
+              <w:rFonts w:ascii="Cambria Math" w:hAnsi="Cambria Math"/>
+            </w:rPr>
+            <m:t>=</m:t>
+          </m:r>
+          <m:r>
+            <m:rPr>
+              <m:sty m:val="p"/>
+            </m:rPr>
+            <w:rPr>
+              <w:rFonts w:ascii="Cambria Math" w:hAnsi="Cambria Math"/>
+            </w:rPr>
+            <m:t>min⁡</m:t>
+          </m:r>
+          <m:r>
+            <w:rPr>
+              <w:rFonts w:ascii="Cambria Math" w:hAnsi="Cambria Math"/>
+            </w:rPr>
+            <m:t>(</m:t>
+          </m:r>
+          <m:sSub>
+            <m:sSubPr>
+              <m:ctrlPr>
+                <w:rPr>
+                  <w:rFonts w:ascii="Cambria Math" w:hAnsi="Cambria Math"/>
+                  <w:i/>
+                </w:rPr>
+              </m:ctrlPr>
+            </m:sSubPr>
+            <m:e>
+              <m:r>
+                <w:rPr>
+                  <w:rFonts w:ascii="Cambria Math" w:hAnsi="Cambria Math"/>
+                </w:rPr>
+                <m:t>A_wall</m:t>
+              </m:r>
+            </m:e>
+            <m:sub>
+              <m:r>
+                <w:rPr>
+                  <w:rFonts w:ascii="Cambria Math" w:hAnsi="Cambria Math"/>
+                </w:rPr>
+                <m:t>i,j</m:t>
+              </m:r>
+            </m:sub>
+          </m:sSub>
+          <m:r>
+            <w:rPr>
+              <w:rFonts w:ascii="Cambria Math" w:hAnsi="Cambria Math"/>
+            </w:rPr>
+            <m:t>)×</m:t>
+          </m:r>
+          <m:d>
+            <m:dPr>
+              <m:ctrlPr>
+                <w:rPr>
+                  <w:rFonts w:ascii="Cambria Math" w:hAnsi="Cambria Math"/>
+                  <w:i/>
+                </w:rPr>
+              </m:ctrlPr>
+            </m:dPr>
+            <m:e>
+              <m:f>
+                <m:fPr>
+                  <m:ctrlPr>
+                    <w:rPr>
+                      <w:rFonts w:ascii="Cambria Math" w:hAnsi="Cambria Math"/>
+                      <w:i/>
+                    </w:rPr>
+                  </m:ctrlPr>
+                </m:fPr>
+                <m:num>
+                  <m:r>
+                    <w:rPr>
+                      <w:rFonts w:ascii="Cambria Math" w:hAnsi="Cambria Math"/>
+                    </w:rPr>
+                    <m:t>1</m:t>
+                  </m:r>
+                </m:num>
+                <m:den>
+                  <m:sSub>
+                    <m:sSubPr>
+                      <m:ctrlPr>
+                        <w:rPr>
+                          <w:rFonts w:ascii="Cambria Math" w:hAnsi="Cambria Math"/>
+                          <w:i/>
+                        </w:rPr>
+                      </m:ctrlPr>
+                    </m:sSubPr>
+                    <m:e>
+                      <m:r>
+                        <w:rPr>
+                          <w:rFonts w:ascii="Cambria Math" w:hAnsi="Cambria Math"/>
+                        </w:rPr>
+                        <m:t>A_wall</m:t>
+                      </m:r>
+                    </m:e>
+                    <m:sub>
+                      <m:r>
+                        <w:rPr>
+                          <w:rFonts w:ascii="Cambria Math" w:hAnsi="Cambria Math"/>
+                        </w:rPr>
+                        <m:t>i</m:t>
+                      </m:r>
+                    </m:sub>
+                  </m:sSub>
+                </m:den>
+              </m:f>
+              <m:r>
+                <w:rPr>
+                  <w:rFonts w:ascii="Cambria Math" w:hAnsi="Cambria Math"/>
+                </w:rPr>
+                <m:t>+</m:t>
+              </m:r>
+              <m:f>
+                <m:fPr>
+                  <m:ctrlPr>
+                    <w:rPr>
+                      <w:rFonts w:ascii="Cambria Math" w:hAnsi="Cambria Math"/>
+                      <w:i/>
+                    </w:rPr>
+                  </m:ctrlPr>
+                </m:fPr>
+                <m:num>
+                  <m:r>
+                    <w:rPr>
+                      <w:rFonts w:ascii="Cambria Math" w:hAnsi="Cambria Math"/>
+                    </w:rPr>
+                    <m:t>1</m:t>
+                  </m:r>
+                </m:num>
+                <m:den>
+                  <m:sSub>
+                    <m:sSubPr>
+                      <m:ctrlPr>
+                        <w:rPr>
+                          <w:rFonts w:ascii="Cambria Math" w:hAnsi="Cambria Math"/>
+                          <w:i/>
+                        </w:rPr>
+                      </m:ctrlPr>
+                    </m:sSubPr>
+                    <m:e>
+                      <m:r>
+                        <w:rPr>
+                          <w:rFonts w:ascii="Cambria Math" w:hAnsi="Cambria Math"/>
+                        </w:rPr>
+                        <m:t>A_wall</m:t>
+                      </m:r>
+                    </m:e>
+                    <m:sub>
+                      <m:r>
+                        <w:rPr>
+                          <w:rFonts w:ascii="Cambria Math" w:hAnsi="Cambria Math"/>
+                        </w:rPr>
+                        <m:t>j</m:t>
+                      </m:r>
+                    </m:sub>
+                  </m:sSub>
+                </m:den>
+              </m:f>
+            </m:e>
+          </m:d>
+        </m:oMath>
+      </m:oMathPara>
+      <w:bookmarkStart w:id="3" w:name="_GoBack"/>
+      <w:bookmarkEnd w:id="3"/>
     </w:p>
     <w:p>
       <w:pPr>
@@ -3757,6 +4302,7 @@
         <w:rPr>
           <w:rFonts w:eastAsiaTheme="minorEastAsia"/>
         </w:rPr>
+        <w:lastRenderedPageBreak/>
         <w:t>Linear conduction</w:t>
       </w:r>
       <w:bookmarkEnd w:id="6"/>
@@ -3844,7 +4390,6 @@
         <w:rPr>
           <w:rFonts w:eastAsiaTheme="minorEastAsia"/>
         </w:rPr>
-        <w:lastRenderedPageBreak/>
         <w:t>Cylindrical conduction</w:t>
       </w:r>
       <w:bookmarkEnd w:id="7"/>
@@ -4749,6 +5294,7 @@
             <w:rPr>
               <w:rFonts w:ascii="Cambria Math" w:hAnsi="Cambria Math"/>
             </w:rPr>
+            <w:lastRenderedPageBreak/>
             <m:t>NTU=</m:t>
           </m:r>
           <m:f>
@@ -4893,13 +5439,7 @@
                     <w:rPr>
                       <w:rFonts w:ascii="Cambria Math" w:hAnsi="Cambria Math"/>
                     </w:rPr>
-                    <m:t>i</m:t>
-                  </m:r>
-                  <m:r>
-                    <w:rPr>
-                      <w:rFonts w:ascii="Cambria Math" w:hAnsi="Cambria Math"/>
-                    </w:rPr>
-                    <m:t>n</m:t>
+                    <m:t>in</m:t>
                   </m:r>
                 </m:sub>
               </m:sSub>
@@ -5056,7 +5596,6 @@
             <w:rPr>
               <w:rFonts w:ascii="Cambria Math" w:hAnsi="Cambria Math"/>
             </w:rPr>
-            <w:lastRenderedPageBreak/>
             <m:t>Q</m:t>
           </m:r>
           <m:sSub>
@@ -6683,7 +7222,13 @@
             <w:rPr>
               <w:rFonts w:ascii="Cambria Math" w:eastAsiaTheme="minorEastAsia" w:hAnsi="Cambria Math"/>
             </w:rPr>
-            <m:t xml:space="preserve"> for i from n+1 to N</m:t>
+            <m:t xml:space="preserve"> for i from n+1 t</m:t>
+          </m:r>
+          <m:r>
+            <w:rPr>
+              <w:rFonts w:ascii="Cambria Math" w:eastAsiaTheme="minorEastAsia" w:hAnsi="Cambria Math"/>
+            </w:rPr>
+            <m:t>o N</m:t>
           </m:r>
         </m:oMath>
       </m:oMathPara>
@@ -7677,7 +8222,13 @@
             <w:rPr>
               <w:rFonts w:ascii="Cambria Math" w:eastAsiaTheme="minorEastAsia" w:hAnsi="Cambria Math"/>
             </w:rPr>
-            <m:t xml:space="preserve"> for i from n+2 to N+1</m:t>
+            <m:t xml:space="preserve"> f</m:t>
+          </m:r>
+          <m:r>
+            <w:rPr>
+              <w:rFonts w:ascii="Cambria Math" w:eastAsiaTheme="minorEastAsia" w:hAnsi="Cambria Math"/>
+            </w:rPr>
+            <m:t>or i from n+2 to N+1</m:t>
           </m:r>
         </m:oMath>
       </m:oMathPara>
@@ -8670,13 +9221,7 @@
             <w:rPr>
               <w:rFonts w:ascii="Cambria Math" w:eastAsiaTheme="minorEastAsia" w:hAnsi="Cambria Math"/>
             </w:rPr>
-            <m:t>Eff=polynomial interpolation(N</m:t>
-          </m:r>
-          <m:r>
-            <w:rPr>
-              <w:rFonts w:ascii="Cambria Math" w:eastAsiaTheme="minorEastAsia" w:hAnsi="Cambria Math"/>
-            </w:rPr>
-            <m:t>TU, NTU(Cr=1)) For 0.98&lt;Cr&lt;0.99</m:t>
+            <m:t>Eff=polynomial interpolation(NTU, NTU(Cr=1)) For 0.98&lt;Cr&lt;0.99</m:t>
           </m:r>
         </m:oMath>
       </m:oMathPara>
@@ -13063,7 +13608,7 @@
   <a:extraClrSchemeLst/>
   <a:extLst>
     <a:ext uri="{05A4C25C-085E-4340-85A3-A5531E510DB2}">
-      <thm15:themeFamily xmlns:thm15="http://schemas.microsoft.com/office/thememl/2012/main" xmlns="" name="Office Theme" id="{62F939B6-93AF-4DB8-9C6B-D6C7DFDC589F}" vid="{4A3C46E8-61CC-4603-A589-7422A47A8E4A}"/>
+      <thm15:themeFamily xmlns="" xmlns:thm15="http://schemas.microsoft.com/office/thememl/2012/main" name="Office Theme" id="{62F939B6-93AF-4DB8-9C6B-D6C7DFDC589F}" vid="{4A3C46E8-61CC-4603-A589-7422A47A8E4A}"/>
     </a:ext>
   </a:extLst>
 </a:theme>
@@ -13074,7 +13619,7 @@
 </file>
 
 <file path=customXml/itemProps1.xml><?xml version="1.0" encoding="utf-8"?>
-<ds:datastoreItem xmlns:ds="http://schemas.openxmlformats.org/officeDocument/2006/customXml" ds:itemID="{6892813E-AA0F-44CC-A730-3FFA0096D347}">
+<ds:datastoreItem xmlns:ds="http://schemas.openxmlformats.org/officeDocument/2006/customXml" ds:itemID="{C13144BB-6FB3-429E-94E1-F39988AD74F3}">
   <ds:schemaRefs>
     <ds:schemaRef ds:uri="http://schemas.openxmlformats.org/officeDocument/2006/bibliography"/>
   </ds:schemaRefs>

</xml_diff>

<commit_message>
Addition of the FreeConvection module in the FluidDynamics.BasesClasses package
</commit_message>
<xml_diff>
--- a/Information/script for equations.docx
+++ b/Information/script for equations.docx
@@ -3682,19 +3682,7 @@
                 <w:rPr>
                   <w:rFonts w:ascii="Cambria Math" w:hAnsi="Cambria Math"/>
                 </w:rPr>
-                <m:t>F</m:t>
-              </m:r>
-              <m:r>
-                <w:rPr>
-                  <w:rFonts w:ascii="Cambria Math" w:hAnsi="Cambria Math"/>
-                </w:rPr>
-                <m:t>_</m:t>
-              </m:r>
-              <m:r>
-                <w:rPr>
-                  <w:rFonts w:ascii="Cambria Math" w:hAnsi="Cambria Math"/>
-                </w:rPr>
-                <m:t>view</m:t>
+                <m:t>F_view</m:t>
               </m:r>
             </m:e>
             <m:sub>
@@ -3760,19 +3748,7 @@
                         <w:rPr>
                           <w:rFonts w:ascii="Cambria Math" w:hAnsi="Cambria Math"/>
                         </w:rPr>
-                        <m:t>A</m:t>
-                      </m:r>
-                      <m:r>
-                        <w:rPr>
-                          <w:rFonts w:ascii="Cambria Math" w:hAnsi="Cambria Math"/>
-                        </w:rPr>
-                        <m:t>_</m:t>
-                      </m:r>
-                      <m:r>
-                        <w:rPr>
-                          <w:rFonts w:ascii="Cambria Math" w:hAnsi="Cambria Math"/>
-                        </w:rPr>
-                        <m:t>wall</m:t>
+                        <m:t>A_wall</m:t>
                       </m:r>
                     </m:e>
                     <m:sub>
@@ -3804,19 +3780,7 @@
                         <w:rPr>
                           <w:rFonts w:ascii="Cambria Math" w:hAnsi="Cambria Math"/>
                         </w:rPr>
-                        <m:t>F</m:t>
-                      </m:r>
-                      <m:r>
-                        <w:rPr>
-                          <w:rFonts w:ascii="Cambria Math" w:hAnsi="Cambria Math"/>
-                        </w:rPr>
-                        <m:t>_</m:t>
-                      </m:r>
-                      <m:r>
-                        <w:rPr>
-                          <w:rFonts w:ascii="Cambria Math" w:hAnsi="Cambria Math"/>
-                        </w:rPr>
-                        <m:t>view</m:t>
+                        <m:t>F_view</m:t>
                       </m:r>
                     </m:e>
                     <m:sub>
@@ -3866,19 +3830,7 @@
                             <w:rPr>
                               <w:rFonts w:ascii="Cambria Math" w:hAnsi="Cambria Math"/>
                             </w:rPr>
-                            <m:t>A</m:t>
-                          </m:r>
-                          <m:r>
-                            <w:rPr>
-                              <w:rFonts w:ascii="Cambria Math" w:hAnsi="Cambria Math"/>
-                            </w:rPr>
-                            <m:t>_</m:t>
-                          </m:r>
-                          <m:r>
-                            <w:rPr>
-                              <w:rFonts w:ascii="Cambria Math" w:hAnsi="Cambria Math"/>
-                            </w:rPr>
-                            <m:t>wall</m:t>
+                            <m:t>A_wall</m:t>
                           </m:r>
                         </m:e>
                         <m:sub>
@@ -3910,19 +3862,7 @@
                             <w:rPr>
                               <w:rFonts w:ascii="Cambria Math" w:hAnsi="Cambria Math"/>
                             </w:rPr>
-                            <m:t>F</m:t>
-                          </m:r>
-                          <m:r>
-                            <w:rPr>
-                              <w:rFonts w:ascii="Cambria Math" w:hAnsi="Cambria Math"/>
-                            </w:rPr>
-                            <m:t>_</m:t>
-                          </m:r>
-                          <m:r>
-                            <w:rPr>
-                              <w:rFonts w:ascii="Cambria Math" w:hAnsi="Cambria Math"/>
-                            </w:rPr>
-                            <m:t>view</m:t>
+                            <m:t>F_view</m:t>
                           </m:r>
                         </m:e>
                         <m:sub>
@@ -3965,19 +3905,7 @@
                 <w:rPr>
                   <w:rFonts w:ascii="Cambria Math" w:hAnsi="Cambria Math"/>
                 </w:rPr>
-                <m:t>F</m:t>
-              </m:r>
-              <m:r>
-                <w:rPr>
-                  <w:rFonts w:ascii="Cambria Math" w:hAnsi="Cambria Math"/>
-                </w:rPr>
-                <m:t>_</m:t>
-              </m:r>
-              <m:r>
-                <w:rPr>
-                  <w:rFonts w:ascii="Cambria Math" w:hAnsi="Cambria Math"/>
-                </w:rPr>
-                <m:t>view</m:t>
+                <m:t>F_view</m:t>
               </m:r>
             </m:e>
             <m:sub>
@@ -4009,19 +3937,7 @@
                 <w:rPr>
                   <w:rFonts w:ascii="Cambria Math" w:hAnsi="Cambria Math"/>
                 </w:rPr>
-                <m:t>F</m:t>
-              </m:r>
-              <m:r>
-                <w:rPr>
-                  <w:rFonts w:ascii="Cambria Math" w:hAnsi="Cambria Math"/>
-                </w:rPr>
-                <m:t>_</m:t>
-              </m:r>
-              <m:r>
-                <w:rPr>
-                  <w:rFonts w:ascii="Cambria Math" w:hAnsi="Cambria Math"/>
-                </w:rPr>
-                <m:t>view</m:t>
+                <m:t>F_view</m:t>
               </m:r>
             </m:e>
             <m:sub>
@@ -4198,8 +4114,6 @@
           </m:d>
         </m:oMath>
       </m:oMathPara>
-      <w:bookmarkStart w:id="3" w:name="_GoBack"/>
-      <w:bookmarkEnd w:id="3"/>
     </w:p>
     <w:p>
       <w:pPr>
@@ -4216,7 +4130,7 @@
           <w:lang w:val="fr-FR"/>
         </w:rPr>
       </w:pPr>
-      <w:bookmarkStart w:id="4" w:name="_Toc37234517"/>
+      <w:bookmarkStart w:id="3" w:name="_Toc37234517"/>
       <w:proofErr w:type="spellStart"/>
       <w:r>
         <w:rPr>
@@ -4224,35 +4138,35 @@
           <w:lang w:val="fr-FR"/>
         </w:rPr>
         <w:t>BasesClasses</w:t>
+      </w:r>
+      <w:bookmarkEnd w:id="3"/>
+      <w:proofErr w:type="spellEnd"/>
+    </w:p>
+    <w:p>
+      <w:pPr>
+        <w:rPr>
+          <w:lang w:val="fr-FR"/>
+        </w:rPr>
+      </w:pPr>
+    </w:p>
+    <w:p>
+      <w:pPr>
+        <w:pStyle w:val="Titre3"/>
+        <w:rPr>
+          <w:rFonts w:eastAsiaTheme="minorEastAsia"/>
+        </w:rPr>
+      </w:pPr>
+      <w:bookmarkStart w:id="4" w:name="_Toc37234518"/>
+      <w:proofErr w:type="spellStart"/>
+      <w:r>
+        <w:rPr>
+          <w:rFonts w:eastAsiaTheme="minorEastAsia"/>
+        </w:rPr>
+        <w:t>FreeConvection</w:t>
       </w:r>
       <w:bookmarkEnd w:id="4"/>
       <w:proofErr w:type="spellEnd"/>
     </w:p>
-    <w:p>
-      <w:pPr>
-        <w:rPr>
-          <w:lang w:val="fr-FR"/>
-        </w:rPr>
-      </w:pPr>
-    </w:p>
-    <w:p>
-      <w:pPr>
-        <w:pStyle w:val="Titre3"/>
-        <w:rPr>
-          <w:rFonts w:eastAsiaTheme="minorEastAsia"/>
-        </w:rPr>
-      </w:pPr>
-      <w:bookmarkStart w:id="5" w:name="_Toc37234518"/>
-      <w:proofErr w:type="spellStart"/>
-      <w:r>
-        <w:rPr>
-          <w:rFonts w:eastAsiaTheme="minorEastAsia"/>
-        </w:rPr>
-        <w:t>FreeConvection</w:t>
-      </w:r>
-      <w:bookmarkEnd w:id="5"/>
-      <w:proofErr w:type="spellEnd"/>
-    </w:p>
     <w:p/>
     <w:p>
       <w:pPr>
@@ -4297,7 +4211,7 @@
           <w:rFonts w:eastAsiaTheme="minorEastAsia"/>
         </w:rPr>
       </w:pPr>
-      <w:bookmarkStart w:id="6" w:name="_Toc37234519"/>
+      <w:bookmarkStart w:id="5" w:name="_Toc37234519"/>
       <w:r>
         <w:rPr>
           <w:rFonts w:eastAsiaTheme="minorEastAsia"/>
@@ -4305,7 +4219,7 @@
         <w:lastRenderedPageBreak/>
         <w:t>Linear conduction</w:t>
       </w:r>
-      <w:bookmarkEnd w:id="6"/>
+      <w:bookmarkEnd w:id="5"/>
     </w:p>
     <w:p/>
     <w:p>
@@ -4385,14 +4299,14 @@
           <w:rFonts w:eastAsiaTheme="minorEastAsia"/>
         </w:rPr>
       </w:pPr>
-      <w:bookmarkStart w:id="7" w:name="_Toc37234520"/>
+      <w:bookmarkStart w:id="6" w:name="_Toc37234520"/>
       <w:r>
         <w:rPr>
           <w:rFonts w:eastAsiaTheme="minorEastAsia"/>
         </w:rPr>
         <w:t>Cylindrical conduction</w:t>
       </w:r>
-      <w:bookmarkEnd w:id="7"/>
+      <w:bookmarkEnd w:id="6"/>
     </w:p>
     <w:p>
       <w:pPr>
@@ -4519,14 +4433,14 @@
           <w:rFonts w:eastAsiaTheme="minorEastAsia"/>
         </w:rPr>
       </w:pPr>
-      <w:bookmarkStart w:id="8" w:name="_Toc37234521"/>
+      <w:bookmarkStart w:id="7" w:name="_Toc37234521"/>
       <w:r>
         <w:rPr>
           <w:rFonts w:eastAsiaTheme="minorEastAsia"/>
         </w:rPr>
         <w:t>Carroll radiation</w:t>
       </w:r>
-      <w:bookmarkEnd w:id="8"/>
+      <w:bookmarkEnd w:id="7"/>
     </w:p>
     <w:p>
       <w:pPr>
@@ -4934,7 +4848,13 @@
                     <w:rPr>
                       <w:rFonts w:ascii="Cambria Math" w:hAnsi="Cambria Math"/>
                     </w:rPr>
-                    <m:t>i→MRT</m:t>
+                    <m:t>i→M</m:t>
+                  </m:r>
+                  <m:r>
+                    <w:rPr>
+                      <w:rFonts w:ascii="Cambria Math" w:hAnsi="Cambria Math"/>
+                    </w:rPr>
+                    <m:t>RT</m:t>
                   </m:r>
                 </m:sub>
               </m:sSub>
@@ -5000,7 +4920,7 @@
           <w:rFonts w:eastAsiaTheme="minorEastAsia"/>
         </w:rPr>
       </w:pPr>
-      <w:bookmarkStart w:id="9" w:name="_Toc37234522"/>
+      <w:bookmarkStart w:id="8" w:name="_Toc37234522"/>
       <w:proofErr w:type="spellStart"/>
       <w:r>
         <w:rPr>
@@ -5008,7 +4928,7 @@
         </w:rPr>
         <w:t>HeatCapacitor</w:t>
       </w:r>
-      <w:bookmarkEnd w:id="9"/>
+      <w:bookmarkEnd w:id="8"/>
       <w:proofErr w:type="spellEnd"/>
     </w:p>
     <w:p/>
@@ -5075,7 +4995,7 @@
           <w:rFonts w:eastAsiaTheme="minorEastAsia"/>
         </w:rPr>
       </w:pPr>
-      <w:bookmarkStart w:id="10" w:name="_Toc37234523"/>
+      <w:bookmarkStart w:id="9" w:name="_Toc37234523"/>
       <w:proofErr w:type="spellStart"/>
       <w:r>
         <w:rPr>
@@ -5083,7 +5003,7 @@
         </w:rPr>
         <w:t>LumpVolume</w:t>
       </w:r>
-      <w:bookmarkEnd w:id="10"/>
+      <w:bookmarkEnd w:id="9"/>
       <w:proofErr w:type="spellEnd"/>
     </w:p>
     <w:p/>
@@ -5188,14 +5108,14 @@
           <w:rFonts w:eastAsiaTheme="minorEastAsia"/>
         </w:rPr>
       </w:pPr>
-      <w:bookmarkStart w:id="11" w:name="_Toc37234524"/>
+      <w:bookmarkStart w:id="10" w:name="_Toc37234524"/>
       <w:r>
         <w:rPr>
           <w:rFonts w:eastAsiaTheme="minorEastAsia"/>
         </w:rPr>
         <w:t>Heat Exchanger</w:t>
       </w:r>
-      <w:bookmarkEnd w:id="11"/>
+      <w:bookmarkEnd w:id="10"/>
     </w:p>
     <w:p/>
     <w:p>
@@ -5911,7 +5831,7 @@
           <w:rFonts w:eastAsiaTheme="minorEastAsia"/>
         </w:rPr>
       </w:pPr>
-      <w:bookmarkStart w:id="12" w:name="_Toc37234525"/>
+      <w:bookmarkStart w:id="11" w:name="_Toc37234525"/>
       <w:proofErr w:type="spellStart"/>
       <w:r>
         <w:rPr>
@@ -5919,7 +5839,7 @@
         </w:rPr>
         <w:t>PartialWall</w:t>
       </w:r>
-      <w:bookmarkEnd w:id="12"/>
+      <w:bookmarkEnd w:id="11"/>
       <w:proofErr w:type="spellEnd"/>
     </w:p>
     <w:p/>
@@ -6070,7 +5990,7 @@
           <w:lang w:val="fr-FR"/>
         </w:rPr>
       </w:pPr>
-      <w:bookmarkStart w:id="13" w:name="_Toc37234526"/>
+      <w:bookmarkStart w:id="12" w:name="_Toc37234526"/>
       <w:proofErr w:type="spellStart"/>
       <w:r>
         <w:rPr>
@@ -6080,7 +6000,7 @@
         <w:lastRenderedPageBreak/>
         <w:t>Functions</w:t>
       </w:r>
-      <w:bookmarkEnd w:id="13"/>
+      <w:bookmarkEnd w:id="12"/>
       <w:proofErr w:type="spellEnd"/>
     </w:p>
     <w:p>
@@ -6097,7 +6017,7 @@
           <w:rFonts w:eastAsiaTheme="minorEastAsia"/>
         </w:rPr>
       </w:pPr>
-      <w:bookmarkStart w:id="14" w:name="_Toc37234527"/>
+      <w:bookmarkStart w:id="13" w:name="_Toc37234527"/>
       <w:proofErr w:type="spellStart"/>
       <w:r>
         <w:rPr>
@@ -6105,7 +6025,7 @@
         </w:rPr>
         <w:t>Flat_plate_ASHRAE</w:t>
       </w:r>
-      <w:bookmarkEnd w:id="14"/>
+      <w:bookmarkEnd w:id="13"/>
       <w:proofErr w:type="spellEnd"/>
     </w:p>
     <w:p>
@@ -6219,7 +6139,7 @@
           <w:rFonts w:eastAsiaTheme="minorEastAsia"/>
         </w:rPr>
       </w:pPr>
-      <w:bookmarkStart w:id="15" w:name="_Toc37234528"/>
+      <w:bookmarkStart w:id="14" w:name="_Toc37234528"/>
       <w:proofErr w:type="spellStart"/>
       <w:r>
         <w:rPr>
@@ -6227,7 +6147,7 @@
         </w:rPr>
         <w:t>h_rad</w:t>
       </w:r>
-      <w:bookmarkEnd w:id="15"/>
+      <w:bookmarkEnd w:id="14"/>
       <w:proofErr w:type="spellEnd"/>
     </w:p>
     <w:p>
@@ -6342,7 +6262,7 @@
           <w:rFonts w:eastAsiaTheme="minorEastAsia"/>
         </w:rPr>
       </w:pPr>
-      <w:bookmarkStart w:id="16" w:name="_Toc37234529"/>
+      <w:bookmarkStart w:id="15" w:name="_Toc37234529"/>
       <w:proofErr w:type="spellStart"/>
       <w:proofErr w:type="gramStart"/>
       <w:r>
@@ -6351,7 +6271,7 @@
         </w:rPr>
         <w:t>uniformGrid</w:t>
       </w:r>
-      <w:bookmarkEnd w:id="16"/>
+      <w:bookmarkEnd w:id="15"/>
       <w:proofErr w:type="spellEnd"/>
       <w:proofErr w:type="gramEnd"/>
     </w:p>
@@ -6487,7 +6407,7 @@
           <w:rFonts w:eastAsiaTheme="minorEastAsia"/>
         </w:rPr>
       </w:pPr>
-      <w:bookmarkStart w:id="17" w:name="_Toc37234530"/>
+      <w:bookmarkStart w:id="16" w:name="_Toc37234530"/>
       <w:proofErr w:type="spellStart"/>
       <w:proofErr w:type="gramStart"/>
       <w:r>
@@ -6496,7 +6416,7 @@
         </w:rPr>
         <w:t>geometricalGrowthGrid</w:t>
       </w:r>
-      <w:bookmarkEnd w:id="17"/>
+      <w:bookmarkEnd w:id="16"/>
       <w:proofErr w:type="spellEnd"/>
       <w:proofErr w:type="gramEnd"/>
     </w:p>
@@ -7222,13 +7142,7 @@
             <w:rPr>
               <w:rFonts w:ascii="Cambria Math" w:eastAsiaTheme="minorEastAsia" w:hAnsi="Cambria Math"/>
             </w:rPr>
-            <m:t xml:space="preserve"> for i from n+1 t</m:t>
-          </m:r>
-          <m:r>
-            <w:rPr>
-              <w:rFonts w:ascii="Cambria Math" w:eastAsiaTheme="minorEastAsia" w:hAnsi="Cambria Math"/>
-            </w:rPr>
-            <m:t>o N</m:t>
+            <m:t xml:space="preserve"> for i from n+1 to N</m:t>
           </m:r>
         </m:oMath>
       </m:oMathPara>
@@ -7507,7 +7421,7 @@
           <w:rFonts w:eastAsiaTheme="minorEastAsia"/>
         </w:rPr>
       </w:pPr>
-      <w:bookmarkStart w:id="18" w:name="_Toc37234531"/>
+      <w:bookmarkStart w:id="17" w:name="_Toc37234531"/>
       <w:proofErr w:type="spellStart"/>
       <w:proofErr w:type="gramStart"/>
       <w:r>
@@ -7516,7 +7430,7 @@
         </w:rPr>
         <w:t>biotAndUniformGrid</w:t>
       </w:r>
-      <w:bookmarkEnd w:id="18"/>
+      <w:bookmarkEnd w:id="17"/>
       <w:proofErr w:type="spellEnd"/>
       <w:proofErr w:type="gramEnd"/>
     </w:p>
@@ -7755,7 +7669,7 @@
           <w:rFonts w:eastAsiaTheme="minorEastAsia"/>
         </w:rPr>
       </w:pPr>
-      <w:bookmarkStart w:id="19" w:name="_Toc37234532"/>
+      <w:bookmarkStart w:id="18" w:name="_Toc37234532"/>
       <w:proofErr w:type="spellStart"/>
       <w:proofErr w:type="gramStart"/>
       <w:r>
@@ -7764,7 +7678,7 @@
         </w:rPr>
         <w:t>biotAndGeometricalGrowthGrid</w:t>
       </w:r>
-      <w:bookmarkEnd w:id="19"/>
+      <w:bookmarkEnd w:id="18"/>
       <w:proofErr w:type="spellEnd"/>
       <w:proofErr w:type="gramEnd"/>
     </w:p>
@@ -8222,13 +8136,7 @@
             <w:rPr>
               <w:rFonts w:ascii="Cambria Math" w:eastAsiaTheme="minorEastAsia" w:hAnsi="Cambria Math"/>
             </w:rPr>
-            <m:t xml:space="preserve"> f</m:t>
-          </m:r>
-          <m:r>
-            <w:rPr>
-              <w:rFonts w:ascii="Cambria Math" w:eastAsiaTheme="minorEastAsia" w:hAnsi="Cambria Math"/>
-            </w:rPr>
-            <m:t>or i from n+2 to N+1</m:t>
+            <m:t xml:space="preserve"> for i from n+2 to N+1</m:t>
           </m:r>
         </m:oMath>
       </m:oMathPara>
@@ -8494,7 +8402,13 @@
                 <w:rPr>
                   <w:rFonts w:ascii="Cambria Math" w:eastAsiaTheme="minorEastAsia" w:hAnsi="Cambria Math"/>
                 </w:rPr>
-                <m:t>dx×q</m:t>
+                <m:t>d</m:t>
+              </m:r>
+              <m:r>
+                <w:rPr>
+                  <w:rFonts w:ascii="Cambria Math" w:eastAsiaTheme="minorEastAsia" w:hAnsi="Cambria Math"/>
+                </w:rPr>
+                <m:t>x×q</m:t>
               </m:r>
             </m:e>
             <m:sup>
@@ -8821,7 +8735,7 @@
           <w:rFonts w:eastAsiaTheme="minorEastAsia"/>
         </w:rPr>
       </w:pPr>
-      <w:bookmarkStart w:id="20" w:name="_Toc37234533"/>
+      <w:bookmarkStart w:id="19" w:name="_Toc37234533"/>
       <w:proofErr w:type="spellStart"/>
       <w:proofErr w:type="gramStart"/>
       <w:r>
@@ -8830,7 +8744,7 @@
         </w:rPr>
         <w:t>counterCurrent</w:t>
       </w:r>
-      <w:bookmarkEnd w:id="20"/>
+      <w:bookmarkEnd w:id="19"/>
       <w:proofErr w:type="spellEnd"/>
       <w:proofErr w:type="gramEnd"/>
     </w:p>
@@ -9004,7 +8918,7 @@
           <w:rFonts w:eastAsiaTheme="minorEastAsia"/>
         </w:rPr>
       </w:pPr>
-      <w:bookmarkStart w:id="21" w:name="_Toc37234534"/>
+      <w:bookmarkStart w:id="20" w:name="_Toc37234534"/>
       <w:proofErr w:type="spellStart"/>
       <w:r>
         <w:rPr>
@@ -9018,7 +8932,7 @@
         </w:rPr>
         <w:t>counterCurrent</w:t>
       </w:r>
-      <w:bookmarkEnd w:id="21"/>
+      <w:bookmarkEnd w:id="20"/>
       <w:proofErr w:type="spellEnd"/>
     </w:p>
     <w:p>
@@ -9254,15 +9168,359 @@
           <w:lang w:val="fr-FR"/>
         </w:rPr>
       </w:pPr>
-      <w:bookmarkStart w:id="22" w:name="_Toc37234535"/>
+      <w:bookmarkStart w:id="21" w:name="_Toc37234535"/>
+      <w:proofErr w:type="spellStart"/>
       <w:r>
         <w:rPr>
           <w:rFonts w:eastAsiaTheme="minorEastAsia"/>
           <w:lang w:val="fr-FR"/>
         </w:rPr>
         <w:lastRenderedPageBreak/>
+        <w:t>FluidDynamics</w:t>
+      </w:r>
+      <w:proofErr w:type="spellEnd"/>
+    </w:p>
+    <w:p>
+      <w:pPr>
+        <w:rPr>
+          <w:lang w:val="fr-FR"/>
+        </w:rPr>
+      </w:pPr>
+    </w:p>
+    <w:p>
+      <w:pPr>
+        <w:pStyle w:val="Titre2"/>
+        <w:rPr>
+          <w:lang w:val="fr-FR"/>
+        </w:rPr>
+      </w:pPr>
+      <w:proofErr w:type="spellStart"/>
+      <w:r>
+        <w:rPr>
+          <w:lang w:val="fr-FR"/>
+        </w:rPr>
+        <w:t>BasesClasses</w:t>
+      </w:r>
+      <w:proofErr w:type="spellEnd"/>
+    </w:p>
+    <w:p>
+      <w:pPr>
+        <w:rPr>
+          <w:lang w:val="fr-FR"/>
+        </w:rPr>
+      </w:pPr>
+    </w:p>
+    <w:p>
+      <w:pPr>
+        <w:pStyle w:val="Titre3"/>
+        <w:rPr>
+          <w:rFonts w:eastAsiaTheme="minorEastAsia"/>
+        </w:rPr>
+      </w:pPr>
+      <w:proofErr w:type="spellStart"/>
+      <w:r>
+        <w:rPr>
+          <w:rFonts w:eastAsiaTheme="minorEastAsia"/>
+        </w:rPr>
+        <w:t>AeraulicConvection</w:t>
+      </w:r>
+      <w:proofErr w:type="spellEnd"/>
+    </w:p>
+    <w:p/>
+    <w:p>
+      <w:pPr>
+        <w:ind w:left="-567" w:right="-567"/>
+        <w:rPr>
+          <w:rFonts w:eastAsiaTheme="minorEastAsia"/>
+        </w:rPr>
+      </w:pPr>
+      <m:oMathPara>
+        <m:oMath>
+          <m:r>
+            <w:rPr>
+              <w:rFonts w:ascii="Cambria Math" w:hAnsi="Cambria Math"/>
+            </w:rPr>
+            <m:t>m_flow</m:t>
+          </m:r>
+          <m:r>
+            <m:rPr>
+              <m:sty m:val="p"/>
+            </m:rPr>
+            <w:rPr>
+              <w:rFonts w:ascii="Cambria Math" w:hAnsi="Cambria Math"/>
+            </w:rPr>
+            <m:t>×</m:t>
+          </m:r>
+          <m:r>
+            <m:rPr>
+              <m:sty m:val="p"/>
+            </m:rPr>
+            <w:rPr>
+              <w:rFonts w:ascii="Cambria Math" w:hAnsi="Cambria Math"/>
+            </w:rPr>
+            <m:t>cp</m:t>
+          </m:r>
+          <m:r>
+            <m:rPr>
+              <m:sty m:val="p"/>
+            </m:rPr>
+            <w:rPr>
+              <w:rFonts w:ascii="Cambria Math" w:hAnsi="Cambria Math"/>
+            </w:rPr>
+            <m:t>×</m:t>
+          </m:r>
+          <m:d>
+            <m:dPr>
+              <m:ctrlPr>
+                <w:rPr>
+                  <w:rFonts w:ascii="Cambria Math" w:hAnsi="Cambria Math"/>
+                </w:rPr>
+              </m:ctrlPr>
+            </m:dPr>
+            <m:e>
+              <m:sSub>
+                <m:sSubPr>
+                  <m:ctrlPr>
+                    <w:rPr>
+                      <w:rFonts w:ascii="Cambria Math" w:hAnsi="Cambria Math"/>
+                    </w:rPr>
+                  </m:ctrlPr>
+                </m:sSubPr>
+                <m:e>
+                  <m:r>
+                    <w:rPr>
+                      <w:rFonts w:ascii="Cambria Math" w:hAnsi="Cambria Math"/>
+                    </w:rPr>
+                    <m:t>T</m:t>
+                  </m:r>
+                </m:e>
+                <m:sub>
+                  <m:r>
+                    <w:rPr>
+                      <w:rFonts w:ascii="Cambria Math" w:hAnsi="Cambria Math"/>
+                    </w:rPr>
+                    <m:t>outlet</m:t>
+                  </m:r>
+                </m:sub>
+              </m:sSub>
+              <m:r>
+                <m:rPr>
+                  <m:sty m:val="p"/>
+                </m:rPr>
+                <w:rPr>
+                  <w:rFonts w:ascii="Cambria Math" w:hAnsi="Cambria Math"/>
+                </w:rPr>
+                <m:t>-</m:t>
+              </m:r>
+              <m:sSub>
+                <m:sSubPr>
+                  <m:ctrlPr>
+                    <w:rPr>
+                      <w:rFonts w:ascii="Cambria Math" w:hAnsi="Cambria Math"/>
+                    </w:rPr>
+                  </m:ctrlPr>
+                </m:sSubPr>
+                <m:e>
+                  <m:r>
+                    <w:rPr>
+                      <w:rFonts w:ascii="Cambria Math" w:hAnsi="Cambria Math"/>
+                    </w:rPr>
+                    <m:t>T</m:t>
+                  </m:r>
+                </m:e>
+                <m:sub>
+                  <m:r>
+                    <w:rPr>
+                      <w:rFonts w:ascii="Cambria Math" w:hAnsi="Cambria Math"/>
+                    </w:rPr>
+                    <m:t xml:space="preserve">inlet </m:t>
+                  </m:r>
+                </m:sub>
+              </m:sSub>
+            </m:e>
+          </m:d>
+          <m:r>
+            <m:rPr>
+              <m:sty m:val="p"/>
+            </m:rPr>
+            <w:rPr>
+              <w:rFonts w:ascii="Cambria Math" w:hAnsi="Cambria Math"/>
+            </w:rPr>
+            <m:t>=</m:t>
+          </m:r>
+          <m:r>
+            <w:rPr>
+              <w:rFonts w:ascii="Cambria Math" w:hAnsi="Cambria Math"/>
+            </w:rPr>
+            <m:t>h_cv</m:t>
+          </m:r>
+          <m:r>
+            <w:rPr>
+              <w:rFonts w:ascii="Cambria Math" w:hAnsi="Cambria Math"/>
+            </w:rPr>
+            <m:t>×</m:t>
+          </m:r>
+          <m:r>
+            <w:rPr>
+              <w:rFonts w:ascii="Cambria Math" w:hAnsi="Cambria Math"/>
+            </w:rPr>
+            <m:t>A</m:t>
+          </m:r>
+          <m:r>
+            <w:rPr>
+              <w:rFonts w:ascii="Cambria Math" w:hAnsi="Cambria Math"/>
+            </w:rPr>
+            <m:t>×</m:t>
+          </m:r>
+          <m:d>
+            <m:dPr>
+              <m:ctrlPr>
+                <w:rPr>
+                  <w:rFonts w:ascii="Cambria Math" w:hAnsi="Cambria Math"/>
+                </w:rPr>
+              </m:ctrlPr>
+            </m:dPr>
+            <m:e>
+              <m:sSub>
+                <m:sSubPr>
+                  <m:ctrlPr>
+                    <w:rPr>
+                      <w:rFonts w:ascii="Cambria Math" w:hAnsi="Cambria Math"/>
+                    </w:rPr>
+                  </m:ctrlPr>
+                </m:sSubPr>
+                <m:e>
+                  <m:r>
+                    <w:rPr>
+                      <w:rFonts w:ascii="Cambria Math" w:hAnsi="Cambria Math"/>
+                    </w:rPr>
+                    <m:t>T</m:t>
+                  </m:r>
+                </m:e>
+                <m:sub>
+                  <m:r>
+                    <w:rPr>
+                      <w:rFonts w:ascii="Cambria Math" w:hAnsi="Cambria Math"/>
+                    </w:rPr>
+                    <m:t>wall</m:t>
+                  </m:r>
+                </m:sub>
+              </m:sSub>
+              <m:r>
+                <m:rPr>
+                  <m:sty m:val="p"/>
+                </m:rPr>
+                <w:rPr>
+                  <w:rFonts w:ascii="Cambria Math" w:hAnsi="Cambria Math"/>
+                </w:rPr>
+                <m:t>-</m:t>
+              </m:r>
+              <m:sSub>
+                <m:sSubPr>
+                  <m:ctrlPr>
+                    <w:rPr>
+                      <w:rFonts w:ascii="Cambria Math" w:hAnsi="Cambria Math"/>
+                    </w:rPr>
+                  </m:ctrlPr>
+                </m:sSubPr>
+                <m:e>
+                  <m:r>
+                    <w:rPr>
+                      <w:rFonts w:ascii="Cambria Math" w:hAnsi="Cambria Math"/>
+                    </w:rPr>
+                    <m:t>T</m:t>
+                  </m:r>
+                </m:e>
+                <m:sub>
+                  <m:r>
+                    <w:rPr>
+                      <w:rFonts w:ascii="Cambria Math" w:hAnsi="Cambria Math"/>
+                    </w:rPr>
+                    <m:t xml:space="preserve">∞ </m:t>
+                  </m:r>
+                </m:sub>
+              </m:sSub>
+            </m:e>
+          </m:d>
+        </m:oMath>
+      </m:oMathPara>
+    </w:p>
+    <w:p>
+      <w:pPr>
+        <w:ind w:left="-567" w:right="-567"/>
+        <w:rPr>
+          <w:rFonts w:eastAsiaTheme="minorEastAsia"/>
+        </w:rPr>
+      </w:pPr>
+      <m:oMathPara>
+        <m:oMath>
+          <m:r>
+            <w:rPr>
+              <w:rFonts w:ascii="Cambria Math" w:hAnsi="Cambria Math"/>
+            </w:rPr>
+            <m:t>m_flow</m:t>
+          </m:r>
+          <m:r>
+            <m:rPr>
+              <m:sty m:val="p"/>
+            </m:rPr>
+            <w:rPr>
+              <w:rFonts w:ascii="Cambria Math" w:hAnsi="Cambria Math"/>
+            </w:rPr>
+            <m:t>=</m:t>
+          </m:r>
+          <m:f>
+            <m:fPr>
+              <m:ctrlPr>
+                <w:rPr>
+                  <w:rFonts w:ascii="Cambria Math" w:hAnsi="Cambria Math"/>
+                  <w:i/>
+                </w:rPr>
+              </m:ctrlPr>
+            </m:fPr>
+            <m:num>
+              <m:r>
+                <w:rPr>
+                  <w:rFonts w:ascii="Cambria Math" w:hAnsi="Cambria Math"/>
+                </w:rPr>
+                <m:t>h_cv</m:t>
+              </m:r>
+              <m:r>
+                <w:rPr>
+                  <w:rFonts w:ascii="Cambria Math" w:hAnsi="Cambria Math"/>
+                </w:rPr>
+                <m:t>×A</m:t>
+              </m:r>
+            </m:num>
+            <m:den>
+              <m:r>
+                <w:rPr>
+                  <w:rFonts w:ascii="Cambria Math" w:hAnsi="Cambria Math"/>
+                </w:rPr>
+                <m:t>cp</m:t>
+              </m:r>
+            </m:den>
+          </m:f>
+        </m:oMath>
+      </m:oMathPara>
+    </w:p>
+    <w:p>
+      <w:pPr>
+        <w:pStyle w:val="Titre1"/>
+        <w:rPr>
+          <w:rFonts w:eastAsiaTheme="minorEastAsia"/>
+          <w:lang w:val="fr-FR"/>
+        </w:rPr>
+      </w:pPr>
+      <w:r>
+        <w:rPr>
+          <w:rFonts w:eastAsiaTheme="minorEastAsia"/>
+          <w:lang w:val="fr-FR"/>
+        </w:rPr>
         <w:t>PDE</w:t>
       </w:r>
+      <w:bookmarkStart w:id="22" w:name="_GoBack"/>
+      <w:bookmarkEnd w:id="21"/>
       <w:bookmarkEnd w:id="22"/>
     </w:p>
     <w:p>
@@ -11129,7 +11387,14 @@
               <w:rFonts w:ascii="Cambria Math" w:hAnsi="Cambria Math"/>
               <w:sz w:val="18"/>
             </w:rPr>
-            <m:t>CoeffTimeDer×der</m:t>
+            <m:t>Co</m:t>
+          </m:r>
+          <m:r>
+            <w:rPr>
+              <w:rFonts w:ascii="Cambria Math" w:hAnsi="Cambria Math"/>
+              <w:sz w:val="18"/>
+            </w:rPr>
+            <m:t>effTimeDer×der</m:t>
           </m:r>
           <m:d>
             <m:dPr>
@@ -13608,7 +13873,7 @@
   <a:extraClrSchemeLst/>
   <a:extLst>
     <a:ext uri="{05A4C25C-085E-4340-85A3-A5531E510DB2}">
-      <thm15:themeFamily xmlns="" xmlns:thm15="http://schemas.microsoft.com/office/thememl/2012/main" name="Office Theme" id="{62F939B6-93AF-4DB8-9C6B-D6C7DFDC589F}" vid="{4A3C46E8-61CC-4603-A589-7422A47A8E4A}"/>
+      <thm15:themeFamily xmlns:thm15="http://schemas.microsoft.com/office/thememl/2012/main" xmlns="" name="Office Theme" id="{62F939B6-93AF-4DB8-9C6B-D6C7DFDC589F}" vid="{4A3C46E8-61CC-4603-A589-7422A47A8E4A}"/>
     </a:ext>
   </a:extLst>
 </a:theme>
@@ -13619,7 +13884,7 @@
 </file>
 
 <file path=customXml/itemProps1.xml><?xml version="1.0" encoding="utf-8"?>
-<ds:datastoreItem xmlns:ds="http://schemas.openxmlformats.org/officeDocument/2006/customXml" ds:itemID="{C13144BB-6FB3-429E-94E1-F39988AD74F3}">
+<ds:datastoreItem xmlns:ds="http://schemas.openxmlformats.org/officeDocument/2006/customXml" ds:itemID="{0EB68C71-4DC1-4C98-A743-9CB8FE7C1569}">
   <ds:schemaRefs>
     <ds:schemaRef ds:uri="http://schemas.openxmlformats.org/officeDocument/2006/bibliography"/>
   </ds:schemaRefs>

</xml_diff>

<commit_message>
Addition of the Condensation module and its test
</commit_message>
<xml_diff>
--- a/Information/script for equations.docx
+++ b/Information/script for equations.docx
@@ -19,7 +19,6 @@
           <w:docPartUnique/>
         </w:docPartObj>
       </w:sdtPr>
-      <w:sdtEndPr/>
       <w:sdtContent>
         <w:p>
           <w:pPr>
@@ -60,7 +59,7 @@
           <w:r>
             <w:fldChar w:fldCharType="separate"/>
           </w:r>
-          <w:hyperlink w:anchor="_Toc37234514" w:history="1">
+          <w:hyperlink w:anchor="_Toc37754741" w:history="1">
             <w:r>
               <w:rPr>
                 <w:rStyle w:val="Lienhypertexte"/>
@@ -104,7 +103,7 @@
                 <w:noProof/>
                 <w:webHidden/>
               </w:rPr>
-              <w:instrText xml:space="preserve"> PAGEREF _Toc37234514 \h </w:instrText>
+              <w:instrText xml:space="preserve"> PAGEREF _Toc37754741 \h </w:instrText>
             </w:r>
             <w:r>
               <w:rPr>
@@ -148,7 +147,7 @@
               <w:lang w:eastAsia="en-GB"/>
             </w:rPr>
           </w:pPr>
-          <w:hyperlink w:anchor="_Toc37234515" w:history="1">
+          <w:hyperlink w:anchor="_Toc37754742" w:history="1">
             <w:r>
               <w:rPr>
                 <w:rStyle w:val="Lienhypertexte"/>
@@ -192,7 +191,7 @@
                 <w:noProof/>
                 <w:webHidden/>
               </w:rPr>
-              <w:instrText xml:space="preserve"> PAGEREF _Toc37234515 \h </w:instrText>
+              <w:instrText xml:space="preserve"> PAGEREF _Toc37754742 \h </w:instrText>
             </w:r>
             <w:r>
               <w:rPr>
@@ -236,7 +235,7 @@
               <w:lang w:eastAsia="en-GB"/>
             </w:rPr>
           </w:pPr>
-          <w:hyperlink w:anchor="_Toc37234516" w:history="1">
+          <w:hyperlink w:anchor="_Toc37754743" w:history="1">
             <w:r>
               <w:rPr>
                 <w:rStyle w:val="Lienhypertexte"/>
@@ -278,7 +277,179 @@
                 <w:noProof/>
                 <w:webHidden/>
               </w:rPr>
-              <w:instrText xml:space="preserve"> PAGEREF _Toc37234516 \h </w:instrText>
+              <w:instrText xml:space="preserve"> PAGEREF _Toc37754743 \h </w:instrText>
+            </w:r>
+            <w:r>
+              <w:rPr>
+                <w:noProof/>
+                <w:webHidden/>
+              </w:rPr>
+            </w:r>
+            <w:r>
+              <w:rPr>
+                <w:noProof/>
+                <w:webHidden/>
+              </w:rPr>
+              <w:fldChar w:fldCharType="separate"/>
+            </w:r>
+            <w:r>
+              <w:rPr>
+                <w:noProof/>
+                <w:webHidden/>
+              </w:rPr>
+              <w:t>2</w:t>
+            </w:r>
+            <w:r>
+              <w:rPr>
+                <w:noProof/>
+                <w:webHidden/>
+              </w:rPr>
+              <w:fldChar w:fldCharType="end"/>
+            </w:r>
+          </w:hyperlink>
+        </w:p>
+        <w:p>
+          <w:pPr>
+            <w:pStyle w:val="TM3"/>
+            <w:tabs>
+              <w:tab w:val="left" w:pos="880"/>
+              <w:tab w:val="right" w:leader="dot" w:pos="9062"/>
+            </w:tabs>
+            <w:rPr>
+              <w:rFonts w:eastAsiaTheme="minorEastAsia"/>
+              <w:noProof/>
+              <w:lang w:eastAsia="en-GB"/>
+            </w:rPr>
+          </w:pPr>
+          <w:hyperlink w:anchor="_Toc37754744" w:history="1">
+            <w:r>
+              <w:rPr>
+                <w:rStyle w:val="Lienhypertexte"/>
+                <w:noProof/>
+              </w:rPr>
+              <w:t>1.</w:t>
+            </w:r>
+            <w:r>
+              <w:rPr>
+                <w:rFonts w:eastAsiaTheme="minorEastAsia"/>
+                <w:noProof/>
+                <w:lang w:eastAsia="en-GB"/>
+              </w:rPr>
+              <w:tab/>
+            </w:r>
+            <w:r>
+              <w:rPr>
+                <w:rStyle w:val="Lienhypertexte"/>
+                <w:noProof/>
+              </w:rPr>
+              <w:t>FanVentilation</w:t>
+            </w:r>
+            <w:r>
+              <w:rPr>
+                <w:noProof/>
+                <w:webHidden/>
+              </w:rPr>
+              <w:tab/>
+            </w:r>
+            <w:r>
+              <w:rPr>
+                <w:noProof/>
+                <w:webHidden/>
+              </w:rPr>
+              <w:fldChar w:fldCharType="begin"/>
+            </w:r>
+            <w:r>
+              <w:rPr>
+                <w:noProof/>
+                <w:webHidden/>
+              </w:rPr>
+              <w:instrText xml:space="preserve"> PAGEREF _Toc37754744 \h </w:instrText>
+            </w:r>
+            <w:r>
+              <w:rPr>
+                <w:noProof/>
+                <w:webHidden/>
+              </w:rPr>
+            </w:r>
+            <w:r>
+              <w:rPr>
+                <w:noProof/>
+                <w:webHidden/>
+              </w:rPr>
+              <w:fldChar w:fldCharType="separate"/>
+            </w:r>
+            <w:r>
+              <w:rPr>
+                <w:noProof/>
+                <w:webHidden/>
+              </w:rPr>
+              <w:t>2</w:t>
+            </w:r>
+            <w:r>
+              <w:rPr>
+                <w:noProof/>
+                <w:webHidden/>
+              </w:rPr>
+              <w:fldChar w:fldCharType="end"/>
+            </w:r>
+          </w:hyperlink>
+        </w:p>
+        <w:p>
+          <w:pPr>
+            <w:pStyle w:val="TM3"/>
+            <w:tabs>
+              <w:tab w:val="left" w:pos="880"/>
+              <w:tab w:val="right" w:leader="dot" w:pos="9062"/>
+            </w:tabs>
+            <w:rPr>
+              <w:rFonts w:eastAsiaTheme="minorEastAsia"/>
+              <w:noProof/>
+              <w:lang w:eastAsia="en-GB"/>
+            </w:rPr>
+          </w:pPr>
+          <w:hyperlink w:anchor="_Toc37754745" w:history="1">
+            <w:r>
+              <w:rPr>
+                <w:rStyle w:val="Lienhypertexte"/>
+                <w:noProof/>
+              </w:rPr>
+              <w:t>2.</w:t>
+            </w:r>
+            <w:r>
+              <w:rPr>
+                <w:rFonts w:eastAsiaTheme="minorEastAsia"/>
+                <w:noProof/>
+                <w:lang w:eastAsia="en-GB"/>
+              </w:rPr>
+              <w:tab/>
+            </w:r>
+            <w:r>
+              <w:rPr>
+                <w:rStyle w:val="Lienhypertexte"/>
+                <w:noProof/>
+              </w:rPr>
+              <w:t>FviewCalculator</w:t>
+            </w:r>
+            <w:r>
+              <w:rPr>
+                <w:noProof/>
+                <w:webHidden/>
+              </w:rPr>
+              <w:tab/>
+            </w:r>
+            <w:r>
+              <w:rPr>
+                <w:noProof/>
+                <w:webHidden/>
+              </w:rPr>
+              <w:fldChar w:fldCharType="begin"/>
+            </w:r>
+            <w:r>
+              <w:rPr>
+                <w:noProof/>
+                <w:webHidden/>
+              </w:rPr>
+              <w:instrText xml:space="preserve"> PAGEREF _Toc37754745 \h </w:instrText>
             </w:r>
             <w:r>
               <w:rPr>
@@ -322,7 +493,7 @@
               <w:lang w:eastAsia="en-GB"/>
             </w:rPr>
           </w:pPr>
-          <w:hyperlink w:anchor="_Toc37234517" w:history="1">
+          <w:hyperlink w:anchor="_Toc37754746" w:history="1">
             <w:r>
               <w:rPr>
                 <w:rStyle w:val="Lienhypertexte"/>
@@ -366,7 +537,7 @@
                 <w:noProof/>
                 <w:webHidden/>
               </w:rPr>
-              <w:instrText xml:space="preserve"> PAGEREF _Toc37234517 \h </w:instrText>
+              <w:instrText xml:space="preserve"> PAGEREF _Toc37754746 \h </w:instrText>
             </w:r>
             <w:r>
               <w:rPr>
@@ -410,7 +581,7 @@
               <w:lang w:eastAsia="en-GB"/>
             </w:rPr>
           </w:pPr>
-          <w:hyperlink w:anchor="_Toc37234518" w:history="1">
+          <w:hyperlink w:anchor="_Toc37754747" w:history="1">
             <w:r>
               <w:rPr>
                 <w:rStyle w:val="Lienhypertexte"/>
@@ -452,7 +623,7 @@
                 <w:noProof/>
                 <w:webHidden/>
               </w:rPr>
-              <w:instrText xml:space="preserve"> PAGEREF _Toc37234518 \h </w:instrText>
+              <w:instrText xml:space="preserve"> PAGEREF _Toc37754747 \h </w:instrText>
             </w:r>
             <w:r>
               <w:rPr>
@@ -496,7 +667,7 @@
               <w:lang w:eastAsia="en-GB"/>
             </w:rPr>
           </w:pPr>
-          <w:hyperlink w:anchor="_Toc37234519" w:history="1">
+          <w:hyperlink w:anchor="_Toc37754748" w:history="1">
             <w:r>
               <w:rPr>
                 <w:rStyle w:val="Lienhypertexte"/>
@@ -538,7 +709,7 @@
                 <w:noProof/>
                 <w:webHidden/>
               </w:rPr>
-              <w:instrText xml:space="preserve"> PAGEREF _Toc37234519 \h </w:instrText>
+              <w:instrText xml:space="preserve"> PAGEREF _Toc37754748 \h </w:instrText>
             </w:r>
             <w:r>
               <w:rPr>
@@ -558,7 +729,7 @@
                 <w:noProof/>
                 <w:webHidden/>
               </w:rPr>
-              <w:t>2</w:t>
+              <w:t>3</w:t>
             </w:r>
             <w:r>
               <w:rPr>
@@ -582,7 +753,7 @@
               <w:lang w:eastAsia="en-GB"/>
             </w:rPr>
           </w:pPr>
-          <w:hyperlink w:anchor="_Toc37234520" w:history="1">
+          <w:hyperlink w:anchor="_Toc37754749" w:history="1">
             <w:r>
               <w:rPr>
                 <w:rStyle w:val="Lienhypertexte"/>
@@ -624,7 +795,7 @@
                 <w:noProof/>
                 <w:webHidden/>
               </w:rPr>
-              <w:instrText xml:space="preserve"> PAGEREF _Toc37234520 \h </w:instrText>
+              <w:instrText xml:space="preserve"> PAGEREF _Toc37754749 \h </w:instrText>
             </w:r>
             <w:r>
               <w:rPr>
@@ -644,7 +815,7 @@
                 <w:noProof/>
                 <w:webHidden/>
               </w:rPr>
-              <w:t>2</w:t>
+              <w:t>3</w:t>
             </w:r>
             <w:r>
               <w:rPr>
@@ -668,7 +839,7 @@
               <w:lang w:eastAsia="en-GB"/>
             </w:rPr>
           </w:pPr>
-          <w:hyperlink w:anchor="_Toc37234521" w:history="1">
+          <w:hyperlink w:anchor="_Toc37754750" w:history="1">
             <w:r>
               <w:rPr>
                 <w:rStyle w:val="Lienhypertexte"/>
@@ -710,7 +881,7 @@
                 <w:noProof/>
                 <w:webHidden/>
               </w:rPr>
-              <w:instrText xml:space="preserve"> PAGEREF _Toc37234521 \h </w:instrText>
+              <w:instrText xml:space="preserve"> PAGEREF _Toc37754750 \h </w:instrText>
             </w:r>
             <w:r>
               <w:rPr>
@@ -730,7 +901,7 @@
                 <w:noProof/>
                 <w:webHidden/>
               </w:rPr>
-              <w:t>2</w:t>
+              <w:t>3</w:t>
             </w:r>
             <w:r>
               <w:rPr>
@@ -754,7 +925,7 @@
               <w:lang w:eastAsia="en-GB"/>
             </w:rPr>
           </w:pPr>
-          <w:hyperlink w:anchor="_Toc37234522" w:history="1">
+          <w:hyperlink w:anchor="_Toc37754751" w:history="1">
             <w:r>
               <w:rPr>
                 <w:rStyle w:val="Lienhypertexte"/>
@@ -796,7 +967,7 @@
                 <w:noProof/>
                 <w:webHidden/>
               </w:rPr>
-              <w:instrText xml:space="preserve"> PAGEREF _Toc37234522 \h </w:instrText>
+              <w:instrText xml:space="preserve"> PAGEREF _Toc37754751 \h </w:instrText>
             </w:r>
             <w:r>
               <w:rPr>
@@ -840,7 +1011,7 @@
               <w:lang w:eastAsia="en-GB"/>
             </w:rPr>
           </w:pPr>
-          <w:hyperlink w:anchor="_Toc37234523" w:history="1">
+          <w:hyperlink w:anchor="_Toc37754752" w:history="1">
             <w:r>
               <w:rPr>
                 <w:rStyle w:val="Lienhypertexte"/>
@@ -882,7 +1053,7 @@
                 <w:noProof/>
                 <w:webHidden/>
               </w:rPr>
-              <w:instrText xml:space="preserve"> PAGEREF _Toc37234523 \h </w:instrText>
+              <w:instrText xml:space="preserve"> PAGEREF _Toc37754752 \h </w:instrText>
             </w:r>
             <w:r>
               <w:rPr>
@@ -926,7 +1097,7 @@
               <w:lang w:eastAsia="en-GB"/>
             </w:rPr>
           </w:pPr>
-          <w:hyperlink w:anchor="_Toc37234524" w:history="1">
+          <w:hyperlink w:anchor="_Toc37754753" w:history="1">
             <w:r>
               <w:rPr>
                 <w:rStyle w:val="Lienhypertexte"/>
@@ -968,7 +1139,7 @@
                 <w:noProof/>
                 <w:webHidden/>
               </w:rPr>
-              <w:instrText xml:space="preserve"> PAGEREF _Toc37234524 \h </w:instrText>
+              <w:instrText xml:space="preserve"> PAGEREF _Toc37754753 \h </w:instrText>
             </w:r>
             <w:r>
               <w:rPr>
@@ -1012,7 +1183,7 @@
               <w:lang w:eastAsia="en-GB"/>
             </w:rPr>
           </w:pPr>
-          <w:hyperlink w:anchor="_Toc37234525" w:history="1">
+          <w:hyperlink w:anchor="_Toc37754754" w:history="1">
             <w:r>
               <w:rPr>
                 <w:rStyle w:val="Lienhypertexte"/>
@@ -1054,7 +1225,7 @@
                 <w:noProof/>
                 <w:webHidden/>
               </w:rPr>
-              <w:instrText xml:space="preserve"> PAGEREF _Toc37234525 \h </w:instrText>
+              <w:instrText xml:space="preserve"> PAGEREF _Toc37754754 \h </w:instrText>
             </w:r>
             <w:r>
               <w:rPr>
@@ -1074,7 +1245,7 @@
                 <w:noProof/>
                 <w:webHidden/>
               </w:rPr>
-              <w:t>3</w:t>
+              <w:t>4</w:t>
             </w:r>
             <w:r>
               <w:rPr>
@@ -1098,7 +1269,7 @@
               <w:lang w:eastAsia="en-GB"/>
             </w:rPr>
           </w:pPr>
-          <w:hyperlink w:anchor="_Toc37234526" w:history="1">
+          <w:hyperlink w:anchor="_Toc37754755" w:history="1">
             <w:r>
               <w:rPr>
                 <w:rStyle w:val="Lienhypertexte"/>
@@ -1142,7 +1313,7 @@
                 <w:noProof/>
                 <w:webHidden/>
               </w:rPr>
-              <w:instrText xml:space="preserve"> PAGEREF _Toc37234526 \h </w:instrText>
+              <w:instrText xml:space="preserve"> PAGEREF _Toc37754755 \h </w:instrText>
             </w:r>
             <w:r>
               <w:rPr>
@@ -1162,7 +1333,7 @@
                 <w:noProof/>
                 <w:webHidden/>
               </w:rPr>
-              <w:t>4</w:t>
+              <w:t>5</w:t>
             </w:r>
             <w:r>
               <w:rPr>
@@ -1186,7 +1357,7 @@
               <w:lang w:eastAsia="en-GB"/>
             </w:rPr>
           </w:pPr>
-          <w:hyperlink w:anchor="_Toc37234527" w:history="1">
+          <w:hyperlink w:anchor="_Toc37754756" w:history="1">
             <w:r>
               <w:rPr>
                 <w:rStyle w:val="Lienhypertexte"/>
@@ -1228,7 +1399,7 @@
                 <w:noProof/>
                 <w:webHidden/>
               </w:rPr>
-              <w:instrText xml:space="preserve"> PAGEREF _Toc37234527 \h </w:instrText>
+              <w:instrText xml:space="preserve"> PAGEREF _Toc37754756 \h </w:instrText>
             </w:r>
             <w:r>
               <w:rPr>
@@ -1248,7 +1419,7 @@
                 <w:noProof/>
                 <w:webHidden/>
               </w:rPr>
-              <w:t>4</w:t>
+              <w:t>5</w:t>
             </w:r>
             <w:r>
               <w:rPr>
@@ -1272,7 +1443,7 @@
               <w:lang w:eastAsia="en-GB"/>
             </w:rPr>
           </w:pPr>
-          <w:hyperlink w:anchor="_Toc37234528" w:history="1">
+          <w:hyperlink w:anchor="_Toc37754757" w:history="1">
             <w:r>
               <w:rPr>
                 <w:rStyle w:val="Lienhypertexte"/>
@@ -1314,7 +1485,7 @@
                 <w:noProof/>
                 <w:webHidden/>
               </w:rPr>
-              <w:instrText xml:space="preserve"> PAGEREF _Toc37234528 \h </w:instrText>
+              <w:instrText xml:space="preserve"> PAGEREF _Toc37754757 \h </w:instrText>
             </w:r>
             <w:r>
               <w:rPr>
@@ -1334,7 +1505,7 @@
                 <w:noProof/>
                 <w:webHidden/>
               </w:rPr>
-              <w:t>4</w:t>
+              <w:t>5</w:t>
             </w:r>
             <w:r>
               <w:rPr>
@@ -1358,7 +1529,7 @@
               <w:lang w:eastAsia="en-GB"/>
             </w:rPr>
           </w:pPr>
-          <w:hyperlink w:anchor="_Toc37234529" w:history="1">
+          <w:hyperlink w:anchor="_Toc37754758" w:history="1">
             <w:r>
               <w:rPr>
                 <w:rStyle w:val="Lienhypertexte"/>
@@ -1400,7 +1571,7 @@
                 <w:noProof/>
                 <w:webHidden/>
               </w:rPr>
-              <w:instrText xml:space="preserve"> PAGEREF _Toc37234529 \h </w:instrText>
+              <w:instrText xml:space="preserve"> PAGEREF _Toc37754758 \h </w:instrText>
             </w:r>
             <w:r>
               <w:rPr>
@@ -1420,7 +1591,7 @@
                 <w:noProof/>
                 <w:webHidden/>
               </w:rPr>
-              <w:t>4</w:t>
+              <w:t>5</w:t>
             </w:r>
             <w:r>
               <w:rPr>
@@ -1444,7 +1615,7 @@
               <w:lang w:eastAsia="en-GB"/>
             </w:rPr>
           </w:pPr>
-          <w:hyperlink w:anchor="_Toc37234530" w:history="1">
+          <w:hyperlink w:anchor="_Toc37754759" w:history="1">
             <w:r>
               <w:rPr>
                 <w:rStyle w:val="Lienhypertexte"/>
@@ -1486,7 +1657,7 @@
                 <w:noProof/>
                 <w:webHidden/>
               </w:rPr>
-              <w:instrText xml:space="preserve"> PAGEREF _Toc37234530 \h </w:instrText>
+              <w:instrText xml:space="preserve"> PAGEREF _Toc37754759 \h </w:instrText>
             </w:r>
             <w:r>
               <w:rPr>
@@ -1506,7 +1677,7 @@
                 <w:noProof/>
                 <w:webHidden/>
               </w:rPr>
-              <w:t>4</w:t>
+              <w:t>5</w:t>
             </w:r>
             <w:r>
               <w:rPr>
@@ -1530,7 +1701,7 @@
               <w:lang w:eastAsia="en-GB"/>
             </w:rPr>
           </w:pPr>
-          <w:hyperlink w:anchor="_Toc37234531" w:history="1">
+          <w:hyperlink w:anchor="_Toc37754760" w:history="1">
             <w:r>
               <w:rPr>
                 <w:rStyle w:val="Lienhypertexte"/>
@@ -1572,7 +1743,7 @@
                 <w:noProof/>
                 <w:webHidden/>
               </w:rPr>
-              <w:instrText xml:space="preserve"> PAGEREF _Toc37234531 \h </w:instrText>
+              <w:instrText xml:space="preserve"> PAGEREF _Toc37754760 \h </w:instrText>
             </w:r>
             <w:r>
               <w:rPr>
@@ -1592,7 +1763,7 @@
                 <w:noProof/>
                 <w:webHidden/>
               </w:rPr>
-              <w:t>5</w:t>
+              <w:t>6</w:t>
             </w:r>
             <w:r>
               <w:rPr>
@@ -1616,7 +1787,7 @@
               <w:lang w:eastAsia="en-GB"/>
             </w:rPr>
           </w:pPr>
-          <w:hyperlink w:anchor="_Toc37234532" w:history="1">
+          <w:hyperlink w:anchor="_Toc37754761" w:history="1">
             <w:r>
               <w:rPr>
                 <w:rStyle w:val="Lienhypertexte"/>
@@ -1658,7 +1829,7 @@
                 <w:noProof/>
                 <w:webHidden/>
               </w:rPr>
-              <w:instrText xml:space="preserve"> PAGEREF _Toc37234532 \h </w:instrText>
+              <w:instrText xml:space="preserve"> PAGEREF _Toc37754761 \h </w:instrText>
             </w:r>
             <w:r>
               <w:rPr>
@@ -1678,7 +1849,7 @@
                 <w:noProof/>
                 <w:webHidden/>
               </w:rPr>
-              <w:t>5</w:t>
+              <w:t>6</w:t>
             </w:r>
             <w:r>
               <w:rPr>
@@ -1702,7 +1873,7 @@
               <w:lang w:eastAsia="en-GB"/>
             </w:rPr>
           </w:pPr>
-          <w:hyperlink w:anchor="_Toc37234533" w:history="1">
+          <w:hyperlink w:anchor="_Toc37754762" w:history="1">
             <w:r>
               <w:rPr>
                 <w:rStyle w:val="Lienhypertexte"/>
@@ -1744,7 +1915,7 @@
                 <w:noProof/>
                 <w:webHidden/>
               </w:rPr>
-              <w:instrText xml:space="preserve"> PAGEREF _Toc37234533 \h </w:instrText>
+              <w:instrText xml:space="preserve"> PAGEREF _Toc37754762 \h </w:instrText>
             </w:r>
             <w:r>
               <w:rPr>
@@ -1764,7 +1935,7 @@
                 <w:noProof/>
                 <w:webHidden/>
               </w:rPr>
-              <w:t>6</w:t>
+              <w:t>7</w:t>
             </w:r>
             <w:r>
               <w:rPr>
@@ -1788,7 +1959,7 @@
               <w:lang w:eastAsia="en-GB"/>
             </w:rPr>
           </w:pPr>
-          <w:hyperlink w:anchor="_Toc37234534" w:history="1">
+          <w:hyperlink w:anchor="_Toc37754763" w:history="1">
             <w:r>
               <w:rPr>
                 <w:rStyle w:val="Lienhypertexte"/>
@@ -1830,7 +2001,7 @@
                 <w:noProof/>
                 <w:webHidden/>
               </w:rPr>
-              <w:instrText xml:space="preserve"> PAGEREF _Toc37234534 \h </w:instrText>
+              <w:instrText xml:space="preserve"> PAGEREF _Toc37754763 \h </w:instrText>
             </w:r>
             <w:r>
               <w:rPr>
@@ -1850,7 +2021,7 @@
                 <w:noProof/>
                 <w:webHidden/>
               </w:rPr>
-              <w:t>6</w:t>
+              <w:t>7</w:t>
             </w:r>
             <w:r>
               <w:rPr>
@@ -1874,7 +2045,7 @@
               <w:lang w:eastAsia="en-GB"/>
             </w:rPr>
           </w:pPr>
-          <w:hyperlink w:anchor="_Toc37234535" w:history="1">
+          <w:hyperlink w:anchor="_Toc37754764" w:history="1">
             <w:r>
               <w:rPr>
                 <w:rStyle w:val="Lienhypertexte"/>
@@ -1897,7 +2068,7 @@
                 <w:noProof/>
                 <w:lang w:val="fr-FR"/>
               </w:rPr>
-              <w:t>PDE</w:t>
+              <w:t>FluidDynamics</w:t>
             </w:r>
             <w:r>
               <w:rPr>
@@ -1918,7 +2089,7 @@
                 <w:noProof/>
                 <w:webHidden/>
               </w:rPr>
-              <w:instrText xml:space="preserve"> PAGEREF _Toc37234535 \h </w:instrText>
+              <w:instrText xml:space="preserve"> PAGEREF _Toc37754764 \h </w:instrText>
             </w:r>
             <w:r>
               <w:rPr>
@@ -1938,7 +2109,7 @@
                 <w:noProof/>
                 <w:webHidden/>
               </w:rPr>
-              <w:t>7</w:t>
+              <w:t>8</w:t>
             </w:r>
             <w:r>
               <w:rPr>
@@ -1962,7 +2133,7 @@
               <w:lang w:eastAsia="en-GB"/>
             </w:rPr>
           </w:pPr>
-          <w:hyperlink w:anchor="_Toc37234536" w:history="1">
+          <w:hyperlink w:anchor="_Toc37754765" w:history="1">
             <w:r>
               <w:rPr>
                 <w:rStyle w:val="Lienhypertexte"/>
@@ -1985,7 +2156,7 @@
                 <w:noProof/>
                 <w:lang w:val="fr-FR"/>
               </w:rPr>
-              <w:t>ThermalDiffusion</w:t>
+              <w:t>BasesClasses</w:t>
             </w:r>
             <w:r>
               <w:rPr>
@@ -2006,7 +2177,7 @@
                 <w:noProof/>
                 <w:webHidden/>
               </w:rPr>
-              <w:instrText xml:space="preserve"> PAGEREF _Toc37234536 \h </w:instrText>
+              <w:instrText xml:space="preserve"> PAGEREF _Toc37754765 \h </w:instrText>
             </w:r>
             <w:r>
               <w:rPr>
@@ -2026,7 +2197,7 @@
                 <w:noProof/>
                 <w:webHidden/>
               </w:rPr>
-              <w:t>7</w:t>
+              <w:t>8</w:t>
             </w:r>
             <w:r>
               <w:rPr>
@@ -2050,7 +2221,7 @@
               <w:lang w:eastAsia="en-GB"/>
             </w:rPr>
           </w:pPr>
-          <w:hyperlink w:anchor="_Toc37234537" w:history="1">
+          <w:hyperlink w:anchor="_Toc37754766" w:history="1">
             <w:r>
               <w:rPr>
                 <w:rStyle w:val="Lienhypertexte"/>
@@ -2071,6 +2242,282 @@
                 <w:rStyle w:val="Lienhypertexte"/>
                 <w:noProof/>
               </w:rPr>
+              <w:t>Aeraulic</w:t>
+            </w:r>
+            <w:r>
+              <w:rPr>
+                <w:rStyle w:val="Lienhypertexte"/>
+                <w:noProof/>
+              </w:rPr>
+              <w:t>C</w:t>
+            </w:r>
+            <w:r>
+              <w:rPr>
+                <w:rStyle w:val="Lienhypertexte"/>
+                <w:noProof/>
+              </w:rPr>
+              <w:t>onvection</w:t>
+            </w:r>
+            <w:r>
+              <w:rPr>
+                <w:noProof/>
+                <w:webHidden/>
+              </w:rPr>
+              <w:tab/>
+            </w:r>
+            <w:r>
+              <w:rPr>
+                <w:noProof/>
+                <w:webHidden/>
+              </w:rPr>
+              <w:fldChar w:fldCharType="begin"/>
+            </w:r>
+            <w:r>
+              <w:rPr>
+                <w:noProof/>
+                <w:webHidden/>
+              </w:rPr>
+              <w:instrText xml:space="preserve"> PAGEREF _Toc37754766 \h </w:instrText>
+            </w:r>
+            <w:r>
+              <w:rPr>
+                <w:noProof/>
+                <w:webHidden/>
+              </w:rPr>
+            </w:r>
+            <w:r>
+              <w:rPr>
+                <w:noProof/>
+                <w:webHidden/>
+              </w:rPr>
+              <w:fldChar w:fldCharType="separate"/>
+            </w:r>
+            <w:r>
+              <w:rPr>
+                <w:noProof/>
+                <w:webHidden/>
+              </w:rPr>
+              <w:t>8</w:t>
+            </w:r>
+            <w:r>
+              <w:rPr>
+                <w:noProof/>
+                <w:webHidden/>
+              </w:rPr>
+              <w:fldChar w:fldCharType="end"/>
+            </w:r>
+          </w:hyperlink>
+        </w:p>
+        <w:p>
+          <w:pPr>
+            <w:pStyle w:val="TM1"/>
+            <w:tabs>
+              <w:tab w:val="left" w:pos="660"/>
+              <w:tab w:val="right" w:leader="dot" w:pos="9062"/>
+            </w:tabs>
+            <w:rPr>
+              <w:rFonts w:eastAsiaTheme="minorEastAsia"/>
+              <w:noProof/>
+              <w:lang w:eastAsia="en-GB"/>
+            </w:rPr>
+          </w:pPr>
+          <w:hyperlink w:anchor="_Toc37754767" w:history="1">
+            <w:r>
+              <w:rPr>
+                <w:rStyle w:val="Lienhypertexte"/>
+                <w:noProof/>
+                <w:lang w:val="fr-FR"/>
+              </w:rPr>
+              <w:t>IV.</w:t>
+            </w:r>
+            <w:r>
+              <w:rPr>
+                <w:rFonts w:eastAsiaTheme="minorEastAsia"/>
+                <w:noProof/>
+                <w:lang w:eastAsia="en-GB"/>
+              </w:rPr>
+              <w:tab/>
+            </w:r>
+            <w:r>
+              <w:rPr>
+                <w:rStyle w:val="Lienhypertexte"/>
+                <w:noProof/>
+                <w:lang w:val="fr-FR"/>
+              </w:rPr>
+              <w:t>PDE</w:t>
+            </w:r>
+            <w:r>
+              <w:rPr>
+                <w:noProof/>
+                <w:webHidden/>
+              </w:rPr>
+              <w:tab/>
+            </w:r>
+            <w:r>
+              <w:rPr>
+                <w:noProof/>
+                <w:webHidden/>
+              </w:rPr>
+              <w:fldChar w:fldCharType="begin"/>
+            </w:r>
+            <w:r>
+              <w:rPr>
+                <w:noProof/>
+                <w:webHidden/>
+              </w:rPr>
+              <w:instrText xml:space="preserve"> PAGEREF _Toc37754767 \h </w:instrText>
+            </w:r>
+            <w:r>
+              <w:rPr>
+                <w:noProof/>
+                <w:webHidden/>
+              </w:rPr>
+            </w:r>
+            <w:r>
+              <w:rPr>
+                <w:noProof/>
+                <w:webHidden/>
+              </w:rPr>
+              <w:fldChar w:fldCharType="separate"/>
+            </w:r>
+            <w:r>
+              <w:rPr>
+                <w:noProof/>
+                <w:webHidden/>
+              </w:rPr>
+              <w:t>8</w:t>
+            </w:r>
+            <w:r>
+              <w:rPr>
+                <w:noProof/>
+                <w:webHidden/>
+              </w:rPr>
+              <w:fldChar w:fldCharType="end"/>
+            </w:r>
+          </w:hyperlink>
+        </w:p>
+        <w:p>
+          <w:pPr>
+            <w:pStyle w:val="TM2"/>
+            <w:tabs>
+              <w:tab w:val="left" w:pos="660"/>
+              <w:tab w:val="right" w:leader="dot" w:pos="9062"/>
+            </w:tabs>
+            <w:rPr>
+              <w:rFonts w:eastAsiaTheme="minorEastAsia"/>
+              <w:noProof/>
+              <w:lang w:eastAsia="en-GB"/>
+            </w:rPr>
+          </w:pPr>
+          <w:hyperlink w:anchor="_Toc37754768" w:history="1">
+            <w:r>
+              <w:rPr>
+                <w:rStyle w:val="Lienhypertexte"/>
+                <w:noProof/>
+                <w:lang w:val="fr-FR"/>
+              </w:rPr>
+              <w:t>A.</w:t>
+            </w:r>
+            <w:r>
+              <w:rPr>
+                <w:rFonts w:eastAsiaTheme="minorEastAsia"/>
+                <w:noProof/>
+                <w:lang w:eastAsia="en-GB"/>
+              </w:rPr>
+              <w:tab/>
+            </w:r>
+            <w:r>
+              <w:rPr>
+                <w:rStyle w:val="Lienhypertexte"/>
+                <w:noProof/>
+                <w:lang w:val="fr-FR"/>
+              </w:rPr>
+              <w:t>ThermalDiffusion</w:t>
+            </w:r>
+            <w:r>
+              <w:rPr>
+                <w:noProof/>
+                <w:webHidden/>
+              </w:rPr>
+              <w:tab/>
+            </w:r>
+            <w:r>
+              <w:rPr>
+                <w:noProof/>
+                <w:webHidden/>
+              </w:rPr>
+              <w:fldChar w:fldCharType="begin"/>
+            </w:r>
+            <w:r>
+              <w:rPr>
+                <w:noProof/>
+                <w:webHidden/>
+              </w:rPr>
+              <w:instrText xml:space="preserve"> PAGEREF _Toc37754768 \h </w:instrText>
+            </w:r>
+            <w:r>
+              <w:rPr>
+                <w:noProof/>
+                <w:webHidden/>
+              </w:rPr>
+            </w:r>
+            <w:r>
+              <w:rPr>
+                <w:noProof/>
+                <w:webHidden/>
+              </w:rPr>
+              <w:fldChar w:fldCharType="separate"/>
+            </w:r>
+            <w:r>
+              <w:rPr>
+                <w:noProof/>
+                <w:webHidden/>
+              </w:rPr>
+              <w:t>8</w:t>
+            </w:r>
+            <w:r>
+              <w:rPr>
+                <w:noProof/>
+                <w:webHidden/>
+              </w:rPr>
+              <w:fldChar w:fldCharType="end"/>
+            </w:r>
+          </w:hyperlink>
+        </w:p>
+        <w:p>
+          <w:pPr>
+            <w:pStyle w:val="TM3"/>
+            <w:tabs>
+              <w:tab w:val="left" w:pos="880"/>
+              <w:tab w:val="right" w:leader="dot" w:pos="9062"/>
+            </w:tabs>
+            <w:rPr>
+              <w:rFonts w:eastAsiaTheme="minorEastAsia"/>
+              <w:noProof/>
+              <w:lang w:eastAsia="en-GB"/>
+            </w:rPr>
+          </w:pPr>
+          <w:hyperlink w:anchor="_Toc37754769" w:history="1">
+            <w:r>
+              <w:rPr>
+                <w:rStyle w:val="Lienhypertexte"/>
+                <w:noProof/>
+              </w:rPr>
+              <w:t>1.</w:t>
+            </w:r>
+            <w:r>
+              <w:rPr>
+                <w:rFonts w:eastAsiaTheme="minorEastAsia"/>
+                <w:noProof/>
+                <w:lang w:eastAsia="en-GB"/>
+              </w:rPr>
+              <w:tab/>
+            </w:r>
+            <w:r>
+              <w:rPr>
+                <w:rStyle w:val="Lienhypertexte"/>
+                <w:noProof/>
+              </w:rPr>
               <w:t>Second order central</w:t>
             </w:r>
             <w:r>
@@ -2092,7 +2539,7 @@
                 <w:noProof/>
                 <w:webHidden/>
               </w:rPr>
-              <w:instrText xml:space="preserve"> PAGEREF _Toc37234537 \h </w:instrText>
+              <w:instrText xml:space="preserve"> PAGEREF _Toc37754769 \h </w:instrText>
             </w:r>
             <w:r>
               <w:rPr>
@@ -2112,7 +2559,7 @@
                 <w:noProof/>
                 <w:webHidden/>
               </w:rPr>
-              <w:t>7</w:t>
+              <w:t>8</w:t>
             </w:r>
             <w:r>
               <w:rPr>
@@ -2174,7 +2621,7 @@
           <w:lang w:val="fr-FR"/>
         </w:rPr>
       </w:pPr>
-      <w:bookmarkStart w:id="0" w:name="_Toc37234514"/>
+      <w:bookmarkStart w:id="0" w:name="_Toc37754741"/>
       <w:proofErr w:type="spellStart"/>
       <w:r>
         <w:rPr>
@@ -2201,7 +2648,7 @@
           <w:lang w:val="fr-FR"/>
         </w:rPr>
       </w:pPr>
-      <w:bookmarkStart w:id="1" w:name="_Toc37234515"/>
+      <w:bookmarkStart w:id="1" w:name="_Toc37754742"/>
       <w:r>
         <w:rPr>
           <w:lang w:val="fr-FR"/>
@@ -2224,7 +2671,7 @@
           <w:rFonts w:eastAsiaTheme="minorEastAsia"/>
         </w:rPr>
       </w:pPr>
-      <w:bookmarkStart w:id="2" w:name="_Toc37234516"/>
+      <w:bookmarkStart w:id="2" w:name="_Toc37754743"/>
       <w:r>
         <w:rPr>
           <w:rFonts w:eastAsiaTheme="minorEastAsia"/>
@@ -2691,6 +3138,7 @@
           <w:rFonts w:eastAsiaTheme="minorEastAsia"/>
         </w:rPr>
       </w:pPr>
+      <w:bookmarkStart w:id="3" w:name="_Toc37754744"/>
       <w:proofErr w:type="spellStart"/>
       <w:r>
         <w:rPr>
@@ -2704,6 +3152,7 @@
         </w:rPr>
         <w:t>Ventilation</w:t>
       </w:r>
+      <w:bookmarkEnd w:id="3"/>
       <w:proofErr w:type="spellEnd"/>
     </w:p>
     <w:p/>
@@ -3650,6 +4099,7 @@
           <w:rFonts w:eastAsiaTheme="minorEastAsia"/>
         </w:rPr>
       </w:pPr>
+      <w:bookmarkStart w:id="4" w:name="_Toc37754745"/>
       <w:proofErr w:type="spellStart"/>
       <w:r>
         <w:rPr>
@@ -3657,6 +4107,7 @@
         </w:rPr>
         <w:t>FviewCalculator</w:t>
       </w:r>
+      <w:bookmarkEnd w:id="4"/>
       <w:proofErr w:type="spellEnd"/>
     </w:p>
     <w:p/>
@@ -4130,7 +4581,7 @@
           <w:lang w:val="fr-FR"/>
         </w:rPr>
       </w:pPr>
-      <w:bookmarkStart w:id="3" w:name="_Toc37234517"/>
+      <w:bookmarkStart w:id="5" w:name="_Toc37754746"/>
       <w:proofErr w:type="spellStart"/>
       <w:r>
         <w:rPr>
@@ -4139,7 +4590,7 @@
         </w:rPr>
         <w:t>BasesClasses</w:t>
       </w:r>
-      <w:bookmarkEnd w:id="3"/>
+      <w:bookmarkEnd w:id="5"/>
       <w:proofErr w:type="spellEnd"/>
     </w:p>
     <w:p>
@@ -4156,7 +4607,7 @@
           <w:rFonts w:eastAsiaTheme="minorEastAsia"/>
         </w:rPr>
       </w:pPr>
-      <w:bookmarkStart w:id="4" w:name="_Toc37234518"/>
+      <w:bookmarkStart w:id="6" w:name="_Toc37754747"/>
       <w:proofErr w:type="spellStart"/>
       <w:r>
         <w:rPr>
@@ -4164,7 +4615,7 @@
         </w:rPr>
         <w:t>FreeConvection</w:t>
       </w:r>
-      <w:bookmarkEnd w:id="4"/>
+      <w:bookmarkEnd w:id="6"/>
       <w:proofErr w:type="spellEnd"/>
     </w:p>
     <w:p/>
@@ -4211,7 +4662,7 @@
           <w:rFonts w:eastAsiaTheme="minorEastAsia"/>
         </w:rPr>
       </w:pPr>
-      <w:bookmarkStart w:id="5" w:name="_Toc37234519"/>
+      <w:bookmarkStart w:id="7" w:name="_Toc37754748"/>
       <w:r>
         <w:rPr>
           <w:rFonts w:eastAsiaTheme="minorEastAsia"/>
@@ -4219,7 +4670,7 @@
         <w:lastRenderedPageBreak/>
         <w:t>Linear conduction</w:t>
       </w:r>
-      <w:bookmarkEnd w:id="5"/>
+      <w:bookmarkEnd w:id="7"/>
     </w:p>
     <w:p/>
     <w:p>
@@ -4299,14 +4750,14 @@
           <w:rFonts w:eastAsiaTheme="minorEastAsia"/>
         </w:rPr>
       </w:pPr>
-      <w:bookmarkStart w:id="6" w:name="_Toc37234520"/>
+      <w:bookmarkStart w:id="8" w:name="_Toc37754749"/>
       <w:r>
         <w:rPr>
           <w:rFonts w:eastAsiaTheme="minorEastAsia"/>
         </w:rPr>
         <w:t>Cylindrical conduction</w:t>
       </w:r>
-      <w:bookmarkEnd w:id="6"/>
+      <w:bookmarkEnd w:id="8"/>
     </w:p>
     <w:p>
       <w:pPr>
@@ -4433,14 +4884,14 @@
           <w:rFonts w:eastAsiaTheme="minorEastAsia"/>
         </w:rPr>
       </w:pPr>
-      <w:bookmarkStart w:id="7" w:name="_Toc37234521"/>
+      <w:bookmarkStart w:id="9" w:name="_Toc37754750"/>
       <w:r>
         <w:rPr>
           <w:rFonts w:eastAsiaTheme="minorEastAsia"/>
         </w:rPr>
         <w:t>Carroll radiation</w:t>
       </w:r>
-      <w:bookmarkEnd w:id="7"/>
+      <w:bookmarkEnd w:id="9"/>
     </w:p>
     <w:p>
       <w:pPr>
@@ -4848,13 +5299,7 @@
                     <w:rPr>
                       <w:rFonts w:ascii="Cambria Math" w:hAnsi="Cambria Math"/>
                     </w:rPr>
-                    <m:t>i→M</m:t>
-                  </m:r>
-                  <m:r>
-                    <w:rPr>
-                      <w:rFonts w:ascii="Cambria Math" w:hAnsi="Cambria Math"/>
-                    </w:rPr>
-                    <m:t>RT</m:t>
+                    <m:t>i→MRT</m:t>
                   </m:r>
                 </m:sub>
               </m:sSub>
@@ -4920,7 +5365,7 @@
           <w:rFonts w:eastAsiaTheme="minorEastAsia"/>
         </w:rPr>
       </w:pPr>
-      <w:bookmarkStart w:id="8" w:name="_Toc37234522"/>
+      <w:bookmarkStart w:id="10" w:name="_Toc37754751"/>
       <w:proofErr w:type="spellStart"/>
       <w:r>
         <w:rPr>
@@ -4928,7 +5373,7 @@
         </w:rPr>
         <w:t>HeatCapacitor</w:t>
       </w:r>
-      <w:bookmarkEnd w:id="8"/>
+      <w:bookmarkEnd w:id="10"/>
       <w:proofErr w:type="spellEnd"/>
     </w:p>
     <w:p/>
@@ -4995,7 +5440,7 @@
           <w:rFonts w:eastAsiaTheme="minorEastAsia"/>
         </w:rPr>
       </w:pPr>
-      <w:bookmarkStart w:id="9" w:name="_Toc37234523"/>
+      <w:bookmarkStart w:id="11" w:name="_Toc37754752"/>
       <w:proofErr w:type="spellStart"/>
       <w:r>
         <w:rPr>
@@ -5003,7 +5448,7 @@
         </w:rPr>
         <w:t>LumpVolume</w:t>
       </w:r>
-      <w:bookmarkEnd w:id="9"/>
+      <w:bookmarkEnd w:id="11"/>
       <w:proofErr w:type="spellEnd"/>
     </w:p>
     <w:p/>
@@ -5108,14 +5553,14 @@
           <w:rFonts w:eastAsiaTheme="minorEastAsia"/>
         </w:rPr>
       </w:pPr>
-      <w:bookmarkStart w:id="10" w:name="_Toc37234524"/>
+      <w:bookmarkStart w:id="12" w:name="_Toc37754753"/>
       <w:r>
         <w:rPr>
           <w:rFonts w:eastAsiaTheme="minorEastAsia"/>
         </w:rPr>
         <w:t>Heat Exchanger</w:t>
       </w:r>
-      <w:bookmarkEnd w:id="10"/>
+      <w:bookmarkEnd w:id="12"/>
     </w:p>
     <w:p/>
     <w:p>
@@ -5831,7 +6276,7 @@
           <w:rFonts w:eastAsiaTheme="minorEastAsia"/>
         </w:rPr>
       </w:pPr>
-      <w:bookmarkStart w:id="11" w:name="_Toc37234525"/>
+      <w:bookmarkStart w:id="13" w:name="_Toc37754754"/>
       <w:proofErr w:type="spellStart"/>
       <w:r>
         <w:rPr>
@@ -5839,7 +6284,7 @@
         </w:rPr>
         <w:t>PartialWall</w:t>
       </w:r>
-      <w:bookmarkEnd w:id="11"/>
+      <w:bookmarkEnd w:id="13"/>
       <w:proofErr w:type="spellEnd"/>
     </w:p>
     <w:p/>
@@ -5990,7 +6435,7 @@
           <w:lang w:val="fr-FR"/>
         </w:rPr>
       </w:pPr>
-      <w:bookmarkStart w:id="12" w:name="_Toc37234526"/>
+      <w:bookmarkStart w:id="14" w:name="_Toc37754755"/>
       <w:proofErr w:type="spellStart"/>
       <w:r>
         <w:rPr>
@@ -6000,7 +6445,7 @@
         <w:lastRenderedPageBreak/>
         <w:t>Functions</w:t>
       </w:r>
-      <w:bookmarkEnd w:id="12"/>
+      <w:bookmarkEnd w:id="14"/>
       <w:proofErr w:type="spellEnd"/>
     </w:p>
     <w:p>
@@ -6017,7 +6462,7 @@
           <w:rFonts w:eastAsiaTheme="minorEastAsia"/>
         </w:rPr>
       </w:pPr>
-      <w:bookmarkStart w:id="13" w:name="_Toc37234527"/>
+      <w:bookmarkStart w:id="15" w:name="_Toc37754756"/>
       <w:proofErr w:type="spellStart"/>
       <w:r>
         <w:rPr>
@@ -6025,7 +6470,7 @@
         </w:rPr>
         <w:t>Flat_plate_ASHRAE</w:t>
       </w:r>
-      <w:bookmarkEnd w:id="13"/>
+      <w:bookmarkEnd w:id="15"/>
       <w:proofErr w:type="spellEnd"/>
     </w:p>
     <w:p>
@@ -6139,7 +6584,7 @@
           <w:rFonts w:eastAsiaTheme="minorEastAsia"/>
         </w:rPr>
       </w:pPr>
-      <w:bookmarkStart w:id="14" w:name="_Toc37234528"/>
+      <w:bookmarkStart w:id="16" w:name="_Toc37754757"/>
       <w:proofErr w:type="spellStart"/>
       <w:r>
         <w:rPr>
@@ -6147,7 +6592,7 @@
         </w:rPr>
         <w:t>h_rad</w:t>
       </w:r>
-      <w:bookmarkEnd w:id="14"/>
+      <w:bookmarkEnd w:id="16"/>
       <w:proofErr w:type="spellEnd"/>
     </w:p>
     <w:p>
@@ -6262,7 +6707,7 @@
           <w:rFonts w:eastAsiaTheme="minorEastAsia"/>
         </w:rPr>
       </w:pPr>
-      <w:bookmarkStart w:id="15" w:name="_Toc37234529"/>
+      <w:bookmarkStart w:id="17" w:name="_Toc37754758"/>
       <w:proofErr w:type="spellStart"/>
       <w:proofErr w:type="gramStart"/>
       <w:r>
@@ -6271,7 +6716,7 @@
         </w:rPr>
         <w:t>uniformGrid</w:t>
       </w:r>
-      <w:bookmarkEnd w:id="15"/>
+      <w:bookmarkEnd w:id="17"/>
       <w:proofErr w:type="spellEnd"/>
       <w:proofErr w:type="gramEnd"/>
     </w:p>
@@ -6407,7 +6852,7 @@
           <w:rFonts w:eastAsiaTheme="minorEastAsia"/>
         </w:rPr>
       </w:pPr>
-      <w:bookmarkStart w:id="16" w:name="_Toc37234530"/>
+      <w:bookmarkStart w:id="18" w:name="_Toc37754759"/>
       <w:proofErr w:type="spellStart"/>
       <w:proofErr w:type="gramStart"/>
       <w:r>
@@ -6416,7 +6861,7 @@
         </w:rPr>
         <w:t>geometricalGrowthGrid</w:t>
       </w:r>
-      <w:bookmarkEnd w:id="16"/>
+      <w:bookmarkEnd w:id="18"/>
       <w:proofErr w:type="spellEnd"/>
       <w:proofErr w:type="gramEnd"/>
     </w:p>
@@ -7421,7 +7866,7 @@
           <w:rFonts w:eastAsiaTheme="minorEastAsia"/>
         </w:rPr>
       </w:pPr>
-      <w:bookmarkStart w:id="17" w:name="_Toc37234531"/>
+      <w:bookmarkStart w:id="19" w:name="_Toc37754760"/>
       <w:proofErr w:type="spellStart"/>
       <w:proofErr w:type="gramStart"/>
       <w:r>
@@ -7430,7 +7875,7 @@
         </w:rPr>
         <w:t>biotAndUniformGrid</w:t>
       </w:r>
-      <w:bookmarkEnd w:id="17"/>
+      <w:bookmarkEnd w:id="19"/>
       <w:proofErr w:type="spellEnd"/>
       <w:proofErr w:type="gramEnd"/>
     </w:p>
@@ -7669,7 +8114,7 @@
           <w:rFonts w:eastAsiaTheme="minorEastAsia"/>
         </w:rPr>
       </w:pPr>
-      <w:bookmarkStart w:id="18" w:name="_Toc37234532"/>
+      <w:bookmarkStart w:id="20" w:name="_Toc37754761"/>
       <w:proofErr w:type="spellStart"/>
       <w:proofErr w:type="gramStart"/>
       <w:r>
@@ -7678,7 +8123,7 @@
         </w:rPr>
         <w:t>biotAndGeometricalGrowthGrid</w:t>
       </w:r>
-      <w:bookmarkEnd w:id="18"/>
+      <w:bookmarkEnd w:id="20"/>
       <w:proofErr w:type="spellEnd"/>
       <w:proofErr w:type="gramEnd"/>
     </w:p>
@@ -8402,13 +8847,7 @@
                 <w:rPr>
                   <w:rFonts w:ascii="Cambria Math" w:eastAsiaTheme="minorEastAsia" w:hAnsi="Cambria Math"/>
                 </w:rPr>
-                <m:t>d</m:t>
-              </m:r>
-              <m:r>
-                <w:rPr>
-                  <w:rFonts w:ascii="Cambria Math" w:eastAsiaTheme="minorEastAsia" w:hAnsi="Cambria Math"/>
-                </w:rPr>
-                <m:t>x×q</m:t>
+                <m:t>dx×q</m:t>
               </m:r>
             </m:e>
             <m:sup>
@@ -8735,7 +9174,7 @@
           <w:rFonts w:eastAsiaTheme="minorEastAsia"/>
         </w:rPr>
       </w:pPr>
-      <w:bookmarkStart w:id="19" w:name="_Toc37234533"/>
+      <w:bookmarkStart w:id="21" w:name="_Toc37754762"/>
       <w:proofErr w:type="spellStart"/>
       <w:proofErr w:type="gramStart"/>
       <w:r>
@@ -8744,7 +9183,7 @@
         </w:rPr>
         <w:t>counterCurrent</w:t>
       </w:r>
-      <w:bookmarkEnd w:id="19"/>
+      <w:bookmarkEnd w:id="21"/>
       <w:proofErr w:type="spellEnd"/>
       <w:proofErr w:type="gramEnd"/>
     </w:p>
@@ -8918,7 +9357,7 @@
           <w:rFonts w:eastAsiaTheme="minorEastAsia"/>
         </w:rPr>
       </w:pPr>
-      <w:bookmarkStart w:id="20" w:name="_Toc37234534"/>
+      <w:bookmarkStart w:id="22" w:name="_Toc37754763"/>
       <w:proofErr w:type="spellStart"/>
       <w:r>
         <w:rPr>
@@ -8932,7 +9371,7 @@
         </w:rPr>
         <w:t>counterCurrent</w:t>
       </w:r>
-      <w:bookmarkEnd w:id="20"/>
+      <w:bookmarkEnd w:id="22"/>
       <w:proofErr w:type="spellEnd"/>
     </w:p>
     <w:p>
@@ -9168,7 +9607,7 @@
           <w:lang w:val="fr-FR"/>
         </w:rPr>
       </w:pPr>
-      <w:bookmarkStart w:id="21" w:name="_Toc37234535"/>
+      <w:bookmarkStart w:id="23" w:name="_Toc37754764"/>
       <w:proofErr w:type="spellStart"/>
       <w:r>
         <w:rPr>
@@ -9178,6 +9617,7 @@
         <w:lastRenderedPageBreak/>
         <w:t>FluidDynamics</w:t>
       </w:r>
+      <w:bookmarkEnd w:id="23"/>
       <w:proofErr w:type="spellEnd"/>
     </w:p>
     <w:p>
@@ -9194,6 +9634,7 @@
           <w:lang w:val="fr-FR"/>
         </w:rPr>
       </w:pPr>
+      <w:bookmarkStart w:id="24" w:name="_Toc37754765"/>
       <w:proofErr w:type="spellStart"/>
       <w:r>
         <w:rPr>
@@ -9201,6 +9642,7 @@
         </w:rPr>
         <w:t>BasesClasses</w:t>
       </w:r>
+      <w:bookmarkEnd w:id="24"/>
       <w:proofErr w:type="spellEnd"/>
     </w:p>
     <w:p>
@@ -9217,6 +9659,7 @@
           <w:rFonts w:eastAsiaTheme="minorEastAsia"/>
         </w:rPr>
       </w:pPr>
+      <w:bookmarkStart w:id="25" w:name="_Toc37754766"/>
       <w:proofErr w:type="spellStart"/>
       <w:r>
         <w:rPr>
@@ -9224,6 +9667,7 @@
         </w:rPr>
         <w:t>AeraulicConvection</w:t>
       </w:r>
+      <w:bookmarkEnd w:id="25"/>
       <w:proofErr w:type="spellEnd"/>
     </w:p>
     <w:p/>
@@ -9249,25 +9693,7 @@
             <w:rPr>
               <w:rFonts w:ascii="Cambria Math" w:hAnsi="Cambria Math"/>
             </w:rPr>
-            <m:t>×</m:t>
-          </m:r>
-          <m:r>
-            <m:rPr>
-              <m:sty m:val="p"/>
-            </m:rPr>
-            <w:rPr>
-              <w:rFonts w:ascii="Cambria Math" w:hAnsi="Cambria Math"/>
-            </w:rPr>
-            <m:t>cp</m:t>
-          </m:r>
-          <m:r>
-            <m:rPr>
-              <m:sty m:val="p"/>
-            </m:rPr>
-            <w:rPr>
-              <w:rFonts w:ascii="Cambria Math" w:hAnsi="Cambria Math"/>
-            </w:rPr>
-            <m:t>×</m:t>
+            <m:t>×cp×</m:t>
           </m:r>
           <m:d>
             <m:dPr>
@@ -9352,25 +9778,7 @@
             <w:rPr>
               <w:rFonts w:ascii="Cambria Math" w:hAnsi="Cambria Math"/>
             </w:rPr>
-            <m:t>h_cv</m:t>
-          </m:r>
-          <m:r>
-            <w:rPr>
-              <w:rFonts w:ascii="Cambria Math" w:hAnsi="Cambria Math"/>
-            </w:rPr>
-            <m:t>×</m:t>
-          </m:r>
-          <m:r>
-            <w:rPr>
-              <w:rFonts w:ascii="Cambria Math" w:hAnsi="Cambria Math"/>
-            </w:rPr>
-            <m:t>A</m:t>
-          </m:r>
-          <m:r>
-            <w:rPr>
-              <w:rFonts w:ascii="Cambria Math" w:hAnsi="Cambria Math"/>
-            </w:rPr>
-            <m:t>×</m:t>
+            <m:t>h_cv×A×</m:t>
           </m:r>
           <m:d>
             <m:dPr>
@@ -9483,13 +9891,7 @@
                 <w:rPr>
                   <w:rFonts w:ascii="Cambria Math" w:hAnsi="Cambria Math"/>
                 </w:rPr>
-                <m:t>h_cv</m:t>
-              </m:r>
-              <m:r>
-                <w:rPr>
-                  <w:rFonts w:ascii="Cambria Math" w:hAnsi="Cambria Math"/>
-                </w:rPr>
-                <m:t>×A</m:t>
+                <m:t>h_cv×A</m:t>
               </m:r>
             </m:num>
             <m:den>
@@ -9506,12 +9908,272 @@
     </w:p>
     <w:p>
       <w:pPr>
+        <w:ind w:left="-567" w:right="-567"/>
+        <w:rPr>
+          <w:rFonts w:eastAsiaTheme="minorEastAsia"/>
+        </w:rPr>
+      </w:pPr>
+    </w:p>
+    <w:p>
+      <w:pPr>
+        <w:pStyle w:val="Titre3"/>
+        <w:rPr>
+          <w:rFonts w:eastAsiaTheme="minorEastAsia"/>
+        </w:rPr>
+      </w:pPr>
+      <w:r>
+        <w:rPr>
+          <w:rFonts w:eastAsiaTheme="minorEastAsia"/>
+        </w:rPr>
+        <w:t>Con</w:t>
+      </w:r>
+      <w:r>
+        <w:rPr>
+          <w:rFonts w:eastAsiaTheme="minorEastAsia"/>
+        </w:rPr>
+        <w:t>densation</w:t>
+      </w:r>
+      <w:bookmarkStart w:id="26" w:name="_GoBack"/>
+      <w:bookmarkEnd w:id="26"/>
+    </w:p>
+    <w:p/>
+    <w:p>
+      <w:pPr>
+        <w:ind w:left="-567" w:right="-567"/>
+        <w:rPr>
+          <w:rFonts w:eastAsiaTheme="minorEastAsia"/>
+        </w:rPr>
+      </w:pPr>
+      <m:oMathPara>
+        <m:oMath>
+          <m:sSub>
+            <m:sSubPr>
+              <m:ctrlPr>
+                <w:rPr>
+                  <w:rFonts w:ascii="Cambria Math" w:hAnsi="Cambria Math"/>
+                  <w:i/>
+                </w:rPr>
+              </m:ctrlPr>
+            </m:sSubPr>
+            <m:e>
+              <m:r>
+                <w:rPr>
+                  <w:rFonts w:ascii="Cambria Math" w:hAnsi="Cambria Math"/>
+                </w:rPr>
+                <m:t>V_flow</m:t>
+              </m:r>
+            </m:e>
+            <m:sub>
+              <m:r>
+                <w:rPr>
+                  <w:rFonts w:ascii="Cambria Math" w:hAnsi="Cambria Math"/>
+                </w:rPr>
+                <m:t>moved by convection</m:t>
+              </m:r>
+            </m:sub>
+          </m:sSub>
+          <m:r>
+            <w:rPr>
+              <w:rFonts w:ascii="Cambria Math" w:hAnsi="Cambria Math"/>
+            </w:rPr>
+            <m:t xml:space="preserve">= </m:t>
+          </m:r>
+          <m:sSub>
+            <m:sSubPr>
+              <m:ctrlPr>
+                <w:rPr>
+                  <w:rFonts w:ascii="Cambria Math" w:eastAsiaTheme="minorEastAsia" w:hAnsi="Cambria Math"/>
+                  <w:i/>
+                </w:rPr>
+              </m:ctrlPr>
+            </m:sSubPr>
+            <m:e>
+              <m:r>
+                <w:rPr>
+                  <w:rFonts w:ascii="Cambria Math" w:eastAsiaTheme="minorEastAsia" w:hAnsi="Cambria Math"/>
+                </w:rPr>
+                <m:t>β</m:t>
+              </m:r>
+            </m:e>
+            <m:sub>
+              <m:r>
+                <w:rPr>
+                  <w:rFonts w:ascii="Cambria Math" w:eastAsiaTheme="minorEastAsia" w:hAnsi="Cambria Math"/>
+                </w:rPr>
+                <m:t>v</m:t>
+              </m:r>
+            </m:sub>
+          </m:sSub>
+          <m:r>
+            <w:rPr>
+              <w:rFonts w:ascii="Cambria Math" w:hAnsi="Cambria Math"/>
+            </w:rPr>
+            <m:t>×A</m:t>
+          </m:r>
+        </m:oMath>
+      </m:oMathPara>
+    </w:p>
+    <w:p>
+      <w:pPr>
+        <w:ind w:left="-567" w:right="-567"/>
+        <w:rPr>
+          <w:rFonts w:eastAsiaTheme="minorEastAsia"/>
+        </w:rPr>
+      </w:pPr>
+      <m:oMathPara>
+        <m:oMath>
+          <m:r>
+            <w:rPr>
+              <w:rFonts w:ascii="Cambria Math" w:hAnsi="Cambria Math"/>
+            </w:rPr>
+            <m:t>m_flow</m:t>
+          </m:r>
+          <m:r>
+            <w:rPr>
+              <w:rFonts w:ascii="Cambria Math" w:hAnsi="Cambria Math"/>
+            </w:rPr>
+            <m:t xml:space="preserve">= </m:t>
+          </m:r>
+          <m:sSub>
+            <m:sSubPr>
+              <m:ctrlPr>
+                <w:rPr>
+                  <w:rFonts w:ascii="Cambria Math" w:eastAsiaTheme="minorEastAsia" w:hAnsi="Cambria Math"/>
+                  <w:i/>
+                </w:rPr>
+              </m:ctrlPr>
+            </m:sSubPr>
+            <m:e>
+              <m:r>
+                <w:rPr>
+                  <w:rFonts w:ascii="Cambria Math" w:eastAsiaTheme="minorEastAsia" w:hAnsi="Cambria Math"/>
+                </w:rPr>
+                <m:t>β</m:t>
+              </m:r>
+            </m:e>
+            <m:sub>
+              <m:r>
+                <w:rPr>
+                  <w:rFonts w:ascii="Cambria Math" w:eastAsiaTheme="minorEastAsia" w:hAnsi="Cambria Math"/>
+                </w:rPr>
+                <m:t>v</m:t>
+              </m:r>
+            </m:sub>
+          </m:sSub>
+          <m:r>
+            <w:rPr>
+              <w:rFonts w:ascii="Cambria Math" w:hAnsi="Cambria Math"/>
+            </w:rPr>
+            <m:t>×</m:t>
+          </m:r>
+          <m:r>
+            <w:rPr>
+              <w:rFonts w:ascii="Cambria Math" w:hAnsi="Cambria Math"/>
+            </w:rPr>
+            <m:t>A</m:t>
+          </m:r>
+          <m:r>
+            <w:rPr>
+              <w:rFonts w:ascii="Cambria Math" w:hAnsi="Cambria Math"/>
+            </w:rPr>
+            <m:t>×(</m:t>
+          </m:r>
+          <m:sSub>
+            <m:sSubPr>
+              <m:ctrlPr>
+                <w:rPr>
+                  <w:rFonts w:ascii="Cambria Math" w:hAnsi="Cambria Math"/>
+                  <w:i/>
+                </w:rPr>
+              </m:ctrlPr>
+            </m:sSubPr>
+            <m:e>
+              <m:r>
+                <w:rPr>
+                  <w:rFonts w:ascii="Cambria Math" w:hAnsi="Cambria Math"/>
+                </w:rPr>
+                <m:t>d</m:t>
+              </m:r>
+            </m:e>
+            <m:sub>
+              <m:r>
+                <w:rPr>
+                  <w:rFonts w:ascii="Cambria Math" w:hAnsi="Cambria Math"/>
+                </w:rPr>
+                <m:t>condensable species</m:t>
+              </m:r>
+            </m:sub>
+          </m:sSub>
+          <m:r>
+            <w:rPr>
+              <w:rFonts w:ascii="Cambria Math" w:hAnsi="Cambria Math"/>
+            </w:rPr>
+            <m:t>-</m:t>
+          </m:r>
+          <m:sSub>
+            <m:sSubPr>
+              <m:ctrlPr>
+                <w:rPr>
+                  <w:rFonts w:ascii="Cambria Math" w:hAnsi="Cambria Math"/>
+                  <w:i/>
+                </w:rPr>
+              </m:ctrlPr>
+            </m:sSubPr>
+            <m:e>
+              <m:r>
+                <w:rPr>
+                  <w:rFonts w:ascii="Cambria Math" w:hAnsi="Cambria Math"/>
+                </w:rPr>
+                <m:t>d</m:t>
+              </m:r>
+            </m:e>
+            <m:sub>
+              <m:r>
+                <w:rPr>
+                  <w:rFonts w:ascii="Cambria Math" w:hAnsi="Cambria Math"/>
+                </w:rPr>
+                <m:t>sat condensable species</m:t>
+              </m:r>
+            </m:sub>
+          </m:sSub>
+          <m:r>
+            <w:rPr>
+              <w:rFonts w:ascii="Cambria Math" w:hAnsi="Cambria Math"/>
+            </w:rPr>
+            <m:t>(</m:t>
+          </m:r>
+          <m:r>
+            <w:rPr>
+              <w:rFonts w:ascii="Cambria Math" w:hAnsi="Cambria Math"/>
+            </w:rPr>
+            <m:t>heatPort.T</m:t>
+          </m:r>
+          <m:r>
+            <w:rPr>
+              <w:rFonts w:ascii="Cambria Math" w:hAnsi="Cambria Math"/>
+            </w:rPr>
+            <m:t>))</m:t>
+          </m:r>
+        </m:oMath>
+      </m:oMathPara>
+    </w:p>
+    <w:p>
+      <w:pPr>
+        <w:ind w:left="-567" w:right="-567"/>
+        <w:rPr>
+          <w:rFonts w:eastAsiaTheme="minorEastAsia"/>
+        </w:rPr>
+      </w:pPr>
+    </w:p>
+    <w:p>
+      <w:pPr>
         <w:pStyle w:val="Titre1"/>
         <w:rPr>
           <w:rFonts w:eastAsiaTheme="minorEastAsia"/>
           <w:lang w:val="fr-FR"/>
         </w:rPr>
       </w:pPr>
+      <w:bookmarkStart w:id="27" w:name="_Toc37754767"/>
       <w:r>
         <w:rPr>
           <w:rFonts w:eastAsiaTheme="minorEastAsia"/>
@@ -9519,9 +10181,7 @@
         </w:rPr>
         <w:t>PDE</w:t>
       </w:r>
-      <w:bookmarkStart w:id="22" w:name="_GoBack"/>
-      <w:bookmarkEnd w:id="21"/>
-      <w:bookmarkEnd w:id="22"/>
+      <w:bookmarkEnd w:id="27"/>
     </w:p>
     <w:p>
       <w:pPr>
@@ -9537,7 +10197,7 @@
           <w:lang w:val="fr-FR"/>
         </w:rPr>
       </w:pPr>
-      <w:bookmarkStart w:id="23" w:name="_Toc37234536"/>
+      <w:bookmarkStart w:id="28" w:name="_Toc37754768"/>
       <w:proofErr w:type="spellStart"/>
       <w:r>
         <w:rPr>
@@ -9545,18 +10205,18 @@
         </w:rPr>
         <w:t>ThermalDiffusion</w:t>
       </w:r>
-      <w:bookmarkEnd w:id="23"/>
+      <w:bookmarkEnd w:id="28"/>
       <w:proofErr w:type="spellEnd"/>
     </w:p>
     <w:p>
       <w:pPr>
         <w:pStyle w:val="Titre3"/>
       </w:pPr>
-      <w:bookmarkStart w:id="24" w:name="_Toc37234537"/>
+      <w:bookmarkStart w:id="29" w:name="_Toc37754769"/>
       <w:r>
         <w:t>Second order central</w:t>
       </w:r>
-      <w:bookmarkEnd w:id="24"/>
+      <w:bookmarkEnd w:id="29"/>
     </w:p>
     <w:p>
       <w:pPr>
@@ -11387,14 +12047,7 @@
               <w:rFonts w:ascii="Cambria Math" w:hAnsi="Cambria Math"/>
               <w:sz w:val="18"/>
             </w:rPr>
-            <m:t>Co</m:t>
-          </m:r>
-          <m:r>
-            <w:rPr>
-              <w:rFonts w:ascii="Cambria Math" w:hAnsi="Cambria Math"/>
-              <w:sz w:val="18"/>
-            </w:rPr>
-            <m:t>effTimeDer×der</m:t>
+            <m:t>CoeffTimeDer×der</m:t>
           </m:r>
           <m:d>
             <m:dPr>
@@ -13873,7 +14526,7 @@
   <a:extraClrSchemeLst/>
   <a:extLst>
     <a:ext uri="{05A4C25C-085E-4340-85A3-A5531E510DB2}">
-      <thm15:themeFamily xmlns:thm15="http://schemas.microsoft.com/office/thememl/2012/main" xmlns="" name="Office Theme" id="{62F939B6-93AF-4DB8-9C6B-D6C7DFDC589F}" vid="{4A3C46E8-61CC-4603-A589-7422A47A8E4A}"/>
+      <thm15:themeFamily xmlns="" xmlns:thm15="http://schemas.microsoft.com/office/thememl/2012/main" name="Office Theme" id="{62F939B6-93AF-4DB8-9C6B-D6C7DFDC589F}" vid="{4A3C46E8-61CC-4603-A589-7422A47A8E4A}"/>
     </a:ext>
   </a:extLst>
 </a:theme>
@@ -13884,7 +14537,7 @@
 </file>
 
 <file path=customXml/itemProps1.xml><?xml version="1.0" encoding="utf-8"?>
-<ds:datastoreItem xmlns:ds="http://schemas.openxmlformats.org/officeDocument/2006/customXml" ds:itemID="{0EB68C71-4DC1-4C98-A743-9CB8FE7C1569}">
+<ds:datastoreItem xmlns:ds="http://schemas.openxmlformats.org/officeDocument/2006/customXml" ds:itemID="{71C7B7D3-1A04-4309-9610-8EDCFD08554D}">
   <ds:schemaRefs>
     <ds:schemaRef ds:uri="http://schemas.openxmlformats.org/officeDocument/2006/bibliography"/>
   </ds:schemaRefs>

</xml_diff>

<commit_message>
Addition of the MolecularDiffusion module
</commit_message>
<xml_diff>
--- a/Information/script for equations.docx
+++ b/Information/script for equations.docx
@@ -9933,8 +9933,6 @@
         </w:rPr>
         <w:t>densation</w:t>
       </w:r>
-      <w:bookmarkStart w:id="26" w:name="_GoBack"/>
-      <w:bookmarkEnd w:id="26"/>
     </w:p>
     <w:p/>
     <w:p>
@@ -10164,6 +10162,287 @@
           <w:rFonts w:eastAsiaTheme="minorEastAsia"/>
         </w:rPr>
       </w:pPr>
+    </w:p>
+    <w:p>
+      <w:pPr>
+        <w:pStyle w:val="Titre3"/>
+        <w:rPr>
+          <w:rFonts w:eastAsiaTheme="minorEastAsia"/>
+        </w:rPr>
+      </w:pPr>
+      <w:proofErr w:type="spellStart"/>
+      <w:r>
+        <w:rPr>
+          <w:rFonts w:eastAsiaTheme="minorEastAsia"/>
+        </w:rPr>
+        <w:t>MolecularDiffusion</w:t>
+      </w:r>
+      <w:proofErr w:type="spellEnd"/>
+    </w:p>
+    <w:p/>
+    <w:p>
+      <w:pPr>
+        <w:rPr>
+          <w:rFonts w:eastAsiaTheme="minorEastAsia"/>
+        </w:rPr>
+      </w:pPr>
+      <m:oMathPara>
+        <m:oMath>
+          <m:sSub>
+            <m:sSubPr>
+              <m:ctrlPr>
+                <w:rPr>
+                  <w:rFonts w:ascii="Cambria Math" w:hAnsi="Cambria Math"/>
+                  <w:i/>
+                </w:rPr>
+              </m:ctrlPr>
+            </m:sSubPr>
+            <m:e>
+              <m:r>
+                <w:rPr>
+                  <w:rFonts w:ascii="Cambria Math" w:hAnsi="Cambria Math"/>
+                </w:rPr>
+                <m:t>J</m:t>
+              </m:r>
+            </m:e>
+            <m:sub>
+              <m:r>
+                <w:rPr>
+                  <w:rFonts w:ascii="Cambria Math" w:hAnsi="Cambria Math"/>
+                </w:rPr>
+                <m:t>j</m:t>
+              </m:r>
+            </m:sub>
+          </m:sSub>
+          <m:r>
+            <w:rPr>
+              <w:rFonts w:ascii="Cambria Math" w:hAnsi="Cambria Math"/>
+            </w:rPr>
+            <m:t xml:space="preserve">=-ρ× </m:t>
+          </m:r>
+          <m:sSub>
+            <m:sSubPr>
+              <m:ctrlPr>
+                <w:rPr>
+                  <w:rFonts w:ascii="Cambria Math" w:eastAsiaTheme="minorEastAsia" w:hAnsi="Cambria Math"/>
+                  <w:i/>
+                </w:rPr>
+              </m:ctrlPr>
+            </m:sSubPr>
+            <m:e>
+              <m:r>
+                <w:rPr>
+                  <w:rFonts w:ascii="Cambria Math" w:eastAsiaTheme="minorEastAsia" w:hAnsi="Cambria Math"/>
+                </w:rPr>
+                <m:t>D</m:t>
+              </m:r>
+            </m:e>
+            <m:sub>
+              <m:r>
+                <w:rPr>
+                  <w:rFonts w:ascii="Cambria Math" w:eastAsiaTheme="minorEastAsia" w:hAnsi="Cambria Math"/>
+                </w:rPr>
+                <m:t>ij</m:t>
+              </m:r>
+            </m:sub>
+          </m:sSub>
+          <m:r>
+            <w:rPr>
+              <w:rFonts w:ascii="Cambria Math" w:hAnsi="Cambria Math"/>
+            </w:rPr>
+            <m:t>×</m:t>
+          </m:r>
+          <m:sSub>
+            <m:sSubPr>
+              <m:ctrlPr>
+                <w:rPr>
+                  <w:rFonts w:ascii="Cambria Math" w:hAnsi="Cambria Math"/>
+                  <w:i/>
+                </w:rPr>
+              </m:ctrlPr>
+            </m:sSubPr>
+            <m:e>
+              <m:r>
+                <m:rPr>
+                  <m:sty m:val="p"/>
+                </m:rPr>
+                <w:rPr>
+                  <w:rFonts w:ascii="Cambria Math" w:hAnsi="Cambria Math"/>
+                </w:rPr>
+                <m:t>∇c</m:t>
+              </m:r>
+            </m:e>
+            <m:sub>
+              <m:r>
+                <w:rPr>
+                  <w:rFonts w:ascii="Cambria Math" w:hAnsi="Cambria Math"/>
+                </w:rPr>
+                <m:t>j</m:t>
+              </m:r>
+            </m:sub>
+          </m:sSub>
+        </m:oMath>
+      </m:oMathPara>
+    </w:p>
+    <w:p>
+      <w:pPr>
+        <w:rPr>
+          <w:rFonts w:eastAsiaTheme="minorEastAsia"/>
+        </w:rPr>
+      </w:pPr>
+      <m:oMathPara>
+        <m:oMath>
+          <m:sSub>
+            <m:sSubPr>
+              <m:ctrlPr>
+                <w:rPr>
+                  <w:rFonts w:ascii="Cambria Math" w:hAnsi="Cambria Math"/>
+                  <w:i/>
+                </w:rPr>
+              </m:ctrlPr>
+            </m:sSubPr>
+            <m:e>
+              <m:r>
+                <w:rPr>
+                  <w:rFonts w:ascii="Cambria Math" w:hAnsi="Cambria Math"/>
+                </w:rPr>
+                <m:t>m_flow</m:t>
+              </m:r>
+            </m:e>
+            <m:sub>
+              <m:r>
+                <w:rPr>
+                  <w:rFonts w:ascii="Cambria Math" w:hAnsi="Cambria Math"/>
+                </w:rPr>
+                <m:t>j</m:t>
+              </m:r>
+            </m:sub>
+          </m:sSub>
+          <m:r>
+            <w:rPr>
+              <w:rFonts w:ascii="Cambria Math" w:hAnsi="Cambria Math"/>
+            </w:rPr>
+            <m:t>=</m:t>
+          </m:r>
+          <m:sSub>
+            <m:sSubPr>
+              <m:ctrlPr>
+                <w:rPr>
+                  <w:rFonts w:ascii="Cambria Math" w:hAnsi="Cambria Math"/>
+                  <w:i/>
+                </w:rPr>
+              </m:ctrlPr>
+            </m:sSubPr>
+            <m:e>
+              <m:r>
+                <w:rPr>
+                  <w:rFonts w:ascii="Cambria Math" w:hAnsi="Cambria Math"/>
+                </w:rPr>
+                <m:t>J</m:t>
+              </m:r>
+            </m:e>
+            <m:sub>
+              <m:r>
+                <w:rPr>
+                  <w:rFonts w:ascii="Cambria Math" w:hAnsi="Cambria Math"/>
+                </w:rPr>
+                <m:t>j</m:t>
+              </m:r>
+            </m:sub>
+          </m:sSub>
+          <m:r>
+            <w:rPr>
+              <w:rFonts w:ascii="Cambria Math" w:hAnsi="Cambria Math"/>
+            </w:rPr>
+            <m:t>×A</m:t>
+          </m:r>
+        </m:oMath>
+      </m:oMathPara>
+    </w:p>
+    <w:p>
+      <w:pPr>
+        <w:rPr>
+          <w:rFonts w:eastAsiaTheme="minorEastAsia"/>
+        </w:rPr>
+      </w:pPr>
+      <m:oMathPara>
+        <m:oMath>
+          <m:sSub>
+            <m:sSubPr>
+              <m:ctrlPr>
+                <w:rPr>
+                  <w:rFonts w:ascii="Cambria Math" w:hAnsi="Cambria Math"/>
+                  <w:i/>
+                </w:rPr>
+              </m:ctrlPr>
+            </m:sSubPr>
+            <m:e>
+              <m:r>
+                <w:rPr>
+                  <w:rFonts w:ascii="Cambria Math" w:hAnsi="Cambria Math"/>
+                </w:rPr>
+                <m:t>J</m:t>
+              </m:r>
+            </m:e>
+            <m:sub>
+              <m:r>
+                <w:rPr>
+                  <w:rFonts w:ascii="Cambria Math" w:hAnsi="Cambria Math"/>
+                </w:rPr>
+                <m:t>i</m:t>
+              </m:r>
+            </m:sub>
+          </m:sSub>
+          <m:r>
+            <w:rPr>
+              <w:rFonts w:ascii="Cambria Math" w:hAnsi="Cambria Math"/>
+            </w:rPr>
+            <m:t>+</m:t>
+          </m:r>
+          <m:sSub>
+            <m:sSubPr>
+              <m:ctrlPr>
+                <w:rPr>
+                  <w:rFonts w:ascii="Cambria Math" w:hAnsi="Cambria Math"/>
+                  <w:i/>
+                </w:rPr>
+              </m:ctrlPr>
+            </m:sSubPr>
+            <m:e>
+              <m:r>
+                <w:rPr>
+                  <w:rFonts w:ascii="Cambria Math" w:hAnsi="Cambria Math"/>
+                </w:rPr>
+                <m:t>J</m:t>
+              </m:r>
+            </m:e>
+            <m:sub>
+              <m:r>
+                <w:rPr>
+                  <w:rFonts w:ascii="Cambria Math" w:hAnsi="Cambria Math"/>
+                </w:rPr>
+                <m:t>j</m:t>
+              </m:r>
+            </m:sub>
+          </m:sSub>
+          <m:r>
+            <w:rPr>
+              <w:rFonts w:ascii="Cambria Math" w:hAnsi="Cambria Math"/>
+            </w:rPr>
+            <m:t>=0</m:t>
+          </m:r>
+        </m:oMath>
+      </m:oMathPara>
+    </w:p>
+    <w:p>
+      <w:pPr>
+        <w:ind w:left="-567" w:right="-567"/>
+        <w:rPr>
+          <w:rFonts w:eastAsiaTheme="minorEastAsia"/>
+        </w:rPr>
+      </w:pPr>
+      <w:bookmarkStart w:id="26" w:name="_GoBack"/>
+      <w:bookmarkEnd w:id="26"/>
     </w:p>
     <w:p>
       <w:pPr>
@@ -14537,7 +14816,7 @@
 </file>
 
 <file path=customXml/itemProps1.xml><?xml version="1.0" encoding="utf-8"?>
-<ds:datastoreItem xmlns:ds="http://schemas.openxmlformats.org/officeDocument/2006/customXml" ds:itemID="{71C7B7D3-1A04-4309-9610-8EDCFD08554D}">
+<ds:datastoreItem xmlns:ds="http://schemas.openxmlformats.org/officeDocument/2006/customXml" ds:itemID="{5EACF7A4-B394-442E-B9A7-6CA4D0879111}">
   <ds:schemaRefs>
     <ds:schemaRef ds:uri="http://schemas.openxmlformats.org/officeDocument/2006/bibliography"/>
   </ds:schemaRefs>

</xml_diff>

<commit_message>
Addition of the GasNode module and its test
</commit_message>
<xml_diff>
--- a/Information/script for equations.docx
+++ b/Information/script for equations.docx
@@ -59,7 +59,7 @@
           <w:r>
             <w:fldChar w:fldCharType="separate"/>
           </w:r>
-          <w:hyperlink w:anchor="_Toc37754741" w:history="1">
+          <w:hyperlink w:anchor="_Toc37837260" w:history="1">
             <w:r>
               <w:rPr>
                 <w:rStyle w:val="Lienhypertexte"/>
@@ -103,7 +103,7 @@
                 <w:noProof/>
                 <w:webHidden/>
               </w:rPr>
-              <w:instrText xml:space="preserve"> PAGEREF _Toc37754741 \h </w:instrText>
+              <w:instrText xml:space="preserve"> PAGEREF _Toc37837260 \h </w:instrText>
             </w:r>
             <w:r>
               <w:rPr>
@@ -123,7 +123,7 @@
                 <w:noProof/>
                 <w:webHidden/>
               </w:rPr>
-              <w:t>2</w:t>
+              <w:t>3</w:t>
             </w:r>
             <w:r>
               <w:rPr>
@@ -147,7 +147,7 @@
               <w:lang w:eastAsia="en-GB"/>
             </w:rPr>
           </w:pPr>
-          <w:hyperlink w:anchor="_Toc37754742" w:history="1">
+          <w:hyperlink w:anchor="_Toc37837261" w:history="1">
             <w:r>
               <w:rPr>
                 <w:rStyle w:val="Lienhypertexte"/>
@@ -191,7 +191,7 @@
                 <w:noProof/>
                 <w:webHidden/>
               </w:rPr>
-              <w:instrText xml:space="preserve"> PAGEREF _Toc37754742 \h </w:instrText>
+              <w:instrText xml:space="preserve"> PAGEREF _Toc37837261 \h </w:instrText>
             </w:r>
             <w:r>
               <w:rPr>
@@ -211,7 +211,7 @@
                 <w:noProof/>
                 <w:webHidden/>
               </w:rPr>
-              <w:t>2</w:t>
+              <w:t>3</w:t>
             </w:r>
             <w:r>
               <w:rPr>
@@ -235,7 +235,7 @@
               <w:lang w:eastAsia="en-GB"/>
             </w:rPr>
           </w:pPr>
-          <w:hyperlink w:anchor="_Toc37754743" w:history="1">
+          <w:hyperlink w:anchor="_Toc37837262" w:history="1">
             <w:r>
               <w:rPr>
                 <w:rStyle w:val="Lienhypertexte"/>
@@ -277,7 +277,7 @@
                 <w:noProof/>
                 <w:webHidden/>
               </w:rPr>
-              <w:instrText xml:space="preserve"> PAGEREF _Toc37754743 \h </w:instrText>
+              <w:instrText xml:space="preserve"> PAGEREF _Toc37837262 \h </w:instrText>
             </w:r>
             <w:r>
               <w:rPr>
@@ -297,7 +297,7 @@
                 <w:noProof/>
                 <w:webHidden/>
               </w:rPr>
-              <w:t>2</w:t>
+              <w:t>3</w:t>
             </w:r>
             <w:r>
               <w:rPr>
@@ -321,7 +321,7 @@
               <w:lang w:eastAsia="en-GB"/>
             </w:rPr>
           </w:pPr>
-          <w:hyperlink w:anchor="_Toc37754744" w:history="1">
+          <w:hyperlink w:anchor="_Toc37837263" w:history="1">
             <w:r>
               <w:rPr>
                 <w:rStyle w:val="Lienhypertexte"/>
@@ -363,7 +363,7 @@
                 <w:noProof/>
                 <w:webHidden/>
               </w:rPr>
-              <w:instrText xml:space="preserve"> PAGEREF _Toc37754744 \h </w:instrText>
+              <w:instrText xml:space="preserve"> PAGEREF _Toc37837263 \h </w:instrText>
             </w:r>
             <w:r>
               <w:rPr>
@@ -383,7 +383,7 @@
                 <w:noProof/>
                 <w:webHidden/>
               </w:rPr>
-              <w:t>2</w:t>
+              <w:t>3</w:t>
             </w:r>
             <w:r>
               <w:rPr>
@@ -407,7 +407,7 @@
               <w:lang w:eastAsia="en-GB"/>
             </w:rPr>
           </w:pPr>
-          <w:hyperlink w:anchor="_Toc37754745" w:history="1">
+          <w:hyperlink w:anchor="_Toc37837264" w:history="1">
             <w:r>
               <w:rPr>
                 <w:rStyle w:val="Lienhypertexte"/>
@@ -449,7 +449,7 @@
                 <w:noProof/>
                 <w:webHidden/>
               </w:rPr>
-              <w:instrText xml:space="preserve"> PAGEREF _Toc37754745 \h </w:instrText>
+              <w:instrText xml:space="preserve"> PAGEREF _Toc37837264 \h </w:instrText>
             </w:r>
             <w:r>
               <w:rPr>
@@ -469,7 +469,7 @@
                 <w:noProof/>
                 <w:webHidden/>
               </w:rPr>
-              <w:t>2</w:t>
+              <w:t>3</w:t>
             </w:r>
             <w:r>
               <w:rPr>
@@ -493,7 +493,7 @@
               <w:lang w:eastAsia="en-GB"/>
             </w:rPr>
           </w:pPr>
-          <w:hyperlink w:anchor="_Toc37754746" w:history="1">
+          <w:hyperlink w:anchor="_Toc37837265" w:history="1">
             <w:r>
               <w:rPr>
                 <w:rStyle w:val="Lienhypertexte"/>
@@ -537,7 +537,7 @@
                 <w:noProof/>
                 <w:webHidden/>
               </w:rPr>
-              <w:instrText xml:space="preserve"> PAGEREF _Toc37754746 \h </w:instrText>
+              <w:instrText xml:space="preserve"> PAGEREF _Toc37837265 \h </w:instrText>
             </w:r>
             <w:r>
               <w:rPr>
@@ -557,7 +557,7 @@
                 <w:noProof/>
                 <w:webHidden/>
               </w:rPr>
-              <w:t>2</w:t>
+              <w:t>3</w:t>
             </w:r>
             <w:r>
               <w:rPr>
@@ -581,7 +581,7 @@
               <w:lang w:eastAsia="en-GB"/>
             </w:rPr>
           </w:pPr>
-          <w:hyperlink w:anchor="_Toc37754747" w:history="1">
+          <w:hyperlink w:anchor="_Toc37837266" w:history="1">
             <w:r>
               <w:rPr>
                 <w:rStyle w:val="Lienhypertexte"/>
@@ -623,7 +623,7 @@
                 <w:noProof/>
                 <w:webHidden/>
               </w:rPr>
-              <w:instrText xml:space="preserve"> PAGEREF _Toc37754747 \h </w:instrText>
+              <w:instrText xml:space="preserve"> PAGEREF _Toc37837266 \h </w:instrText>
             </w:r>
             <w:r>
               <w:rPr>
@@ -643,7 +643,7 @@
                 <w:noProof/>
                 <w:webHidden/>
               </w:rPr>
-              <w:t>2</w:t>
+              <w:t>3</w:t>
             </w:r>
             <w:r>
               <w:rPr>
@@ -667,7 +667,7 @@
               <w:lang w:eastAsia="en-GB"/>
             </w:rPr>
           </w:pPr>
-          <w:hyperlink w:anchor="_Toc37754748" w:history="1">
+          <w:hyperlink w:anchor="_Toc37837267" w:history="1">
             <w:r>
               <w:rPr>
                 <w:rStyle w:val="Lienhypertexte"/>
@@ -709,7 +709,7 @@
                 <w:noProof/>
                 <w:webHidden/>
               </w:rPr>
-              <w:instrText xml:space="preserve"> PAGEREF _Toc37754748 \h </w:instrText>
+              <w:instrText xml:space="preserve"> PAGEREF _Toc37837267 \h </w:instrText>
             </w:r>
             <w:r>
               <w:rPr>
@@ -729,7 +729,7 @@
                 <w:noProof/>
                 <w:webHidden/>
               </w:rPr>
-              <w:t>3</w:t>
+              <w:t>4</w:t>
             </w:r>
             <w:r>
               <w:rPr>
@@ -753,7 +753,7 @@
               <w:lang w:eastAsia="en-GB"/>
             </w:rPr>
           </w:pPr>
-          <w:hyperlink w:anchor="_Toc37754749" w:history="1">
+          <w:hyperlink w:anchor="_Toc37837268" w:history="1">
             <w:r>
               <w:rPr>
                 <w:rStyle w:val="Lienhypertexte"/>
@@ -795,7 +795,7 @@
                 <w:noProof/>
                 <w:webHidden/>
               </w:rPr>
-              <w:instrText xml:space="preserve"> PAGEREF _Toc37754749 \h </w:instrText>
+              <w:instrText xml:space="preserve"> PAGEREF _Toc37837268 \h </w:instrText>
             </w:r>
             <w:r>
               <w:rPr>
@@ -815,7 +815,7 @@
                 <w:noProof/>
                 <w:webHidden/>
               </w:rPr>
-              <w:t>3</w:t>
+              <w:t>4</w:t>
             </w:r>
             <w:r>
               <w:rPr>
@@ -839,7 +839,7 @@
               <w:lang w:eastAsia="en-GB"/>
             </w:rPr>
           </w:pPr>
-          <w:hyperlink w:anchor="_Toc37754750" w:history="1">
+          <w:hyperlink w:anchor="_Toc37837269" w:history="1">
             <w:r>
               <w:rPr>
                 <w:rStyle w:val="Lienhypertexte"/>
@@ -881,7 +881,7 @@
                 <w:noProof/>
                 <w:webHidden/>
               </w:rPr>
-              <w:instrText xml:space="preserve"> PAGEREF _Toc37754750 \h </w:instrText>
+              <w:instrText xml:space="preserve"> PAGEREF _Toc37837269 \h </w:instrText>
             </w:r>
             <w:r>
               <w:rPr>
@@ -901,7 +901,7 @@
                 <w:noProof/>
                 <w:webHidden/>
               </w:rPr>
-              <w:t>3</w:t>
+              <w:t>4</w:t>
             </w:r>
             <w:r>
               <w:rPr>
@@ -925,7 +925,7 @@
               <w:lang w:eastAsia="en-GB"/>
             </w:rPr>
           </w:pPr>
-          <w:hyperlink w:anchor="_Toc37754751" w:history="1">
+          <w:hyperlink w:anchor="_Toc37837270" w:history="1">
             <w:r>
               <w:rPr>
                 <w:rStyle w:val="Lienhypertexte"/>
@@ -967,7 +967,7 @@
                 <w:noProof/>
                 <w:webHidden/>
               </w:rPr>
-              <w:instrText xml:space="preserve"> PAGEREF _Toc37754751 \h </w:instrText>
+              <w:instrText xml:space="preserve"> PAGEREF _Toc37837270 \h </w:instrText>
             </w:r>
             <w:r>
               <w:rPr>
@@ -987,7 +987,7 @@
                 <w:noProof/>
                 <w:webHidden/>
               </w:rPr>
-              <w:t>3</w:t>
+              <w:t>4</w:t>
             </w:r>
             <w:r>
               <w:rPr>
@@ -1011,7 +1011,7 @@
               <w:lang w:eastAsia="en-GB"/>
             </w:rPr>
           </w:pPr>
-          <w:hyperlink w:anchor="_Toc37754752" w:history="1">
+          <w:hyperlink w:anchor="_Toc37837271" w:history="1">
             <w:r>
               <w:rPr>
                 <w:rStyle w:val="Lienhypertexte"/>
@@ -1053,7 +1053,7 @@
                 <w:noProof/>
                 <w:webHidden/>
               </w:rPr>
-              <w:instrText xml:space="preserve"> PAGEREF _Toc37754752 \h </w:instrText>
+              <w:instrText xml:space="preserve"> PAGEREF _Toc37837271 \h </w:instrText>
             </w:r>
             <w:r>
               <w:rPr>
@@ -1073,7 +1073,7 @@
                 <w:noProof/>
                 <w:webHidden/>
               </w:rPr>
-              <w:t>3</w:t>
+              <w:t>4</w:t>
             </w:r>
             <w:r>
               <w:rPr>
@@ -1097,7 +1097,7 @@
               <w:lang w:eastAsia="en-GB"/>
             </w:rPr>
           </w:pPr>
-          <w:hyperlink w:anchor="_Toc37754753" w:history="1">
+          <w:hyperlink w:anchor="_Toc37837272" w:history="1">
             <w:r>
               <w:rPr>
                 <w:rStyle w:val="Lienhypertexte"/>
@@ -1139,7 +1139,7 @@
                 <w:noProof/>
                 <w:webHidden/>
               </w:rPr>
-              <w:instrText xml:space="preserve"> PAGEREF _Toc37754753 \h </w:instrText>
+              <w:instrText xml:space="preserve"> PAGEREF _Toc37837272 \h </w:instrText>
             </w:r>
             <w:r>
               <w:rPr>
@@ -1159,7 +1159,7 @@
                 <w:noProof/>
                 <w:webHidden/>
               </w:rPr>
-              <w:t>3</w:t>
+              <w:t>4</w:t>
             </w:r>
             <w:r>
               <w:rPr>
@@ -1183,7 +1183,7 @@
               <w:lang w:eastAsia="en-GB"/>
             </w:rPr>
           </w:pPr>
-          <w:hyperlink w:anchor="_Toc37754754" w:history="1">
+          <w:hyperlink w:anchor="_Toc37837273" w:history="1">
             <w:r>
               <w:rPr>
                 <w:rStyle w:val="Lienhypertexte"/>
@@ -1225,7 +1225,7 @@
                 <w:noProof/>
                 <w:webHidden/>
               </w:rPr>
-              <w:instrText xml:space="preserve"> PAGEREF _Toc37754754 \h </w:instrText>
+              <w:instrText xml:space="preserve"> PAGEREF _Toc37837273 \h </w:instrText>
             </w:r>
             <w:r>
               <w:rPr>
@@ -1245,7 +1245,7 @@
                 <w:noProof/>
                 <w:webHidden/>
               </w:rPr>
-              <w:t>4</w:t>
+              <w:t>5</w:t>
             </w:r>
             <w:r>
               <w:rPr>
@@ -1269,7 +1269,7 @@
               <w:lang w:eastAsia="en-GB"/>
             </w:rPr>
           </w:pPr>
-          <w:hyperlink w:anchor="_Toc37754755" w:history="1">
+          <w:hyperlink w:anchor="_Toc37837274" w:history="1">
             <w:r>
               <w:rPr>
                 <w:rStyle w:val="Lienhypertexte"/>
@@ -1313,7 +1313,7 @@
                 <w:noProof/>
                 <w:webHidden/>
               </w:rPr>
-              <w:instrText xml:space="preserve"> PAGEREF _Toc37754755 \h </w:instrText>
+              <w:instrText xml:space="preserve"> PAGEREF _Toc37837274 \h </w:instrText>
             </w:r>
             <w:r>
               <w:rPr>
@@ -1333,7 +1333,7 @@
                 <w:noProof/>
                 <w:webHidden/>
               </w:rPr>
-              <w:t>5</w:t>
+              <w:t>6</w:t>
             </w:r>
             <w:r>
               <w:rPr>
@@ -1357,7 +1357,7 @@
               <w:lang w:eastAsia="en-GB"/>
             </w:rPr>
           </w:pPr>
-          <w:hyperlink w:anchor="_Toc37754756" w:history="1">
+          <w:hyperlink w:anchor="_Toc37837275" w:history="1">
             <w:r>
               <w:rPr>
                 <w:rStyle w:val="Lienhypertexte"/>
@@ -1399,7 +1399,7 @@
                 <w:noProof/>
                 <w:webHidden/>
               </w:rPr>
-              <w:instrText xml:space="preserve"> PAGEREF _Toc37754756 \h </w:instrText>
+              <w:instrText xml:space="preserve"> PAGEREF _Toc37837275 \h </w:instrText>
             </w:r>
             <w:r>
               <w:rPr>
@@ -1419,7 +1419,7 @@
                 <w:noProof/>
                 <w:webHidden/>
               </w:rPr>
-              <w:t>5</w:t>
+              <w:t>6</w:t>
             </w:r>
             <w:r>
               <w:rPr>
@@ -1443,7 +1443,7 @@
               <w:lang w:eastAsia="en-GB"/>
             </w:rPr>
           </w:pPr>
-          <w:hyperlink w:anchor="_Toc37754757" w:history="1">
+          <w:hyperlink w:anchor="_Toc37837276" w:history="1">
             <w:r>
               <w:rPr>
                 <w:rStyle w:val="Lienhypertexte"/>
@@ -1485,7 +1485,7 @@
                 <w:noProof/>
                 <w:webHidden/>
               </w:rPr>
-              <w:instrText xml:space="preserve"> PAGEREF _Toc37754757 \h </w:instrText>
+              <w:instrText xml:space="preserve"> PAGEREF _Toc37837276 \h </w:instrText>
             </w:r>
             <w:r>
               <w:rPr>
@@ -1505,7 +1505,7 @@
                 <w:noProof/>
                 <w:webHidden/>
               </w:rPr>
-              <w:t>5</w:t>
+              <w:t>6</w:t>
             </w:r>
             <w:r>
               <w:rPr>
@@ -1529,7 +1529,7 @@
               <w:lang w:eastAsia="en-GB"/>
             </w:rPr>
           </w:pPr>
-          <w:hyperlink w:anchor="_Toc37754758" w:history="1">
+          <w:hyperlink w:anchor="_Toc37837277" w:history="1">
             <w:r>
               <w:rPr>
                 <w:rStyle w:val="Lienhypertexte"/>
@@ -1571,7 +1571,7 @@
                 <w:noProof/>
                 <w:webHidden/>
               </w:rPr>
-              <w:instrText xml:space="preserve"> PAGEREF _Toc37754758 \h </w:instrText>
+              <w:instrText xml:space="preserve"> PAGEREF _Toc37837277 \h </w:instrText>
             </w:r>
             <w:r>
               <w:rPr>
@@ -1591,7 +1591,7 @@
                 <w:noProof/>
                 <w:webHidden/>
               </w:rPr>
-              <w:t>5</w:t>
+              <w:t>6</w:t>
             </w:r>
             <w:r>
               <w:rPr>
@@ -1615,7 +1615,7 @@
               <w:lang w:eastAsia="en-GB"/>
             </w:rPr>
           </w:pPr>
-          <w:hyperlink w:anchor="_Toc37754759" w:history="1">
+          <w:hyperlink w:anchor="_Toc37837278" w:history="1">
             <w:r>
               <w:rPr>
                 <w:rStyle w:val="Lienhypertexte"/>
@@ -1657,7 +1657,7 @@
                 <w:noProof/>
                 <w:webHidden/>
               </w:rPr>
-              <w:instrText xml:space="preserve"> PAGEREF _Toc37754759 \h </w:instrText>
+              <w:instrText xml:space="preserve"> PAGEREF _Toc37837278 \h </w:instrText>
             </w:r>
             <w:r>
               <w:rPr>
@@ -1677,7 +1677,7 @@
                 <w:noProof/>
                 <w:webHidden/>
               </w:rPr>
-              <w:t>5</w:t>
+              <w:t>6</w:t>
             </w:r>
             <w:r>
               <w:rPr>
@@ -1701,7 +1701,7 @@
               <w:lang w:eastAsia="en-GB"/>
             </w:rPr>
           </w:pPr>
-          <w:hyperlink w:anchor="_Toc37754760" w:history="1">
+          <w:hyperlink w:anchor="_Toc37837279" w:history="1">
             <w:r>
               <w:rPr>
                 <w:rStyle w:val="Lienhypertexte"/>
@@ -1743,7 +1743,7 @@
                 <w:noProof/>
                 <w:webHidden/>
               </w:rPr>
-              <w:instrText xml:space="preserve"> PAGEREF _Toc37754760 \h </w:instrText>
+              <w:instrText xml:space="preserve"> PAGEREF _Toc37837279 \h </w:instrText>
             </w:r>
             <w:r>
               <w:rPr>
@@ -1763,7 +1763,7 @@
                 <w:noProof/>
                 <w:webHidden/>
               </w:rPr>
-              <w:t>6</w:t>
+              <w:t>7</w:t>
             </w:r>
             <w:r>
               <w:rPr>
@@ -1787,7 +1787,7 @@
               <w:lang w:eastAsia="en-GB"/>
             </w:rPr>
           </w:pPr>
-          <w:hyperlink w:anchor="_Toc37754761" w:history="1">
+          <w:hyperlink w:anchor="_Toc37837280" w:history="1">
             <w:r>
               <w:rPr>
                 <w:rStyle w:val="Lienhypertexte"/>
@@ -1829,7 +1829,7 @@
                 <w:noProof/>
                 <w:webHidden/>
               </w:rPr>
-              <w:instrText xml:space="preserve"> PAGEREF _Toc37754761 \h </w:instrText>
+              <w:instrText xml:space="preserve"> PAGEREF _Toc37837280 \h </w:instrText>
             </w:r>
             <w:r>
               <w:rPr>
@@ -1849,7 +1849,7 @@
                 <w:noProof/>
                 <w:webHidden/>
               </w:rPr>
-              <w:t>6</w:t>
+              <w:t>7</w:t>
             </w:r>
             <w:r>
               <w:rPr>
@@ -1873,7 +1873,7 @@
               <w:lang w:eastAsia="en-GB"/>
             </w:rPr>
           </w:pPr>
-          <w:hyperlink w:anchor="_Toc37754762" w:history="1">
+          <w:hyperlink w:anchor="_Toc37837281" w:history="1">
             <w:r>
               <w:rPr>
                 <w:rStyle w:val="Lienhypertexte"/>
@@ -1915,7 +1915,7 @@
                 <w:noProof/>
                 <w:webHidden/>
               </w:rPr>
-              <w:instrText xml:space="preserve"> PAGEREF _Toc37754762 \h </w:instrText>
+              <w:instrText xml:space="preserve"> PAGEREF _Toc37837281 \h </w:instrText>
             </w:r>
             <w:r>
               <w:rPr>
@@ -1935,7 +1935,7 @@
                 <w:noProof/>
                 <w:webHidden/>
               </w:rPr>
-              <w:t>7</w:t>
+              <w:t>8</w:t>
             </w:r>
             <w:r>
               <w:rPr>
@@ -1959,7 +1959,7 @@
               <w:lang w:eastAsia="en-GB"/>
             </w:rPr>
           </w:pPr>
-          <w:hyperlink w:anchor="_Toc37754763" w:history="1">
+          <w:hyperlink w:anchor="_Toc37837282" w:history="1">
             <w:r>
               <w:rPr>
                 <w:rStyle w:val="Lienhypertexte"/>
@@ -2001,7 +2001,7 @@
                 <w:noProof/>
                 <w:webHidden/>
               </w:rPr>
-              <w:instrText xml:space="preserve"> PAGEREF _Toc37754763 \h </w:instrText>
+              <w:instrText xml:space="preserve"> PAGEREF _Toc37837282 \h </w:instrText>
             </w:r>
             <w:r>
               <w:rPr>
@@ -2021,7 +2021,7 @@
                 <w:noProof/>
                 <w:webHidden/>
               </w:rPr>
-              <w:t>7</w:t>
+              <w:t>8</w:t>
             </w:r>
             <w:r>
               <w:rPr>
@@ -2045,7 +2045,7 @@
               <w:lang w:eastAsia="en-GB"/>
             </w:rPr>
           </w:pPr>
-          <w:hyperlink w:anchor="_Toc37754764" w:history="1">
+          <w:hyperlink w:anchor="_Toc37837283" w:history="1">
             <w:r>
               <w:rPr>
                 <w:rStyle w:val="Lienhypertexte"/>
@@ -2089,7 +2089,7 @@
                 <w:noProof/>
                 <w:webHidden/>
               </w:rPr>
-              <w:instrText xml:space="preserve"> PAGEREF _Toc37754764 \h </w:instrText>
+              <w:instrText xml:space="preserve"> PAGEREF _Toc37837283 \h </w:instrText>
             </w:r>
             <w:r>
               <w:rPr>
@@ -2109,7 +2109,7 @@
                 <w:noProof/>
                 <w:webHidden/>
               </w:rPr>
-              <w:t>8</w:t>
+              <w:t>9</w:t>
             </w:r>
             <w:r>
               <w:rPr>
@@ -2133,7 +2133,7 @@
               <w:lang w:eastAsia="en-GB"/>
             </w:rPr>
           </w:pPr>
-          <w:hyperlink w:anchor="_Toc37754765" w:history="1">
+          <w:hyperlink w:anchor="_Toc37837284" w:history="1">
             <w:r>
               <w:rPr>
                 <w:rStyle w:val="Lienhypertexte"/>
@@ -2177,7 +2177,7 @@
                 <w:noProof/>
                 <w:webHidden/>
               </w:rPr>
-              <w:instrText xml:space="preserve"> PAGEREF _Toc37754765 \h </w:instrText>
+              <w:instrText xml:space="preserve"> PAGEREF _Toc37837284 \h </w:instrText>
             </w:r>
             <w:r>
               <w:rPr>
@@ -2197,7 +2197,7 @@
                 <w:noProof/>
                 <w:webHidden/>
               </w:rPr>
-              <w:t>8</w:t>
+              <w:t>9</w:t>
             </w:r>
             <w:r>
               <w:rPr>
@@ -2221,7 +2221,7 @@
               <w:lang w:eastAsia="en-GB"/>
             </w:rPr>
           </w:pPr>
-          <w:hyperlink w:anchor="_Toc37754766" w:history="1">
+          <w:hyperlink w:anchor="_Toc37837285" w:history="1">
             <w:r>
               <w:rPr>
                 <w:rStyle w:val="Lienhypertexte"/>
@@ -2242,21 +2242,93 @@
                 <w:rStyle w:val="Lienhypertexte"/>
                 <w:noProof/>
               </w:rPr>
-              <w:t>Aeraulic</w:t>
-            </w:r>
+              <w:t>AeraulicConvection</w:t>
+            </w:r>
+            <w:r>
+              <w:rPr>
+                <w:noProof/>
+                <w:webHidden/>
+              </w:rPr>
+              <w:tab/>
+            </w:r>
+            <w:r>
+              <w:rPr>
+                <w:noProof/>
+                <w:webHidden/>
+              </w:rPr>
+              <w:fldChar w:fldCharType="begin"/>
+            </w:r>
+            <w:r>
+              <w:rPr>
+                <w:noProof/>
+                <w:webHidden/>
+              </w:rPr>
+              <w:instrText xml:space="preserve"> PAGEREF _Toc37837285 \h </w:instrText>
+            </w:r>
+            <w:r>
+              <w:rPr>
+                <w:noProof/>
+                <w:webHidden/>
+              </w:rPr>
+            </w:r>
+            <w:r>
+              <w:rPr>
+                <w:noProof/>
+                <w:webHidden/>
+              </w:rPr>
+              <w:fldChar w:fldCharType="separate"/>
+            </w:r>
+            <w:r>
+              <w:rPr>
+                <w:noProof/>
+                <w:webHidden/>
+              </w:rPr>
+              <w:t>9</w:t>
+            </w:r>
+            <w:r>
+              <w:rPr>
+                <w:noProof/>
+                <w:webHidden/>
+              </w:rPr>
+              <w:fldChar w:fldCharType="end"/>
+            </w:r>
+          </w:hyperlink>
+        </w:p>
+        <w:p>
+          <w:pPr>
+            <w:pStyle w:val="TM3"/>
+            <w:tabs>
+              <w:tab w:val="left" w:pos="880"/>
+              <w:tab w:val="right" w:leader="dot" w:pos="9062"/>
+            </w:tabs>
+            <w:rPr>
+              <w:rFonts w:eastAsiaTheme="minorEastAsia"/>
+              <w:noProof/>
+              <w:lang w:eastAsia="en-GB"/>
+            </w:rPr>
+          </w:pPr>
+          <w:hyperlink w:anchor="_Toc37837286" w:history="1">
             <w:r>
               <w:rPr>
                 <w:rStyle w:val="Lienhypertexte"/>
                 <w:noProof/>
               </w:rPr>
-              <w:t>C</w:t>
+              <w:t>2.</w:t>
+            </w:r>
+            <w:r>
+              <w:rPr>
+                <w:rFonts w:eastAsiaTheme="minorEastAsia"/>
+                <w:noProof/>
+                <w:lang w:eastAsia="en-GB"/>
+              </w:rPr>
+              <w:tab/>
             </w:r>
             <w:r>
               <w:rPr>
                 <w:rStyle w:val="Lienhypertexte"/>
                 <w:noProof/>
               </w:rPr>
-              <w:t>onvection</w:t>
+              <w:t>Condensation</w:t>
             </w:r>
             <w:r>
               <w:rPr>
@@ -2277,7 +2349,7 @@
                 <w:noProof/>
                 <w:webHidden/>
               </w:rPr>
-              <w:instrText xml:space="preserve"> PAGEREF _Toc37754766 \h </w:instrText>
+              <w:instrText xml:space="preserve"> PAGEREF _Toc37837286 \h </w:instrText>
             </w:r>
             <w:r>
               <w:rPr>
@@ -2297,7 +2369,193 @@
                 <w:noProof/>
                 <w:webHidden/>
               </w:rPr>
-              <w:t>8</w:t>
+              <w:t>9</w:t>
+            </w:r>
+            <w:r>
+              <w:rPr>
+                <w:noProof/>
+                <w:webHidden/>
+              </w:rPr>
+              <w:fldChar w:fldCharType="end"/>
+            </w:r>
+          </w:hyperlink>
+        </w:p>
+        <w:p>
+          <w:pPr>
+            <w:pStyle w:val="TM3"/>
+            <w:tabs>
+              <w:tab w:val="left" w:pos="880"/>
+              <w:tab w:val="right" w:leader="dot" w:pos="9062"/>
+            </w:tabs>
+            <w:rPr>
+              <w:rFonts w:eastAsiaTheme="minorEastAsia"/>
+              <w:noProof/>
+              <w:lang w:eastAsia="en-GB"/>
+            </w:rPr>
+          </w:pPr>
+          <w:hyperlink w:anchor="_Toc37837287" w:history="1">
+            <w:r>
+              <w:rPr>
+                <w:rStyle w:val="Lienhypertexte"/>
+                <w:noProof/>
+              </w:rPr>
+              <w:t>3.</w:t>
+            </w:r>
+            <w:r>
+              <w:rPr>
+                <w:rFonts w:eastAsiaTheme="minorEastAsia"/>
+                <w:noProof/>
+                <w:lang w:eastAsia="en-GB"/>
+              </w:rPr>
+              <w:tab/>
+            </w:r>
+            <w:r>
+              <w:rPr>
+                <w:rStyle w:val="Lienhypertexte"/>
+                <w:noProof/>
+              </w:rPr>
+              <w:t>MolecularDiffusion</w:t>
+            </w:r>
+            <w:r>
+              <w:rPr>
+                <w:noProof/>
+                <w:webHidden/>
+              </w:rPr>
+              <w:tab/>
+            </w:r>
+            <w:r>
+              <w:rPr>
+                <w:noProof/>
+                <w:webHidden/>
+              </w:rPr>
+              <w:fldChar w:fldCharType="begin"/>
+            </w:r>
+            <w:r>
+              <w:rPr>
+                <w:noProof/>
+                <w:webHidden/>
+              </w:rPr>
+              <w:instrText xml:space="preserve"> PAGEREF _Toc37837287 \h </w:instrText>
+            </w:r>
+            <w:r>
+              <w:rPr>
+                <w:noProof/>
+                <w:webHidden/>
+              </w:rPr>
+            </w:r>
+            <w:r>
+              <w:rPr>
+                <w:noProof/>
+                <w:webHidden/>
+              </w:rPr>
+              <w:fldChar w:fldCharType="separate"/>
+            </w:r>
+            <w:r>
+              <w:rPr>
+                <w:noProof/>
+                <w:webHidden/>
+              </w:rPr>
+              <w:t>9</w:t>
+            </w:r>
+            <w:r>
+              <w:rPr>
+                <w:noProof/>
+                <w:webHidden/>
+              </w:rPr>
+              <w:fldChar w:fldCharType="end"/>
+            </w:r>
+          </w:hyperlink>
+        </w:p>
+        <w:p>
+          <w:pPr>
+            <w:pStyle w:val="TM3"/>
+            <w:tabs>
+              <w:tab w:val="left" w:pos="880"/>
+              <w:tab w:val="right" w:leader="dot" w:pos="9062"/>
+            </w:tabs>
+            <w:rPr>
+              <w:rFonts w:eastAsiaTheme="minorEastAsia"/>
+              <w:noProof/>
+              <w:lang w:eastAsia="en-GB"/>
+            </w:rPr>
+          </w:pPr>
+          <w:hyperlink w:anchor="_Toc37837288" w:history="1">
+            <w:r>
+              <w:rPr>
+                <w:rStyle w:val="Lienhypertexte"/>
+                <w:noProof/>
+              </w:rPr>
+              <w:t>1.</w:t>
+            </w:r>
+            <w:r>
+              <w:rPr>
+                <w:rFonts w:eastAsiaTheme="minorEastAsia"/>
+                <w:noProof/>
+                <w:lang w:eastAsia="en-GB"/>
+              </w:rPr>
+              <w:tab/>
+            </w:r>
+            <w:r>
+              <w:rPr>
+                <w:rStyle w:val="Lienhypertexte"/>
+                <w:noProof/>
+              </w:rPr>
+              <w:t>Gas</w:t>
+            </w:r>
+            <w:r>
+              <w:rPr>
+                <w:rStyle w:val="Lienhypertexte"/>
+                <w:noProof/>
+              </w:rPr>
+              <w:t>N</w:t>
+            </w:r>
+            <w:r>
+              <w:rPr>
+                <w:rStyle w:val="Lienhypertexte"/>
+                <w:noProof/>
+              </w:rPr>
+              <w:t>ode</w:t>
+            </w:r>
+            <w:r>
+              <w:rPr>
+                <w:noProof/>
+                <w:webHidden/>
+              </w:rPr>
+              <w:tab/>
+            </w:r>
+            <w:r>
+              <w:rPr>
+                <w:noProof/>
+                <w:webHidden/>
+              </w:rPr>
+              <w:fldChar w:fldCharType="begin"/>
+            </w:r>
+            <w:r>
+              <w:rPr>
+                <w:noProof/>
+                <w:webHidden/>
+              </w:rPr>
+              <w:instrText xml:space="preserve"> PAGEREF _Toc37837288 \h </w:instrText>
+            </w:r>
+            <w:r>
+              <w:rPr>
+                <w:noProof/>
+                <w:webHidden/>
+              </w:rPr>
+            </w:r>
+            <w:r>
+              <w:rPr>
+                <w:noProof/>
+                <w:webHidden/>
+              </w:rPr>
+              <w:fldChar w:fldCharType="separate"/>
+            </w:r>
+            <w:r>
+              <w:rPr>
+                <w:noProof/>
+                <w:webHidden/>
+              </w:rPr>
+              <w:t>9</w:t>
             </w:r>
             <w:r>
               <w:rPr>
@@ -2321,7 +2579,7 @@
               <w:lang w:eastAsia="en-GB"/>
             </w:rPr>
           </w:pPr>
-          <w:hyperlink w:anchor="_Toc37754767" w:history="1">
+          <w:hyperlink w:anchor="_Toc37837289" w:history="1">
             <w:r>
               <w:rPr>
                 <w:rStyle w:val="Lienhypertexte"/>
@@ -2365,7 +2623,7 @@
                 <w:noProof/>
                 <w:webHidden/>
               </w:rPr>
-              <w:instrText xml:space="preserve"> PAGEREF _Toc37754767 \h </w:instrText>
+              <w:instrText xml:space="preserve"> PAGEREF _Toc37837289 \h </w:instrText>
             </w:r>
             <w:r>
               <w:rPr>
@@ -2385,7 +2643,7 @@
                 <w:noProof/>
                 <w:webHidden/>
               </w:rPr>
-              <w:t>8</w:t>
+              <w:t>9</w:t>
             </w:r>
             <w:r>
               <w:rPr>
@@ -2409,7 +2667,7 @@
               <w:lang w:eastAsia="en-GB"/>
             </w:rPr>
           </w:pPr>
-          <w:hyperlink w:anchor="_Toc37754768" w:history="1">
+          <w:hyperlink w:anchor="_Toc37837290" w:history="1">
             <w:r>
               <w:rPr>
                 <w:rStyle w:val="Lienhypertexte"/>
@@ -2453,7 +2711,7 @@
                 <w:noProof/>
                 <w:webHidden/>
               </w:rPr>
-              <w:instrText xml:space="preserve"> PAGEREF _Toc37754768 \h </w:instrText>
+              <w:instrText xml:space="preserve"> PAGEREF _Toc37837290 \h </w:instrText>
             </w:r>
             <w:r>
               <w:rPr>
@@ -2473,7 +2731,7 @@
                 <w:noProof/>
                 <w:webHidden/>
               </w:rPr>
-              <w:t>8</w:t>
+              <w:t>10</w:t>
             </w:r>
             <w:r>
               <w:rPr>
@@ -2497,7 +2755,7 @@
               <w:lang w:eastAsia="en-GB"/>
             </w:rPr>
           </w:pPr>
-          <w:hyperlink w:anchor="_Toc37754769" w:history="1">
+          <w:hyperlink w:anchor="_Toc37837291" w:history="1">
             <w:r>
               <w:rPr>
                 <w:rStyle w:val="Lienhypertexte"/>
@@ -2539,7 +2797,7 @@
                 <w:noProof/>
                 <w:webHidden/>
               </w:rPr>
-              <w:instrText xml:space="preserve"> PAGEREF _Toc37754769 \h </w:instrText>
+              <w:instrText xml:space="preserve"> PAGEREF _Toc37837291 \h </w:instrText>
             </w:r>
             <w:r>
               <w:rPr>
@@ -2559,7 +2817,7 @@
                 <w:noProof/>
                 <w:webHidden/>
               </w:rPr>
-              <w:t>8</w:t>
+              <w:t>10</w:t>
             </w:r>
             <w:r>
               <w:rPr>
@@ -2621,7 +2879,7 @@
           <w:lang w:val="fr-FR"/>
         </w:rPr>
       </w:pPr>
-      <w:bookmarkStart w:id="0" w:name="_Toc37754741"/>
+      <w:bookmarkStart w:id="0" w:name="_Toc37837260"/>
       <w:proofErr w:type="spellStart"/>
       <w:r>
         <w:rPr>
@@ -2648,7 +2906,7 @@
           <w:lang w:val="fr-FR"/>
         </w:rPr>
       </w:pPr>
-      <w:bookmarkStart w:id="1" w:name="_Toc37754742"/>
+      <w:bookmarkStart w:id="1" w:name="_Toc37837261"/>
       <w:r>
         <w:rPr>
           <w:lang w:val="fr-FR"/>
@@ -2671,7 +2929,7 @@
           <w:rFonts w:eastAsiaTheme="minorEastAsia"/>
         </w:rPr>
       </w:pPr>
-      <w:bookmarkStart w:id="2" w:name="_Toc37754743"/>
+      <w:bookmarkStart w:id="2" w:name="_Toc37837262"/>
       <w:r>
         <w:rPr>
           <w:rFonts w:eastAsiaTheme="minorEastAsia"/>
@@ -3138,7 +3396,7 @@
           <w:rFonts w:eastAsiaTheme="minorEastAsia"/>
         </w:rPr>
       </w:pPr>
-      <w:bookmarkStart w:id="3" w:name="_Toc37754744"/>
+      <w:bookmarkStart w:id="3" w:name="_Toc37837263"/>
       <w:proofErr w:type="spellStart"/>
       <w:r>
         <w:rPr>
@@ -4099,7 +4357,7 @@
           <w:rFonts w:eastAsiaTheme="minorEastAsia"/>
         </w:rPr>
       </w:pPr>
-      <w:bookmarkStart w:id="4" w:name="_Toc37754745"/>
+      <w:bookmarkStart w:id="4" w:name="_Toc37837264"/>
       <w:proofErr w:type="spellStart"/>
       <w:r>
         <w:rPr>
@@ -4356,7 +4614,13 @@
                 <w:rPr>
                   <w:rFonts w:ascii="Cambria Math" w:hAnsi="Cambria Math"/>
                 </w:rPr>
-                <m:t>F_view</m:t>
+                <m:t>F_v</m:t>
+              </m:r>
+              <m:r>
+                <w:rPr>
+                  <w:rFonts w:ascii="Cambria Math" w:hAnsi="Cambria Math"/>
+                </w:rPr>
+                <m:t>iew</m:t>
               </m:r>
             </m:e>
             <m:sub>
@@ -4581,7 +4845,7 @@
           <w:lang w:val="fr-FR"/>
         </w:rPr>
       </w:pPr>
-      <w:bookmarkStart w:id="5" w:name="_Toc37754746"/>
+      <w:bookmarkStart w:id="5" w:name="_Toc37837265"/>
       <w:proofErr w:type="spellStart"/>
       <w:r>
         <w:rPr>
@@ -4607,7 +4871,7 @@
           <w:rFonts w:eastAsiaTheme="minorEastAsia"/>
         </w:rPr>
       </w:pPr>
-      <w:bookmarkStart w:id="6" w:name="_Toc37754747"/>
+      <w:bookmarkStart w:id="6" w:name="_Toc37837266"/>
       <w:proofErr w:type="spellStart"/>
       <w:r>
         <w:rPr>
@@ -4662,7 +4926,7 @@
           <w:rFonts w:eastAsiaTheme="minorEastAsia"/>
         </w:rPr>
       </w:pPr>
-      <w:bookmarkStart w:id="7" w:name="_Toc37754748"/>
+      <w:bookmarkStart w:id="7" w:name="_Toc37837267"/>
       <w:r>
         <w:rPr>
           <w:rFonts w:eastAsiaTheme="minorEastAsia"/>
@@ -4750,7 +5014,7 @@
           <w:rFonts w:eastAsiaTheme="minorEastAsia"/>
         </w:rPr>
       </w:pPr>
-      <w:bookmarkStart w:id="8" w:name="_Toc37754749"/>
+      <w:bookmarkStart w:id="8" w:name="_Toc37837268"/>
       <w:r>
         <w:rPr>
           <w:rFonts w:eastAsiaTheme="minorEastAsia"/>
@@ -4884,7 +5148,7 @@
           <w:rFonts w:eastAsiaTheme="minorEastAsia"/>
         </w:rPr>
       </w:pPr>
-      <w:bookmarkStart w:id="9" w:name="_Toc37754750"/>
+      <w:bookmarkStart w:id="9" w:name="_Toc37837269"/>
       <w:r>
         <w:rPr>
           <w:rFonts w:eastAsiaTheme="minorEastAsia"/>
@@ -5365,7 +5629,7 @@
           <w:rFonts w:eastAsiaTheme="minorEastAsia"/>
         </w:rPr>
       </w:pPr>
-      <w:bookmarkStart w:id="10" w:name="_Toc37754751"/>
+      <w:bookmarkStart w:id="10" w:name="_Toc37837270"/>
       <w:proofErr w:type="spellStart"/>
       <w:r>
         <w:rPr>
@@ -5440,7 +5704,7 @@
           <w:rFonts w:eastAsiaTheme="minorEastAsia"/>
         </w:rPr>
       </w:pPr>
-      <w:bookmarkStart w:id="11" w:name="_Toc37754752"/>
+      <w:bookmarkStart w:id="11" w:name="_Toc37837271"/>
       <w:proofErr w:type="spellStart"/>
       <w:r>
         <w:rPr>
@@ -5553,7 +5817,7 @@
           <w:rFonts w:eastAsiaTheme="minorEastAsia"/>
         </w:rPr>
       </w:pPr>
-      <w:bookmarkStart w:id="12" w:name="_Toc37754753"/>
+      <w:bookmarkStart w:id="12" w:name="_Toc37837272"/>
       <w:r>
         <w:rPr>
           <w:rFonts w:eastAsiaTheme="minorEastAsia"/>
@@ -6276,7 +6540,7 @@
           <w:rFonts w:eastAsiaTheme="minorEastAsia"/>
         </w:rPr>
       </w:pPr>
-      <w:bookmarkStart w:id="13" w:name="_Toc37754754"/>
+      <w:bookmarkStart w:id="13" w:name="_Toc37837273"/>
       <w:proofErr w:type="spellStart"/>
       <w:r>
         <w:rPr>
@@ -6435,7 +6699,7 @@
           <w:lang w:val="fr-FR"/>
         </w:rPr>
       </w:pPr>
-      <w:bookmarkStart w:id="14" w:name="_Toc37754755"/>
+      <w:bookmarkStart w:id="14" w:name="_Toc37837274"/>
       <w:proofErr w:type="spellStart"/>
       <w:r>
         <w:rPr>
@@ -6462,7 +6726,7 @@
           <w:rFonts w:eastAsiaTheme="minorEastAsia"/>
         </w:rPr>
       </w:pPr>
-      <w:bookmarkStart w:id="15" w:name="_Toc37754756"/>
+      <w:bookmarkStart w:id="15" w:name="_Toc37837275"/>
       <w:proofErr w:type="spellStart"/>
       <w:r>
         <w:rPr>
@@ -6584,7 +6848,7 @@
           <w:rFonts w:eastAsiaTheme="minorEastAsia"/>
         </w:rPr>
       </w:pPr>
-      <w:bookmarkStart w:id="16" w:name="_Toc37754757"/>
+      <w:bookmarkStart w:id="16" w:name="_Toc37837276"/>
       <w:proofErr w:type="spellStart"/>
       <w:r>
         <w:rPr>
@@ -6707,7 +6971,7 @@
           <w:rFonts w:eastAsiaTheme="minorEastAsia"/>
         </w:rPr>
       </w:pPr>
-      <w:bookmarkStart w:id="17" w:name="_Toc37754758"/>
+      <w:bookmarkStart w:id="17" w:name="_Toc37837277"/>
       <w:proofErr w:type="spellStart"/>
       <w:proofErr w:type="gramStart"/>
       <w:r>
@@ -6852,7 +7116,7 @@
           <w:rFonts w:eastAsiaTheme="minorEastAsia"/>
         </w:rPr>
       </w:pPr>
-      <w:bookmarkStart w:id="18" w:name="_Toc37754759"/>
+      <w:bookmarkStart w:id="18" w:name="_Toc37837278"/>
       <w:proofErr w:type="spellStart"/>
       <w:proofErr w:type="gramStart"/>
       <w:r>
@@ -7866,7 +8130,7 @@
           <w:rFonts w:eastAsiaTheme="minorEastAsia"/>
         </w:rPr>
       </w:pPr>
-      <w:bookmarkStart w:id="19" w:name="_Toc37754760"/>
+      <w:bookmarkStart w:id="19" w:name="_Toc37837279"/>
       <w:proofErr w:type="spellStart"/>
       <w:proofErr w:type="gramStart"/>
       <w:r>
@@ -8114,7 +8378,7 @@
           <w:rFonts w:eastAsiaTheme="minorEastAsia"/>
         </w:rPr>
       </w:pPr>
-      <w:bookmarkStart w:id="20" w:name="_Toc37754761"/>
+      <w:bookmarkStart w:id="20" w:name="_Toc37837280"/>
       <w:proofErr w:type="spellStart"/>
       <w:proofErr w:type="gramStart"/>
       <w:r>
@@ -9174,7 +9438,7 @@
           <w:rFonts w:eastAsiaTheme="minorEastAsia"/>
         </w:rPr>
       </w:pPr>
-      <w:bookmarkStart w:id="21" w:name="_Toc37754762"/>
+      <w:bookmarkStart w:id="21" w:name="_Toc37837281"/>
       <w:proofErr w:type="spellStart"/>
       <w:proofErr w:type="gramStart"/>
       <w:r>
@@ -9357,7 +9621,7 @@
           <w:rFonts w:eastAsiaTheme="minorEastAsia"/>
         </w:rPr>
       </w:pPr>
-      <w:bookmarkStart w:id="22" w:name="_Toc37754763"/>
+      <w:bookmarkStart w:id="22" w:name="_Toc37837282"/>
       <w:proofErr w:type="spellStart"/>
       <w:r>
         <w:rPr>
@@ -9607,7 +9871,7 @@
           <w:lang w:val="fr-FR"/>
         </w:rPr>
       </w:pPr>
-      <w:bookmarkStart w:id="23" w:name="_Toc37754764"/>
+      <w:bookmarkStart w:id="23" w:name="_Toc37837283"/>
       <w:proofErr w:type="spellStart"/>
       <w:r>
         <w:rPr>
@@ -9634,7 +9898,7 @@
           <w:lang w:val="fr-FR"/>
         </w:rPr>
       </w:pPr>
-      <w:bookmarkStart w:id="24" w:name="_Toc37754765"/>
+      <w:bookmarkStart w:id="24" w:name="_Toc37837284"/>
       <w:proofErr w:type="spellStart"/>
       <w:r>
         <w:rPr>
@@ -9659,7 +9923,7 @@
           <w:rFonts w:eastAsiaTheme="minorEastAsia"/>
         </w:rPr>
       </w:pPr>
-      <w:bookmarkStart w:id="25" w:name="_Toc37754766"/>
+      <w:bookmarkStart w:id="25" w:name="_Toc37837285"/>
       <w:proofErr w:type="spellStart"/>
       <w:r>
         <w:rPr>
@@ -9921,6 +10185,7 @@
           <w:rFonts w:eastAsiaTheme="minorEastAsia"/>
         </w:rPr>
       </w:pPr>
+      <w:bookmarkStart w:id="26" w:name="_Toc37837286"/>
       <w:r>
         <w:rPr>
           <w:rFonts w:eastAsiaTheme="minorEastAsia"/>
@@ -9933,6 +10198,7 @@
         </w:rPr>
         <w:t>densation</w:t>
       </w:r>
+      <w:bookmarkEnd w:id="26"/>
     </w:p>
     <w:p/>
     <w:p>
@@ -10024,13 +10290,7 @@
             <w:rPr>
               <w:rFonts w:ascii="Cambria Math" w:hAnsi="Cambria Math"/>
             </w:rPr>
-            <m:t>m_flow</m:t>
-          </m:r>
-          <m:r>
-            <w:rPr>
-              <w:rFonts w:ascii="Cambria Math" w:hAnsi="Cambria Math"/>
-            </w:rPr>
-            <m:t xml:space="preserve">= </m:t>
+            <m:t xml:space="preserve">m_flow= </m:t>
           </m:r>
           <m:sSub>
             <m:sSubPr>
@@ -10062,19 +10322,7 @@
             <w:rPr>
               <w:rFonts w:ascii="Cambria Math" w:hAnsi="Cambria Math"/>
             </w:rPr>
-            <m:t>×</m:t>
-          </m:r>
-          <m:r>
-            <w:rPr>
-              <w:rFonts w:ascii="Cambria Math" w:hAnsi="Cambria Math"/>
-            </w:rPr>
-            <m:t>A</m:t>
-          </m:r>
-          <m:r>
-            <w:rPr>
-              <w:rFonts w:ascii="Cambria Math" w:hAnsi="Cambria Math"/>
-            </w:rPr>
-            <m:t>×(</m:t>
+            <m:t>×A×(</m:t>
           </m:r>
           <m:sSub>
             <m:sSubPr>
@@ -10138,19 +10386,7 @@
             <w:rPr>
               <w:rFonts w:ascii="Cambria Math" w:hAnsi="Cambria Math"/>
             </w:rPr>
-            <m:t>(</m:t>
-          </m:r>
-          <m:r>
-            <w:rPr>
-              <w:rFonts w:ascii="Cambria Math" w:hAnsi="Cambria Math"/>
-            </w:rPr>
-            <m:t>heatPort.T</m:t>
-          </m:r>
-          <m:r>
-            <w:rPr>
-              <w:rFonts w:ascii="Cambria Math" w:hAnsi="Cambria Math"/>
-            </w:rPr>
-            <m:t>))</m:t>
+            <m:t>(heatPort.T))</m:t>
           </m:r>
         </m:oMath>
       </m:oMathPara>
@@ -10170,6 +10406,7 @@
           <w:rFonts w:eastAsiaTheme="minorEastAsia"/>
         </w:rPr>
       </w:pPr>
+      <w:bookmarkStart w:id="27" w:name="_Toc37837287"/>
       <w:proofErr w:type="spellStart"/>
       <w:r>
         <w:rPr>
@@ -10177,6 +10414,7 @@
         </w:rPr>
         <w:t>MolecularDiffusion</w:t>
       </w:r>
+      <w:bookmarkEnd w:id="27"/>
       <w:proofErr w:type="spellEnd"/>
     </w:p>
     <w:p/>
@@ -10433,69 +10671,782 @@
           </m:r>
         </m:oMath>
       </m:oMathPara>
-    </w:p>
-    <w:p>
-      <w:pPr>
-        <w:ind w:left="-567" w:right="-567"/>
-        <w:rPr>
-          <w:rFonts w:eastAsiaTheme="minorEastAsia"/>
-        </w:rPr>
-      </w:pPr>
-      <w:bookmarkStart w:id="26" w:name="_GoBack"/>
-      <w:bookmarkEnd w:id="26"/>
-    </w:p>
-    <w:p>
-      <w:pPr>
-        <w:pStyle w:val="Titre1"/>
-        <w:rPr>
-          <w:rFonts w:eastAsiaTheme="minorEastAsia"/>
-          <w:lang w:val="fr-FR"/>
-        </w:rPr>
-      </w:pPr>
-      <w:bookmarkStart w:id="27" w:name="_Toc37754767"/>
-      <w:r>
-        <w:rPr>
-          <w:rFonts w:eastAsiaTheme="minorEastAsia"/>
-          <w:lang w:val="fr-FR"/>
-        </w:rPr>
-        <w:t>PDE</w:t>
-      </w:r>
-      <w:bookmarkEnd w:id="27"/>
-    </w:p>
-    <w:p>
-      <w:pPr>
-        <w:rPr>
-          <w:lang w:val="fr-FR"/>
-        </w:rPr>
-      </w:pPr>
-    </w:p>
-    <w:p>
-      <w:pPr>
-        <w:pStyle w:val="Titre2"/>
-        <w:rPr>
-          <w:lang w:val="fr-FR"/>
-        </w:rPr>
-      </w:pPr>
-      <w:bookmarkStart w:id="28" w:name="_Toc37754768"/>
+      <w:bookmarkStart w:id="28" w:name="_Toc37837288"/>
+    </w:p>
+    <w:p>
+      <w:pPr>
+        <w:rPr>
+          <w:rFonts w:eastAsiaTheme="minorEastAsia"/>
+        </w:rPr>
+      </w:pPr>
+    </w:p>
+    <w:p>
+      <w:pPr>
+        <w:pStyle w:val="Titre3"/>
+        <w:rPr>
+          <w:rFonts w:eastAsiaTheme="minorEastAsia"/>
+        </w:rPr>
+      </w:pPr>
       <w:proofErr w:type="spellStart"/>
       <w:r>
         <w:rPr>
-          <w:lang w:val="fr-FR"/>
-        </w:rPr>
-        <w:t>ThermalDiffusion</w:t>
+          <w:rFonts w:eastAsiaTheme="minorEastAsia"/>
+        </w:rPr>
+        <w:t>GasNode</w:t>
       </w:r>
       <w:bookmarkEnd w:id="28"/>
       <w:proofErr w:type="spellEnd"/>
     </w:p>
+    <w:p/>
+    <w:p>
+      <m:oMathPara>
+        <m:oMath>
+          <m:r>
+            <w:rPr>
+              <w:rFonts w:ascii="Cambria Math" w:eastAsiaTheme="minorEastAsia" w:hAnsi="Cambria Math"/>
+            </w:rPr>
+            <m:t>m=V×medium.d</m:t>
+          </m:r>
+        </m:oMath>
+      </m:oMathPara>
+    </w:p>
+    <w:p>
+      <w:pPr>
+        <w:rPr>
+          <w:rFonts w:eastAsiaTheme="minorEastAsia"/>
+        </w:rPr>
+      </w:pPr>
+      <m:oMathPara>
+        <m:oMath>
+          <m:r>
+            <w:rPr>
+              <w:rFonts w:ascii="Cambria Math" w:eastAsiaTheme="minorEastAsia" w:hAnsi="Cambria Math"/>
+            </w:rPr>
+            <m:t>U=m</m:t>
+          </m:r>
+          <m:r>
+            <w:rPr>
+              <w:rFonts w:ascii="Cambria Math" w:eastAsiaTheme="minorEastAsia" w:hAnsi="Cambria Math"/>
+            </w:rPr>
+            <m:t>×mediu</m:t>
+          </m:r>
+          <m:r>
+            <w:rPr>
+              <w:rFonts w:ascii="Cambria Math" w:eastAsiaTheme="minorEastAsia" w:hAnsi="Cambria Math"/>
+            </w:rPr>
+            <m:t>m</m:t>
+          </m:r>
+          <m:r>
+            <w:rPr>
+              <w:rFonts w:ascii="Cambria Math" w:eastAsiaTheme="minorEastAsia" w:hAnsi="Cambria Math"/>
+            </w:rPr>
+            <m:t>.</m:t>
+          </m:r>
+          <m:r>
+            <w:rPr>
+              <w:rFonts w:ascii="Cambria Math" w:eastAsiaTheme="minorEastAsia" w:hAnsi="Cambria Math"/>
+            </w:rPr>
+            <m:t>u</m:t>
+          </m:r>
+        </m:oMath>
+      </m:oMathPara>
+    </w:p>
+    <w:p>
+      <w:pPr>
+        <w:rPr>
+          <w:rFonts w:eastAsiaTheme="minorEastAsia"/>
+        </w:rPr>
+      </w:pPr>
+      <m:oMathPara>
+        <m:oMath>
+          <m:r>
+            <w:rPr>
+              <w:rFonts w:ascii="Cambria Math" w:eastAsiaTheme="minorEastAsia" w:hAnsi="Cambria Math"/>
+            </w:rPr>
+            <m:t>mXi</m:t>
+          </m:r>
+          <m:r>
+            <w:rPr>
+              <w:rFonts w:ascii="Cambria Math" w:eastAsiaTheme="minorEastAsia" w:hAnsi="Cambria Math"/>
+            </w:rPr>
+            <m:t>=m×medium.</m:t>
+          </m:r>
+          <m:r>
+            <w:rPr>
+              <w:rFonts w:ascii="Cambria Math" w:eastAsiaTheme="minorEastAsia" w:hAnsi="Cambria Math"/>
+            </w:rPr>
+            <m:t>Xi</m:t>
+          </m:r>
+        </m:oMath>
+      </m:oMathPara>
+    </w:p>
+    <w:p>
+      <w:pPr>
+        <w:rPr>
+          <w:rFonts w:eastAsiaTheme="minorEastAsia"/>
+        </w:rPr>
+      </w:pPr>
+      <m:oMathPara>
+        <m:oMath>
+          <m:r>
+            <w:rPr>
+              <w:rFonts w:ascii="Cambria Math" w:eastAsiaTheme="minorEastAsia" w:hAnsi="Cambria Math"/>
+            </w:rPr>
+            <m:t>mC</m:t>
+          </m:r>
+          <m:r>
+            <w:rPr>
+              <w:rFonts w:ascii="Cambria Math" w:eastAsiaTheme="minorEastAsia" w:hAnsi="Cambria Math"/>
+            </w:rPr>
+            <m:t>=m×</m:t>
+          </m:r>
+          <m:r>
+            <w:rPr>
+              <w:rFonts w:ascii="Cambria Math" w:eastAsiaTheme="minorEastAsia" w:hAnsi="Cambria Math"/>
+            </w:rPr>
+            <m:t>c</m:t>
+          </m:r>
+        </m:oMath>
+      </m:oMathPara>
+    </w:p>
+    <w:p>
+      <w:pPr>
+        <w:rPr>
+          <w:rFonts w:eastAsiaTheme="minorEastAsia"/>
+        </w:rPr>
+      </w:pPr>
+      <m:oMathPara>
+        <m:oMath>
+          <m:f>
+            <m:fPr>
+              <m:ctrlPr>
+                <w:rPr>
+                  <w:rFonts w:ascii="Cambria Math" w:eastAsiaTheme="minorEastAsia" w:hAnsi="Cambria Math"/>
+                  <w:i/>
+                </w:rPr>
+              </m:ctrlPr>
+            </m:fPr>
+            <m:num>
+              <m:r>
+                <w:rPr>
+                  <w:rFonts w:ascii="Cambria Math" w:hAnsi="Cambria Math"/>
+                </w:rPr>
+                <m:t>dm</m:t>
+              </m:r>
+            </m:num>
+            <m:den>
+              <m:r>
+                <w:rPr>
+                  <w:rFonts w:ascii="Cambria Math" w:hAnsi="Cambria Math"/>
+                </w:rPr>
+                <m:t>dt</m:t>
+              </m:r>
+            </m:den>
+          </m:f>
+          <m:r>
+            <w:rPr>
+              <w:rFonts w:ascii="Cambria Math" w:eastAsiaTheme="minorEastAsia" w:hAnsi="Cambria Math"/>
+            </w:rPr>
+            <m:t>=</m:t>
+          </m:r>
+          <m:r>
+            <w:rPr>
+              <w:rFonts w:ascii="Cambria Math" w:eastAsiaTheme="minorEastAsia" w:hAnsi="Cambria Math"/>
+            </w:rPr>
+            <m:t>m</m:t>
+          </m:r>
+          <m:r>
+            <w:rPr>
+              <w:rFonts w:ascii="Cambria Math" w:eastAsiaTheme="minorEastAsia" w:hAnsi="Cambria Math"/>
+            </w:rPr>
+            <m:t>_flow</m:t>
+          </m:r>
+          <m:r>
+            <w:rPr>
+              <w:rFonts w:ascii="Cambria Math" w:eastAsiaTheme="minorEastAsia" w:hAnsi="Cambria Math"/>
+            </w:rPr>
+            <m:t xml:space="preserve"> </m:t>
+          </m:r>
+          <m:r>
+            <w:rPr>
+              <w:rFonts w:ascii="Cambria Math" w:eastAsiaTheme="minorEastAsia" w:hAnsi="Cambria Math"/>
+            </w:rPr>
+            <m:t xml:space="preserve"> </m:t>
+          </m:r>
+        </m:oMath>
+      </m:oMathPara>
+    </w:p>
+    <w:p>
+      <w:pPr>
+        <w:rPr>
+          <w:rFonts w:eastAsiaTheme="minorEastAsia"/>
+        </w:rPr>
+      </w:pPr>
+      <m:oMathPara>
+        <m:oMath>
+          <m:f>
+            <m:fPr>
+              <m:ctrlPr>
+                <w:rPr>
+                  <w:rFonts w:ascii="Cambria Math" w:eastAsiaTheme="minorEastAsia" w:hAnsi="Cambria Math"/>
+                  <w:i/>
+                </w:rPr>
+              </m:ctrlPr>
+            </m:fPr>
+            <m:num>
+              <m:r>
+                <w:rPr>
+                  <w:rFonts w:ascii="Cambria Math" w:hAnsi="Cambria Math"/>
+                </w:rPr>
+                <m:t>dm</m:t>
+              </m:r>
+              <m:r>
+                <w:rPr>
+                  <w:rFonts w:ascii="Cambria Math" w:hAnsi="Cambria Math"/>
+                </w:rPr>
+                <m:t>Xi</m:t>
+              </m:r>
+            </m:num>
+            <m:den>
+              <m:r>
+                <w:rPr>
+                  <w:rFonts w:ascii="Cambria Math" w:hAnsi="Cambria Math"/>
+                </w:rPr>
+                <m:t>dt</m:t>
+              </m:r>
+            </m:den>
+          </m:f>
+          <m:r>
+            <w:rPr>
+              <w:rFonts w:ascii="Cambria Math" w:eastAsiaTheme="minorEastAsia" w:hAnsi="Cambria Math"/>
+            </w:rPr>
+            <m:t>=m</m:t>
+          </m:r>
+          <m:r>
+            <w:rPr>
+              <w:rFonts w:ascii="Cambria Math" w:eastAsiaTheme="minorEastAsia" w:hAnsi="Cambria Math"/>
+            </w:rPr>
+            <m:t>Xi</m:t>
+          </m:r>
+          <m:r>
+            <w:rPr>
+              <w:rFonts w:ascii="Cambria Math" w:eastAsiaTheme="minorEastAsia" w:hAnsi="Cambria Math"/>
+            </w:rPr>
+            <m:t xml:space="preserve">_flow  </m:t>
+          </m:r>
+        </m:oMath>
+      </m:oMathPara>
+    </w:p>
+    <w:p>
+      <w:pPr>
+        <w:rPr>
+          <w:rFonts w:eastAsiaTheme="minorEastAsia"/>
+        </w:rPr>
+      </w:pPr>
+      <m:oMathPara>
+        <m:oMath>
+          <m:f>
+            <m:fPr>
+              <m:ctrlPr>
+                <w:rPr>
+                  <w:rFonts w:ascii="Cambria Math" w:eastAsiaTheme="minorEastAsia" w:hAnsi="Cambria Math"/>
+                  <w:i/>
+                </w:rPr>
+              </m:ctrlPr>
+            </m:fPr>
+            <m:num>
+              <m:r>
+                <w:rPr>
+                  <w:rFonts w:ascii="Cambria Math" w:hAnsi="Cambria Math"/>
+                </w:rPr>
+                <m:t>dU</m:t>
+              </m:r>
+            </m:num>
+            <m:den>
+              <m:r>
+                <w:rPr>
+                  <w:rFonts w:ascii="Cambria Math" w:hAnsi="Cambria Math"/>
+                </w:rPr>
+                <m:t>dt</m:t>
+              </m:r>
+            </m:den>
+          </m:f>
+          <m:r>
+            <w:rPr>
+              <w:rFonts w:ascii="Cambria Math" w:eastAsiaTheme="minorEastAsia" w:hAnsi="Cambria Math"/>
+            </w:rPr>
+            <m:t>=Q_flow</m:t>
+          </m:r>
+          <m:r>
+            <w:rPr>
+              <w:rFonts w:ascii="Cambria Math" w:eastAsiaTheme="minorEastAsia" w:hAnsi="Cambria Math"/>
+            </w:rPr>
+            <m:t>+</m:t>
+          </m:r>
+          <m:r>
+            <w:rPr>
+              <w:rFonts w:ascii="Cambria Math" w:eastAsiaTheme="minorEastAsia" w:hAnsi="Cambria Math"/>
+            </w:rPr>
+            <m:t xml:space="preserve"> H_flow</m:t>
+          </m:r>
+        </m:oMath>
+      </m:oMathPara>
+    </w:p>
+    <w:p>
+      <w:pPr>
+        <w:rPr>
+          <w:rFonts w:eastAsiaTheme="minorEastAsia"/>
+        </w:rPr>
+      </w:pPr>
+      <m:oMathPara>
+        <m:oMath>
+          <m:r>
+            <m:rPr>
+              <m:sty m:val="bi"/>
+            </m:rPr>
+            <w:rPr>
+              <w:rFonts w:ascii="Cambria Math" w:eastAsiaTheme="minorEastAsia" w:hAnsi="Cambria Math"/>
+            </w:rPr>
+            <w:lastRenderedPageBreak/>
+            <m:t>m_flow</m:t>
+          </m:r>
+          <m:r>
+            <w:rPr>
+              <w:rFonts w:ascii="Cambria Math" w:eastAsiaTheme="minorEastAsia" w:hAnsi="Cambria Math"/>
+            </w:rPr>
+            <m:t xml:space="preserve">= </m:t>
+          </m:r>
+          <m:nary>
+            <m:naryPr>
+              <m:chr m:val="∑"/>
+              <m:limLoc m:val="undOvr"/>
+              <m:ctrlPr>
+                <w:rPr>
+                  <w:rFonts w:ascii="Cambria Math" w:eastAsiaTheme="minorEastAsia" w:hAnsi="Cambria Math"/>
+                  <w:i/>
+                </w:rPr>
+              </m:ctrlPr>
+            </m:naryPr>
+            <m:sub>
+              <m:r>
+                <w:rPr>
+                  <w:rFonts w:ascii="Cambria Math" w:eastAsiaTheme="minorEastAsia" w:hAnsi="Cambria Math"/>
+                </w:rPr>
+                <m:t>i=1</m:t>
+              </m:r>
+            </m:sub>
+            <m:sup>
+              <m:r>
+                <w:rPr>
+                  <w:rFonts w:ascii="Cambria Math" w:eastAsiaTheme="minorEastAsia" w:hAnsi="Cambria Math"/>
+                </w:rPr>
+                <m:t>nports</m:t>
+              </m:r>
+            </m:sup>
+            <m:e>
+              <m:r>
+                <w:rPr>
+                  <w:rFonts w:ascii="Cambria Math" w:eastAsiaTheme="minorEastAsia" w:hAnsi="Cambria Math"/>
+                </w:rPr>
+                <m:t>fluidPort[i].m_flow</m:t>
+              </m:r>
+            </m:e>
+          </m:nary>
+          <m:r>
+            <w:rPr>
+              <w:rFonts w:ascii="Cambria Math" w:eastAsiaTheme="minorEastAsia" w:hAnsi="Cambria Math"/>
+            </w:rPr>
+            <m:t>+</m:t>
+          </m:r>
+          <m:nary>
+            <m:naryPr>
+              <m:chr m:val="∑"/>
+              <m:limLoc m:val="undOvr"/>
+              <m:ctrlPr>
+                <w:rPr>
+                  <w:rFonts w:ascii="Cambria Math" w:eastAsiaTheme="minorEastAsia" w:hAnsi="Cambria Math"/>
+                  <w:i/>
+                </w:rPr>
+              </m:ctrlPr>
+            </m:naryPr>
+            <m:sub>
+              <m:r>
+                <w:rPr>
+                  <w:rFonts w:ascii="Cambria Math" w:eastAsiaTheme="minorEastAsia" w:hAnsi="Cambria Math"/>
+                </w:rPr>
+                <m:t>i=1</m:t>
+              </m:r>
+            </m:sub>
+            <m:sup>
+              <m:r>
+                <w:rPr>
+                  <w:rFonts w:ascii="Cambria Math" w:eastAsiaTheme="minorEastAsia" w:hAnsi="Cambria Math"/>
+                </w:rPr>
+                <m:t>Medium.nX</m:t>
+              </m:r>
+            </m:sup>
+            <m:e>
+              <m:r>
+                <w:rPr>
+                  <w:rFonts w:ascii="Cambria Math" w:eastAsiaTheme="minorEastAsia" w:hAnsi="Cambria Math"/>
+                </w:rPr>
+                <m:t>flowPort.m_flow[i]</m:t>
+              </m:r>
+            </m:e>
+          </m:nary>
+          <m:r>
+            <w:rPr>
+              <w:rFonts w:ascii="Cambria Math" w:eastAsiaTheme="minorEastAsia" w:hAnsi="Cambria Math"/>
+            </w:rPr>
+            <m:t xml:space="preserve"> </m:t>
+          </m:r>
+        </m:oMath>
+      </m:oMathPara>
+    </w:p>
+    <w:p>
+      <w:pPr>
+        <w:rPr>
+          <w:rFonts w:eastAsiaTheme="minorEastAsia"/>
+        </w:rPr>
+      </w:pPr>
+      <m:oMathPara>
+        <m:oMath>
+          <m:r>
+            <m:rPr>
+              <m:sty m:val="bi"/>
+            </m:rPr>
+            <w:rPr>
+              <w:rFonts w:ascii="Cambria Math" w:eastAsiaTheme="minorEastAsia" w:hAnsi="Cambria Math"/>
+            </w:rPr>
+            <m:t>mXi_flow[i]</m:t>
+          </m:r>
+          <m:r>
+            <w:rPr>
+              <w:rFonts w:ascii="Cambria Math" w:eastAsiaTheme="minorEastAsia" w:hAnsi="Cambria Math"/>
+            </w:rPr>
+            <m:t xml:space="preserve">= </m:t>
+          </m:r>
+          <m:nary>
+            <m:naryPr>
+              <m:chr m:val="∑"/>
+              <m:limLoc m:val="undOvr"/>
+              <m:ctrlPr>
+                <w:rPr>
+                  <w:rFonts w:ascii="Cambria Math" w:eastAsiaTheme="minorEastAsia" w:hAnsi="Cambria Math"/>
+                  <w:i/>
+                </w:rPr>
+              </m:ctrlPr>
+            </m:naryPr>
+            <m:sub>
+              <m:r>
+                <w:rPr>
+                  <w:rFonts w:ascii="Cambria Math" w:eastAsiaTheme="minorEastAsia" w:hAnsi="Cambria Math"/>
+                </w:rPr>
+                <m:t>j</m:t>
+              </m:r>
+              <m:r>
+                <w:rPr>
+                  <w:rFonts w:ascii="Cambria Math" w:eastAsiaTheme="minorEastAsia" w:hAnsi="Cambria Math"/>
+                </w:rPr>
+                <m:t>=1</m:t>
+              </m:r>
+            </m:sub>
+            <m:sup>
+              <m:r>
+                <w:rPr>
+                  <w:rFonts w:ascii="Cambria Math" w:eastAsiaTheme="minorEastAsia" w:hAnsi="Cambria Math"/>
+                </w:rPr>
+                <m:t>nports</m:t>
+              </m:r>
+            </m:sup>
+            <m:e>
+              <m:d>
+                <m:dPr>
+                  <m:ctrlPr>
+                    <w:rPr>
+                      <w:rFonts w:ascii="Cambria Math" w:eastAsiaTheme="minorEastAsia" w:hAnsi="Cambria Math"/>
+                      <w:i/>
+                    </w:rPr>
+                  </m:ctrlPr>
+                </m:dPr>
+                <m:e>
+                  <m:r>
+                    <w:rPr>
+                      <w:rFonts w:ascii="Cambria Math" w:eastAsiaTheme="minorEastAsia" w:hAnsi="Cambria Math"/>
+                    </w:rPr>
+                    <m:t>fluidPort</m:t>
+                  </m:r>
+                  <m:d>
+                    <m:dPr>
+                      <m:begChr m:val="["/>
+                      <m:endChr m:val="]"/>
+                      <m:ctrlPr>
+                        <w:rPr>
+                          <w:rFonts w:ascii="Cambria Math" w:eastAsiaTheme="minorEastAsia" w:hAnsi="Cambria Math"/>
+                          <w:i/>
+                        </w:rPr>
+                      </m:ctrlPr>
+                    </m:dPr>
+                    <m:e>
+                      <m:r>
+                        <w:rPr>
+                          <w:rFonts w:ascii="Cambria Math" w:eastAsiaTheme="minorEastAsia" w:hAnsi="Cambria Math"/>
+                        </w:rPr>
+                        <m:t>j</m:t>
+                      </m:r>
+                    </m:e>
+                  </m:d>
+                  <m:r>
+                    <w:rPr>
+                      <w:rFonts w:ascii="Cambria Math" w:eastAsiaTheme="minorEastAsia" w:hAnsi="Cambria Math"/>
+                    </w:rPr>
+                    <m:t>.</m:t>
+                  </m:r>
+                  <m:r>
+                    <w:rPr>
+                      <w:rFonts w:ascii="Cambria Math" w:eastAsiaTheme="minorEastAsia" w:hAnsi="Cambria Math"/>
+                    </w:rPr>
+                    <m:t xml:space="preserve">m_flow </m:t>
+                  </m:r>
+                  <m:r>
+                    <w:rPr>
+                      <w:rFonts w:ascii="Cambria Math" w:eastAsiaTheme="minorEastAsia" w:hAnsi="Cambria Math"/>
+                    </w:rPr>
+                    <m:t>×actualStream(fluidPort[</m:t>
+                  </m:r>
+                  <m:r>
+                    <w:rPr>
+                      <w:rFonts w:ascii="Cambria Math" w:eastAsiaTheme="minorEastAsia" w:hAnsi="Cambria Math"/>
+                    </w:rPr>
+                    <m:t>j</m:t>
+                  </m:r>
+                  <m:r>
+                    <w:rPr>
+                      <w:rFonts w:ascii="Cambria Math" w:eastAsiaTheme="minorEastAsia" w:hAnsi="Cambria Math"/>
+                    </w:rPr>
+                    <m:t>].Xi_outflow</m:t>
+                  </m:r>
+                  <m:r>
+                    <w:rPr>
+                      <w:rFonts w:ascii="Cambria Math" w:eastAsiaTheme="minorEastAsia" w:hAnsi="Cambria Math"/>
+                    </w:rPr>
+                    <m:t>[i]</m:t>
+                  </m:r>
+                  <m:r>
+                    <w:rPr>
+                      <w:rFonts w:ascii="Cambria Math" w:eastAsiaTheme="minorEastAsia" w:hAnsi="Cambria Math"/>
+                    </w:rPr>
+                    <m:t>)</m:t>
+                  </m:r>
+                </m:e>
+              </m:d>
+            </m:e>
+          </m:nary>
+          <m:r>
+            <w:rPr>
+              <w:rFonts w:ascii="Cambria Math" w:eastAsiaTheme="minorEastAsia" w:hAnsi="Cambria Math"/>
+            </w:rPr>
+            <m:t xml:space="preserve">+flowPort.m_flow[i]  </m:t>
+          </m:r>
+        </m:oMath>
+      </m:oMathPara>
+    </w:p>
+    <w:p>
+      <w:pPr>
+        <w:rPr>
+          <w:rFonts w:eastAsiaTheme="minorEastAsia"/>
+        </w:rPr>
+      </w:pPr>
+      <m:oMathPara>
+        <m:oMath>
+          <m:r>
+            <m:rPr>
+              <m:sty m:val="bi"/>
+            </m:rPr>
+            <w:rPr>
+              <w:rFonts w:ascii="Cambria Math" w:eastAsiaTheme="minorEastAsia" w:hAnsi="Cambria Math"/>
+            </w:rPr>
+            <m:t>Q_flow</m:t>
+          </m:r>
+          <m:r>
+            <w:rPr>
+              <w:rFonts w:ascii="Cambria Math" w:eastAsiaTheme="minorEastAsia" w:hAnsi="Cambria Math"/>
+            </w:rPr>
+            <m:t>=</m:t>
+          </m:r>
+          <m:r>
+            <w:rPr>
+              <w:rFonts w:ascii="Cambria Math" w:eastAsiaTheme="minorEastAsia" w:hAnsi="Cambria Math"/>
+            </w:rPr>
+            <m:t>heatPort.Q</m:t>
+          </m:r>
+          <m:r>
+            <w:rPr>
+              <w:rFonts w:ascii="Cambria Math" w:eastAsiaTheme="minorEastAsia" w:hAnsi="Cambria Math"/>
+            </w:rPr>
+            <m:t xml:space="preserve">_flow  </m:t>
+          </m:r>
+        </m:oMath>
+      </m:oMathPara>
+    </w:p>
+    <w:p>
+      <w:pPr>
+        <w:rPr>
+          <w:rFonts w:eastAsiaTheme="minorEastAsia"/>
+        </w:rPr>
+      </w:pPr>
+      <m:oMathPara>
+        <m:oMath>
+          <m:r>
+            <m:rPr>
+              <m:sty m:val="bi"/>
+            </m:rPr>
+            <w:rPr>
+              <w:rFonts w:ascii="Cambria Math" w:eastAsiaTheme="minorEastAsia" w:hAnsi="Cambria Math"/>
+            </w:rPr>
+            <m:t>H_flow</m:t>
+          </m:r>
+          <m:r>
+            <w:rPr>
+              <w:rFonts w:ascii="Cambria Math" w:eastAsiaTheme="minorEastAsia" w:hAnsi="Cambria Math"/>
+            </w:rPr>
+            <m:t>=</m:t>
+          </m:r>
+          <m:nary>
+            <m:naryPr>
+              <m:chr m:val="∑"/>
+              <m:limLoc m:val="undOvr"/>
+              <m:ctrlPr>
+                <w:rPr>
+                  <w:rFonts w:ascii="Cambria Math" w:eastAsiaTheme="minorEastAsia" w:hAnsi="Cambria Math"/>
+                  <w:i/>
+                </w:rPr>
+              </m:ctrlPr>
+            </m:naryPr>
+            <m:sub>
+              <m:r>
+                <w:rPr>
+                  <w:rFonts w:ascii="Cambria Math" w:eastAsiaTheme="minorEastAsia" w:hAnsi="Cambria Math"/>
+                </w:rPr>
+                <m:t>i=1</m:t>
+              </m:r>
+            </m:sub>
+            <m:sup>
+              <m:r>
+                <w:rPr>
+                  <w:rFonts w:ascii="Cambria Math" w:eastAsiaTheme="minorEastAsia" w:hAnsi="Cambria Math"/>
+                </w:rPr>
+                <m:t>nports</m:t>
+              </m:r>
+            </m:sup>
+            <m:e>
+              <m:d>
+                <m:dPr>
+                  <m:ctrlPr>
+                    <w:rPr>
+                      <w:rFonts w:ascii="Cambria Math" w:eastAsiaTheme="minorEastAsia" w:hAnsi="Cambria Math"/>
+                      <w:i/>
+                    </w:rPr>
+                  </m:ctrlPr>
+                </m:dPr>
+                <m:e>
+                  <m:r>
+                    <w:rPr>
+                      <w:rFonts w:ascii="Cambria Math" w:eastAsiaTheme="minorEastAsia" w:hAnsi="Cambria Math"/>
+                    </w:rPr>
+                    <m:t>fluidPort.</m:t>
+                  </m:r>
+                  <m:r>
+                    <w:rPr>
+                      <w:rFonts w:ascii="Cambria Math" w:eastAsiaTheme="minorEastAsia" w:hAnsi="Cambria Math"/>
+                    </w:rPr>
+                    <m:t>m_flow</m:t>
+                  </m:r>
+                  <m:r>
+                    <w:rPr>
+                      <w:rFonts w:ascii="Cambria Math" w:eastAsiaTheme="minorEastAsia" w:hAnsi="Cambria Math"/>
+                    </w:rPr>
+                    <m:t>×actualStream(fluidPort.h_outflow)</m:t>
+                  </m:r>
+                </m:e>
+              </m:d>
+            </m:e>
+          </m:nary>
+          <m:r>
+            <w:rPr>
+              <w:rFonts w:ascii="Cambria Math" w:eastAsiaTheme="minorEastAsia" w:hAnsi="Cambria Math"/>
+            </w:rPr>
+            <m:t>+flowPort.</m:t>
+          </m:r>
+          <m:r>
+            <w:rPr>
+              <w:rFonts w:ascii="Cambria Math" w:eastAsiaTheme="minorEastAsia" w:hAnsi="Cambria Math"/>
+            </w:rPr>
+            <m:t>H</m:t>
+          </m:r>
+          <m:r>
+            <w:rPr>
+              <w:rFonts w:ascii="Cambria Math" w:eastAsiaTheme="minorEastAsia" w:hAnsi="Cambria Math"/>
+            </w:rPr>
+            <m:t xml:space="preserve">_flow  </m:t>
+          </m:r>
+        </m:oMath>
+      </m:oMathPara>
+    </w:p>
+    <w:p>
+      <w:pPr>
+        <w:pStyle w:val="Titre1"/>
+        <w:rPr>
+          <w:rFonts w:eastAsiaTheme="minorEastAsia"/>
+          <w:lang w:val="fr-FR"/>
+        </w:rPr>
+      </w:pPr>
+      <w:bookmarkStart w:id="29" w:name="_Toc37837289"/>
+      <w:r>
+        <w:rPr>
+          <w:rFonts w:eastAsiaTheme="minorEastAsia"/>
+          <w:lang w:val="fr-FR"/>
+        </w:rPr>
+        <w:t>PDE</w:t>
+      </w:r>
+      <w:bookmarkStart w:id="30" w:name="_GoBack"/>
+      <w:bookmarkEnd w:id="29"/>
+      <w:bookmarkEnd w:id="30"/>
+    </w:p>
+    <w:p>
+      <w:pPr>
+        <w:rPr>
+          <w:lang w:val="fr-FR"/>
+        </w:rPr>
+      </w:pPr>
+    </w:p>
+    <w:p>
+      <w:pPr>
+        <w:pStyle w:val="Titre2"/>
+        <w:rPr>
+          <w:lang w:val="fr-FR"/>
+        </w:rPr>
+      </w:pPr>
+      <w:bookmarkStart w:id="31" w:name="_Toc37837290"/>
+      <w:proofErr w:type="spellStart"/>
+      <w:r>
+        <w:rPr>
+          <w:lang w:val="fr-FR"/>
+        </w:rPr>
+        <w:t>ThermalDiffusion</w:t>
+      </w:r>
+      <w:bookmarkEnd w:id="31"/>
+      <w:proofErr w:type="spellEnd"/>
+    </w:p>
     <w:p>
       <w:pPr>
         <w:pStyle w:val="Titre3"/>
       </w:pPr>
-      <w:bookmarkStart w:id="29" w:name="_Toc37754769"/>
+      <w:bookmarkStart w:id="32" w:name="_Toc37837291"/>
       <w:r>
         <w:t>Second order central</w:t>
       </w:r>
-      <w:bookmarkEnd w:id="29"/>
+      <w:bookmarkEnd w:id="32"/>
     </w:p>
     <w:p>
       <w:pPr>
@@ -13184,6 +14135,36 @@
     </w:lvlOverride>
   </w:num>
   <w:num w:numId="6">
+    <w:abstractNumId w:val="1"/>
+    <w:lvlOverride w:ilvl="0">
+      <w:startOverride w:val="1"/>
+    </w:lvlOverride>
+    <w:lvlOverride w:ilvl="1">
+      <w:startOverride w:val="1"/>
+    </w:lvlOverride>
+    <w:lvlOverride w:ilvl="2">
+      <w:startOverride w:val="1"/>
+    </w:lvlOverride>
+    <w:lvlOverride w:ilvl="3">
+      <w:startOverride w:val="1"/>
+    </w:lvlOverride>
+    <w:lvlOverride w:ilvl="4">
+      <w:startOverride w:val="1"/>
+    </w:lvlOverride>
+    <w:lvlOverride w:ilvl="5">
+      <w:startOverride w:val="1"/>
+    </w:lvlOverride>
+    <w:lvlOverride w:ilvl="6">
+      <w:startOverride w:val="1"/>
+    </w:lvlOverride>
+    <w:lvlOverride w:ilvl="7">
+      <w:startOverride w:val="1"/>
+    </w:lvlOverride>
+    <w:lvlOverride w:ilvl="8">
+      <w:startOverride w:val="1"/>
+    </w:lvlOverride>
+  </w:num>
+  <w:num w:numId="7">
     <w:abstractNumId w:val="1"/>
     <w:lvlOverride w:ilvl="0">
       <w:startOverride w:val="1"/>
@@ -14816,7 +15797,7 @@
 </file>
 
 <file path=customXml/itemProps1.xml><?xml version="1.0" encoding="utf-8"?>
-<ds:datastoreItem xmlns:ds="http://schemas.openxmlformats.org/officeDocument/2006/customXml" ds:itemID="{5EACF7A4-B394-442E-B9A7-6CA4D0879111}">
+<ds:datastoreItem xmlns:ds="http://schemas.openxmlformats.org/officeDocument/2006/customXml" ds:itemID="{5A36C661-4479-4906-B2B5-B2A604EB8242}">
   <ds:schemaRefs>
     <ds:schemaRef ds:uri="http://schemas.openxmlformats.org/officeDocument/2006/bibliography"/>
   </ds:schemaRefs>

</xml_diff>

<commit_message>
Addition of a description in the FogModel module
</commit_message>
<xml_diff>
--- a/Information/script for equations.docx
+++ b/Information/script for equations.docx
@@ -2500,21 +2500,7 @@
                 <w:rStyle w:val="Lienhypertexte"/>
                 <w:noProof/>
               </w:rPr>
-              <w:t>Gas</w:t>
-            </w:r>
-            <w:r>
-              <w:rPr>
-                <w:rStyle w:val="Lienhypertexte"/>
-                <w:noProof/>
-              </w:rPr>
-              <w:t>N</w:t>
-            </w:r>
-            <w:r>
-              <w:rPr>
-                <w:rStyle w:val="Lienhypertexte"/>
-                <w:noProof/>
-              </w:rPr>
-              <w:t>ode</w:t>
+              <w:t>GasNode</w:t>
             </w:r>
             <w:r>
               <w:rPr>
@@ -4614,13 +4600,7 @@
                 <w:rPr>
                   <w:rFonts w:ascii="Cambria Math" w:hAnsi="Cambria Math"/>
                 </w:rPr>
-                <m:t>F_v</m:t>
-              </m:r>
-              <m:r>
-                <w:rPr>
-                  <w:rFonts w:ascii="Cambria Math" w:hAnsi="Cambria Math"/>
-                </w:rPr>
-                <m:t>iew</m:t>
+                <m:t>F_view</m:t>
               </m:r>
             </m:e>
             <m:sub>
@@ -10722,31 +10702,7 @@
             <w:rPr>
               <w:rFonts w:ascii="Cambria Math" w:eastAsiaTheme="minorEastAsia" w:hAnsi="Cambria Math"/>
             </w:rPr>
-            <m:t>U=m</m:t>
-          </m:r>
-          <m:r>
-            <w:rPr>
-              <w:rFonts w:ascii="Cambria Math" w:eastAsiaTheme="minorEastAsia" w:hAnsi="Cambria Math"/>
-            </w:rPr>
-            <m:t>×mediu</m:t>
-          </m:r>
-          <m:r>
-            <w:rPr>
-              <w:rFonts w:ascii="Cambria Math" w:eastAsiaTheme="minorEastAsia" w:hAnsi="Cambria Math"/>
-            </w:rPr>
-            <m:t>m</m:t>
-          </m:r>
-          <m:r>
-            <w:rPr>
-              <w:rFonts w:ascii="Cambria Math" w:eastAsiaTheme="minorEastAsia" w:hAnsi="Cambria Math"/>
-            </w:rPr>
-            <m:t>.</m:t>
-          </m:r>
-          <m:r>
-            <w:rPr>
-              <w:rFonts w:ascii="Cambria Math" w:eastAsiaTheme="minorEastAsia" w:hAnsi="Cambria Math"/>
-            </w:rPr>
-            <m:t>u</m:t>
+            <m:t>U=m×medium.u</m:t>
           </m:r>
         </m:oMath>
       </m:oMathPara>
@@ -10763,19 +10719,7 @@
             <w:rPr>
               <w:rFonts w:ascii="Cambria Math" w:eastAsiaTheme="minorEastAsia" w:hAnsi="Cambria Math"/>
             </w:rPr>
-            <m:t>mXi</m:t>
-          </m:r>
-          <m:r>
-            <w:rPr>
-              <w:rFonts w:ascii="Cambria Math" w:eastAsiaTheme="minorEastAsia" w:hAnsi="Cambria Math"/>
-            </w:rPr>
-            <m:t>=m×medium.</m:t>
-          </m:r>
-          <m:r>
-            <w:rPr>
-              <w:rFonts w:ascii="Cambria Math" w:eastAsiaTheme="minorEastAsia" w:hAnsi="Cambria Math"/>
-            </w:rPr>
-            <m:t>Xi</m:t>
+            <m:t>mXi=m×medium.Xi</m:t>
           </m:r>
         </m:oMath>
       </m:oMathPara>
@@ -10792,19 +10736,7 @@
             <w:rPr>
               <w:rFonts w:ascii="Cambria Math" w:eastAsiaTheme="minorEastAsia" w:hAnsi="Cambria Math"/>
             </w:rPr>
-            <m:t>mC</m:t>
-          </m:r>
-          <m:r>
-            <w:rPr>
-              <w:rFonts w:ascii="Cambria Math" w:eastAsiaTheme="minorEastAsia" w:hAnsi="Cambria Math"/>
-            </w:rPr>
-            <m:t>=m×</m:t>
-          </m:r>
-          <m:r>
-            <w:rPr>
-              <w:rFonts w:ascii="Cambria Math" w:eastAsiaTheme="minorEastAsia" w:hAnsi="Cambria Math"/>
-            </w:rPr>
-            <m:t>c</m:t>
+            <m:t>mC=m×c</m:t>
           </m:r>
         </m:oMath>
       </m:oMathPara>
@@ -10847,31 +10779,7 @@
             <w:rPr>
               <w:rFonts w:ascii="Cambria Math" w:eastAsiaTheme="minorEastAsia" w:hAnsi="Cambria Math"/>
             </w:rPr>
-            <m:t>=</m:t>
-          </m:r>
-          <m:r>
-            <w:rPr>
-              <w:rFonts w:ascii="Cambria Math" w:eastAsiaTheme="minorEastAsia" w:hAnsi="Cambria Math"/>
-            </w:rPr>
-            <m:t>m</m:t>
-          </m:r>
-          <m:r>
-            <w:rPr>
-              <w:rFonts w:ascii="Cambria Math" w:eastAsiaTheme="minorEastAsia" w:hAnsi="Cambria Math"/>
-            </w:rPr>
-            <m:t>_flow</m:t>
-          </m:r>
-          <m:r>
-            <w:rPr>
-              <w:rFonts w:ascii="Cambria Math" w:eastAsiaTheme="minorEastAsia" w:hAnsi="Cambria Math"/>
-            </w:rPr>
-            <m:t xml:space="preserve"> </m:t>
-          </m:r>
-          <m:r>
-            <w:rPr>
-              <w:rFonts w:ascii="Cambria Math" w:eastAsiaTheme="minorEastAsia" w:hAnsi="Cambria Math"/>
-            </w:rPr>
-            <m:t xml:space="preserve"> </m:t>
+            <m:t xml:space="preserve">=m_flow  </m:t>
           </m:r>
         </m:oMath>
       </m:oMathPara>
@@ -10898,13 +10806,7 @@
                 <w:rPr>
                   <w:rFonts w:ascii="Cambria Math" w:hAnsi="Cambria Math"/>
                 </w:rPr>
-                <m:t>dm</m:t>
-              </m:r>
-              <m:r>
-                <w:rPr>
-                  <w:rFonts w:ascii="Cambria Math" w:hAnsi="Cambria Math"/>
-                </w:rPr>
-                <m:t>Xi</m:t>
+                <m:t>dmXi</m:t>
               </m:r>
             </m:num>
             <m:den>
@@ -10920,19 +10822,7 @@
             <w:rPr>
               <w:rFonts w:ascii="Cambria Math" w:eastAsiaTheme="minorEastAsia" w:hAnsi="Cambria Math"/>
             </w:rPr>
-            <m:t>=m</m:t>
-          </m:r>
-          <m:r>
-            <w:rPr>
-              <w:rFonts w:ascii="Cambria Math" w:eastAsiaTheme="minorEastAsia" w:hAnsi="Cambria Math"/>
-            </w:rPr>
-            <m:t>Xi</m:t>
-          </m:r>
-          <m:r>
-            <w:rPr>
-              <w:rFonts w:ascii="Cambria Math" w:eastAsiaTheme="minorEastAsia" w:hAnsi="Cambria Math"/>
-            </w:rPr>
-            <m:t xml:space="preserve">_flow  </m:t>
+            <m:t xml:space="preserve">=mXi_flow  </m:t>
           </m:r>
         </m:oMath>
       </m:oMathPara>
@@ -10975,22 +10865,1085 @@
             <w:rPr>
               <w:rFonts w:ascii="Cambria Math" w:eastAsiaTheme="minorEastAsia" w:hAnsi="Cambria Math"/>
             </w:rPr>
-            <m:t>=Q_flow</m:t>
-          </m:r>
-          <m:r>
-            <w:rPr>
-              <w:rFonts w:ascii="Cambria Math" w:eastAsiaTheme="minorEastAsia" w:hAnsi="Cambria Math"/>
-            </w:rPr>
-            <m:t>+</m:t>
-          </m:r>
-          <m:r>
-            <w:rPr>
-              <w:rFonts w:ascii="Cambria Math" w:eastAsiaTheme="minorEastAsia" w:hAnsi="Cambria Math"/>
-            </w:rPr>
-            <m:t xml:space="preserve"> H_flow</m:t>
+            <m:t>=Q_flow+ H_flow</m:t>
           </m:r>
         </m:oMath>
       </m:oMathPara>
+    </w:p>
+    <w:p>
+      <w:pPr>
+        <w:rPr>
+          <w:rFonts w:eastAsiaTheme="minorEastAsia"/>
+        </w:rPr>
+      </w:pPr>
+    </w:p>
+    <w:p>
+      <w:pPr>
+        <w:pStyle w:val="Titre3"/>
+      </w:pPr>
+      <w:proofErr w:type="spellStart"/>
+      <w:r>
+        <w:lastRenderedPageBreak/>
+        <w:t>FogModel</w:t>
+      </w:r>
+      <w:proofErr w:type="spellEnd"/>
+    </w:p>
+    <w:p/>
+    <w:p>
+      <m:oMathPara>
+        <m:oMath>
+          <m:r>
+            <w:rPr>
+              <w:rFonts w:ascii="Cambria Math" w:eastAsiaTheme="minorEastAsia" w:hAnsi="Cambria Math"/>
+            </w:rPr>
+            <m:t>d_sat=</m:t>
+          </m:r>
+          <m:f>
+            <m:fPr>
+              <m:ctrlPr>
+                <w:rPr>
+                  <w:rFonts w:ascii="Cambria Math" w:eastAsiaTheme="minorEastAsia" w:hAnsi="Cambria Math"/>
+                  <w:i/>
+                </w:rPr>
+              </m:ctrlPr>
+            </m:fPr>
+            <m:num>
+              <m:r>
+                <w:rPr>
+                  <w:rFonts w:ascii="Cambria Math" w:eastAsiaTheme="minorEastAsia" w:hAnsi="Cambria Math"/>
+                </w:rPr>
+                <m:t>p_sat(T)</m:t>
+              </m:r>
+            </m:num>
+            <m:den>
+              <m:f>
+                <m:fPr>
+                  <m:ctrlPr>
+                    <w:rPr>
+                      <w:rFonts w:ascii="Cambria Math" w:eastAsiaTheme="minorEastAsia" w:hAnsi="Cambria Math"/>
+                      <w:i/>
+                    </w:rPr>
+                  </m:ctrlPr>
+                </m:fPr>
+                <m:num>
+                  <m:r>
+                    <w:rPr>
+                      <w:rFonts w:ascii="Cambria Math" w:eastAsiaTheme="minorEastAsia" w:hAnsi="Cambria Math"/>
+                    </w:rPr>
+                    <m:t>R</m:t>
+                  </m:r>
+                </m:num>
+                <m:den>
+                  <m:sSub>
+                    <m:sSubPr>
+                      <m:ctrlPr>
+                        <w:rPr>
+                          <w:rFonts w:ascii="Cambria Math" w:eastAsiaTheme="minorEastAsia" w:hAnsi="Cambria Math"/>
+                          <w:i/>
+                        </w:rPr>
+                      </m:ctrlPr>
+                    </m:sSubPr>
+                    <m:e>
+                      <m:r>
+                        <w:rPr>
+                          <w:rFonts w:ascii="Cambria Math" w:eastAsiaTheme="minorEastAsia" w:hAnsi="Cambria Math"/>
+                        </w:rPr>
+                        <m:t>MM</m:t>
+                      </m:r>
+                    </m:e>
+                    <m:sub>
+                      <m:r>
+                        <w:rPr>
+                          <w:rFonts w:ascii="Cambria Math" w:eastAsiaTheme="minorEastAsia" w:hAnsi="Cambria Math"/>
+                        </w:rPr>
+                        <m:t>water</m:t>
+                      </m:r>
+                    </m:sub>
+                  </m:sSub>
+                </m:den>
+              </m:f>
+              <m:r>
+                <w:rPr>
+                  <w:rFonts w:ascii="Cambria Math" w:eastAsiaTheme="minorEastAsia" w:hAnsi="Cambria Math"/>
+                </w:rPr>
+                <m:t>×T</m:t>
+              </m:r>
+            </m:den>
+          </m:f>
+        </m:oMath>
+      </m:oMathPara>
+    </w:p>
+    <w:p>
+      <w:pPr>
+        <w:rPr>
+          <w:rFonts w:eastAsiaTheme="minorEastAsia"/>
+        </w:rPr>
+      </w:pPr>
+      <m:oMathPara>
+        <m:oMath>
+          <m:d>
+            <m:dPr>
+              <m:ctrlPr>
+                <w:rPr>
+                  <w:rFonts w:ascii="Cambria Math" w:eastAsiaTheme="minorEastAsia" w:hAnsi="Cambria Math"/>
+                  <w:i/>
+                </w:rPr>
+              </m:ctrlPr>
+            </m:dPr>
+            <m:e>
+              <m:r>
+                <w:rPr>
+                  <w:rFonts w:ascii="Cambria Math" w:eastAsiaTheme="minorEastAsia" w:hAnsi="Cambria Math"/>
+                </w:rPr>
+                <m:t xml:space="preserve">d_condensable -d_sat </m:t>
+              </m:r>
+            </m:e>
+          </m:d>
+          <m:r>
+            <w:rPr>
+              <w:rFonts w:ascii="Cambria Math" w:eastAsiaTheme="minorEastAsia" w:hAnsi="Cambria Math"/>
+            </w:rPr>
+            <m:t>×V=n_drops×</m:t>
+          </m:r>
+          <m:sSup>
+            <m:sSupPr>
+              <m:ctrlPr>
+                <w:rPr>
+                  <w:rFonts w:ascii="Cambria Math" w:eastAsiaTheme="minorEastAsia" w:hAnsi="Cambria Math"/>
+                  <w:i/>
+                </w:rPr>
+              </m:ctrlPr>
+            </m:sSupPr>
+            <m:e>
+              <m:r>
+                <w:rPr>
+                  <w:rFonts w:ascii="Cambria Math" w:eastAsiaTheme="minorEastAsia" w:hAnsi="Cambria Math"/>
+                </w:rPr>
+                <m:t>10</m:t>
+              </m:r>
+            </m:e>
+            <m:sup>
+              <m:r>
+                <w:rPr>
+                  <w:rFonts w:ascii="Cambria Math" w:eastAsiaTheme="minorEastAsia" w:hAnsi="Cambria Math"/>
+                </w:rPr>
+                <m:t>6</m:t>
+              </m:r>
+            </m:sup>
+          </m:sSup>
+          <m:r>
+            <w:rPr>
+              <w:rFonts w:ascii="Cambria Math" w:eastAsiaTheme="minorEastAsia" w:hAnsi="Cambria Math"/>
+            </w:rPr>
+            <m:t>×V</m:t>
+          </m:r>
+          <m:r>
+            <w:rPr>
+              <w:rFonts w:ascii="Cambria Math" w:eastAsiaTheme="minorEastAsia" w:hAnsi="Cambria Math"/>
+            </w:rPr>
+            <m:t>×</m:t>
+          </m:r>
+          <m:f>
+            <m:fPr>
+              <m:ctrlPr>
+                <w:rPr>
+                  <w:rFonts w:ascii="Cambria Math" w:eastAsiaTheme="minorEastAsia" w:hAnsi="Cambria Math"/>
+                  <w:i/>
+                </w:rPr>
+              </m:ctrlPr>
+            </m:fPr>
+            <m:num>
+              <m:r>
+                <w:rPr>
+                  <w:rFonts w:ascii="Cambria Math" w:eastAsiaTheme="minorEastAsia" w:hAnsi="Cambria Math"/>
+                </w:rPr>
+                <m:t>4</m:t>
+              </m:r>
+            </m:num>
+            <m:den>
+              <m:r>
+                <w:rPr>
+                  <w:rFonts w:ascii="Cambria Math" w:eastAsiaTheme="minorEastAsia" w:hAnsi="Cambria Math"/>
+                </w:rPr>
+                <m:t>3</m:t>
+              </m:r>
+            </m:den>
+          </m:f>
+          <m:r>
+            <w:rPr>
+              <w:rFonts w:ascii="Cambria Math" w:eastAsiaTheme="minorEastAsia" w:hAnsi="Cambria Math"/>
+            </w:rPr>
+            <m:t>×π×</m:t>
+          </m:r>
+          <m:sSup>
+            <m:sSupPr>
+              <m:ctrlPr>
+                <w:rPr>
+                  <w:rFonts w:ascii="Cambria Math" w:eastAsiaTheme="minorEastAsia" w:hAnsi="Cambria Math"/>
+                  <w:i/>
+                </w:rPr>
+              </m:ctrlPr>
+            </m:sSupPr>
+            <m:e>
+              <m:d>
+                <m:dPr>
+                  <m:ctrlPr>
+                    <w:rPr>
+                      <w:rFonts w:ascii="Cambria Math" w:eastAsiaTheme="minorEastAsia" w:hAnsi="Cambria Math"/>
+                      <w:i/>
+                    </w:rPr>
+                  </m:ctrlPr>
+                </m:dPr>
+                <m:e>
+                  <m:f>
+                    <m:fPr>
+                      <m:ctrlPr>
+                        <w:rPr>
+                          <w:rFonts w:ascii="Cambria Math" w:eastAsiaTheme="minorEastAsia" w:hAnsi="Cambria Math"/>
+                          <w:i/>
+                        </w:rPr>
+                      </m:ctrlPr>
+                    </m:fPr>
+                    <m:num>
+                      <m:r>
+                        <w:rPr>
+                          <w:rFonts w:ascii="Cambria Math" w:eastAsiaTheme="minorEastAsia" w:hAnsi="Cambria Math"/>
+                        </w:rPr>
+                        <m:t>d_drop</m:t>
+                      </m:r>
+                    </m:num>
+                    <m:den>
+                      <m:r>
+                        <w:rPr>
+                          <w:rFonts w:ascii="Cambria Math" w:eastAsiaTheme="minorEastAsia" w:hAnsi="Cambria Math"/>
+                        </w:rPr>
+                        <m:t>2</m:t>
+                      </m:r>
+                    </m:den>
+                  </m:f>
+                </m:e>
+              </m:d>
+            </m:e>
+            <m:sup>
+              <m:r>
+                <w:rPr>
+                  <w:rFonts w:ascii="Cambria Math" w:eastAsiaTheme="minorEastAsia" w:hAnsi="Cambria Math"/>
+                </w:rPr>
+                <m:t>3</m:t>
+              </m:r>
+            </m:sup>
+          </m:sSup>
+        </m:oMath>
+      </m:oMathPara>
+    </w:p>
+    <w:p>
+      <w:pPr>
+        <w:rPr>
+          <w:rFonts w:eastAsiaTheme="minorEastAsia"/>
+        </w:rPr>
+      </w:pPr>
+    </w:p>
+    <w:p>
+      <w:pPr>
+        <w:rPr>
+          <w:rFonts w:eastAsiaTheme="minorEastAsia"/>
+        </w:rPr>
+      </w:pPr>
+      <m:oMathPara>
+        <m:oMath>
+          <m:sSub>
+            <m:sSubPr>
+              <m:ctrlPr>
+                <w:rPr>
+                  <w:rFonts w:ascii="Cambria Math" w:eastAsiaTheme="minorEastAsia" w:hAnsi="Cambria Math"/>
+                  <w:i/>
+                </w:rPr>
+              </m:ctrlPr>
+            </m:sSubPr>
+            <m:e>
+              <m:r>
+                <w:rPr>
+                  <w:rFonts w:ascii="Cambria Math" w:eastAsiaTheme="minorEastAsia" w:hAnsi="Cambria Math"/>
+                </w:rPr>
+                <m:t>F</m:t>
+              </m:r>
+            </m:e>
+            <m:sub>
+              <m:r>
+                <w:rPr>
+                  <w:rFonts w:ascii="Cambria Math" w:eastAsiaTheme="minorEastAsia" w:hAnsi="Cambria Math"/>
+                </w:rPr>
+                <m:t>drag</m:t>
+              </m:r>
+            </m:sub>
+          </m:sSub>
+          <m:r>
+            <w:rPr>
+              <w:rFonts w:ascii="Cambria Math" w:eastAsiaTheme="minorEastAsia" w:hAnsi="Cambria Math"/>
+            </w:rPr>
+            <m:t>=</m:t>
+          </m:r>
+          <m:r>
+            <w:rPr>
+              <w:rFonts w:ascii="Cambria Math" w:eastAsiaTheme="minorEastAsia" w:hAnsi="Cambria Math"/>
+            </w:rPr>
+            <m:t>12×</m:t>
+          </m:r>
+          <m:r>
+            <w:rPr>
+              <w:rFonts w:ascii="Cambria Math" w:eastAsiaTheme="minorEastAsia" w:hAnsi="Cambria Math"/>
+            </w:rPr>
+            <m:t>π×</m:t>
+          </m:r>
+          <m:sSub>
+            <m:sSubPr>
+              <m:ctrlPr>
+                <w:rPr>
+                  <w:rFonts w:ascii="Cambria Math" w:eastAsiaTheme="minorEastAsia" w:hAnsi="Cambria Math"/>
+                  <w:i/>
+                </w:rPr>
+              </m:ctrlPr>
+            </m:sSubPr>
+            <m:e>
+              <m:r>
+                <w:rPr>
+                  <w:rFonts w:ascii="Cambria Math" w:eastAsiaTheme="minorEastAsia" w:hAnsi="Cambria Math"/>
+                </w:rPr>
+                <m:t>μ</m:t>
+              </m:r>
+            </m:e>
+            <m:sub>
+              <m:r>
+                <w:rPr>
+                  <w:rFonts w:ascii="Cambria Math" w:eastAsiaTheme="minorEastAsia" w:hAnsi="Cambria Math"/>
+                </w:rPr>
+                <m:t>fluid</m:t>
+              </m:r>
+            </m:sub>
+          </m:sSub>
+          <m:r>
+            <w:rPr>
+              <w:rFonts w:ascii="Cambria Math" w:eastAsiaTheme="minorEastAsia" w:hAnsi="Cambria Math"/>
+            </w:rPr>
+            <m:t>×d_drop×Vel</m:t>
+          </m:r>
+        </m:oMath>
+      </m:oMathPara>
+    </w:p>
+    <w:p>
+      <w:pPr>
+        <w:rPr>
+          <w:rFonts w:eastAsiaTheme="minorEastAsia"/>
+        </w:rPr>
+      </w:pPr>
+      <m:oMathPara>
+        <m:oMath>
+          <m:r>
+            <w:rPr>
+              <w:rFonts w:ascii="Cambria Math" w:eastAsiaTheme="minorEastAsia" w:hAnsi="Cambria Math"/>
+            </w:rPr>
+            <m:t>P</m:t>
+          </m:r>
+          <m:r>
+            <w:rPr>
+              <w:rFonts w:ascii="Cambria Math" w:eastAsiaTheme="minorEastAsia" w:hAnsi="Cambria Math"/>
+            </w:rPr>
+            <m:t>=</m:t>
+          </m:r>
+          <m:r>
+            <w:rPr>
+              <w:rFonts w:ascii="Cambria Math" w:eastAsiaTheme="minorEastAsia" w:hAnsi="Cambria Math"/>
+            </w:rPr>
+            <m:t xml:space="preserve"> </m:t>
+          </m:r>
+          <m:r>
+            <w:rPr>
+              <w:rFonts w:ascii="Cambria Math" w:eastAsiaTheme="minorEastAsia" w:hAnsi="Cambria Math"/>
+            </w:rPr>
+            <m:t>-</m:t>
+          </m:r>
+          <m:sSub>
+            <m:sSubPr>
+              <m:ctrlPr>
+                <w:rPr>
+                  <w:rFonts w:ascii="Cambria Math" w:eastAsiaTheme="minorEastAsia" w:hAnsi="Cambria Math"/>
+                  <w:i/>
+                </w:rPr>
+              </m:ctrlPr>
+            </m:sSubPr>
+            <m:e>
+              <m:r>
+                <w:rPr>
+                  <w:rFonts w:ascii="Cambria Math" w:eastAsiaTheme="minorEastAsia" w:hAnsi="Cambria Math"/>
+                </w:rPr>
+                <m:t>d</m:t>
+              </m:r>
+            </m:e>
+            <m:sub>
+              <m:r>
+                <w:rPr>
+                  <w:rFonts w:ascii="Cambria Math" w:eastAsiaTheme="minorEastAsia" w:hAnsi="Cambria Math"/>
+                </w:rPr>
+                <m:t>droplet</m:t>
+              </m:r>
+            </m:sub>
+          </m:sSub>
+          <m:r>
+            <w:rPr>
+              <w:rFonts w:ascii="Cambria Math" w:eastAsiaTheme="minorEastAsia" w:hAnsi="Cambria Math"/>
+            </w:rPr>
+            <m:t>×</m:t>
+          </m:r>
+          <m:f>
+            <m:fPr>
+              <m:ctrlPr>
+                <w:rPr>
+                  <w:rFonts w:ascii="Cambria Math" w:eastAsiaTheme="minorEastAsia" w:hAnsi="Cambria Math"/>
+                  <w:i/>
+                </w:rPr>
+              </m:ctrlPr>
+            </m:fPr>
+            <m:num>
+              <m:r>
+                <w:rPr>
+                  <w:rFonts w:ascii="Cambria Math" w:eastAsiaTheme="minorEastAsia" w:hAnsi="Cambria Math"/>
+                </w:rPr>
+                <m:t>4</m:t>
+              </m:r>
+            </m:num>
+            <m:den>
+              <m:r>
+                <w:rPr>
+                  <w:rFonts w:ascii="Cambria Math" w:eastAsiaTheme="minorEastAsia" w:hAnsi="Cambria Math"/>
+                </w:rPr>
+                <m:t>3</m:t>
+              </m:r>
+            </m:den>
+          </m:f>
+          <m:r>
+            <w:rPr>
+              <w:rFonts w:ascii="Cambria Math" w:eastAsiaTheme="minorEastAsia" w:hAnsi="Cambria Math"/>
+            </w:rPr>
+            <m:t>×π×</m:t>
+          </m:r>
+          <m:sSup>
+            <m:sSupPr>
+              <m:ctrlPr>
+                <w:rPr>
+                  <w:rFonts w:ascii="Cambria Math" w:eastAsiaTheme="minorEastAsia" w:hAnsi="Cambria Math"/>
+                  <w:i/>
+                </w:rPr>
+              </m:ctrlPr>
+            </m:sSupPr>
+            <m:e>
+              <m:d>
+                <m:dPr>
+                  <m:ctrlPr>
+                    <w:rPr>
+                      <w:rFonts w:ascii="Cambria Math" w:eastAsiaTheme="minorEastAsia" w:hAnsi="Cambria Math"/>
+                      <w:i/>
+                    </w:rPr>
+                  </m:ctrlPr>
+                </m:dPr>
+                <m:e>
+                  <m:f>
+                    <m:fPr>
+                      <m:ctrlPr>
+                        <w:rPr>
+                          <w:rFonts w:ascii="Cambria Math" w:eastAsiaTheme="minorEastAsia" w:hAnsi="Cambria Math"/>
+                          <w:i/>
+                        </w:rPr>
+                      </m:ctrlPr>
+                    </m:fPr>
+                    <m:num>
+                      <m:r>
+                        <w:rPr>
+                          <w:rFonts w:ascii="Cambria Math" w:eastAsiaTheme="minorEastAsia" w:hAnsi="Cambria Math"/>
+                        </w:rPr>
+                        <m:t>d_drop</m:t>
+                      </m:r>
+                    </m:num>
+                    <m:den>
+                      <m:r>
+                        <w:rPr>
+                          <w:rFonts w:ascii="Cambria Math" w:eastAsiaTheme="minorEastAsia" w:hAnsi="Cambria Math"/>
+                        </w:rPr>
+                        <m:t>2</m:t>
+                      </m:r>
+                    </m:den>
+                  </m:f>
+                </m:e>
+              </m:d>
+            </m:e>
+            <m:sup>
+              <m:r>
+                <w:rPr>
+                  <w:rFonts w:ascii="Cambria Math" w:eastAsiaTheme="minorEastAsia" w:hAnsi="Cambria Math"/>
+                </w:rPr>
+                <m:t>3</m:t>
+              </m:r>
+            </m:sup>
+          </m:sSup>
+          <m:r>
+            <w:rPr>
+              <w:rFonts w:ascii="Cambria Math" w:eastAsiaTheme="minorEastAsia" w:hAnsi="Cambria Math"/>
+            </w:rPr>
+            <m:t>×g</m:t>
+          </m:r>
+        </m:oMath>
+      </m:oMathPara>
+    </w:p>
+    <w:p>
+      <w:pPr>
+        <w:rPr>
+          <w:rFonts w:eastAsiaTheme="minorEastAsia"/>
+        </w:rPr>
+      </w:pPr>
+      <m:oMathPara>
+        <m:oMath>
+          <m:r>
+            <w:rPr>
+              <w:rFonts w:ascii="Cambria Math" w:eastAsiaTheme="minorEastAsia" w:hAnsi="Cambria Math"/>
+            </w:rPr>
+            <m:t>Π</m:t>
+          </m:r>
+          <m:r>
+            <w:rPr>
+              <w:rFonts w:ascii="Cambria Math" w:eastAsiaTheme="minorEastAsia" w:hAnsi="Cambria Math"/>
+            </w:rPr>
+            <m:t xml:space="preserve">=  </m:t>
+          </m:r>
+          <m:sSub>
+            <m:sSubPr>
+              <m:ctrlPr>
+                <w:rPr>
+                  <w:rFonts w:ascii="Cambria Math" w:eastAsiaTheme="minorEastAsia" w:hAnsi="Cambria Math"/>
+                  <w:i/>
+                </w:rPr>
+              </m:ctrlPr>
+            </m:sSubPr>
+            <m:e>
+              <m:r>
+                <w:rPr>
+                  <w:rFonts w:ascii="Cambria Math" w:eastAsiaTheme="minorEastAsia" w:hAnsi="Cambria Math"/>
+                </w:rPr>
+                <m:t>d</m:t>
+              </m:r>
+            </m:e>
+            <m:sub>
+              <m:r>
+                <w:rPr>
+                  <w:rFonts w:ascii="Cambria Math" w:eastAsiaTheme="minorEastAsia" w:hAnsi="Cambria Math"/>
+                </w:rPr>
+                <m:t>fluid</m:t>
+              </m:r>
+            </m:sub>
+          </m:sSub>
+          <m:r>
+            <w:rPr>
+              <w:rFonts w:ascii="Cambria Math" w:eastAsiaTheme="minorEastAsia" w:hAnsi="Cambria Math"/>
+            </w:rPr>
+            <m:t>×</m:t>
+          </m:r>
+          <m:f>
+            <m:fPr>
+              <m:ctrlPr>
+                <w:rPr>
+                  <w:rFonts w:ascii="Cambria Math" w:eastAsiaTheme="minorEastAsia" w:hAnsi="Cambria Math"/>
+                  <w:i/>
+                </w:rPr>
+              </m:ctrlPr>
+            </m:fPr>
+            <m:num>
+              <m:r>
+                <w:rPr>
+                  <w:rFonts w:ascii="Cambria Math" w:eastAsiaTheme="minorEastAsia" w:hAnsi="Cambria Math"/>
+                </w:rPr>
+                <m:t>4</m:t>
+              </m:r>
+            </m:num>
+            <m:den>
+              <m:r>
+                <w:rPr>
+                  <w:rFonts w:ascii="Cambria Math" w:eastAsiaTheme="minorEastAsia" w:hAnsi="Cambria Math"/>
+                </w:rPr>
+                <m:t>3</m:t>
+              </m:r>
+            </m:den>
+          </m:f>
+          <m:r>
+            <w:rPr>
+              <w:rFonts w:ascii="Cambria Math" w:eastAsiaTheme="minorEastAsia" w:hAnsi="Cambria Math"/>
+            </w:rPr>
+            <m:t>×π×</m:t>
+          </m:r>
+          <m:sSup>
+            <m:sSupPr>
+              <m:ctrlPr>
+                <w:rPr>
+                  <w:rFonts w:ascii="Cambria Math" w:eastAsiaTheme="minorEastAsia" w:hAnsi="Cambria Math"/>
+                  <w:i/>
+                </w:rPr>
+              </m:ctrlPr>
+            </m:sSupPr>
+            <m:e>
+              <m:d>
+                <m:dPr>
+                  <m:ctrlPr>
+                    <w:rPr>
+                      <w:rFonts w:ascii="Cambria Math" w:eastAsiaTheme="minorEastAsia" w:hAnsi="Cambria Math"/>
+                      <w:i/>
+                    </w:rPr>
+                  </m:ctrlPr>
+                </m:dPr>
+                <m:e>
+                  <m:f>
+                    <m:fPr>
+                      <m:ctrlPr>
+                        <w:rPr>
+                          <w:rFonts w:ascii="Cambria Math" w:eastAsiaTheme="minorEastAsia" w:hAnsi="Cambria Math"/>
+                          <w:i/>
+                        </w:rPr>
+                      </m:ctrlPr>
+                    </m:fPr>
+                    <m:num>
+                      <m:r>
+                        <w:rPr>
+                          <w:rFonts w:ascii="Cambria Math" w:eastAsiaTheme="minorEastAsia" w:hAnsi="Cambria Math"/>
+                        </w:rPr>
+                        <m:t>d_drop</m:t>
+                      </m:r>
+                    </m:num>
+                    <m:den>
+                      <m:r>
+                        <w:rPr>
+                          <w:rFonts w:ascii="Cambria Math" w:eastAsiaTheme="minorEastAsia" w:hAnsi="Cambria Math"/>
+                        </w:rPr>
+                        <m:t>2</m:t>
+                      </m:r>
+                    </m:den>
+                  </m:f>
+                </m:e>
+              </m:d>
+            </m:e>
+            <m:sup>
+              <m:r>
+                <w:rPr>
+                  <w:rFonts w:ascii="Cambria Math" w:eastAsiaTheme="minorEastAsia" w:hAnsi="Cambria Math"/>
+                </w:rPr>
+                <m:t>3</m:t>
+              </m:r>
+            </m:sup>
+          </m:sSup>
+          <m:r>
+            <w:rPr>
+              <w:rFonts w:ascii="Cambria Math" w:eastAsiaTheme="minorEastAsia" w:hAnsi="Cambria Math"/>
+            </w:rPr>
+            <m:t>×g</m:t>
+          </m:r>
+        </m:oMath>
+      </m:oMathPara>
+    </w:p>
+    <w:p>
+      <w:pPr>
+        <w:rPr>
+          <w:rFonts w:eastAsiaTheme="minorEastAsia"/>
+        </w:rPr>
+      </w:pPr>
+      <m:oMathPara>
+        <m:oMath>
+          <m:r>
+            <w:rPr>
+              <w:rFonts w:ascii="Cambria Math" w:eastAsiaTheme="minorEastAsia" w:hAnsi="Cambria Math"/>
+            </w:rPr>
+            <m:t>Π</m:t>
+          </m:r>
+          <m:r>
+            <w:rPr>
+              <w:rFonts w:ascii="Cambria Math" w:eastAsiaTheme="minorEastAsia" w:hAnsi="Cambria Math"/>
+            </w:rPr>
+            <m:t>+</m:t>
+          </m:r>
+          <m:sSub>
+            <m:sSubPr>
+              <m:ctrlPr>
+                <w:rPr>
+                  <w:rFonts w:ascii="Cambria Math" w:eastAsiaTheme="minorEastAsia" w:hAnsi="Cambria Math"/>
+                  <w:i/>
+                </w:rPr>
+              </m:ctrlPr>
+            </m:sSubPr>
+            <m:e>
+              <m:r>
+                <w:rPr>
+                  <w:rFonts w:ascii="Cambria Math" w:eastAsiaTheme="minorEastAsia" w:hAnsi="Cambria Math"/>
+                </w:rPr>
+                <m:t>F</m:t>
+              </m:r>
+            </m:e>
+            <m:sub>
+              <m:r>
+                <w:rPr>
+                  <w:rFonts w:ascii="Cambria Math" w:eastAsiaTheme="minorEastAsia" w:hAnsi="Cambria Math"/>
+                </w:rPr>
+                <m:t>drag</m:t>
+              </m:r>
+            </m:sub>
+          </m:sSub>
+          <m:r>
+            <w:rPr>
+              <w:rFonts w:ascii="Cambria Math" w:eastAsiaTheme="minorEastAsia" w:hAnsi="Cambria Math"/>
+            </w:rPr>
+            <m:t>+P=0</m:t>
+          </m:r>
+        </m:oMath>
+      </m:oMathPara>
+    </w:p>
+    <w:p>
+      <w:pPr>
+        <w:rPr>
+          <w:rFonts w:eastAsiaTheme="minorEastAsia"/>
+        </w:rPr>
+      </w:pPr>
+      <m:oMathPara>
+        <m:oMath>
+          <m:r>
+            <w:rPr>
+              <w:rFonts w:ascii="Cambria Math" w:eastAsiaTheme="minorEastAsia" w:hAnsi="Cambria Math"/>
+            </w:rPr>
+            <m:t>m_flow</m:t>
+          </m:r>
+          <m:r>
+            <w:rPr>
+              <w:rFonts w:ascii="Cambria Math" w:eastAsiaTheme="minorEastAsia" w:hAnsi="Cambria Math"/>
+            </w:rPr>
+            <m:t xml:space="preserve">= </m:t>
+          </m:r>
+          <m:sSub>
+            <m:sSubPr>
+              <m:ctrlPr>
+                <w:rPr>
+                  <w:rFonts w:ascii="Cambria Math" w:eastAsiaTheme="minorEastAsia" w:hAnsi="Cambria Math"/>
+                  <w:i/>
+                </w:rPr>
+              </m:ctrlPr>
+            </m:sSubPr>
+            <m:e>
+              <m:r>
+                <w:rPr>
+                  <w:rFonts w:ascii="Cambria Math" w:eastAsiaTheme="minorEastAsia" w:hAnsi="Cambria Math"/>
+                </w:rPr>
+                <m:t>d</m:t>
+              </m:r>
+            </m:e>
+            <m:sub>
+              <m:r>
+                <w:rPr>
+                  <w:rFonts w:ascii="Cambria Math" w:eastAsiaTheme="minorEastAsia" w:hAnsi="Cambria Math"/>
+                </w:rPr>
+                <m:t>droplet</m:t>
+              </m:r>
+            </m:sub>
+          </m:sSub>
+          <m:r>
+            <w:rPr>
+              <w:rFonts w:ascii="Cambria Math" w:eastAsiaTheme="minorEastAsia" w:hAnsi="Cambria Math"/>
+            </w:rPr>
+            <m:t>×</m:t>
+          </m:r>
+          <m:sSub>
+            <m:sSubPr>
+              <m:ctrlPr>
+                <w:rPr>
+                  <w:rFonts w:ascii="Cambria Math" w:eastAsiaTheme="minorEastAsia" w:hAnsi="Cambria Math"/>
+                  <w:i/>
+                </w:rPr>
+              </m:ctrlPr>
+            </m:sSubPr>
+            <m:e>
+              <m:r>
+                <w:rPr>
+                  <w:rFonts w:ascii="Cambria Math" w:eastAsiaTheme="minorEastAsia" w:hAnsi="Cambria Math"/>
+                </w:rPr>
+                <m:t>A</m:t>
+              </m:r>
+            </m:e>
+            <m:sub>
+              <m:r>
+                <w:rPr>
+                  <w:rFonts w:ascii="Cambria Math" w:eastAsiaTheme="minorEastAsia" w:hAnsi="Cambria Math"/>
+                </w:rPr>
+                <m:t>liquid</m:t>
+              </m:r>
+            </m:sub>
+          </m:sSub>
+          <m:r>
+            <w:rPr>
+              <w:rFonts w:ascii="Cambria Math" w:eastAsiaTheme="minorEastAsia" w:hAnsi="Cambria Math"/>
+            </w:rPr>
+            <m:t>×</m:t>
+          </m:r>
+          <m:r>
+            <w:rPr>
+              <w:rFonts w:ascii="Cambria Math" w:eastAsiaTheme="minorEastAsia" w:hAnsi="Cambria Math"/>
+            </w:rPr>
+            <m:t xml:space="preserve"> </m:t>
+          </m:r>
+          <m:r>
+            <w:rPr>
+              <w:rFonts w:ascii="Cambria Math" w:eastAsiaTheme="minorEastAsia" w:hAnsi="Cambria Math"/>
+            </w:rPr>
+            <m:t>Vel</m:t>
+          </m:r>
+        </m:oMath>
+      </m:oMathPara>
+    </w:p>
+    <w:p>
+      <w:pPr>
+        <w:rPr>
+          <w:rFonts w:eastAsiaTheme="minorEastAsia"/>
+        </w:rPr>
+      </w:pPr>
+      <m:oMathPara>
+        <m:oMath>
+          <m:sSub>
+            <m:sSubPr>
+              <m:ctrlPr>
+                <w:rPr>
+                  <w:rFonts w:ascii="Cambria Math" w:eastAsiaTheme="minorEastAsia" w:hAnsi="Cambria Math"/>
+                  <w:i/>
+                </w:rPr>
+              </m:ctrlPr>
+            </m:sSubPr>
+            <m:e>
+              <m:r>
+                <w:rPr>
+                  <w:rFonts w:ascii="Cambria Math" w:eastAsiaTheme="minorEastAsia" w:hAnsi="Cambria Math"/>
+                </w:rPr>
+                <m:t>A</m:t>
+              </m:r>
+            </m:e>
+            <m:sub>
+              <m:r>
+                <w:rPr>
+                  <w:rFonts w:ascii="Cambria Math" w:eastAsiaTheme="minorEastAsia" w:hAnsi="Cambria Math"/>
+                </w:rPr>
+                <m:t>liquid</m:t>
+              </m:r>
+            </m:sub>
+          </m:sSub>
+          <m:r>
+            <w:rPr>
+              <w:rFonts w:ascii="Cambria Math" w:eastAsiaTheme="minorEastAsia" w:hAnsi="Cambria Math"/>
+            </w:rPr>
+            <m:t>≅</m:t>
+          </m:r>
+          <m:r>
+            <w:rPr>
+              <w:rFonts w:ascii="Cambria Math" w:eastAsiaTheme="minorEastAsia" w:hAnsi="Cambria Math"/>
+            </w:rPr>
+            <m:t xml:space="preserve"> </m:t>
+          </m:r>
+          <m:sSub>
+            <m:sSubPr>
+              <m:ctrlPr>
+                <w:rPr>
+                  <w:rFonts w:ascii="Cambria Math" w:eastAsiaTheme="minorEastAsia" w:hAnsi="Cambria Math"/>
+                  <w:i/>
+                </w:rPr>
+              </m:ctrlPr>
+            </m:sSubPr>
+            <m:e>
+              <m:r>
+                <w:rPr>
+                  <w:rFonts w:ascii="Cambria Math" w:eastAsiaTheme="minorEastAsia" w:hAnsi="Cambria Math"/>
+                </w:rPr>
+                <m:t>A</m:t>
+              </m:r>
+            </m:e>
+            <m:sub>
+              <m:r>
+                <w:rPr>
+                  <w:rFonts w:ascii="Cambria Math" w:eastAsiaTheme="minorEastAsia" w:hAnsi="Cambria Math"/>
+                </w:rPr>
+                <m:t>ground gas node</m:t>
+              </m:r>
+            </m:sub>
+          </m:sSub>
+          <m:r>
+            <w:rPr>
+              <w:rFonts w:ascii="Cambria Math" w:eastAsiaTheme="minorEastAsia" w:hAnsi="Cambria Math"/>
+            </w:rPr>
+            <m:t>×</m:t>
+          </m:r>
+          <m:r>
+            <w:rPr>
+              <w:rFonts w:ascii="Cambria Math" w:eastAsiaTheme="minorEastAsia" w:hAnsi="Cambria Math"/>
+            </w:rPr>
+            <m:t>n_drop×</m:t>
+          </m:r>
+          <m:f>
+            <m:fPr>
+              <m:ctrlPr>
+                <w:rPr>
+                  <w:rFonts w:ascii="Cambria Math" w:eastAsiaTheme="minorEastAsia" w:hAnsi="Cambria Math"/>
+                  <w:i/>
+                </w:rPr>
+              </m:ctrlPr>
+            </m:fPr>
+            <m:num>
+              <m:r>
+                <w:rPr>
+                  <w:rFonts w:ascii="Cambria Math" w:eastAsiaTheme="minorEastAsia" w:hAnsi="Cambria Math"/>
+                </w:rPr>
+                <m:t>π×</m:t>
+              </m:r>
+              <m:sSup>
+                <m:sSupPr>
+                  <m:ctrlPr>
+                    <w:rPr>
+                      <w:rFonts w:ascii="Cambria Math" w:eastAsiaTheme="minorEastAsia" w:hAnsi="Cambria Math"/>
+                      <w:i/>
+                    </w:rPr>
+                  </m:ctrlPr>
+                </m:sSupPr>
+                <m:e>
+                  <m:r>
+                    <w:rPr>
+                      <w:rFonts w:ascii="Cambria Math" w:eastAsiaTheme="minorEastAsia" w:hAnsi="Cambria Math"/>
+                    </w:rPr>
+                    <m:t>d_drop</m:t>
+                  </m:r>
+                </m:e>
+                <m:sup>
+                  <m:r>
+                    <w:rPr>
+                      <w:rFonts w:ascii="Cambria Math" w:eastAsiaTheme="minorEastAsia" w:hAnsi="Cambria Math"/>
+                    </w:rPr>
+                    <m:t>3</m:t>
+                  </m:r>
+                </m:sup>
+              </m:sSup>
+            </m:num>
+            <m:den>
+              <m:r>
+                <w:rPr>
+                  <w:rFonts w:ascii="Cambria Math" w:eastAsiaTheme="minorEastAsia" w:hAnsi="Cambria Math"/>
+                </w:rPr>
+                <m:t>6</m:t>
+              </m:r>
+            </m:den>
+          </m:f>
+        </m:oMath>
+      </m:oMathPara>
+    </w:p>
+    <w:p>
+      <w:pPr>
+        <w:rPr>
+          <w:rFonts w:eastAsiaTheme="minorEastAsia"/>
+        </w:rPr>
+      </w:pPr>
+    </w:p>
+    <w:p>
+      <w:pPr>
+        <w:rPr>
+          <w:rFonts w:eastAsiaTheme="minorEastAsia"/>
+        </w:rPr>
+      </w:pPr>
+      <m:oMathPara>
+        <m:oMath>
+          <m:f>
+            <m:fPr>
+              <m:ctrlPr>
+                <w:rPr>
+                  <w:rFonts w:ascii="Cambria Math" w:eastAsiaTheme="minorEastAsia" w:hAnsi="Cambria Math"/>
+                  <w:i/>
+                </w:rPr>
+              </m:ctrlPr>
+            </m:fPr>
+            <m:num>
+              <m:r>
+                <w:rPr>
+                  <w:rFonts w:ascii="Cambria Math" w:hAnsi="Cambria Math"/>
+                </w:rPr>
+                <m:t>dmXi</m:t>
+              </m:r>
+            </m:num>
+            <m:den>
+              <m:r>
+                <w:rPr>
+                  <w:rFonts w:ascii="Cambria Math" w:hAnsi="Cambria Math"/>
+                </w:rPr>
+                <m:t>dt</m:t>
+              </m:r>
+            </m:den>
+          </m:f>
+          <m:r>
+            <w:rPr>
+              <w:rFonts w:ascii="Cambria Math" w:eastAsiaTheme="minorEastAsia" w:hAnsi="Cambria Math"/>
+            </w:rPr>
+            <m:t xml:space="preserve">=mXi_flow  </m:t>
+          </m:r>
+        </m:oMath>
+      </m:oMathPara>
+      <w:bookmarkStart w:id="29" w:name="_GoBack"/>
+      <w:bookmarkEnd w:id="29"/>
+    </w:p>
+    <w:p>
+      <w:pPr>
+        <w:rPr>
+          <w:rFonts w:eastAsiaTheme="minorEastAsia"/>
+        </w:rPr>
+      </w:pPr>
+      <m:oMathPara>
+        <m:oMath>
+          <m:f>
+            <m:fPr>
+              <m:ctrlPr>
+                <w:rPr>
+                  <w:rFonts w:ascii="Cambria Math" w:eastAsiaTheme="minorEastAsia" w:hAnsi="Cambria Math"/>
+                  <w:i/>
+                </w:rPr>
+              </m:ctrlPr>
+            </m:fPr>
+            <m:num>
+              <m:r>
+                <w:rPr>
+                  <w:rFonts w:ascii="Cambria Math" w:hAnsi="Cambria Math"/>
+                </w:rPr>
+                <m:t>d</m:t>
+              </m:r>
+              <m:r>
+                <w:rPr>
+                  <w:rFonts w:ascii="Cambria Math" w:hAnsi="Cambria Math"/>
+                </w:rPr>
+                <m:t>U</m:t>
+              </m:r>
+            </m:num>
+            <m:den>
+              <m:r>
+                <w:rPr>
+                  <w:rFonts w:ascii="Cambria Math" w:hAnsi="Cambria Math"/>
+                </w:rPr>
+                <m:t>dt</m:t>
+              </m:r>
+            </m:den>
+          </m:f>
+          <m:r>
+            <w:rPr>
+              <w:rFonts w:ascii="Cambria Math" w:eastAsiaTheme="minorEastAsia" w:hAnsi="Cambria Math"/>
+            </w:rPr>
+            <m:t>=Q_flow+ H_flow</m:t>
+          </m:r>
+        </m:oMath>
+      </m:oMathPara>
+    </w:p>
+    <w:p>
+      <w:pPr>
+        <w:rPr>
+          <w:rFonts w:eastAsiaTheme="minorEastAsia"/>
+        </w:rPr>
+      </w:pPr>
     </w:p>
     <w:p>
       <w:pPr>
@@ -11007,7 +11960,6 @@
             <w:rPr>
               <w:rFonts w:ascii="Cambria Math" w:eastAsiaTheme="minorEastAsia" w:hAnsi="Cambria Math"/>
             </w:rPr>
-            <w:lastRenderedPageBreak/>
             <m:t>m_flow</m:t>
           </m:r>
           <m:r>
@@ -11142,13 +12094,7 @@
                 <w:rPr>
                   <w:rFonts w:ascii="Cambria Math" w:eastAsiaTheme="minorEastAsia" w:hAnsi="Cambria Math"/>
                 </w:rPr>
-                <m:t>j</m:t>
-              </m:r>
-              <m:r>
-                <w:rPr>
-                  <w:rFonts w:ascii="Cambria Math" w:eastAsiaTheme="minorEastAsia" w:hAnsi="Cambria Math"/>
-                </w:rPr>
-                <m:t>=1</m:t>
+                <m:t>j=1</m:t>
               </m:r>
             </m:sub>
             <m:sup>
@@ -11200,43 +12146,7 @@
                     <w:rPr>
                       <w:rFonts w:ascii="Cambria Math" w:eastAsiaTheme="minorEastAsia" w:hAnsi="Cambria Math"/>
                     </w:rPr>
-                    <m:t>.</m:t>
-                  </m:r>
-                  <m:r>
-                    <w:rPr>
-                      <w:rFonts w:ascii="Cambria Math" w:eastAsiaTheme="minorEastAsia" w:hAnsi="Cambria Math"/>
-                    </w:rPr>
-                    <m:t xml:space="preserve">m_flow </m:t>
-                  </m:r>
-                  <m:r>
-                    <w:rPr>
-                      <w:rFonts w:ascii="Cambria Math" w:eastAsiaTheme="minorEastAsia" w:hAnsi="Cambria Math"/>
-                    </w:rPr>
-                    <m:t>×actualStream(fluidPort[</m:t>
-                  </m:r>
-                  <m:r>
-                    <w:rPr>
-                      <w:rFonts w:ascii="Cambria Math" w:eastAsiaTheme="minorEastAsia" w:hAnsi="Cambria Math"/>
-                    </w:rPr>
-                    <m:t>j</m:t>
-                  </m:r>
-                  <m:r>
-                    <w:rPr>
-                      <w:rFonts w:ascii="Cambria Math" w:eastAsiaTheme="minorEastAsia" w:hAnsi="Cambria Math"/>
-                    </w:rPr>
-                    <m:t>].Xi_outflow</m:t>
-                  </m:r>
-                  <m:r>
-                    <w:rPr>
-                      <w:rFonts w:ascii="Cambria Math" w:eastAsiaTheme="minorEastAsia" w:hAnsi="Cambria Math"/>
-                    </w:rPr>
-                    <m:t>[i]</m:t>
-                  </m:r>
-                  <m:r>
-                    <w:rPr>
-                      <w:rFonts w:ascii="Cambria Math" w:eastAsiaTheme="minorEastAsia" w:hAnsi="Cambria Math"/>
-                    </w:rPr>
-                    <m:t>)</m:t>
+                    <m:t>.m_flow ×actualStream(fluidPort[j].Xi_outflow[i])</m:t>
                   </m:r>
                 </m:e>
               </m:d>
@@ -11272,19 +12182,7 @@
             <w:rPr>
               <w:rFonts w:ascii="Cambria Math" w:eastAsiaTheme="minorEastAsia" w:hAnsi="Cambria Math"/>
             </w:rPr>
-            <m:t>=</m:t>
-          </m:r>
-          <m:r>
-            <w:rPr>
-              <w:rFonts w:ascii="Cambria Math" w:eastAsiaTheme="minorEastAsia" w:hAnsi="Cambria Math"/>
-            </w:rPr>
-            <m:t>heatPort.Q</m:t>
-          </m:r>
-          <m:r>
-            <w:rPr>
-              <w:rFonts w:ascii="Cambria Math" w:eastAsiaTheme="minorEastAsia" w:hAnsi="Cambria Math"/>
-            </w:rPr>
-            <m:t xml:space="preserve">_flow  </m:t>
+            <m:t xml:space="preserve">=heatPort.Q_flow  </m:t>
           </m:r>
         </m:oMath>
       </m:oMathPara>
@@ -11354,19 +12252,13 @@
                     <w:rPr>
                       <w:rFonts w:ascii="Cambria Math" w:eastAsiaTheme="minorEastAsia" w:hAnsi="Cambria Math"/>
                     </w:rPr>
-                    <m:t>fluidPort.</m:t>
+                    <m:t>fluidPort.m_flow×actualStream(fluidPort.h_outflo</m:t>
                   </m:r>
                   <m:r>
                     <w:rPr>
                       <w:rFonts w:ascii="Cambria Math" w:eastAsiaTheme="minorEastAsia" w:hAnsi="Cambria Math"/>
                     </w:rPr>
-                    <m:t>m_flow</m:t>
-                  </m:r>
-                  <m:r>
-                    <w:rPr>
-                      <w:rFonts w:ascii="Cambria Math" w:eastAsiaTheme="minorEastAsia" w:hAnsi="Cambria Math"/>
-                    </w:rPr>
-                    <m:t>×actualStream(fluidPort.h_outflow)</m:t>
+                    <m:t>w)</m:t>
                   </m:r>
                 </m:e>
               </m:d>
@@ -11376,19 +12268,7 @@
             <w:rPr>
               <w:rFonts w:ascii="Cambria Math" w:eastAsiaTheme="minorEastAsia" w:hAnsi="Cambria Math"/>
             </w:rPr>
-            <m:t>+flowPort.</m:t>
-          </m:r>
-          <m:r>
-            <w:rPr>
-              <w:rFonts w:ascii="Cambria Math" w:eastAsiaTheme="minorEastAsia" w:hAnsi="Cambria Math"/>
-            </w:rPr>
-            <m:t>H</m:t>
-          </m:r>
-          <m:r>
-            <w:rPr>
-              <w:rFonts w:ascii="Cambria Math" w:eastAsiaTheme="minorEastAsia" w:hAnsi="Cambria Math"/>
-            </w:rPr>
-            <m:t xml:space="preserve">_flow  </m:t>
+            <m:t xml:space="preserve">+flowPort.H_flow  </m:t>
           </m:r>
         </m:oMath>
       </m:oMathPara>
@@ -11401,7 +12281,7 @@
           <w:lang w:val="fr-FR"/>
         </w:rPr>
       </w:pPr>
-      <w:bookmarkStart w:id="29" w:name="_Toc37837289"/>
+      <w:bookmarkStart w:id="30" w:name="_Toc37837289"/>
       <w:r>
         <w:rPr>
           <w:rFonts w:eastAsiaTheme="minorEastAsia"/>
@@ -11409,8 +12289,6 @@
         </w:rPr>
         <w:t>PDE</w:t>
       </w:r>
-      <w:bookmarkStart w:id="30" w:name="_GoBack"/>
-      <w:bookmarkEnd w:id="29"/>
       <w:bookmarkEnd w:id="30"/>
     </w:p>
     <w:p>
@@ -11433,6 +12311,7 @@
         <w:rPr>
           <w:lang w:val="fr-FR"/>
         </w:rPr>
+        <w:lastRenderedPageBreak/>
         <w:t>ThermalDiffusion</w:t>
       </w:r>
       <w:bookmarkEnd w:id="31"/>
@@ -14165,6 +15044,36 @@
     </w:lvlOverride>
   </w:num>
   <w:num w:numId="7">
+    <w:abstractNumId w:val="1"/>
+    <w:lvlOverride w:ilvl="0">
+      <w:startOverride w:val="1"/>
+    </w:lvlOverride>
+    <w:lvlOverride w:ilvl="1">
+      <w:startOverride w:val="1"/>
+    </w:lvlOverride>
+    <w:lvlOverride w:ilvl="2">
+      <w:startOverride w:val="1"/>
+    </w:lvlOverride>
+    <w:lvlOverride w:ilvl="3">
+      <w:startOverride w:val="1"/>
+    </w:lvlOverride>
+    <w:lvlOverride w:ilvl="4">
+      <w:startOverride w:val="1"/>
+    </w:lvlOverride>
+    <w:lvlOverride w:ilvl="5">
+      <w:startOverride w:val="1"/>
+    </w:lvlOverride>
+    <w:lvlOverride w:ilvl="6">
+      <w:startOverride w:val="1"/>
+    </w:lvlOverride>
+    <w:lvlOverride w:ilvl="7">
+      <w:startOverride w:val="1"/>
+    </w:lvlOverride>
+    <w:lvlOverride w:ilvl="8">
+      <w:startOverride w:val="1"/>
+    </w:lvlOverride>
+  </w:num>
+  <w:num w:numId="8">
     <w:abstractNumId w:val="1"/>
     <w:lvlOverride w:ilvl="0">
       <w:startOverride w:val="1"/>
@@ -15786,7 +16695,7 @@
   <a:extraClrSchemeLst/>
   <a:extLst>
     <a:ext uri="{05A4C25C-085E-4340-85A3-A5531E510DB2}">
-      <thm15:themeFamily xmlns="" xmlns:thm15="http://schemas.microsoft.com/office/thememl/2012/main" name="Office Theme" id="{62F939B6-93AF-4DB8-9C6B-D6C7DFDC589F}" vid="{4A3C46E8-61CC-4603-A589-7422A47A8E4A}"/>
+      <thm15:themeFamily xmlns:thm15="http://schemas.microsoft.com/office/thememl/2012/main" xmlns="" name="Office Theme" id="{62F939B6-93AF-4DB8-9C6B-D6C7DFDC589F}" vid="{4A3C46E8-61CC-4603-A589-7422A47A8E4A}"/>
     </a:ext>
   </a:extLst>
 </a:theme>
@@ -15797,7 +16706,7 @@
 </file>
 
 <file path=customXml/itemProps1.xml><?xml version="1.0" encoding="utf-8"?>
-<ds:datastoreItem xmlns:ds="http://schemas.openxmlformats.org/officeDocument/2006/customXml" ds:itemID="{5A36C661-4479-4906-B2B5-B2A604EB8242}">
+<ds:datastoreItem xmlns:ds="http://schemas.openxmlformats.org/officeDocument/2006/customXml" ds:itemID="{C9BCDE0C-9678-43E3-B0FB-F242854EA7CA}">
   <ds:schemaRefs>
     <ds:schemaRef ds:uri="http://schemas.openxmlformats.org/officeDocument/2006/bibliography"/>
   </ds:schemaRefs>

</xml_diff>

<commit_message>
Addition of the rootsPolyOrder3 function and its test
</commit_message>
<xml_diff>
--- a/Information/script for equations.docx
+++ b/Information/script for equations.docx
@@ -11035,13 +11035,7 @@
             <w:rPr>
               <w:rFonts w:ascii="Cambria Math" w:eastAsiaTheme="minorEastAsia" w:hAnsi="Cambria Math"/>
             </w:rPr>
-            <m:t>×V</m:t>
-          </m:r>
-          <m:r>
-            <w:rPr>
-              <w:rFonts w:ascii="Cambria Math" w:eastAsiaTheme="minorEastAsia" w:hAnsi="Cambria Math"/>
-            </w:rPr>
-            <m:t>×</m:t>
+            <m:t>×V×</m:t>
           </m:r>
           <m:f>
             <m:fPr>
@@ -11181,19 +11175,7 @@
             <w:rPr>
               <w:rFonts w:ascii="Cambria Math" w:eastAsiaTheme="minorEastAsia" w:hAnsi="Cambria Math"/>
             </w:rPr>
-            <m:t>=</m:t>
-          </m:r>
-          <m:r>
-            <w:rPr>
-              <w:rFonts w:ascii="Cambria Math" w:eastAsiaTheme="minorEastAsia" w:hAnsi="Cambria Math"/>
-            </w:rPr>
-            <m:t>12×</m:t>
-          </m:r>
-          <m:r>
-            <w:rPr>
-              <w:rFonts w:ascii="Cambria Math" w:eastAsiaTheme="minorEastAsia" w:hAnsi="Cambria Math"/>
-            </w:rPr>
-            <m:t>π×</m:t>
+            <m:t>=12×π×</m:t>
           </m:r>
           <m:sSub>
             <m:sSubPr>
@@ -11242,25 +11224,7 @@
             <w:rPr>
               <w:rFonts w:ascii="Cambria Math" w:eastAsiaTheme="minorEastAsia" w:hAnsi="Cambria Math"/>
             </w:rPr>
-            <m:t>P</m:t>
-          </m:r>
-          <m:r>
-            <w:rPr>
-              <w:rFonts w:ascii="Cambria Math" w:eastAsiaTheme="minorEastAsia" w:hAnsi="Cambria Math"/>
-            </w:rPr>
-            <m:t>=</m:t>
-          </m:r>
-          <m:r>
-            <w:rPr>
-              <w:rFonts w:ascii="Cambria Math" w:eastAsiaTheme="minorEastAsia" w:hAnsi="Cambria Math"/>
-            </w:rPr>
-            <m:t xml:space="preserve"> </m:t>
-          </m:r>
-          <m:r>
-            <w:rPr>
-              <w:rFonts w:ascii="Cambria Math" w:eastAsiaTheme="minorEastAsia" w:hAnsi="Cambria Math"/>
-            </w:rPr>
-            <m:t>-</m:t>
+            <m:t>P= -</m:t>
           </m:r>
           <m:sSub>
             <m:sSubPr>
@@ -11284,7 +11248,13 @@
                 <w:rPr>
                   <w:rFonts w:ascii="Cambria Math" w:eastAsiaTheme="minorEastAsia" w:hAnsi="Cambria Math"/>
                 </w:rPr>
-                <m:t>droplet</m:t>
+                <m:t>dr</m:t>
+              </m:r>
+              <m:r>
+                <w:rPr>
+                  <w:rFonts w:ascii="Cambria Math" w:eastAsiaTheme="minorEastAsia" w:hAnsi="Cambria Math"/>
+                </w:rPr>
+                <m:t>oplet</m:t>
               </m:r>
             </m:sub>
           </m:sSub>
@@ -11405,13 +11375,7 @@
             <w:rPr>
               <w:rFonts w:ascii="Cambria Math" w:eastAsiaTheme="minorEastAsia" w:hAnsi="Cambria Math"/>
             </w:rPr>
-            <m:t>Π</m:t>
-          </m:r>
-          <m:r>
-            <w:rPr>
-              <w:rFonts w:ascii="Cambria Math" w:eastAsiaTheme="minorEastAsia" w:hAnsi="Cambria Math"/>
-            </w:rPr>
-            <m:t xml:space="preserve">=  </m:t>
+            <m:t xml:space="preserve">Π=  </m:t>
           </m:r>
           <m:sSub>
             <m:sSubPr>
@@ -11556,13 +11520,7 @@
             <w:rPr>
               <w:rFonts w:ascii="Cambria Math" w:eastAsiaTheme="minorEastAsia" w:hAnsi="Cambria Math"/>
             </w:rPr>
-            <m:t>Π</m:t>
-          </m:r>
-          <m:r>
-            <w:rPr>
-              <w:rFonts w:ascii="Cambria Math" w:eastAsiaTheme="minorEastAsia" w:hAnsi="Cambria Math"/>
-            </w:rPr>
-            <m:t>+</m:t>
+            <m:t>Π+</m:t>
           </m:r>
           <m:sSub>
             <m:sSubPr>
@@ -11611,13 +11569,7 @@
             <w:rPr>
               <w:rFonts w:ascii="Cambria Math" w:eastAsiaTheme="minorEastAsia" w:hAnsi="Cambria Math"/>
             </w:rPr>
-            <m:t>m_flow</m:t>
-          </m:r>
-          <m:r>
-            <w:rPr>
-              <w:rFonts w:ascii="Cambria Math" w:eastAsiaTheme="minorEastAsia" w:hAnsi="Cambria Math"/>
-            </w:rPr>
-            <m:t xml:space="preserve">= </m:t>
+            <m:t xml:space="preserve">m_flow= </m:t>
           </m:r>
           <m:sSub>
             <m:sSubPr>
@@ -11681,19 +11633,7 @@
             <w:rPr>
               <w:rFonts w:ascii="Cambria Math" w:eastAsiaTheme="minorEastAsia" w:hAnsi="Cambria Math"/>
             </w:rPr>
-            <m:t>×</m:t>
-          </m:r>
-          <m:r>
-            <w:rPr>
-              <w:rFonts w:ascii="Cambria Math" w:eastAsiaTheme="minorEastAsia" w:hAnsi="Cambria Math"/>
-            </w:rPr>
-            <m:t xml:space="preserve"> </m:t>
-          </m:r>
-          <m:r>
-            <w:rPr>
-              <w:rFonts w:ascii="Cambria Math" w:eastAsiaTheme="minorEastAsia" w:hAnsi="Cambria Math"/>
-            </w:rPr>
-            <m:t>Vel</m:t>
+            <m:t>× Vel</m:t>
           </m:r>
         </m:oMath>
       </m:oMathPara>
@@ -11736,13 +11676,7 @@
             <w:rPr>
               <w:rFonts w:ascii="Cambria Math" w:eastAsiaTheme="minorEastAsia" w:hAnsi="Cambria Math"/>
             </w:rPr>
-            <m:t>≅</m:t>
-          </m:r>
-          <m:r>
-            <w:rPr>
-              <w:rFonts w:ascii="Cambria Math" w:eastAsiaTheme="minorEastAsia" w:hAnsi="Cambria Math"/>
-            </w:rPr>
-            <m:t xml:space="preserve"> </m:t>
+            <m:t xml:space="preserve">≅ </m:t>
           </m:r>
           <m:sSub>
             <m:sSubPr>
@@ -11774,13 +11708,7 @@
             <w:rPr>
               <w:rFonts w:ascii="Cambria Math" w:eastAsiaTheme="minorEastAsia" w:hAnsi="Cambria Math"/>
             </w:rPr>
-            <m:t>×</m:t>
-          </m:r>
-          <m:r>
-            <w:rPr>
-              <w:rFonts w:ascii="Cambria Math" w:eastAsiaTheme="minorEastAsia" w:hAnsi="Cambria Math"/>
-            </w:rPr>
-            <m:t>n_drop×</m:t>
+            <m:t>×n_drop×</m:t>
           </m:r>
           <m:f>
             <m:fPr>
@@ -11886,8 +11814,6 @@
           </m:r>
         </m:oMath>
       </m:oMathPara>
-      <w:bookmarkStart w:id="29" w:name="_GoBack"/>
-      <w:bookmarkEnd w:id="29"/>
     </w:p>
     <w:p>
       <w:pPr>
@@ -11911,13 +11837,7 @@
                 <w:rPr>
                   <w:rFonts w:ascii="Cambria Math" w:hAnsi="Cambria Math"/>
                 </w:rPr>
-                <m:t>d</m:t>
-              </m:r>
-              <m:r>
-                <w:rPr>
-                  <w:rFonts w:ascii="Cambria Math" w:hAnsi="Cambria Math"/>
-                </w:rPr>
-                <m:t>U</m:t>
+                <m:t>dU</m:t>
               </m:r>
             </m:num>
             <m:den>
@@ -12252,13 +12172,13 @@
                     <w:rPr>
                       <w:rFonts w:ascii="Cambria Math" w:eastAsiaTheme="minorEastAsia" w:hAnsi="Cambria Math"/>
                     </w:rPr>
-                    <m:t>fluidPort.m_flow×actualStream(fluidPort.h_outflo</m:t>
+                    <m:t>fluidPort.m_flow×act</m:t>
                   </m:r>
                   <m:r>
                     <w:rPr>
                       <w:rFonts w:ascii="Cambria Math" w:eastAsiaTheme="minorEastAsia" w:hAnsi="Cambria Math"/>
                     </w:rPr>
-                    <m:t>w)</m:t>
+                    <m:t>ualStream(fluidPort.h_outflow)</m:t>
                   </m:r>
                 </m:e>
               </m:d>
@@ -12275,6 +12195,676 @@
     </w:p>
     <w:p>
       <w:pPr>
+        <w:rPr>
+          <w:rFonts w:eastAsiaTheme="minorEastAsia"/>
+        </w:rPr>
+      </w:pPr>
+    </w:p>
+    <w:p>
+      <w:pPr>
+        <w:rPr>
+          <w:rFonts w:eastAsiaTheme="minorEastAsia"/>
+        </w:rPr>
+      </w:pPr>
+    </w:p>
+    <w:p>
+      <w:pPr>
+        <w:pStyle w:val="Titre2"/>
+      </w:pPr>
+      <w:r>
+        <w:lastRenderedPageBreak/>
+        <w:t>Functions</w:t>
+      </w:r>
+    </w:p>
+    <w:p>
+      <w:pPr>
+        <w:rPr>
+          <w:lang w:val="fr-FR"/>
+        </w:rPr>
+      </w:pPr>
+    </w:p>
+    <w:p>
+      <w:pPr>
+        <w:pStyle w:val="Titre3"/>
+        <w:rPr>
+          <w:rFonts w:eastAsiaTheme="minorEastAsia"/>
+        </w:rPr>
+      </w:pPr>
+      <w:r>
+        <w:rPr>
+          <w:rFonts w:eastAsiaTheme="minorEastAsia"/>
+        </w:rPr>
+        <w:t>rootsPolyorder3</w:t>
+      </w:r>
+    </w:p>
+    <w:p/>
+    <w:p>
+      <w:pPr>
+        <w:ind w:left="-567" w:right="-567"/>
+        <w:rPr>
+          <w:rFonts w:eastAsiaTheme="minorEastAsia"/>
+        </w:rPr>
+      </w:pPr>
+      <m:oMathPara>
+        <m:oMath>
+          <m:r>
+            <w:rPr>
+              <w:rFonts w:ascii="Cambria Math" w:eastAsiaTheme="minorEastAsia" w:hAnsi="Cambria Math"/>
+            </w:rPr>
+            <m:t>P</m:t>
+          </m:r>
+          <m:d>
+            <m:dPr>
+              <m:ctrlPr>
+                <w:rPr>
+                  <w:rFonts w:ascii="Cambria Math" w:eastAsiaTheme="minorEastAsia" w:hAnsi="Cambria Math"/>
+                  <w:i/>
+                </w:rPr>
+              </m:ctrlPr>
+            </m:dPr>
+            <m:e>
+              <m:r>
+                <w:rPr>
+                  <w:rFonts w:ascii="Cambria Math" w:eastAsiaTheme="minorEastAsia" w:hAnsi="Cambria Math"/>
+                </w:rPr>
+                <m:t>x</m:t>
+              </m:r>
+            </m:e>
+          </m:d>
+          <m:r>
+            <w:rPr>
+              <w:rFonts w:ascii="Cambria Math" w:eastAsiaTheme="minorEastAsia" w:hAnsi="Cambria Math"/>
+            </w:rPr>
+            <m:t>: a</m:t>
+          </m:r>
+          <m:sSup>
+            <m:sSupPr>
+              <m:ctrlPr>
+                <w:rPr>
+                  <w:rFonts w:ascii="Cambria Math" w:eastAsiaTheme="minorEastAsia" w:hAnsi="Cambria Math"/>
+                  <w:i/>
+                </w:rPr>
+              </m:ctrlPr>
+            </m:sSupPr>
+            <m:e>
+              <m:r>
+                <w:rPr>
+                  <w:rFonts w:ascii="Cambria Math" w:eastAsiaTheme="minorEastAsia" w:hAnsi="Cambria Math"/>
+                </w:rPr>
+                <m:t>x</m:t>
+              </m:r>
+            </m:e>
+            <m:sup>
+              <m:r>
+                <w:rPr>
+                  <w:rFonts w:ascii="Cambria Math" w:eastAsiaTheme="minorEastAsia" w:hAnsi="Cambria Math"/>
+                </w:rPr>
+                <m:t>3</m:t>
+              </m:r>
+            </m:sup>
+          </m:sSup>
+          <m:r>
+            <w:rPr>
+              <w:rFonts w:ascii="Cambria Math" w:eastAsiaTheme="minorEastAsia" w:hAnsi="Cambria Math"/>
+            </w:rPr>
+            <m:t>+b</m:t>
+          </m:r>
+          <m:sSup>
+            <m:sSupPr>
+              <m:ctrlPr>
+                <w:rPr>
+                  <w:rFonts w:ascii="Cambria Math" w:eastAsiaTheme="minorEastAsia" w:hAnsi="Cambria Math"/>
+                  <w:i/>
+                </w:rPr>
+              </m:ctrlPr>
+            </m:sSupPr>
+            <m:e>
+              <m:r>
+                <w:rPr>
+                  <w:rFonts w:ascii="Cambria Math" w:eastAsiaTheme="minorEastAsia" w:hAnsi="Cambria Math"/>
+                </w:rPr>
+                <m:t>x</m:t>
+              </m:r>
+            </m:e>
+            <m:sup>
+              <m:r>
+                <w:rPr>
+                  <w:rFonts w:ascii="Cambria Math" w:eastAsiaTheme="minorEastAsia" w:hAnsi="Cambria Math"/>
+                </w:rPr>
+                <m:t>2</m:t>
+              </m:r>
+            </m:sup>
+          </m:sSup>
+          <m:r>
+            <w:rPr>
+              <w:rFonts w:ascii="Cambria Math" w:eastAsiaTheme="minorEastAsia" w:hAnsi="Cambria Math"/>
+            </w:rPr>
+            <m:t>+cx+d=0</m:t>
+          </m:r>
+        </m:oMath>
+      </m:oMathPara>
+    </w:p>
+    <w:p>
+      <w:pPr>
+        <w:ind w:left="-567" w:right="-567"/>
+        <w:rPr>
+          <w:rFonts w:eastAsiaTheme="minorEastAsia"/>
+        </w:rPr>
+      </w:pPr>
+      <m:oMathPara>
+        <m:oMath>
+          <m:r>
+            <w:rPr>
+              <w:rFonts w:ascii="Cambria Math" w:eastAsiaTheme="minorEastAsia" w:hAnsi="Cambria Math"/>
+            </w:rPr>
+            <m:t>X=</m:t>
+          </m:r>
+          <m:r>
+            <w:rPr>
+              <w:rFonts w:ascii="Cambria Math" w:eastAsiaTheme="minorEastAsia" w:hAnsi="Cambria Math"/>
+            </w:rPr>
+            <m:t>x+</m:t>
+          </m:r>
+          <m:f>
+            <m:fPr>
+              <m:ctrlPr>
+                <w:rPr>
+                  <w:rFonts w:ascii="Cambria Math" w:eastAsiaTheme="minorEastAsia" w:hAnsi="Cambria Math"/>
+                  <w:i/>
+                </w:rPr>
+              </m:ctrlPr>
+            </m:fPr>
+            <m:num>
+              <m:r>
+                <w:rPr>
+                  <w:rFonts w:ascii="Cambria Math" w:eastAsiaTheme="minorEastAsia" w:hAnsi="Cambria Math"/>
+                </w:rPr>
+                <m:t>b</m:t>
+              </m:r>
+            </m:num>
+            <m:den>
+              <m:r>
+                <w:rPr>
+                  <w:rFonts w:ascii="Cambria Math" w:eastAsiaTheme="minorEastAsia" w:hAnsi="Cambria Math"/>
+                </w:rPr>
+                <m:t>3a</m:t>
+              </m:r>
+            </m:den>
+          </m:f>
+        </m:oMath>
+      </m:oMathPara>
+    </w:p>
+    <w:p>
+      <w:pPr>
+        <w:ind w:left="-567" w:right="-567"/>
+        <w:rPr>
+          <w:rFonts w:eastAsiaTheme="minorEastAsia"/>
+        </w:rPr>
+      </w:pPr>
+      <m:oMathPara>
+        <m:oMath>
+          <m:r>
+            <w:rPr>
+              <w:rFonts w:ascii="Cambria Math" w:eastAsiaTheme="minorEastAsia" w:hAnsi="Cambria Math"/>
+            </w:rPr>
+            <m:t>P</m:t>
+          </m:r>
+          <m:d>
+            <m:dPr>
+              <m:ctrlPr>
+                <w:rPr>
+                  <w:rFonts w:ascii="Cambria Math" w:eastAsiaTheme="minorEastAsia" w:hAnsi="Cambria Math"/>
+                  <w:i/>
+                </w:rPr>
+              </m:ctrlPr>
+            </m:dPr>
+            <m:e>
+              <m:r>
+                <w:rPr>
+                  <w:rFonts w:ascii="Cambria Math" w:eastAsiaTheme="minorEastAsia" w:hAnsi="Cambria Math"/>
+                </w:rPr>
+                <m:t>X</m:t>
+              </m:r>
+            </m:e>
+          </m:d>
+          <m:r>
+            <w:rPr>
+              <w:rFonts w:ascii="Cambria Math" w:eastAsiaTheme="minorEastAsia" w:hAnsi="Cambria Math"/>
+            </w:rPr>
+            <m:t xml:space="preserve">: </m:t>
+          </m:r>
+          <m:sSup>
+            <m:sSupPr>
+              <m:ctrlPr>
+                <w:rPr>
+                  <w:rFonts w:ascii="Cambria Math" w:eastAsiaTheme="minorEastAsia" w:hAnsi="Cambria Math"/>
+                  <w:i/>
+                </w:rPr>
+              </m:ctrlPr>
+            </m:sSupPr>
+            <m:e>
+              <m:r>
+                <w:rPr>
+                  <w:rFonts w:ascii="Cambria Math" w:eastAsiaTheme="minorEastAsia" w:hAnsi="Cambria Math"/>
+                </w:rPr>
+                <m:t>X</m:t>
+              </m:r>
+            </m:e>
+            <m:sup>
+              <m:r>
+                <w:rPr>
+                  <w:rFonts w:ascii="Cambria Math" w:eastAsiaTheme="minorEastAsia" w:hAnsi="Cambria Math"/>
+                </w:rPr>
+                <m:t>3</m:t>
+              </m:r>
+            </m:sup>
+          </m:sSup>
+          <m:r>
+            <w:rPr>
+              <w:rFonts w:ascii="Cambria Math" w:eastAsiaTheme="minorEastAsia" w:hAnsi="Cambria Math"/>
+            </w:rPr>
+            <m:t>+px+q=0</m:t>
+          </m:r>
+        </m:oMath>
+      </m:oMathPara>
+    </w:p>
+    <w:p>
+      <w:pPr>
+        <w:ind w:left="-567" w:right="-567"/>
+        <w:rPr>
+          <w:rFonts w:eastAsiaTheme="minorEastAsia"/>
+        </w:rPr>
+      </w:pPr>
+      <m:oMathPara>
+        <m:oMath>
+          <m:r>
+            <w:rPr>
+              <w:rFonts w:ascii="Cambria Math" w:eastAsiaTheme="minorEastAsia" w:hAnsi="Cambria Math"/>
+            </w:rPr>
+            <m:t>∆=</m:t>
+          </m:r>
+          <m:sSup>
+            <m:sSupPr>
+              <m:ctrlPr>
+                <w:rPr>
+                  <w:rFonts w:ascii="Cambria Math" w:eastAsiaTheme="minorEastAsia" w:hAnsi="Cambria Math"/>
+                  <w:i/>
+                </w:rPr>
+              </m:ctrlPr>
+            </m:sSupPr>
+            <m:e>
+              <m:r>
+                <w:rPr>
+                  <w:rFonts w:ascii="Cambria Math" w:eastAsiaTheme="minorEastAsia" w:hAnsi="Cambria Math"/>
+                </w:rPr>
+                <m:t>c</m:t>
+              </m:r>
+            </m:e>
+            <m:sup>
+              <m:r>
+                <w:rPr>
+                  <w:rFonts w:ascii="Cambria Math" w:eastAsiaTheme="minorEastAsia" w:hAnsi="Cambria Math"/>
+                </w:rPr>
+                <m:t>2</m:t>
+              </m:r>
+            </m:sup>
+          </m:sSup>
+          <m:r>
+            <w:rPr>
+              <w:rFonts w:ascii="Cambria Math" w:eastAsiaTheme="minorEastAsia" w:hAnsi="Cambria Math"/>
+            </w:rPr>
+            <m:t>-4bd</m:t>
+          </m:r>
+        </m:oMath>
+      </m:oMathPara>
+    </w:p>
+    <w:p>
+      <w:pPr>
+        <w:rPr>
+          <w:rFonts w:eastAsiaTheme="minorEastAsia"/>
+        </w:rPr>
+      </w:pPr>
+      <m:oMathPara>
+        <m:oMath>
+          <m:r>
+            <w:rPr>
+              <w:rFonts w:ascii="Cambria Math" w:eastAsiaTheme="minorEastAsia" w:hAnsi="Cambria Math"/>
+            </w:rPr>
+            <m:t>∆=-</m:t>
+          </m:r>
+          <m:d>
+            <m:dPr>
+              <m:ctrlPr>
+                <w:rPr>
+                  <w:rFonts w:ascii="Cambria Math" w:eastAsiaTheme="minorEastAsia" w:hAnsi="Cambria Math"/>
+                  <w:i/>
+                </w:rPr>
+              </m:ctrlPr>
+            </m:dPr>
+            <m:e>
+              <m:r>
+                <w:rPr>
+                  <w:rFonts w:ascii="Cambria Math" w:eastAsiaTheme="minorEastAsia" w:hAnsi="Cambria Math"/>
+                </w:rPr>
+                <m:t>4</m:t>
+              </m:r>
+              <m:sSup>
+                <m:sSupPr>
+                  <m:ctrlPr>
+                    <w:rPr>
+                      <w:rFonts w:ascii="Cambria Math" w:eastAsiaTheme="minorEastAsia" w:hAnsi="Cambria Math"/>
+                      <w:i/>
+                    </w:rPr>
+                  </m:ctrlPr>
+                </m:sSupPr>
+                <m:e>
+                  <m:r>
+                    <w:rPr>
+                      <w:rFonts w:ascii="Cambria Math" w:eastAsiaTheme="minorEastAsia" w:hAnsi="Cambria Math"/>
+                    </w:rPr>
+                    <m:t>p</m:t>
+                  </m:r>
+                </m:e>
+                <m:sup>
+                  <m:r>
+                    <w:rPr>
+                      <w:rFonts w:ascii="Cambria Math" w:eastAsiaTheme="minorEastAsia" w:hAnsi="Cambria Math"/>
+                    </w:rPr>
+                    <m:t>3</m:t>
+                  </m:r>
+                </m:sup>
+              </m:sSup>
+              <m:r>
+                <w:rPr>
+                  <w:rFonts w:ascii="Cambria Math" w:eastAsiaTheme="minorEastAsia" w:hAnsi="Cambria Math"/>
+                </w:rPr>
+                <m:t>-27</m:t>
+              </m:r>
+              <m:sSup>
+                <m:sSupPr>
+                  <m:ctrlPr>
+                    <w:rPr>
+                      <w:rFonts w:ascii="Cambria Math" w:eastAsiaTheme="minorEastAsia" w:hAnsi="Cambria Math"/>
+                      <w:i/>
+                    </w:rPr>
+                  </m:ctrlPr>
+                </m:sSupPr>
+                <m:e>
+                  <m:r>
+                    <w:rPr>
+                      <w:rFonts w:ascii="Cambria Math" w:eastAsiaTheme="minorEastAsia" w:hAnsi="Cambria Math"/>
+                    </w:rPr>
+                    <m:t>q</m:t>
+                  </m:r>
+                </m:e>
+                <m:sup>
+                  <m:r>
+                    <w:rPr>
+                      <w:rFonts w:ascii="Cambria Math" w:eastAsiaTheme="minorEastAsia" w:hAnsi="Cambria Math"/>
+                    </w:rPr>
+                    <m:t>2</m:t>
+                  </m:r>
+                </m:sup>
+              </m:sSup>
+            </m:e>
+          </m:d>
+        </m:oMath>
+      </m:oMathPara>
+      <w:bookmarkStart w:id="29" w:name="_GoBack"/>
+      <w:bookmarkEnd w:id="29"/>
+    </w:p>
+    <w:p>
+      <w:pPr>
+        <w:rPr>
+          <w:rFonts w:eastAsiaTheme="minorEastAsia"/>
+        </w:rPr>
+      </w:pPr>
+      <m:oMathPara>
+        <m:oMath>
+          <m:r>
+            <w:rPr>
+              <w:rFonts w:ascii="Cambria Math" w:eastAsiaTheme="minorEastAsia" w:hAnsi="Cambria Math"/>
+            </w:rPr>
+            <m:t>x1=x2</m:t>
+          </m:r>
+          <m:r>
+            <w:rPr>
+              <w:rFonts w:ascii="Cambria Math" w:eastAsiaTheme="minorEastAsia" w:hAnsi="Cambria Math"/>
+            </w:rPr>
+            <m:t>=</m:t>
+          </m:r>
+          <m:f>
+            <m:fPr>
+              <m:ctrlPr>
+                <w:rPr>
+                  <w:rFonts w:ascii="Cambria Math" w:eastAsiaTheme="minorEastAsia" w:hAnsi="Cambria Math"/>
+                  <w:i/>
+                </w:rPr>
+              </m:ctrlPr>
+            </m:fPr>
+            <m:num>
+              <m:r>
+                <w:rPr>
+                  <w:rFonts w:ascii="Cambria Math" w:eastAsiaTheme="minorEastAsia" w:hAnsi="Cambria Math"/>
+                </w:rPr>
+                <m:t>-c</m:t>
+              </m:r>
+            </m:num>
+            <m:den>
+              <m:r>
+                <w:rPr>
+                  <w:rFonts w:ascii="Cambria Math" w:eastAsiaTheme="minorEastAsia" w:hAnsi="Cambria Math"/>
+                </w:rPr>
+                <m:t>2b</m:t>
+              </m:r>
+            </m:den>
+          </m:f>
+        </m:oMath>
+      </m:oMathPara>
+    </w:p>
+    <w:p>
+      <w:pPr>
+        <w:rPr>
+          <w:rFonts w:eastAsiaTheme="minorEastAsia"/>
+        </w:rPr>
+      </w:pPr>
+      <m:oMathPara>
+        <m:oMath>
+          <m:r>
+            <w:rPr>
+              <w:rFonts w:ascii="Cambria Math" w:eastAsiaTheme="minorEastAsia" w:hAnsi="Cambria Math"/>
+            </w:rPr>
+            <m:t>x1</m:t>
+          </m:r>
+          <m:r>
+            <w:rPr>
+              <w:rFonts w:ascii="Cambria Math" w:eastAsiaTheme="minorEastAsia" w:hAnsi="Cambria Math"/>
+            </w:rPr>
+            <m:t>=</m:t>
+          </m:r>
+          <m:f>
+            <m:fPr>
+              <m:ctrlPr>
+                <w:rPr>
+                  <w:rFonts w:ascii="Cambria Math" w:eastAsiaTheme="minorEastAsia" w:hAnsi="Cambria Math"/>
+                  <w:i/>
+                </w:rPr>
+              </m:ctrlPr>
+            </m:fPr>
+            <m:num>
+              <m:r>
+                <w:rPr>
+                  <w:rFonts w:ascii="Cambria Math" w:eastAsiaTheme="minorEastAsia" w:hAnsi="Cambria Math"/>
+                </w:rPr>
+                <m:t>-c-</m:t>
+              </m:r>
+              <m:rad>
+                <m:radPr>
+                  <m:degHide m:val="1"/>
+                  <m:ctrlPr>
+                    <w:rPr>
+                      <w:rFonts w:ascii="Cambria Math" w:eastAsiaTheme="minorEastAsia" w:hAnsi="Cambria Math"/>
+                      <w:i/>
+                    </w:rPr>
+                  </m:ctrlPr>
+                </m:radPr>
+                <m:deg/>
+                <m:e>
+                  <m:r>
+                    <w:rPr>
+                      <w:rFonts w:ascii="Cambria Math" w:eastAsiaTheme="minorEastAsia" w:hAnsi="Cambria Math"/>
+                    </w:rPr>
+                    <m:t>∆</m:t>
+                  </m:r>
+                </m:e>
+              </m:rad>
+            </m:num>
+            <m:den>
+              <m:r>
+                <w:rPr>
+                  <w:rFonts w:ascii="Cambria Math" w:eastAsiaTheme="minorEastAsia" w:hAnsi="Cambria Math"/>
+                </w:rPr>
+                <m:t>2b</m:t>
+              </m:r>
+            </m:den>
+          </m:f>
+          <m:r>
+            <w:rPr>
+              <w:rFonts w:ascii="Cambria Math" w:eastAsiaTheme="minorEastAsia" w:hAnsi="Cambria Math"/>
+            </w:rPr>
+            <m:t xml:space="preserve">          </m:t>
+          </m:r>
+          <m:r>
+            <w:rPr>
+              <w:rFonts w:ascii="Cambria Math" w:eastAsiaTheme="minorEastAsia" w:hAnsi="Cambria Math"/>
+            </w:rPr>
+            <m:t>x</m:t>
+          </m:r>
+          <m:r>
+            <w:rPr>
+              <w:rFonts w:ascii="Cambria Math" w:eastAsiaTheme="minorEastAsia" w:hAnsi="Cambria Math"/>
+            </w:rPr>
+            <m:t>2</m:t>
+          </m:r>
+          <m:r>
+            <w:rPr>
+              <w:rFonts w:ascii="Cambria Math" w:eastAsiaTheme="minorEastAsia" w:hAnsi="Cambria Math"/>
+            </w:rPr>
+            <m:t>=</m:t>
+          </m:r>
+          <m:f>
+            <m:fPr>
+              <m:ctrlPr>
+                <w:rPr>
+                  <w:rFonts w:ascii="Cambria Math" w:eastAsiaTheme="minorEastAsia" w:hAnsi="Cambria Math"/>
+                  <w:i/>
+                </w:rPr>
+              </m:ctrlPr>
+            </m:fPr>
+            <m:num>
+              <m:r>
+                <w:rPr>
+                  <w:rFonts w:ascii="Cambria Math" w:eastAsiaTheme="minorEastAsia" w:hAnsi="Cambria Math"/>
+                </w:rPr>
+                <m:t>-c</m:t>
+              </m:r>
+              <m:r>
+                <w:rPr>
+                  <w:rFonts w:ascii="Cambria Math" w:eastAsiaTheme="minorEastAsia" w:hAnsi="Cambria Math"/>
+                </w:rPr>
+                <m:t>+</m:t>
+              </m:r>
+              <m:rad>
+                <m:radPr>
+                  <m:degHide m:val="1"/>
+                  <m:ctrlPr>
+                    <w:rPr>
+                      <w:rFonts w:ascii="Cambria Math" w:eastAsiaTheme="minorEastAsia" w:hAnsi="Cambria Math"/>
+                      <w:i/>
+                    </w:rPr>
+                  </m:ctrlPr>
+                </m:radPr>
+                <m:deg/>
+                <m:e>
+                  <m:r>
+                    <w:rPr>
+                      <w:rFonts w:ascii="Cambria Math" w:eastAsiaTheme="minorEastAsia" w:hAnsi="Cambria Math"/>
+                    </w:rPr>
+                    <m:t>∆</m:t>
+                  </m:r>
+                </m:e>
+              </m:rad>
+            </m:num>
+            <m:den>
+              <m:r>
+                <w:rPr>
+                  <w:rFonts w:ascii="Cambria Math" w:eastAsiaTheme="minorEastAsia" w:hAnsi="Cambria Math"/>
+                </w:rPr>
+                <m:t>2b</m:t>
+              </m:r>
+            </m:den>
+          </m:f>
+        </m:oMath>
+      </m:oMathPara>
+    </w:p>
+    <w:p>
+      <w:pPr>
+        <w:rPr>
+          <w:rFonts w:eastAsiaTheme="minorEastAsia"/>
+        </w:rPr>
+      </w:pPr>
+      <m:oMathPara>
+        <m:oMath>
+          <m:r>
+            <w:rPr>
+              <w:rFonts w:ascii="Cambria Math" w:eastAsiaTheme="minorEastAsia" w:hAnsi="Cambria Math"/>
+            </w:rPr>
+            <m:t>x1=</m:t>
+          </m:r>
+          <m:f>
+            <m:fPr>
+              <m:ctrlPr>
+                <w:rPr>
+                  <w:rFonts w:ascii="Cambria Math" w:eastAsiaTheme="minorEastAsia" w:hAnsi="Cambria Math"/>
+                  <w:i/>
+                </w:rPr>
+              </m:ctrlPr>
+            </m:fPr>
+            <m:num>
+              <m:r>
+                <w:rPr>
+                  <w:rFonts w:ascii="Cambria Math" w:eastAsiaTheme="minorEastAsia" w:hAnsi="Cambria Math"/>
+                </w:rPr>
+                <m:t>-d</m:t>
+              </m:r>
+            </m:num>
+            <m:den>
+              <m:r>
+                <w:rPr>
+                  <w:rFonts w:ascii="Cambria Math" w:eastAsiaTheme="minorEastAsia" w:hAnsi="Cambria Math"/>
+                </w:rPr>
+                <m:t>c</m:t>
+              </m:r>
+            </m:den>
+          </m:f>
+        </m:oMath>
+      </m:oMathPara>
+    </w:p>
+    <w:p>
+      <w:pPr>
+        <w:rPr>
+          <w:rFonts w:eastAsiaTheme="minorEastAsia"/>
+        </w:rPr>
+      </w:pPr>
+      <w:r>
+        <w:rPr>
+          <w:rFonts w:eastAsiaTheme="minorEastAsia"/>
+        </w:rPr>
+        <w:br w:type="page"/>
+      </w:r>
+    </w:p>
+    <w:p>
+      <w:pPr>
         <w:pStyle w:val="Titre1"/>
         <w:rPr>
           <w:rFonts w:eastAsiaTheme="minorEastAsia"/>
@@ -12287,6 +12877,7 @@
           <w:rFonts w:eastAsiaTheme="minorEastAsia"/>
           <w:lang w:val="fr-FR"/>
         </w:rPr>
+        <w:lastRenderedPageBreak/>
         <w:t>PDE</w:t>
       </w:r>
       <w:bookmarkEnd w:id="30"/>
@@ -12311,7 +12902,6 @@
         <w:rPr>
           <w:lang w:val="fr-FR"/>
         </w:rPr>
-        <w:lastRenderedPageBreak/>
         <w:t>ThermalDiffusion</w:t>
       </w:r>
       <w:bookmarkEnd w:id="31"/>
@@ -15074,6 +15664,36 @@
     </w:lvlOverride>
   </w:num>
   <w:num w:numId="8">
+    <w:abstractNumId w:val="1"/>
+    <w:lvlOverride w:ilvl="0">
+      <w:startOverride w:val="1"/>
+    </w:lvlOverride>
+    <w:lvlOverride w:ilvl="1">
+      <w:startOverride w:val="1"/>
+    </w:lvlOverride>
+    <w:lvlOverride w:ilvl="2">
+      <w:startOverride w:val="1"/>
+    </w:lvlOverride>
+    <w:lvlOverride w:ilvl="3">
+      <w:startOverride w:val="1"/>
+    </w:lvlOverride>
+    <w:lvlOverride w:ilvl="4">
+      <w:startOverride w:val="1"/>
+    </w:lvlOverride>
+    <w:lvlOverride w:ilvl="5">
+      <w:startOverride w:val="1"/>
+    </w:lvlOverride>
+    <w:lvlOverride w:ilvl="6">
+      <w:startOverride w:val="1"/>
+    </w:lvlOverride>
+    <w:lvlOverride w:ilvl="7">
+      <w:startOverride w:val="1"/>
+    </w:lvlOverride>
+    <w:lvlOverride w:ilvl="8">
+      <w:startOverride w:val="1"/>
+    </w:lvlOverride>
+  </w:num>
+  <w:num w:numId="9">
     <w:abstractNumId w:val="1"/>
     <w:lvlOverride w:ilvl="0">
       <w:startOverride w:val="1"/>
@@ -16440,6 +17060,500 @@
 </w:styles>
 </file>
 
+<file path=word/glossary/document.xml><?xml version="1.0" encoding="utf-8"?>
+<w:glossaryDocument xmlns:wpc="http://schemas.microsoft.com/office/word/2010/wordprocessingCanvas" xmlns:mc="http://schemas.openxmlformats.org/markup-compatibility/2006" xmlns:o="urn:schemas-microsoft-com:office:office" xmlns:r="http://schemas.openxmlformats.org/officeDocument/2006/relationships" xmlns:m="http://schemas.openxmlformats.org/officeDocument/2006/math" xmlns:v="urn:schemas-microsoft-com:vml" xmlns:wp14="http://schemas.microsoft.com/office/word/2010/wordprocessingDrawing" xmlns:wp="http://schemas.openxmlformats.org/drawingml/2006/wordprocessingDrawing" xmlns:w10="urn:schemas-microsoft-com:office:word" xmlns:w="http://schemas.openxmlformats.org/wordprocessingml/2006/main" xmlns:w14="http://schemas.microsoft.com/office/word/2010/wordml" xmlns:wpg="http://schemas.microsoft.com/office/word/2010/wordprocessingGroup" xmlns:wpi="http://schemas.microsoft.com/office/word/2010/wordprocessingInk" xmlns:wne="http://schemas.microsoft.com/office/word/2006/wordml" xmlns:wps="http://schemas.microsoft.com/office/word/2010/wordprocessingShape" mc:Ignorable="w14 wp14"/>
+</file>
+
+<file path=word/glossary/fontTable.xml><?xml version="1.0" encoding="utf-8"?>
+<w:fonts xmlns:mc="http://schemas.openxmlformats.org/markup-compatibility/2006" xmlns:r="http://schemas.openxmlformats.org/officeDocument/2006/relationships" xmlns:w="http://schemas.openxmlformats.org/wordprocessingml/2006/main" xmlns:w14="http://schemas.microsoft.com/office/word/2010/wordml" mc:Ignorable="w14">
+  <w:font w:name="Calibri">
+    <w:panose1 w:val="020F0502020204030204"/>
+    <w:charset w:val="00"/>
+    <w:family w:val="swiss"/>
+    <w:pitch w:val="variable"/>
+    <w:sig w:usb0="E0002AFF" w:usb1="C000247B" w:usb2="00000009" w:usb3="00000000" w:csb0="000001FF" w:csb1="00000000"/>
+  </w:font>
+  <w:font w:name="Times New Roman">
+    <w:panose1 w:val="02020603050405020304"/>
+    <w:charset w:val="00"/>
+    <w:family w:val="roman"/>
+    <w:pitch w:val="variable"/>
+    <w:sig w:usb0="E0002EFF" w:usb1="C000785B" w:usb2="00000009" w:usb3="00000000" w:csb0="000001FF" w:csb1="00000000"/>
+  </w:font>
+  <w:font w:name="Calibri Light">
+    <w:panose1 w:val="020F0302020204030204"/>
+    <w:charset w:val="00"/>
+    <w:family w:val="swiss"/>
+    <w:pitch w:val="variable"/>
+    <w:sig w:usb0="E0002AFF" w:usb1="C000247B" w:usb2="00000009" w:usb3="00000000" w:csb0="000001FF" w:csb1="00000000"/>
+  </w:font>
+  <w:font w:name="Tahoma">
+    <w:panose1 w:val="020B0604030504040204"/>
+    <w:charset w:val="00"/>
+    <w:family w:val="swiss"/>
+    <w:pitch w:val="variable"/>
+    <w:sig w:usb0="E1002EFF" w:usb1="C000605B" w:usb2="00000029" w:usb3="00000000" w:csb0="000101FF" w:csb1="00000000"/>
+  </w:font>
+  <w:font w:name="Cambria Math">
+    <w:panose1 w:val="02040503050406030204"/>
+    <w:charset w:val="00"/>
+    <w:family w:val="roman"/>
+    <w:pitch w:val="variable"/>
+    <w:sig w:usb0="E00006FF" w:usb1="420024FF" w:usb2="02000000" w:usb3="00000000" w:csb0="0000019F" w:csb1="00000000"/>
+  </w:font>
+  <w:font w:name="Cambria">
+    <w:panose1 w:val="02040503050406030204"/>
+    <w:charset w:val="00"/>
+    <w:family w:val="roman"/>
+    <w:pitch w:val="variable"/>
+    <w:sig w:usb0="E00006FF" w:usb1="420024FF" w:usb2="02000000" w:usb3="00000000" w:csb0="0000019F" w:csb1="00000000"/>
+  </w:font>
+</w:fonts>
+</file>
+
+<file path=word/glossary/settings.xml><?xml version="1.0" encoding="utf-8"?>
+<w:settings xmlns:mc="http://schemas.openxmlformats.org/markup-compatibility/2006" xmlns:o="urn:schemas-microsoft-com:office:office" xmlns:r="http://schemas.openxmlformats.org/officeDocument/2006/relationships" xmlns:m="http://schemas.openxmlformats.org/officeDocument/2006/math" xmlns:v="urn:schemas-microsoft-com:vml" xmlns:w10="urn:schemas-microsoft-com:office:word" xmlns:w="http://schemas.openxmlformats.org/wordprocessingml/2006/main" xmlns:w14="http://schemas.microsoft.com/office/word/2010/wordml" xmlns:sl="http://schemas.openxmlformats.org/schemaLibrary/2006/main" mc:Ignorable="w14">
+  <w:view w:val="normal"/>
+  <w:defaultTabStop w:val="720"/>
+  <w:characterSpacingControl w:val="doNotCompress"/>
+  <w:compat>
+    <w:useFELayout/>
+    <w:compatSetting w:name="compatibilityMode" w:uri="http://schemas.microsoft.com/office/word" w:val="14"/>
+    <w:compatSetting w:name="overrideTableStyleFontSizeAndJustification" w:uri="http://schemas.microsoft.com/office/word" w:val="1"/>
+    <w:compatSetting w:name="enableOpenTypeFeatures" w:uri="http://schemas.microsoft.com/office/word" w:val="1"/>
+    <w:compatSetting w:name="doNotFlipMirrorIndents" w:uri="http://schemas.microsoft.com/office/word" w:val="1"/>
+  </w:compat>
+  <w:rsids>
+    <w:rsidRoot w:val="001C3F4C"/>
+    <w:rsid w:val="001C3F4C"/>
+  </w:rsids>
+  <m:mathPr>
+    <m:mathFont m:val="Cambria Math"/>
+    <m:brkBin m:val="before"/>
+    <m:brkBinSub m:val="--"/>
+    <m:smallFrac m:val="0"/>
+    <m:dispDef/>
+    <m:lMargin m:val="0"/>
+    <m:rMargin m:val="0"/>
+    <m:defJc m:val="centerGroup"/>
+    <m:wrapIndent m:val="1440"/>
+    <m:intLim m:val="subSup"/>
+    <m:naryLim m:val="undOvr"/>
+  </m:mathPr>
+  <w:themeFontLang w:val="en-GB"/>
+  <w:clrSchemeMapping w:bg1="light1" w:t1="dark1" w:bg2="light2" w:t2="dark2" w:accent1="accent1" w:accent2="accent2" w:accent3="accent3" w:accent4="accent4" w:accent5="accent5" w:accent6="accent6" w:hyperlink="hyperlink" w:followedHyperlink="followedHyperlink"/>
+  <w:decimalSymbol w:val=","/>
+  <w:listSeparator w:val=";"/>
+</w:settings>
+</file>
+
+<file path=word/glossary/styles.xml><?xml version="1.0" encoding="utf-8"?>
+<w:styles xmlns:mc="http://schemas.openxmlformats.org/markup-compatibility/2006" xmlns:r="http://schemas.openxmlformats.org/officeDocument/2006/relationships" xmlns:w="http://schemas.openxmlformats.org/wordprocessingml/2006/main" xmlns:w14="http://schemas.microsoft.com/office/word/2010/wordml" mc:Ignorable="w14">
+  <w:docDefaults>
+    <w:rPrDefault>
+      <w:rPr>
+        <w:rFonts w:asciiTheme="minorHAnsi" w:eastAsiaTheme="minorEastAsia" w:hAnsiTheme="minorHAnsi" w:cstheme="minorBidi"/>
+        <w:sz w:val="22"/>
+        <w:szCs w:val="22"/>
+        <w:lang w:val="en-GB" w:eastAsia="en-GB" w:bidi="ar-SA"/>
+      </w:rPr>
+    </w:rPrDefault>
+    <w:pPrDefault>
+      <w:pPr>
+        <w:spacing w:after="200" w:line="276" w:lineRule="auto"/>
+      </w:pPr>
+    </w:pPrDefault>
+  </w:docDefaults>
+  <w:latentStyles w:defLockedState="0" w:defUIPriority="99" w:defSemiHidden="1" w:defUnhideWhenUsed="1" w:defQFormat="0" w:count="267">
+    <w:lsdException w:name="Normal" w:semiHidden="0" w:uiPriority="0" w:unhideWhenUsed="0" w:qFormat="1"/>
+    <w:lsdException w:name="heading 1" w:semiHidden="0" w:uiPriority="9" w:unhideWhenUsed="0" w:qFormat="1"/>
+    <w:lsdException w:name="heading 2" w:uiPriority="9" w:qFormat="1"/>
+    <w:lsdException w:name="heading 3" w:uiPriority="9" w:qFormat="1"/>
+    <w:lsdException w:name="heading 4" w:uiPriority="9" w:qFormat="1"/>
+    <w:lsdException w:name="heading 5" w:uiPriority="9" w:qFormat="1"/>
+    <w:lsdException w:name="heading 6" w:uiPriority="9" w:qFormat="1"/>
+    <w:lsdException w:name="heading 7" w:uiPriority="9" w:qFormat="1"/>
+    <w:lsdException w:name="heading 8" w:uiPriority="9" w:qFormat="1"/>
+    <w:lsdException w:name="heading 9" w:uiPriority="9" w:qFormat="1"/>
+    <w:lsdException w:name="toc 1" w:uiPriority="39"/>
+    <w:lsdException w:name="toc 2" w:uiPriority="39"/>
+    <w:lsdException w:name="toc 3" w:uiPriority="39"/>
+    <w:lsdException w:name="toc 4" w:uiPriority="39"/>
+    <w:lsdException w:name="toc 5" w:uiPriority="39"/>
+    <w:lsdException w:name="toc 6" w:uiPriority="39"/>
+    <w:lsdException w:name="toc 7" w:uiPriority="39"/>
+    <w:lsdException w:name="toc 8" w:uiPriority="39"/>
+    <w:lsdException w:name="toc 9" w:uiPriority="39"/>
+    <w:lsdException w:name="caption" w:uiPriority="35" w:qFormat="1"/>
+    <w:lsdException w:name="Title" w:semiHidden="0" w:uiPriority="10" w:unhideWhenUsed="0" w:qFormat="1"/>
+    <w:lsdException w:name="Default Paragraph Font" w:uiPriority="1"/>
+    <w:lsdException w:name="Subtitle" w:semiHidden="0" w:uiPriority="11" w:unhideWhenUsed="0" w:qFormat="1"/>
+    <w:lsdException w:name="Strong" w:semiHidden="0" w:uiPriority="22" w:unhideWhenUsed="0" w:qFormat="1"/>
+    <w:lsdException w:name="Emphasis" w:semiHidden="0" w:uiPriority="20" w:unhideWhenUsed="0" w:qFormat="1"/>
+    <w:lsdException w:name="Table Grid" w:semiHidden="0" w:uiPriority="59" w:unhideWhenUsed="0"/>
+    <w:lsdException w:name="Placeholder Text" w:unhideWhenUsed="0"/>
+    <w:lsdException w:name="No Spacing" w:semiHidden="0" w:uiPriority="1" w:unhideWhenUsed="0" w:qFormat="1"/>
+    <w:lsdException w:name="Light Shading" w:semiHidden="0" w:uiPriority="60" w:unhideWhenUsed="0"/>
+    <w:lsdException w:name="Light List" w:semiHidden="0" w:uiPriority="61" w:unhideWhenUsed="0"/>
+    <w:lsdException w:name="Light Grid" w:semiHidden="0" w:uiPriority="62" w:unhideWhenUsed="0"/>
+    <w:lsdException w:name="Medium Shading 1" w:semiHidden="0" w:uiPriority="63" w:unhideWhenUsed="0"/>
+    <w:lsdException w:name="Medium Shading 2" w:semiHidden="0" w:uiPriority="64" w:unhideWhenUsed="0"/>
+    <w:lsdException w:name="Medium List 1" w:semiHidden="0" w:uiPriority="65" w:unhideWhenUsed="0"/>
+    <w:lsdException w:name="Medium List 2" w:semiHidden="0" w:uiPriority="66" w:unhideWhenUsed="0"/>
+    <w:lsdException w:name="Medium Grid 1" w:semiHidden="0" w:uiPriority="67" w:unhideWhenUsed="0"/>
+    <w:lsdException w:name="Medium Grid 2" w:semiHidden="0" w:uiPriority="68" w:unhideWhenUsed="0"/>
+    <w:lsdException w:name="Medium Grid 3" w:semiHidden="0" w:uiPriority="69" w:unhideWhenUsed="0"/>
+    <w:lsdException w:name="Dark List" w:semiHidden="0" w:uiPriority="70" w:unhideWhenUsed="0"/>
+    <w:lsdException w:name="Colorful Shading" w:semiHidden="0" w:uiPriority="71" w:unhideWhenUsed="0"/>
+    <w:lsdException w:name="Colorful List" w:semiHidden="0" w:uiPriority="72" w:unhideWhenUsed="0"/>
+    <w:lsdException w:name="Colorful Grid" w:semiHidden="0" w:uiPriority="73" w:unhideWhenUsed="0"/>
+    <w:lsdException w:name="Light Shading Accent 1" w:semiHidden="0" w:uiPriority="60" w:unhideWhenUsed="0"/>
+    <w:lsdException w:name="Light List Accent 1" w:semiHidden="0" w:uiPriority="61" w:unhideWhenUsed="0"/>
+    <w:lsdException w:name="Light Grid Accent 1" w:semiHidden="0" w:uiPriority="62" w:unhideWhenUsed="0"/>
+    <w:lsdException w:name="Medium Shading 1 Accent 1" w:semiHidden="0" w:uiPriority="63" w:unhideWhenUsed="0"/>
+    <w:lsdException w:name="Medium Shading 2 Accent 1" w:semiHidden="0" w:uiPriority="64" w:unhideWhenUsed="0"/>
+    <w:lsdException w:name="Medium List 1 Accent 1" w:semiHidden="0" w:uiPriority="65" w:unhideWhenUsed="0"/>
+    <w:lsdException w:name="Revision" w:unhideWhenUsed="0"/>
+    <w:lsdException w:name="List Paragraph" w:semiHidden="0" w:uiPriority="34" w:unhideWhenUsed="0" w:qFormat="1"/>
+    <w:lsdException w:name="Quote" w:semiHidden="0" w:uiPriority="29" w:unhideWhenUsed="0" w:qFormat="1"/>
+    <w:lsdException w:name="Intense Quote" w:semiHidden="0" w:uiPriority="30" w:unhideWhenUsed="0" w:qFormat="1"/>
+    <w:lsdException w:name="Medium List 2 Accent 1" w:semiHidden="0" w:uiPriority="66" w:unhideWhenUsed="0"/>
+    <w:lsdException w:name="Medium Grid 1 Accent 1" w:semiHidden="0" w:uiPriority="67" w:unhideWhenUsed="0"/>
+    <w:lsdException w:name="Medium Grid 2 Accent 1" w:semiHidden="0" w:uiPriority="68" w:unhideWhenUsed="0"/>
+    <w:lsdException w:name="Medium Grid 3 Accent 1" w:semiHidden="0" w:uiPriority="69" w:unhideWhenUsed="0"/>
+    <w:lsdException w:name="Dark List Accent 1" w:semiHidden="0" w:uiPriority="70" w:unhideWhenUsed="0"/>
+    <w:lsdException w:name="Colorful Shading Accent 1" w:semiHidden="0" w:uiPriority="71" w:unhideWhenUsed="0"/>
+    <w:lsdException w:name="Colorful List Accent 1" w:semiHidden="0" w:uiPriority="72" w:unhideWhenUsed="0"/>
+    <w:lsdException w:name="Colorful Grid Accent 1" w:semiHidden="0" w:uiPriority="73" w:unhideWhenUsed="0"/>
+    <w:lsdException w:name="Light Shading Accent 2" w:semiHidden="0" w:uiPriority="60" w:unhideWhenUsed="0"/>
+    <w:lsdException w:name="Light List Accent 2" w:semiHidden="0" w:uiPriority="61" w:unhideWhenUsed="0"/>
+    <w:lsdException w:name="Light Grid Accent 2" w:semiHidden="0" w:uiPriority="62" w:unhideWhenUsed="0"/>
+    <w:lsdException w:name="Medium Shading 1 Accent 2" w:semiHidden="0" w:uiPriority="63" w:unhideWhenUsed="0"/>
+    <w:lsdException w:name="Medium Shading 2 Accent 2" w:semiHidden="0" w:uiPriority="64" w:unhideWhenUsed="0"/>
+    <w:lsdException w:name="Medium List 1 Accent 2" w:semiHidden="0" w:uiPriority="65" w:unhideWhenUsed="0"/>
+    <w:lsdException w:name="Medium List 2 Accent 2" w:semiHidden="0" w:uiPriority="66" w:unhideWhenUsed="0"/>
+    <w:lsdException w:name="Medium Grid 1 Accent 2" w:semiHidden="0" w:uiPriority="67" w:unhideWhenUsed="0"/>
+    <w:lsdException w:name="Medium Grid 2 Accent 2" w:semiHidden="0" w:uiPriority="68" w:unhideWhenUsed="0"/>
+    <w:lsdException w:name="Medium Grid 3 Accent 2" w:semiHidden="0" w:uiPriority="69" w:unhideWhenUsed="0"/>
+    <w:lsdException w:name="Dark List Accent 2" w:semiHidden="0" w:uiPriority="70" w:unhideWhenUsed="0"/>
+    <w:lsdException w:name="Colorful Shading Accent 2" w:semiHidden="0" w:uiPriority="71" w:unhideWhenUsed="0"/>
+    <w:lsdException w:name="Colorful List Accent 2" w:semiHidden="0" w:uiPriority="72" w:unhideWhenUsed="0"/>
+    <w:lsdException w:name="Colorful Grid Accent 2" w:semiHidden="0" w:uiPriority="73" w:unhideWhenUsed="0"/>
+    <w:lsdException w:name="Light Shading Accent 3" w:semiHidden="0" w:uiPriority="60" w:unhideWhenUsed="0"/>
+    <w:lsdException w:name="Light List Accent 3" w:semiHidden="0" w:uiPriority="61" w:unhideWhenUsed="0"/>
+    <w:lsdException w:name="Light Grid Accent 3" w:semiHidden="0" w:uiPriority="62" w:unhideWhenUsed="0"/>
+    <w:lsdException w:name="Medium Shading 1 Accent 3" w:semiHidden="0" w:uiPriority="63" w:unhideWhenUsed="0"/>
+    <w:lsdException w:name="Medium Shading 2 Accent 3" w:semiHidden="0" w:uiPriority="64" w:unhideWhenUsed="0"/>
+    <w:lsdException w:name="Medium List 1 Accent 3" w:semiHidden="0" w:uiPriority="65" w:unhideWhenUsed="0"/>
+    <w:lsdException w:name="Medium List 2 Accent 3" w:semiHidden="0" w:uiPriority="66" w:unhideWhenUsed="0"/>
+    <w:lsdException w:name="Medium Grid 1 Accent 3" w:semiHidden="0" w:uiPriority="67" w:unhideWhenUsed="0"/>
+    <w:lsdException w:name="Medium Grid 2 Accent 3" w:semiHidden="0" w:uiPriority="68" w:unhideWhenUsed="0"/>
+    <w:lsdException w:name="Medium Grid 3 Accent 3" w:semiHidden="0" w:uiPriority="69" w:unhideWhenUsed="0"/>
+    <w:lsdException w:name="Dark List Accent 3" w:semiHidden="0" w:uiPriority="70" w:unhideWhenUsed="0"/>
+    <w:lsdException w:name="Colorful Shading Accent 3" w:semiHidden="0" w:uiPriority="71" w:unhideWhenUsed="0"/>
+    <w:lsdException w:name="Colorful List Accent 3" w:semiHidden="0" w:uiPriority="72" w:unhideWhenUsed="0"/>
+    <w:lsdException w:name="Colorful Grid Accent 3" w:semiHidden="0" w:uiPriority="73" w:unhideWhenUsed="0"/>
+    <w:lsdException w:name="Light Shading Accent 4" w:semiHidden="0" w:uiPriority="60" w:unhideWhenUsed="0"/>
+    <w:lsdException w:name="Light List Accent 4" w:semiHidden="0" w:uiPriority="61" w:unhideWhenUsed="0"/>
+    <w:lsdException w:name="Light Grid Accent 4" w:semiHidden="0" w:uiPriority="62" w:unhideWhenUsed="0"/>
+    <w:lsdException w:name="Medium Shading 1 Accent 4" w:semiHidden="0" w:uiPriority="63" w:unhideWhenUsed="0"/>
+    <w:lsdException w:name="Medium Shading 2 Accent 4" w:semiHidden="0" w:uiPriority="64" w:unhideWhenUsed="0"/>
+    <w:lsdException w:name="Medium List 1 Accent 4" w:semiHidden="0" w:uiPriority="65" w:unhideWhenUsed="0"/>
+    <w:lsdException w:name="Medium List 2 Accent 4" w:semiHidden="0" w:uiPriority="66" w:unhideWhenUsed="0"/>
+    <w:lsdException w:name="Medium Grid 1 Accent 4" w:semiHidden="0" w:uiPriority="67" w:unhideWhenUsed="0"/>
+    <w:lsdException w:name="Medium Grid 2 Accent 4" w:semiHidden="0" w:uiPriority="68" w:unhideWhenUsed="0"/>
+    <w:lsdException w:name="Medium Grid 3 Accent 4" w:semiHidden="0" w:uiPriority="69" w:unhideWhenUsed="0"/>
+    <w:lsdException w:name="Dark List Accent 4" w:semiHidden="0" w:uiPriority="70" w:unhideWhenUsed="0"/>
+    <w:lsdException w:name="Colorful Shading Accent 4" w:semiHidden="0" w:uiPriority="71" w:unhideWhenUsed="0"/>
+    <w:lsdException w:name="Colorful List Accent 4" w:semiHidden="0" w:uiPriority="72" w:unhideWhenUsed="0"/>
+    <w:lsdException w:name="Colorful Grid Accent 4" w:semiHidden="0" w:uiPriority="73" w:unhideWhenUsed="0"/>
+    <w:lsdException w:name="Light Shading Accent 5" w:semiHidden="0" w:uiPriority="60" w:unhideWhenUsed="0"/>
+    <w:lsdException w:name="Light List Accent 5" w:semiHidden="0" w:uiPriority="61" w:unhideWhenUsed="0"/>
+    <w:lsdException w:name="Light Grid Accent 5" w:semiHidden="0" w:uiPriority="62" w:unhideWhenUsed="0"/>
+    <w:lsdException w:name="Medium Shading 1 Accent 5" w:semiHidden="0" w:uiPriority="63" w:unhideWhenUsed="0"/>
+    <w:lsdException w:name="Medium Shading 2 Accent 5" w:semiHidden="0" w:uiPriority="64" w:unhideWhenUsed="0"/>
+    <w:lsdException w:name="Medium List 1 Accent 5" w:semiHidden="0" w:uiPriority="65" w:unhideWhenUsed="0"/>
+    <w:lsdException w:name="Medium List 2 Accent 5" w:semiHidden="0" w:uiPriority="66" w:unhideWhenUsed="0"/>
+    <w:lsdException w:name="Medium Grid 1 Accent 5" w:semiHidden="0" w:uiPriority="67" w:unhideWhenUsed="0"/>
+    <w:lsdException w:name="Medium Grid 2 Accent 5" w:semiHidden="0" w:uiPriority="68" w:unhideWhenUsed="0"/>
+    <w:lsdException w:name="Medium Grid 3 Accent 5" w:semiHidden="0" w:uiPriority="69" w:unhideWhenUsed="0"/>
+    <w:lsdException w:name="Dark List Accent 5" w:semiHidden="0" w:uiPriority="70" w:unhideWhenUsed="0"/>
+    <w:lsdException w:name="Colorful Shading Accent 5" w:semiHidden="0" w:uiPriority="71" w:unhideWhenUsed="0"/>
+    <w:lsdException w:name="Colorful List Accent 5" w:semiHidden="0" w:uiPriority="72" w:unhideWhenUsed="0"/>
+    <w:lsdException w:name="Colorful Grid Accent 5" w:semiHidden="0" w:uiPriority="73" w:unhideWhenUsed="0"/>
+    <w:lsdException w:name="Light Shading Accent 6" w:semiHidden="0" w:uiPriority="60" w:unhideWhenUsed="0"/>
+    <w:lsdException w:name="Light List Accent 6" w:semiHidden="0" w:uiPriority="61" w:unhideWhenUsed="0"/>
+    <w:lsdException w:name="Light Grid Accent 6" w:semiHidden="0" w:uiPriority="62" w:unhideWhenUsed="0"/>
+    <w:lsdException w:name="Medium Shading 1 Accent 6" w:semiHidden="0" w:uiPriority="63" w:unhideWhenUsed="0"/>
+    <w:lsdException w:name="Medium Shading 2 Accent 6" w:semiHidden="0" w:uiPriority="64" w:unhideWhenUsed="0"/>
+    <w:lsdException w:name="Medium List 1 Accent 6" w:semiHidden="0" w:uiPriority="65" w:unhideWhenUsed="0"/>
+    <w:lsdException w:name="Medium List 2 Accent 6" w:semiHidden="0" w:uiPriority="66" w:unhideWhenUsed="0"/>
+    <w:lsdException w:name="Medium Grid 1 Accent 6" w:semiHidden="0" w:uiPriority="67" w:unhideWhenUsed="0"/>
+    <w:lsdException w:name="Medium Grid 2 Accent 6" w:semiHidden="0" w:uiPriority="68" w:unhideWhenUsed="0"/>
+    <w:lsdException w:name="Medium Grid 3 Accent 6" w:semiHidden="0" w:uiPriority="69" w:unhideWhenUsed="0"/>
+    <w:lsdException w:name="Dark List Accent 6" w:semiHidden="0" w:uiPriority="70" w:unhideWhenUsed="0"/>
+    <w:lsdException w:name="Colorful Shading Accent 6" w:semiHidden="0" w:uiPriority="71" w:unhideWhenUsed="0"/>
+    <w:lsdException w:name="Colorful List Accent 6" w:semiHidden="0" w:uiPriority="72" w:unhideWhenUsed="0"/>
+    <w:lsdException w:name="Colorful Grid Accent 6" w:semiHidden="0" w:uiPriority="73" w:unhideWhenUsed="0"/>
+    <w:lsdException w:name="Subtle Emphasis" w:semiHidden="0" w:uiPriority="19" w:unhideWhenUsed="0" w:qFormat="1"/>
+    <w:lsdException w:name="Intense Emphasis" w:semiHidden="0" w:uiPriority="21" w:unhideWhenUsed="0" w:qFormat="1"/>
+    <w:lsdException w:name="Subtle Reference" w:semiHidden="0" w:uiPriority="31" w:unhideWhenUsed="0" w:qFormat="1"/>
+    <w:lsdException w:name="Intense Reference" w:semiHidden="0" w:uiPriority="32" w:unhideWhenUsed="0" w:qFormat="1"/>
+    <w:lsdException w:name="Book Title" w:semiHidden="0" w:uiPriority="33" w:unhideWhenUsed="0" w:qFormat="1"/>
+    <w:lsdException w:name="Bibliography" w:uiPriority="37"/>
+    <w:lsdException w:name="TOC Heading" w:uiPriority="39" w:qFormat="1"/>
+  </w:latentStyles>
+  <w:style w:type="paragraph" w:default="1" w:styleId="Normal">
+    <w:name w:val="Normal"/>
+    <w:qFormat/>
+  </w:style>
+  <w:style w:type="character" w:default="1" w:styleId="Policepardfaut">
+    <w:name w:val="Default Paragraph Font"/>
+    <w:uiPriority w:val="1"/>
+    <w:semiHidden/>
+    <w:unhideWhenUsed/>
+  </w:style>
+  <w:style w:type="table" w:default="1" w:styleId="TableauNormal">
+    <w:name w:val="Normal Table"/>
+    <w:uiPriority w:val="99"/>
+    <w:semiHidden/>
+    <w:unhideWhenUsed/>
+    <w:tblPr>
+      <w:tblInd w:w="0" w:type="dxa"/>
+      <w:tblCellMar>
+        <w:top w:w="0" w:type="dxa"/>
+        <w:left w:w="108" w:type="dxa"/>
+        <w:bottom w:w="0" w:type="dxa"/>
+        <w:right w:w="108" w:type="dxa"/>
+      </w:tblCellMar>
+    </w:tblPr>
+  </w:style>
+  <w:style w:type="numbering" w:default="1" w:styleId="Aucuneliste">
+    <w:name w:val="No List"/>
+    <w:uiPriority w:val="99"/>
+    <w:semiHidden/>
+    <w:unhideWhenUsed/>
+  </w:style>
+  <w:style w:type="character" w:styleId="Textedelespacerserv">
+    <w:name w:val="Placeholder Text"/>
+    <w:basedOn w:val="Policepardfaut"/>
+    <w:uiPriority w:val="99"/>
+    <w:semiHidden/>
+    <w:rsid w:val="001C3F4C"/>
+    <w:rPr>
+      <w:color w:val="808080"/>
+    </w:rPr>
+  </w:style>
+</w:styles>
+</file>
+
+<file path=word/glossary/stylesWithEffects.xml><?xml version="1.0" encoding="utf-8"?>
+<w:styles xmlns:wpc="http://schemas.microsoft.com/office/word/2010/wordprocessingCanvas" xmlns:mc="http://schemas.openxmlformats.org/markup-compatibility/2006" xmlns:o="urn:schemas-microsoft-com:office:office" xmlns:r="http://schemas.openxmlformats.org/officeDocument/2006/relationships" xmlns:m="http://schemas.openxmlformats.org/officeDocument/2006/math" xmlns:v="urn:schemas-microsoft-com:vml" xmlns:wp14="http://schemas.microsoft.com/office/word/2010/wordprocessingDrawing" xmlns:wp="http://schemas.openxmlformats.org/drawingml/2006/wordprocessingDrawing" xmlns:w10="urn:schemas-microsoft-com:office:word" xmlns:w="http://schemas.openxmlformats.org/wordprocessingml/2006/main" xmlns:w14="http://schemas.microsoft.com/office/word/2010/wordml" xmlns:wpg="http://schemas.microsoft.com/office/word/2010/wordprocessingGroup" xmlns:wpi="http://schemas.microsoft.com/office/word/2010/wordprocessingInk" xmlns:wne="http://schemas.microsoft.com/office/word/2006/wordml" xmlns:wps="http://schemas.microsoft.com/office/word/2010/wordprocessingShape" mc:Ignorable="w14 wp14">
+  <w:docDefaults>
+    <w:rPrDefault>
+      <w:rPr>
+        <w:rFonts w:asciiTheme="minorHAnsi" w:eastAsiaTheme="minorEastAsia" w:hAnsiTheme="minorHAnsi" w:cstheme="minorBidi"/>
+        <w:sz w:val="22"/>
+        <w:szCs w:val="22"/>
+        <w:lang w:val="en-GB" w:eastAsia="en-GB" w:bidi="ar-SA"/>
+      </w:rPr>
+    </w:rPrDefault>
+    <w:pPrDefault>
+      <w:pPr>
+        <w:spacing w:after="200" w:line="276" w:lineRule="auto"/>
+      </w:pPr>
+    </w:pPrDefault>
+  </w:docDefaults>
+  <w:latentStyles w:defLockedState="0" w:defUIPriority="99" w:defSemiHidden="1" w:defUnhideWhenUsed="1" w:defQFormat="0" w:count="267">
+    <w:lsdException w:name="Normal" w:semiHidden="0" w:uiPriority="0" w:unhideWhenUsed="0" w:qFormat="1"/>
+    <w:lsdException w:name="heading 1" w:semiHidden="0" w:uiPriority="9" w:unhideWhenUsed="0" w:qFormat="1"/>
+    <w:lsdException w:name="heading 2" w:uiPriority="9" w:qFormat="1"/>
+    <w:lsdException w:name="heading 3" w:uiPriority="9" w:qFormat="1"/>
+    <w:lsdException w:name="heading 4" w:uiPriority="9" w:qFormat="1"/>
+    <w:lsdException w:name="heading 5" w:uiPriority="9" w:qFormat="1"/>
+    <w:lsdException w:name="heading 6" w:uiPriority="9" w:qFormat="1"/>
+    <w:lsdException w:name="heading 7" w:uiPriority="9" w:qFormat="1"/>
+    <w:lsdException w:name="heading 8" w:uiPriority="9" w:qFormat="1"/>
+    <w:lsdException w:name="heading 9" w:uiPriority="9" w:qFormat="1"/>
+    <w:lsdException w:name="toc 1" w:uiPriority="39"/>
+    <w:lsdException w:name="toc 2" w:uiPriority="39"/>
+    <w:lsdException w:name="toc 3" w:uiPriority="39"/>
+    <w:lsdException w:name="toc 4" w:uiPriority="39"/>
+    <w:lsdException w:name="toc 5" w:uiPriority="39"/>
+    <w:lsdException w:name="toc 6" w:uiPriority="39"/>
+    <w:lsdException w:name="toc 7" w:uiPriority="39"/>
+    <w:lsdException w:name="toc 8" w:uiPriority="39"/>
+    <w:lsdException w:name="toc 9" w:uiPriority="39"/>
+    <w:lsdException w:name="caption" w:uiPriority="35" w:qFormat="1"/>
+    <w:lsdException w:name="Title" w:semiHidden="0" w:uiPriority="10" w:unhideWhenUsed="0" w:qFormat="1"/>
+    <w:lsdException w:name="Default Paragraph Font" w:uiPriority="1"/>
+    <w:lsdException w:name="Subtitle" w:semiHidden="0" w:uiPriority="11" w:unhideWhenUsed="0" w:qFormat="1"/>
+    <w:lsdException w:name="Strong" w:semiHidden="0" w:uiPriority="22" w:unhideWhenUsed="0" w:qFormat="1"/>
+    <w:lsdException w:name="Emphasis" w:semiHidden="0" w:uiPriority="20" w:unhideWhenUsed="0" w:qFormat="1"/>
+    <w:lsdException w:name="Table Grid" w:semiHidden="0" w:uiPriority="59" w:unhideWhenUsed="0"/>
+    <w:lsdException w:name="Placeholder Text" w:unhideWhenUsed="0"/>
+    <w:lsdException w:name="No Spacing" w:semiHidden="0" w:uiPriority="1" w:unhideWhenUsed="0" w:qFormat="1"/>
+    <w:lsdException w:name="Light Shading" w:semiHidden="0" w:uiPriority="60" w:unhideWhenUsed="0"/>
+    <w:lsdException w:name="Light List" w:semiHidden="0" w:uiPriority="61" w:unhideWhenUsed="0"/>
+    <w:lsdException w:name="Light Grid" w:semiHidden="0" w:uiPriority="62" w:unhideWhenUsed="0"/>
+    <w:lsdException w:name="Medium Shading 1" w:semiHidden="0" w:uiPriority="63" w:unhideWhenUsed="0"/>
+    <w:lsdException w:name="Medium Shading 2" w:semiHidden="0" w:uiPriority="64" w:unhideWhenUsed="0"/>
+    <w:lsdException w:name="Medium List 1" w:semiHidden="0" w:uiPriority="65" w:unhideWhenUsed="0"/>
+    <w:lsdException w:name="Medium List 2" w:semiHidden="0" w:uiPriority="66" w:unhideWhenUsed="0"/>
+    <w:lsdException w:name="Medium Grid 1" w:semiHidden="0" w:uiPriority="67" w:unhideWhenUsed="0"/>
+    <w:lsdException w:name="Medium Grid 2" w:semiHidden="0" w:uiPriority="68" w:unhideWhenUsed="0"/>
+    <w:lsdException w:name="Medium Grid 3" w:semiHidden="0" w:uiPriority="69" w:unhideWhenUsed="0"/>
+    <w:lsdException w:name="Dark List" w:semiHidden="0" w:uiPriority="70" w:unhideWhenUsed="0"/>
+    <w:lsdException w:name="Colorful Shading" w:semiHidden="0" w:uiPriority="71" w:unhideWhenUsed="0"/>
+    <w:lsdException w:name="Colorful List" w:semiHidden="0" w:uiPriority="72" w:unhideWhenUsed="0"/>
+    <w:lsdException w:name="Colorful Grid" w:semiHidden="0" w:uiPriority="73" w:unhideWhenUsed="0"/>
+    <w:lsdException w:name="Light Shading Accent 1" w:semiHidden="0" w:uiPriority="60" w:unhideWhenUsed="0"/>
+    <w:lsdException w:name="Light List Accent 1" w:semiHidden="0" w:uiPriority="61" w:unhideWhenUsed="0"/>
+    <w:lsdException w:name="Light Grid Accent 1" w:semiHidden="0" w:uiPriority="62" w:unhideWhenUsed="0"/>
+    <w:lsdException w:name="Medium Shading 1 Accent 1" w:semiHidden="0" w:uiPriority="63" w:unhideWhenUsed="0"/>
+    <w:lsdException w:name="Medium Shading 2 Accent 1" w:semiHidden="0" w:uiPriority="64" w:unhideWhenUsed="0"/>
+    <w:lsdException w:name="Medium List 1 Accent 1" w:semiHidden="0" w:uiPriority="65" w:unhideWhenUsed="0"/>
+    <w:lsdException w:name="Revision" w:unhideWhenUsed="0"/>
+    <w:lsdException w:name="List Paragraph" w:semiHidden="0" w:uiPriority="34" w:unhideWhenUsed="0" w:qFormat="1"/>
+    <w:lsdException w:name="Quote" w:semiHidden="0" w:uiPriority="29" w:unhideWhenUsed="0" w:qFormat="1"/>
+    <w:lsdException w:name="Intense Quote" w:semiHidden="0" w:uiPriority="30" w:unhideWhenUsed="0" w:qFormat="1"/>
+    <w:lsdException w:name="Medium List 2 Accent 1" w:semiHidden="0" w:uiPriority="66" w:unhideWhenUsed="0"/>
+    <w:lsdException w:name="Medium Grid 1 Accent 1" w:semiHidden="0" w:uiPriority="67" w:unhideWhenUsed="0"/>
+    <w:lsdException w:name="Medium Grid 2 Accent 1" w:semiHidden="0" w:uiPriority="68" w:unhideWhenUsed="0"/>
+    <w:lsdException w:name="Medium Grid 3 Accent 1" w:semiHidden="0" w:uiPriority="69" w:unhideWhenUsed="0"/>
+    <w:lsdException w:name="Dark List Accent 1" w:semiHidden="0" w:uiPriority="70" w:unhideWhenUsed="0"/>
+    <w:lsdException w:name="Colorful Shading Accent 1" w:semiHidden="0" w:uiPriority="71" w:unhideWhenUsed="0"/>
+    <w:lsdException w:name="Colorful List Accent 1" w:semiHidden="0" w:uiPriority="72" w:unhideWhenUsed="0"/>
+    <w:lsdException w:name="Colorful Grid Accent 1" w:semiHidden="0" w:uiPriority="73" w:unhideWhenUsed="0"/>
+    <w:lsdException w:name="Light Shading Accent 2" w:semiHidden="0" w:uiPriority="60" w:unhideWhenUsed="0"/>
+    <w:lsdException w:name="Light List Accent 2" w:semiHidden="0" w:uiPriority="61" w:unhideWhenUsed="0"/>
+    <w:lsdException w:name="Light Grid Accent 2" w:semiHidden="0" w:uiPriority="62" w:unhideWhenUsed="0"/>
+    <w:lsdException w:name="Medium Shading 1 Accent 2" w:semiHidden="0" w:uiPriority="63" w:unhideWhenUsed="0"/>
+    <w:lsdException w:name="Medium Shading 2 Accent 2" w:semiHidden="0" w:uiPriority="64" w:unhideWhenUsed="0"/>
+    <w:lsdException w:name="Medium List 1 Accent 2" w:semiHidden="0" w:uiPriority="65" w:unhideWhenUsed="0"/>
+    <w:lsdException w:name="Medium List 2 Accent 2" w:semiHidden="0" w:uiPriority="66" w:unhideWhenUsed="0"/>
+    <w:lsdException w:name="Medium Grid 1 Accent 2" w:semiHidden="0" w:uiPriority="67" w:unhideWhenUsed="0"/>
+    <w:lsdException w:name="Medium Grid 2 Accent 2" w:semiHidden="0" w:uiPriority="68" w:unhideWhenUsed="0"/>
+    <w:lsdException w:name="Medium Grid 3 Accent 2" w:semiHidden="0" w:uiPriority="69" w:unhideWhenUsed="0"/>
+    <w:lsdException w:name="Dark List Accent 2" w:semiHidden="0" w:uiPriority="70" w:unhideWhenUsed="0"/>
+    <w:lsdException w:name="Colorful Shading Accent 2" w:semiHidden="0" w:uiPriority="71" w:unhideWhenUsed="0"/>
+    <w:lsdException w:name="Colorful List Accent 2" w:semiHidden="0" w:uiPriority="72" w:unhideWhenUsed="0"/>
+    <w:lsdException w:name="Colorful Grid Accent 2" w:semiHidden="0" w:uiPriority="73" w:unhideWhenUsed="0"/>
+    <w:lsdException w:name="Light Shading Accent 3" w:semiHidden="0" w:uiPriority="60" w:unhideWhenUsed="0"/>
+    <w:lsdException w:name="Light List Accent 3" w:semiHidden="0" w:uiPriority="61" w:unhideWhenUsed="0"/>
+    <w:lsdException w:name="Light Grid Accent 3" w:semiHidden="0" w:uiPriority="62" w:unhideWhenUsed="0"/>
+    <w:lsdException w:name="Medium Shading 1 Accent 3" w:semiHidden="0" w:uiPriority="63" w:unhideWhenUsed="0"/>
+    <w:lsdException w:name="Medium Shading 2 Accent 3" w:semiHidden="0" w:uiPriority="64" w:unhideWhenUsed="0"/>
+    <w:lsdException w:name="Medium List 1 Accent 3" w:semiHidden="0" w:uiPriority="65" w:unhideWhenUsed="0"/>
+    <w:lsdException w:name="Medium List 2 Accent 3" w:semiHidden="0" w:uiPriority="66" w:unhideWhenUsed="0"/>
+    <w:lsdException w:name="Medium Grid 1 Accent 3" w:semiHidden="0" w:uiPriority="67" w:unhideWhenUsed="0"/>
+    <w:lsdException w:name="Medium Grid 2 Accent 3" w:semiHidden="0" w:uiPriority="68" w:unhideWhenUsed="0"/>
+    <w:lsdException w:name="Medium Grid 3 Accent 3" w:semiHidden="0" w:uiPriority="69" w:unhideWhenUsed="0"/>
+    <w:lsdException w:name="Dark List Accent 3" w:semiHidden="0" w:uiPriority="70" w:unhideWhenUsed="0"/>
+    <w:lsdException w:name="Colorful Shading Accent 3" w:semiHidden="0" w:uiPriority="71" w:unhideWhenUsed="0"/>
+    <w:lsdException w:name="Colorful List Accent 3" w:semiHidden="0" w:uiPriority="72" w:unhideWhenUsed="0"/>
+    <w:lsdException w:name="Colorful Grid Accent 3" w:semiHidden="0" w:uiPriority="73" w:unhideWhenUsed="0"/>
+    <w:lsdException w:name="Light Shading Accent 4" w:semiHidden="0" w:uiPriority="60" w:unhideWhenUsed="0"/>
+    <w:lsdException w:name="Light List Accent 4" w:semiHidden="0" w:uiPriority="61" w:unhideWhenUsed="0"/>
+    <w:lsdException w:name="Light Grid Accent 4" w:semiHidden="0" w:uiPriority="62" w:unhideWhenUsed="0"/>
+    <w:lsdException w:name="Medium Shading 1 Accent 4" w:semiHidden="0" w:uiPriority="63" w:unhideWhenUsed="0"/>
+    <w:lsdException w:name="Medium Shading 2 Accent 4" w:semiHidden="0" w:uiPriority="64" w:unhideWhenUsed="0"/>
+    <w:lsdException w:name="Medium List 1 Accent 4" w:semiHidden="0" w:uiPriority="65" w:unhideWhenUsed="0"/>
+    <w:lsdException w:name="Medium List 2 Accent 4" w:semiHidden="0" w:uiPriority="66" w:unhideWhenUsed="0"/>
+    <w:lsdException w:name="Medium Grid 1 Accent 4" w:semiHidden="0" w:uiPriority="67" w:unhideWhenUsed="0"/>
+    <w:lsdException w:name="Medium Grid 2 Accent 4" w:semiHidden="0" w:uiPriority="68" w:unhideWhenUsed="0"/>
+    <w:lsdException w:name="Medium Grid 3 Accent 4" w:semiHidden="0" w:uiPriority="69" w:unhideWhenUsed="0"/>
+    <w:lsdException w:name="Dark List Accent 4" w:semiHidden="0" w:uiPriority="70" w:unhideWhenUsed="0"/>
+    <w:lsdException w:name="Colorful Shading Accent 4" w:semiHidden="0" w:uiPriority="71" w:unhideWhenUsed="0"/>
+    <w:lsdException w:name="Colorful List Accent 4" w:semiHidden="0" w:uiPriority="72" w:unhideWhenUsed="0"/>
+    <w:lsdException w:name="Colorful Grid Accent 4" w:semiHidden="0" w:uiPriority="73" w:unhideWhenUsed="0"/>
+    <w:lsdException w:name="Light Shading Accent 5" w:semiHidden="0" w:uiPriority="60" w:unhideWhenUsed="0"/>
+    <w:lsdException w:name="Light List Accent 5" w:semiHidden="0" w:uiPriority="61" w:unhideWhenUsed="0"/>
+    <w:lsdException w:name="Light Grid Accent 5" w:semiHidden="0" w:uiPriority="62" w:unhideWhenUsed="0"/>
+    <w:lsdException w:name="Medium Shading 1 Accent 5" w:semiHidden="0" w:uiPriority="63" w:unhideWhenUsed="0"/>
+    <w:lsdException w:name="Medium Shading 2 Accent 5" w:semiHidden="0" w:uiPriority="64" w:unhideWhenUsed="0"/>
+    <w:lsdException w:name="Medium List 1 Accent 5" w:semiHidden="0" w:uiPriority="65" w:unhideWhenUsed="0"/>
+    <w:lsdException w:name="Medium List 2 Accent 5" w:semiHidden="0" w:uiPriority="66" w:unhideWhenUsed="0"/>
+    <w:lsdException w:name="Medium Grid 1 Accent 5" w:semiHidden="0" w:uiPriority="67" w:unhideWhenUsed="0"/>
+    <w:lsdException w:name="Medium Grid 2 Accent 5" w:semiHidden="0" w:uiPriority="68" w:unhideWhenUsed="0"/>
+    <w:lsdException w:name="Medium Grid 3 Accent 5" w:semiHidden="0" w:uiPriority="69" w:unhideWhenUsed="0"/>
+    <w:lsdException w:name="Dark List Accent 5" w:semiHidden="0" w:uiPriority="70" w:unhideWhenUsed="0"/>
+    <w:lsdException w:name="Colorful Shading Accent 5" w:semiHidden="0" w:uiPriority="71" w:unhideWhenUsed="0"/>
+    <w:lsdException w:name="Colorful List Accent 5" w:semiHidden="0" w:uiPriority="72" w:unhideWhenUsed="0"/>
+    <w:lsdException w:name="Colorful Grid Accent 5" w:semiHidden="0" w:uiPriority="73" w:unhideWhenUsed="0"/>
+    <w:lsdException w:name="Light Shading Accent 6" w:semiHidden="0" w:uiPriority="60" w:unhideWhenUsed="0"/>
+    <w:lsdException w:name="Light List Accent 6" w:semiHidden="0" w:uiPriority="61" w:unhideWhenUsed="0"/>
+    <w:lsdException w:name="Light Grid Accent 6" w:semiHidden="0" w:uiPriority="62" w:unhideWhenUsed="0"/>
+    <w:lsdException w:name="Medium Shading 1 Accent 6" w:semiHidden="0" w:uiPriority="63" w:unhideWhenUsed="0"/>
+    <w:lsdException w:name="Medium Shading 2 Accent 6" w:semiHidden="0" w:uiPriority="64" w:unhideWhenUsed="0"/>
+    <w:lsdException w:name="Medium List 1 Accent 6" w:semiHidden="0" w:uiPriority="65" w:unhideWhenUsed="0"/>
+    <w:lsdException w:name="Medium List 2 Accent 6" w:semiHidden="0" w:uiPriority="66" w:unhideWhenUsed="0"/>
+    <w:lsdException w:name="Medium Grid 1 Accent 6" w:semiHidden="0" w:uiPriority="67" w:unhideWhenUsed="0"/>
+    <w:lsdException w:name="Medium Grid 2 Accent 6" w:semiHidden="0" w:uiPriority="68" w:unhideWhenUsed="0"/>
+    <w:lsdException w:name="Medium Grid 3 Accent 6" w:semiHidden="0" w:uiPriority="69" w:unhideWhenUsed="0"/>
+    <w:lsdException w:name="Dark List Accent 6" w:semiHidden="0" w:uiPriority="70" w:unhideWhenUsed="0"/>
+    <w:lsdException w:name="Colorful Shading Accent 6" w:semiHidden="0" w:uiPriority="71" w:unhideWhenUsed="0"/>
+    <w:lsdException w:name="Colorful List Accent 6" w:semiHidden="0" w:uiPriority="72" w:unhideWhenUsed="0"/>
+    <w:lsdException w:name="Colorful Grid Accent 6" w:semiHidden="0" w:uiPriority="73" w:unhideWhenUsed="0"/>
+    <w:lsdException w:name="Subtle Emphasis" w:semiHidden="0" w:uiPriority="19" w:unhideWhenUsed="0" w:qFormat="1"/>
+    <w:lsdException w:name="Intense Emphasis" w:semiHidden="0" w:uiPriority="21" w:unhideWhenUsed="0" w:qFormat="1"/>
+    <w:lsdException w:name="Subtle Reference" w:semiHidden="0" w:uiPriority="31" w:unhideWhenUsed="0" w:qFormat="1"/>
+    <w:lsdException w:name="Intense Reference" w:semiHidden="0" w:uiPriority="32" w:unhideWhenUsed="0" w:qFormat="1"/>
+    <w:lsdException w:name="Book Title" w:semiHidden="0" w:uiPriority="33" w:unhideWhenUsed="0" w:qFormat="1"/>
+    <w:lsdException w:name="Bibliography" w:uiPriority="37"/>
+    <w:lsdException w:name="TOC Heading" w:uiPriority="39" w:qFormat="1"/>
+  </w:latentStyles>
+  <w:style w:type="paragraph" w:default="1" w:styleId="Normal">
+    <w:name w:val="Normal"/>
+    <w:qFormat/>
+  </w:style>
+  <w:style w:type="character" w:default="1" w:styleId="Policepardfaut">
+    <w:name w:val="Default Paragraph Font"/>
+    <w:uiPriority w:val="1"/>
+    <w:semiHidden/>
+    <w:unhideWhenUsed/>
+  </w:style>
+  <w:style w:type="table" w:default="1" w:styleId="TableauNormal">
+    <w:name w:val="Normal Table"/>
+    <w:uiPriority w:val="99"/>
+    <w:semiHidden/>
+    <w:unhideWhenUsed/>
+    <w:tblPr>
+      <w:tblInd w:w="0" w:type="dxa"/>
+      <w:tblCellMar>
+        <w:top w:w="0" w:type="dxa"/>
+        <w:left w:w="108" w:type="dxa"/>
+        <w:bottom w:w="0" w:type="dxa"/>
+        <w:right w:w="108" w:type="dxa"/>
+      </w:tblCellMar>
+    </w:tblPr>
+  </w:style>
+  <w:style w:type="numbering" w:default="1" w:styleId="Aucuneliste">
+    <w:name w:val="No List"/>
+    <w:uiPriority w:val="99"/>
+    <w:semiHidden/>
+    <w:unhideWhenUsed/>
+  </w:style>
+  <w:style w:type="character" w:styleId="Textedelespacerserv">
+    <w:name w:val="Placeholder Text"/>
+    <w:basedOn w:val="Policepardfaut"/>
+    <w:uiPriority w:val="99"/>
+    <w:semiHidden/>
+    <w:rsid w:val="001C3F4C"/>
+    <w:rPr>
+      <w:color w:val="808080"/>
+    </w:rPr>
+  </w:style>
+</w:styles>
+</file>
+
+<file path=word/glossary/webSettings.xml><?xml version="1.0" encoding="utf-8"?>
+<w:webSettings xmlns:mc="http://schemas.openxmlformats.org/markup-compatibility/2006" xmlns:r="http://schemas.openxmlformats.org/officeDocument/2006/relationships" xmlns:w="http://schemas.openxmlformats.org/wordprocessingml/2006/main" xmlns:w14="http://schemas.microsoft.com/office/word/2010/wordml" mc:Ignorable="w14">
+  <w:optimizeForBrowser/>
+  <w:allowPNG/>
+</w:webSettings>
+</file>
+
 <file path=word/theme/theme1.xml><?xml version="1.0" encoding="utf-8"?>
 <a:theme xmlns:a="http://schemas.openxmlformats.org/drawingml/2006/main" name="Thème Office">
   <a:themeElements>
@@ -16695,7 +17809,7 @@
   <a:extraClrSchemeLst/>
   <a:extLst>
     <a:ext uri="{05A4C25C-085E-4340-85A3-A5531E510DB2}">
-      <thm15:themeFamily xmlns:thm15="http://schemas.microsoft.com/office/thememl/2012/main" xmlns="" name="Office Theme" id="{62F939B6-93AF-4DB8-9C6B-D6C7DFDC589F}" vid="{4A3C46E8-61CC-4603-A589-7422A47A8E4A}"/>
+      <thm15:themeFamily xmlns="" xmlns:thm15="http://schemas.microsoft.com/office/thememl/2012/main" name="Office Theme" id="{62F939B6-93AF-4DB8-9C6B-D6C7DFDC589F}" vid="{4A3C46E8-61CC-4603-A589-7422A47A8E4A}"/>
     </a:ext>
   </a:extLst>
 </a:theme>
@@ -16706,7 +17820,7 @@
 </file>
 
 <file path=customXml/itemProps1.xml><?xml version="1.0" encoding="utf-8"?>
-<ds:datastoreItem xmlns:ds="http://schemas.openxmlformats.org/officeDocument/2006/customXml" ds:itemID="{C9BCDE0C-9678-43E3-B0FB-F242854EA7CA}">
+<ds:datastoreItem xmlns:ds="http://schemas.openxmlformats.org/officeDocument/2006/customXml" ds:itemID="{034FC38B-8018-40D9-A324-2463580CBAE0}">
   <ds:schemaRefs>
     <ds:schemaRef ds:uri="http://schemas.openxmlformats.org/officeDocument/2006/bibliography"/>
   </ds:schemaRefs>

</xml_diff>

<commit_message>
Update the description of the function rootsPolyOrder3
</commit_message>
<xml_diff>
--- a/Information/script for equations.docx
+++ b/Information/script for equations.docx
@@ -59,7 +59,7 @@
           <w:r>
             <w:fldChar w:fldCharType="separate"/>
           </w:r>
-          <w:hyperlink w:anchor="_Toc37837260" w:history="1">
+          <w:hyperlink w:anchor="_Toc38312628" w:history="1">
             <w:r>
               <w:rPr>
                 <w:rStyle w:val="Lienhypertexte"/>
@@ -103,7 +103,7 @@
                 <w:noProof/>
                 <w:webHidden/>
               </w:rPr>
-              <w:instrText xml:space="preserve"> PAGEREF _Toc37837260 \h </w:instrText>
+              <w:instrText xml:space="preserve"> PAGEREF _Toc38312628 \h </w:instrText>
             </w:r>
             <w:r>
               <w:rPr>
@@ -147,7 +147,7 @@
               <w:lang w:eastAsia="en-GB"/>
             </w:rPr>
           </w:pPr>
-          <w:hyperlink w:anchor="_Toc37837261" w:history="1">
+          <w:hyperlink w:anchor="_Toc38312629" w:history="1">
             <w:r>
               <w:rPr>
                 <w:rStyle w:val="Lienhypertexte"/>
@@ -191,7 +191,7 @@
                 <w:noProof/>
                 <w:webHidden/>
               </w:rPr>
-              <w:instrText xml:space="preserve"> PAGEREF _Toc37837261 \h </w:instrText>
+              <w:instrText xml:space="preserve"> PAGEREF _Toc38312629 \h </w:instrText>
             </w:r>
             <w:r>
               <w:rPr>
@@ -235,7 +235,7 @@
               <w:lang w:eastAsia="en-GB"/>
             </w:rPr>
           </w:pPr>
-          <w:hyperlink w:anchor="_Toc37837262" w:history="1">
+          <w:hyperlink w:anchor="_Toc38312630" w:history="1">
             <w:r>
               <w:rPr>
                 <w:rStyle w:val="Lienhypertexte"/>
@@ -277,7 +277,7 @@
                 <w:noProof/>
                 <w:webHidden/>
               </w:rPr>
-              <w:instrText xml:space="preserve"> PAGEREF _Toc37837262 \h </w:instrText>
+              <w:instrText xml:space="preserve"> PAGEREF _Toc38312630 \h </w:instrText>
             </w:r>
             <w:r>
               <w:rPr>
@@ -321,7 +321,7 @@
               <w:lang w:eastAsia="en-GB"/>
             </w:rPr>
           </w:pPr>
-          <w:hyperlink w:anchor="_Toc37837263" w:history="1">
+          <w:hyperlink w:anchor="_Toc38312631" w:history="1">
             <w:r>
               <w:rPr>
                 <w:rStyle w:val="Lienhypertexte"/>
@@ -363,7 +363,7 @@
                 <w:noProof/>
                 <w:webHidden/>
               </w:rPr>
-              <w:instrText xml:space="preserve"> PAGEREF _Toc37837263 \h </w:instrText>
+              <w:instrText xml:space="preserve"> PAGEREF _Toc38312631 \h </w:instrText>
             </w:r>
             <w:r>
               <w:rPr>
@@ -407,7 +407,7 @@
               <w:lang w:eastAsia="en-GB"/>
             </w:rPr>
           </w:pPr>
-          <w:hyperlink w:anchor="_Toc37837264" w:history="1">
+          <w:hyperlink w:anchor="_Toc38312632" w:history="1">
             <w:r>
               <w:rPr>
                 <w:rStyle w:val="Lienhypertexte"/>
@@ -449,7 +449,7 @@
                 <w:noProof/>
                 <w:webHidden/>
               </w:rPr>
-              <w:instrText xml:space="preserve"> PAGEREF _Toc37837264 \h </w:instrText>
+              <w:instrText xml:space="preserve"> PAGEREF _Toc38312632 \h </w:instrText>
             </w:r>
             <w:r>
               <w:rPr>
@@ -493,7 +493,7 @@
               <w:lang w:eastAsia="en-GB"/>
             </w:rPr>
           </w:pPr>
-          <w:hyperlink w:anchor="_Toc37837265" w:history="1">
+          <w:hyperlink w:anchor="_Toc38312633" w:history="1">
             <w:r>
               <w:rPr>
                 <w:rStyle w:val="Lienhypertexte"/>
@@ -537,7 +537,7 @@
                 <w:noProof/>
                 <w:webHidden/>
               </w:rPr>
-              <w:instrText xml:space="preserve"> PAGEREF _Toc37837265 \h </w:instrText>
+              <w:instrText xml:space="preserve"> PAGEREF _Toc38312633 \h </w:instrText>
             </w:r>
             <w:r>
               <w:rPr>
@@ -581,7 +581,7 @@
               <w:lang w:eastAsia="en-GB"/>
             </w:rPr>
           </w:pPr>
-          <w:hyperlink w:anchor="_Toc37837266" w:history="1">
+          <w:hyperlink w:anchor="_Toc38312634" w:history="1">
             <w:r>
               <w:rPr>
                 <w:rStyle w:val="Lienhypertexte"/>
@@ -623,7 +623,7 @@
                 <w:noProof/>
                 <w:webHidden/>
               </w:rPr>
-              <w:instrText xml:space="preserve"> PAGEREF _Toc37837266 \h </w:instrText>
+              <w:instrText xml:space="preserve"> PAGEREF _Toc38312634 \h </w:instrText>
             </w:r>
             <w:r>
               <w:rPr>
@@ -667,7 +667,7 @@
               <w:lang w:eastAsia="en-GB"/>
             </w:rPr>
           </w:pPr>
-          <w:hyperlink w:anchor="_Toc37837267" w:history="1">
+          <w:hyperlink w:anchor="_Toc38312635" w:history="1">
             <w:r>
               <w:rPr>
                 <w:rStyle w:val="Lienhypertexte"/>
@@ -709,7 +709,7 @@
                 <w:noProof/>
                 <w:webHidden/>
               </w:rPr>
-              <w:instrText xml:space="preserve"> PAGEREF _Toc37837267 \h </w:instrText>
+              <w:instrText xml:space="preserve"> PAGEREF _Toc38312635 \h </w:instrText>
             </w:r>
             <w:r>
               <w:rPr>
@@ -753,7 +753,7 @@
               <w:lang w:eastAsia="en-GB"/>
             </w:rPr>
           </w:pPr>
-          <w:hyperlink w:anchor="_Toc37837268" w:history="1">
+          <w:hyperlink w:anchor="_Toc38312636" w:history="1">
             <w:r>
               <w:rPr>
                 <w:rStyle w:val="Lienhypertexte"/>
@@ -795,7 +795,7 @@
                 <w:noProof/>
                 <w:webHidden/>
               </w:rPr>
-              <w:instrText xml:space="preserve"> PAGEREF _Toc37837268 \h </w:instrText>
+              <w:instrText xml:space="preserve"> PAGEREF _Toc38312636 \h </w:instrText>
             </w:r>
             <w:r>
               <w:rPr>
@@ -839,7 +839,7 @@
               <w:lang w:eastAsia="en-GB"/>
             </w:rPr>
           </w:pPr>
-          <w:hyperlink w:anchor="_Toc37837269" w:history="1">
+          <w:hyperlink w:anchor="_Toc38312637" w:history="1">
             <w:r>
               <w:rPr>
                 <w:rStyle w:val="Lienhypertexte"/>
@@ -881,7 +881,7 @@
                 <w:noProof/>
                 <w:webHidden/>
               </w:rPr>
-              <w:instrText xml:space="preserve"> PAGEREF _Toc37837269 \h </w:instrText>
+              <w:instrText xml:space="preserve"> PAGEREF _Toc38312637 \h </w:instrText>
             </w:r>
             <w:r>
               <w:rPr>
@@ -925,7 +925,7 @@
               <w:lang w:eastAsia="en-GB"/>
             </w:rPr>
           </w:pPr>
-          <w:hyperlink w:anchor="_Toc37837270" w:history="1">
+          <w:hyperlink w:anchor="_Toc38312638" w:history="1">
             <w:r>
               <w:rPr>
                 <w:rStyle w:val="Lienhypertexte"/>
@@ -967,7 +967,7 @@
                 <w:noProof/>
                 <w:webHidden/>
               </w:rPr>
-              <w:instrText xml:space="preserve"> PAGEREF _Toc37837270 \h </w:instrText>
+              <w:instrText xml:space="preserve"> PAGEREF _Toc38312638 \h </w:instrText>
             </w:r>
             <w:r>
               <w:rPr>
@@ -1011,7 +1011,7 @@
               <w:lang w:eastAsia="en-GB"/>
             </w:rPr>
           </w:pPr>
-          <w:hyperlink w:anchor="_Toc37837271" w:history="1">
+          <w:hyperlink w:anchor="_Toc38312639" w:history="1">
             <w:r>
               <w:rPr>
                 <w:rStyle w:val="Lienhypertexte"/>
@@ -1053,7 +1053,7 @@
                 <w:noProof/>
                 <w:webHidden/>
               </w:rPr>
-              <w:instrText xml:space="preserve"> PAGEREF _Toc37837271 \h </w:instrText>
+              <w:instrText xml:space="preserve"> PAGEREF _Toc38312639 \h </w:instrText>
             </w:r>
             <w:r>
               <w:rPr>
@@ -1097,7 +1097,7 @@
               <w:lang w:eastAsia="en-GB"/>
             </w:rPr>
           </w:pPr>
-          <w:hyperlink w:anchor="_Toc37837272" w:history="1">
+          <w:hyperlink w:anchor="_Toc38312640" w:history="1">
             <w:r>
               <w:rPr>
                 <w:rStyle w:val="Lienhypertexte"/>
@@ -1139,7 +1139,7 @@
                 <w:noProof/>
                 <w:webHidden/>
               </w:rPr>
-              <w:instrText xml:space="preserve"> PAGEREF _Toc37837272 \h </w:instrText>
+              <w:instrText xml:space="preserve"> PAGEREF _Toc38312640 \h </w:instrText>
             </w:r>
             <w:r>
               <w:rPr>
@@ -1183,7 +1183,7 @@
               <w:lang w:eastAsia="en-GB"/>
             </w:rPr>
           </w:pPr>
-          <w:hyperlink w:anchor="_Toc37837273" w:history="1">
+          <w:hyperlink w:anchor="_Toc38312641" w:history="1">
             <w:r>
               <w:rPr>
                 <w:rStyle w:val="Lienhypertexte"/>
@@ -1225,7 +1225,7 @@
                 <w:noProof/>
                 <w:webHidden/>
               </w:rPr>
-              <w:instrText xml:space="preserve"> PAGEREF _Toc37837273 \h </w:instrText>
+              <w:instrText xml:space="preserve"> PAGEREF _Toc38312641 \h </w:instrText>
             </w:r>
             <w:r>
               <w:rPr>
@@ -1269,7 +1269,7 @@
               <w:lang w:eastAsia="en-GB"/>
             </w:rPr>
           </w:pPr>
-          <w:hyperlink w:anchor="_Toc37837274" w:history="1">
+          <w:hyperlink w:anchor="_Toc38312642" w:history="1">
             <w:r>
               <w:rPr>
                 <w:rStyle w:val="Lienhypertexte"/>
@@ -1313,7 +1313,7 @@
                 <w:noProof/>
                 <w:webHidden/>
               </w:rPr>
-              <w:instrText xml:space="preserve"> PAGEREF _Toc37837274 \h </w:instrText>
+              <w:instrText xml:space="preserve"> PAGEREF _Toc38312642 \h </w:instrText>
             </w:r>
             <w:r>
               <w:rPr>
@@ -1357,7 +1357,7 @@
               <w:lang w:eastAsia="en-GB"/>
             </w:rPr>
           </w:pPr>
-          <w:hyperlink w:anchor="_Toc37837275" w:history="1">
+          <w:hyperlink w:anchor="_Toc38312643" w:history="1">
             <w:r>
               <w:rPr>
                 <w:rStyle w:val="Lienhypertexte"/>
@@ -1399,7 +1399,7 @@
                 <w:noProof/>
                 <w:webHidden/>
               </w:rPr>
-              <w:instrText xml:space="preserve"> PAGEREF _Toc37837275 \h </w:instrText>
+              <w:instrText xml:space="preserve"> PAGEREF _Toc38312643 \h </w:instrText>
             </w:r>
             <w:r>
               <w:rPr>
@@ -1443,7 +1443,7 @@
               <w:lang w:eastAsia="en-GB"/>
             </w:rPr>
           </w:pPr>
-          <w:hyperlink w:anchor="_Toc37837276" w:history="1">
+          <w:hyperlink w:anchor="_Toc38312644" w:history="1">
             <w:r>
               <w:rPr>
                 <w:rStyle w:val="Lienhypertexte"/>
@@ -1485,7 +1485,7 @@
                 <w:noProof/>
                 <w:webHidden/>
               </w:rPr>
-              <w:instrText xml:space="preserve"> PAGEREF _Toc37837276 \h </w:instrText>
+              <w:instrText xml:space="preserve"> PAGEREF _Toc38312644 \h </w:instrText>
             </w:r>
             <w:r>
               <w:rPr>
@@ -1529,7 +1529,7 @@
               <w:lang w:eastAsia="en-GB"/>
             </w:rPr>
           </w:pPr>
-          <w:hyperlink w:anchor="_Toc37837277" w:history="1">
+          <w:hyperlink w:anchor="_Toc38312645" w:history="1">
             <w:r>
               <w:rPr>
                 <w:rStyle w:val="Lienhypertexte"/>
@@ -1571,7 +1571,7 @@
                 <w:noProof/>
                 <w:webHidden/>
               </w:rPr>
-              <w:instrText xml:space="preserve"> PAGEREF _Toc37837277 \h </w:instrText>
+              <w:instrText xml:space="preserve"> PAGEREF _Toc38312645 \h </w:instrText>
             </w:r>
             <w:r>
               <w:rPr>
@@ -1615,7 +1615,7 @@
               <w:lang w:eastAsia="en-GB"/>
             </w:rPr>
           </w:pPr>
-          <w:hyperlink w:anchor="_Toc37837278" w:history="1">
+          <w:hyperlink w:anchor="_Toc38312646" w:history="1">
             <w:r>
               <w:rPr>
                 <w:rStyle w:val="Lienhypertexte"/>
@@ -1657,7 +1657,7 @@
                 <w:noProof/>
                 <w:webHidden/>
               </w:rPr>
-              <w:instrText xml:space="preserve"> PAGEREF _Toc37837278 \h </w:instrText>
+              <w:instrText xml:space="preserve"> PAGEREF _Toc38312646 \h </w:instrText>
             </w:r>
             <w:r>
               <w:rPr>
@@ -1701,7 +1701,7 @@
               <w:lang w:eastAsia="en-GB"/>
             </w:rPr>
           </w:pPr>
-          <w:hyperlink w:anchor="_Toc37837279" w:history="1">
+          <w:hyperlink w:anchor="_Toc38312647" w:history="1">
             <w:r>
               <w:rPr>
                 <w:rStyle w:val="Lienhypertexte"/>
@@ -1743,7 +1743,7 @@
                 <w:noProof/>
                 <w:webHidden/>
               </w:rPr>
-              <w:instrText xml:space="preserve"> PAGEREF _Toc37837279 \h </w:instrText>
+              <w:instrText xml:space="preserve"> PAGEREF _Toc38312647 \h </w:instrText>
             </w:r>
             <w:r>
               <w:rPr>
@@ -1787,7 +1787,7 @@
               <w:lang w:eastAsia="en-GB"/>
             </w:rPr>
           </w:pPr>
-          <w:hyperlink w:anchor="_Toc37837280" w:history="1">
+          <w:hyperlink w:anchor="_Toc38312648" w:history="1">
             <w:r>
               <w:rPr>
                 <w:rStyle w:val="Lienhypertexte"/>
@@ -1829,7 +1829,7 @@
                 <w:noProof/>
                 <w:webHidden/>
               </w:rPr>
-              <w:instrText xml:space="preserve"> PAGEREF _Toc37837280 \h </w:instrText>
+              <w:instrText xml:space="preserve"> PAGEREF _Toc38312648 \h </w:instrText>
             </w:r>
             <w:r>
               <w:rPr>
@@ -1873,7 +1873,7 @@
               <w:lang w:eastAsia="en-GB"/>
             </w:rPr>
           </w:pPr>
-          <w:hyperlink w:anchor="_Toc37837281" w:history="1">
+          <w:hyperlink w:anchor="_Toc38312649" w:history="1">
             <w:r>
               <w:rPr>
                 <w:rStyle w:val="Lienhypertexte"/>
@@ -1915,7 +1915,7 @@
                 <w:noProof/>
                 <w:webHidden/>
               </w:rPr>
-              <w:instrText xml:space="preserve"> PAGEREF _Toc37837281 \h </w:instrText>
+              <w:instrText xml:space="preserve"> PAGEREF _Toc38312649 \h </w:instrText>
             </w:r>
             <w:r>
               <w:rPr>
@@ -1959,7 +1959,7 @@
               <w:lang w:eastAsia="en-GB"/>
             </w:rPr>
           </w:pPr>
-          <w:hyperlink w:anchor="_Toc37837282" w:history="1">
+          <w:hyperlink w:anchor="_Toc38312650" w:history="1">
             <w:r>
               <w:rPr>
                 <w:rStyle w:val="Lienhypertexte"/>
@@ -2001,7 +2001,7 @@
                 <w:noProof/>
                 <w:webHidden/>
               </w:rPr>
-              <w:instrText xml:space="preserve"> PAGEREF _Toc37837282 \h </w:instrText>
+              <w:instrText xml:space="preserve"> PAGEREF _Toc38312650 \h </w:instrText>
             </w:r>
             <w:r>
               <w:rPr>
@@ -2045,7 +2045,7 @@
               <w:lang w:eastAsia="en-GB"/>
             </w:rPr>
           </w:pPr>
-          <w:hyperlink w:anchor="_Toc37837283" w:history="1">
+          <w:hyperlink w:anchor="_Toc38312651" w:history="1">
             <w:r>
               <w:rPr>
                 <w:rStyle w:val="Lienhypertexte"/>
@@ -2089,7 +2089,7 @@
                 <w:noProof/>
                 <w:webHidden/>
               </w:rPr>
-              <w:instrText xml:space="preserve"> PAGEREF _Toc37837283 \h </w:instrText>
+              <w:instrText xml:space="preserve"> PAGEREF _Toc38312651 \h </w:instrText>
             </w:r>
             <w:r>
               <w:rPr>
@@ -2133,7 +2133,7 @@
               <w:lang w:eastAsia="en-GB"/>
             </w:rPr>
           </w:pPr>
-          <w:hyperlink w:anchor="_Toc37837284" w:history="1">
+          <w:hyperlink w:anchor="_Toc38312652" w:history="1">
             <w:r>
               <w:rPr>
                 <w:rStyle w:val="Lienhypertexte"/>
@@ -2177,7 +2177,7 @@
                 <w:noProof/>
                 <w:webHidden/>
               </w:rPr>
-              <w:instrText xml:space="preserve"> PAGEREF _Toc37837284 \h </w:instrText>
+              <w:instrText xml:space="preserve"> PAGEREF _Toc38312652 \h </w:instrText>
             </w:r>
             <w:r>
               <w:rPr>
@@ -2221,7 +2221,7 @@
               <w:lang w:eastAsia="en-GB"/>
             </w:rPr>
           </w:pPr>
-          <w:hyperlink w:anchor="_Toc37837285" w:history="1">
+          <w:hyperlink w:anchor="_Toc38312653" w:history="1">
             <w:r>
               <w:rPr>
                 <w:rStyle w:val="Lienhypertexte"/>
@@ -2263,7 +2263,7 @@
                 <w:noProof/>
                 <w:webHidden/>
               </w:rPr>
-              <w:instrText xml:space="preserve"> PAGEREF _Toc37837285 \h </w:instrText>
+              <w:instrText xml:space="preserve"> PAGEREF _Toc38312653 \h </w:instrText>
             </w:r>
             <w:r>
               <w:rPr>
@@ -2307,7 +2307,7 @@
               <w:lang w:eastAsia="en-GB"/>
             </w:rPr>
           </w:pPr>
-          <w:hyperlink w:anchor="_Toc37837286" w:history="1">
+          <w:hyperlink w:anchor="_Toc38312654" w:history="1">
             <w:r>
               <w:rPr>
                 <w:rStyle w:val="Lienhypertexte"/>
@@ -2349,7 +2349,7 @@
                 <w:noProof/>
                 <w:webHidden/>
               </w:rPr>
-              <w:instrText xml:space="preserve"> PAGEREF _Toc37837286 \h </w:instrText>
+              <w:instrText xml:space="preserve"> PAGEREF _Toc38312654 \h </w:instrText>
             </w:r>
             <w:r>
               <w:rPr>
@@ -2393,7 +2393,7 @@
               <w:lang w:eastAsia="en-GB"/>
             </w:rPr>
           </w:pPr>
-          <w:hyperlink w:anchor="_Toc37837287" w:history="1">
+          <w:hyperlink w:anchor="_Toc38312655" w:history="1">
             <w:r>
               <w:rPr>
                 <w:rStyle w:val="Lienhypertexte"/>
@@ -2435,7 +2435,7 @@
                 <w:noProof/>
                 <w:webHidden/>
               </w:rPr>
-              <w:instrText xml:space="preserve"> PAGEREF _Toc37837287 \h </w:instrText>
+              <w:instrText xml:space="preserve"> PAGEREF _Toc38312655 \h </w:instrText>
             </w:r>
             <w:r>
               <w:rPr>
@@ -2479,12 +2479,270 @@
               <w:lang w:eastAsia="en-GB"/>
             </w:rPr>
           </w:pPr>
-          <w:hyperlink w:anchor="_Toc37837288" w:history="1">
+          <w:hyperlink w:anchor="_Toc38312656" w:history="1">
             <w:r>
               <w:rPr>
                 <w:rStyle w:val="Lienhypertexte"/>
                 <w:noProof/>
               </w:rPr>
+              <w:t>4.</w:t>
+            </w:r>
+            <w:r>
+              <w:rPr>
+                <w:rFonts w:eastAsiaTheme="minorEastAsia"/>
+                <w:noProof/>
+                <w:lang w:eastAsia="en-GB"/>
+              </w:rPr>
+              <w:tab/>
+            </w:r>
+            <w:r>
+              <w:rPr>
+                <w:rStyle w:val="Lienhypertexte"/>
+                <w:noProof/>
+              </w:rPr>
+              <w:t>GasNode</w:t>
+            </w:r>
+            <w:r>
+              <w:rPr>
+                <w:noProof/>
+                <w:webHidden/>
+              </w:rPr>
+              <w:tab/>
+            </w:r>
+            <w:r>
+              <w:rPr>
+                <w:noProof/>
+                <w:webHidden/>
+              </w:rPr>
+              <w:fldChar w:fldCharType="begin"/>
+            </w:r>
+            <w:r>
+              <w:rPr>
+                <w:noProof/>
+                <w:webHidden/>
+              </w:rPr>
+              <w:instrText xml:space="preserve"> PAGEREF _Toc38312656 \h </w:instrText>
+            </w:r>
+            <w:r>
+              <w:rPr>
+                <w:noProof/>
+                <w:webHidden/>
+              </w:rPr>
+            </w:r>
+            <w:r>
+              <w:rPr>
+                <w:noProof/>
+                <w:webHidden/>
+              </w:rPr>
+              <w:fldChar w:fldCharType="separate"/>
+            </w:r>
+            <w:r>
+              <w:rPr>
+                <w:noProof/>
+                <w:webHidden/>
+              </w:rPr>
+              <w:t>9</w:t>
+            </w:r>
+            <w:r>
+              <w:rPr>
+                <w:noProof/>
+                <w:webHidden/>
+              </w:rPr>
+              <w:fldChar w:fldCharType="end"/>
+            </w:r>
+          </w:hyperlink>
+        </w:p>
+        <w:p>
+          <w:pPr>
+            <w:pStyle w:val="TM3"/>
+            <w:tabs>
+              <w:tab w:val="left" w:pos="880"/>
+              <w:tab w:val="right" w:leader="dot" w:pos="9062"/>
+            </w:tabs>
+            <w:rPr>
+              <w:rFonts w:eastAsiaTheme="minorEastAsia"/>
+              <w:noProof/>
+              <w:lang w:eastAsia="en-GB"/>
+            </w:rPr>
+          </w:pPr>
+          <w:hyperlink w:anchor="_Toc38312657" w:history="1">
+            <w:r>
+              <w:rPr>
+                <w:rStyle w:val="Lienhypertexte"/>
+                <w:noProof/>
+              </w:rPr>
+              <w:t>5.</w:t>
+            </w:r>
+            <w:r>
+              <w:rPr>
+                <w:rFonts w:eastAsiaTheme="minorEastAsia"/>
+                <w:noProof/>
+                <w:lang w:eastAsia="en-GB"/>
+              </w:rPr>
+              <w:tab/>
+            </w:r>
+            <w:r>
+              <w:rPr>
+                <w:rStyle w:val="Lienhypertexte"/>
+                <w:noProof/>
+              </w:rPr>
+              <w:t>FogModel</w:t>
+            </w:r>
+            <w:r>
+              <w:rPr>
+                <w:noProof/>
+                <w:webHidden/>
+              </w:rPr>
+              <w:tab/>
+            </w:r>
+            <w:r>
+              <w:rPr>
+                <w:noProof/>
+                <w:webHidden/>
+              </w:rPr>
+              <w:fldChar w:fldCharType="begin"/>
+            </w:r>
+            <w:r>
+              <w:rPr>
+                <w:noProof/>
+                <w:webHidden/>
+              </w:rPr>
+              <w:instrText xml:space="preserve"> PAGEREF _Toc38312657 \h </w:instrText>
+            </w:r>
+            <w:r>
+              <w:rPr>
+                <w:noProof/>
+                <w:webHidden/>
+              </w:rPr>
+            </w:r>
+            <w:r>
+              <w:rPr>
+                <w:noProof/>
+                <w:webHidden/>
+              </w:rPr>
+              <w:fldChar w:fldCharType="separate"/>
+            </w:r>
+            <w:r>
+              <w:rPr>
+                <w:noProof/>
+                <w:webHidden/>
+              </w:rPr>
+              <w:t>10</w:t>
+            </w:r>
+            <w:r>
+              <w:rPr>
+                <w:noProof/>
+                <w:webHidden/>
+              </w:rPr>
+              <w:fldChar w:fldCharType="end"/>
+            </w:r>
+          </w:hyperlink>
+        </w:p>
+        <w:p>
+          <w:pPr>
+            <w:pStyle w:val="TM2"/>
+            <w:tabs>
+              <w:tab w:val="left" w:pos="660"/>
+              <w:tab w:val="right" w:leader="dot" w:pos="9062"/>
+            </w:tabs>
+            <w:rPr>
+              <w:rFonts w:eastAsiaTheme="minorEastAsia"/>
+              <w:noProof/>
+              <w:lang w:eastAsia="en-GB"/>
+            </w:rPr>
+          </w:pPr>
+          <w:hyperlink w:anchor="_Toc38312658" w:history="1">
+            <w:r>
+              <w:rPr>
+                <w:rStyle w:val="Lienhypertexte"/>
+                <w:noProof/>
+              </w:rPr>
+              <w:t>B.</w:t>
+            </w:r>
+            <w:r>
+              <w:rPr>
+                <w:rFonts w:eastAsiaTheme="minorEastAsia"/>
+                <w:noProof/>
+                <w:lang w:eastAsia="en-GB"/>
+              </w:rPr>
+              <w:tab/>
+            </w:r>
+            <w:r>
+              <w:rPr>
+                <w:rStyle w:val="Lienhypertexte"/>
+                <w:noProof/>
+              </w:rPr>
+              <w:t>Functions</w:t>
+            </w:r>
+            <w:r>
+              <w:rPr>
+                <w:noProof/>
+                <w:webHidden/>
+              </w:rPr>
+              <w:tab/>
+            </w:r>
+            <w:r>
+              <w:rPr>
+                <w:noProof/>
+                <w:webHidden/>
+              </w:rPr>
+              <w:fldChar w:fldCharType="begin"/>
+            </w:r>
+            <w:r>
+              <w:rPr>
+                <w:noProof/>
+                <w:webHidden/>
+              </w:rPr>
+              <w:instrText xml:space="preserve"> PAGEREF _Toc38312658 \h </w:instrText>
+            </w:r>
+            <w:r>
+              <w:rPr>
+                <w:noProof/>
+                <w:webHidden/>
+              </w:rPr>
+            </w:r>
+            <w:r>
+              <w:rPr>
+                <w:noProof/>
+                <w:webHidden/>
+              </w:rPr>
+              <w:fldChar w:fldCharType="separate"/>
+            </w:r>
+            <w:r>
+              <w:rPr>
+                <w:noProof/>
+                <w:webHidden/>
+              </w:rPr>
+              <w:t>11</w:t>
+            </w:r>
+            <w:r>
+              <w:rPr>
+                <w:noProof/>
+                <w:webHidden/>
+              </w:rPr>
+              <w:fldChar w:fldCharType="end"/>
+            </w:r>
+          </w:hyperlink>
+        </w:p>
+        <w:p>
+          <w:pPr>
+            <w:pStyle w:val="TM3"/>
+            <w:tabs>
+              <w:tab w:val="left" w:pos="880"/>
+              <w:tab w:val="right" w:leader="dot" w:pos="9062"/>
+            </w:tabs>
+            <w:rPr>
+              <w:rFonts w:eastAsiaTheme="minorEastAsia"/>
+              <w:noProof/>
+              <w:lang w:eastAsia="en-GB"/>
+            </w:rPr>
+          </w:pPr>
+          <w:hyperlink w:anchor="_Toc38312659" w:history="1">
+            <w:r>
+              <w:rPr>
+                <w:rStyle w:val="Lienhypertexte"/>
+                <w:noProof/>
+              </w:rPr>
               <w:t>1.</w:t>
             </w:r>
             <w:r>
@@ -2500,7 +2758,21 @@
                 <w:rStyle w:val="Lienhypertexte"/>
                 <w:noProof/>
               </w:rPr>
-              <w:t>GasNode</w:t>
+              <w:t>rootsPo</w:t>
+            </w:r>
+            <w:r>
+              <w:rPr>
+                <w:rStyle w:val="Lienhypertexte"/>
+                <w:noProof/>
+              </w:rPr>
+              <w:t>l</w:t>
+            </w:r>
+            <w:r>
+              <w:rPr>
+                <w:rStyle w:val="Lienhypertexte"/>
+                <w:noProof/>
+              </w:rPr>
+              <w:t>yorder3</w:t>
             </w:r>
             <w:r>
               <w:rPr>
@@ -2521,7 +2793,7 @@
                 <w:noProof/>
                 <w:webHidden/>
               </w:rPr>
-              <w:instrText xml:space="preserve"> PAGEREF _Toc37837288 \h </w:instrText>
+              <w:instrText xml:space="preserve"> PAGEREF _Toc38312659 \h </w:instrText>
             </w:r>
             <w:r>
               <w:rPr>
@@ -2541,7 +2813,7 @@
                 <w:noProof/>
                 <w:webHidden/>
               </w:rPr>
-              <w:t>9</w:t>
+              <w:t>11</w:t>
             </w:r>
             <w:r>
               <w:rPr>
@@ -2565,7 +2837,7 @@
               <w:lang w:eastAsia="en-GB"/>
             </w:rPr>
           </w:pPr>
-          <w:hyperlink w:anchor="_Toc37837289" w:history="1">
+          <w:hyperlink w:anchor="_Toc38312660" w:history="1">
             <w:r>
               <w:rPr>
                 <w:rStyle w:val="Lienhypertexte"/>
@@ -2609,7 +2881,7 @@
                 <w:noProof/>
                 <w:webHidden/>
               </w:rPr>
-              <w:instrText xml:space="preserve"> PAGEREF _Toc37837289 \h </w:instrText>
+              <w:instrText xml:space="preserve"> PAGEREF _Toc38312660 \h </w:instrText>
             </w:r>
             <w:r>
               <w:rPr>
@@ -2629,7 +2901,7 @@
                 <w:noProof/>
                 <w:webHidden/>
               </w:rPr>
-              <w:t>9</w:t>
+              <w:t>12</w:t>
             </w:r>
             <w:r>
               <w:rPr>
@@ -2653,7 +2925,7 @@
               <w:lang w:eastAsia="en-GB"/>
             </w:rPr>
           </w:pPr>
-          <w:hyperlink w:anchor="_Toc37837290" w:history="1">
+          <w:hyperlink w:anchor="_Toc38312661" w:history="1">
             <w:r>
               <w:rPr>
                 <w:rStyle w:val="Lienhypertexte"/>
@@ -2697,7 +2969,7 @@
                 <w:noProof/>
                 <w:webHidden/>
               </w:rPr>
-              <w:instrText xml:space="preserve"> PAGEREF _Toc37837290 \h </w:instrText>
+              <w:instrText xml:space="preserve"> PAGEREF _Toc38312661 \h </w:instrText>
             </w:r>
             <w:r>
               <w:rPr>
@@ -2717,7 +2989,7 @@
                 <w:noProof/>
                 <w:webHidden/>
               </w:rPr>
-              <w:t>10</w:t>
+              <w:t>12</w:t>
             </w:r>
             <w:r>
               <w:rPr>
@@ -2741,7 +3013,7 @@
               <w:lang w:eastAsia="en-GB"/>
             </w:rPr>
           </w:pPr>
-          <w:hyperlink w:anchor="_Toc37837291" w:history="1">
+          <w:hyperlink w:anchor="_Toc38312662" w:history="1">
             <w:r>
               <w:rPr>
                 <w:rStyle w:val="Lienhypertexte"/>
@@ -2783,7 +3055,7 @@
                 <w:noProof/>
                 <w:webHidden/>
               </w:rPr>
-              <w:instrText xml:space="preserve"> PAGEREF _Toc37837291 \h </w:instrText>
+              <w:instrText xml:space="preserve"> PAGEREF _Toc38312662 \h </w:instrText>
             </w:r>
             <w:r>
               <w:rPr>
@@ -2803,7 +3075,7 @@
                 <w:noProof/>
                 <w:webHidden/>
               </w:rPr>
-              <w:t>10</w:t>
+              <w:t>12</w:t>
             </w:r>
             <w:r>
               <w:rPr>
@@ -2865,7 +3137,7 @@
           <w:lang w:val="fr-FR"/>
         </w:rPr>
       </w:pPr>
-      <w:bookmarkStart w:id="0" w:name="_Toc37837260"/>
+      <w:bookmarkStart w:id="0" w:name="_Toc38312628"/>
       <w:proofErr w:type="spellStart"/>
       <w:r>
         <w:rPr>
@@ -2892,7 +3164,7 @@
           <w:lang w:val="fr-FR"/>
         </w:rPr>
       </w:pPr>
-      <w:bookmarkStart w:id="1" w:name="_Toc37837261"/>
+      <w:bookmarkStart w:id="1" w:name="_Toc38312629"/>
       <w:r>
         <w:rPr>
           <w:lang w:val="fr-FR"/>
@@ -2915,7 +3187,7 @@
           <w:rFonts w:eastAsiaTheme="minorEastAsia"/>
         </w:rPr>
       </w:pPr>
-      <w:bookmarkStart w:id="2" w:name="_Toc37837262"/>
+      <w:bookmarkStart w:id="2" w:name="_Toc38312630"/>
       <w:r>
         <w:rPr>
           <w:rFonts w:eastAsiaTheme="minorEastAsia"/>
@@ -3382,7 +3654,7 @@
           <w:rFonts w:eastAsiaTheme="minorEastAsia"/>
         </w:rPr>
       </w:pPr>
-      <w:bookmarkStart w:id="3" w:name="_Toc37837263"/>
+      <w:bookmarkStart w:id="3" w:name="_Toc38312631"/>
       <w:proofErr w:type="spellStart"/>
       <w:r>
         <w:rPr>
@@ -4343,7 +4615,7 @@
           <w:rFonts w:eastAsiaTheme="minorEastAsia"/>
         </w:rPr>
       </w:pPr>
-      <w:bookmarkStart w:id="4" w:name="_Toc37837264"/>
+      <w:bookmarkStart w:id="4" w:name="_Toc38312632"/>
       <w:proofErr w:type="spellStart"/>
       <w:r>
         <w:rPr>
@@ -4825,7 +5097,7 @@
           <w:lang w:val="fr-FR"/>
         </w:rPr>
       </w:pPr>
-      <w:bookmarkStart w:id="5" w:name="_Toc37837265"/>
+      <w:bookmarkStart w:id="5" w:name="_Toc38312633"/>
       <w:proofErr w:type="spellStart"/>
       <w:r>
         <w:rPr>
@@ -4851,7 +5123,7 @@
           <w:rFonts w:eastAsiaTheme="minorEastAsia"/>
         </w:rPr>
       </w:pPr>
-      <w:bookmarkStart w:id="6" w:name="_Toc37837266"/>
+      <w:bookmarkStart w:id="6" w:name="_Toc38312634"/>
       <w:proofErr w:type="spellStart"/>
       <w:r>
         <w:rPr>
@@ -4906,7 +5178,7 @@
           <w:rFonts w:eastAsiaTheme="minorEastAsia"/>
         </w:rPr>
       </w:pPr>
-      <w:bookmarkStart w:id="7" w:name="_Toc37837267"/>
+      <w:bookmarkStart w:id="7" w:name="_Toc38312635"/>
       <w:r>
         <w:rPr>
           <w:rFonts w:eastAsiaTheme="minorEastAsia"/>
@@ -4994,7 +5266,7 @@
           <w:rFonts w:eastAsiaTheme="minorEastAsia"/>
         </w:rPr>
       </w:pPr>
-      <w:bookmarkStart w:id="8" w:name="_Toc37837268"/>
+      <w:bookmarkStart w:id="8" w:name="_Toc38312636"/>
       <w:r>
         <w:rPr>
           <w:rFonts w:eastAsiaTheme="minorEastAsia"/>
@@ -5128,7 +5400,7 @@
           <w:rFonts w:eastAsiaTheme="minorEastAsia"/>
         </w:rPr>
       </w:pPr>
-      <w:bookmarkStart w:id="9" w:name="_Toc37837269"/>
+      <w:bookmarkStart w:id="9" w:name="_Toc38312637"/>
       <w:r>
         <w:rPr>
           <w:rFonts w:eastAsiaTheme="minorEastAsia"/>
@@ -5609,7 +5881,7 @@
           <w:rFonts w:eastAsiaTheme="minorEastAsia"/>
         </w:rPr>
       </w:pPr>
-      <w:bookmarkStart w:id="10" w:name="_Toc37837270"/>
+      <w:bookmarkStart w:id="10" w:name="_Toc38312638"/>
       <w:proofErr w:type="spellStart"/>
       <w:r>
         <w:rPr>
@@ -5684,7 +5956,7 @@
           <w:rFonts w:eastAsiaTheme="minorEastAsia"/>
         </w:rPr>
       </w:pPr>
-      <w:bookmarkStart w:id="11" w:name="_Toc37837271"/>
+      <w:bookmarkStart w:id="11" w:name="_Toc38312639"/>
       <w:proofErr w:type="spellStart"/>
       <w:r>
         <w:rPr>
@@ -5797,7 +6069,7 @@
           <w:rFonts w:eastAsiaTheme="minorEastAsia"/>
         </w:rPr>
       </w:pPr>
-      <w:bookmarkStart w:id="12" w:name="_Toc37837272"/>
+      <w:bookmarkStart w:id="12" w:name="_Toc38312640"/>
       <w:r>
         <w:rPr>
           <w:rFonts w:eastAsiaTheme="minorEastAsia"/>
@@ -6520,7 +6792,7 @@
           <w:rFonts w:eastAsiaTheme="minorEastAsia"/>
         </w:rPr>
       </w:pPr>
-      <w:bookmarkStart w:id="13" w:name="_Toc37837273"/>
+      <w:bookmarkStart w:id="13" w:name="_Toc38312641"/>
       <w:proofErr w:type="spellStart"/>
       <w:r>
         <w:rPr>
@@ -6679,7 +6951,7 @@
           <w:lang w:val="fr-FR"/>
         </w:rPr>
       </w:pPr>
-      <w:bookmarkStart w:id="14" w:name="_Toc37837274"/>
+      <w:bookmarkStart w:id="14" w:name="_Toc38312642"/>
       <w:proofErr w:type="spellStart"/>
       <w:r>
         <w:rPr>
@@ -6706,7 +6978,7 @@
           <w:rFonts w:eastAsiaTheme="minorEastAsia"/>
         </w:rPr>
       </w:pPr>
-      <w:bookmarkStart w:id="15" w:name="_Toc37837275"/>
+      <w:bookmarkStart w:id="15" w:name="_Toc38312643"/>
       <w:proofErr w:type="spellStart"/>
       <w:r>
         <w:rPr>
@@ -6828,7 +7100,7 @@
           <w:rFonts w:eastAsiaTheme="minorEastAsia"/>
         </w:rPr>
       </w:pPr>
-      <w:bookmarkStart w:id="16" w:name="_Toc37837276"/>
+      <w:bookmarkStart w:id="16" w:name="_Toc38312644"/>
       <w:proofErr w:type="spellStart"/>
       <w:r>
         <w:rPr>
@@ -6951,7 +7223,7 @@
           <w:rFonts w:eastAsiaTheme="minorEastAsia"/>
         </w:rPr>
       </w:pPr>
-      <w:bookmarkStart w:id="17" w:name="_Toc37837277"/>
+      <w:bookmarkStart w:id="17" w:name="_Toc38312645"/>
       <w:proofErr w:type="spellStart"/>
       <w:proofErr w:type="gramStart"/>
       <w:r>
@@ -7096,7 +7368,7 @@
           <w:rFonts w:eastAsiaTheme="minorEastAsia"/>
         </w:rPr>
       </w:pPr>
-      <w:bookmarkStart w:id="18" w:name="_Toc37837278"/>
+      <w:bookmarkStart w:id="18" w:name="_Toc38312646"/>
       <w:proofErr w:type="spellStart"/>
       <w:proofErr w:type="gramStart"/>
       <w:r>
@@ -8110,7 +8382,7 @@
           <w:rFonts w:eastAsiaTheme="minorEastAsia"/>
         </w:rPr>
       </w:pPr>
-      <w:bookmarkStart w:id="19" w:name="_Toc37837279"/>
+      <w:bookmarkStart w:id="19" w:name="_Toc38312647"/>
       <w:proofErr w:type="spellStart"/>
       <w:proofErr w:type="gramStart"/>
       <w:r>
@@ -8135,7 +8407,13 @@
             <w:rPr>
               <w:rFonts w:ascii="Cambria Math" w:eastAsiaTheme="minorEastAsia" w:hAnsi="Cambria Math"/>
             </w:rPr>
-            <m:t>dx= Biot×</m:t>
+            <m:t>dx= B</m:t>
+          </m:r>
+          <m:r>
+            <w:rPr>
+              <w:rFonts w:ascii="Cambria Math" w:eastAsiaTheme="minorEastAsia" w:hAnsi="Cambria Math"/>
+            </w:rPr>
+            <m:t>iot×</m:t>
           </m:r>
           <m:f>
             <m:fPr>
@@ -8358,7 +8636,7 @@
           <w:rFonts w:eastAsiaTheme="minorEastAsia"/>
         </w:rPr>
       </w:pPr>
-      <w:bookmarkStart w:id="20" w:name="_Toc37837280"/>
+      <w:bookmarkStart w:id="20" w:name="_Toc38312648"/>
       <w:proofErr w:type="spellStart"/>
       <w:proofErr w:type="gramStart"/>
       <w:r>
@@ -9418,7 +9696,7 @@
           <w:rFonts w:eastAsiaTheme="minorEastAsia"/>
         </w:rPr>
       </w:pPr>
-      <w:bookmarkStart w:id="21" w:name="_Toc37837281"/>
+      <w:bookmarkStart w:id="21" w:name="_Toc38312649"/>
       <w:proofErr w:type="spellStart"/>
       <w:proofErr w:type="gramStart"/>
       <w:r>
@@ -9601,7 +9879,7 @@
           <w:rFonts w:eastAsiaTheme="minorEastAsia"/>
         </w:rPr>
       </w:pPr>
-      <w:bookmarkStart w:id="22" w:name="_Toc37837282"/>
+      <w:bookmarkStart w:id="22" w:name="_Toc38312650"/>
       <w:proofErr w:type="spellStart"/>
       <w:r>
         <w:rPr>
@@ -9851,7 +10129,7 @@
           <w:lang w:val="fr-FR"/>
         </w:rPr>
       </w:pPr>
-      <w:bookmarkStart w:id="23" w:name="_Toc37837283"/>
+      <w:bookmarkStart w:id="23" w:name="_Toc38312651"/>
       <w:proofErr w:type="spellStart"/>
       <w:r>
         <w:rPr>
@@ -9878,7 +10156,7 @@
           <w:lang w:val="fr-FR"/>
         </w:rPr>
       </w:pPr>
-      <w:bookmarkStart w:id="24" w:name="_Toc37837284"/>
+      <w:bookmarkStart w:id="24" w:name="_Toc38312652"/>
       <w:proofErr w:type="spellStart"/>
       <w:r>
         <w:rPr>
@@ -9903,7 +10181,7 @@
           <w:rFonts w:eastAsiaTheme="minorEastAsia"/>
         </w:rPr>
       </w:pPr>
-      <w:bookmarkStart w:id="25" w:name="_Toc37837285"/>
+      <w:bookmarkStart w:id="25" w:name="_Toc38312653"/>
       <w:proofErr w:type="spellStart"/>
       <w:r>
         <w:rPr>
@@ -10165,7 +10443,7 @@
           <w:rFonts w:eastAsiaTheme="minorEastAsia"/>
         </w:rPr>
       </w:pPr>
-      <w:bookmarkStart w:id="26" w:name="_Toc37837286"/>
+      <w:bookmarkStart w:id="26" w:name="_Toc38312654"/>
       <w:r>
         <w:rPr>
           <w:rFonts w:eastAsiaTheme="minorEastAsia"/>
@@ -10386,7 +10664,7 @@
           <w:rFonts w:eastAsiaTheme="minorEastAsia"/>
         </w:rPr>
       </w:pPr>
-      <w:bookmarkStart w:id="27" w:name="_Toc37837287"/>
+      <w:bookmarkStart w:id="27" w:name="_Toc38312655"/>
       <w:proofErr w:type="spellStart"/>
       <w:r>
         <w:rPr>
@@ -10651,7 +10929,6 @@
           </m:r>
         </m:oMath>
       </m:oMathPara>
-      <w:bookmarkStart w:id="28" w:name="_Toc37837288"/>
     </w:p>
     <w:p>
       <w:pPr>
@@ -10667,6 +10944,7 @@
           <w:rFonts w:eastAsiaTheme="minorEastAsia"/>
         </w:rPr>
       </w:pPr>
+      <w:bookmarkStart w:id="28" w:name="_Toc38312656"/>
       <w:proofErr w:type="spellStart"/>
       <w:r>
         <w:rPr>
@@ -10702,7 +10980,13 @@
             <w:rPr>
               <w:rFonts w:ascii="Cambria Math" w:eastAsiaTheme="minorEastAsia" w:hAnsi="Cambria Math"/>
             </w:rPr>
-            <m:t>U=m×medium.u</m:t>
+            <m:t>U=m×m</m:t>
+          </m:r>
+          <m:r>
+            <w:rPr>
+              <w:rFonts w:ascii="Cambria Math" w:eastAsiaTheme="minorEastAsia" w:hAnsi="Cambria Math"/>
+            </w:rPr>
+            <m:t>edium.u</m:t>
           </m:r>
         </m:oMath>
       </m:oMathPara>
@@ -10881,11 +11165,13 @@
       <w:pPr>
         <w:pStyle w:val="Titre3"/>
       </w:pPr>
+      <w:bookmarkStart w:id="29" w:name="_Toc38312657"/>
       <w:proofErr w:type="spellStart"/>
       <w:r>
         <w:lastRenderedPageBreak/>
         <w:t>FogModel</w:t>
       </w:r>
+      <w:bookmarkEnd w:id="29"/>
       <w:proofErr w:type="spellEnd"/>
     </w:p>
     <w:p/>
@@ -11248,13 +11534,7 @@
                 <w:rPr>
                   <w:rFonts w:ascii="Cambria Math" w:eastAsiaTheme="minorEastAsia" w:hAnsi="Cambria Math"/>
                 </w:rPr>
-                <m:t>dr</m:t>
-              </m:r>
-              <m:r>
-                <w:rPr>
-                  <w:rFonts w:ascii="Cambria Math" w:eastAsiaTheme="minorEastAsia" w:hAnsi="Cambria Math"/>
-                </w:rPr>
-                <m:t>oplet</m:t>
+                <m:t>droplet</m:t>
               </m:r>
             </m:sub>
           </m:sSub>
@@ -11569,7 +11849,13 @@
             <w:rPr>
               <w:rFonts w:ascii="Cambria Math" w:eastAsiaTheme="minorEastAsia" w:hAnsi="Cambria Math"/>
             </w:rPr>
-            <m:t xml:space="preserve">m_flow= </m:t>
+            <m:t>m_flo</m:t>
+          </m:r>
+          <m:r>
+            <w:rPr>
+              <w:rFonts w:ascii="Cambria Math" w:eastAsiaTheme="minorEastAsia" w:hAnsi="Cambria Math"/>
+            </w:rPr>
+            <m:t xml:space="preserve">w= </m:t>
           </m:r>
           <m:sSub>
             <m:sSubPr>
@@ -12076,7 +12362,13 @@
             <w:rPr>
               <w:rFonts w:ascii="Cambria Math" w:eastAsiaTheme="minorEastAsia" w:hAnsi="Cambria Math"/>
             </w:rPr>
-            <m:t xml:space="preserve">+flowPort.m_flow[i]  </m:t>
+            <m:t>+flowPort.m_f</m:t>
+          </m:r>
+          <m:r>
+            <w:rPr>
+              <w:rFonts w:ascii="Cambria Math" w:eastAsiaTheme="minorEastAsia" w:hAnsi="Cambria Math"/>
+            </w:rPr>
+            <m:t xml:space="preserve">low[i]  </m:t>
           </m:r>
         </m:oMath>
       </m:oMathPara>
@@ -12172,13 +12464,7 @@
                     <w:rPr>
                       <w:rFonts w:ascii="Cambria Math" w:eastAsiaTheme="minorEastAsia" w:hAnsi="Cambria Math"/>
                     </w:rPr>
-                    <m:t>fluidPort.m_flow×act</m:t>
-                  </m:r>
-                  <m:r>
-                    <w:rPr>
-                      <w:rFonts w:ascii="Cambria Math" w:eastAsiaTheme="minorEastAsia" w:hAnsi="Cambria Math"/>
-                    </w:rPr>
-                    <m:t>ualStream(fluidPort.h_outflow)</m:t>
+                    <m:t>fluidPort.m_flow×actualStream(fluidPort.h_outflow)</m:t>
                   </m:r>
                 </m:e>
               </m:d>
@@ -12211,10 +12497,12 @@
       <w:pPr>
         <w:pStyle w:val="Titre2"/>
       </w:pPr>
+      <w:bookmarkStart w:id="30" w:name="_Toc38312658"/>
       <w:r>
         <w:lastRenderedPageBreak/>
         <w:t>Functions</w:t>
       </w:r>
+      <w:bookmarkEnd w:id="30"/>
     </w:p>
     <w:p>
       <w:pPr>
@@ -12230,12 +12518,14 @@
           <w:rFonts w:eastAsiaTheme="minorEastAsia"/>
         </w:rPr>
       </w:pPr>
+      <w:bookmarkStart w:id="31" w:name="_Toc38312659"/>
       <w:r>
         <w:rPr>
           <w:rFonts w:eastAsiaTheme="minorEastAsia"/>
         </w:rPr>
         <w:t>rootsPolyorder3</w:t>
       </w:r>
+      <w:bookmarkEnd w:id="31"/>
     </w:p>
     <w:p/>
     <w:p>
@@ -12351,19 +12641,59 @@
           <w:rFonts w:eastAsiaTheme="minorEastAsia"/>
         </w:rPr>
       </w:pPr>
+      <w:r>
+        <w:rPr>
+          <w:rFonts w:eastAsiaTheme="minorEastAsia"/>
+        </w:rPr>
+        <w:t>Si discriminant = 0</w:t>
+      </w:r>
+    </w:p>
+    <w:p>
+      <w:pPr>
+        <w:ind w:left="-567" w:right="-567"/>
+        <w:rPr>
+          <w:rFonts w:eastAsiaTheme="minorEastAsia"/>
+        </w:rPr>
+      </w:pPr>
       <m:oMathPara>
         <m:oMath>
           <m:r>
             <w:rPr>
               <w:rFonts w:ascii="Cambria Math" w:eastAsiaTheme="minorEastAsia" w:hAnsi="Cambria Math"/>
             </w:rPr>
-            <m:t>X=</m:t>
-          </m:r>
+            <m:t>x1=</m:t>
+          </m:r>
+          <m:f>
+            <m:fPr>
+              <m:ctrlPr>
+                <w:rPr>
+                  <w:rFonts w:ascii="Cambria Math" w:eastAsiaTheme="minorEastAsia" w:hAnsi="Cambria Math"/>
+                  <w:i/>
+                </w:rPr>
+              </m:ctrlPr>
+            </m:fPr>
+            <m:num>
+              <m:r>
+                <w:rPr>
+                  <w:rFonts w:ascii="Cambria Math" w:eastAsiaTheme="minorEastAsia" w:hAnsi="Cambria Math"/>
+                </w:rPr>
+                <m:t>3q</m:t>
+              </m:r>
+            </m:num>
+            <m:den>
+              <m:r>
+                <w:rPr>
+                  <w:rFonts w:ascii="Cambria Math" w:eastAsiaTheme="minorEastAsia" w:hAnsi="Cambria Math"/>
+                </w:rPr>
+                <m:t>p</m:t>
+              </m:r>
+            </m:den>
+          </m:f>
           <m:r>
             <w:rPr>
               <w:rFonts w:ascii="Cambria Math" w:eastAsiaTheme="minorEastAsia" w:hAnsi="Cambria Math"/>
             </w:rPr>
-            <m:t>x+</m:t>
+            <m:t>-</m:t>
           </m:r>
           <m:f>
             <m:fPr>
@@ -12407,6 +12737,1308 @@
             <w:rPr>
               <w:rFonts w:ascii="Cambria Math" w:eastAsiaTheme="minorEastAsia" w:hAnsi="Cambria Math"/>
             </w:rPr>
+            <m:t>x2=x3=-</m:t>
+          </m:r>
+          <m:f>
+            <m:fPr>
+              <m:ctrlPr>
+                <w:rPr>
+                  <w:rFonts w:ascii="Cambria Math" w:eastAsiaTheme="minorEastAsia" w:hAnsi="Cambria Math"/>
+                  <w:i/>
+                </w:rPr>
+              </m:ctrlPr>
+            </m:fPr>
+            <m:num>
+              <m:r>
+                <w:rPr>
+                  <w:rFonts w:ascii="Cambria Math" w:eastAsiaTheme="minorEastAsia" w:hAnsi="Cambria Math"/>
+                </w:rPr>
+                <m:t>3q</m:t>
+              </m:r>
+            </m:num>
+            <m:den>
+              <m:r>
+                <w:rPr>
+                  <w:rFonts w:ascii="Cambria Math" w:eastAsiaTheme="minorEastAsia" w:hAnsi="Cambria Math"/>
+                </w:rPr>
+                <m:t>2p</m:t>
+              </m:r>
+            </m:den>
+          </m:f>
+          <m:r>
+            <w:rPr>
+              <w:rFonts w:ascii="Cambria Math" w:eastAsiaTheme="minorEastAsia" w:hAnsi="Cambria Math"/>
+            </w:rPr>
+            <m:t>-</m:t>
+          </m:r>
+          <m:f>
+            <m:fPr>
+              <m:ctrlPr>
+                <w:rPr>
+                  <w:rFonts w:ascii="Cambria Math" w:eastAsiaTheme="minorEastAsia" w:hAnsi="Cambria Math"/>
+                  <w:i/>
+                </w:rPr>
+              </m:ctrlPr>
+            </m:fPr>
+            <m:num>
+              <m:r>
+                <w:rPr>
+                  <w:rFonts w:ascii="Cambria Math" w:eastAsiaTheme="minorEastAsia" w:hAnsi="Cambria Math"/>
+                </w:rPr>
+                <m:t>b</m:t>
+              </m:r>
+            </m:num>
+            <m:den>
+              <m:r>
+                <w:rPr>
+                  <w:rFonts w:ascii="Cambria Math" w:eastAsiaTheme="minorEastAsia" w:hAnsi="Cambria Math"/>
+                </w:rPr>
+                <m:t>3a</m:t>
+              </m:r>
+            </m:den>
+          </m:f>
+        </m:oMath>
+      </m:oMathPara>
+    </w:p>
+    <w:p>
+      <w:pPr>
+        <w:ind w:left="-567" w:right="-567"/>
+        <w:rPr>
+          <w:rFonts w:eastAsiaTheme="minorEastAsia"/>
+        </w:rPr>
+      </w:pPr>
+      <w:r>
+        <w:rPr>
+          <w:rFonts w:eastAsiaTheme="minorEastAsia"/>
+        </w:rPr>
+        <w:t>Si discriminant &lt; 0</w:t>
+      </w:r>
+    </w:p>
+    <w:p>
+      <w:pPr>
+        <w:ind w:left="-567" w:right="-567"/>
+        <w:rPr>
+          <w:rFonts w:eastAsiaTheme="minorEastAsia"/>
+        </w:rPr>
+      </w:pPr>
+      <m:oMathPara>
+        <m:oMath>
+          <m:r>
+            <w:rPr>
+              <w:rFonts w:ascii="Cambria Math" w:eastAsiaTheme="minorEastAsia" w:hAnsi="Cambria Math"/>
+            </w:rPr>
+            <m:t>x1=</m:t>
+          </m:r>
+          <m:rad>
+            <m:radPr>
+              <m:ctrlPr>
+                <w:rPr>
+                  <w:rFonts w:ascii="Cambria Math" w:eastAsiaTheme="minorEastAsia" w:hAnsi="Cambria Math"/>
+                  <w:i/>
+                </w:rPr>
+              </m:ctrlPr>
+            </m:radPr>
+            <m:deg>
+              <m:r>
+                <w:rPr>
+                  <w:rFonts w:ascii="Cambria Math" w:hAnsi="Cambria Math"/>
+                </w:rPr>
+                <m:t>3</m:t>
+              </m:r>
+            </m:deg>
+            <m:e>
+              <m:f>
+                <m:fPr>
+                  <m:ctrlPr>
+                    <w:rPr>
+                      <w:rFonts w:ascii="Cambria Math" w:eastAsiaTheme="minorEastAsia" w:hAnsi="Cambria Math"/>
+                      <w:i/>
+                    </w:rPr>
+                  </m:ctrlPr>
+                </m:fPr>
+                <m:num>
+                  <m:r>
+                    <w:rPr>
+                      <w:rFonts w:ascii="Cambria Math" w:eastAsiaTheme="minorEastAsia" w:hAnsi="Cambria Math"/>
+                    </w:rPr>
+                    <m:t>-q+</m:t>
+                  </m:r>
+                  <m:rad>
+                    <m:radPr>
+                      <m:degHide m:val="1"/>
+                      <m:ctrlPr>
+                        <w:rPr>
+                          <w:rFonts w:ascii="Cambria Math" w:eastAsiaTheme="minorEastAsia" w:hAnsi="Cambria Math"/>
+                          <w:i/>
+                        </w:rPr>
+                      </m:ctrlPr>
+                    </m:radPr>
+                    <m:deg/>
+                    <m:e>
+                      <m:r>
+                        <w:rPr>
+                          <w:rFonts w:ascii="Cambria Math" w:eastAsiaTheme="minorEastAsia" w:hAnsi="Cambria Math"/>
+                        </w:rPr>
+                        <m:t>-</m:t>
+                      </m:r>
+                      <m:f>
+                        <m:fPr>
+                          <m:ctrlPr>
+                            <w:rPr>
+                              <w:rFonts w:ascii="Cambria Math" w:eastAsiaTheme="minorEastAsia" w:hAnsi="Cambria Math"/>
+                              <w:i/>
+                            </w:rPr>
+                          </m:ctrlPr>
+                        </m:fPr>
+                        <m:num>
+                          <m:r>
+                            <w:rPr>
+                              <w:rFonts w:ascii="Cambria Math" w:eastAsiaTheme="minorEastAsia" w:hAnsi="Cambria Math"/>
+                            </w:rPr>
+                            <m:t>∆</m:t>
+                          </m:r>
+                        </m:num>
+                        <m:den>
+                          <m:r>
+                            <w:rPr>
+                              <w:rFonts w:ascii="Cambria Math" w:eastAsiaTheme="minorEastAsia" w:hAnsi="Cambria Math"/>
+                            </w:rPr>
+                            <m:t>27</m:t>
+                          </m:r>
+                        </m:den>
+                      </m:f>
+                    </m:e>
+                  </m:rad>
+                </m:num>
+                <m:den>
+                  <m:r>
+                    <w:rPr>
+                      <w:rFonts w:ascii="Cambria Math" w:eastAsiaTheme="minorEastAsia" w:hAnsi="Cambria Math"/>
+                    </w:rPr>
+                    <m:t>2</m:t>
+                  </m:r>
+                </m:den>
+              </m:f>
+            </m:e>
+          </m:rad>
+          <m:r>
+            <w:rPr>
+              <w:rFonts w:ascii="Cambria Math" w:eastAsiaTheme="minorEastAsia" w:hAnsi="Cambria Math"/>
+            </w:rPr>
+            <m:t>+</m:t>
+          </m:r>
+          <m:rad>
+            <m:radPr>
+              <m:ctrlPr>
+                <w:rPr>
+                  <w:rFonts w:ascii="Cambria Math" w:eastAsiaTheme="minorEastAsia" w:hAnsi="Cambria Math"/>
+                  <w:i/>
+                </w:rPr>
+              </m:ctrlPr>
+            </m:radPr>
+            <m:deg>
+              <m:r>
+                <w:rPr>
+                  <w:rFonts w:ascii="Cambria Math" w:hAnsi="Cambria Math"/>
+                </w:rPr>
+                <m:t>3</m:t>
+              </m:r>
+            </m:deg>
+            <m:e>
+              <m:f>
+                <m:fPr>
+                  <m:ctrlPr>
+                    <w:rPr>
+                      <w:rFonts w:ascii="Cambria Math" w:eastAsiaTheme="minorEastAsia" w:hAnsi="Cambria Math"/>
+                      <w:i/>
+                    </w:rPr>
+                  </m:ctrlPr>
+                </m:fPr>
+                <m:num>
+                  <m:r>
+                    <w:rPr>
+                      <w:rFonts w:ascii="Cambria Math" w:eastAsiaTheme="minorEastAsia" w:hAnsi="Cambria Math"/>
+                    </w:rPr>
+                    <m:t>-q</m:t>
+                  </m:r>
+                  <m:r>
+                    <w:rPr>
+                      <w:rFonts w:ascii="Cambria Math" w:eastAsiaTheme="minorEastAsia" w:hAnsi="Cambria Math"/>
+                    </w:rPr>
+                    <m:t>-</m:t>
+                  </m:r>
+                  <m:rad>
+                    <m:radPr>
+                      <m:degHide m:val="1"/>
+                      <m:ctrlPr>
+                        <w:rPr>
+                          <w:rFonts w:ascii="Cambria Math" w:eastAsiaTheme="minorEastAsia" w:hAnsi="Cambria Math"/>
+                          <w:i/>
+                        </w:rPr>
+                      </m:ctrlPr>
+                    </m:radPr>
+                    <m:deg/>
+                    <m:e>
+                      <m:r>
+                        <w:rPr>
+                          <w:rFonts w:ascii="Cambria Math" w:eastAsiaTheme="minorEastAsia" w:hAnsi="Cambria Math"/>
+                        </w:rPr>
+                        <m:t>-</m:t>
+                      </m:r>
+                      <m:f>
+                        <m:fPr>
+                          <m:ctrlPr>
+                            <w:rPr>
+                              <w:rFonts w:ascii="Cambria Math" w:eastAsiaTheme="minorEastAsia" w:hAnsi="Cambria Math"/>
+                              <w:i/>
+                            </w:rPr>
+                          </m:ctrlPr>
+                        </m:fPr>
+                        <m:num>
+                          <m:r>
+                            <w:rPr>
+                              <w:rFonts w:ascii="Cambria Math" w:eastAsiaTheme="minorEastAsia" w:hAnsi="Cambria Math"/>
+                            </w:rPr>
+                            <m:t>∆</m:t>
+                          </m:r>
+                        </m:num>
+                        <m:den>
+                          <m:r>
+                            <w:rPr>
+                              <w:rFonts w:ascii="Cambria Math" w:eastAsiaTheme="minorEastAsia" w:hAnsi="Cambria Math"/>
+                            </w:rPr>
+                            <m:t>27</m:t>
+                          </m:r>
+                        </m:den>
+                      </m:f>
+                    </m:e>
+                  </m:rad>
+                </m:num>
+                <m:den>
+                  <m:r>
+                    <w:rPr>
+                      <w:rFonts w:ascii="Cambria Math" w:eastAsiaTheme="minorEastAsia" w:hAnsi="Cambria Math"/>
+                    </w:rPr>
+                    <m:t>2</m:t>
+                  </m:r>
+                </m:den>
+              </m:f>
+            </m:e>
+          </m:rad>
+          <m:r>
+            <w:rPr>
+              <w:rFonts w:ascii="Cambria Math" w:eastAsiaTheme="minorEastAsia" w:hAnsi="Cambria Math"/>
+            </w:rPr>
+            <m:t>-</m:t>
+          </m:r>
+          <m:f>
+            <m:fPr>
+              <m:ctrlPr>
+                <w:rPr>
+                  <w:rFonts w:ascii="Cambria Math" w:eastAsiaTheme="minorEastAsia" w:hAnsi="Cambria Math"/>
+                  <w:i/>
+                </w:rPr>
+              </m:ctrlPr>
+            </m:fPr>
+            <m:num>
+              <m:r>
+                <w:rPr>
+                  <w:rFonts w:ascii="Cambria Math" w:eastAsiaTheme="minorEastAsia" w:hAnsi="Cambria Math"/>
+                </w:rPr>
+                <m:t>b</m:t>
+              </m:r>
+            </m:num>
+            <m:den>
+              <m:r>
+                <w:rPr>
+                  <w:rFonts w:ascii="Cambria Math" w:eastAsiaTheme="minorEastAsia" w:hAnsi="Cambria Math"/>
+                </w:rPr>
+                <m:t>3a</m:t>
+              </m:r>
+            </m:den>
+          </m:f>
+        </m:oMath>
+      </m:oMathPara>
+    </w:p>
+    <w:p>
+      <w:pPr>
+        <w:ind w:left="-567" w:right="-567"/>
+        <w:rPr>
+          <w:rFonts w:eastAsiaTheme="minorEastAsia"/>
+        </w:rPr>
+      </w:pPr>
+      <w:r>
+        <w:rPr>
+          <w:rFonts w:eastAsiaTheme="minorEastAsia"/>
+        </w:rPr>
+        <w:t>Si discriminant &gt;</w:t>
+      </w:r>
+      <w:r>
+        <w:rPr>
+          <w:rFonts w:eastAsiaTheme="minorEastAsia"/>
+        </w:rPr>
+        <w:t xml:space="preserve"> 0</w:t>
+      </w:r>
+    </w:p>
+    <w:p>
+      <w:pPr>
+        <w:ind w:left="-567" w:right="-567"/>
+        <w:rPr>
+          <w:rFonts w:eastAsiaTheme="minorEastAsia"/>
+        </w:rPr>
+      </w:pPr>
+      <m:oMathPara>
+        <m:oMath>
+          <m:r>
+            <w:rPr>
+              <w:rFonts w:ascii="Cambria Math" w:eastAsiaTheme="minorEastAsia" w:hAnsi="Cambria Math"/>
+            </w:rPr>
+            <m:t>x1=</m:t>
+          </m:r>
+          <m:r>
+            <w:rPr>
+              <w:rFonts w:ascii="Cambria Math" w:eastAsiaTheme="minorEastAsia" w:hAnsi="Cambria Math"/>
+            </w:rPr>
+            <m:t>2×</m:t>
+          </m:r>
+          <m:rad>
+            <m:radPr>
+              <m:degHide m:val="1"/>
+              <m:ctrlPr>
+                <w:rPr>
+                  <w:rFonts w:ascii="Cambria Math" w:eastAsiaTheme="minorEastAsia" w:hAnsi="Cambria Math"/>
+                  <w:i/>
+                </w:rPr>
+              </m:ctrlPr>
+            </m:radPr>
+            <m:deg/>
+            <m:e>
+              <m:r>
+                <w:rPr>
+                  <w:rFonts w:ascii="Cambria Math" w:eastAsiaTheme="minorEastAsia" w:hAnsi="Cambria Math"/>
+                </w:rPr>
+                <m:t>-</m:t>
+              </m:r>
+              <m:f>
+                <m:fPr>
+                  <m:ctrlPr>
+                    <w:rPr>
+                      <w:rFonts w:ascii="Cambria Math" w:eastAsiaTheme="minorEastAsia" w:hAnsi="Cambria Math"/>
+                      <w:i/>
+                    </w:rPr>
+                  </m:ctrlPr>
+                </m:fPr>
+                <m:num>
+                  <m:r>
+                    <w:rPr>
+                      <w:rFonts w:ascii="Cambria Math" w:eastAsiaTheme="minorEastAsia" w:hAnsi="Cambria Math"/>
+                    </w:rPr>
+                    <m:t>p</m:t>
+                  </m:r>
+                </m:num>
+                <m:den>
+                  <m:r>
+                    <w:rPr>
+                      <w:rFonts w:ascii="Cambria Math" w:eastAsiaTheme="minorEastAsia" w:hAnsi="Cambria Math"/>
+                    </w:rPr>
+                    <m:t>3</m:t>
+                  </m:r>
+                </m:den>
+              </m:f>
+            </m:e>
+          </m:rad>
+          <m:r>
+            <w:rPr>
+              <w:rFonts w:ascii="Cambria Math" w:eastAsiaTheme="minorEastAsia" w:hAnsi="Cambria Math"/>
+            </w:rPr>
+            <m:t>×</m:t>
+          </m:r>
+          <m:func>
+            <m:funcPr>
+              <m:ctrlPr>
+                <w:rPr>
+                  <w:rFonts w:ascii="Cambria Math" w:eastAsiaTheme="minorEastAsia" w:hAnsi="Cambria Math"/>
+                  <w:i/>
+                </w:rPr>
+              </m:ctrlPr>
+            </m:funcPr>
+            <m:fName>
+              <m:r>
+                <m:rPr>
+                  <m:sty m:val="p"/>
+                </m:rPr>
+                <w:rPr>
+                  <w:rFonts w:ascii="Cambria Math" w:hAnsi="Cambria Math"/>
+                </w:rPr>
+                <m:t>cos</m:t>
+              </m:r>
+            </m:fName>
+            <m:e>
+              <m:d>
+                <m:dPr>
+                  <m:ctrlPr>
+                    <w:rPr>
+                      <w:rFonts w:ascii="Cambria Math" w:eastAsiaTheme="minorEastAsia" w:hAnsi="Cambria Math"/>
+                      <w:i/>
+                    </w:rPr>
+                  </m:ctrlPr>
+                </m:dPr>
+                <m:e>
+                  <m:f>
+                    <m:fPr>
+                      <m:ctrlPr>
+                        <w:rPr>
+                          <w:rFonts w:ascii="Cambria Math" w:eastAsiaTheme="minorEastAsia" w:hAnsi="Cambria Math"/>
+                          <w:i/>
+                        </w:rPr>
+                      </m:ctrlPr>
+                    </m:fPr>
+                    <m:num>
+                      <m:func>
+                        <m:funcPr>
+                          <m:ctrlPr>
+                            <w:rPr>
+                              <w:rFonts w:ascii="Cambria Math" w:eastAsiaTheme="minorEastAsia" w:hAnsi="Cambria Math"/>
+                              <w:i/>
+                            </w:rPr>
+                          </m:ctrlPr>
+                        </m:funcPr>
+                        <m:fName>
+                          <m:sSup>
+                            <m:sSupPr>
+                              <m:ctrlPr>
+                                <w:rPr>
+                                  <w:rFonts w:ascii="Cambria Math" w:eastAsiaTheme="minorEastAsia" w:hAnsi="Cambria Math"/>
+                                  <w:i/>
+                                </w:rPr>
+                              </m:ctrlPr>
+                            </m:sSupPr>
+                            <m:e>
+                              <m:r>
+                                <m:rPr>
+                                  <m:sty m:val="p"/>
+                                </m:rPr>
+                                <w:rPr>
+                                  <w:rFonts w:ascii="Cambria Math" w:hAnsi="Cambria Math"/>
+                                </w:rPr>
+                                <m:t>cos</m:t>
+                              </m:r>
+                            </m:e>
+                            <m:sup>
+                              <m:r>
+                                <w:rPr>
+                                  <w:rFonts w:ascii="Cambria Math" w:hAnsi="Cambria Math"/>
+                                </w:rPr>
+                                <m:t>-1</m:t>
+                              </m:r>
+                            </m:sup>
+                          </m:sSup>
+                        </m:fName>
+                        <m:e>
+                          <m:d>
+                            <m:dPr>
+                              <m:ctrlPr>
+                                <w:rPr>
+                                  <w:rFonts w:ascii="Cambria Math" w:eastAsiaTheme="minorEastAsia" w:hAnsi="Cambria Math"/>
+                                  <w:i/>
+                                </w:rPr>
+                              </m:ctrlPr>
+                            </m:dPr>
+                            <m:e>
+                              <m:f>
+                                <m:fPr>
+                                  <m:ctrlPr>
+                                    <w:rPr>
+                                      <w:rFonts w:ascii="Cambria Math" w:eastAsiaTheme="minorEastAsia" w:hAnsi="Cambria Math"/>
+                                      <w:i/>
+                                    </w:rPr>
+                                  </m:ctrlPr>
+                                </m:fPr>
+                                <m:num>
+                                  <m:r>
+                                    <w:rPr>
+                                      <w:rFonts w:ascii="Cambria Math" w:eastAsiaTheme="minorEastAsia" w:hAnsi="Cambria Math"/>
+                                    </w:rPr>
+                                    <m:t>3q</m:t>
+                                  </m:r>
+                                </m:num>
+                                <m:den>
+                                  <m:r>
+                                    <w:rPr>
+                                      <w:rFonts w:ascii="Cambria Math" w:eastAsiaTheme="minorEastAsia" w:hAnsi="Cambria Math"/>
+                                    </w:rPr>
+                                    <m:t>2p</m:t>
+                                  </m:r>
+                                </m:den>
+                              </m:f>
+                              <m:r>
+                                <w:rPr>
+                                  <w:rFonts w:ascii="Cambria Math" w:eastAsiaTheme="minorEastAsia" w:hAnsi="Cambria Math"/>
+                                </w:rPr>
+                                <m:t>×</m:t>
+                              </m:r>
+                              <m:rad>
+                                <m:radPr>
+                                  <m:degHide m:val="1"/>
+                                  <m:ctrlPr>
+                                    <w:rPr>
+                                      <w:rFonts w:ascii="Cambria Math" w:eastAsiaTheme="minorEastAsia" w:hAnsi="Cambria Math"/>
+                                      <w:i/>
+                                    </w:rPr>
+                                  </m:ctrlPr>
+                                </m:radPr>
+                                <m:deg/>
+                                <m:e>
+                                  <m:f>
+                                    <m:fPr>
+                                      <m:ctrlPr>
+                                        <w:rPr>
+                                          <w:rFonts w:ascii="Cambria Math" w:eastAsiaTheme="minorEastAsia" w:hAnsi="Cambria Math"/>
+                                          <w:i/>
+                                        </w:rPr>
+                                      </m:ctrlPr>
+                                    </m:fPr>
+                                    <m:num>
+                                      <m:r>
+                                        <w:rPr>
+                                          <w:rFonts w:ascii="Cambria Math" w:eastAsiaTheme="minorEastAsia" w:hAnsi="Cambria Math"/>
+                                        </w:rPr>
+                                        <m:t>-3</m:t>
+                                      </m:r>
+                                    </m:num>
+                                    <m:den>
+                                      <m:r>
+                                        <w:rPr>
+                                          <w:rFonts w:ascii="Cambria Math" w:eastAsiaTheme="minorEastAsia" w:hAnsi="Cambria Math"/>
+                                        </w:rPr>
+                                        <m:t>p</m:t>
+                                      </m:r>
+                                    </m:den>
+                                  </m:f>
+                                </m:e>
+                              </m:rad>
+                            </m:e>
+                          </m:d>
+                        </m:e>
+                      </m:func>
+                    </m:num>
+                    <m:den>
+                      <m:r>
+                        <w:rPr>
+                          <w:rFonts w:ascii="Cambria Math" w:eastAsiaTheme="minorEastAsia" w:hAnsi="Cambria Math"/>
+                        </w:rPr>
+                        <m:t>3</m:t>
+                      </m:r>
+                    </m:den>
+                  </m:f>
+                </m:e>
+              </m:d>
+            </m:e>
+          </m:func>
+          <m:r>
+            <w:rPr>
+              <w:rFonts w:ascii="Cambria Math" w:eastAsiaTheme="minorEastAsia" w:hAnsi="Cambria Math"/>
+            </w:rPr>
+            <m:t>-</m:t>
+          </m:r>
+          <m:f>
+            <m:fPr>
+              <m:ctrlPr>
+                <w:rPr>
+                  <w:rFonts w:ascii="Cambria Math" w:eastAsiaTheme="minorEastAsia" w:hAnsi="Cambria Math"/>
+                  <w:i/>
+                </w:rPr>
+              </m:ctrlPr>
+            </m:fPr>
+            <m:num>
+              <m:r>
+                <w:rPr>
+                  <w:rFonts w:ascii="Cambria Math" w:eastAsiaTheme="minorEastAsia" w:hAnsi="Cambria Math"/>
+                </w:rPr>
+                <m:t>b</m:t>
+              </m:r>
+            </m:num>
+            <m:den>
+              <m:r>
+                <w:rPr>
+                  <w:rFonts w:ascii="Cambria Math" w:eastAsiaTheme="minorEastAsia" w:hAnsi="Cambria Math"/>
+                </w:rPr>
+                <m:t>3a</m:t>
+              </m:r>
+            </m:den>
+          </m:f>
+        </m:oMath>
+      </m:oMathPara>
+    </w:p>
+    <w:p>
+      <w:pPr>
+        <w:ind w:left="-567" w:right="-567"/>
+        <w:rPr>
+          <w:rFonts w:eastAsiaTheme="minorEastAsia"/>
+        </w:rPr>
+      </w:pPr>
+      <m:oMathPara>
+        <m:oMath>
+          <m:r>
+            <w:rPr>
+              <w:rFonts w:ascii="Cambria Math" w:eastAsiaTheme="minorEastAsia" w:hAnsi="Cambria Math"/>
+            </w:rPr>
+            <m:t>x</m:t>
+          </m:r>
+          <m:r>
+            <w:rPr>
+              <w:rFonts w:ascii="Cambria Math" w:eastAsiaTheme="minorEastAsia" w:hAnsi="Cambria Math"/>
+            </w:rPr>
+            <m:t>2</m:t>
+          </m:r>
+          <m:r>
+            <w:rPr>
+              <w:rFonts w:ascii="Cambria Math" w:eastAsiaTheme="minorEastAsia" w:hAnsi="Cambria Math"/>
+            </w:rPr>
+            <m:t>=2×</m:t>
+          </m:r>
+          <m:rad>
+            <m:radPr>
+              <m:degHide m:val="1"/>
+              <m:ctrlPr>
+                <w:rPr>
+                  <w:rFonts w:ascii="Cambria Math" w:eastAsiaTheme="minorEastAsia" w:hAnsi="Cambria Math"/>
+                  <w:i/>
+                </w:rPr>
+              </m:ctrlPr>
+            </m:radPr>
+            <m:deg/>
+            <m:e>
+              <m:r>
+                <w:rPr>
+                  <w:rFonts w:ascii="Cambria Math" w:eastAsiaTheme="minorEastAsia" w:hAnsi="Cambria Math"/>
+                </w:rPr>
+                <m:t>-</m:t>
+              </m:r>
+              <m:f>
+                <m:fPr>
+                  <m:ctrlPr>
+                    <w:rPr>
+                      <w:rFonts w:ascii="Cambria Math" w:eastAsiaTheme="minorEastAsia" w:hAnsi="Cambria Math"/>
+                      <w:i/>
+                    </w:rPr>
+                  </m:ctrlPr>
+                </m:fPr>
+                <m:num>
+                  <m:r>
+                    <w:rPr>
+                      <w:rFonts w:ascii="Cambria Math" w:eastAsiaTheme="minorEastAsia" w:hAnsi="Cambria Math"/>
+                    </w:rPr>
+                    <m:t>p</m:t>
+                  </m:r>
+                </m:num>
+                <m:den>
+                  <m:r>
+                    <w:rPr>
+                      <w:rFonts w:ascii="Cambria Math" w:eastAsiaTheme="minorEastAsia" w:hAnsi="Cambria Math"/>
+                    </w:rPr>
+                    <m:t>3</m:t>
+                  </m:r>
+                </m:den>
+              </m:f>
+            </m:e>
+          </m:rad>
+          <m:r>
+            <w:rPr>
+              <w:rFonts w:ascii="Cambria Math" w:eastAsiaTheme="minorEastAsia" w:hAnsi="Cambria Math"/>
+            </w:rPr>
+            <m:t>×</m:t>
+          </m:r>
+          <m:func>
+            <m:funcPr>
+              <m:ctrlPr>
+                <w:rPr>
+                  <w:rFonts w:ascii="Cambria Math" w:eastAsiaTheme="minorEastAsia" w:hAnsi="Cambria Math"/>
+                  <w:i/>
+                </w:rPr>
+              </m:ctrlPr>
+            </m:funcPr>
+            <m:fName>
+              <m:r>
+                <m:rPr>
+                  <m:sty m:val="p"/>
+                </m:rPr>
+                <w:rPr>
+                  <w:rFonts w:ascii="Cambria Math" w:hAnsi="Cambria Math"/>
+                </w:rPr>
+                <m:t>cos</m:t>
+              </m:r>
+            </m:fName>
+            <m:e>
+              <m:d>
+                <m:dPr>
+                  <m:ctrlPr>
+                    <w:rPr>
+                      <w:rFonts w:ascii="Cambria Math" w:eastAsiaTheme="minorEastAsia" w:hAnsi="Cambria Math"/>
+                      <w:i/>
+                    </w:rPr>
+                  </m:ctrlPr>
+                </m:dPr>
+                <m:e>
+                  <m:f>
+                    <m:fPr>
+                      <m:ctrlPr>
+                        <w:rPr>
+                          <w:rFonts w:ascii="Cambria Math" w:eastAsiaTheme="minorEastAsia" w:hAnsi="Cambria Math"/>
+                          <w:i/>
+                        </w:rPr>
+                      </m:ctrlPr>
+                    </m:fPr>
+                    <m:num>
+                      <m:func>
+                        <m:funcPr>
+                          <m:ctrlPr>
+                            <w:rPr>
+                              <w:rFonts w:ascii="Cambria Math" w:eastAsiaTheme="minorEastAsia" w:hAnsi="Cambria Math"/>
+                              <w:i/>
+                            </w:rPr>
+                          </m:ctrlPr>
+                        </m:funcPr>
+                        <m:fName>
+                          <m:sSup>
+                            <m:sSupPr>
+                              <m:ctrlPr>
+                                <w:rPr>
+                                  <w:rFonts w:ascii="Cambria Math" w:eastAsiaTheme="minorEastAsia" w:hAnsi="Cambria Math"/>
+                                  <w:i/>
+                                </w:rPr>
+                              </m:ctrlPr>
+                            </m:sSupPr>
+                            <m:e>
+                              <m:r>
+                                <m:rPr>
+                                  <m:sty m:val="p"/>
+                                </m:rPr>
+                                <w:rPr>
+                                  <w:rFonts w:ascii="Cambria Math" w:hAnsi="Cambria Math"/>
+                                </w:rPr>
+                                <m:t>cos</m:t>
+                              </m:r>
+                            </m:e>
+                            <m:sup>
+                              <m:r>
+                                <w:rPr>
+                                  <w:rFonts w:ascii="Cambria Math" w:hAnsi="Cambria Math"/>
+                                </w:rPr>
+                                <m:t>-1</m:t>
+                              </m:r>
+                            </m:sup>
+                          </m:sSup>
+                        </m:fName>
+                        <m:e>
+                          <m:d>
+                            <m:dPr>
+                              <m:ctrlPr>
+                                <w:rPr>
+                                  <w:rFonts w:ascii="Cambria Math" w:eastAsiaTheme="minorEastAsia" w:hAnsi="Cambria Math"/>
+                                  <w:i/>
+                                </w:rPr>
+                              </m:ctrlPr>
+                            </m:dPr>
+                            <m:e>
+                              <m:f>
+                                <m:fPr>
+                                  <m:ctrlPr>
+                                    <w:rPr>
+                                      <w:rFonts w:ascii="Cambria Math" w:eastAsiaTheme="minorEastAsia" w:hAnsi="Cambria Math"/>
+                                      <w:i/>
+                                    </w:rPr>
+                                  </m:ctrlPr>
+                                </m:fPr>
+                                <m:num>
+                                  <m:r>
+                                    <w:rPr>
+                                      <w:rFonts w:ascii="Cambria Math" w:eastAsiaTheme="minorEastAsia" w:hAnsi="Cambria Math"/>
+                                    </w:rPr>
+                                    <m:t>3q</m:t>
+                                  </m:r>
+                                </m:num>
+                                <m:den>
+                                  <m:r>
+                                    <w:rPr>
+                                      <w:rFonts w:ascii="Cambria Math" w:eastAsiaTheme="minorEastAsia" w:hAnsi="Cambria Math"/>
+                                    </w:rPr>
+                                    <m:t>2p</m:t>
+                                  </m:r>
+                                </m:den>
+                              </m:f>
+                              <m:r>
+                                <w:rPr>
+                                  <w:rFonts w:ascii="Cambria Math" w:eastAsiaTheme="minorEastAsia" w:hAnsi="Cambria Math"/>
+                                </w:rPr>
+                                <m:t>×</m:t>
+                              </m:r>
+                              <m:rad>
+                                <m:radPr>
+                                  <m:degHide m:val="1"/>
+                                  <m:ctrlPr>
+                                    <w:rPr>
+                                      <w:rFonts w:ascii="Cambria Math" w:eastAsiaTheme="minorEastAsia" w:hAnsi="Cambria Math"/>
+                                      <w:i/>
+                                    </w:rPr>
+                                  </m:ctrlPr>
+                                </m:radPr>
+                                <m:deg/>
+                                <m:e>
+                                  <m:f>
+                                    <m:fPr>
+                                      <m:ctrlPr>
+                                        <w:rPr>
+                                          <w:rFonts w:ascii="Cambria Math" w:eastAsiaTheme="minorEastAsia" w:hAnsi="Cambria Math"/>
+                                          <w:i/>
+                                        </w:rPr>
+                                      </m:ctrlPr>
+                                    </m:fPr>
+                                    <m:num>
+                                      <m:r>
+                                        <w:rPr>
+                                          <w:rFonts w:ascii="Cambria Math" w:eastAsiaTheme="minorEastAsia" w:hAnsi="Cambria Math"/>
+                                        </w:rPr>
+                                        <m:t>-3</m:t>
+                                      </m:r>
+                                    </m:num>
+                                    <m:den>
+                                      <m:r>
+                                        <w:rPr>
+                                          <w:rFonts w:ascii="Cambria Math" w:eastAsiaTheme="minorEastAsia" w:hAnsi="Cambria Math"/>
+                                        </w:rPr>
+                                        <m:t>p</m:t>
+                                      </m:r>
+                                    </m:den>
+                                  </m:f>
+                                </m:e>
+                              </m:rad>
+                            </m:e>
+                          </m:d>
+                        </m:e>
+                      </m:func>
+                      <m:r>
+                        <w:rPr>
+                          <w:rFonts w:ascii="Cambria Math" w:eastAsiaTheme="minorEastAsia" w:hAnsi="Cambria Math"/>
+                        </w:rPr>
+                        <m:t>+2π</m:t>
+                      </m:r>
+                    </m:num>
+                    <m:den>
+                      <m:r>
+                        <w:rPr>
+                          <w:rFonts w:ascii="Cambria Math" w:eastAsiaTheme="minorEastAsia" w:hAnsi="Cambria Math"/>
+                        </w:rPr>
+                        <m:t>3</m:t>
+                      </m:r>
+                    </m:den>
+                  </m:f>
+                </m:e>
+              </m:d>
+            </m:e>
+          </m:func>
+          <m:r>
+            <w:rPr>
+              <w:rFonts w:ascii="Cambria Math" w:eastAsiaTheme="minorEastAsia" w:hAnsi="Cambria Math"/>
+            </w:rPr>
+            <m:t>-</m:t>
+          </m:r>
+          <m:f>
+            <m:fPr>
+              <m:ctrlPr>
+                <w:rPr>
+                  <w:rFonts w:ascii="Cambria Math" w:eastAsiaTheme="minorEastAsia" w:hAnsi="Cambria Math"/>
+                  <w:i/>
+                </w:rPr>
+              </m:ctrlPr>
+            </m:fPr>
+            <m:num>
+              <m:r>
+                <w:rPr>
+                  <w:rFonts w:ascii="Cambria Math" w:eastAsiaTheme="minorEastAsia" w:hAnsi="Cambria Math"/>
+                </w:rPr>
+                <m:t>b</m:t>
+              </m:r>
+            </m:num>
+            <m:den>
+              <m:r>
+                <w:rPr>
+                  <w:rFonts w:ascii="Cambria Math" w:eastAsiaTheme="minorEastAsia" w:hAnsi="Cambria Math"/>
+                </w:rPr>
+                <m:t>3a</m:t>
+              </m:r>
+            </m:den>
+          </m:f>
+        </m:oMath>
+      </m:oMathPara>
+    </w:p>
+    <w:p>
+      <w:pPr>
+        <w:ind w:left="-567" w:right="-567"/>
+        <w:rPr>
+          <w:rFonts w:eastAsiaTheme="minorEastAsia"/>
+        </w:rPr>
+      </w:pPr>
+      <m:oMathPara>
+        <m:oMath>
+          <m:r>
+            <w:rPr>
+              <w:rFonts w:ascii="Cambria Math" w:eastAsiaTheme="minorEastAsia" w:hAnsi="Cambria Math"/>
+            </w:rPr>
+            <m:t>x</m:t>
+          </m:r>
+          <m:r>
+            <w:rPr>
+              <w:rFonts w:ascii="Cambria Math" w:eastAsiaTheme="minorEastAsia" w:hAnsi="Cambria Math"/>
+            </w:rPr>
+            <m:t>3</m:t>
+          </m:r>
+          <m:r>
+            <w:rPr>
+              <w:rFonts w:ascii="Cambria Math" w:eastAsiaTheme="minorEastAsia" w:hAnsi="Cambria Math"/>
+            </w:rPr>
+            <m:t>=2×</m:t>
+          </m:r>
+          <m:rad>
+            <m:radPr>
+              <m:degHide m:val="1"/>
+              <m:ctrlPr>
+                <w:rPr>
+                  <w:rFonts w:ascii="Cambria Math" w:eastAsiaTheme="minorEastAsia" w:hAnsi="Cambria Math"/>
+                  <w:i/>
+                </w:rPr>
+              </m:ctrlPr>
+            </m:radPr>
+            <m:deg/>
+            <m:e>
+              <m:r>
+                <w:rPr>
+                  <w:rFonts w:ascii="Cambria Math" w:eastAsiaTheme="minorEastAsia" w:hAnsi="Cambria Math"/>
+                </w:rPr>
+                <m:t>-</m:t>
+              </m:r>
+              <m:f>
+                <m:fPr>
+                  <m:ctrlPr>
+                    <w:rPr>
+                      <w:rFonts w:ascii="Cambria Math" w:eastAsiaTheme="minorEastAsia" w:hAnsi="Cambria Math"/>
+                      <w:i/>
+                    </w:rPr>
+                  </m:ctrlPr>
+                </m:fPr>
+                <m:num>
+                  <m:r>
+                    <w:rPr>
+                      <w:rFonts w:ascii="Cambria Math" w:eastAsiaTheme="minorEastAsia" w:hAnsi="Cambria Math"/>
+                    </w:rPr>
+                    <m:t>p</m:t>
+                  </m:r>
+                </m:num>
+                <m:den>
+                  <m:r>
+                    <w:rPr>
+                      <w:rFonts w:ascii="Cambria Math" w:eastAsiaTheme="minorEastAsia" w:hAnsi="Cambria Math"/>
+                    </w:rPr>
+                    <m:t>3</m:t>
+                  </m:r>
+                </m:den>
+              </m:f>
+            </m:e>
+          </m:rad>
+          <m:r>
+            <w:rPr>
+              <w:rFonts w:ascii="Cambria Math" w:eastAsiaTheme="minorEastAsia" w:hAnsi="Cambria Math"/>
+            </w:rPr>
+            <m:t>×</m:t>
+          </m:r>
+          <m:func>
+            <m:funcPr>
+              <m:ctrlPr>
+                <w:rPr>
+                  <w:rFonts w:ascii="Cambria Math" w:eastAsiaTheme="minorEastAsia" w:hAnsi="Cambria Math"/>
+                  <w:i/>
+                </w:rPr>
+              </m:ctrlPr>
+            </m:funcPr>
+            <m:fName>
+              <m:r>
+                <m:rPr>
+                  <m:sty m:val="p"/>
+                </m:rPr>
+                <w:rPr>
+                  <w:rFonts w:ascii="Cambria Math" w:hAnsi="Cambria Math"/>
+                </w:rPr>
+                <m:t>cos</m:t>
+              </m:r>
+            </m:fName>
+            <m:e>
+              <m:d>
+                <m:dPr>
+                  <m:ctrlPr>
+                    <w:rPr>
+                      <w:rFonts w:ascii="Cambria Math" w:eastAsiaTheme="minorEastAsia" w:hAnsi="Cambria Math"/>
+                      <w:i/>
+                    </w:rPr>
+                  </m:ctrlPr>
+                </m:dPr>
+                <m:e>
+                  <m:f>
+                    <m:fPr>
+                      <m:ctrlPr>
+                        <w:rPr>
+                          <w:rFonts w:ascii="Cambria Math" w:eastAsiaTheme="minorEastAsia" w:hAnsi="Cambria Math"/>
+                          <w:i/>
+                        </w:rPr>
+                      </m:ctrlPr>
+                    </m:fPr>
+                    <m:num>
+                      <m:func>
+                        <m:funcPr>
+                          <m:ctrlPr>
+                            <w:rPr>
+                              <w:rFonts w:ascii="Cambria Math" w:eastAsiaTheme="minorEastAsia" w:hAnsi="Cambria Math"/>
+                              <w:i/>
+                            </w:rPr>
+                          </m:ctrlPr>
+                        </m:funcPr>
+                        <m:fName>
+                          <m:sSup>
+                            <m:sSupPr>
+                              <m:ctrlPr>
+                                <w:rPr>
+                                  <w:rFonts w:ascii="Cambria Math" w:eastAsiaTheme="minorEastAsia" w:hAnsi="Cambria Math"/>
+                                  <w:i/>
+                                </w:rPr>
+                              </m:ctrlPr>
+                            </m:sSupPr>
+                            <m:e>
+                              <m:r>
+                                <m:rPr>
+                                  <m:sty m:val="p"/>
+                                </m:rPr>
+                                <w:rPr>
+                                  <w:rFonts w:ascii="Cambria Math" w:hAnsi="Cambria Math"/>
+                                </w:rPr>
+                                <m:t>cos</m:t>
+                              </m:r>
+                            </m:e>
+                            <m:sup>
+                              <m:r>
+                                <w:rPr>
+                                  <w:rFonts w:ascii="Cambria Math" w:hAnsi="Cambria Math"/>
+                                </w:rPr>
+                                <m:t>-1</m:t>
+                              </m:r>
+                            </m:sup>
+                          </m:sSup>
+                        </m:fName>
+                        <m:e>
+                          <m:d>
+                            <m:dPr>
+                              <m:ctrlPr>
+                                <w:rPr>
+                                  <w:rFonts w:ascii="Cambria Math" w:eastAsiaTheme="minorEastAsia" w:hAnsi="Cambria Math"/>
+                                  <w:i/>
+                                </w:rPr>
+                              </m:ctrlPr>
+                            </m:dPr>
+                            <m:e>
+                              <m:f>
+                                <m:fPr>
+                                  <m:ctrlPr>
+                                    <w:rPr>
+                                      <w:rFonts w:ascii="Cambria Math" w:eastAsiaTheme="minorEastAsia" w:hAnsi="Cambria Math"/>
+                                      <w:i/>
+                                    </w:rPr>
+                                  </m:ctrlPr>
+                                </m:fPr>
+                                <m:num>
+                                  <m:r>
+                                    <w:rPr>
+                                      <w:rFonts w:ascii="Cambria Math" w:eastAsiaTheme="minorEastAsia" w:hAnsi="Cambria Math"/>
+                                    </w:rPr>
+                                    <m:t>3q</m:t>
+                                  </m:r>
+                                </m:num>
+                                <m:den>
+                                  <m:r>
+                                    <w:rPr>
+                                      <w:rFonts w:ascii="Cambria Math" w:eastAsiaTheme="minorEastAsia" w:hAnsi="Cambria Math"/>
+                                    </w:rPr>
+                                    <m:t>2p</m:t>
+                                  </m:r>
+                                </m:den>
+                              </m:f>
+                              <m:r>
+                                <w:rPr>
+                                  <w:rFonts w:ascii="Cambria Math" w:eastAsiaTheme="minorEastAsia" w:hAnsi="Cambria Math"/>
+                                </w:rPr>
+                                <m:t>×</m:t>
+                              </m:r>
+                              <m:rad>
+                                <m:radPr>
+                                  <m:degHide m:val="1"/>
+                                  <m:ctrlPr>
+                                    <w:rPr>
+                                      <w:rFonts w:ascii="Cambria Math" w:eastAsiaTheme="minorEastAsia" w:hAnsi="Cambria Math"/>
+                                      <w:i/>
+                                    </w:rPr>
+                                  </m:ctrlPr>
+                                </m:radPr>
+                                <m:deg/>
+                                <m:e>
+                                  <m:f>
+                                    <m:fPr>
+                                      <m:ctrlPr>
+                                        <w:rPr>
+                                          <w:rFonts w:ascii="Cambria Math" w:eastAsiaTheme="minorEastAsia" w:hAnsi="Cambria Math"/>
+                                          <w:i/>
+                                        </w:rPr>
+                                      </m:ctrlPr>
+                                    </m:fPr>
+                                    <m:num>
+                                      <m:r>
+                                        <w:rPr>
+                                          <w:rFonts w:ascii="Cambria Math" w:eastAsiaTheme="minorEastAsia" w:hAnsi="Cambria Math"/>
+                                        </w:rPr>
+                                        <m:t>-3</m:t>
+                                      </m:r>
+                                    </m:num>
+                                    <m:den>
+                                      <m:r>
+                                        <w:rPr>
+                                          <w:rFonts w:ascii="Cambria Math" w:eastAsiaTheme="minorEastAsia" w:hAnsi="Cambria Math"/>
+                                        </w:rPr>
+                                        <m:t>p</m:t>
+                                      </m:r>
+                                    </m:den>
+                                  </m:f>
+                                </m:e>
+                              </m:rad>
+                            </m:e>
+                          </m:d>
+                        </m:e>
+                      </m:func>
+                      <m:r>
+                        <w:rPr>
+                          <w:rFonts w:ascii="Cambria Math" w:eastAsiaTheme="minorEastAsia" w:hAnsi="Cambria Math"/>
+                        </w:rPr>
+                        <m:t>-</m:t>
+                      </m:r>
+                      <m:r>
+                        <w:rPr>
+                          <w:rFonts w:ascii="Cambria Math" w:eastAsiaTheme="minorEastAsia" w:hAnsi="Cambria Math"/>
+                        </w:rPr>
+                        <m:t>2π</m:t>
+                      </m:r>
+                    </m:num>
+                    <m:den>
+                      <m:r>
+                        <w:rPr>
+                          <w:rFonts w:ascii="Cambria Math" w:eastAsiaTheme="minorEastAsia" w:hAnsi="Cambria Math"/>
+                        </w:rPr>
+                        <m:t>3</m:t>
+                      </m:r>
+                    </m:den>
+                  </m:f>
+                </m:e>
+              </m:d>
+            </m:e>
+          </m:func>
+          <m:r>
+            <w:rPr>
+              <w:rFonts w:ascii="Cambria Math" w:eastAsiaTheme="minorEastAsia" w:hAnsi="Cambria Math"/>
+            </w:rPr>
+            <m:t>-</m:t>
+          </m:r>
+          <m:f>
+            <m:fPr>
+              <m:ctrlPr>
+                <w:rPr>
+                  <w:rFonts w:ascii="Cambria Math" w:eastAsiaTheme="minorEastAsia" w:hAnsi="Cambria Math"/>
+                  <w:i/>
+                </w:rPr>
+              </m:ctrlPr>
+            </m:fPr>
+            <m:num>
+              <m:r>
+                <w:rPr>
+                  <w:rFonts w:ascii="Cambria Math" w:eastAsiaTheme="minorEastAsia" w:hAnsi="Cambria Math"/>
+                </w:rPr>
+                <m:t>b</m:t>
+              </m:r>
+            </m:num>
+            <m:den>
+              <m:r>
+                <w:rPr>
+                  <w:rFonts w:ascii="Cambria Math" w:eastAsiaTheme="minorEastAsia" w:hAnsi="Cambria Math"/>
+                </w:rPr>
+                <m:t>3a</m:t>
+              </m:r>
+            </m:den>
+          </m:f>
+        </m:oMath>
+      </m:oMathPara>
+    </w:p>
+    <w:p>
+      <w:pPr>
+        <w:ind w:left="-567" w:right="-567"/>
+        <w:rPr>
+          <w:rFonts w:eastAsiaTheme="minorEastAsia"/>
+        </w:rPr>
+      </w:pPr>
+    </w:p>
+    <w:p>
+      <w:pPr>
+        <w:ind w:left="-567" w:right="-567"/>
+        <w:rPr>
+          <w:rFonts w:eastAsiaTheme="minorEastAsia"/>
+        </w:rPr>
+      </w:pPr>
+      <m:oMathPara>
+        <m:oMath>
+          <m:r>
+            <w:rPr>
+              <w:rFonts w:ascii="Cambria Math" w:eastAsiaTheme="minorEastAsia" w:hAnsi="Cambria Math"/>
+            </w:rPr>
+            <m:t>X=x+</m:t>
+          </m:r>
+          <m:f>
+            <m:fPr>
+              <m:ctrlPr>
+                <w:rPr>
+                  <w:rFonts w:ascii="Cambria Math" w:eastAsiaTheme="minorEastAsia" w:hAnsi="Cambria Math"/>
+                  <w:i/>
+                </w:rPr>
+              </m:ctrlPr>
+            </m:fPr>
+            <m:num>
+              <m:r>
+                <w:rPr>
+                  <w:rFonts w:ascii="Cambria Math" w:eastAsiaTheme="minorEastAsia" w:hAnsi="Cambria Math"/>
+                </w:rPr>
+                <m:t>b</m:t>
+              </m:r>
+            </m:num>
+            <m:den>
+              <m:r>
+                <w:rPr>
+                  <w:rFonts w:ascii="Cambria Math" w:eastAsiaTheme="minorEastAsia" w:hAnsi="Cambria Math"/>
+                </w:rPr>
+                <m:t>3a</m:t>
+              </m:r>
+            </m:den>
+          </m:f>
+          <m:r>
+            <w:rPr>
+              <w:rFonts w:ascii="Cambria Math" w:eastAsiaTheme="minorEastAsia" w:hAnsi="Cambria Math"/>
+            </w:rPr>
+            <m:t xml:space="preserve">  →  </m:t>
+          </m:r>
+          <m:r>
+            <w:rPr>
+              <w:rFonts w:ascii="Cambria Math" w:eastAsiaTheme="minorEastAsia" w:hAnsi="Cambria Math"/>
+            </w:rPr>
             <m:t>P</m:t>
           </m:r>
           <m:d>
@@ -12481,72 +14113,29 @@
             <w:rPr>
               <w:rFonts w:ascii="Cambria Math" w:eastAsiaTheme="minorEastAsia" w:hAnsi="Cambria Math"/>
             </w:rPr>
-            <m:t>∆=</m:t>
-          </m:r>
-          <m:sSup>
-            <m:sSupPr>
-              <m:ctrlPr>
-                <w:rPr>
-                  <w:rFonts w:ascii="Cambria Math" w:eastAsiaTheme="minorEastAsia" w:hAnsi="Cambria Math"/>
-                  <w:i/>
-                </w:rPr>
-              </m:ctrlPr>
-            </m:sSupPr>
-            <m:e>
-              <m:r>
-                <w:rPr>
-                  <w:rFonts w:ascii="Cambria Math" w:eastAsiaTheme="minorEastAsia" w:hAnsi="Cambria Math"/>
-                </w:rPr>
-                <m:t>c</m:t>
-              </m:r>
-            </m:e>
-            <m:sup>
-              <m:r>
-                <w:rPr>
-                  <w:rFonts w:ascii="Cambria Math" w:eastAsiaTheme="minorEastAsia" w:hAnsi="Cambria Math"/>
-                </w:rPr>
-                <m:t>2</m:t>
-              </m:r>
-            </m:sup>
-          </m:sSup>
+            <m:t>p</m:t>
+          </m:r>
           <m:r>
             <w:rPr>
               <w:rFonts w:ascii="Cambria Math" w:eastAsiaTheme="minorEastAsia" w:hAnsi="Cambria Math"/>
             </w:rPr>
-            <m:t>-4bd</m:t>
-          </m:r>
-        </m:oMath>
-      </m:oMathPara>
-    </w:p>
-    <w:p>
-      <w:pPr>
-        <w:rPr>
-          <w:rFonts w:eastAsiaTheme="minorEastAsia"/>
-        </w:rPr>
-      </w:pPr>
-      <m:oMathPara>
-        <m:oMath>
-          <m:r>
-            <w:rPr>
-              <w:rFonts w:ascii="Cambria Math" w:eastAsiaTheme="minorEastAsia" w:hAnsi="Cambria Math"/>
-            </w:rPr>
-            <m:t>∆=-</m:t>
-          </m:r>
-          <m:d>
-            <m:dPr>
-              <m:ctrlPr>
-                <w:rPr>
-                  <w:rFonts w:ascii="Cambria Math" w:eastAsiaTheme="minorEastAsia" w:hAnsi="Cambria Math"/>
-                  <w:i/>
-                </w:rPr>
-              </m:ctrlPr>
-            </m:dPr>
-            <m:e>
-              <m:r>
-                <w:rPr>
-                  <w:rFonts w:ascii="Cambria Math" w:eastAsiaTheme="minorEastAsia" w:hAnsi="Cambria Math"/>
-                </w:rPr>
-                <m:t>4</m:t>
+            <m:t xml:space="preserve">= </m:t>
+          </m:r>
+          <m:f>
+            <m:fPr>
+              <m:ctrlPr>
+                <w:rPr>
+                  <w:rFonts w:ascii="Cambria Math" w:eastAsiaTheme="minorEastAsia" w:hAnsi="Cambria Math"/>
+                  <w:i/>
+                </w:rPr>
+              </m:ctrlPr>
+            </m:fPr>
+            <m:num>
+              <m:r>
+                <w:rPr>
+                  <w:rFonts w:ascii="Cambria Math" w:eastAsiaTheme="minorEastAsia" w:hAnsi="Cambria Math"/>
+                </w:rPr>
+                <m:t>3ac-</m:t>
               </m:r>
               <m:sSup>
                 <m:sSupPr>
@@ -12562,7 +14151,7 @@
                     <w:rPr>
                       <w:rFonts w:ascii="Cambria Math" w:eastAsiaTheme="minorEastAsia" w:hAnsi="Cambria Math"/>
                     </w:rPr>
-                    <m:t>p</m:t>
+                    <m:t>b</m:t>
                   </m:r>
                 </m:e>
                 <m:sup>
@@ -12570,93 +14159,172 @@
                     <w:rPr>
                       <w:rFonts w:ascii="Cambria Math" w:eastAsiaTheme="minorEastAsia" w:hAnsi="Cambria Math"/>
                     </w:rPr>
+                    <m:t>2</m:t>
+                  </m:r>
+                </m:sup>
+              </m:sSup>
+            </m:num>
+            <m:den>
+              <m:r>
+                <w:rPr>
+                  <w:rFonts w:ascii="Cambria Math" w:eastAsiaTheme="minorEastAsia" w:hAnsi="Cambria Math"/>
+                </w:rPr>
+                <m:t>3</m:t>
+              </m:r>
+              <m:sSup>
+                <m:sSupPr>
+                  <m:ctrlPr>
+                    <w:rPr>
+                      <w:rFonts w:ascii="Cambria Math" w:eastAsiaTheme="minorEastAsia" w:hAnsi="Cambria Math"/>
+                      <w:i/>
+                    </w:rPr>
+                  </m:ctrlPr>
+                </m:sSupPr>
+                <m:e>
+                  <m:r>
+                    <w:rPr>
+                      <w:rFonts w:ascii="Cambria Math" w:eastAsiaTheme="minorEastAsia" w:hAnsi="Cambria Math"/>
+                    </w:rPr>
+                    <m:t>a</m:t>
+                  </m:r>
+                </m:e>
+                <m:sup>
+                  <m:r>
+                    <w:rPr>
+                      <w:rFonts w:ascii="Cambria Math" w:eastAsiaTheme="minorEastAsia" w:hAnsi="Cambria Math"/>
+                    </w:rPr>
+                    <m:t>2</m:t>
+                  </m:r>
+                </m:sup>
+              </m:sSup>
+            </m:den>
+          </m:f>
+          <m:r>
+            <w:rPr>
+              <w:rFonts w:ascii="Cambria Math" w:eastAsiaTheme="minorEastAsia" w:hAnsi="Cambria Math"/>
+            </w:rPr>
+            <m:t xml:space="preserve">; </m:t>
+          </m:r>
+          <m:r>
+            <w:rPr>
+              <w:rFonts w:ascii="Cambria Math" w:eastAsiaTheme="minorEastAsia" w:hAnsi="Cambria Math"/>
+            </w:rPr>
+            <m:t>q=</m:t>
+          </m:r>
+          <m:f>
+            <m:fPr>
+              <m:ctrlPr>
+                <w:rPr>
+                  <w:rFonts w:ascii="Cambria Math" w:eastAsiaTheme="minorEastAsia" w:hAnsi="Cambria Math"/>
+                  <w:i/>
+                </w:rPr>
+              </m:ctrlPr>
+            </m:fPr>
+            <m:num>
+              <m:r>
+                <w:rPr>
+                  <w:rFonts w:ascii="Cambria Math" w:eastAsiaTheme="minorEastAsia" w:hAnsi="Cambria Math"/>
+                </w:rPr>
+                <m:t>2</m:t>
+              </m:r>
+              <m:sSup>
+                <m:sSupPr>
+                  <m:ctrlPr>
+                    <w:rPr>
+                      <w:rFonts w:ascii="Cambria Math" w:eastAsiaTheme="minorEastAsia" w:hAnsi="Cambria Math"/>
+                      <w:i/>
+                    </w:rPr>
+                  </m:ctrlPr>
+                </m:sSupPr>
+                <m:e>
+                  <m:r>
+                    <w:rPr>
+                      <w:rFonts w:ascii="Cambria Math" w:eastAsiaTheme="minorEastAsia" w:hAnsi="Cambria Math"/>
+                    </w:rPr>
+                    <m:t>b</m:t>
+                  </m:r>
+                </m:e>
+                <m:sup>
+                  <m:r>
+                    <w:rPr>
+                      <w:rFonts w:ascii="Cambria Math" w:eastAsiaTheme="minorEastAsia" w:hAnsi="Cambria Math"/>
+                    </w:rPr>
+                    <m:t>2</m:t>
+                  </m:r>
+                </m:sup>
+              </m:sSup>
+              <m:r>
+                <w:rPr>
+                  <w:rFonts w:ascii="Cambria Math" w:eastAsiaTheme="minorEastAsia" w:hAnsi="Cambria Math"/>
+                </w:rPr>
+                <m:t>-9abc+27</m:t>
+              </m:r>
+              <m:sSup>
+                <m:sSupPr>
+                  <m:ctrlPr>
+                    <w:rPr>
+                      <w:rFonts w:ascii="Cambria Math" w:eastAsiaTheme="minorEastAsia" w:hAnsi="Cambria Math"/>
+                      <w:i/>
+                    </w:rPr>
+                  </m:ctrlPr>
+                </m:sSupPr>
+                <m:e>
+                  <m:r>
+                    <w:rPr>
+                      <w:rFonts w:ascii="Cambria Math" w:eastAsiaTheme="minorEastAsia" w:hAnsi="Cambria Math"/>
+                    </w:rPr>
+                    <m:t>a</m:t>
+                  </m:r>
+                </m:e>
+                <m:sup>
+                  <m:r>
+                    <w:rPr>
+                      <w:rFonts w:ascii="Cambria Math" w:eastAsiaTheme="minorEastAsia" w:hAnsi="Cambria Math"/>
+                    </w:rPr>
+                    <m:t>2</m:t>
+                  </m:r>
+                </m:sup>
+              </m:sSup>
+              <m:r>
+                <w:rPr>
+                  <w:rFonts w:ascii="Cambria Math" w:eastAsiaTheme="minorEastAsia" w:hAnsi="Cambria Math"/>
+                </w:rPr>
+                <m:t>d</m:t>
+              </m:r>
+            </m:num>
+            <m:den>
+              <m:r>
+                <w:rPr>
+                  <w:rFonts w:ascii="Cambria Math" w:eastAsiaTheme="minorEastAsia" w:hAnsi="Cambria Math"/>
+                </w:rPr>
+                <m:t>27</m:t>
+              </m:r>
+              <m:sSup>
+                <m:sSupPr>
+                  <m:ctrlPr>
+                    <w:rPr>
+                      <w:rFonts w:ascii="Cambria Math" w:eastAsiaTheme="minorEastAsia" w:hAnsi="Cambria Math"/>
+                      <w:i/>
+                    </w:rPr>
+                  </m:ctrlPr>
+                </m:sSupPr>
+                <m:e>
+                  <m:r>
+                    <w:rPr>
+                      <w:rFonts w:ascii="Cambria Math" w:eastAsiaTheme="minorEastAsia" w:hAnsi="Cambria Math"/>
+                    </w:rPr>
+                    <m:t>a</m:t>
+                  </m:r>
+                </m:e>
+                <m:sup>
+                  <m:r>
+                    <w:rPr>
+                      <w:rFonts w:ascii="Cambria Math" w:eastAsiaTheme="minorEastAsia" w:hAnsi="Cambria Math"/>
+                    </w:rPr>
                     <m:t>3</m:t>
                   </m:r>
                 </m:sup>
               </m:sSup>
-              <m:r>
-                <w:rPr>
-                  <w:rFonts w:ascii="Cambria Math" w:eastAsiaTheme="minorEastAsia" w:hAnsi="Cambria Math"/>
-                </w:rPr>
-                <m:t>-27</m:t>
-              </m:r>
-              <m:sSup>
-                <m:sSupPr>
-                  <m:ctrlPr>
-                    <w:rPr>
-                      <w:rFonts w:ascii="Cambria Math" w:eastAsiaTheme="minorEastAsia" w:hAnsi="Cambria Math"/>
-                      <w:i/>
-                    </w:rPr>
-                  </m:ctrlPr>
-                </m:sSupPr>
-                <m:e>
-                  <m:r>
-                    <w:rPr>
-                      <w:rFonts w:ascii="Cambria Math" w:eastAsiaTheme="minorEastAsia" w:hAnsi="Cambria Math"/>
-                    </w:rPr>
-                    <m:t>q</m:t>
-                  </m:r>
-                </m:e>
-                <m:sup>
-                  <m:r>
-                    <w:rPr>
-                      <w:rFonts w:ascii="Cambria Math" w:eastAsiaTheme="minorEastAsia" w:hAnsi="Cambria Math"/>
-                    </w:rPr>
-                    <m:t>2</m:t>
-                  </m:r>
-                </m:sup>
-              </m:sSup>
-            </m:e>
-          </m:d>
-        </m:oMath>
-      </m:oMathPara>
-      <w:bookmarkStart w:id="29" w:name="_GoBack"/>
-      <w:bookmarkEnd w:id="29"/>
-    </w:p>
-    <w:p>
-      <w:pPr>
-        <w:rPr>
-          <w:rFonts w:eastAsiaTheme="minorEastAsia"/>
-        </w:rPr>
-      </w:pPr>
-      <m:oMathPara>
-        <m:oMath>
-          <m:r>
-            <w:rPr>
-              <w:rFonts w:ascii="Cambria Math" w:eastAsiaTheme="minorEastAsia" w:hAnsi="Cambria Math"/>
-            </w:rPr>
-            <m:t>x1=x2</m:t>
-          </m:r>
-          <m:r>
-            <w:rPr>
-              <w:rFonts w:ascii="Cambria Math" w:eastAsiaTheme="minorEastAsia" w:hAnsi="Cambria Math"/>
-            </w:rPr>
-            <m:t>=</m:t>
-          </m:r>
-          <m:f>
-            <m:fPr>
-              <m:ctrlPr>
-                <w:rPr>
-                  <w:rFonts w:ascii="Cambria Math" w:eastAsiaTheme="minorEastAsia" w:hAnsi="Cambria Math"/>
-                  <w:i/>
-                </w:rPr>
-              </m:ctrlPr>
-            </m:fPr>
-            <m:num>
-              <m:r>
-                <w:rPr>
-                  <w:rFonts w:ascii="Cambria Math" w:eastAsiaTheme="minorEastAsia" w:hAnsi="Cambria Math"/>
-                </w:rPr>
-                <m:t>-c</m:t>
-              </m:r>
-            </m:num>
-            <m:den>
-              <m:r>
-                <w:rPr>
-                  <w:rFonts w:ascii="Cambria Math" w:eastAsiaTheme="minorEastAsia" w:hAnsi="Cambria Math"/>
-                </w:rPr>
-                <m:t>2b</m:t>
-              </m:r>
             </m:den>
           </m:f>
         </m:oMath>
@@ -12664,6 +14332,64 @@
     </w:p>
     <w:p>
       <w:pPr>
+        <w:ind w:left="-567" w:right="-567"/>
+        <w:rPr>
+          <w:rFonts w:eastAsiaTheme="minorEastAsia"/>
+        </w:rPr>
+      </w:pPr>
+      <w:proofErr w:type="gramStart"/>
+      <w:r>
+        <w:rPr>
+          <w:rFonts w:eastAsiaTheme="minorEastAsia"/>
+        </w:rPr>
+        <w:t>discriminant</w:t>
+      </w:r>
+      <w:proofErr w:type="gramEnd"/>
+      <w:r>
+        <w:rPr>
+          <w:rFonts w:eastAsiaTheme="minorEastAsia"/>
+        </w:rPr>
+        <w:t xml:space="preserve"> </w:t>
+      </w:r>
+      <w:r>
+        <w:rPr>
+          <w:rFonts w:eastAsiaTheme="minorEastAsia"/>
+        </w:rPr>
+        <w:t>2</w:t>
+      </w:r>
+      <w:r>
+        <w:rPr>
+          <w:rFonts w:eastAsiaTheme="minorEastAsia"/>
+          <w:vertAlign w:val="superscript"/>
+        </w:rPr>
+        <w:t>nd</w:t>
+      </w:r>
+      <w:r>
+        <w:rPr>
+          <w:rFonts w:eastAsiaTheme="minorEastAsia"/>
+        </w:rPr>
+        <w:t xml:space="preserve"> </w:t>
+      </w:r>
+      <w:proofErr w:type="spellStart"/>
+      <w:r>
+        <w:rPr>
+          <w:rFonts w:eastAsiaTheme="minorEastAsia"/>
+        </w:rPr>
+        <w:t>degré</w:t>
+      </w:r>
+      <w:proofErr w:type="spellEnd"/>
+    </w:p>
+    <w:p>
+      <w:pPr>
+        <w:ind w:left="-567" w:right="-567"/>
+        <w:rPr>
+          <w:rFonts w:eastAsiaTheme="minorEastAsia"/>
+        </w:rPr>
+      </w:pPr>
+    </w:p>
+    <w:p>
+      <w:pPr>
+        <w:ind w:left="-567" w:right="-567"/>
         <w:rPr>
           <w:rFonts w:eastAsiaTheme="minorEastAsia"/>
         </w:rPr>
@@ -12674,13 +14400,141 @@
             <w:rPr>
               <w:rFonts w:ascii="Cambria Math" w:eastAsiaTheme="minorEastAsia" w:hAnsi="Cambria Math"/>
             </w:rPr>
-            <m:t>x1</m:t>
-          </m:r>
+            <m:t>∆=</m:t>
+          </m:r>
+          <m:sSup>
+            <m:sSupPr>
+              <m:ctrlPr>
+                <w:rPr>
+                  <w:rFonts w:ascii="Cambria Math" w:eastAsiaTheme="minorEastAsia" w:hAnsi="Cambria Math"/>
+                  <w:i/>
+                </w:rPr>
+              </m:ctrlPr>
+            </m:sSupPr>
+            <m:e>
+              <m:r>
+                <w:rPr>
+                  <w:rFonts w:ascii="Cambria Math" w:eastAsiaTheme="minorEastAsia" w:hAnsi="Cambria Math"/>
+                </w:rPr>
+                <m:t>c</m:t>
+              </m:r>
+            </m:e>
+            <m:sup>
+              <m:r>
+                <w:rPr>
+                  <w:rFonts w:ascii="Cambria Math" w:eastAsiaTheme="minorEastAsia" w:hAnsi="Cambria Math"/>
+                </w:rPr>
+                <m:t>2</m:t>
+              </m:r>
+            </m:sup>
+          </m:sSup>
           <m:r>
             <w:rPr>
               <w:rFonts w:ascii="Cambria Math" w:eastAsiaTheme="minorEastAsia" w:hAnsi="Cambria Math"/>
             </w:rPr>
-            <m:t>=</m:t>
+            <m:t>-4bd</m:t>
+          </m:r>
+        </m:oMath>
+      </m:oMathPara>
+    </w:p>
+    <w:p>
+      <w:pPr>
+        <w:rPr>
+          <w:rFonts w:eastAsiaTheme="minorEastAsia"/>
+        </w:rPr>
+      </w:pPr>
+    </w:p>
+    <w:p>
+      <w:pPr>
+        <w:ind w:left="-567" w:right="-567"/>
+        <w:rPr>
+          <w:rFonts w:eastAsiaTheme="minorEastAsia"/>
+        </w:rPr>
+      </w:pPr>
+      <w:r>
+        <w:rPr>
+          <w:rFonts w:eastAsiaTheme="minorEastAsia"/>
+        </w:rPr>
+        <w:lastRenderedPageBreak/>
+        <w:t>Si discriminant = 0</w:t>
+      </w:r>
+    </w:p>
+    <w:p>
+      <w:pPr>
+        <w:rPr>
+          <w:rFonts w:eastAsiaTheme="minorEastAsia"/>
+        </w:rPr>
+      </w:pPr>
+      <m:oMathPara>
+        <m:oMath>
+          <m:r>
+            <w:rPr>
+              <w:rFonts w:ascii="Cambria Math" w:eastAsiaTheme="minorEastAsia" w:hAnsi="Cambria Math"/>
+            </w:rPr>
+            <m:t>x1=x2=</m:t>
+          </m:r>
+          <m:f>
+            <m:fPr>
+              <m:ctrlPr>
+                <w:rPr>
+                  <w:rFonts w:ascii="Cambria Math" w:eastAsiaTheme="minorEastAsia" w:hAnsi="Cambria Math"/>
+                  <w:i/>
+                </w:rPr>
+              </m:ctrlPr>
+            </m:fPr>
+            <m:num>
+              <m:r>
+                <w:rPr>
+                  <w:rFonts w:ascii="Cambria Math" w:eastAsiaTheme="minorEastAsia" w:hAnsi="Cambria Math"/>
+                </w:rPr>
+                <m:t>-c</m:t>
+              </m:r>
+            </m:num>
+            <m:den>
+              <m:r>
+                <w:rPr>
+                  <w:rFonts w:ascii="Cambria Math" w:eastAsiaTheme="minorEastAsia" w:hAnsi="Cambria Math"/>
+                </w:rPr>
+                <m:t>2b</m:t>
+              </m:r>
+            </m:den>
+          </m:f>
+        </m:oMath>
+      </m:oMathPara>
+    </w:p>
+    <w:p>
+      <w:pPr>
+        <w:ind w:left="-567" w:right="-567"/>
+        <w:rPr>
+          <w:rFonts w:eastAsiaTheme="minorEastAsia"/>
+        </w:rPr>
+      </w:pPr>
+      <w:r>
+        <w:rPr>
+          <w:rFonts w:eastAsiaTheme="minorEastAsia"/>
+        </w:rPr>
+        <w:t>Si discriminant &gt;</w:t>
+      </w:r>
+      <w:r>
+        <w:rPr>
+          <w:rFonts w:eastAsiaTheme="minorEastAsia"/>
+        </w:rPr>
+        <w:t xml:space="preserve"> 0</w:t>
+      </w:r>
+    </w:p>
+    <w:p>
+      <w:pPr>
+        <w:rPr>
+          <w:rFonts w:eastAsiaTheme="minorEastAsia"/>
+        </w:rPr>
+      </w:pPr>
+      <m:oMathPara>
+        <m:oMath>
+          <m:r>
+            <w:rPr>
+              <w:rFonts w:ascii="Cambria Math" w:eastAsiaTheme="minorEastAsia" w:hAnsi="Cambria Math"/>
+            </w:rPr>
+            <m:t>x1=</m:t>
           </m:r>
           <m:f>
             <m:fPr>
@@ -12732,25 +14586,7 @@
             <w:rPr>
               <w:rFonts w:ascii="Cambria Math" w:eastAsiaTheme="minorEastAsia" w:hAnsi="Cambria Math"/>
             </w:rPr>
-            <m:t xml:space="preserve">          </m:t>
-          </m:r>
-          <m:r>
-            <w:rPr>
-              <w:rFonts w:ascii="Cambria Math" w:eastAsiaTheme="minorEastAsia" w:hAnsi="Cambria Math"/>
-            </w:rPr>
-            <m:t>x</m:t>
-          </m:r>
-          <m:r>
-            <w:rPr>
-              <w:rFonts w:ascii="Cambria Math" w:eastAsiaTheme="minorEastAsia" w:hAnsi="Cambria Math"/>
-            </w:rPr>
-            <m:t>2</m:t>
-          </m:r>
-          <m:r>
-            <w:rPr>
-              <w:rFonts w:ascii="Cambria Math" w:eastAsiaTheme="minorEastAsia" w:hAnsi="Cambria Math"/>
-            </w:rPr>
-            <m:t>=</m:t>
+            <m:t xml:space="preserve">          x2=</m:t>
           </m:r>
           <m:f>
             <m:fPr>
@@ -12766,13 +14602,7 @@
                 <w:rPr>
                   <w:rFonts w:ascii="Cambria Math" w:eastAsiaTheme="minorEastAsia" w:hAnsi="Cambria Math"/>
                 </w:rPr>
-                <m:t>-c</m:t>
-              </m:r>
-              <m:r>
-                <w:rPr>
-                  <w:rFonts w:ascii="Cambria Math" w:eastAsiaTheme="minorEastAsia" w:hAnsi="Cambria Math"/>
-                </w:rPr>
-                <m:t>+</m:t>
+                <m:t>-c+</m:t>
               </m:r>
               <m:rad>
                 <m:radPr>
@@ -12809,6 +14639,28 @@
     </w:p>
     <w:p>
       <w:pPr>
+        <w:ind w:left="-567"/>
+        <w:rPr>
+          <w:rFonts w:eastAsiaTheme="minorEastAsia"/>
+        </w:rPr>
+      </w:pPr>
+      <w:r>
+        <w:rPr>
+          <w:rFonts w:eastAsiaTheme="minorEastAsia"/>
+        </w:rPr>
+        <w:t>Solu</w:t>
+      </w:r>
+      <w:bookmarkStart w:id="32" w:name="_GoBack"/>
+      <w:bookmarkEnd w:id="32"/>
+      <w:r>
+        <w:rPr>
+          <w:rFonts w:eastAsiaTheme="minorEastAsia"/>
+        </w:rPr>
+        <w:t>tion 1er degree</w:t>
+      </w:r>
+    </w:p>
+    <w:p>
+      <w:pPr>
         <w:rPr>
           <w:rFonts w:eastAsiaTheme="minorEastAsia"/>
         </w:rPr>
@@ -12871,7 +14723,7 @@
           <w:lang w:val="fr-FR"/>
         </w:rPr>
       </w:pPr>
-      <w:bookmarkStart w:id="30" w:name="_Toc37837289"/>
+      <w:bookmarkStart w:id="33" w:name="_Toc38312660"/>
       <w:r>
         <w:rPr>
           <w:rFonts w:eastAsiaTheme="minorEastAsia"/>
@@ -12880,7 +14732,7 @@
         <w:lastRenderedPageBreak/>
         <w:t>PDE</w:t>
       </w:r>
-      <w:bookmarkEnd w:id="30"/>
+      <w:bookmarkEnd w:id="33"/>
     </w:p>
     <w:p>
       <w:pPr>
@@ -12896,7 +14748,7 @@
           <w:lang w:val="fr-FR"/>
         </w:rPr>
       </w:pPr>
-      <w:bookmarkStart w:id="31" w:name="_Toc37837290"/>
+      <w:bookmarkStart w:id="34" w:name="_Toc38312661"/>
       <w:proofErr w:type="spellStart"/>
       <w:r>
         <w:rPr>
@@ -12904,18 +14756,18 @@
         </w:rPr>
         <w:t>ThermalDiffusion</w:t>
       </w:r>
-      <w:bookmarkEnd w:id="31"/>
+      <w:bookmarkEnd w:id="34"/>
       <w:proofErr w:type="spellEnd"/>
     </w:p>
     <w:p>
       <w:pPr>
         <w:pStyle w:val="Titre3"/>
       </w:pPr>
-      <w:bookmarkStart w:id="32" w:name="_Toc37837291"/>
+      <w:bookmarkStart w:id="35" w:name="_Toc38312662"/>
       <w:r>
         <w:t>Second order central</w:t>
       </w:r>
-      <w:bookmarkEnd w:id="32"/>
+      <w:bookmarkEnd w:id="35"/>
     </w:p>
     <w:p>
       <w:pPr>
@@ -17060,500 +18912,6 @@
 </w:styles>
 </file>
 
-<file path=word/glossary/document.xml><?xml version="1.0" encoding="utf-8"?>
-<w:glossaryDocument xmlns:wpc="http://schemas.microsoft.com/office/word/2010/wordprocessingCanvas" xmlns:mc="http://schemas.openxmlformats.org/markup-compatibility/2006" xmlns:o="urn:schemas-microsoft-com:office:office" xmlns:r="http://schemas.openxmlformats.org/officeDocument/2006/relationships" xmlns:m="http://schemas.openxmlformats.org/officeDocument/2006/math" xmlns:v="urn:schemas-microsoft-com:vml" xmlns:wp14="http://schemas.microsoft.com/office/word/2010/wordprocessingDrawing" xmlns:wp="http://schemas.openxmlformats.org/drawingml/2006/wordprocessingDrawing" xmlns:w10="urn:schemas-microsoft-com:office:word" xmlns:w="http://schemas.openxmlformats.org/wordprocessingml/2006/main" xmlns:w14="http://schemas.microsoft.com/office/word/2010/wordml" xmlns:wpg="http://schemas.microsoft.com/office/word/2010/wordprocessingGroup" xmlns:wpi="http://schemas.microsoft.com/office/word/2010/wordprocessingInk" xmlns:wne="http://schemas.microsoft.com/office/word/2006/wordml" xmlns:wps="http://schemas.microsoft.com/office/word/2010/wordprocessingShape" mc:Ignorable="w14 wp14"/>
-</file>
-
-<file path=word/glossary/fontTable.xml><?xml version="1.0" encoding="utf-8"?>
-<w:fonts xmlns:mc="http://schemas.openxmlformats.org/markup-compatibility/2006" xmlns:r="http://schemas.openxmlformats.org/officeDocument/2006/relationships" xmlns:w="http://schemas.openxmlformats.org/wordprocessingml/2006/main" xmlns:w14="http://schemas.microsoft.com/office/word/2010/wordml" mc:Ignorable="w14">
-  <w:font w:name="Calibri">
-    <w:panose1 w:val="020F0502020204030204"/>
-    <w:charset w:val="00"/>
-    <w:family w:val="swiss"/>
-    <w:pitch w:val="variable"/>
-    <w:sig w:usb0="E0002AFF" w:usb1="C000247B" w:usb2="00000009" w:usb3="00000000" w:csb0="000001FF" w:csb1="00000000"/>
-  </w:font>
-  <w:font w:name="Times New Roman">
-    <w:panose1 w:val="02020603050405020304"/>
-    <w:charset w:val="00"/>
-    <w:family w:val="roman"/>
-    <w:pitch w:val="variable"/>
-    <w:sig w:usb0="E0002EFF" w:usb1="C000785B" w:usb2="00000009" w:usb3="00000000" w:csb0="000001FF" w:csb1="00000000"/>
-  </w:font>
-  <w:font w:name="Calibri Light">
-    <w:panose1 w:val="020F0302020204030204"/>
-    <w:charset w:val="00"/>
-    <w:family w:val="swiss"/>
-    <w:pitch w:val="variable"/>
-    <w:sig w:usb0="E0002AFF" w:usb1="C000247B" w:usb2="00000009" w:usb3="00000000" w:csb0="000001FF" w:csb1="00000000"/>
-  </w:font>
-  <w:font w:name="Tahoma">
-    <w:panose1 w:val="020B0604030504040204"/>
-    <w:charset w:val="00"/>
-    <w:family w:val="swiss"/>
-    <w:pitch w:val="variable"/>
-    <w:sig w:usb0="E1002EFF" w:usb1="C000605B" w:usb2="00000029" w:usb3="00000000" w:csb0="000101FF" w:csb1="00000000"/>
-  </w:font>
-  <w:font w:name="Cambria Math">
-    <w:panose1 w:val="02040503050406030204"/>
-    <w:charset w:val="00"/>
-    <w:family w:val="roman"/>
-    <w:pitch w:val="variable"/>
-    <w:sig w:usb0="E00006FF" w:usb1="420024FF" w:usb2="02000000" w:usb3="00000000" w:csb0="0000019F" w:csb1="00000000"/>
-  </w:font>
-  <w:font w:name="Cambria">
-    <w:panose1 w:val="02040503050406030204"/>
-    <w:charset w:val="00"/>
-    <w:family w:val="roman"/>
-    <w:pitch w:val="variable"/>
-    <w:sig w:usb0="E00006FF" w:usb1="420024FF" w:usb2="02000000" w:usb3="00000000" w:csb0="0000019F" w:csb1="00000000"/>
-  </w:font>
-</w:fonts>
-</file>
-
-<file path=word/glossary/settings.xml><?xml version="1.0" encoding="utf-8"?>
-<w:settings xmlns:mc="http://schemas.openxmlformats.org/markup-compatibility/2006" xmlns:o="urn:schemas-microsoft-com:office:office" xmlns:r="http://schemas.openxmlformats.org/officeDocument/2006/relationships" xmlns:m="http://schemas.openxmlformats.org/officeDocument/2006/math" xmlns:v="urn:schemas-microsoft-com:vml" xmlns:w10="urn:schemas-microsoft-com:office:word" xmlns:w="http://schemas.openxmlformats.org/wordprocessingml/2006/main" xmlns:w14="http://schemas.microsoft.com/office/word/2010/wordml" xmlns:sl="http://schemas.openxmlformats.org/schemaLibrary/2006/main" mc:Ignorable="w14">
-  <w:view w:val="normal"/>
-  <w:defaultTabStop w:val="720"/>
-  <w:characterSpacingControl w:val="doNotCompress"/>
-  <w:compat>
-    <w:useFELayout/>
-    <w:compatSetting w:name="compatibilityMode" w:uri="http://schemas.microsoft.com/office/word" w:val="14"/>
-    <w:compatSetting w:name="overrideTableStyleFontSizeAndJustification" w:uri="http://schemas.microsoft.com/office/word" w:val="1"/>
-    <w:compatSetting w:name="enableOpenTypeFeatures" w:uri="http://schemas.microsoft.com/office/word" w:val="1"/>
-    <w:compatSetting w:name="doNotFlipMirrorIndents" w:uri="http://schemas.microsoft.com/office/word" w:val="1"/>
-  </w:compat>
-  <w:rsids>
-    <w:rsidRoot w:val="001C3F4C"/>
-    <w:rsid w:val="001C3F4C"/>
-  </w:rsids>
-  <m:mathPr>
-    <m:mathFont m:val="Cambria Math"/>
-    <m:brkBin m:val="before"/>
-    <m:brkBinSub m:val="--"/>
-    <m:smallFrac m:val="0"/>
-    <m:dispDef/>
-    <m:lMargin m:val="0"/>
-    <m:rMargin m:val="0"/>
-    <m:defJc m:val="centerGroup"/>
-    <m:wrapIndent m:val="1440"/>
-    <m:intLim m:val="subSup"/>
-    <m:naryLim m:val="undOvr"/>
-  </m:mathPr>
-  <w:themeFontLang w:val="en-GB"/>
-  <w:clrSchemeMapping w:bg1="light1" w:t1="dark1" w:bg2="light2" w:t2="dark2" w:accent1="accent1" w:accent2="accent2" w:accent3="accent3" w:accent4="accent4" w:accent5="accent5" w:accent6="accent6" w:hyperlink="hyperlink" w:followedHyperlink="followedHyperlink"/>
-  <w:decimalSymbol w:val=","/>
-  <w:listSeparator w:val=";"/>
-</w:settings>
-</file>
-
-<file path=word/glossary/styles.xml><?xml version="1.0" encoding="utf-8"?>
-<w:styles xmlns:mc="http://schemas.openxmlformats.org/markup-compatibility/2006" xmlns:r="http://schemas.openxmlformats.org/officeDocument/2006/relationships" xmlns:w="http://schemas.openxmlformats.org/wordprocessingml/2006/main" xmlns:w14="http://schemas.microsoft.com/office/word/2010/wordml" mc:Ignorable="w14">
-  <w:docDefaults>
-    <w:rPrDefault>
-      <w:rPr>
-        <w:rFonts w:asciiTheme="minorHAnsi" w:eastAsiaTheme="minorEastAsia" w:hAnsiTheme="minorHAnsi" w:cstheme="minorBidi"/>
-        <w:sz w:val="22"/>
-        <w:szCs w:val="22"/>
-        <w:lang w:val="en-GB" w:eastAsia="en-GB" w:bidi="ar-SA"/>
-      </w:rPr>
-    </w:rPrDefault>
-    <w:pPrDefault>
-      <w:pPr>
-        <w:spacing w:after="200" w:line="276" w:lineRule="auto"/>
-      </w:pPr>
-    </w:pPrDefault>
-  </w:docDefaults>
-  <w:latentStyles w:defLockedState="0" w:defUIPriority="99" w:defSemiHidden="1" w:defUnhideWhenUsed="1" w:defQFormat="0" w:count="267">
-    <w:lsdException w:name="Normal" w:semiHidden="0" w:uiPriority="0" w:unhideWhenUsed="0" w:qFormat="1"/>
-    <w:lsdException w:name="heading 1" w:semiHidden="0" w:uiPriority="9" w:unhideWhenUsed="0" w:qFormat="1"/>
-    <w:lsdException w:name="heading 2" w:uiPriority="9" w:qFormat="1"/>
-    <w:lsdException w:name="heading 3" w:uiPriority="9" w:qFormat="1"/>
-    <w:lsdException w:name="heading 4" w:uiPriority="9" w:qFormat="1"/>
-    <w:lsdException w:name="heading 5" w:uiPriority="9" w:qFormat="1"/>
-    <w:lsdException w:name="heading 6" w:uiPriority="9" w:qFormat="1"/>
-    <w:lsdException w:name="heading 7" w:uiPriority="9" w:qFormat="1"/>
-    <w:lsdException w:name="heading 8" w:uiPriority="9" w:qFormat="1"/>
-    <w:lsdException w:name="heading 9" w:uiPriority="9" w:qFormat="1"/>
-    <w:lsdException w:name="toc 1" w:uiPriority="39"/>
-    <w:lsdException w:name="toc 2" w:uiPriority="39"/>
-    <w:lsdException w:name="toc 3" w:uiPriority="39"/>
-    <w:lsdException w:name="toc 4" w:uiPriority="39"/>
-    <w:lsdException w:name="toc 5" w:uiPriority="39"/>
-    <w:lsdException w:name="toc 6" w:uiPriority="39"/>
-    <w:lsdException w:name="toc 7" w:uiPriority="39"/>
-    <w:lsdException w:name="toc 8" w:uiPriority="39"/>
-    <w:lsdException w:name="toc 9" w:uiPriority="39"/>
-    <w:lsdException w:name="caption" w:uiPriority="35" w:qFormat="1"/>
-    <w:lsdException w:name="Title" w:semiHidden="0" w:uiPriority="10" w:unhideWhenUsed="0" w:qFormat="1"/>
-    <w:lsdException w:name="Default Paragraph Font" w:uiPriority="1"/>
-    <w:lsdException w:name="Subtitle" w:semiHidden="0" w:uiPriority="11" w:unhideWhenUsed="0" w:qFormat="1"/>
-    <w:lsdException w:name="Strong" w:semiHidden="0" w:uiPriority="22" w:unhideWhenUsed="0" w:qFormat="1"/>
-    <w:lsdException w:name="Emphasis" w:semiHidden="0" w:uiPriority="20" w:unhideWhenUsed="0" w:qFormat="1"/>
-    <w:lsdException w:name="Table Grid" w:semiHidden="0" w:uiPriority="59" w:unhideWhenUsed="0"/>
-    <w:lsdException w:name="Placeholder Text" w:unhideWhenUsed="0"/>
-    <w:lsdException w:name="No Spacing" w:semiHidden="0" w:uiPriority="1" w:unhideWhenUsed="0" w:qFormat="1"/>
-    <w:lsdException w:name="Light Shading" w:semiHidden="0" w:uiPriority="60" w:unhideWhenUsed="0"/>
-    <w:lsdException w:name="Light List" w:semiHidden="0" w:uiPriority="61" w:unhideWhenUsed="0"/>
-    <w:lsdException w:name="Light Grid" w:semiHidden="0" w:uiPriority="62" w:unhideWhenUsed="0"/>
-    <w:lsdException w:name="Medium Shading 1" w:semiHidden="0" w:uiPriority="63" w:unhideWhenUsed="0"/>
-    <w:lsdException w:name="Medium Shading 2" w:semiHidden="0" w:uiPriority="64" w:unhideWhenUsed="0"/>
-    <w:lsdException w:name="Medium List 1" w:semiHidden="0" w:uiPriority="65" w:unhideWhenUsed="0"/>
-    <w:lsdException w:name="Medium List 2" w:semiHidden="0" w:uiPriority="66" w:unhideWhenUsed="0"/>
-    <w:lsdException w:name="Medium Grid 1" w:semiHidden="0" w:uiPriority="67" w:unhideWhenUsed="0"/>
-    <w:lsdException w:name="Medium Grid 2" w:semiHidden="0" w:uiPriority="68" w:unhideWhenUsed="0"/>
-    <w:lsdException w:name="Medium Grid 3" w:semiHidden="0" w:uiPriority="69" w:unhideWhenUsed="0"/>
-    <w:lsdException w:name="Dark List" w:semiHidden="0" w:uiPriority="70" w:unhideWhenUsed="0"/>
-    <w:lsdException w:name="Colorful Shading" w:semiHidden="0" w:uiPriority="71" w:unhideWhenUsed="0"/>
-    <w:lsdException w:name="Colorful List" w:semiHidden="0" w:uiPriority="72" w:unhideWhenUsed="0"/>
-    <w:lsdException w:name="Colorful Grid" w:semiHidden="0" w:uiPriority="73" w:unhideWhenUsed="0"/>
-    <w:lsdException w:name="Light Shading Accent 1" w:semiHidden="0" w:uiPriority="60" w:unhideWhenUsed="0"/>
-    <w:lsdException w:name="Light List Accent 1" w:semiHidden="0" w:uiPriority="61" w:unhideWhenUsed="0"/>
-    <w:lsdException w:name="Light Grid Accent 1" w:semiHidden="0" w:uiPriority="62" w:unhideWhenUsed="0"/>
-    <w:lsdException w:name="Medium Shading 1 Accent 1" w:semiHidden="0" w:uiPriority="63" w:unhideWhenUsed="0"/>
-    <w:lsdException w:name="Medium Shading 2 Accent 1" w:semiHidden="0" w:uiPriority="64" w:unhideWhenUsed="0"/>
-    <w:lsdException w:name="Medium List 1 Accent 1" w:semiHidden="0" w:uiPriority="65" w:unhideWhenUsed="0"/>
-    <w:lsdException w:name="Revision" w:unhideWhenUsed="0"/>
-    <w:lsdException w:name="List Paragraph" w:semiHidden="0" w:uiPriority="34" w:unhideWhenUsed="0" w:qFormat="1"/>
-    <w:lsdException w:name="Quote" w:semiHidden="0" w:uiPriority="29" w:unhideWhenUsed="0" w:qFormat="1"/>
-    <w:lsdException w:name="Intense Quote" w:semiHidden="0" w:uiPriority="30" w:unhideWhenUsed="0" w:qFormat="1"/>
-    <w:lsdException w:name="Medium List 2 Accent 1" w:semiHidden="0" w:uiPriority="66" w:unhideWhenUsed="0"/>
-    <w:lsdException w:name="Medium Grid 1 Accent 1" w:semiHidden="0" w:uiPriority="67" w:unhideWhenUsed="0"/>
-    <w:lsdException w:name="Medium Grid 2 Accent 1" w:semiHidden="0" w:uiPriority="68" w:unhideWhenUsed="0"/>
-    <w:lsdException w:name="Medium Grid 3 Accent 1" w:semiHidden="0" w:uiPriority="69" w:unhideWhenUsed="0"/>
-    <w:lsdException w:name="Dark List Accent 1" w:semiHidden="0" w:uiPriority="70" w:unhideWhenUsed="0"/>
-    <w:lsdException w:name="Colorful Shading Accent 1" w:semiHidden="0" w:uiPriority="71" w:unhideWhenUsed="0"/>
-    <w:lsdException w:name="Colorful List Accent 1" w:semiHidden="0" w:uiPriority="72" w:unhideWhenUsed="0"/>
-    <w:lsdException w:name="Colorful Grid Accent 1" w:semiHidden="0" w:uiPriority="73" w:unhideWhenUsed="0"/>
-    <w:lsdException w:name="Light Shading Accent 2" w:semiHidden="0" w:uiPriority="60" w:unhideWhenUsed="0"/>
-    <w:lsdException w:name="Light List Accent 2" w:semiHidden="0" w:uiPriority="61" w:unhideWhenUsed="0"/>
-    <w:lsdException w:name="Light Grid Accent 2" w:semiHidden="0" w:uiPriority="62" w:unhideWhenUsed="0"/>
-    <w:lsdException w:name="Medium Shading 1 Accent 2" w:semiHidden="0" w:uiPriority="63" w:unhideWhenUsed="0"/>
-    <w:lsdException w:name="Medium Shading 2 Accent 2" w:semiHidden="0" w:uiPriority="64" w:unhideWhenUsed="0"/>
-    <w:lsdException w:name="Medium List 1 Accent 2" w:semiHidden="0" w:uiPriority="65" w:unhideWhenUsed="0"/>
-    <w:lsdException w:name="Medium List 2 Accent 2" w:semiHidden="0" w:uiPriority="66" w:unhideWhenUsed="0"/>
-    <w:lsdException w:name="Medium Grid 1 Accent 2" w:semiHidden="0" w:uiPriority="67" w:unhideWhenUsed="0"/>
-    <w:lsdException w:name="Medium Grid 2 Accent 2" w:semiHidden="0" w:uiPriority="68" w:unhideWhenUsed="0"/>
-    <w:lsdException w:name="Medium Grid 3 Accent 2" w:semiHidden="0" w:uiPriority="69" w:unhideWhenUsed="0"/>
-    <w:lsdException w:name="Dark List Accent 2" w:semiHidden="0" w:uiPriority="70" w:unhideWhenUsed="0"/>
-    <w:lsdException w:name="Colorful Shading Accent 2" w:semiHidden="0" w:uiPriority="71" w:unhideWhenUsed="0"/>
-    <w:lsdException w:name="Colorful List Accent 2" w:semiHidden="0" w:uiPriority="72" w:unhideWhenUsed="0"/>
-    <w:lsdException w:name="Colorful Grid Accent 2" w:semiHidden="0" w:uiPriority="73" w:unhideWhenUsed="0"/>
-    <w:lsdException w:name="Light Shading Accent 3" w:semiHidden="0" w:uiPriority="60" w:unhideWhenUsed="0"/>
-    <w:lsdException w:name="Light List Accent 3" w:semiHidden="0" w:uiPriority="61" w:unhideWhenUsed="0"/>
-    <w:lsdException w:name="Light Grid Accent 3" w:semiHidden="0" w:uiPriority="62" w:unhideWhenUsed="0"/>
-    <w:lsdException w:name="Medium Shading 1 Accent 3" w:semiHidden="0" w:uiPriority="63" w:unhideWhenUsed="0"/>
-    <w:lsdException w:name="Medium Shading 2 Accent 3" w:semiHidden="0" w:uiPriority="64" w:unhideWhenUsed="0"/>
-    <w:lsdException w:name="Medium List 1 Accent 3" w:semiHidden="0" w:uiPriority="65" w:unhideWhenUsed="0"/>
-    <w:lsdException w:name="Medium List 2 Accent 3" w:semiHidden="0" w:uiPriority="66" w:unhideWhenUsed="0"/>
-    <w:lsdException w:name="Medium Grid 1 Accent 3" w:semiHidden="0" w:uiPriority="67" w:unhideWhenUsed="0"/>
-    <w:lsdException w:name="Medium Grid 2 Accent 3" w:semiHidden="0" w:uiPriority="68" w:unhideWhenUsed="0"/>
-    <w:lsdException w:name="Medium Grid 3 Accent 3" w:semiHidden="0" w:uiPriority="69" w:unhideWhenUsed="0"/>
-    <w:lsdException w:name="Dark List Accent 3" w:semiHidden="0" w:uiPriority="70" w:unhideWhenUsed="0"/>
-    <w:lsdException w:name="Colorful Shading Accent 3" w:semiHidden="0" w:uiPriority="71" w:unhideWhenUsed="0"/>
-    <w:lsdException w:name="Colorful List Accent 3" w:semiHidden="0" w:uiPriority="72" w:unhideWhenUsed="0"/>
-    <w:lsdException w:name="Colorful Grid Accent 3" w:semiHidden="0" w:uiPriority="73" w:unhideWhenUsed="0"/>
-    <w:lsdException w:name="Light Shading Accent 4" w:semiHidden="0" w:uiPriority="60" w:unhideWhenUsed="0"/>
-    <w:lsdException w:name="Light List Accent 4" w:semiHidden="0" w:uiPriority="61" w:unhideWhenUsed="0"/>
-    <w:lsdException w:name="Light Grid Accent 4" w:semiHidden="0" w:uiPriority="62" w:unhideWhenUsed="0"/>
-    <w:lsdException w:name="Medium Shading 1 Accent 4" w:semiHidden="0" w:uiPriority="63" w:unhideWhenUsed="0"/>
-    <w:lsdException w:name="Medium Shading 2 Accent 4" w:semiHidden="0" w:uiPriority="64" w:unhideWhenUsed="0"/>
-    <w:lsdException w:name="Medium List 1 Accent 4" w:semiHidden="0" w:uiPriority="65" w:unhideWhenUsed="0"/>
-    <w:lsdException w:name="Medium List 2 Accent 4" w:semiHidden="0" w:uiPriority="66" w:unhideWhenUsed="0"/>
-    <w:lsdException w:name="Medium Grid 1 Accent 4" w:semiHidden="0" w:uiPriority="67" w:unhideWhenUsed="0"/>
-    <w:lsdException w:name="Medium Grid 2 Accent 4" w:semiHidden="0" w:uiPriority="68" w:unhideWhenUsed="0"/>
-    <w:lsdException w:name="Medium Grid 3 Accent 4" w:semiHidden="0" w:uiPriority="69" w:unhideWhenUsed="0"/>
-    <w:lsdException w:name="Dark List Accent 4" w:semiHidden="0" w:uiPriority="70" w:unhideWhenUsed="0"/>
-    <w:lsdException w:name="Colorful Shading Accent 4" w:semiHidden="0" w:uiPriority="71" w:unhideWhenUsed="0"/>
-    <w:lsdException w:name="Colorful List Accent 4" w:semiHidden="0" w:uiPriority="72" w:unhideWhenUsed="0"/>
-    <w:lsdException w:name="Colorful Grid Accent 4" w:semiHidden="0" w:uiPriority="73" w:unhideWhenUsed="0"/>
-    <w:lsdException w:name="Light Shading Accent 5" w:semiHidden="0" w:uiPriority="60" w:unhideWhenUsed="0"/>
-    <w:lsdException w:name="Light List Accent 5" w:semiHidden="0" w:uiPriority="61" w:unhideWhenUsed="0"/>
-    <w:lsdException w:name="Light Grid Accent 5" w:semiHidden="0" w:uiPriority="62" w:unhideWhenUsed="0"/>
-    <w:lsdException w:name="Medium Shading 1 Accent 5" w:semiHidden="0" w:uiPriority="63" w:unhideWhenUsed="0"/>
-    <w:lsdException w:name="Medium Shading 2 Accent 5" w:semiHidden="0" w:uiPriority="64" w:unhideWhenUsed="0"/>
-    <w:lsdException w:name="Medium List 1 Accent 5" w:semiHidden="0" w:uiPriority="65" w:unhideWhenUsed="0"/>
-    <w:lsdException w:name="Medium List 2 Accent 5" w:semiHidden="0" w:uiPriority="66" w:unhideWhenUsed="0"/>
-    <w:lsdException w:name="Medium Grid 1 Accent 5" w:semiHidden="0" w:uiPriority="67" w:unhideWhenUsed="0"/>
-    <w:lsdException w:name="Medium Grid 2 Accent 5" w:semiHidden="0" w:uiPriority="68" w:unhideWhenUsed="0"/>
-    <w:lsdException w:name="Medium Grid 3 Accent 5" w:semiHidden="0" w:uiPriority="69" w:unhideWhenUsed="0"/>
-    <w:lsdException w:name="Dark List Accent 5" w:semiHidden="0" w:uiPriority="70" w:unhideWhenUsed="0"/>
-    <w:lsdException w:name="Colorful Shading Accent 5" w:semiHidden="0" w:uiPriority="71" w:unhideWhenUsed="0"/>
-    <w:lsdException w:name="Colorful List Accent 5" w:semiHidden="0" w:uiPriority="72" w:unhideWhenUsed="0"/>
-    <w:lsdException w:name="Colorful Grid Accent 5" w:semiHidden="0" w:uiPriority="73" w:unhideWhenUsed="0"/>
-    <w:lsdException w:name="Light Shading Accent 6" w:semiHidden="0" w:uiPriority="60" w:unhideWhenUsed="0"/>
-    <w:lsdException w:name="Light List Accent 6" w:semiHidden="0" w:uiPriority="61" w:unhideWhenUsed="0"/>
-    <w:lsdException w:name="Light Grid Accent 6" w:semiHidden="0" w:uiPriority="62" w:unhideWhenUsed="0"/>
-    <w:lsdException w:name="Medium Shading 1 Accent 6" w:semiHidden="0" w:uiPriority="63" w:unhideWhenUsed="0"/>
-    <w:lsdException w:name="Medium Shading 2 Accent 6" w:semiHidden="0" w:uiPriority="64" w:unhideWhenUsed="0"/>
-    <w:lsdException w:name="Medium List 1 Accent 6" w:semiHidden="0" w:uiPriority="65" w:unhideWhenUsed="0"/>
-    <w:lsdException w:name="Medium List 2 Accent 6" w:semiHidden="0" w:uiPriority="66" w:unhideWhenUsed="0"/>
-    <w:lsdException w:name="Medium Grid 1 Accent 6" w:semiHidden="0" w:uiPriority="67" w:unhideWhenUsed="0"/>
-    <w:lsdException w:name="Medium Grid 2 Accent 6" w:semiHidden="0" w:uiPriority="68" w:unhideWhenUsed="0"/>
-    <w:lsdException w:name="Medium Grid 3 Accent 6" w:semiHidden="0" w:uiPriority="69" w:unhideWhenUsed="0"/>
-    <w:lsdException w:name="Dark List Accent 6" w:semiHidden="0" w:uiPriority="70" w:unhideWhenUsed="0"/>
-    <w:lsdException w:name="Colorful Shading Accent 6" w:semiHidden="0" w:uiPriority="71" w:unhideWhenUsed="0"/>
-    <w:lsdException w:name="Colorful List Accent 6" w:semiHidden="0" w:uiPriority="72" w:unhideWhenUsed="0"/>
-    <w:lsdException w:name="Colorful Grid Accent 6" w:semiHidden="0" w:uiPriority="73" w:unhideWhenUsed="0"/>
-    <w:lsdException w:name="Subtle Emphasis" w:semiHidden="0" w:uiPriority="19" w:unhideWhenUsed="0" w:qFormat="1"/>
-    <w:lsdException w:name="Intense Emphasis" w:semiHidden="0" w:uiPriority="21" w:unhideWhenUsed="0" w:qFormat="1"/>
-    <w:lsdException w:name="Subtle Reference" w:semiHidden="0" w:uiPriority="31" w:unhideWhenUsed="0" w:qFormat="1"/>
-    <w:lsdException w:name="Intense Reference" w:semiHidden="0" w:uiPriority="32" w:unhideWhenUsed="0" w:qFormat="1"/>
-    <w:lsdException w:name="Book Title" w:semiHidden="0" w:uiPriority="33" w:unhideWhenUsed="0" w:qFormat="1"/>
-    <w:lsdException w:name="Bibliography" w:uiPriority="37"/>
-    <w:lsdException w:name="TOC Heading" w:uiPriority="39" w:qFormat="1"/>
-  </w:latentStyles>
-  <w:style w:type="paragraph" w:default="1" w:styleId="Normal">
-    <w:name w:val="Normal"/>
-    <w:qFormat/>
-  </w:style>
-  <w:style w:type="character" w:default="1" w:styleId="Policepardfaut">
-    <w:name w:val="Default Paragraph Font"/>
-    <w:uiPriority w:val="1"/>
-    <w:semiHidden/>
-    <w:unhideWhenUsed/>
-  </w:style>
-  <w:style w:type="table" w:default="1" w:styleId="TableauNormal">
-    <w:name w:val="Normal Table"/>
-    <w:uiPriority w:val="99"/>
-    <w:semiHidden/>
-    <w:unhideWhenUsed/>
-    <w:tblPr>
-      <w:tblInd w:w="0" w:type="dxa"/>
-      <w:tblCellMar>
-        <w:top w:w="0" w:type="dxa"/>
-        <w:left w:w="108" w:type="dxa"/>
-        <w:bottom w:w="0" w:type="dxa"/>
-        <w:right w:w="108" w:type="dxa"/>
-      </w:tblCellMar>
-    </w:tblPr>
-  </w:style>
-  <w:style w:type="numbering" w:default="1" w:styleId="Aucuneliste">
-    <w:name w:val="No List"/>
-    <w:uiPriority w:val="99"/>
-    <w:semiHidden/>
-    <w:unhideWhenUsed/>
-  </w:style>
-  <w:style w:type="character" w:styleId="Textedelespacerserv">
-    <w:name w:val="Placeholder Text"/>
-    <w:basedOn w:val="Policepardfaut"/>
-    <w:uiPriority w:val="99"/>
-    <w:semiHidden/>
-    <w:rsid w:val="001C3F4C"/>
-    <w:rPr>
-      <w:color w:val="808080"/>
-    </w:rPr>
-  </w:style>
-</w:styles>
-</file>
-
-<file path=word/glossary/stylesWithEffects.xml><?xml version="1.0" encoding="utf-8"?>
-<w:styles xmlns:wpc="http://schemas.microsoft.com/office/word/2010/wordprocessingCanvas" xmlns:mc="http://schemas.openxmlformats.org/markup-compatibility/2006" xmlns:o="urn:schemas-microsoft-com:office:office" xmlns:r="http://schemas.openxmlformats.org/officeDocument/2006/relationships" xmlns:m="http://schemas.openxmlformats.org/officeDocument/2006/math" xmlns:v="urn:schemas-microsoft-com:vml" xmlns:wp14="http://schemas.microsoft.com/office/word/2010/wordprocessingDrawing" xmlns:wp="http://schemas.openxmlformats.org/drawingml/2006/wordprocessingDrawing" xmlns:w10="urn:schemas-microsoft-com:office:word" xmlns:w="http://schemas.openxmlformats.org/wordprocessingml/2006/main" xmlns:w14="http://schemas.microsoft.com/office/word/2010/wordml" xmlns:wpg="http://schemas.microsoft.com/office/word/2010/wordprocessingGroup" xmlns:wpi="http://schemas.microsoft.com/office/word/2010/wordprocessingInk" xmlns:wne="http://schemas.microsoft.com/office/word/2006/wordml" xmlns:wps="http://schemas.microsoft.com/office/word/2010/wordprocessingShape" mc:Ignorable="w14 wp14">
-  <w:docDefaults>
-    <w:rPrDefault>
-      <w:rPr>
-        <w:rFonts w:asciiTheme="minorHAnsi" w:eastAsiaTheme="minorEastAsia" w:hAnsiTheme="minorHAnsi" w:cstheme="minorBidi"/>
-        <w:sz w:val="22"/>
-        <w:szCs w:val="22"/>
-        <w:lang w:val="en-GB" w:eastAsia="en-GB" w:bidi="ar-SA"/>
-      </w:rPr>
-    </w:rPrDefault>
-    <w:pPrDefault>
-      <w:pPr>
-        <w:spacing w:after="200" w:line="276" w:lineRule="auto"/>
-      </w:pPr>
-    </w:pPrDefault>
-  </w:docDefaults>
-  <w:latentStyles w:defLockedState="0" w:defUIPriority="99" w:defSemiHidden="1" w:defUnhideWhenUsed="1" w:defQFormat="0" w:count="267">
-    <w:lsdException w:name="Normal" w:semiHidden="0" w:uiPriority="0" w:unhideWhenUsed="0" w:qFormat="1"/>
-    <w:lsdException w:name="heading 1" w:semiHidden="0" w:uiPriority="9" w:unhideWhenUsed="0" w:qFormat="1"/>
-    <w:lsdException w:name="heading 2" w:uiPriority="9" w:qFormat="1"/>
-    <w:lsdException w:name="heading 3" w:uiPriority="9" w:qFormat="1"/>
-    <w:lsdException w:name="heading 4" w:uiPriority="9" w:qFormat="1"/>
-    <w:lsdException w:name="heading 5" w:uiPriority="9" w:qFormat="1"/>
-    <w:lsdException w:name="heading 6" w:uiPriority="9" w:qFormat="1"/>
-    <w:lsdException w:name="heading 7" w:uiPriority="9" w:qFormat="1"/>
-    <w:lsdException w:name="heading 8" w:uiPriority="9" w:qFormat="1"/>
-    <w:lsdException w:name="heading 9" w:uiPriority="9" w:qFormat="1"/>
-    <w:lsdException w:name="toc 1" w:uiPriority="39"/>
-    <w:lsdException w:name="toc 2" w:uiPriority="39"/>
-    <w:lsdException w:name="toc 3" w:uiPriority="39"/>
-    <w:lsdException w:name="toc 4" w:uiPriority="39"/>
-    <w:lsdException w:name="toc 5" w:uiPriority="39"/>
-    <w:lsdException w:name="toc 6" w:uiPriority="39"/>
-    <w:lsdException w:name="toc 7" w:uiPriority="39"/>
-    <w:lsdException w:name="toc 8" w:uiPriority="39"/>
-    <w:lsdException w:name="toc 9" w:uiPriority="39"/>
-    <w:lsdException w:name="caption" w:uiPriority="35" w:qFormat="1"/>
-    <w:lsdException w:name="Title" w:semiHidden="0" w:uiPriority="10" w:unhideWhenUsed="0" w:qFormat="1"/>
-    <w:lsdException w:name="Default Paragraph Font" w:uiPriority="1"/>
-    <w:lsdException w:name="Subtitle" w:semiHidden="0" w:uiPriority="11" w:unhideWhenUsed="0" w:qFormat="1"/>
-    <w:lsdException w:name="Strong" w:semiHidden="0" w:uiPriority="22" w:unhideWhenUsed="0" w:qFormat="1"/>
-    <w:lsdException w:name="Emphasis" w:semiHidden="0" w:uiPriority="20" w:unhideWhenUsed="0" w:qFormat="1"/>
-    <w:lsdException w:name="Table Grid" w:semiHidden="0" w:uiPriority="59" w:unhideWhenUsed="0"/>
-    <w:lsdException w:name="Placeholder Text" w:unhideWhenUsed="0"/>
-    <w:lsdException w:name="No Spacing" w:semiHidden="0" w:uiPriority="1" w:unhideWhenUsed="0" w:qFormat="1"/>
-    <w:lsdException w:name="Light Shading" w:semiHidden="0" w:uiPriority="60" w:unhideWhenUsed="0"/>
-    <w:lsdException w:name="Light List" w:semiHidden="0" w:uiPriority="61" w:unhideWhenUsed="0"/>
-    <w:lsdException w:name="Light Grid" w:semiHidden="0" w:uiPriority="62" w:unhideWhenUsed="0"/>
-    <w:lsdException w:name="Medium Shading 1" w:semiHidden="0" w:uiPriority="63" w:unhideWhenUsed="0"/>
-    <w:lsdException w:name="Medium Shading 2" w:semiHidden="0" w:uiPriority="64" w:unhideWhenUsed="0"/>
-    <w:lsdException w:name="Medium List 1" w:semiHidden="0" w:uiPriority="65" w:unhideWhenUsed="0"/>
-    <w:lsdException w:name="Medium List 2" w:semiHidden="0" w:uiPriority="66" w:unhideWhenUsed="0"/>
-    <w:lsdException w:name="Medium Grid 1" w:semiHidden="0" w:uiPriority="67" w:unhideWhenUsed="0"/>
-    <w:lsdException w:name="Medium Grid 2" w:semiHidden="0" w:uiPriority="68" w:unhideWhenUsed="0"/>
-    <w:lsdException w:name="Medium Grid 3" w:semiHidden="0" w:uiPriority="69" w:unhideWhenUsed="0"/>
-    <w:lsdException w:name="Dark List" w:semiHidden="0" w:uiPriority="70" w:unhideWhenUsed="0"/>
-    <w:lsdException w:name="Colorful Shading" w:semiHidden="0" w:uiPriority="71" w:unhideWhenUsed="0"/>
-    <w:lsdException w:name="Colorful List" w:semiHidden="0" w:uiPriority="72" w:unhideWhenUsed="0"/>
-    <w:lsdException w:name="Colorful Grid" w:semiHidden="0" w:uiPriority="73" w:unhideWhenUsed="0"/>
-    <w:lsdException w:name="Light Shading Accent 1" w:semiHidden="0" w:uiPriority="60" w:unhideWhenUsed="0"/>
-    <w:lsdException w:name="Light List Accent 1" w:semiHidden="0" w:uiPriority="61" w:unhideWhenUsed="0"/>
-    <w:lsdException w:name="Light Grid Accent 1" w:semiHidden="0" w:uiPriority="62" w:unhideWhenUsed="0"/>
-    <w:lsdException w:name="Medium Shading 1 Accent 1" w:semiHidden="0" w:uiPriority="63" w:unhideWhenUsed="0"/>
-    <w:lsdException w:name="Medium Shading 2 Accent 1" w:semiHidden="0" w:uiPriority="64" w:unhideWhenUsed="0"/>
-    <w:lsdException w:name="Medium List 1 Accent 1" w:semiHidden="0" w:uiPriority="65" w:unhideWhenUsed="0"/>
-    <w:lsdException w:name="Revision" w:unhideWhenUsed="0"/>
-    <w:lsdException w:name="List Paragraph" w:semiHidden="0" w:uiPriority="34" w:unhideWhenUsed="0" w:qFormat="1"/>
-    <w:lsdException w:name="Quote" w:semiHidden="0" w:uiPriority="29" w:unhideWhenUsed="0" w:qFormat="1"/>
-    <w:lsdException w:name="Intense Quote" w:semiHidden="0" w:uiPriority="30" w:unhideWhenUsed="0" w:qFormat="1"/>
-    <w:lsdException w:name="Medium List 2 Accent 1" w:semiHidden="0" w:uiPriority="66" w:unhideWhenUsed="0"/>
-    <w:lsdException w:name="Medium Grid 1 Accent 1" w:semiHidden="0" w:uiPriority="67" w:unhideWhenUsed="0"/>
-    <w:lsdException w:name="Medium Grid 2 Accent 1" w:semiHidden="0" w:uiPriority="68" w:unhideWhenUsed="0"/>
-    <w:lsdException w:name="Medium Grid 3 Accent 1" w:semiHidden="0" w:uiPriority="69" w:unhideWhenUsed="0"/>
-    <w:lsdException w:name="Dark List Accent 1" w:semiHidden="0" w:uiPriority="70" w:unhideWhenUsed="0"/>
-    <w:lsdException w:name="Colorful Shading Accent 1" w:semiHidden="0" w:uiPriority="71" w:unhideWhenUsed="0"/>
-    <w:lsdException w:name="Colorful List Accent 1" w:semiHidden="0" w:uiPriority="72" w:unhideWhenUsed="0"/>
-    <w:lsdException w:name="Colorful Grid Accent 1" w:semiHidden="0" w:uiPriority="73" w:unhideWhenUsed="0"/>
-    <w:lsdException w:name="Light Shading Accent 2" w:semiHidden="0" w:uiPriority="60" w:unhideWhenUsed="0"/>
-    <w:lsdException w:name="Light List Accent 2" w:semiHidden="0" w:uiPriority="61" w:unhideWhenUsed="0"/>
-    <w:lsdException w:name="Light Grid Accent 2" w:semiHidden="0" w:uiPriority="62" w:unhideWhenUsed="0"/>
-    <w:lsdException w:name="Medium Shading 1 Accent 2" w:semiHidden="0" w:uiPriority="63" w:unhideWhenUsed="0"/>
-    <w:lsdException w:name="Medium Shading 2 Accent 2" w:semiHidden="0" w:uiPriority="64" w:unhideWhenUsed="0"/>
-    <w:lsdException w:name="Medium List 1 Accent 2" w:semiHidden="0" w:uiPriority="65" w:unhideWhenUsed="0"/>
-    <w:lsdException w:name="Medium List 2 Accent 2" w:semiHidden="0" w:uiPriority="66" w:unhideWhenUsed="0"/>
-    <w:lsdException w:name="Medium Grid 1 Accent 2" w:semiHidden="0" w:uiPriority="67" w:unhideWhenUsed="0"/>
-    <w:lsdException w:name="Medium Grid 2 Accent 2" w:semiHidden="0" w:uiPriority="68" w:unhideWhenUsed="0"/>
-    <w:lsdException w:name="Medium Grid 3 Accent 2" w:semiHidden="0" w:uiPriority="69" w:unhideWhenUsed="0"/>
-    <w:lsdException w:name="Dark List Accent 2" w:semiHidden="0" w:uiPriority="70" w:unhideWhenUsed="0"/>
-    <w:lsdException w:name="Colorful Shading Accent 2" w:semiHidden="0" w:uiPriority="71" w:unhideWhenUsed="0"/>
-    <w:lsdException w:name="Colorful List Accent 2" w:semiHidden="0" w:uiPriority="72" w:unhideWhenUsed="0"/>
-    <w:lsdException w:name="Colorful Grid Accent 2" w:semiHidden="0" w:uiPriority="73" w:unhideWhenUsed="0"/>
-    <w:lsdException w:name="Light Shading Accent 3" w:semiHidden="0" w:uiPriority="60" w:unhideWhenUsed="0"/>
-    <w:lsdException w:name="Light List Accent 3" w:semiHidden="0" w:uiPriority="61" w:unhideWhenUsed="0"/>
-    <w:lsdException w:name="Light Grid Accent 3" w:semiHidden="0" w:uiPriority="62" w:unhideWhenUsed="0"/>
-    <w:lsdException w:name="Medium Shading 1 Accent 3" w:semiHidden="0" w:uiPriority="63" w:unhideWhenUsed="0"/>
-    <w:lsdException w:name="Medium Shading 2 Accent 3" w:semiHidden="0" w:uiPriority="64" w:unhideWhenUsed="0"/>
-    <w:lsdException w:name="Medium List 1 Accent 3" w:semiHidden="0" w:uiPriority="65" w:unhideWhenUsed="0"/>
-    <w:lsdException w:name="Medium List 2 Accent 3" w:semiHidden="0" w:uiPriority="66" w:unhideWhenUsed="0"/>
-    <w:lsdException w:name="Medium Grid 1 Accent 3" w:semiHidden="0" w:uiPriority="67" w:unhideWhenUsed="0"/>
-    <w:lsdException w:name="Medium Grid 2 Accent 3" w:semiHidden="0" w:uiPriority="68" w:unhideWhenUsed="0"/>
-    <w:lsdException w:name="Medium Grid 3 Accent 3" w:semiHidden="0" w:uiPriority="69" w:unhideWhenUsed="0"/>
-    <w:lsdException w:name="Dark List Accent 3" w:semiHidden="0" w:uiPriority="70" w:unhideWhenUsed="0"/>
-    <w:lsdException w:name="Colorful Shading Accent 3" w:semiHidden="0" w:uiPriority="71" w:unhideWhenUsed="0"/>
-    <w:lsdException w:name="Colorful List Accent 3" w:semiHidden="0" w:uiPriority="72" w:unhideWhenUsed="0"/>
-    <w:lsdException w:name="Colorful Grid Accent 3" w:semiHidden="0" w:uiPriority="73" w:unhideWhenUsed="0"/>
-    <w:lsdException w:name="Light Shading Accent 4" w:semiHidden="0" w:uiPriority="60" w:unhideWhenUsed="0"/>
-    <w:lsdException w:name="Light List Accent 4" w:semiHidden="0" w:uiPriority="61" w:unhideWhenUsed="0"/>
-    <w:lsdException w:name="Light Grid Accent 4" w:semiHidden="0" w:uiPriority="62" w:unhideWhenUsed="0"/>
-    <w:lsdException w:name="Medium Shading 1 Accent 4" w:semiHidden="0" w:uiPriority="63" w:unhideWhenUsed="0"/>
-    <w:lsdException w:name="Medium Shading 2 Accent 4" w:semiHidden="0" w:uiPriority="64" w:unhideWhenUsed="0"/>
-    <w:lsdException w:name="Medium List 1 Accent 4" w:semiHidden="0" w:uiPriority="65" w:unhideWhenUsed="0"/>
-    <w:lsdException w:name="Medium List 2 Accent 4" w:semiHidden="0" w:uiPriority="66" w:unhideWhenUsed="0"/>
-    <w:lsdException w:name="Medium Grid 1 Accent 4" w:semiHidden="0" w:uiPriority="67" w:unhideWhenUsed="0"/>
-    <w:lsdException w:name="Medium Grid 2 Accent 4" w:semiHidden="0" w:uiPriority="68" w:unhideWhenUsed="0"/>
-    <w:lsdException w:name="Medium Grid 3 Accent 4" w:semiHidden="0" w:uiPriority="69" w:unhideWhenUsed="0"/>
-    <w:lsdException w:name="Dark List Accent 4" w:semiHidden="0" w:uiPriority="70" w:unhideWhenUsed="0"/>
-    <w:lsdException w:name="Colorful Shading Accent 4" w:semiHidden="0" w:uiPriority="71" w:unhideWhenUsed="0"/>
-    <w:lsdException w:name="Colorful List Accent 4" w:semiHidden="0" w:uiPriority="72" w:unhideWhenUsed="0"/>
-    <w:lsdException w:name="Colorful Grid Accent 4" w:semiHidden="0" w:uiPriority="73" w:unhideWhenUsed="0"/>
-    <w:lsdException w:name="Light Shading Accent 5" w:semiHidden="0" w:uiPriority="60" w:unhideWhenUsed="0"/>
-    <w:lsdException w:name="Light List Accent 5" w:semiHidden="0" w:uiPriority="61" w:unhideWhenUsed="0"/>
-    <w:lsdException w:name="Light Grid Accent 5" w:semiHidden="0" w:uiPriority="62" w:unhideWhenUsed="0"/>
-    <w:lsdException w:name="Medium Shading 1 Accent 5" w:semiHidden="0" w:uiPriority="63" w:unhideWhenUsed="0"/>
-    <w:lsdException w:name="Medium Shading 2 Accent 5" w:semiHidden="0" w:uiPriority="64" w:unhideWhenUsed="0"/>
-    <w:lsdException w:name="Medium List 1 Accent 5" w:semiHidden="0" w:uiPriority="65" w:unhideWhenUsed="0"/>
-    <w:lsdException w:name="Medium List 2 Accent 5" w:semiHidden="0" w:uiPriority="66" w:unhideWhenUsed="0"/>
-    <w:lsdException w:name="Medium Grid 1 Accent 5" w:semiHidden="0" w:uiPriority="67" w:unhideWhenUsed="0"/>
-    <w:lsdException w:name="Medium Grid 2 Accent 5" w:semiHidden="0" w:uiPriority="68" w:unhideWhenUsed="0"/>
-    <w:lsdException w:name="Medium Grid 3 Accent 5" w:semiHidden="0" w:uiPriority="69" w:unhideWhenUsed="0"/>
-    <w:lsdException w:name="Dark List Accent 5" w:semiHidden="0" w:uiPriority="70" w:unhideWhenUsed="0"/>
-    <w:lsdException w:name="Colorful Shading Accent 5" w:semiHidden="0" w:uiPriority="71" w:unhideWhenUsed="0"/>
-    <w:lsdException w:name="Colorful List Accent 5" w:semiHidden="0" w:uiPriority="72" w:unhideWhenUsed="0"/>
-    <w:lsdException w:name="Colorful Grid Accent 5" w:semiHidden="0" w:uiPriority="73" w:unhideWhenUsed="0"/>
-    <w:lsdException w:name="Light Shading Accent 6" w:semiHidden="0" w:uiPriority="60" w:unhideWhenUsed="0"/>
-    <w:lsdException w:name="Light List Accent 6" w:semiHidden="0" w:uiPriority="61" w:unhideWhenUsed="0"/>
-    <w:lsdException w:name="Light Grid Accent 6" w:semiHidden="0" w:uiPriority="62" w:unhideWhenUsed="0"/>
-    <w:lsdException w:name="Medium Shading 1 Accent 6" w:semiHidden="0" w:uiPriority="63" w:unhideWhenUsed="0"/>
-    <w:lsdException w:name="Medium Shading 2 Accent 6" w:semiHidden="0" w:uiPriority="64" w:unhideWhenUsed="0"/>
-    <w:lsdException w:name="Medium List 1 Accent 6" w:semiHidden="0" w:uiPriority="65" w:unhideWhenUsed="0"/>
-    <w:lsdException w:name="Medium List 2 Accent 6" w:semiHidden="0" w:uiPriority="66" w:unhideWhenUsed="0"/>
-    <w:lsdException w:name="Medium Grid 1 Accent 6" w:semiHidden="0" w:uiPriority="67" w:unhideWhenUsed="0"/>
-    <w:lsdException w:name="Medium Grid 2 Accent 6" w:semiHidden="0" w:uiPriority="68" w:unhideWhenUsed="0"/>
-    <w:lsdException w:name="Medium Grid 3 Accent 6" w:semiHidden="0" w:uiPriority="69" w:unhideWhenUsed="0"/>
-    <w:lsdException w:name="Dark List Accent 6" w:semiHidden="0" w:uiPriority="70" w:unhideWhenUsed="0"/>
-    <w:lsdException w:name="Colorful Shading Accent 6" w:semiHidden="0" w:uiPriority="71" w:unhideWhenUsed="0"/>
-    <w:lsdException w:name="Colorful List Accent 6" w:semiHidden="0" w:uiPriority="72" w:unhideWhenUsed="0"/>
-    <w:lsdException w:name="Colorful Grid Accent 6" w:semiHidden="0" w:uiPriority="73" w:unhideWhenUsed="0"/>
-    <w:lsdException w:name="Subtle Emphasis" w:semiHidden="0" w:uiPriority="19" w:unhideWhenUsed="0" w:qFormat="1"/>
-    <w:lsdException w:name="Intense Emphasis" w:semiHidden="0" w:uiPriority="21" w:unhideWhenUsed="0" w:qFormat="1"/>
-    <w:lsdException w:name="Subtle Reference" w:semiHidden="0" w:uiPriority="31" w:unhideWhenUsed="0" w:qFormat="1"/>
-    <w:lsdException w:name="Intense Reference" w:semiHidden="0" w:uiPriority="32" w:unhideWhenUsed="0" w:qFormat="1"/>
-    <w:lsdException w:name="Book Title" w:semiHidden="0" w:uiPriority="33" w:unhideWhenUsed="0" w:qFormat="1"/>
-    <w:lsdException w:name="Bibliography" w:uiPriority="37"/>
-    <w:lsdException w:name="TOC Heading" w:uiPriority="39" w:qFormat="1"/>
-  </w:latentStyles>
-  <w:style w:type="paragraph" w:default="1" w:styleId="Normal">
-    <w:name w:val="Normal"/>
-    <w:qFormat/>
-  </w:style>
-  <w:style w:type="character" w:default="1" w:styleId="Policepardfaut">
-    <w:name w:val="Default Paragraph Font"/>
-    <w:uiPriority w:val="1"/>
-    <w:semiHidden/>
-    <w:unhideWhenUsed/>
-  </w:style>
-  <w:style w:type="table" w:default="1" w:styleId="TableauNormal">
-    <w:name w:val="Normal Table"/>
-    <w:uiPriority w:val="99"/>
-    <w:semiHidden/>
-    <w:unhideWhenUsed/>
-    <w:tblPr>
-      <w:tblInd w:w="0" w:type="dxa"/>
-      <w:tblCellMar>
-        <w:top w:w="0" w:type="dxa"/>
-        <w:left w:w="108" w:type="dxa"/>
-        <w:bottom w:w="0" w:type="dxa"/>
-        <w:right w:w="108" w:type="dxa"/>
-      </w:tblCellMar>
-    </w:tblPr>
-  </w:style>
-  <w:style w:type="numbering" w:default="1" w:styleId="Aucuneliste">
-    <w:name w:val="No List"/>
-    <w:uiPriority w:val="99"/>
-    <w:semiHidden/>
-    <w:unhideWhenUsed/>
-  </w:style>
-  <w:style w:type="character" w:styleId="Textedelespacerserv">
-    <w:name w:val="Placeholder Text"/>
-    <w:basedOn w:val="Policepardfaut"/>
-    <w:uiPriority w:val="99"/>
-    <w:semiHidden/>
-    <w:rsid w:val="001C3F4C"/>
-    <w:rPr>
-      <w:color w:val="808080"/>
-    </w:rPr>
-  </w:style>
-</w:styles>
-</file>
-
-<file path=word/glossary/webSettings.xml><?xml version="1.0" encoding="utf-8"?>
-<w:webSettings xmlns:mc="http://schemas.openxmlformats.org/markup-compatibility/2006" xmlns:r="http://schemas.openxmlformats.org/officeDocument/2006/relationships" xmlns:w="http://schemas.openxmlformats.org/wordprocessingml/2006/main" xmlns:w14="http://schemas.microsoft.com/office/word/2010/wordml" mc:Ignorable="w14">
-  <w:optimizeForBrowser/>
-  <w:allowPNG/>
-</w:webSettings>
-</file>
-
 <file path=word/theme/theme1.xml><?xml version="1.0" encoding="utf-8"?>
 <a:theme xmlns:a="http://schemas.openxmlformats.org/drawingml/2006/main" name="Thème Office">
   <a:themeElements>
@@ -17809,7 +19167,7 @@
   <a:extraClrSchemeLst/>
   <a:extLst>
     <a:ext uri="{05A4C25C-085E-4340-85A3-A5531E510DB2}">
-      <thm15:themeFamily xmlns="" xmlns:thm15="http://schemas.microsoft.com/office/thememl/2012/main" name="Office Theme" id="{62F939B6-93AF-4DB8-9C6B-D6C7DFDC589F}" vid="{4A3C46E8-61CC-4603-A589-7422A47A8E4A}"/>
+      <thm15:themeFamily xmlns:thm15="http://schemas.microsoft.com/office/thememl/2012/main" xmlns="" name="Office Theme" id="{62F939B6-93AF-4DB8-9C6B-D6C7DFDC589F}" vid="{4A3C46E8-61CC-4603-A589-7422A47A8E4A}"/>
     </a:ext>
   </a:extLst>
 </a:theme>
@@ -17820,7 +19178,7 @@
 </file>
 
 <file path=customXml/itemProps1.xml><?xml version="1.0" encoding="utf-8"?>
-<ds:datastoreItem xmlns:ds="http://schemas.openxmlformats.org/officeDocument/2006/customXml" ds:itemID="{034FC38B-8018-40D9-A324-2463580CBAE0}">
+<ds:datastoreItem xmlns:ds="http://schemas.openxmlformats.org/officeDocument/2006/customXml" ds:itemID="{E1A2E592-0450-46B1-ADAA-AD66C8B110F2}">
   <ds:schemaRefs>
     <ds:schemaRef ds:uri="http://schemas.openxmlformats.org/officeDocument/2006/bibliography"/>
   </ds:schemaRefs>

</xml_diff>

<commit_message>
Minor change in the description
</commit_message>
<xml_diff>
--- a/Information/script for equations.docx
+++ b/Information/script for equations.docx
@@ -19,6 +19,7 @@
           <w:docPartUnique/>
         </w:docPartObj>
       </w:sdtPr>
+      <w:sdtEndPr/>
       <w:sdtContent>
         <w:p>
           <w:pPr>
@@ -59,7 +60,7 @@
           <w:r>
             <w:fldChar w:fldCharType="separate"/>
           </w:r>
-          <w:hyperlink w:anchor="_Toc38312628" w:history="1">
+          <w:hyperlink w:anchor="_Toc38635954" w:history="1">
             <w:r>
               <w:rPr>
                 <w:rStyle w:val="Lienhypertexte"/>
@@ -103,7 +104,7 @@
                 <w:noProof/>
                 <w:webHidden/>
               </w:rPr>
-              <w:instrText xml:space="preserve"> PAGEREF _Toc38312628 \h </w:instrText>
+              <w:instrText xml:space="preserve"> PAGEREF _Toc38635954 \h </w:instrText>
             </w:r>
             <w:r>
               <w:rPr>
@@ -147,7 +148,7 @@
               <w:lang w:eastAsia="en-GB"/>
             </w:rPr>
           </w:pPr>
-          <w:hyperlink w:anchor="_Toc38312629" w:history="1">
+          <w:hyperlink w:anchor="_Toc38635955" w:history="1">
             <w:r>
               <w:rPr>
                 <w:rStyle w:val="Lienhypertexte"/>
@@ -191,7 +192,7 @@
                 <w:noProof/>
                 <w:webHidden/>
               </w:rPr>
-              <w:instrText xml:space="preserve"> PAGEREF _Toc38312629 \h </w:instrText>
+              <w:instrText xml:space="preserve"> PAGEREF _Toc38635955 \h </w:instrText>
             </w:r>
             <w:r>
               <w:rPr>
@@ -235,7 +236,7 @@
               <w:lang w:eastAsia="en-GB"/>
             </w:rPr>
           </w:pPr>
-          <w:hyperlink w:anchor="_Toc38312630" w:history="1">
+          <w:hyperlink w:anchor="_Toc38635956" w:history="1">
             <w:r>
               <w:rPr>
                 <w:rStyle w:val="Lienhypertexte"/>
@@ -277,7 +278,7 @@
                 <w:noProof/>
                 <w:webHidden/>
               </w:rPr>
-              <w:instrText xml:space="preserve"> PAGEREF _Toc38312630 \h </w:instrText>
+              <w:instrText xml:space="preserve"> PAGEREF _Toc38635956 \h </w:instrText>
             </w:r>
             <w:r>
               <w:rPr>
@@ -321,7 +322,7 @@
               <w:lang w:eastAsia="en-GB"/>
             </w:rPr>
           </w:pPr>
-          <w:hyperlink w:anchor="_Toc38312631" w:history="1">
+          <w:hyperlink w:anchor="_Toc38635957" w:history="1">
             <w:r>
               <w:rPr>
                 <w:rStyle w:val="Lienhypertexte"/>
@@ -363,7 +364,7 @@
                 <w:noProof/>
                 <w:webHidden/>
               </w:rPr>
-              <w:instrText xml:space="preserve"> PAGEREF _Toc38312631 \h </w:instrText>
+              <w:instrText xml:space="preserve"> PAGEREF _Toc38635957 \h </w:instrText>
             </w:r>
             <w:r>
               <w:rPr>
@@ -407,7 +408,7 @@
               <w:lang w:eastAsia="en-GB"/>
             </w:rPr>
           </w:pPr>
-          <w:hyperlink w:anchor="_Toc38312632" w:history="1">
+          <w:hyperlink w:anchor="_Toc38635958" w:history="1">
             <w:r>
               <w:rPr>
                 <w:rStyle w:val="Lienhypertexte"/>
@@ -449,7 +450,7 @@
                 <w:noProof/>
                 <w:webHidden/>
               </w:rPr>
-              <w:instrText xml:space="preserve"> PAGEREF _Toc38312632 \h </w:instrText>
+              <w:instrText xml:space="preserve"> PAGEREF _Toc38635958 \h </w:instrText>
             </w:r>
             <w:r>
               <w:rPr>
@@ -493,7 +494,7 @@
               <w:lang w:eastAsia="en-GB"/>
             </w:rPr>
           </w:pPr>
-          <w:hyperlink w:anchor="_Toc38312633" w:history="1">
+          <w:hyperlink w:anchor="_Toc38635959" w:history="1">
             <w:r>
               <w:rPr>
                 <w:rStyle w:val="Lienhypertexte"/>
@@ -537,7 +538,7 @@
                 <w:noProof/>
                 <w:webHidden/>
               </w:rPr>
-              <w:instrText xml:space="preserve"> PAGEREF _Toc38312633 \h </w:instrText>
+              <w:instrText xml:space="preserve"> PAGEREF _Toc38635959 \h </w:instrText>
             </w:r>
             <w:r>
               <w:rPr>
@@ -581,7 +582,7 @@
               <w:lang w:eastAsia="en-GB"/>
             </w:rPr>
           </w:pPr>
-          <w:hyperlink w:anchor="_Toc38312634" w:history="1">
+          <w:hyperlink w:anchor="_Toc38635960" w:history="1">
             <w:r>
               <w:rPr>
                 <w:rStyle w:val="Lienhypertexte"/>
@@ -623,7 +624,7 @@
                 <w:noProof/>
                 <w:webHidden/>
               </w:rPr>
-              <w:instrText xml:space="preserve"> PAGEREF _Toc38312634 \h </w:instrText>
+              <w:instrText xml:space="preserve"> PAGEREF _Toc38635960 \h </w:instrText>
             </w:r>
             <w:r>
               <w:rPr>
@@ -667,7 +668,7 @@
               <w:lang w:eastAsia="en-GB"/>
             </w:rPr>
           </w:pPr>
-          <w:hyperlink w:anchor="_Toc38312635" w:history="1">
+          <w:hyperlink w:anchor="_Toc38635961" w:history="1">
             <w:r>
               <w:rPr>
                 <w:rStyle w:val="Lienhypertexte"/>
@@ -709,7 +710,7 @@
                 <w:noProof/>
                 <w:webHidden/>
               </w:rPr>
-              <w:instrText xml:space="preserve"> PAGEREF _Toc38312635 \h </w:instrText>
+              <w:instrText xml:space="preserve"> PAGEREF _Toc38635961 \h </w:instrText>
             </w:r>
             <w:r>
               <w:rPr>
@@ -753,7 +754,7 @@
               <w:lang w:eastAsia="en-GB"/>
             </w:rPr>
           </w:pPr>
-          <w:hyperlink w:anchor="_Toc38312636" w:history="1">
+          <w:hyperlink w:anchor="_Toc38635962" w:history="1">
             <w:r>
               <w:rPr>
                 <w:rStyle w:val="Lienhypertexte"/>
@@ -795,7 +796,7 @@
                 <w:noProof/>
                 <w:webHidden/>
               </w:rPr>
-              <w:instrText xml:space="preserve"> PAGEREF _Toc38312636 \h </w:instrText>
+              <w:instrText xml:space="preserve"> PAGEREF _Toc38635962 \h </w:instrText>
             </w:r>
             <w:r>
               <w:rPr>
@@ -839,7 +840,7 @@
               <w:lang w:eastAsia="en-GB"/>
             </w:rPr>
           </w:pPr>
-          <w:hyperlink w:anchor="_Toc38312637" w:history="1">
+          <w:hyperlink w:anchor="_Toc38635963" w:history="1">
             <w:r>
               <w:rPr>
                 <w:rStyle w:val="Lienhypertexte"/>
@@ -881,7 +882,7 @@
                 <w:noProof/>
                 <w:webHidden/>
               </w:rPr>
-              <w:instrText xml:space="preserve"> PAGEREF _Toc38312637 \h </w:instrText>
+              <w:instrText xml:space="preserve"> PAGEREF _Toc38635963 \h </w:instrText>
             </w:r>
             <w:r>
               <w:rPr>
@@ -925,7 +926,7 @@
               <w:lang w:eastAsia="en-GB"/>
             </w:rPr>
           </w:pPr>
-          <w:hyperlink w:anchor="_Toc38312638" w:history="1">
+          <w:hyperlink w:anchor="_Toc38635964" w:history="1">
             <w:r>
               <w:rPr>
                 <w:rStyle w:val="Lienhypertexte"/>
@@ -967,7 +968,7 @@
                 <w:noProof/>
                 <w:webHidden/>
               </w:rPr>
-              <w:instrText xml:space="preserve"> PAGEREF _Toc38312638 \h </w:instrText>
+              <w:instrText xml:space="preserve"> PAGEREF _Toc38635964 \h </w:instrText>
             </w:r>
             <w:r>
               <w:rPr>
@@ -1011,7 +1012,7 @@
               <w:lang w:eastAsia="en-GB"/>
             </w:rPr>
           </w:pPr>
-          <w:hyperlink w:anchor="_Toc38312639" w:history="1">
+          <w:hyperlink w:anchor="_Toc38635965" w:history="1">
             <w:r>
               <w:rPr>
                 <w:rStyle w:val="Lienhypertexte"/>
@@ -1053,7 +1054,7 @@
                 <w:noProof/>
                 <w:webHidden/>
               </w:rPr>
-              <w:instrText xml:space="preserve"> PAGEREF _Toc38312639 \h </w:instrText>
+              <w:instrText xml:space="preserve"> PAGEREF _Toc38635965 \h </w:instrText>
             </w:r>
             <w:r>
               <w:rPr>
@@ -1097,7 +1098,7 @@
               <w:lang w:eastAsia="en-GB"/>
             </w:rPr>
           </w:pPr>
-          <w:hyperlink w:anchor="_Toc38312640" w:history="1">
+          <w:hyperlink w:anchor="_Toc38635966" w:history="1">
             <w:r>
               <w:rPr>
                 <w:rStyle w:val="Lienhypertexte"/>
@@ -1139,7 +1140,7 @@
                 <w:noProof/>
                 <w:webHidden/>
               </w:rPr>
-              <w:instrText xml:space="preserve"> PAGEREF _Toc38312640 \h </w:instrText>
+              <w:instrText xml:space="preserve"> PAGEREF _Toc38635966 \h </w:instrText>
             </w:r>
             <w:r>
               <w:rPr>
@@ -1183,7 +1184,7 @@
               <w:lang w:eastAsia="en-GB"/>
             </w:rPr>
           </w:pPr>
-          <w:hyperlink w:anchor="_Toc38312641" w:history="1">
+          <w:hyperlink w:anchor="_Toc38635967" w:history="1">
             <w:r>
               <w:rPr>
                 <w:rStyle w:val="Lienhypertexte"/>
@@ -1225,7 +1226,7 @@
                 <w:noProof/>
                 <w:webHidden/>
               </w:rPr>
-              <w:instrText xml:space="preserve"> PAGEREF _Toc38312641 \h </w:instrText>
+              <w:instrText xml:space="preserve"> PAGEREF _Toc38635967 \h </w:instrText>
             </w:r>
             <w:r>
               <w:rPr>
@@ -1269,7 +1270,7 @@
               <w:lang w:eastAsia="en-GB"/>
             </w:rPr>
           </w:pPr>
-          <w:hyperlink w:anchor="_Toc38312642" w:history="1">
+          <w:hyperlink w:anchor="_Toc38635968" w:history="1">
             <w:r>
               <w:rPr>
                 <w:rStyle w:val="Lienhypertexte"/>
@@ -1313,7 +1314,7 @@
                 <w:noProof/>
                 <w:webHidden/>
               </w:rPr>
-              <w:instrText xml:space="preserve"> PAGEREF _Toc38312642 \h </w:instrText>
+              <w:instrText xml:space="preserve"> PAGEREF _Toc38635968 \h </w:instrText>
             </w:r>
             <w:r>
               <w:rPr>
@@ -1357,7 +1358,7 @@
               <w:lang w:eastAsia="en-GB"/>
             </w:rPr>
           </w:pPr>
-          <w:hyperlink w:anchor="_Toc38312643" w:history="1">
+          <w:hyperlink w:anchor="_Toc38635969" w:history="1">
             <w:r>
               <w:rPr>
                 <w:rStyle w:val="Lienhypertexte"/>
@@ -1399,7 +1400,7 @@
                 <w:noProof/>
                 <w:webHidden/>
               </w:rPr>
-              <w:instrText xml:space="preserve"> PAGEREF _Toc38312643 \h </w:instrText>
+              <w:instrText xml:space="preserve"> PAGEREF _Toc38635969 \h </w:instrText>
             </w:r>
             <w:r>
               <w:rPr>
@@ -1443,7 +1444,7 @@
               <w:lang w:eastAsia="en-GB"/>
             </w:rPr>
           </w:pPr>
-          <w:hyperlink w:anchor="_Toc38312644" w:history="1">
+          <w:hyperlink w:anchor="_Toc38635970" w:history="1">
             <w:r>
               <w:rPr>
                 <w:rStyle w:val="Lienhypertexte"/>
@@ -1485,7 +1486,7 @@
                 <w:noProof/>
                 <w:webHidden/>
               </w:rPr>
-              <w:instrText xml:space="preserve"> PAGEREF _Toc38312644 \h </w:instrText>
+              <w:instrText xml:space="preserve"> PAGEREF _Toc38635970 \h </w:instrText>
             </w:r>
             <w:r>
               <w:rPr>
@@ -1529,7 +1530,7 @@
               <w:lang w:eastAsia="en-GB"/>
             </w:rPr>
           </w:pPr>
-          <w:hyperlink w:anchor="_Toc38312645" w:history="1">
+          <w:hyperlink w:anchor="_Toc38635971" w:history="1">
             <w:r>
               <w:rPr>
                 <w:rStyle w:val="Lienhypertexte"/>
@@ -1571,7 +1572,7 @@
                 <w:noProof/>
                 <w:webHidden/>
               </w:rPr>
-              <w:instrText xml:space="preserve"> PAGEREF _Toc38312645 \h </w:instrText>
+              <w:instrText xml:space="preserve"> PAGEREF _Toc38635971 \h </w:instrText>
             </w:r>
             <w:r>
               <w:rPr>
@@ -1615,7 +1616,7 @@
               <w:lang w:eastAsia="en-GB"/>
             </w:rPr>
           </w:pPr>
-          <w:hyperlink w:anchor="_Toc38312646" w:history="1">
+          <w:hyperlink w:anchor="_Toc38635972" w:history="1">
             <w:r>
               <w:rPr>
                 <w:rStyle w:val="Lienhypertexte"/>
@@ -1657,7 +1658,7 @@
                 <w:noProof/>
                 <w:webHidden/>
               </w:rPr>
-              <w:instrText xml:space="preserve"> PAGEREF _Toc38312646 \h </w:instrText>
+              <w:instrText xml:space="preserve"> PAGEREF _Toc38635972 \h </w:instrText>
             </w:r>
             <w:r>
               <w:rPr>
@@ -1701,7 +1702,7 @@
               <w:lang w:eastAsia="en-GB"/>
             </w:rPr>
           </w:pPr>
-          <w:hyperlink w:anchor="_Toc38312647" w:history="1">
+          <w:hyperlink w:anchor="_Toc38635973" w:history="1">
             <w:r>
               <w:rPr>
                 <w:rStyle w:val="Lienhypertexte"/>
@@ -1743,7 +1744,7 @@
                 <w:noProof/>
                 <w:webHidden/>
               </w:rPr>
-              <w:instrText xml:space="preserve"> PAGEREF _Toc38312647 \h </w:instrText>
+              <w:instrText xml:space="preserve"> PAGEREF _Toc38635973 \h </w:instrText>
             </w:r>
             <w:r>
               <w:rPr>
@@ -1787,7 +1788,7 @@
               <w:lang w:eastAsia="en-GB"/>
             </w:rPr>
           </w:pPr>
-          <w:hyperlink w:anchor="_Toc38312648" w:history="1">
+          <w:hyperlink w:anchor="_Toc38635974" w:history="1">
             <w:r>
               <w:rPr>
                 <w:rStyle w:val="Lienhypertexte"/>
@@ -1829,7 +1830,7 @@
                 <w:noProof/>
                 <w:webHidden/>
               </w:rPr>
-              <w:instrText xml:space="preserve"> PAGEREF _Toc38312648 \h </w:instrText>
+              <w:instrText xml:space="preserve"> PAGEREF _Toc38635974 \h </w:instrText>
             </w:r>
             <w:r>
               <w:rPr>
@@ -1873,7 +1874,7 @@
               <w:lang w:eastAsia="en-GB"/>
             </w:rPr>
           </w:pPr>
-          <w:hyperlink w:anchor="_Toc38312649" w:history="1">
+          <w:hyperlink w:anchor="_Toc38635975" w:history="1">
             <w:r>
               <w:rPr>
                 <w:rStyle w:val="Lienhypertexte"/>
@@ -1915,7 +1916,7 @@
                 <w:noProof/>
                 <w:webHidden/>
               </w:rPr>
-              <w:instrText xml:space="preserve"> PAGEREF _Toc38312649 \h </w:instrText>
+              <w:instrText xml:space="preserve"> PAGEREF _Toc38635975 \h </w:instrText>
             </w:r>
             <w:r>
               <w:rPr>
@@ -1959,7 +1960,7 @@
               <w:lang w:eastAsia="en-GB"/>
             </w:rPr>
           </w:pPr>
-          <w:hyperlink w:anchor="_Toc38312650" w:history="1">
+          <w:hyperlink w:anchor="_Toc38635976" w:history="1">
             <w:r>
               <w:rPr>
                 <w:rStyle w:val="Lienhypertexte"/>
@@ -2001,7 +2002,7 @@
                 <w:noProof/>
                 <w:webHidden/>
               </w:rPr>
-              <w:instrText xml:space="preserve"> PAGEREF _Toc38312650 \h </w:instrText>
+              <w:instrText xml:space="preserve"> PAGEREF _Toc38635976 \h </w:instrText>
             </w:r>
             <w:r>
               <w:rPr>
@@ -2045,7 +2046,7 @@
               <w:lang w:eastAsia="en-GB"/>
             </w:rPr>
           </w:pPr>
-          <w:hyperlink w:anchor="_Toc38312651" w:history="1">
+          <w:hyperlink w:anchor="_Toc38635977" w:history="1">
             <w:r>
               <w:rPr>
                 <w:rStyle w:val="Lienhypertexte"/>
@@ -2089,7 +2090,7 @@
                 <w:noProof/>
                 <w:webHidden/>
               </w:rPr>
-              <w:instrText xml:space="preserve"> PAGEREF _Toc38312651 \h </w:instrText>
+              <w:instrText xml:space="preserve"> PAGEREF _Toc38635977 \h </w:instrText>
             </w:r>
             <w:r>
               <w:rPr>
@@ -2133,7 +2134,7 @@
               <w:lang w:eastAsia="en-GB"/>
             </w:rPr>
           </w:pPr>
-          <w:hyperlink w:anchor="_Toc38312652" w:history="1">
+          <w:hyperlink w:anchor="_Toc38635978" w:history="1">
             <w:r>
               <w:rPr>
                 <w:rStyle w:val="Lienhypertexte"/>
@@ -2177,7 +2178,7 @@
                 <w:noProof/>
                 <w:webHidden/>
               </w:rPr>
-              <w:instrText xml:space="preserve"> PAGEREF _Toc38312652 \h </w:instrText>
+              <w:instrText xml:space="preserve"> PAGEREF _Toc38635978 \h </w:instrText>
             </w:r>
             <w:r>
               <w:rPr>
@@ -2221,7 +2222,7 @@
               <w:lang w:eastAsia="en-GB"/>
             </w:rPr>
           </w:pPr>
-          <w:hyperlink w:anchor="_Toc38312653" w:history="1">
+          <w:hyperlink w:anchor="_Toc38635979" w:history="1">
             <w:r>
               <w:rPr>
                 <w:rStyle w:val="Lienhypertexte"/>
@@ -2263,7 +2264,7 @@
                 <w:noProof/>
                 <w:webHidden/>
               </w:rPr>
-              <w:instrText xml:space="preserve"> PAGEREF _Toc38312653 \h </w:instrText>
+              <w:instrText xml:space="preserve"> PAGEREF _Toc38635979 \h </w:instrText>
             </w:r>
             <w:r>
               <w:rPr>
@@ -2307,7 +2308,7 @@
               <w:lang w:eastAsia="en-GB"/>
             </w:rPr>
           </w:pPr>
-          <w:hyperlink w:anchor="_Toc38312654" w:history="1">
+          <w:hyperlink w:anchor="_Toc38635980" w:history="1">
             <w:r>
               <w:rPr>
                 <w:rStyle w:val="Lienhypertexte"/>
@@ -2349,7 +2350,7 @@
                 <w:noProof/>
                 <w:webHidden/>
               </w:rPr>
-              <w:instrText xml:space="preserve"> PAGEREF _Toc38312654 \h </w:instrText>
+              <w:instrText xml:space="preserve"> PAGEREF _Toc38635980 \h </w:instrText>
             </w:r>
             <w:r>
               <w:rPr>
@@ -2393,7 +2394,7 @@
               <w:lang w:eastAsia="en-GB"/>
             </w:rPr>
           </w:pPr>
-          <w:hyperlink w:anchor="_Toc38312655" w:history="1">
+          <w:hyperlink w:anchor="_Toc38635981" w:history="1">
             <w:r>
               <w:rPr>
                 <w:rStyle w:val="Lienhypertexte"/>
@@ -2435,7 +2436,7 @@
                 <w:noProof/>
                 <w:webHidden/>
               </w:rPr>
-              <w:instrText xml:space="preserve"> PAGEREF _Toc38312655 \h </w:instrText>
+              <w:instrText xml:space="preserve"> PAGEREF _Toc38635981 \h </w:instrText>
             </w:r>
             <w:r>
               <w:rPr>
@@ -2479,7 +2480,7 @@
               <w:lang w:eastAsia="en-GB"/>
             </w:rPr>
           </w:pPr>
-          <w:hyperlink w:anchor="_Toc38312656" w:history="1">
+          <w:hyperlink w:anchor="_Toc38635982" w:history="1">
             <w:r>
               <w:rPr>
                 <w:rStyle w:val="Lienhypertexte"/>
@@ -2521,7 +2522,7 @@
                 <w:noProof/>
                 <w:webHidden/>
               </w:rPr>
-              <w:instrText xml:space="preserve"> PAGEREF _Toc38312656 \h </w:instrText>
+              <w:instrText xml:space="preserve"> PAGEREF _Toc38635982 \h </w:instrText>
             </w:r>
             <w:r>
               <w:rPr>
@@ -2565,7 +2566,7 @@
               <w:lang w:eastAsia="en-GB"/>
             </w:rPr>
           </w:pPr>
-          <w:hyperlink w:anchor="_Toc38312657" w:history="1">
+          <w:hyperlink w:anchor="_Toc38635983" w:history="1">
             <w:r>
               <w:rPr>
                 <w:rStyle w:val="Lienhypertexte"/>
@@ -2607,7 +2608,7 @@
                 <w:noProof/>
                 <w:webHidden/>
               </w:rPr>
-              <w:instrText xml:space="preserve"> PAGEREF _Toc38312657 \h </w:instrText>
+              <w:instrText xml:space="preserve"> PAGEREF _Toc38635983 \h </w:instrText>
             </w:r>
             <w:r>
               <w:rPr>
@@ -2651,7 +2652,7 @@
               <w:lang w:eastAsia="en-GB"/>
             </w:rPr>
           </w:pPr>
-          <w:hyperlink w:anchor="_Toc38312658" w:history="1">
+          <w:hyperlink w:anchor="_Toc38635984" w:history="1">
             <w:r>
               <w:rPr>
                 <w:rStyle w:val="Lienhypertexte"/>
@@ -2693,7 +2694,7 @@
                 <w:noProof/>
                 <w:webHidden/>
               </w:rPr>
-              <w:instrText xml:space="preserve"> PAGEREF _Toc38312658 \h </w:instrText>
+              <w:instrText xml:space="preserve"> PAGEREF _Toc38635984 \h </w:instrText>
             </w:r>
             <w:r>
               <w:rPr>
@@ -2737,7 +2738,7 @@
               <w:lang w:eastAsia="en-GB"/>
             </w:rPr>
           </w:pPr>
-          <w:hyperlink w:anchor="_Toc38312659" w:history="1">
+          <w:hyperlink w:anchor="_Toc38635985" w:history="1">
             <w:r>
               <w:rPr>
                 <w:rStyle w:val="Lienhypertexte"/>
@@ -2758,21 +2759,21 @@
                 <w:rStyle w:val="Lienhypertexte"/>
                 <w:noProof/>
               </w:rPr>
-              <w:t>rootsPo</w:t>
+              <w:t>rootsP</w:t>
             </w:r>
             <w:r>
               <w:rPr>
                 <w:rStyle w:val="Lienhypertexte"/>
                 <w:noProof/>
               </w:rPr>
-              <w:t>l</w:t>
+              <w:t>o</w:t>
             </w:r>
             <w:r>
               <w:rPr>
                 <w:rStyle w:val="Lienhypertexte"/>
                 <w:noProof/>
               </w:rPr>
-              <w:t>yorder3</w:t>
+              <w:t>lyorder3</w:t>
             </w:r>
             <w:r>
               <w:rPr>
@@ -2793,7 +2794,7 @@
                 <w:noProof/>
                 <w:webHidden/>
               </w:rPr>
-              <w:instrText xml:space="preserve"> PAGEREF _Toc38312659 \h </w:instrText>
+              <w:instrText xml:space="preserve"> PAGEREF _Toc38635985 \h </w:instrText>
             </w:r>
             <w:r>
               <w:rPr>
@@ -2837,7 +2838,7 @@
               <w:lang w:eastAsia="en-GB"/>
             </w:rPr>
           </w:pPr>
-          <w:hyperlink w:anchor="_Toc38312660" w:history="1">
+          <w:hyperlink w:anchor="_Toc38635986" w:history="1">
             <w:r>
               <w:rPr>
                 <w:rStyle w:val="Lienhypertexte"/>
@@ -2881,7 +2882,7 @@
                 <w:noProof/>
                 <w:webHidden/>
               </w:rPr>
-              <w:instrText xml:space="preserve"> PAGEREF _Toc38312660 \h </w:instrText>
+              <w:instrText xml:space="preserve"> PAGEREF _Toc38635986 \h </w:instrText>
             </w:r>
             <w:r>
               <w:rPr>
@@ -2901,7 +2902,7 @@
                 <w:noProof/>
                 <w:webHidden/>
               </w:rPr>
-              <w:t>12</w:t>
+              <w:t>13</w:t>
             </w:r>
             <w:r>
               <w:rPr>
@@ -2925,7 +2926,7 @@
               <w:lang w:eastAsia="en-GB"/>
             </w:rPr>
           </w:pPr>
-          <w:hyperlink w:anchor="_Toc38312661" w:history="1">
+          <w:hyperlink w:anchor="_Toc38635987" w:history="1">
             <w:r>
               <w:rPr>
                 <w:rStyle w:val="Lienhypertexte"/>
@@ -2969,7 +2970,7 @@
                 <w:noProof/>
                 <w:webHidden/>
               </w:rPr>
-              <w:instrText xml:space="preserve"> PAGEREF _Toc38312661 \h </w:instrText>
+              <w:instrText xml:space="preserve"> PAGEREF _Toc38635987 \h </w:instrText>
             </w:r>
             <w:r>
               <w:rPr>
@@ -2989,7 +2990,7 @@
                 <w:noProof/>
                 <w:webHidden/>
               </w:rPr>
-              <w:t>12</w:t>
+              <w:t>13</w:t>
             </w:r>
             <w:r>
               <w:rPr>
@@ -3013,7 +3014,7 @@
               <w:lang w:eastAsia="en-GB"/>
             </w:rPr>
           </w:pPr>
-          <w:hyperlink w:anchor="_Toc38312662" w:history="1">
+          <w:hyperlink w:anchor="_Toc38635988" w:history="1">
             <w:r>
               <w:rPr>
                 <w:rStyle w:val="Lienhypertexte"/>
@@ -3055,7 +3056,7 @@
                 <w:noProof/>
                 <w:webHidden/>
               </w:rPr>
-              <w:instrText xml:space="preserve"> PAGEREF _Toc38312662 \h </w:instrText>
+              <w:instrText xml:space="preserve"> PAGEREF _Toc38635988 \h </w:instrText>
             </w:r>
             <w:r>
               <w:rPr>
@@ -3075,7 +3076,7 @@
                 <w:noProof/>
                 <w:webHidden/>
               </w:rPr>
-              <w:t>12</w:t>
+              <w:t>13</w:t>
             </w:r>
             <w:r>
               <w:rPr>
@@ -3137,7 +3138,7 @@
           <w:lang w:val="fr-FR"/>
         </w:rPr>
       </w:pPr>
-      <w:bookmarkStart w:id="0" w:name="_Toc38312628"/>
+      <w:bookmarkStart w:id="0" w:name="_Toc38635954"/>
       <w:proofErr w:type="spellStart"/>
       <w:r>
         <w:rPr>
@@ -3164,7 +3165,7 @@
           <w:lang w:val="fr-FR"/>
         </w:rPr>
       </w:pPr>
-      <w:bookmarkStart w:id="1" w:name="_Toc38312629"/>
+      <w:bookmarkStart w:id="1" w:name="_Toc38635955"/>
       <w:r>
         <w:rPr>
           <w:lang w:val="fr-FR"/>
@@ -3187,7 +3188,7 @@
           <w:rFonts w:eastAsiaTheme="minorEastAsia"/>
         </w:rPr>
       </w:pPr>
-      <w:bookmarkStart w:id="2" w:name="_Toc38312630"/>
+      <w:bookmarkStart w:id="2" w:name="_Toc38635956"/>
       <w:r>
         <w:rPr>
           <w:rFonts w:eastAsiaTheme="minorEastAsia"/>
@@ -3576,7 +3577,13 @@
             <w:rPr>
               <w:rFonts w:ascii="Cambria Math" w:hAnsi="Cambria Math"/>
             </w:rPr>
-            <m:t>port_b.Q_flow=m_flow×cp</m:t>
+            <m:t>po</m:t>
+          </m:r>
+          <m:r>
+            <w:rPr>
+              <w:rFonts w:ascii="Cambria Math" w:hAnsi="Cambria Math"/>
+            </w:rPr>
+            <m:t>rt_b.Q_flow=m_flow×cp</m:t>
           </m:r>
           <m:d>
             <m:dPr>
@@ -3654,7 +3661,7 @@
           <w:rFonts w:eastAsiaTheme="minorEastAsia"/>
         </w:rPr>
       </w:pPr>
-      <w:bookmarkStart w:id="3" w:name="_Toc38312631"/>
+      <w:bookmarkStart w:id="3" w:name="_Toc38635957"/>
       <w:proofErr w:type="spellStart"/>
       <w:r>
         <w:rPr>
@@ -4615,7 +4622,7 @@
           <w:rFonts w:eastAsiaTheme="minorEastAsia"/>
         </w:rPr>
       </w:pPr>
-      <w:bookmarkStart w:id="4" w:name="_Toc38312632"/>
+      <w:bookmarkStart w:id="4" w:name="_Toc38635958"/>
       <w:proofErr w:type="spellStart"/>
       <w:r>
         <w:rPr>
@@ -5097,7 +5104,7 @@
           <w:lang w:val="fr-FR"/>
         </w:rPr>
       </w:pPr>
-      <w:bookmarkStart w:id="5" w:name="_Toc38312633"/>
+      <w:bookmarkStart w:id="5" w:name="_Toc38635959"/>
       <w:proofErr w:type="spellStart"/>
       <w:r>
         <w:rPr>
@@ -5123,7 +5130,7 @@
           <w:rFonts w:eastAsiaTheme="minorEastAsia"/>
         </w:rPr>
       </w:pPr>
-      <w:bookmarkStart w:id="6" w:name="_Toc38312634"/>
+      <w:bookmarkStart w:id="6" w:name="_Toc38635960"/>
       <w:proofErr w:type="spellStart"/>
       <w:r>
         <w:rPr>
@@ -5178,7 +5185,7 @@
           <w:rFonts w:eastAsiaTheme="minorEastAsia"/>
         </w:rPr>
       </w:pPr>
-      <w:bookmarkStart w:id="7" w:name="_Toc38312635"/>
+      <w:bookmarkStart w:id="7" w:name="_Toc38635961"/>
       <w:r>
         <w:rPr>
           <w:rFonts w:eastAsiaTheme="minorEastAsia"/>
@@ -5266,7 +5273,7 @@
           <w:rFonts w:eastAsiaTheme="minorEastAsia"/>
         </w:rPr>
       </w:pPr>
-      <w:bookmarkStart w:id="8" w:name="_Toc38312636"/>
+      <w:bookmarkStart w:id="8" w:name="_Toc38635962"/>
       <w:r>
         <w:rPr>
           <w:rFonts w:eastAsiaTheme="minorEastAsia"/>
@@ -5400,7 +5407,7 @@
           <w:rFonts w:eastAsiaTheme="minorEastAsia"/>
         </w:rPr>
       </w:pPr>
-      <w:bookmarkStart w:id="9" w:name="_Toc38312637"/>
+      <w:bookmarkStart w:id="9" w:name="_Toc38635963"/>
       <w:r>
         <w:rPr>
           <w:rFonts w:eastAsiaTheme="minorEastAsia"/>
@@ -5881,7 +5888,7 @@
           <w:rFonts w:eastAsiaTheme="minorEastAsia"/>
         </w:rPr>
       </w:pPr>
-      <w:bookmarkStart w:id="10" w:name="_Toc38312638"/>
+      <w:bookmarkStart w:id="10" w:name="_Toc38635964"/>
       <w:proofErr w:type="spellStart"/>
       <w:r>
         <w:rPr>
@@ -5956,7 +5963,7 @@
           <w:rFonts w:eastAsiaTheme="minorEastAsia"/>
         </w:rPr>
       </w:pPr>
-      <w:bookmarkStart w:id="11" w:name="_Toc38312639"/>
+      <w:bookmarkStart w:id="11" w:name="_Toc38635965"/>
       <w:proofErr w:type="spellStart"/>
       <w:r>
         <w:rPr>
@@ -6044,7 +6051,13 @@
                     <w:rPr>
                       <w:rFonts w:ascii="Cambria Math" w:eastAsiaTheme="minorEastAsia" w:hAnsi="Cambria Math"/>
                     </w:rPr>
-                    <m:t>Q_flow</m:t>
+                    <m:t>Q_f</m:t>
+                  </m:r>
+                  <m:r>
+                    <w:rPr>
+                      <w:rFonts w:ascii="Cambria Math" w:eastAsiaTheme="minorEastAsia" w:hAnsi="Cambria Math"/>
+                    </w:rPr>
+                    <m:t>low</m:t>
                   </m:r>
                 </m:e>
               </m:nary>
@@ -6069,7 +6082,7 @@
           <w:rFonts w:eastAsiaTheme="minorEastAsia"/>
         </w:rPr>
       </w:pPr>
-      <w:bookmarkStart w:id="12" w:name="_Toc38312640"/>
+      <w:bookmarkStart w:id="12" w:name="_Toc38635966"/>
       <w:r>
         <w:rPr>
           <w:rFonts w:eastAsiaTheme="minorEastAsia"/>
@@ -6792,7 +6805,7 @@
           <w:rFonts w:eastAsiaTheme="minorEastAsia"/>
         </w:rPr>
       </w:pPr>
-      <w:bookmarkStart w:id="13" w:name="_Toc38312641"/>
+      <w:bookmarkStart w:id="13" w:name="_Toc38635967"/>
       <w:proofErr w:type="spellStart"/>
       <w:r>
         <w:rPr>
@@ -6951,7 +6964,7 @@
           <w:lang w:val="fr-FR"/>
         </w:rPr>
       </w:pPr>
-      <w:bookmarkStart w:id="14" w:name="_Toc38312642"/>
+      <w:bookmarkStart w:id="14" w:name="_Toc38635968"/>
       <w:proofErr w:type="spellStart"/>
       <w:r>
         <w:rPr>
@@ -6978,7 +6991,7 @@
           <w:rFonts w:eastAsiaTheme="minorEastAsia"/>
         </w:rPr>
       </w:pPr>
-      <w:bookmarkStart w:id="15" w:name="_Toc38312643"/>
+      <w:bookmarkStart w:id="15" w:name="_Toc38635969"/>
       <w:proofErr w:type="spellStart"/>
       <w:r>
         <w:rPr>
@@ -7100,7 +7113,7 @@
           <w:rFonts w:eastAsiaTheme="minorEastAsia"/>
         </w:rPr>
       </w:pPr>
-      <w:bookmarkStart w:id="16" w:name="_Toc38312644"/>
+      <w:bookmarkStart w:id="16" w:name="_Toc38635970"/>
       <w:proofErr w:type="spellStart"/>
       <w:r>
         <w:rPr>
@@ -7223,7 +7236,7 @@
           <w:rFonts w:eastAsiaTheme="minorEastAsia"/>
         </w:rPr>
       </w:pPr>
-      <w:bookmarkStart w:id="17" w:name="_Toc38312645"/>
+      <w:bookmarkStart w:id="17" w:name="_Toc38635971"/>
       <w:proofErr w:type="spellStart"/>
       <w:proofErr w:type="gramStart"/>
       <w:r>
@@ -7368,7 +7381,7 @@
           <w:rFonts w:eastAsiaTheme="minorEastAsia"/>
         </w:rPr>
       </w:pPr>
-      <w:bookmarkStart w:id="18" w:name="_Toc38312646"/>
+      <w:bookmarkStart w:id="18" w:name="_Toc38635972"/>
       <w:proofErr w:type="spellStart"/>
       <w:proofErr w:type="gramStart"/>
       <w:r>
@@ -8382,7 +8395,7 @@
           <w:rFonts w:eastAsiaTheme="minorEastAsia"/>
         </w:rPr>
       </w:pPr>
-      <w:bookmarkStart w:id="19" w:name="_Toc38312647"/>
+      <w:bookmarkStart w:id="19" w:name="_Toc38635973"/>
       <w:proofErr w:type="spellStart"/>
       <w:proofErr w:type="gramStart"/>
       <w:r>
@@ -8407,13 +8420,7 @@
             <w:rPr>
               <w:rFonts w:ascii="Cambria Math" w:eastAsiaTheme="minorEastAsia" w:hAnsi="Cambria Math"/>
             </w:rPr>
-            <m:t>dx= B</m:t>
-          </m:r>
-          <m:r>
-            <w:rPr>
-              <w:rFonts w:ascii="Cambria Math" w:eastAsiaTheme="minorEastAsia" w:hAnsi="Cambria Math"/>
-            </w:rPr>
-            <m:t>iot×</m:t>
+            <m:t>dx= Biot×</m:t>
           </m:r>
           <m:f>
             <m:fPr>
@@ -8636,7 +8643,7 @@
           <w:rFonts w:eastAsiaTheme="minorEastAsia"/>
         </w:rPr>
       </w:pPr>
-      <w:bookmarkStart w:id="20" w:name="_Toc38312648"/>
+      <w:bookmarkStart w:id="20" w:name="_Toc38635974"/>
       <w:proofErr w:type="spellStart"/>
       <w:proofErr w:type="gramStart"/>
       <w:r>
@@ -9454,7 +9461,13 @@
             <w:rPr>
               <w:rFonts w:ascii="Cambria Math" w:eastAsiaTheme="minorEastAsia" w:hAnsi="Cambria Math"/>
             </w:rPr>
-            <m:t xml:space="preserve"> for i from n+2 to N</m:t>
+            <m:t xml:space="preserve"> for i from n+2 t</m:t>
+          </m:r>
+          <m:r>
+            <w:rPr>
+              <w:rFonts w:ascii="Cambria Math" w:eastAsiaTheme="minorEastAsia" w:hAnsi="Cambria Math"/>
+            </w:rPr>
+            <m:t>o N</m:t>
           </m:r>
         </m:oMath>
       </m:oMathPara>
@@ -9696,7 +9709,7 @@
           <w:rFonts w:eastAsiaTheme="minorEastAsia"/>
         </w:rPr>
       </w:pPr>
-      <w:bookmarkStart w:id="21" w:name="_Toc38312649"/>
+      <w:bookmarkStart w:id="21" w:name="_Toc38635975"/>
       <w:proofErr w:type="spellStart"/>
       <w:proofErr w:type="gramStart"/>
       <w:r>
@@ -9879,7 +9892,7 @@
           <w:rFonts w:eastAsiaTheme="minorEastAsia"/>
         </w:rPr>
       </w:pPr>
-      <w:bookmarkStart w:id="22" w:name="_Toc38312650"/>
+      <w:bookmarkStart w:id="22" w:name="_Toc38635976"/>
       <w:proofErr w:type="spellStart"/>
       <w:r>
         <w:rPr>
@@ -10129,7 +10142,7 @@
           <w:lang w:val="fr-FR"/>
         </w:rPr>
       </w:pPr>
-      <w:bookmarkStart w:id="23" w:name="_Toc38312651"/>
+      <w:bookmarkStart w:id="23" w:name="_Toc38635977"/>
       <w:proofErr w:type="spellStart"/>
       <w:r>
         <w:rPr>
@@ -10156,15 +10169,215 @@
           <w:lang w:val="fr-FR"/>
         </w:rPr>
       </w:pPr>
-      <w:bookmarkStart w:id="24" w:name="_Toc38312652"/>
+      <w:r>
+        <w:rPr>
+          <w:lang w:val="fr-FR"/>
+        </w:rPr>
+        <w:t>Components</w:t>
+      </w:r>
+    </w:p>
+    <w:p>
+      <w:pPr>
+        <w:rPr>
+          <w:lang w:val="fr-FR"/>
+        </w:rPr>
+      </w:pPr>
+    </w:p>
+    <w:p>
+      <w:pPr>
+        <w:pStyle w:val="Titre3"/>
+        <w:rPr>
+          <w:lang w:val="fr-FR"/>
+        </w:rPr>
+      </w:pPr>
       <w:proofErr w:type="spellStart"/>
       <w:r>
         <w:rPr>
           <w:lang w:val="fr-FR"/>
         </w:rPr>
+        <w:t>PartialPump</w:t>
+      </w:r>
+      <w:bookmarkStart w:id="24" w:name="_GoBack"/>
+      <w:bookmarkEnd w:id="24"/>
+      <w:proofErr w:type="spellEnd"/>
+    </w:p>
+    <w:p>
+      <w:pPr>
+        <w:rPr>
+          <w:lang w:val="fr-FR"/>
+        </w:rPr>
+      </w:pPr>
+    </w:p>
+    <w:p>
+      <w:pPr>
+        <w:rPr>
+          <w:rFonts w:eastAsiaTheme="minorEastAsia"/>
+        </w:rPr>
+      </w:pPr>
+      <m:oMathPara>
+        <m:oMath>
+          <m:r>
+            <w:rPr>
+              <w:rFonts w:ascii="Cambria Math" w:hAnsi="Cambria Math"/>
+            </w:rPr>
+            <m:t>V</m:t>
+          </m:r>
+          <m:r>
+            <w:rPr>
+              <w:rFonts w:ascii="Cambria Math" w:hAnsi="Cambria Math"/>
+            </w:rPr>
+            <m:t>_flow</m:t>
+          </m:r>
+          <m:r>
+            <m:rPr>
+              <m:sty m:val="p"/>
+            </m:rPr>
+            <w:rPr>
+              <w:rFonts w:ascii="Cambria Math" w:hAnsi="Cambria Math"/>
+            </w:rPr>
+            <m:t>∝N</m:t>
+          </m:r>
+        </m:oMath>
+      </m:oMathPara>
+    </w:p>
+    <w:p>
+      <w:pPr>
+        <w:rPr>
+          <w:rFonts w:eastAsiaTheme="minorEastAsia"/>
+        </w:rPr>
+      </w:pPr>
+      <m:oMathPara>
+        <m:oMath>
+          <m:r>
+            <w:rPr>
+              <w:rFonts w:ascii="Cambria Math" w:hAnsi="Cambria Math"/>
+            </w:rPr>
+            <m:t>head</m:t>
+          </m:r>
+          <m:r>
+            <m:rPr>
+              <m:sty m:val="p"/>
+            </m:rPr>
+            <w:rPr>
+              <w:rFonts w:ascii="Cambria Math" w:hAnsi="Cambria Math"/>
+            </w:rPr>
+            <m:t>∝</m:t>
+          </m:r>
+          <m:sSup>
+            <m:sSupPr>
+              <m:ctrlPr>
+                <w:rPr>
+                  <w:rFonts w:ascii="Cambria Math" w:hAnsi="Cambria Math"/>
+                </w:rPr>
+              </m:ctrlPr>
+            </m:sSupPr>
+            <m:e>
+              <m:r>
+                <w:rPr>
+                  <w:rFonts w:ascii="Cambria Math" w:hAnsi="Cambria Math"/>
+                </w:rPr>
+                <m:t>N</m:t>
+              </m:r>
+            </m:e>
+            <m:sup>
+              <m:r>
+                <w:rPr>
+                  <w:rFonts w:ascii="Cambria Math" w:hAnsi="Cambria Math"/>
+                </w:rPr>
+                <m:t>2</m:t>
+              </m:r>
+            </m:sup>
+          </m:sSup>
+        </m:oMath>
+      </m:oMathPara>
+    </w:p>
+    <w:p>
+      <w:pPr>
+        <w:rPr>
+          <w:lang w:val="fr-FR"/>
+        </w:rPr>
+      </w:pPr>
+      <m:oMathPara>
+        <m:oMath>
+          <m:r>
+            <w:rPr>
+              <w:rFonts w:ascii="Cambria Math" w:hAnsi="Cambria Math"/>
+            </w:rPr>
+            <m:t>P</m:t>
+          </m:r>
+          <m:r>
+            <m:rPr>
+              <m:sty m:val="p"/>
+            </m:rPr>
+            <w:rPr>
+              <w:rFonts w:ascii="Cambria Math" w:hAnsi="Cambria Math"/>
+            </w:rPr>
+            <m:t>∝</m:t>
+          </m:r>
+          <m:sSup>
+            <m:sSupPr>
+              <m:ctrlPr>
+                <w:rPr>
+                  <w:rFonts w:ascii="Cambria Math" w:hAnsi="Cambria Math"/>
+                </w:rPr>
+              </m:ctrlPr>
+            </m:sSupPr>
+            <m:e>
+              <m:r>
+                <w:rPr>
+                  <w:rFonts w:ascii="Cambria Math" w:hAnsi="Cambria Math"/>
+                </w:rPr>
+                <m:t>N</m:t>
+              </m:r>
+            </m:e>
+            <m:sup>
+              <m:r>
+                <w:rPr>
+                  <w:rFonts w:ascii="Cambria Math" w:hAnsi="Cambria Math"/>
+                </w:rPr>
+                <m:t>3</m:t>
+              </m:r>
+            </m:sup>
+          </m:sSup>
+          <m:r>
+            <w:rPr>
+              <w:rFonts w:ascii="Cambria Math" w:hAnsi="Cambria Math"/>
+            </w:rPr>
+            <m:t>,ρ</m:t>
+          </m:r>
+        </m:oMath>
+      </m:oMathPara>
+    </w:p>
+    <w:p>
+      <w:pPr>
+        <w:rPr>
+          <w:lang w:val="fr-FR"/>
+        </w:rPr>
+      </w:pPr>
+    </w:p>
+    <w:p>
+      <w:pPr>
+        <w:rPr>
+          <w:lang w:val="fr-FR"/>
+        </w:rPr>
+      </w:pPr>
+    </w:p>
+    <w:p>
+      <w:pPr>
+        <w:pStyle w:val="Titre2"/>
+        <w:rPr>
+          <w:lang w:val="fr-FR"/>
+        </w:rPr>
+      </w:pPr>
+      <w:bookmarkStart w:id="25" w:name="_Toc38635978"/>
+      <w:proofErr w:type="spellStart"/>
+      <w:r>
+        <w:rPr>
+          <w:lang w:val="fr-FR"/>
+        </w:rPr>
         <w:t>BasesClasses</w:t>
       </w:r>
-      <w:bookmarkEnd w:id="24"/>
+      <w:bookmarkEnd w:id="25"/>
       <w:proofErr w:type="spellEnd"/>
     </w:p>
     <w:p>
@@ -10181,7 +10394,7 @@
           <w:rFonts w:eastAsiaTheme="minorEastAsia"/>
         </w:rPr>
       </w:pPr>
-      <w:bookmarkStart w:id="25" w:name="_Toc38312653"/>
+      <w:bookmarkStart w:id="26" w:name="_Toc38635979"/>
       <w:proofErr w:type="spellStart"/>
       <w:r>
         <w:rPr>
@@ -10189,7 +10402,7 @@
         </w:rPr>
         <w:t>AeraulicConvection</w:t>
       </w:r>
-      <w:bookmarkEnd w:id="25"/>
+      <w:bookmarkEnd w:id="26"/>
       <w:proofErr w:type="spellEnd"/>
     </w:p>
     <w:p/>
@@ -10443,7 +10656,7 @@
           <w:rFonts w:eastAsiaTheme="minorEastAsia"/>
         </w:rPr>
       </w:pPr>
-      <w:bookmarkStart w:id="26" w:name="_Toc38312654"/>
+      <w:bookmarkStart w:id="27" w:name="_Toc38635980"/>
       <w:r>
         <w:rPr>
           <w:rFonts w:eastAsiaTheme="minorEastAsia"/>
@@ -10456,7 +10669,7 @@
         </w:rPr>
         <w:t>densation</w:t>
       </w:r>
-      <w:bookmarkEnd w:id="26"/>
+      <w:bookmarkEnd w:id="27"/>
     </w:p>
     <w:p/>
     <w:p>
@@ -10664,7 +10877,7 @@
           <w:rFonts w:eastAsiaTheme="minorEastAsia"/>
         </w:rPr>
       </w:pPr>
-      <w:bookmarkStart w:id="27" w:name="_Toc38312655"/>
+      <w:bookmarkStart w:id="28" w:name="_Toc38635981"/>
       <w:proofErr w:type="spellStart"/>
       <w:r>
         <w:rPr>
@@ -10672,7 +10885,7 @@
         </w:rPr>
         <w:t>MolecularDiffusion</w:t>
       </w:r>
-      <w:bookmarkEnd w:id="27"/>
+      <w:bookmarkEnd w:id="28"/>
       <w:proofErr w:type="spellEnd"/>
     </w:p>
     <w:p/>
@@ -10944,7 +11157,7 @@
           <w:rFonts w:eastAsiaTheme="minorEastAsia"/>
         </w:rPr>
       </w:pPr>
-      <w:bookmarkStart w:id="28" w:name="_Toc38312656"/>
+      <w:bookmarkStart w:id="29" w:name="_Toc38635982"/>
       <w:proofErr w:type="spellStart"/>
       <w:r>
         <w:rPr>
@@ -10952,7 +11165,7 @@
         </w:rPr>
         <w:t>GasNode</w:t>
       </w:r>
-      <w:bookmarkEnd w:id="28"/>
+      <w:bookmarkEnd w:id="29"/>
       <w:proofErr w:type="spellEnd"/>
     </w:p>
     <w:p/>
@@ -10980,13 +11193,8 @@
             <w:rPr>
               <w:rFonts w:ascii="Cambria Math" w:eastAsiaTheme="minorEastAsia" w:hAnsi="Cambria Math"/>
             </w:rPr>
-            <m:t>U=m×m</m:t>
-          </m:r>
-          <m:r>
-            <w:rPr>
-              <w:rFonts w:ascii="Cambria Math" w:eastAsiaTheme="minorEastAsia" w:hAnsi="Cambria Math"/>
-            </w:rPr>
-            <m:t>edium.u</m:t>
+            <w:lastRenderedPageBreak/>
+            <m:t>U=m×medium.u</m:t>
           </m:r>
         </m:oMath>
       </m:oMathPara>
@@ -11165,13 +11373,12 @@
       <w:pPr>
         <w:pStyle w:val="Titre3"/>
       </w:pPr>
-      <w:bookmarkStart w:id="29" w:name="_Toc38312657"/>
+      <w:bookmarkStart w:id="30" w:name="_Toc38635983"/>
       <w:proofErr w:type="spellStart"/>
       <w:r>
-        <w:lastRenderedPageBreak/>
         <w:t>FogModel</w:t>
       </w:r>
-      <w:bookmarkEnd w:id="29"/>
+      <w:bookmarkEnd w:id="30"/>
       <w:proofErr w:type="spellEnd"/>
     </w:p>
     <w:p/>
@@ -11849,13 +12056,7 @@
             <w:rPr>
               <w:rFonts w:ascii="Cambria Math" w:eastAsiaTheme="minorEastAsia" w:hAnsi="Cambria Math"/>
             </w:rPr>
-            <m:t>m_flo</m:t>
-          </m:r>
-          <m:r>
-            <w:rPr>
-              <w:rFonts w:ascii="Cambria Math" w:eastAsiaTheme="minorEastAsia" w:hAnsi="Cambria Math"/>
-            </w:rPr>
-            <m:t xml:space="preserve">w= </m:t>
+            <m:t xml:space="preserve">m_flow= </m:t>
           </m:r>
           <m:sSub>
             <m:sSubPr>
@@ -12276,6 +12477,7 @@
             <w:rPr>
               <w:rFonts w:ascii="Cambria Math" w:eastAsiaTheme="minorEastAsia" w:hAnsi="Cambria Math"/>
             </w:rPr>
+            <w:lastRenderedPageBreak/>
             <m:t>mXi_flow[i]</m:t>
           </m:r>
           <m:r>
@@ -12362,13 +12564,7 @@
             <w:rPr>
               <w:rFonts w:ascii="Cambria Math" w:eastAsiaTheme="minorEastAsia" w:hAnsi="Cambria Math"/>
             </w:rPr>
-            <m:t>+flowPort.m_f</m:t>
-          </m:r>
-          <m:r>
-            <w:rPr>
-              <w:rFonts w:ascii="Cambria Math" w:eastAsiaTheme="minorEastAsia" w:hAnsi="Cambria Math"/>
-            </w:rPr>
-            <m:t xml:space="preserve">low[i]  </m:t>
+            <m:t xml:space="preserve">+flowPort.m_flow[i]  </m:t>
           </m:r>
         </m:oMath>
       </m:oMathPara>
@@ -12394,7 +12590,13 @@
             <w:rPr>
               <w:rFonts w:ascii="Cambria Math" w:eastAsiaTheme="minorEastAsia" w:hAnsi="Cambria Math"/>
             </w:rPr>
-            <m:t xml:space="preserve">=heatPort.Q_flow  </m:t>
+            <m:t>=heatPor</m:t>
+          </m:r>
+          <m:r>
+            <w:rPr>
+              <w:rFonts w:ascii="Cambria Math" w:eastAsiaTheme="minorEastAsia" w:hAnsi="Cambria Math"/>
+            </w:rPr>
+            <m:t xml:space="preserve">t.Q_flow  </m:t>
           </m:r>
         </m:oMath>
       </m:oMathPara>
@@ -12497,12 +12699,11 @@
       <w:pPr>
         <w:pStyle w:val="Titre2"/>
       </w:pPr>
-      <w:bookmarkStart w:id="30" w:name="_Toc38312658"/>
+      <w:bookmarkStart w:id="31" w:name="_Toc38635984"/>
       <w:r>
-        <w:lastRenderedPageBreak/>
         <w:t>Functions</w:t>
       </w:r>
-      <w:bookmarkEnd w:id="30"/>
+      <w:bookmarkEnd w:id="31"/>
     </w:p>
     <w:p>
       <w:pPr>
@@ -12518,14 +12719,14 @@
           <w:rFonts w:eastAsiaTheme="minorEastAsia"/>
         </w:rPr>
       </w:pPr>
-      <w:bookmarkStart w:id="31" w:name="_Toc38312659"/>
+      <w:bookmarkStart w:id="32" w:name="_Toc38635985"/>
       <w:r>
         <w:rPr>
           <w:rFonts w:eastAsiaTheme="minorEastAsia"/>
         </w:rPr>
         <w:t>rootsPolyorder3</w:t>
       </w:r>
-      <w:bookmarkEnd w:id="31"/>
+      <w:bookmarkEnd w:id="32"/>
     </w:p>
     <w:p/>
     <w:p>
@@ -12959,13 +13160,7 @@
                     <w:rPr>
                       <w:rFonts w:ascii="Cambria Math" w:eastAsiaTheme="minorEastAsia" w:hAnsi="Cambria Math"/>
                     </w:rPr>
-                    <m:t>-q</m:t>
-                  </m:r>
-                  <m:r>
-                    <w:rPr>
-                      <w:rFonts w:ascii="Cambria Math" w:eastAsiaTheme="minorEastAsia" w:hAnsi="Cambria Math"/>
-                    </w:rPr>
-                    <m:t>-</m:t>
+                    <m:t>-q-</m:t>
                   </m:r>
                   <m:rad>
                     <m:radPr>
@@ -13071,13 +13266,7 @@
         <w:rPr>
           <w:rFonts w:eastAsiaTheme="minorEastAsia"/>
         </w:rPr>
-        <w:t>Si discriminant &gt;</w:t>
-      </w:r>
-      <w:r>
-        <w:rPr>
-          <w:rFonts w:eastAsiaTheme="minorEastAsia"/>
-        </w:rPr>
-        <w:t xml:space="preserve"> 0</w:t>
+        <w:t>Si discriminant &gt; 0</w:t>
       </w:r>
     </w:p>
     <w:p>
@@ -13093,13 +13282,7 @@
             <w:rPr>
               <w:rFonts w:ascii="Cambria Math" w:eastAsiaTheme="minorEastAsia" w:hAnsi="Cambria Math"/>
             </w:rPr>
-            <m:t>x1=</m:t>
-          </m:r>
-          <m:r>
-            <w:rPr>
-              <w:rFonts w:ascii="Cambria Math" w:eastAsiaTheme="minorEastAsia" w:hAnsi="Cambria Math"/>
-            </w:rPr>
-            <m:t>2×</m:t>
+            <m:t>x1=2×</m:t>
           </m:r>
           <m:rad>
             <m:radPr>
@@ -13383,19 +13566,7 @@
             <w:rPr>
               <w:rFonts w:ascii="Cambria Math" w:eastAsiaTheme="minorEastAsia" w:hAnsi="Cambria Math"/>
             </w:rPr>
-            <m:t>x</m:t>
-          </m:r>
-          <m:r>
-            <w:rPr>
-              <w:rFonts w:ascii="Cambria Math" w:eastAsiaTheme="minorEastAsia" w:hAnsi="Cambria Math"/>
-            </w:rPr>
-            <m:t>2</m:t>
-          </m:r>
-          <m:r>
-            <w:rPr>
-              <w:rFonts w:ascii="Cambria Math" w:eastAsiaTheme="minorEastAsia" w:hAnsi="Cambria Math"/>
-            </w:rPr>
-            <m:t>=2×</m:t>
+            <m:t>x2=2×</m:t>
           </m:r>
           <m:rad>
             <m:radPr>
@@ -13685,19 +13856,8 @@
             <w:rPr>
               <w:rFonts w:ascii="Cambria Math" w:eastAsiaTheme="minorEastAsia" w:hAnsi="Cambria Math"/>
             </w:rPr>
-            <m:t>x</m:t>
-          </m:r>
-          <m:r>
-            <w:rPr>
-              <w:rFonts w:ascii="Cambria Math" w:eastAsiaTheme="minorEastAsia" w:hAnsi="Cambria Math"/>
-            </w:rPr>
-            <m:t>3</m:t>
-          </m:r>
-          <m:r>
-            <w:rPr>
-              <w:rFonts w:ascii="Cambria Math" w:eastAsiaTheme="minorEastAsia" w:hAnsi="Cambria Math"/>
-            </w:rPr>
-            <m:t>=2×</m:t>
+            <w:lastRenderedPageBreak/>
+            <m:t>x3=2×</m:t>
           </m:r>
           <m:rad>
             <m:radPr>
@@ -13923,13 +14083,7 @@
                         <w:rPr>
                           <w:rFonts w:ascii="Cambria Math" w:eastAsiaTheme="minorEastAsia" w:hAnsi="Cambria Math"/>
                         </w:rPr>
-                        <m:t>-</m:t>
-                      </m:r>
-                      <m:r>
-                        <w:rPr>
-                          <w:rFonts w:ascii="Cambria Math" w:eastAsiaTheme="minorEastAsia" w:hAnsi="Cambria Math"/>
-                        </w:rPr>
-                        <m:t>2π</m:t>
+                        <m:t>-2π</m:t>
                       </m:r>
                     </m:num>
                     <m:den>
@@ -14033,13 +14187,7 @@
             <w:rPr>
               <w:rFonts w:ascii="Cambria Math" w:eastAsiaTheme="minorEastAsia" w:hAnsi="Cambria Math"/>
             </w:rPr>
-            <m:t xml:space="preserve">  →  </m:t>
-          </m:r>
-          <m:r>
-            <w:rPr>
-              <w:rFonts w:ascii="Cambria Math" w:eastAsiaTheme="minorEastAsia" w:hAnsi="Cambria Math"/>
-            </w:rPr>
-            <m:t>P</m:t>
+            <m:t xml:space="preserve">  →  P</m:t>
           </m:r>
           <m:d>
             <m:dPr>
@@ -14113,13 +14261,7 @@
             <w:rPr>
               <w:rFonts w:ascii="Cambria Math" w:eastAsiaTheme="minorEastAsia" w:hAnsi="Cambria Math"/>
             </w:rPr>
-            <m:t>p</m:t>
-          </m:r>
-          <m:r>
-            <w:rPr>
-              <w:rFonts w:ascii="Cambria Math" w:eastAsiaTheme="minorEastAsia" w:hAnsi="Cambria Math"/>
-            </w:rPr>
-            <m:t xml:space="preserve">= </m:t>
+            <m:t xml:space="preserve">p= </m:t>
           </m:r>
           <m:f>
             <m:fPr>
@@ -14203,13 +14345,7 @@
             <w:rPr>
               <w:rFonts w:ascii="Cambria Math" w:eastAsiaTheme="minorEastAsia" w:hAnsi="Cambria Math"/>
             </w:rPr>
-            <m:t xml:space="preserve">; </m:t>
-          </m:r>
-          <m:r>
-            <w:rPr>
-              <w:rFonts w:ascii="Cambria Math" w:eastAsiaTheme="minorEastAsia" w:hAnsi="Cambria Math"/>
-            </w:rPr>
-            <m:t>q=</m:t>
+            <m:t>; q=</m:t>
           </m:r>
           <m:f>
             <m:fPr>
@@ -14349,13 +14485,7 @@
         <w:rPr>
           <w:rFonts w:eastAsiaTheme="minorEastAsia"/>
         </w:rPr>
-        <w:t xml:space="preserve"> </w:t>
-      </w:r>
-      <w:r>
-        <w:rPr>
-          <w:rFonts w:eastAsiaTheme="minorEastAsia"/>
-        </w:rPr>
-        <w:t>2</w:t>
+        <w:t xml:space="preserve"> 2</w:t>
       </w:r>
       <w:r>
         <w:rPr>
@@ -14455,7 +14585,6 @@
         <w:rPr>
           <w:rFonts w:eastAsiaTheme="minorEastAsia"/>
         </w:rPr>
-        <w:lastRenderedPageBreak/>
         <w:t>Si discriminant = 0</w:t>
       </w:r>
     </w:p>
@@ -14513,13 +14642,7 @@
         <w:rPr>
           <w:rFonts w:eastAsiaTheme="minorEastAsia"/>
         </w:rPr>
-        <w:t>Si discriminant &gt;</w:t>
-      </w:r>
-      <w:r>
-        <w:rPr>
-          <w:rFonts w:eastAsiaTheme="minorEastAsia"/>
-        </w:rPr>
-        <w:t xml:space="preserve"> 0</w:t>
+        <w:t>Si discriminant &gt; 0</w:t>
       </w:r>
     </w:p>
     <w:p>
@@ -14648,15 +14771,7 @@
         <w:rPr>
           <w:rFonts w:eastAsiaTheme="minorEastAsia"/>
         </w:rPr>
-        <w:t>Solu</w:t>
-      </w:r>
-      <w:bookmarkStart w:id="32" w:name="_GoBack"/>
-      <w:bookmarkEnd w:id="32"/>
-      <w:r>
-        <w:rPr>
-          <w:rFonts w:eastAsiaTheme="minorEastAsia"/>
-        </w:rPr>
-        <w:t>tion 1er degree</w:t>
+        <w:t>Solution 1er degree</w:t>
       </w:r>
     </w:p>
     <w:p>
@@ -14708,6 +14823,20 @@
           <w:rFonts w:eastAsiaTheme="minorEastAsia"/>
         </w:rPr>
       </w:pPr>
+    </w:p>
+    <w:p>
+      <w:pPr>
+        <w:rPr>
+          <w:rFonts w:eastAsiaTheme="minorEastAsia"/>
+        </w:rPr>
+      </w:pPr>
+    </w:p>
+    <w:p>
+      <w:pPr>
+        <w:rPr>
+          <w:rFonts w:eastAsiaTheme="minorEastAsia"/>
+        </w:rPr>
+      </w:pPr>
       <w:r>
         <w:rPr>
           <w:rFonts w:eastAsiaTheme="minorEastAsia"/>
@@ -14723,7 +14852,7 @@
           <w:lang w:val="fr-FR"/>
         </w:rPr>
       </w:pPr>
-      <w:bookmarkStart w:id="33" w:name="_Toc38312660"/>
+      <w:bookmarkStart w:id="33" w:name="_Toc38635986"/>
       <w:r>
         <w:rPr>
           <w:rFonts w:eastAsiaTheme="minorEastAsia"/>
@@ -14748,7 +14877,7 @@
           <w:lang w:val="fr-FR"/>
         </w:rPr>
       </w:pPr>
-      <w:bookmarkStart w:id="34" w:name="_Toc38312661"/>
+      <w:bookmarkStart w:id="34" w:name="_Toc38635987"/>
       <w:proofErr w:type="spellStart"/>
       <w:r>
         <w:rPr>
@@ -14763,7 +14892,7 @@
       <w:pPr>
         <w:pStyle w:val="Titre3"/>
       </w:pPr>
-      <w:bookmarkStart w:id="35" w:name="_Toc38312662"/>
+      <w:bookmarkStart w:id="35" w:name="_Toc38635988"/>
       <w:r>
         <w:t>Second order central</w:t>
       </w:r>
@@ -19167,7 +19296,7 @@
   <a:extraClrSchemeLst/>
   <a:extLst>
     <a:ext uri="{05A4C25C-085E-4340-85A3-A5531E510DB2}">
-      <thm15:themeFamily xmlns:thm15="http://schemas.microsoft.com/office/thememl/2012/main" xmlns="" name="Office Theme" id="{62F939B6-93AF-4DB8-9C6B-D6C7DFDC589F}" vid="{4A3C46E8-61CC-4603-A589-7422A47A8E4A}"/>
+      <thm15:themeFamily xmlns="" xmlns:thm15="http://schemas.microsoft.com/office/thememl/2012/main" name="Office Theme" id="{62F939B6-93AF-4DB8-9C6B-D6C7DFDC589F}" vid="{4A3C46E8-61CC-4603-A589-7422A47A8E4A}"/>
     </a:ext>
   </a:extLst>
 </a:theme>
@@ -19178,7 +19307,7 @@
 </file>
 
 <file path=customXml/itemProps1.xml><?xml version="1.0" encoding="utf-8"?>
-<ds:datastoreItem xmlns:ds="http://schemas.openxmlformats.org/officeDocument/2006/customXml" ds:itemID="{E1A2E592-0450-46B1-ADAA-AD66C8B110F2}">
+<ds:datastoreItem xmlns:ds="http://schemas.openxmlformats.org/officeDocument/2006/customXml" ds:itemID="{9D2151EE-F462-45DE-B79D-63C53BE325C7}">
   <ds:schemaRefs>
     <ds:schemaRef ds:uri="http://schemas.openxmlformats.org/officeDocument/2006/bibliography"/>
   </ds:schemaRefs>

</xml_diff>

<commit_message>
Additions of the staticPipe module and its test in the Pipes subpackage
</commit_message>
<xml_diff>
--- a/Information/script for equations.docx
+++ b/Information/script for equations.docx
@@ -19,7 +19,6 @@
           <w:docPartUnique/>
         </w:docPartObj>
       </w:sdtPr>
-      <w:sdtEndPr/>
       <w:sdtContent>
         <w:p>
           <w:pPr>
@@ -2759,21 +2758,7 @@
                 <w:rStyle w:val="Lienhypertexte"/>
                 <w:noProof/>
               </w:rPr>
-              <w:t>rootsP</w:t>
-            </w:r>
-            <w:r>
-              <w:rPr>
-                <w:rStyle w:val="Lienhypertexte"/>
-                <w:noProof/>
-              </w:rPr>
-              <w:t>o</w:t>
-            </w:r>
-            <w:r>
-              <w:rPr>
-                <w:rStyle w:val="Lienhypertexte"/>
-                <w:noProof/>
-              </w:rPr>
-              <w:t>lyorder3</w:t>
+              <w:t>rootsPolyorder3</w:t>
             </w:r>
             <w:r>
               <w:rPr>
@@ -3577,13 +3562,7 @@
             <w:rPr>
               <w:rFonts w:ascii="Cambria Math" w:hAnsi="Cambria Math"/>
             </w:rPr>
-            <m:t>po</m:t>
-          </m:r>
-          <m:r>
-            <w:rPr>
-              <w:rFonts w:ascii="Cambria Math" w:hAnsi="Cambria Math"/>
-            </w:rPr>
-            <m:t>rt_b.Q_flow=m_flow×cp</m:t>
+            <m:t>port_b.Q_flow=m_flow×cp</m:t>
           </m:r>
           <m:d>
             <m:dPr>
@@ -6051,13 +6030,7 @@
                     <w:rPr>
                       <w:rFonts w:ascii="Cambria Math" w:eastAsiaTheme="minorEastAsia" w:hAnsi="Cambria Math"/>
                     </w:rPr>
-                    <m:t>Q_f</m:t>
-                  </m:r>
-                  <m:r>
-                    <w:rPr>
-                      <w:rFonts w:ascii="Cambria Math" w:eastAsiaTheme="minorEastAsia" w:hAnsi="Cambria Math"/>
-                    </w:rPr>
-                    <m:t>low</m:t>
+                    <m:t>Q_flow</m:t>
                   </m:r>
                 </m:e>
               </m:nary>
@@ -8420,7 +8393,13 @@
             <w:rPr>
               <w:rFonts w:ascii="Cambria Math" w:eastAsiaTheme="minorEastAsia" w:hAnsi="Cambria Math"/>
             </w:rPr>
-            <m:t>dx= Biot×</m:t>
+            <m:t>dx= B</m:t>
+          </m:r>
+          <m:r>
+            <w:rPr>
+              <w:rFonts w:ascii="Cambria Math" w:eastAsiaTheme="minorEastAsia" w:hAnsi="Cambria Math"/>
+            </w:rPr>
+            <m:t>iot×</m:t>
           </m:r>
           <m:f>
             <m:fPr>
@@ -9461,13 +9440,7 @@
             <w:rPr>
               <w:rFonts w:ascii="Cambria Math" w:eastAsiaTheme="minorEastAsia" w:hAnsi="Cambria Math"/>
             </w:rPr>
-            <m:t xml:space="preserve"> for i from n+2 t</m:t>
-          </m:r>
-          <m:r>
-            <w:rPr>
-              <w:rFonts w:ascii="Cambria Math" w:eastAsiaTheme="minorEastAsia" w:hAnsi="Cambria Math"/>
-            </w:rPr>
-            <m:t>o N</m:t>
+            <m:t xml:space="preserve"> for i from n+2 to N</m:t>
           </m:r>
         </m:oMath>
       </m:oMathPara>
@@ -10197,8 +10170,6 @@
         </w:rPr>
         <w:t>PartialPump</w:t>
       </w:r>
-      <w:bookmarkStart w:id="24" w:name="_GoBack"/>
-      <w:bookmarkEnd w:id="24"/>
       <w:proofErr w:type="spellEnd"/>
     </w:p>
     <w:p>
@@ -10220,13 +10191,7 @@
             <w:rPr>
               <w:rFonts w:ascii="Cambria Math" w:hAnsi="Cambria Math"/>
             </w:rPr>
-            <m:t>V</m:t>
-          </m:r>
-          <m:r>
-            <w:rPr>
-              <w:rFonts w:ascii="Cambria Math" w:hAnsi="Cambria Math"/>
-            </w:rPr>
-            <m:t>_flow</m:t>
+            <m:t>V_flow</m:t>
           </m:r>
           <m:r>
             <m:rPr>
@@ -10369,7 +10334,7 @@
           <w:lang w:val="fr-FR"/>
         </w:rPr>
       </w:pPr>
-      <w:bookmarkStart w:id="25" w:name="_Toc38635978"/>
+      <w:bookmarkStart w:id="24" w:name="_Toc38635978"/>
       <w:proofErr w:type="spellStart"/>
       <w:r>
         <w:rPr>
@@ -10377,7 +10342,7 @@
         </w:rPr>
         <w:t>BasesClasses</w:t>
       </w:r>
-      <w:bookmarkEnd w:id="25"/>
+      <w:bookmarkEnd w:id="24"/>
       <w:proofErr w:type="spellEnd"/>
     </w:p>
     <w:p>
@@ -10394,7 +10359,7 @@
           <w:rFonts w:eastAsiaTheme="minorEastAsia"/>
         </w:rPr>
       </w:pPr>
-      <w:bookmarkStart w:id="26" w:name="_Toc38635979"/>
+      <w:bookmarkStart w:id="25" w:name="_Toc38635979"/>
       <w:proofErr w:type="spellStart"/>
       <w:r>
         <w:rPr>
@@ -10402,7 +10367,7 @@
         </w:rPr>
         <w:t>AeraulicConvection</w:t>
       </w:r>
-      <w:bookmarkEnd w:id="26"/>
+      <w:bookmarkEnd w:id="25"/>
       <w:proofErr w:type="spellEnd"/>
     </w:p>
     <w:p/>
@@ -10656,7 +10621,7 @@
           <w:rFonts w:eastAsiaTheme="minorEastAsia"/>
         </w:rPr>
       </w:pPr>
-      <w:bookmarkStart w:id="27" w:name="_Toc38635980"/>
+      <w:bookmarkStart w:id="26" w:name="_Toc38635980"/>
       <w:r>
         <w:rPr>
           <w:rFonts w:eastAsiaTheme="minorEastAsia"/>
@@ -10669,7 +10634,7 @@
         </w:rPr>
         <w:t>densation</w:t>
       </w:r>
-      <w:bookmarkEnd w:id="27"/>
+      <w:bookmarkEnd w:id="26"/>
     </w:p>
     <w:p/>
     <w:p>
@@ -10703,7 +10668,13 @@
                 <w:rPr>
                   <w:rFonts w:ascii="Cambria Math" w:hAnsi="Cambria Math"/>
                 </w:rPr>
-                <m:t>moved by convection</m:t>
+                <m:t>mo</m:t>
+              </m:r>
+              <m:r>
+                <w:rPr>
+                  <w:rFonts w:ascii="Cambria Math" w:hAnsi="Cambria Math"/>
+                </w:rPr>
+                <m:t>ved by convection</m:t>
               </m:r>
             </m:sub>
           </m:sSub>
@@ -10877,7 +10848,7 @@
           <w:rFonts w:eastAsiaTheme="minorEastAsia"/>
         </w:rPr>
       </w:pPr>
-      <w:bookmarkStart w:id="28" w:name="_Toc38635981"/>
+      <w:bookmarkStart w:id="27" w:name="_Toc38635981"/>
       <w:proofErr w:type="spellStart"/>
       <w:r>
         <w:rPr>
@@ -10885,7 +10856,7 @@
         </w:rPr>
         <w:t>MolecularDiffusion</w:t>
       </w:r>
-      <w:bookmarkEnd w:id="28"/>
+      <w:bookmarkEnd w:id="27"/>
       <w:proofErr w:type="spellEnd"/>
     </w:p>
     <w:p/>
@@ -11157,7 +11128,7 @@
           <w:rFonts w:eastAsiaTheme="minorEastAsia"/>
         </w:rPr>
       </w:pPr>
-      <w:bookmarkStart w:id="29" w:name="_Toc38635982"/>
+      <w:bookmarkStart w:id="28" w:name="_Toc38635982"/>
       <w:proofErr w:type="spellStart"/>
       <w:r>
         <w:rPr>
@@ -11165,7 +11136,7 @@
         </w:rPr>
         <w:t>GasNode</w:t>
       </w:r>
-      <w:bookmarkEnd w:id="29"/>
+      <w:bookmarkEnd w:id="28"/>
       <w:proofErr w:type="spellEnd"/>
     </w:p>
     <w:p/>
@@ -11373,12 +11344,12 @@
       <w:pPr>
         <w:pStyle w:val="Titre3"/>
       </w:pPr>
-      <w:bookmarkStart w:id="30" w:name="_Toc38635983"/>
+      <w:bookmarkStart w:id="29" w:name="_Toc38635983"/>
       <w:proofErr w:type="spellStart"/>
       <w:r>
         <w:t>FogModel</w:t>
       </w:r>
-      <w:bookmarkEnd w:id="30"/>
+      <w:bookmarkEnd w:id="29"/>
       <w:proofErr w:type="spellEnd"/>
     </w:p>
     <w:p/>
@@ -12590,13 +12561,7 @@
             <w:rPr>
               <w:rFonts w:ascii="Cambria Math" w:eastAsiaTheme="minorEastAsia" w:hAnsi="Cambria Math"/>
             </w:rPr>
-            <m:t>=heatPor</m:t>
-          </m:r>
-          <m:r>
-            <w:rPr>
-              <w:rFonts w:ascii="Cambria Math" w:eastAsiaTheme="minorEastAsia" w:hAnsi="Cambria Math"/>
-            </w:rPr>
-            <m:t xml:space="preserve">t.Q_flow  </m:t>
+            <m:t xml:space="preserve">=heatPort.Q_flow  </m:t>
           </m:r>
         </m:oMath>
       </m:oMathPara>
@@ -12699,11 +12664,11 @@
       <w:pPr>
         <w:pStyle w:val="Titre2"/>
       </w:pPr>
-      <w:bookmarkStart w:id="31" w:name="_Toc38635984"/>
+      <w:bookmarkStart w:id="30" w:name="_Toc38635984"/>
       <w:r>
         <w:t>Functions</w:t>
       </w:r>
-      <w:bookmarkEnd w:id="31"/>
+      <w:bookmarkEnd w:id="30"/>
     </w:p>
     <w:p>
       <w:pPr>
@@ -12719,14 +12684,14 @@
           <w:rFonts w:eastAsiaTheme="minorEastAsia"/>
         </w:rPr>
       </w:pPr>
-      <w:bookmarkStart w:id="32" w:name="_Toc38635985"/>
+      <w:bookmarkStart w:id="31" w:name="_Toc38635985"/>
       <w:r>
         <w:rPr>
           <w:rFonts w:eastAsiaTheme="minorEastAsia"/>
         </w:rPr>
         <w:t>rootsPolyorder3</w:t>
       </w:r>
-      <w:bookmarkEnd w:id="32"/>
+      <w:bookmarkEnd w:id="31"/>
     </w:p>
     <w:p/>
     <w:p>
@@ -14826,10 +14791,173 @@
     </w:p>
     <w:p>
       <w:pPr>
-        <w:rPr>
-          <w:rFonts w:eastAsiaTheme="minorEastAsia"/>
-        </w:rPr>
-      </w:pPr>
+        <w:pStyle w:val="Titre2"/>
+        <w:numPr>
+          <w:ilvl w:val="1"/>
+          <w:numId w:val="10"/>
+        </w:numPr>
+      </w:pPr>
+      <w:r>
+        <w:t>Components</w:t>
+      </w:r>
+    </w:p>
+    <w:p>
+      <w:pPr>
+        <w:rPr>
+          <w:lang w:val="fr-FR"/>
+        </w:rPr>
+      </w:pPr>
+    </w:p>
+    <w:p>
+      <w:pPr>
+        <w:pStyle w:val="Titre3"/>
+        <w:rPr>
+          <w:rFonts w:eastAsiaTheme="minorEastAsia"/>
+        </w:rPr>
+      </w:pPr>
+      <w:proofErr w:type="spellStart"/>
+      <w:r>
+        <w:rPr>
+          <w:rFonts w:eastAsiaTheme="minorEastAsia"/>
+        </w:rPr>
+        <w:t>StaticPipe</w:t>
+      </w:r>
+      <w:proofErr w:type="spellEnd"/>
+    </w:p>
+    <w:p/>
+    <w:p>
+      <w:pPr>
+        <w:ind w:left="-567" w:right="-567"/>
+        <w:rPr>
+          <w:rFonts w:eastAsiaTheme="minorEastAsia"/>
+        </w:rPr>
+      </w:pPr>
+      <m:oMathPara>
+        <m:oMath>
+          <m:r>
+            <w:rPr>
+              <w:rFonts w:ascii="Cambria Math" w:eastAsiaTheme="minorEastAsia" w:hAnsi="Cambria Math"/>
+            </w:rPr>
+            <m:t>dp=</m:t>
+          </m:r>
+          <m:f>
+            <m:fPr>
+              <m:ctrlPr>
+                <w:rPr>
+                  <w:rFonts w:ascii="Cambria Math" w:eastAsiaTheme="minorEastAsia" w:hAnsi="Cambria Math"/>
+                  <w:i/>
+                </w:rPr>
+              </m:ctrlPr>
+            </m:fPr>
+            <m:num>
+              <m:r>
+                <w:rPr>
+                  <w:rFonts w:ascii="Cambria Math" w:eastAsiaTheme="minorEastAsia" w:hAnsi="Cambria Math"/>
+                </w:rPr>
+                <m:t>1</m:t>
+              </m:r>
+            </m:num>
+            <m:den>
+              <m:r>
+                <w:rPr>
+                  <w:rFonts w:ascii="Cambria Math" w:eastAsiaTheme="minorEastAsia" w:hAnsi="Cambria Math"/>
+                </w:rPr>
+                <m:t>2</m:t>
+              </m:r>
+            </m:den>
+          </m:f>
+          <m:r>
+            <w:rPr>
+              <w:rFonts w:ascii="Cambria Math" w:eastAsiaTheme="minorEastAsia" w:hAnsi="Cambria Math"/>
+            </w:rPr>
+            <m:t>×ksi×d×</m:t>
+          </m:r>
+          <m:sSup>
+            <m:sSupPr>
+              <m:ctrlPr>
+                <w:rPr>
+                  <w:rFonts w:ascii="Cambria Math" w:eastAsiaTheme="minorEastAsia" w:hAnsi="Cambria Math"/>
+                  <w:i/>
+                </w:rPr>
+              </m:ctrlPr>
+            </m:sSupPr>
+            <m:e>
+              <m:r>
+                <w:rPr>
+                  <w:rFonts w:ascii="Cambria Math" w:eastAsiaTheme="minorEastAsia" w:hAnsi="Cambria Math"/>
+                </w:rPr>
+                <m:t>Vel</m:t>
+              </m:r>
+            </m:e>
+            <m:sup>
+              <m:r>
+                <w:rPr>
+                  <w:rFonts w:ascii="Cambria Math" w:eastAsiaTheme="minorEastAsia" w:hAnsi="Cambria Math"/>
+                </w:rPr>
+                <m:t>2</m:t>
+              </m:r>
+            </m:sup>
+          </m:sSup>
+        </m:oMath>
+      </m:oMathPara>
+    </w:p>
+    <w:p>
+      <w:pPr>
+        <w:ind w:left="-567" w:right="-567"/>
+        <w:rPr>
+          <w:rFonts w:eastAsiaTheme="minorEastAsia"/>
+        </w:rPr>
+      </w:pPr>
+      <m:oMathPara>
+        <m:oMath>
+          <m:r>
+            <w:rPr>
+              <w:rFonts w:ascii="Cambria Math" w:eastAsiaTheme="minorEastAsia" w:hAnsi="Cambria Math"/>
+            </w:rPr>
+            <m:t>m_flow=d×A×Vel=A×</m:t>
+          </m:r>
+          <m:rad>
+            <m:radPr>
+              <m:degHide m:val="1"/>
+              <m:ctrlPr>
+                <w:rPr>
+                  <w:rFonts w:ascii="Cambria Math" w:eastAsiaTheme="minorEastAsia" w:hAnsi="Cambria Math"/>
+                  <w:i/>
+                </w:rPr>
+              </m:ctrlPr>
+            </m:radPr>
+            <m:deg/>
+            <m:e>
+              <m:f>
+                <m:fPr>
+                  <m:ctrlPr>
+                    <w:rPr>
+                      <w:rFonts w:ascii="Cambria Math" w:eastAsiaTheme="minorEastAsia" w:hAnsi="Cambria Math"/>
+                      <w:i/>
+                    </w:rPr>
+                  </m:ctrlPr>
+                </m:fPr>
+                <m:num>
+                  <m:r>
+                    <w:rPr>
+                      <w:rFonts w:ascii="Cambria Math" w:eastAsiaTheme="minorEastAsia" w:hAnsi="Cambria Math"/>
+                    </w:rPr>
+                    <m:t>2×dp×d</m:t>
+                  </m:r>
+                </m:num>
+                <m:den>
+                  <m:r>
+                    <w:rPr>
+                      <w:rFonts w:ascii="Cambria Math" w:eastAsiaTheme="minorEastAsia" w:hAnsi="Cambria Math"/>
+                    </w:rPr>
+                    <m:t>ksi</m:t>
+                  </m:r>
+                </m:den>
+              </m:f>
+            </m:e>
+          </m:rad>
+        </m:oMath>
+      </m:oMathPara>
     </w:p>
     <w:p>
       <w:pPr>
@@ -14846,6 +14974,15 @@
     </w:p>
     <w:p>
       <w:pPr>
+        <w:rPr>
+          <w:rFonts w:eastAsiaTheme="minorEastAsia"/>
+        </w:rPr>
+      </w:pPr>
+      <w:bookmarkStart w:id="32" w:name="_GoBack"/>
+      <w:bookmarkEnd w:id="32"/>
+    </w:p>
+    <w:p>
+      <w:pPr>
         <w:pStyle w:val="Titre1"/>
         <w:rPr>
           <w:rFonts w:eastAsiaTheme="minorEastAsia"/>
@@ -14858,7 +14995,6 @@
           <w:rFonts w:eastAsiaTheme="minorEastAsia"/>
           <w:lang w:val="fr-FR"/>
         </w:rPr>
-        <w:lastRenderedPageBreak/>
         <w:t>PDE</w:t>
       </w:r>
       <w:bookmarkEnd w:id="33"/>
@@ -17675,6 +17811,36 @@
     </w:lvlOverride>
   </w:num>
   <w:num w:numId="9">
+    <w:abstractNumId w:val="1"/>
+    <w:lvlOverride w:ilvl="0">
+      <w:startOverride w:val="1"/>
+    </w:lvlOverride>
+    <w:lvlOverride w:ilvl="1">
+      <w:startOverride w:val="1"/>
+    </w:lvlOverride>
+    <w:lvlOverride w:ilvl="2">
+      <w:startOverride w:val="1"/>
+    </w:lvlOverride>
+    <w:lvlOverride w:ilvl="3">
+      <w:startOverride w:val="1"/>
+    </w:lvlOverride>
+    <w:lvlOverride w:ilvl="4">
+      <w:startOverride w:val="1"/>
+    </w:lvlOverride>
+    <w:lvlOverride w:ilvl="5">
+      <w:startOverride w:val="1"/>
+    </w:lvlOverride>
+    <w:lvlOverride w:ilvl="6">
+      <w:startOverride w:val="1"/>
+    </w:lvlOverride>
+    <w:lvlOverride w:ilvl="7">
+      <w:startOverride w:val="1"/>
+    </w:lvlOverride>
+    <w:lvlOverride w:ilvl="8">
+      <w:startOverride w:val="1"/>
+    </w:lvlOverride>
+  </w:num>
+  <w:num w:numId="10">
     <w:abstractNumId w:val="1"/>
     <w:lvlOverride w:ilvl="0">
       <w:startOverride w:val="1"/>
@@ -19041,6 +19207,501 @@
 </w:styles>
 </file>
 
+<file path=word/glossary/document.xml><?xml version="1.0" encoding="utf-8"?>
+<w:glossaryDocument xmlns:wpc="http://schemas.microsoft.com/office/word/2010/wordprocessingCanvas" xmlns:mc="http://schemas.openxmlformats.org/markup-compatibility/2006" xmlns:o="urn:schemas-microsoft-com:office:office" xmlns:r="http://schemas.openxmlformats.org/officeDocument/2006/relationships" xmlns:m="http://schemas.openxmlformats.org/officeDocument/2006/math" xmlns:v="urn:schemas-microsoft-com:vml" xmlns:wp14="http://schemas.microsoft.com/office/word/2010/wordprocessingDrawing" xmlns:wp="http://schemas.openxmlformats.org/drawingml/2006/wordprocessingDrawing" xmlns:w10="urn:schemas-microsoft-com:office:word" xmlns:w="http://schemas.openxmlformats.org/wordprocessingml/2006/main" xmlns:w14="http://schemas.microsoft.com/office/word/2010/wordml" xmlns:wpg="http://schemas.microsoft.com/office/word/2010/wordprocessingGroup" xmlns:wpi="http://schemas.microsoft.com/office/word/2010/wordprocessingInk" xmlns:wne="http://schemas.microsoft.com/office/word/2006/wordml" xmlns:wps="http://schemas.microsoft.com/office/word/2010/wordprocessingShape" mc:Ignorable="w14 wp14"/>
+</file>
+
+<file path=word/glossary/fontTable.xml><?xml version="1.0" encoding="utf-8"?>
+<w:fonts xmlns:mc="http://schemas.openxmlformats.org/markup-compatibility/2006" xmlns:r="http://schemas.openxmlformats.org/officeDocument/2006/relationships" xmlns:w="http://schemas.openxmlformats.org/wordprocessingml/2006/main" xmlns:w14="http://schemas.microsoft.com/office/word/2010/wordml" mc:Ignorable="w14">
+  <w:font w:name="Calibri">
+    <w:panose1 w:val="020F0502020204030204"/>
+    <w:charset w:val="00"/>
+    <w:family w:val="swiss"/>
+    <w:pitch w:val="variable"/>
+    <w:sig w:usb0="E0002AFF" w:usb1="C000247B" w:usb2="00000009" w:usb3="00000000" w:csb0="000001FF" w:csb1="00000000"/>
+  </w:font>
+  <w:font w:name="Times New Roman">
+    <w:panose1 w:val="02020603050405020304"/>
+    <w:charset w:val="00"/>
+    <w:family w:val="roman"/>
+    <w:pitch w:val="variable"/>
+    <w:sig w:usb0="E0002EFF" w:usb1="C000785B" w:usb2="00000009" w:usb3="00000000" w:csb0="000001FF" w:csb1="00000000"/>
+  </w:font>
+  <w:font w:name="Calibri Light">
+    <w:panose1 w:val="020F0302020204030204"/>
+    <w:charset w:val="00"/>
+    <w:family w:val="swiss"/>
+    <w:pitch w:val="variable"/>
+    <w:sig w:usb0="E0002AFF" w:usb1="C000247B" w:usb2="00000009" w:usb3="00000000" w:csb0="000001FF" w:csb1="00000000"/>
+  </w:font>
+  <w:font w:name="Tahoma">
+    <w:panose1 w:val="020B0604030504040204"/>
+    <w:charset w:val="00"/>
+    <w:family w:val="swiss"/>
+    <w:pitch w:val="variable"/>
+    <w:sig w:usb0="E1002EFF" w:usb1="C000605B" w:usb2="00000029" w:usb3="00000000" w:csb0="000101FF" w:csb1="00000000"/>
+  </w:font>
+  <w:font w:name="Cambria Math">
+    <w:panose1 w:val="02040503050406030204"/>
+    <w:charset w:val="00"/>
+    <w:family w:val="roman"/>
+    <w:pitch w:val="variable"/>
+    <w:sig w:usb0="E00006FF" w:usb1="420024FF" w:usb2="02000000" w:usb3="00000000" w:csb0="0000019F" w:csb1="00000000"/>
+  </w:font>
+  <w:font w:name="Cambria">
+    <w:panose1 w:val="02040503050406030204"/>
+    <w:charset w:val="00"/>
+    <w:family w:val="roman"/>
+    <w:pitch w:val="variable"/>
+    <w:sig w:usb0="E00006FF" w:usb1="420024FF" w:usb2="02000000" w:usb3="00000000" w:csb0="0000019F" w:csb1="00000000"/>
+  </w:font>
+</w:fonts>
+</file>
+
+<file path=word/glossary/settings.xml><?xml version="1.0" encoding="utf-8"?>
+<w:settings xmlns:mc="http://schemas.openxmlformats.org/markup-compatibility/2006" xmlns:o="urn:schemas-microsoft-com:office:office" xmlns:r="http://schemas.openxmlformats.org/officeDocument/2006/relationships" xmlns:m="http://schemas.openxmlformats.org/officeDocument/2006/math" xmlns:v="urn:schemas-microsoft-com:vml" xmlns:w10="urn:schemas-microsoft-com:office:word" xmlns:w="http://schemas.openxmlformats.org/wordprocessingml/2006/main" xmlns:w14="http://schemas.microsoft.com/office/word/2010/wordml" xmlns:sl="http://schemas.openxmlformats.org/schemaLibrary/2006/main" mc:Ignorable="w14">
+  <w:view w:val="normal"/>
+  <w:defaultTabStop w:val="720"/>
+  <w:characterSpacingControl w:val="doNotCompress"/>
+  <w:compat>
+    <w:useFELayout/>
+    <w:compatSetting w:name="compatibilityMode" w:uri="http://schemas.microsoft.com/office/word" w:val="14"/>
+    <w:compatSetting w:name="overrideTableStyleFontSizeAndJustification" w:uri="http://schemas.microsoft.com/office/word" w:val="1"/>
+    <w:compatSetting w:name="enableOpenTypeFeatures" w:uri="http://schemas.microsoft.com/office/word" w:val="1"/>
+    <w:compatSetting w:name="doNotFlipMirrorIndents" w:uri="http://schemas.microsoft.com/office/word" w:val="1"/>
+  </w:compat>
+  <w:rsids>
+    <w:rsidRoot w:val="00C657A8"/>
+    <w:rsid w:val="00C657A8"/>
+    <w:rsid w:val="00EE5494"/>
+  </w:rsids>
+  <m:mathPr>
+    <m:mathFont m:val="Cambria Math"/>
+    <m:brkBin m:val="before"/>
+    <m:brkBinSub m:val="--"/>
+    <m:smallFrac m:val="0"/>
+    <m:dispDef/>
+    <m:lMargin m:val="0"/>
+    <m:rMargin m:val="0"/>
+    <m:defJc m:val="centerGroup"/>
+    <m:wrapIndent m:val="1440"/>
+    <m:intLim m:val="subSup"/>
+    <m:naryLim m:val="undOvr"/>
+  </m:mathPr>
+  <w:themeFontLang w:val="en-GB"/>
+  <w:clrSchemeMapping w:bg1="light1" w:t1="dark1" w:bg2="light2" w:t2="dark2" w:accent1="accent1" w:accent2="accent2" w:accent3="accent3" w:accent4="accent4" w:accent5="accent5" w:accent6="accent6" w:hyperlink="hyperlink" w:followedHyperlink="followedHyperlink"/>
+  <w:decimalSymbol w:val=","/>
+  <w:listSeparator w:val=";"/>
+</w:settings>
+</file>
+
+<file path=word/glossary/styles.xml><?xml version="1.0" encoding="utf-8"?>
+<w:styles xmlns:mc="http://schemas.openxmlformats.org/markup-compatibility/2006" xmlns:r="http://schemas.openxmlformats.org/officeDocument/2006/relationships" xmlns:w="http://schemas.openxmlformats.org/wordprocessingml/2006/main" xmlns:w14="http://schemas.microsoft.com/office/word/2010/wordml" mc:Ignorable="w14">
+  <w:docDefaults>
+    <w:rPrDefault>
+      <w:rPr>
+        <w:rFonts w:asciiTheme="minorHAnsi" w:eastAsiaTheme="minorEastAsia" w:hAnsiTheme="minorHAnsi" w:cstheme="minorBidi"/>
+        <w:sz w:val="22"/>
+        <w:szCs w:val="22"/>
+        <w:lang w:val="en-GB" w:eastAsia="en-GB" w:bidi="ar-SA"/>
+      </w:rPr>
+    </w:rPrDefault>
+    <w:pPrDefault>
+      <w:pPr>
+        <w:spacing w:after="200" w:line="276" w:lineRule="auto"/>
+      </w:pPr>
+    </w:pPrDefault>
+  </w:docDefaults>
+  <w:latentStyles w:defLockedState="0" w:defUIPriority="99" w:defSemiHidden="1" w:defUnhideWhenUsed="1" w:defQFormat="0" w:count="267">
+    <w:lsdException w:name="Normal" w:semiHidden="0" w:uiPriority="0" w:unhideWhenUsed="0" w:qFormat="1"/>
+    <w:lsdException w:name="heading 1" w:semiHidden="0" w:uiPriority="9" w:unhideWhenUsed="0" w:qFormat="1"/>
+    <w:lsdException w:name="heading 2" w:uiPriority="9" w:qFormat="1"/>
+    <w:lsdException w:name="heading 3" w:uiPriority="9" w:qFormat="1"/>
+    <w:lsdException w:name="heading 4" w:uiPriority="9" w:qFormat="1"/>
+    <w:lsdException w:name="heading 5" w:uiPriority="9" w:qFormat="1"/>
+    <w:lsdException w:name="heading 6" w:uiPriority="9" w:qFormat="1"/>
+    <w:lsdException w:name="heading 7" w:uiPriority="9" w:qFormat="1"/>
+    <w:lsdException w:name="heading 8" w:uiPriority="9" w:qFormat="1"/>
+    <w:lsdException w:name="heading 9" w:uiPriority="9" w:qFormat="1"/>
+    <w:lsdException w:name="toc 1" w:uiPriority="39"/>
+    <w:lsdException w:name="toc 2" w:uiPriority="39"/>
+    <w:lsdException w:name="toc 3" w:uiPriority="39"/>
+    <w:lsdException w:name="toc 4" w:uiPriority="39"/>
+    <w:lsdException w:name="toc 5" w:uiPriority="39"/>
+    <w:lsdException w:name="toc 6" w:uiPriority="39"/>
+    <w:lsdException w:name="toc 7" w:uiPriority="39"/>
+    <w:lsdException w:name="toc 8" w:uiPriority="39"/>
+    <w:lsdException w:name="toc 9" w:uiPriority="39"/>
+    <w:lsdException w:name="caption" w:uiPriority="35" w:qFormat="1"/>
+    <w:lsdException w:name="Title" w:semiHidden="0" w:uiPriority="10" w:unhideWhenUsed="0" w:qFormat="1"/>
+    <w:lsdException w:name="Default Paragraph Font" w:uiPriority="1"/>
+    <w:lsdException w:name="Subtitle" w:semiHidden="0" w:uiPriority="11" w:unhideWhenUsed="0" w:qFormat="1"/>
+    <w:lsdException w:name="Strong" w:semiHidden="0" w:uiPriority="22" w:unhideWhenUsed="0" w:qFormat="1"/>
+    <w:lsdException w:name="Emphasis" w:semiHidden="0" w:uiPriority="20" w:unhideWhenUsed="0" w:qFormat="1"/>
+    <w:lsdException w:name="Table Grid" w:semiHidden="0" w:uiPriority="59" w:unhideWhenUsed="0"/>
+    <w:lsdException w:name="Placeholder Text" w:unhideWhenUsed="0"/>
+    <w:lsdException w:name="No Spacing" w:semiHidden="0" w:uiPriority="1" w:unhideWhenUsed="0" w:qFormat="1"/>
+    <w:lsdException w:name="Light Shading" w:semiHidden="0" w:uiPriority="60" w:unhideWhenUsed="0"/>
+    <w:lsdException w:name="Light List" w:semiHidden="0" w:uiPriority="61" w:unhideWhenUsed="0"/>
+    <w:lsdException w:name="Light Grid" w:semiHidden="0" w:uiPriority="62" w:unhideWhenUsed="0"/>
+    <w:lsdException w:name="Medium Shading 1" w:semiHidden="0" w:uiPriority="63" w:unhideWhenUsed="0"/>
+    <w:lsdException w:name="Medium Shading 2" w:semiHidden="0" w:uiPriority="64" w:unhideWhenUsed="0"/>
+    <w:lsdException w:name="Medium List 1" w:semiHidden="0" w:uiPriority="65" w:unhideWhenUsed="0"/>
+    <w:lsdException w:name="Medium List 2" w:semiHidden="0" w:uiPriority="66" w:unhideWhenUsed="0"/>
+    <w:lsdException w:name="Medium Grid 1" w:semiHidden="0" w:uiPriority="67" w:unhideWhenUsed="0"/>
+    <w:lsdException w:name="Medium Grid 2" w:semiHidden="0" w:uiPriority="68" w:unhideWhenUsed="0"/>
+    <w:lsdException w:name="Medium Grid 3" w:semiHidden="0" w:uiPriority="69" w:unhideWhenUsed="0"/>
+    <w:lsdException w:name="Dark List" w:semiHidden="0" w:uiPriority="70" w:unhideWhenUsed="0"/>
+    <w:lsdException w:name="Colorful Shading" w:semiHidden="0" w:uiPriority="71" w:unhideWhenUsed="0"/>
+    <w:lsdException w:name="Colorful List" w:semiHidden="0" w:uiPriority="72" w:unhideWhenUsed="0"/>
+    <w:lsdException w:name="Colorful Grid" w:semiHidden="0" w:uiPriority="73" w:unhideWhenUsed="0"/>
+    <w:lsdException w:name="Light Shading Accent 1" w:semiHidden="0" w:uiPriority="60" w:unhideWhenUsed="0"/>
+    <w:lsdException w:name="Light List Accent 1" w:semiHidden="0" w:uiPriority="61" w:unhideWhenUsed="0"/>
+    <w:lsdException w:name="Light Grid Accent 1" w:semiHidden="0" w:uiPriority="62" w:unhideWhenUsed="0"/>
+    <w:lsdException w:name="Medium Shading 1 Accent 1" w:semiHidden="0" w:uiPriority="63" w:unhideWhenUsed="0"/>
+    <w:lsdException w:name="Medium Shading 2 Accent 1" w:semiHidden="0" w:uiPriority="64" w:unhideWhenUsed="0"/>
+    <w:lsdException w:name="Medium List 1 Accent 1" w:semiHidden="0" w:uiPriority="65" w:unhideWhenUsed="0"/>
+    <w:lsdException w:name="Revision" w:unhideWhenUsed="0"/>
+    <w:lsdException w:name="List Paragraph" w:semiHidden="0" w:uiPriority="34" w:unhideWhenUsed="0" w:qFormat="1"/>
+    <w:lsdException w:name="Quote" w:semiHidden="0" w:uiPriority="29" w:unhideWhenUsed="0" w:qFormat="1"/>
+    <w:lsdException w:name="Intense Quote" w:semiHidden="0" w:uiPriority="30" w:unhideWhenUsed="0" w:qFormat="1"/>
+    <w:lsdException w:name="Medium List 2 Accent 1" w:semiHidden="0" w:uiPriority="66" w:unhideWhenUsed="0"/>
+    <w:lsdException w:name="Medium Grid 1 Accent 1" w:semiHidden="0" w:uiPriority="67" w:unhideWhenUsed="0"/>
+    <w:lsdException w:name="Medium Grid 2 Accent 1" w:semiHidden="0" w:uiPriority="68" w:unhideWhenUsed="0"/>
+    <w:lsdException w:name="Medium Grid 3 Accent 1" w:semiHidden="0" w:uiPriority="69" w:unhideWhenUsed="0"/>
+    <w:lsdException w:name="Dark List Accent 1" w:semiHidden="0" w:uiPriority="70" w:unhideWhenUsed="0"/>
+    <w:lsdException w:name="Colorful Shading Accent 1" w:semiHidden="0" w:uiPriority="71" w:unhideWhenUsed="0"/>
+    <w:lsdException w:name="Colorful List Accent 1" w:semiHidden="0" w:uiPriority="72" w:unhideWhenUsed="0"/>
+    <w:lsdException w:name="Colorful Grid Accent 1" w:semiHidden="0" w:uiPriority="73" w:unhideWhenUsed="0"/>
+    <w:lsdException w:name="Light Shading Accent 2" w:semiHidden="0" w:uiPriority="60" w:unhideWhenUsed="0"/>
+    <w:lsdException w:name="Light List Accent 2" w:semiHidden="0" w:uiPriority="61" w:unhideWhenUsed="0"/>
+    <w:lsdException w:name="Light Grid Accent 2" w:semiHidden="0" w:uiPriority="62" w:unhideWhenUsed="0"/>
+    <w:lsdException w:name="Medium Shading 1 Accent 2" w:semiHidden="0" w:uiPriority="63" w:unhideWhenUsed="0"/>
+    <w:lsdException w:name="Medium Shading 2 Accent 2" w:semiHidden="0" w:uiPriority="64" w:unhideWhenUsed="0"/>
+    <w:lsdException w:name="Medium List 1 Accent 2" w:semiHidden="0" w:uiPriority="65" w:unhideWhenUsed="0"/>
+    <w:lsdException w:name="Medium List 2 Accent 2" w:semiHidden="0" w:uiPriority="66" w:unhideWhenUsed="0"/>
+    <w:lsdException w:name="Medium Grid 1 Accent 2" w:semiHidden="0" w:uiPriority="67" w:unhideWhenUsed="0"/>
+    <w:lsdException w:name="Medium Grid 2 Accent 2" w:semiHidden="0" w:uiPriority="68" w:unhideWhenUsed="0"/>
+    <w:lsdException w:name="Medium Grid 3 Accent 2" w:semiHidden="0" w:uiPriority="69" w:unhideWhenUsed="0"/>
+    <w:lsdException w:name="Dark List Accent 2" w:semiHidden="0" w:uiPriority="70" w:unhideWhenUsed="0"/>
+    <w:lsdException w:name="Colorful Shading Accent 2" w:semiHidden="0" w:uiPriority="71" w:unhideWhenUsed="0"/>
+    <w:lsdException w:name="Colorful List Accent 2" w:semiHidden="0" w:uiPriority="72" w:unhideWhenUsed="0"/>
+    <w:lsdException w:name="Colorful Grid Accent 2" w:semiHidden="0" w:uiPriority="73" w:unhideWhenUsed="0"/>
+    <w:lsdException w:name="Light Shading Accent 3" w:semiHidden="0" w:uiPriority="60" w:unhideWhenUsed="0"/>
+    <w:lsdException w:name="Light List Accent 3" w:semiHidden="0" w:uiPriority="61" w:unhideWhenUsed="0"/>
+    <w:lsdException w:name="Light Grid Accent 3" w:semiHidden="0" w:uiPriority="62" w:unhideWhenUsed="0"/>
+    <w:lsdException w:name="Medium Shading 1 Accent 3" w:semiHidden="0" w:uiPriority="63" w:unhideWhenUsed="0"/>
+    <w:lsdException w:name="Medium Shading 2 Accent 3" w:semiHidden="0" w:uiPriority="64" w:unhideWhenUsed="0"/>
+    <w:lsdException w:name="Medium List 1 Accent 3" w:semiHidden="0" w:uiPriority="65" w:unhideWhenUsed="0"/>
+    <w:lsdException w:name="Medium List 2 Accent 3" w:semiHidden="0" w:uiPriority="66" w:unhideWhenUsed="0"/>
+    <w:lsdException w:name="Medium Grid 1 Accent 3" w:semiHidden="0" w:uiPriority="67" w:unhideWhenUsed="0"/>
+    <w:lsdException w:name="Medium Grid 2 Accent 3" w:semiHidden="0" w:uiPriority="68" w:unhideWhenUsed="0"/>
+    <w:lsdException w:name="Medium Grid 3 Accent 3" w:semiHidden="0" w:uiPriority="69" w:unhideWhenUsed="0"/>
+    <w:lsdException w:name="Dark List Accent 3" w:semiHidden="0" w:uiPriority="70" w:unhideWhenUsed="0"/>
+    <w:lsdException w:name="Colorful Shading Accent 3" w:semiHidden="0" w:uiPriority="71" w:unhideWhenUsed="0"/>
+    <w:lsdException w:name="Colorful List Accent 3" w:semiHidden="0" w:uiPriority="72" w:unhideWhenUsed="0"/>
+    <w:lsdException w:name="Colorful Grid Accent 3" w:semiHidden="0" w:uiPriority="73" w:unhideWhenUsed="0"/>
+    <w:lsdException w:name="Light Shading Accent 4" w:semiHidden="0" w:uiPriority="60" w:unhideWhenUsed="0"/>
+    <w:lsdException w:name="Light List Accent 4" w:semiHidden="0" w:uiPriority="61" w:unhideWhenUsed="0"/>
+    <w:lsdException w:name="Light Grid Accent 4" w:semiHidden="0" w:uiPriority="62" w:unhideWhenUsed="0"/>
+    <w:lsdException w:name="Medium Shading 1 Accent 4" w:semiHidden="0" w:uiPriority="63" w:unhideWhenUsed="0"/>
+    <w:lsdException w:name="Medium Shading 2 Accent 4" w:semiHidden="0" w:uiPriority="64" w:unhideWhenUsed="0"/>
+    <w:lsdException w:name="Medium List 1 Accent 4" w:semiHidden="0" w:uiPriority="65" w:unhideWhenUsed="0"/>
+    <w:lsdException w:name="Medium List 2 Accent 4" w:semiHidden="0" w:uiPriority="66" w:unhideWhenUsed="0"/>
+    <w:lsdException w:name="Medium Grid 1 Accent 4" w:semiHidden="0" w:uiPriority="67" w:unhideWhenUsed="0"/>
+    <w:lsdException w:name="Medium Grid 2 Accent 4" w:semiHidden="0" w:uiPriority="68" w:unhideWhenUsed="0"/>
+    <w:lsdException w:name="Medium Grid 3 Accent 4" w:semiHidden="0" w:uiPriority="69" w:unhideWhenUsed="0"/>
+    <w:lsdException w:name="Dark List Accent 4" w:semiHidden="0" w:uiPriority="70" w:unhideWhenUsed="0"/>
+    <w:lsdException w:name="Colorful Shading Accent 4" w:semiHidden="0" w:uiPriority="71" w:unhideWhenUsed="0"/>
+    <w:lsdException w:name="Colorful List Accent 4" w:semiHidden="0" w:uiPriority="72" w:unhideWhenUsed="0"/>
+    <w:lsdException w:name="Colorful Grid Accent 4" w:semiHidden="0" w:uiPriority="73" w:unhideWhenUsed="0"/>
+    <w:lsdException w:name="Light Shading Accent 5" w:semiHidden="0" w:uiPriority="60" w:unhideWhenUsed="0"/>
+    <w:lsdException w:name="Light List Accent 5" w:semiHidden="0" w:uiPriority="61" w:unhideWhenUsed="0"/>
+    <w:lsdException w:name="Light Grid Accent 5" w:semiHidden="0" w:uiPriority="62" w:unhideWhenUsed="0"/>
+    <w:lsdException w:name="Medium Shading 1 Accent 5" w:semiHidden="0" w:uiPriority="63" w:unhideWhenUsed="0"/>
+    <w:lsdException w:name="Medium Shading 2 Accent 5" w:semiHidden="0" w:uiPriority="64" w:unhideWhenUsed="0"/>
+    <w:lsdException w:name="Medium List 1 Accent 5" w:semiHidden="0" w:uiPriority="65" w:unhideWhenUsed="0"/>
+    <w:lsdException w:name="Medium List 2 Accent 5" w:semiHidden="0" w:uiPriority="66" w:unhideWhenUsed="0"/>
+    <w:lsdException w:name="Medium Grid 1 Accent 5" w:semiHidden="0" w:uiPriority="67" w:unhideWhenUsed="0"/>
+    <w:lsdException w:name="Medium Grid 2 Accent 5" w:semiHidden="0" w:uiPriority="68" w:unhideWhenUsed="0"/>
+    <w:lsdException w:name="Medium Grid 3 Accent 5" w:semiHidden="0" w:uiPriority="69" w:unhideWhenUsed="0"/>
+    <w:lsdException w:name="Dark List Accent 5" w:semiHidden="0" w:uiPriority="70" w:unhideWhenUsed="0"/>
+    <w:lsdException w:name="Colorful Shading Accent 5" w:semiHidden="0" w:uiPriority="71" w:unhideWhenUsed="0"/>
+    <w:lsdException w:name="Colorful List Accent 5" w:semiHidden="0" w:uiPriority="72" w:unhideWhenUsed="0"/>
+    <w:lsdException w:name="Colorful Grid Accent 5" w:semiHidden="0" w:uiPriority="73" w:unhideWhenUsed="0"/>
+    <w:lsdException w:name="Light Shading Accent 6" w:semiHidden="0" w:uiPriority="60" w:unhideWhenUsed="0"/>
+    <w:lsdException w:name="Light List Accent 6" w:semiHidden="0" w:uiPriority="61" w:unhideWhenUsed="0"/>
+    <w:lsdException w:name="Light Grid Accent 6" w:semiHidden="0" w:uiPriority="62" w:unhideWhenUsed="0"/>
+    <w:lsdException w:name="Medium Shading 1 Accent 6" w:semiHidden="0" w:uiPriority="63" w:unhideWhenUsed="0"/>
+    <w:lsdException w:name="Medium Shading 2 Accent 6" w:semiHidden="0" w:uiPriority="64" w:unhideWhenUsed="0"/>
+    <w:lsdException w:name="Medium List 1 Accent 6" w:semiHidden="0" w:uiPriority="65" w:unhideWhenUsed="0"/>
+    <w:lsdException w:name="Medium List 2 Accent 6" w:semiHidden="0" w:uiPriority="66" w:unhideWhenUsed="0"/>
+    <w:lsdException w:name="Medium Grid 1 Accent 6" w:semiHidden="0" w:uiPriority="67" w:unhideWhenUsed="0"/>
+    <w:lsdException w:name="Medium Grid 2 Accent 6" w:semiHidden="0" w:uiPriority="68" w:unhideWhenUsed="0"/>
+    <w:lsdException w:name="Medium Grid 3 Accent 6" w:semiHidden="0" w:uiPriority="69" w:unhideWhenUsed="0"/>
+    <w:lsdException w:name="Dark List Accent 6" w:semiHidden="0" w:uiPriority="70" w:unhideWhenUsed="0"/>
+    <w:lsdException w:name="Colorful Shading Accent 6" w:semiHidden="0" w:uiPriority="71" w:unhideWhenUsed="0"/>
+    <w:lsdException w:name="Colorful List Accent 6" w:semiHidden="0" w:uiPriority="72" w:unhideWhenUsed="0"/>
+    <w:lsdException w:name="Colorful Grid Accent 6" w:semiHidden="0" w:uiPriority="73" w:unhideWhenUsed="0"/>
+    <w:lsdException w:name="Subtle Emphasis" w:semiHidden="0" w:uiPriority="19" w:unhideWhenUsed="0" w:qFormat="1"/>
+    <w:lsdException w:name="Intense Emphasis" w:semiHidden="0" w:uiPriority="21" w:unhideWhenUsed="0" w:qFormat="1"/>
+    <w:lsdException w:name="Subtle Reference" w:semiHidden="0" w:uiPriority="31" w:unhideWhenUsed="0" w:qFormat="1"/>
+    <w:lsdException w:name="Intense Reference" w:semiHidden="0" w:uiPriority="32" w:unhideWhenUsed="0" w:qFormat="1"/>
+    <w:lsdException w:name="Book Title" w:semiHidden="0" w:uiPriority="33" w:unhideWhenUsed="0" w:qFormat="1"/>
+    <w:lsdException w:name="Bibliography" w:uiPriority="37"/>
+    <w:lsdException w:name="TOC Heading" w:uiPriority="39" w:qFormat="1"/>
+  </w:latentStyles>
+  <w:style w:type="paragraph" w:default="1" w:styleId="Normal">
+    <w:name w:val="Normal"/>
+    <w:qFormat/>
+  </w:style>
+  <w:style w:type="character" w:default="1" w:styleId="Policepardfaut">
+    <w:name w:val="Default Paragraph Font"/>
+    <w:uiPriority w:val="1"/>
+    <w:semiHidden/>
+    <w:unhideWhenUsed/>
+  </w:style>
+  <w:style w:type="table" w:default="1" w:styleId="TableauNormal">
+    <w:name w:val="Normal Table"/>
+    <w:uiPriority w:val="99"/>
+    <w:semiHidden/>
+    <w:unhideWhenUsed/>
+    <w:tblPr>
+      <w:tblInd w:w="0" w:type="dxa"/>
+      <w:tblCellMar>
+        <w:top w:w="0" w:type="dxa"/>
+        <w:left w:w="108" w:type="dxa"/>
+        <w:bottom w:w="0" w:type="dxa"/>
+        <w:right w:w="108" w:type="dxa"/>
+      </w:tblCellMar>
+    </w:tblPr>
+  </w:style>
+  <w:style w:type="numbering" w:default="1" w:styleId="Aucuneliste">
+    <w:name w:val="No List"/>
+    <w:uiPriority w:val="99"/>
+    <w:semiHidden/>
+    <w:unhideWhenUsed/>
+  </w:style>
+  <w:style w:type="character" w:styleId="Textedelespacerserv">
+    <w:name w:val="Placeholder Text"/>
+    <w:basedOn w:val="Policepardfaut"/>
+    <w:uiPriority w:val="99"/>
+    <w:semiHidden/>
+    <w:rsid w:val="00C657A8"/>
+    <w:rPr>
+      <w:color w:val="808080"/>
+    </w:rPr>
+  </w:style>
+</w:styles>
+</file>
+
+<file path=word/glossary/stylesWithEffects.xml><?xml version="1.0" encoding="utf-8"?>
+<w:styles xmlns:wpc="http://schemas.microsoft.com/office/word/2010/wordprocessingCanvas" xmlns:mc="http://schemas.openxmlformats.org/markup-compatibility/2006" xmlns:o="urn:schemas-microsoft-com:office:office" xmlns:r="http://schemas.openxmlformats.org/officeDocument/2006/relationships" xmlns:m="http://schemas.openxmlformats.org/officeDocument/2006/math" xmlns:v="urn:schemas-microsoft-com:vml" xmlns:wp14="http://schemas.microsoft.com/office/word/2010/wordprocessingDrawing" xmlns:wp="http://schemas.openxmlformats.org/drawingml/2006/wordprocessingDrawing" xmlns:w10="urn:schemas-microsoft-com:office:word" xmlns:w="http://schemas.openxmlformats.org/wordprocessingml/2006/main" xmlns:w14="http://schemas.microsoft.com/office/word/2010/wordml" xmlns:wpg="http://schemas.microsoft.com/office/word/2010/wordprocessingGroup" xmlns:wpi="http://schemas.microsoft.com/office/word/2010/wordprocessingInk" xmlns:wne="http://schemas.microsoft.com/office/word/2006/wordml" xmlns:wps="http://schemas.microsoft.com/office/word/2010/wordprocessingShape" mc:Ignorable="w14 wp14">
+  <w:docDefaults>
+    <w:rPrDefault>
+      <w:rPr>
+        <w:rFonts w:asciiTheme="minorHAnsi" w:eastAsiaTheme="minorEastAsia" w:hAnsiTheme="minorHAnsi" w:cstheme="minorBidi"/>
+        <w:sz w:val="22"/>
+        <w:szCs w:val="22"/>
+        <w:lang w:val="en-GB" w:eastAsia="en-GB" w:bidi="ar-SA"/>
+      </w:rPr>
+    </w:rPrDefault>
+    <w:pPrDefault>
+      <w:pPr>
+        <w:spacing w:after="200" w:line="276" w:lineRule="auto"/>
+      </w:pPr>
+    </w:pPrDefault>
+  </w:docDefaults>
+  <w:latentStyles w:defLockedState="0" w:defUIPriority="99" w:defSemiHidden="1" w:defUnhideWhenUsed="1" w:defQFormat="0" w:count="267">
+    <w:lsdException w:name="Normal" w:semiHidden="0" w:uiPriority="0" w:unhideWhenUsed="0" w:qFormat="1"/>
+    <w:lsdException w:name="heading 1" w:semiHidden="0" w:uiPriority="9" w:unhideWhenUsed="0" w:qFormat="1"/>
+    <w:lsdException w:name="heading 2" w:uiPriority="9" w:qFormat="1"/>
+    <w:lsdException w:name="heading 3" w:uiPriority="9" w:qFormat="1"/>
+    <w:lsdException w:name="heading 4" w:uiPriority="9" w:qFormat="1"/>
+    <w:lsdException w:name="heading 5" w:uiPriority="9" w:qFormat="1"/>
+    <w:lsdException w:name="heading 6" w:uiPriority="9" w:qFormat="1"/>
+    <w:lsdException w:name="heading 7" w:uiPriority="9" w:qFormat="1"/>
+    <w:lsdException w:name="heading 8" w:uiPriority="9" w:qFormat="1"/>
+    <w:lsdException w:name="heading 9" w:uiPriority="9" w:qFormat="1"/>
+    <w:lsdException w:name="toc 1" w:uiPriority="39"/>
+    <w:lsdException w:name="toc 2" w:uiPriority="39"/>
+    <w:lsdException w:name="toc 3" w:uiPriority="39"/>
+    <w:lsdException w:name="toc 4" w:uiPriority="39"/>
+    <w:lsdException w:name="toc 5" w:uiPriority="39"/>
+    <w:lsdException w:name="toc 6" w:uiPriority="39"/>
+    <w:lsdException w:name="toc 7" w:uiPriority="39"/>
+    <w:lsdException w:name="toc 8" w:uiPriority="39"/>
+    <w:lsdException w:name="toc 9" w:uiPriority="39"/>
+    <w:lsdException w:name="caption" w:uiPriority="35" w:qFormat="1"/>
+    <w:lsdException w:name="Title" w:semiHidden="0" w:uiPriority="10" w:unhideWhenUsed="0" w:qFormat="1"/>
+    <w:lsdException w:name="Default Paragraph Font" w:uiPriority="1"/>
+    <w:lsdException w:name="Subtitle" w:semiHidden="0" w:uiPriority="11" w:unhideWhenUsed="0" w:qFormat="1"/>
+    <w:lsdException w:name="Strong" w:semiHidden="0" w:uiPriority="22" w:unhideWhenUsed="0" w:qFormat="1"/>
+    <w:lsdException w:name="Emphasis" w:semiHidden="0" w:uiPriority="20" w:unhideWhenUsed="0" w:qFormat="1"/>
+    <w:lsdException w:name="Table Grid" w:semiHidden="0" w:uiPriority="59" w:unhideWhenUsed="0"/>
+    <w:lsdException w:name="Placeholder Text" w:unhideWhenUsed="0"/>
+    <w:lsdException w:name="No Spacing" w:semiHidden="0" w:uiPriority="1" w:unhideWhenUsed="0" w:qFormat="1"/>
+    <w:lsdException w:name="Light Shading" w:semiHidden="0" w:uiPriority="60" w:unhideWhenUsed="0"/>
+    <w:lsdException w:name="Light List" w:semiHidden="0" w:uiPriority="61" w:unhideWhenUsed="0"/>
+    <w:lsdException w:name="Light Grid" w:semiHidden="0" w:uiPriority="62" w:unhideWhenUsed="0"/>
+    <w:lsdException w:name="Medium Shading 1" w:semiHidden="0" w:uiPriority="63" w:unhideWhenUsed="0"/>
+    <w:lsdException w:name="Medium Shading 2" w:semiHidden="0" w:uiPriority="64" w:unhideWhenUsed="0"/>
+    <w:lsdException w:name="Medium List 1" w:semiHidden="0" w:uiPriority="65" w:unhideWhenUsed="0"/>
+    <w:lsdException w:name="Medium List 2" w:semiHidden="0" w:uiPriority="66" w:unhideWhenUsed="0"/>
+    <w:lsdException w:name="Medium Grid 1" w:semiHidden="0" w:uiPriority="67" w:unhideWhenUsed="0"/>
+    <w:lsdException w:name="Medium Grid 2" w:semiHidden="0" w:uiPriority="68" w:unhideWhenUsed="0"/>
+    <w:lsdException w:name="Medium Grid 3" w:semiHidden="0" w:uiPriority="69" w:unhideWhenUsed="0"/>
+    <w:lsdException w:name="Dark List" w:semiHidden="0" w:uiPriority="70" w:unhideWhenUsed="0"/>
+    <w:lsdException w:name="Colorful Shading" w:semiHidden="0" w:uiPriority="71" w:unhideWhenUsed="0"/>
+    <w:lsdException w:name="Colorful List" w:semiHidden="0" w:uiPriority="72" w:unhideWhenUsed="0"/>
+    <w:lsdException w:name="Colorful Grid" w:semiHidden="0" w:uiPriority="73" w:unhideWhenUsed="0"/>
+    <w:lsdException w:name="Light Shading Accent 1" w:semiHidden="0" w:uiPriority="60" w:unhideWhenUsed="0"/>
+    <w:lsdException w:name="Light List Accent 1" w:semiHidden="0" w:uiPriority="61" w:unhideWhenUsed="0"/>
+    <w:lsdException w:name="Light Grid Accent 1" w:semiHidden="0" w:uiPriority="62" w:unhideWhenUsed="0"/>
+    <w:lsdException w:name="Medium Shading 1 Accent 1" w:semiHidden="0" w:uiPriority="63" w:unhideWhenUsed="0"/>
+    <w:lsdException w:name="Medium Shading 2 Accent 1" w:semiHidden="0" w:uiPriority="64" w:unhideWhenUsed="0"/>
+    <w:lsdException w:name="Medium List 1 Accent 1" w:semiHidden="0" w:uiPriority="65" w:unhideWhenUsed="0"/>
+    <w:lsdException w:name="Revision" w:unhideWhenUsed="0"/>
+    <w:lsdException w:name="List Paragraph" w:semiHidden="0" w:uiPriority="34" w:unhideWhenUsed="0" w:qFormat="1"/>
+    <w:lsdException w:name="Quote" w:semiHidden="0" w:uiPriority="29" w:unhideWhenUsed="0" w:qFormat="1"/>
+    <w:lsdException w:name="Intense Quote" w:semiHidden="0" w:uiPriority="30" w:unhideWhenUsed="0" w:qFormat="1"/>
+    <w:lsdException w:name="Medium List 2 Accent 1" w:semiHidden="0" w:uiPriority="66" w:unhideWhenUsed="0"/>
+    <w:lsdException w:name="Medium Grid 1 Accent 1" w:semiHidden="0" w:uiPriority="67" w:unhideWhenUsed="0"/>
+    <w:lsdException w:name="Medium Grid 2 Accent 1" w:semiHidden="0" w:uiPriority="68" w:unhideWhenUsed="0"/>
+    <w:lsdException w:name="Medium Grid 3 Accent 1" w:semiHidden="0" w:uiPriority="69" w:unhideWhenUsed="0"/>
+    <w:lsdException w:name="Dark List Accent 1" w:semiHidden="0" w:uiPriority="70" w:unhideWhenUsed="0"/>
+    <w:lsdException w:name="Colorful Shading Accent 1" w:semiHidden="0" w:uiPriority="71" w:unhideWhenUsed="0"/>
+    <w:lsdException w:name="Colorful List Accent 1" w:semiHidden="0" w:uiPriority="72" w:unhideWhenUsed="0"/>
+    <w:lsdException w:name="Colorful Grid Accent 1" w:semiHidden="0" w:uiPriority="73" w:unhideWhenUsed="0"/>
+    <w:lsdException w:name="Light Shading Accent 2" w:semiHidden="0" w:uiPriority="60" w:unhideWhenUsed="0"/>
+    <w:lsdException w:name="Light List Accent 2" w:semiHidden="0" w:uiPriority="61" w:unhideWhenUsed="0"/>
+    <w:lsdException w:name="Light Grid Accent 2" w:semiHidden="0" w:uiPriority="62" w:unhideWhenUsed="0"/>
+    <w:lsdException w:name="Medium Shading 1 Accent 2" w:semiHidden="0" w:uiPriority="63" w:unhideWhenUsed="0"/>
+    <w:lsdException w:name="Medium Shading 2 Accent 2" w:semiHidden="0" w:uiPriority="64" w:unhideWhenUsed="0"/>
+    <w:lsdException w:name="Medium List 1 Accent 2" w:semiHidden="0" w:uiPriority="65" w:unhideWhenUsed="0"/>
+    <w:lsdException w:name="Medium List 2 Accent 2" w:semiHidden="0" w:uiPriority="66" w:unhideWhenUsed="0"/>
+    <w:lsdException w:name="Medium Grid 1 Accent 2" w:semiHidden="0" w:uiPriority="67" w:unhideWhenUsed="0"/>
+    <w:lsdException w:name="Medium Grid 2 Accent 2" w:semiHidden="0" w:uiPriority="68" w:unhideWhenUsed="0"/>
+    <w:lsdException w:name="Medium Grid 3 Accent 2" w:semiHidden="0" w:uiPriority="69" w:unhideWhenUsed="0"/>
+    <w:lsdException w:name="Dark List Accent 2" w:semiHidden="0" w:uiPriority="70" w:unhideWhenUsed="0"/>
+    <w:lsdException w:name="Colorful Shading Accent 2" w:semiHidden="0" w:uiPriority="71" w:unhideWhenUsed="0"/>
+    <w:lsdException w:name="Colorful List Accent 2" w:semiHidden="0" w:uiPriority="72" w:unhideWhenUsed="0"/>
+    <w:lsdException w:name="Colorful Grid Accent 2" w:semiHidden="0" w:uiPriority="73" w:unhideWhenUsed="0"/>
+    <w:lsdException w:name="Light Shading Accent 3" w:semiHidden="0" w:uiPriority="60" w:unhideWhenUsed="0"/>
+    <w:lsdException w:name="Light List Accent 3" w:semiHidden="0" w:uiPriority="61" w:unhideWhenUsed="0"/>
+    <w:lsdException w:name="Light Grid Accent 3" w:semiHidden="0" w:uiPriority="62" w:unhideWhenUsed="0"/>
+    <w:lsdException w:name="Medium Shading 1 Accent 3" w:semiHidden="0" w:uiPriority="63" w:unhideWhenUsed="0"/>
+    <w:lsdException w:name="Medium Shading 2 Accent 3" w:semiHidden="0" w:uiPriority="64" w:unhideWhenUsed="0"/>
+    <w:lsdException w:name="Medium List 1 Accent 3" w:semiHidden="0" w:uiPriority="65" w:unhideWhenUsed="0"/>
+    <w:lsdException w:name="Medium List 2 Accent 3" w:semiHidden="0" w:uiPriority="66" w:unhideWhenUsed="0"/>
+    <w:lsdException w:name="Medium Grid 1 Accent 3" w:semiHidden="0" w:uiPriority="67" w:unhideWhenUsed="0"/>
+    <w:lsdException w:name="Medium Grid 2 Accent 3" w:semiHidden="0" w:uiPriority="68" w:unhideWhenUsed="0"/>
+    <w:lsdException w:name="Medium Grid 3 Accent 3" w:semiHidden="0" w:uiPriority="69" w:unhideWhenUsed="0"/>
+    <w:lsdException w:name="Dark List Accent 3" w:semiHidden="0" w:uiPriority="70" w:unhideWhenUsed="0"/>
+    <w:lsdException w:name="Colorful Shading Accent 3" w:semiHidden="0" w:uiPriority="71" w:unhideWhenUsed="0"/>
+    <w:lsdException w:name="Colorful List Accent 3" w:semiHidden="0" w:uiPriority="72" w:unhideWhenUsed="0"/>
+    <w:lsdException w:name="Colorful Grid Accent 3" w:semiHidden="0" w:uiPriority="73" w:unhideWhenUsed="0"/>
+    <w:lsdException w:name="Light Shading Accent 4" w:semiHidden="0" w:uiPriority="60" w:unhideWhenUsed="0"/>
+    <w:lsdException w:name="Light List Accent 4" w:semiHidden="0" w:uiPriority="61" w:unhideWhenUsed="0"/>
+    <w:lsdException w:name="Light Grid Accent 4" w:semiHidden="0" w:uiPriority="62" w:unhideWhenUsed="0"/>
+    <w:lsdException w:name="Medium Shading 1 Accent 4" w:semiHidden="0" w:uiPriority="63" w:unhideWhenUsed="0"/>
+    <w:lsdException w:name="Medium Shading 2 Accent 4" w:semiHidden="0" w:uiPriority="64" w:unhideWhenUsed="0"/>
+    <w:lsdException w:name="Medium List 1 Accent 4" w:semiHidden="0" w:uiPriority="65" w:unhideWhenUsed="0"/>
+    <w:lsdException w:name="Medium List 2 Accent 4" w:semiHidden="0" w:uiPriority="66" w:unhideWhenUsed="0"/>
+    <w:lsdException w:name="Medium Grid 1 Accent 4" w:semiHidden="0" w:uiPriority="67" w:unhideWhenUsed="0"/>
+    <w:lsdException w:name="Medium Grid 2 Accent 4" w:semiHidden="0" w:uiPriority="68" w:unhideWhenUsed="0"/>
+    <w:lsdException w:name="Medium Grid 3 Accent 4" w:semiHidden="0" w:uiPriority="69" w:unhideWhenUsed="0"/>
+    <w:lsdException w:name="Dark List Accent 4" w:semiHidden="0" w:uiPriority="70" w:unhideWhenUsed="0"/>
+    <w:lsdException w:name="Colorful Shading Accent 4" w:semiHidden="0" w:uiPriority="71" w:unhideWhenUsed="0"/>
+    <w:lsdException w:name="Colorful List Accent 4" w:semiHidden="0" w:uiPriority="72" w:unhideWhenUsed="0"/>
+    <w:lsdException w:name="Colorful Grid Accent 4" w:semiHidden="0" w:uiPriority="73" w:unhideWhenUsed="0"/>
+    <w:lsdException w:name="Light Shading Accent 5" w:semiHidden="0" w:uiPriority="60" w:unhideWhenUsed="0"/>
+    <w:lsdException w:name="Light List Accent 5" w:semiHidden="0" w:uiPriority="61" w:unhideWhenUsed="0"/>
+    <w:lsdException w:name="Light Grid Accent 5" w:semiHidden="0" w:uiPriority="62" w:unhideWhenUsed="0"/>
+    <w:lsdException w:name="Medium Shading 1 Accent 5" w:semiHidden="0" w:uiPriority="63" w:unhideWhenUsed="0"/>
+    <w:lsdException w:name="Medium Shading 2 Accent 5" w:semiHidden="0" w:uiPriority="64" w:unhideWhenUsed="0"/>
+    <w:lsdException w:name="Medium List 1 Accent 5" w:semiHidden="0" w:uiPriority="65" w:unhideWhenUsed="0"/>
+    <w:lsdException w:name="Medium List 2 Accent 5" w:semiHidden="0" w:uiPriority="66" w:unhideWhenUsed="0"/>
+    <w:lsdException w:name="Medium Grid 1 Accent 5" w:semiHidden="0" w:uiPriority="67" w:unhideWhenUsed="0"/>
+    <w:lsdException w:name="Medium Grid 2 Accent 5" w:semiHidden="0" w:uiPriority="68" w:unhideWhenUsed="0"/>
+    <w:lsdException w:name="Medium Grid 3 Accent 5" w:semiHidden="0" w:uiPriority="69" w:unhideWhenUsed="0"/>
+    <w:lsdException w:name="Dark List Accent 5" w:semiHidden="0" w:uiPriority="70" w:unhideWhenUsed="0"/>
+    <w:lsdException w:name="Colorful Shading Accent 5" w:semiHidden="0" w:uiPriority="71" w:unhideWhenUsed="0"/>
+    <w:lsdException w:name="Colorful List Accent 5" w:semiHidden="0" w:uiPriority="72" w:unhideWhenUsed="0"/>
+    <w:lsdException w:name="Colorful Grid Accent 5" w:semiHidden="0" w:uiPriority="73" w:unhideWhenUsed="0"/>
+    <w:lsdException w:name="Light Shading Accent 6" w:semiHidden="0" w:uiPriority="60" w:unhideWhenUsed="0"/>
+    <w:lsdException w:name="Light List Accent 6" w:semiHidden="0" w:uiPriority="61" w:unhideWhenUsed="0"/>
+    <w:lsdException w:name="Light Grid Accent 6" w:semiHidden="0" w:uiPriority="62" w:unhideWhenUsed="0"/>
+    <w:lsdException w:name="Medium Shading 1 Accent 6" w:semiHidden="0" w:uiPriority="63" w:unhideWhenUsed="0"/>
+    <w:lsdException w:name="Medium Shading 2 Accent 6" w:semiHidden="0" w:uiPriority="64" w:unhideWhenUsed="0"/>
+    <w:lsdException w:name="Medium List 1 Accent 6" w:semiHidden="0" w:uiPriority="65" w:unhideWhenUsed="0"/>
+    <w:lsdException w:name="Medium List 2 Accent 6" w:semiHidden="0" w:uiPriority="66" w:unhideWhenUsed="0"/>
+    <w:lsdException w:name="Medium Grid 1 Accent 6" w:semiHidden="0" w:uiPriority="67" w:unhideWhenUsed="0"/>
+    <w:lsdException w:name="Medium Grid 2 Accent 6" w:semiHidden="0" w:uiPriority="68" w:unhideWhenUsed="0"/>
+    <w:lsdException w:name="Medium Grid 3 Accent 6" w:semiHidden="0" w:uiPriority="69" w:unhideWhenUsed="0"/>
+    <w:lsdException w:name="Dark List Accent 6" w:semiHidden="0" w:uiPriority="70" w:unhideWhenUsed="0"/>
+    <w:lsdException w:name="Colorful Shading Accent 6" w:semiHidden="0" w:uiPriority="71" w:unhideWhenUsed="0"/>
+    <w:lsdException w:name="Colorful List Accent 6" w:semiHidden="0" w:uiPriority="72" w:unhideWhenUsed="0"/>
+    <w:lsdException w:name="Colorful Grid Accent 6" w:semiHidden="0" w:uiPriority="73" w:unhideWhenUsed="0"/>
+    <w:lsdException w:name="Subtle Emphasis" w:semiHidden="0" w:uiPriority="19" w:unhideWhenUsed="0" w:qFormat="1"/>
+    <w:lsdException w:name="Intense Emphasis" w:semiHidden="0" w:uiPriority="21" w:unhideWhenUsed="0" w:qFormat="1"/>
+    <w:lsdException w:name="Subtle Reference" w:semiHidden="0" w:uiPriority="31" w:unhideWhenUsed="0" w:qFormat="1"/>
+    <w:lsdException w:name="Intense Reference" w:semiHidden="0" w:uiPriority="32" w:unhideWhenUsed="0" w:qFormat="1"/>
+    <w:lsdException w:name="Book Title" w:semiHidden="0" w:uiPriority="33" w:unhideWhenUsed="0" w:qFormat="1"/>
+    <w:lsdException w:name="Bibliography" w:uiPriority="37"/>
+    <w:lsdException w:name="TOC Heading" w:uiPriority="39" w:qFormat="1"/>
+  </w:latentStyles>
+  <w:style w:type="paragraph" w:default="1" w:styleId="Normal">
+    <w:name w:val="Normal"/>
+    <w:qFormat/>
+  </w:style>
+  <w:style w:type="character" w:default="1" w:styleId="Policepardfaut">
+    <w:name w:val="Default Paragraph Font"/>
+    <w:uiPriority w:val="1"/>
+    <w:semiHidden/>
+    <w:unhideWhenUsed/>
+  </w:style>
+  <w:style w:type="table" w:default="1" w:styleId="TableauNormal">
+    <w:name w:val="Normal Table"/>
+    <w:uiPriority w:val="99"/>
+    <w:semiHidden/>
+    <w:unhideWhenUsed/>
+    <w:tblPr>
+      <w:tblInd w:w="0" w:type="dxa"/>
+      <w:tblCellMar>
+        <w:top w:w="0" w:type="dxa"/>
+        <w:left w:w="108" w:type="dxa"/>
+        <w:bottom w:w="0" w:type="dxa"/>
+        <w:right w:w="108" w:type="dxa"/>
+      </w:tblCellMar>
+    </w:tblPr>
+  </w:style>
+  <w:style w:type="numbering" w:default="1" w:styleId="Aucuneliste">
+    <w:name w:val="No List"/>
+    <w:uiPriority w:val="99"/>
+    <w:semiHidden/>
+    <w:unhideWhenUsed/>
+  </w:style>
+  <w:style w:type="character" w:styleId="Textedelespacerserv">
+    <w:name w:val="Placeholder Text"/>
+    <w:basedOn w:val="Policepardfaut"/>
+    <w:uiPriority w:val="99"/>
+    <w:semiHidden/>
+    <w:rsid w:val="00C657A8"/>
+    <w:rPr>
+      <w:color w:val="808080"/>
+    </w:rPr>
+  </w:style>
+</w:styles>
+</file>
+
+<file path=word/glossary/webSettings.xml><?xml version="1.0" encoding="utf-8"?>
+<w:webSettings xmlns:mc="http://schemas.openxmlformats.org/markup-compatibility/2006" xmlns:r="http://schemas.openxmlformats.org/officeDocument/2006/relationships" xmlns:w="http://schemas.openxmlformats.org/wordprocessingml/2006/main" xmlns:w14="http://schemas.microsoft.com/office/word/2010/wordml" mc:Ignorable="w14">
+  <w:optimizeForBrowser/>
+  <w:allowPNG/>
+</w:webSettings>
+</file>
+
 <file path=word/theme/theme1.xml><?xml version="1.0" encoding="utf-8"?>
 <a:theme xmlns:a="http://schemas.openxmlformats.org/drawingml/2006/main" name="Thème Office">
   <a:themeElements>
@@ -19296,7 +19957,7 @@
   <a:extraClrSchemeLst/>
   <a:extLst>
     <a:ext uri="{05A4C25C-085E-4340-85A3-A5531E510DB2}">
-      <thm15:themeFamily xmlns="" xmlns:thm15="http://schemas.microsoft.com/office/thememl/2012/main" name="Office Theme" id="{62F939B6-93AF-4DB8-9C6B-D6C7DFDC589F}" vid="{4A3C46E8-61CC-4603-A589-7422A47A8E4A}"/>
+      <thm15:themeFamily xmlns:thm15="http://schemas.microsoft.com/office/thememl/2012/main" xmlns="" name="Office Theme" id="{62F939B6-93AF-4DB8-9C6B-D6C7DFDC589F}" vid="{4A3C46E8-61CC-4603-A589-7422A47A8E4A}"/>
     </a:ext>
   </a:extLst>
 </a:theme>
@@ -19307,7 +19968,7 @@
 </file>
 
 <file path=customXml/itemProps1.xml><?xml version="1.0" encoding="utf-8"?>
-<ds:datastoreItem xmlns:ds="http://schemas.openxmlformats.org/officeDocument/2006/customXml" ds:itemID="{9D2151EE-F462-45DE-B79D-63C53BE325C7}">
+<ds:datastoreItem xmlns:ds="http://schemas.openxmlformats.org/officeDocument/2006/customXml" ds:itemID="{70797D30-8A32-43AD-B81B-F63D1BF889DC}">
   <ds:schemaRefs>
     <ds:schemaRef ds:uri="http://schemas.openxmlformats.org/officeDocument/2006/bibliography"/>
   </ds:schemaRefs>

</xml_diff>

<commit_message>
Addition of an HTML description + graphic modifications
</commit_message>
<xml_diff>
--- a/Information/script for equations.docx
+++ b/Information/script for equations.docx
@@ -19,6 +19,7 @@
           <w:docPartUnique/>
         </w:docPartObj>
       </w:sdtPr>
+      <w:sdtEndPr/>
       <w:sdtContent>
         <w:p>
           <w:pPr>
@@ -59,7 +60,7 @@
           <w:r>
             <w:fldChar w:fldCharType="separate"/>
           </w:r>
-          <w:hyperlink w:anchor="_Toc38635954" w:history="1">
+          <w:hyperlink w:anchor="_Toc41489159" w:history="1">
             <w:r>
               <w:rPr>
                 <w:rStyle w:val="Lienhypertexte"/>
@@ -103,7 +104,7 @@
                 <w:noProof/>
                 <w:webHidden/>
               </w:rPr>
-              <w:instrText xml:space="preserve"> PAGEREF _Toc38635954 \h </w:instrText>
+              <w:instrText xml:space="preserve"> PAGEREF _Toc41489159 \h </w:instrText>
             </w:r>
             <w:r>
               <w:rPr>
@@ -147,7 +148,7 @@
               <w:lang w:eastAsia="en-GB"/>
             </w:rPr>
           </w:pPr>
-          <w:hyperlink w:anchor="_Toc38635955" w:history="1">
+          <w:hyperlink w:anchor="_Toc41489160" w:history="1">
             <w:r>
               <w:rPr>
                 <w:rStyle w:val="Lienhypertexte"/>
@@ -191,7 +192,7 @@
                 <w:noProof/>
                 <w:webHidden/>
               </w:rPr>
-              <w:instrText xml:space="preserve"> PAGEREF _Toc38635955 \h </w:instrText>
+              <w:instrText xml:space="preserve"> PAGEREF _Toc41489160 \h </w:instrText>
             </w:r>
             <w:r>
               <w:rPr>
@@ -235,7 +236,7 @@
               <w:lang w:eastAsia="en-GB"/>
             </w:rPr>
           </w:pPr>
-          <w:hyperlink w:anchor="_Toc38635956" w:history="1">
+          <w:hyperlink w:anchor="_Toc41489161" w:history="1">
             <w:r>
               <w:rPr>
                 <w:rStyle w:val="Lienhypertexte"/>
@@ -277,7 +278,7 @@
                 <w:noProof/>
                 <w:webHidden/>
               </w:rPr>
-              <w:instrText xml:space="preserve"> PAGEREF _Toc38635956 \h </w:instrText>
+              <w:instrText xml:space="preserve"> PAGEREF _Toc41489161 \h </w:instrText>
             </w:r>
             <w:r>
               <w:rPr>
@@ -321,7 +322,7 @@
               <w:lang w:eastAsia="en-GB"/>
             </w:rPr>
           </w:pPr>
-          <w:hyperlink w:anchor="_Toc38635957" w:history="1">
+          <w:hyperlink w:anchor="_Toc41489162" w:history="1">
             <w:r>
               <w:rPr>
                 <w:rStyle w:val="Lienhypertexte"/>
@@ -363,7 +364,7 @@
                 <w:noProof/>
                 <w:webHidden/>
               </w:rPr>
-              <w:instrText xml:space="preserve"> PAGEREF _Toc38635957 \h </w:instrText>
+              <w:instrText xml:space="preserve"> PAGEREF _Toc41489162 \h </w:instrText>
             </w:r>
             <w:r>
               <w:rPr>
@@ -407,7 +408,7 @@
               <w:lang w:eastAsia="en-GB"/>
             </w:rPr>
           </w:pPr>
-          <w:hyperlink w:anchor="_Toc38635958" w:history="1">
+          <w:hyperlink w:anchor="_Toc41489163" w:history="1">
             <w:r>
               <w:rPr>
                 <w:rStyle w:val="Lienhypertexte"/>
@@ -449,7 +450,7 @@
                 <w:noProof/>
                 <w:webHidden/>
               </w:rPr>
-              <w:instrText xml:space="preserve"> PAGEREF _Toc38635958 \h </w:instrText>
+              <w:instrText xml:space="preserve"> PAGEREF _Toc41489163 \h </w:instrText>
             </w:r>
             <w:r>
               <w:rPr>
@@ -493,7 +494,7 @@
               <w:lang w:eastAsia="en-GB"/>
             </w:rPr>
           </w:pPr>
-          <w:hyperlink w:anchor="_Toc38635959" w:history="1">
+          <w:hyperlink w:anchor="_Toc41489164" w:history="1">
             <w:r>
               <w:rPr>
                 <w:rStyle w:val="Lienhypertexte"/>
@@ -537,7 +538,7 @@
                 <w:noProof/>
                 <w:webHidden/>
               </w:rPr>
-              <w:instrText xml:space="preserve"> PAGEREF _Toc38635959 \h </w:instrText>
+              <w:instrText xml:space="preserve"> PAGEREF _Toc41489164 \h </w:instrText>
             </w:r>
             <w:r>
               <w:rPr>
@@ -581,7 +582,7 @@
               <w:lang w:eastAsia="en-GB"/>
             </w:rPr>
           </w:pPr>
-          <w:hyperlink w:anchor="_Toc38635960" w:history="1">
+          <w:hyperlink w:anchor="_Toc41489165" w:history="1">
             <w:r>
               <w:rPr>
                 <w:rStyle w:val="Lienhypertexte"/>
@@ -623,7 +624,7 @@
                 <w:noProof/>
                 <w:webHidden/>
               </w:rPr>
-              <w:instrText xml:space="preserve"> PAGEREF _Toc38635960 \h </w:instrText>
+              <w:instrText xml:space="preserve"> PAGEREF _Toc41489165 \h </w:instrText>
             </w:r>
             <w:r>
               <w:rPr>
@@ -667,7 +668,7 @@
               <w:lang w:eastAsia="en-GB"/>
             </w:rPr>
           </w:pPr>
-          <w:hyperlink w:anchor="_Toc38635961" w:history="1">
+          <w:hyperlink w:anchor="_Toc41489166" w:history="1">
             <w:r>
               <w:rPr>
                 <w:rStyle w:val="Lienhypertexte"/>
@@ -709,7 +710,7 @@
                 <w:noProof/>
                 <w:webHidden/>
               </w:rPr>
-              <w:instrText xml:space="preserve"> PAGEREF _Toc38635961 \h </w:instrText>
+              <w:instrText xml:space="preserve"> PAGEREF _Toc41489166 \h </w:instrText>
             </w:r>
             <w:r>
               <w:rPr>
@@ -753,7 +754,7 @@
               <w:lang w:eastAsia="en-GB"/>
             </w:rPr>
           </w:pPr>
-          <w:hyperlink w:anchor="_Toc38635962" w:history="1">
+          <w:hyperlink w:anchor="_Toc41489167" w:history="1">
             <w:r>
               <w:rPr>
                 <w:rStyle w:val="Lienhypertexte"/>
@@ -795,7 +796,7 @@
                 <w:noProof/>
                 <w:webHidden/>
               </w:rPr>
-              <w:instrText xml:space="preserve"> PAGEREF _Toc38635962 \h </w:instrText>
+              <w:instrText xml:space="preserve"> PAGEREF _Toc41489167 \h </w:instrText>
             </w:r>
             <w:r>
               <w:rPr>
@@ -839,7 +840,7 @@
               <w:lang w:eastAsia="en-GB"/>
             </w:rPr>
           </w:pPr>
-          <w:hyperlink w:anchor="_Toc38635963" w:history="1">
+          <w:hyperlink w:anchor="_Toc41489168" w:history="1">
             <w:r>
               <w:rPr>
                 <w:rStyle w:val="Lienhypertexte"/>
@@ -881,7 +882,7 @@
                 <w:noProof/>
                 <w:webHidden/>
               </w:rPr>
-              <w:instrText xml:space="preserve"> PAGEREF _Toc38635963 \h </w:instrText>
+              <w:instrText xml:space="preserve"> PAGEREF _Toc41489168 \h </w:instrText>
             </w:r>
             <w:r>
               <w:rPr>
@@ -925,7 +926,7 @@
               <w:lang w:eastAsia="en-GB"/>
             </w:rPr>
           </w:pPr>
-          <w:hyperlink w:anchor="_Toc38635964" w:history="1">
+          <w:hyperlink w:anchor="_Toc41489169" w:history="1">
             <w:r>
               <w:rPr>
                 <w:rStyle w:val="Lienhypertexte"/>
@@ -967,7 +968,7 @@
                 <w:noProof/>
                 <w:webHidden/>
               </w:rPr>
-              <w:instrText xml:space="preserve"> PAGEREF _Toc38635964 \h </w:instrText>
+              <w:instrText xml:space="preserve"> PAGEREF _Toc41489169 \h </w:instrText>
             </w:r>
             <w:r>
               <w:rPr>
@@ -1011,7 +1012,7 @@
               <w:lang w:eastAsia="en-GB"/>
             </w:rPr>
           </w:pPr>
-          <w:hyperlink w:anchor="_Toc38635965" w:history="1">
+          <w:hyperlink w:anchor="_Toc41489170" w:history="1">
             <w:r>
               <w:rPr>
                 <w:rStyle w:val="Lienhypertexte"/>
@@ -1053,7 +1054,7 @@
                 <w:noProof/>
                 <w:webHidden/>
               </w:rPr>
-              <w:instrText xml:space="preserve"> PAGEREF _Toc38635965 \h </w:instrText>
+              <w:instrText xml:space="preserve"> PAGEREF _Toc41489170 \h </w:instrText>
             </w:r>
             <w:r>
               <w:rPr>
@@ -1097,7 +1098,7 @@
               <w:lang w:eastAsia="en-GB"/>
             </w:rPr>
           </w:pPr>
-          <w:hyperlink w:anchor="_Toc38635966" w:history="1">
+          <w:hyperlink w:anchor="_Toc41489171" w:history="1">
             <w:r>
               <w:rPr>
                 <w:rStyle w:val="Lienhypertexte"/>
@@ -1139,7 +1140,7 @@
                 <w:noProof/>
                 <w:webHidden/>
               </w:rPr>
-              <w:instrText xml:space="preserve"> PAGEREF _Toc38635966 \h </w:instrText>
+              <w:instrText xml:space="preserve"> PAGEREF _Toc41489171 \h </w:instrText>
             </w:r>
             <w:r>
               <w:rPr>
@@ -1183,7 +1184,7 @@
               <w:lang w:eastAsia="en-GB"/>
             </w:rPr>
           </w:pPr>
-          <w:hyperlink w:anchor="_Toc38635967" w:history="1">
+          <w:hyperlink w:anchor="_Toc41489172" w:history="1">
             <w:r>
               <w:rPr>
                 <w:rStyle w:val="Lienhypertexte"/>
@@ -1225,7 +1226,7 @@
                 <w:noProof/>
                 <w:webHidden/>
               </w:rPr>
-              <w:instrText xml:space="preserve"> PAGEREF _Toc38635967 \h </w:instrText>
+              <w:instrText xml:space="preserve"> PAGEREF _Toc41489172 \h </w:instrText>
             </w:r>
             <w:r>
               <w:rPr>
@@ -1269,7 +1270,7 @@
               <w:lang w:eastAsia="en-GB"/>
             </w:rPr>
           </w:pPr>
-          <w:hyperlink w:anchor="_Toc38635968" w:history="1">
+          <w:hyperlink w:anchor="_Toc41489173" w:history="1">
             <w:r>
               <w:rPr>
                 <w:rStyle w:val="Lienhypertexte"/>
@@ -1313,7 +1314,7 @@
                 <w:noProof/>
                 <w:webHidden/>
               </w:rPr>
-              <w:instrText xml:space="preserve"> PAGEREF _Toc38635968 \h </w:instrText>
+              <w:instrText xml:space="preserve"> PAGEREF _Toc41489173 \h </w:instrText>
             </w:r>
             <w:r>
               <w:rPr>
@@ -1357,7 +1358,7 @@
               <w:lang w:eastAsia="en-GB"/>
             </w:rPr>
           </w:pPr>
-          <w:hyperlink w:anchor="_Toc38635969" w:history="1">
+          <w:hyperlink w:anchor="_Toc41489174" w:history="1">
             <w:r>
               <w:rPr>
                 <w:rStyle w:val="Lienhypertexte"/>
@@ -1399,7 +1400,7 @@
                 <w:noProof/>
                 <w:webHidden/>
               </w:rPr>
-              <w:instrText xml:space="preserve"> PAGEREF _Toc38635969 \h </w:instrText>
+              <w:instrText xml:space="preserve"> PAGEREF _Toc41489174 \h </w:instrText>
             </w:r>
             <w:r>
               <w:rPr>
@@ -1443,7 +1444,7 @@
               <w:lang w:eastAsia="en-GB"/>
             </w:rPr>
           </w:pPr>
-          <w:hyperlink w:anchor="_Toc38635970" w:history="1">
+          <w:hyperlink w:anchor="_Toc41489175" w:history="1">
             <w:r>
               <w:rPr>
                 <w:rStyle w:val="Lienhypertexte"/>
@@ -1485,7 +1486,7 @@
                 <w:noProof/>
                 <w:webHidden/>
               </w:rPr>
-              <w:instrText xml:space="preserve"> PAGEREF _Toc38635970 \h </w:instrText>
+              <w:instrText xml:space="preserve"> PAGEREF _Toc41489175 \h </w:instrText>
             </w:r>
             <w:r>
               <w:rPr>
@@ -1529,7 +1530,7 @@
               <w:lang w:eastAsia="en-GB"/>
             </w:rPr>
           </w:pPr>
-          <w:hyperlink w:anchor="_Toc38635971" w:history="1">
+          <w:hyperlink w:anchor="_Toc41489176" w:history="1">
             <w:r>
               <w:rPr>
                 <w:rStyle w:val="Lienhypertexte"/>
@@ -1571,7 +1572,7 @@
                 <w:noProof/>
                 <w:webHidden/>
               </w:rPr>
-              <w:instrText xml:space="preserve"> PAGEREF _Toc38635971 \h </w:instrText>
+              <w:instrText xml:space="preserve"> PAGEREF _Toc41489176 \h </w:instrText>
             </w:r>
             <w:r>
               <w:rPr>
@@ -1615,7 +1616,7 @@
               <w:lang w:eastAsia="en-GB"/>
             </w:rPr>
           </w:pPr>
-          <w:hyperlink w:anchor="_Toc38635972" w:history="1">
+          <w:hyperlink w:anchor="_Toc41489177" w:history="1">
             <w:r>
               <w:rPr>
                 <w:rStyle w:val="Lienhypertexte"/>
@@ -1657,7 +1658,7 @@
                 <w:noProof/>
                 <w:webHidden/>
               </w:rPr>
-              <w:instrText xml:space="preserve"> PAGEREF _Toc38635972 \h </w:instrText>
+              <w:instrText xml:space="preserve"> PAGEREF _Toc41489177 \h </w:instrText>
             </w:r>
             <w:r>
               <w:rPr>
@@ -1701,7 +1702,7 @@
               <w:lang w:eastAsia="en-GB"/>
             </w:rPr>
           </w:pPr>
-          <w:hyperlink w:anchor="_Toc38635973" w:history="1">
+          <w:hyperlink w:anchor="_Toc41489178" w:history="1">
             <w:r>
               <w:rPr>
                 <w:rStyle w:val="Lienhypertexte"/>
@@ -1743,7 +1744,7 @@
                 <w:noProof/>
                 <w:webHidden/>
               </w:rPr>
-              <w:instrText xml:space="preserve"> PAGEREF _Toc38635973 \h </w:instrText>
+              <w:instrText xml:space="preserve"> PAGEREF _Toc41489178 \h </w:instrText>
             </w:r>
             <w:r>
               <w:rPr>
@@ -1787,7 +1788,7 @@
               <w:lang w:eastAsia="en-GB"/>
             </w:rPr>
           </w:pPr>
-          <w:hyperlink w:anchor="_Toc38635974" w:history="1">
+          <w:hyperlink w:anchor="_Toc41489179" w:history="1">
             <w:r>
               <w:rPr>
                 <w:rStyle w:val="Lienhypertexte"/>
@@ -1829,7 +1830,7 @@
                 <w:noProof/>
                 <w:webHidden/>
               </w:rPr>
-              <w:instrText xml:space="preserve"> PAGEREF _Toc38635974 \h </w:instrText>
+              <w:instrText xml:space="preserve"> PAGEREF _Toc41489179 \h </w:instrText>
             </w:r>
             <w:r>
               <w:rPr>
@@ -1873,7 +1874,7 @@
               <w:lang w:eastAsia="en-GB"/>
             </w:rPr>
           </w:pPr>
-          <w:hyperlink w:anchor="_Toc38635975" w:history="1">
+          <w:hyperlink w:anchor="_Toc41489180" w:history="1">
             <w:r>
               <w:rPr>
                 <w:rStyle w:val="Lienhypertexte"/>
@@ -1915,7 +1916,7 @@
                 <w:noProof/>
                 <w:webHidden/>
               </w:rPr>
-              <w:instrText xml:space="preserve"> PAGEREF _Toc38635975 \h </w:instrText>
+              <w:instrText xml:space="preserve"> PAGEREF _Toc41489180 \h </w:instrText>
             </w:r>
             <w:r>
               <w:rPr>
@@ -1959,7 +1960,7 @@
               <w:lang w:eastAsia="en-GB"/>
             </w:rPr>
           </w:pPr>
-          <w:hyperlink w:anchor="_Toc38635976" w:history="1">
+          <w:hyperlink w:anchor="_Toc41489181" w:history="1">
             <w:r>
               <w:rPr>
                 <w:rStyle w:val="Lienhypertexte"/>
@@ -2001,7 +2002,7 @@
                 <w:noProof/>
                 <w:webHidden/>
               </w:rPr>
-              <w:instrText xml:space="preserve"> PAGEREF _Toc38635976 \h </w:instrText>
+              <w:instrText xml:space="preserve"> PAGEREF _Toc41489181 \h </w:instrText>
             </w:r>
             <w:r>
               <w:rPr>
@@ -2045,7 +2046,7 @@
               <w:lang w:eastAsia="en-GB"/>
             </w:rPr>
           </w:pPr>
-          <w:hyperlink w:anchor="_Toc38635977" w:history="1">
+          <w:hyperlink w:anchor="_Toc41489182" w:history="1">
             <w:r>
               <w:rPr>
                 <w:rStyle w:val="Lienhypertexte"/>
@@ -2089,7 +2090,7 @@
                 <w:noProof/>
                 <w:webHidden/>
               </w:rPr>
-              <w:instrText xml:space="preserve"> PAGEREF _Toc38635977 \h </w:instrText>
+              <w:instrText xml:space="preserve"> PAGEREF _Toc41489182 \h </w:instrText>
             </w:r>
             <w:r>
               <w:rPr>
@@ -2133,7 +2134,7 @@
               <w:lang w:eastAsia="en-GB"/>
             </w:rPr>
           </w:pPr>
-          <w:hyperlink w:anchor="_Toc38635978" w:history="1">
+          <w:hyperlink w:anchor="_Toc41489183" w:history="1">
             <w:r>
               <w:rPr>
                 <w:rStyle w:val="Lienhypertexte"/>
@@ -2156,7 +2157,23 @@
                 <w:noProof/>
                 <w:lang w:val="fr-FR"/>
               </w:rPr>
-              <w:t>BasesClasses</w:t>
+              <w:t>Compo</w:t>
+            </w:r>
+            <w:r>
+              <w:rPr>
+                <w:rStyle w:val="Lienhypertexte"/>
+                <w:noProof/>
+                <w:lang w:val="fr-FR"/>
+              </w:rPr>
+              <w:t>n</w:t>
+            </w:r>
+            <w:r>
+              <w:rPr>
+                <w:rStyle w:val="Lienhypertexte"/>
+                <w:noProof/>
+                <w:lang w:val="fr-FR"/>
+              </w:rPr>
+              <w:t>ents</w:t>
             </w:r>
             <w:r>
               <w:rPr>
@@ -2177,7 +2194,7 @@
                 <w:noProof/>
                 <w:webHidden/>
               </w:rPr>
-              <w:instrText xml:space="preserve"> PAGEREF _Toc38635978 \h </w:instrText>
+              <w:instrText xml:space="preserve"> PAGEREF _Toc41489183 \h </w:instrText>
             </w:r>
             <w:r>
               <w:rPr>
@@ -2221,11 +2238,12 @@
               <w:lang w:eastAsia="en-GB"/>
             </w:rPr>
           </w:pPr>
-          <w:hyperlink w:anchor="_Toc38635979" w:history="1">
+          <w:hyperlink w:anchor="_Toc41489184" w:history="1">
             <w:r>
               <w:rPr>
                 <w:rStyle w:val="Lienhypertexte"/>
                 <w:noProof/>
+                <w:lang w:val="fr-FR"/>
               </w:rPr>
               <w:t>1.</w:t>
             </w:r>
@@ -2241,8 +2259,9 @@
               <w:rPr>
                 <w:rStyle w:val="Lienhypertexte"/>
                 <w:noProof/>
-              </w:rPr>
-              <w:t>AeraulicConvection</w:t>
+                <w:lang w:val="fr-FR"/>
+              </w:rPr>
+              <w:t>PartialPump</w:t>
             </w:r>
             <w:r>
               <w:rPr>
@@ -2263,7 +2282,95 @@
                 <w:noProof/>
                 <w:webHidden/>
               </w:rPr>
-              <w:instrText xml:space="preserve"> PAGEREF _Toc38635979 \h </w:instrText>
+              <w:instrText xml:space="preserve"> PAGEREF _Toc41489184 \h </w:instrText>
+            </w:r>
+            <w:r>
+              <w:rPr>
+                <w:noProof/>
+                <w:webHidden/>
+              </w:rPr>
+            </w:r>
+            <w:r>
+              <w:rPr>
+                <w:noProof/>
+                <w:webHidden/>
+              </w:rPr>
+              <w:fldChar w:fldCharType="separate"/>
+            </w:r>
+            <w:r>
+              <w:rPr>
+                <w:noProof/>
+                <w:webHidden/>
+              </w:rPr>
+              <w:t>9</w:t>
+            </w:r>
+            <w:r>
+              <w:rPr>
+                <w:noProof/>
+                <w:webHidden/>
+              </w:rPr>
+              <w:fldChar w:fldCharType="end"/>
+            </w:r>
+          </w:hyperlink>
+        </w:p>
+        <w:p>
+          <w:pPr>
+            <w:pStyle w:val="TM2"/>
+            <w:tabs>
+              <w:tab w:val="left" w:pos="660"/>
+              <w:tab w:val="right" w:leader="dot" w:pos="9062"/>
+            </w:tabs>
+            <w:rPr>
+              <w:rFonts w:eastAsiaTheme="minorEastAsia"/>
+              <w:noProof/>
+              <w:lang w:eastAsia="en-GB"/>
+            </w:rPr>
+          </w:pPr>
+          <w:hyperlink w:anchor="_Toc41489185" w:history="1">
+            <w:r>
+              <w:rPr>
+                <w:rStyle w:val="Lienhypertexte"/>
+                <w:noProof/>
+                <w:lang w:val="fr-FR"/>
+              </w:rPr>
+              <w:t>B.</w:t>
+            </w:r>
+            <w:r>
+              <w:rPr>
+                <w:rFonts w:eastAsiaTheme="minorEastAsia"/>
+                <w:noProof/>
+                <w:lang w:eastAsia="en-GB"/>
+              </w:rPr>
+              <w:tab/>
+            </w:r>
+            <w:r>
+              <w:rPr>
+                <w:rStyle w:val="Lienhypertexte"/>
+                <w:noProof/>
+                <w:lang w:val="fr-FR"/>
+              </w:rPr>
+              <w:t>BasesClasses</w:t>
+            </w:r>
+            <w:r>
+              <w:rPr>
+                <w:noProof/>
+                <w:webHidden/>
+              </w:rPr>
+              <w:tab/>
+            </w:r>
+            <w:r>
+              <w:rPr>
+                <w:noProof/>
+                <w:webHidden/>
+              </w:rPr>
+              <w:fldChar w:fldCharType="begin"/>
+            </w:r>
+            <w:r>
+              <w:rPr>
+                <w:noProof/>
+                <w:webHidden/>
+              </w:rPr>
+              <w:instrText xml:space="preserve"> PAGEREF _Toc41489185 \h </w:instrText>
             </w:r>
             <w:r>
               <w:rPr>
@@ -2307,13 +2414,13 @@
               <w:lang w:eastAsia="en-GB"/>
             </w:rPr>
           </w:pPr>
-          <w:hyperlink w:anchor="_Toc38635980" w:history="1">
+          <w:hyperlink w:anchor="_Toc41489186" w:history="1">
             <w:r>
               <w:rPr>
                 <w:rStyle w:val="Lienhypertexte"/>
                 <w:noProof/>
               </w:rPr>
-              <w:t>2.</w:t>
+              <w:t>1.</w:t>
             </w:r>
             <w:r>
               <w:rPr>
@@ -2328,7 +2435,7 @@
                 <w:rStyle w:val="Lienhypertexte"/>
                 <w:noProof/>
               </w:rPr>
-              <w:t>Condensation</w:t>
+              <w:t>AeraulicConvection</w:t>
             </w:r>
             <w:r>
               <w:rPr>
@@ -2349,7 +2456,7 @@
                 <w:noProof/>
                 <w:webHidden/>
               </w:rPr>
-              <w:instrText xml:space="preserve"> PAGEREF _Toc38635980 \h </w:instrText>
+              <w:instrText xml:space="preserve"> PAGEREF _Toc41489186 \h </w:instrText>
             </w:r>
             <w:r>
               <w:rPr>
@@ -2393,13 +2500,13 @@
               <w:lang w:eastAsia="en-GB"/>
             </w:rPr>
           </w:pPr>
-          <w:hyperlink w:anchor="_Toc38635981" w:history="1">
+          <w:hyperlink w:anchor="_Toc41489187" w:history="1">
             <w:r>
               <w:rPr>
                 <w:rStyle w:val="Lienhypertexte"/>
                 <w:noProof/>
               </w:rPr>
-              <w:t>3.</w:t>
+              <w:t>2.</w:t>
             </w:r>
             <w:r>
               <w:rPr>
@@ -2414,7 +2521,7 @@
                 <w:rStyle w:val="Lienhypertexte"/>
                 <w:noProof/>
               </w:rPr>
-              <w:t>MolecularDiffusion</w:t>
+              <w:t>Condensation</w:t>
             </w:r>
             <w:r>
               <w:rPr>
@@ -2435,7 +2542,7 @@
                 <w:noProof/>
                 <w:webHidden/>
               </w:rPr>
-              <w:instrText xml:space="preserve"> PAGEREF _Toc38635981 \h </w:instrText>
+              <w:instrText xml:space="preserve"> PAGEREF _Toc41489187 \h </w:instrText>
             </w:r>
             <w:r>
               <w:rPr>
@@ -2479,13 +2586,13 @@
               <w:lang w:eastAsia="en-GB"/>
             </w:rPr>
           </w:pPr>
-          <w:hyperlink w:anchor="_Toc38635982" w:history="1">
+          <w:hyperlink w:anchor="_Toc41489188" w:history="1">
             <w:r>
               <w:rPr>
                 <w:rStyle w:val="Lienhypertexte"/>
                 <w:noProof/>
               </w:rPr>
-              <w:t>4.</w:t>
+              <w:t>3.</w:t>
             </w:r>
             <w:r>
               <w:rPr>
@@ -2500,7 +2607,7 @@
                 <w:rStyle w:val="Lienhypertexte"/>
                 <w:noProof/>
               </w:rPr>
-              <w:t>GasNode</w:t>
+              <w:t>MolecularDiffusion</w:t>
             </w:r>
             <w:r>
               <w:rPr>
@@ -2521,7 +2628,7 @@
                 <w:noProof/>
                 <w:webHidden/>
               </w:rPr>
-              <w:instrText xml:space="preserve"> PAGEREF _Toc38635982 \h </w:instrText>
+              <w:instrText xml:space="preserve"> PAGEREF _Toc41489188 \h </w:instrText>
             </w:r>
             <w:r>
               <w:rPr>
@@ -2565,12 +2672,98 @@
               <w:lang w:eastAsia="en-GB"/>
             </w:rPr>
           </w:pPr>
-          <w:hyperlink w:anchor="_Toc38635983" w:history="1">
+          <w:hyperlink w:anchor="_Toc41489189" w:history="1">
             <w:r>
               <w:rPr>
                 <w:rStyle w:val="Lienhypertexte"/>
                 <w:noProof/>
               </w:rPr>
+              <w:t>4.</w:t>
+            </w:r>
+            <w:r>
+              <w:rPr>
+                <w:rFonts w:eastAsiaTheme="minorEastAsia"/>
+                <w:noProof/>
+                <w:lang w:eastAsia="en-GB"/>
+              </w:rPr>
+              <w:tab/>
+            </w:r>
+            <w:r>
+              <w:rPr>
+                <w:rStyle w:val="Lienhypertexte"/>
+                <w:noProof/>
+              </w:rPr>
+              <w:t>GasNode</w:t>
+            </w:r>
+            <w:r>
+              <w:rPr>
+                <w:noProof/>
+                <w:webHidden/>
+              </w:rPr>
+              <w:tab/>
+            </w:r>
+            <w:r>
+              <w:rPr>
+                <w:noProof/>
+                <w:webHidden/>
+              </w:rPr>
+              <w:fldChar w:fldCharType="begin"/>
+            </w:r>
+            <w:r>
+              <w:rPr>
+                <w:noProof/>
+                <w:webHidden/>
+              </w:rPr>
+              <w:instrText xml:space="preserve"> PAGEREF _Toc41489189 \h </w:instrText>
+            </w:r>
+            <w:r>
+              <w:rPr>
+                <w:noProof/>
+                <w:webHidden/>
+              </w:rPr>
+            </w:r>
+            <w:r>
+              <w:rPr>
+                <w:noProof/>
+                <w:webHidden/>
+              </w:rPr>
+              <w:fldChar w:fldCharType="separate"/>
+            </w:r>
+            <w:r>
+              <w:rPr>
+                <w:noProof/>
+                <w:webHidden/>
+              </w:rPr>
+              <w:t>9</w:t>
+            </w:r>
+            <w:r>
+              <w:rPr>
+                <w:noProof/>
+                <w:webHidden/>
+              </w:rPr>
+              <w:fldChar w:fldCharType="end"/>
+            </w:r>
+          </w:hyperlink>
+        </w:p>
+        <w:p>
+          <w:pPr>
+            <w:pStyle w:val="TM3"/>
+            <w:tabs>
+              <w:tab w:val="left" w:pos="880"/>
+              <w:tab w:val="right" w:leader="dot" w:pos="9062"/>
+            </w:tabs>
+            <w:rPr>
+              <w:rFonts w:eastAsiaTheme="minorEastAsia"/>
+              <w:noProof/>
+              <w:lang w:eastAsia="en-GB"/>
+            </w:rPr>
+          </w:pPr>
+          <w:hyperlink w:anchor="_Toc41489190" w:history="1">
+            <w:r>
+              <w:rPr>
+                <w:rStyle w:val="Lienhypertexte"/>
+                <w:noProof/>
+              </w:rPr>
               <w:t>5.</w:t>
             </w:r>
             <w:r>
@@ -2607,7 +2800,7 @@
                 <w:noProof/>
                 <w:webHidden/>
               </w:rPr>
-              <w:instrText xml:space="preserve"> PAGEREF _Toc38635983 \h </w:instrText>
+              <w:instrText xml:space="preserve"> PAGEREF _Toc41489190 \h </w:instrText>
             </w:r>
             <w:r>
               <w:rPr>
@@ -2651,13 +2844,13 @@
               <w:lang w:eastAsia="en-GB"/>
             </w:rPr>
           </w:pPr>
-          <w:hyperlink w:anchor="_Toc38635984" w:history="1">
+          <w:hyperlink w:anchor="_Toc41489191" w:history="1">
             <w:r>
               <w:rPr>
                 <w:rStyle w:val="Lienhypertexte"/>
                 <w:noProof/>
               </w:rPr>
-              <w:t>B.</w:t>
+              <w:t>C.</w:t>
             </w:r>
             <w:r>
               <w:rPr>
@@ -2693,7 +2886,7 @@
                 <w:noProof/>
                 <w:webHidden/>
               </w:rPr>
-              <w:instrText xml:space="preserve"> PAGEREF _Toc38635984 \h </w:instrText>
+              <w:instrText xml:space="preserve"> PAGEREF _Toc41489191 \h </w:instrText>
             </w:r>
             <w:r>
               <w:rPr>
@@ -2737,7 +2930,7 @@
               <w:lang w:eastAsia="en-GB"/>
             </w:rPr>
           </w:pPr>
-          <w:hyperlink w:anchor="_Toc38635985" w:history="1">
+          <w:hyperlink w:anchor="_Toc41489192" w:history="1">
             <w:r>
               <w:rPr>
                 <w:rStyle w:val="Lienhypertexte"/>
@@ -2779,7 +2972,7 @@
                 <w:noProof/>
                 <w:webHidden/>
               </w:rPr>
-              <w:instrText xml:space="preserve"> PAGEREF _Toc38635985 \h </w:instrText>
+              <w:instrText xml:space="preserve"> PAGEREF _Toc41489192 \h </w:instrText>
             </w:r>
             <w:r>
               <w:rPr>
@@ -2800,6 +2993,178 @@
                 <w:webHidden/>
               </w:rPr>
               <w:t>11</w:t>
+            </w:r>
+            <w:r>
+              <w:rPr>
+                <w:noProof/>
+                <w:webHidden/>
+              </w:rPr>
+              <w:fldChar w:fldCharType="end"/>
+            </w:r>
+          </w:hyperlink>
+        </w:p>
+        <w:p>
+          <w:pPr>
+            <w:pStyle w:val="TM2"/>
+            <w:tabs>
+              <w:tab w:val="left" w:pos="660"/>
+              <w:tab w:val="right" w:leader="dot" w:pos="9062"/>
+            </w:tabs>
+            <w:rPr>
+              <w:rFonts w:eastAsiaTheme="minorEastAsia"/>
+              <w:noProof/>
+              <w:lang w:eastAsia="en-GB"/>
+            </w:rPr>
+          </w:pPr>
+          <w:hyperlink w:anchor="_Toc41489193" w:history="1">
+            <w:r>
+              <w:rPr>
+                <w:rStyle w:val="Lienhypertexte"/>
+                <w:noProof/>
+              </w:rPr>
+              <w:t>A.</w:t>
+            </w:r>
+            <w:r>
+              <w:rPr>
+                <w:rFonts w:eastAsiaTheme="minorEastAsia"/>
+                <w:noProof/>
+                <w:lang w:eastAsia="en-GB"/>
+              </w:rPr>
+              <w:tab/>
+            </w:r>
+            <w:r>
+              <w:rPr>
+                <w:rStyle w:val="Lienhypertexte"/>
+                <w:noProof/>
+              </w:rPr>
+              <w:t>Components</w:t>
+            </w:r>
+            <w:r>
+              <w:rPr>
+                <w:noProof/>
+                <w:webHidden/>
+              </w:rPr>
+              <w:tab/>
+            </w:r>
+            <w:r>
+              <w:rPr>
+                <w:noProof/>
+                <w:webHidden/>
+              </w:rPr>
+              <w:fldChar w:fldCharType="begin"/>
+            </w:r>
+            <w:r>
+              <w:rPr>
+                <w:noProof/>
+                <w:webHidden/>
+              </w:rPr>
+              <w:instrText xml:space="preserve"> PAGEREF _Toc41489193 \h </w:instrText>
+            </w:r>
+            <w:r>
+              <w:rPr>
+                <w:noProof/>
+                <w:webHidden/>
+              </w:rPr>
+            </w:r>
+            <w:r>
+              <w:rPr>
+                <w:noProof/>
+                <w:webHidden/>
+              </w:rPr>
+              <w:fldChar w:fldCharType="separate"/>
+            </w:r>
+            <w:r>
+              <w:rPr>
+                <w:noProof/>
+                <w:webHidden/>
+              </w:rPr>
+              <w:t>12</w:t>
+            </w:r>
+            <w:r>
+              <w:rPr>
+                <w:noProof/>
+                <w:webHidden/>
+              </w:rPr>
+              <w:fldChar w:fldCharType="end"/>
+            </w:r>
+          </w:hyperlink>
+        </w:p>
+        <w:p>
+          <w:pPr>
+            <w:pStyle w:val="TM3"/>
+            <w:tabs>
+              <w:tab w:val="left" w:pos="880"/>
+              <w:tab w:val="right" w:leader="dot" w:pos="9062"/>
+            </w:tabs>
+            <w:rPr>
+              <w:rFonts w:eastAsiaTheme="minorEastAsia"/>
+              <w:noProof/>
+              <w:lang w:eastAsia="en-GB"/>
+            </w:rPr>
+          </w:pPr>
+          <w:hyperlink w:anchor="_Toc41489194" w:history="1">
+            <w:r>
+              <w:rPr>
+                <w:rStyle w:val="Lienhypertexte"/>
+                <w:noProof/>
+              </w:rPr>
+              <w:t>1.</w:t>
+            </w:r>
+            <w:r>
+              <w:rPr>
+                <w:rFonts w:eastAsiaTheme="minorEastAsia"/>
+                <w:noProof/>
+                <w:lang w:eastAsia="en-GB"/>
+              </w:rPr>
+              <w:tab/>
+            </w:r>
+            <w:r>
+              <w:rPr>
+                <w:rStyle w:val="Lienhypertexte"/>
+                <w:noProof/>
+              </w:rPr>
+              <w:t>StaticPipe</w:t>
+            </w:r>
+            <w:r>
+              <w:rPr>
+                <w:noProof/>
+                <w:webHidden/>
+              </w:rPr>
+              <w:tab/>
+            </w:r>
+            <w:r>
+              <w:rPr>
+                <w:noProof/>
+                <w:webHidden/>
+              </w:rPr>
+              <w:fldChar w:fldCharType="begin"/>
+            </w:r>
+            <w:r>
+              <w:rPr>
+                <w:noProof/>
+                <w:webHidden/>
+              </w:rPr>
+              <w:instrText xml:space="preserve"> PAGEREF _Toc41489194 \h </w:instrText>
+            </w:r>
+            <w:r>
+              <w:rPr>
+                <w:noProof/>
+                <w:webHidden/>
+              </w:rPr>
+            </w:r>
+            <w:r>
+              <w:rPr>
+                <w:noProof/>
+                <w:webHidden/>
+              </w:rPr>
+              <w:fldChar w:fldCharType="separate"/>
+            </w:r>
+            <w:r>
+              <w:rPr>
+                <w:noProof/>
+                <w:webHidden/>
+              </w:rPr>
+              <w:t>12</w:t>
             </w:r>
             <w:r>
               <w:rPr>
@@ -2823,7 +3188,7 @@
               <w:lang w:eastAsia="en-GB"/>
             </w:rPr>
           </w:pPr>
-          <w:hyperlink w:anchor="_Toc38635986" w:history="1">
+          <w:hyperlink w:anchor="_Toc41489195" w:history="1">
             <w:r>
               <w:rPr>
                 <w:rStyle w:val="Lienhypertexte"/>
@@ -2867,7 +3232,7 @@
                 <w:noProof/>
                 <w:webHidden/>
               </w:rPr>
-              <w:instrText xml:space="preserve"> PAGEREF _Toc38635986 \h </w:instrText>
+              <w:instrText xml:space="preserve"> PAGEREF _Toc41489195 \h </w:instrText>
             </w:r>
             <w:r>
               <w:rPr>
@@ -2911,7 +3276,7 @@
               <w:lang w:eastAsia="en-GB"/>
             </w:rPr>
           </w:pPr>
-          <w:hyperlink w:anchor="_Toc38635987" w:history="1">
+          <w:hyperlink w:anchor="_Toc41489196" w:history="1">
             <w:r>
               <w:rPr>
                 <w:rStyle w:val="Lienhypertexte"/>
@@ -2955,7 +3320,7 @@
                 <w:noProof/>
                 <w:webHidden/>
               </w:rPr>
-              <w:instrText xml:space="preserve"> PAGEREF _Toc38635987 \h </w:instrText>
+              <w:instrText xml:space="preserve"> PAGEREF _Toc41489196 \h </w:instrText>
             </w:r>
             <w:r>
               <w:rPr>
@@ -2999,7 +3364,7 @@
               <w:lang w:eastAsia="en-GB"/>
             </w:rPr>
           </w:pPr>
-          <w:hyperlink w:anchor="_Toc38635988" w:history="1">
+          <w:hyperlink w:anchor="_Toc41489197" w:history="1">
             <w:r>
               <w:rPr>
                 <w:rStyle w:val="Lienhypertexte"/>
@@ -3041,7 +3406,7 @@
                 <w:noProof/>
                 <w:webHidden/>
               </w:rPr>
-              <w:instrText xml:space="preserve"> PAGEREF _Toc38635988 \h </w:instrText>
+              <w:instrText xml:space="preserve"> PAGEREF _Toc41489197 \h </w:instrText>
             </w:r>
             <w:r>
               <w:rPr>
@@ -3123,7 +3488,7 @@
           <w:lang w:val="fr-FR"/>
         </w:rPr>
       </w:pPr>
-      <w:bookmarkStart w:id="0" w:name="_Toc38635954"/>
+      <w:bookmarkStart w:id="0" w:name="_Toc41489159"/>
       <w:proofErr w:type="spellStart"/>
       <w:r>
         <w:rPr>
@@ -3150,7 +3515,7 @@
           <w:lang w:val="fr-FR"/>
         </w:rPr>
       </w:pPr>
-      <w:bookmarkStart w:id="1" w:name="_Toc38635955"/>
+      <w:bookmarkStart w:id="1" w:name="_Toc41489160"/>
       <w:r>
         <w:rPr>
           <w:lang w:val="fr-FR"/>
@@ -3173,7 +3538,7 @@
           <w:rFonts w:eastAsiaTheme="minorEastAsia"/>
         </w:rPr>
       </w:pPr>
-      <w:bookmarkStart w:id="2" w:name="_Toc38635956"/>
+      <w:bookmarkStart w:id="2" w:name="_Toc41489161"/>
       <w:r>
         <w:rPr>
           <w:rFonts w:eastAsiaTheme="minorEastAsia"/>
@@ -3562,7 +3927,13 @@
             <w:rPr>
               <w:rFonts w:ascii="Cambria Math" w:hAnsi="Cambria Math"/>
             </w:rPr>
-            <m:t>port_b.Q_flow=m_flow×cp</m:t>
+            <m:t>po</m:t>
+          </m:r>
+          <m:r>
+            <w:rPr>
+              <w:rFonts w:ascii="Cambria Math" w:hAnsi="Cambria Math"/>
+            </w:rPr>
+            <m:t>rt_b.Q_flow=m_flow×cp</m:t>
           </m:r>
           <m:d>
             <m:dPr>
@@ -3640,7 +4011,7 @@
           <w:rFonts w:eastAsiaTheme="minorEastAsia"/>
         </w:rPr>
       </w:pPr>
-      <w:bookmarkStart w:id="3" w:name="_Toc38635957"/>
+      <w:bookmarkStart w:id="3" w:name="_Toc41489162"/>
       <w:proofErr w:type="spellStart"/>
       <w:r>
         <w:rPr>
@@ -4601,7 +4972,7 @@
           <w:rFonts w:eastAsiaTheme="minorEastAsia"/>
         </w:rPr>
       </w:pPr>
-      <w:bookmarkStart w:id="4" w:name="_Toc38635958"/>
+      <w:bookmarkStart w:id="4" w:name="_Toc41489163"/>
       <w:proofErr w:type="spellStart"/>
       <w:r>
         <w:rPr>
@@ -5083,7 +5454,7 @@
           <w:lang w:val="fr-FR"/>
         </w:rPr>
       </w:pPr>
-      <w:bookmarkStart w:id="5" w:name="_Toc38635959"/>
+      <w:bookmarkStart w:id="5" w:name="_Toc41489164"/>
       <w:proofErr w:type="spellStart"/>
       <w:r>
         <w:rPr>
@@ -5109,7 +5480,7 @@
           <w:rFonts w:eastAsiaTheme="minorEastAsia"/>
         </w:rPr>
       </w:pPr>
-      <w:bookmarkStart w:id="6" w:name="_Toc38635960"/>
+      <w:bookmarkStart w:id="6" w:name="_Toc41489165"/>
       <w:proofErr w:type="spellStart"/>
       <w:r>
         <w:rPr>
@@ -5164,7 +5535,7 @@
           <w:rFonts w:eastAsiaTheme="minorEastAsia"/>
         </w:rPr>
       </w:pPr>
-      <w:bookmarkStart w:id="7" w:name="_Toc38635961"/>
+      <w:bookmarkStart w:id="7" w:name="_Toc41489166"/>
       <w:r>
         <w:rPr>
           <w:rFonts w:eastAsiaTheme="minorEastAsia"/>
@@ -5252,7 +5623,7 @@
           <w:rFonts w:eastAsiaTheme="minorEastAsia"/>
         </w:rPr>
       </w:pPr>
-      <w:bookmarkStart w:id="8" w:name="_Toc38635962"/>
+      <w:bookmarkStart w:id="8" w:name="_Toc41489167"/>
       <w:r>
         <w:rPr>
           <w:rFonts w:eastAsiaTheme="minorEastAsia"/>
@@ -5386,7 +5757,7 @@
           <w:rFonts w:eastAsiaTheme="minorEastAsia"/>
         </w:rPr>
       </w:pPr>
-      <w:bookmarkStart w:id="9" w:name="_Toc38635963"/>
+      <w:bookmarkStart w:id="9" w:name="_Toc41489168"/>
       <w:r>
         <w:rPr>
           <w:rFonts w:eastAsiaTheme="minorEastAsia"/>
@@ -5867,7 +6238,7 @@
           <w:rFonts w:eastAsiaTheme="minorEastAsia"/>
         </w:rPr>
       </w:pPr>
-      <w:bookmarkStart w:id="10" w:name="_Toc38635964"/>
+      <w:bookmarkStart w:id="10" w:name="_Toc41489169"/>
       <w:proofErr w:type="spellStart"/>
       <w:r>
         <w:rPr>
@@ -5942,7 +6313,7 @@
           <w:rFonts w:eastAsiaTheme="minorEastAsia"/>
         </w:rPr>
       </w:pPr>
-      <w:bookmarkStart w:id="11" w:name="_Toc38635965"/>
+      <w:bookmarkStart w:id="11" w:name="_Toc41489170"/>
       <w:proofErr w:type="spellStart"/>
       <w:r>
         <w:rPr>
@@ -6030,7 +6401,13 @@
                     <w:rPr>
                       <w:rFonts w:ascii="Cambria Math" w:eastAsiaTheme="minorEastAsia" w:hAnsi="Cambria Math"/>
                     </w:rPr>
-                    <m:t>Q_flow</m:t>
+                    <m:t>Q_f</m:t>
+                  </m:r>
+                  <m:r>
+                    <w:rPr>
+                      <w:rFonts w:ascii="Cambria Math" w:eastAsiaTheme="minorEastAsia" w:hAnsi="Cambria Math"/>
+                    </w:rPr>
+                    <m:t>low</m:t>
                   </m:r>
                 </m:e>
               </m:nary>
@@ -6055,7 +6432,7 @@
           <w:rFonts w:eastAsiaTheme="minorEastAsia"/>
         </w:rPr>
       </w:pPr>
-      <w:bookmarkStart w:id="12" w:name="_Toc38635966"/>
+      <w:bookmarkStart w:id="12" w:name="_Toc41489171"/>
       <w:r>
         <w:rPr>
           <w:rFonts w:eastAsiaTheme="minorEastAsia"/>
@@ -6778,7 +7155,7 @@
           <w:rFonts w:eastAsiaTheme="minorEastAsia"/>
         </w:rPr>
       </w:pPr>
-      <w:bookmarkStart w:id="13" w:name="_Toc38635967"/>
+      <w:bookmarkStart w:id="13" w:name="_Toc41489172"/>
       <w:proofErr w:type="spellStart"/>
       <w:r>
         <w:rPr>
@@ -6937,7 +7314,7 @@
           <w:lang w:val="fr-FR"/>
         </w:rPr>
       </w:pPr>
-      <w:bookmarkStart w:id="14" w:name="_Toc38635968"/>
+      <w:bookmarkStart w:id="14" w:name="_Toc41489173"/>
       <w:proofErr w:type="spellStart"/>
       <w:r>
         <w:rPr>
@@ -6964,7 +7341,7 @@
           <w:rFonts w:eastAsiaTheme="minorEastAsia"/>
         </w:rPr>
       </w:pPr>
-      <w:bookmarkStart w:id="15" w:name="_Toc38635969"/>
+      <w:bookmarkStart w:id="15" w:name="_Toc41489174"/>
       <w:proofErr w:type="spellStart"/>
       <w:r>
         <w:rPr>
@@ -7086,7 +7463,7 @@
           <w:rFonts w:eastAsiaTheme="minorEastAsia"/>
         </w:rPr>
       </w:pPr>
-      <w:bookmarkStart w:id="16" w:name="_Toc38635970"/>
+      <w:bookmarkStart w:id="16" w:name="_Toc41489175"/>
       <w:proofErr w:type="spellStart"/>
       <w:r>
         <w:rPr>
@@ -7209,7 +7586,7 @@
           <w:rFonts w:eastAsiaTheme="minorEastAsia"/>
         </w:rPr>
       </w:pPr>
-      <w:bookmarkStart w:id="17" w:name="_Toc38635971"/>
+      <w:bookmarkStart w:id="17" w:name="_Toc41489176"/>
       <w:proofErr w:type="spellStart"/>
       <w:proofErr w:type="gramStart"/>
       <w:r>
@@ -7354,7 +7731,7 @@
           <w:rFonts w:eastAsiaTheme="minorEastAsia"/>
         </w:rPr>
       </w:pPr>
-      <w:bookmarkStart w:id="18" w:name="_Toc38635972"/>
+      <w:bookmarkStart w:id="18" w:name="_Toc41489177"/>
       <w:proofErr w:type="spellStart"/>
       <w:proofErr w:type="gramStart"/>
       <w:r>
@@ -8368,7 +8745,7 @@
           <w:rFonts w:eastAsiaTheme="minorEastAsia"/>
         </w:rPr>
       </w:pPr>
-      <w:bookmarkStart w:id="19" w:name="_Toc38635973"/>
+      <w:bookmarkStart w:id="19" w:name="_Toc41489178"/>
       <w:proofErr w:type="spellStart"/>
       <w:proofErr w:type="gramStart"/>
       <w:r>
@@ -8393,13 +8770,7 @@
             <w:rPr>
               <w:rFonts w:ascii="Cambria Math" w:eastAsiaTheme="minorEastAsia" w:hAnsi="Cambria Math"/>
             </w:rPr>
-            <m:t>dx= B</m:t>
-          </m:r>
-          <m:r>
-            <w:rPr>
-              <w:rFonts w:ascii="Cambria Math" w:eastAsiaTheme="minorEastAsia" w:hAnsi="Cambria Math"/>
-            </w:rPr>
-            <m:t>iot×</m:t>
+            <m:t>dx= Biot×</m:t>
           </m:r>
           <m:f>
             <m:fPr>
@@ -8622,7 +8993,7 @@
           <w:rFonts w:eastAsiaTheme="minorEastAsia"/>
         </w:rPr>
       </w:pPr>
-      <w:bookmarkStart w:id="20" w:name="_Toc38635974"/>
+      <w:bookmarkStart w:id="20" w:name="_Toc41489179"/>
       <w:proofErr w:type="spellStart"/>
       <w:proofErr w:type="gramStart"/>
       <w:r>
@@ -9440,7 +9811,13 @@
             <w:rPr>
               <w:rFonts w:ascii="Cambria Math" w:eastAsiaTheme="minorEastAsia" w:hAnsi="Cambria Math"/>
             </w:rPr>
-            <m:t xml:space="preserve"> for i from n+2 to N</m:t>
+            <m:t xml:space="preserve"> for i from n+2 t</m:t>
+          </m:r>
+          <m:r>
+            <w:rPr>
+              <w:rFonts w:ascii="Cambria Math" w:eastAsiaTheme="minorEastAsia" w:hAnsi="Cambria Math"/>
+            </w:rPr>
+            <m:t>o N</m:t>
           </m:r>
         </m:oMath>
       </m:oMathPara>
@@ -9682,7 +10059,7 @@
           <w:rFonts w:eastAsiaTheme="minorEastAsia"/>
         </w:rPr>
       </w:pPr>
-      <w:bookmarkStart w:id="21" w:name="_Toc38635975"/>
+      <w:bookmarkStart w:id="21" w:name="_Toc41489180"/>
       <w:proofErr w:type="spellStart"/>
       <w:proofErr w:type="gramStart"/>
       <w:r>
@@ -9865,7 +10242,7 @@
           <w:rFonts w:eastAsiaTheme="minorEastAsia"/>
         </w:rPr>
       </w:pPr>
-      <w:bookmarkStart w:id="22" w:name="_Toc38635976"/>
+      <w:bookmarkStart w:id="22" w:name="_Toc41489181"/>
       <w:proofErr w:type="spellStart"/>
       <w:r>
         <w:rPr>
@@ -10115,7 +10492,7 @@
           <w:lang w:val="fr-FR"/>
         </w:rPr>
       </w:pPr>
-      <w:bookmarkStart w:id="23" w:name="_Toc38635977"/>
+      <w:bookmarkStart w:id="23" w:name="_Toc41489182"/>
       <w:proofErr w:type="spellStart"/>
       <w:r>
         <w:rPr>
@@ -10142,12 +10519,14 @@
           <w:lang w:val="fr-FR"/>
         </w:rPr>
       </w:pPr>
+      <w:bookmarkStart w:id="24" w:name="_Toc41489183"/>
       <w:r>
         <w:rPr>
           <w:lang w:val="fr-FR"/>
         </w:rPr>
         <w:t>Components</w:t>
       </w:r>
+      <w:bookmarkEnd w:id="24"/>
     </w:p>
     <w:p>
       <w:pPr>
@@ -10163,6 +10542,7 @@
           <w:lang w:val="fr-FR"/>
         </w:rPr>
       </w:pPr>
+      <w:bookmarkStart w:id="25" w:name="_Toc41489184"/>
       <w:proofErr w:type="spellStart"/>
       <w:r>
         <w:rPr>
@@ -10170,6 +10550,7 @@
         </w:rPr>
         <w:t>PartialPump</w:t>
       </w:r>
+      <w:bookmarkEnd w:id="25"/>
       <w:proofErr w:type="spellEnd"/>
     </w:p>
     <w:p>
@@ -10259,7 +10640,7 @@
     <w:p>
       <w:pPr>
         <w:rPr>
-          <w:lang w:val="fr-FR"/>
+          <w:rFonts w:eastAsiaTheme="minorEastAsia"/>
         </w:rPr>
       </w:pPr>
       <m:oMathPara>
@@ -10322,27 +10703,374 @@
     </w:p>
     <w:p>
       <w:pPr>
+        <w:pStyle w:val="Titre3"/>
         <w:rPr>
           <w:lang w:val="fr-FR"/>
         </w:rPr>
       </w:pPr>
-    </w:p>
-    <w:p>
-      <w:pPr>
-        <w:pStyle w:val="Titre2"/>
-        <w:rPr>
-          <w:lang w:val="fr-FR"/>
-        </w:rPr>
-      </w:pPr>
-      <w:bookmarkStart w:id="24" w:name="_Toc38635978"/>
       <w:proofErr w:type="spellStart"/>
       <w:r>
         <w:rPr>
           <w:lang w:val="fr-FR"/>
         </w:rPr>
+        <w:t>SimpleOpening</w:t>
+      </w:r>
+      <w:proofErr w:type="spellEnd"/>
+    </w:p>
+    <w:p>
+      <w:pPr>
+        <w:rPr>
+          <w:lang w:val="fr-FR"/>
+        </w:rPr>
+      </w:pPr>
+      <w:bookmarkStart w:id="26" w:name="_GoBack"/>
+      <w:bookmarkEnd w:id="26"/>
+    </w:p>
+    <w:p>
+      <w:pPr>
+        <w:rPr>
+          <w:rFonts w:eastAsiaTheme="minorEastAsia"/>
+        </w:rPr>
+      </w:pPr>
+      <m:oMathPara>
+        <m:oMath>
+          <m:r>
+            <w:rPr>
+              <w:rFonts w:ascii="Cambria Math" w:eastAsiaTheme="minorEastAsia" w:hAnsi="Cambria Math"/>
+            </w:rPr>
+            <m:t>dp=</m:t>
+          </m:r>
+          <m:f>
+            <m:fPr>
+              <m:ctrlPr>
+                <w:rPr>
+                  <w:rFonts w:ascii="Cambria Math" w:eastAsiaTheme="minorEastAsia" w:hAnsi="Cambria Math"/>
+                  <w:i/>
+                </w:rPr>
+              </m:ctrlPr>
+            </m:fPr>
+            <m:num>
+              <m:r>
+                <w:rPr>
+                  <w:rFonts w:ascii="Cambria Math" w:eastAsiaTheme="minorEastAsia" w:hAnsi="Cambria Math"/>
+                </w:rPr>
+                <m:t>1</m:t>
+              </m:r>
+            </m:num>
+            <m:den>
+              <m:r>
+                <w:rPr>
+                  <w:rFonts w:ascii="Cambria Math" w:eastAsiaTheme="minorEastAsia" w:hAnsi="Cambria Math"/>
+                </w:rPr>
+                <m:t>2</m:t>
+              </m:r>
+            </m:den>
+          </m:f>
+          <m:r>
+            <w:rPr>
+              <w:rFonts w:ascii="Cambria Math" w:eastAsiaTheme="minorEastAsia" w:hAnsi="Cambria Math"/>
+            </w:rPr>
+            <m:t>×d×</m:t>
+          </m:r>
+          <m:sSup>
+            <m:sSupPr>
+              <m:ctrlPr>
+                <w:rPr>
+                  <w:rFonts w:ascii="Cambria Math" w:eastAsiaTheme="minorEastAsia" w:hAnsi="Cambria Math"/>
+                  <w:i/>
+                </w:rPr>
+              </m:ctrlPr>
+            </m:sSupPr>
+            <m:e>
+              <m:r>
+                <w:rPr>
+                  <w:rFonts w:ascii="Cambria Math" w:eastAsiaTheme="minorEastAsia" w:hAnsi="Cambria Math"/>
+                </w:rPr>
+                <m:t>Vel</m:t>
+              </m:r>
+            </m:e>
+            <m:sup>
+              <m:r>
+                <w:rPr>
+                  <w:rFonts w:ascii="Cambria Math" w:eastAsiaTheme="minorEastAsia" w:hAnsi="Cambria Math"/>
+                </w:rPr>
+                <m:t>2</m:t>
+              </m:r>
+            </m:sup>
+          </m:sSup>
+        </m:oMath>
+      </m:oMathPara>
+    </w:p>
+    <w:p>
+      <w:pPr>
+        <w:rPr>
+          <w:rFonts w:eastAsiaTheme="minorEastAsia"/>
+        </w:rPr>
+      </w:pPr>
+      <m:oMathPara>
+        <m:oMath>
+          <m:r>
+            <w:rPr>
+              <w:rFonts w:ascii="Cambria Math" w:eastAsiaTheme="minorEastAsia" w:hAnsi="Cambria Math"/>
+            </w:rPr>
+            <m:t>m_flow=d×</m:t>
+          </m:r>
+          <m:sSub>
+            <m:sSubPr>
+              <m:ctrlPr>
+                <w:rPr>
+                  <w:rFonts w:ascii="Cambria Math" w:eastAsiaTheme="minorEastAsia" w:hAnsi="Cambria Math"/>
+                  <w:i/>
+                </w:rPr>
+              </m:ctrlPr>
+            </m:sSubPr>
+            <m:e>
+              <m:r>
+                <w:rPr>
+                  <w:rFonts w:ascii="Cambria Math" w:eastAsiaTheme="minorEastAsia" w:hAnsi="Cambria Math"/>
+                </w:rPr>
+                <m:t>A</m:t>
+              </m:r>
+            </m:e>
+            <m:sub>
+              <m:r>
+                <w:rPr>
+                  <w:rFonts w:ascii="Cambria Math" w:eastAsiaTheme="minorEastAsia" w:hAnsi="Cambria Math"/>
+                </w:rPr>
+                <m:t>flow</m:t>
+              </m:r>
+            </m:sub>
+          </m:sSub>
+          <m:r>
+            <w:rPr>
+              <w:rFonts w:ascii="Cambria Math" w:eastAsiaTheme="minorEastAsia" w:hAnsi="Cambria Math"/>
+            </w:rPr>
+            <m:t>×Vel=A×</m:t>
+          </m:r>
+          <m:r>
+            <w:rPr>
+              <w:rFonts w:ascii="Cambria Math" w:eastAsiaTheme="minorEastAsia" w:hAnsi="Cambria Math"/>
+            </w:rPr>
+            <m:t>Cd×</m:t>
+          </m:r>
+          <m:rad>
+            <m:radPr>
+              <m:degHide m:val="1"/>
+              <m:ctrlPr>
+                <w:rPr>
+                  <w:rFonts w:ascii="Cambria Math" w:eastAsiaTheme="minorEastAsia" w:hAnsi="Cambria Math"/>
+                  <w:i/>
+                </w:rPr>
+              </m:ctrlPr>
+            </m:radPr>
+            <m:deg/>
+            <m:e>
+              <m:r>
+                <w:rPr>
+                  <w:rFonts w:ascii="Cambria Math" w:eastAsiaTheme="minorEastAsia" w:hAnsi="Cambria Math"/>
+                </w:rPr>
+                <m:t>2×dp×d</m:t>
+              </m:r>
+            </m:e>
+          </m:rad>
+        </m:oMath>
+      </m:oMathPara>
+    </w:p>
+    <w:p>
+      <w:pPr>
+        <w:rPr>
+          <w:rFonts w:eastAsiaTheme="minorEastAsia"/>
+        </w:rPr>
+      </w:pPr>
+    </w:p>
+    <w:p>
+      <w:pPr>
+        <w:pStyle w:val="Titre3"/>
+        <w:rPr>
+          <w:rFonts w:asciiTheme="minorHAnsi" w:eastAsiaTheme="minorEastAsia" w:hAnsiTheme="minorHAnsi" w:cstheme="minorBidi"/>
+        </w:rPr>
+      </w:pPr>
+      <w:proofErr w:type="spellStart"/>
+      <w:r>
+        <w:rPr>
+          <w:rFonts w:eastAsiaTheme="minorEastAsia"/>
+        </w:rPr>
+        <w:t>StaticPipe</w:t>
+      </w:r>
+      <w:proofErr w:type="spellEnd"/>
+    </w:p>
+    <w:p/>
+    <w:p>
+      <w:pPr>
+        <w:ind w:left="-567" w:right="-567"/>
+        <w:rPr>
+          <w:rFonts w:eastAsiaTheme="minorEastAsia"/>
+        </w:rPr>
+      </w:pPr>
+      <m:oMathPara>
+        <m:oMath>
+          <m:r>
+            <w:rPr>
+              <w:rFonts w:ascii="Cambria Math" w:eastAsiaTheme="minorEastAsia" w:hAnsi="Cambria Math"/>
+            </w:rPr>
+            <m:t>dp=</m:t>
+          </m:r>
+          <m:f>
+            <m:fPr>
+              <m:ctrlPr>
+                <w:rPr>
+                  <w:rFonts w:ascii="Cambria Math" w:eastAsiaTheme="minorEastAsia" w:hAnsi="Cambria Math"/>
+                  <w:i/>
+                </w:rPr>
+              </m:ctrlPr>
+            </m:fPr>
+            <m:num>
+              <m:r>
+                <w:rPr>
+                  <w:rFonts w:ascii="Cambria Math" w:eastAsiaTheme="minorEastAsia" w:hAnsi="Cambria Math"/>
+                </w:rPr>
+                <m:t>1</m:t>
+              </m:r>
+            </m:num>
+            <m:den>
+              <m:r>
+                <w:rPr>
+                  <w:rFonts w:ascii="Cambria Math" w:eastAsiaTheme="minorEastAsia" w:hAnsi="Cambria Math"/>
+                </w:rPr>
+                <m:t>2</m:t>
+              </m:r>
+            </m:den>
+          </m:f>
+          <m:r>
+            <w:rPr>
+              <w:rFonts w:ascii="Cambria Math" w:eastAsiaTheme="minorEastAsia" w:hAnsi="Cambria Math"/>
+            </w:rPr>
+            <m:t>×ksi×d×</m:t>
+          </m:r>
+          <m:sSup>
+            <m:sSupPr>
+              <m:ctrlPr>
+                <w:rPr>
+                  <w:rFonts w:ascii="Cambria Math" w:eastAsiaTheme="minorEastAsia" w:hAnsi="Cambria Math"/>
+                  <w:i/>
+                </w:rPr>
+              </m:ctrlPr>
+            </m:sSupPr>
+            <m:e>
+              <m:r>
+                <w:rPr>
+                  <w:rFonts w:ascii="Cambria Math" w:eastAsiaTheme="minorEastAsia" w:hAnsi="Cambria Math"/>
+                </w:rPr>
+                <m:t>Vel</m:t>
+              </m:r>
+            </m:e>
+            <m:sup>
+              <m:r>
+                <w:rPr>
+                  <w:rFonts w:ascii="Cambria Math" w:eastAsiaTheme="minorEastAsia" w:hAnsi="Cambria Math"/>
+                </w:rPr>
+                <m:t>2</m:t>
+              </m:r>
+            </m:sup>
+          </m:sSup>
+        </m:oMath>
+      </m:oMathPara>
+    </w:p>
+    <w:p>
+      <w:pPr>
+        <w:ind w:left="-567" w:right="-567"/>
+        <w:rPr>
+          <w:rFonts w:eastAsiaTheme="minorEastAsia"/>
+        </w:rPr>
+      </w:pPr>
+      <m:oMathPara>
+        <m:oMath>
+          <m:r>
+            <w:rPr>
+              <w:rFonts w:ascii="Cambria Math" w:eastAsiaTheme="minorEastAsia" w:hAnsi="Cambria Math"/>
+            </w:rPr>
+            <m:t>m_flow=d×A×Vel=A×</m:t>
+          </m:r>
+          <m:rad>
+            <m:radPr>
+              <m:degHide m:val="1"/>
+              <m:ctrlPr>
+                <w:rPr>
+                  <w:rFonts w:ascii="Cambria Math" w:eastAsiaTheme="minorEastAsia" w:hAnsi="Cambria Math"/>
+                  <w:i/>
+                </w:rPr>
+              </m:ctrlPr>
+            </m:radPr>
+            <m:deg/>
+            <m:e>
+              <m:f>
+                <m:fPr>
+                  <m:ctrlPr>
+                    <w:rPr>
+                      <w:rFonts w:ascii="Cambria Math" w:eastAsiaTheme="minorEastAsia" w:hAnsi="Cambria Math"/>
+                      <w:i/>
+                    </w:rPr>
+                  </m:ctrlPr>
+                </m:fPr>
+                <m:num>
+                  <m:r>
+                    <w:rPr>
+                      <w:rFonts w:ascii="Cambria Math" w:eastAsiaTheme="minorEastAsia" w:hAnsi="Cambria Math"/>
+                    </w:rPr>
+                    <m:t>2×dp×d</m:t>
+                  </m:r>
+                </m:num>
+                <m:den>
+                  <m:r>
+                    <w:rPr>
+                      <w:rFonts w:ascii="Cambria Math" w:eastAsiaTheme="minorEastAsia" w:hAnsi="Cambria Math"/>
+                    </w:rPr>
+                    <m:t>ksi</m:t>
+                  </m:r>
+                </m:den>
+              </m:f>
+            </m:e>
+          </m:rad>
+        </m:oMath>
+      </m:oMathPara>
+    </w:p>
+    <w:p>
+      <w:pPr>
+        <w:rPr>
+          <w:rFonts w:eastAsiaTheme="minorEastAsia"/>
+        </w:rPr>
+      </w:pPr>
+    </w:p>
+    <w:p>
+      <w:pPr>
+        <w:rPr>
+          <w:lang w:val="fr-FR"/>
+        </w:rPr>
+      </w:pPr>
+    </w:p>
+    <w:p>
+      <w:pPr>
+        <w:rPr>
+          <w:lang w:val="fr-FR"/>
+        </w:rPr>
+      </w:pPr>
+    </w:p>
+    <w:p>
+      <w:pPr>
+        <w:pStyle w:val="Titre2"/>
+        <w:rPr>
+          <w:lang w:val="fr-FR"/>
+        </w:rPr>
+      </w:pPr>
+      <w:bookmarkStart w:id="27" w:name="_Toc41489185"/>
+      <w:proofErr w:type="spellStart"/>
+      <w:r>
+        <w:rPr>
+          <w:lang w:val="fr-FR"/>
+        </w:rPr>
         <w:t>BasesClasses</w:t>
       </w:r>
-      <w:bookmarkEnd w:id="24"/>
+      <w:bookmarkEnd w:id="27"/>
       <w:proofErr w:type="spellEnd"/>
     </w:p>
     <w:p>
@@ -10359,7 +11087,7 @@
           <w:rFonts w:eastAsiaTheme="minorEastAsia"/>
         </w:rPr>
       </w:pPr>
-      <w:bookmarkStart w:id="25" w:name="_Toc38635979"/>
+      <w:bookmarkStart w:id="28" w:name="_Toc41489186"/>
       <w:proofErr w:type="spellStart"/>
       <w:r>
         <w:rPr>
@@ -10367,7 +11095,7 @@
         </w:rPr>
         <w:t>AeraulicConvection</w:t>
       </w:r>
-      <w:bookmarkEnd w:id="25"/>
+      <w:bookmarkEnd w:id="28"/>
       <w:proofErr w:type="spellEnd"/>
     </w:p>
     <w:p/>
@@ -10621,11 +11349,12 @@
           <w:rFonts w:eastAsiaTheme="minorEastAsia"/>
         </w:rPr>
       </w:pPr>
-      <w:bookmarkStart w:id="26" w:name="_Toc38635980"/>
+      <w:bookmarkStart w:id="29" w:name="_Toc41489187"/>
       <w:r>
         <w:rPr>
           <w:rFonts w:eastAsiaTheme="minorEastAsia"/>
         </w:rPr>
+        <w:lastRenderedPageBreak/>
         <w:t>Con</w:t>
       </w:r>
       <w:r>
@@ -10634,7 +11363,7 @@
         </w:rPr>
         <w:t>densation</w:t>
       </w:r>
-      <w:bookmarkEnd w:id="26"/>
+      <w:bookmarkEnd w:id="29"/>
     </w:p>
     <w:p/>
     <w:p>
@@ -10668,13 +11397,7 @@
                 <w:rPr>
                   <w:rFonts w:ascii="Cambria Math" w:hAnsi="Cambria Math"/>
                 </w:rPr>
-                <m:t>mo</m:t>
-              </m:r>
-              <m:r>
-                <w:rPr>
-                  <w:rFonts w:ascii="Cambria Math" w:hAnsi="Cambria Math"/>
-                </w:rPr>
-                <m:t>ved by convection</m:t>
+                <m:t>moved by convection</m:t>
               </m:r>
             </m:sub>
           </m:sSub>
@@ -10848,7 +11571,7 @@
           <w:rFonts w:eastAsiaTheme="minorEastAsia"/>
         </w:rPr>
       </w:pPr>
-      <w:bookmarkStart w:id="27" w:name="_Toc38635981"/>
+      <w:bookmarkStart w:id="30" w:name="_Toc41489188"/>
       <w:proofErr w:type="spellStart"/>
       <w:r>
         <w:rPr>
@@ -10856,7 +11579,7 @@
         </w:rPr>
         <w:t>MolecularDiffusion</w:t>
       </w:r>
-      <w:bookmarkEnd w:id="27"/>
+      <w:bookmarkEnd w:id="30"/>
       <w:proofErr w:type="spellEnd"/>
     </w:p>
     <w:p/>
@@ -11128,7 +11851,7 @@
           <w:rFonts w:eastAsiaTheme="minorEastAsia"/>
         </w:rPr>
       </w:pPr>
-      <w:bookmarkStart w:id="28" w:name="_Toc38635982"/>
+      <w:bookmarkStart w:id="31" w:name="_Toc41489189"/>
       <w:proofErr w:type="spellStart"/>
       <w:r>
         <w:rPr>
@@ -11136,7 +11859,7 @@
         </w:rPr>
         <w:t>GasNode</w:t>
       </w:r>
-      <w:bookmarkEnd w:id="28"/>
+      <w:bookmarkEnd w:id="31"/>
       <w:proofErr w:type="spellEnd"/>
     </w:p>
     <w:p/>
@@ -11164,7 +11887,6 @@
             <w:rPr>
               <w:rFonts w:ascii="Cambria Math" w:eastAsiaTheme="minorEastAsia" w:hAnsi="Cambria Math"/>
             </w:rPr>
-            <w:lastRenderedPageBreak/>
             <m:t>U=m×medium.u</m:t>
           </m:r>
         </m:oMath>
@@ -11344,12 +12066,12 @@
       <w:pPr>
         <w:pStyle w:val="Titre3"/>
       </w:pPr>
-      <w:bookmarkStart w:id="29" w:name="_Toc38635983"/>
+      <w:bookmarkStart w:id="32" w:name="_Toc41489190"/>
       <w:proofErr w:type="spellStart"/>
       <w:r>
         <w:t>FogModel</w:t>
       </w:r>
-      <w:bookmarkEnd w:id="29"/>
+      <w:bookmarkEnd w:id="32"/>
       <w:proofErr w:type="spellEnd"/>
     </w:p>
     <w:p/>
@@ -11833,6 +12555,7 @@
             <w:rPr>
               <w:rFonts w:ascii="Cambria Math" w:eastAsiaTheme="minorEastAsia" w:hAnsi="Cambria Math"/>
             </w:rPr>
+            <w:lastRenderedPageBreak/>
             <m:t xml:space="preserve">Π=  </m:t>
           </m:r>
           <m:sSub>
@@ -12448,7 +13171,6 @@
             <w:rPr>
               <w:rFonts w:ascii="Cambria Math" w:eastAsiaTheme="minorEastAsia" w:hAnsi="Cambria Math"/>
             </w:rPr>
-            <w:lastRenderedPageBreak/>
             <m:t>mXi_flow[i]</m:t>
           </m:r>
           <m:r>
@@ -12664,11 +13386,11 @@
       <w:pPr>
         <w:pStyle w:val="Titre2"/>
       </w:pPr>
-      <w:bookmarkStart w:id="30" w:name="_Toc38635984"/>
+      <w:bookmarkStart w:id="33" w:name="_Toc41489191"/>
       <w:r>
         <w:t>Functions</w:t>
       </w:r>
-      <w:bookmarkEnd w:id="30"/>
+      <w:bookmarkEnd w:id="33"/>
     </w:p>
     <w:p>
       <w:pPr>
@@ -12684,14 +13406,14 @@
           <w:rFonts w:eastAsiaTheme="minorEastAsia"/>
         </w:rPr>
       </w:pPr>
-      <w:bookmarkStart w:id="31" w:name="_Toc38635985"/>
+      <w:bookmarkStart w:id="34" w:name="_Toc41489192"/>
       <w:r>
         <w:rPr>
           <w:rFonts w:eastAsiaTheme="minorEastAsia"/>
         </w:rPr>
         <w:t>rootsPolyorder3</w:t>
       </w:r>
-      <w:bookmarkEnd w:id="31"/>
+      <w:bookmarkEnd w:id="34"/>
     </w:p>
     <w:p/>
     <w:p>
@@ -12993,6 +13715,7 @@
             <w:rPr>
               <w:rFonts w:ascii="Cambria Math" w:eastAsiaTheme="minorEastAsia" w:hAnsi="Cambria Math"/>
             </w:rPr>
+            <w:lastRenderedPageBreak/>
             <m:t>x1=</m:t>
           </m:r>
           <m:rad>
@@ -13821,7 +14544,6 @@
             <w:rPr>
               <w:rFonts w:ascii="Cambria Math" w:eastAsiaTheme="minorEastAsia" w:hAnsi="Cambria Math"/>
             </w:rPr>
-            <w:lastRenderedPageBreak/>
             <m:t>x3=2×</m:t>
           </m:r>
           <m:rad>
@@ -14785,254 +15507,76 @@
     <w:p>
       <w:pPr>
         <w:rPr>
-          <w:rFonts w:eastAsiaTheme="minorEastAsia"/>
+          <w:lang w:val="fr-FR"/>
+        </w:rPr>
+      </w:pPr>
+    </w:p>
+    <w:p>
+      <w:pPr>
+        <w:rPr>
+          <w:rFonts w:eastAsiaTheme="minorEastAsia"/>
+        </w:rPr>
+      </w:pPr>
+      <w:r>
+        <w:rPr>
+          <w:rFonts w:eastAsiaTheme="minorEastAsia"/>
+        </w:rPr>
+        <w:br w:type="page"/>
+      </w:r>
+    </w:p>
+    <w:p>
+      <w:pPr>
+        <w:pStyle w:val="Titre1"/>
+        <w:rPr>
+          <w:rFonts w:eastAsiaTheme="minorEastAsia"/>
+          <w:lang w:val="fr-FR"/>
+        </w:rPr>
+      </w:pPr>
+      <w:bookmarkStart w:id="35" w:name="_Toc41489195"/>
+      <w:r>
+        <w:rPr>
+          <w:rFonts w:eastAsiaTheme="minorEastAsia"/>
+          <w:lang w:val="fr-FR"/>
+        </w:rPr>
+        <w:lastRenderedPageBreak/>
+        <w:t>PDE</w:t>
+      </w:r>
+      <w:bookmarkEnd w:id="35"/>
+    </w:p>
+    <w:p>
+      <w:pPr>
+        <w:rPr>
+          <w:lang w:val="fr-FR"/>
         </w:rPr>
       </w:pPr>
     </w:p>
     <w:p>
       <w:pPr>
         <w:pStyle w:val="Titre2"/>
-        <w:numPr>
-          <w:ilvl w:val="1"/>
-          <w:numId w:val="10"/>
-        </w:numPr>
-      </w:pPr>
-      <w:r>
-        <w:t>Components</w:t>
-      </w:r>
-    </w:p>
-    <w:p>
-      <w:pPr>
         <w:rPr>
           <w:lang w:val="fr-FR"/>
         </w:rPr>
       </w:pPr>
-    </w:p>
-    <w:p>
-      <w:pPr>
-        <w:pStyle w:val="Titre3"/>
-        <w:rPr>
-          <w:rFonts w:eastAsiaTheme="minorEastAsia"/>
-        </w:rPr>
-      </w:pPr>
+      <w:bookmarkStart w:id="36" w:name="_Toc41489196"/>
       <w:proofErr w:type="spellStart"/>
       <w:r>
         <w:rPr>
-          <w:rFonts w:eastAsiaTheme="minorEastAsia"/>
-        </w:rPr>
-        <w:t>StaticPipe</w:t>
-      </w:r>
-      <w:proofErr w:type="spellEnd"/>
-    </w:p>
-    <w:p/>
-    <w:p>
-      <w:pPr>
-        <w:ind w:left="-567" w:right="-567"/>
-        <w:rPr>
-          <w:rFonts w:eastAsiaTheme="minorEastAsia"/>
-        </w:rPr>
-      </w:pPr>
-      <m:oMathPara>
-        <m:oMath>
-          <m:r>
-            <w:rPr>
-              <w:rFonts w:ascii="Cambria Math" w:eastAsiaTheme="minorEastAsia" w:hAnsi="Cambria Math"/>
-            </w:rPr>
-            <m:t>dp=</m:t>
-          </m:r>
-          <m:f>
-            <m:fPr>
-              <m:ctrlPr>
-                <w:rPr>
-                  <w:rFonts w:ascii="Cambria Math" w:eastAsiaTheme="minorEastAsia" w:hAnsi="Cambria Math"/>
-                  <w:i/>
-                </w:rPr>
-              </m:ctrlPr>
-            </m:fPr>
-            <m:num>
-              <m:r>
-                <w:rPr>
-                  <w:rFonts w:ascii="Cambria Math" w:eastAsiaTheme="minorEastAsia" w:hAnsi="Cambria Math"/>
-                </w:rPr>
-                <m:t>1</m:t>
-              </m:r>
-            </m:num>
-            <m:den>
-              <m:r>
-                <w:rPr>
-                  <w:rFonts w:ascii="Cambria Math" w:eastAsiaTheme="minorEastAsia" w:hAnsi="Cambria Math"/>
-                </w:rPr>
-                <m:t>2</m:t>
-              </m:r>
-            </m:den>
-          </m:f>
-          <m:r>
-            <w:rPr>
-              <w:rFonts w:ascii="Cambria Math" w:eastAsiaTheme="minorEastAsia" w:hAnsi="Cambria Math"/>
-            </w:rPr>
-            <m:t>×ksi×d×</m:t>
-          </m:r>
-          <m:sSup>
-            <m:sSupPr>
-              <m:ctrlPr>
-                <w:rPr>
-                  <w:rFonts w:ascii="Cambria Math" w:eastAsiaTheme="minorEastAsia" w:hAnsi="Cambria Math"/>
-                  <w:i/>
-                </w:rPr>
-              </m:ctrlPr>
-            </m:sSupPr>
-            <m:e>
-              <m:r>
-                <w:rPr>
-                  <w:rFonts w:ascii="Cambria Math" w:eastAsiaTheme="minorEastAsia" w:hAnsi="Cambria Math"/>
-                </w:rPr>
-                <m:t>Vel</m:t>
-              </m:r>
-            </m:e>
-            <m:sup>
-              <m:r>
-                <w:rPr>
-                  <w:rFonts w:ascii="Cambria Math" w:eastAsiaTheme="minorEastAsia" w:hAnsi="Cambria Math"/>
-                </w:rPr>
-                <m:t>2</m:t>
-              </m:r>
-            </m:sup>
-          </m:sSup>
-        </m:oMath>
-      </m:oMathPara>
-    </w:p>
-    <w:p>
-      <w:pPr>
-        <w:ind w:left="-567" w:right="-567"/>
-        <w:rPr>
-          <w:rFonts w:eastAsiaTheme="minorEastAsia"/>
-        </w:rPr>
-      </w:pPr>
-      <m:oMathPara>
-        <m:oMath>
-          <m:r>
-            <w:rPr>
-              <w:rFonts w:ascii="Cambria Math" w:eastAsiaTheme="minorEastAsia" w:hAnsi="Cambria Math"/>
-            </w:rPr>
-            <m:t>m_flow=d×A×Vel=A×</m:t>
-          </m:r>
-          <m:rad>
-            <m:radPr>
-              <m:degHide m:val="1"/>
-              <m:ctrlPr>
-                <w:rPr>
-                  <w:rFonts w:ascii="Cambria Math" w:eastAsiaTheme="minorEastAsia" w:hAnsi="Cambria Math"/>
-                  <w:i/>
-                </w:rPr>
-              </m:ctrlPr>
-            </m:radPr>
-            <m:deg/>
-            <m:e>
-              <m:f>
-                <m:fPr>
-                  <m:ctrlPr>
-                    <w:rPr>
-                      <w:rFonts w:ascii="Cambria Math" w:eastAsiaTheme="minorEastAsia" w:hAnsi="Cambria Math"/>
-                      <w:i/>
-                    </w:rPr>
-                  </m:ctrlPr>
-                </m:fPr>
-                <m:num>
-                  <m:r>
-                    <w:rPr>
-                      <w:rFonts w:ascii="Cambria Math" w:eastAsiaTheme="minorEastAsia" w:hAnsi="Cambria Math"/>
-                    </w:rPr>
-                    <m:t>2×dp×d</m:t>
-                  </m:r>
-                </m:num>
-                <m:den>
-                  <m:r>
-                    <w:rPr>
-                      <w:rFonts w:ascii="Cambria Math" w:eastAsiaTheme="minorEastAsia" w:hAnsi="Cambria Math"/>
-                    </w:rPr>
-                    <m:t>ksi</m:t>
-                  </m:r>
-                </m:den>
-              </m:f>
-            </m:e>
-          </m:rad>
-        </m:oMath>
-      </m:oMathPara>
-    </w:p>
-    <w:p>
-      <w:pPr>
-        <w:rPr>
-          <w:rFonts w:eastAsiaTheme="minorEastAsia"/>
-        </w:rPr>
-      </w:pPr>
-      <w:r>
-        <w:rPr>
-          <w:rFonts w:eastAsiaTheme="minorEastAsia"/>
-        </w:rPr>
-        <w:br w:type="page"/>
-      </w:r>
-    </w:p>
-    <w:p>
-      <w:pPr>
-        <w:rPr>
-          <w:rFonts w:eastAsiaTheme="minorEastAsia"/>
-        </w:rPr>
-      </w:pPr>
-      <w:bookmarkStart w:id="32" w:name="_GoBack"/>
-      <w:bookmarkEnd w:id="32"/>
-    </w:p>
-    <w:p>
-      <w:pPr>
-        <w:pStyle w:val="Titre1"/>
-        <w:rPr>
-          <w:rFonts w:eastAsiaTheme="minorEastAsia"/>
-          <w:lang w:val="fr-FR"/>
-        </w:rPr>
-      </w:pPr>
-      <w:bookmarkStart w:id="33" w:name="_Toc38635986"/>
-      <w:r>
-        <w:rPr>
-          <w:rFonts w:eastAsiaTheme="minorEastAsia"/>
-          <w:lang w:val="fr-FR"/>
-        </w:rPr>
-        <w:t>PDE</w:t>
-      </w:r>
-      <w:bookmarkEnd w:id="33"/>
-    </w:p>
-    <w:p>
-      <w:pPr>
-        <w:rPr>
-          <w:lang w:val="fr-FR"/>
-        </w:rPr>
-      </w:pPr>
-    </w:p>
-    <w:p>
-      <w:pPr>
-        <w:pStyle w:val="Titre2"/>
-        <w:rPr>
-          <w:lang w:val="fr-FR"/>
-        </w:rPr>
-      </w:pPr>
-      <w:bookmarkStart w:id="34" w:name="_Toc38635987"/>
-      <w:proofErr w:type="spellStart"/>
-      <w:r>
-        <w:rPr>
           <w:lang w:val="fr-FR"/>
         </w:rPr>
         <w:t>ThermalDiffusion</w:t>
       </w:r>
-      <w:bookmarkEnd w:id="34"/>
+      <w:bookmarkEnd w:id="36"/>
       <w:proofErr w:type="spellEnd"/>
     </w:p>
     <w:p>
       <w:pPr>
         <w:pStyle w:val="Titre3"/>
       </w:pPr>
-      <w:bookmarkStart w:id="35" w:name="_Toc38635988"/>
+      <w:bookmarkStart w:id="37" w:name="_Toc41489197"/>
       <w:r>
         <w:t>Second order central</w:t>
       </w:r>
-      <w:bookmarkEnd w:id="35"/>
+      <w:bookmarkEnd w:id="37"/>
     </w:p>
     <w:p>
       <w:pPr>
@@ -17841,6 +18385,66 @@
     </w:lvlOverride>
   </w:num>
   <w:num w:numId="10">
+    <w:abstractNumId w:val="1"/>
+    <w:lvlOverride w:ilvl="0">
+      <w:startOverride w:val="1"/>
+    </w:lvlOverride>
+    <w:lvlOverride w:ilvl="1">
+      <w:startOverride w:val="1"/>
+    </w:lvlOverride>
+    <w:lvlOverride w:ilvl="2">
+      <w:startOverride w:val="1"/>
+    </w:lvlOverride>
+    <w:lvlOverride w:ilvl="3">
+      <w:startOverride w:val="1"/>
+    </w:lvlOverride>
+    <w:lvlOverride w:ilvl="4">
+      <w:startOverride w:val="1"/>
+    </w:lvlOverride>
+    <w:lvlOverride w:ilvl="5">
+      <w:startOverride w:val="1"/>
+    </w:lvlOverride>
+    <w:lvlOverride w:ilvl="6">
+      <w:startOverride w:val="1"/>
+    </w:lvlOverride>
+    <w:lvlOverride w:ilvl="7">
+      <w:startOverride w:val="1"/>
+    </w:lvlOverride>
+    <w:lvlOverride w:ilvl="8">
+      <w:startOverride w:val="1"/>
+    </w:lvlOverride>
+  </w:num>
+  <w:num w:numId="11">
+    <w:abstractNumId w:val="1"/>
+    <w:lvlOverride w:ilvl="0">
+      <w:startOverride w:val="1"/>
+    </w:lvlOverride>
+    <w:lvlOverride w:ilvl="1">
+      <w:startOverride w:val="1"/>
+    </w:lvlOverride>
+    <w:lvlOverride w:ilvl="2">
+      <w:startOverride w:val="1"/>
+    </w:lvlOverride>
+    <w:lvlOverride w:ilvl="3">
+      <w:startOverride w:val="1"/>
+    </w:lvlOverride>
+    <w:lvlOverride w:ilvl="4">
+      <w:startOverride w:val="1"/>
+    </w:lvlOverride>
+    <w:lvlOverride w:ilvl="5">
+      <w:startOverride w:val="1"/>
+    </w:lvlOverride>
+    <w:lvlOverride w:ilvl="6">
+      <w:startOverride w:val="1"/>
+    </w:lvlOverride>
+    <w:lvlOverride w:ilvl="7">
+      <w:startOverride w:val="1"/>
+    </w:lvlOverride>
+    <w:lvlOverride w:ilvl="8">
+      <w:startOverride w:val="1"/>
+    </w:lvlOverride>
+  </w:num>
+  <w:num w:numId="12">
     <w:abstractNumId w:val="1"/>
     <w:lvlOverride w:ilvl="0">
       <w:startOverride w:val="1"/>
@@ -19207,501 +19811,6 @@
 </w:styles>
 </file>
 
-<file path=word/glossary/document.xml><?xml version="1.0" encoding="utf-8"?>
-<w:glossaryDocument xmlns:wpc="http://schemas.microsoft.com/office/word/2010/wordprocessingCanvas" xmlns:mc="http://schemas.openxmlformats.org/markup-compatibility/2006" xmlns:o="urn:schemas-microsoft-com:office:office" xmlns:r="http://schemas.openxmlformats.org/officeDocument/2006/relationships" xmlns:m="http://schemas.openxmlformats.org/officeDocument/2006/math" xmlns:v="urn:schemas-microsoft-com:vml" xmlns:wp14="http://schemas.microsoft.com/office/word/2010/wordprocessingDrawing" xmlns:wp="http://schemas.openxmlformats.org/drawingml/2006/wordprocessingDrawing" xmlns:w10="urn:schemas-microsoft-com:office:word" xmlns:w="http://schemas.openxmlformats.org/wordprocessingml/2006/main" xmlns:w14="http://schemas.microsoft.com/office/word/2010/wordml" xmlns:wpg="http://schemas.microsoft.com/office/word/2010/wordprocessingGroup" xmlns:wpi="http://schemas.microsoft.com/office/word/2010/wordprocessingInk" xmlns:wne="http://schemas.microsoft.com/office/word/2006/wordml" xmlns:wps="http://schemas.microsoft.com/office/word/2010/wordprocessingShape" mc:Ignorable="w14 wp14"/>
-</file>
-
-<file path=word/glossary/fontTable.xml><?xml version="1.0" encoding="utf-8"?>
-<w:fonts xmlns:mc="http://schemas.openxmlformats.org/markup-compatibility/2006" xmlns:r="http://schemas.openxmlformats.org/officeDocument/2006/relationships" xmlns:w="http://schemas.openxmlformats.org/wordprocessingml/2006/main" xmlns:w14="http://schemas.microsoft.com/office/word/2010/wordml" mc:Ignorable="w14">
-  <w:font w:name="Calibri">
-    <w:panose1 w:val="020F0502020204030204"/>
-    <w:charset w:val="00"/>
-    <w:family w:val="swiss"/>
-    <w:pitch w:val="variable"/>
-    <w:sig w:usb0="E0002AFF" w:usb1="C000247B" w:usb2="00000009" w:usb3="00000000" w:csb0="000001FF" w:csb1="00000000"/>
-  </w:font>
-  <w:font w:name="Times New Roman">
-    <w:panose1 w:val="02020603050405020304"/>
-    <w:charset w:val="00"/>
-    <w:family w:val="roman"/>
-    <w:pitch w:val="variable"/>
-    <w:sig w:usb0="E0002EFF" w:usb1="C000785B" w:usb2="00000009" w:usb3="00000000" w:csb0="000001FF" w:csb1="00000000"/>
-  </w:font>
-  <w:font w:name="Calibri Light">
-    <w:panose1 w:val="020F0302020204030204"/>
-    <w:charset w:val="00"/>
-    <w:family w:val="swiss"/>
-    <w:pitch w:val="variable"/>
-    <w:sig w:usb0="E0002AFF" w:usb1="C000247B" w:usb2="00000009" w:usb3="00000000" w:csb0="000001FF" w:csb1="00000000"/>
-  </w:font>
-  <w:font w:name="Tahoma">
-    <w:panose1 w:val="020B0604030504040204"/>
-    <w:charset w:val="00"/>
-    <w:family w:val="swiss"/>
-    <w:pitch w:val="variable"/>
-    <w:sig w:usb0="E1002EFF" w:usb1="C000605B" w:usb2="00000029" w:usb3="00000000" w:csb0="000101FF" w:csb1="00000000"/>
-  </w:font>
-  <w:font w:name="Cambria Math">
-    <w:panose1 w:val="02040503050406030204"/>
-    <w:charset w:val="00"/>
-    <w:family w:val="roman"/>
-    <w:pitch w:val="variable"/>
-    <w:sig w:usb0="E00006FF" w:usb1="420024FF" w:usb2="02000000" w:usb3="00000000" w:csb0="0000019F" w:csb1="00000000"/>
-  </w:font>
-  <w:font w:name="Cambria">
-    <w:panose1 w:val="02040503050406030204"/>
-    <w:charset w:val="00"/>
-    <w:family w:val="roman"/>
-    <w:pitch w:val="variable"/>
-    <w:sig w:usb0="E00006FF" w:usb1="420024FF" w:usb2="02000000" w:usb3="00000000" w:csb0="0000019F" w:csb1="00000000"/>
-  </w:font>
-</w:fonts>
-</file>
-
-<file path=word/glossary/settings.xml><?xml version="1.0" encoding="utf-8"?>
-<w:settings xmlns:mc="http://schemas.openxmlformats.org/markup-compatibility/2006" xmlns:o="urn:schemas-microsoft-com:office:office" xmlns:r="http://schemas.openxmlformats.org/officeDocument/2006/relationships" xmlns:m="http://schemas.openxmlformats.org/officeDocument/2006/math" xmlns:v="urn:schemas-microsoft-com:vml" xmlns:w10="urn:schemas-microsoft-com:office:word" xmlns:w="http://schemas.openxmlformats.org/wordprocessingml/2006/main" xmlns:w14="http://schemas.microsoft.com/office/word/2010/wordml" xmlns:sl="http://schemas.openxmlformats.org/schemaLibrary/2006/main" mc:Ignorable="w14">
-  <w:view w:val="normal"/>
-  <w:defaultTabStop w:val="720"/>
-  <w:characterSpacingControl w:val="doNotCompress"/>
-  <w:compat>
-    <w:useFELayout/>
-    <w:compatSetting w:name="compatibilityMode" w:uri="http://schemas.microsoft.com/office/word" w:val="14"/>
-    <w:compatSetting w:name="overrideTableStyleFontSizeAndJustification" w:uri="http://schemas.microsoft.com/office/word" w:val="1"/>
-    <w:compatSetting w:name="enableOpenTypeFeatures" w:uri="http://schemas.microsoft.com/office/word" w:val="1"/>
-    <w:compatSetting w:name="doNotFlipMirrorIndents" w:uri="http://schemas.microsoft.com/office/word" w:val="1"/>
-  </w:compat>
-  <w:rsids>
-    <w:rsidRoot w:val="00C657A8"/>
-    <w:rsid w:val="00C657A8"/>
-    <w:rsid w:val="00EE5494"/>
-  </w:rsids>
-  <m:mathPr>
-    <m:mathFont m:val="Cambria Math"/>
-    <m:brkBin m:val="before"/>
-    <m:brkBinSub m:val="--"/>
-    <m:smallFrac m:val="0"/>
-    <m:dispDef/>
-    <m:lMargin m:val="0"/>
-    <m:rMargin m:val="0"/>
-    <m:defJc m:val="centerGroup"/>
-    <m:wrapIndent m:val="1440"/>
-    <m:intLim m:val="subSup"/>
-    <m:naryLim m:val="undOvr"/>
-  </m:mathPr>
-  <w:themeFontLang w:val="en-GB"/>
-  <w:clrSchemeMapping w:bg1="light1" w:t1="dark1" w:bg2="light2" w:t2="dark2" w:accent1="accent1" w:accent2="accent2" w:accent3="accent3" w:accent4="accent4" w:accent5="accent5" w:accent6="accent6" w:hyperlink="hyperlink" w:followedHyperlink="followedHyperlink"/>
-  <w:decimalSymbol w:val=","/>
-  <w:listSeparator w:val=";"/>
-</w:settings>
-</file>
-
-<file path=word/glossary/styles.xml><?xml version="1.0" encoding="utf-8"?>
-<w:styles xmlns:mc="http://schemas.openxmlformats.org/markup-compatibility/2006" xmlns:r="http://schemas.openxmlformats.org/officeDocument/2006/relationships" xmlns:w="http://schemas.openxmlformats.org/wordprocessingml/2006/main" xmlns:w14="http://schemas.microsoft.com/office/word/2010/wordml" mc:Ignorable="w14">
-  <w:docDefaults>
-    <w:rPrDefault>
-      <w:rPr>
-        <w:rFonts w:asciiTheme="minorHAnsi" w:eastAsiaTheme="minorEastAsia" w:hAnsiTheme="minorHAnsi" w:cstheme="minorBidi"/>
-        <w:sz w:val="22"/>
-        <w:szCs w:val="22"/>
-        <w:lang w:val="en-GB" w:eastAsia="en-GB" w:bidi="ar-SA"/>
-      </w:rPr>
-    </w:rPrDefault>
-    <w:pPrDefault>
-      <w:pPr>
-        <w:spacing w:after="200" w:line="276" w:lineRule="auto"/>
-      </w:pPr>
-    </w:pPrDefault>
-  </w:docDefaults>
-  <w:latentStyles w:defLockedState="0" w:defUIPriority="99" w:defSemiHidden="1" w:defUnhideWhenUsed="1" w:defQFormat="0" w:count="267">
-    <w:lsdException w:name="Normal" w:semiHidden="0" w:uiPriority="0" w:unhideWhenUsed="0" w:qFormat="1"/>
-    <w:lsdException w:name="heading 1" w:semiHidden="0" w:uiPriority="9" w:unhideWhenUsed="0" w:qFormat="1"/>
-    <w:lsdException w:name="heading 2" w:uiPriority="9" w:qFormat="1"/>
-    <w:lsdException w:name="heading 3" w:uiPriority="9" w:qFormat="1"/>
-    <w:lsdException w:name="heading 4" w:uiPriority="9" w:qFormat="1"/>
-    <w:lsdException w:name="heading 5" w:uiPriority="9" w:qFormat="1"/>
-    <w:lsdException w:name="heading 6" w:uiPriority="9" w:qFormat="1"/>
-    <w:lsdException w:name="heading 7" w:uiPriority="9" w:qFormat="1"/>
-    <w:lsdException w:name="heading 8" w:uiPriority="9" w:qFormat="1"/>
-    <w:lsdException w:name="heading 9" w:uiPriority="9" w:qFormat="1"/>
-    <w:lsdException w:name="toc 1" w:uiPriority="39"/>
-    <w:lsdException w:name="toc 2" w:uiPriority="39"/>
-    <w:lsdException w:name="toc 3" w:uiPriority="39"/>
-    <w:lsdException w:name="toc 4" w:uiPriority="39"/>
-    <w:lsdException w:name="toc 5" w:uiPriority="39"/>
-    <w:lsdException w:name="toc 6" w:uiPriority="39"/>
-    <w:lsdException w:name="toc 7" w:uiPriority="39"/>
-    <w:lsdException w:name="toc 8" w:uiPriority="39"/>
-    <w:lsdException w:name="toc 9" w:uiPriority="39"/>
-    <w:lsdException w:name="caption" w:uiPriority="35" w:qFormat="1"/>
-    <w:lsdException w:name="Title" w:semiHidden="0" w:uiPriority="10" w:unhideWhenUsed="0" w:qFormat="1"/>
-    <w:lsdException w:name="Default Paragraph Font" w:uiPriority="1"/>
-    <w:lsdException w:name="Subtitle" w:semiHidden="0" w:uiPriority="11" w:unhideWhenUsed="0" w:qFormat="1"/>
-    <w:lsdException w:name="Strong" w:semiHidden="0" w:uiPriority="22" w:unhideWhenUsed="0" w:qFormat="1"/>
-    <w:lsdException w:name="Emphasis" w:semiHidden="0" w:uiPriority="20" w:unhideWhenUsed="0" w:qFormat="1"/>
-    <w:lsdException w:name="Table Grid" w:semiHidden="0" w:uiPriority="59" w:unhideWhenUsed="0"/>
-    <w:lsdException w:name="Placeholder Text" w:unhideWhenUsed="0"/>
-    <w:lsdException w:name="No Spacing" w:semiHidden="0" w:uiPriority="1" w:unhideWhenUsed="0" w:qFormat="1"/>
-    <w:lsdException w:name="Light Shading" w:semiHidden="0" w:uiPriority="60" w:unhideWhenUsed="0"/>
-    <w:lsdException w:name="Light List" w:semiHidden="0" w:uiPriority="61" w:unhideWhenUsed="0"/>
-    <w:lsdException w:name="Light Grid" w:semiHidden="0" w:uiPriority="62" w:unhideWhenUsed="0"/>
-    <w:lsdException w:name="Medium Shading 1" w:semiHidden="0" w:uiPriority="63" w:unhideWhenUsed="0"/>
-    <w:lsdException w:name="Medium Shading 2" w:semiHidden="0" w:uiPriority="64" w:unhideWhenUsed="0"/>
-    <w:lsdException w:name="Medium List 1" w:semiHidden="0" w:uiPriority="65" w:unhideWhenUsed="0"/>
-    <w:lsdException w:name="Medium List 2" w:semiHidden="0" w:uiPriority="66" w:unhideWhenUsed="0"/>
-    <w:lsdException w:name="Medium Grid 1" w:semiHidden="0" w:uiPriority="67" w:unhideWhenUsed="0"/>
-    <w:lsdException w:name="Medium Grid 2" w:semiHidden="0" w:uiPriority="68" w:unhideWhenUsed="0"/>
-    <w:lsdException w:name="Medium Grid 3" w:semiHidden="0" w:uiPriority="69" w:unhideWhenUsed="0"/>
-    <w:lsdException w:name="Dark List" w:semiHidden="0" w:uiPriority="70" w:unhideWhenUsed="0"/>
-    <w:lsdException w:name="Colorful Shading" w:semiHidden="0" w:uiPriority="71" w:unhideWhenUsed="0"/>
-    <w:lsdException w:name="Colorful List" w:semiHidden="0" w:uiPriority="72" w:unhideWhenUsed="0"/>
-    <w:lsdException w:name="Colorful Grid" w:semiHidden="0" w:uiPriority="73" w:unhideWhenUsed="0"/>
-    <w:lsdException w:name="Light Shading Accent 1" w:semiHidden="0" w:uiPriority="60" w:unhideWhenUsed="0"/>
-    <w:lsdException w:name="Light List Accent 1" w:semiHidden="0" w:uiPriority="61" w:unhideWhenUsed="0"/>
-    <w:lsdException w:name="Light Grid Accent 1" w:semiHidden="0" w:uiPriority="62" w:unhideWhenUsed="0"/>
-    <w:lsdException w:name="Medium Shading 1 Accent 1" w:semiHidden="0" w:uiPriority="63" w:unhideWhenUsed="0"/>
-    <w:lsdException w:name="Medium Shading 2 Accent 1" w:semiHidden="0" w:uiPriority="64" w:unhideWhenUsed="0"/>
-    <w:lsdException w:name="Medium List 1 Accent 1" w:semiHidden="0" w:uiPriority="65" w:unhideWhenUsed="0"/>
-    <w:lsdException w:name="Revision" w:unhideWhenUsed="0"/>
-    <w:lsdException w:name="List Paragraph" w:semiHidden="0" w:uiPriority="34" w:unhideWhenUsed="0" w:qFormat="1"/>
-    <w:lsdException w:name="Quote" w:semiHidden="0" w:uiPriority="29" w:unhideWhenUsed="0" w:qFormat="1"/>
-    <w:lsdException w:name="Intense Quote" w:semiHidden="0" w:uiPriority="30" w:unhideWhenUsed="0" w:qFormat="1"/>
-    <w:lsdException w:name="Medium List 2 Accent 1" w:semiHidden="0" w:uiPriority="66" w:unhideWhenUsed="0"/>
-    <w:lsdException w:name="Medium Grid 1 Accent 1" w:semiHidden="0" w:uiPriority="67" w:unhideWhenUsed="0"/>
-    <w:lsdException w:name="Medium Grid 2 Accent 1" w:semiHidden="0" w:uiPriority="68" w:unhideWhenUsed="0"/>
-    <w:lsdException w:name="Medium Grid 3 Accent 1" w:semiHidden="0" w:uiPriority="69" w:unhideWhenUsed="0"/>
-    <w:lsdException w:name="Dark List Accent 1" w:semiHidden="0" w:uiPriority="70" w:unhideWhenUsed="0"/>
-    <w:lsdException w:name="Colorful Shading Accent 1" w:semiHidden="0" w:uiPriority="71" w:unhideWhenUsed="0"/>
-    <w:lsdException w:name="Colorful List Accent 1" w:semiHidden="0" w:uiPriority="72" w:unhideWhenUsed="0"/>
-    <w:lsdException w:name="Colorful Grid Accent 1" w:semiHidden="0" w:uiPriority="73" w:unhideWhenUsed="0"/>
-    <w:lsdException w:name="Light Shading Accent 2" w:semiHidden="0" w:uiPriority="60" w:unhideWhenUsed="0"/>
-    <w:lsdException w:name="Light List Accent 2" w:semiHidden="0" w:uiPriority="61" w:unhideWhenUsed="0"/>
-    <w:lsdException w:name="Light Grid Accent 2" w:semiHidden="0" w:uiPriority="62" w:unhideWhenUsed="0"/>
-    <w:lsdException w:name="Medium Shading 1 Accent 2" w:semiHidden="0" w:uiPriority="63" w:unhideWhenUsed="0"/>
-    <w:lsdException w:name="Medium Shading 2 Accent 2" w:semiHidden="0" w:uiPriority="64" w:unhideWhenUsed="0"/>
-    <w:lsdException w:name="Medium List 1 Accent 2" w:semiHidden="0" w:uiPriority="65" w:unhideWhenUsed="0"/>
-    <w:lsdException w:name="Medium List 2 Accent 2" w:semiHidden="0" w:uiPriority="66" w:unhideWhenUsed="0"/>
-    <w:lsdException w:name="Medium Grid 1 Accent 2" w:semiHidden="0" w:uiPriority="67" w:unhideWhenUsed="0"/>
-    <w:lsdException w:name="Medium Grid 2 Accent 2" w:semiHidden="0" w:uiPriority="68" w:unhideWhenUsed="0"/>
-    <w:lsdException w:name="Medium Grid 3 Accent 2" w:semiHidden="0" w:uiPriority="69" w:unhideWhenUsed="0"/>
-    <w:lsdException w:name="Dark List Accent 2" w:semiHidden="0" w:uiPriority="70" w:unhideWhenUsed="0"/>
-    <w:lsdException w:name="Colorful Shading Accent 2" w:semiHidden="0" w:uiPriority="71" w:unhideWhenUsed="0"/>
-    <w:lsdException w:name="Colorful List Accent 2" w:semiHidden="0" w:uiPriority="72" w:unhideWhenUsed="0"/>
-    <w:lsdException w:name="Colorful Grid Accent 2" w:semiHidden="0" w:uiPriority="73" w:unhideWhenUsed="0"/>
-    <w:lsdException w:name="Light Shading Accent 3" w:semiHidden="0" w:uiPriority="60" w:unhideWhenUsed="0"/>
-    <w:lsdException w:name="Light List Accent 3" w:semiHidden="0" w:uiPriority="61" w:unhideWhenUsed="0"/>
-    <w:lsdException w:name="Light Grid Accent 3" w:semiHidden="0" w:uiPriority="62" w:unhideWhenUsed="0"/>
-    <w:lsdException w:name="Medium Shading 1 Accent 3" w:semiHidden="0" w:uiPriority="63" w:unhideWhenUsed="0"/>
-    <w:lsdException w:name="Medium Shading 2 Accent 3" w:semiHidden="0" w:uiPriority="64" w:unhideWhenUsed="0"/>
-    <w:lsdException w:name="Medium List 1 Accent 3" w:semiHidden="0" w:uiPriority="65" w:unhideWhenUsed="0"/>
-    <w:lsdException w:name="Medium List 2 Accent 3" w:semiHidden="0" w:uiPriority="66" w:unhideWhenUsed="0"/>
-    <w:lsdException w:name="Medium Grid 1 Accent 3" w:semiHidden="0" w:uiPriority="67" w:unhideWhenUsed="0"/>
-    <w:lsdException w:name="Medium Grid 2 Accent 3" w:semiHidden="0" w:uiPriority="68" w:unhideWhenUsed="0"/>
-    <w:lsdException w:name="Medium Grid 3 Accent 3" w:semiHidden="0" w:uiPriority="69" w:unhideWhenUsed="0"/>
-    <w:lsdException w:name="Dark List Accent 3" w:semiHidden="0" w:uiPriority="70" w:unhideWhenUsed="0"/>
-    <w:lsdException w:name="Colorful Shading Accent 3" w:semiHidden="0" w:uiPriority="71" w:unhideWhenUsed="0"/>
-    <w:lsdException w:name="Colorful List Accent 3" w:semiHidden="0" w:uiPriority="72" w:unhideWhenUsed="0"/>
-    <w:lsdException w:name="Colorful Grid Accent 3" w:semiHidden="0" w:uiPriority="73" w:unhideWhenUsed="0"/>
-    <w:lsdException w:name="Light Shading Accent 4" w:semiHidden="0" w:uiPriority="60" w:unhideWhenUsed="0"/>
-    <w:lsdException w:name="Light List Accent 4" w:semiHidden="0" w:uiPriority="61" w:unhideWhenUsed="0"/>
-    <w:lsdException w:name="Light Grid Accent 4" w:semiHidden="0" w:uiPriority="62" w:unhideWhenUsed="0"/>
-    <w:lsdException w:name="Medium Shading 1 Accent 4" w:semiHidden="0" w:uiPriority="63" w:unhideWhenUsed="0"/>
-    <w:lsdException w:name="Medium Shading 2 Accent 4" w:semiHidden="0" w:uiPriority="64" w:unhideWhenUsed="0"/>
-    <w:lsdException w:name="Medium List 1 Accent 4" w:semiHidden="0" w:uiPriority="65" w:unhideWhenUsed="0"/>
-    <w:lsdException w:name="Medium List 2 Accent 4" w:semiHidden="0" w:uiPriority="66" w:unhideWhenUsed="0"/>
-    <w:lsdException w:name="Medium Grid 1 Accent 4" w:semiHidden="0" w:uiPriority="67" w:unhideWhenUsed="0"/>
-    <w:lsdException w:name="Medium Grid 2 Accent 4" w:semiHidden="0" w:uiPriority="68" w:unhideWhenUsed="0"/>
-    <w:lsdException w:name="Medium Grid 3 Accent 4" w:semiHidden="0" w:uiPriority="69" w:unhideWhenUsed="0"/>
-    <w:lsdException w:name="Dark List Accent 4" w:semiHidden="0" w:uiPriority="70" w:unhideWhenUsed="0"/>
-    <w:lsdException w:name="Colorful Shading Accent 4" w:semiHidden="0" w:uiPriority="71" w:unhideWhenUsed="0"/>
-    <w:lsdException w:name="Colorful List Accent 4" w:semiHidden="0" w:uiPriority="72" w:unhideWhenUsed="0"/>
-    <w:lsdException w:name="Colorful Grid Accent 4" w:semiHidden="0" w:uiPriority="73" w:unhideWhenUsed="0"/>
-    <w:lsdException w:name="Light Shading Accent 5" w:semiHidden="0" w:uiPriority="60" w:unhideWhenUsed="0"/>
-    <w:lsdException w:name="Light List Accent 5" w:semiHidden="0" w:uiPriority="61" w:unhideWhenUsed="0"/>
-    <w:lsdException w:name="Light Grid Accent 5" w:semiHidden="0" w:uiPriority="62" w:unhideWhenUsed="0"/>
-    <w:lsdException w:name="Medium Shading 1 Accent 5" w:semiHidden="0" w:uiPriority="63" w:unhideWhenUsed="0"/>
-    <w:lsdException w:name="Medium Shading 2 Accent 5" w:semiHidden="0" w:uiPriority="64" w:unhideWhenUsed="0"/>
-    <w:lsdException w:name="Medium List 1 Accent 5" w:semiHidden="0" w:uiPriority="65" w:unhideWhenUsed="0"/>
-    <w:lsdException w:name="Medium List 2 Accent 5" w:semiHidden="0" w:uiPriority="66" w:unhideWhenUsed="0"/>
-    <w:lsdException w:name="Medium Grid 1 Accent 5" w:semiHidden="0" w:uiPriority="67" w:unhideWhenUsed="0"/>
-    <w:lsdException w:name="Medium Grid 2 Accent 5" w:semiHidden="0" w:uiPriority="68" w:unhideWhenUsed="0"/>
-    <w:lsdException w:name="Medium Grid 3 Accent 5" w:semiHidden="0" w:uiPriority="69" w:unhideWhenUsed="0"/>
-    <w:lsdException w:name="Dark List Accent 5" w:semiHidden="0" w:uiPriority="70" w:unhideWhenUsed="0"/>
-    <w:lsdException w:name="Colorful Shading Accent 5" w:semiHidden="0" w:uiPriority="71" w:unhideWhenUsed="0"/>
-    <w:lsdException w:name="Colorful List Accent 5" w:semiHidden="0" w:uiPriority="72" w:unhideWhenUsed="0"/>
-    <w:lsdException w:name="Colorful Grid Accent 5" w:semiHidden="0" w:uiPriority="73" w:unhideWhenUsed="0"/>
-    <w:lsdException w:name="Light Shading Accent 6" w:semiHidden="0" w:uiPriority="60" w:unhideWhenUsed="0"/>
-    <w:lsdException w:name="Light List Accent 6" w:semiHidden="0" w:uiPriority="61" w:unhideWhenUsed="0"/>
-    <w:lsdException w:name="Light Grid Accent 6" w:semiHidden="0" w:uiPriority="62" w:unhideWhenUsed="0"/>
-    <w:lsdException w:name="Medium Shading 1 Accent 6" w:semiHidden="0" w:uiPriority="63" w:unhideWhenUsed="0"/>
-    <w:lsdException w:name="Medium Shading 2 Accent 6" w:semiHidden="0" w:uiPriority="64" w:unhideWhenUsed="0"/>
-    <w:lsdException w:name="Medium List 1 Accent 6" w:semiHidden="0" w:uiPriority="65" w:unhideWhenUsed="0"/>
-    <w:lsdException w:name="Medium List 2 Accent 6" w:semiHidden="0" w:uiPriority="66" w:unhideWhenUsed="0"/>
-    <w:lsdException w:name="Medium Grid 1 Accent 6" w:semiHidden="0" w:uiPriority="67" w:unhideWhenUsed="0"/>
-    <w:lsdException w:name="Medium Grid 2 Accent 6" w:semiHidden="0" w:uiPriority="68" w:unhideWhenUsed="0"/>
-    <w:lsdException w:name="Medium Grid 3 Accent 6" w:semiHidden="0" w:uiPriority="69" w:unhideWhenUsed="0"/>
-    <w:lsdException w:name="Dark List Accent 6" w:semiHidden="0" w:uiPriority="70" w:unhideWhenUsed="0"/>
-    <w:lsdException w:name="Colorful Shading Accent 6" w:semiHidden="0" w:uiPriority="71" w:unhideWhenUsed="0"/>
-    <w:lsdException w:name="Colorful List Accent 6" w:semiHidden="0" w:uiPriority="72" w:unhideWhenUsed="0"/>
-    <w:lsdException w:name="Colorful Grid Accent 6" w:semiHidden="0" w:uiPriority="73" w:unhideWhenUsed="0"/>
-    <w:lsdException w:name="Subtle Emphasis" w:semiHidden="0" w:uiPriority="19" w:unhideWhenUsed="0" w:qFormat="1"/>
-    <w:lsdException w:name="Intense Emphasis" w:semiHidden="0" w:uiPriority="21" w:unhideWhenUsed="0" w:qFormat="1"/>
-    <w:lsdException w:name="Subtle Reference" w:semiHidden="0" w:uiPriority="31" w:unhideWhenUsed="0" w:qFormat="1"/>
-    <w:lsdException w:name="Intense Reference" w:semiHidden="0" w:uiPriority="32" w:unhideWhenUsed="0" w:qFormat="1"/>
-    <w:lsdException w:name="Book Title" w:semiHidden="0" w:uiPriority="33" w:unhideWhenUsed="0" w:qFormat="1"/>
-    <w:lsdException w:name="Bibliography" w:uiPriority="37"/>
-    <w:lsdException w:name="TOC Heading" w:uiPriority="39" w:qFormat="1"/>
-  </w:latentStyles>
-  <w:style w:type="paragraph" w:default="1" w:styleId="Normal">
-    <w:name w:val="Normal"/>
-    <w:qFormat/>
-  </w:style>
-  <w:style w:type="character" w:default="1" w:styleId="Policepardfaut">
-    <w:name w:val="Default Paragraph Font"/>
-    <w:uiPriority w:val="1"/>
-    <w:semiHidden/>
-    <w:unhideWhenUsed/>
-  </w:style>
-  <w:style w:type="table" w:default="1" w:styleId="TableauNormal">
-    <w:name w:val="Normal Table"/>
-    <w:uiPriority w:val="99"/>
-    <w:semiHidden/>
-    <w:unhideWhenUsed/>
-    <w:tblPr>
-      <w:tblInd w:w="0" w:type="dxa"/>
-      <w:tblCellMar>
-        <w:top w:w="0" w:type="dxa"/>
-        <w:left w:w="108" w:type="dxa"/>
-        <w:bottom w:w="0" w:type="dxa"/>
-        <w:right w:w="108" w:type="dxa"/>
-      </w:tblCellMar>
-    </w:tblPr>
-  </w:style>
-  <w:style w:type="numbering" w:default="1" w:styleId="Aucuneliste">
-    <w:name w:val="No List"/>
-    <w:uiPriority w:val="99"/>
-    <w:semiHidden/>
-    <w:unhideWhenUsed/>
-  </w:style>
-  <w:style w:type="character" w:styleId="Textedelespacerserv">
-    <w:name w:val="Placeholder Text"/>
-    <w:basedOn w:val="Policepardfaut"/>
-    <w:uiPriority w:val="99"/>
-    <w:semiHidden/>
-    <w:rsid w:val="00C657A8"/>
-    <w:rPr>
-      <w:color w:val="808080"/>
-    </w:rPr>
-  </w:style>
-</w:styles>
-</file>
-
-<file path=word/glossary/stylesWithEffects.xml><?xml version="1.0" encoding="utf-8"?>
-<w:styles xmlns:wpc="http://schemas.microsoft.com/office/word/2010/wordprocessingCanvas" xmlns:mc="http://schemas.openxmlformats.org/markup-compatibility/2006" xmlns:o="urn:schemas-microsoft-com:office:office" xmlns:r="http://schemas.openxmlformats.org/officeDocument/2006/relationships" xmlns:m="http://schemas.openxmlformats.org/officeDocument/2006/math" xmlns:v="urn:schemas-microsoft-com:vml" xmlns:wp14="http://schemas.microsoft.com/office/word/2010/wordprocessingDrawing" xmlns:wp="http://schemas.openxmlformats.org/drawingml/2006/wordprocessingDrawing" xmlns:w10="urn:schemas-microsoft-com:office:word" xmlns:w="http://schemas.openxmlformats.org/wordprocessingml/2006/main" xmlns:w14="http://schemas.microsoft.com/office/word/2010/wordml" xmlns:wpg="http://schemas.microsoft.com/office/word/2010/wordprocessingGroup" xmlns:wpi="http://schemas.microsoft.com/office/word/2010/wordprocessingInk" xmlns:wne="http://schemas.microsoft.com/office/word/2006/wordml" xmlns:wps="http://schemas.microsoft.com/office/word/2010/wordprocessingShape" mc:Ignorable="w14 wp14">
-  <w:docDefaults>
-    <w:rPrDefault>
-      <w:rPr>
-        <w:rFonts w:asciiTheme="minorHAnsi" w:eastAsiaTheme="minorEastAsia" w:hAnsiTheme="minorHAnsi" w:cstheme="minorBidi"/>
-        <w:sz w:val="22"/>
-        <w:szCs w:val="22"/>
-        <w:lang w:val="en-GB" w:eastAsia="en-GB" w:bidi="ar-SA"/>
-      </w:rPr>
-    </w:rPrDefault>
-    <w:pPrDefault>
-      <w:pPr>
-        <w:spacing w:after="200" w:line="276" w:lineRule="auto"/>
-      </w:pPr>
-    </w:pPrDefault>
-  </w:docDefaults>
-  <w:latentStyles w:defLockedState="0" w:defUIPriority="99" w:defSemiHidden="1" w:defUnhideWhenUsed="1" w:defQFormat="0" w:count="267">
-    <w:lsdException w:name="Normal" w:semiHidden="0" w:uiPriority="0" w:unhideWhenUsed="0" w:qFormat="1"/>
-    <w:lsdException w:name="heading 1" w:semiHidden="0" w:uiPriority="9" w:unhideWhenUsed="0" w:qFormat="1"/>
-    <w:lsdException w:name="heading 2" w:uiPriority="9" w:qFormat="1"/>
-    <w:lsdException w:name="heading 3" w:uiPriority="9" w:qFormat="1"/>
-    <w:lsdException w:name="heading 4" w:uiPriority="9" w:qFormat="1"/>
-    <w:lsdException w:name="heading 5" w:uiPriority="9" w:qFormat="1"/>
-    <w:lsdException w:name="heading 6" w:uiPriority="9" w:qFormat="1"/>
-    <w:lsdException w:name="heading 7" w:uiPriority="9" w:qFormat="1"/>
-    <w:lsdException w:name="heading 8" w:uiPriority="9" w:qFormat="1"/>
-    <w:lsdException w:name="heading 9" w:uiPriority="9" w:qFormat="1"/>
-    <w:lsdException w:name="toc 1" w:uiPriority="39"/>
-    <w:lsdException w:name="toc 2" w:uiPriority="39"/>
-    <w:lsdException w:name="toc 3" w:uiPriority="39"/>
-    <w:lsdException w:name="toc 4" w:uiPriority="39"/>
-    <w:lsdException w:name="toc 5" w:uiPriority="39"/>
-    <w:lsdException w:name="toc 6" w:uiPriority="39"/>
-    <w:lsdException w:name="toc 7" w:uiPriority="39"/>
-    <w:lsdException w:name="toc 8" w:uiPriority="39"/>
-    <w:lsdException w:name="toc 9" w:uiPriority="39"/>
-    <w:lsdException w:name="caption" w:uiPriority="35" w:qFormat="1"/>
-    <w:lsdException w:name="Title" w:semiHidden="0" w:uiPriority="10" w:unhideWhenUsed="0" w:qFormat="1"/>
-    <w:lsdException w:name="Default Paragraph Font" w:uiPriority="1"/>
-    <w:lsdException w:name="Subtitle" w:semiHidden="0" w:uiPriority="11" w:unhideWhenUsed="0" w:qFormat="1"/>
-    <w:lsdException w:name="Strong" w:semiHidden="0" w:uiPriority="22" w:unhideWhenUsed="0" w:qFormat="1"/>
-    <w:lsdException w:name="Emphasis" w:semiHidden="0" w:uiPriority="20" w:unhideWhenUsed="0" w:qFormat="1"/>
-    <w:lsdException w:name="Table Grid" w:semiHidden="0" w:uiPriority="59" w:unhideWhenUsed="0"/>
-    <w:lsdException w:name="Placeholder Text" w:unhideWhenUsed="0"/>
-    <w:lsdException w:name="No Spacing" w:semiHidden="0" w:uiPriority="1" w:unhideWhenUsed="0" w:qFormat="1"/>
-    <w:lsdException w:name="Light Shading" w:semiHidden="0" w:uiPriority="60" w:unhideWhenUsed="0"/>
-    <w:lsdException w:name="Light List" w:semiHidden="0" w:uiPriority="61" w:unhideWhenUsed="0"/>
-    <w:lsdException w:name="Light Grid" w:semiHidden="0" w:uiPriority="62" w:unhideWhenUsed="0"/>
-    <w:lsdException w:name="Medium Shading 1" w:semiHidden="0" w:uiPriority="63" w:unhideWhenUsed="0"/>
-    <w:lsdException w:name="Medium Shading 2" w:semiHidden="0" w:uiPriority="64" w:unhideWhenUsed="0"/>
-    <w:lsdException w:name="Medium List 1" w:semiHidden="0" w:uiPriority="65" w:unhideWhenUsed="0"/>
-    <w:lsdException w:name="Medium List 2" w:semiHidden="0" w:uiPriority="66" w:unhideWhenUsed="0"/>
-    <w:lsdException w:name="Medium Grid 1" w:semiHidden="0" w:uiPriority="67" w:unhideWhenUsed="0"/>
-    <w:lsdException w:name="Medium Grid 2" w:semiHidden="0" w:uiPriority="68" w:unhideWhenUsed="0"/>
-    <w:lsdException w:name="Medium Grid 3" w:semiHidden="0" w:uiPriority="69" w:unhideWhenUsed="0"/>
-    <w:lsdException w:name="Dark List" w:semiHidden="0" w:uiPriority="70" w:unhideWhenUsed="0"/>
-    <w:lsdException w:name="Colorful Shading" w:semiHidden="0" w:uiPriority="71" w:unhideWhenUsed="0"/>
-    <w:lsdException w:name="Colorful List" w:semiHidden="0" w:uiPriority="72" w:unhideWhenUsed="0"/>
-    <w:lsdException w:name="Colorful Grid" w:semiHidden="0" w:uiPriority="73" w:unhideWhenUsed="0"/>
-    <w:lsdException w:name="Light Shading Accent 1" w:semiHidden="0" w:uiPriority="60" w:unhideWhenUsed="0"/>
-    <w:lsdException w:name="Light List Accent 1" w:semiHidden="0" w:uiPriority="61" w:unhideWhenUsed="0"/>
-    <w:lsdException w:name="Light Grid Accent 1" w:semiHidden="0" w:uiPriority="62" w:unhideWhenUsed="0"/>
-    <w:lsdException w:name="Medium Shading 1 Accent 1" w:semiHidden="0" w:uiPriority="63" w:unhideWhenUsed="0"/>
-    <w:lsdException w:name="Medium Shading 2 Accent 1" w:semiHidden="0" w:uiPriority="64" w:unhideWhenUsed="0"/>
-    <w:lsdException w:name="Medium List 1 Accent 1" w:semiHidden="0" w:uiPriority="65" w:unhideWhenUsed="0"/>
-    <w:lsdException w:name="Revision" w:unhideWhenUsed="0"/>
-    <w:lsdException w:name="List Paragraph" w:semiHidden="0" w:uiPriority="34" w:unhideWhenUsed="0" w:qFormat="1"/>
-    <w:lsdException w:name="Quote" w:semiHidden="0" w:uiPriority="29" w:unhideWhenUsed="0" w:qFormat="1"/>
-    <w:lsdException w:name="Intense Quote" w:semiHidden="0" w:uiPriority="30" w:unhideWhenUsed="0" w:qFormat="1"/>
-    <w:lsdException w:name="Medium List 2 Accent 1" w:semiHidden="0" w:uiPriority="66" w:unhideWhenUsed="0"/>
-    <w:lsdException w:name="Medium Grid 1 Accent 1" w:semiHidden="0" w:uiPriority="67" w:unhideWhenUsed="0"/>
-    <w:lsdException w:name="Medium Grid 2 Accent 1" w:semiHidden="0" w:uiPriority="68" w:unhideWhenUsed="0"/>
-    <w:lsdException w:name="Medium Grid 3 Accent 1" w:semiHidden="0" w:uiPriority="69" w:unhideWhenUsed="0"/>
-    <w:lsdException w:name="Dark List Accent 1" w:semiHidden="0" w:uiPriority="70" w:unhideWhenUsed="0"/>
-    <w:lsdException w:name="Colorful Shading Accent 1" w:semiHidden="0" w:uiPriority="71" w:unhideWhenUsed="0"/>
-    <w:lsdException w:name="Colorful List Accent 1" w:semiHidden="0" w:uiPriority="72" w:unhideWhenUsed="0"/>
-    <w:lsdException w:name="Colorful Grid Accent 1" w:semiHidden="0" w:uiPriority="73" w:unhideWhenUsed="0"/>
-    <w:lsdException w:name="Light Shading Accent 2" w:semiHidden="0" w:uiPriority="60" w:unhideWhenUsed="0"/>
-    <w:lsdException w:name="Light List Accent 2" w:semiHidden="0" w:uiPriority="61" w:unhideWhenUsed="0"/>
-    <w:lsdException w:name="Light Grid Accent 2" w:semiHidden="0" w:uiPriority="62" w:unhideWhenUsed="0"/>
-    <w:lsdException w:name="Medium Shading 1 Accent 2" w:semiHidden="0" w:uiPriority="63" w:unhideWhenUsed="0"/>
-    <w:lsdException w:name="Medium Shading 2 Accent 2" w:semiHidden="0" w:uiPriority="64" w:unhideWhenUsed="0"/>
-    <w:lsdException w:name="Medium List 1 Accent 2" w:semiHidden="0" w:uiPriority="65" w:unhideWhenUsed="0"/>
-    <w:lsdException w:name="Medium List 2 Accent 2" w:semiHidden="0" w:uiPriority="66" w:unhideWhenUsed="0"/>
-    <w:lsdException w:name="Medium Grid 1 Accent 2" w:semiHidden="0" w:uiPriority="67" w:unhideWhenUsed="0"/>
-    <w:lsdException w:name="Medium Grid 2 Accent 2" w:semiHidden="0" w:uiPriority="68" w:unhideWhenUsed="0"/>
-    <w:lsdException w:name="Medium Grid 3 Accent 2" w:semiHidden="0" w:uiPriority="69" w:unhideWhenUsed="0"/>
-    <w:lsdException w:name="Dark List Accent 2" w:semiHidden="0" w:uiPriority="70" w:unhideWhenUsed="0"/>
-    <w:lsdException w:name="Colorful Shading Accent 2" w:semiHidden="0" w:uiPriority="71" w:unhideWhenUsed="0"/>
-    <w:lsdException w:name="Colorful List Accent 2" w:semiHidden="0" w:uiPriority="72" w:unhideWhenUsed="0"/>
-    <w:lsdException w:name="Colorful Grid Accent 2" w:semiHidden="0" w:uiPriority="73" w:unhideWhenUsed="0"/>
-    <w:lsdException w:name="Light Shading Accent 3" w:semiHidden="0" w:uiPriority="60" w:unhideWhenUsed="0"/>
-    <w:lsdException w:name="Light List Accent 3" w:semiHidden="0" w:uiPriority="61" w:unhideWhenUsed="0"/>
-    <w:lsdException w:name="Light Grid Accent 3" w:semiHidden="0" w:uiPriority="62" w:unhideWhenUsed="0"/>
-    <w:lsdException w:name="Medium Shading 1 Accent 3" w:semiHidden="0" w:uiPriority="63" w:unhideWhenUsed="0"/>
-    <w:lsdException w:name="Medium Shading 2 Accent 3" w:semiHidden="0" w:uiPriority="64" w:unhideWhenUsed="0"/>
-    <w:lsdException w:name="Medium List 1 Accent 3" w:semiHidden="0" w:uiPriority="65" w:unhideWhenUsed="0"/>
-    <w:lsdException w:name="Medium List 2 Accent 3" w:semiHidden="0" w:uiPriority="66" w:unhideWhenUsed="0"/>
-    <w:lsdException w:name="Medium Grid 1 Accent 3" w:semiHidden="0" w:uiPriority="67" w:unhideWhenUsed="0"/>
-    <w:lsdException w:name="Medium Grid 2 Accent 3" w:semiHidden="0" w:uiPriority="68" w:unhideWhenUsed="0"/>
-    <w:lsdException w:name="Medium Grid 3 Accent 3" w:semiHidden="0" w:uiPriority="69" w:unhideWhenUsed="0"/>
-    <w:lsdException w:name="Dark List Accent 3" w:semiHidden="0" w:uiPriority="70" w:unhideWhenUsed="0"/>
-    <w:lsdException w:name="Colorful Shading Accent 3" w:semiHidden="0" w:uiPriority="71" w:unhideWhenUsed="0"/>
-    <w:lsdException w:name="Colorful List Accent 3" w:semiHidden="0" w:uiPriority="72" w:unhideWhenUsed="0"/>
-    <w:lsdException w:name="Colorful Grid Accent 3" w:semiHidden="0" w:uiPriority="73" w:unhideWhenUsed="0"/>
-    <w:lsdException w:name="Light Shading Accent 4" w:semiHidden="0" w:uiPriority="60" w:unhideWhenUsed="0"/>
-    <w:lsdException w:name="Light List Accent 4" w:semiHidden="0" w:uiPriority="61" w:unhideWhenUsed="0"/>
-    <w:lsdException w:name="Light Grid Accent 4" w:semiHidden="0" w:uiPriority="62" w:unhideWhenUsed="0"/>
-    <w:lsdException w:name="Medium Shading 1 Accent 4" w:semiHidden="0" w:uiPriority="63" w:unhideWhenUsed="0"/>
-    <w:lsdException w:name="Medium Shading 2 Accent 4" w:semiHidden="0" w:uiPriority="64" w:unhideWhenUsed="0"/>
-    <w:lsdException w:name="Medium List 1 Accent 4" w:semiHidden="0" w:uiPriority="65" w:unhideWhenUsed="0"/>
-    <w:lsdException w:name="Medium List 2 Accent 4" w:semiHidden="0" w:uiPriority="66" w:unhideWhenUsed="0"/>
-    <w:lsdException w:name="Medium Grid 1 Accent 4" w:semiHidden="0" w:uiPriority="67" w:unhideWhenUsed="0"/>
-    <w:lsdException w:name="Medium Grid 2 Accent 4" w:semiHidden="0" w:uiPriority="68" w:unhideWhenUsed="0"/>
-    <w:lsdException w:name="Medium Grid 3 Accent 4" w:semiHidden="0" w:uiPriority="69" w:unhideWhenUsed="0"/>
-    <w:lsdException w:name="Dark List Accent 4" w:semiHidden="0" w:uiPriority="70" w:unhideWhenUsed="0"/>
-    <w:lsdException w:name="Colorful Shading Accent 4" w:semiHidden="0" w:uiPriority="71" w:unhideWhenUsed="0"/>
-    <w:lsdException w:name="Colorful List Accent 4" w:semiHidden="0" w:uiPriority="72" w:unhideWhenUsed="0"/>
-    <w:lsdException w:name="Colorful Grid Accent 4" w:semiHidden="0" w:uiPriority="73" w:unhideWhenUsed="0"/>
-    <w:lsdException w:name="Light Shading Accent 5" w:semiHidden="0" w:uiPriority="60" w:unhideWhenUsed="0"/>
-    <w:lsdException w:name="Light List Accent 5" w:semiHidden="0" w:uiPriority="61" w:unhideWhenUsed="0"/>
-    <w:lsdException w:name="Light Grid Accent 5" w:semiHidden="0" w:uiPriority="62" w:unhideWhenUsed="0"/>
-    <w:lsdException w:name="Medium Shading 1 Accent 5" w:semiHidden="0" w:uiPriority="63" w:unhideWhenUsed="0"/>
-    <w:lsdException w:name="Medium Shading 2 Accent 5" w:semiHidden="0" w:uiPriority="64" w:unhideWhenUsed="0"/>
-    <w:lsdException w:name="Medium List 1 Accent 5" w:semiHidden="0" w:uiPriority="65" w:unhideWhenUsed="0"/>
-    <w:lsdException w:name="Medium List 2 Accent 5" w:semiHidden="0" w:uiPriority="66" w:unhideWhenUsed="0"/>
-    <w:lsdException w:name="Medium Grid 1 Accent 5" w:semiHidden="0" w:uiPriority="67" w:unhideWhenUsed="0"/>
-    <w:lsdException w:name="Medium Grid 2 Accent 5" w:semiHidden="0" w:uiPriority="68" w:unhideWhenUsed="0"/>
-    <w:lsdException w:name="Medium Grid 3 Accent 5" w:semiHidden="0" w:uiPriority="69" w:unhideWhenUsed="0"/>
-    <w:lsdException w:name="Dark List Accent 5" w:semiHidden="0" w:uiPriority="70" w:unhideWhenUsed="0"/>
-    <w:lsdException w:name="Colorful Shading Accent 5" w:semiHidden="0" w:uiPriority="71" w:unhideWhenUsed="0"/>
-    <w:lsdException w:name="Colorful List Accent 5" w:semiHidden="0" w:uiPriority="72" w:unhideWhenUsed="0"/>
-    <w:lsdException w:name="Colorful Grid Accent 5" w:semiHidden="0" w:uiPriority="73" w:unhideWhenUsed="0"/>
-    <w:lsdException w:name="Light Shading Accent 6" w:semiHidden="0" w:uiPriority="60" w:unhideWhenUsed="0"/>
-    <w:lsdException w:name="Light List Accent 6" w:semiHidden="0" w:uiPriority="61" w:unhideWhenUsed="0"/>
-    <w:lsdException w:name="Light Grid Accent 6" w:semiHidden="0" w:uiPriority="62" w:unhideWhenUsed="0"/>
-    <w:lsdException w:name="Medium Shading 1 Accent 6" w:semiHidden="0" w:uiPriority="63" w:unhideWhenUsed="0"/>
-    <w:lsdException w:name="Medium Shading 2 Accent 6" w:semiHidden="0" w:uiPriority="64" w:unhideWhenUsed="0"/>
-    <w:lsdException w:name="Medium List 1 Accent 6" w:semiHidden="0" w:uiPriority="65" w:unhideWhenUsed="0"/>
-    <w:lsdException w:name="Medium List 2 Accent 6" w:semiHidden="0" w:uiPriority="66" w:unhideWhenUsed="0"/>
-    <w:lsdException w:name="Medium Grid 1 Accent 6" w:semiHidden="0" w:uiPriority="67" w:unhideWhenUsed="0"/>
-    <w:lsdException w:name="Medium Grid 2 Accent 6" w:semiHidden="0" w:uiPriority="68" w:unhideWhenUsed="0"/>
-    <w:lsdException w:name="Medium Grid 3 Accent 6" w:semiHidden="0" w:uiPriority="69" w:unhideWhenUsed="0"/>
-    <w:lsdException w:name="Dark List Accent 6" w:semiHidden="0" w:uiPriority="70" w:unhideWhenUsed="0"/>
-    <w:lsdException w:name="Colorful Shading Accent 6" w:semiHidden="0" w:uiPriority="71" w:unhideWhenUsed="0"/>
-    <w:lsdException w:name="Colorful List Accent 6" w:semiHidden="0" w:uiPriority="72" w:unhideWhenUsed="0"/>
-    <w:lsdException w:name="Colorful Grid Accent 6" w:semiHidden="0" w:uiPriority="73" w:unhideWhenUsed="0"/>
-    <w:lsdException w:name="Subtle Emphasis" w:semiHidden="0" w:uiPriority="19" w:unhideWhenUsed="0" w:qFormat="1"/>
-    <w:lsdException w:name="Intense Emphasis" w:semiHidden="0" w:uiPriority="21" w:unhideWhenUsed="0" w:qFormat="1"/>
-    <w:lsdException w:name="Subtle Reference" w:semiHidden="0" w:uiPriority="31" w:unhideWhenUsed="0" w:qFormat="1"/>
-    <w:lsdException w:name="Intense Reference" w:semiHidden="0" w:uiPriority="32" w:unhideWhenUsed="0" w:qFormat="1"/>
-    <w:lsdException w:name="Book Title" w:semiHidden="0" w:uiPriority="33" w:unhideWhenUsed="0" w:qFormat="1"/>
-    <w:lsdException w:name="Bibliography" w:uiPriority="37"/>
-    <w:lsdException w:name="TOC Heading" w:uiPriority="39" w:qFormat="1"/>
-  </w:latentStyles>
-  <w:style w:type="paragraph" w:default="1" w:styleId="Normal">
-    <w:name w:val="Normal"/>
-    <w:qFormat/>
-  </w:style>
-  <w:style w:type="character" w:default="1" w:styleId="Policepardfaut">
-    <w:name w:val="Default Paragraph Font"/>
-    <w:uiPriority w:val="1"/>
-    <w:semiHidden/>
-    <w:unhideWhenUsed/>
-  </w:style>
-  <w:style w:type="table" w:default="1" w:styleId="TableauNormal">
-    <w:name w:val="Normal Table"/>
-    <w:uiPriority w:val="99"/>
-    <w:semiHidden/>
-    <w:unhideWhenUsed/>
-    <w:tblPr>
-      <w:tblInd w:w="0" w:type="dxa"/>
-      <w:tblCellMar>
-        <w:top w:w="0" w:type="dxa"/>
-        <w:left w:w="108" w:type="dxa"/>
-        <w:bottom w:w="0" w:type="dxa"/>
-        <w:right w:w="108" w:type="dxa"/>
-      </w:tblCellMar>
-    </w:tblPr>
-  </w:style>
-  <w:style w:type="numbering" w:default="1" w:styleId="Aucuneliste">
-    <w:name w:val="No List"/>
-    <w:uiPriority w:val="99"/>
-    <w:semiHidden/>
-    <w:unhideWhenUsed/>
-  </w:style>
-  <w:style w:type="character" w:styleId="Textedelespacerserv">
-    <w:name w:val="Placeholder Text"/>
-    <w:basedOn w:val="Policepardfaut"/>
-    <w:uiPriority w:val="99"/>
-    <w:semiHidden/>
-    <w:rsid w:val="00C657A8"/>
-    <w:rPr>
-      <w:color w:val="808080"/>
-    </w:rPr>
-  </w:style>
-</w:styles>
-</file>
-
-<file path=word/glossary/webSettings.xml><?xml version="1.0" encoding="utf-8"?>
-<w:webSettings xmlns:mc="http://schemas.openxmlformats.org/markup-compatibility/2006" xmlns:r="http://schemas.openxmlformats.org/officeDocument/2006/relationships" xmlns:w="http://schemas.openxmlformats.org/wordprocessingml/2006/main" xmlns:w14="http://schemas.microsoft.com/office/word/2010/wordml" mc:Ignorable="w14">
-  <w:optimizeForBrowser/>
-  <w:allowPNG/>
-</w:webSettings>
-</file>
-
 <file path=word/theme/theme1.xml><?xml version="1.0" encoding="utf-8"?>
 <a:theme xmlns:a="http://schemas.openxmlformats.org/drawingml/2006/main" name="Thème Office">
   <a:themeElements>
@@ -19957,7 +20066,7 @@
   <a:extraClrSchemeLst/>
   <a:extLst>
     <a:ext uri="{05A4C25C-085E-4340-85A3-A5531E510DB2}">
-      <thm15:themeFamily xmlns:thm15="http://schemas.microsoft.com/office/thememl/2012/main" xmlns="" name="Office Theme" id="{62F939B6-93AF-4DB8-9C6B-D6C7DFDC589F}" vid="{4A3C46E8-61CC-4603-A589-7422A47A8E4A}"/>
+      <thm15:themeFamily xmlns="" xmlns:thm15="http://schemas.microsoft.com/office/thememl/2012/main" name="Office Theme" id="{62F939B6-93AF-4DB8-9C6B-D6C7DFDC589F}" vid="{4A3C46E8-61CC-4603-A589-7422A47A8E4A}"/>
     </a:ext>
   </a:extLst>
 </a:theme>
@@ -19968,7 +20077,7 @@
 </file>
 
 <file path=customXml/itemProps1.xml><?xml version="1.0" encoding="utf-8"?>
-<ds:datastoreItem xmlns:ds="http://schemas.openxmlformats.org/officeDocument/2006/customXml" ds:itemID="{70797D30-8A32-43AD-B81B-F63D1BF889DC}">
+<ds:datastoreItem xmlns:ds="http://schemas.openxmlformats.org/officeDocument/2006/customXml" ds:itemID="{0712F809-8866-4A17-B89F-12C5A21A6075}">
   <ds:schemaRefs>
     <ds:schemaRef ds:uri="http://schemas.openxmlformats.org/officeDocument/2006/bibliography"/>
   </ds:schemaRefs>

</xml_diff>

<commit_message>
Addition of an HTML description Correction of the variable name H_fluidStream from H_fluidSteam to H_fluidStream
</commit_message>
<xml_diff>
--- a/Information/script for equations.docx
+++ b/Information/script for equations.docx
@@ -19,7 +19,6 @@
           <w:docPartUnique/>
         </w:docPartObj>
       </w:sdtPr>
-      <w:sdtEndPr/>
       <w:sdtContent>
         <w:p>
           <w:pPr>
@@ -2157,23 +2156,7 @@
                 <w:noProof/>
                 <w:lang w:val="fr-FR"/>
               </w:rPr>
-              <w:t>Compo</w:t>
-            </w:r>
-            <w:r>
-              <w:rPr>
-                <w:rStyle w:val="Lienhypertexte"/>
-                <w:noProof/>
-                <w:lang w:val="fr-FR"/>
-              </w:rPr>
-              <w:t>n</w:t>
-            </w:r>
-            <w:r>
-              <w:rPr>
-                <w:rStyle w:val="Lienhypertexte"/>
-                <w:noProof/>
-                <w:lang w:val="fr-FR"/>
-              </w:rPr>
-              <w:t>ents</w:t>
+              <w:t>Components</w:t>
             </w:r>
             <w:r>
               <w:rPr>
@@ -3927,13 +3910,7 @@
             <w:rPr>
               <w:rFonts w:ascii="Cambria Math" w:hAnsi="Cambria Math"/>
             </w:rPr>
-            <m:t>po</m:t>
-          </m:r>
-          <m:r>
-            <w:rPr>
-              <w:rFonts w:ascii="Cambria Math" w:hAnsi="Cambria Math"/>
-            </w:rPr>
-            <m:t>rt_b.Q_flow=m_flow×cp</m:t>
+            <m:t>port_b.Q_flow=m_flow×cp</m:t>
           </m:r>
           <m:d>
             <m:dPr>
@@ -4287,7 +4264,13 @@
             <w:rPr>
               <w:rFonts w:ascii="Cambria Math" w:hAnsi="Cambria Math"/>
             </w:rPr>
-            <m:t>supply: H_flow=m_flow×(</m:t>
+            <m:t>supply: H_fl</m:t>
+          </m:r>
+          <m:r>
+            <w:rPr>
+              <w:rFonts w:ascii="Cambria Math" w:hAnsi="Cambria Math"/>
+            </w:rPr>
+            <m:t>ow=m_flow×(</m:t>
           </m:r>
           <m:sSub>
             <m:sSubPr>
@@ -6211,7 +6194,13 @@
                 <w:rPr>
                   <w:rFonts w:ascii="Cambria Math" w:hAnsi="Cambria Math"/>
                 </w:rPr>
-                <m:t>i→MRT</m:t>
+                <m:t>i→MR</m:t>
+              </m:r>
+              <m:r>
+                <w:rPr>
+                  <w:rFonts w:ascii="Cambria Math" w:hAnsi="Cambria Math"/>
+                </w:rPr>
+                <m:t>T</m:t>
               </m:r>
             </m:sub>
           </m:sSub>
@@ -6401,13 +6390,7 @@
                     <w:rPr>
                       <w:rFonts w:ascii="Cambria Math" w:eastAsiaTheme="minorEastAsia" w:hAnsi="Cambria Math"/>
                     </w:rPr>
-                    <m:t>Q_f</m:t>
-                  </m:r>
-                  <m:r>
-                    <w:rPr>
-                      <w:rFonts w:ascii="Cambria Math" w:eastAsiaTheme="minorEastAsia" w:hAnsi="Cambria Math"/>
-                    </w:rPr>
-                    <m:t>low</m:t>
+                    <m:t>Q_flow</m:t>
                   </m:r>
                 </m:e>
               </m:nary>
@@ -8030,7 +8013,13 @@
             <w:rPr>
               <w:rFonts w:ascii="Cambria Math" w:eastAsiaTheme="minorEastAsia" w:hAnsi="Cambria Math"/>
             </w:rPr>
-            <m:t xml:space="preserve"> for i from 1 to n</m:t>
+            <m:t xml:space="preserve"> for i from 1 t</m:t>
+          </m:r>
+          <m:r>
+            <w:rPr>
+              <w:rFonts w:ascii="Cambria Math" w:eastAsiaTheme="minorEastAsia" w:hAnsi="Cambria Math"/>
+            </w:rPr>
+            <m:t>o n</m:t>
           </m:r>
         </m:oMath>
       </m:oMathPara>
@@ -9811,13 +9800,7 @@
             <w:rPr>
               <w:rFonts w:ascii="Cambria Math" w:eastAsiaTheme="minorEastAsia" w:hAnsi="Cambria Math"/>
             </w:rPr>
-            <m:t xml:space="preserve"> for i from n+2 t</m:t>
-          </m:r>
-          <m:r>
-            <w:rPr>
-              <w:rFonts w:ascii="Cambria Math" w:eastAsiaTheme="minorEastAsia" w:hAnsi="Cambria Math"/>
-            </w:rPr>
-            <m:t>o N</m:t>
+            <m:t xml:space="preserve"> for i from n+2 to N</m:t>
           </m:r>
         </m:oMath>
       </m:oMathPara>
@@ -10723,8 +10706,6 @@
           <w:lang w:val="fr-FR"/>
         </w:rPr>
       </w:pPr>
-      <w:bookmarkStart w:id="26" w:name="_GoBack"/>
-      <w:bookmarkEnd w:id="26"/>
     </w:p>
     <w:p>
       <w:pPr>
@@ -10845,13 +10826,7 @@
             <w:rPr>
               <w:rFonts w:ascii="Cambria Math" w:eastAsiaTheme="minorEastAsia" w:hAnsi="Cambria Math"/>
             </w:rPr>
-            <m:t>×Vel=A×</m:t>
-          </m:r>
-          <m:r>
-            <w:rPr>
-              <w:rFonts w:ascii="Cambria Math" w:eastAsiaTheme="minorEastAsia" w:hAnsi="Cambria Math"/>
-            </w:rPr>
-            <m:t>Cd×</m:t>
+            <m:t>×Vel=A×Cd×</m:t>
           </m:r>
           <m:rad>
             <m:radPr>
@@ -11043,6 +11018,517 @@
     </w:p>
     <w:p>
       <w:pPr>
+        <w:pStyle w:val="Titre3"/>
+        <w:rPr>
+          <w:lang w:val="fr-FR"/>
+        </w:rPr>
+      </w:pPr>
+      <w:proofErr w:type="spellStart"/>
+      <w:r>
+        <w:rPr>
+          <w:lang w:val="fr-FR"/>
+        </w:rPr>
+        <w:t>VerticalOpening</w:t>
+      </w:r>
+      <w:proofErr w:type="spellEnd"/>
+    </w:p>
+    <w:p>
+      <w:pPr>
+        <w:rPr>
+          <w:lang w:val="fr-FR"/>
+        </w:rPr>
+      </w:pPr>
+    </w:p>
+    <w:p>
+      <w:pPr>
+        <w:rPr>
+          <w:rFonts w:eastAsiaTheme="minorEastAsia"/>
+        </w:rPr>
+      </w:pPr>
+      <m:oMathPara>
+        <m:oMath>
+          <m:r>
+            <w:rPr>
+              <w:rFonts w:ascii="Cambria Math" w:eastAsiaTheme="minorEastAsia" w:hAnsi="Cambria Math"/>
+            </w:rPr>
+            <m:t>H_fluidStream=H×</m:t>
+          </m:r>
+          <m:rad>
+            <m:radPr>
+              <m:degHide m:val="1"/>
+              <m:ctrlPr>
+                <w:rPr>
+                  <w:rFonts w:ascii="Cambria Math" w:eastAsiaTheme="minorEastAsia" w:hAnsi="Cambria Math"/>
+                  <w:i/>
+                </w:rPr>
+              </m:ctrlPr>
+            </m:radPr>
+            <m:deg/>
+            <m:e>
+              <m:r>
+                <w:rPr>
+                  <w:rFonts w:ascii="Cambria Math" w:eastAsiaTheme="minorEastAsia" w:hAnsi="Cambria Math"/>
+                </w:rPr>
+                <m:t>Cd</m:t>
+              </m:r>
+            </m:e>
+          </m:rad>
+        </m:oMath>
+      </m:oMathPara>
+    </w:p>
+    <w:p>
+      <w:pPr>
+        <w:rPr>
+          <w:lang w:val="fr-FR"/>
+        </w:rPr>
+      </w:pPr>
+      <m:oMathPara>
+        <m:oMath>
+          <m:r>
+            <w:rPr>
+              <w:rFonts w:ascii="Cambria Math" w:eastAsiaTheme="minorEastAsia" w:hAnsi="Cambria Math"/>
+            </w:rPr>
+            <m:t>d</m:t>
+          </m:r>
+          <m:r>
+            <w:rPr>
+              <w:rFonts w:ascii="Cambria Math" w:eastAsiaTheme="minorEastAsia" w:hAnsi="Cambria Math"/>
+            </w:rPr>
+            <m:t>p_i[i]</m:t>
+          </m:r>
+          <m:r>
+            <w:rPr>
+              <w:rFonts w:ascii="Cambria Math" w:eastAsiaTheme="minorEastAsia" w:hAnsi="Cambria Math"/>
+            </w:rPr>
+            <m:t>=dp+g</m:t>
+          </m:r>
+          <m:r>
+            <w:rPr>
+              <w:rFonts w:ascii="Cambria Math" w:eastAsiaTheme="minorEastAsia" w:hAnsi="Cambria Math"/>
+            </w:rPr>
+            <m:t>×</m:t>
+          </m:r>
+          <m:d>
+            <m:dPr>
+              <m:ctrlPr>
+                <w:rPr>
+                  <w:rFonts w:ascii="Cambria Math" w:eastAsiaTheme="minorEastAsia" w:hAnsi="Cambria Math"/>
+                  <w:i/>
+                </w:rPr>
+              </m:ctrlPr>
+            </m:dPr>
+            <m:e>
+              <m:r>
+                <w:rPr>
+                  <w:rFonts w:ascii="Cambria Math" w:eastAsiaTheme="minorEastAsia" w:hAnsi="Cambria Math"/>
+                </w:rPr>
+                <m:t>H_fluidStream×</m:t>
+              </m:r>
+              <m:d>
+                <m:dPr>
+                  <m:ctrlPr>
+                    <w:rPr>
+                      <w:rFonts w:ascii="Cambria Math" w:eastAsiaTheme="minorEastAsia" w:hAnsi="Cambria Math"/>
+                      <w:i/>
+                    </w:rPr>
+                  </m:ctrlPr>
+                </m:dPr>
+                <m:e>
+                  <m:f>
+                    <m:fPr>
+                      <m:ctrlPr>
+                        <w:rPr>
+                          <w:rFonts w:ascii="Cambria Math" w:eastAsiaTheme="minorEastAsia" w:hAnsi="Cambria Math"/>
+                          <w:i/>
+                        </w:rPr>
+                      </m:ctrlPr>
+                    </m:fPr>
+                    <m:num>
+                      <m:r>
+                        <w:rPr>
+                          <w:rFonts w:ascii="Cambria Math" w:eastAsiaTheme="minorEastAsia" w:hAnsi="Cambria Math"/>
+                        </w:rPr>
+                        <m:t>1</m:t>
+                      </m:r>
+                    </m:num>
+                    <m:den>
+                      <m:r>
+                        <w:rPr>
+                          <w:rFonts w:ascii="Cambria Math" w:eastAsiaTheme="minorEastAsia" w:hAnsi="Cambria Math"/>
+                        </w:rPr>
+                        <m:t>2</m:t>
+                      </m:r>
+                    </m:den>
+                  </m:f>
+                  <m:r>
+                    <w:rPr>
+                      <w:rFonts w:ascii="Cambria Math" w:eastAsiaTheme="minorEastAsia" w:hAnsi="Cambria Math"/>
+                    </w:rPr>
+                    <m:t>-</m:t>
+                  </m:r>
+                  <m:f>
+                    <m:fPr>
+                      <m:ctrlPr>
+                        <w:rPr>
+                          <w:rFonts w:ascii="Cambria Math" w:eastAsiaTheme="minorEastAsia" w:hAnsi="Cambria Math"/>
+                          <w:i/>
+                        </w:rPr>
+                      </m:ctrlPr>
+                    </m:fPr>
+                    <m:num>
+                      <m:r>
+                        <w:rPr>
+                          <w:rFonts w:ascii="Cambria Math" w:eastAsiaTheme="minorEastAsia" w:hAnsi="Cambria Math"/>
+                        </w:rPr>
+                        <m:t>i-</m:t>
+                      </m:r>
+                      <m:f>
+                        <m:fPr>
+                          <m:ctrlPr>
+                            <w:rPr>
+                              <w:rFonts w:ascii="Cambria Math" w:eastAsiaTheme="minorEastAsia" w:hAnsi="Cambria Math"/>
+                              <w:i/>
+                            </w:rPr>
+                          </m:ctrlPr>
+                        </m:fPr>
+                        <m:num>
+                          <m:r>
+                            <w:rPr>
+                              <w:rFonts w:ascii="Cambria Math" w:eastAsiaTheme="minorEastAsia" w:hAnsi="Cambria Math"/>
+                            </w:rPr>
+                            <m:t>1</m:t>
+                          </m:r>
+                        </m:num>
+                        <m:den>
+                          <m:r>
+                            <w:rPr>
+                              <w:rFonts w:ascii="Cambria Math" w:eastAsiaTheme="minorEastAsia" w:hAnsi="Cambria Math"/>
+                            </w:rPr>
+                            <m:t>2</m:t>
+                          </m:r>
+                        </m:den>
+                      </m:f>
+                    </m:num>
+                    <m:den>
+                      <m:r>
+                        <w:rPr>
+                          <w:rFonts w:ascii="Cambria Math" w:eastAsiaTheme="minorEastAsia" w:hAnsi="Cambria Math"/>
+                        </w:rPr>
+                        <m:t>N</m:t>
+                      </m:r>
+                    </m:den>
+                  </m:f>
+                </m:e>
+              </m:d>
+            </m:e>
+          </m:d>
+          <m:r>
+            <w:rPr>
+              <w:rFonts w:ascii="Cambria Math" w:eastAsiaTheme="minorEastAsia" w:hAnsi="Cambria Math"/>
+            </w:rPr>
+            <m:t>×(</m:t>
+          </m:r>
+          <m:sSub>
+            <m:sSubPr>
+              <m:ctrlPr>
+                <w:rPr>
+                  <w:rFonts w:ascii="Cambria Math" w:eastAsiaTheme="minorEastAsia" w:hAnsi="Cambria Math"/>
+                  <w:i/>
+                </w:rPr>
+              </m:ctrlPr>
+            </m:sSubPr>
+            <m:e>
+              <m:r>
+                <w:rPr>
+                  <w:rFonts w:ascii="Cambria Math" w:eastAsiaTheme="minorEastAsia" w:hAnsi="Cambria Math"/>
+                </w:rPr>
+                <m:t>d</m:t>
+              </m:r>
+            </m:e>
+            <m:sub>
+              <m:r>
+                <w:rPr>
+                  <w:rFonts w:ascii="Cambria Math" w:eastAsiaTheme="minorEastAsia" w:hAnsi="Cambria Math"/>
+                </w:rPr>
+                <m:t>port_a</m:t>
+              </m:r>
+            </m:sub>
+          </m:sSub>
+          <m:r>
+            <w:rPr>
+              <w:rFonts w:ascii="Cambria Math" w:eastAsiaTheme="minorEastAsia" w:hAnsi="Cambria Math"/>
+            </w:rPr>
+            <m:t>-</m:t>
+          </m:r>
+          <m:sSub>
+            <m:sSubPr>
+              <m:ctrlPr>
+                <w:rPr>
+                  <w:rFonts w:ascii="Cambria Math" w:eastAsiaTheme="minorEastAsia" w:hAnsi="Cambria Math"/>
+                  <w:i/>
+                </w:rPr>
+              </m:ctrlPr>
+            </m:sSubPr>
+            <m:e>
+              <m:r>
+                <w:rPr>
+                  <w:rFonts w:ascii="Cambria Math" w:eastAsiaTheme="minorEastAsia" w:hAnsi="Cambria Math"/>
+                </w:rPr>
+                <m:t>d</m:t>
+              </m:r>
+            </m:e>
+            <m:sub>
+              <m:r>
+                <w:rPr>
+                  <w:rFonts w:ascii="Cambria Math" w:eastAsiaTheme="minorEastAsia" w:hAnsi="Cambria Math"/>
+                </w:rPr>
+                <m:t>port_b</m:t>
+              </m:r>
+            </m:sub>
+          </m:sSub>
+          <m:r>
+            <w:rPr>
+              <w:rFonts w:ascii="Cambria Math" w:eastAsiaTheme="minorEastAsia" w:hAnsi="Cambria Math"/>
+            </w:rPr>
+            <m:t>)</m:t>
+          </m:r>
+        </m:oMath>
+      </m:oMathPara>
+    </w:p>
+    <w:p>
+      <w:pPr>
+        <w:rPr>
+          <w:rFonts w:eastAsiaTheme="minorEastAsia"/>
+        </w:rPr>
+      </w:pPr>
+      <m:oMathPara>
+        <m:oMath>
+          <m:r>
+            <w:rPr>
+              <w:rFonts w:ascii="Cambria Math" w:eastAsiaTheme="minorEastAsia" w:hAnsi="Cambria Math"/>
+            </w:rPr>
+            <m:t>dp</m:t>
+          </m:r>
+          <m:r>
+            <w:rPr>
+              <w:rFonts w:ascii="Cambria Math" w:eastAsiaTheme="minorEastAsia" w:hAnsi="Cambria Math"/>
+            </w:rPr>
+            <m:t>_i</m:t>
+          </m:r>
+          <m:r>
+            <w:rPr>
+              <w:rFonts w:ascii="Cambria Math" w:eastAsiaTheme="minorEastAsia" w:hAnsi="Cambria Math"/>
+            </w:rPr>
+            <m:t>=</m:t>
+          </m:r>
+          <m:f>
+            <m:fPr>
+              <m:ctrlPr>
+                <w:rPr>
+                  <w:rFonts w:ascii="Cambria Math" w:eastAsiaTheme="minorEastAsia" w:hAnsi="Cambria Math"/>
+                  <w:i/>
+                </w:rPr>
+              </m:ctrlPr>
+            </m:fPr>
+            <m:num>
+              <m:r>
+                <w:rPr>
+                  <w:rFonts w:ascii="Cambria Math" w:eastAsiaTheme="minorEastAsia" w:hAnsi="Cambria Math"/>
+                </w:rPr>
+                <m:t>1</m:t>
+              </m:r>
+            </m:num>
+            <m:den>
+              <m:r>
+                <w:rPr>
+                  <w:rFonts w:ascii="Cambria Math" w:eastAsiaTheme="minorEastAsia" w:hAnsi="Cambria Math"/>
+                </w:rPr>
+                <m:t>2</m:t>
+              </m:r>
+            </m:den>
+          </m:f>
+          <m:r>
+            <w:rPr>
+              <w:rFonts w:ascii="Cambria Math" w:eastAsiaTheme="minorEastAsia" w:hAnsi="Cambria Math"/>
+            </w:rPr>
+            <m:t>×d×</m:t>
+          </m:r>
+          <m:sSup>
+            <m:sSupPr>
+              <m:ctrlPr>
+                <w:rPr>
+                  <w:rFonts w:ascii="Cambria Math" w:eastAsiaTheme="minorEastAsia" w:hAnsi="Cambria Math"/>
+                  <w:i/>
+                </w:rPr>
+              </m:ctrlPr>
+            </m:sSupPr>
+            <m:e>
+              <m:r>
+                <w:rPr>
+                  <w:rFonts w:ascii="Cambria Math" w:eastAsiaTheme="minorEastAsia" w:hAnsi="Cambria Math"/>
+                </w:rPr>
+                <m:t>Vel</m:t>
+              </m:r>
+              <m:r>
+                <w:rPr>
+                  <w:rFonts w:ascii="Cambria Math" w:eastAsiaTheme="minorEastAsia" w:hAnsi="Cambria Math"/>
+                </w:rPr>
+                <m:t>_i</m:t>
+              </m:r>
+            </m:e>
+            <m:sup>
+              <m:r>
+                <w:rPr>
+                  <w:rFonts w:ascii="Cambria Math" w:eastAsiaTheme="minorEastAsia" w:hAnsi="Cambria Math"/>
+                </w:rPr>
+                <m:t>2</m:t>
+              </m:r>
+            </m:sup>
+          </m:sSup>
+        </m:oMath>
+      </m:oMathPara>
+      <w:bookmarkStart w:id="26" w:name="_GoBack"/>
+      <w:bookmarkEnd w:id="26"/>
+    </w:p>
+    <w:p>
+      <w:pPr>
+        <w:rPr>
+          <w:rFonts w:eastAsiaTheme="minorEastAsia"/>
+        </w:rPr>
+      </w:pPr>
+      <m:oMathPara>
+        <m:oMath>
+          <m:r>
+            <w:rPr>
+              <w:rFonts w:ascii="Cambria Math" w:eastAsiaTheme="minorEastAsia" w:hAnsi="Cambria Math"/>
+            </w:rPr>
+            <m:t>m_flow</m:t>
+          </m:r>
+          <m:r>
+            <w:rPr>
+              <w:rFonts w:ascii="Cambria Math" w:eastAsiaTheme="minorEastAsia" w:hAnsi="Cambria Math"/>
+            </w:rPr>
+            <m:t>_i</m:t>
+          </m:r>
+          <m:r>
+            <w:rPr>
+              <w:rFonts w:ascii="Cambria Math" w:eastAsiaTheme="minorEastAsia" w:hAnsi="Cambria Math"/>
+            </w:rPr>
+            <m:t>=d×</m:t>
+          </m:r>
+          <m:sSub>
+            <m:sSubPr>
+              <m:ctrlPr>
+                <w:rPr>
+                  <w:rFonts w:ascii="Cambria Math" w:eastAsiaTheme="minorEastAsia" w:hAnsi="Cambria Math"/>
+                  <w:i/>
+                </w:rPr>
+              </m:ctrlPr>
+            </m:sSubPr>
+            <m:e>
+              <m:r>
+                <w:rPr>
+                  <w:rFonts w:ascii="Cambria Math" w:eastAsiaTheme="minorEastAsia" w:hAnsi="Cambria Math"/>
+                </w:rPr>
+                <m:t>A</m:t>
+              </m:r>
+            </m:e>
+            <m:sub>
+              <m:r>
+                <w:rPr>
+                  <w:rFonts w:ascii="Cambria Math" w:eastAsiaTheme="minorEastAsia" w:hAnsi="Cambria Math"/>
+                </w:rPr>
+                <m:t>flow</m:t>
+              </m:r>
+            </m:sub>
+          </m:sSub>
+          <m:r>
+            <w:rPr>
+              <w:rFonts w:ascii="Cambria Math" w:eastAsiaTheme="minorEastAsia" w:hAnsi="Cambria Math"/>
+            </w:rPr>
+            <m:t>×Vel</m:t>
+          </m:r>
+          <m:r>
+            <w:rPr>
+              <w:rFonts w:ascii="Cambria Math" w:eastAsiaTheme="minorEastAsia" w:hAnsi="Cambria Math"/>
+            </w:rPr>
+            <m:t>_i</m:t>
+          </m:r>
+          <m:r>
+            <w:rPr>
+              <w:rFonts w:ascii="Cambria Math" w:eastAsiaTheme="minorEastAsia" w:hAnsi="Cambria Math"/>
+            </w:rPr>
+            <m:t>=</m:t>
+          </m:r>
+          <m:f>
+            <m:fPr>
+              <m:ctrlPr>
+                <w:rPr>
+                  <w:rFonts w:ascii="Cambria Math" w:eastAsiaTheme="minorEastAsia" w:hAnsi="Cambria Math"/>
+                  <w:i/>
+                </w:rPr>
+              </m:ctrlPr>
+            </m:fPr>
+            <m:num>
+              <m:r>
+                <w:rPr>
+                  <w:rFonts w:ascii="Cambria Math" w:eastAsiaTheme="minorEastAsia" w:hAnsi="Cambria Math"/>
+                </w:rPr>
+                <m:t>A</m:t>
+              </m:r>
+            </m:num>
+            <m:den>
+              <m:r>
+                <w:rPr>
+                  <w:rFonts w:ascii="Cambria Math" w:eastAsiaTheme="minorEastAsia" w:hAnsi="Cambria Math"/>
+                </w:rPr>
+                <m:t>N</m:t>
+              </m:r>
+            </m:den>
+          </m:f>
+          <m:r>
+            <w:rPr>
+              <w:rFonts w:ascii="Cambria Math" w:eastAsiaTheme="minorEastAsia" w:hAnsi="Cambria Math"/>
+            </w:rPr>
+            <m:t>×Cd×</m:t>
+          </m:r>
+          <m:rad>
+            <m:radPr>
+              <m:degHide m:val="1"/>
+              <m:ctrlPr>
+                <w:rPr>
+                  <w:rFonts w:ascii="Cambria Math" w:eastAsiaTheme="minorEastAsia" w:hAnsi="Cambria Math"/>
+                  <w:i/>
+                </w:rPr>
+              </m:ctrlPr>
+            </m:radPr>
+            <m:deg/>
+            <m:e>
+              <m:r>
+                <w:rPr>
+                  <w:rFonts w:ascii="Cambria Math" w:eastAsiaTheme="minorEastAsia" w:hAnsi="Cambria Math"/>
+                </w:rPr>
+                <m:t>2×dp</m:t>
+              </m:r>
+              <m:r>
+                <w:rPr>
+                  <w:rFonts w:ascii="Cambria Math" w:eastAsiaTheme="minorEastAsia" w:hAnsi="Cambria Math"/>
+                </w:rPr>
+                <m:t>_i</m:t>
+              </m:r>
+              <m:r>
+                <w:rPr>
+                  <w:rFonts w:ascii="Cambria Math" w:eastAsiaTheme="minorEastAsia" w:hAnsi="Cambria Math"/>
+                </w:rPr>
+                <m:t>×d</m:t>
+              </m:r>
+            </m:e>
+          </m:rad>
+        </m:oMath>
+      </m:oMathPara>
+    </w:p>
+    <w:p>
+      <w:pPr>
         <w:rPr>
           <w:lang w:val="fr-FR"/>
         </w:rPr>
@@ -11068,6 +11554,7 @@
         <w:rPr>
           <w:lang w:val="fr-FR"/>
         </w:rPr>
+        <w:lastRenderedPageBreak/>
         <w:t>BasesClasses</w:t>
       </w:r>
       <w:bookmarkEnd w:id="27"/>
@@ -11354,7 +11841,6 @@
         <w:rPr>
           <w:rFonts w:eastAsiaTheme="minorEastAsia"/>
         </w:rPr>
-        <w:lastRenderedPageBreak/>
         <w:t>Con</w:t>
       </w:r>
       <w:r>
@@ -12082,6 +12568,7 @@
             <w:rPr>
               <w:rFonts w:ascii="Cambria Math" w:eastAsiaTheme="minorEastAsia" w:hAnsi="Cambria Math"/>
             </w:rPr>
+            <w:lastRenderedPageBreak/>
             <m:t>d_sat=</m:t>
           </m:r>
           <m:f>
@@ -12555,7 +13042,6 @@
             <w:rPr>
               <w:rFonts w:ascii="Cambria Math" w:eastAsiaTheme="minorEastAsia" w:hAnsi="Cambria Math"/>
             </w:rPr>
-            <w:lastRenderedPageBreak/>
             <m:t xml:space="preserve">Π=  </m:t>
           </m:r>
           <m:sSub>
@@ -13411,6 +13897,7 @@
         <w:rPr>
           <w:rFonts w:eastAsiaTheme="minorEastAsia"/>
         </w:rPr>
+        <w:lastRenderedPageBreak/>
         <w:t>rootsPolyorder3</w:t>
       </w:r>
       <w:bookmarkEnd w:id="34"/>
@@ -13715,7 +14202,6 @@
             <w:rPr>
               <w:rFonts w:ascii="Cambria Math" w:eastAsiaTheme="minorEastAsia" w:hAnsi="Cambria Math"/>
             </w:rPr>
-            <w:lastRenderedPageBreak/>
             <m:t>x1=</m:t>
           </m:r>
           <m:rad>
@@ -15287,6 +15773,7 @@
             <w:rPr>
               <w:rFonts w:ascii="Cambria Math" w:eastAsiaTheme="minorEastAsia" w:hAnsi="Cambria Math"/>
             </w:rPr>
+            <w:lastRenderedPageBreak/>
             <m:t>x1=x2=</m:t>
           </m:r>
           <m:f>
@@ -16089,7 +16576,14 @@
                           <w:rFonts w:ascii="Cambria Math" w:hAnsi="Cambria Math"/>
                           <w:sz w:val="18"/>
                         </w:rPr>
-                        <m:t>∂x</m:t>
+                        <m:t>∂</m:t>
+                      </m:r>
+                      <m:r>
+                        <w:rPr>
+                          <w:rFonts w:ascii="Cambria Math" w:hAnsi="Cambria Math"/>
+                          <w:sz w:val="18"/>
+                        </w:rPr>
+                        <m:t>x</m:t>
                       </m:r>
                     </m:den>
                   </m:f>
@@ -18445,6 +18939,36 @@
     </w:lvlOverride>
   </w:num>
   <w:num w:numId="12">
+    <w:abstractNumId w:val="1"/>
+    <w:lvlOverride w:ilvl="0">
+      <w:startOverride w:val="1"/>
+    </w:lvlOverride>
+    <w:lvlOverride w:ilvl="1">
+      <w:startOverride w:val="1"/>
+    </w:lvlOverride>
+    <w:lvlOverride w:ilvl="2">
+      <w:startOverride w:val="1"/>
+    </w:lvlOverride>
+    <w:lvlOverride w:ilvl="3">
+      <w:startOverride w:val="1"/>
+    </w:lvlOverride>
+    <w:lvlOverride w:ilvl="4">
+      <w:startOverride w:val="1"/>
+    </w:lvlOverride>
+    <w:lvlOverride w:ilvl="5">
+      <w:startOverride w:val="1"/>
+    </w:lvlOverride>
+    <w:lvlOverride w:ilvl="6">
+      <w:startOverride w:val="1"/>
+    </w:lvlOverride>
+    <w:lvlOverride w:ilvl="7">
+      <w:startOverride w:val="1"/>
+    </w:lvlOverride>
+    <w:lvlOverride w:ilvl="8">
+      <w:startOverride w:val="1"/>
+    </w:lvlOverride>
+  </w:num>
+  <w:num w:numId="13">
     <w:abstractNumId w:val="1"/>
     <w:lvlOverride w:ilvl="0">
       <w:startOverride w:val="1"/>
@@ -20066,7 +20590,7 @@
   <a:extraClrSchemeLst/>
   <a:extLst>
     <a:ext uri="{05A4C25C-085E-4340-85A3-A5531E510DB2}">
-      <thm15:themeFamily xmlns="" xmlns:thm15="http://schemas.microsoft.com/office/thememl/2012/main" name="Office Theme" id="{62F939B6-93AF-4DB8-9C6B-D6C7DFDC589F}" vid="{4A3C46E8-61CC-4603-A589-7422A47A8E4A}"/>
+      <thm15:themeFamily xmlns:thm15="http://schemas.microsoft.com/office/thememl/2012/main" xmlns="" name="Office Theme" id="{62F939B6-93AF-4DB8-9C6B-D6C7DFDC589F}" vid="{4A3C46E8-61CC-4603-A589-7422A47A8E4A}"/>
     </a:ext>
   </a:extLst>
 </a:theme>
@@ -20077,7 +20601,7 @@
 </file>
 
 <file path=customXml/itemProps1.xml><?xml version="1.0" encoding="utf-8"?>
-<ds:datastoreItem xmlns:ds="http://schemas.openxmlformats.org/officeDocument/2006/customXml" ds:itemID="{0712F809-8866-4A17-B89F-12C5A21A6075}">
+<ds:datastoreItem xmlns:ds="http://schemas.openxmlformats.org/officeDocument/2006/customXml" ds:itemID="{092DC66C-C47D-471E-B75F-DA36A6C2E36D}">
   <ds:schemaRefs>
     <ds:schemaRef ds:uri="http://schemas.openxmlformats.org/officeDocument/2006/bibliography"/>
   </ds:schemaRefs>

</xml_diff>

<commit_message>
Addition of an HTML description to the HorizontalOpening module
</commit_message>
<xml_diff>
--- a/Information/script for equations.docx
+++ b/Information/script for equations.docx
@@ -11387,8 +11387,6 @@
           </m:sSup>
         </m:oMath>
       </m:oMathPara>
-      <w:bookmarkStart w:id="26" w:name="_GoBack"/>
-      <w:bookmarkEnd w:id="26"/>
     </w:p>
     <w:p>
       <w:pPr>
@@ -11536,6 +11534,679 @@
     </w:p>
     <w:p>
       <w:pPr>
+        <w:pStyle w:val="Titre3"/>
+        <w:rPr>
+          <w:lang w:val="fr-FR"/>
+        </w:rPr>
+      </w:pPr>
+      <w:proofErr w:type="spellStart"/>
+      <w:r>
+        <w:rPr>
+          <w:lang w:val="fr-FR"/>
+        </w:rPr>
+        <w:lastRenderedPageBreak/>
+        <w:t>HorizontalOpening</w:t>
+      </w:r>
+      <w:proofErr w:type="spellEnd"/>
+    </w:p>
+    <w:p>
+      <w:pPr>
+        <w:rPr>
+          <w:lang w:val="fr-FR"/>
+        </w:rPr>
+      </w:pPr>
+    </w:p>
+    <w:p>
+      <w:pPr>
+        <w:rPr>
+          <w:rFonts w:eastAsiaTheme="minorEastAsia"/>
+        </w:rPr>
+      </w:pPr>
+      <m:oMathPara>
+        <m:oMath>
+          <m:r>
+            <w:rPr>
+              <w:rFonts w:ascii="Cambria Math" w:eastAsiaTheme="minorEastAsia" w:hAnsi="Cambria Math"/>
+            </w:rPr>
+            <m:t>p_up =</m:t>
+          </m:r>
+          <m:sSub>
+            <m:sSubPr>
+              <m:ctrlPr>
+                <w:rPr>
+                  <w:rFonts w:ascii="Cambria Math" w:eastAsiaTheme="minorEastAsia" w:hAnsi="Cambria Math"/>
+                  <w:i/>
+                </w:rPr>
+              </m:ctrlPr>
+            </m:sSubPr>
+            <m:e>
+              <m:r>
+                <w:rPr>
+                  <w:rFonts w:ascii="Cambria Math" w:eastAsiaTheme="minorEastAsia" w:hAnsi="Cambria Math"/>
+                </w:rPr>
+                <m:t>p</m:t>
+              </m:r>
+            </m:e>
+            <m:sub>
+              <m:r>
+                <w:rPr>
+                  <w:rFonts w:ascii="Cambria Math" w:eastAsiaTheme="minorEastAsia" w:hAnsi="Cambria Math"/>
+                </w:rPr>
+                <m:t>port_a</m:t>
+              </m:r>
+            </m:sub>
+          </m:sSub>
+          <m:r>
+            <w:rPr>
+              <w:rFonts w:ascii="Cambria Math" w:eastAsiaTheme="minorEastAsia" w:hAnsi="Cambria Math"/>
+            </w:rPr>
+            <m:t>+</m:t>
+          </m:r>
+          <m:sSub>
+            <m:sSubPr>
+              <m:ctrlPr>
+                <w:rPr>
+                  <w:rFonts w:ascii="Cambria Math" w:eastAsiaTheme="minorEastAsia" w:hAnsi="Cambria Math"/>
+                  <w:i/>
+                </w:rPr>
+              </m:ctrlPr>
+            </m:sSubPr>
+            <m:e>
+              <m:r>
+                <w:rPr>
+                  <w:rFonts w:ascii="Cambria Math" w:eastAsiaTheme="minorEastAsia" w:hAnsi="Cambria Math"/>
+                </w:rPr>
+                <m:t>d</m:t>
+              </m:r>
+            </m:e>
+            <m:sub>
+              <m:r>
+                <w:rPr>
+                  <w:rFonts w:ascii="Cambria Math" w:eastAsiaTheme="minorEastAsia" w:hAnsi="Cambria Math"/>
+                </w:rPr>
+                <m:t>por</m:t>
+              </m:r>
+              <m:r>
+                <w:rPr>
+                  <w:rFonts w:ascii="Cambria Math" w:eastAsiaTheme="minorEastAsia" w:hAnsi="Cambria Math"/>
+                </w:rPr>
+                <m:t>t_a</m:t>
+              </m:r>
+            </m:sub>
+          </m:sSub>
+          <m:r>
+            <w:rPr>
+              <w:rFonts w:ascii="Cambria Math" w:eastAsiaTheme="minorEastAsia" w:hAnsi="Cambria Math"/>
+            </w:rPr>
+            <m:t>×g×L_up</m:t>
+          </m:r>
+        </m:oMath>
+      </m:oMathPara>
+    </w:p>
+    <w:p>
+      <w:pPr>
+        <w:rPr>
+          <w:rFonts w:eastAsiaTheme="minorEastAsia"/>
+        </w:rPr>
+      </w:pPr>
+      <m:oMathPara>
+        <m:oMath>
+          <m:r>
+            <w:rPr>
+              <w:rFonts w:ascii="Cambria Math" w:eastAsiaTheme="minorEastAsia" w:hAnsi="Cambria Math"/>
+            </w:rPr>
+            <m:t>p_</m:t>
+          </m:r>
+          <m:r>
+            <w:rPr>
+              <w:rFonts w:ascii="Cambria Math" w:eastAsiaTheme="minorEastAsia" w:hAnsi="Cambria Math"/>
+            </w:rPr>
+            <m:t>down</m:t>
+          </m:r>
+          <m:r>
+            <w:rPr>
+              <w:rFonts w:ascii="Cambria Math" w:eastAsiaTheme="minorEastAsia" w:hAnsi="Cambria Math"/>
+            </w:rPr>
+            <m:t xml:space="preserve"> =</m:t>
+          </m:r>
+          <m:sSub>
+            <m:sSubPr>
+              <m:ctrlPr>
+                <w:rPr>
+                  <w:rFonts w:ascii="Cambria Math" w:eastAsiaTheme="minorEastAsia" w:hAnsi="Cambria Math"/>
+                  <w:i/>
+                </w:rPr>
+              </m:ctrlPr>
+            </m:sSubPr>
+            <m:e>
+              <m:r>
+                <w:rPr>
+                  <w:rFonts w:ascii="Cambria Math" w:eastAsiaTheme="minorEastAsia" w:hAnsi="Cambria Math"/>
+                </w:rPr>
+                <m:t>p</m:t>
+              </m:r>
+            </m:e>
+            <m:sub>
+              <m:r>
+                <w:rPr>
+                  <w:rFonts w:ascii="Cambria Math" w:eastAsiaTheme="minorEastAsia" w:hAnsi="Cambria Math"/>
+                </w:rPr>
+                <m:t>por</m:t>
+              </m:r>
+              <m:r>
+                <w:rPr>
+                  <w:rFonts w:ascii="Cambria Math" w:eastAsiaTheme="minorEastAsia" w:hAnsi="Cambria Math"/>
+                </w:rPr>
+                <m:t>t_b</m:t>
+              </m:r>
+            </m:sub>
+          </m:sSub>
+          <m:r>
+            <w:rPr>
+              <w:rFonts w:ascii="Cambria Math" w:eastAsiaTheme="minorEastAsia" w:hAnsi="Cambria Math"/>
+            </w:rPr>
+            <m:t>-</m:t>
+          </m:r>
+          <m:sSub>
+            <m:sSubPr>
+              <m:ctrlPr>
+                <w:rPr>
+                  <w:rFonts w:ascii="Cambria Math" w:eastAsiaTheme="minorEastAsia" w:hAnsi="Cambria Math"/>
+                  <w:i/>
+                </w:rPr>
+              </m:ctrlPr>
+            </m:sSubPr>
+            <m:e>
+              <m:r>
+                <w:rPr>
+                  <w:rFonts w:ascii="Cambria Math" w:eastAsiaTheme="minorEastAsia" w:hAnsi="Cambria Math"/>
+                </w:rPr>
+                <m:t>d</m:t>
+              </m:r>
+            </m:e>
+            <m:sub>
+              <m:r>
+                <w:rPr>
+                  <w:rFonts w:ascii="Cambria Math" w:eastAsiaTheme="minorEastAsia" w:hAnsi="Cambria Math"/>
+                </w:rPr>
+                <m:t>por</m:t>
+              </m:r>
+              <m:r>
+                <w:rPr>
+                  <w:rFonts w:ascii="Cambria Math" w:eastAsiaTheme="minorEastAsia" w:hAnsi="Cambria Math"/>
+                </w:rPr>
+                <m:t>t_b</m:t>
+              </m:r>
+            </m:sub>
+          </m:sSub>
+          <m:r>
+            <w:rPr>
+              <w:rFonts w:ascii="Cambria Math" w:eastAsiaTheme="minorEastAsia" w:hAnsi="Cambria Math"/>
+            </w:rPr>
+            <m:t>×g×L_</m:t>
+          </m:r>
+          <m:r>
+            <w:rPr>
+              <w:rFonts w:ascii="Cambria Math" w:eastAsiaTheme="minorEastAsia" w:hAnsi="Cambria Math"/>
+            </w:rPr>
+            <m:t>down</m:t>
+          </m:r>
+        </m:oMath>
+      </m:oMathPara>
+    </w:p>
+    <w:p>
+      <w:pPr>
+        <w:rPr>
+          <w:rFonts w:eastAsiaTheme="minorEastAsia"/>
+        </w:rPr>
+      </w:pPr>
+      <m:oMathPara>
+        <m:oMath>
+          <m:r>
+            <w:rPr>
+              <w:rFonts w:ascii="Cambria Math" w:eastAsiaTheme="minorEastAsia" w:hAnsi="Cambria Math"/>
+            </w:rPr>
+            <m:t>dp</m:t>
+          </m:r>
+          <m:r>
+            <w:rPr>
+              <w:rFonts w:ascii="Cambria Math" w:eastAsiaTheme="minorEastAsia" w:hAnsi="Cambria Math"/>
+            </w:rPr>
+            <m:t xml:space="preserve"> =p_up</m:t>
+          </m:r>
+          <m:r>
+            <w:rPr>
+              <w:rFonts w:ascii="Cambria Math" w:eastAsiaTheme="minorEastAsia" w:hAnsi="Cambria Math"/>
+            </w:rPr>
+            <m:t>-</m:t>
+          </m:r>
+          <m:r>
+            <w:rPr>
+              <w:rFonts w:ascii="Cambria Math" w:eastAsiaTheme="minorEastAsia" w:hAnsi="Cambria Math"/>
+            </w:rPr>
+            <m:t>p_</m:t>
+          </m:r>
+          <m:r>
+            <w:rPr>
+              <w:rFonts w:ascii="Cambria Math" w:eastAsiaTheme="minorEastAsia" w:hAnsi="Cambria Math"/>
+            </w:rPr>
+            <m:t>down</m:t>
+          </m:r>
+        </m:oMath>
+      </m:oMathPara>
+    </w:p>
+    <w:p>
+      <w:pPr>
+        <w:rPr>
+          <w:rFonts w:eastAsiaTheme="minorEastAsia"/>
+        </w:rPr>
+      </w:pPr>
+      <m:oMathPara>
+        <m:oMath>
+          <m:r>
+            <w:rPr>
+              <w:rFonts w:ascii="Cambria Math" w:eastAsiaTheme="minorEastAsia" w:hAnsi="Cambria Math"/>
+            </w:rPr>
+            <m:t>dp=</m:t>
+          </m:r>
+          <m:f>
+            <m:fPr>
+              <m:ctrlPr>
+                <w:rPr>
+                  <w:rFonts w:ascii="Cambria Math" w:eastAsiaTheme="minorEastAsia" w:hAnsi="Cambria Math"/>
+                  <w:i/>
+                </w:rPr>
+              </m:ctrlPr>
+            </m:fPr>
+            <m:num>
+              <m:r>
+                <w:rPr>
+                  <w:rFonts w:ascii="Cambria Math" w:eastAsiaTheme="minorEastAsia" w:hAnsi="Cambria Math"/>
+                </w:rPr>
+                <m:t>1</m:t>
+              </m:r>
+            </m:num>
+            <m:den>
+              <m:r>
+                <w:rPr>
+                  <w:rFonts w:ascii="Cambria Math" w:eastAsiaTheme="minorEastAsia" w:hAnsi="Cambria Math"/>
+                </w:rPr>
+                <m:t>2</m:t>
+              </m:r>
+            </m:den>
+          </m:f>
+          <m:r>
+            <w:rPr>
+              <w:rFonts w:ascii="Cambria Math" w:eastAsiaTheme="minorEastAsia" w:hAnsi="Cambria Math"/>
+            </w:rPr>
+            <m:t>×d×</m:t>
+          </m:r>
+          <m:sSup>
+            <m:sSupPr>
+              <m:ctrlPr>
+                <w:rPr>
+                  <w:rFonts w:ascii="Cambria Math" w:eastAsiaTheme="minorEastAsia" w:hAnsi="Cambria Math"/>
+                  <w:i/>
+                </w:rPr>
+              </m:ctrlPr>
+            </m:sSupPr>
+            <m:e>
+              <m:r>
+                <w:rPr>
+                  <w:rFonts w:ascii="Cambria Math" w:eastAsiaTheme="minorEastAsia" w:hAnsi="Cambria Math"/>
+                </w:rPr>
+                <m:t>Vel</m:t>
+              </m:r>
+            </m:e>
+            <m:sup>
+              <m:r>
+                <w:rPr>
+                  <w:rFonts w:ascii="Cambria Math" w:eastAsiaTheme="minorEastAsia" w:hAnsi="Cambria Math"/>
+                </w:rPr>
+                <m:t>2</m:t>
+              </m:r>
+            </m:sup>
+          </m:sSup>
+        </m:oMath>
+      </m:oMathPara>
+    </w:p>
+    <w:p>
+      <w:pPr>
+        <w:rPr>
+          <w:rFonts w:eastAsiaTheme="minorEastAsia"/>
+        </w:rPr>
+      </w:pPr>
+      <m:oMathPara>
+        <m:oMath>
+          <m:r>
+            <w:rPr>
+              <w:rFonts w:ascii="Cambria Math" w:eastAsiaTheme="minorEastAsia" w:hAnsi="Cambria Math"/>
+            </w:rPr>
+            <m:t>m_flow=d×</m:t>
+          </m:r>
+          <m:sSub>
+            <m:sSubPr>
+              <m:ctrlPr>
+                <w:rPr>
+                  <w:rFonts w:ascii="Cambria Math" w:eastAsiaTheme="minorEastAsia" w:hAnsi="Cambria Math"/>
+                  <w:i/>
+                </w:rPr>
+              </m:ctrlPr>
+            </m:sSubPr>
+            <m:e>
+              <m:r>
+                <w:rPr>
+                  <w:rFonts w:ascii="Cambria Math" w:eastAsiaTheme="minorEastAsia" w:hAnsi="Cambria Math"/>
+                </w:rPr>
+                <m:t>A</m:t>
+              </m:r>
+            </m:e>
+            <m:sub>
+              <m:r>
+                <w:rPr>
+                  <w:rFonts w:ascii="Cambria Math" w:eastAsiaTheme="minorEastAsia" w:hAnsi="Cambria Math"/>
+                </w:rPr>
+                <m:t>flow</m:t>
+              </m:r>
+            </m:sub>
+          </m:sSub>
+          <m:r>
+            <w:rPr>
+              <w:rFonts w:ascii="Cambria Math" w:eastAsiaTheme="minorEastAsia" w:hAnsi="Cambria Math"/>
+            </w:rPr>
+            <m:t>×Vel=</m:t>
+          </m:r>
+          <m:r>
+            <w:rPr>
+              <w:rFonts w:ascii="Cambria Math" w:eastAsiaTheme="minorEastAsia" w:hAnsi="Cambria Math"/>
+            </w:rPr>
+            <m:t>A</m:t>
+          </m:r>
+          <m:r>
+            <w:rPr>
+              <w:rFonts w:ascii="Cambria Math" w:eastAsiaTheme="minorEastAsia" w:hAnsi="Cambria Math"/>
+            </w:rPr>
+            <m:t>×Cd×</m:t>
+          </m:r>
+          <m:rad>
+            <m:radPr>
+              <m:degHide m:val="1"/>
+              <m:ctrlPr>
+                <w:rPr>
+                  <w:rFonts w:ascii="Cambria Math" w:eastAsiaTheme="minorEastAsia" w:hAnsi="Cambria Math"/>
+                  <w:i/>
+                </w:rPr>
+              </m:ctrlPr>
+            </m:radPr>
+            <m:deg/>
+            <m:e>
+              <m:r>
+                <w:rPr>
+                  <w:rFonts w:ascii="Cambria Math" w:eastAsiaTheme="minorEastAsia" w:hAnsi="Cambria Math"/>
+                </w:rPr>
+                <m:t>2×dp×d</m:t>
+              </m:r>
+            </m:e>
+          </m:rad>
+        </m:oMath>
+      </m:oMathPara>
+    </w:p>
+    <w:p>
+      <w:pPr>
+        <w:rPr>
+          <w:rFonts w:eastAsiaTheme="minorEastAsia"/>
+        </w:rPr>
+      </w:pPr>
+      <m:oMathPara>
+        <m:oMath>
+          <m:r>
+            <w:rPr>
+              <w:rFonts w:ascii="Cambria Math" w:eastAsiaTheme="minorEastAsia" w:hAnsi="Cambria Math"/>
+            </w:rPr>
+            <m:t>dp_buoyancy=g×L_up×</m:t>
+          </m:r>
+          <m:r>
+            <m:rPr>
+              <m:sty m:val="p"/>
+            </m:rPr>
+            <w:rPr>
+              <w:rFonts w:ascii="Cambria Math" w:eastAsiaTheme="minorEastAsia" w:hAnsi="Cambria Math"/>
+            </w:rPr>
+            <m:t>max⁡</m:t>
+          </m:r>
+          <m:r>
+            <w:rPr>
+              <w:rFonts w:ascii="Cambria Math" w:eastAsiaTheme="minorEastAsia" w:hAnsi="Cambria Math"/>
+            </w:rPr>
+            <m:t>(</m:t>
+          </m:r>
+          <m:sSub>
+            <m:sSubPr>
+              <m:ctrlPr>
+                <w:rPr>
+                  <w:rFonts w:ascii="Cambria Math" w:eastAsiaTheme="minorEastAsia" w:hAnsi="Cambria Math"/>
+                  <w:i/>
+                </w:rPr>
+              </m:ctrlPr>
+            </m:sSubPr>
+            <m:e>
+              <m:r>
+                <w:rPr>
+                  <w:rFonts w:ascii="Cambria Math" w:eastAsiaTheme="minorEastAsia" w:hAnsi="Cambria Math"/>
+                </w:rPr>
+                <m:t>d</m:t>
+              </m:r>
+            </m:e>
+            <m:sub>
+              <m:r>
+                <w:rPr>
+                  <w:rFonts w:ascii="Cambria Math" w:eastAsiaTheme="minorEastAsia" w:hAnsi="Cambria Math"/>
+                </w:rPr>
+                <m:t>port_a</m:t>
+              </m:r>
+            </m:sub>
+          </m:sSub>
+          <m:r>
+            <w:rPr>
+              <w:rFonts w:ascii="Cambria Math" w:eastAsiaTheme="minorEastAsia" w:hAnsi="Cambria Math"/>
+            </w:rPr>
+            <m:t>-</m:t>
+          </m:r>
+          <m:sSub>
+            <m:sSubPr>
+              <m:ctrlPr>
+                <w:rPr>
+                  <w:rFonts w:ascii="Cambria Math" w:eastAsiaTheme="minorEastAsia" w:hAnsi="Cambria Math"/>
+                  <w:i/>
+                </w:rPr>
+              </m:ctrlPr>
+            </m:sSubPr>
+            <m:e>
+              <m:r>
+                <w:rPr>
+                  <w:rFonts w:ascii="Cambria Math" w:eastAsiaTheme="minorEastAsia" w:hAnsi="Cambria Math"/>
+                </w:rPr>
+                <m:t>d</m:t>
+              </m:r>
+            </m:e>
+            <m:sub>
+              <m:r>
+                <w:rPr>
+                  <w:rFonts w:ascii="Cambria Math" w:eastAsiaTheme="minorEastAsia" w:hAnsi="Cambria Math"/>
+                </w:rPr>
+                <m:t>port_b</m:t>
+              </m:r>
+            </m:sub>
+          </m:sSub>
+          <m:r>
+            <w:rPr>
+              <w:rFonts w:ascii="Cambria Math" w:eastAsiaTheme="minorEastAsia" w:hAnsi="Cambria Math"/>
+            </w:rPr>
+            <m:t>, 0)</m:t>
+          </m:r>
+        </m:oMath>
+      </m:oMathPara>
+    </w:p>
+    <w:p>
+      <w:pPr>
+        <w:rPr>
+          <w:rFonts w:eastAsiaTheme="minorEastAsia"/>
+        </w:rPr>
+      </w:pPr>
+      <m:oMathPara>
+        <m:oMath>
+          <m:r>
+            <w:rPr>
+              <w:rFonts w:ascii="Cambria Math" w:eastAsiaTheme="minorEastAsia" w:hAnsi="Cambria Math"/>
+            </w:rPr>
+            <m:t>m_flow_buoyancy=</m:t>
+          </m:r>
+          <m:f>
+            <m:fPr>
+              <m:ctrlPr>
+                <w:rPr>
+                  <w:rFonts w:ascii="Cambria Math" w:eastAsiaTheme="minorEastAsia" w:hAnsi="Cambria Math"/>
+                  <w:i/>
+                </w:rPr>
+              </m:ctrlPr>
+            </m:fPr>
+            <m:num>
+              <m:r>
+                <w:rPr>
+                  <w:rFonts w:ascii="Cambria Math" w:eastAsiaTheme="minorEastAsia" w:hAnsi="Cambria Math"/>
+                </w:rPr>
+                <m:t>A</m:t>
+              </m:r>
+            </m:num>
+            <m:den>
+              <m:r>
+                <w:rPr>
+                  <w:rFonts w:ascii="Cambria Math" w:eastAsiaTheme="minorEastAsia" w:hAnsi="Cambria Math"/>
+                </w:rPr>
+                <m:t>2</m:t>
+              </m:r>
+            </m:den>
+          </m:f>
+          <m:r>
+            <w:rPr>
+              <w:rFonts w:ascii="Cambria Math" w:eastAsiaTheme="minorEastAsia" w:hAnsi="Cambria Math"/>
+            </w:rPr>
+            <m:t>×Cd×</m:t>
+          </m:r>
+          <m:rad>
+            <m:radPr>
+              <m:degHide m:val="1"/>
+              <m:ctrlPr>
+                <w:rPr>
+                  <w:rFonts w:ascii="Cambria Math" w:eastAsiaTheme="minorEastAsia" w:hAnsi="Cambria Math"/>
+                  <w:i/>
+                </w:rPr>
+              </m:ctrlPr>
+            </m:radPr>
+            <m:deg/>
+            <m:e>
+              <m:r>
+                <w:rPr>
+                  <w:rFonts w:ascii="Cambria Math" w:eastAsiaTheme="minorEastAsia" w:hAnsi="Cambria Math"/>
+                </w:rPr>
+                <m:t>2×dp_buoyancy×</m:t>
+              </m:r>
+              <m:sSub>
+                <m:sSubPr>
+                  <m:ctrlPr>
+                    <w:rPr>
+                      <w:rFonts w:ascii="Cambria Math" w:eastAsiaTheme="minorEastAsia" w:hAnsi="Cambria Math"/>
+                      <w:i/>
+                    </w:rPr>
+                  </m:ctrlPr>
+                </m:sSubPr>
+                <m:e>
+                  <m:r>
+                    <w:rPr>
+                      <w:rFonts w:ascii="Cambria Math" w:eastAsiaTheme="minorEastAsia" w:hAnsi="Cambria Math"/>
+                    </w:rPr>
+                    <m:t>d</m:t>
+                  </m:r>
+                </m:e>
+                <m:sub>
+                  <m:r>
+                    <w:rPr>
+                      <w:rFonts w:ascii="Cambria Math" w:eastAsiaTheme="minorEastAsia" w:hAnsi="Cambria Math"/>
+                    </w:rPr>
+                    <m:t>port_a</m:t>
+                  </m:r>
+                </m:sub>
+              </m:sSub>
+            </m:e>
+          </m:rad>
+        </m:oMath>
+      </m:oMathPara>
+      <w:bookmarkStart w:id="26" w:name="_GoBack"/>
+      <w:bookmarkEnd w:id="26"/>
+    </w:p>
+    <w:p>
+      <w:pPr>
+        <w:rPr>
+          <w:rFonts w:eastAsiaTheme="minorEastAsia"/>
+        </w:rPr>
+      </w:pPr>
+      <m:oMathPara>
+        <m:oMath>
+          <m:r>
+            <w:rPr>
+              <w:rFonts w:ascii="Cambria Math" w:eastAsiaTheme="minorEastAsia" w:hAnsi="Cambria Math"/>
+            </w:rPr>
+            <m:t>Q</m:t>
+          </m:r>
+          <m:r>
+            <w:rPr>
+              <w:rFonts w:ascii="Cambria Math" w:eastAsiaTheme="minorEastAsia" w:hAnsi="Cambria Math"/>
+            </w:rPr>
+            <m:t>_flow_buoyancy=m_flow_buoyancy</m:t>
+          </m:r>
+          <m:r>
+            <w:rPr>
+              <w:rFonts w:ascii="Cambria Math" w:eastAsiaTheme="minorEastAsia" w:hAnsi="Cambria Math"/>
+            </w:rPr>
+            <m:t>×</m:t>
+          </m:r>
+          <m:d>
+            <m:dPr>
+              <m:ctrlPr>
+                <w:rPr>
+                  <w:rFonts w:ascii="Cambria Math" w:eastAsiaTheme="minorEastAsia" w:hAnsi="Cambria Math"/>
+                  <w:i/>
+                </w:rPr>
+              </m:ctrlPr>
+            </m:dPr>
+            <m:e>
+              <m:r>
+                <w:rPr>
+                  <w:rFonts w:ascii="Cambria Math" w:eastAsiaTheme="minorEastAsia" w:hAnsi="Cambria Math"/>
+                </w:rPr>
+                <m:t>h_b-h_a</m:t>
+              </m:r>
+            </m:e>
+          </m:d>
+        </m:oMath>
+      </m:oMathPara>
+    </w:p>
+    <w:p>
+      <w:pPr>
+        <w:rPr>
+          <w:rFonts w:eastAsiaTheme="minorEastAsia"/>
+        </w:rPr>
+      </w:pPr>
+    </w:p>
+    <w:p>
+      <w:pPr>
+        <w:rPr>
+          <w:lang w:val="fr-FR"/>
+        </w:rPr>
+      </w:pPr>
+    </w:p>
+    <w:p>
+      <w:pPr>
         <w:rPr>
           <w:lang w:val="fr-FR"/>
         </w:rPr>
@@ -11554,7 +12225,6 @@
         <w:rPr>
           <w:lang w:val="fr-FR"/>
         </w:rPr>
-        <w:lastRenderedPageBreak/>
         <w:t>BasesClasses</w:t>
       </w:r>
       <w:bookmarkEnd w:id="27"/>
@@ -12568,7 +13238,6 @@
             <w:rPr>
               <w:rFonts w:ascii="Cambria Math" w:eastAsiaTheme="minorEastAsia" w:hAnsi="Cambria Math"/>
             </w:rPr>
-            <w:lastRenderedPageBreak/>
             <m:t>d_sat=</m:t>
           </m:r>
           <m:f>
@@ -13897,7 +14566,6 @@
         <w:rPr>
           <w:rFonts w:eastAsiaTheme="minorEastAsia"/>
         </w:rPr>
-        <w:lastRenderedPageBreak/>
         <w:t>rootsPolyorder3</w:t>
       </w:r>
       <w:bookmarkEnd w:id="34"/>
@@ -15030,6 +15698,7 @@
             <w:rPr>
               <w:rFonts w:ascii="Cambria Math" w:eastAsiaTheme="minorEastAsia" w:hAnsi="Cambria Math"/>
             </w:rPr>
+            <w:lastRenderedPageBreak/>
             <m:t>x3=2×</m:t>
           </m:r>
           <m:rad>
@@ -15773,7 +16442,6 @@
             <w:rPr>
               <w:rFonts w:ascii="Cambria Math" w:eastAsiaTheme="minorEastAsia" w:hAnsi="Cambria Math"/>
             </w:rPr>
-            <w:lastRenderedPageBreak/>
             <m:t>x1=x2=</m:t>
           </m:r>
           <m:f>
@@ -18969,6 +19637,36 @@
     </w:lvlOverride>
   </w:num>
   <w:num w:numId="13">
+    <w:abstractNumId w:val="1"/>
+    <w:lvlOverride w:ilvl="0">
+      <w:startOverride w:val="1"/>
+    </w:lvlOverride>
+    <w:lvlOverride w:ilvl="1">
+      <w:startOverride w:val="1"/>
+    </w:lvlOverride>
+    <w:lvlOverride w:ilvl="2">
+      <w:startOverride w:val="1"/>
+    </w:lvlOverride>
+    <w:lvlOverride w:ilvl="3">
+      <w:startOverride w:val="1"/>
+    </w:lvlOverride>
+    <w:lvlOverride w:ilvl="4">
+      <w:startOverride w:val="1"/>
+    </w:lvlOverride>
+    <w:lvlOverride w:ilvl="5">
+      <w:startOverride w:val="1"/>
+    </w:lvlOverride>
+    <w:lvlOverride w:ilvl="6">
+      <w:startOverride w:val="1"/>
+    </w:lvlOverride>
+    <w:lvlOverride w:ilvl="7">
+      <w:startOverride w:val="1"/>
+    </w:lvlOverride>
+    <w:lvlOverride w:ilvl="8">
+      <w:startOverride w:val="1"/>
+    </w:lvlOverride>
+  </w:num>
+  <w:num w:numId="14">
     <w:abstractNumId w:val="1"/>
     <w:lvlOverride w:ilvl="0">
       <w:startOverride w:val="1"/>
@@ -20601,7 +21299,7 @@
 </file>
 
 <file path=customXml/itemProps1.xml><?xml version="1.0" encoding="utf-8"?>
-<ds:datastoreItem xmlns:ds="http://schemas.openxmlformats.org/officeDocument/2006/customXml" ds:itemID="{092DC66C-C47D-471E-B75F-DA36A6C2E36D}">
+<ds:datastoreItem xmlns:ds="http://schemas.openxmlformats.org/officeDocument/2006/customXml" ds:itemID="{69FA6DEA-AC85-47D1-A110-35A30DFBDB19}">
   <ds:schemaRefs>
     <ds:schemaRef ds:uri="http://schemas.openxmlformats.org/officeDocument/2006/bibliography"/>
   </ds:schemaRefs>

</xml_diff>

<commit_message>
Addition of the SimpleOpeningComp module and its test
</commit_message>
<xml_diff>
--- a/Information/script for equations.docx
+++ b/Information/script for equations.docx
@@ -59,7 +59,7 @@
           <w:r>
             <w:fldChar w:fldCharType="separate"/>
           </w:r>
-          <w:hyperlink w:anchor="_Toc41489159" w:history="1">
+          <w:hyperlink w:anchor="_Toc41656089" w:history="1">
             <w:r>
               <w:rPr>
                 <w:rStyle w:val="Lienhypertexte"/>
@@ -103,7 +103,7 @@
                 <w:noProof/>
                 <w:webHidden/>
               </w:rPr>
-              <w:instrText xml:space="preserve"> PAGEREF _Toc41489159 \h </w:instrText>
+              <w:instrText xml:space="preserve"> PAGEREF _Toc41656089 \h </w:instrText>
             </w:r>
             <w:r>
               <w:rPr>
@@ -147,7 +147,7 @@
               <w:lang w:eastAsia="en-GB"/>
             </w:rPr>
           </w:pPr>
-          <w:hyperlink w:anchor="_Toc41489160" w:history="1">
+          <w:hyperlink w:anchor="_Toc41656090" w:history="1">
             <w:r>
               <w:rPr>
                 <w:rStyle w:val="Lienhypertexte"/>
@@ -191,7 +191,7 @@
                 <w:noProof/>
                 <w:webHidden/>
               </w:rPr>
-              <w:instrText xml:space="preserve"> PAGEREF _Toc41489160 \h </w:instrText>
+              <w:instrText xml:space="preserve"> PAGEREF _Toc41656090 \h </w:instrText>
             </w:r>
             <w:r>
               <w:rPr>
@@ -235,7 +235,7 @@
               <w:lang w:eastAsia="en-GB"/>
             </w:rPr>
           </w:pPr>
-          <w:hyperlink w:anchor="_Toc41489161" w:history="1">
+          <w:hyperlink w:anchor="_Toc41656091" w:history="1">
             <w:r>
               <w:rPr>
                 <w:rStyle w:val="Lienhypertexte"/>
@@ -277,7 +277,7 @@
                 <w:noProof/>
                 <w:webHidden/>
               </w:rPr>
-              <w:instrText xml:space="preserve"> PAGEREF _Toc41489161 \h </w:instrText>
+              <w:instrText xml:space="preserve"> PAGEREF _Toc41656091 \h </w:instrText>
             </w:r>
             <w:r>
               <w:rPr>
@@ -321,7 +321,7 @@
               <w:lang w:eastAsia="en-GB"/>
             </w:rPr>
           </w:pPr>
-          <w:hyperlink w:anchor="_Toc41489162" w:history="1">
+          <w:hyperlink w:anchor="_Toc41656092" w:history="1">
             <w:r>
               <w:rPr>
                 <w:rStyle w:val="Lienhypertexte"/>
@@ -363,7 +363,7 @@
                 <w:noProof/>
                 <w:webHidden/>
               </w:rPr>
-              <w:instrText xml:space="preserve"> PAGEREF _Toc41489162 \h </w:instrText>
+              <w:instrText xml:space="preserve"> PAGEREF _Toc41656092 \h </w:instrText>
             </w:r>
             <w:r>
               <w:rPr>
@@ -407,7 +407,7 @@
               <w:lang w:eastAsia="en-GB"/>
             </w:rPr>
           </w:pPr>
-          <w:hyperlink w:anchor="_Toc41489163" w:history="1">
+          <w:hyperlink w:anchor="_Toc41656093" w:history="1">
             <w:r>
               <w:rPr>
                 <w:rStyle w:val="Lienhypertexte"/>
@@ -449,7 +449,7 @@
                 <w:noProof/>
                 <w:webHidden/>
               </w:rPr>
-              <w:instrText xml:space="preserve"> PAGEREF _Toc41489163 \h </w:instrText>
+              <w:instrText xml:space="preserve"> PAGEREF _Toc41656093 \h </w:instrText>
             </w:r>
             <w:r>
               <w:rPr>
@@ -493,7 +493,7 @@
               <w:lang w:eastAsia="en-GB"/>
             </w:rPr>
           </w:pPr>
-          <w:hyperlink w:anchor="_Toc41489164" w:history="1">
+          <w:hyperlink w:anchor="_Toc41656094" w:history="1">
             <w:r>
               <w:rPr>
                 <w:rStyle w:val="Lienhypertexte"/>
@@ -537,7 +537,7 @@
                 <w:noProof/>
                 <w:webHidden/>
               </w:rPr>
-              <w:instrText xml:space="preserve"> PAGEREF _Toc41489164 \h </w:instrText>
+              <w:instrText xml:space="preserve"> PAGEREF _Toc41656094 \h </w:instrText>
             </w:r>
             <w:r>
               <w:rPr>
@@ -581,7 +581,7 @@
               <w:lang w:eastAsia="en-GB"/>
             </w:rPr>
           </w:pPr>
-          <w:hyperlink w:anchor="_Toc41489165" w:history="1">
+          <w:hyperlink w:anchor="_Toc41656095" w:history="1">
             <w:r>
               <w:rPr>
                 <w:rStyle w:val="Lienhypertexte"/>
@@ -623,7 +623,7 @@
                 <w:noProof/>
                 <w:webHidden/>
               </w:rPr>
-              <w:instrText xml:space="preserve"> PAGEREF _Toc41489165 \h </w:instrText>
+              <w:instrText xml:space="preserve"> PAGEREF _Toc41656095 \h </w:instrText>
             </w:r>
             <w:r>
               <w:rPr>
@@ -667,7 +667,7 @@
               <w:lang w:eastAsia="en-GB"/>
             </w:rPr>
           </w:pPr>
-          <w:hyperlink w:anchor="_Toc41489166" w:history="1">
+          <w:hyperlink w:anchor="_Toc41656096" w:history="1">
             <w:r>
               <w:rPr>
                 <w:rStyle w:val="Lienhypertexte"/>
@@ -709,7 +709,7 @@
                 <w:noProof/>
                 <w:webHidden/>
               </w:rPr>
-              <w:instrText xml:space="preserve"> PAGEREF _Toc41489166 \h </w:instrText>
+              <w:instrText xml:space="preserve"> PAGEREF _Toc41656096 \h </w:instrText>
             </w:r>
             <w:r>
               <w:rPr>
@@ -753,7 +753,7 @@
               <w:lang w:eastAsia="en-GB"/>
             </w:rPr>
           </w:pPr>
-          <w:hyperlink w:anchor="_Toc41489167" w:history="1">
+          <w:hyperlink w:anchor="_Toc41656097" w:history="1">
             <w:r>
               <w:rPr>
                 <w:rStyle w:val="Lienhypertexte"/>
@@ -795,7 +795,7 @@
                 <w:noProof/>
                 <w:webHidden/>
               </w:rPr>
-              <w:instrText xml:space="preserve"> PAGEREF _Toc41489167 \h </w:instrText>
+              <w:instrText xml:space="preserve"> PAGEREF _Toc41656097 \h </w:instrText>
             </w:r>
             <w:r>
               <w:rPr>
@@ -839,7 +839,7 @@
               <w:lang w:eastAsia="en-GB"/>
             </w:rPr>
           </w:pPr>
-          <w:hyperlink w:anchor="_Toc41489168" w:history="1">
+          <w:hyperlink w:anchor="_Toc41656098" w:history="1">
             <w:r>
               <w:rPr>
                 <w:rStyle w:val="Lienhypertexte"/>
@@ -881,7 +881,7 @@
                 <w:noProof/>
                 <w:webHidden/>
               </w:rPr>
-              <w:instrText xml:space="preserve"> PAGEREF _Toc41489168 \h </w:instrText>
+              <w:instrText xml:space="preserve"> PAGEREF _Toc41656098 \h </w:instrText>
             </w:r>
             <w:r>
               <w:rPr>
@@ -925,7 +925,7 @@
               <w:lang w:eastAsia="en-GB"/>
             </w:rPr>
           </w:pPr>
-          <w:hyperlink w:anchor="_Toc41489169" w:history="1">
+          <w:hyperlink w:anchor="_Toc41656099" w:history="1">
             <w:r>
               <w:rPr>
                 <w:rStyle w:val="Lienhypertexte"/>
@@ -967,7 +967,7 @@
                 <w:noProof/>
                 <w:webHidden/>
               </w:rPr>
-              <w:instrText xml:space="preserve"> PAGEREF _Toc41489169 \h </w:instrText>
+              <w:instrText xml:space="preserve"> PAGEREF _Toc41656099 \h </w:instrText>
             </w:r>
             <w:r>
               <w:rPr>
@@ -1011,7 +1011,7 @@
               <w:lang w:eastAsia="en-GB"/>
             </w:rPr>
           </w:pPr>
-          <w:hyperlink w:anchor="_Toc41489170" w:history="1">
+          <w:hyperlink w:anchor="_Toc41656100" w:history="1">
             <w:r>
               <w:rPr>
                 <w:rStyle w:val="Lienhypertexte"/>
@@ -1053,7 +1053,7 @@
                 <w:noProof/>
                 <w:webHidden/>
               </w:rPr>
-              <w:instrText xml:space="preserve"> PAGEREF _Toc41489170 \h </w:instrText>
+              <w:instrText xml:space="preserve"> PAGEREF _Toc41656100 \h </w:instrText>
             </w:r>
             <w:r>
               <w:rPr>
@@ -1097,7 +1097,7 @@
               <w:lang w:eastAsia="en-GB"/>
             </w:rPr>
           </w:pPr>
-          <w:hyperlink w:anchor="_Toc41489171" w:history="1">
+          <w:hyperlink w:anchor="_Toc41656101" w:history="1">
             <w:r>
               <w:rPr>
                 <w:rStyle w:val="Lienhypertexte"/>
@@ -1139,7 +1139,7 @@
                 <w:noProof/>
                 <w:webHidden/>
               </w:rPr>
-              <w:instrText xml:space="preserve"> PAGEREF _Toc41489171 \h </w:instrText>
+              <w:instrText xml:space="preserve"> PAGEREF _Toc41656101 \h </w:instrText>
             </w:r>
             <w:r>
               <w:rPr>
@@ -1183,7 +1183,7 @@
               <w:lang w:eastAsia="en-GB"/>
             </w:rPr>
           </w:pPr>
-          <w:hyperlink w:anchor="_Toc41489172" w:history="1">
+          <w:hyperlink w:anchor="_Toc41656102" w:history="1">
             <w:r>
               <w:rPr>
                 <w:rStyle w:val="Lienhypertexte"/>
@@ -1225,7 +1225,7 @@
                 <w:noProof/>
                 <w:webHidden/>
               </w:rPr>
-              <w:instrText xml:space="preserve"> PAGEREF _Toc41489172 \h </w:instrText>
+              <w:instrText xml:space="preserve"> PAGEREF _Toc41656102 \h </w:instrText>
             </w:r>
             <w:r>
               <w:rPr>
@@ -1269,7 +1269,7 @@
               <w:lang w:eastAsia="en-GB"/>
             </w:rPr>
           </w:pPr>
-          <w:hyperlink w:anchor="_Toc41489173" w:history="1">
+          <w:hyperlink w:anchor="_Toc41656103" w:history="1">
             <w:r>
               <w:rPr>
                 <w:rStyle w:val="Lienhypertexte"/>
@@ -1313,7 +1313,7 @@
                 <w:noProof/>
                 <w:webHidden/>
               </w:rPr>
-              <w:instrText xml:space="preserve"> PAGEREF _Toc41489173 \h </w:instrText>
+              <w:instrText xml:space="preserve"> PAGEREF _Toc41656103 \h </w:instrText>
             </w:r>
             <w:r>
               <w:rPr>
@@ -1357,7 +1357,7 @@
               <w:lang w:eastAsia="en-GB"/>
             </w:rPr>
           </w:pPr>
-          <w:hyperlink w:anchor="_Toc41489174" w:history="1">
+          <w:hyperlink w:anchor="_Toc41656104" w:history="1">
             <w:r>
               <w:rPr>
                 <w:rStyle w:val="Lienhypertexte"/>
@@ -1399,7 +1399,7 @@
                 <w:noProof/>
                 <w:webHidden/>
               </w:rPr>
-              <w:instrText xml:space="preserve"> PAGEREF _Toc41489174 \h </w:instrText>
+              <w:instrText xml:space="preserve"> PAGEREF _Toc41656104 \h </w:instrText>
             </w:r>
             <w:r>
               <w:rPr>
@@ -1443,7 +1443,7 @@
               <w:lang w:eastAsia="en-GB"/>
             </w:rPr>
           </w:pPr>
-          <w:hyperlink w:anchor="_Toc41489175" w:history="1">
+          <w:hyperlink w:anchor="_Toc41656105" w:history="1">
             <w:r>
               <w:rPr>
                 <w:rStyle w:val="Lienhypertexte"/>
@@ -1485,7 +1485,7 @@
                 <w:noProof/>
                 <w:webHidden/>
               </w:rPr>
-              <w:instrText xml:space="preserve"> PAGEREF _Toc41489175 \h </w:instrText>
+              <w:instrText xml:space="preserve"> PAGEREF _Toc41656105 \h </w:instrText>
             </w:r>
             <w:r>
               <w:rPr>
@@ -1529,7 +1529,7 @@
               <w:lang w:eastAsia="en-GB"/>
             </w:rPr>
           </w:pPr>
-          <w:hyperlink w:anchor="_Toc41489176" w:history="1">
+          <w:hyperlink w:anchor="_Toc41656106" w:history="1">
             <w:r>
               <w:rPr>
                 <w:rStyle w:val="Lienhypertexte"/>
@@ -1571,7 +1571,7 @@
                 <w:noProof/>
                 <w:webHidden/>
               </w:rPr>
-              <w:instrText xml:space="preserve"> PAGEREF _Toc41489176 \h </w:instrText>
+              <w:instrText xml:space="preserve"> PAGEREF _Toc41656106 \h </w:instrText>
             </w:r>
             <w:r>
               <w:rPr>
@@ -1615,7 +1615,7 @@
               <w:lang w:eastAsia="en-GB"/>
             </w:rPr>
           </w:pPr>
-          <w:hyperlink w:anchor="_Toc41489177" w:history="1">
+          <w:hyperlink w:anchor="_Toc41656107" w:history="1">
             <w:r>
               <w:rPr>
                 <w:rStyle w:val="Lienhypertexte"/>
@@ -1657,7 +1657,7 @@
                 <w:noProof/>
                 <w:webHidden/>
               </w:rPr>
-              <w:instrText xml:space="preserve"> PAGEREF _Toc41489177 \h </w:instrText>
+              <w:instrText xml:space="preserve"> PAGEREF _Toc41656107 \h </w:instrText>
             </w:r>
             <w:r>
               <w:rPr>
@@ -1701,7 +1701,7 @@
               <w:lang w:eastAsia="en-GB"/>
             </w:rPr>
           </w:pPr>
-          <w:hyperlink w:anchor="_Toc41489178" w:history="1">
+          <w:hyperlink w:anchor="_Toc41656108" w:history="1">
             <w:r>
               <w:rPr>
                 <w:rStyle w:val="Lienhypertexte"/>
@@ -1743,7 +1743,7 @@
                 <w:noProof/>
                 <w:webHidden/>
               </w:rPr>
-              <w:instrText xml:space="preserve"> PAGEREF _Toc41489178 \h </w:instrText>
+              <w:instrText xml:space="preserve"> PAGEREF _Toc41656108 \h </w:instrText>
             </w:r>
             <w:r>
               <w:rPr>
@@ -1787,7 +1787,7 @@
               <w:lang w:eastAsia="en-GB"/>
             </w:rPr>
           </w:pPr>
-          <w:hyperlink w:anchor="_Toc41489179" w:history="1">
+          <w:hyperlink w:anchor="_Toc41656109" w:history="1">
             <w:r>
               <w:rPr>
                 <w:rStyle w:val="Lienhypertexte"/>
@@ -1829,7 +1829,7 @@
                 <w:noProof/>
                 <w:webHidden/>
               </w:rPr>
-              <w:instrText xml:space="preserve"> PAGEREF _Toc41489179 \h </w:instrText>
+              <w:instrText xml:space="preserve"> PAGEREF _Toc41656109 \h </w:instrText>
             </w:r>
             <w:r>
               <w:rPr>
@@ -1873,7 +1873,7 @@
               <w:lang w:eastAsia="en-GB"/>
             </w:rPr>
           </w:pPr>
-          <w:hyperlink w:anchor="_Toc41489180" w:history="1">
+          <w:hyperlink w:anchor="_Toc41656110" w:history="1">
             <w:r>
               <w:rPr>
                 <w:rStyle w:val="Lienhypertexte"/>
@@ -1915,7 +1915,7 @@
                 <w:noProof/>
                 <w:webHidden/>
               </w:rPr>
-              <w:instrText xml:space="preserve"> PAGEREF _Toc41489180 \h </w:instrText>
+              <w:instrText xml:space="preserve"> PAGEREF _Toc41656110 \h </w:instrText>
             </w:r>
             <w:r>
               <w:rPr>
@@ -1959,7 +1959,7 @@
               <w:lang w:eastAsia="en-GB"/>
             </w:rPr>
           </w:pPr>
-          <w:hyperlink w:anchor="_Toc41489181" w:history="1">
+          <w:hyperlink w:anchor="_Toc41656111" w:history="1">
             <w:r>
               <w:rPr>
                 <w:rStyle w:val="Lienhypertexte"/>
@@ -2001,7 +2001,7 @@
                 <w:noProof/>
                 <w:webHidden/>
               </w:rPr>
-              <w:instrText xml:space="preserve"> PAGEREF _Toc41489181 \h </w:instrText>
+              <w:instrText xml:space="preserve"> PAGEREF _Toc41656111 \h </w:instrText>
             </w:r>
             <w:r>
               <w:rPr>
@@ -2045,7 +2045,7 @@
               <w:lang w:eastAsia="en-GB"/>
             </w:rPr>
           </w:pPr>
-          <w:hyperlink w:anchor="_Toc41489182" w:history="1">
+          <w:hyperlink w:anchor="_Toc41656112" w:history="1">
             <w:r>
               <w:rPr>
                 <w:rStyle w:val="Lienhypertexte"/>
@@ -2089,7 +2089,7 @@
                 <w:noProof/>
                 <w:webHidden/>
               </w:rPr>
-              <w:instrText xml:space="preserve"> PAGEREF _Toc41489182 \h </w:instrText>
+              <w:instrText xml:space="preserve"> PAGEREF _Toc41656112 \h </w:instrText>
             </w:r>
             <w:r>
               <w:rPr>
@@ -2133,7 +2133,7 @@
               <w:lang w:eastAsia="en-GB"/>
             </w:rPr>
           </w:pPr>
-          <w:hyperlink w:anchor="_Toc41489183" w:history="1">
+          <w:hyperlink w:anchor="_Toc41656113" w:history="1">
             <w:r>
               <w:rPr>
                 <w:rStyle w:val="Lienhypertexte"/>
@@ -2177,7 +2177,7 @@
                 <w:noProof/>
                 <w:webHidden/>
               </w:rPr>
-              <w:instrText xml:space="preserve"> PAGEREF _Toc41489183 \h </w:instrText>
+              <w:instrText xml:space="preserve"> PAGEREF _Toc41656113 \h </w:instrText>
             </w:r>
             <w:r>
               <w:rPr>
@@ -2221,7 +2221,7 @@
               <w:lang w:eastAsia="en-GB"/>
             </w:rPr>
           </w:pPr>
-          <w:hyperlink w:anchor="_Toc41489184" w:history="1">
+          <w:hyperlink w:anchor="_Toc41656114" w:history="1">
             <w:r>
               <w:rPr>
                 <w:rStyle w:val="Lienhypertexte"/>
@@ -2265,7 +2265,7 @@
                 <w:noProof/>
                 <w:webHidden/>
               </w:rPr>
-              <w:instrText xml:space="preserve"> PAGEREF _Toc41489184 \h </w:instrText>
+              <w:instrText xml:space="preserve"> PAGEREF _Toc41656114 \h </w:instrText>
             </w:r>
             <w:r>
               <w:rPr>
@@ -2286,6 +2286,372 @@
                 <w:webHidden/>
               </w:rPr>
               <w:t>9</w:t>
+            </w:r>
+            <w:r>
+              <w:rPr>
+                <w:noProof/>
+                <w:webHidden/>
+              </w:rPr>
+              <w:fldChar w:fldCharType="end"/>
+            </w:r>
+          </w:hyperlink>
+        </w:p>
+        <w:p>
+          <w:pPr>
+            <w:pStyle w:val="TM3"/>
+            <w:tabs>
+              <w:tab w:val="left" w:pos="880"/>
+              <w:tab w:val="right" w:leader="dot" w:pos="9062"/>
+            </w:tabs>
+            <w:rPr>
+              <w:rFonts w:eastAsiaTheme="minorEastAsia"/>
+              <w:noProof/>
+              <w:lang w:eastAsia="en-GB"/>
+            </w:rPr>
+          </w:pPr>
+          <w:hyperlink w:anchor="_Toc41656115" w:history="1">
+            <w:r>
+              <w:rPr>
+                <w:rStyle w:val="Lienhypertexte"/>
+                <w:noProof/>
+                <w:lang w:val="fr-FR"/>
+              </w:rPr>
+              <w:t>2.</w:t>
+            </w:r>
+            <w:r>
+              <w:rPr>
+                <w:rFonts w:eastAsiaTheme="minorEastAsia"/>
+                <w:noProof/>
+                <w:lang w:eastAsia="en-GB"/>
+              </w:rPr>
+              <w:tab/>
+            </w:r>
+            <w:r>
+              <w:rPr>
+                <w:rStyle w:val="Lienhypertexte"/>
+                <w:noProof/>
+                <w:lang w:val="fr-FR"/>
+              </w:rPr>
+              <w:t>SimpleOpening</w:t>
+            </w:r>
+            <w:r>
+              <w:rPr>
+                <w:noProof/>
+                <w:webHidden/>
+              </w:rPr>
+              <w:tab/>
+            </w:r>
+            <w:r>
+              <w:rPr>
+                <w:noProof/>
+                <w:webHidden/>
+              </w:rPr>
+              <w:fldChar w:fldCharType="begin"/>
+            </w:r>
+            <w:r>
+              <w:rPr>
+                <w:noProof/>
+                <w:webHidden/>
+              </w:rPr>
+              <w:instrText xml:space="preserve"> PAGEREF _Toc41656115 \h </w:instrText>
+            </w:r>
+            <w:r>
+              <w:rPr>
+                <w:noProof/>
+                <w:webHidden/>
+              </w:rPr>
+            </w:r>
+            <w:r>
+              <w:rPr>
+                <w:noProof/>
+                <w:webHidden/>
+              </w:rPr>
+              <w:fldChar w:fldCharType="separate"/>
+            </w:r>
+            <w:r>
+              <w:rPr>
+                <w:noProof/>
+                <w:webHidden/>
+              </w:rPr>
+              <w:t>9</w:t>
+            </w:r>
+            <w:r>
+              <w:rPr>
+                <w:noProof/>
+                <w:webHidden/>
+              </w:rPr>
+              <w:fldChar w:fldCharType="end"/>
+            </w:r>
+          </w:hyperlink>
+        </w:p>
+        <w:p>
+          <w:pPr>
+            <w:pStyle w:val="TM3"/>
+            <w:tabs>
+              <w:tab w:val="left" w:pos="880"/>
+              <w:tab w:val="right" w:leader="dot" w:pos="9062"/>
+            </w:tabs>
+            <w:rPr>
+              <w:rFonts w:eastAsiaTheme="minorEastAsia"/>
+              <w:noProof/>
+              <w:lang w:eastAsia="en-GB"/>
+            </w:rPr>
+          </w:pPr>
+          <w:hyperlink w:anchor="_Toc41656116" w:history="1">
+            <w:r>
+              <w:rPr>
+                <w:rStyle w:val="Lienhypertexte"/>
+                <w:noProof/>
+              </w:rPr>
+              <w:t>3.</w:t>
+            </w:r>
+            <w:r>
+              <w:rPr>
+                <w:rFonts w:eastAsiaTheme="minorEastAsia"/>
+                <w:noProof/>
+                <w:lang w:eastAsia="en-GB"/>
+              </w:rPr>
+              <w:tab/>
+            </w:r>
+            <w:r>
+              <w:rPr>
+                <w:rStyle w:val="Lienhypertexte"/>
+                <w:noProof/>
+              </w:rPr>
+              <w:t>StaticPipe</w:t>
+            </w:r>
+            <w:r>
+              <w:rPr>
+                <w:noProof/>
+                <w:webHidden/>
+              </w:rPr>
+              <w:tab/>
+            </w:r>
+            <w:r>
+              <w:rPr>
+                <w:noProof/>
+                <w:webHidden/>
+              </w:rPr>
+              <w:fldChar w:fldCharType="begin"/>
+            </w:r>
+            <w:r>
+              <w:rPr>
+                <w:noProof/>
+                <w:webHidden/>
+              </w:rPr>
+              <w:instrText xml:space="preserve"> PAGEREF _Toc41656116 \h </w:instrText>
+            </w:r>
+            <w:r>
+              <w:rPr>
+                <w:noProof/>
+                <w:webHidden/>
+              </w:rPr>
+            </w:r>
+            <w:r>
+              <w:rPr>
+                <w:noProof/>
+                <w:webHidden/>
+              </w:rPr>
+              <w:fldChar w:fldCharType="separate"/>
+            </w:r>
+            <w:r>
+              <w:rPr>
+                <w:noProof/>
+                <w:webHidden/>
+              </w:rPr>
+              <w:t>9</w:t>
+            </w:r>
+            <w:r>
+              <w:rPr>
+                <w:noProof/>
+                <w:webHidden/>
+              </w:rPr>
+              <w:fldChar w:fldCharType="end"/>
+            </w:r>
+          </w:hyperlink>
+        </w:p>
+        <w:p>
+          <w:pPr>
+            <w:pStyle w:val="TM3"/>
+            <w:tabs>
+              <w:tab w:val="left" w:pos="880"/>
+              <w:tab w:val="right" w:leader="dot" w:pos="9062"/>
+            </w:tabs>
+            <w:rPr>
+              <w:rFonts w:eastAsiaTheme="minorEastAsia"/>
+              <w:noProof/>
+              <w:lang w:eastAsia="en-GB"/>
+            </w:rPr>
+          </w:pPr>
+          <w:hyperlink w:anchor="_Toc41656117" w:history="1">
+            <w:r>
+              <w:rPr>
+                <w:rStyle w:val="Lienhypertexte"/>
+                <w:noProof/>
+                <w:lang w:val="fr-FR"/>
+              </w:rPr>
+              <w:t>4.</w:t>
+            </w:r>
+            <w:r>
+              <w:rPr>
+                <w:rFonts w:eastAsiaTheme="minorEastAsia"/>
+                <w:noProof/>
+                <w:lang w:eastAsia="en-GB"/>
+              </w:rPr>
+              <w:tab/>
+            </w:r>
+            <w:r>
+              <w:rPr>
+                <w:rStyle w:val="Lienhypertexte"/>
+                <w:noProof/>
+                <w:lang w:val="fr-FR"/>
+              </w:rPr>
+              <w:t>VerticalOpening</w:t>
+            </w:r>
+            <w:r>
+              <w:rPr>
+                <w:noProof/>
+                <w:webHidden/>
+              </w:rPr>
+              <w:tab/>
+            </w:r>
+            <w:r>
+              <w:rPr>
+                <w:noProof/>
+                <w:webHidden/>
+              </w:rPr>
+              <w:fldChar w:fldCharType="begin"/>
+            </w:r>
+            <w:r>
+              <w:rPr>
+                <w:noProof/>
+                <w:webHidden/>
+              </w:rPr>
+              <w:instrText xml:space="preserve"> PAGEREF _Toc41656117 \h </w:instrText>
+            </w:r>
+            <w:r>
+              <w:rPr>
+                <w:noProof/>
+                <w:webHidden/>
+              </w:rPr>
+            </w:r>
+            <w:r>
+              <w:rPr>
+                <w:noProof/>
+                <w:webHidden/>
+              </w:rPr>
+              <w:fldChar w:fldCharType="separate"/>
+            </w:r>
+            <w:r>
+              <w:rPr>
+                <w:noProof/>
+                <w:webHidden/>
+              </w:rPr>
+              <w:t>9</w:t>
+            </w:r>
+            <w:r>
+              <w:rPr>
+                <w:noProof/>
+                <w:webHidden/>
+              </w:rPr>
+              <w:fldChar w:fldCharType="end"/>
+            </w:r>
+          </w:hyperlink>
+        </w:p>
+        <w:p>
+          <w:pPr>
+            <w:pStyle w:val="TM3"/>
+            <w:tabs>
+              <w:tab w:val="left" w:pos="880"/>
+              <w:tab w:val="right" w:leader="dot" w:pos="9062"/>
+            </w:tabs>
+            <w:rPr>
+              <w:rFonts w:eastAsiaTheme="minorEastAsia"/>
+              <w:noProof/>
+              <w:lang w:eastAsia="en-GB"/>
+            </w:rPr>
+          </w:pPr>
+          <w:hyperlink w:anchor="_Toc41656118" w:history="1">
+            <w:r>
+              <w:rPr>
+                <w:rStyle w:val="Lienhypertexte"/>
+                <w:noProof/>
+                <w:lang w:val="fr-FR"/>
+              </w:rPr>
+              <w:t>5.</w:t>
+            </w:r>
+            <w:r>
+              <w:rPr>
+                <w:rFonts w:eastAsiaTheme="minorEastAsia"/>
+                <w:noProof/>
+                <w:lang w:eastAsia="en-GB"/>
+              </w:rPr>
+              <w:tab/>
+            </w:r>
+            <w:r>
+              <w:rPr>
+                <w:rStyle w:val="Lienhypertexte"/>
+                <w:noProof/>
+                <w:lang w:val="fr-FR"/>
+              </w:rPr>
+              <w:t>Horizo</w:t>
+            </w:r>
+            <w:r>
+              <w:rPr>
+                <w:rStyle w:val="Lienhypertexte"/>
+                <w:noProof/>
+                <w:lang w:val="fr-FR"/>
+              </w:rPr>
+              <w:t>n</w:t>
+            </w:r>
+            <w:r>
+              <w:rPr>
+                <w:rStyle w:val="Lienhypertexte"/>
+                <w:noProof/>
+                <w:lang w:val="fr-FR"/>
+              </w:rPr>
+              <w:t>talOpening</w:t>
+            </w:r>
+            <w:r>
+              <w:rPr>
+                <w:noProof/>
+                <w:webHidden/>
+              </w:rPr>
+              <w:tab/>
+            </w:r>
+            <w:r>
+              <w:rPr>
+                <w:noProof/>
+                <w:webHidden/>
+              </w:rPr>
+              <w:fldChar w:fldCharType="begin"/>
+            </w:r>
+            <w:r>
+              <w:rPr>
+                <w:noProof/>
+                <w:webHidden/>
+              </w:rPr>
+              <w:instrText xml:space="preserve"> PAGEREF _Toc41656118 \h </w:instrText>
+            </w:r>
+            <w:r>
+              <w:rPr>
+                <w:noProof/>
+                <w:webHidden/>
+              </w:rPr>
+            </w:r>
+            <w:r>
+              <w:rPr>
+                <w:noProof/>
+                <w:webHidden/>
+              </w:rPr>
+              <w:fldChar w:fldCharType="separate"/>
+            </w:r>
+            <w:r>
+              <w:rPr>
+                <w:noProof/>
+                <w:webHidden/>
+              </w:rPr>
+              <w:t>10</w:t>
             </w:r>
             <w:r>
               <w:rPr>
@@ -2309,7 +2675,7 @@
               <w:lang w:eastAsia="en-GB"/>
             </w:rPr>
           </w:pPr>
-          <w:hyperlink w:anchor="_Toc41489185" w:history="1">
+          <w:hyperlink w:anchor="_Toc41656119" w:history="1">
             <w:r>
               <w:rPr>
                 <w:rStyle w:val="Lienhypertexte"/>
@@ -2353,7 +2719,7 @@
                 <w:noProof/>
                 <w:webHidden/>
               </w:rPr>
-              <w:instrText xml:space="preserve"> PAGEREF _Toc41489185 \h </w:instrText>
+              <w:instrText xml:space="preserve"> PAGEREF _Toc41656119 \h </w:instrText>
             </w:r>
             <w:r>
               <w:rPr>
@@ -2373,7 +2739,7 @@
                 <w:noProof/>
                 <w:webHidden/>
               </w:rPr>
-              <w:t>9</w:t>
+              <w:t>10</w:t>
             </w:r>
             <w:r>
               <w:rPr>
@@ -2397,7 +2763,7 @@
               <w:lang w:eastAsia="en-GB"/>
             </w:rPr>
           </w:pPr>
-          <w:hyperlink w:anchor="_Toc41489186" w:history="1">
+          <w:hyperlink w:anchor="_Toc41656120" w:history="1">
             <w:r>
               <w:rPr>
                 <w:rStyle w:val="Lienhypertexte"/>
@@ -2439,7 +2805,7 @@
                 <w:noProof/>
                 <w:webHidden/>
               </w:rPr>
-              <w:instrText xml:space="preserve"> PAGEREF _Toc41489186 \h </w:instrText>
+              <w:instrText xml:space="preserve"> PAGEREF _Toc41656120 \h </w:instrText>
             </w:r>
             <w:r>
               <w:rPr>
@@ -2459,7 +2825,7 @@
                 <w:noProof/>
                 <w:webHidden/>
               </w:rPr>
-              <w:t>9</w:t>
+              <w:t>10</w:t>
             </w:r>
             <w:r>
               <w:rPr>
@@ -2483,7 +2849,7 @@
               <w:lang w:eastAsia="en-GB"/>
             </w:rPr>
           </w:pPr>
-          <w:hyperlink w:anchor="_Toc41489187" w:history="1">
+          <w:hyperlink w:anchor="_Toc41656121" w:history="1">
             <w:r>
               <w:rPr>
                 <w:rStyle w:val="Lienhypertexte"/>
@@ -2525,7 +2891,7 @@
                 <w:noProof/>
                 <w:webHidden/>
               </w:rPr>
-              <w:instrText xml:space="preserve"> PAGEREF _Toc41489187 \h </w:instrText>
+              <w:instrText xml:space="preserve"> PAGEREF _Toc41656121 \h </w:instrText>
             </w:r>
             <w:r>
               <w:rPr>
@@ -2545,7 +2911,7 @@
                 <w:noProof/>
                 <w:webHidden/>
               </w:rPr>
-              <w:t>9</w:t>
+              <w:t>10</w:t>
             </w:r>
             <w:r>
               <w:rPr>
@@ -2569,7 +2935,7 @@
               <w:lang w:eastAsia="en-GB"/>
             </w:rPr>
           </w:pPr>
-          <w:hyperlink w:anchor="_Toc41489188" w:history="1">
+          <w:hyperlink w:anchor="_Toc41656122" w:history="1">
             <w:r>
               <w:rPr>
                 <w:rStyle w:val="Lienhypertexte"/>
@@ -2611,7 +2977,7 @@
                 <w:noProof/>
                 <w:webHidden/>
               </w:rPr>
-              <w:instrText xml:space="preserve"> PAGEREF _Toc41489188 \h </w:instrText>
+              <w:instrText xml:space="preserve"> PAGEREF _Toc41656122 \h </w:instrText>
             </w:r>
             <w:r>
               <w:rPr>
@@ -2631,7 +2997,7 @@
                 <w:noProof/>
                 <w:webHidden/>
               </w:rPr>
-              <w:t>9</w:t>
+              <w:t>10</w:t>
             </w:r>
             <w:r>
               <w:rPr>
@@ -2655,7 +3021,7 @@
               <w:lang w:eastAsia="en-GB"/>
             </w:rPr>
           </w:pPr>
-          <w:hyperlink w:anchor="_Toc41489189" w:history="1">
+          <w:hyperlink w:anchor="_Toc41656123" w:history="1">
             <w:r>
               <w:rPr>
                 <w:rStyle w:val="Lienhypertexte"/>
@@ -2697,7 +3063,7 @@
                 <w:noProof/>
                 <w:webHidden/>
               </w:rPr>
-              <w:instrText xml:space="preserve"> PAGEREF _Toc41489189 \h </w:instrText>
+              <w:instrText xml:space="preserve"> PAGEREF _Toc41656123 \h </w:instrText>
             </w:r>
             <w:r>
               <w:rPr>
@@ -2717,7 +3083,7 @@
                 <w:noProof/>
                 <w:webHidden/>
               </w:rPr>
-              <w:t>9</w:t>
+              <w:t>11</w:t>
             </w:r>
             <w:r>
               <w:rPr>
@@ -2741,7 +3107,7 @@
               <w:lang w:eastAsia="en-GB"/>
             </w:rPr>
           </w:pPr>
-          <w:hyperlink w:anchor="_Toc41489190" w:history="1">
+          <w:hyperlink w:anchor="_Toc41656124" w:history="1">
             <w:r>
               <w:rPr>
                 <w:rStyle w:val="Lienhypertexte"/>
@@ -2783,7 +3149,7 @@
                 <w:noProof/>
                 <w:webHidden/>
               </w:rPr>
-              <w:instrText xml:space="preserve"> PAGEREF _Toc41489190 \h </w:instrText>
+              <w:instrText xml:space="preserve"> PAGEREF _Toc41656124 \h </w:instrText>
             </w:r>
             <w:r>
               <w:rPr>
@@ -2803,7 +3169,7 @@
                 <w:noProof/>
                 <w:webHidden/>
               </w:rPr>
-              <w:t>10</w:t>
+              <w:t>11</w:t>
             </w:r>
             <w:r>
               <w:rPr>
@@ -2827,7 +3193,7 @@
               <w:lang w:eastAsia="en-GB"/>
             </w:rPr>
           </w:pPr>
-          <w:hyperlink w:anchor="_Toc41489191" w:history="1">
+          <w:hyperlink w:anchor="_Toc41656125" w:history="1">
             <w:r>
               <w:rPr>
                 <w:rStyle w:val="Lienhypertexte"/>
@@ -2869,7 +3235,7 @@
                 <w:noProof/>
                 <w:webHidden/>
               </w:rPr>
-              <w:instrText xml:space="preserve"> PAGEREF _Toc41489191 \h </w:instrText>
+              <w:instrText xml:space="preserve"> PAGEREF _Toc41656125 \h </w:instrText>
             </w:r>
             <w:r>
               <w:rPr>
@@ -2889,7 +3255,7 @@
                 <w:noProof/>
                 <w:webHidden/>
               </w:rPr>
-              <w:t>11</w:t>
+              <w:t>12</w:t>
             </w:r>
             <w:r>
               <w:rPr>
@@ -2913,7 +3279,7 @@
               <w:lang w:eastAsia="en-GB"/>
             </w:rPr>
           </w:pPr>
-          <w:hyperlink w:anchor="_Toc41489192" w:history="1">
+          <w:hyperlink w:anchor="_Toc41656126" w:history="1">
             <w:r>
               <w:rPr>
                 <w:rStyle w:val="Lienhypertexte"/>
@@ -2955,7 +3321,7 @@
                 <w:noProof/>
                 <w:webHidden/>
               </w:rPr>
-              <w:instrText xml:space="preserve"> PAGEREF _Toc41489192 \h </w:instrText>
+              <w:instrText xml:space="preserve"> PAGEREF _Toc41656126 \h </w:instrText>
             </w:r>
             <w:r>
               <w:rPr>
@@ -2975,7 +3341,95 @@
                 <w:noProof/>
                 <w:webHidden/>
               </w:rPr>
-              <w:t>11</w:t>
+              <w:t>12</w:t>
+            </w:r>
+            <w:r>
+              <w:rPr>
+                <w:noProof/>
+                <w:webHidden/>
+              </w:rPr>
+              <w:fldChar w:fldCharType="end"/>
+            </w:r>
+          </w:hyperlink>
+        </w:p>
+        <w:p>
+          <w:pPr>
+            <w:pStyle w:val="TM1"/>
+            <w:tabs>
+              <w:tab w:val="left" w:pos="660"/>
+              <w:tab w:val="right" w:leader="dot" w:pos="9062"/>
+            </w:tabs>
+            <w:rPr>
+              <w:rFonts w:eastAsiaTheme="minorEastAsia"/>
+              <w:noProof/>
+              <w:lang w:eastAsia="en-GB"/>
+            </w:rPr>
+          </w:pPr>
+          <w:hyperlink w:anchor="_Toc41656127" w:history="1">
+            <w:r>
+              <w:rPr>
+                <w:rStyle w:val="Lienhypertexte"/>
+                <w:noProof/>
+                <w:lang w:val="fr-FR"/>
+              </w:rPr>
+              <w:t>IV.</w:t>
+            </w:r>
+            <w:r>
+              <w:rPr>
+                <w:rFonts w:eastAsiaTheme="minorEastAsia"/>
+                <w:noProof/>
+                <w:lang w:eastAsia="en-GB"/>
+              </w:rPr>
+              <w:tab/>
+            </w:r>
+            <w:r>
+              <w:rPr>
+                <w:rStyle w:val="Lienhypertexte"/>
+                <w:noProof/>
+                <w:lang w:val="fr-FR"/>
+              </w:rPr>
+              <w:t>PDE</w:t>
+            </w:r>
+            <w:r>
+              <w:rPr>
+                <w:noProof/>
+                <w:webHidden/>
+              </w:rPr>
+              <w:tab/>
+            </w:r>
+            <w:r>
+              <w:rPr>
+                <w:noProof/>
+                <w:webHidden/>
+              </w:rPr>
+              <w:fldChar w:fldCharType="begin"/>
+            </w:r>
+            <w:r>
+              <w:rPr>
+                <w:noProof/>
+                <w:webHidden/>
+              </w:rPr>
+              <w:instrText xml:space="preserve"> PAGEREF _Toc41656127 \h </w:instrText>
+            </w:r>
+            <w:r>
+              <w:rPr>
+                <w:noProof/>
+                <w:webHidden/>
+              </w:rPr>
+            </w:r>
+            <w:r>
+              <w:rPr>
+                <w:noProof/>
+                <w:webHidden/>
+              </w:rPr>
+              <w:fldChar w:fldCharType="separate"/>
+            </w:r>
+            <w:r>
+              <w:rPr>
+                <w:noProof/>
+                <w:webHidden/>
+              </w:rPr>
+              <w:t>14</w:t>
             </w:r>
             <w:r>
               <w:rPr>
@@ -2999,11 +3453,12 @@
               <w:lang w:eastAsia="en-GB"/>
             </w:rPr>
           </w:pPr>
-          <w:hyperlink w:anchor="_Toc41489193" w:history="1">
+          <w:hyperlink w:anchor="_Toc41656128" w:history="1">
             <w:r>
               <w:rPr>
                 <w:rStyle w:val="Lienhypertexte"/>
                 <w:noProof/>
+                <w:lang w:val="fr-FR"/>
               </w:rPr>
               <w:t>A.</w:t>
             </w:r>
@@ -3019,8 +3474,9 @@
               <w:rPr>
                 <w:rStyle w:val="Lienhypertexte"/>
                 <w:noProof/>
-              </w:rPr>
-              <w:t>Components</w:t>
+                <w:lang w:val="fr-FR"/>
+              </w:rPr>
+              <w:t>ThermalDiffusion</w:t>
             </w:r>
             <w:r>
               <w:rPr>
@@ -3041,7 +3497,7 @@
                 <w:noProof/>
                 <w:webHidden/>
               </w:rPr>
-              <w:instrText xml:space="preserve"> PAGEREF _Toc41489193 \h </w:instrText>
+              <w:instrText xml:space="preserve"> PAGEREF _Toc41656128 \h </w:instrText>
             </w:r>
             <w:r>
               <w:rPr>
@@ -3061,7 +3517,7 @@
                 <w:noProof/>
                 <w:webHidden/>
               </w:rPr>
-              <w:t>12</w:t>
+              <w:t>14</w:t>
             </w:r>
             <w:r>
               <w:rPr>
@@ -3085,7 +3541,7 @@
               <w:lang w:eastAsia="en-GB"/>
             </w:rPr>
           </w:pPr>
-          <w:hyperlink w:anchor="_Toc41489194" w:history="1">
+          <w:hyperlink w:anchor="_Toc41656129" w:history="1">
             <w:r>
               <w:rPr>
                 <w:rStyle w:val="Lienhypertexte"/>
@@ -3106,7 +3562,7 @@
                 <w:rStyle w:val="Lienhypertexte"/>
                 <w:noProof/>
               </w:rPr>
-              <w:t>StaticPipe</w:t>
+              <w:t>Second order central</w:t>
             </w:r>
             <w:r>
               <w:rPr>
@@ -3127,7 +3583,7 @@
                 <w:noProof/>
                 <w:webHidden/>
               </w:rPr>
-              <w:instrText xml:space="preserve"> PAGEREF _Toc41489194 \h </w:instrText>
+              <w:instrText xml:space="preserve"> PAGEREF _Toc41656129 \h </w:instrText>
             </w:r>
             <w:r>
               <w:rPr>
@@ -3147,269 +3603,7 @@
                 <w:noProof/>
                 <w:webHidden/>
               </w:rPr>
-              <w:t>12</w:t>
-            </w:r>
-            <w:r>
-              <w:rPr>
-                <w:noProof/>
-                <w:webHidden/>
-              </w:rPr>
-              <w:fldChar w:fldCharType="end"/>
-            </w:r>
-          </w:hyperlink>
-        </w:p>
-        <w:p>
-          <w:pPr>
-            <w:pStyle w:val="TM1"/>
-            <w:tabs>
-              <w:tab w:val="left" w:pos="660"/>
-              <w:tab w:val="right" w:leader="dot" w:pos="9062"/>
-            </w:tabs>
-            <w:rPr>
-              <w:rFonts w:eastAsiaTheme="minorEastAsia"/>
-              <w:noProof/>
-              <w:lang w:eastAsia="en-GB"/>
-            </w:rPr>
-          </w:pPr>
-          <w:hyperlink w:anchor="_Toc41489195" w:history="1">
-            <w:r>
-              <w:rPr>
-                <w:rStyle w:val="Lienhypertexte"/>
-                <w:noProof/>
-                <w:lang w:val="fr-FR"/>
-              </w:rPr>
-              <w:t>IV.</w:t>
-            </w:r>
-            <w:r>
-              <w:rPr>
-                <w:rFonts w:eastAsiaTheme="minorEastAsia"/>
-                <w:noProof/>
-                <w:lang w:eastAsia="en-GB"/>
-              </w:rPr>
-              <w:tab/>
-            </w:r>
-            <w:r>
-              <w:rPr>
-                <w:rStyle w:val="Lienhypertexte"/>
-                <w:noProof/>
-                <w:lang w:val="fr-FR"/>
-              </w:rPr>
-              <w:t>PDE</w:t>
-            </w:r>
-            <w:r>
-              <w:rPr>
-                <w:noProof/>
-                <w:webHidden/>
-              </w:rPr>
-              <w:tab/>
-            </w:r>
-            <w:r>
-              <w:rPr>
-                <w:noProof/>
-                <w:webHidden/>
-              </w:rPr>
-              <w:fldChar w:fldCharType="begin"/>
-            </w:r>
-            <w:r>
-              <w:rPr>
-                <w:noProof/>
-                <w:webHidden/>
-              </w:rPr>
-              <w:instrText xml:space="preserve"> PAGEREF _Toc41489195 \h </w:instrText>
-            </w:r>
-            <w:r>
-              <w:rPr>
-                <w:noProof/>
-                <w:webHidden/>
-              </w:rPr>
-            </w:r>
-            <w:r>
-              <w:rPr>
-                <w:noProof/>
-                <w:webHidden/>
-              </w:rPr>
-              <w:fldChar w:fldCharType="separate"/>
-            </w:r>
-            <w:r>
-              <w:rPr>
-                <w:noProof/>
-                <w:webHidden/>
-              </w:rPr>
-              <w:t>13</w:t>
-            </w:r>
-            <w:r>
-              <w:rPr>
-                <w:noProof/>
-                <w:webHidden/>
-              </w:rPr>
-              <w:fldChar w:fldCharType="end"/>
-            </w:r>
-          </w:hyperlink>
-        </w:p>
-        <w:p>
-          <w:pPr>
-            <w:pStyle w:val="TM2"/>
-            <w:tabs>
-              <w:tab w:val="left" w:pos="660"/>
-              <w:tab w:val="right" w:leader="dot" w:pos="9062"/>
-            </w:tabs>
-            <w:rPr>
-              <w:rFonts w:eastAsiaTheme="minorEastAsia"/>
-              <w:noProof/>
-              <w:lang w:eastAsia="en-GB"/>
-            </w:rPr>
-          </w:pPr>
-          <w:hyperlink w:anchor="_Toc41489196" w:history="1">
-            <w:r>
-              <w:rPr>
-                <w:rStyle w:val="Lienhypertexte"/>
-                <w:noProof/>
-                <w:lang w:val="fr-FR"/>
-              </w:rPr>
-              <w:t>A.</w:t>
-            </w:r>
-            <w:r>
-              <w:rPr>
-                <w:rFonts w:eastAsiaTheme="minorEastAsia"/>
-                <w:noProof/>
-                <w:lang w:eastAsia="en-GB"/>
-              </w:rPr>
-              <w:tab/>
-            </w:r>
-            <w:r>
-              <w:rPr>
-                <w:rStyle w:val="Lienhypertexte"/>
-                <w:noProof/>
-                <w:lang w:val="fr-FR"/>
-              </w:rPr>
-              <w:t>ThermalDiffusion</w:t>
-            </w:r>
-            <w:r>
-              <w:rPr>
-                <w:noProof/>
-                <w:webHidden/>
-              </w:rPr>
-              <w:tab/>
-            </w:r>
-            <w:r>
-              <w:rPr>
-                <w:noProof/>
-                <w:webHidden/>
-              </w:rPr>
-              <w:fldChar w:fldCharType="begin"/>
-            </w:r>
-            <w:r>
-              <w:rPr>
-                <w:noProof/>
-                <w:webHidden/>
-              </w:rPr>
-              <w:instrText xml:space="preserve"> PAGEREF _Toc41489196 \h </w:instrText>
-            </w:r>
-            <w:r>
-              <w:rPr>
-                <w:noProof/>
-                <w:webHidden/>
-              </w:rPr>
-            </w:r>
-            <w:r>
-              <w:rPr>
-                <w:noProof/>
-                <w:webHidden/>
-              </w:rPr>
-              <w:fldChar w:fldCharType="separate"/>
-            </w:r>
-            <w:r>
-              <w:rPr>
-                <w:noProof/>
-                <w:webHidden/>
-              </w:rPr>
-              <w:t>13</w:t>
-            </w:r>
-            <w:r>
-              <w:rPr>
-                <w:noProof/>
-                <w:webHidden/>
-              </w:rPr>
-              <w:fldChar w:fldCharType="end"/>
-            </w:r>
-          </w:hyperlink>
-        </w:p>
-        <w:p>
-          <w:pPr>
-            <w:pStyle w:val="TM3"/>
-            <w:tabs>
-              <w:tab w:val="left" w:pos="880"/>
-              <w:tab w:val="right" w:leader="dot" w:pos="9062"/>
-            </w:tabs>
-            <w:rPr>
-              <w:rFonts w:eastAsiaTheme="minorEastAsia"/>
-              <w:noProof/>
-              <w:lang w:eastAsia="en-GB"/>
-            </w:rPr>
-          </w:pPr>
-          <w:hyperlink w:anchor="_Toc41489197" w:history="1">
-            <w:r>
-              <w:rPr>
-                <w:rStyle w:val="Lienhypertexte"/>
-                <w:noProof/>
-              </w:rPr>
-              <w:t>1.</w:t>
-            </w:r>
-            <w:r>
-              <w:rPr>
-                <w:rFonts w:eastAsiaTheme="minorEastAsia"/>
-                <w:noProof/>
-                <w:lang w:eastAsia="en-GB"/>
-              </w:rPr>
-              <w:tab/>
-            </w:r>
-            <w:r>
-              <w:rPr>
-                <w:rStyle w:val="Lienhypertexte"/>
-                <w:noProof/>
-              </w:rPr>
-              <w:t>Second order central</w:t>
-            </w:r>
-            <w:r>
-              <w:rPr>
-                <w:noProof/>
-                <w:webHidden/>
-              </w:rPr>
-              <w:tab/>
-            </w:r>
-            <w:r>
-              <w:rPr>
-                <w:noProof/>
-                <w:webHidden/>
-              </w:rPr>
-              <w:fldChar w:fldCharType="begin"/>
-            </w:r>
-            <w:r>
-              <w:rPr>
-                <w:noProof/>
-                <w:webHidden/>
-              </w:rPr>
-              <w:instrText xml:space="preserve"> PAGEREF _Toc41489197 \h </w:instrText>
-            </w:r>
-            <w:r>
-              <w:rPr>
-                <w:noProof/>
-                <w:webHidden/>
-              </w:rPr>
-            </w:r>
-            <w:r>
-              <w:rPr>
-                <w:noProof/>
-                <w:webHidden/>
-              </w:rPr>
-              <w:fldChar w:fldCharType="separate"/>
-            </w:r>
-            <w:r>
-              <w:rPr>
-                <w:noProof/>
-                <w:webHidden/>
-              </w:rPr>
-              <w:t>13</w:t>
+              <w:t>14</w:t>
             </w:r>
             <w:r>
               <w:rPr>
@@ -3471,7 +3665,7 @@
           <w:lang w:val="fr-FR"/>
         </w:rPr>
       </w:pPr>
-      <w:bookmarkStart w:id="0" w:name="_Toc41489159"/>
+      <w:bookmarkStart w:id="0" w:name="_Toc41656089"/>
       <w:proofErr w:type="spellStart"/>
       <w:r>
         <w:rPr>
@@ -3498,7 +3692,7 @@
           <w:lang w:val="fr-FR"/>
         </w:rPr>
       </w:pPr>
-      <w:bookmarkStart w:id="1" w:name="_Toc41489160"/>
+      <w:bookmarkStart w:id="1" w:name="_Toc41656090"/>
       <w:r>
         <w:rPr>
           <w:lang w:val="fr-FR"/>
@@ -3521,7 +3715,7 @@
           <w:rFonts w:eastAsiaTheme="minorEastAsia"/>
         </w:rPr>
       </w:pPr>
-      <w:bookmarkStart w:id="2" w:name="_Toc41489161"/>
+      <w:bookmarkStart w:id="2" w:name="_Toc41656091"/>
       <w:r>
         <w:rPr>
           <w:rFonts w:eastAsiaTheme="minorEastAsia"/>
@@ -3988,7 +4182,7 @@
           <w:rFonts w:eastAsiaTheme="minorEastAsia"/>
         </w:rPr>
       </w:pPr>
-      <w:bookmarkStart w:id="3" w:name="_Toc41489162"/>
+      <w:bookmarkStart w:id="3" w:name="_Toc41656092"/>
       <w:proofErr w:type="spellStart"/>
       <w:r>
         <w:rPr>
@@ -4264,13 +4458,7 @@
             <w:rPr>
               <w:rFonts w:ascii="Cambria Math" w:hAnsi="Cambria Math"/>
             </w:rPr>
-            <m:t>supply: H_fl</m:t>
-          </m:r>
-          <m:r>
-            <w:rPr>
-              <w:rFonts w:ascii="Cambria Math" w:hAnsi="Cambria Math"/>
-            </w:rPr>
-            <m:t>ow=m_flow×(</m:t>
+            <m:t>supply: H_flow=m_flow×(</m:t>
           </m:r>
           <m:sSub>
             <m:sSubPr>
@@ -4955,7 +5143,7 @@
           <w:rFonts w:eastAsiaTheme="minorEastAsia"/>
         </w:rPr>
       </w:pPr>
-      <w:bookmarkStart w:id="4" w:name="_Toc41489163"/>
+      <w:bookmarkStart w:id="4" w:name="_Toc41656093"/>
       <w:proofErr w:type="spellStart"/>
       <w:r>
         <w:rPr>
@@ -5437,7 +5625,7 @@
           <w:lang w:val="fr-FR"/>
         </w:rPr>
       </w:pPr>
-      <w:bookmarkStart w:id="5" w:name="_Toc41489164"/>
+      <w:bookmarkStart w:id="5" w:name="_Toc41656094"/>
       <w:proofErr w:type="spellStart"/>
       <w:r>
         <w:rPr>
@@ -5463,7 +5651,7 @@
           <w:rFonts w:eastAsiaTheme="minorEastAsia"/>
         </w:rPr>
       </w:pPr>
-      <w:bookmarkStart w:id="6" w:name="_Toc41489165"/>
+      <w:bookmarkStart w:id="6" w:name="_Toc41656095"/>
       <w:proofErr w:type="spellStart"/>
       <w:r>
         <w:rPr>
@@ -5518,7 +5706,7 @@
           <w:rFonts w:eastAsiaTheme="minorEastAsia"/>
         </w:rPr>
       </w:pPr>
-      <w:bookmarkStart w:id="7" w:name="_Toc41489166"/>
+      <w:bookmarkStart w:id="7" w:name="_Toc41656096"/>
       <w:r>
         <w:rPr>
           <w:rFonts w:eastAsiaTheme="minorEastAsia"/>
@@ -5606,7 +5794,7 @@
           <w:rFonts w:eastAsiaTheme="minorEastAsia"/>
         </w:rPr>
       </w:pPr>
-      <w:bookmarkStart w:id="8" w:name="_Toc41489167"/>
+      <w:bookmarkStart w:id="8" w:name="_Toc41656097"/>
       <w:r>
         <w:rPr>
           <w:rFonts w:eastAsiaTheme="minorEastAsia"/>
@@ -5740,7 +5928,7 @@
           <w:rFonts w:eastAsiaTheme="minorEastAsia"/>
         </w:rPr>
       </w:pPr>
-      <w:bookmarkStart w:id="9" w:name="_Toc41489168"/>
+      <w:bookmarkStart w:id="9" w:name="_Toc41656098"/>
       <w:r>
         <w:rPr>
           <w:rFonts w:eastAsiaTheme="minorEastAsia"/>
@@ -6194,13 +6382,7 @@
                 <w:rPr>
                   <w:rFonts w:ascii="Cambria Math" w:hAnsi="Cambria Math"/>
                 </w:rPr>
-                <m:t>i→MR</m:t>
-              </m:r>
-              <m:r>
-                <w:rPr>
-                  <w:rFonts w:ascii="Cambria Math" w:hAnsi="Cambria Math"/>
-                </w:rPr>
-                <m:t>T</m:t>
+                <m:t>i→MRT</m:t>
               </m:r>
             </m:sub>
           </m:sSub>
@@ -6227,7 +6409,7 @@
           <w:rFonts w:eastAsiaTheme="minorEastAsia"/>
         </w:rPr>
       </w:pPr>
-      <w:bookmarkStart w:id="10" w:name="_Toc41489169"/>
+      <w:bookmarkStart w:id="10" w:name="_Toc41656099"/>
       <w:proofErr w:type="spellStart"/>
       <w:r>
         <w:rPr>
@@ -6302,7 +6484,7 @@
           <w:rFonts w:eastAsiaTheme="minorEastAsia"/>
         </w:rPr>
       </w:pPr>
-      <w:bookmarkStart w:id="11" w:name="_Toc41489170"/>
+      <w:bookmarkStart w:id="11" w:name="_Toc41656100"/>
       <w:proofErr w:type="spellStart"/>
       <w:r>
         <w:rPr>
@@ -6415,7 +6597,7 @@
           <w:rFonts w:eastAsiaTheme="minorEastAsia"/>
         </w:rPr>
       </w:pPr>
-      <w:bookmarkStart w:id="12" w:name="_Toc41489171"/>
+      <w:bookmarkStart w:id="12" w:name="_Toc41656101"/>
       <w:r>
         <w:rPr>
           <w:rFonts w:eastAsiaTheme="minorEastAsia"/>
@@ -7138,7 +7320,7 @@
           <w:rFonts w:eastAsiaTheme="minorEastAsia"/>
         </w:rPr>
       </w:pPr>
-      <w:bookmarkStart w:id="13" w:name="_Toc41489172"/>
+      <w:bookmarkStart w:id="13" w:name="_Toc41656102"/>
       <w:proofErr w:type="spellStart"/>
       <w:r>
         <w:rPr>
@@ -7297,7 +7479,7 @@
           <w:lang w:val="fr-FR"/>
         </w:rPr>
       </w:pPr>
-      <w:bookmarkStart w:id="14" w:name="_Toc41489173"/>
+      <w:bookmarkStart w:id="14" w:name="_Toc41656103"/>
       <w:proofErr w:type="spellStart"/>
       <w:r>
         <w:rPr>
@@ -7324,7 +7506,7 @@
           <w:rFonts w:eastAsiaTheme="minorEastAsia"/>
         </w:rPr>
       </w:pPr>
-      <w:bookmarkStart w:id="15" w:name="_Toc41489174"/>
+      <w:bookmarkStart w:id="15" w:name="_Toc41656104"/>
       <w:proofErr w:type="spellStart"/>
       <w:r>
         <w:rPr>
@@ -7446,7 +7628,7 @@
           <w:rFonts w:eastAsiaTheme="minorEastAsia"/>
         </w:rPr>
       </w:pPr>
-      <w:bookmarkStart w:id="16" w:name="_Toc41489175"/>
+      <w:bookmarkStart w:id="16" w:name="_Toc41656105"/>
       <w:proofErr w:type="spellStart"/>
       <w:r>
         <w:rPr>
@@ -7569,7 +7751,7 @@
           <w:rFonts w:eastAsiaTheme="minorEastAsia"/>
         </w:rPr>
       </w:pPr>
-      <w:bookmarkStart w:id="17" w:name="_Toc41489176"/>
+      <w:bookmarkStart w:id="17" w:name="_Toc41656106"/>
       <w:proofErr w:type="spellStart"/>
       <w:proofErr w:type="gramStart"/>
       <w:r>
@@ -7714,7 +7896,7 @@
           <w:rFonts w:eastAsiaTheme="minorEastAsia"/>
         </w:rPr>
       </w:pPr>
-      <w:bookmarkStart w:id="18" w:name="_Toc41489177"/>
+      <w:bookmarkStart w:id="18" w:name="_Toc41656107"/>
       <w:proofErr w:type="spellStart"/>
       <w:proofErr w:type="gramStart"/>
       <w:r>
@@ -8013,13 +8195,7 @@
             <w:rPr>
               <w:rFonts w:ascii="Cambria Math" w:eastAsiaTheme="minorEastAsia" w:hAnsi="Cambria Math"/>
             </w:rPr>
-            <m:t xml:space="preserve"> for i from 1 t</m:t>
-          </m:r>
-          <m:r>
-            <w:rPr>
-              <w:rFonts w:ascii="Cambria Math" w:eastAsiaTheme="minorEastAsia" w:hAnsi="Cambria Math"/>
-            </w:rPr>
-            <m:t>o n</m:t>
+            <m:t xml:space="preserve"> for i from 1 to n</m:t>
           </m:r>
         </m:oMath>
       </m:oMathPara>
@@ -8734,7 +8910,7 @@
           <w:rFonts w:eastAsiaTheme="minorEastAsia"/>
         </w:rPr>
       </w:pPr>
-      <w:bookmarkStart w:id="19" w:name="_Toc41489178"/>
+      <w:bookmarkStart w:id="19" w:name="_Toc41656108"/>
       <w:proofErr w:type="spellStart"/>
       <w:proofErr w:type="gramStart"/>
       <w:r>
@@ -8759,7 +8935,13 @@
             <w:rPr>
               <w:rFonts w:ascii="Cambria Math" w:eastAsiaTheme="minorEastAsia" w:hAnsi="Cambria Math"/>
             </w:rPr>
-            <m:t>dx= Biot×</m:t>
+            <m:t>dx= B</m:t>
+          </m:r>
+          <m:r>
+            <w:rPr>
+              <w:rFonts w:ascii="Cambria Math" w:eastAsiaTheme="minorEastAsia" w:hAnsi="Cambria Math"/>
+            </w:rPr>
+            <m:t>iot×</m:t>
           </m:r>
           <m:f>
             <m:fPr>
@@ -8982,7 +9164,7 @@
           <w:rFonts w:eastAsiaTheme="minorEastAsia"/>
         </w:rPr>
       </w:pPr>
-      <w:bookmarkStart w:id="20" w:name="_Toc41489179"/>
+      <w:bookmarkStart w:id="20" w:name="_Toc41656109"/>
       <w:proofErr w:type="spellStart"/>
       <w:proofErr w:type="gramStart"/>
       <w:r>
@@ -10042,7 +10224,7 @@
           <w:rFonts w:eastAsiaTheme="minorEastAsia"/>
         </w:rPr>
       </w:pPr>
-      <w:bookmarkStart w:id="21" w:name="_Toc41489180"/>
+      <w:bookmarkStart w:id="21" w:name="_Toc41656110"/>
       <w:proofErr w:type="spellStart"/>
       <w:proofErr w:type="gramStart"/>
       <w:r>
@@ -10225,7 +10407,7 @@
           <w:rFonts w:eastAsiaTheme="minorEastAsia"/>
         </w:rPr>
       </w:pPr>
-      <w:bookmarkStart w:id="22" w:name="_Toc41489181"/>
+      <w:bookmarkStart w:id="22" w:name="_Toc41656111"/>
       <w:proofErr w:type="spellStart"/>
       <w:r>
         <w:rPr>
@@ -10475,7 +10657,7 @@
           <w:lang w:val="fr-FR"/>
         </w:rPr>
       </w:pPr>
-      <w:bookmarkStart w:id="23" w:name="_Toc41489182"/>
+      <w:bookmarkStart w:id="23" w:name="_Toc41656112"/>
       <w:proofErr w:type="spellStart"/>
       <w:r>
         <w:rPr>
@@ -10502,7 +10684,7 @@
           <w:lang w:val="fr-FR"/>
         </w:rPr>
       </w:pPr>
-      <w:bookmarkStart w:id="24" w:name="_Toc41489183"/>
+      <w:bookmarkStart w:id="24" w:name="_Toc41656113"/>
       <w:r>
         <w:rPr>
           <w:lang w:val="fr-FR"/>
@@ -10525,7 +10707,7 @@
           <w:lang w:val="fr-FR"/>
         </w:rPr>
       </w:pPr>
-      <w:bookmarkStart w:id="25" w:name="_Toc41489184"/>
+      <w:bookmarkStart w:id="25" w:name="_Toc41656114"/>
       <w:proofErr w:type="spellStart"/>
       <w:r>
         <w:rPr>
@@ -10691,6 +10873,7 @@
           <w:lang w:val="fr-FR"/>
         </w:rPr>
       </w:pPr>
+      <w:bookmarkStart w:id="26" w:name="_Toc41656115"/>
       <w:proofErr w:type="spellStart"/>
       <w:r>
         <w:rPr>
@@ -10698,6 +10881,7 @@
         </w:rPr>
         <w:t>SimpleOpening</w:t>
       </w:r>
+      <w:bookmarkEnd w:id="26"/>
       <w:proofErr w:type="spellEnd"/>
     </w:p>
     <w:p>
@@ -10865,6 +11049,7 @@
           <w:rFonts w:asciiTheme="minorHAnsi" w:eastAsiaTheme="minorEastAsia" w:hAnsiTheme="minorHAnsi" w:cstheme="minorBidi"/>
         </w:rPr>
       </w:pPr>
+      <w:bookmarkStart w:id="27" w:name="_Toc41656116"/>
       <w:proofErr w:type="spellStart"/>
       <w:r>
         <w:rPr>
@@ -10872,6 +11057,7 @@
         </w:rPr>
         <w:t>StaticPipe</w:t>
       </w:r>
+      <w:bookmarkEnd w:id="27"/>
       <w:proofErr w:type="spellEnd"/>
     </w:p>
     <w:p/>
@@ -11023,6 +11209,7 @@
           <w:lang w:val="fr-FR"/>
         </w:rPr>
       </w:pPr>
+      <w:bookmarkStart w:id="28" w:name="_Toc41656117"/>
       <w:proofErr w:type="spellStart"/>
       <w:r>
         <w:rPr>
@@ -11030,6 +11217,7 @@
         </w:rPr>
         <w:t>VerticalOpening</w:t>
       </w:r>
+      <w:bookmarkEnd w:id="28"/>
       <w:proofErr w:type="spellEnd"/>
     </w:p>
     <w:p>
@@ -11088,25 +11276,7 @@
             <w:rPr>
               <w:rFonts w:ascii="Cambria Math" w:eastAsiaTheme="minorEastAsia" w:hAnsi="Cambria Math"/>
             </w:rPr>
-            <m:t>d</m:t>
-          </m:r>
-          <m:r>
-            <w:rPr>
-              <w:rFonts w:ascii="Cambria Math" w:eastAsiaTheme="minorEastAsia" w:hAnsi="Cambria Math"/>
-            </w:rPr>
-            <m:t>p_i[i]</m:t>
-          </m:r>
-          <m:r>
-            <w:rPr>
-              <w:rFonts w:ascii="Cambria Math" w:eastAsiaTheme="minorEastAsia" w:hAnsi="Cambria Math"/>
-            </w:rPr>
-            <m:t>=dp+g</m:t>
-          </m:r>
-          <m:r>
-            <w:rPr>
-              <w:rFonts w:ascii="Cambria Math" w:eastAsiaTheme="minorEastAsia" w:hAnsi="Cambria Math"/>
-            </w:rPr>
-            <m:t>×</m:t>
+            <m:t>dp_i[i]=dp+g×</m:t>
           </m:r>
           <m:d>
             <m:dPr>
@@ -11307,19 +11477,7 @@
             <w:rPr>
               <w:rFonts w:ascii="Cambria Math" w:eastAsiaTheme="minorEastAsia" w:hAnsi="Cambria Math"/>
             </w:rPr>
-            <m:t>dp</m:t>
-          </m:r>
-          <m:r>
-            <w:rPr>
-              <w:rFonts w:ascii="Cambria Math" w:eastAsiaTheme="minorEastAsia" w:hAnsi="Cambria Math"/>
-            </w:rPr>
-            <m:t>_i</m:t>
-          </m:r>
-          <m:r>
-            <w:rPr>
-              <w:rFonts w:ascii="Cambria Math" w:eastAsiaTheme="minorEastAsia" w:hAnsi="Cambria Math"/>
-            </w:rPr>
-            <m:t>=</m:t>
+            <m:t>dp_i=</m:t>
           </m:r>
           <m:f>
             <m:fPr>
@@ -11367,13 +11525,7 @@
                 <w:rPr>
                   <w:rFonts w:ascii="Cambria Math" w:eastAsiaTheme="minorEastAsia" w:hAnsi="Cambria Math"/>
                 </w:rPr>
-                <m:t>Vel</m:t>
-              </m:r>
-              <m:r>
-                <w:rPr>
-                  <w:rFonts w:ascii="Cambria Math" w:eastAsiaTheme="minorEastAsia" w:hAnsi="Cambria Math"/>
-                </w:rPr>
-                <m:t>_i</m:t>
+                <m:t>Vel_i</m:t>
               </m:r>
             </m:e>
             <m:sup>
@@ -11400,19 +11552,7 @@
             <w:rPr>
               <w:rFonts w:ascii="Cambria Math" w:eastAsiaTheme="minorEastAsia" w:hAnsi="Cambria Math"/>
             </w:rPr>
-            <m:t>m_flow</m:t>
-          </m:r>
-          <m:r>
-            <w:rPr>
-              <w:rFonts w:ascii="Cambria Math" w:eastAsiaTheme="minorEastAsia" w:hAnsi="Cambria Math"/>
-            </w:rPr>
-            <m:t>_i</m:t>
-          </m:r>
-          <m:r>
-            <w:rPr>
-              <w:rFonts w:ascii="Cambria Math" w:eastAsiaTheme="minorEastAsia" w:hAnsi="Cambria Math"/>
-            </w:rPr>
-            <m:t>=d×</m:t>
+            <m:t>m_flow_i=d×</m:t>
           </m:r>
           <m:sSub>
             <m:sSubPr>
@@ -11444,19 +11584,7 @@
             <w:rPr>
               <w:rFonts w:ascii="Cambria Math" w:eastAsiaTheme="minorEastAsia" w:hAnsi="Cambria Math"/>
             </w:rPr>
-            <m:t>×Vel</m:t>
-          </m:r>
-          <m:r>
-            <w:rPr>
-              <w:rFonts w:ascii="Cambria Math" w:eastAsiaTheme="minorEastAsia" w:hAnsi="Cambria Math"/>
-            </w:rPr>
-            <m:t>_i</m:t>
-          </m:r>
-          <m:r>
-            <w:rPr>
-              <w:rFonts w:ascii="Cambria Math" w:eastAsiaTheme="minorEastAsia" w:hAnsi="Cambria Math"/>
-            </w:rPr>
-            <m:t>=</m:t>
+            <m:t>×Vel_i=</m:t>
           </m:r>
           <m:f>
             <m:fPr>
@@ -11506,19 +11634,7 @@
                 <w:rPr>
                   <w:rFonts w:ascii="Cambria Math" w:eastAsiaTheme="minorEastAsia" w:hAnsi="Cambria Math"/>
                 </w:rPr>
-                <m:t>2×dp</m:t>
-              </m:r>
-              <m:r>
-                <w:rPr>
-                  <w:rFonts w:ascii="Cambria Math" w:eastAsiaTheme="minorEastAsia" w:hAnsi="Cambria Math"/>
-                </w:rPr>
-                <m:t>_i</m:t>
-              </m:r>
-              <m:r>
-                <w:rPr>
-                  <w:rFonts w:ascii="Cambria Math" w:eastAsiaTheme="minorEastAsia" w:hAnsi="Cambria Math"/>
-                </w:rPr>
-                <m:t>×d</m:t>
+                <m:t>2×dp_i×d</m:t>
               </m:r>
             </m:e>
           </m:rad>
@@ -11539,6 +11655,7 @@
           <w:lang w:val="fr-FR"/>
         </w:rPr>
       </w:pPr>
+      <w:bookmarkStart w:id="29" w:name="_Toc41656118"/>
       <w:proofErr w:type="spellStart"/>
       <w:r>
         <w:rPr>
@@ -11547,6 +11664,7 @@
         <w:lastRenderedPageBreak/>
         <w:t>HorizontalOpening</w:t>
       </w:r>
+      <w:bookmarkEnd w:id="29"/>
       <w:proofErr w:type="spellEnd"/>
     </w:p>
     <w:p>
@@ -11624,13 +11742,7 @@
                 <w:rPr>
                   <w:rFonts w:ascii="Cambria Math" w:eastAsiaTheme="minorEastAsia" w:hAnsi="Cambria Math"/>
                 </w:rPr>
-                <m:t>por</m:t>
-              </m:r>
-              <m:r>
-                <w:rPr>
-                  <w:rFonts w:ascii="Cambria Math" w:eastAsiaTheme="minorEastAsia" w:hAnsi="Cambria Math"/>
-                </w:rPr>
-                <m:t>t_a</m:t>
+                <m:t>port_a</m:t>
               </m:r>
             </m:sub>
           </m:sSub>
@@ -11655,19 +11767,7 @@
             <w:rPr>
               <w:rFonts w:ascii="Cambria Math" w:eastAsiaTheme="minorEastAsia" w:hAnsi="Cambria Math"/>
             </w:rPr>
-            <m:t>p_</m:t>
-          </m:r>
-          <m:r>
-            <w:rPr>
-              <w:rFonts w:ascii="Cambria Math" w:eastAsiaTheme="minorEastAsia" w:hAnsi="Cambria Math"/>
-            </w:rPr>
-            <m:t>down</m:t>
-          </m:r>
-          <m:r>
-            <w:rPr>
-              <w:rFonts w:ascii="Cambria Math" w:eastAsiaTheme="minorEastAsia" w:hAnsi="Cambria Math"/>
-            </w:rPr>
-            <m:t xml:space="preserve"> =</m:t>
+            <m:t>p_down =</m:t>
           </m:r>
           <m:sSub>
             <m:sSubPr>
@@ -11691,13 +11791,7 @@
                 <w:rPr>
                   <w:rFonts w:ascii="Cambria Math" w:eastAsiaTheme="minorEastAsia" w:hAnsi="Cambria Math"/>
                 </w:rPr>
-                <m:t>por</m:t>
-              </m:r>
-              <m:r>
-                <w:rPr>
-                  <w:rFonts w:ascii="Cambria Math" w:eastAsiaTheme="minorEastAsia" w:hAnsi="Cambria Math"/>
-                </w:rPr>
-                <m:t>t_b</m:t>
+                <m:t>port_b</m:t>
               </m:r>
             </m:sub>
           </m:sSub>
@@ -11729,13 +11823,7 @@
                 <w:rPr>
                   <w:rFonts w:ascii="Cambria Math" w:eastAsiaTheme="minorEastAsia" w:hAnsi="Cambria Math"/>
                 </w:rPr>
-                <m:t>por</m:t>
-              </m:r>
-              <m:r>
-                <w:rPr>
-                  <w:rFonts w:ascii="Cambria Math" w:eastAsiaTheme="minorEastAsia" w:hAnsi="Cambria Math"/>
-                </w:rPr>
-                <m:t>t_b</m:t>
+                <m:t>port_b</m:t>
               </m:r>
             </m:sub>
           </m:sSub>
@@ -11743,13 +11831,7 @@
             <w:rPr>
               <w:rFonts w:ascii="Cambria Math" w:eastAsiaTheme="minorEastAsia" w:hAnsi="Cambria Math"/>
             </w:rPr>
-            <m:t>×g×L_</m:t>
-          </m:r>
-          <m:r>
-            <w:rPr>
-              <w:rFonts w:ascii="Cambria Math" w:eastAsiaTheme="minorEastAsia" w:hAnsi="Cambria Math"/>
-            </w:rPr>
-            <m:t>down</m:t>
+            <m:t>×g×L_down</m:t>
           </m:r>
         </m:oMath>
       </m:oMathPara>
@@ -11766,31 +11848,7 @@
             <w:rPr>
               <w:rFonts w:ascii="Cambria Math" w:eastAsiaTheme="minorEastAsia" w:hAnsi="Cambria Math"/>
             </w:rPr>
-            <m:t>dp</m:t>
-          </m:r>
-          <m:r>
-            <w:rPr>
-              <w:rFonts w:ascii="Cambria Math" w:eastAsiaTheme="minorEastAsia" w:hAnsi="Cambria Math"/>
-            </w:rPr>
-            <m:t xml:space="preserve"> =p_up</m:t>
-          </m:r>
-          <m:r>
-            <w:rPr>
-              <w:rFonts w:ascii="Cambria Math" w:eastAsiaTheme="minorEastAsia" w:hAnsi="Cambria Math"/>
-            </w:rPr>
-            <m:t>-</m:t>
-          </m:r>
-          <m:r>
-            <w:rPr>
-              <w:rFonts w:ascii="Cambria Math" w:eastAsiaTheme="minorEastAsia" w:hAnsi="Cambria Math"/>
-            </w:rPr>
-            <m:t>p_</m:t>
-          </m:r>
-          <m:r>
-            <w:rPr>
-              <w:rFonts w:ascii="Cambria Math" w:eastAsiaTheme="minorEastAsia" w:hAnsi="Cambria Math"/>
-            </w:rPr>
-            <m:t>down</m:t>
+            <m:t>dp =p_up-p_down</m:t>
           </m:r>
         </m:oMath>
       </m:oMathPara>
@@ -11914,19 +11972,7 @@
             <w:rPr>
               <w:rFonts w:ascii="Cambria Math" w:eastAsiaTheme="minorEastAsia" w:hAnsi="Cambria Math"/>
             </w:rPr>
-            <m:t>×Vel=</m:t>
-          </m:r>
-          <m:r>
-            <w:rPr>
-              <w:rFonts w:ascii="Cambria Math" w:eastAsiaTheme="minorEastAsia" w:hAnsi="Cambria Math"/>
-            </w:rPr>
-            <m:t>A</m:t>
-          </m:r>
-          <m:r>
-            <w:rPr>
-              <w:rFonts w:ascii="Cambria Math" w:eastAsiaTheme="minorEastAsia" w:hAnsi="Cambria Math"/>
-            </w:rPr>
-            <m:t>×Cd×</m:t>
+            <m:t>×Vel=A×Cd×</m:t>
           </m:r>
           <m:rad>
             <m:radPr>
@@ -12141,8 +12187,6 @@
           </m:rad>
         </m:oMath>
       </m:oMathPara>
-      <w:bookmarkStart w:id="26" w:name="_GoBack"/>
-      <w:bookmarkEnd w:id="26"/>
     </w:p>
     <w:p>
       <w:pPr>
@@ -12156,19 +12200,7 @@
             <w:rPr>
               <w:rFonts w:ascii="Cambria Math" w:eastAsiaTheme="minorEastAsia" w:hAnsi="Cambria Math"/>
             </w:rPr>
-            <m:t>Q</m:t>
-          </m:r>
-          <m:r>
-            <w:rPr>
-              <w:rFonts w:ascii="Cambria Math" w:eastAsiaTheme="minorEastAsia" w:hAnsi="Cambria Math"/>
-            </w:rPr>
-            <m:t>_flow_buoyancy=m_flow_buoyancy</m:t>
-          </m:r>
-          <m:r>
-            <w:rPr>
-              <w:rFonts w:ascii="Cambria Math" w:eastAsiaTheme="minorEastAsia" w:hAnsi="Cambria Math"/>
-            </w:rPr>
-            <m:t>×</m:t>
+            <m:t>Q_flow_buoyancy=m_flow_buoyancy×</m:t>
           </m:r>
           <m:d>
             <m:dPr>
@@ -12200,34 +12232,803 @@
     </w:p>
     <w:p>
       <w:pPr>
+        <w:pStyle w:val="Titre3"/>
         <w:rPr>
           <w:lang w:val="fr-FR"/>
         </w:rPr>
       </w:pPr>
-    </w:p>
-    <w:p>
-      <w:pPr>
-        <w:rPr>
-          <w:lang w:val="fr-FR"/>
-        </w:rPr>
-      </w:pPr>
-    </w:p>
-    <w:p>
-      <w:pPr>
-        <w:pStyle w:val="Titre2"/>
-        <w:rPr>
-          <w:lang w:val="fr-FR"/>
-        </w:rPr>
-      </w:pPr>
-      <w:bookmarkStart w:id="27" w:name="_Toc41489185"/>
       <w:proofErr w:type="spellStart"/>
       <w:r>
         <w:rPr>
           <w:lang w:val="fr-FR"/>
         </w:rPr>
+        <w:t>SimpleOpeningComp</w:t>
+      </w:r>
+      <w:proofErr w:type="spellEnd"/>
+    </w:p>
+    <w:p>
+      <w:pPr>
+        <w:rPr>
+          <w:lang w:val="fr-FR"/>
+        </w:rPr>
+      </w:pPr>
+    </w:p>
+    <w:p>
+      <w:pPr>
+        <w:rPr>
+          <w:rFonts w:eastAsiaTheme="minorEastAsia"/>
+        </w:rPr>
+      </w:pPr>
+      <m:oMathPara>
+        <m:oMath>
+          <m:r>
+            <w:rPr>
+              <w:rFonts w:ascii="Cambria Math" w:eastAsiaTheme="minorEastAsia" w:hAnsi="Cambria Math"/>
+            </w:rPr>
+            <m:t>cp×</m:t>
+          </m:r>
+          <m:sSub>
+            <m:sSubPr>
+              <m:ctrlPr>
+                <w:rPr>
+                  <w:rFonts w:ascii="Cambria Math" w:eastAsiaTheme="minorEastAsia" w:hAnsi="Cambria Math"/>
+                  <w:i/>
+                </w:rPr>
+              </m:ctrlPr>
+            </m:sSubPr>
+            <m:e>
+              <m:r>
+                <w:rPr>
+                  <w:rFonts w:ascii="Cambria Math" w:eastAsiaTheme="minorEastAsia" w:hAnsi="Cambria Math"/>
+                </w:rPr>
+                <m:t>T</m:t>
+              </m:r>
+            </m:e>
+            <m:sub>
+              <m:r>
+                <w:rPr>
+                  <w:rFonts w:ascii="Cambria Math" w:eastAsiaTheme="minorEastAsia" w:hAnsi="Cambria Math"/>
+                </w:rPr>
+                <m:t>0</m:t>
+              </m:r>
+            </m:sub>
+          </m:sSub>
+          <m:r>
+            <w:rPr>
+              <w:rFonts w:ascii="Cambria Math" w:eastAsiaTheme="minorEastAsia" w:hAnsi="Cambria Math"/>
+            </w:rPr>
+            <m:t>=cp×T+</m:t>
+          </m:r>
+          <m:f>
+            <m:fPr>
+              <m:ctrlPr>
+                <w:rPr>
+                  <w:rFonts w:ascii="Cambria Math" w:eastAsiaTheme="minorEastAsia" w:hAnsi="Cambria Math"/>
+                  <w:i/>
+                </w:rPr>
+              </m:ctrlPr>
+            </m:fPr>
+            <m:num>
+              <m:sSup>
+                <m:sSupPr>
+                  <m:ctrlPr>
+                    <w:rPr>
+                      <w:rFonts w:ascii="Cambria Math" w:eastAsiaTheme="minorEastAsia" w:hAnsi="Cambria Math"/>
+                      <w:i/>
+                    </w:rPr>
+                  </m:ctrlPr>
+                </m:sSupPr>
+                <m:e>
+                  <m:d>
+                    <m:dPr>
+                      <m:ctrlPr>
+                        <w:rPr>
+                          <w:rFonts w:ascii="Cambria Math" w:eastAsiaTheme="minorEastAsia" w:hAnsi="Cambria Math"/>
+                          <w:i/>
+                        </w:rPr>
+                      </m:ctrlPr>
+                    </m:dPr>
+                    <m:e>
+                      <m:r>
+                        <w:rPr>
+                          <w:rFonts w:ascii="Cambria Math" w:eastAsiaTheme="minorEastAsia" w:hAnsi="Cambria Math"/>
+                        </w:rPr>
+                        <m:t>M×c</m:t>
+                      </m:r>
+                    </m:e>
+                  </m:d>
+                </m:e>
+                <m:sup>
+                  <m:r>
+                    <w:rPr>
+                      <w:rFonts w:ascii="Cambria Math" w:eastAsiaTheme="minorEastAsia" w:hAnsi="Cambria Math"/>
+                    </w:rPr>
+                    <m:t>2</m:t>
+                  </m:r>
+                </m:sup>
+              </m:sSup>
+            </m:num>
+            <m:den>
+              <m:r>
+                <w:rPr>
+                  <w:rFonts w:ascii="Cambria Math" w:eastAsiaTheme="minorEastAsia" w:hAnsi="Cambria Math"/>
+                </w:rPr>
+                <m:t>2</m:t>
+              </m:r>
+            </m:den>
+          </m:f>
+        </m:oMath>
+      </m:oMathPara>
+    </w:p>
+    <w:p>
+      <w:pPr>
+        <w:rPr>
+          <w:rFonts w:eastAsiaTheme="minorEastAsia"/>
+        </w:rPr>
+      </w:pPr>
+      <m:oMathPara>
+        <m:oMath>
+          <m:r>
+            <w:rPr>
+              <w:rFonts w:ascii="Cambria Math" w:hAnsi="Cambria Math"/>
+            </w:rPr>
+            <m:t xml:space="preserve">p=d×r×T  and  </m:t>
+          </m:r>
+          <m:r>
+            <w:rPr>
+              <w:rFonts w:ascii="Cambria Math" w:hAnsi="Cambria Math"/>
+            </w:rPr>
+            <m:t>p</m:t>
+          </m:r>
+          <m:r>
+            <w:rPr>
+              <w:rFonts w:ascii="Cambria Math" w:hAnsi="Cambria Math"/>
+            </w:rPr>
+            <m:t>×</m:t>
+          </m:r>
+          <m:sSup>
+            <m:sSupPr>
+              <m:ctrlPr>
+                <w:rPr>
+                  <w:rFonts w:ascii="Cambria Math" w:hAnsi="Cambria Math"/>
+                  <w:i/>
+                  <w:iCs/>
+                </w:rPr>
+              </m:ctrlPr>
+            </m:sSupPr>
+            <m:e>
+              <m:r>
+                <w:rPr>
+                  <w:rFonts w:ascii="Cambria Math" w:hAnsi="Cambria Math"/>
+                </w:rPr>
+                <m:t>d</m:t>
+              </m:r>
+            </m:e>
+            <m:sup>
+              <m:r>
+                <w:rPr>
+                  <w:rFonts w:ascii="Cambria Math" w:hAnsi="Cambria Math"/>
+                </w:rPr>
+                <m:t>-γ</m:t>
+              </m:r>
+            </m:sup>
+          </m:sSup>
+          <m:r>
+            <w:rPr>
+              <w:rFonts w:ascii="Cambria Math" w:hAnsi="Cambria Math"/>
+            </w:rPr>
+            <m:t>=</m:t>
+          </m:r>
+          <m:r>
+            <w:rPr>
+              <w:rFonts w:ascii="Cambria Math" w:hAnsi="Cambria Math"/>
+            </w:rPr>
+            <m:t>constant</m:t>
+          </m:r>
+          <m:r>
+            <w:rPr>
+              <w:rFonts w:ascii="Cambria Math" w:hAnsi="Cambria Math"/>
+            </w:rPr>
+            <m:t xml:space="preserve"> </m:t>
+          </m:r>
+          <m:r>
+            <w:rPr>
+              <w:rFonts w:ascii="Cambria Math" w:hAnsi="Cambria Math"/>
+            </w:rPr>
+            <m:t xml:space="preserve"> </m:t>
+          </m:r>
+        </m:oMath>
+      </m:oMathPara>
+    </w:p>
+    <w:p>
+      <w:pPr>
+        <w:rPr>
+          <w:rFonts w:eastAsiaTheme="minorEastAsia"/>
+          <w:iCs/>
+        </w:rPr>
+      </w:pPr>
+      <m:oMathPara>
+        <m:oMath>
+          <m:f>
+            <m:fPr>
+              <m:ctrlPr>
+                <w:rPr>
+                  <w:rFonts w:ascii="Cambria Math" w:hAnsi="Cambria Math"/>
+                  <w:i/>
+                  <w:iCs/>
+                </w:rPr>
+              </m:ctrlPr>
+            </m:fPr>
+            <m:num>
+              <m:r>
+                <m:rPr>
+                  <m:sty m:val="p"/>
+                </m:rPr>
+                <w:rPr>
+                  <w:rFonts w:ascii="Cambria Math" w:hAnsi="Cambria Math"/>
+                </w:rPr>
+                <m:t>p</m:t>
+              </m:r>
+            </m:num>
+            <m:den>
+              <m:sSub>
+                <m:sSubPr>
+                  <m:ctrlPr>
+                    <w:rPr>
+                      <w:rFonts w:ascii="Cambria Math" w:hAnsi="Cambria Math"/>
+                      <w:iCs/>
+                    </w:rPr>
+                  </m:ctrlPr>
+                </m:sSubPr>
+                <m:e>
+                  <m:r>
+                    <m:rPr>
+                      <m:sty m:val="p"/>
+                    </m:rPr>
+                    <w:rPr>
+                      <w:rFonts w:ascii="Cambria Math" w:hAnsi="Cambria Math"/>
+                    </w:rPr>
+                    <m:t>p</m:t>
+                  </m:r>
+                </m:e>
+                <m:sub>
+                  <m:r>
+                    <w:rPr>
+                      <w:rFonts w:ascii="Cambria Math" w:hAnsi="Cambria Math"/>
+                    </w:rPr>
+                    <m:t>0</m:t>
+                  </m:r>
+                </m:sub>
+              </m:sSub>
+            </m:den>
+          </m:f>
+          <m:r>
+            <w:rPr>
+              <w:rFonts w:ascii="Cambria Math" w:hAnsi="Cambria Math"/>
+            </w:rPr>
+            <m:t>=</m:t>
+          </m:r>
+          <m:sSup>
+            <m:sSupPr>
+              <m:ctrlPr>
+                <w:rPr>
+                  <w:rFonts w:ascii="Cambria Math" w:hAnsi="Cambria Math"/>
+                  <w:i/>
+                  <w:iCs/>
+                </w:rPr>
+              </m:ctrlPr>
+            </m:sSupPr>
+            <m:e>
+              <m:d>
+                <m:dPr>
+                  <m:ctrlPr>
+                    <w:rPr>
+                      <w:rFonts w:ascii="Cambria Math" w:hAnsi="Cambria Math"/>
+                      <w:i/>
+                      <w:iCs/>
+                    </w:rPr>
+                  </m:ctrlPr>
+                </m:dPr>
+                <m:e>
+                  <m:r>
+                    <w:rPr>
+                      <w:rFonts w:ascii="Cambria Math" w:hAnsi="Cambria Math"/>
+                    </w:rPr>
+                    <m:t>1+</m:t>
+                  </m:r>
+                  <m:f>
+                    <m:fPr>
+                      <m:ctrlPr>
+                        <w:rPr>
+                          <w:rFonts w:ascii="Cambria Math" w:hAnsi="Cambria Math"/>
+                          <w:i/>
+                          <w:iCs/>
+                        </w:rPr>
+                      </m:ctrlPr>
+                    </m:fPr>
+                    <m:num>
+                      <m:r>
+                        <w:rPr>
+                          <w:rFonts w:ascii="Cambria Math" w:hAnsi="Cambria Math"/>
+                        </w:rPr>
+                        <m:t>γ-1</m:t>
+                      </m:r>
+                    </m:num>
+                    <m:den>
+                      <m:r>
+                        <w:rPr>
+                          <w:rFonts w:ascii="Cambria Math" w:hAnsi="Cambria Math"/>
+                        </w:rPr>
+                        <m:t>2</m:t>
+                      </m:r>
+                    </m:den>
+                  </m:f>
+                  <m:r>
+                    <w:rPr>
+                      <w:rFonts w:ascii="Cambria Math" w:hAnsi="Cambria Math"/>
+                    </w:rPr>
+                    <m:t>×</m:t>
+                  </m:r>
+                  <m:sSup>
+                    <m:sSupPr>
+                      <m:ctrlPr>
+                        <w:rPr>
+                          <w:rFonts w:ascii="Cambria Math" w:hAnsi="Cambria Math"/>
+                          <w:i/>
+                          <w:iCs/>
+                        </w:rPr>
+                      </m:ctrlPr>
+                    </m:sSupPr>
+                    <m:e>
+                      <m:r>
+                        <w:rPr>
+                          <w:rFonts w:ascii="Cambria Math" w:hAnsi="Cambria Math"/>
+                        </w:rPr>
+                        <m:t>M</m:t>
+                      </m:r>
+                    </m:e>
+                    <m:sup>
+                      <m:r>
+                        <w:rPr>
+                          <w:rFonts w:ascii="Cambria Math" w:hAnsi="Cambria Math"/>
+                        </w:rPr>
+                        <m:t>2</m:t>
+                      </m:r>
+                    </m:sup>
+                  </m:sSup>
+                </m:e>
+              </m:d>
+            </m:e>
+            <m:sup>
+              <m:f>
+                <m:fPr>
+                  <m:ctrlPr>
+                    <w:rPr>
+                      <w:rFonts w:ascii="Cambria Math" w:hAnsi="Cambria Math"/>
+                      <w:i/>
+                      <w:iCs/>
+                    </w:rPr>
+                  </m:ctrlPr>
+                </m:fPr>
+                <m:num>
+                  <m:r>
+                    <w:rPr>
+                      <w:rFonts w:ascii="Cambria Math" w:hAnsi="Cambria Math"/>
+                    </w:rPr>
+                    <m:t>γ</m:t>
+                  </m:r>
+                </m:num>
+                <m:den>
+                  <m:r>
+                    <w:rPr>
+                      <w:rFonts w:ascii="Cambria Math" w:hAnsi="Cambria Math"/>
+                    </w:rPr>
+                    <m:t>1-γ</m:t>
+                  </m:r>
+                </m:den>
+              </m:f>
+            </m:sup>
+          </m:sSup>
+        </m:oMath>
+      </m:oMathPara>
+    </w:p>
+    <w:p>
+      <w:pPr>
+        <w:rPr>
+          <w:rFonts w:eastAsiaTheme="minorEastAsia"/>
+          <w:iCs/>
+        </w:rPr>
+      </w:pPr>
+      <m:oMathPara>
+        <m:oMath>
+          <m:f>
+            <m:fPr>
+              <m:ctrlPr>
+                <w:rPr>
+                  <w:rFonts w:ascii="Cambria Math" w:hAnsi="Cambria Math"/>
+                  <w:i/>
+                  <w:iCs/>
+                </w:rPr>
+              </m:ctrlPr>
+            </m:fPr>
+            <m:num>
+              <m:r>
+                <m:rPr>
+                  <m:sty m:val="p"/>
+                </m:rPr>
+                <w:rPr>
+                  <w:rFonts w:ascii="Cambria Math" w:hAnsi="Cambria Math"/>
+                </w:rPr>
+                <m:t>d</m:t>
+              </m:r>
+            </m:num>
+            <m:den>
+              <m:sSub>
+                <m:sSubPr>
+                  <m:ctrlPr>
+                    <w:rPr>
+                      <w:rFonts w:ascii="Cambria Math" w:hAnsi="Cambria Math"/>
+                      <w:iCs/>
+                    </w:rPr>
+                  </m:ctrlPr>
+                </m:sSubPr>
+                <m:e>
+                  <m:r>
+                    <m:rPr>
+                      <m:sty m:val="p"/>
+                    </m:rPr>
+                    <w:rPr>
+                      <w:rFonts w:ascii="Cambria Math" w:hAnsi="Cambria Math"/>
+                    </w:rPr>
+                    <m:t>d</m:t>
+                  </m:r>
+                </m:e>
+                <m:sub>
+                  <m:r>
+                    <w:rPr>
+                      <w:rFonts w:ascii="Cambria Math" w:hAnsi="Cambria Math"/>
+                    </w:rPr>
+                    <m:t>0</m:t>
+                  </m:r>
+                </m:sub>
+              </m:sSub>
+            </m:den>
+          </m:f>
+          <m:r>
+            <w:rPr>
+              <w:rFonts w:ascii="Cambria Math" w:hAnsi="Cambria Math"/>
+            </w:rPr>
+            <m:t>=</m:t>
+          </m:r>
+          <m:sSup>
+            <m:sSupPr>
+              <m:ctrlPr>
+                <w:rPr>
+                  <w:rFonts w:ascii="Cambria Math" w:hAnsi="Cambria Math"/>
+                  <w:i/>
+                  <w:iCs/>
+                </w:rPr>
+              </m:ctrlPr>
+            </m:sSupPr>
+            <m:e>
+              <m:d>
+                <m:dPr>
+                  <m:ctrlPr>
+                    <w:rPr>
+                      <w:rFonts w:ascii="Cambria Math" w:hAnsi="Cambria Math"/>
+                      <w:i/>
+                      <w:iCs/>
+                    </w:rPr>
+                  </m:ctrlPr>
+                </m:dPr>
+                <m:e>
+                  <m:r>
+                    <w:rPr>
+                      <w:rFonts w:ascii="Cambria Math" w:hAnsi="Cambria Math"/>
+                    </w:rPr>
+                    <m:t>1+</m:t>
+                  </m:r>
+                  <m:f>
+                    <m:fPr>
+                      <m:ctrlPr>
+                        <w:rPr>
+                          <w:rFonts w:ascii="Cambria Math" w:hAnsi="Cambria Math"/>
+                          <w:i/>
+                          <w:iCs/>
+                        </w:rPr>
+                      </m:ctrlPr>
+                    </m:fPr>
+                    <m:num>
+                      <m:r>
+                        <w:rPr>
+                          <w:rFonts w:ascii="Cambria Math" w:hAnsi="Cambria Math"/>
+                        </w:rPr>
+                        <m:t>γ-1</m:t>
+                      </m:r>
+                    </m:num>
+                    <m:den>
+                      <m:r>
+                        <w:rPr>
+                          <w:rFonts w:ascii="Cambria Math" w:hAnsi="Cambria Math"/>
+                        </w:rPr>
+                        <m:t>2</m:t>
+                      </m:r>
+                    </m:den>
+                  </m:f>
+                  <m:r>
+                    <w:rPr>
+                      <w:rFonts w:ascii="Cambria Math" w:hAnsi="Cambria Math"/>
+                    </w:rPr>
+                    <m:t>×</m:t>
+                  </m:r>
+                  <m:sSup>
+                    <m:sSupPr>
+                      <m:ctrlPr>
+                        <w:rPr>
+                          <w:rFonts w:ascii="Cambria Math" w:hAnsi="Cambria Math"/>
+                          <w:i/>
+                          <w:iCs/>
+                        </w:rPr>
+                      </m:ctrlPr>
+                    </m:sSupPr>
+                    <m:e>
+                      <m:r>
+                        <w:rPr>
+                          <w:rFonts w:ascii="Cambria Math" w:hAnsi="Cambria Math"/>
+                        </w:rPr>
+                        <m:t>M</m:t>
+                      </m:r>
+                    </m:e>
+                    <m:sup>
+                      <m:r>
+                        <w:rPr>
+                          <w:rFonts w:ascii="Cambria Math" w:hAnsi="Cambria Math"/>
+                        </w:rPr>
+                        <m:t>2</m:t>
+                      </m:r>
+                    </m:sup>
+                  </m:sSup>
+                </m:e>
+              </m:d>
+            </m:e>
+            <m:sup>
+              <m:f>
+                <m:fPr>
+                  <m:ctrlPr>
+                    <w:rPr>
+                      <w:rFonts w:ascii="Cambria Math" w:hAnsi="Cambria Math"/>
+                      <w:i/>
+                      <w:iCs/>
+                    </w:rPr>
+                  </m:ctrlPr>
+                </m:fPr>
+                <m:num>
+                  <m:r>
+                    <w:rPr>
+                      <w:rFonts w:ascii="Cambria Math" w:hAnsi="Cambria Math"/>
+                    </w:rPr>
+                    <m:t>1</m:t>
+                  </m:r>
+                </m:num>
+                <m:den>
+                  <m:r>
+                    <w:rPr>
+                      <w:rFonts w:ascii="Cambria Math" w:hAnsi="Cambria Math"/>
+                    </w:rPr>
+                    <m:t>1-γ</m:t>
+                  </m:r>
+                </m:den>
+              </m:f>
+            </m:sup>
+          </m:sSup>
+        </m:oMath>
+      </m:oMathPara>
+    </w:p>
+    <w:p>
+      <m:oMathPara>
+        <m:oMath>
+          <m:r>
+            <w:rPr>
+              <w:rFonts w:ascii="Cambria Math" w:hAnsi="Cambria Math"/>
+            </w:rPr>
+            <m:t>Vel</m:t>
+          </m:r>
+          <m:r>
+            <w:rPr>
+              <w:rFonts w:ascii="Cambria Math" w:hAnsi="Cambria Math"/>
+            </w:rPr>
+            <m:t>=</m:t>
+          </m:r>
+          <m:r>
+            <w:rPr>
+              <w:rFonts w:ascii="Cambria Math" w:hAnsi="Cambria Math"/>
+            </w:rPr>
+            <m:t>M×c</m:t>
+          </m:r>
+        </m:oMath>
+      </m:oMathPara>
+    </w:p>
+    <w:p>
+      <w:pPr>
+        <w:rPr>
+          <w:rFonts w:eastAsiaTheme="minorEastAsia"/>
+        </w:rPr>
+      </w:pPr>
+      <m:oMathPara>
+        <m:oMath>
+          <m:f>
+            <m:fPr>
+              <m:ctrlPr>
+                <w:rPr>
+                  <w:rFonts w:ascii="Cambria Math" w:eastAsiaTheme="minorEastAsia" w:hAnsi="Cambria Math"/>
+                  <w:i/>
+                </w:rPr>
+              </m:ctrlPr>
+            </m:fPr>
+            <m:num>
+              <m:r>
+                <w:rPr>
+                  <w:rFonts w:ascii="Cambria Math" w:hAnsi="Cambria Math"/>
+                </w:rPr>
+                <m:t>γ</m:t>
+              </m:r>
+            </m:num>
+            <m:den>
+              <m:r>
+                <w:rPr>
+                  <w:rFonts w:ascii="Cambria Math" w:hAnsi="Cambria Math"/>
+                </w:rPr>
+                <m:t>γ-1</m:t>
+              </m:r>
+            </m:den>
+          </m:f>
+          <m:r>
+            <w:rPr>
+              <w:rFonts w:ascii="Cambria Math" w:eastAsiaTheme="minorEastAsia" w:hAnsi="Cambria Math"/>
+            </w:rPr>
+            <m:t>×</m:t>
+          </m:r>
+          <m:f>
+            <m:fPr>
+              <m:ctrlPr>
+                <w:rPr>
+                  <w:rFonts w:ascii="Cambria Math" w:eastAsiaTheme="minorEastAsia" w:hAnsi="Cambria Math"/>
+                  <w:i/>
+                </w:rPr>
+              </m:ctrlPr>
+            </m:fPr>
+            <m:num>
+              <m:r>
+                <w:rPr>
+                  <w:rFonts w:ascii="Cambria Math" w:eastAsiaTheme="minorEastAsia" w:hAnsi="Cambria Math"/>
+                </w:rPr>
+                <m:t>p</m:t>
+              </m:r>
+            </m:num>
+            <m:den>
+              <m:r>
+                <w:rPr>
+                  <w:rFonts w:ascii="Cambria Math" w:eastAsiaTheme="minorEastAsia" w:hAnsi="Cambria Math"/>
+                </w:rPr>
+                <m:t>d</m:t>
+              </m:r>
+            </m:den>
+          </m:f>
+          <m:r>
+            <w:rPr>
+              <w:rFonts w:ascii="Cambria Math" w:eastAsiaTheme="minorEastAsia" w:hAnsi="Cambria Math"/>
+            </w:rPr>
+            <m:t>+</m:t>
+          </m:r>
+          <m:f>
+            <m:fPr>
+              <m:ctrlPr>
+                <w:rPr>
+                  <w:rFonts w:ascii="Cambria Math" w:eastAsiaTheme="minorEastAsia" w:hAnsi="Cambria Math"/>
+                  <w:i/>
+                </w:rPr>
+              </m:ctrlPr>
+            </m:fPr>
+            <m:num>
+              <m:sSup>
+                <m:sSupPr>
+                  <m:ctrlPr>
+                    <w:rPr>
+                      <w:rFonts w:ascii="Cambria Math" w:eastAsiaTheme="minorEastAsia" w:hAnsi="Cambria Math"/>
+                      <w:i/>
+                    </w:rPr>
+                  </m:ctrlPr>
+                </m:sSupPr>
+                <m:e>
+                  <m:r>
+                    <w:rPr>
+                      <w:rFonts w:ascii="Cambria Math" w:eastAsiaTheme="minorEastAsia" w:hAnsi="Cambria Math"/>
+                    </w:rPr>
+                    <m:t>Vel</m:t>
+                  </m:r>
+                </m:e>
+                <m:sup>
+                  <m:r>
+                    <w:rPr>
+                      <w:rFonts w:ascii="Cambria Math" w:eastAsiaTheme="minorEastAsia" w:hAnsi="Cambria Math"/>
+                    </w:rPr>
+                    <m:t>2</m:t>
+                  </m:r>
+                </m:sup>
+              </m:sSup>
+            </m:num>
+            <m:den>
+              <m:r>
+                <w:rPr>
+                  <w:rFonts w:ascii="Cambria Math" w:eastAsiaTheme="minorEastAsia" w:hAnsi="Cambria Math"/>
+                </w:rPr>
+                <m:t>2</m:t>
+              </m:r>
+            </m:den>
+          </m:f>
+          <m:r>
+            <w:rPr>
+              <w:rFonts w:ascii="Cambria Math" w:eastAsiaTheme="minorEastAsia" w:hAnsi="Cambria Math"/>
+            </w:rPr>
+            <m:t>=constant</m:t>
+          </m:r>
+        </m:oMath>
+      </m:oMathPara>
+    </w:p>
+    <w:p>
+      <w:pPr>
+        <w:rPr>
+          <w:rFonts w:eastAsiaTheme="minorEastAsia"/>
+        </w:rPr>
+      </w:pPr>
+      <m:oMathPara>
+        <m:oMath>
+          <m:r>
+            <w:rPr>
+              <w:rFonts w:ascii="Cambria Math" w:eastAsiaTheme="minorEastAsia" w:hAnsi="Cambria Math"/>
+            </w:rPr>
+            <m:t>m_flow=</m:t>
+          </m:r>
+          <m:r>
+            <w:rPr>
+              <w:rFonts w:ascii="Cambria Math" w:eastAsiaTheme="minorEastAsia" w:hAnsi="Cambria Math"/>
+            </w:rPr>
+            <m:t>d×Vel×A</m:t>
+          </m:r>
+          <m:r>
+            <w:rPr>
+              <w:rFonts w:ascii="Cambria Math" w:eastAsiaTheme="minorEastAsia" w:hAnsi="Cambria Math"/>
+            </w:rPr>
+            <m:t>×Cd</m:t>
+          </m:r>
+        </m:oMath>
+      </m:oMathPara>
+      <w:bookmarkStart w:id="30" w:name="_GoBack"/>
+      <w:bookmarkEnd w:id="30"/>
+    </w:p>
+    <w:p>
+      <w:pPr>
+        <w:rPr>
+          <w:lang w:val="fr-FR"/>
+        </w:rPr>
+      </w:pPr>
+    </w:p>
+    <w:p>
+      <w:pPr>
+        <w:pStyle w:val="Titre2"/>
+        <w:rPr>
+          <w:lang w:val="fr-FR"/>
+        </w:rPr>
+      </w:pPr>
+      <w:bookmarkStart w:id="31" w:name="_Toc41656119"/>
+      <w:proofErr w:type="spellStart"/>
+      <w:r>
+        <w:rPr>
+          <w:lang w:val="fr-FR"/>
+        </w:rPr>
         <w:t>BasesClasses</w:t>
       </w:r>
-      <w:bookmarkEnd w:id="27"/>
+      <w:bookmarkEnd w:id="31"/>
       <w:proofErr w:type="spellEnd"/>
     </w:p>
     <w:p>
@@ -12244,7 +13045,7 @@
           <w:rFonts w:eastAsiaTheme="minorEastAsia"/>
         </w:rPr>
       </w:pPr>
-      <w:bookmarkStart w:id="28" w:name="_Toc41489186"/>
+      <w:bookmarkStart w:id="32" w:name="_Toc41656120"/>
       <w:proofErr w:type="spellStart"/>
       <w:r>
         <w:rPr>
@@ -12252,7 +13053,7 @@
         </w:rPr>
         <w:t>AeraulicConvection</w:t>
       </w:r>
-      <w:bookmarkEnd w:id="28"/>
+      <w:bookmarkEnd w:id="32"/>
       <w:proofErr w:type="spellEnd"/>
     </w:p>
     <w:p/>
@@ -12506,7 +13307,7 @@
           <w:rFonts w:eastAsiaTheme="minorEastAsia"/>
         </w:rPr>
       </w:pPr>
-      <w:bookmarkStart w:id="29" w:name="_Toc41489187"/>
+      <w:bookmarkStart w:id="33" w:name="_Toc41656121"/>
       <w:r>
         <w:rPr>
           <w:rFonts w:eastAsiaTheme="minorEastAsia"/>
@@ -12519,7 +13320,7 @@
         </w:rPr>
         <w:t>densation</w:t>
       </w:r>
-      <w:bookmarkEnd w:id="29"/>
+      <w:bookmarkEnd w:id="33"/>
     </w:p>
     <w:p/>
     <w:p>
@@ -12727,7 +13528,7 @@
           <w:rFonts w:eastAsiaTheme="minorEastAsia"/>
         </w:rPr>
       </w:pPr>
-      <w:bookmarkStart w:id="30" w:name="_Toc41489188"/>
+      <w:bookmarkStart w:id="34" w:name="_Toc41656122"/>
       <w:proofErr w:type="spellStart"/>
       <w:r>
         <w:rPr>
@@ -12735,7 +13536,7 @@
         </w:rPr>
         <w:t>MolecularDiffusion</w:t>
       </w:r>
-      <w:bookmarkEnd w:id="30"/>
+      <w:bookmarkEnd w:id="34"/>
       <w:proofErr w:type="spellEnd"/>
     </w:p>
     <w:p/>
@@ -13007,7 +13808,7 @@
           <w:rFonts w:eastAsiaTheme="minorEastAsia"/>
         </w:rPr>
       </w:pPr>
-      <w:bookmarkStart w:id="31" w:name="_Toc41489189"/>
+      <w:bookmarkStart w:id="35" w:name="_Toc41656123"/>
       <w:proofErr w:type="spellStart"/>
       <w:r>
         <w:rPr>
@@ -13015,7 +13816,7 @@
         </w:rPr>
         <w:t>GasNode</w:t>
       </w:r>
-      <w:bookmarkEnd w:id="31"/>
+      <w:bookmarkEnd w:id="35"/>
       <w:proofErr w:type="spellEnd"/>
     </w:p>
     <w:p/>
@@ -13222,12 +14023,12 @@
       <w:pPr>
         <w:pStyle w:val="Titre3"/>
       </w:pPr>
-      <w:bookmarkStart w:id="32" w:name="_Toc41489190"/>
+      <w:bookmarkStart w:id="36" w:name="_Toc41656124"/>
       <w:proofErr w:type="spellStart"/>
       <w:r>
         <w:t>FogModel</w:t>
       </w:r>
-      <w:bookmarkEnd w:id="32"/>
+      <w:bookmarkEnd w:id="36"/>
       <w:proofErr w:type="spellEnd"/>
     </w:p>
     <w:p/>
@@ -13566,6 +14367,7 @@
             <w:rPr>
               <w:rFonts w:ascii="Cambria Math" w:eastAsiaTheme="minorEastAsia" w:hAnsi="Cambria Math"/>
             </w:rPr>
+            <w:lastRenderedPageBreak/>
             <m:t>P= -</m:t>
           </m:r>
           <m:sSub>
@@ -14036,7 +14838,13 @@
                 <w:rPr>
                   <w:rFonts w:ascii="Cambria Math" w:eastAsiaTheme="minorEastAsia" w:hAnsi="Cambria Math"/>
                 </w:rPr>
-                <m:t>ground gas node</m:t>
+                <m:t>grou</m:t>
+              </m:r>
+              <m:r>
+                <w:rPr>
+                  <w:rFonts w:ascii="Cambria Math" w:eastAsiaTheme="minorEastAsia" w:hAnsi="Cambria Math"/>
+                </w:rPr>
+                <m:t>nd gas node</m:t>
               </m:r>
             </m:sub>
           </m:sSub>
@@ -14490,7 +15298,13 @@
                 <w:rPr>
                   <w:rFonts w:ascii="Cambria Math" w:eastAsiaTheme="minorEastAsia" w:hAnsi="Cambria Math"/>
                 </w:rPr>
-                <m:t>nports</m:t>
+                <m:t>npor</m:t>
+              </m:r>
+              <m:r>
+                <w:rPr>
+                  <w:rFonts w:ascii="Cambria Math" w:eastAsiaTheme="minorEastAsia" w:hAnsi="Cambria Math"/>
+                </w:rPr>
+                <m:t>ts</m:t>
               </m:r>
             </m:sup>
             <m:e>
@@ -14541,11 +15355,11 @@
       <w:pPr>
         <w:pStyle w:val="Titre2"/>
       </w:pPr>
-      <w:bookmarkStart w:id="33" w:name="_Toc41489191"/>
+      <w:bookmarkStart w:id="37" w:name="_Toc41656125"/>
       <w:r>
         <w:t>Functions</w:t>
       </w:r>
-      <w:bookmarkEnd w:id="33"/>
+      <w:bookmarkEnd w:id="37"/>
     </w:p>
     <w:p>
       <w:pPr>
@@ -14561,14 +15375,14 @@
           <w:rFonts w:eastAsiaTheme="minorEastAsia"/>
         </w:rPr>
       </w:pPr>
-      <w:bookmarkStart w:id="34" w:name="_Toc41489192"/>
+      <w:bookmarkStart w:id="38" w:name="_Toc41656126"/>
       <w:r>
         <w:rPr>
           <w:rFonts w:eastAsiaTheme="minorEastAsia"/>
         </w:rPr>
         <w:t>rootsPolyorder3</w:t>
       </w:r>
-      <w:bookmarkEnd w:id="34"/>
+      <w:bookmarkEnd w:id="38"/>
     </w:p>
     <w:p/>
     <w:p>
@@ -14854,6 +15668,7 @@
         <w:rPr>
           <w:rFonts w:eastAsiaTheme="minorEastAsia"/>
         </w:rPr>
+        <w:lastRenderedPageBreak/>
         <w:t>Si discriminant &lt; 0</w:t>
       </w:r>
     </w:p>
@@ -15698,7 +16513,6 @@
             <w:rPr>
               <w:rFonts w:ascii="Cambria Math" w:eastAsiaTheme="minorEastAsia" w:hAnsi="Cambria Math"/>
             </w:rPr>
-            <w:lastRenderedPageBreak/>
             <m:t>x3=2×</m:t>
           </m:r>
           <m:rad>
@@ -16676,6 +17490,7 @@
         <w:rPr>
           <w:rFonts w:eastAsiaTheme="minorEastAsia"/>
         </w:rPr>
+        <w:lastRenderedPageBreak/>
         <w:br w:type="page"/>
       </w:r>
     </w:p>
@@ -16687,7 +17502,7 @@
           <w:lang w:val="fr-FR"/>
         </w:rPr>
       </w:pPr>
-      <w:bookmarkStart w:id="35" w:name="_Toc41489195"/>
+      <w:bookmarkStart w:id="39" w:name="_Toc41656127"/>
       <w:r>
         <w:rPr>
           <w:rFonts w:eastAsiaTheme="minorEastAsia"/>
@@ -16696,7 +17511,7 @@
         <w:lastRenderedPageBreak/>
         <w:t>PDE</w:t>
       </w:r>
-      <w:bookmarkEnd w:id="35"/>
+      <w:bookmarkEnd w:id="39"/>
     </w:p>
     <w:p>
       <w:pPr>
@@ -16712,7 +17527,7 @@
           <w:lang w:val="fr-FR"/>
         </w:rPr>
       </w:pPr>
-      <w:bookmarkStart w:id="36" w:name="_Toc41489196"/>
+      <w:bookmarkStart w:id="40" w:name="_Toc41656128"/>
       <w:proofErr w:type="spellStart"/>
       <w:r>
         <w:rPr>
@@ -16720,18 +17535,18 @@
         </w:rPr>
         <w:t>ThermalDiffusion</w:t>
       </w:r>
-      <w:bookmarkEnd w:id="36"/>
+      <w:bookmarkEnd w:id="40"/>
       <w:proofErr w:type="spellEnd"/>
     </w:p>
     <w:p>
       <w:pPr>
         <w:pStyle w:val="Titre3"/>
       </w:pPr>
-      <w:bookmarkStart w:id="37" w:name="_Toc41489197"/>
+      <w:bookmarkStart w:id="41" w:name="_Toc41656129"/>
       <w:r>
         <w:t>Second order central</w:t>
       </w:r>
-      <w:bookmarkEnd w:id="37"/>
+      <w:bookmarkEnd w:id="41"/>
     </w:p>
     <w:p>
       <w:pPr>
@@ -17244,14 +18059,7 @@
                           <w:rFonts w:ascii="Cambria Math" w:hAnsi="Cambria Math"/>
                           <w:sz w:val="18"/>
                         </w:rPr>
-                        <m:t>∂</m:t>
-                      </m:r>
-                      <m:r>
-                        <w:rPr>
-                          <w:rFonts w:ascii="Cambria Math" w:hAnsi="Cambria Math"/>
-                          <w:sz w:val="18"/>
-                        </w:rPr>
-                        <m:t>x</m:t>
+                        <m:t>∂x</m:t>
                       </m:r>
                     </m:den>
                   </m:f>
@@ -19667,6 +20475,36 @@
     </w:lvlOverride>
   </w:num>
   <w:num w:numId="14">
+    <w:abstractNumId w:val="1"/>
+    <w:lvlOverride w:ilvl="0">
+      <w:startOverride w:val="1"/>
+    </w:lvlOverride>
+    <w:lvlOverride w:ilvl="1">
+      <w:startOverride w:val="1"/>
+    </w:lvlOverride>
+    <w:lvlOverride w:ilvl="2">
+      <w:startOverride w:val="1"/>
+    </w:lvlOverride>
+    <w:lvlOverride w:ilvl="3">
+      <w:startOverride w:val="1"/>
+    </w:lvlOverride>
+    <w:lvlOverride w:ilvl="4">
+      <w:startOverride w:val="1"/>
+    </w:lvlOverride>
+    <w:lvlOverride w:ilvl="5">
+      <w:startOverride w:val="1"/>
+    </w:lvlOverride>
+    <w:lvlOverride w:ilvl="6">
+      <w:startOverride w:val="1"/>
+    </w:lvlOverride>
+    <w:lvlOverride w:ilvl="7">
+      <w:startOverride w:val="1"/>
+    </w:lvlOverride>
+    <w:lvlOverride w:ilvl="8">
+      <w:startOverride w:val="1"/>
+    </w:lvlOverride>
+  </w:num>
+  <w:num w:numId="15">
     <w:abstractNumId w:val="1"/>
     <w:lvlOverride w:ilvl="0">
       <w:startOverride w:val="1"/>
@@ -21033,6 +21871,501 @@
 </w:styles>
 </file>
 
+<file path=word/glossary/document.xml><?xml version="1.0" encoding="utf-8"?>
+<w:glossaryDocument xmlns:wpc="http://schemas.microsoft.com/office/word/2010/wordprocessingCanvas" xmlns:mc="http://schemas.openxmlformats.org/markup-compatibility/2006" xmlns:o="urn:schemas-microsoft-com:office:office" xmlns:r="http://schemas.openxmlformats.org/officeDocument/2006/relationships" xmlns:m="http://schemas.openxmlformats.org/officeDocument/2006/math" xmlns:v="urn:schemas-microsoft-com:vml" xmlns:wp14="http://schemas.microsoft.com/office/word/2010/wordprocessingDrawing" xmlns:wp="http://schemas.openxmlformats.org/drawingml/2006/wordprocessingDrawing" xmlns:w10="urn:schemas-microsoft-com:office:word" xmlns:w="http://schemas.openxmlformats.org/wordprocessingml/2006/main" xmlns:w14="http://schemas.microsoft.com/office/word/2010/wordml" xmlns:wpg="http://schemas.microsoft.com/office/word/2010/wordprocessingGroup" xmlns:wpi="http://schemas.microsoft.com/office/word/2010/wordprocessingInk" xmlns:wne="http://schemas.microsoft.com/office/word/2006/wordml" xmlns:wps="http://schemas.microsoft.com/office/word/2010/wordprocessingShape" mc:Ignorable="w14 wp14"/>
+</file>
+
+<file path=word/glossary/fontTable.xml><?xml version="1.0" encoding="utf-8"?>
+<w:fonts xmlns:mc="http://schemas.openxmlformats.org/markup-compatibility/2006" xmlns:r="http://schemas.openxmlformats.org/officeDocument/2006/relationships" xmlns:w="http://schemas.openxmlformats.org/wordprocessingml/2006/main" xmlns:w14="http://schemas.microsoft.com/office/word/2010/wordml" mc:Ignorable="w14">
+  <w:font w:name="Calibri">
+    <w:panose1 w:val="020F0502020204030204"/>
+    <w:charset w:val="00"/>
+    <w:family w:val="swiss"/>
+    <w:pitch w:val="variable"/>
+    <w:sig w:usb0="E0002AFF" w:usb1="C000247B" w:usb2="00000009" w:usb3="00000000" w:csb0="000001FF" w:csb1="00000000"/>
+  </w:font>
+  <w:font w:name="Times New Roman">
+    <w:panose1 w:val="02020603050405020304"/>
+    <w:charset w:val="00"/>
+    <w:family w:val="roman"/>
+    <w:pitch w:val="variable"/>
+    <w:sig w:usb0="E0002EFF" w:usb1="C000785B" w:usb2="00000009" w:usb3="00000000" w:csb0="000001FF" w:csb1="00000000"/>
+  </w:font>
+  <w:font w:name="Calibri Light">
+    <w:panose1 w:val="020F0302020204030204"/>
+    <w:charset w:val="00"/>
+    <w:family w:val="swiss"/>
+    <w:pitch w:val="variable"/>
+    <w:sig w:usb0="E0002AFF" w:usb1="C000247B" w:usb2="00000009" w:usb3="00000000" w:csb0="000001FF" w:csb1="00000000"/>
+  </w:font>
+  <w:font w:name="Tahoma">
+    <w:panose1 w:val="020B0604030504040204"/>
+    <w:charset w:val="00"/>
+    <w:family w:val="swiss"/>
+    <w:pitch w:val="variable"/>
+    <w:sig w:usb0="E1002EFF" w:usb1="C000605B" w:usb2="00000029" w:usb3="00000000" w:csb0="000101FF" w:csb1="00000000"/>
+  </w:font>
+  <w:font w:name="Cambria Math">
+    <w:panose1 w:val="02040503050406030204"/>
+    <w:charset w:val="00"/>
+    <w:family w:val="roman"/>
+    <w:pitch w:val="variable"/>
+    <w:sig w:usb0="E00006FF" w:usb1="420024FF" w:usb2="02000000" w:usb3="00000000" w:csb0="0000019F" w:csb1="00000000"/>
+  </w:font>
+  <w:font w:name="Cambria">
+    <w:panose1 w:val="02040503050406030204"/>
+    <w:charset w:val="00"/>
+    <w:family w:val="roman"/>
+    <w:pitch w:val="variable"/>
+    <w:sig w:usb0="E00006FF" w:usb1="420024FF" w:usb2="02000000" w:usb3="00000000" w:csb0="0000019F" w:csb1="00000000"/>
+  </w:font>
+</w:fonts>
+</file>
+
+<file path=word/glossary/settings.xml><?xml version="1.0" encoding="utf-8"?>
+<w:settings xmlns:mc="http://schemas.openxmlformats.org/markup-compatibility/2006" xmlns:o="urn:schemas-microsoft-com:office:office" xmlns:r="http://schemas.openxmlformats.org/officeDocument/2006/relationships" xmlns:m="http://schemas.openxmlformats.org/officeDocument/2006/math" xmlns:v="urn:schemas-microsoft-com:vml" xmlns:w10="urn:schemas-microsoft-com:office:word" xmlns:w="http://schemas.openxmlformats.org/wordprocessingml/2006/main" xmlns:w14="http://schemas.microsoft.com/office/word/2010/wordml" xmlns:sl="http://schemas.openxmlformats.org/schemaLibrary/2006/main" mc:Ignorable="w14">
+  <w:view w:val="normal"/>
+  <w:defaultTabStop w:val="720"/>
+  <w:characterSpacingControl w:val="doNotCompress"/>
+  <w:compat>
+    <w:useFELayout/>
+    <w:compatSetting w:name="compatibilityMode" w:uri="http://schemas.microsoft.com/office/word" w:val="14"/>
+    <w:compatSetting w:name="overrideTableStyleFontSizeAndJustification" w:uri="http://schemas.microsoft.com/office/word" w:val="1"/>
+    <w:compatSetting w:name="enableOpenTypeFeatures" w:uri="http://schemas.microsoft.com/office/word" w:val="1"/>
+    <w:compatSetting w:name="doNotFlipMirrorIndents" w:uri="http://schemas.microsoft.com/office/word" w:val="1"/>
+  </w:compat>
+  <w:rsids>
+    <w:rsidRoot w:val="000544A6"/>
+    <w:rsid w:val="000544A6"/>
+    <w:rsid w:val="001D31CA"/>
+  </w:rsids>
+  <m:mathPr>
+    <m:mathFont m:val="Cambria Math"/>
+    <m:brkBin m:val="before"/>
+    <m:brkBinSub m:val="--"/>
+    <m:smallFrac m:val="0"/>
+    <m:dispDef/>
+    <m:lMargin m:val="0"/>
+    <m:rMargin m:val="0"/>
+    <m:defJc m:val="centerGroup"/>
+    <m:wrapIndent m:val="1440"/>
+    <m:intLim m:val="subSup"/>
+    <m:naryLim m:val="undOvr"/>
+  </m:mathPr>
+  <w:themeFontLang w:val="en-GB"/>
+  <w:clrSchemeMapping w:bg1="light1" w:t1="dark1" w:bg2="light2" w:t2="dark2" w:accent1="accent1" w:accent2="accent2" w:accent3="accent3" w:accent4="accent4" w:accent5="accent5" w:accent6="accent6" w:hyperlink="hyperlink" w:followedHyperlink="followedHyperlink"/>
+  <w:decimalSymbol w:val=","/>
+  <w:listSeparator w:val=";"/>
+</w:settings>
+</file>
+
+<file path=word/glossary/styles.xml><?xml version="1.0" encoding="utf-8"?>
+<w:styles xmlns:mc="http://schemas.openxmlformats.org/markup-compatibility/2006" xmlns:r="http://schemas.openxmlformats.org/officeDocument/2006/relationships" xmlns:w="http://schemas.openxmlformats.org/wordprocessingml/2006/main" xmlns:w14="http://schemas.microsoft.com/office/word/2010/wordml" mc:Ignorable="w14">
+  <w:docDefaults>
+    <w:rPrDefault>
+      <w:rPr>
+        <w:rFonts w:asciiTheme="minorHAnsi" w:eastAsiaTheme="minorEastAsia" w:hAnsiTheme="minorHAnsi" w:cstheme="minorBidi"/>
+        <w:sz w:val="22"/>
+        <w:szCs w:val="22"/>
+        <w:lang w:val="en-GB" w:eastAsia="en-GB" w:bidi="ar-SA"/>
+      </w:rPr>
+    </w:rPrDefault>
+    <w:pPrDefault>
+      <w:pPr>
+        <w:spacing w:after="200" w:line="276" w:lineRule="auto"/>
+      </w:pPr>
+    </w:pPrDefault>
+  </w:docDefaults>
+  <w:latentStyles w:defLockedState="0" w:defUIPriority="99" w:defSemiHidden="1" w:defUnhideWhenUsed="1" w:defQFormat="0" w:count="267">
+    <w:lsdException w:name="Normal" w:semiHidden="0" w:uiPriority="0" w:unhideWhenUsed="0" w:qFormat="1"/>
+    <w:lsdException w:name="heading 1" w:semiHidden="0" w:uiPriority="9" w:unhideWhenUsed="0" w:qFormat="1"/>
+    <w:lsdException w:name="heading 2" w:uiPriority="9" w:qFormat="1"/>
+    <w:lsdException w:name="heading 3" w:uiPriority="9" w:qFormat="1"/>
+    <w:lsdException w:name="heading 4" w:uiPriority="9" w:qFormat="1"/>
+    <w:lsdException w:name="heading 5" w:uiPriority="9" w:qFormat="1"/>
+    <w:lsdException w:name="heading 6" w:uiPriority="9" w:qFormat="1"/>
+    <w:lsdException w:name="heading 7" w:uiPriority="9" w:qFormat="1"/>
+    <w:lsdException w:name="heading 8" w:uiPriority="9" w:qFormat="1"/>
+    <w:lsdException w:name="heading 9" w:uiPriority="9" w:qFormat="1"/>
+    <w:lsdException w:name="toc 1" w:uiPriority="39"/>
+    <w:lsdException w:name="toc 2" w:uiPriority="39"/>
+    <w:lsdException w:name="toc 3" w:uiPriority="39"/>
+    <w:lsdException w:name="toc 4" w:uiPriority="39"/>
+    <w:lsdException w:name="toc 5" w:uiPriority="39"/>
+    <w:lsdException w:name="toc 6" w:uiPriority="39"/>
+    <w:lsdException w:name="toc 7" w:uiPriority="39"/>
+    <w:lsdException w:name="toc 8" w:uiPriority="39"/>
+    <w:lsdException w:name="toc 9" w:uiPriority="39"/>
+    <w:lsdException w:name="caption" w:uiPriority="35" w:qFormat="1"/>
+    <w:lsdException w:name="Title" w:semiHidden="0" w:uiPriority="10" w:unhideWhenUsed="0" w:qFormat="1"/>
+    <w:lsdException w:name="Default Paragraph Font" w:uiPriority="1"/>
+    <w:lsdException w:name="Subtitle" w:semiHidden="0" w:uiPriority="11" w:unhideWhenUsed="0" w:qFormat="1"/>
+    <w:lsdException w:name="Strong" w:semiHidden="0" w:uiPriority="22" w:unhideWhenUsed="0" w:qFormat="1"/>
+    <w:lsdException w:name="Emphasis" w:semiHidden="0" w:uiPriority="20" w:unhideWhenUsed="0" w:qFormat="1"/>
+    <w:lsdException w:name="Table Grid" w:semiHidden="0" w:uiPriority="59" w:unhideWhenUsed="0"/>
+    <w:lsdException w:name="Placeholder Text" w:unhideWhenUsed="0"/>
+    <w:lsdException w:name="No Spacing" w:semiHidden="0" w:uiPriority="1" w:unhideWhenUsed="0" w:qFormat="1"/>
+    <w:lsdException w:name="Light Shading" w:semiHidden="0" w:uiPriority="60" w:unhideWhenUsed="0"/>
+    <w:lsdException w:name="Light List" w:semiHidden="0" w:uiPriority="61" w:unhideWhenUsed="0"/>
+    <w:lsdException w:name="Light Grid" w:semiHidden="0" w:uiPriority="62" w:unhideWhenUsed="0"/>
+    <w:lsdException w:name="Medium Shading 1" w:semiHidden="0" w:uiPriority="63" w:unhideWhenUsed="0"/>
+    <w:lsdException w:name="Medium Shading 2" w:semiHidden="0" w:uiPriority="64" w:unhideWhenUsed="0"/>
+    <w:lsdException w:name="Medium List 1" w:semiHidden="0" w:uiPriority="65" w:unhideWhenUsed="0"/>
+    <w:lsdException w:name="Medium List 2" w:semiHidden="0" w:uiPriority="66" w:unhideWhenUsed="0"/>
+    <w:lsdException w:name="Medium Grid 1" w:semiHidden="0" w:uiPriority="67" w:unhideWhenUsed="0"/>
+    <w:lsdException w:name="Medium Grid 2" w:semiHidden="0" w:uiPriority="68" w:unhideWhenUsed="0"/>
+    <w:lsdException w:name="Medium Grid 3" w:semiHidden="0" w:uiPriority="69" w:unhideWhenUsed="0"/>
+    <w:lsdException w:name="Dark List" w:semiHidden="0" w:uiPriority="70" w:unhideWhenUsed="0"/>
+    <w:lsdException w:name="Colorful Shading" w:semiHidden="0" w:uiPriority="71" w:unhideWhenUsed="0"/>
+    <w:lsdException w:name="Colorful List" w:semiHidden="0" w:uiPriority="72" w:unhideWhenUsed="0"/>
+    <w:lsdException w:name="Colorful Grid" w:semiHidden="0" w:uiPriority="73" w:unhideWhenUsed="0"/>
+    <w:lsdException w:name="Light Shading Accent 1" w:semiHidden="0" w:uiPriority="60" w:unhideWhenUsed="0"/>
+    <w:lsdException w:name="Light List Accent 1" w:semiHidden="0" w:uiPriority="61" w:unhideWhenUsed="0"/>
+    <w:lsdException w:name="Light Grid Accent 1" w:semiHidden="0" w:uiPriority="62" w:unhideWhenUsed="0"/>
+    <w:lsdException w:name="Medium Shading 1 Accent 1" w:semiHidden="0" w:uiPriority="63" w:unhideWhenUsed="0"/>
+    <w:lsdException w:name="Medium Shading 2 Accent 1" w:semiHidden="0" w:uiPriority="64" w:unhideWhenUsed="0"/>
+    <w:lsdException w:name="Medium List 1 Accent 1" w:semiHidden="0" w:uiPriority="65" w:unhideWhenUsed="0"/>
+    <w:lsdException w:name="Revision" w:unhideWhenUsed="0"/>
+    <w:lsdException w:name="List Paragraph" w:semiHidden="0" w:uiPriority="34" w:unhideWhenUsed="0" w:qFormat="1"/>
+    <w:lsdException w:name="Quote" w:semiHidden="0" w:uiPriority="29" w:unhideWhenUsed="0" w:qFormat="1"/>
+    <w:lsdException w:name="Intense Quote" w:semiHidden="0" w:uiPriority="30" w:unhideWhenUsed="0" w:qFormat="1"/>
+    <w:lsdException w:name="Medium List 2 Accent 1" w:semiHidden="0" w:uiPriority="66" w:unhideWhenUsed="0"/>
+    <w:lsdException w:name="Medium Grid 1 Accent 1" w:semiHidden="0" w:uiPriority="67" w:unhideWhenUsed="0"/>
+    <w:lsdException w:name="Medium Grid 2 Accent 1" w:semiHidden="0" w:uiPriority="68" w:unhideWhenUsed="0"/>
+    <w:lsdException w:name="Medium Grid 3 Accent 1" w:semiHidden="0" w:uiPriority="69" w:unhideWhenUsed="0"/>
+    <w:lsdException w:name="Dark List Accent 1" w:semiHidden="0" w:uiPriority="70" w:unhideWhenUsed="0"/>
+    <w:lsdException w:name="Colorful Shading Accent 1" w:semiHidden="0" w:uiPriority="71" w:unhideWhenUsed="0"/>
+    <w:lsdException w:name="Colorful List Accent 1" w:semiHidden="0" w:uiPriority="72" w:unhideWhenUsed="0"/>
+    <w:lsdException w:name="Colorful Grid Accent 1" w:semiHidden="0" w:uiPriority="73" w:unhideWhenUsed="0"/>
+    <w:lsdException w:name="Light Shading Accent 2" w:semiHidden="0" w:uiPriority="60" w:unhideWhenUsed="0"/>
+    <w:lsdException w:name="Light List Accent 2" w:semiHidden="0" w:uiPriority="61" w:unhideWhenUsed="0"/>
+    <w:lsdException w:name="Light Grid Accent 2" w:semiHidden="0" w:uiPriority="62" w:unhideWhenUsed="0"/>
+    <w:lsdException w:name="Medium Shading 1 Accent 2" w:semiHidden="0" w:uiPriority="63" w:unhideWhenUsed="0"/>
+    <w:lsdException w:name="Medium Shading 2 Accent 2" w:semiHidden="0" w:uiPriority="64" w:unhideWhenUsed="0"/>
+    <w:lsdException w:name="Medium List 1 Accent 2" w:semiHidden="0" w:uiPriority="65" w:unhideWhenUsed="0"/>
+    <w:lsdException w:name="Medium List 2 Accent 2" w:semiHidden="0" w:uiPriority="66" w:unhideWhenUsed="0"/>
+    <w:lsdException w:name="Medium Grid 1 Accent 2" w:semiHidden="0" w:uiPriority="67" w:unhideWhenUsed="0"/>
+    <w:lsdException w:name="Medium Grid 2 Accent 2" w:semiHidden="0" w:uiPriority="68" w:unhideWhenUsed="0"/>
+    <w:lsdException w:name="Medium Grid 3 Accent 2" w:semiHidden="0" w:uiPriority="69" w:unhideWhenUsed="0"/>
+    <w:lsdException w:name="Dark List Accent 2" w:semiHidden="0" w:uiPriority="70" w:unhideWhenUsed="0"/>
+    <w:lsdException w:name="Colorful Shading Accent 2" w:semiHidden="0" w:uiPriority="71" w:unhideWhenUsed="0"/>
+    <w:lsdException w:name="Colorful List Accent 2" w:semiHidden="0" w:uiPriority="72" w:unhideWhenUsed="0"/>
+    <w:lsdException w:name="Colorful Grid Accent 2" w:semiHidden="0" w:uiPriority="73" w:unhideWhenUsed="0"/>
+    <w:lsdException w:name="Light Shading Accent 3" w:semiHidden="0" w:uiPriority="60" w:unhideWhenUsed="0"/>
+    <w:lsdException w:name="Light List Accent 3" w:semiHidden="0" w:uiPriority="61" w:unhideWhenUsed="0"/>
+    <w:lsdException w:name="Light Grid Accent 3" w:semiHidden="0" w:uiPriority="62" w:unhideWhenUsed="0"/>
+    <w:lsdException w:name="Medium Shading 1 Accent 3" w:semiHidden="0" w:uiPriority="63" w:unhideWhenUsed="0"/>
+    <w:lsdException w:name="Medium Shading 2 Accent 3" w:semiHidden="0" w:uiPriority="64" w:unhideWhenUsed="0"/>
+    <w:lsdException w:name="Medium List 1 Accent 3" w:semiHidden="0" w:uiPriority="65" w:unhideWhenUsed="0"/>
+    <w:lsdException w:name="Medium List 2 Accent 3" w:semiHidden="0" w:uiPriority="66" w:unhideWhenUsed="0"/>
+    <w:lsdException w:name="Medium Grid 1 Accent 3" w:semiHidden="0" w:uiPriority="67" w:unhideWhenUsed="0"/>
+    <w:lsdException w:name="Medium Grid 2 Accent 3" w:semiHidden="0" w:uiPriority="68" w:unhideWhenUsed="0"/>
+    <w:lsdException w:name="Medium Grid 3 Accent 3" w:semiHidden="0" w:uiPriority="69" w:unhideWhenUsed="0"/>
+    <w:lsdException w:name="Dark List Accent 3" w:semiHidden="0" w:uiPriority="70" w:unhideWhenUsed="0"/>
+    <w:lsdException w:name="Colorful Shading Accent 3" w:semiHidden="0" w:uiPriority="71" w:unhideWhenUsed="0"/>
+    <w:lsdException w:name="Colorful List Accent 3" w:semiHidden="0" w:uiPriority="72" w:unhideWhenUsed="0"/>
+    <w:lsdException w:name="Colorful Grid Accent 3" w:semiHidden="0" w:uiPriority="73" w:unhideWhenUsed="0"/>
+    <w:lsdException w:name="Light Shading Accent 4" w:semiHidden="0" w:uiPriority="60" w:unhideWhenUsed="0"/>
+    <w:lsdException w:name="Light List Accent 4" w:semiHidden="0" w:uiPriority="61" w:unhideWhenUsed="0"/>
+    <w:lsdException w:name="Light Grid Accent 4" w:semiHidden="0" w:uiPriority="62" w:unhideWhenUsed="0"/>
+    <w:lsdException w:name="Medium Shading 1 Accent 4" w:semiHidden="0" w:uiPriority="63" w:unhideWhenUsed="0"/>
+    <w:lsdException w:name="Medium Shading 2 Accent 4" w:semiHidden="0" w:uiPriority="64" w:unhideWhenUsed="0"/>
+    <w:lsdException w:name="Medium List 1 Accent 4" w:semiHidden="0" w:uiPriority="65" w:unhideWhenUsed="0"/>
+    <w:lsdException w:name="Medium List 2 Accent 4" w:semiHidden="0" w:uiPriority="66" w:unhideWhenUsed="0"/>
+    <w:lsdException w:name="Medium Grid 1 Accent 4" w:semiHidden="0" w:uiPriority="67" w:unhideWhenUsed="0"/>
+    <w:lsdException w:name="Medium Grid 2 Accent 4" w:semiHidden="0" w:uiPriority="68" w:unhideWhenUsed="0"/>
+    <w:lsdException w:name="Medium Grid 3 Accent 4" w:semiHidden="0" w:uiPriority="69" w:unhideWhenUsed="0"/>
+    <w:lsdException w:name="Dark List Accent 4" w:semiHidden="0" w:uiPriority="70" w:unhideWhenUsed="0"/>
+    <w:lsdException w:name="Colorful Shading Accent 4" w:semiHidden="0" w:uiPriority="71" w:unhideWhenUsed="0"/>
+    <w:lsdException w:name="Colorful List Accent 4" w:semiHidden="0" w:uiPriority="72" w:unhideWhenUsed="0"/>
+    <w:lsdException w:name="Colorful Grid Accent 4" w:semiHidden="0" w:uiPriority="73" w:unhideWhenUsed="0"/>
+    <w:lsdException w:name="Light Shading Accent 5" w:semiHidden="0" w:uiPriority="60" w:unhideWhenUsed="0"/>
+    <w:lsdException w:name="Light List Accent 5" w:semiHidden="0" w:uiPriority="61" w:unhideWhenUsed="0"/>
+    <w:lsdException w:name="Light Grid Accent 5" w:semiHidden="0" w:uiPriority="62" w:unhideWhenUsed="0"/>
+    <w:lsdException w:name="Medium Shading 1 Accent 5" w:semiHidden="0" w:uiPriority="63" w:unhideWhenUsed="0"/>
+    <w:lsdException w:name="Medium Shading 2 Accent 5" w:semiHidden="0" w:uiPriority="64" w:unhideWhenUsed="0"/>
+    <w:lsdException w:name="Medium List 1 Accent 5" w:semiHidden="0" w:uiPriority="65" w:unhideWhenUsed="0"/>
+    <w:lsdException w:name="Medium List 2 Accent 5" w:semiHidden="0" w:uiPriority="66" w:unhideWhenUsed="0"/>
+    <w:lsdException w:name="Medium Grid 1 Accent 5" w:semiHidden="0" w:uiPriority="67" w:unhideWhenUsed="0"/>
+    <w:lsdException w:name="Medium Grid 2 Accent 5" w:semiHidden="0" w:uiPriority="68" w:unhideWhenUsed="0"/>
+    <w:lsdException w:name="Medium Grid 3 Accent 5" w:semiHidden="0" w:uiPriority="69" w:unhideWhenUsed="0"/>
+    <w:lsdException w:name="Dark List Accent 5" w:semiHidden="0" w:uiPriority="70" w:unhideWhenUsed="0"/>
+    <w:lsdException w:name="Colorful Shading Accent 5" w:semiHidden="0" w:uiPriority="71" w:unhideWhenUsed="0"/>
+    <w:lsdException w:name="Colorful List Accent 5" w:semiHidden="0" w:uiPriority="72" w:unhideWhenUsed="0"/>
+    <w:lsdException w:name="Colorful Grid Accent 5" w:semiHidden="0" w:uiPriority="73" w:unhideWhenUsed="0"/>
+    <w:lsdException w:name="Light Shading Accent 6" w:semiHidden="0" w:uiPriority="60" w:unhideWhenUsed="0"/>
+    <w:lsdException w:name="Light List Accent 6" w:semiHidden="0" w:uiPriority="61" w:unhideWhenUsed="0"/>
+    <w:lsdException w:name="Light Grid Accent 6" w:semiHidden="0" w:uiPriority="62" w:unhideWhenUsed="0"/>
+    <w:lsdException w:name="Medium Shading 1 Accent 6" w:semiHidden="0" w:uiPriority="63" w:unhideWhenUsed="0"/>
+    <w:lsdException w:name="Medium Shading 2 Accent 6" w:semiHidden="0" w:uiPriority="64" w:unhideWhenUsed="0"/>
+    <w:lsdException w:name="Medium List 1 Accent 6" w:semiHidden="0" w:uiPriority="65" w:unhideWhenUsed="0"/>
+    <w:lsdException w:name="Medium List 2 Accent 6" w:semiHidden="0" w:uiPriority="66" w:unhideWhenUsed="0"/>
+    <w:lsdException w:name="Medium Grid 1 Accent 6" w:semiHidden="0" w:uiPriority="67" w:unhideWhenUsed="0"/>
+    <w:lsdException w:name="Medium Grid 2 Accent 6" w:semiHidden="0" w:uiPriority="68" w:unhideWhenUsed="0"/>
+    <w:lsdException w:name="Medium Grid 3 Accent 6" w:semiHidden="0" w:uiPriority="69" w:unhideWhenUsed="0"/>
+    <w:lsdException w:name="Dark List Accent 6" w:semiHidden="0" w:uiPriority="70" w:unhideWhenUsed="0"/>
+    <w:lsdException w:name="Colorful Shading Accent 6" w:semiHidden="0" w:uiPriority="71" w:unhideWhenUsed="0"/>
+    <w:lsdException w:name="Colorful List Accent 6" w:semiHidden="0" w:uiPriority="72" w:unhideWhenUsed="0"/>
+    <w:lsdException w:name="Colorful Grid Accent 6" w:semiHidden="0" w:uiPriority="73" w:unhideWhenUsed="0"/>
+    <w:lsdException w:name="Subtle Emphasis" w:semiHidden="0" w:uiPriority="19" w:unhideWhenUsed="0" w:qFormat="1"/>
+    <w:lsdException w:name="Intense Emphasis" w:semiHidden="0" w:uiPriority="21" w:unhideWhenUsed="0" w:qFormat="1"/>
+    <w:lsdException w:name="Subtle Reference" w:semiHidden="0" w:uiPriority="31" w:unhideWhenUsed="0" w:qFormat="1"/>
+    <w:lsdException w:name="Intense Reference" w:semiHidden="0" w:uiPriority="32" w:unhideWhenUsed="0" w:qFormat="1"/>
+    <w:lsdException w:name="Book Title" w:semiHidden="0" w:uiPriority="33" w:unhideWhenUsed="0" w:qFormat="1"/>
+    <w:lsdException w:name="Bibliography" w:uiPriority="37"/>
+    <w:lsdException w:name="TOC Heading" w:uiPriority="39" w:qFormat="1"/>
+  </w:latentStyles>
+  <w:style w:type="paragraph" w:default="1" w:styleId="Normal">
+    <w:name w:val="Normal"/>
+    <w:qFormat/>
+  </w:style>
+  <w:style w:type="character" w:default="1" w:styleId="Policepardfaut">
+    <w:name w:val="Default Paragraph Font"/>
+    <w:uiPriority w:val="1"/>
+    <w:semiHidden/>
+    <w:unhideWhenUsed/>
+  </w:style>
+  <w:style w:type="table" w:default="1" w:styleId="TableauNormal">
+    <w:name w:val="Normal Table"/>
+    <w:uiPriority w:val="99"/>
+    <w:semiHidden/>
+    <w:unhideWhenUsed/>
+    <w:tblPr>
+      <w:tblInd w:w="0" w:type="dxa"/>
+      <w:tblCellMar>
+        <w:top w:w="0" w:type="dxa"/>
+        <w:left w:w="108" w:type="dxa"/>
+        <w:bottom w:w="0" w:type="dxa"/>
+        <w:right w:w="108" w:type="dxa"/>
+      </w:tblCellMar>
+    </w:tblPr>
+  </w:style>
+  <w:style w:type="numbering" w:default="1" w:styleId="Aucuneliste">
+    <w:name w:val="No List"/>
+    <w:uiPriority w:val="99"/>
+    <w:semiHidden/>
+    <w:unhideWhenUsed/>
+  </w:style>
+  <w:style w:type="character" w:styleId="Textedelespacerserv">
+    <w:name w:val="Placeholder Text"/>
+    <w:basedOn w:val="Policepardfaut"/>
+    <w:uiPriority w:val="99"/>
+    <w:semiHidden/>
+    <w:rsid w:val="000544A6"/>
+    <w:rPr>
+      <w:color w:val="808080"/>
+    </w:rPr>
+  </w:style>
+</w:styles>
+</file>
+
+<file path=word/glossary/stylesWithEffects.xml><?xml version="1.0" encoding="utf-8"?>
+<w:styles xmlns:wpc="http://schemas.microsoft.com/office/word/2010/wordprocessingCanvas" xmlns:mc="http://schemas.openxmlformats.org/markup-compatibility/2006" xmlns:o="urn:schemas-microsoft-com:office:office" xmlns:r="http://schemas.openxmlformats.org/officeDocument/2006/relationships" xmlns:m="http://schemas.openxmlformats.org/officeDocument/2006/math" xmlns:v="urn:schemas-microsoft-com:vml" xmlns:wp14="http://schemas.microsoft.com/office/word/2010/wordprocessingDrawing" xmlns:wp="http://schemas.openxmlformats.org/drawingml/2006/wordprocessingDrawing" xmlns:w10="urn:schemas-microsoft-com:office:word" xmlns:w="http://schemas.openxmlformats.org/wordprocessingml/2006/main" xmlns:w14="http://schemas.microsoft.com/office/word/2010/wordml" xmlns:wpg="http://schemas.microsoft.com/office/word/2010/wordprocessingGroup" xmlns:wpi="http://schemas.microsoft.com/office/word/2010/wordprocessingInk" xmlns:wne="http://schemas.microsoft.com/office/word/2006/wordml" xmlns:wps="http://schemas.microsoft.com/office/word/2010/wordprocessingShape" mc:Ignorable="w14 wp14">
+  <w:docDefaults>
+    <w:rPrDefault>
+      <w:rPr>
+        <w:rFonts w:asciiTheme="minorHAnsi" w:eastAsiaTheme="minorEastAsia" w:hAnsiTheme="minorHAnsi" w:cstheme="minorBidi"/>
+        <w:sz w:val="22"/>
+        <w:szCs w:val="22"/>
+        <w:lang w:val="en-GB" w:eastAsia="en-GB" w:bidi="ar-SA"/>
+      </w:rPr>
+    </w:rPrDefault>
+    <w:pPrDefault>
+      <w:pPr>
+        <w:spacing w:after="200" w:line="276" w:lineRule="auto"/>
+      </w:pPr>
+    </w:pPrDefault>
+  </w:docDefaults>
+  <w:latentStyles w:defLockedState="0" w:defUIPriority="99" w:defSemiHidden="1" w:defUnhideWhenUsed="1" w:defQFormat="0" w:count="267">
+    <w:lsdException w:name="Normal" w:semiHidden="0" w:uiPriority="0" w:unhideWhenUsed="0" w:qFormat="1"/>
+    <w:lsdException w:name="heading 1" w:semiHidden="0" w:uiPriority="9" w:unhideWhenUsed="0" w:qFormat="1"/>
+    <w:lsdException w:name="heading 2" w:uiPriority="9" w:qFormat="1"/>
+    <w:lsdException w:name="heading 3" w:uiPriority="9" w:qFormat="1"/>
+    <w:lsdException w:name="heading 4" w:uiPriority="9" w:qFormat="1"/>
+    <w:lsdException w:name="heading 5" w:uiPriority="9" w:qFormat="1"/>
+    <w:lsdException w:name="heading 6" w:uiPriority="9" w:qFormat="1"/>
+    <w:lsdException w:name="heading 7" w:uiPriority="9" w:qFormat="1"/>
+    <w:lsdException w:name="heading 8" w:uiPriority="9" w:qFormat="1"/>
+    <w:lsdException w:name="heading 9" w:uiPriority="9" w:qFormat="1"/>
+    <w:lsdException w:name="toc 1" w:uiPriority="39"/>
+    <w:lsdException w:name="toc 2" w:uiPriority="39"/>
+    <w:lsdException w:name="toc 3" w:uiPriority="39"/>
+    <w:lsdException w:name="toc 4" w:uiPriority="39"/>
+    <w:lsdException w:name="toc 5" w:uiPriority="39"/>
+    <w:lsdException w:name="toc 6" w:uiPriority="39"/>
+    <w:lsdException w:name="toc 7" w:uiPriority="39"/>
+    <w:lsdException w:name="toc 8" w:uiPriority="39"/>
+    <w:lsdException w:name="toc 9" w:uiPriority="39"/>
+    <w:lsdException w:name="caption" w:uiPriority="35" w:qFormat="1"/>
+    <w:lsdException w:name="Title" w:semiHidden="0" w:uiPriority="10" w:unhideWhenUsed="0" w:qFormat="1"/>
+    <w:lsdException w:name="Default Paragraph Font" w:uiPriority="1"/>
+    <w:lsdException w:name="Subtitle" w:semiHidden="0" w:uiPriority="11" w:unhideWhenUsed="0" w:qFormat="1"/>
+    <w:lsdException w:name="Strong" w:semiHidden="0" w:uiPriority="22" w:unhideWhenUsed="0" w:qFormat="1"/>
+    <w:lsdException w:name="Emphasis" w:semiHidden="0" w:uiPriority="20" w:unhideWhenUsed="0" w:qFormat="1"/>
+    <w:lsdException w:name="Table Grid" w:semiHidden="0" w:uiPriority="59" w:unhideWhenUsed="0"/>
+    <w:lsdException w:name="Placeholder Text" w:unhideWhenUsed="0"/>
+    <w:lsdException w:name="No Spacing" w:semiHidden="0" w:uiPriority="1" w:unhideWhenUsed="0" w:qFormat="1"/>
+    <w:lsdException w:name="Light Shading" w:semiHidden="0" w:uiPriority="60" w:unhideWhenUsed="0"/>
+    <w:lsdException w:name="Light List" w:semiHidden="0" w:uiPriority="61" w:unhideWhenUsed="0"/>
+    <w:lsdException w:name="Light Grid" w:semiHidden="0" w:uiPriority="62" w:unhideWhenUsed="0"/>
+    <w:lsdException w:name="Medium Shading 1" w:semiHidden="0" w:uiPriority="63" w:unhideWhenUsed="0"/>
+    <w:lsdException w:name="Medium Shading 2" w:semiHidden="0" w:uiPriority="64" w:unhideWhenUsed="0"/>
+    <w:lsdException w:name="Medium List 1" w:semiHidden="0" w:uiPriority="65" w:unhideWhenUsed="0"/>
+    <w:lsdException w:name="Medium List 2" w:semiHidden="0" w:uiPriority="66" w:unhideWhenUsed="0"/>
+    <w:lsdException w:name="Medium Grid 1" w:semiHidden="0" w:uiPriority="67" w:unhideWhenUsed="0"/>
+    <w:lsdException w:name="Medium Grid 2" w:semiHidden="0" w:uiPriority="68" w:unhideWhenUsed="0"/>
+    <w:lsdException w:name="Medium Grid 3" w:semiHidden="0" w:uiPriority="69" w:unhideWhenUsed="0"/>
+    <w:lsdException w:name="Dark List" w:semiHidden="0" w:uiPriority="70" w:unhideWhenUsed="0"/>
+    <w:lsdException w:name="Colorful Shading" w:semiHidden="0" w:uiPriority="71" w:unhideWhenUsed="0"/>
+    <w:lsdException w:name="Colorful List" w:semiHidden="0" w:uiPriority="72" w:unhideWhenUsed="0"/>
+    <w:lsdException w:name="Colorful Grid" w:semiHidden="0" w:uiPriority="73" w:unhideWhenUsed="0"/>
+    <w:lsdException w:name="Light Shading Accent 1" w:semiHidden="0" w:uiPriority="60" w:unhideWhenUsed="0"/>
+    <w:lsdException w:name="Light List Accent 1" w:semiHidden="0" w:uiPriority="61" w:unhideWhenUsed="0"/>
+    <w:lsdException w:name="Light Grid Accent 1" w:semiHidden="0" w:uiPriority="62" w:unhideWhenUsed="0"/>
+    <w:lsdException w:name="Medium Shading 1 Accent 1" w:semiHidden="0" w:uiPriority="63" w:unhideWhenUsed="0"/>
+    <w:lsdException w:name="Medium Shading 2 Accent 1" w:semiHidden="0" w:uiPriority="64" w:unhideWhenUsed="0"/>
+    <w:lsdException w:name="Medium List 1 Accent 1" w:semiHidden="0" w:uiPriority="65" w:unhideWhenUsed="0"/>
+    <w:lsdException w:name="Revision" w:unhideWhenUsed="0"/>
+    <w:lsdException w:name="List Paragraph" w:semiHidden="0" w:uiPriority="34" w:unhideWhenUsed="0" w:qFormat="1"/>
+    <w:lsdException w:name="Quote" w:semiHidden="0" w:uiPriority="29" w:unhideWhenUsed="0" w:qFormat="1"/>
+    <w:lsdException w:name="Intense Quote" w:semiHidden="0" w:uiPriority="30" w:unhideWhenUsed="0" w:qFormat="1"/>
+    <w:lsdException w:name="Medium List 2 Accent 1" w:semiHidden="0" w:uiPriority="66" w:unhideWhenUsed="0"/>
+    <w:lsdException w:name="Medium Grid 1 Accent 1" w:semiHidden="0" w:uiPriority="67" w:unhideWhenUsed="0"/>
+    <w:lsdException w:name="Medium Grid 2 Accent 1" w:semiHidden="0" w:uiPriority="68" w:unhideWhenUsed="0"/>
+    <w:lsdException w:name="Medium Grid 3 Accent 1" w:semiHidden="0" w:uiPriority="69" w:unhideWhenUsed="0"/>
+    <w:lsdException w:name="Dark List Accent 1" w:semiHidden="0" w:uiPriority="70" w:unhideWhenUsed="0"/>
+    <w:lsdException w:name="Colorful Shading Accent 1" w:semiHidden="0" w:uiPriority="71" w:unhideWhenUsed="0"/>
+    <w:lsdException w:name="Colorful List Accent 1" w:semiHidden="0" w:uiPriority="72" w:unhideWhenUsed="0"/>
+    <w:lsdException w:name="Colorful Grid Accent 1" w:semiHidden="0" w:uiPriority="73" w:unhideWhenUsed="0"/>
+    <w:lsdException w:name="Light Shading Accent 2" w:semiHidden="0" w:uiPriority="60" w:unhideWhenUsed="0"/>
+    <w:lsdException w:name="Light List Accent 2" w:semiHidden="0" w:uiPriority="61" w:unhideWhenUsed="0"/>
+    <w:lsdException w:name="Light Grid Accent 2" w:semiHidden="0" w:uiPriority="62" w:unhideWhenUsed="0"/>
+    <w:lsdException w:name="Medium Shading 1 Accent 2" w:semiHidden="0" w:uiPriority="63" w:unhideWhenUsed="0"/>
+    <w:lsdException w:name="Medium Shading 2 Accent 2" w:semiHidden="0" w:uiPriority="64" w:unhideWhenUsed="0"/>
+    <w:lsdException w:name="Medium List 1 Accent 2" w:semiHidden="0" w:uiPriority="65" w:unhideWhenUsed="0"/>
+    <w:lsdException w:name="Medium List 2 Accent 2" w:semiHidden="0" w:uiPriority="66" w:unhideWhenUsed="0"/>
+    <w:lsdException w:name="Medium Grid 1 Accent 2" w:semiHidden="0" w:uiPriority="67" w:unhideWhenUsed="0"/>
+    <w:lsdException w:name="Medium Grid 2 Accent 2" w:semiHidden="0" w:uiPriority="68" w:unhideWhenUsed="0"/>
+    <w:lsdException w:name="Medium Grid 3 Accent 2" w:semiHidden="0" w:uiPriority="69" w:unhideWhenUsed="0"/>
+    <w:lsdException w:name="Dark List Accent 2" w:semiHidden="0" w:uiPriority="70" w:unhideWhenUsed="0"/>
+    <w:lsdException w:name="Colorful Shading Accent 2" w:semiHidden="0" w:uiPriority="71" w:unhideWhenUsed="0"/>
+    <w:lsdException w:name="Colorful List Accent 2" w:semiHidden="0" w:uiPriority="72" w:unhideWhenUsed="0"/>
+    <w:lsdException w:name="Colorful Grid Accent 2" w:semiHidden="0" w:uiPriority="73" w:unhideWhenUsed="0"/>
+    <w:lsdException w:name="Light Shading Accent 3" w:semiHidden="0" w:uiPriority="60" w:unhideWhenUsed="0"/>
+    <w:lsdException w:name="Light List Accent 3" w:semiHidden="0" w:uiPriority="61" w:unhideWhenUsed="0"/>
+    <w:lsdException w:name="Light Grid Accent 3" w:semiHidden="0" w:uiPriority="62" w:unhideWhenUsed="0"/>
+    <w:lsdException w:name="Medium Shading 1 Accent 3" w:semiHidden="0" w:uiPriority="63" w:unhideWhenUsed="0"/>
+    <w:lsdException w:name="Medium Shading 2 Accent 3" w:semiHidden="0" w:uiPriority="64" w:unhideWhenUsed="0"/>
+    <w:lsdException w:name="Medium List 1 Accent 3" w:semiHidden="0" w:uiPriority="65" w:unhideWhenUsed="0"/>
+    <w:lsdException w:name="Medium List 2 Accent 3" w:semiHidden="0" w:uiPriority="66" w:unhideWhenUsed="0"/>
+    <w:lsdException w:name="Medium Grid 1 Accent 3" w:semiHidden="0" w:uiPriority="67" w:unhideWhenUsed="0"/>
+    <w:lsdException w:name="Medium Grid 2 Accent 3" w:semiHidden="0" w:uiPriority="68" w:unhideWhenUsed="0"/>
+    <w:lsdException w:name="Medium Grid 3 Accent 3" w:semiHidden="0" w:uiPriority="69" w:unhideWhenUsed="0"/>
+    <w:lsdException w:name="Dark List Accent 3" w:semiHidden="0" w:uiPriority="70" w:unhideWhenUsed="0"/>
+    <w:lsdException w:name="Colorful Shading Accent 3" w:semiHidden="0" w:uiPriority="71" w:unhideWhenUsed="0"/>
+    <w:lsdException w:name="Colorful List Accent 3" w:semiHidden="0" w:uiPriority="72" w:unhideWhenUsed="0"/>
+    <w:lsdException w:name="Colorful Grid Accent 3" w:semiHidden="0" w:uiPriority="73" w:unhideWhenUsed="0"/>
+    <w:lsdException w:name="Light Shading Accent 4" w:semiHidden="0" w:uiPriority="60" w:unhideWhenUsed="0"/>
+    <w:lsdException w:name="Light List Accent 4" w:semiHidden="0" w:uiPriority="61" w:unhideWhenUsed="0"/>
+    <w:lsdException w:name="Light Grid Accent 4" w:semiHidden="0" w:uiPriority="62" w:unhideWhenUsed="0"/>
+    <w:lsdException w:name="Medium Shading 1 Accent 4" w:semiHidden="0" w:uiPriority="63" w:unhideWhenUsed="0"/>
+    <w:lsdException w:name="Medium Shading 2 Accent 4" w:semiHidden="0" w:uiPriority="64" w:unhideWhenUsed="0"/>
+    <w:lsdException w:name="Medium List 1 Accent 4" w:semiHidden="0" w:uiPriority="65" w:unhideWhenUsed="0"/>
+    <w:lsdException w:name="Medium List 2 Accent 4" w:semiHidden="0" w:uiPriority="66" w:unhideWhenUsed="0"/>
+    <w:lsdException w:name="Medium Grid 1 Accent 4" w:semiHidden="0" w:uiPriority="67" w:unhideWhenUsed="0"/>
+    <w:lsdException w:name="Medium Grid 2 Accent 4" w:semiHidden="0" w:uiPriority="68" w:unhideWhenUsed="0"/>
+    <w:lsdException w:name="Medium Grid 3 Accent 4" w:semiHidden="0" w:uiPriority="69" w:unhideWhenUsed="0"/>
+    <w:lsdException w:name="Dark List Accent 4" w:semiHidden="0" w:uiPriority="70" w:unhideWhenUsed="0"/>
+    <w:lsdException w:name="Colorful Shading Accent 4" w:semiHidden="0" w:uiPriority="71" w:unhideWhenUsed="0"/>
+    <w:lsdException w:name="Colorful List Accent 4" w:semiHidden="0" w:uiPriority="72" w:unhideWhenUsed="0"/>
+    <w:lsdException w:name="Colorful Grid Accent 4" w:semiHidden="0" w:uiPriority="73" w:unhideWhenUsed="0"/>
+    <w:lsdException w:name="Light Shading Accent 5" w:semiHidden="0" w:uiPriority="60" w:unhideWhenUsed="0"/>
+    <w:lsdException w:name="Light List Accent 5" w:semiHidden="0" w:uiPriority="61" w:unhideWhenUsed="0"/>
+    <w:lsdException w:name="Light Grid Accent 5" w:semiHidden="0" w:uiPriority="62" w:unhideWhenUsed="0"/>
+    <w:lsdException w:name="Medium Shading 1 Accent 5" w:semiHidden="0" w:uiPriority="63" w:unhideWhenUsed="0"/>
+    <w:lsdException w:name="Medium Shading 2 Accent 5" w:semiHidden="0" w:uiPriority="64" w:unhideWhenUsed="0"/>
+    <w:lsdException w:name="Medium List 1 Accent 5" w:semiHidden="0" w:uiPriority="65" w:unhideWhenUsed="0"/>
+    <w:lsdException w:name="Medium List 2 Accent 5" w:semiHidden="0" w:uiPriority="66" w:unhideWhenUsed="0"/>
+    <w:lsdException w:name="Medium Grid 1 Accent 5" w:semiHidden="0" w:uiPriority="67" w:unhideWhenUsed="0"/>
+    <w:lsdException w:name="Medium Grid 2 Accent 5" w:semiHidden="0" w:uiPriority="68" w:unhideWhenUsed="0"/>
+    <w:lsdException w:name="Medium Grid 3 Accent 5" w:semiHidden="0" w:uiPriority="69" w:unhideWhenUsed="0"/>
+    <w:lsdException w:name="Dark List Accent 5" w:semiHidden="0" w:uiPriority="70" w:unhideWhenUsed="0"/>
+    <w:lsdException w:name="Colorful Shading Accent 5" w:semiHidden="0" w:uiPriority="71" w:unhideWhenUsed="0"/>
+    <w:lsdException w:name="Colorful List Accent 5" w:semiHidden="0" w:uiPriority="72" w:unhideWhenUsed="0"/>
+    <w:lsdException w:name="Colorful Grid Accent 5" w:semiHidden="0" w:uiPriority="73" w:unhideWhenUsed="0"/>
+    <w:lsdException w:name="Light Shading Accent 6" w:semiHidden="0" w:uiPriority="60" w:unhideWhenUsed="0"/>
+    <w:lsdException w:name="Light List Accent 6" w:semiHidden="0" w:uiPriority="61" w:unhideWhenUsed="0"/>
+    <w:lsdException w:name="Light Grid Accent 6" w:semiHidden="0" w:uiPriority="62" w:unhideWhenUsed="0"/>
+    <w:lsdException w:name="Medium Shading 1 Accent 6" w:semiHidden="0" w:uiPriority="63" w:unhideWhenUsed="0"/>
+    <w:lsdException w:name="Medium Shading 2 Accent 6" w:semiHidden="0" w:uiPriority="64" w:unhideWhenUsed="0"/>
+    <w:lsdException w:name="Medium List 1 Accent 6" w:semiHidden="0" w:uiPriority="65" w:unhideWhenUsed="0"/>
+    <w:lsdException w:name="Medium List 2 Accent 6" w:semiHidden="0" w:uiPriority="66" w:unhideWhenUsed="0"/>
+    <w:lsdException w:name="Medium Grid 1 Accent 6" w:semiHidden="0" w:uiPriority="67" w:unhideWhenUsed="0"/>
+    <w:lsdException w:name="Medium Grid 2 Accent 6" w:semiHidden="0" w:uiPriority="68" w:unhideWhenUsed="0"/>
+    <w:lsdException w:name="Medium Grid 3 Accent 6" w:semiHidden="0" w:uiPriority="69" w:unhideWhenUsed="0"/>
+    <w:lsdException w:name="Dark List Accent 6" w:semiHidden="0" w:uiPriority="70" w:unhideWhenUsed="0"/>
+    <w:lsdException w:name="Colorful Shading Accent 6" w:semiHidden="0" w:uiPriority="71" w:unhideWhenUsed="0"/>
+    <w:lsdException w:name="Colorful List Accent 6" w:semiHidden="0" w:uiPriority="72" w:unhideWhenUsed="0"/>
+    <w:lsdException w:name="Colorful Grid Accent 6" w:semiHidden="0" w:uiPriority="73" w:unhideWhenUsed="0"/>
+    <w:lsdException w:name="Subtle Emphasis" w:semiHidden="0" w:uiPriority="19" w:unhideWhenUsed="0" w:qFormat="1"/>
+    <w:lsdException w:name="Intense Emphasis" w:semiHidden="0" w:uiPriority="21" w:unhideWhenUsed="0" w:qFormat="1"/>
+    <w:lsdException w:name="Subtle Reference" w:semiHidden="0" w:uiPriority="31" w:unhideWhenUsed="0" w:qFormat="1"/>
+    <w:lsdException w:name="Intense Reference" w:semiHidden="0" w:uiPriority="32" w:unhideWhenUsed="0" w:qFormat="1"/>
+    <w:lsdException w:name="Book Title" w:semiHidden="0" w:uiPriority="33" w:unhideWhenUsed="0" w:qFormat="1"/>
+    <w:lsdException w:name="Bibliography" w:uiPriority="37"/>
+    <w:lsdException w:name="TOC Heading" w:uiPriority="39" w:qFormat="1"/>
+  </w:latentStyles>
+  <w:style w:type="paragraph" w:default="1" w:styleId="Normal">
+    <w:name w:val="Normal"/>
+    <w:qFormat/>
+  </w:style>
+  <w:style w:type="character" w:default="1" w:styleId="Policepardfaut">
+    <w:name w:val="Default Paragraph Font"/>
+    <w:uiPriority w:val="1"/>
+    <w:semiHidden/>
+    <w:unhideWhenUsed/>
+  </w:style>
+  <w:style w:type="table" w:default="1" w:styleId="TableauNormal">
+    <w:name w:val="Normal Table"/>
+    <w:uiPriority w:val="99"/>
+    <w:semiHidden/>
+    <w:unhideWhenUsed/>
+    <w:tblPr>
+      <w:tblInd w:w="0" w:type="dxa"/>
+      <w:tblCellMar>
+        <w:top w:w="0" w:type="dxa"/>
+        <w:left w:w="108" w:type="dxa"/>
+        <w:bottom w:w="0" w:type="dxa"/>
+        <w:right w:w="108" w:type="dxa"/>
+      </w:tblCellMar>
+    </w:tblPr>
+  </w:style>
+  <w:style w:type="numbering" w:default="1" w:styleId="Aucuneliste">
+    <w:name w:val="No List"/>
+    <w:uiPriority w:val="99"/>
+    <w:semiHidden/>
+    <w:unhideWhenUsed/>
+  </w:style>
+  <w:style w:type="character" w:styleId="Textedelespacerserv">
+    <w:name w:val="Placeholder Text"/>
+    <w:basedOn w:val="Policepardfaut"/>
+    <w:uiPriority w:val="99"/>
+    <w:semiHidden/>
+    <w:rsid w:val="000544A6"/>
+    <w:rPr>
+      <w:color w:val="808080"/>
+    </w:rPr>
+  </w:style>
+</w:styles>
+</file>
+
+<file path=word/glossary/webSettings.xml><?xml version="1.0" encoding="utf-8"?>
+<w:webSettings xmlns:mc="http://schemas.openxmlformats.org/markup-compatibility/2006" xmlns:r="http://schemas.openxmlformats.org/officeDocument/2006/relationships" xmlns:w="http://schemas.openxmlformats.org/wordprocessingml/2006/main" xmlns:w14="http://schemas.microsoft.com/office/word/2010/wordml" mc:Ignorable="w14">
+  <w:optimizeForBrowser/>
+  <w:allowPNG/>
+</w:webSettings>
+</file>
+
 <file path=word/theme/theme1.xml><?xml version="1.0" encoding="utf-8"?>
 <a:theme xmlns:a="http://schemas.openxmlformats.org/drawingml/2006/main" name="Thème Office">
   <a:themeElements>
@@ -21288,7 +22621,7 @@
   <a:extraClrSchemeLst/>
   <a:extLst>
     <a:ext uri="{05A4C25C-085E-4340-85A3-A5531E510DB2}">
-      <thm15:themeFamily xmlns:thm15="http://schemas.microsoft.com/office/thememl/2012/main" xmlns="" name="Office Theme" id="{62F939B6-93AF-4DB8-9C6B-D6C7DFDC589F}" vid="{4A3C46E8-61CC-4603-A589-7422A47A8E4A}"/>
+      <thm15:themeFamily xmlns="" xmlns:thm15="http://schemas.microsoft.com/office/thememl/2012/main" name="Office Theme" id="{62F939B6-93AF-4DB8-9C6B-D6C7DFDC589F}" vid="{4A3C46E8-61CC-4603-A589-7422A47A8E4A}"/>
     </a:ext>
   </a:extLst>
 </a:theme>
@@ -21299,7 +22632,7 @@
 </file>
 
 <file path=customXml/itemProps1.xml><?xml version="1.0" encoding="utf-8"?>
-<ds:datastoreItem xmlns:ds="http://schemas.openxmlformats.org/officeDocument/2006/customXml" ds:itemID="{69FA6DEA-AC85-47D1-A110-35A30DFBDB19}">
+<ds:datastoreItem xmlns:ds="http://schemas.openxmlformats.org/officeDocument/2006/customXml" ds:itemID="{948D8227-9A1A-4BCB-8823-C29CEBD8CAF1}">
   <ds:schemaRefs>
     <ds:schemaRef ds:uri="http://schemas.openxmlformats.org/officeDocument/2006/bibliography"/>
   </ds:schemaRefs>

</xml_diff>

<commit_message>
Addition of the Filter module and its test
</commit_message>
<xml_diff>
--- a/Information/script for equations.docx
+++ b/Information/script for equations.docx
@@ -19,6 +19,7 @@
           <w:docPartUnique/>
         </w:docPartObj>
       </w:sdtPr>
+      <w:sdtEndPr/>
       <w:sdtContent>
         <w:p>
           <w:pPr>
@@ -2594,23 +2595,7 @@
                 <w:noProof/>
                 <w:lang w:val="fr-FR"/>
               </w:rPr>
-              <w:t>Horizo</w:t>
-            </w:r>
-            <w:r>
-              <w:rPr>
-                <w:rStyle w:val="Lienhypertexte"/>
-                <w:noProof/>
-                <w:lang w:val="fr-FR"/>
-              </w:rPr>
-              <w:t>n</w:t>
-            </w:r>
-            <w:r>
-              <w:rPr>
-                <w:rStyle w:val="Lienhypertexte"/>
-                <w:noProof/>
-                <w:lang w:val="fr-FR"/>
-              </w:rPr>
-              <w:t>talOpening</w:t>
+              <w:t>HorizontalOpening</w:t>
             </w:r>
             <w:r>
               <w:rPr>
@@ -8935,13 +8920,7 @@
             <w:rPr>
               <w:rFonts w:ascii="Cambria Math" w:eastAsiaTheme="minorEastAsia" w:hAnsi="Cambria Math"/>
             </w:rPr>
-            <m:t>dx= B</m:t>
-          </m:r>
-          <m:r>
-            <w:rPr>
-              <w:rFonts w:ascii="Cambria Math" w:eastAsiaTheme="minorEastAsia" w:hAnsi="Cambria Math"/>
-            </w:rPr>
-            <m:t>iot×</m:t>
+            <m:t>dx= Biot×</m:t>
           </m:r>
           <m:f>
             <m:fPr>
@@ -12372,19 +12351,7 @@
             <w:rPr>
               <w:rFonts w:ascii="Cambria Math" w:hAnsi="Cambria Math"/>
             </w:rPr>
-            <m:t xml:space="preserve">p=d×r×T  and  </m:t>
-          </m:r>
-          <m:r>
-            <w:rPr>
-              <w:rFonts w:ascii="Cambria Math" w:hAnsi="Cambria Math"/>
-            </w:rPr>
-            <m:t>p</m:t>
-          </m:r>
-          <m:r>
-            <w:rPr>
-              <w:rFonts w:ascii="Cambria Math" w:hAnsi="Cambria Math"/>
-            </w:rPr>
-            <m:t>×</m:t>
+            <m:t>p=d×r×T  and  p×</m:t>
           </m:r>
           <m:sSup>
             <m:sSupPr>
@@ -12417,25 +12384,7 @@
             <w:rPr>
               <w:rFonts w:ascii="Cambria Math" w:hAnsi="Cambria Math"/>
             </w:rPr>
-            <m:t>=</m:t>
-          </m:r>
-          <m:r>
-            <w:rPr>
-              <w:rFonts w:ascii="Cambria Math" w:hAnsi="Cambria Math"/>
-            </w:rPr>
-            <m:t>constant</m:t>
-          </m:r>
-          <m:r>
-            <w:rPr>
-              <w:rFonts w:ascii="Cambria Math" w:hAnsi="Cambria Math"/>
-            </w:rPr>
-            <m:t xml:space="preserve"> </m:t>
-          </m:r>
-          <m:r>
-            <w:rPr>
-              <w:rFonts w:ascii="Cambria Math" w:hAnsi="Cambria Math"/>
-            </w:rPr>
-            <m:t xml:space="preserve"> </m:t>
+            <m:t xml:space="preserve">=constant  </m:t>
           </m:r>
         </m:oMath>
       </m:oMathPara>
@@ -12831,19 +12780,7 @@
             <w:rPr>
               <w:rFonts w:ascii="Cambria Math" w:hAnsi="Cambria Math"/>
             </w:rPr>
-            <m:t>Vel</m:t>
-          </m:r>
-          <m:r>
-            <w:rPr>
-              <w:rFonts w:ascii="Cambria Math" w:hAnsi="Cambria Math"/>
-            </w:rPr>
-            <m:t>=</m:t>
-          </m:r>
-          <m:r>
-            <w:rPr>
-              <w:rFonts w:ascii="Cambria Math" w:hAnsi="Cambria Math"/>
-            </w:rPr>
-            <m:t>M×c</m:t>
+            <m:t>Vel=M×c</m:t>
           </m:r>
         </m:oMath>
       </m:oMathPara>
@@ -12987,24 +12924,301 @@
             <w:rPr>
               <w:rFonts w:ascii="Cambria Math" w:eastAsiaTheme="minorEastAsia" w:hAnsi="Cambria Math"/>
             </w:rPr>
-            <m:t>m_flow=</m:t>
-          </m:r>
-          <m:r>
-            <w:rPr>
-              <w:rFonts w:ascii="Cambria Math" w:eastAsiaTheme="minorEastAsia" w:hAnsi="Cambria Math"/>
-            </w:rPr>
-            <m:t>d×Vel×A</m:t>
-          </m:r>
-          <m:r>
-            <w:rPr>
-              <w:rFonts w:ascii="Cambria Math" w:eastAsiaTheme="minorEastAsia" w:hAnsi="Cambria Math"/>
-            </w:rPr>
-            <m:t>×Cd</m:t>
-          </m:r>
+            <m:t>m_flow=d×Vel×A×Cd</m:t>
+          </m:r>
+        </m:oMath>
+      </m:oMathPara>
+    </w:p>
+    <w:p>
+      <w:pPr>
+        <w:rPr>
+          <w:lang w:val="fr-FR"/>
+        </w:rPr>
+      </w:pPr>
+    </w:p>
+    <w:p>
+      <w:pPr>
+        <w:pStyle w:val="Titre3"/>
+        <w:rPr>
+          <w:lang w:val="fr-FR"/>
+        </w:rPr>
+      </w:pPr>
+      <w:proofErr w:type="spellStart"/>
+      <w:r>
+        <w:rPr>
+          <w:lang w:val="fr-FR"/>
+        </w:rPr>
+        <w:t>Filters</w:t>
+      </w:r>
+      <w:proofErr w:type="spellEnd"/>
+    </w:p>
+    <w:p>
+      <w:pPr>
+        <w:rPr>
+          <w:lang w:val="fr-FR"/>
+        </w:rPr>
+      </w:pPr>
+    </w:p>
+    <w:p>
+      <w:pPr>
+        <w:rPr>
+          <w:rFonts w:eastAsiaTheme="minorEastAsia"/>
+        </w:rPr>
+      </w:pPr>
+      <m:oMathPara>
+        <m:oMath>
+          <m:r>
+            <w:rPr>
+              <w:rFonts w:ascii="Cambria Math" w:hAnsi="Cambria Math"/>
+            </w:rPr>
+            <m:t>V</m:t>
+          </m:r>
+          <m:r>
+            <w:rPr>
+              <w:rFonts w:ascii="Cambria Math" w:hAnsi="Cambria Math"/>
+            </w:rPr>
+            <m:t>el= -</m:t>
+          </m:r>
+          <m:f>
+            <m:fPr>
+              <m:ctrlPr>
+                <w:rPr>
+                  <w:rFonts w:ascii="Cambria Math" w:hAnsi="Cambria Math"/>
+                  <w:i/>
+                </w:rPr>
+              </m:ctrlPr>
+            </m:fPr>
+            <m:num>
+              <m:r>
+                <w:rPr>
+                  <w:rFonts w:ascii="Cambria Math" w:hAnsi="Cambria Math"/>
+                </w:rPr>
+                <m:t>k</m:t>
+              </m:r>
+            </m:num>
+            <m:den>
+              <m:r>
+                <w:rPr>
+                  <w:rFonts w:ascii="Cambria Math" w:hAnsi="Cambria Math"/>
+                </w:rPr>
+                <m:t>μ</m:t>
+              </m:r>
+            </m:den>
+          </m:f>
+          <m:r>
+            <m:rPr>
+              <m:sty m:val="p"/>
+            </m:rPr>
+            <w:rPr>
+              <w:rFonts w:ascii="Cambria Math" w:hAnsi="Cambria Math"/>
+            </w:rPr>
+            <m:t>×</m:t>
+          </m:r>
+          <m:r>
+            <m:rPr>
+              <m:sty m:val="p"/>
+            </m:rPr>
+            <w:rPr>
+              <w:rFonts w:ascii="Cambria Math" w:hAnsi="Cambria Math"/>
+            </w:rPr>
+            <m:t>∇</m:t>
+          </m:r>
+          <m:r>
+            <w:rPr>
+              <w:rFonts w:ascii="Cambria Math" w:hAnsi="Cambria Math"/>
+            </w:rPr>
+            <m:t>p    local form</m:t>
+          </m:r>
+        </m:oMath>
+      </m:oMathPara>
+    </w:p>
+    <w:p>
+      <w:pPr>
+        <w:rPr>
+          <w:rFonts w:eastAsiaTheme="minorEastAsia"/>
+        </w:rPr>
+      </w:pPr>
+      <m:oMathPara>
+        <m:oMath>
+          <m:r>
+            <w:rPr>
+              <w:rFonts w:ascii="Cambria Math" w:hAnsi="Cambria Math"/>
+            </w:rPr>
+            <m:t xml:space="preserve">V_flow= </m:t>
+          </m:r>
+          <m:f>
+            <m:fPr>
+              <m:ctrlPr>
+                <w:rPr>
+                  <w:rFonts w:ascii="Cambria Math" w:hAnsi="Cambria Math"/>
+                  <w:i/>
+                </w:rPr>
+              </m:ctrlPr>
+            </m:fPr>
+            <m:num>
+              <m:r>
+                <w:rPr>
+                  <w:rFonts w:ascii="Cambria Math" w:hAnsi="Cambria Math"/>
+                </w:rPr>
+                <m:t>k</m:t>
+              </m:r>
+              <m:r>
+                <w:rPr>
+                  <w:rFonts w:ascii="Cambria Math" w:hAnsi="Cambria Math"/>
+                </w:rPr>
+                <m:t>×A</m:t>
+              </m:r>
+            </m:num>
+            <m:den>
+              <m:r>
+                <w:rPr>
+                  <w:rFonts w:ascii="Cambria Math" w:hAnsi="Cambria Math"/>
+                </w:rPr>
+                <m:t>μ</m:t>
+              </m:r>
+              <m:r>
+                <w:rPr>
+                  <w:rFonts w:ascii="Cambria Math" w:hAnsi="Cambria Math"/>
+                </w:rPr>
+                <m:t>×L</m:t>
+              </m:r>
+            </m:den>
+          </m:f>
+          <m:r>
+            <m:rPr>
+              <m:sty m:val="p"/>
+            </m:rPr>
+            <w:rPr>
+              <w:rFonts w:ascii="Cambria Math" w:hAnsi="Cambria Math"/>
+            </w:rPr>
+            <m:t>×d</m:t>
+          </m:r>
+          <m:r>
+            <w:rPr>
+              <w:rFonts w:ascii="Cambria Math" w:hAnsi="Cambria Math"/>
+            </w:rPr>
+            <m:t xml:space="preserve">p </m:t>
+          </m:r>
+          <m:r>
+            <w:rPr>
+              <w:rFonts w:ascii="Cambria Math" w:hAnsi="Cambria Math"/>
+            </w:rPr>
+            <m:t>≈</m:t>
+          </m:r>
+          <m:r>
+            <w:rPr>
+              <w:rFonts w:ascii="Cambria Math" w:hAnsi="Cambria Math"/>
+            </w:rPr>
+            <m:t>K×dp</m:t>
+          </m:r>
+          <m:r>
+            <w:rPr>
+              <w:rFonts w:ascii="Cambria Math" w:hAnsi="Cambria Math"/>
+            </w:rPr>
+            <m:t xml:space="preserve">   </m:t>
+          </m:r>
+          <m:r>
+            <w:rPr>
+              <w:rFonts w:ascii="Cambria Math" w:hAnsi="Cambria Math"/>
+            </w:rPr>
+            <m:t xml:space="preserve">Integral </m:t>
+          </m:r>
+          <m:r>
+            <w:rPr>
+              <w:rFonts w:ascii="Cambria Math" w:hAnsi="Cambria Math"/>
+            </w:rPr>
+            <m:t>form</m:t>
+          </m:r>
+        </m:oMath>
+      </m:oMathPara>
+    </w:p>
+    <w:p>
+      <w:pPr>
+        <w:rPr>
+          <w:rFonts w:eastAsiaTheme="minorEastAsia"/>
+        </w:rPr>
+      </w:pPr>
+      <m:oMathPara>
+        <m:oMath>
+          <m:r>
+            <w:rPr>
+              <w:rFonts w:ascii="Cambria Math" w:hAnsi="Cambria Math"/>
+            </w:rPr>
+            <m:t>K</m:t>
+          </m:r>
+          <m:r>
+            <w:rPr>
+              <w:rFonts w:ascii="Cambria Math" w:hAnsi="Cambria Math"/>
+            </w:rPr>
+            <m:t xml:space="preserve">= </m:t>
+          </m:r>
+          <m:f>
+            <m:fPr>
+              <m:ctrlPr>
+                <w:rPr>
+                  <w:rFonts w:ascii="Cambria Math" w:hAnsi="Cambria Math"/>
+                  <w:i/>
+                </w:rPr>
+              </m:ctrlPr>
+            </m:fPr>
+            <m:num>
+              <m:r>
+                <w:rPr>
+                  <w:rFonts w:ascii="Cambria Math" w:hAnsi="Cambria Math"/>
+                </w:rPr>
+                <m:t>V_flow</m:t>
+              </m:r>
+              <m:r>
+                <w:rPr>
+                  <w:rFonts w:ascii="Cambria Math" w:hAnsi="Cambria Math"/>
+                </w:rPr>
+                <m:t>_nominal</m:t>
+              </m:r>
+            </m:num>
+            <m:den>
+              <m:r>
+                <w:rPr>
+                  <w:rFonts w:ascii="Cambria Math" w:hAnsi="Cambria Math"/>
+                </w:rPr>
+                <m:t>dp_nominal</m:t>
+              </m:r>
+            </m:den>
+          </m:f>
         </m:oMath>
       </m:oMathPara>
       <w:bookmarkStart w:id="30" w:name="_GoBack"/>
       <w:bookmarkEnd w:id="30"/>
+    </w:p>
+    <w:p>
+      <w:pPr>
+        <w:rPr>
+          <w:rFonts w:eastAsiaTheme="minorEastAsia"/>
+        </w:rPr>
+      </w:pPr>
+      <m:oMathPara>
+        <m:oMath>
+          <m:r>
+            <w:rPr>
+              <w:rFonts w:ascii="Cambria Math" w:eastAsiaTheme="minorEastAsia" w:hAnsi="Cambria Math"/>
+            </w:rPr>
+            <w:lastRenderedPageBreak/>
+            <m:t>m_flow=</m:t>
+          </m:r>
+          <m:r>
+            <w:rPr>
+              <w:rFonts w:ascii="Cambria Math" w:eastAsiaTheme="minorEastAsia" w:hAnsi="Cambria Math"/>
+            </w:rPr>
+            <m:t>d×K×dp</m:t>
+          </m:r>
+        </m:oMath>
+      </m:oMathPara>
+    </w:p>
+    <w:p>
+      <w:pPr>
+        <w:rPr>
+          <w:lang w:val="fr-FR"/>
+        </w:rPr>
+      </w:pPr>
     </w:p>
     <w:p>
       <w:pPr>
@@ -14367,7 +14581,6 @@
             <w:rPr>
               <w:rFonts w:ascii="Cambria Math" w:eastAsiaTheme="minorEastAsia" w:hAnsi="Cambria Math"/>
             </w:rPr>
-            <w:lastRenderedPageBreak/>
             <m:t>P= -</m:t>
           </m:r>
           <m:sSub>
@@ -14838,13 +15051,7 @@
                 <w:rPr>
                   <w:rFonts w:ascii="Cambria Math" w:eastAsiaTheme="minorEastAsia" w:hAnsi="Cambria Math"/>
                 </w:rPr>
-                <m:t>grou</m:t>
-              </m:r>
-              <m:r>
-                <w:rPr>
-                  <w:rFonts w:ascii="Cambria Math" w:eastAsiaTheme="minorEastAsia" w:hAnsi="Cambria Math"/>
-                </w:rPr>
-                <m:t>nd gas node</m:t>
+                <m:t>ground gas node</m:t>
               </m:r>
             </m:sub>
           </m:sSub>
@@ -15298,13 +15505,7 @@
                 <w:rPr>
                   <w:rFonts w:ascii="Cambria Math" w:eastAsiaTheme="minorEastAsia" w:hAnsi="Cambria Math"/>
                 </w:rPr>
-                <m:t>npor</m:t>
-              </m:r>
-              <m:r>
-                <w:rPr>
-                  <w:rFonts w:ascii="Cambria Math" w:eastAsiaTheme="minorEastAsia" w:hAnsi="Cambria Math"/>
-                </w:rPr>
-                <m:t>ts</m:t>
+                <m:t>nports</m:t>
               </m:r>
             </m:sup>
             <m:e>
@@ -15357,6 +15558,7 @@
       </w:pPr>
       <w:bookmarkStart w:id="37" w:name="_Toc41656125"/>
       <w:r>
+        <w:lastRenderedPageBreak/>
         <w:t>Functions</w:t>
       </w:r>
       <w:bookmarkEnd w:id="37"/>
@@ -15668,7 +15870,6 @@
         <w:rPr>
           <w:rFonts w:eastAsiaTheme="minorEastAsia"/>
         </w:rPr>
-        <w:lastRenderedPageBreak/>
         <w:t>Si discriminant &lt; 0</w:t>
       </w:r>
     </w:p>
@@ -17241,6 +17442,7 @@
         <w:rPr>
           <w:rFonts w:eastAsiaTheme="minorEastAsia"/>
         </w:rPr>
+        <w:lastRenderedPageBreak/>
         <w:t>Si discriminant = 0</w:t>
       </w:r>
     </w:p>
@@ -17490,7 +17692,6 @@
         <w:rPr>
           <w:rFonts w:eastAsiaTheme="minorEastAsia"/>
         </w:rPr>
-        <w:lastRenderedPageBreak/>
         <w:br w:type="page"/>
       </w:r>
     </w:p>
@@ -20505,6 +20706,36 @@
     </w:lvlOverride>
   </w:num>
   <w:num w:numId="15">
+    <w:abstractNumId w:val="1"/>
+    <w:lvlOverride w:ilvl="0">
+      <w:startOverride w:val="1"/>
+    </w:lvlOverride>
+    <w:lvlOverride w:ilvl="1">
+      <w:startOverride w:val="1"/>
+    </w:lvlOverride>
+    <w:lvlOverride w:ilvl="2">
+      <w:startOverride w:val="1"/>
+    </w:lvlOverride>
+    <w:lvlOverride w:ilvl="3">
+      <w:startOverride w:val="1"/>
+    </w:lvlOverride>
+    <w:lvlOverride w:ilvl="4">
+      <w:startOverride w:val="1"/>
+    </w:lvlOverride>
+    <w:lvlOverride w:ilvl="5">
+      <w:startOverride w:val="1"/>
+    </w:lvlOverride>
+    <w:lvlOverride w:ilvl="6">
+      <w:startOverride w:val="1"/>
+    </w:lvlOverride>
+    <w:lvlOverride w:ilvl="7">
+      <w:startOverride w:val="1"/>
+    </w:lvlOverride>
+    <w:lvlOverride w:ilvl="8">
+      <w:startOverride w:val="1"/>
+    </w:lvlOverride>
+  </w:num>
+  <w:num w:numId="16">
     <w:abstractNumId w:val="1"/>
     <w:lvlOverride w:ilvl="0">
       <w:startOverride w:val="1"/>
@@ -21871,501 +22102,6 @@
 </w:styles>
 </file>
 
-<file path=word/glossary/document.xml><?xml version="1.0" encoding="utf-8"?>
-<w:glossaryDocument xmlns:wpc="http://schemas.microsoft.com/office/word/2010/wordprocessingCanvas" xmlns:mc="http://schemas.openxmlformats.org/markup-compatibility/2006" xmlns:o="urn:schemas-microsoft-com:office:office" xmlns:r="http://schemas.openxmlformats.org/officeDocument/2006/relationships" xmlns:m="http://schemas.openxmlformats.org/officeDocument/2006/math" xmlns:v="urn:schemas-microsoft-com:vml" xmlns:wp14="http://schemas.microsoft.com/office/word/2010/wordprocessingDrawing" xmlns:wp="http://schemas.openxmlformats.org/drawingml/2006/wordprocessingDrawing" xmlns:w10="urn:schemas-microsoft-com:office:word" xmlns:w="http://schemas.openxmlformats.org/wordprocessingml/2006/main" xmlns:w14="http://schemas.microsoft.com/office/word/2010/wordml" xmlns:wpg="http://schemas.microsoft.com/office/word/2010/wordprocessingGroup" xmlns:wpi="http://schemas.microsoft.com/office/word/2010/wordprocessingInk" xmlns:wne="http://schemas.microsoft.com/office/word/2006/wordml" xmlns:wps="http://schemas.microsoft.com/office/word/2010/wordprocessingShape" mc:Ignorable="w14 wp14"/>
-</file>
-
-<file path=word/glossary/fontTable.xml><?xml version="1.0" encoding="utf-8"?>
-<w:fonts xmlns:mc="http://schemas.openxmlformats.org/markup-compatibility/2006" xmlns:r="http://schemas.openxmlformats.org/officeDocument/2006/relationships" xmlns:w="http://schemas.openxmlformats.org/wordprocessingml/2006/main" xmlns:w14="http://schemas.microsoft.com/office/word/2010/wordml" mc:Ignorable="w14">
-  <w:font w:name="Calibri">
-    <w:panose1 w:val="020F0502020204030204"/>
-    <w:charset w:val="00"/>
-    <w:family w:val="swiss"/>
-    <w:pitch w:val="variable"/>
-    <w:sig w:usb0="E0002AFF" w:usb1="C000247B" w:usb2="00000009" w:usb3="00000000" w:csb0="000001FF" w:csb1="00000000"/>
-  </w:font>
-  <w:font w:name="Times New Roman">
-    <w:panose1 w:val="02020603050405020304"/>
-    <w:charset w:val="00"/>
-    <w:family w:val="roman"/>
-    <w:pitch w:val="variable"/>
-    <w:sig w:usb0="E0002EFF" w:usb1="C000785B" w:usb2="00000009" w:usb3="00000000" w:csb0="000001FF" w:csb1="00000000"/>
-  </w:font>
-  <w:font w:name="Calibri Light">
-    <w:panose1 w:val="020F0302020204030204"/>
-    <w:charset w:val="00"/>
-    <w:family w:val="swiss"/>
-    <w:pitch w:val="variable"/>
-    <w:sig w:usb0="E0002AFF" w:usb1="C000247B" w:usb2="00000009" w:usb3="00000000" w:csb0="000001FF" w:csb1="00000000"/>
-  </w:font>
-  <w:font w:name="Tahoma">
-    <w:panose1 w:val="020B0604030504040204"/>
-    <w:charset w:val="00"/>
-    <w:family w:val="swiss"/>
-    <w:pitch w:val="variable"/>
-    <w:sig w:usb0="E1002EFF" w:usb1="C000605B" w:usb2="00000029" w:usb3="00000000" w:csb0="000101FF" w:csb1="00000000"/>
-  </w:font>
-  <w:font w:name="Cambria Math">
-    <w:panose1 w:val="02040503050406030204"/>
-    <w:charset w:val="00"/>
-    <w:family w:val="roman"/>
-    <w:pitch w:val="variable"/>
-    <w:sig w:usb0="E00006FF" w:usb1="420024FF" w:usb2="02000000" w:usb3="00000000" w:csb0="0000019F" w:csb1="00000000"/>
-  </w:font>
-  <w:font w:name="Cambria">
-    <w:panose1 w:val="02040503050406030204"/>
-    <w:charset w:val="00"/>
-    <w:family w:val="roman"/>
-    <w:pitch w:val="variable"/>
-    <w:sig w:usb0="E00006FF" w:usb1="420024FF" w:usb2="02000000" w:usb3="00000000" w:csb0="0000019F" w:csb1="00000000"/>
-  </w:font>
-</w:fonts>
-</file>
-
-<file path=word/glossary/settings.xml><?xml version="1.0" encoding="utf-8"?>
-<w:settings xmlns:mc="http://schemas.openxmlformats.org/markup-compatibility/2006" xmlns:o="urn:schemas-microsoft-com:office:office" xmlns:r="http://schemas.openxmlformats.org/officeDocument/2006/relationships" xmlns:m="http://schemas.openxmlformats.org/officeDocument/2006/math" xmlns:v="urn:schemas-microsoft-com:vml" xmlns:w10="urn:schemas-microsoft-com:office:word" xmlns:w="http://schemas.openxmlformats.org/wordprocessingml/2006/main" xmlns:w14="http://schemas.microsoft.com/office/word/2010/wordml" xmlns:sl="http://schemas.openxmlformats.org/schemaLibrary/2006/main" mc:Ignorable="w14">
-  <w:view w:val="normal"/>
-  <w:defaultTabStop w:val="720"/>
-  <w:characterSpacingControl w:val="doNotCompress"/>
-  <w:compat>
-    <w:useFELayout/>
-    <w:compatSetting w:name="compatibilityMode" w:uri="http://schemas.microsoft.com/office/word" w:val="14"/>
-    <w:compatSetting w:name="overrideTableStyleFontSizeAndJustification" w:uri="http://schemas.microsoft.com/office/word" w:val="1"/>
-    <w:compatSetting w:name="enableOpenTypeFeatures" w:uri="http://schemas.microsoft.com/office/word" w:val="1"/>
-    <w:compatSetting w:name="doNotFlipMirrorIndents" w:uri="http://schemas.microsoft.com/office/word" w:val="1"/>
-  </w:compat>
-  <w:rsids>
-    <w:rsidRoot w:val="000544A6"/>
-    <w:rsid w:val="000544A6"/>
-    <w:rsid w:val="001D31CA"/>
-  </w:rsids>
-  <m:mathPr>
-    <m:mathFont m:val="Cambria Math"/>
-    <m:brkBin m:val="before"/>
-    <m:brkBinSub m:val="--"/>
-    <m:smallFrac m:val="0"/>
-    <m:dispDef/>
-    <m:lMargin m:val="0"/>
-    <m:rMargin m:val="0"/>
-    <m:defJc m:val="centerGroup"/>
-    <m:wrapIndent m:val="1440"/>
-    <m:intLim m:val="subSup"/>
-    <m:naryLim m:val="undOvr"/>
-  </m:mathPr>
-  <w:themeFontLang w:val="en-GB"/>
-  <w:clrSchemeMapping w:bg1="light1" w:t1="dark1" w:bg2="light2" w:t2="dark2" w:accent1="accent1" w:accent2="accent2" w:accent3="accent3" w:accent4="accent4" w:accent5="accent5" w:accent6="accent6" w:hyperlink="hyperlink" w:followedHyperlink="followedHyperlink"/>
-  <w:decimalSymbol w:val=","/>
-  <w:listSeparator w:val=";"/>
-</w:settings>
-</file>
-
-<file path=word/glossary/styles.xml><?xml version="1.0" encoding="utf-8"?>
-<w:styles xmlns:mc="http://schemas.openxmlformats.org/markup-compatibility/2006" xmlns:r="http://schemas.openxmlformats.org/officeDocument/2006/relationships" xmlns:w="http://schemas.openxmlformats.org/wordprocessingml/2006/main" xmlns:w14="http://schemas.microsoft.com/office/word/2010/wordml" mc:Ignorable="w14">
-  <w:docDefaults>
-    <w:rPrDefault>
-      <w:rPr>
-        <w:rFonts w:asciiTheme="minorHAnsi" w:eastAsiaTheme="minorEastAsia" w:hAnsiTheme="minorHAnsi" w:cstheme="minorBidi"/>
-        <w:sz w:val="22"/>
-        <w:szCs w:val="22"/>
-        <w:lang w:val="en-GB" w:eastAsia="en-GB" w:bidi="ar-SA"/>
-      </w:rPr>
-    </w:rPrDefault>
-    <w:pPrDefault>
-      <w:pPr>
-        <w:spacing w:after="200" w:line="276" w:lineRule="auto"/>
-      </w:pPr>
-    </w:pPrDefault>
-  </w:docDefaults>
-  <w:latentStyles w:defLockedState="0" w:defUIPriority="99" w:defSemiHidden="1" w:defUnhideWhenUsed="1" w:defQFormat="0" w:count="267">
-    <w:lsdException w:name="Normal" w:semiHidden="0" w:uiPriority="0" w:unhideWhenUsed="0" w:qFormat="1"/>
-    <w:lsdException w:name="heading 1" w:semiHidden="0" w:uiPriority="9" w:unhideWhenUsed="0" w:qFormat="1"/>
-    <w:lsdException w:name="heading 2" w:uiPriority="9" w:qFormat="1"/>
-    <w:lsdException w:name="heading 3" w:uiPriority="9" w:qFormat="1"/>
-    <w:lsdException w:name="heading 4" w:uiPriority="9" w:qFormat="1"/>
-    <w:lsdException w:name="heading 5" w:uiPriority="9" w:qFormat="1"/>
-    <w:lsdException w:name="heading 6" w:uiPriority="9" w:qFormat="1"/>
-    <w:lsdException w:name="heading 7" w:uiPriority="9" w:qFormat="1"/>
-    <w:lsdException w:name="heading 8" w:uiPriority="9" w:qFormat="1"/>
-    <w:lsdException w:name="heading 9" w:uiPriority="9" w:qFormat="1"/>
-    <w:lsdException w:name="toc 1" w:uiPriority="39"/>
-    <w:lsdException w:name="toc 2" w:uiPriority="39"/>
-    <w:lsdException w:name="toc 3" w:uiPriority="39"/>
-    <w:lsdException w:name="toc 4" w:uiPriority="39"/>
-    <w:lsdException w:name="toc 5" w:uiPriority="39"/>
-    <w:lsdException w:name="toc 6" w:uiPriority="39"/>
-    <w:lsdException w:name="toc 7" w:uiPriority="39"/>
-    <w:lsdException w:name="toc 8" w:uiPriority="39"/>
-    <w:lsdException w:name="toc 9" w:uiPriority="39"/>
-    <w:lsdException w:name="caption" w:uiPriority="35" w:qFormat="1"/>
-    <w:lsdException w:name="Title" w:semiHidden="0" w:uiPriority="10" w:unhideWhenUsed="0" w:qFormat="1"/>
-    <w:lsdException w:name="Default Paragraph Font" w:uiPriority="1"/>
-    <w:lsdException w:name="Subtitle" w:semiHidden="0" w:uiPriority="11" w:unhideWhenUsed="0" w:qFormat="1"/>
-    <w:lsdException w:name="Strong" w:semiHidden="0" w:uiPriority="22" w:unhideWhenUsed="0" w:qFormat="1"/>
-    <w:lsdException w:name="Emphasis" w:semiHidden="0" w:uiPriority="20" w:unhideWhenUsed="0" w:qFormat="1"/>
-    <w:lsdException w:name="Table Grid" w:semiHidden="0" w:uiPriority="59" w:unhideWhenUsed="0"/>
-    <w:lsdException w:name="Placeholder Text" w:unhideWhenUsed="0"/>
-    <w:lsdException w:name="No Spacing" w:semiHidden="0" w:uiPriority="1" w:unhideWhenUsed="0" w:qFormat="1"/>
-    <w:lsdException w:name="Light Shading" w:semiHidden="0" w:uiPriority="60" w:unhideWhenUsed="0"/>
-    <w:lsdException w:name="Light List" w:semiHidden="0" w:uiPriority="61" w:unhideWhenUsed="0"/>
-    <w:lsdException w:name="Light Grid" w:semiHidden="0" w:uiPriority="62" w:unhideWhenUsed="0"/>
-    <w:lsdException w:name="Medium Shading 1" w:semiHidden="0" w:uiPriority="63" w:unhideWhenUsed="0"/>
-    <w:lsdException w:name="Medium Shading 2" w:semiHidden="0" w:uiPriority="64" w:unhideWhenUsed="0"/>
-    <w:lsdException w:name="Medium List 1" w:semiHidden="0" w:uiPriority="65" w:unhideWhenUsed="0"/>
-    <w:lsdException w:name="Medium List 2" w:semiHidden="0" w:uiPriority="66" w:unhideWhenUsed="0"/>
-    <w:lsdException w:name="Medium Grid 1" w:semiHidden="0" w:uiPriority="67" w:unhideWhenUsed="0"/>
-    <w:lsdException w:name="Medium Grid 2" w:semiHidden="0" w:uiPriority="68" w:unhideWhenUsed="0"/>
-    <w:lsdException w:name="Medium Grid 3" w:semiHidden="0" w:uiPriority="69" w:unhideWhenUsed="0"/>
-    <w:lsdException w:name="Dark List" w:semiHidden="0" w:uiPriority="70" w:unhideWhenUsed="0"/>
-    <w:lsdException w:name="Colorful Shading" w:semiHidden="0" w:uiPriority="71" w:unhideWhenUsed="0"/>
-    <w:lsdException w:name="Colorful List" w:semiHidden="0" w:uiPriority="72" w:unhideWhenUsed="0"/>
-    <w:lsdException w:name="Colorful Grid" w:semiHidden="0" w:uiPriority="73" w:unhideWhenUsed="0"/>
-    <w:lsdException w:name="Light Shading Accent 1" w:semiHidden="0" w:uiPriority="60" w:unhideWhenUsed="0"/>
-    <w:lsdException w:name="Light List Accent 1" w:semiHidden="0" w:uiPriority="61" w:unhideWhenUsed="0"/>
-    <w:lsdException w:name="Light Grid Accent 1" w:semiHidden="0" w:uiPriority="62" w:unhideWhenUsed="0"/>
-    <w:lsdException w:name="Medium Shading 1 Accent 1" w:semiHidden="0" w:uiPriority="63" w:unhideWhenUsed="0"/>
-    <w:lsdException w:name="Medium Shading 2 Accent 1" w:semiHidden="0" w:uiPriority="64" w:unhideWhenUsed="0"/>
-    <w:lsdException w:name="Medium List 1 Accent 1" w:semiHidden="0" w:uiPriority="65" w:unhideWhenUsed="0"/>
-    <w:lsdException w:name="Revision" w:unhideWhenUsed="0"/>
-    <w:lsdException w:name="List Paragraph" w:semiHidden="0" w:uiPriority="34" w:unhideWhenUsed="0" w:qFormat="1"/>
-    <w:lsdException w:name="Quote" w:semiHidden="0" w:uiPriority="29" w:unhideWhenUsed="0" w:qFormat="1"/>
-    <w:lsdException w:name="Intense Quote" w:semiHidden="0" w:uiPriority="30" w:unhideWhenUsed="0" w:qFormat="1"/>
-    <w:lsdException w:name="Medium List 2 Accent 1" w:semiHidden="0" w:uiPriority="66" w:unhideWhenUsed="0"/>
-    <w:lsdException w:name="Medium Grid 1 Accent 1" w:semiHidden="0" w:uiPriority="67" w:unhideWhenUsed="0"/>
-    <w:lsdException w:name="Medium Grid 2 Accent 1" w:semiHidden="0" w:uiPriority="68" w:unhideWhenUsed="0"/>
-    <w:lsdException w:name="Medium Grid 3 Accent 1" w:semiHidden="0" w:uiPriority="69" w:unhideWhenUsed="0"/>
-    <w:lsdException w:name="Dark List Accent 1" w:semiHidden="0" w:uiPriority="70" w:unhideWhenUsed="0"/>
-    <w:lsdException w:name="Colorful Shading Accent 1" w:semiHidden="0" w:uiPriority="71" w:unhideWhenUsed="0"/>
-    <w:lsdException w:name="Colorful List Accent 1" w:semiHidden="0" w:uiPriority="72" w:unhideWhenUsed="0"/>
-    <w:lsdException w:name="Colorful Grid Accent 1" w:semiHidden="0" w:uiPriority="73" w:unhideWhenUsed="0"/>
-    <w:lsdException w:name="Light Shading Accent 2" w:semiHidden="0" w:uiPriority="60" w:unhideWhenUsed="0"/>
-    <w:lsdException w:name="Light List Accent 2" w:semiHidden="0" w:uiPriority="61" w:unhideWhenUsed="0"/>
-    <w:lsdException w:name="Light Grid Accent 2" w:semiHidden="0" w:uiPriority="62" w:unhideWhenUsed="0"/>
-    <w:lsdException w:name="Medium Shading 1 Accent 2" w:semiHidden="0" w:uiPriority="63" w:unhideWhenUsed="0"/>
-    <w:lsdException w:name="Medium Shading 2 Accent 2" w:semiHidden="0" w:uiPriority="64" w:unhideWhenUsed="0"/>
-    <w:lsdException w:name="Medium List 1 Accent 2" w:semiHidden="0" w:uiPriority="65" w:unhideWhenUsed="0"/>
-    <w:lsdException w:name="Medium List 2 Accent 2" w:semiHidden="0" w:uiPriority="66" w:unhideWhenUsed="0"/>
-    <w:lsdException w:name="Medium Grid 1 Accent 2" w:semiHidden="0" w:uiPriority="67" w:unhideWhenUsed="0"/>
-    <w:lsdException w:name="Medium Grid 2 Accent 2" w:semiHidden="0" w:uiPriority="68" w:unhideWhenUsed="0"/>
-    <w:lsdException w:name="Medium Grid 3 Accent 2" w:semiHidden="0" w:uiPriority="69" w:unhideWhenUsed="0"/>
-    <w:lsdException w:name="Dark List Accent 2" w:semiHidden="0" w:uiPriority="70" w:unhideWhenUsed="0"/>
-    <w:lsdException w:name="Colorful Shading Accent 2" w:semiHidden="0" w:uiPriority="71" w:unhideWhenUsed="0"/>
-    <w:lsdException w:name="Colorful List Accent 2" w:semiHidden="0" w:uiPriority="72" w:unhideWhenUsed="0"/>
-    <w:lsdException w:name="Colorful Grid Accent 2" w:semiHidden="0" w:uiPriority="73" w:unhideWhenUsed="0"/>
-    <w:lsdException w:name="Light Shading Accent 3" w:semiHidden="0" w:uiPriority="60" w:unhideWhenUsed="0"/>
-    <w:lsdException w:name="Light List Accent 3" w:semiHidden="0" w:uiPriority="61" w:unhideWhenUsed="0"/>
-    <w:lsdException w:name="Light Grid Accent 3" w:semiHidden="0" w:uiPriority="62" w:unhideWhenUsed="0"/>
-    <w:lsdException w:name="Medium Shading 1 Accent 3" w:semiHidden="0" w:uiPriority="63" w:unhideWhenUsed="0"/>
-    <w:lsdException w:name="Medium Shading 2 Accent 3" w:semiHidden="0" w:uiPriority="64" w:unhideWhenUsed="0"/>
-    <w:lsdException w:name="Medium List 1 Accent 3" w:semiHidden="0" w:uiPriority="65" w:unhideWhenUsed="0"/>
-    <w:lsdException w:name="Medium List 2 Accent 3" w:semiHidden="0" w:uiPriority="66" w:unhideWhenUsed="0"/>
-    <w:lsdException w:name="Medium Grid 1 Accent 3" w:semiHidden="0" w:uiPriority="67" w:unhideWhenUsed="0"/>
-    <w:lsdException w:name="Medium Grid 2 Accent 3" w:semiHidden="0" w:uiPriority="68" w:unhideWhenUsed="0"/>
-    <w:lsdException w:name="Medium Grid 3 Accent 3" w:semiHidden="0" w:uiPriority="69" w:unhideWhenUsed="0"/>
-    <w:lsdException w:name="Dark List Accent 3" w:semiHidden="0" w:uiPriority="70" w:unhideWhenUsed="0"/>
-    <w:lsdException w:name="Colorful Shading Accent 3" w:semiHidden="0" w:uiPriority="71" w:unhideWhenUsed="0"/>
-    <w:lsdException w:name="Colorful List Accent 3" w:semiHidden="0" w:uiPriority="72" w:unhideWhenUsed="0"/>
-    <w:lsdException w:name="Colorful Grid Accent 3" w:semiHidden="0" w:uiPriority="73" w:unhideWhenUsed="0"/>
-    <w:lsdException w:name="Light Shading Accent 4" w:semiHidden="0" w:uiPriority="60" w:unhideWhenUsed="0"/>
-    <w:lsdException w:name="Light List Accent 4" w:semiHidden="0" w:uiPriority="61" w:unhideWhenUsed="0"/>
-    <w:lsdException w:name="Light Grid Accent 4" w:semiHidden="0" w:uiPriority="62" w:unhideWhenUsed="0"/>
-    <w:lsdException w:name="Medium Shading 1 Accent 4" w:semiHidden="0" w:uiPriority="63" w:unhideWhenUsed="0"/>
-    <w:lsdException w:name="Medium Shading 2 Accent 4" w:semiHidden="0" w:uiPriority="64" w:unhideWhenUsed="0"/>
-    <w:lsdException w:name="Medium List 1 Accent 4" w:semiHidden="0" w:uiPriority="65" w:unhideWhenUsed="0"/>
-    <w:lsdException w:name="Medium List 2 Accent 4" w:semiHidden="0" w:uiPriority="66" w:unhideWhenUsed="0"/>
-    <w:lsdException w:name="Medium Grid 1 Accent 4" w:semiHidden="0" w:uiPriority="67" w:unhideWhenUsed="0"/>
-    <w:lsdException w:name="Medium Grid 2 Accent 4" w:semiHidden="0" w:uiPriority="68" w:unhideWhenUsed="0"/>
-    <w:lsdException w:name="Medium Grid 3 Accent 4" w:semiHidden="0" w:uiPriority="69" w:unhideWhenUsed="0"/>
-    <w:lsdException w:name="Dark List Accent 4" w:semiHidden="0" w:uiPriority="70" w:unhideWhenUsed="0"/>
-    <w:lsdException w:name="Colorful Shading Accent 4" w:semiHidden="0" w:uiPriority="71" w:unhideWhenUsed="0"/>
-    <w:lsdException w:name="Colorful List Accent 4" w:semiHidden="0" w:uiPriority="72" w:unhideWhenUsed="0"/>
-    <w:lsdException w:name="Colorful Grid Accent 4" w:semiHidden="0" w:uiPriority="73" w:unhideWhenUsed="0"/>
-    <w:lsdException w:name="Light Shading Accent 5" w:semiHidden="0" w:uiPriority="60" w:unhideWhenUsed="0"/>
-    <w:lsdException w:name="Light List Accent 5" w:semiHidden="0" w:uiPriority="61" w:unhideWhenUsed="0"/>
-    <w:lsdException w:name="Light Grid Accent 5" w:semiHidden="0" w:uiPriority="62" w:unhideWhenUsed="0"/>
-    <w:lsdException w:name="Medium Shading 1 Accent 5" w:semiHidden="0" w:uiPriority="63" w:unhideWhenUsed="0"/>
-    <w:lsdException w:name="Medium Shading 2 Accent 5" w:semiHidden="0" w:uiPriority="64" w:unhideWhenUsed="0"/>
-    <w:lsdException w:name="Medium List 1 Accent 5" w:semiHidden="0" w:uiPriority="65" w:unhideWhenUsed="0"/>
-    <w:lsdException w:name="Medium List 2 Accent 5" w:semiHidden="0" w:uiPriority="66" w:unhideWhenUsed="0"/>
-    <w:lsdException w:name="Medium Grid 1 Accent 5" w:semiHidden="0" w:uiPriority="67" w:unhideWhenUsed="0"/>
-    <w:lsdException w:name="Medium Grid 2 Accent 5" w:semiHidden="0" w:uiPriority="68" w:unhideWhenUsed="0"/>
-    <w:lsdException w:name="Medium Grid 3 Accent 5" w:semiHidden="0" w:uiPriority="69" w:unhideWhenUsed="0"/>
-    <w:lsdException w:name="Dark List Accent 5" w:semiHidden="0" w:uiPriority="70" w:unhideWhenUsed="0"/>
-    <w:lsdException w:name="Colorful Shading Accent 5" w:semiHidden="0" w:uiPriority="71" w:unhideWhenUsed="0"/>
-    <w:lsdException w:name="Colorful List Accent 5" w:semiHidden="0" w:uiPriority="72" w:unhideWhenUsed="0"/>
-    <w:lsdException w:name="Colorful Grid Accent 5" w:semiHidden="0" w:uiPriority="73" w:unhideWhenUsed="0"/>
-    <w:lsdException w:name="Light Shading Accent 6" w:semiHidden="0" w:uiPriority="60" w:unhideWhenUsed="0"/>
-    <w:lsdException w:name="Light List Accent 6" w:semiHidden="0" w:uiPriority="61" w:unhideWhenUsed="0"/>
-    <w:lsdException w:name="Light Grid Accent 6" w:semiHidden="0" w:uiPriority="62" w:unhideWhenUsed="0"/>
-    <w:lsdException w:name="Medium Shading 1 Accent 6" w:semiHidden="0" w:uiPriority="63" w:unhideWhenUsed="0"/>
-    <w:lsdException w:name="Medium Shading 2 Accent 6" w:semiHidden="0" w:uiPriority="64" w:unhideWhenUsed="0"/>
-    <w:lsdException w:name="Medium List 1 Accent 6" w:semiHidden="0" w:uiPriority="65" w:unhideWhenUsed="0"/>
-    <w:lsdException w:name="Medium List 2 Accent 6" w:semiHidden="0" w:uiPriority="66" w:unhideWhenUsed="0"/>
-    <w:lsdException w:name="Medium Grid 1 Accent 6" w:semiHidden="0" w:uiPriority="67" w:unhideWhenUsed="0"/>
-    <w:lsdException w:name="Medium Grid 2 Accent 6" w:semiHidden="0" w:uiPriority="68" w:unhideWhenUsed="0"/>
-    <w:lsdException w:name="Medium Grid 3 Accent 6" w:semiHidden="0" w:uiPriority="69" w:unhideWhenUsed="0"/>
-    <w:lsdException w:name="Dark List Accent 6" w:semiHidden="0" w:uiPriority="70" w:unhideWhenUsed="0"/>
-    <w:lsdException w:name="Colorful Shading Accent 6" w:semiHidden="0" w:uiPriority="71" w:unhideWhenUsed="0"/>
-    <w:lsdException w:name="Colorful List Accent 6" w:semiHidden="0" w:uiPriority="72" w:unhideWhenUsed="0"/>
-    <w:lsdException w:name="Colorful Grid Accent 6" w:semiHidden="0" w:uiPriority="73" w:unhideWhenUsed="0"/>
-    <w:lsdException w:name="Subtle Emphasis" w:semiHidden="0" w:uiPriority="19" w:unhideWhenUsed="0" w:qFormat="1"/>
-    <w:lsdException w:name="Intense Emphasis" w:semiHidden="0" w:uiPriority="21" w:unhideWhenUsed="0" w:qFormat="1"/>
-    <w:lsdException w:name="Subtle Reference" w:semiHidden="0" w:uiPriority="31" w:unhideWhenUsed="0" w:qFormat="1"/>
-    <w:lsdException w:name="Intense Reference" w:semiHidden="0" w:uiPriority="32" w:unhideWhenUsed="0" w:qFormat="1"/>
-    <w:lsdException w:name="Book Title" w:semiHidden="0" w:uiPriority="33" w:unhideWhenUsed="0" w:qFormat="1"/>
-    <w:lsdException w:name="Bibliography" w:uiPriority="37"/>
-    <w:lsdException w:name="TOC Heading" w:uiPriority="39" w:qFormat="1"/>
-  </w:latentStyles>
-  <w:style w:type="paragraph" w:default="1" w:styleId="Normal">
-    <w:name w:val="Normal"/>
-    <w:qFormat/>
-  </w:style>
-  <w:style w:type="character" w:default="1" w:styleId="Policepardfaut">
-    <w:name w:val="Default Paragraph Font"/>
-    <w:uiPriority w:val="1"/>
-    <w:semiHidden/>
-    <w:unhideWhenUsed/>
-  </w:style>
-  <w:style w:type="table" w:default="1" w:styleId="TableauNormal">
-    <w:name w:val="Normal Table"/>
-    <w:uiPriority w:val="99"/>
-    <w:semiHidden/>
-    <w:unhideWhenUsed/>
-    <w:tblPr>
-      <w:tblInd w:w="0" w:type="dxa"/>
-      <w:tblCellMar>
-        <w:top w:w="0" w:type="dxa"/>
-        <w:left w:w="108" w:type="dxa"/>
-        <w:bottom w:w="0" w:type="dxa"/>
-        <w:right w:w="108" w:type="dxa"/>
-      </w:tblCellMar>
-    </w:tblPr>
-  </w:style>
-  <w:style w:type="numbering" w:default="1" w:styleId="Aucuneliste">
-    <w:name w:val="No List"/>
-    <w:uiPriority w:val="99"/>
-    <w:semiHidden/>
-    <w:unhideWhenUsed/>
-  </w:style>
-  <w:style w:type="character" w:styleId="Textedelespacerserv">
-    <w:name w:val="Placeholder Text"/>
-    <w:basedOn w:val="Policepardfaut"/>
-    <w:uiPriority w:val="99"/>
-    <w:semiHidden/>
-    <w:rsid w:val="000544A6"/>
-    <w:rPr>
-      <w:color w:val="808080"/>
-    </w:rPr>
-  </w:style>
-</w:styles>
-</file>
-
-<file path=word/glossary/stylesWithEffects.xml><?xml version="1.0" encoding="utf-8"?>
-<w:styles xmlns:wpc="http://schemas.microsoft.com/office/word/2010/wordprocessingCanvas" xmlns:mc="http://schemas.openxmlformats.org/markup-compatibility/2006" xmlns:o="urn:schemas-microsoft-com:office:office" xmlns:r="http://schemas.openxmlformats.org/officeDocument/2006/relationships" xmlns:m="http://schemas.openxmlformats.org/officeDocument/2006/math" xmlns:v="urn:schemas-microsoft-com:vml" xmlns:wp14="http://schemas.microsoft.com/office/word/2010/wordprocessingDrawing" xmlns:wp="http://schemas.openxmlformats.org/drawingml/2006/wordprocessingDrawing" xmlns:w10="urn:schemas-microsoft-com:office:word" xmlns:w="http://schemas.openxmlformats.org/wordprocessingml/2006/main" xmlns:w14="http://schemas.microsoft.com/office/word/2010/wordml" xmlns:wpg="http://schemas.microsoft.com/office/word/2010/wordprocessingGroup" xmlns:wpi="http://schemas.microsoft.com/office/word/2010/wordprocessingInk" xmlns:wne="http://schemas.microsoft.com/office/word/2006/wordml" xmlns:wps="http://schemas.microsoft.com/office/word/2010/wordprocessingShape" mc:Ignorable="w14 wp14">
-  <w:docDefaults>
-    <w:rPrDefault>
-      <w:rPr>
-        <w:rFonts w:asciiTheme="minorHAnsi" w:eastAsiaTheme="minorEastAsia" w:hAnsiTheme="minorHAnsi" w:cstheme="minorBidi"/>
-        <w:sz w:val="22"/>
-        <w:szCs w:val="22"/>
-        <w:lang w:val="en-GB" w:eastAsia="en-GB" w:bidi="ar-SA"/>
-      </w:rPr>
-    </w:rPrDefault>
-    <w:pPrDefault>
-      <w:pPr>
-        <w:spacing w:after="200" w:line="276" w:lineRule="auto"/>
-      </w:pPr>
-    </w:pPrDefault>
-  </w:docDefaults>
-  <w:latentStyles w:defLockedState="0" w:defUIPriority="99" w:defSemiHidden="1" w:defUnhideWhenUsed="1" w:defQFormat="0" w:count="267">
-    <w:lsdException w:name="Normal" w:semiHidden="0" w:uiPriority="0" w:unhideWhenUsed="0" w:qFormat="1"/>
-    <w:lsdException w:name="heading 1" w:semiHidden="0" w:uiPriority="9" w:unhideWhenUsed="0" w:qFormat="1"/>
-    <w:lsdException w:name="heading 2" w:uiPriority="9" w:qFormat="1"/>
-    <w:lsdException w:name="heading 3" w:uiPriority="9" w:qFormat="1"/>
-    <w:lsdException w:name="heading 4" w:uiPriority="9" w:qFormat="1"/>
-    <w:lsdException w:name="heading 5" w:uiPriority="9" w:qFormat="1"/>
-    <w:lsdException w:name="heading 6" w:uiPriority="9" w:qFormat="1"/>
-    <w:lsdException w:name="heading 7" w:uiPriority="9" w:qFormat="1"/>
-    <w:lsdException w:name="heading 8" w:uiPriority="9" w:qFormat="1"/>
-    <w:lsdException w:name="heading 9" w:uiPriority="9" w:qFormat="1"/>
-    <w:lsdException w:name="toc 1" w:uiPriority="39"/>
-    <w:lsdException w:name="toc 2" w:uiPriority="39"/>
-    <w:lsdException w:name="toc 3" w:uiPriority="39"/>
-    <w:lsdException w:name="toc 4" w:uiPriority="39"/>
-    <w:lsdException w:name="toc 5" w:uiPriority="39"/>
-    <w:lsdException w:name="toc 6" w:uiPriority="39"/>
-    <w:lsdException w:name="toc 7" w:uiPriority="39"/>
-    <w:lsdException w:name="toc 8" w:uiPriority="39"/>
-    <w:lsdException w:name="toc 9" w:uiPriority="39"/>
-    <w:lsdException w:name="caption" w:uiPriority="35" w:qFormat="1"/>
-    <w:lsdException w:name="Title" w:semiHidden="0" w:uiPriority="10" w:unhideWhenUsed="0" w:qFormat="1"/>
-    <w:lsdException w:name="Default Paragraph Font" w:uiPriority="1"/>
-    <w:lsdException w:name="Subtitle" w:semiHidden="0" w:uiPriority="11" w:unhideWhenUsed="0" w:qFormat="1"/>
-    <w:lsdException w:name="Strong" w:semiHidden="0" w:uiPriority="22" w:unhideWhenUsed="0" w:qFormat="1"/>
-    <w:lsdException w:name="Emphasis" w:semiHidden="0" w:uiPriority="20" w:unhideWhenUsed="0" w:qFormat="1"/>
-    <w:lsdException w:name="Table Grid" w:semiHidden="0" w:uiPriority="59" w:unhideWhenUsed="0"/>
-    <w:lsdException w:name="Placeholder Text" w:unhideWhenUsed="0"/>
-    <w:lsdException w:name="No Spacing" w:semiHidden="0" w:uiPriority="1" w:unhideWhenUsed="0" w:qFormat="1"/>
-    <w:lsdException w:name="Light Shading" w:semiHidden="0" w:uiPriority="60" w:unhideWhenUsed="0"/>
-    <w:lsdException w:name="Light List" w:semiHidden="0" w:uiPriority="61" w:unhideWhenUsed="0"/>
-    <w:lsdException w:name="Light Grid" w:semiHidden="0" w:uiPriority="62" w:unhideWhenUsed="0"/>
-    <w:lsdException w:name="Medium Shading 1" w:semiHidden="0" w:uiPriority="63" w:unhideWhenUsed="0"/>
-    <w:lsdException w:name="Medium Shading 2" w:semiHidden="0" w:uiPriority="64" w:unhideWhenUsed="0"/>
-    <w:lsdException w:name="Medium List 1" w:semiHidden="0" w:uiPriority="65" w:unhideWhenUsed="0"/>
-    <w:lsdException w:name="Medium List 2" w:semiHidden="0" w:uiPriority="66" w:unhideWhenUsed="0"/>
-    <w:lsdException w:name="Medium Grid 1" w:semiHidden="0" w:uiPriority="67" w:unhideWhenUsed="0"/>
-    <w:lsdException w:name="Medium Grid 2" w:semiHidden="0" w:uiPriority="68" w:unhideWhenUsed="0"/>
-    <w:lsdException w:name="Medium Grid 3" w:semiHidden="0" w:uiPriority="69" w:unhideWhenUsed="0"/>
-    <w:lsdException w:name="Dark List" w:semiHidden="0" w:uiPriority="70" w:unhideWhenUsed="0"/>
-    <w:lsdException w:name="Colorful Shading" w:semiHidden="0" w:uiPriority="71" w:unhideWhenUsed="0"/>
-    <w:lsdException w:name="Colorful List" w:semiHidden="0" w:uiPriority="72" w:unhideWhenUsed="0"/>
-    <w:lsdException w:name="Colorful Grid" w:semiHidden="0" w:uiPriority="73" w:unhideWhenUsed="0"/>
-    <w:lsdException w:name="Light Shading Accent 1" w:semiHidden="0" w:uiPriority="60" w:unhideWhenUsed="0"/>
-    <w:lsdException w:name="Light List Accent 1" w:semiHidden="0" w:uiPriority="61" w:unhideWhenUsed="0"/>
-    <w:lsdException w:name="Light Grid Accent 1" w:semiHidden="0" w:uiPriority="62" w:unhideWhenUsed="0"/>
-    <w:lsdException w:name="Medium Shading 1 Accent 1" w:semiHidden="0" w:uiPriority="63" w:unhideWhenUsed="0"/>
-    <w:lsdException w:name="Medium Shading 2 Accent 1" w:semiHidden="0" w:uiPriority="64" w:unhideWhenUsed="0"/>
-    <w:lsdException w:name="Medium List 1 Accent 1" w:semiHidden="0" w:uiPriority="65" w:unhideWhenUsed="0"/>
-    <w:lsdException w:name="Revision" w:unhideWhenUsed="0"/>
-    <w:lsdException w:name="List Paragraph" w:semiHidden="0" w:uiPriority="34" w:unhideWhenUsed="0" w:qFormat="1"/>
-    <w:lsdException w:name="Quote" w:semiHidden="0" w:uiPriority="29" w:unhideWhenUsed="0" w:qFormat="1"/>
-    <w:lsdException w:name="Intense Quote" w:semiHidden="0" w:uiPriority="30" w:unhideWhenUsed="0" w:qFormat="1"/>
-    <w:lsdException w:name="Medium List 2 Accent 1" w:semiHidden="0" w:uiPriority="66" w:unhideWhenUsed="0"/>
-    <w:lsdException w:name="Medium Grid 1 Accent 1" w:semiHidden="0" w:uiPriority="67" w:unhideWhenUsed="0"/>
-    <w:lsdException w:name="Medium Grid 2 Accent 1" w:semiHidden="0" w:uiPriority="68" w:unhideWhenUsed="0"/>
-    <w:lsdException w:name="Medium Grid 3 Accent 1" w:semiHidden="0" w:uiPriority="69" w:unhideWhenUsed="0"/>
-    <w:lsdException w:name="Dark List Accent 1" w:semiHidden="0" w:uiPriority="70" w:unhideWhenUsed="0"/>
-    <w:lsdException w:name="Colorful Shading Accent 1" w:semiHidden="0" w:uiPriority="71" w:unhideWhenUsed="0"/>
-    <w:lsdException w:name="Colorful List Accent 1" w:semiHidden="0" w:uiPriority="72" w:unhideWhenUsed="0"/>
-    <w:lsdException w:name="Colorful Grid Accent 1" w:semiHidden="0" w:uiPriority="73" w:unhideWhenUsed="0"/>
-    <w:lsdException w:name="Light Shading Accent 2" w:semiHidden="0" w:uiPriority="60" w:unhideWhenUsed="0"/>
-    <w:lsdException w:name="Light List Accent 2" w:semiHidden="0" w:uiPriority="61" w:unhideWhenUsed="0"/>
-    <w:lsdException w:name="Light Grid Accent 2" w:semiHidden="0" w:uiPriority="62" w:unhideWhenUsed="0"/>
-    <w:lsdException w:name="Medium Shading 1 Accent 2" w:semiHidden="0" w:uiPriority="63" w:unhideWhenUsed="0"/>
-    <w:lsdException w:name="Medium Shading 2 Accent 2" w:semiHidden="0" w:uiPriority="64" w:unhideWhenUsed="0"/>
-    <w:lsdException w:name="Medium List 1 Accent 2" w:semiHidden="0" w:uiPriority="65" w:unhideWhenUsed="0"/>
-    <w:lsdException w:name="Medium List 2 Accent 2" w:semiHidden="0" w:uiPriority="66" w:unhideWhenUsed="0"/>
-    <w:lsdException w:name="Medium Grid 1 Accent 2" w:semiHidden="0" w:uiPriority="67" w:unhideWhenUsed="0"/>
-    <w:lsdException w:name="Medium Grid 2 Accent 2" w:semiHidden="0" w:uiPriority="68" w:unhideWhenUsed="0"/>
-    <w:lsdException w:name="Medium Grid 3 Accent 2" w:semiHidden="0" w:uiPriority="69" w:unhideWhenUsed="0"/>
-    <w:lsdException w:name="Dark List Accent 2" w:semiHidden="0" w:uiPriority="70" w:unhideWhenUsed="0"/>
-    <w:lsdException w:name="Colorful Shading Accent 2" w:semiHidden="0" w:uiPriority="71" w:unhideWhenUsed="0"/>
-    <w:lsdException w:name="Colorful List Accent 2" w:semiHidden="0" w:uiPriority="72" w:unhideWhenUsed="0"/>
-    <w:lsdException w:name="Colorful Grid Accent 2" w:semiHidden="0" w:uiPriority="73" w:unhideWhenUsed="0"/>
-    <w:lsdException w:name="Light Shading Accent 3" w:semiHidden="0" w:uiPriority="60" w:unhideWhenUsed="0"/>
-    <w:lsdException w:name="Light List Accent 3" w:semiHidden="0" w:uiPriority="61" w:unhideWhenUsed="0"/>
-    <w:lsdException w:name="Light Grid Accent 3" w:semiHidden="0" w:uiPriority="62" w:unhideWhenUsed="0"/>
-    <w:lsdException w:name="Medium Shading 1 Accent 3" w:semiHidden="0" w:uiPriority="63" w:unhideWhenUsed="0"/>
-    <w:lsdException w:name="Medium Shading 2 Accent 3" w:semiHidden="0" w:uiPriority="64" w:unhideWhenUsed="0"/>
-    <w:lsdException w:name="Medium List 1 Accent 3" w:semiHidden="0" w:uiPriority="65" w:unhideWhenUsed="0"/>
-    <w:lsdException w:name="Medium List 2 Accent 3" w:semiHidden="0" w:uiPriority="66" w:unhideWhenUsed="0"/>
-    <w:lsdException w:name="Medium Grid 1 Accent 3" w:semiHidden="0" w:uiPriority="67" w:unhideWhenUsed="0"/>
-    <w:lsdException w:name="Medium Grid 2 Accent 3" w:semiHidden="0" w:uiPriority="68" w:unhideWhenUsed="0"/>
-    <w:lsdException w:name="Medium Grid 3 Accent 3" w:semiHidden="0" w:uiPriority="69" w:unhideWhenUsed="0"/>
-    <w:lsdException w:name="Dark List Accent 3" w:semiHidden="0" w:uiPriority="70" w:unhideWhenUsed="0"/>
-    <w:lsdException w:name="Colorful Shading Accent 3" w:semiHidden="0" w:uiPriority="71" w:unhideWhenUsed="0"/>
-    <w:lsdException w:name="Colorful List Accent 3" w:semiHidden="0" w:uiPriority="72" w:unhideWhenUsed="0"/>
-    <w:lsdException w:name="Colorful Grid Accent 3" w:semiHidden="0" w:uiPriority="73" w:unhideWhenUsed="0"/>
-    <w:lsdException w:name="Light Shading Accent 4" w:semiHidden="0" w:uiPriority="60" w:unhideWhenUsed="0"/>
-    <w:lsdException w:name="Light List Accent 4" w:semiHidden="0" w:uiPriority="61" w:unhideWhenUsed="0"/>
-    <w:lsdException w:name="Light Grid Accent 4" w:semiHidden="0" w:uiPriority="62" w:unhideWhenUsed="0"/>
-    <w:lsdException w:name="Medium Shading 1 Accent 4" w:semiHidden="0" w:uiPriority="63" w:unhideWhenUsed="0"/>
-    <w:lsdException w:name="Medium Shading 2 Accent 4" w:semiHidden="0" w:uiPriority="64" w:unhideWhenUsed="0"/>
-    <w:lsdException w:name="Medium List 1 Accent 4" w:semiHidden="0" w:uiPriority="65" w:unhideWhenUsed="0"/>
-    <w:lsdException w:name="Medium List 2 Accent 4" w:semiHidden="0" w:uiPriority="66" w:unhideWhenUsed="0"/>
-    <w:lsdException w:name="Medium Grid 1 Accent 4" w:semiHidden="0" w:uiPriority="67" w:unhideWhenUsed="0"/>
-    <w:lsdException w:name="Medium Grid 2 Accent 4" w:semiHidden="0" w:uiPriority="68" w:unhideWhenUsed="0"/>
-    <w:lsdException w:name="Medium Grid 3 Accent 4" w:semiHidden="0" w:uiPriority="69" w:unhideWhenUsed="0"/>
-    <w:lsdException w:name="Dark List Accent 4" w:semiHidden="0" w:uiPriority="70" w:unhideWhenUsed="0"/>
-    <w:lsdException w:name="Colorful Shading Accent 4" w:semiHidden="0" w:uiPriority="71" w:unhideWhenUsed="0"/>
-    <w:lsdException w:name="Colorful List Accent 4" w:semiHidden="0" w:uiPriority="72" w:unhideWhenUsed="0"/>
-    <w:lsdException w:name="Colorful Grid Accent 4" w:semiHidden="0" w:uiPriority="73" w:unhideWhenUsed="0"/>
-    <w:lsdException w:name="Light Shading Accent 5" w:semiHidden="0" w:uiPriority="60" w:unhideWhenUsed="0"/>
-    <w:lsdException w:name="Light List Accent 5" w:semiHidden="0" w:uiPriority="61" w:unhideWhenUsed="0"/>
-    <w:lsdException w:name="Light Grid Accent 5" w:semiHidden="0" w:uiPriority="62" w:unhideWhenUsed="0"/>
-    <w:lsdException w:name="Medium Shading 1 Accent 5" w:semiHidden="0" w:uiPriority="63" w:unhideWhenUsed="0"/>
-    <w:lsdException w:name="Medium Shading 2 Accent 5" w:semiHidden="0" w:uiPriority="64" w:unhideWhenUsed="0"/>
-    <w:lsdException w:name="Medium List 1 Accent 5" w:semiHidden="0" w:uiPriority="65" w:unhideWhenUsed="0"/>
-    <w:lsdException w:name="Medium List 2 Accent 5" w:semiHidden="0" w:uiPriority="66" w:unhideWhenUsed="0"/>
-    <w:lsdException w:name="Medium Grid 1 Accent 5" w:semiHidden="0" w:uiPriority="67" w:unhideWhenUsed="0"/>
-    <w:lsdException w:name="Medium Grid 2 Accent 5" w:semiHidden="0" w:uiPriority="68" w:unhideWhenUsed="0"/>
-    <w:lsdException w:name="Medium Grid 3 Accent 5" w:semiHidden="0" w:uiPriority="69" w:unhideWhenUsed="0"/>
-    <w:lsdException w:name="Dark List Accent 5" w:semiHidden="0" w:uiPriority="70" w:unhideWhenUsed="0"/>
-    <w:lsdException w:name="Colorful Shading Accent 5" w:semiHidden="0" w:uiPriority="71" w:unhideWhenUsed="0"/>
-    <w:lsdException w:name="Colorful List Accent 5" w:semiHidden="0" w:uiPriority="72" w:unhideWhenUsed="0"/>
-    <w:lsdException w:name="Colorful Grid Accent 5" w:semiHidden="0" w:uiPriority="73" w:unhideWhenUsed="0"/>
-    <w:lsdException w:name="Light Shading Accent 6" w:semiHidden="0" w:uiPriority="60" w:unhideWhenUsed="0"/>
-    <w:lsdException w:name="Light List Accent 6" w:semiHidden="0" w:uiPriority="61" w:unhideWhenUsed="0"/>
-    <w:lsdException w:name="Light Grid Accent 6" w:semiHidden="0" w:uiPriority="62" w:unhideWhenUsed="0"/>
-    <w:lsdException w:name="Medium Shading 1 Accent 6" w:semiHidden="0" w:uiPriority="63" w:unhideWhenUsed="0"/>
-    <w:lsdException w:name="Medium Shading 2 Accent 6" w:semiHidden="0" w:uiPriority="64" w:unhideWhenUsed="0"/>
-    <w:lsdException w:name="Medium List 1 Accent 6" w:semiHidden="0" w:uiPriority="65" w:unhideWhenUsed="0"/>
-    <w:lsdException w:name="Medium List 2 Accent 6" w:semiHidden="0" w:uiPriority="66" w:unhideWhenUsed="0"/>
-    <w:lsdException w:name="Medium Grid 1 Accent 6" w:semiHidden="0" w:uiPriority="67" w:unhideWhenUsed="0"/>
-    <w:lsdException w:name="Medium Grid 2 Accent 6" w:semiHidden="0" w:uiPriority="68" w:unhideWhenUsed="0"/>
-    <w:lsdException w:name="Medium Grid 3 Accent 6" w:semiHidden="0" w:uiPriority="69" w:unhideWhenUsed="0"/>
-    <w:lsdException w:name="Dark List Accent 6" w:semiHidden="0" w:uiPriority="70" w:unhideWhenUsed="0"/>
-    <w:lsdException w:name="Colorful Shading Accent 6" w:semiHidden="0" w:uiPriority="71" w:unhideWhenUsed="0"/>
-    <w:lsdException w:name="Colorful List Accent 6" w:semiHidden="0" w:uiPriority="72" w:unhideWhenUsed="0"/>
-    <w:lsdException w:name="Colorful Grid Accent 6" w:semiHidden="0" w:uiPriority="73" w:unhideWhenUsed="0"/>
-    <w:lsdException w:name="Subtle Emphasis" w:semiHidden="0" w:uiPriority="19" w:unhideWhenUsed="0" w:qFormat="1"/>
-    <w:lsdException w:name="Intense Emphasis" w:semiHidden="0" w:uiPriority="21" w:unhideWhenUsed="0" w:qFormat="1"/>
-    <w:lsdException w:name="Subtle Reference" w:semiHidden="0" w:uiPriority="31" w:unhideWhenUsed="0" w:qFormat="1"/>
-    <w:lsdException w:name="Intense Reference" w:semiHidden="0" w:uiPriority="32" w:unhideWhenUsed="0" w:qFormat="1"/>
-    <w:lsdException w:name="Book Title" w:semiHidden="0" w:uiPriority="33" w:unhideWhenUsed="0" w:qFormat="1"/>
-    <w:lsdException w:name="Bibliography" w:uiPriority="37"/>
-    <w:lsdException w:name="TOC Heading" w:uiPriority="39" w:qFormat="1"/>
-  </w:latentStyles>
-  <w:style w:type="paragraph" w:default="1" w:styleId="Normal">
-    <w:name w:val="Normal"/>
-    <w:qFormat/>
-  </w:style>
-  <w:style w:type="character" w:default="1" w:styleId="Policepardfaut">
-    <w:name w:val="Default Paragraph Font"/>
-    <w:uiPriority w:val="1"/>
-    <w:semiHidden/>
-    <w:unhideWhenUsed/>
-  </w:style>
-  <w:style w:type="table" w:default="1" w:styleId="TableauNormal">
-    <w:name w:val="Normal Table"/>
-    <w:uiPriority w:val="99"/>
-    <w:semiHidden/>
-    <w:unhideWhenUsed/>
-    <w:tblPr>
-      <w:tblInd w:w="0" w:type="dxa"/>
-      <w:tblCellMar>
-        <w:top w:w="0" w:type="dxa"/>
-        <w:left w:w="108" w:type="dxa"/>
-        <w:bottom w:w="0" w:type="dxa"/>
-        <w:right w:w="108" w:type="dxa"/>
-      </w:tblCellMar>
-    </w:tblPr>
-  </w:style>
-  <w:style w:type="numbering" w:default="1" w:styleId="Aucuneliste">
-    <w:name w:val="No List"/>
-    <w:uiPriority w:val="99"/>
-    <w:semiHidden/>
-    <w:unhideWhenUsed/>
-  </w:style>
-  <w:style w:type="character" w:styleId="Textedelespacerserv">
-    <w:name w:val="Placeholder Text"/>
-    <w:basedOn w:val="Policepardfaut"/>
-    <w:uiPriority w:val="99"/>
-    <w:semiHidden/>
-    <w:rsid w:val="000544A6"/>
-    <w:rPr>
-      <w:color w:val="808080"/>
-    </w:rPr>
-  </w:style>
-</w:styles>
-</file>
-
-<file path=word/glossary/webSettings.xml><?xml version="1.0" encoding="utf-8"?>
-<w:webSettings xmlns:mc="http://schemas.openxmlformats.org/markup-compatibility/2006" xmlns:r="http://schemas.openxmlformats.org/officeDocument/2006/relationships" xmlns:w="http://schemas.openxmlformats.org/wordprocessingml/2006/main" xmlns:w14="http://schemas.microsoft.com/office/word/2010/wordml" mc:Ignorable="w14">
-  <w:optimizeForBrowser/>
-  <w:allowPNG/>
-</w:webSettings>
-</file>
-
 <file path=word/theme/theme1.xml><?xml version="1.0" encoding="utf-8"?>
 <a:theme xmlns:a="http://schemas.openxmlformats.org/drawingml/2006/main" name="Thème Office">
   <a:themeElements>
@@ -22621,7 +22357,7 @@
   <a:extraClrSchemeLst/>
   <a:extLst>
     <a:ext uri="{05A4C25C-085E-4340-85A3-A5531E510DB2}">
-      <thm15:themeFamily xmlns="" xmlns:thm15="http://schemas.microsoft.com/office/thememl/2012/main" name="Office Theme" id="{62F939B6-93AF-4DB8-9C6B-D6C7DFDC589F}" vid="{4A3C46E8-61CC-4603-A589-7422A47A8E4A}"/>
+      <thm15:themeFamily xmlns:thm15="http://schemas.microsoft.com/office/thememl/2012/main" xmlns="" name="Office Theme" id="{62F939B6-93AF-4DB8-9C6B-D6C7DFDC589F}" vid="{4A3C46E8-61CC-4603-A589-7422A47A8E4A}"/>
     </a:ext>
   </a:extLst>
 </a:theme>
@@ -22632,7 +22368,7 @@
 </file>
 
 <file path=customXml/itemProps1.xml><?xml version="1.0" encoding="utf-8"?>
-<ds:datastoreItem xmlns:ds="http://schemas.openxmlformats.org/officeDocument/2006/customXml" ds:itemID="{948D8227-9A1A-4BCB-8823-C29CEBD8CAF1}">
+<ds:datastoreItem xmlns:ds="http://schemas.openxmlformats.org/officeDocument/2006/customXml" ds:itemID="{2D6FC420-9210-4C05-B93A-98ACE4A92557}">
   <ds:schemaRefs>
     <ds:schemaRef ds:uri="http://schemas.openxmlformats.org/officeDocument/2006/bibliography"/>
   </ds:schemaRefs>

</xml_diff>

<commit_message>
Addition of an HTML description of the Interface_liq_gas module
</commit_message>
<xml_diff>
--- a/Information/script for equations.docx
+++ b/Information/script for equations.docx
@@ -19,7 +19,6 @@
           <w:docPartUnique/>
         </w:docPartObj>
       </w:sdtPr>
-      <w:sdtEndPr/>
       <w:sdtContent>
         <w:p>
           <w:pPr>
@@ -8920,7 +8919,13 @@
             <w:rPr>
               <w:rFonts w:ascii="Cambria Math" w:eastAsiaTheme="minorEastAsia" w:hAnsi="Cambria Math"/>
             </w:rPr>
-            <m:t>dx= Biot×</m:t>
+            <m:t>dx= B</m:t>
+          </m:r>
+          <m:r>
+            <w:rPr>
+              <w:rFonts w:ascii="Cambria Math" w:eastAsiaTheme="minorEastAsia" w:hAnsi="Cambria Math"/>
+            </w:rPr>
+            <m:t>iot×</m:t>
           </m:r>
           <m:f>
             <m:fPr>
@@ -12971,13 +12976,7 @@
             <w:rPr>
               <w:rFonts w:ascii="Cambria Math" w:hAnsi="Cambria Math"/>
             </w:rPr>
-            <m:t>V</m:t>
-          </m:r>
-          <m:r>
-            <w:rPr>
-              <w:rFonts w:ascii="Cambria Math" w:hAnsi="Cambria Math"/>
-            </w:rPr>
-            <m:t>el= -</m:t>
+            <m:t>Vel= -</m:t>
           </m:r>
           <m:f>
             <m:fPr>
@@ -13012,8 +13011,57 @@
             <w:rPr>
               <w:rFonts w:ascii="Cambria Math" w:hAnsi="Cambria Math"/>
             </w:rPr>
-            <m:t>×</m:t>
-          </m:r>
+            <m:t>×∇</m:t>
+          </m:r>
+          <m:r>
+            <w:rPr>
+              <w:rFonts w:ascii="Cambria Math" w:hAnsi="Cambria Math"/>
+            </w:rPr>
+            <m:t>p    local form</m:t>
+          </m:r>
+        </m:oMath>
+      </m:oMathPara>
+    </w:p>
+    <w:p>
+      <w:pPr>
+        <w:rPr>
+          <w:rFonts w:eastAsiaTheme="minorEastAsia"/>
+        </w:rPr>
+      </w:pPr>
+      <m:oMathPara>
+        <m:oMath>
+          <m:r>
+            <w:rPr>
+              <w:rFonts w:ascii="Cambria Math" w:hAnsi="Cambria Math"/>
+            </w:rPr>
+            <m:t xml:space="preserve">V_flow= </m:t>
+          </m:r>
+          <m:f>
+            <m:fPr>
+              <m:ctrlPr>
+                <w:rPr>
+                  <w:rFonts w:ascii="Cambria Math" w:hAnsi="Cambria Math"/>
+                  <w:i/>
+                </w:rPr>
+              </m:ctrlPr>
+            </m:fPr>
+            <m:num>
+              <m:r>
+                <w:rPr>
+                  <w:rFonts w:ascii="Cambria Math" w:hAnsi="Cambria Math"/>
+                </w:rPr>
+                <m:t>k×A</m:t>
+              </m:r>
+            </m:num>
+            <m:den>
+              <m:r>
+                <w:rPr>
+                  <w:rFonts w:ascii="Cambria Math" w:hAnsi="Cambria Math"/>
+                </w:rPr>
+                <m:t>μ×L</m:t>
+              </m:r>
+            </m:den>
+          </m:f>
           <m:r>
             <m:rPr>
               <m:sty m:val="p"/>
@@ -13021,13 +13069,13 @@
             <w:rPr>
               <w:rFonts w:ascii="Cambria Math" w:hAnsi="Cambria Math"/>
             </w:rPr>
-            <m:t>∇</m:t>
+            <m:t>×d</m:t>
           </m:r>
           <m:r>
             <w:rPr>
               <w:rFonts w:ascii="Cambria Math" w:hAnsi="Cambria Math"/>
             </w:rPr>
-            <m:t>p    local form</m:t>
+            <m:t>p ≈K×dp   Integral form</m:t>
           </m:r>
         </m:oMath>
       </m:oMathPara>
@@ -13044,7 +13092,7 @@
             <w:rPr>
               <w:rFonts w:ascii="Cambria Math" w:hAnsi="Cambria Math"/>
             </w:rPr>
-            <m:t xml:space="preserve">V_flow= </m:t>
+            <m:t xml:space="preserve">K= </m:t>
           </m:r>
           <m:f>
             <m:fPr>
@@ -13060,119 +13108,7 @@
                 <w:rPr>
                   <w:rFonts w:ascii="Cambria Math" w:hAnsi="Cambria Math"/>
                 </w:rPr>
-                <m:t>k</m:t>
-              </m:r>
-              <m:r>
-                <w:rPr>
-                  <w:rFonts w:ascii="Cambria Math" w:hAnsi="Cambria Math"/>
-                </w:rPr>
-                <m:t>×A</m:t>
-              </m:r>
-            </m:num>
-            <m:den>
-              <m:r>
-                <w:rPr>
-                  <w:rFonts w:ascii="Cambria Math" w:hAnsi="Cambria Math"/>
-                </w:rPr>
-                <m:t>μ</m:t>
-              </m:r>
-              <m:r>
-                <w:rPr>
-                  <w:rFonts w:ascii="Cambria Math" w:hAnsi="Cambria Math"/>
-                </w:rPr>
-                <m:t>×L</m:t>
-              </m:r>
-            </m:den>
-          </m:f>
-          <m:r>
-            <m:rPr>
-              <m:sty m:val="p"/>
-            </m:rPr>
-            <w:rPr>
-              <w:rFonts w:ascii="Cambria Math" w:hAnsi="Cambria Math"/>
-            </w:rPr>
-            <m:t>×d</m:t>
-          </m:r>
-          <m:r>
-            <w:rPr>
-              <w:rFonts w:ascii="Cambria Math" w:hAnsi="Cambria Math"/>
-            </w:rPr>
-            <m:t xml:space="preserve">p </m:t>
-          </m:r>
-          <m:r>
-            <w:rPr>
-              <w:rFonts w:ascii="Cambria Math" w:hAnsi="Cambria Math"/>
-            </w:rPr>
-            <m:t>≈</m:t>
-          </m:r>
-          <m:r>
-            <w:rPr>
-              <w:rFonts w:ascii="Cambria Math" w:hAnsi="Cambria Math"/>
-            </w:rPr>
-            <m:t>K×dp</m:t>
-          </m:r>
-          <m:r>
-            <w:rPr>
-              <w:rFonts w:ascii="Cambria Math" w:hAnsi="Cambria Math"/>
-            </w:rPr>
-            <m:t xml:space="preserve">   </m:t>
-          </m:r>
-          <m:r>
-            <w:rPr>
-              <w:rFonts w:ascii="Cambria Math" w:hAnsi="Cambria Math"/>
-            </w:rPr>
-            <m:t xml:space="preserve">Integral </m:t>
-          </m:r>
-          <m:r>
-            <w:rPr>
-              <w:rFonts w:ascii="Cambria Math" w:hAnsi="Cambria Math"/>
-            </w:rPr>
-            <m:t>form</m:t>
-          </m:r>
-        </m:oMath>
-      </m:oMathPara>
-    </w:p>
-    <w:p>
-      <w:pPr>
-        <w:rPr>
-          <w:rFonts w:eastAsiaTheme="minorEastAsia"/>
-        </w:rPr>
-      </w:pPr>
-      <m:oMathPara>
-        <m:oMath>
-          <m:r>
-            <w:rPr>
-              <w:rFonts w:ascii="Cambria Math" w:hAnsi="Cambria Math"/>
-            </w:rPr>
-            <m:t>K</m:t>
-          </m:r>
-          <m:r>
-            <w:rPr>
-              <w:rFonts w:ascii="Cambria Math" w:hAnsi="Cambria Math"/>
-            </w:rPr>
-            <m:t xml:space="preserve">= </m:t>
-          </m:r>
-          <m:f>
-            <m:fPr>
-              <m:ctrlPr>
-                <w:rPr>
-                  <w:rFonts w:ascii="Cambria Math" w:hAnsi="Cambria Math"/>
-                  <w:i/>
-                </w:rPr>
-              </m:ctrlPr>
-            </m:fPr>
-            <m:num>
-              <m:r>
-                <w:rPr>
-                  <w:rFonts w:ascii="Cambria Math" w:hAnsi="Cambria Math"/>
-                </w:rPr>
-                <m:t>V_flow</m:t>
-              </m:r>
-              <m:r>
-                <w:rPr>
-                  <w:rFonts w:ascii="Cambria Math" w:hAnsi="Cambria Math"/>
-                </w:rPr>
-                <m:t>_nominal</m:t>
+                <m:t>V_flow_nominal</m:t>
               </m:r>
             </m:num>
             <m:den>
@@ -13186,8 +13122,6 @@
           </m:f>
         </m:oMath>
       </m:oMathPara>
-      <w:bookmarkStart w:id="30" w:name="_GoBack"/>
-      <w:bookmarkEnd w:id="30"/>
     </w:p>
     <w:p>
       <w:pPr>
@@ -13202,13 +13136,7 @@
               <w:rFonts w:ascii="Cambria Math" w:eastAsiaTheme="minorEastAsia" w:hAnsi="Cambria Math"/>
             </w:rPr>
             <w:lastRenderedPageBreak/>
-            <m:t>m_flow=</m:t>
-          </m:r>
-          <m:r>
-            <w:rPr>
-              <w:rFonts w:ascii="Cambria Math" w:eastAsiaTheme="minorEastAsia" w:hAnsi="Cambria Math"/>
-            </w:rPr>
-            <m:t>d×K×dp</m:t>
+            <m:t>m_flow=d×K×dp</m:t>
           </m:r>
         </m:oMath>
       </m:oMathPara>
@@ -13234,7 +13162,7 @@
           <w:lang w:val="fr-FR"/>
         </w:rPr>
       </w:pPr>
-      <w:bookmarkStart w:id="31" w:name="_Toc41656119"/>
+      <w:bookmarkStart w:id="30" w:name="_Toc41656119"/>
       <w:proofErr w:type="spellStart"/>
       <w:r>
         <w:rPr>
@@ -13242,7 +13170,7 @@
         </w:rPr>
         <w:t>BasesClasses</w:t>
       </w:r>
-      <w:bookmarkEnd w:id="31"/>
+      <w:bookmarkEnd w:id="30"/>
       <w:proofErr w:type="spellEnd"/>
     </w:p>
     <w:p>
@@ -13259,7 +13187,7 @@
           <w:rFonts w:eastAsiaTheme="minorEastAsia"/>
         </w:rPr>
       </w:pPr>
-      <w:bookmarkStart w:id="32" w:name="_Toc41656120"/>
+      <w:bookmarkStart w:id="31" w:name="_Toc41656120"/>
       <w:proofErr w:type="spellStart"/>
       <w:r>
         <w:rPr>
@@ -13267,7 +13195,7 @@
         </w:rPr>
         <w:t>AeraulicConvection</w:t>
       </w:r>
-      <w:bookmarkEnd w:id="32"/>
+      <w:bookmarkEnd w:id="31"/>
       <w:proofErr w:type="spellEnd"/>
     </w:p>
     <w:p/>
@@ -13521,7 +13449,7 @@
           <w:rFonts w:eastAsiaTheme="minorEastAsia"/>
         </w:rPr>
       </w:pPr>
-      <w:bookmarkStart w:id="33" w:name="_Toc41656121"/>
+      <w:bookmarkStart w:id="32" w:name="_Toc41656121"/>
       <w:r>
         <w:rPr>
           <w:rFonts w:eastAsiaTheme="minorEastAsia"/>
@@ -13534,7 +13462,7 @@
         </w:rPr>
         <w:t>densation</w:t>
       </w:r>
-      <w:bookmarkEnd w:id="33"/>
+      <w:bookmarkEnd w:id="32"/>
     </w:p>
     <w:p/>
     <w:p>
@@ -13742,7 +13670,7 @@
           <w:rFonts w:eastAsiaTheme="minorEastAsia"/>
         </w:rPr>
       </w:pPr>
-      <w:bookmarkStart w:id="34" w:name="_Toc41656122"/>
+      <w:bookmarkStart w:id="33" w:name="_Toc41656122"/>
       <w:proofErr w:type="spellStart"/>
       <w:r>
         <w:rPr>
@@ -13750,7 +13678,7 @@
         </w:rPr>
         <w:t>MolecularDiffusion</w:t>
       </w:r>
-      <w:bookmarkEnd w:id="34"/>
+      <w:bookmarkEnd w:id="33"/>
       <w:proofErr w:type="spellEnd"/>
     </w:p>
     <w:p/>
@@ -14022,7 +13950,7 @@
           <w:rFonts w:eastAsiaTheme="minorEastAsia"/>
         </w:rPr>
       </w:pPr>
-      <w:bookmarkStart w:id="35" w:name="_Toc41656123"/>
+      <w:bookmarkStart w:id="34" w:name="_Toc41656123"/>
       <w:proofErr w:type="spellStart"/>
       <w:r>
         <w:rPr>
@@ -14030,7 +13958,7 @@
         </w:rPr>
         <w:t>GasNode</w:t>
       </w:r>
-      <w:bookmarkEnd w:id="35"/>
+      <w:bookmarkEnd w:id="34"/>
       <w:proofErr w:type="spellEnd"/>
     </w:p>
     <w:p/>
@@ -14119,7 +14047,13 @@
                 <w:rPr>
                   <w:rFonts w:ascii="Cambria Math" w:hAnsi="Cambria Math"/>
                 </w:rPr>
-                <m:t>dm</m:t>
+                <m:t>d</m:t>
+              </m:r>
+              <m:r>
+                <w:rPr>
+                  <w:rFonts w:ascii="Cambria Math" w:hAnsi="Cambria Math"/>
+                </w:rPr>
+                <m:t>m</m:t>
               </m:r>
             </m:num>
             <m:den>
@@ -14237,12 +14171,12 @@
       <w:pPr>
         <w:pStyle w:val="Titre3"/>
       </w:pPr>
-      <w:bookmarkStart w:id="36" w:name="_Toc41656124"/>
+      <w:bookmarkStart w:id="35" w:name="_Toc41656124"/>
       <w:proofErr w:type="spellStart"/>
       <w:r>
         <w:t>FogModel</w:t>
       </w:r>
-      <w:bookmarkEnd w:id="36"/>
+      <w:bookmarkEnd w:id="35"/>
       <w:proofErr w:type="spellEnd"/>
     </w:p>
     <w:p/>
@@ -14532,7 +14466,21 @@
             <w:rPr>
               <w:rFonts w:ascii="Cambria Math" w:eastAsiaTheme="minorEastAsia" w:hAnsi="Cambria Math"/>
             </w:rPr>
-            <m:t>=12×π×</m:t>
+            <m:t>=</m:t>
+          </m:r>
+          <w:bookmarkStart w:id="36" w:name="_GoBack"/>
+          <w:bookmarkEnd w:id="36"/>
+          <m:r>
+            <w:rPr>
+              <w:rFonts w:ascii="Cambria Math" w:eastAsiaTheme="minorEastAsia" w:hAnsi="Cambria Math"/>
+            </w:rPr>
+            <m:t>3</m:t>
+          </m:r>
+          <m:r>
+            <w:rPr>
+              <w:rFonts w:ascii="Cambria Math" w:eastAsiaTheme="minorEastAsia" w:hAnsi="Cambria Math"/>
+            </w:rPr>
+            <m:t>×π×</m:t>
           </m:r>
           <m:sSub>
             <m:sSubPr>
@@ -15019,7 +14967,13 @@
                 <w:rPr>
                   <w:rFonts w:ascii="Cambria Math" w:eastAsiaTheme="minorEastAsia" w:hAnsi="Cambria Math"/>
                 </w:rPr>
-                <m:t>liquid</m:t>
+                <m:t>l</m:t>
+              </m:r>
+              <m:r>
+                <w:rPr>
+                  <w:rFonts w:ascii="Cambria Math" w:eastAsiaTheme="minorEastAsia" w:hAnsi="Cambria Math"/>
+                </w:rPr>
+                <m:t>iquid</m:t>
               </m:r>
             </m:sub>
           </m:sSub>
@@ -15538,189 +15492,27 @@
         </m:oMath>
       </m:oMathPara>
     </w:p>
-    <w:p>
-      <w:pPr>
-        <w:rPr>
-          <w:rFonts w:eastAsiaTheme="minorEastAsia"/>
-        </w:rPr>
-      </w:pPr>
-    </w:p>
-    <w:p>
-      <w:pPr>
-        <w:rPr>
-          <w:rFonts w:eastAsiaTheme="minorEastAsia"/>
-        </w:rPr>
-      </w:pPr>
-    </w:p>
-    <w:p>
-      <w:pPr>
-        <w:pStyle w:val="Titre2"/>
-      </w:pPr>
-      <w:bookmarkStart w:id="37" w:name="_Toc41656125"/>
+    <w:p/>
+    <w:p>
+      <w:pPr>
+        <w:pStyle w:val="Titre3"/>
+      </w:pPr>
+      <w:proofErr w:type="spellStart"/>
       <w:r>
         <w:lastRenderedPageBreak/>
-        <w:t>Functions</w:t>
+        <w:t>Interface_liq_gas</w:t>
       </w:r>
-      <w:bookmarkEnd w:id="37"/>
-    </w:p>
-    <w:p>
-      <w:pPr>
-        <w:rPr>
-          <w:lang w:val="fr-FR"/>
-        </w:rPr>
-      </w:pPr>
-    </w:p>
-    <w:p>
-      <w:pPr>
-        <w:pStyle w:val="Titre3"/>
-        <w:rPr>
-          <w:rFonts w:eastAsiaTheme="minorEastAsia"/>
-        </w:rPr>
-      </w:pPr>
-      <w:bookmarkStart w:id="38" w:name="_Toc41656126"/>
-      <w:r>
-        <w:rPr>
-          <w:rFonts w:eastAsiaTheme="minorEastAsia"/>
-        </w:rPr>
-        <w:t>rootsPolyorder3</w:t>
-      </w:r>
-      <w:bookmarkEnd w:id="38"/>
+      <w:proofErr w:type="spellEnd"/>
     </w:p>
     <w:p/>
     <w:p>
-      <w:pPr>
-        <w:ind w:left="-567" w:right="-567"/>
-        <w:rPr>
-          <w:rFonts w:eastAsiaTheme="minorEastAsia"/>
-        </w:rPr>
-      </w:pPr>
       <m:oMathPara>
         <m:oMath>
           <m:r>
             <w:rPr>
               <w:rFonts w:ascii="Cambria Math" w:eastAsiaTheme="minorEastAsia" w:hAnsi="Cambria Math"/>
             </w:rPr>
-            <m:t>P</m:t>
-          </m:r>
-          <m:d>
-            <m:dPr>
-              <m:ctrlPr>
-                <w:rPr>
-                  <w:rFonts w:ascii="Cambria Math" w:eastAsiaTheme="minorEastAsia" w:hAnsi="Cambria Math"/>
-                  <w:i/>
-                </w:rPr>
-              </m:ctrlPr>
-            </m:dPr>
-            <m:e>
-              <m:r>
-                <w:rPr>
-                  <w:rFonts w:ascii="Cambria Math" w:eastAsiaTheme="minorEastAsia" w:hAnsi="Cambria Math"/>
-                </w:rPr>
-                <m:t>x</m:t>
-              </m:r>
-            </m:e>
-          </m:d>
-          <m:r>
-            <w:rPr>
-              <w:rFonts w:ascii="Cambria Math" w:eastAsiaTheme="minorEastAsia" w:hAnsi="Cambria Math"/>
-            </w:rPr>
-            <m:t>: a</m:t>
-          </m:r>
-          <m:sSup>
-            <m:sSupPr>
-              <m:ctrlPr>
-                <w:rPr>
-                  <w:rFonts w:ascii="Cambria Math" w:eastAsiaTheme="minorEastAsia" w:hAnsi="Cambria Math"/>
-                  <w:i/>
-                </w:rPr>
-              </m:ctrlPr>
-            </m:sSupPr>
-            <m:e>
-              <m:r>
-                <w:rPr>
-                  <w:rFonts w:ascii="Cambria Math" w:eastAsiaTheme="minorEastAsia" w:hAnsi="Cambria Math"/>
-                </w:rPr>
-                <m:t>x</m:t>
-              </m:r>
-            </m:e>
-            <m:sup>
-              <m:r>
-                <w:rPr>
-                  <w:rFonts w:ascii="Cambria Math" w:eastAsiaTheme="minorEastAsia" w:hAnsi="Cambria Math"/>
-                </w:rPr>
-                <m:t>3</m:t>
-              </m:r>
-            </m:sup>
-          </m:sSup>
-          <m:r>
-            <w:rPr>
-              <w:rFonts w:ascii="Cambria Math" w:eastAsiaTheme="minorEastAsia" w:hAnsi="Cambria Math"/>
-            </w:rPr>
-            <m:t>+b</m:t>
-          </m:r>
-          <m:sSup>
-            <m:sSupPr>
-              <m:ctrlPr>
-                <w:rPr>
-                  <w:rFonts w:ascii="Cambria Math" w:eastAsiaTheme="minorEastAsia" w:hAnsi="Cambria Math"/>
-                  <w:i/>
-                </w:rPr>
-              </m:ctrlPr>
-            </m:sSupPr>
-            <m:e>
-              <m:r>
-                <w:rPr>
-                  <w:rFonts w:ascii="Cambria Math" w:eastAsiaTheme="minorEastAsia" w:hAnsi="Cambria Math"/>
-                </w:rPr>
-                <m:t>x</m:t>
-              </m:r>
-            </m:e>
-            <m:sup>
-              <m:r>
-                <w:rPr>
-                  <w:rFonts w:ascii="Cambria Math" w:eastAsiaTheme="minorEastAsia" w:hAnsi="Cambria Math"/>
-                </w:rPr>
-                <m:t>2</m:t>
-              </m:r>
-            </m:sup>
-          </m:sSup>
-          <m:r>
-            <w:rPr>
-              <w:rFonts w:ascii="Cambria Math" w:eastAsiaTheme="minorEastAsia" w:hAnsi="Cambria Math"/>
-            </w:rPr>
-            <m:t>+cx+d=0</m:t>
-          </m:r>
-        </m:oMath>
-      </m:oMathPara>
-    </w:p>
-    <w:p>
-      <w:pPr>
-        <w:ind w:left="-567" w:right="-567"/>
-        <w:rPr>
-          <w:rFonts w:eastAsiaTheme="minorEastAsia"/>
-        </w:rPr>
-      </w:pPr>
-      <w:r>
-        <w:rPr>
-          <w:rFonts w:eastAsiaTheme="minorEastAsia"/>
-        </w:rPr>
-        <w:t>Si discriminant = 0</w:t>
-      </w:r>
-    </w:p>
-    <w:p>
-      <w:pPr>
-        <w:ind w:left="-567" w:right="-567"/>
-        <w:rPr>
-          <w:rFonts w:eastAsiaTheme="minorEastAsia"/>
-        </w:rPr>
-      </w:pPr>
-      <m:oMathPara>
-        <m:oMath>
-          <m:r>
-            <w:rPr>
-              <w:rFonts w:ascii="Cambria Math" w:eastAsiaTheme="minorEastAsia" w:hAnsi="Cambria Math"/>
-            </w:rPr>
-            <m:t>x1=</m:t>
+            <m:t>Xg=</m:t>
           </m:r>
           <m:f>
             <m:fPr>
@@ -15736,7 +15528,7 @@
                 <w:rPr>
                   <w:rFonts w:ascii="Cambria Math" w:eastAsiaTheme="minorEastAsia" w:hAnsi="Cambria Math"/>
                 </w:rPr>
-                <m:t>3q</m:t>
+                <m:t>h-h_bubble</m:t>
               </m:r>
             </m:num>
             <m:den>
@@ -15744,39 +15536,7 @@
                 <w:rPr>
                   <w:rFonts w:ascii="Cambria Math" w:eastAsiaTheme="minorEastAsia" w:hAnsi="Cambria Math"/>
                 </w:rPr>
-                <m:t>p</m:t>
-              </m:r>
-            </m:den>
-          </m:f>
-          <m:r>
-            <w:rPr>
-              <w:rFonts w:ascii="Cambria Math" w:eastAsiaTheme="minorEastAsia" w:hAnsi="Cambria Math"/>
-            </w:rPr>
-            <m:t>-</m:t>
-          </m:r>
-          <m:f>
-            <m:fPr>
-              <m:ctrlPr>
-                <w:rPr>
-                  <w:rFonts w:ascii="Cambria Math" w:eastAsiaTheme="minorEastAsia" w:hAnsi="Cambria Math"/>
-                  <w:i/>
-                </w:rPr>
-              </m:ctrlPr>
-            </m:fPr>
-            <m:num>
-              <m:r>
-                <w:rPr>
-                  <w:rFonts w:ascii="Cambria Math" w:eastAsiaTheme="minorEastAsia" w:hAnsi="Cambria Math"/>
-                </w:rPr>
-                <m:t>b</m:t>
-              </m:r>
-            </m:num>
-            <m:den>
-              <m:r>
-                <w:rPr>
-                  <w:rFonts w:ascii="Cambria Math" w:eastAsiaTheme="minorEastAsia" w:hAnsi="Cambria Math"/>
-                </w:rPr>
-                <m:t>3a</m:t>
+                <m:t>h_dew-h_bubble</m:t>
               </m:r>
             </m:den>
           </m:f>
@@ -15785,7 +15545,6 @@
     </w:p>
     <w:p>
       <w:pPr>
-        <w:ind w:left="-567" w:right="-567"/>
         <w:rPr>
           <w:rFonts w:eastAsiaTheme="minorEastAsia"/>
         </w:rPr>
@@ -15796,7 +15555,7 @@
             <w:rPr>
               <w:rFonts w:ascii="Cambria Math" w:eastAsiaTheme="minorEastAsia" w:hAnsi="Cambria Math"/>
             </w:rPr>
-            <m:t>x2=x3=-</m:t>
+            <m:t>Xg=</m:t>
           </m:r>
           <m:f>
             <m:fPr>
@@ -15808,27 +15567,67 @@
               </m:ctrlPr>
             </m:fPr>
             <m:num>
-              <m:r>
-                <w:rPr>
-                  <w:rFonts w:ascii="Cambria Math" w:eastAsiaTheme="minorEastAsia" w:hAnsi="Cambria Math"/>
-                </w:rPr>
-                <m:t>3q</m:t>
-              </m:r>
+              <m:sSub>
+                <m:sSubPr>
+                  <m:ctrlPr>
+                    <w:rPr>
+                      <w:rFonts w:ascii="Cambria Math" w:eastAsiaTheme="minorEastAsia" w:hAnsi="Cambria Math"/>
+                      <w:i/>
+                    </w:rPr>
+                  </m:ctrlPr>
+                </m:sSubPr>
+                <m:e>
+                  <m:r>
+                    <w:rPr>
+                      <w:rFonts w:ascii="Cambria Math" w:eastAsiaTheme="minorEastAsia" w:hAnsi="Cambria Math"/>
+                    </w:rPr>
+                    <m:t>m</m:t>
+                  </m:r>
+                </m:e>
+                <m:sub>
+                  <m:r>
+                    <w:rPr>
+                      <w:rFonts w:ascii="Cambria Math" w:eastAsiaTheme="minorEastAsia" w:hAnsi="Cambria Math"/>
+                    </w:rPr>
+                    <m:t>bubble</m:t>
+                  </m:r>
+                </m:sub>
+              </m:sSub>
             </m:num>
             <m:den>
-              <m:r>
-                <w:rPr>
-                  <w:rFonts w:ascii="Cambria Math" w:eastAsiaTheme="minorEastAsia" w:hAnsi="Cambria Math"/>
-                </w:rPr>
-                <m:t>2p</m:t>
-              </m:r>
+              <m:sSub>
+                <m:sSubPr>
+                  <m:ctrlPr>
+                    <w:rPr>
+                      <w:rFonts w:ascii="Cambria Math" w:eastAsiaTheme="minorEastAsia" w:hAnsi="Cambria Math"/>
+                      <w:i/>
+                    </w:rPr>
+                  </m:ctrlPr>
+                </m:sSubPr>
+                <m:e>
+                  <m:r>
+                    <w:rPr>
+                      <w:rFonts w:ascii="Cambria Math" w:eastAsiaTheme="minorEastAsia" w:hAnsi="Cambria Math"/>
+                    </w:rPr>
+                    <m:t>m</m:t>
+                  </m:r>
+                </m:e>
+                <m:sub>
+                  <m:r>
+                    <w:rPr>
+                      <w:rFonts w:ascii="Cambria Math" w:eastAsiaTheme="minorEastAsia" w:hAnsi="Cambria Math"/>
+                    </w:rPr>
+                    <m:t>tot</m:t>
+                  </m:r>
+                </m:sub>
+              </m:sSub>
             </m:den>
           </m:f>
           <m:r>
             <w:rPr>
               <w:rFonts w:ascii="Cambria Math" w:eastAsiaTheme="minorEastAsia" w:hAnsi="Cambria Math"/>
             </w:rPr>
-            <m:t>-</m:t>
+            <m:t>=</m:t>
           </m:r>
           <m:f>
             <m:fPr>
@@ -15840,19 +15639,135 @@
               </m:ctrlPr>
             </m:fPr>
             <m:num>
-              <m:r>
-                <w:rPr>
-                  <w:rFonts w:ascii="Cambria Math" w:eastAsiaTheme="minorEastAsia" w:hAnsi="Cambria Math"/>
-                </w:rPr>
-                <m:t>b</m:t>
-              </m:r>
+              <m:sSub>
+                <m:sSubPr>
+                  <m:ctrlPr>
+                    <w:rPr>
+                      <w:rFonts w:ascii="Cambria Math" w:eastAsiaTheme="minorEastAsia" w:hAnsi="Cambria Math"/>
+                      <w:i/>
+                    </w:rPr>
+                  </m:ctrlPr>
+                </m:sSubPr>
+                <m:e>
+                  <m:r>
+                    <w:rPr>
+                      <w:rFonts w:ascii="Cambria Math" w:eastAsiaTheme="minorEastAsia" w:hAnsi="Cambria Math"/>
+                    </w:rPr>
+                    <m:t>d_sat</m:t>
+                  </m:r>
+                </m:e>
+                <m:sub>
+                  <m:r>
+                    <w:rPr>
+                      <w:rFonts w:ascii="Cambria Math" w:eastAsiaTheme="minorEastAsia" w:hAnsi="Cambria Math"/>
+                    </w:rPr>
+                    <m:t>dew</m:t>
+                  </m:r>
+                </m:sub>
+              </m:sSub>
+              <m:r>
+                <w:rPr>
+                  <w:rFonts w:ascii="Cambria Math" w:eastAsiaTheme="minorEastAsia" w:hAnsi="Cambria Math"/>
+                </w:rPr>
+                <m:t>×V×n_bubbles×</m:t>
+              </m:r>
+              <m:f>
+                <m:fPr>
+                  <m:ctrlPr>
+                    <w:rPr>
+                      <w:rFonts w:ascii="Cambria Math" w:eastAsiaTheme="minorEastAsia" w:hAnsi="Cambria Math"/>
+                      <w:i/>
+                    </w:rPr>
+                  </m:ctrlPr>
+                </m:fPr>
+                <m:num>
+                  <m:r>
+                    <w:rPr>
+                      <w:rFonts w:ascii="Cambria Math" w:eastAsiaTheme="minorEastAsia" w:hAnsi="Cambria Math"/>
+                    </w:rPr>
+                    <m:t>4</m:t>
+                  </m:r>
+                </m:num>
+                <m:den>
+                  <m:r>
+                    <w:rPr>
+                      <w:rFonts w:ascii="Cambria Math" w:eastAsiaTheme="minorEastAsia" w:hAnsi="Cambria Math"/>
+                    </w:rPr>
+                    <m:t>3</m:t>
+                  </m:r>
+                </m:den>
+              </m:f>
+              <m:r>
+                <w:rPr>
+                  <w:rFonts w:ascii="Cambria Math" w:eastAsiaTheme="minorEastAsia" w:hAnsi="Cambria Math"/>
+                </w:rPr>
+                <m:t>π×</m:t>
+              </m:r>
+              <m:sSup>
+                <m:sSupPr>
+                  <m:ctrlPr>
+                    <w:rPr>
+                      <w:rFonts w:ascii="Cambria Math" w:eastAsiaTheme="minorEastAsia" w:hAnsi="Cambria Math"/>
+                      <w:i/>
+                    </w:rPr>
+                  </m:ctrlPr>
+                </m:sSupPr>
+                <m:e>
+                  <m:d>
+                    <m:dPr>
+                      <m:ctrlPr>
+                        <w:rPr>
+                          <w:rFonts w:ascii="Cambria Math" w:eastAsiaTheme="minorEastAsia" w:hAnsi="Cambria Math"/>
+                          <w:i/>
+                        </w:rPr>
+                      </m:ctrlPr>
+                    </m:dPr>
+                    <m:e>
+                      <m:f>
+                        <m:fPr>
+                          <m:ctrlPr>
+                            <w:rPr>
+                              <w:rFonts w:ascii="Cambria Math" w:eastAsiaTheme="minorEastAsia" w:hAnsi="Cambria Math"/>
+                              <w:i/>
+                            </w:rPr>
+                          </m:ctrlPr>
+                        </m:fPr>
+                        <m:num>
+                          <m:r>
+                            <w:rPr>
+                              <w:rFonts w:ascii="Cambria Math" w:eastAsiaTheme="minorEastAsia" w:hAnsi="Cambria Math"/>
+                            </w:rPr>
+                            <m:t>d_bubble</m:t>
+                          </m:r>
+                        </m:num>
+                        <m:den>
+                          <m:r>
+                            <w:rPr>
+                              <w:rFonts w:ascii="Cambria Math" w:eastAsiaTheme="minorEastAsia" w:hAnsi="Cambria Math"/>
+                            </w:rPr>
+                            <m:t>2</m:t>
+                          </m:r>
+                        </m:den>
+                      </m:f>
+                    </m:e>
+                  </m:d>
+                </m:e>
+                <m:sup>
+                  <m:r>
+                    <w:rPr>
+                      <w:rFonts w:ascii="Cambria Math" w:eastAsiaTheme="minorEastAsia" w:hAnsi="Cambria Math"/>
+                    </w:rPr>
+                    <m:t>3</m:t>
+                  </m:r>
+                </m:sup>
+              </m:sSup>
             </m:num>
             <m:den>
               <m:r>
                 <w:rPr>
                   <w:rFonts w:ascii="Cambria Math" w:eastAsiaTheme="minorEastAsia" w:hAnsi="Cambria Math"/>
                 </w:rPr>
-                <m:t>3a</m:t>
+                <m:t>d×V</m:t>
               </m:r>
             </m:den>
           </m:f>
@@ -15861,6 +15776,813 @@
     </w:p>
     <w:p>
       <w:pPr>
+        <w:rPr>
+          <w:rFonts w:eastAsiaTheme="minorEastAsia"/>
+        </w:rPr>
+      </w:pPr>
+    </w:p>
+    <w:p>
+      <w:pPr>
+        <w:rPr>
+          <w:rFonts w:eastAsiaTheme="minorEastAsia"/>
+        </w:rPr>
+      </w:pPr>
+      <m:oMathPara>
+        <m:oMath>
+          <m:sSub>
+            <m:sSubPr>
+              <m:ctrlPr>
+                <w:rPr>
+                  <w:rFonts w:ascii="Cambria Math" w:eastAsiaTheme="minorEastAsia" w:hAnsi="Cambria Math"/>
+                  <w:i/>
+                </w:rPr>
+              </m:ctrlPr>
+            </m:sSubPr>
+            <m:e>
+              <m:r>
+                <w:rPr>
+                  <w:rFonts w:ascii="Cambria Math" w:eastAsiaTheme="minorEastAsia" w:hAnsi="Cambria Math"/>
+                </w:rPr>
+                <m:t>F</m:t>
+              </m:r>
+            </m:e>
+            <m:sub>
+              <m:r>
+                <w:rPr>
+                  <w:rFonts w:ascii="Cambria Math" w:eastAsiaTheme="minorEastAsia" w:hAnsi="Cambria Math"/>
+                </w:rPr>
+                <m:t>drag</m:t>
+              </m:r>
+            </m:sub>
+          </m:sSub>
+          <m:r>
+            <w:rPr>
+              <w:rFonts w:ascii="Cambria Math" w:eastAsiaTheme="minorEastAsia" w:hAnsi="Cambria Math"/>
+            </w:rPr>
+            <m:t>=</m:t>
+          </m:r>
+          <m:r>
+            <w:rPr>
+              <w:rFonts w:ascii="Cambria Math" w:eastAsiaTheme="minorEastAsia" w:hAnsi="Cambria Math"/>
+            </w:rPr>
+            <m:t>-3</m:t>
+          </m:r>
+          <m:r>
+            <w:rPr>
+              <w:rFonts w:ascii="Cambria Math" w:eastAsiaTheme="minorEastAsia" w:hAnsi="Cambria Math"/>
+            </w:rPr>
+            <m:t>×π×</m:t>
+          </m:r>
+          <m:sSub>
+            <m:sSubPr>
+              <m:ctrlPr>
+                <w:rPr>
+                  <w:rFonts w:ascii="Cambria Math" w:eastAsiaTheme="minorEastAsia" w:hAnsi="Cambria Math"/>
+                  <w:i/>
+                </w:rPr>
+              </m:ctrlPr>
+            </m:sSubPr>
+            <m:e>
+              <m:r>
+                <w:rPr>
+                  <w:rFonts w:ascii="Cambria Math" w:eastAsiaTheme="minorEastAsia" w:hAnsi="Cambria Math"/>
+                </w:rPr>
+                <m:t>μ</m:t>
+              </m:r>
+            </m:e>
+            <m:sub>
+              <m:r>
+                <w:rPr>
+                  <w:rFonts w:ascii="Cambria Math" w:eastAsiaTheme="minorEastAsia" w:hAnsi="Cambria Math"/>
+                </w:rPr>
+                <m:t>fluid</m:t>
+              </m:r>
+            </m:sub>
+          </m:sSub>
+          <m:r>
+            <w:rPr>
+              <w:rFonts w:ascii="Cambria Math" w:eastAsiaTheme="minorEastAsia" w:hAnsi="Cambria Math"/>
+            </w:rPr>
+            <m:t>×d_</m:t>
+          </m:r>
+          <m:r>
+            <w:rPr>
+              <w:rFonts w:ascii="Cambria Math" w:eastAsiaTheme="minorEastAsia" w:hAnsi="Cambria Math"/>
+            </w:rPr>
+            <m:t>bubble</m:t>
+          </m:r>
+          <m:r>
+            <w:rPr>
+              <w:rFonts w:ascii="Cambria Math" w:eastAsiaTheme="minorEastAsia" w:hAnsi="Cambria Math"/>
+            </w:rPr>
+            <m:t>×Vel</m:t>
+          </m:r>
+        </m:oMath>
+      </m:oMathPara>
+    </w:p>
+    <w:p>
+      <w:pPr>
+        <w:rPr>
+          <w:rFonts w:eastAsiaTheme="minorEastAsia"/>
+        </w:rPr>
+      </w:pPr>
+      <m:oMathPara>
+        <m:oMath>
+          <m:r>
+            <w:rPr>
+              <w:rFonts w:ascii="Cambria Math" w:eastAsiaTheme="minorEastAsia" w:hAnsi="Cambria Math"/>
+            </w:rPr>
+            <m:t xml:space="preserve">Π=  </m:t>
+          </m:r>
+          <m:sSub>
+            <m:sSubPr>
+              <m:ctrlPr>
+                <w:rPr>
+                  <w:rFonts w:ascii="Cambria Math" w:eastAsiaTheme="minorEastAsia" w:hAnsi="Cambria Math"/>
+                  <w:i/>
+                </w:rPr>
+              </m:ctrlPr>
+            </m:sSubPr>
+            <m:e>
+              <m:r>
+                <w:rPr>
+                  <w:rFonts w:ascii="Cambria Math" w:eastAsiaTheme="minorEastAsia" w:hAnsi="Cambria Math"/>
+                </w:rPr>
+                <m:t>d_sat</m:t>
+              </m:r>
+            </m:e>
+            <m:sub>
+              <m:r>
+                <w:rPr>
+                  <w:rFonts w:ascii="Cambria Math" w:eastAsiaTheme="minorEastAsia" w:hAnsi="Cambria Math"/>
+                </w:rPr>
+                <m:t>dew</m:t>
+              </m:r>
+            </m:sub>
+          </m:sSub>
+          <m:r>
+            <w:rPr>
+              <w:rFonts w:ascii="Cambria Math" w:eastAsiaTheme="minorEastAsia" w:hAnsi="Cambria Math"/>
+            </w:rPr>
+            <m:t>×</m:t>
+          </m:r>
+          <m:f>
+            <m:fPr>
+              <m:ctrlPr>
+                <w:rPr>
+                  <w:rFonts w:ascii="Cambria Math" w:eastAsiaTheme="minorEastAsia" w:hAnsi="Cambria Math"/>
+                  <w:i/>
+                </w:rPr>
+              </m:ctrlPr>
+            </m:fPr>
+            <m:num>
+              <m:r>
+                <w:rPr>
+                  <w:rFonts w:ascii="Cambria Math" w:eastAsiaTheme="minorEastAsia" w:hAnsi="Cambria Math"/>
+                </w:rPr>
+                <m:t>4</m:t>
+              </m:r>
+            </m:num>
+            <m:den>
+              <m:r>
+                <w:rPr>
+                  <w:rFonts w:ascii="Cambria Math" w:eastAsiaTheme="minorEastAsia" w:hAnsi="Cambria Math"/>
+                </w:rPr>
+                <m:t>3</m:t>
+              </m:r>
+            </m:den>
+          </m:f>
+          <m:r>
+            <w:rPr>
+              <w:rFonts w:ascii="Cambria Math" w:eastAsiaTheme="minorEastAsia" w:hAnsi="Cambria Math"/>
+            </w:rPr>
+            <m:t>×π×</m:t>
+          </m:r>
+          <m:sSup>
+            <m:sSupPr>
+              <m:ctrlPr>
+                <w:rPr>
+                  <w:rFonts w:ascii="Cambria Math" w:eastAsiaTheme="minorEastAsia" w:hAnsi="Cambria Math"/>
+                  <w:i/>
+                </w:rPr>
+              </m:ctrlPr>
+            </m:sSupPr>
+            <m:e>
+              <m:d>
+                <m:dPr>
+                  <m:ctrlPr>
+                    <w:rPr>
+                      <w:rFonts w:ascii="Cambria Math" w:eastAsiaTheme="minorEastAsia" w:hAnsi="Cambria Math"/>
+                      <w:i/>
+                    </w:rPr>
+                  </m:ctrlPr>
+                </m:dPr>
+                <m:e>
+                  <m:f>
+                    <m:fPr>
+                      <m:ctrlPr>
+                        <w:rPr>
+                          <w:rFonts w:ascii="Cambria Math" w:eastAsiaTheme="minorEastAsia" w:hAnsi="Cambria Math"/>
+                          <w:i/>
+                        </w:rPr>
+                      </m:ctrlPr>
+                    </m:fPr>
+                    <m:num>
+                      <m:r>
+                        <w:rPr>
+                          <w:rFonts w:ascii="Cambria Math" w:eastAsiaTheme="minorEastAsia" w:hAnsi="Cambria Math"/>
+                        </w:rPr>
+                        <m:t>d_bubble</m:t>
+                      </m:r>
+                    </m:num>
+                    <m:den>
+                      <m:r>
+                        <w:rPr>
+                          <w:rFonts w:ascii="Cambria Math" w:eastAsiaTheme="minorEastAsia" w:hAnsi="Cambria Math"/>
+                        </w:rPr>
+                        <m:t>2</m:t>
+                      </m:r>
+                    </m:den>
+                  </m:f>
+                </m:e>
+              </m:d>
+            </m:e>
+            <m:sup>
+              <m:r>
+                <w:rPr>
+                  <w:rFonts w:ascii="Cambria Math" w:eastAsiaTheme="minorEastAsia" w:hAnsi="Cambria Math"/>
+                </w:rPr>
+                <m:t>3</m:t>
+              </m:r>
+            </m:sup>
+          </m:sSup>
+          <m:r>
+            <w:rPr>
+              <w:rFonts w:ascii="Cambria Math" w:eastAsiaTheme="minorEastAsia" w:hAnsi="Cambria Math"/>
+            </w:rPr>
+            <m:t>×g</m:t>
+          </m:r>
+        </m:oMath>
+      </m:oMathPara>
+    </w:p>
+    <w:p>
+      <w:pPr>
+        <w:rPr>
+          <w:rFonts w:eastAsiaTheme="minorEastAsia"/>
+        </w:rPr>
+      </w:pPr>
+      <m:oMathPara>
+        <m:oMath>
+          <m:r>
+            <w:rPr>
+              <w:rFonts w:ascii="Cambria Math" w:eastAsiaTheme="minorEastAsia" w:hAnsi="Cambria Math"/>
+            </w:rPr>
+            <m:t>Π+</m:t>
+          </m:r>
+          <m:sSub>
+            <m:sSubPr>
+              <m:ctrlPr>
+                <w:rPr>
+                  <w:rFonts w:ascii="Cambria Math" w:eastAsiaTheme="minorEastAsia" w:hAnsi="Cambria Math"/>
+                  <w:i/>
+                </w:rPr>
+              </m:ctrlPr>
+            </m:sSubPr>
+            <m:e>
+              <m:r>
+                <w:rPr>
+                  <w:rFonts w:ascii="Cambria Math" w:eastAsiaTheme="minorEastAsia" w:hAnsi="Cambria Math"/>
+                </w:rPr>
+                <m:t>F</m:t>
+              </m:r>
+            </m:e>
+            <m:sub>
+              <m:r>
+                <w:rPr>
+                  <w:rFonts w:ascii="Cambria Math" w:eastAsiaTheme="minorEastAsia" w:hAnsi="Cambria Math"/>
+                </w:rPr>
+                <m:t>drag</m:t>
+              </m:r>
+            </m:sub>
+          </m:sSub>
+          <m:r>
+            <w:rPr>
+              <w:rFonts w:ascii="Cambria Math" w:eastAsiaTheme="minorEastAsia" w:hAnsi="Cambria Math"/>
+            </w:rPr>
+            <m:t>=0</m:t>
+          </m:r>
+        </m:oMath>
+      </m:oMathPara>
+    </w:p>
+    <w:p>
+      <w:pPr>
+        <w:rPr>
+          <w:rFonts w:eastAsiaTheme="minorEastAsia"/>
+        </w:rPr>
+      </w:pPr>
+      <m:oMathPara>
+        <m:oMath>
+          <m:r>
+            <w:rPr>
+              <w:rFonts w:ascii="Cambria Math" w:eastAsiaTheme="minorEastAsia" w:hAnsi="Cambria Math"/>
+            </w:rPr>
+            <m:t xml:space="preserve">m_flow= </m:t>
+          </m:r>
+          <m:sSub>
+            <m:sSubPr>
+              <m:ctrlPr>
+                <w:rPr>
+                  <w:rFonts w:ascii="Cambria Math" w:eastAsiaTheme="minorEastAsia" w:hAnsi="Cambria Math"/>
+                  <w:i/>
+                </w:rPr>
+              </m:ctrlPr>
+            </m:sSubPr>
+            <m:e>
+              <m:r>
+                <w:rPr>
+                  <w:rFonts w:ascii="Cambria Math" w:eastAsiaTheme="minorEastAsia" w:hAnsi="Cambria Math"/>
+                </w:rPr>
+                <m:t>d_sat</m:t>
+              </m:r>
+            </m:e>
+            <m:sub>
+              <m:r>
+                <w:rPr>
+                  <w:rFonts w:ascii="Cambria Math" w:eastAsiaTheme="minorEastAsia" w:hAnsi="Cambria Math"/>
+                </w:rPr>
+                <m:t>dew</m:t>
+              </m:r>
+            </m:sub>
+          </m:sSub>
+          <m:r>
+            <w:rPr>
+              <w:rFonts w:ascii="Cambria Math" w:eastAsiaTheme="minorEastAsia" w:hAnsi="Cambria Math"/>
+            </w:rPr>
+            <m:t>×</m:t>
+          </m:r>
+          <m:r>
+            <w:rPr>
+              <w:rFonts w:ascii="Cambria Math" w:eastAsiaTheme="minorEastAsia" w:hAnsi="Cambria Math"/>
+            </w:rPr>
+            <m:t>A</m:t>
+          </m:r>
+          <m:r>
+            <w:rPr>
+              <w:rFonts w:ascii="Cambria Math" w:eastAsiaTheme="minorEastAsia" w:hAnsi="Cambria Math"/>
+            </w:rPr>
+            <m:t>×</m:t>
+          </m:r>
+          <m:r>
+            <w:rPr>
+              <w:rFonts w:ascii="Cambria Math" w:eastAsiaTheme="minorEastAsia" w:hAnsi="Cambria Math"/>
+            </w:rPr>
+            <m:t>n_bubbles</m:t>
+          </m:r>
+          <m:r>
+            <w:rPr>
+              <w:rFonts w:ascii="Cambria Math" w:eastAsiaTheme="minorEastAsia" w:hAnsi="Cambria Math"/>
+            </w:rPr>
+            <m:t>×</m:t>
+          </m:r>
+          <m:f>
+            <m:fPr>
+              <m:ctrlPr>
+                <w:rPr>
+                  <w:rFonts w:ascii="Cambria Math" w:eastAsiaTheme="minorEastAsia" w:hAnsi="Cambria Math"/>
+                  <w:i/>
+                </w:rPr>
+              </m:ctrlPr>
+            </m:fPr>
+            <m:num>
+              <m:r>
+                <w:rPr>
+                  <w:rFonts w:ascii="Cambria Math" w:eastAsiaTheme="minorEastAsia" w:hAnsi="Cambria Math"/>
+                </w:rPr>
+                <m:t>π×</m:t>
+              </m:r>
+              <m:sSup>
+                <m:sSupPr>
+                  <m:ctrlPr>
+                    <w:rPr>
+                      <w:rFonts w:ascii="Cambria Math" w:eastAsiaTheme="minorEastAsia" w:hAnsi="Cambria Math"/>
+                      <w:i/>
+                    </w:rPr>
+                  </m:ctrlPr>
+                </m:sSupPr>
+                <m:e>
+                  <m:r>
+                    <w:rPr>
+                      <w:rFonts w:ascii="Cambria Math" w:eastAsiaTheme="minorEastAsia" w:hAnsi="Cambria Math"/>
+                    </w:rPr>
+                    <m:t>d_bubble</m:t>
+                  </m:r>
+                </m:e>
+                <m:sup>
+                  <m:r>
+                    <w:rPr>
+                      <w:rFonts w:ascii="Cambria Math" w:eastAsiaTheme="minorEastAsia" w:hAnsi="Cambria Math"/>
+                    </w:rPr>
+                    <m:t>3</m:t>
+                  </m:r>
+                </m:sup>
+              </m:sSup>
+            </m:num>
+            <m:den>
+              <m:r>
+                <w:rPr>
+                  <w:rFonts w:ascii="Cambria Math" w:eastAsiaTheme="minorEastAsia" w:hAnsi="Cambria Math"/>
+                </w:rPr>
+                <m:t>6</m:t>
+              </m:r>
+            </m:den>
+          </m:f>
+          <m:r>
+            <w:rPr>
+              <w:rFonts w:ascii="Cambria Math" w:eastAsiaTheme="minorEastAsia" w:hAnsi="Cambria Math"/>
+            </w:rPr>
+            <m:t>× Vel</m:t>
+          </m:r>
+        </m:oMath>
+      </m:oMathPara>
+    </w:p>
+    <w:p>
+      <w:pPr>
+        <w:rPr>
+          <w:rFonts w:eastAsiaTheme="minorEastAsia"/>
+        </w:rPr>
+      </w:pPr>
+    </w:p>
+    <w:p>
+      <w:pPr>
+        <w:rPr>
+          <w:rFonts w:eastAsiaTheme="minorEastAsia"/>
+        </w:rPr>
+      </w:pPr>
+    </w:p>
+    <w:p>
+      <w:pPr>
+        <w:rPr>
+          <w:rFonts w:eastAsiaTheme="minorEastAsia"/>
+        </w:rPr>
+      </w:pPr>
+    </w:p>
+    <w:p>
+      <w:pPr>
+        <w:rPr>
+          <w:rFonts w:eastAsiaTheme="minorEastAsia"/>
+        </w:rPr>
+      </w:pPr>
+    </w:p>
+    <w:p>
+      <w:pPr>
+        <w:rPr>
+          <w:rFonts w:eastAsiaTheme="minorEastAsia"/>
+        </w:rPr>
+      </w:pPr>
+    </w:p>
+    <w:p>
+      <w:pPr>
+        <w:rPr>
+          <w:rFonts w:eastAsiaTheme="minorEastAsia"/>
+        </w:rPr>
+      </w:pPr>
+    </w:p>
+    <w:p>
+      <w:pPr>
+        <w:rPr>
+          <w:rFonts w:eastAsiaTheme="minorEastAsia"/>
+        </w:rPr>
+      </w:pPr>
+    </w:p>
+    <w:p>
+      <w:pPr>
+        <w:rPr>
+          <w:rFonts w:eastAsiaTheme="minorEastAsia"/>
+        </w:rPr>
+      </w:pPr>
+    </w:p>
+    <w:p>
+      <w:pPr>
+        <w:rPr>
+          <w:rFonts w:eastAsiaTheme="minorEastAsia"/>
+        </w:rPr>
+      </w:pPr>
+    </w:p>
+    <w:p>
+      <w:pPr>
+        <w:rPr>
+          <w:rFonts w:eastAsiaTheme="minorEastAsia"/>
+        </w:rPr>
+      </w:pPr>
+    </w:p>
+    <w:p>
+      <w:pPr>
+        <w:pStyle w:val="Titre2"/>
+      </w:pPr>
+      <w:bookmarkStart w:id="37" w:name="_Toc41656125"/>
+      <w:r>
+        <w:t>Functions</w:t>
+      </w:r>
+      <w:bookmarkEnd w:id="37"/>
+    </w:p>
+    <w:p>
+      <w:pPr>
+        <w:rPr>
+          <w:lang w:val="fr-FR"/>
+        </w:rPr>
+      </w:pPr>
+    </w:p>
+    <w:p>
+      <w:pPr>
+        <w:pStyle w:val="Titre3"/>
+        <w:rPr>
+          <w:rFonts w:eastAsiaTheme="minorEastAsia"/>
+        </w:rPr>
+      </w:pPr>
+      <w:bookmarkStart w:id="38" w:name="_Toc41656126"/>
+      <w:r>
+        <w:rPr>
+          <w:rFonts w:eastAsiaTheme="minorEastAsia"/>
+        </w:rPr>
+        <w:t>rootsPolyorder3</w:t>
+      </w:r>
+      <w:bookmarkEnd w:id="38"/>
+    </w:p>
+    <w:p/>
+    <w:p>
+      <w:pPr>
+        <w:ind w:left="-567" w:right="-567"/>
+        <w:rPr>
+          <w:rFonts w:eastAsiaTheme="minorEastAsia"/>
+        </w:rPr>
+      </w:pPr>
+      <m:oMathPara>
+        <m:oMath>
+          <m:r>
+            <w:rPr>
+              <w:rFonts w:ascii="Cambria Math" w:eastAsiaTheme="minorEastAsia" w:hAnsi="Cambria Math"/>
+            </w:rPr>
+            <m:t>P</m:t>
+          </m:r>
+          <m:d>
+            <m:dPr>
+              <m:ctrlPr>
+                <w:rPr>
+                  <w:rFonts w:ascii="Cambria Math" w:eastAsiaTheme="minorEastAsia" w:hAnsi="Cambria Math"/>
+                  <w:i/>
+                </w:rPr>
+              </m:ctrlPr>
+            </m:dPr>
+            <m:e>
+              <m:r>
+                <w:rPr>
+                  <w:rFonts w:ascii="Cambria Math" w:eastAsiaTheme="minorEastAsia" w:hAnsi="Cambria Math"/>
+                </w:rPr>
+                <m:t>x</m:t>
+              </m:r>
+            </m:e>
+          </m:d>
+          <m:r>
+            <w:rPr>
+              <w:rFonts w:ascii="Cambria Math" w:eastAsiaTheme="minorEastAsia" w:hAnsi="Cambria Math"/>
+            </w:rPr>
+            <m:t>: a</m:t>
+          </m:r>
+          <m:sSup>
+            <m:sSupPr>
+              <m:ctrlPr>
+                <w:rPr>
+                  <w:rFonts w:ascii="Cambria Math" w:eastAsiaTheme="minorEastAsia" w:hAnsi="Cambria Math"/>
+                  <w:i/>
+                </w:rPr>
+              </m:ctrlPr>
+            </m:sSupPr>
+            <m:e>
+              <m:r>
+                <w:rPr>
+                  <w:rFonts w:ascii="Cambria Math" w:eastAsiaTheme="minorEastAsia" w:hAnsi="Cambria Math"/>
+                </w:rPr>
+                <m:t>x</m:t>
+              </m:r>
+            </m:e>
+            <m:sup>
+              <m:r>
+                <w:rPr>
+                  <w:rFonts w:ascii="Cambria Math" w:eastAsiaTheme="minorEastAsia" w:hAnsi="Cambria Math"/>
+                </w:rPr>
+                <m:t>3</m:t>
+              </m:r>
+            </m:sup>
+          </m:sSup>
+          <m:r>
+            <w:rPr>
+              <w:rFonts w:ascii="Cambria Math" w:eastAsiaTheme="minorEastAsia" w:hAnsi="Cambria Math"/>
+            </w:rPr>
+            <m:t>+b</m:t>
+          </m:r>
+          <m:sSup>
+            <m:sSupPr>
+              <m:ctrlPr>
+                <w:rPr>
+                  <w:rFonts w:ascii="Cambria Math" w:eastAsiaTheme="minorEastAsia" w:hAnsi="Cambria Math"/>
+                  <w:i/>
+                </w:rPr>
+              </m:ctrlPr>
+            </m:sSupPr>
+            <m:e>
+              <m:r>
+                <w:rPr>
+                  <w:rFonts w:ascii="Cambria Math" w:eastAsiaTheme="minorEastAsia" w:hAnsi="Cambria Math"/>
+                </w:rPr>
+                <m:t>x</m:t>
+              </m:r>
+            </m:e>
+            <m:sup>
+              <m:r>
+                <w:rPr>
+                  <w:rFonts w:ascii="Cambria Math" w:eastAsiaTheme="minorEastAsia" w:hAnsi="Cambria Math"/>
+                </w:rPr>
+                <m:t>2</m:t>
+              </m:r>
+            </m:sup>
+          </m:sSup>
+          <m:r>
+            <w:rPr>
+              <w:rFonts w:ascii="Cambria Math" w:eastAsiaTheme="minorEastAsia" w:hAnsi="Cambria Math"/>
+            </w:rPr>
+            <m:t>+cx+d=0</m:t>
+          </m:r>
+        </m:oMath>
+      </m:oMathPara>
+    </w:p>
+    <w:p>
+      <w:pPr>
+        <w:ind w:left="-567" w:right="-567"/>
+        <w:rPr>
+          <w:rFonts w:eastAsiaTheme="minorEastAsia"/>
+        </w:rPr>
+      </w:pPr>
+      <w:r>
+        <w:rPr>
+          <w:rFonts w:eastAsiaTheme="minorEastAsia"/>
+        </w:rPr>
+        <w:t>Si discriminant = 0</w:t>
+      </w:r>
+    </w:p>
+    <w:p>
+      <w:pPr>
+        <w:ind w:left="-567" w:right="-567"/>
+        <w:rPr>
+          <w:rFonts w:eastAsiaTheme="minorEastAsia"/>
+        </w:rPr>
+      </w:pPr>
+      <m:oMathPara>
+        <m:oMath>
+          <m:r>
+            <w:rPr>
+              <w:rFonts w:ascii="Cambria Math" w:eastAsiaTheme="minorEastAsia" w:hAnsi="Cambria Math"/>
+            </w:rPr>
+            <m:t>x1=</m:t>
+          </m:r>
+          <m:f>
+            <m:fPr>
+              <m:ctrlPr>
+                <w:rPr>
+                  <w:rFonts w:ascii="Cambria Math" w:eastAsiaTheme="minorEastAsia" w:hAnsi="Cambria Math"/>
+                  <w:i/>
+                </w:rPr>
+              </m:ctrlPr>
+            </m:fPr>
+            <m:num>
+              <m:r>
+                <w:rPr>
+                  <w:rFonts w:ascii="Cambria Math" w:eastAsiaTheme="minorEastAsia" w:hAnsi="Cambria Math"/>
+                </w:rPr>
+                <m:t>3q</m:t>
+              </m:r>
+            </m:num>
+            <m:den>
+              <m:r>
+                <w:rPr>
+                  <w:rFonts w:ascii="Cambria Math" w:eastAsiaTheme="minorEastAsia" w:hAnsi="Cambria Math"/>
+                </w:rPr>
+                <m:t>p</m:t>
+              </m:r>
+            </m:den>
+          </m:f>
+          <m:r>
+            <w:rPr>
+              <w:rFonts w:ascii="Cambria Math" w:eastAsiaTheme="minorEastAsia" w:hAnsi="Cambria Math"/>
+            </w:rPr>
+            <m:t>-</m:t>
+          </m:r>
+          <m:f>
+            <m:fPr>
+              <m:ctrlPr>
+                <w:rPr>
+                  <w:rFonts w:ascii="Cambria Math" w:eastAsiaTheme="minorEastAsia" w:hAnsi="Cambria Math"/>
+                  <w:i/>
+                </w:rPr>
+              </m:ctrlPr>
+            </m:fPr>
+            <m:num>
+              <m:r>
+                <w:rPr>
+                  <w:rFonts w:ascii="Cambria Math" w:eastAsiaTheme="minorEastAsia" w:hAnsi="Cambria Math"/>
+                </w:rPr>
+                <m:t>b</m:t>
+              </m:r>
+            </m:num>
+            <m:den>
+              <m:r>
+                <w:rPr>
+                  <w:rFonts w:ascii="Cambria Math" w:eastAsiaTheme="minorEastAsia" w:hAnsi="Cambria Math"/>
+                </w:rPr>
+                <m:t>3a</m:t>
+              </m:r>
+            </m:den>
+          </m:f>
+        </m:oMath>
+      </m:oMathPara>
+    </w:p>
+    <w:p>
+      <w:pPr>
+        <w:ind w:left="-567" w:right="-567"/>
+        <w:rPr>
+          <w:rFonts w:eastAsiaTheme="minorEastAsia"/>
+        </w:rPr>
+      </w:pPr>
+      <m:oMathPara>
+        <m:oMath>
+          <m:r>
+            <w:rPr>
+              <w:rFonts w:ascii="Cambria Math" w:eastAsiaTheme="minorEastAsia" w:hAnsi="Cambria Math"/>
+            </w:rPr>
+            <m:t>x2=x3=-</m:t>
+          </m:r>
+          <m:f>
+            <m:fPr>
+              <m:ctrlPr>
+                <w:rPr>
+                  <w:rFonts w:ascii="Cambria Math" w:eastAsiaTheme="minorEastAsia" w:hAnsi="Cambria Math"/>
+                  <w:i/>
+                </w:rPr>
+              </m:ctrlPr>
+            </m:fPr>
+            <m:num>
+              <m:r>
+                <w:rPr>
+                  <w:rFonts w:ascii="Cambria Math" w:eastAsiaTheme="minorEastAsia" w:hAnsi="Cambria Math"/>
+                </w:rPr>
+                <m:t>3q</m:t>
+              </m:r>
+            </m:num>
+            <m:den>
+              <m:r>
+                <w:rPr>
+                  <w:rFonts w:ascii="Cambria Math" w:eastAsiaTheme="minorEastAsia" w:hAnsi="Cambria Math"/>
+                </w:rPr>
+                <m:t>2p</m:t>
+              </m:r>
+            </m:den>
+          </m:f>
+          <m:r>
+            <w:rPr>
+              <w:rFonts w:ascii="Cambria Math" w:eastAsiaTheme="minorEastAsia" w:hAnsi="Cambria Math"/>
+            </w:rPr>
+            <m:t>-</m:t>
+          </m:r>
+          <m:f>
+            <m:fPr>
+              <m:ctrlPr>
+                <w:rPr>
+                  <w:rFonts w:ascii="Cambria Math" w:eastAsiaTheme="minorEastAsia" w:hAnsi="Cambria Math"/>
+                  <w:i/>
+                </w:rPr>
+              </m:ctrlPr>
+            </m:fPr>
+            <m:num>
+              <m:r>
+                <w:rPr>
+                  <w:rFonts w:ascii="Cambria Math" w:eastAsiaTheme="minorEastAsia" w:hAnsi="Cambria Math"/>
+                </w:rPr>
+                <m:t>b</m:t>
+              </m:r>
+            </m:num>
+            <m:den>
+              <m:r>
+                <w:rPr>
+                  <w:rFonts w:ascii="Cambria Math" w:eastAsiaTheme="minorEastAsia" w:hAnsi="Cambria Math"/>
+                </w:rPr>
+                <m:t>3a</m:t>
+              </m:r>
+            </m:den>
+          </m:f>
+        </m:oMath>
+      </m:oMathPara>
+    </w:p>
+    <w:p>
+      <w:pPr>
         <w:ind w:left="-567" w:right="-567"/>
         <w:rPr>
           <w:rFonts w:eastAsiaTheme="minorEastAsia"/>
@@ -15886,6 +16608,7 @@
             <w:rPr>
               <w:rFonts w:ascii="Cambria Math" w:eastAsiaTheme="minorEastAsia" w:hAnsi="Cambria Math"/>
             </w:rPr>
+            <w:lastRenderedPageBreak/>
             <m:t>x1=</m:t>
           </m:r>
           <m:rad>
@@ -17442,7 +18165,6 @@
         <w:rPr>
           <w:rFonts w:eastAsiaTheme="minorEastAsia"/>
         </w:rPr>
-        <w:lastRenderedPageBreak/>
         <w:t>Si discriminant = 0</w:t>
       </w:r>
     </w:p>
@@ -20736,6 +21458,36 @@
     </w:lvlOverride>
   </w:num>
   <w:num w:numId="16">
+    <w:abstractNumId w:val="1"/>
+    <w:lvlOverride w:ilvl="0">
+      <w:startOverride w:val="1"/>
+    </w:lvlOverride>
+    <w:lvlOverride w:ilvl="1">
+      <w:startOverride w:val="1"/>
+    </w:lvlOverride>
+    <w:lvlOverride w:ilvl="2">
+      <w:startOverride w:val="1"/>
+    </w:lvlOverride>
+    <w:lvlOverride w:ilvl="3">
+      <w:startOverride w:val="1"/>
+    </w:lvlOverride>
+    <w:lvlOverride w:ilvl="4">
+      <w:startOverride w:val="1"/>
+    </w:lvlOverride>
+    <w:lvlOverride w:ilvl="5">
+      <w:startOverride w:val="1"/>
+    </w:lvlOverride>
+    <w:lvlOverride w:ilvl="6">
+      <w:startOverride w:val="1"/>
+    </w:lvlOverride>
+    <w:lvlOverride w:ilvl="7">
+      <w:startOverride w:val="1"/>
+    </w:lvlOverride>
+    <w:lvlOverride w:ilvl="8">
+      <w:startOverride w:val="1"/>
+    </w:lvlOverride>
+  </w:num>
+  <w:num w:numId="17">
     <w:abstractNumId w:val="1"/>
     <w:lvlOverride w:ilvl="0">
       <w:startOverride w:val="1"/>
@@ -22357,7 +23109,7 @@
   <a:extraClrSchemeLst/>
   <a:extLst>
     <a:ext uri="{05A4C25C-085E-4340-85A3-A5531E510DB2}">
-      <thm15:themeFamily xmlns:thm15="http://schemas.microsoft.com/office/thememl/2012/main" xmlns="" name="Office Theme" id="{62F939B6-93AF-4DB8-9C6B-D6C7DFDC589F}" vid="{4A3C46E8-61CC-4603-A589-7422A47A8E4A}"/>
+      <thm15:themeFamily xmlns="" xmlns:thm15="http://schemas.microsoft.com/office/thememl/2012/main" name="Office Theme" id="{62F939B6-93AF-4DB8-9C6B-D6C7DFDC589F}" vid="{4A3C46E8-61CC-4603-A589-7422A47A8E4A}"/>
     </a:ext>
   </a:extLst>
 </a:theme>
@@ -22368,7 +23120,7 @@
 </file>
 
 <file path=customXml/itemProps1.xml><?xml version="1.0" encoding="utf-8"?>
-<ds:datastoreItem xmlns:ds="http://schemas.openxmlformats.org/officeDocument/2006/customXml" ds:itemID="{2D6FC420-9210-4C05-B93A-98ACE4A92557}">
+<ds:datastoreItem xmlns:ds="http://schemas.openxmlformats.org/officeDocument/2006/customXml" ds:itemID="{5B64EA85-744D-4249-9342-8283039B246A}">
   <ds:schemaRefs>
     <ds:schemaRef ds:uri="http://schemas.openxmlformats.org/officeDocument/2006/bibliography"/>
   </ds:schemaRefs>

</xml_diff>

<commit_message>
Modification of the description of the PartialDamper module
</commit_message>
<xml_diff>
--- a/Information/script for equations.docx
+++ b/Information/script for equations.docx
@@ -19,6 +19,7 @@
           <w:docPartUnique/>
         </w:docPartObj>
       </w:sdtPr>
+      <w:sdtEndPr/>
       <w:sdtContent>
         <w:p>
           <w:pPr>
@@ -8919,13 +8920,7 @@
             <w:rPr>
               <w:rFonts w:ascii="Cambria Math" w:eastAsiaTheme="minorEastAsia" w:hAnsi="Cambria Math"/>
             </w:rPr>
-            <m:t>dx= B</m:t>
-          </m:r>
-          <m:r>
-            <w:rPr>
-              <w:rFonts w:ascii="Cambria Math" w:eastAsiaTheme="minorEastAsia" w:hAnsi="Cambria Math"/>
-            </w:rPr>
-            <m:t>iot×</m:t>
+            <m:t>dx= Biot×</m:t>
           </m:r>
           <m:f>
             <m:fPr>
@@ -13131,46 +13126,518 @@
       </w:pPr>
       <m:oMathPara>
         <m:oMath>
+          <m:sSub>
+            <m:sSubPr>
+              <m:ctrlPr>
+                <w:rPr>
+                  <w:rFonts w:ascii="Cambria Math" w:eastAsiaTheme="minorEastAsia" w:hAnsi="Cambria Math"/>
+                  <w:i/>
+                </w:rPr>
+              </m:ctrlPr>
+            </m:sSubPr>
+            <m:e>
+              <m:r>
+                <w:rPr>
+                  <w:rFonts w:ascii="Cambria Math" w:eastAsiaTheme="minorEastAsia" w:hAnsi="Cambria Math"/>
+                </w:rPr>
+                <m:t>m</m:t>
+              </m:r>
+            </m:e>
+            <m:sub>
+              <m:r>
+                <w:rPr>
+                  <w:rFonts w:ascii="Cambria Math" w:eastAsiaTheme="minorEastAsia" w:hAnsi="Cambria Math"/>
+                </w:rPr>
+                <m:t>flow</m:t>
+              </m:r>
+            </m:sub>
+          </m:sSub>
           <m:r>
             <w:rPr>
               <w:rFonts w:ascii="Cambria Math" w:eastAsiaTheme="minorEastAsia" w:hAnsi="Cambria Math"/>
             </w:rPr>
-            <w:lastRenderedPageBreak/>
-            <m:t>m_flow=d×K×dp</m:t>
+            <m:t>=d×K×dp</m:t>
           </m:r>
         </m:oMath>
       </m:oMathPara>
     </w:p>
     <w:p>
       <w:pPr>
-        <w:rPr>
-          <w:lang w:val="fr-FR"/>
-        </w:rPr>
-      </w:pPr>
-    </w:p>
-    <w:p>
-      <w:pPr>
-        <w:rPr>
-          <w:lang w:val="fr-FR"/>
-        </w:rPr>
-      </w:pPr>
-    </w:p>
-    <w:p>
-      <w:pPr>
-        <w:pStyle w:val="Titre2"/>
-        <w:rPr>
-          <w:lang w:val="fr-FR"/>
-        </w:rPr>
-      </w:pPr>
-      <w:bookmarkStart w:id="30" w:name="_Toc41656119"/>
+        <w:pStyle w:val="Titre3"/>
+        <w:rPr>
+          <w:rFonts w:asciiTheme="minorHAnsi" w:eastAsiaTheme="minorEastAsia" w:hAnsiTheme="minorHAnsi" w:cstheme="minorBidi"/>
+        </w:rPr>
+      </w:pPr>
       <w:proofErr w:type="spellStart"/>
       <w:r>
         <w:rPr>
+          <w:rFonts w:eastAsiaTheme="minorEastAsia"/>
+        </w:rPr>
+        <w:t>PartialDamper</w:t>
+      </w:r>
+      <w:proofErr w:type="spellEnd"/>
+    </w:p>
+    <w:p>
+      <w:pPr>
+        <w:rPr>
+          <w:rFonts w:eastAsiaTheme="minorEastAsia"/>
+        </w:rPr>
+      </w:pPr>
+    </w:p>
+    <w:p>
+      <w:pPr>
+        <w:rPr>
+          <w:rFonts w:eastAsiaTheme="minorEastAsia"/>
+        </w:rPr>
+      </w:pPr>
+      <m:oMathPara>
+        <m:oMath>
+          <m:r>
+            <w:rPr>
+              <w:rFonts w:ascii="Cambria Math" w:hAnsi="Cambria Math"/>
+            </w:rPr>
+            <m:t>Kv</m:t>
+          </m:r>
+          <m:r>
+            <w:rPr>
+              <w:rFonts w:ascii="Cambria Math" w:hAnsi="Cambria Math"/>
+            </w:rPr>
+            <m:t xml:space="preserve"> </m:t>
+          </m:r>
+          <m:r>
+            <w:rPr>
+              <w:rFonts w:ascii="Cambria Math" w:hAnsi="Cambria Math"/>
+            </w:rPr>
+            <m:t xml:space="preserve">,Cv= </m:t>
+          </m:r>
+          <m:f>
+            <m:fPr>
+              <m:ctrlPr>
+                <w:rPr>
+                  <w:rFonts w:ascii="Cambria Math" w:hAnsi="Cambria Math"/>
+                  <w:i/>
+                </w:rPr>
+              </m:ctrlPr>
+            </m:fPr>
+            <m:num>
+              <m:r>
+                <w:rPr>
+                  <w:rFonts w:ascii="Cambria Math" w:hAnsi="Cambria Math"/>
+                </w:rPr>
+                <m:t>m_flow</m:t>
+              </m:r>
+            </m:num>
+            <m:den>
+              <m:sSub>
+                <m:sSubPr>
+                  <m:ctrlPr>
+                    <w:rPr>
+                      <w:rFonts w:ascii="Cambria Math" w:hAnsi="Cambria Math"/>
+                      <w:i/>
+                    </w:rPr>
+                  </m:ctrlPr>
+                </m:sSubPr>
+                <m:e>
+                  <m:r>
+                    <w:rPr>
+                      <w:rFonts w:ascii="Cambria Math" w:hAnsi="Cambria Math"/>
+                    </w:rPr>
+                    <m:t>N</m:t>
+                  </m:r>
+                </m:e>
+                <m:sub>
+                  <m:r>
+                    <w:rPr>
+                      <w:rFonts w:ascii="Cambria Math" w:hAnsi="Cambria Math"/>
+                    </w:rPr>
+                    <m:t>6</m:t>
+                  </m:r>
+                </m:sub>
+              </m:sSub>
+              <m:r>
+                <w:rPr>
+                  <w:rFonts w:ascii="Cambria Math" w:hAnsi="Cambria Math"/>
+                </w:rPr>
+                <m:t>×Y×</m:t>
+              </m:r>
+              <m:rad>
+                <m:radPr>
+                  <m:degHide m:val="1"/>
+                  <m:ctrlPr>
+                    <w:rPr>
+                      <w:rFonts w:ascii="Cambria Math" w:hAnsi="Cambria Math"/>
+                      <w:i/>
+                    </w:rPr>
+                  </m:ctrlPr>
+                </m:radPr>
+                <m:deg/>
+                <m:e>
+                  <m:r>
+                    <w:rPr>
+                      <w:rFonts w:ascii="Cambria Math" w:hAnsi="Cambria Math"/>
+                    </w:rPr>
+                    <m:t>xs</m:t>
+                  </m:r>
+                  <m:r>
+                    <w:rPr>
+                      <w:rFonts w:ascii="Cambria Math" w:hAnsi="Cambria Math"/>
+                    </w:rPr>
+                    <m:t>×p×d</m:t>
+                  </m:r>
+                </m:e>
+              </m:rad>
+            </m:den>
+          </m:f>
+        </m:oMath>
+      </m:oMathPara>
+    </w:p>
+    <w:p>
+      <w:pPr>
+        <w:rPr>
+          <w:rFonts w:eastAsiaTheme="minorEastAsia"/>
+        </w:rPr>
+      </w:pPr>
+      <m:oMathPara>
+        <m:oMath>
+          <m:r>
+            <w:rPr>
+              <w:rFonts w:ascii="Cambria Math" w:hAnsi="Cambria Math"/>
+            </w:rPr>
+            <m:t>xs</m:t>
+          </m:r>
+          <m:r>
+            <w:rPr>
+              <w:rFonts w:ascii="Cambria Math" w:hAnsi="Cambria Math"/>
+            </w:rPr>
+            <m:t xml:space="preserve">= </m:t>
+          </m:r>
+          <m:r>
+            <m:rPr>
+              <m:sty m:val="p"/>
+            </m:rPr>
+            <w:rPr>
+              <w:rFonts w:ascii="Cambria Math" w:hAnsi="Cambria Math"/>
+            </w:rPr>
+            <m:t>min⁡</m:t>
+          </m:r>
+          <m:r>
+            <w:rPr>
+              <w:rFonts w:ascii="Cambria Math" w:hAnsi="Cambria Math"/>
+            </w:rPr>
+            <m:t>(x</m:t>
+          </m:r>
+          <m:r>
+            <w:rPr>
+              <w:rFonts w:ascii="Cambria Math" w:hAnsi="Cambria Math"/>
+            </w:rPr>
+            <m:t xml:space="preserve"> </m:t>
+          </m:r>
+          <m:r>
+            <w:rPr>
+              <w:rFonts w:ascii="Cambria Math" w:hAnsi="Cambria Math"/>
+            </w:rPr>
+            <m:t>,</m:t>
+          </m:r>
+          <m:r>
+            <w:rPr>
+              <w:rFonts w:ascii="Cambria Math" w:hAnsi="Cambria Math"/>
+            </w:rPr>
+            <m:t xml:space="preserve"> </m:t>
+          </m:r>
+          <m:sSub>
+            <m:sSubPr>
+              <m:ctrlPr>
+                <w:rPr>
+                  <w:rFonts w:ascii="Cambria Math" w:hAnsi="Cambria Math"/>
+                  <w:i/>
+                </w:rPr>
+              </m:ctrlPr>
+            </m:sSubPr>
+            <m:e>
+              <m:r>
+                <w:rPr>
+                  <w:rFonts w:ascii="Cambria Math" w:hAnsi="Cambria Math"/>
+                </w:rPr>
+                <m:t>F</m:t>
+              </m:r>
+            </m:e>
+            <m:sub>
+              <m:r>
+                <w:rPr>
+                  <w:rFonts w:ascii="Cambria Math" w:hAnsi="Cambria Math"/>
+                </w:rPr>
+                <m:t>γ</m:t>
+              </m:r>
+            </m:sub>
+          </m:sSub>
+          <m:r>
+            <w:rPr>
+              <w:rFonts w:ascii="Cambria Math" w:hAnsi="Cambria Math"/>
+            </w:rPr>
+            <m:t>×</m:t>
+          </m:r>
+          <m:sSub>
+            <m:sSubPr>
+              <m:ctrlPr>
+                <w:rPr>
+                  <w:rFonts w:ascii="Cambria Math" w:hAnsi="Cambria Math"/>
+                  <w:i/>
+                </w:rPr>
+              </m:ctrlPr>
+            </m:sSubPr>
+            <m:e>
+              <m:r>
+                <w:rPr>
+                  <w:rFonts w:ascii="Cambria Math" w:hAnsi="Cambria Math"/>
+                </w:rPr>
+                <m:t>x</m:t>
+              </m:r>
+            </m:e>
+            <m:sub>
+              <m:r>
+                <w:rPr>
+                  <w:rFonts w:ascii="Cambria Math" w:hAnsi="Cambria Math"/>
+                </w:rPr>
+                <m:t>T</m:t>
+              </m:r>
+            </m:sub>
+          </m:sSub>
+          <m:r>
+            <w:rPr>
+              <w:rFonts w:ascii="Cambria Math" w:hAnsi="Cambria Math"/>
+            </w:rPr>
+            <m:t>)</m:t>
+          </m:r>
+        </m:oMath>
+      </m:oMathPara>
+    </w:p>
+    <w:p>
+      <w:pPr>
+        <w:rPr>
+          <w:rFonts w:eastAsiaTheme="minorEastAsia"/>
+        </w:rPr>
+      </w:pPr>
+      <m:oMathPara>
+        <m:oMath>
+          <m:r>
+            <w:rPr>
+              <w:rFonts w:ascii="Cambria Math" w:hAnsi="Cambria Math"/>
+            </w:rPr>
+            <m:t>Y</m:t>
+          </m:r>
+          <m:r>
+            <w:rPr>
+              <w:rFonts w:ascii="Cambria Math" w:hAnsi="Cambria Math"/>
+            </w:rPr>
+            <m:t xml:space="preserve">= </m:t>
+          </m:r>
+          <m:r>
+            <w:rPr>
+              <w:rFonts w:ascii="Cambria Math" w:hAnsi="Cambria Math"/>
+            </w:rPr>
+            <m:t>1-</m:t>
+          </m:r>
+          <m:f>
+            <m:fPr>
+              <m:ctrlPr>
+                <w:rPr>
+                  <w:rFonts w:ascii="Cambria Math" w:hAnsi="Cambria Math"/>
+                  <w:i/>
+                </w:rPr>
+              </m:ctrlPr>
+            </m:fPr>
+            <m:num>
+              <m:r>
+                <w:rPr>
+                  <w:rFonts w:ascii="Cambria Math" w:hAnsi="Cambria Math"/>
+                </w:rPr>
+                <m:t>x</m:t>
+              </m:r>
+            </m:num>
+            <m:den>
+              <m:r>
+                <w:rPr>
+                  <w:rFonts w:ascii="Cambria Math" w:hAnsi="Cambria Math"/>
+                </w:rPr>
+                <m:t>3</m:t>
+              </m:r>
+              <m:r>
+                <w:rPr>
+                  <w:rFonts w:ascii="Cambria Math" w:hAnsi="Cambria Math"/>
+                </w:rPr>
+                <m:t>×Y×</m:t>
+              </m:r>
+              <m:sSub>
+                <m:sSubPr>
+                  <m:ctrlPr>
+                    <w:rPr>
+                      <w:rFonts w:ascii="Cambria Math" w:hAnsi="Cambria Math"/>
+                      <w:i/>
+                    </w:rPr>
+                  </m:ctrlPr>
+                </m:sSubPr>
+                <m:e>
+                  <m:r>
+                    <w:rPr>
+                      <w:rFonts w:ascii="Cambria Math" w:hAnsi="Cambria Math"/>
+                    </w:rPr>
+                    <m:t>F</m:t>
+                  </m:r>
+                </m:e>
+                <m:sub>
+                  <m:r>
+                    <w:rPr>
+                      <w:rFonts w:ascii="Cambria Math" w:hAnsi="Cambria Math"/>
+                    </w:rPr>
+                    <m:t>γ</m:t>
+                  </m:r>
+                </m:sub>
+              </m:sSub>
+              <m:r>
+                <w:rPr>
+                  <w:rFonts w:ascii="Cambria Math" w:hAnsi="Cambria Math"/>
+                </w:rPr>
+                <m:t>×</m:t>
+              </m:r>
+              <m:sSub>
+                <m:sSubPr>
+                  <m:ctrlPr>
+                    <w:rPr>
+                      <w:rFonts w:ascii="Cambria Math" w:hAnsi="Cambria Math"/>
+                      <w:i/>
+                    </w:rPr>
+                  </m:ctrlPr>
+                </m:sSubPr>
+                <m:e>
+                  <m:r>
+                    <w:rPr>
+                      <w:rFonts w:ascii="Cambria Math" w:hAnsi="Cambria Math"/>
+                    </w:rPr>
+                    <m:t>x</m:t>
+                  </m:r>
+                </m:e>
+                <m:sub>
+                  <m:r>
+                    <w:rPr>
+                      <w:rFonts w:ascii="Cambria Math" w:hAnsi="Cambria Math"/>
+                    </w:rPr>
+                    <m:t>T</m:t>
+                  </m:r>
+                </m:sub>
+              </m:sSub>
+            </m:den>
+          </m:f>
+        </m:oMath>
+      </m:oMathPara>
+    </w:p>
+    <w:p>
+      <w:pPr>
+        <w:rPr>
+          <w:rFonts w:eastAsiaTheme="minorEastAsia"/>
+        </w:rPr>
+      </w:pPr>
+      <m:oMathPara>
+        <m:oMath>
+          <m:sSub>
+            <m:sSubPr>
+              <m:ctrlPr>
+                <w:rPr>
+                  <w:rFonts w:ascii="Cambria Math" w:hAnsi="Cambria Math"/>
+                  <w:i/>
+                </w:rPr>
+              </m:ctrlPr>
+            </m:sSubPr>
+            <m:e>
+              <m:r>
+                <w:rPr>
+                  <w:rFonts w:ascii="Cambria Math" w:hAnsi="Cambria Math"/>
+                </w:rPr>
+                <m:t>N</m:t>
+              </m:r>
+            </m:e>
+            <m:sub>
+              <m:r>
+                <w:rPr>
+                  <w:rFonts w:ascii="Cambria Math" w:hAnsi="Cambria Math"/>
+                </w:rPr>
+                <m:t>6</m:t>
+              </m:r>
+            </m:sub>
+          </m:sSub>
+          <m:r>
+            <w:rPr>
+              <w:rFonts w:ascii="Cambria Math" w:hAnsi="Cambria Math"/>
+            </w:rPr>
+            <m:t xml:space="preserve">= </m:t>
+          </m:r>
+          <m:d>
+            <m:dPr>
+              <m:begChr m:val="{"/>
+              <m:endChr m:val=""/>
+              <m:ctrlPr>
+                <w:rPr>
+                  <w:rFonts w:ascii="Cambria Math" w:hAnsi="Cambria Math"/>
+                  <w:i/>
+                </w:rPr>
+              </m:ctrlPr>
+            </m:dPr>
+            <m:e>
+              <m:eqArr>
+                <m:eqArrPr>
+                  <m:ctrlPr>
+                    <w:rPr>
+                      <w:rFonts w:ascii="Cambria Math" w:hAnsi="Cambria Math"/>
+                      <w:i/>
+                    </w:rPr>
+                  </m:ctrlPr>
+                </m:eqArrPr>
+                <m:e>
+                  <m:r>
+                    <w:rPr>
+                      <w:rFonts w:ascii="Cambria Math" w:hAnsi="Cambria Math"/>
+                    </w:rPr>
+                    <m:t>31.6 for Kv</m:t>
+                  </m:r>
+                </m:e>
+                <m:e>
+                  <m:r>
+                    <w:rPr>
+                      <w:rFonts w:ascii="Cambria Math" w:hAnsi="Cambria Math"/>
+                    </w:rPr>
+                    <m:t>27.3 for Cv</m:t>
+                  </m:r>
+                </m:e>
+              </m:eqArr>
+            </m:e>
+          </m:d>
+        </m:oMath>
+      </m:oMathPara>
+      <w:bookmarkStart w:id="30" w:name="_GoBack"/>
+      <w:bookmarkEnd w:id="30"/>
+    </w:p>
+    <w:p>
+      <w:pPr>
+        <w:rPr>
+          <w:lang w:val="fr-FR"/>
+        </w:rPr>
+      </w:pPr>
+    </w:p>
+    <w:p>
+      <w:pPr>
+        <w:pStyle w:val="Titre2"/>
+        <w:rPr>
+          <w:lang w:val="fr-FR"/>
+        </w:rPr>
+      </w:pPr>
+      <w:bookmarkStart w:id="31" w:name="_Toc41656119"/>
+      <w:proofErr w:type="spellStart"/>
+      <w:r>
+        <w:rPr>
           <w:lang w:val="fr-FR"/>
         </w:rPr>
         <w:t>BasesClasses</w:t>
       </w:r>
-      <w:bookmarkEnd w:id="30"/>
+      <w:bookmarkEnd w:id="31"/>
       <w:proofErr w:type="spellEnd"/>
     </w:p>
     <w:p>
@@ -13187,7 +13654,7 @@
           <w:rFonts w:eastAsiaTheme="minorEastAsia"/>
         </w:rPr>
       </w:pPr>
-      <w:bookmarkStart w:id="31" w:name="_Toc41656120"/>
+      <w:bookmarkStart w:id="32" w:name="_Toc41656120"/>
       <w:proofErr w:type="spellStart"/>
       <w:r>
         <w:rPr>
@@ -13195,7 +13662,7 @@
         </w:rPr>
         <w:t>AeraulicConvection</w:t>
       </w:r>
-      <w:bookmarkEnd w:id="31"/>
+      <w:bookmarkEnd w:id="32"/>
       <w:proofErr w:type="spellEnd"/>
     </w:p>
     <w:p/>
@@ -13449,7 +13916,7 @@
           <w:rFonts w:eastAsiaTheme="minorEastAsia"/>
         </w:rPr>
       </w:pPr>
-      <w:bookmarkStart w:id="32" w:name="_Toc41656121"/>
+      <w:bookmarkStart w:id="33" w:name="_Toc41656121"/>
       <w:r>
         <w:rPr>
           <w:rFonts w:eastAsiaTheme="minorEastAsia"/>
@@ -13462,7 +13929,7 @@
         </w:rPr>
         <w:t>densation</w:t>
       </w:r>
-      <w:bookmarkEnd w:id="32"/>
+      <w:bookmarkEnd w:id="33"/>
     </w:p>
     <w:p/>
     <w:p>
@@ -13670,7 +14137,7 @@
           <w:rFonts w:eastAsiaTheme="minorEastAsia"/>
         </w:rPr>
       </w:pPr>
-      <w:bookmarkStart w:id="33" w:name="_Toc41656122"/>
+      <w:bookmarkStart w:id="34" w:name="_Toc41656122"/>
       <w:proofErr w:type="spellStart"/>
       <w:r>
         <w:rPr>
@@ -13678,7 +14145,7 @@
         </w:rPr>
         <w:t>MolecularDiffusion</w:t>
       </w:r>
-      <w:bookmarkEnd w:id="33"/>
+      <w:bookmarkEnd w:id="34"/>
       <w:proofErr w:type="spellEnd"/>
     </w:p>
     <w:p/>
@@ -13950,7 +14417,7 @@
           <w:rFonts w:eastAsiaTheme="minorEastAsia"/>
         </w:rPr>
       </w:pPr>
-      <w:bookmarkStart w:id="34" w:name="_Toc41656123"/>
+      <w:bookmarkStart w:id="35" w:name="_Toc41656123"/>
       <w:proofErr w:type="spellStart"/>
       <w:r>
         <w:rPr>
@@ -13958,7 +14425,7 @@
         </w:rPr>
         <w:t>GasNode</w:t>
       </w:r>
-      <w:bookmarkEnd w:id="34"/>
+      <w:bookmarkEnd w:id="35"/>
       <w:proofErr w:type="spellEnd"/>
     </w:p>
     <w:p/>
@@ -14003,6 +14470,7 @@
             <w:rPr>
               <w:rFonts w:ascii="Cambria Math" w:eastAsiaTheme="minorEastAsia" w:hAnsi="Cambria Math"/>
             </w:rPr>
+            <w:lastRenderedPageBreak/>
             <m:t>mXi=m×medium.Xi</m:t>
           </m:r>
         </m:oMath>
@@ -14047,13 +14515,7 @@
                 <w:rPr>
                   <w:rFonts w:ascii="Cambria Math" w:hAnsi="Cambria Math"/>
                 </w:rPr>
-                <m:t>d</m:t>
-              </m:r>
-              <m:r>
-                <w:rPr>
-                  <w:rFonts w:ascii="Cambria Math" w:hAnsi="Cambria Math"/>
-                </w:rPr>
-                <m:t>m</m:t>
+                <m:t>dm</m:t>
               </m:r>
             </m:num>
             <m:den>
@@ -14171,12 +14633,12 @@
       <w:pPr>
         <w:pStyle w:val="Titre3"/>
       </w:pPr>
-      <w:bookmarkStart w:id="35" w:name="_Toc41656124"/>
+      <w:bookmarkStart w:id="36" w:name="_Toc41656124"/>
       <w:proofErr w:type="spellStart"/>
       <w:r>
         <w:t>FogModel</w:t>
       </w:r>
-      <w:bookmarkEnd w:id="35"/>
+      <w:bookmarkEnd w:id="36"/>
       <w:proofErr w:type="spellEnd"/>
     </w:p>
     <w:p/>
@@ -14466,21 +14928,7 @@
             <w:rPr>
               <w:rFonts w:ascii="Cambria Math" w:eastAsiaTheme="minorEastAsia" w:hAnsi="Cambria Math"/>
             </w:rPr>
-            <m:t>=</m:t>
-          </m:r>
-          <w:bookmarkStart w:id="36" w:name="_GoBack"/>
-          <w:bookmarkEnd w:id="36"/>
-          <m:r>
-            <w:rPr>
-              <w:rFonts w:ascii="Cambria Math" w:eastAsiaTheme="minorEastAsia" w:hAnsi="Cambria Math"/>
-            </w:rPr>
-            <m:t>3</m:t>
-          </m:r>
-          <m:r>
-            <w:rPr>
-              <w:rFonts w:ascii="Cambria Math" w:eastAsiaTheme="minorEastAsia" w:hAnsi="Cambria Math"/>
-            </w:rPr>
-            <m:t>×π×</m:t>
+            <m:t>=3×π×</m:t>
           </m:r>
           <m:sSub>
             <m:sSubPr>
@@ -14967,13 +15415,7 @@
                 <w:rPr>
                   <w:rFonts w:ascii="Cambria Math" w:eastAsiaTheme="minorEastAsia" w:hAnsi="Cambria Math"/>
                 </w:rPr>
-                <m:t>l</m:t>
-              </m:r>
-              <m:r>
-                <w:rPr>
-                  <w:rFonts w:ascii="Cambria Math" w:eastAsiaTheme="minorEastAsia" w:hAnsi="Cambria Math"/>
-                </w:rPr>
-                <m:t>iquid</m:t>
+                <m:t>liquid</m:t>
               </m:r>
             </m:sub>
           </m:sSub>
@@ -15295,6 +15737,7 @@
             <w:rPr>
               <w:rFonts w:ascii="Cambria Math" w:eastAsiaTheme="minorEastAsia" w:hAnsi="Cambria Math"/>
             </w:rPr>
+            <w:lastRenderedPageBreak/>
             <m:t>mXi_flow[i]</m:t>
           </m:r>
           <m:r>
@@ -15499,7 +15942,6 @@
       </w:pPr>
       <w:proofErr w:type="spellStart"/>
       <w:r>
-        <w:lastRenderedPageBreak/>
         <w:t>Interface_liq_gas</w:t>
       </w:r>
       <w:proofErr w:type="spellEnd"/>
@@ -15819,19 +16261,7 @@
             <w:rPr>
               <w:rFonts w:ascii="Cambria Math" w:eastAsiaTheme="minorEastAsia" w:hAnsi="Cambria Math"/>
             </w:rPr>
-            <m:t>=</m:t>
-          </m:r>
-          <m:r>
-            <w:rPr>
-              <w:rFonts w:ascii="Cambria Math" w:eastAsiaTheme="minorEastAsia" w:hAnsi="Cambria Math"/>
-            </w:rPr>
-            <m:t>-3</m:t>
-          </m:r>
-          <m:r>
-            <w:rPr>
-              <w:rFonts w:ascii="Cambria Math" w:eastAsiaTheme="minorEastAsia" w:hAnsi="Cambria Math"/>
-            </w:rPr>
-            <m:t>×π×</m:t>
+            <m:t>=-3×π×</m:t>
           </m:r>
           <m:sSub>
             <m:sSubPr>
@@ -15863,19 +16293,7 @@
             <w:rPr>
               <w:rFonts w:ascii="Cambria Math" w:eastAsiaTheme="minorEastAsia" w:hAnsi="Cambria Math"/>
             </w:rPr>
-            <m:t>×d_</m:t>
-          </m:r>
-          <m:r>
-            <w:rPr>
-              <w:rFonts w:ascii="Cambria Math" w:eastAsiaTheme="minorEastAsia" w:hAnsi="Cambria Math"/>
-            </w:rPr>
-            <m:t>bubble</m:t>
-          </m:r>
-          <m:r>
-            <w:rPr>
-              <w:rFonts w:ascii="Cambria Math" w:eastAsiaTheme="minorEastAsia" w:hAnsi="Cambria Math"/>
-            </w:rPr>
-            <m:t>×Vel</m:t>
+            <m:t>×d_bubble×Vel</m:t>
           </m:r>
         </m:oMath>
       </m:oMathPara>
@@ -16118,31 +16536,7 @@
             <w:rPr>
               <w:rFonts w:ascii="Cambria Math" w:eastAsiaTheme="minorEastAsia" w:hAnsi="Cambria Math"/>
             </w:rPr>
-            <m:t>×</m:t>
-          </m:r>
-          <m:r>
-            <w:rPr>
-              <w:rFonts w:ascii="Cambria Math" w:eastAsiaTheme="minorEastAsia" w:hAnsi="Cambria Math"/>
-            </w:rPr>
-            <m:t>A</m:t>
-          </m:r>
-          <m:r>
-            <w:rPr>
-              <w:rFonts w:ascii="Cambria Math" w:eastAsiaTheme="minorEastAsia" w:hAnsi="Cambria Math"/>
-            </w:rPr>
-            <m:t>×</m:t>
-          </m:r>
-          <m:r>
-            <w:rPr>
-              <w:rFonts w:ascii="Cambria Math" w:eastAsiaTheme="minorEastAsia" w:hAnsi="Cambria Math"/>
-            </w:rPr>
-            <m:t>n_bubbles</m:t>
-          </m:r>
-          <m:r>
-            <w:rPr>
-              <w:rFonts w:ascii="Cambria Math" w:eastAsiaTheme="minorEastAsia" w:hAnsi="Cambria Math"/>
-            </w:rPr>
-            <m:t>×</m:t>
+            <m:t>×A×n_bubbles×</m:t>
           </m:r>
           <m:f>
             <m:fPr>
@@ -16304,6 +16698,7 @@
         <w:rPr>
           <w:rFonts w:eastAsiaTheme="minorEastAsia"/>
         </w:rPr>
+        <w:lastRenderedPageBreak/>
         <w:t>rootsPolyorder3</w:t>
       </w:r>
       <w:bookmarkEnd w:id="38"/>
@@ -16608,7 +17003,6 @@
             <w:rPr>
               <w:rFonts w:ascii="Cambria Math" w:eastAsiaTheme="minorEastAsia" w:hAnsi="Cambria Math"/>
             </w:rPr>
-            <w:lastRenderedPageBreak/>
             <m:t>x1=</m:t>
           </m:r>
           <m:rad>
@@ -18180,6 +18574,7 @@
             <w:rPr>
               <w:rFonts w:ascii="Cambria Math" w:eastAsiaTheme="minorEastAsia" w:hAnsi="Cambria Math"/>
             </w:rPr>
+            <w:lastRenderedPageBreak/>
             <m:t>x1=x2=</m:t>
           </m:r>
           <m:f>
@@ -21488,6 +21883,36 @@
     </w:lvlOverride>
   </w:num>
   <w:num w:numId="17">
+    <w:abstractNumId w:val="1"/>
+    <w:lvlOverride w:ilvl="0">
+      <w:startOverride w:val="1"/>
+    </w:lvlOverride>
+    <w:lvlOverride w:ilvl="1">
+      <w:startOverride w:val="1"/>
+    </w:lvlOverride>
+    <w:lvlOverride w:ilvl="2">
+      <w:startOverride w:val="1"/>
+    </w:lvlOverride>
+    <w:lvlOverride w:ilvl="3">
+      <w:startOverride w:val="1"/>
+    </w:lvlOverride>
+    <w:lvlOverride w:ilvl="4">
+      <w:startOverride w:val="1"/>
+    </w:lvlOverride>
+    <w:lvlOverride w:ilvl="5">
+      <w:startOverride w:val="1"/>
+    </w:lvlOverride>
+    <w:lvlOverride w:ilvl="6">
+      <w:startOverride w:val="1"/>
+    </w:lvlOverride>
+    <w:lvlOverride w:ilvl="7">
+      <w:startOverride w:val="1"/>
+    </w:lvlOverride>
+    <w:lvlOverride w:ilvl="8">
+      <w:startOverride w:val="1"/>
+    </w:lvlOverride>
+  </w:num>
+  <w:num w:numId="18">
     <w:abstractNumId w:val="1"/>
     <w:lvlOverride w:ilvl="0">
       <w:startOverride w:val="1"/>
@@ -23109,7 +23534,7 @@
   <a:extraClrSchemeLst/>
   <a:extLst>
     <a:ext uri="{05A4C25C-085E-4340-85A3-A5531E510DB2}">
-      <thm15:themeFamily xmlns="" xmlns:thm15="http://schemas.microsoft.com/office/thememl/2012/main" name="Office Theme" id="{62F939B6-93AF-4DB8-9C6B-D6C7DFDC589F}" vid="{4A3C46E8-61CC-4603-A589-7422A47A8E4A}"/>
+      <thm15:themeFamily xmlns:thm15="http://schemas.microsoft.com/office/thememl/2012/main" xmlns="" name="Office Theme" id="{62F939B6-93AF-4DB8-9C6B-D6C7DFDC589F}" vid="{4A3C46E8-61CC-4603-A589-7422A47A8E4A}"/>
     </a:ext>
   </a:extLst>
 </a:theme>
@@ -23120,7 +23545,7 @@
 </file>
 
 <file path=customXml/itemProps1.xml><?xml version="1.0" encoding="utf-8"?>
-<ds:datastoreItem xmlns:ds="http://schemas.openxmlformats.org/officeDocument/2006/customXml" ds:itemID="{5B64EA85-744D-4249-9342-8283039B246A}">
+<ds:datastoreItem xmlns:ds="http://schemas.openxmlformats.org/officeDocument/2006/customXml" ds:itemID="{32E4A7ED-667F-41FE-B245-C190EC1F94D2}">
   <ds:schemaRefs>
     <ds:schemaRef ds:uri="http://schemas.openxmlformats.org/officeDocument/2006/bibliography"/>
   </ds:schemaRefs>

</xml_diff>

<commit_message>
Addition of the CoCurrent function(+ its test and its inverse function) for the exchanger effectiveness calculation
</commit_message>
<xml_diff>
--- a/Information/script for equations.docx
+++ b/Information/script for equations.docx
@@ -1,6 +1,6 @@
 
 <file path=word/document.xml><?xml version="1.0" encoding="utf-8"?>
-<w:document xmlns:wpc="http://schemas.microsoft.com/office/word/2010/wordprocessingCanvas" xmlns:mc="http://schemas.openxmlformats.org/markup-compatibility/2006" xmlns:o="urn:schemas-microsoft-com:office:office" xmlns:r="http://schemas.openxmlformats.org/officeDocument/2006/relationships" xmlns:m="http://schemas.openxmlformats.org/officeDocument/2006/math" xmlns:v="urn:schemas-microsoft-com:vml" xmlns:wp14="http://schemas.microsoft.com/office/word/2010/wordprocessingDrawing" xmlns:wp="http://schemas.openxmlformats.org/drawingml/2006/wordprocessingDrawing" xmlns:w10="urn:schemas-microsoft-com:office:word" xmlns:w="http://schemas.openxmlformats.org/wordprocessingml/2006/main" xmlns:w14="http://schemas.microsoft.com/office/word/2010/wordml" xmlns:wpg="http://schemas.microsoft.com/office/word/2010/wordprocessingGroup" xmlns:wpi="http://schemas.microsoft.com/office/word/2010/wordprocessingInk" xmlns:wne="http://schemas.microsoft.com/office/word/2006/wordml" xmlns:wps="http://schemas.microsoft.com/office/word/2010/wordprocessingShape" mc:Ignorable="w14 wp14">
+<w:document xmlns:wpc="http://schemas.microsoft.com/office/word/2010/wordprocessingCanvas" xmlns:mc="http://schemas.openxmlformats.org/markup-compatibility/2006" xmlns:o="urn:schemas-microsoft-com:office:office" xmlns:r="http://schemas.openxmlformats.org/officeDocument/2006/relationships" xmlns:m="http://schemas.openxmlformats.org/officeDocument/2006/math" xmlns:v="urn:schemas-microsoft-com:vml" xmlns:wp14="http://schemas.microsoft.com/office/word/2010/wordprocessingDrawing" xmlns:wp="http://schemas.openxmlformats.org/drawingml/2006/wordprocessingDrawing" xmlns:w10="urn:schemas-microsoft-com:office:word" xmlns:w="http://schemas.openxmlformats.org/wordprocessingml/2006/main" xmlns:w14="http://schemas.microsoft.com/office/word/2010/wordml" xmlns:w15="http://schemas.microsoft.com/office/word/2012/wordml" xmlns:wpg="http://schemas.microsoft.com/office/word/2010/wordprocessingGroup" xmlns:wpi="http://schemas.microsoft.com/office/word/2010/wordprocessingInk" xmlns:wne="http://schemas.microsoft.com/office/word/2006/wordml" xmlns:wps="http://schemas.microsoft.com/office/word/2010/wordprocessingShape" mc:Ignorable="w14 w15 wp14">
   <w:body>
     <w:sdt>
       <w:sdtPr>
@@ -19,7 +19,6 @@
           <w:docPartUnique/>
         </w:docPartObj>
       </w:sdtPr>
-      <w:sdtEndPr/>
       <w:sdtContent>
         <w:p>
           <w:pPr>
@@ -10378,10 +10377,108 @@
     <w:p>
       <w:pPr>
         <w:pStyle w:val="Titre3"/>
-        <w:numPr>
-          <w:ilvl w:val="2"/>
-          <w:numId w:val="5"/>
-        </w:numPr>
+        <w:rPr>
+          <w:rFonts w:eastAsiaTheme="minorEastAsia"/>
+        </w:rPr>
+      </w:pPr>
+      <w:proofErr w:type="spellStart"/>
+      <w:proofErr w:type="gramStart"/>
+      <w:r>
+        <w:rPr>
+          <w:rFonts w:eastAsiaTheme="minorEastAsia"/>
+        </w:rPr>
+        <w:t>co</w:t>
+      </w:r>
+      <w:r>
+        <w:rPr>
+          <w:rFonts w:eastAsiaTheme="minorEastAsia"/>
+        </w:rPr>
+        <w:t>Current</w:t>
+      </w:r>
+      <w:proofErr w:type="spellEnd"/>
+      <w:proofErr w:type="gramEnd"/>
+    </w:p>
+    <w:p>
+      <w:pPr>
+        <w:rPr>
+          <w:rFonts w:eastAsiaTheme="minorEastAsia"/>
+        </w:rPr>
+      </w:pPr>
+    </w:p>
+    <w:p>
+      <w:pPr>
+        <w:rPr>
+          <w:rFonts w:eastAsiaTheme="minorEastAsia"/>
+        </w:rPr>
+      </w:pPr>
+      <m:oMathPara>
+        <m:oMath>
+          <m:r>
+            <w:rPr>
+              <w:rFonts w:ascii="Cambria Math" w:eastAsiaTheme="minorEastAsia" w:hAnsi="Cambria Math"/>
+            </w:rPr>
+            <m:t>Eff=</m:t>
+          </m:r>
+          <m:f>
+            <m:fPr>
+              <m:ctrlPr>
+                <w:rPr>
+                  <w:rFonts w:ascii="Cambria Math" w:eastAsiaTheme="minorEastAsia" w:hAnsi="Cambria Math"/>
+                  <w:i/>
+                </w:rPr>
+              </m:ctrlPr>
+            </m:fPr>
+            <m:num>
+              <m:r>
+                <w:rPr>
+                  <w:rFonts w:ascii="Cambria Math" w:eastAsiaTheme="minorEastAsia" w:hAnsi="Cambria Math"/>
+                </w:rPr>
+                <m:t>1-</m:t>
+              </m:r>
+              <m:r>
+                <m:rPr>
+                  <m:sty m:val="p"/>
+                </m:rPr>
+                <w:rPr>
+                  <w:rFonts w:ascii="Cambria Math" w:eastAsiaTheme="minorEastAsia" w:hAnsi="Cambria Math"/>
+                </w:rPr>
+                <m:t>exp⁡</m:t>
+              </m:r>
+              <m:r>
+                <w:rPr>
+                  <w:rFonts w:ascii="Cambria Math" w:eastAsiaTheme="minorEastAsia" w:hAnsi="Cambria Math"/>
+                </w:rPr>
+                <m:t>(-NTU×(1+Cr))</m:t>
+              </m:r>
+            </m:num>
+            <m:den>
+              <m:r>
+                <w:rPr>
+                  <w:rFonts w:ascii="Cambria Math" w:eastAsiaTheme="minorEastAsia" w:hAnsi="Cambria Math"/>
+                </w:rPr>
+                <m:t>1+Cr</m:t>
+              </m:r>
+            </m:den>
+          </m:f>
+          <m:r>
+            <w:rPr>
+              <w:rFonts w:ascii="Cambria Math" w:eastAsiaTheme="minorEastAsia" w:hAnsi="Cambria Math"/>
+            </w:rPr>
+            <m:t xml:space="preserve"> </m:t>
+          </m:r>
+        </m:oMath>
+      </m:oMathPara>
+    </w:p>
+    <w:p>
+      <w:pPr>
+        <w:rPr>
+          <w:rFonts w:eastAsiaTheme="minorEastAsia"/>
+        </w:rPr>
+      </w:pPr>
+    </w:p>
+    <w:p>
+      <w:pPr>
+        <w:pStyle w:val="Titre3"/>
         <w:rPr>
           <w:rFonts w:eastAsiaTheme="minorEastAsia"/>
         </w:rPr>
@@ -10617,6 +10714,126 @@
     </w:p>
     <w:p>
       <w:pPr>
+        <w:pStyle w:val="Titre3"/>
+        <w:rPr>
+          <w:rFonts w:eastAsiaTheme="minorEastAsia"/>
+        </w:rPr>
+      </w:pPr>
+      <w:proofErr w:type="spellStart"/>
+      <w:r>
+        <w:rPr>
+          <w:rFonts w:eastAsiaTheme="minorEastAsia"/>
+        </w:rPr>
+        <w:t>NTU_counterCurrent</w:t>
+      </w:r>
+      <w:proofErr w:type="spellEnd"/>
+    </w:p>
+    <w:p>
+      <w:pPr>
+        <w:rPr>
+          <w:rFonts w:eastAsiaTheme="minorEastAsia"/>
+        </w:rPr>
+      </w:pPr>
+    </w:p>
+    <w:p>
+      <w:pPr>
+        <w:rPr>
+          <w:rFonts w:eastAsiaTheme="minorEastAsia"/>
+        </w:rPr>
+      </w:pPr>
+      <m:oMathPara>
+        <m:oMath>
+          <m:r>
+            <w:rPr>
+              <w:rFonts w:ascii="Cambria Math" w:eastAsiaTheme="minorEastAsia" w:hAnsi="Cambria Math"/>
+            </w:rPr>
+            <m:t>NTU=</m:t>
+          </m:r>
+          <m:r>
+            <w:rPr>
+              <w:rFonts w:ascii="Cambria Math" w:eastAsiaTheme="minorEastAsia" w:hAnsi="Cambria Math"/>
+            </w:rPr>
+            <m:t>-</m:t>
+          </m:r>
+          <m:r>
+            <m:rPr>
+              <m:sty m:val="p"/>
+            </m:rPr>
+            <w:rPr>
+              <w:rFonts w:ascii="Cambria Math" w:eastAsiaTheme="minorEastAsia" w:hAnsi="Cambria Math"/>
+            </w:rPr>
+            <m:t>ln⁡</m:t>
+          </m:r>
+          <m:d>
+            <m:dPr>
+              <m:ctrlPr>
+                <w:rPr>
+                  <w:rFonts w:ascii="Cambria Math" w:eastAsiaTheme="minorEastAsia" w:hAnsi="Cambria Math"/>
+                  <w:i/>
+                </w:rPr>
+              </m:ctrlPr>
+            </m:dPr>
+            <m:e>
+              <m:f>
+                <m:fPr>
+                  <m:ctrlPr>
+                    <w:rPr>
+                      <w:rFonts w:ascii="Cambria Math" w:eastAsiaTheme="minorEastAsia" w:hAnsi="Cambria Math"/>
+                      <w:i/>
+                    </w:rPr>
+                  </m:ctrlPr>
+                </m:fPr>
+                <m:num>
+                  <m:r>
+                    <w:rPr>
+                      <w:rFonts w:ascii="Cambria Math" w:eastAsiaTheme="minorEastAsia" w:hAnsi="Cambria Math"/>
+                    </w:rPr>
+                    <m:t>1-Eff×</m:t>
+                  </m:r>
+                  <m:r>
+                    <w:rPr>
+                      <w:rFonts w:ascii="Cambria Math" w:eastAsiaTheme="minorEastAsia" w:hAnsi="Cambria Math"/>
+                    </w:rPr>
+                    <m:t>(1+Eff)</m:t>
+                  </m:r>
+                </m:num>
+                <m:den>
+                  <m:r>
+                    <w:rPr>
+                      <w:rFonts w:ascii="Cambria Math" w:eastAsiaTheme="minorEastAsia" w:hAnsi="Cambria Math"/>
+                    </w:rPr>
+                    <m:t>1</m:t>
+                  </m:r>
+                  <m:r>
+                    <w:rPr>
+                      <w:rFonts w:ascii="Cambria Math" w:eastAsiaTheme="minorEastAsia" w:hAnsi="Cambria Math"/>
+                    </w:rPr>
+                    <m:t>+</m:t>
+                  </m:r>
+                  <m:r>
+                    <w:rPr>
+                      <w:rFonts w:ascii="Cambria Math" w:eastAsiaTheme="minorEastAsia" w:hAnsi="Cambria Math"/>
+                    </w:rPr>
+                    <m:t>Eff</m:t>
+                  </m:r>
+                </m:den>
+              </m:f>
+            </m:e>
+          </m:d>
+        </m:oMath>
+      </m:oMathPara>
+    </w:p>
+    <w:p>
+      <w:pPr>
+        <w:rPr>
+          <w:rFonts w:eastAsiaTheme="minorEastAsia"/>
+        </w:rPr>
+      </w:pPr>
+      <w:bookmarkStart w:id="23" w:name="_GoBack"/>
+      <w:bookmarkEnd w:id="23"/>
+    </w:p>
+    <w:p>
+      <w:pPr>
         <w:rPr>
           <w:lang w:val="fr-FR"/>
         </w:rPr>
@@ -10636,7 +10853,7 @@
           <w:lang w:val="fr-FR"/>
         </w:rPr>
       </w:pPr>
-      <w:bookmarkStart w:id="23" w:name="_Toc41656112"/>
+      <w:bookmarkStart w:id="24" w:name="_Toc41656112"/>
       <w:proofErr w:type="spellStart"/>
       <w:r>
         <w:rPr>
@@ -10646,7 +10863,7 @@
         <w:lastRenderedPageBreak/>
         <w:t>FluidDynamics</w:t>
       </w:r>
-      <w:bookmarkEnd w:id="23"/>
+      <w:bookmarkEnd w:id="24"/>
       <w:proofErr w:type="spellEnd"/>
     </w:p>
     <w:p>
@@ -10663,14 +10880,14 @@
           <w:lang w:val="fr-FR"/>
         </w:rPr>
       </w:pPr>
-      <w:bookmarkStart w:id="24" w:name="_Toc41656113"/>
+      <w:bookmarkStart w:id="25" w:name="_Toc41656113"/>
       <w:r>
         <w:rPr>
           <w:lang w:val="fr-FR"/>
         </w:rPr>
         <w:t>Components</w:t>
       </w:r>
-      <w:bookmarkEnd w:id="24"/>
+      <w:bookmarkEnd w:id="25"/>
     </w:p>
     <w:p>
       <w:pPr>
@@ -10686,7 +10903,7 @@
           <w:lang w:val="fr-FR"/>
         </w:rPr>
       </w:pPr>
-      <w:bookmarkStart w:id="25" w:name="_Toc41656114"/>
+      <w:bookmarkStart w:id="26" w:name="_Toc41656114"/>
       <w:proofErr w:type="spellStart"/>
       <w:r>
         <w:rPr>
@@ -10694,7 +10911,7 @@
         </w:rPr>
         <w:t>PartialPump</w:t>
       </w:r>
-      <w:bookmarkEnd w:id="25"/>
+      <w:bookmarkEnd w:id="26"/>
       <w:proofErr w:type="spellEnd"/>
     </w:p>
     <w:p>
@@ -10852,7 +11069,7 @@
           <w:lang w:val="fr-FR"/>
         </w:rPr>
       </w:pPr>
-      <w:bookmarkStart w:id="26" w:name="_Toc41656115"/>
+      <w:bookmarkStart w:id="27" w:name="_Toc41656115"/>
       <w:proofErr w:type="spellStart"/>
       <w:r>
         <w:rPr>
@@ -10860,7 +11077,7 @@
         </w:rPr>
         <w:t>SimpleOpening</w:t>
       </w:r>
-      <w:bookmarkEnd w:id="26"/>
+      <w:bookmarkEnd w:id="27"/>
       <w:proofErr w:type="spellEnd"/>
     </w:p>
     <w:p>
@@ -11028,7 +11245,7 @@
           <w:rFonts w:asciiTheme="minorHAnsi" w:eastAsiaTheme="minorEastAsia" w:hAnsiTheme="minorHAnsi" w:cstheme="minorBidi"/>
         </w:rPr>
       </w:pPr>
-      <w:bookmarkStart w:id="27" w:name="_Toc41656116"/>
+      <w:bookmarkStart w:id="28" w:name="_Toc41656116"/>
       <w:proofErr w:type="spellStart"/>
       <w:r>
         <w:rPr>
@@ -11036,7 +11253,7 @@
         </w:rPr>
         <w:t>StaticPipe</w:t>
       </w:r>
-      <w:bookmarkEnd w:id="27"/>
+      <w:bookmarkEnd w:id="28"/>
       <w:proofErr w:type="spellEnd"/>
     </w:p>
     <w:p/>
@@ -11188,7 +11405,7 @@
           <w:lang w:val="fr-FR"/>
         </w:rPr>
       </w:pPr>
-      <w:bookmarkStart w:id="28" w:name="_Toc41656117"/>
+      <w:bookmarkStart w:id="29" w:name="_Toc41656117"/>
       <w:proofErr w:type="spellStart"/>
       <w:r>
         <w:rPr>
@@ -11196,7 +11413,7 @@
         </w:rPr>
         <w:t>VerticalOpening</w:t>
       </w:r>
-      <w:bookmarkEnd w:id="28"/>
+      <w:bookmarkEnd w:id="29"/>
       <w:proofErr w:type="spellEnd"/>
     </w:p>
     <w:p>
@@ -11634,7 +11851,7 @@
           <w:lang w:val="fr-FR"/>
         </w:rPr>
       </w:pPr>
-      <w:bookmarkStart w:id="29" w:name="_Toc41656118"/>
+      <w:bookmarkStart w:id="30" w:name="_Toc41656118"/>
       <w:proofErr w:type="spellStart"/>
       <w:r>
         <w:rPr>
@@ -11643,7 +11860,7 @@
         <w:lastRenderedPageBreak/>
         <w:t>HorizontalOpening</w:t>
       </w:r>
-      <w:bookmarkEnd w:id="29"/>
+      <w:bookmarkEnd w:id="30"/>
       <w:proofErr w:type="spellEnd"/>
     </w:p>
     <w:p>
@@ -13196,19 +13413,7 @@
             <w:rPr>
               <w:rFonts w:ascii="Cambria Math" w:hAnsi="Cambria Math"/>
             </w:rPr>
-            <m:t>Kv</m:t>
-          </m:r>
-          <m:r>
-            <w:rPr>
-              <w:rFonts w:ascii="Cambria Math" w:hAnsi="Cambria Math"/>
-            </w:rPr>
-            <m:t xml:space="preserve"> </m:t>
-          </m:r>
-          <m:r>
-            <w:rPr>
-              <w:rFonts w:ascii="Cambria Math" w:hAnsi="Cambria Math"/>
-            </w:rPr>
-            <m:t xml:space="preserve">,Cv= </m:t>
+            <m:t xml:space="preserve">Kv ,Cv= </m:t>
           </m:r>
           <m:f>
             <m:fPr>
@@ -13276,13 +13481,7 @@
                     <w:rPr>
                       <w:rFonts w:ascii="Cambria Math" w:hAnsi="Cambria Math"/>
                     </w:rPr>
-                    <m:t>xs</m:t>
-                  </m:r>
-                  <m:r>
-                    <w:rPr>
-                      <w:rFonts w:ascii="Cambria Math" w:hAnsi="Cambria Math"/>
-                    </w:rPr>
-                    <m:t>×p×d</m:t>
+                    <m:t>xs×p×d</m:t>
                   </m:r>
                 </m:e>
               </m:rad>
@@ -13303,13 +13502,7 @@
             <w:rPr>
               <w:rFonts w:ascii="Cambria Math" w:hAnsi="Cambria Math"/>
             </w:rPr>
-            <m:t>xs</m:t>
-          </m:r>
-          <m:r>
-            <w:rPr>
-              <w:rFonts w:ascii="Cambria Math" w:hAnsi="Cambria Math"/>
-            </w:rPr>
-            <m:t xml:space="preserve">= </m:t>
+            <m:t xml:space="preserve">xs= </m:t>
           </m:r>
           <m:r>
             <m:rPr>
@@ -13324,25 +13517,7 @@
             <w:rPr>
               <w:rFonts w:ascii="Cambria Math" w:hAnsi="Cambria Math"/>
             </w:rPr>
-            <m:t>(x</m:t>
-          </m:r>
-          <m:r>
-            <w:rPr>
-              <w:rFonts w:ascii="Cambria Math" w:hAnsi="Cambria Math"/>
-            </w:rPr>
-            <m:t xml:space="preserve"> </m:t>
-          </m:r>
-          <m:r>
-            <w:rPr>
-              <w:rFonts w:ascii="Cambria Math" w:hAnsi="Cambria Math"/>
-            </w:rPr>
-            <m:t>,</m:t>
-          </m:r>
-          <m:r>
-            <w:rPr>
-              <w:rFonts w:ascii="Cambria Math" w:hAnsi="Cambria Math"/>
-            </w:rPr>
-            <m:t xml:space="preserve"> </m:t>
+            <m:t xml:space="preserve">(x , </m:t>
           </m:r>
           <m:sSub>
             <m:sSubPr>
@@ -13423,19 +13598,7 @@
             <w:rPr>
               <w:rFonts w:ascii="Cambria Math" w:hAnsi="Cambria Math"/>
             </w:rPr>
-            <m:t>Y</m:t>
-          </m:r>
-          <m:r>
-            <w:rPr>
-              <w:rFonts w:ascii="Cambria Math" w:hAnsi="Cambria Math"/>
-            </w:rPr>
-            <m:t xml:space="preserve">= </m:t>
-          </m:r>
-          <m:r>
-            <w:rPr>
-              <w:rFonts w:ascii="Cambria Math" w:hAnsi="Cambria Math"/>
-            </w:rPr>
-            <m:t>1-</m:t>
+            <m:t>Y= 1-</m:t>
           </m:r>
           <m:f>
             <m:fPr>
@@ -13459,13 +13622,7 @@
                 <w:rPr>
                   <w:rFonts w:ascii="Cambria Math" w:hAnsi="Cambria Math"/>
                 </w:rPr>
-                <m:t>3</m:t>
-              </m:r>
-              <m:r>
-                <w:rPr>
-                  <w:rFonts w:ascii="Cambria Math" w:hAnsi="Cambria Math"/>
-                </w:rPr>
-                <m:t>×Y×</m:t>
+                <m:t>3×Y×</m:t>
               </m:r>
               <m:sSub>
                 <m:sSubPr>
@@ -13612,8 +13769,6 @@
           </m:d>
         </m:oMath>
       </m:oMathPara>
-      <w:bookmarkStart w:id="30" w:name="_GoBack"/>
-      <w:bookmarkEnd w:id="30"/>
     </w:p>
     <w:p>
       <w:pPr>
@@ -21274,8 +21429,8 @@
 </file>
 
 <file path=word/numbering.xml><?xml version="1.0" encoding="utf-8"?>
-<w:numbering xmlns:wpc="http://schemas.microsoft.com/office/word/2010/wordprocessingCanvas" xmlns:mc="http://schemas.openxmlformats.org/markup-compatibility/2006" xmlns:o="urn:schemas-microsoft-com:office:office" xmlns:r="http://schemas.openxmlformats.org/officeDocument/2006/relationships" xmlns:m="http://schemas.openxmlformats.org/officeDocument/2006/math" xmlns:v="urn:schemas-microsoft-com:vml" xmlns:wp14="http://schemas.microsoft.com/office/word/2010/wordprocessingDrawing" xmlns:wp="http://schemas.openxmlformats.org/drawingml/2006/wordprocessingDrawing" xmlns:w10="urn:schemas-microsoft-com:office:word" xmlns:w="http://schemas.openxmlformats.org/wordprocessingml/2006/main" xmlns:w14="http://schemas.microsoft.com/office/word/2010/wordml" xmlns:wpg="http://schemas.microsoft.com/office/word/2010/wordprocessingGroup" xmlns:wpi="http://schemas.microsoft.com/office/word/2010/wordprocessingInk" xmlns:wne="http://schemas.microsoft.com/office/word/2006/wordml" xmlns:wps="http://schemas.microsoft.com/office/word/2010/wordprocessingShape" mc:Ignorable="w14 wp14">
-  <w:abstractNum w:abstractNumId="0">
+<w:numbering xmlns:wpc="http://schemas.microsoft.com/office/word/2010/wordprocessingCanvas" xmlns:mc="http://schemas.openxmlformats.org/markup-compatibility/2006" xmlns:o="urn:schemas-microsoft-com:office:office" xmlns:r="http://schemas.openxmlformats.org/officeDocument/2006/relationships" xmlns:m="http://schemas.openxmlformats.org/officeDocument/2006/math" xmlns:v="urn:schemas-microsoft-com:vml" xmlns:wp14="http://schemas.microsoft.com/office/word/2010/wordprocessingDrawing" xmlns:wp="http://schemas.openxmlformats.org/drawingml/2006/wordprocessingDrawing" xmlns:w10="urn:schemas-microsoft-com:office:word" xmlns:w="http://schemas.openxmlformats.org/wordprocessingml/2006/main" xmlns:w14="http://schemas.microsoft.com/office/word/2010/wordml" xmlns:w15="http://schemas.microsoft.com/office/word/2012/wordml" xmlns:wpg="http://schemas.microsoft.com/office/word/2010/wordprocessingGroup" xmlns:wpi="http://schemas.microsoft.com/office/word/2010/wordprocessingInk" xmlns:wne="http://schemas.microsoft.com/office/word/2006/wordml" xmlns:wps="http://schemas.microsoft.com/office/word/2010/wordprocessingShape" mc:Ignorable="w14 w15 wp14">
+  <w:abstractNum w:abstractNumId="0" w15:restartNumberingAfterBreak="0">
     <w:nsid w:val="06D54705"/>
     <w:multiLevelType w:val="hybridMultilevel"/>
     <w:tmpl w:val="82603C3A"/>
@@ -21361,7 +21516,7 @@
       </w:pPr>
     </w:lvl>
   </w:abstractNum>
-  <w:abstractNum w:abstractNumId="1">
+  <w:abstractNum w:abstractNumId="1" w15:restartNumberingAfterBreak="0">
     <w:nsid w:val="0C276DFE"/>
     <w:multiLevelType w:val="multilevel"/>
     <w:tmpl w:val="08090027"/>
@@ -21942,11 +22097,71 @@
       <w:startOverride w:val="1"/>
     </w:lvlOverride>
   </w:num>
+  <w:num w:numId="19">
+    <w:abstractNumId w:val="1"/>
+    <w:lvlOverride w:ilvl="0">
+      <w:startOverride w:val="1"/>
+    </w:lvlOverride>
+    <w:lvlOverride w:ilvl="1">
+      <w:startOverride w:val="1"/>
+    </w:lvlOverride>
+    <w:lvlOverride w:ilvl="2">
+      <w:startOverride w:val="1"/>
+    </w:lvlOverride>
+    <w:lvlOverride w:ilvl="3">
+      <w:startOverride w:val="1"/>
+    </w:lvlOverride>
+    <w:lvlOverride w:ilvl="4">
+      <w:startOverride w:val="1"/>
+    </w:lvlOverride>
+    <w:lvlOverride w:ilvl="5">
+      <w:startOverride w:val="1"/>
+    </w:lvlOverride>
+    <w:lvlOverride w:ilvl="6">
+      <w:startOverride w:val="1"/>
+    </w:lvlOverride>
+    <w:lvlOverride w:ilvl="7">
+      <w:startOverride w:val="1"/>
+    </w:lvlOverride>
+    <w:lvlOverride w:ilvl="8">
+      <w:startOverride w:val="1"/>
+    </w:lvlOverride>
+  </w:num>
+  <w:num w:numId="20">
+    <w:abstractNumId w:val="1"/>
+    <w:lvlOverride w:ilvl="0">
+      <w:startOverride w:val="1"/>
+    </w:lvlOverride>
+    <w:lvlOverride w:ilvl="1">
+      <w:startOverride w:val="1"/>
+    </w:lvlOverride>
+    <w:lvlOverride w:ilvl="2">
+      <w:startOverride w:val="1"/>
+    </w:lvlOverride>
+    <w:lvlOverride w:ilvl="3">
+      <w:startOverride w:val="1"/>
+    </w:lvlOverride>
+    <w:lvlOverride w:ilvl="4">
+      <w:startOverride w:val="1"/>
+    </w:lvlOverride>
+    <w:lvlOverride w:ilvl="5">
+      <w:startOverride w:val="1"/>
+    </w:lvlOverride>
+    <w:lvlOverride w:ilvl="6">
+      <w:startOverride w:val="1"/>
+    </w:lvlOverride>
+    <w:lvlOverride w:ilvl="7">
+      <w:startOverride w:val="1"/>
+    </w:lvlOverride>
+    <w:lvlOverride w:ilvl="8">
+      <w:startOverride w:val="1"/>
+    </w:lvlOverride>
+  </w:num>
 </w:numbering>
 </file>
 
 <file path=word/styles.xml><?xml version="1.0" encoding="utf-8"?>
-<w:styles xmlns:mc="http://schemas.openxmlformats.org/markup-compatibility/2006" xmlns:r="http://schemas.openxmlformats.org/officeDocument/2006/relationships" xmlns:w="http://schemas.openxmlformats.org/wordprocessingml/2006/main" xmlns:w14="http://schemas.microsoft.com/office/word/2010/wordml" mc:Ignorable="w14">
+<w:styles xmlns:mc="http://schemas.openxmlformats.org/markup-compatibility/2006" xmlns:r="http://schemas.openxmlformats.org/officeDocument/2006/relationships" xmlns:w="http://schemas.openxmlformats.org/wordprocessingml/2006/main" xmlns:w14="http://schemas.microsoft.com/office/word/2010/wordml" xmlns:w15="http://schemas.microsoft.com/office/word/2012/wordml" mc:Ignorable="w14 w15">
   <w:docDefaults>
     <w:rPrDefault>
       <w:rPr>
@@ -21962,811 +22177,378 @@
       </w:pPr>
     </w:pPrDefault>
   </w:docDefaults>
-  <w:latentStyles w:defLockedState="0" w:defUIPriority="99" w:defSemiHidden="1" w:defUnhideWhenUsed="1" w:defQFormat="0" w:count="267">
-    <w:lsdException w:name="Normal" w:semiHidden="0" w:uiPriority="0" w:unhideWhenUsed="0" w:qFormat="1"/>
-    <w:lsdException w:name="heading 1" w:semiHidden="0" w:uiPriority="9" w:unhideWhenUsed="0" w:qFormat="1"/>
-    <w:lsdException w:name="heading 2" w:uiPriority="9" w:qFormat="1"/>
-    <w:lsdException w:name="heading 3" w:uiPriority="9" w:qFormat="1"/>
-    <w:lsdException w:name="heading 4" w:uiPriority="9" w:qFormat="1"/>
-    <w:lsdException w:name="heading 5" w:uiPriority="9" w:qFormat="1"/>
-    <w:lsdException w:name="heading 6" w:uiPriority="9" w:qFormat="1"/>
-    <w:lsdException w:name="heading 7" w:uiPriority="9" w:qFormat="1"/>
-    <w:lsdException w:name="heading 8" w:uiPriority="9" w:qFormat="1"/>
-    <w:lsdException w:name="heading 9" w:uiPriority="9" w:qFormat="1"/>
-    <w:lsdException w:name="toc 1" w:uiPriority="39"/>
-    <w:lsdException w:name="toc 2" w:uiPriority="39"/>
-    <w:lsdException w:name="toc 3" w:uiPriority="39"/>
-    <w:lsdException w:name="toc 4" w:uiPriority="39"/>
-    <w:lsdException w:name="toc 5" w:uiPriority="39"/>
-    <w:lsdException w:name="toc 6" w:uiPriority="39"/>
-    <w:lsdException w:name="toc 7" w:uiPriority="39"/>
-    <w:lsdException w:name="toc 8" w:uiPriority="39"/>
-    <w:lsdException w:name="toc 9" w:uiPriority="39"/>
-    <w:lsdException w:name="caption" w:uiPriority="35" w:qFormat="1"/>
-    <w:lsdException w:name="Title" w:semiHidden="0" w:uiPriority="10" w:unhideWhenUsed="0" w:qFormat="1"/>
-    <w:lsdException w:name="Default Paragraph Font" w:uiPriority="1"/>
-    <w:lsdException w:name="Subtitle" w:semiHidden="0" w:uiPriority="11" w:unhideWhenUsed="0" w:qFormat="1"/>
-    <w:lsdException w:name="Strong" w:semiHidden="0" w:uiPriority="22" w:unhideWhenUsed="0" w:qFormat="1"/>
-    <w:lsdException w:name="Emphasis" w:semiHidden="0" w:uiPriority="20" w:unhideWhenUsed="0" w:qFormat="1"/>
-    <w:lsdException w:name="Table Grid" w:semiHidden="0" w:uiPriority="39" w:unhideWhenUsed="0"/>
-    <w:lsdException w:name="Placeholder Text" w:unhideWhenUsed="0"/>
-    <w:lsdException w:name="No Spacing" w:semiHidden="0" w:uiPriority="1" w:unhideWhenUsed="0" w:qFormat="1"/>
-    <w:lsdException w:name="Light Shading" w:semiHidden="0" w:uiPriority="60" w:unhideWhenUsed="0"/>
-    <w:lsdException w:name="Light List" w:semiHidden="0" w:uiPriority="61" w:unhideWhenUsed="0"/>
-    <w:lsdException w:name="Light Grid" w:semiHidden="0" w:uiPriority="62" w:unhideWhenUsed="0"/>
-    <w:lsdException w:name="Medium Shading 1" w:semiHidden="0" w:uiPriority="63" w:unhideWhenUsed="0"/>
-    <w:lsdException w:name="Medium Shading 2" w:semiHidden="0" w:uiPriority="64" w:unhideWhenUsed="0"/>
-    <w:lsdException w:name="Medium List 1" w:semiHidden="0" w:uiPriority="65" w:unhideWhenUsed="0"/>
-    <w:lsdException w:name="Medium List 2" w:semiHidden="0" w:uiPriority="66" w:unhideWhenUsed="0"/>
-    <w:lsdException w:name="Medium Grid 1" w:semiHidden="0" w:uiPriority="67" w:unhideWhenUsed="0"/>
-    <w:lsdException w:name="Medium Grid 2" w:semiHidden="0" w:uiPriority="68" w:unhideWhenUsed="0"/>
-    <w:lsdException w:name="Medium Grid 3" w:semiHidden="0" w:uiPriority="69" w:unhideWhenUsed="0"/>
-    <w:lsdException w:name="Dark List" w:semiHidden="0" w:uiPriority="70" w:unhideWhenUsed="0"/>
-    <w:lsdException w:name="Colorful Shading" w:semiHidden="0" w:uiPriority="71" w:unhideWhenUsed="0"/>
-    <w:lsdException w:name="Colorful List" w:semiHidden="0" w:uiPriority="72" w:unhideWhenUsed="0"/>
-    <w:lsdException w:name="Colorful Grid" w:semiHidden="0" w:uiPriority="73" w:unhideWhenUsed="0"/>
-    <w:lsdException w:name="Light Shading Accent 1" w:semiHidden="0" w:uiPriority="60" w:unhideWhenUsed="0"/>
-    <w:lsdException w:name="Light List Accent 1" w:semiHidden="0" w:uiPriority="61" w:unhideWhenUsed="0"/>
-    <w:lsdException w:name="Light Grid Accent 1" w:semiHidden="0" w:uiPriority="62" w:unhideWhenUsed="0"/>
-    <w:lsdException w:name="Medium Shading 1 Accent 1" w:semiHidden="0" w:uiPriority="63" w:unhideWhenUsed="0"/>
-    <w:lsdException w:name="Medium Shading 2 Accent 1" w:semiHidden="0" w:uiPriority="64" w:unhideWhenUsed="0"/>
-    <w:lsdException w:name="Medium List 1 Accent 1" w:semiHidden="0" w:uiPriority="65" w:unhideWhenUsed="0"/>
-    <w:lsdException w:name="Revision" w:unhideWhenUsed="0"/>
-    <w:lsdException w:name="List Paragraph" w:semiHidden="0" w:uiPriority="34" w:unhideWhenUsed="0" w:qFormat="1"/>
-    <w:lsdException w:name="Quote" w:semiHidden="0" w:uiPriority="29" w:unhideWhenUsed="0" w:qFormat="1"/>
-    <w:lsdException w:name="Intense Quote" w:semiHidden="0" w:uiPriority="30" w:unhideWhenUsed="0" w:qFormat="1"/>
-    <w:lsdException w:name="Medium List 2 Accent 1" w:semiHidden="0" w:uiPriority="66" w:unhideWhenUsed="0"/>
-    <w:lsdException w:name="Medium Grid 1 Accent 1" w:semiHidden="0" w:uiPriority="67" w:unhideWhenUsed="0"/>
-    <w:lsdException w:name="Medium Grid 2 Accent 1" w:semiHidden="0" w:uiPriority="68" w:unhideWhenUsed="0"/>
-    <w:lsdException w:name="Medium Grid 3 Accent 1" w:semiHidden="0" w:uiPriority="69" w:unhideWhenUsed="0"/>
-    <w:lsdException w:name="Dark List Accent 1" w:semiHidden="0" w:uiPriority="70" w:unhideWhenUsed="0"/>
-    <w:lsdException w:name="Colorful Shading Accent 1" w:semiHidden="0" w:uiPriority="71" w:unhideWhenUsed="0"/>
-    <w:lsdException w:name="Colorful List Accent 1" w:semiHidden="0" w:uiPriority="72" w:unhideWhenUsed="0"/>
-    <w:lsdException w:name="Colorful Grid Accent 1" w:semiHidden="0" w:uiPriority="73" w:unhideWhenUsed="0"/>
-    <w:lsdException w:name="Light Shading Accent 2" w:semiHidden="0" w:uiPriority="60" w:unhideWhenUsed="0"/>
-    <w:lsdException w:name="Light List Accent 2" w:semiHidden="0" w:uiPriority="61" w:unhideWhenUsed="0"/>
-    <w:lsdException w:name="Light Grid Accent 2" w:semiHidden="0" w:uiPriority="62" w:unhideWhenUsed="0"/>
-    <w:lsdException w:name="Medium Shading 1 Accent 2" w:semiHidden="0" w:uiPriority="63" w:unhideWhenUsed="0"/>
-    <w:lsdException w:name="Medium Shading 2 Accent 2" w:semiHidden="0" w:uiPriority="64" w:unhideWhenUsed="0"/>
-    <w:lsdException w:name="Medium List 1 Accent 2" w:semiHidden="0" w:uiPriority="65" w:unhideWhenUsed="0"/>
-    <w:lsdException w:name="Medium List 2 Accent 2" w:semiHidden="0" w:uiPriority="66" w:unhideWhenUsed="0"/>
-    <w:lsdException w:name="Medium Grid 1 Accent 2" w:semiHidden="0" w:uiPriority="67" w:unhideWhenUsed="0"/>
-    <w:lsdException w:name="Medium Grid 2 Accent 2" w:semiHidden="0" w:uiPriority="68" w:unhideWhenUsed="0"/>
-    <w:lsdException w:name="Medium Grid 3 Accent 2" w:semiHidden="0" w:uiPriority="69" w:unhideWhenUsed="0"/>
-    <w:lsdException w:name="Dark List Accent 2" w:semiHidden="0" w:uiPriority="70" w:unhideWhenUsed="0"/>
-    <w:lsdException w:name="Colorful Shading Accent 2" w:semiHidden="0" w:uiPriority="71" w:unhideWhenUsed="0"/>
-    <w:lsdException w:name="Colorful List Accent 2" w:semiHidden="0" w:uiPriority="72" w:unhideWhenUsed="0"/>
-    <w:lsdException w:name="Colorful Grid Accent 2" w:semiHidden="0" w:uiPriority="73" w:unhideWhenUsed="0"/>
-    <w:lsdException w:name="Light Shading Accent 3" w:semiHidden="0" w:uiPriority="60" w:unhideWhenUsed="0"/>
-    <w:lsdException w:name="Light List Accent 3" w:semiHidden="0" w:uiPriority="61" w:unhideWhenUsed="0"/>
-    <w:lsdException w:name="Light Grid Accent 3" w:semiHidden="0" w:uiPriority="62" w:unhideWhenUsed="0"/>
-    <w:lsdException w:name="Medium Shading 1 Accent 3" w:semiHidden="0" w:uiPriority="63" w:unhideWhenUsed="0"/>
-    <w:lsdException w:name="Medium Shading 2 Accent 3" w:semiHidden="0" w:uiPriority="64" w:unhideWhenUsed="0"/>
-    <w:lsdException w:name="Medium List 1 Accent 3" w:semiHidden="0" w:uiPriority="65" w:unhideWhenUsed="0"/>
-    <w:lsdException w:name="Medium List 2 Accent 3" w:semiHidden="0" w:uiPriority="66" w:unhideWhenUsed="0"/>
-    <w:lsdException w:name="Medium Grid 1 Accent 3" w:semiHidden="0" w:uiPriority="67" w:unhideWhenUsed="0"/>
-    <w:lsdException w:name="Medium Grid 2 Accent 3" w:semiHidden="0" w:uiPriority="68" w:unhideWhenUsed="0"/>
-    <w:lsdException w:name="Medium Grid 3 Accent 3" w:semiHidden="0" w:uiPriority="69" w:unhideWhenUsed="0"/>
-    <w:lsdException w:name="Dark List Accent 3" w:semiHidden="0" w:uiPriority="70" w:unhideWhenUsed="0"/>
-    <w:lsdException w:name="Colorful Shading Accent 3" w:semiHidden="0" w:uiPriority="71" w:unhideWhenUsed="0"/>
-    <w:lsdException w:name="Colorful List Accent 3" w:semiHidden="0" w:uiPriority="72" w:unhideWhenUsed="0"/>
-    <w:lsdException w:name="Colorful Grid Accent 3" w:semiHidden="0" w:uiPriority="73" w:unhideWhenUsed="0"/>
-    <w:lsdException w:name="Light Shading Accent 4" w:semiHidden="0" w:uiPriority="60" w:unhideWhenUsed="0"/>
-    <w:lsdException w:name="Light List Accent 4" w:semiHidden="0" w:uiPriority="61" w:unhideWhenUsed="0"/>
-    <w:lsdException w:name="Light Grid Accent 4" w:semiHidden="0" w:uiPriority="62" w:unhideWhenUsed="0"/>
-    <w:lsdException w:name="Medium Shading 1 Accent 4" w:semiHidden="0" w:uiPriority="63" w:unhideWhenUsed="0"/>
-    <w:lsdException w:name="Medium Shading 2 Accent 4" w:semiHidden="0" w:uiPriority="64" w:unhideWhenUsed="0"/>
-    <w:lsdException w:name="Medium List 1 Accent 4" w:semiHidden="0" w:uiPriority="65" w:unhideWhenUsed="0"/>
-    <w:lsdException w:name="Medium List 2 Accent 4" w:semiHidden="0" w:uiPriority="66" w:unhideWhenUsed="0"/>
-    <w:lsdException w:name="Medium Grid 1 Accent 4" w:semiHidden="0" w:uiPriority="67" w:unhideWhenUsed="0"/>
-    <w:lsdException w:name="Medium Grid 2 Accent 4" w:semiHidden="0" w:uiPriority="68" w:unhideWhenUsed="0"/>
-    <w:lsdException w:name="Medium Grid 3 Accent 4" w:semiHidden="0" w:uiPriority="69" w:unhideWhenUsed="0"/>
-    <w:lsdException w:name="Dark List Accent 4" w:semiHidden="0" w:uiPriority="70" w:unhideWhenUsed="0"/>
-    <w:lsdException w:name="Colorful Shading Accent 4" w:semiHidden="0" w:uiPriority="71" w:unhideWhenUsed="0"/>
-    <w:lsdException w:name="Colorful List Accent 4" w:semiHidden="0" w:uiPriority="72" w:unhideWhenUsed="0"/>
-    <w:lsdException w:name="Colorful Grid Accent 4" w:semiHidden="0" w:uiPriority="73" w:unhideWhenUsed="0"/>
-    <w:lsdException w:name="Light Shading Accent 5" w:semiHidden="0" w:uiPriority="60" w:unhideWhenUsed="0"/>
-    <w:lsdException w:name="Light List Accent 5" w:semiHidden="0" w:uiPriority="61" w:unhideWhenUsed="0"/>
-    <w:lsdException w:name="Light Grid Accent 5" w:semiHidden="0" w:uiPriority="62" w:unhideWhenUsed="0"/>
-    <w:lsdException w:name="Medium Shading 1 Accent 5" w:semiHidden="0" w:uiPriority="63" w:unhideWhenUsed="0"/>
-    <w:lsdException w:name="Medium Shading 2 Accent 5" w:semiHidden="0" w:uiPriority="64" w:unhideWhenUsed="0"/>
-    <w:lsdException w:name="Medium List 1 Accent 5" w:semiHidden="0" w:uiPriority="65" w:unhideWhenUsed="0"/>
-    <w:lsdException w:name="Medium List 2 Accent 5" w:semiHidden="0" w:uiPriority="66" w:unhideWhenUsed="0"/>
-    <w:lsdException w:name="Medium Grid 1 Accent 5" w:semiHidden="0" w:uiPriority="67" w:unhideWhenUsed="0"/>
-    <w:lsdException w:name="Medium Grid 2 Accent 5" w:semiHidden="0" w:uiPriority="68" w:unhideWhenUsed="0"/>
-    <w:lsdException w:name="Medium Grid 3 Accent 5" w:semiHidden="0" w:uiPriority="69" w:unhideWhenUsed="0"/>
-    <w:lsdException w:name="Dark List Accent 5" w:semiHidden="0" w:uiPriority="70" w:unhideWhenUsed="0"/>
-    <w:lsdException w:name="Colorful Shading Accent 5" w:semiHidden="0" w:uiPriority="71" w:unhideWhenUsed="0"/>
-    <w:lsdException w:name="Colorful List Accent 5" w:semiHidden="0" w:uiPriority="72" w:unhideWhenUsed="0"/>
-    <w:lsdException w:name="Colorful Grid Accent 5" w:semiHidden="0" w:uiPriority="73" w:unhideWhenUsed="0"/>
-    <w:lsdException w:name="Light Shading Accent 6" w:semiHidden="0" w:uiPriority="60" w:unhideWhenUsed="0"/>
-    <w:lsdException w:name="Light List Accent 6" w:semiHidden="0" w:uiPriority="61" w:unhideWhenUsed="0"/>
-    <w:lsdException w:name="Light Grid Accent 6" w:semiHidden="0" w:uiPriority="62" w:unhideWhenUsed="0"/>
-    <w:lsdException w:name="Medium Shading 1 Accent 6" w:semiHidden="0" w:uiPriority="63" w:unhideWhenUsed="0"/>
-    <w:lsdException w:name="Medium Shading 2 Accent 6" w:semiHidden="0" w:uiPriority="64" w:unhideWhenUsed="0"/>
-    <w:lsdException w:name="Medium List 1 Accent 6" w:semiHidden="0" w:uiPriority="65" w:unhideWhenUsed="0"/>
-    <w:lsdException w:name="Medium List 2 Accent 6" w:semiHidden="0" w:uiPriority="66" w:unhideWhenUsed="0"/>
-    <w:lsdException w:name="Medium Grid 1 Accent 6" w:semiHidden="0" w:uiPriority="67" w:unhideWhenUsed="0"/>
-    <w:lsdException w:name="Medium Grid 2 Accent 6" w:semiHidden="0" w:uiPriority="68" w:unhideWhenUsed="0"/>
-    <w:lsdException w:name="Medium Grid 3 Accent 6" w:semiHidden="0" w:uiPriority="69" w:unhideWhenUsed="0"/>
-    <w:lsdException w:name="Dark List Accent 6" w:semiHidden="0" w:uiPriority="70" w:unhideWhenUsed="0"/>
-    <w:lsdException w:name="Colorful Shading Accent 6" w:semiHidden="0" w:uiPriority="71" w:unhideWhenUsed="0"/>
-    <w:lsdException w:name="Colorful List Accent 6" w:semiHidden="0" w:uiPriority="72" w:unhideWhenUsed="0"/>
-    <w:lsdException w:name="Colorful Grid Accent 6" w:semiHidden="0" w:uiPriority="73" w:unhideWhenUsed="0"/>
-    <w:lsdException w:name="Subtle Emphasis" w:semiHidden="0" w:uiPriority="19" w:unhideWhenUsed="0" w:qFormat="1"/>
-    <w:lsdException w:name="Intense Emphasis" w:semiHidden="0" w:uiPriority="21" w:unhideWhenUsed="0" w:qFormat="1"/>
-    <w:lsdException w:name="Subtle Reference" w:semiHidden="0" w:uiPriority="31" w:unhideWhenUsed="0" w:qFormat="1"/>
-    <w:lsdException w:name="Intense Reference" w:semiHidden="0" w:uiPriority="32" w:unhideWhenUsed="0" w:qFormat="1"/>
-    <w:lsdException w:name="Book Title" w:semiHidden="0" w:uiPriority="33" w:unhideWhenUsed="0" w:qFormat="1"/>
-    <w:lsdException w:name="Bibliography" w:uiPriority="37"/>
-    <w:lsdException w:name="TOC Heading" w:uiPriority="39" w:qFormat="1"/>
-  </w:latentStyles>
-  <w:style w:type="paragraph" w:default="1" w:styleId="Normal">
-    <w:name w:val="Normal"/>
-    <w:qFormat/>
-  </w:style>
-  <w:style w:type="paragraph" w:styleId="Titre1">
-    <w:name w:val="heading 1"/>
-    <w:basedOn w:val="Normal"/>
-    <w:next w:val="Normal"/>
-    <w:link w:val="Titre1Car"/>
-    <w:uiPriority w:val="9"/>
-    <w:qFormat/>
-    <w:rsid w:val="005127FF"/>
-    <w:pPr>
-      <w:keepNext/>
-      <w:keepLines/>
-      <w:numPr>
-        <w:numId w:val="2"/>
-      </w:numPr>
-      <w:spacing w:before="480" w:after="0"/>
-      <w:outlineLvl w:val="0"/>
-    </w:pPr>
-    <w:rPr>
-      <w:rFonts w:asciiTheme="majorHAnsi" w:eastAsiaTheme="majorEastAsia" w:hAnsiTheme="majorHAnsi" w:cstheme="majorBidi"/>
-      <w:b/>
-      <w:bCs/>
-      <w:color w:val="2E74B5" w:themeColor="accent1" w:themeShade="BF"/>
-      <w:sz w:val="28"/>
-      <w:szCs w:val="28"/>
-    </w:rPr>
-  </w:style>
-  <w:style w:type="paragraph" w:styleId="Titre2">
-    <w:name w:val="heading 2"/>
-    <w:basedOn w:val="Normal"/>
-    <w:next w:val="Normal"/>
-    <w:link w:val="Titre2Car"/>
-    <w:uiPriority w:val="9"/>
-    <w:unhideWhenUsed/>
-    <w:qFormat/>
-    <w:rsid w:val="005127FF"/>
-    <w:pPr>
-      <w:keepNext/>
-      <w:keepLines/>
-      <w:numPr>
-        <w:ilvl w:val="1"/>
-        <w:numId w:val="2"/>
-      </w:numPr>
-      <w:spacing w:before="200" w:after="0"/>
-      <w:outlineLvl w:val="1"/>
-    </w:pPr>
-    <w:rPr>
-      <w:rFonts w:asciiTheme="majorHAnsi" w:eastAsiaTheme="majorEastAsia" w:hAnsiTheme="majorHAnsi" w:cstheme="majorBidi"/>
-      <w:b/>
-      <w:bCs/>
-      <w:color w:val="5B9BD5" w:themeColor="accent1"/>
-      <w:sz w:val="26"/>
-      <w:szCs w:val="26"/>
-    </w:rPr>
-  </w:style>
-  <w:style w:type="paragraph" w:styleId="Titre3">
-    <w:name w:val="heading 3"/>
-    <w:basedOn w:val="Normal"/>
-    <w:next w:val="Normal"/>
-    <w:link w:val="Titre3Car"/>
-    <w:uiPriority w:val="9"/>
-    <w:unhideWhenUsed/>
-    <w:qFormat/>
-    <w:rsid w:val="005127FF"/>
-    <w:pPr>
-      <w:keepNext/>
-      <w:keepLines/>
-      <w:numPr>
-        <w:ilvl w:val="2"/>
-        <w:numId w:val="2"/>
-      </w:numPr>
-      <w:spacing w:before="200" w:after="0"/>
-      <w:outlineLvl w:val="2"/>
-    </w:pPr>
-    <w:rPr>
-      <w:rFonts w:asciiTheme="majorHAnsi" w:eastAsiaTheme="majorEastAsia" w:hAnsiTheme="majorHAnsi" w:cstheme="majorBidi"/>
-      <w:b/>
-      <w:bCs/>
-      <w:color w:val="5B9BD5" w:themeColor="accent1"/>
-    </w:rPr>
-  </w:style>
-  <w:style w:type="paragraph" w:styleId="Titre4">
-    <w:name w:val="heading 4"/>
-    <w:basedOn w:val="Normal"/>
-    <w:next w:val="Normal"/>
-    <w:link w:val="Titre4Car"/>
-    <w:uiPriority w:val="9"/>
-    <w:unhideWhenUsed/>
-    <w:qFormat/>
-    <w:rsid w:val="005127FF"/>
-    <w:pPr>
-      <w:keepNext/>
-      <w:keepLines/>
-      <w:numPr>
-        <w:ilvl w:val="3"/>
-        <w:numId w:val="2"/>
-      </w:numPr>
-      <w:spacing w:before="200" w:after="0"/>
-      <w:outlineLvl w:val="3"/>
-    </w:pPr>
-    <w:rPr>
-      <w:rFonts w:asciiTheme="majorHAnsi" w:eastAsiaTheme="majorEastAsia" w:hAnsiTheme="majorHAnsi" w:cstheme="majorBidi"/>
-      <w:b/>
-      <w:bCs/>
-      <w:i/>
-      <w:iCs/>
-      <w:color w:val="5B9BD5" w:themeColor="accent1"/>
-    </w:rPr>
-  </w:style>
-  <w:style w:type="paragraph" w:styleId="Titre5">
-    <w:name w:val="heading 5"/>
-    <w:basedOn w:val="Normal"/>
-    <w:next w:val="Normal"/>
-    <w:link w:val="Titre5Car"/>
-    <w:uiPriority w:val="9"/>
-    <w:semiHidden/>
-    <w:unhideWhenUsed/>
-    <w:qFormat/>
-    <w:rsid w:val="005127FF"/>
-    <w:pPr>
-      <w:keepNext/>
-      <w:keepLines/>
-      <w:numPr>
-        <w:ilvl w:val="4"/>
-        <w:numId w:val="2"/>
-      </w:numPr>
-      <w:spacing w:before="200" w:after="0"/>
-      <w:outlineLvl w:val="4"/>
-    </w:pPr>
-    <w:rPr>
-      <w:rFonts w:asciiTheme="majorHAnsi" w:eastAsiaTheme="majorEastAsia" w:hAnsiTheme="majorHAnsi" w:cstheme="majorBidi"/>
-      <w:color w:val="1F4D78" w:themeColor="accent1" w:themeShade="7F"/>
-    </w:rPr>
-  </w:style>
-  <w:style w:type="paragraph" w:styleId="Titre6">
-    <w:name w:val="heading 6"/>
-    <w:basedOn w:val="Normal"/>
-    <w:next w:val="Normal"/>
-    <w:link w:val="Titre6Car"/>
-    <w:uiPriority w:val="9"/>
-    <w:semiHidden/>
-    <w:unhideWhenUsed/>
-    <w:qFormat/>
-    <w:rsid w:val="005127FF"/>
-    <w:pPr>
-      <w:keepNext/>
-      <w:keepLines/>
-      <w:numPr>
-        <w:ilvl w:val="5"/>
-        <w:numId w:val="2"/>
-      </w:numPr>
-      <w:spacing w:before="200" w:after="0"/>
-      <w:outlineLvl w:val="5"/>
-    </w:pPr>
-    <w:rPr>
-      <w:rFonts w:asciiTheme="majorHAnsi" w:eastAsiaTheme="majorEastAsia" w:hAnsiTheme="majorHAnsi" w:cstheme="majorBidi"/>
-      <w:i/>
-      <w:iCs/>
-      <w:color w:val="1F4D78" w:themeColor="accent1" w:themeShade="7F"/>
-    </w:rPr>
-  </w:style>
-  <w:style w:type="paragraph" w:styleId="Titre7">
-    <w:name w:val="heading 7"/>
-    <w:basedOn w:val="Normal"/>
-    <w:next w:val="Normal"/>
-    <w:link w:val="Titre7Car"/>
-    <w:uiPriority w:val="9"/>
-    <w:semiHidden/>
-    <w:unhideWhenUsed/>
-    <w:qFormat/>
-    <w:rsid w:val="005127FF"/>
-    <w:pPr>
-      <w:keepNext/>
-      <w:keepLines/>
-      <w:numPr>
-        <w:ilvl w:val="6"/>
-        <w:numId w:val="2"/>
-      </w:numPr>
-      <w:spacing w:before="200" w:after="0"/>
-      <w:outlineLvl w:val="6"/>
-    </w:pPr>
-    <w:rPr>
-      <w:rFonts w:asciiTheme="majorHAnsi" w:eastAsiaTheme="majorEastAsia" w:hAnsiTheme="majorHAnsi" w:cstheme="majorBidi"/>
-      <w:i/>
-      <w:iCs/>
-      <w:color w:val="404040" w:themeColor="text1" w:themeTint="BF"/>
-    </w:rPr>
-  </w:style>
-  <w:style w:type="paragraph" w:styleId="Titre8">
-    <w:name w:val="heading 8"/>
-    <w:basedOn w:val="Normal"/>
-    <w:next w:val="Normal"/>
-    <w:link w:val="Titre8Car"/>
-    <w:uiPriority w:val="9"/>
-    <w:semiHidden/>
-    <w:unhideWhenUsed/>
-    <w:qFormat/>
-    <w:rsid w:val="005127FF"/>
-    <w:pPr>
-      <w:keepNext/>
-      <w:keepLines/>
-      <w:numPr>
-        <w:ilvl w:val="7"/>
-        <w:numId w:val="2"/>
-      </w:numPr>
-      <w:spacing w:before="200" w:after="0"/>
-      <w:outlineLvl w:val="7"/>
-    </w:pPr>
-    <w:rPr>
-      <w:rFonts w:asciiTheme="majorHAnsi" w:eastAsiaTheme="majorEastAsia" w:hAnsiTheme="majorHAnsi" w:cstheme="majorBidi"/>
-      <w:color w:val="404040" w:themeColor="text1" w:themeTint="BF"/>
-      <w:sz w:val="20"/>
-      <w:szCs w:val="20"/>
-    </w:rPr>
-  </w:style>
-  <w:style w:type="paragraph" w:styleId="Titre9">
-    <w:name w:val="heading 9"/>
-    <w:basedOn w:val="Normal"/>
-    <w:next w:val="Normal"/>
-    <w:link w:val="Titre9Car"/>
-    <w:uiPriority w:val="9"/>
-    <w:semiHidden/>
-    <w:unhideWhenUsed/>
-    <w:qFormat/>
-    <w:rsid w:val="005127FF"/>
-    <w:pPr>
-      <w:keepNext/>
-      <w:keepLines/>
-      <w:numPr>
-        <w:ilvl w:val="8"/>
-        <w:numId w:val="2"/>
-      </w:numPr>
-      <w:spacing w:before="200" w:after="0"/>
-      <w:outlineLvl w:val="8"/>
-    </w:pPr>
-    <w:rPr>
-      <w:rFonts w:asciiTheme="majorHAnsi" w:eastAsiaTheme="majorEastAsia" w:hAnsiTheme="majorHAnsi" w:cstheme="majorBidi"/>
-      <w:i/>
-      <w:iCs/>
-      <w:color w:val="404040" w:themeColor="text1" w:themeTint="BF"/>
-      <w:sz w:val="20"/>
-      <w:szCs w:val="20"/>
-    </w:rPr>
-  </w:style>
-  <w:style w:type="character" w:default="1" w:styleId="Policepardfaut">
-    <w:name w:val="Default Paragraph Font"/>
-    <w:uiPriority w:val="1"/>
-    <w:semiHidden/>
-    <w:unhideWhenUsed/>
-  </w:style>
-  <w:style w:type="table" w:default="1" w:styleId="TableauNormal">
-    <w:name w:val="Normal Table"/>
-    <w:uiPriority w:val="99"/>
-    <w:semiHidden/>
-    <w:unhideWhenUsed/>
-    <w:tblPr>
-      <w:tblInd w:w="0" w:type="dxa"/>
-      <w:tblCellMar>
-        <w:top w:w="0" w:type="dxa"/>
-        <w:left w:w="108" w:type="dxa"/>
-        <w:bottom w:w="0" w:type="dxa"/>
-        <w:right w:w="108" w:type="dxa"/>
-      </w:tblCellMar>
-    </w:tblPr>
-  </w:style>
-  <w:style w:type="numbering" w:default="1" w:styleId="Aucuneliste">
-    <w:name w:val="No List"/>
-    <w:uiPriority w:val="99"/>
-    <w:semiHidden/>
-    <w:unhideWhenUsed/>
-  </w:style>
-  <w:style w:type="character" w:styleId="Textedelespacerserv">
-    <w:name w:val="Placeholder Text"/>
-    <w:basedOn w:val="Policepardfaut"/>
-    <w:uiPriority w:val="99"/>
-    <w:semiHidden/>
-    <w:rsid w:val="00270677"/>
-    <w:rPr>
-      <w:color w:val="808080"/>
-    </w:rPr>
-  </w:style>
-  <w:style w:type="paragraph" w:styleId="Textedebulles">
-    <w:name w:val="Balloon Text"/>
-    <w:basedOn w:val="Normal"/>
-    <w:link w:val="TextedebullesCar"/>
-    <w:uiPriority w:val="99"/>
-    <w:semiHidden/>
-    <w:unhideWhenUsed/>
-    <w:rsid w:val="005F2D7B"/>
-    <w:pPr>
-      <w:spacing w:after="0" w:line="240" w:lineRule="auto"/>
-    </w:pPr>
-    <w:rPr>
-      <w:rFonts w:ascii="Tahoma" w:hAnsi="Tahoma" w:cs="Tahoma"/>
-      <w:sz w:val="16"/>
-      <w:szCs w:val="16"/>
-    </w:rPr>
-  </w:style>
-  <w:style w:type="character" w:customStyle="1" w:styleId="TextedebullesCar">
-    <w:name w:val="Texte de bulles Car"/>
-    <w:basedOn w:val="Policepardfaut"/>
-    <w:link w:val="Textedebulles"/>
-    <w:uiPriority w:val="99"/>
-    <w:semiHidden/>
-    <w:rsid w:val="005F2D7B"/>
-    <w:rPr>
-      <w:rFonts w:ascii="Tahoma" w:hAnsi="Tahoma" w:cs="Tahoma"/>
-      <w:sz w:val="16"/>
-      <w:szCs w:val="16"/>
-    </w:rPr>
-  </w:style>
-  <w:style w:type="character" w:customStyle="1" w:styleId="Titre1Car">
-    <w:name w:val="Titre 1 Car"/>
-    <w:basedOn w:val="Policepardfaut"/>
-    <w:link w:val="Titre1"/>
-    <w:uiPriority w:val="9"/>
-    <w:rsid w:val="005127FF"/>
-    <w:rPr>
-      <w:rFonts w:asciiTheme="majorHAnsi" w:eastAsiaTheme="majorEastAsia" w:hAnsiTheme="majorHAnsi" w:cstheme="majorBidi"/>
-      <w:b/>
-      <w:bCs/>
-      <w:color w:val="2E74B5" w:themeColor="accent1" w:themeShade="BF"/>
-      <w:sz w:val="28"/>
-      <w:szCs w:val="28"/>
-    </w:rPr>
-  </w:style>
-  <w:style w:type="paragraph" w:styleId="En-ttedetabledesmatires">
-    <w:name w:val="TOC Heading"/>
-    <w:basedOn w:val="Titre1"/>
-    <w:next w:val="Normal"/>
-    <w:uiPriority w:val="39"/>
-    <w:semiHidden/>
-    <w:unhideWhenUsed/>
-    <w:qFormat/>
-    <w:rsid w:val="005127FF"/>
-    <w:pPr>
-      <w:spacing w:line="276" w:lineRule="auto"/>
-      <w:outlineLvl w:val="9"/>
-    </w:pPr>
-    <w:rPr>
-      <w:lang w:eastAsia="en-GB"/>
-    </w:rPr>
-  </w:style>
-  <w:style w:type="character" w:customStyle="1" w:styleId="Titre2Car">
-    <w:name w:val="Titre 2 Car"/>
-    <w:basedOn w:val="Policepardfaut"/>
-    <w:link w:val="Titre2"/>
-    <w:uiPriority w:val="9"/>
-    <w:rsid w:val="005127FF"/>
-    <w:rPr>
-      <w:rFonts w:asciiTheme="majorHAnsi" w:eastAsiaTheme="majorEastAsia" w:hAnsiTheme="majorHAnsi" w:cstheme="majorBidi"/>
-      <w:b/>
-      <w:bCs/>
-      <w:color w:val="5B9BD5" w:themeColor="accent1"/>
-      <w:sz w:val="26"/>
-      <w:szCs w:val="26"/>
-    </w:rPr>
-  </w:style>
-  <w:style w:type="character" w:customStyle="1" w:styleId="Titre3Car">
-    <w:name w:val="Titre 3 Car"/>
-    <w:basedOn w:val="Policepardfaut"/>
-    <w:link w:val="Titre3"/>
-    <w:uiPriority w:val="9"/>
-    <w:rsid w:val="005127FF"/>
-    <w:rPr>
-      <w:rFonts w:asciiTheme="majorHAnsi" w:eastAsiaTheme="majorEastAsia" w:hAnsiTheme="majorHAnsi" w:cstheme="majorBidi"/>
-      <w:b/>
-      <w:bCs/>
-      <w:color w:val="5B9BD5" w:themeColor="accent1"/>
-    </w:rPr>
-  </w:style>
-  <w:style w:type="character" w:customStyle="1" w:styleId="Titre4Car">
-    <w:name w:val="Titre 4 Car"/>
-    <w:basedOn w:val="Policepardfaut"/>
-    <w:link w:val="Titre4"/>
-    <w:uiPriority w:val="9"/>
-    <w:rsid w:val="005127FF"/>
-    <w:rPr>
-      <w:rFonts w:asciiTheme="majorHAnsi" w:eastAsiaTheme="majorEastAsia" w:hAnsiTheme="majorHAnsi" w:cstheme="majorBidi"/>
-      <w:b/>
-      <w:bCs/>
-      <w:i/>
-      <w:iCs/>
-      <w:color w:val="5B9BD5" w:themeColor="accent1"/>
-    </w:rPr>
-  </w:style>
-  <w:style w:type="character" w:customStyle="1" w:styleId="Titre5Car">
-    <w:name w:val="Titre 5 Car"/>
-    <w:basedOn w:val="Policepardfaut"/>
-    <w:link w:val="Titre5"/>
-    <w:uiPriority w:val="9"/>
-    <w:semiHidden/>
-    <w:rsid w:val="005127FF"/>
-    <w:rPr>
-      <w:rFonts w:asciiTheme="majorHAnsi" w:eastAsiaTheme="majorEastAsia" w:hAnsiTheme="majorHAnsi" w:cstheme="majorBidi"/>
-      <w:color w:val="1F4D78" w:themeColor="accent1" w:themeShade="7F"/>
-    </w:rPr>
-  </w:style>
-  <w:style w:type="character" w:customStyle="1" w:styleId="Titre6Car">
-    <w:name w:val="Titre 6 Car"/>
-    <w:basedOn w:val="Policepardfaut"/>
-    <w:link w:val="Titre6"/>
-    <w:uiPriority w:val="9"/>
-    <w:semiHidden/>
-    <w:rsid w:val="005127FF"/>
-    <w:rPr>
-      <w:rFonts w:asciiTheme="majorHAnsi" w:eastAsiaTheme="majorEastAsia" w:hAnsiTheme="majorHAnsi" w:cstheme="majorBidi"/>
-      <w:i/>
-      <w:iCs/>
-      <w:color w:val="1F4D78" w:themeColor="accent1" w:themeShade="7F"/>
-    </w:rPr>
-  </w:style>
-  <w:style w:type="character" w:customStyle="1" w:styleId="Titre7Car">
-    <w:name w:val="Titre 7 Car"/>
-    <w:basedOn w:val="Policepardfaut"/>
-    <w:link w:val="Titre7"/>
-    <w:uiPriority w:val="9"/>
-    <w:semiHidden/>
-    <w:rsid w:val="005127FF"/>
-    <w:rPr>
-      <w:rFonts w:asciiTheme="majorHAnsi" w:eastAsiaTheme="majorEastAsia" w:hAnsiTheme="majorHAnsi" w:cstheme="majorBidi"/>
-      <w:i/>
-      <w:iCs/>
-      <w:color w:val="404040" w:themeColor="text1" w:themeTint="BF"/>
-    </w:rPr>
-  </w:style>
-  <w:style w:type="character" w:customStyle="1" w:styleId="Titre8Car">
-    <w:name w:val="Titre 8 Car"/>
-    <w:basedOn w:val="Policepardfaut"/>
-    <w:link w:val="Titre8"/>
-    <w:uiPriority w:val="9"/>
-    <w:semiHidden/>
-    <w:rsid w:val="005127FF"/>
-    <w:rPr>
-      <w:rFonts w:asciiTheme="majorHAnsi" w:eastAsiaTheme="majorEastAsia" w:hAnsiTheme="majorHAnsi" w:cstheme="majorBidi"/>
-      <w:color w:val="404040" w:themeColor="text1" w:themeTint="BF"/>
-      <w:sz w:val="20"/>
-      <w:szCs w:val="20"/>
-    </w:rPr>
-  </w:style>
-  <w:style w:type="character" w:customStyle="1" w:styleId="Titre9Car">
-    <w:name w:val="Titre 9 Car"/>
-    <w:basedOn w:val="Policepardfaut"/>
-    <w:link w:val="Titre9"/>
-    <w:uiPriority w:val="9"/>
-    <w:semiHidden/>
-    <w:rsid w:val="005127FF"/>
-    <w:rPr>
-      <w:rFonts w:asciiTheme="majorHAnsi" w:eastAsiaTheme="majorEastAsia" w:hAnsiTheme="majorHAnsi" w:cstheme="majorBidi"/>
-      <w:i/>
-      <w:iCs/>
-      <w:color w:val="404040" w:themeColor="text1" w:themeTint="BF"/>
-      <w:sz w:val="20"/>
-      <w:szCs w:val="20"/>
-    </w:rPr>
-  </w:style>
-  <w:style w:type="paragraph" w:styleId="TM1">
-    <w:name w:val="toc 1"/>
-    <w:basedOn w:val="Normal"/>
-    <w:next w:val="Normal"/>
-    <w:autoRedefine/>
-    <w:uiPriority w:val="39"/>
-    <w:unhideWhenUsed/>
-    <w:rsid w:val="00A161BB"/>
-    <w:pPr>
-      <w:spacing w:after="100"/>
-    </w:pPr>
-  </w:style>
-  <w:style w:type="paragraph" w:styleId="TM2">
-    <w:name w:val="toc 2"/>
-    <w:basedOn w:val="Normal"/>
-    <w:next w:val="Normal"/>
-    <w:autoRedefine/>
-    <w:uiPriority w:val="39"/>
-    <w:unhideWhenUsed/>
-    <w:rsid w:val="00A161BB"/>
-    <w:pPr>
-      <w:spacing w:after="100"/>
-      <w:ind w:left="220"/>
-    </w:pPr>
-  </w:style>
-  <w:style w:type="paragraph" w:styleId="TM3">
-    <w:name w:val="toc 3"/>
-    <w:basedOn w:val="Normal"/>
-    <w:next w:val="Normal"/>
-    <w:autoRedefine/>
-    <w:uiPriority w:val="39"/>
-    <w:unhideWhenUsed/>
-    <w:rsid w:val="00A161BB"/>
-    <w:pPr>
-      <w:spacing w:after="100"/>
-      <w:ind w:left="440"/>
-    </w:pPr>
-  </w:style>
-  <w:style w:type="character" w:styleId="Lienhypertexte">
-    <w:name w:val="Hyperlink"/>
-    <w:basedOn w:val="Policepardfaut"/>
-    <w:uiPriority w:val="99"/>
-    <w:unhideWhenUsed/>
-    <w:rsid w:val="00A161BB"/>
-    <w:rPr>
-      <w:color w:val="0563C1" w:themeColor="hyperlink"/>
-      <w:u w:val="single"/>
-    </w:rPr>
-  </w:style>
-</w:styles>
-</file>
-
-<file path=word/stylesWithEffects.xml><?xml version="1.0" encoding="utf-8"?>
-<w:styles xmlns:wpc="http://schemas.microsoft.com/office/word/2010/wordprocessingCanvas" xmlns:mc="http://schemas.openxmlformats.org/markup-compatibility/2006" xmlns:o="urn:schemas-microsoft-com:office:office" xmlns:r="http://schemas.openxmlformats.org/officeDocument/2006/relationships" xmlns:m="http://schemas.openxmlformats.org/officeDocument/2006/math" xmlns:v="urn:schemas-microsoft-com:vml" xmlns:wp14="http://schemas.microsoft.com/office/word/2010/wordprocessingDrawing" xmlns:wp="http://schemas.openxmlformats.org/drawingml/2006/wordprocessingDrawing" xmlns:w10="urn:schemas-microsoft-com:office:word" xmlns:w="http://schemas.openxmlformats.org/wordprocessingml/2006/main" xmlns:w14="http://schemas.microsoft.com/office/word/2010/wordml" xmlns:wpg="http://schemas.microsoft.com/office/word/2010/wordprocessingGroup" xmlns:wpi="http://schemas.microsoft.com/office/word/2010/wordprocessingInk" xmlns:wne="http://schemas.microsoft.com/office/word/2006/wordml" xmlns:wps="http://schemas.microsoft.com/office/word/2010/wordprocessingShape" mc:Ignorable="w14 wp14">
-  <w:docDefaults>
-    <w:rPrDefault>
-      <w:rPr>
-        <w:rFonts w:asciiTheme="minorHAnsi" w:eastAsiaTheme="minorHAnsi" w:hAnsiTheme="minorHAnsi" w:cstheme="minorBidi"/>
-        <w:sz w:val="22"/>
-        <w:szCs w:val="22"/>
-        <w:lang w:val="en-GB" w:eastAsia="en-US" w:bidi="ar-SA"/>
-      </w:rPr>
-    </w:rPrDefault>
-    <w:pPrDefault>
-      <w:pPr>
-        <w:spacing w:after="160" w:line="259" w:lineRule="auto"/>
-      </w:pPr>
-    </w:pPrDefault>
-  </w:docDefaults>
-  <w:latentStyles w:defLockedState="0" w:defUIPriority="99" w:defSemiHidden="1" w:defUnhideWhenUsed="1" w:defQFormat="0" w:count="267">
-    <w:lsdException w:name="Normal" w:semiHidden="0" w:uiPriority="0" w:unhideWhenUsed="0" w:qFormat="1"/>
-    <w:lsdException w:name="heading 1" w:semiHidden="0" w:uiPriority="9" w:unhideWhenUsed="0" w:qFormat="1"/>
-    <w:lsdException w:name="heading 2" w:uiPriority="9" w:qFormat="1"/>
-    <w:lsdException w:name="heading 3" w:uiPriority="9" w:qFormat="1"/>
-    <w:lsdException w:name="heading 4" w:uiPriority="9" w:qFormat="1"/>
-    <w:lsdException w:name="heading 5" w:uiPriority="9" w:qFormat="1"/>
-    <w:lsdException w:name="heading 6" w:uiPriority="9" w:qFormat="1"/>
-    <w:lsdException w:name="heading 7" w:uiPriority="9" w:qFormat="1"/>
-    <w:lsdException w:name="heading 8" w:uiPriority="9" w:qFormat="1"/>
-    <w:lsdException w:name="heading 9" w:uiPriority="9" w:qFormat="1"/>
-    <w:lsdException w:name="toc 1" w:uiPriority="39"/>
-    <w:lsdException w:name="toc 2" w:uiPriority="39"/>
-    <w:lsdException w:name="toc 3" w:uiPriority="39"/>
-    <w:lsdException w:name="toc 4" w:uiPriority="39"/>
-    <w:lsdException w:name="toc 5" w:uiPriority="39"/>
-    <w:lsdException w:name="toc 6" w:uiPriority="39"/>
-    <w:lsdException w:name="toc 7" w:uiPriority="39"/>
-    <w:lsdException w:name="toc 8" w:uiPriority="39"/>
-    <w:lsdException w:name="toc 9" w:uiPriority="39"/>
-    <w:lsdException w:name="caption" w:uiPriority="35" w:qFormat="1"/>
-    <w:lsdException w:name="Title" w:semiHidden="0" w:uiPriority="10" w:unhideWhenUsed="0" w:qFormat="1"/>
-    <w:lsdException w:name="Default Paragraph Font" w:uiPriority="1"/>
-    <w:lsdException w:name="Subtitle" w:semiHidden="0" w:uiPriority="11" w:unhideWhenUsed="0" w:qFormat="1"/>
-    <w:lsdException w:name="Strong" w:semiHidden="0" w:uiPriority="22" w:unhideWhenUsed="0" w:qFormat="1"/>
-    <w:lsdException w:name="Emphasis" w:semiHidden="0" w:uiPriority="20" w:unhideWhenUsed="0" w:qFormat="1"/>
-    <w:lsdException w:name="Table Grid" w:semiHidden="0" w:uiPriority="39" w:unhideWhenUsed="0"/>
-    <w:lsdException w:name="Placeholder Text" w:unhideWhenUsed="0"/>
-    <w:lsdException w:name="No Spacing" w:semiHidden="0" w:uiPriority="1" w:unhideWhenUsed="0" w:qFormat="1"/>
-    <w:lsdException w:name="Light Shading" w:semiHidden="0" w:uiPriority="60" w:unhideWhenUsed="0"/>
-    <w:lsdException w:name="Light List" w:semiHidden="0" w:uiPriority="61" w:unhideWhenUsed="0"/>
-    <w:lsdException w:name="Light Grid" w:semiHidden="0" w:uiPriority="62" w:unhideWhenUsed="0"/>
-    <w:lsdException w:name="Medium Shading 1" w:semiHidden="0" w:uiPriority="63" w:unhideWhenUsed="0"/>
-    <w:lsdException w:name="Medium Shading 2" w:semiHidden="0" w:uiPriority="64" w:unhideWhenUsed="0"/>
-    <w:lsdException w:name="Medium List 1" w:semiHidden="0" w:uiPriority="65" w:unhideWhenUsed="0"/>
-    <w:lsdException w:name="Medium List 2" w:semiHidden="0" w:uiPriority="66" w:unhideWhenUsed="0"/>
-    <w:lsdException w:name="Medium Grid 1" w:semiHidden="0" w:uiPriority="67" w:unhideWhenUsed="0"/>
-    <w:lsdException w:name="Medium Grid 2" w:semiHidden="0" w:uiPriority="68" w:unhideWhenUsed="0"/>
-    <w:lsdException w:name="Medium Grid 3" w:semiHidden="0" w:uiPriority="69" w:unhideWhenUsed="0"/>
-    <w:lsdException w:name="Dark List" w:semiHidden="0" w:uiPriority="70" w:unhideWhenUsed="0"/>
-    <w:lsdException w:name="Colorful Shading" w:semiHidden="0" w:uiPriority="71" w:unhideWhenUsed="0"/>
-    <w:lsdException w:name="Colorful List" w:semiHidden="0" w:uiPriority="72" w:unhideWhenUsed="0"/>
-    <w:lsdException w:name="Colorful Grid" w:semiHidden="0" w:uiPriority="73" w:unhideWhenUsed="0"/>
-    <w:lsdException w:name="Light Shading Accent 1" w:semiHidden="0" w:uiPriority="60" w:unhideWhenUsed="0"/>
-    <w:lsdException w:name="Light List Accent 1" w:semiHidden="0" w:uiPriority="61" w:unhideWhenUsed="0"/>
-    <w:lsdException w:name="Light Grid Accent 1" w:semiHidden="0" w:uiPriority="62" w:unhideWhenUsed="0"/>
-    <w:lsdException w:name="Medium Shading 1 Accent 1" w:semiHidden="0" w:uiPriority="63" w:unhideWhenUsed="0"/>
-    <w:lsdException w:name="Medium Shading 2 Accent 1" w:semiHidden="0" w:uiPriority="64" w:unhideWhenUsed="0"/>
-    <w:lsdException w:name="Medium List 1 Accent 1" w:semiHidden="0" w:uiPriority="65" w:unhideWhenUsed="0"/>
-    <w:lsdException w:name="Revision" w:unhideWhenUsed="0"/>
-    <w:lsdException w:name="List Paragraph" w:semiHidden="0" w:uiPriority="34" w:unhideWhenUsed="0" w:qFormat="1"/>
-    <w:lsdException w:name="Quote" w:semiHidden="0" w:uiPriority="29" w:unhideWhenUsed="0" w:qFormat="1"/>
-    <w:lsdException w:name="Intense Quote" w:semiHidden="0" w:uiPriority="30" w:unhideWhenUsed="0" w:qFormat="1"/>
-    <w:lsdException w:name="Medium List 2 Accent 1" w:semiHidden="0" w:uiPriority="66" w:unhideWhenUsed="0"/>
-    <w:lsdException w:name="Medium Grid 1 Accent 1" w:semiHidden="0" w:uiPriority="67" w:unhideWhenUsed="0"/>
-    <w:lsdException w:name="Medium Grid 2 Accent 1" w:semiHidden="0" w:uiPriority="68" w:unhideWhenUsed="0"/>
-    <w:lsdException w:name="Medium Grid 3 Accent 1" w:semiHidden="0" w:uiPriority="69" w:unhideWhenUsed="0"/>
-    <w:lsdException w:name="Dark List Accent 1" w:semiHidden="0" w:uiPriority="70" w:unhideWhenUsed="0"/>
-    <w:lsdException w:name="Colorful Shading Accent 1" w:semiHidden="0" w:uiPriority="71" w:unhideWhenUsed="0"/>
-    <w:lsdException w:name="Colorful List Accent 1" w:semiHidden="0" w:uiPriority="72" w:unhideWhenUsed="0"/>
-    <w:lsdException w:name="Colorful Grid Accent 1" w:semiHidden="0" w:uiPriority="73" w:unhideWhenUsed="0"/>
-    <w:lsdException w:name="Light Shading Accent 2" w:semiHidden="0" w:uiPriority="60" w:unhideWhenUsed="0"/>
-    <w:lsdException w:name="Light List Accent 2" w:semiHidden="0" w:uiPriority="61" w:unhideWhenUsed="0"/>
-    <w:lsdException w:name="Light Grid Accent 2" w:semiHidden="0" w:uiPriority="62" w:unhideWhenUsed="0"/>
-    <w:lsdException w:name="Medium Shading 1 Accent 2" w:semiHidden="0" w:uiPriority="63" w:unhideWhenUsed="0"/>
-    <w:lsdException w:name="Medium Shading 2 Accent 2" w:semiHidden="0" w:uiPriority="64" w:unhideWhenUsed="0"/>
-    <w:lsdException w:name="Medium List 1 Accent 2" w:semiHidden="0" w:uiPriority="65" w:unhideWhenUsed="0"/>
-    <w:lsdException w:name="Medium List 2 Accent 2" w:semiHidden="0" w:uiPriority="66" w:unhideWhenUsed="0"/>
-    <w:lsdException w:name="Medium Grid 1 Accent 2" w:semiHidden="0" w:uiPriority="67" w:unhideWhenUsed="0"/>
-    <w:lsdException w:name="Medium Grid 2 Accent 2" w:semiHidden="0" w:uiPriority="68" w:unhideWhenUsed="0"/>
-    <w:lsdException w:name="Medium Grid 3 Accent 2" w:semiHidden="0" w:uiPriority="69" w:unhideWhenUsed="0"/>
-    <w:lsdException w:name="Dark List Accent 2" w:semiHidden="0" w:uiPriority="70" w:unhideWhenUsed="0"/>
-    <w:lsdException w:name="Colorful Shading Accent 2" w:semiHidden="0" w:uiPriority="71" w:unhideWhenUsed="0"/>
-    <w:lsdException w:name="Colorful List Accent 2" w:semiHidden="0" w:uiPriority="72" w:unhideWhenUsed="0"/>
-    <w:lsdException w:name="Colorful Grid Accent 2" w:semiHidden="0" w:uiPriority="73" w:unhideWhenUsed="0"/>
-    <w:lsdException w:name="Light Shading Accent 3" w:semiHidden="0" w:uiPriority="60" w:unhideWhenUsed="0"/>
-    <w:lsdException w:name="Light List Accent 3" w:semiHidden="0" w:uiPriority="61" w:unhideWhenUsed="0"/>
-    <w:lsdException w:name="Light Grid Accent 3" w:semiHidden="0" w:uiPriority="62" w:unhideWhenUsed="0"/>
-    <w:lsdException w:name="Medium Shading 1 Accent 3" w:semiHidden="0" w:uiPriority="63" w:unhideWhenUsed="0"/>
-    <w:lsdException w:name="Medium Shading 2 Accent 3" w:semiHidden="0" w:uiPriority="64" w:unhideWhenUsed="0"/>
-    <w:lsdException w:name="Medium List 1 Accent 3" w:semiHidden="0" w:uiPriority="65" w:unhideWhenUsed="0"/>
-    <w:lsdException w:name="Medium List 2 Accent 3" w:semiHidden="0" w:uiPriority="66" w:unhideWhenUsed="0"/>
-    <w:lsdException w:name="Medium Grid 1 Accent 3" w:semiHidden="0" w:uiPriority="67" w:unhideWhenUsed="0"/>
-    <w:lsdException w:name="Medium Grid 2 Accent 3" w:semiHidden="0" w:uiPriority="68" w:unhideWhenUsed="0"/>
-    <w:lsdException w:name="Medium Grid 3 Accent 3" w:semiHidden="0" w:uiPriority="69" w:unhideWhenUsed="0"/>
-    <w:lsdException w:name="Dark List Accent 3" w:semiHidden="0" w:uiPriority="70" w:unhideWhenUsed="0"/>
-    <w:lsdException w:name="Colorful Shading Accent 3" w:semiHidden="0" w:uiPriority="71" w:unhideWhenUsed="0"/>
-    <w:lsdException w:name="Colorful List Accent 3" w:semiHidden="0" w:uiPriority="72" w:unhideWhenUsed="0"/>
-    <w:lsdException w:name="Colorful Grid Accent 3" w:semiHidden="0" w:uiPriority="73" w:unhideWhenUsed="0"/>
-    <w:lsdException w:name="Light Shading Accent 4" w:semiHidden="0" w:uiPriority="60" w:unhideWhenUsed="0"/>
-    <w:lsdException w:name="Light List Accent 4" w:semiHidden="0" w:uiPriority="61" w:unhideWhenUsed="0"/>
-    <w:lsdException w:name="Light Grid Accent 4" w:semiHidden="0" w:uiPriority="62" w:unhideWhenUsed="0"/>
-    <w:lsdException w:name="Medium Shading 1 Accent 4" w:semiHidden="0" w:uiPriority="63" w:unhideWhenUsed="0"/>
-    <w:lsdException w:name="Medium Shading 2 Accent 4" w:semiHidden="0" w:uiPriority="64" w:unhideWhenUsed="0"/>
-    <w:lsdException w:name="Medium List 1 Accent 4" w:semiHidden="0" w:uiPriority="65" w:unhideWhenUsed="0"/>
-    <w:lsdException w:name="Medium List 2 Accent 4" w:semiHidden="0" w:uiPriority="66" w:unhideWhenUsed="0"/>
-    <w:lsdException w:name="Medium Grid 1 Accent 4" w:semiHidden="0" w:uiPriority="67" w:unhideWhenUsed="0"/>
-    <w:lsdException w:name="Medium Grid 2 Accent 4" w:semiHidden="0" w:uiPriority="68" w:unhideWhenUsed="0"/>
-    <w:lsdException w:name="Medium Grid 3 Accent 4" w:semiHidden="0" w:uiPriority="69" w:unhideWhenUsed="0"/>
-    <w:lsdException w:name="Dark List Accent 4" w:semiHidden="0" w:uiPriority="70" w:unhideWhenUsed="0"/>
-    <w:lsdException w:name="Colorful Shading Accent 4" w:semiHidden="0" w:uiPriority="71" w:unhideWhenUsed="0"/>
-    <w:lsdException w:name="Colorful List Accent 4" w:semiHidden="0" w:uiPriority="72" w:unhideWhenUsed="0"/>
-    <w:lsdException w:name="Colorful Grid Accent 4" w:semiHidden="0" w:uiPriority="73" w:unhideWhenUsed="0"/>
-    <w:lsdException w:name="Light Shading Accent 5" w:semiHidden="0" w:uiPriority="60" w:unhideWhenUsed="0"/>
-    <w:lsdException w:name="Light List Accent 5" w:semiHidden="0" w:uiPriority="61" w:unhideWhenUsed="0"/>
-    <w:lsdException w:name="Light Grid Accent 5" w:semiHidden="0" w:uiPriority="62" w:unhideWhenUsed="0"/>
-    <w:lsdException w:name="Medium Shading 1 Accent 5" w:semiHidden="0" w:uiPriority="63" w:unhideWhenUsed="0"/>
-    <w:lsdException w:name="Medium Shading 2 Accent 5" w:semiHidden="0" w:uiPriority="64" w:unhideWhenUsed="0"/>
-    <w:lsdException w:name="Medium List 1 Accent 5" w:semiHidden="0" w:uiPriority="65" w:unhideWhenUsed="0"/>
-    <w:lsdException w:name="Medium List 2 Accent 5" w:semiHidden="0" w:uiPriority="66" w:unhideWhenUsed="0"/>
-    <w:lsdException w:name="Medium Grid 1 Accent 5" w:semiHidden="0" w:uiPriority="67" w:unhideWhenUsed="0"/>
-    <w:lsdException w:name="Medium Grid 2 Accent 5" w:semiHidden="0" w:uiPriority="68" w:unhideWhenUsed="0"/>
-    <w:lsdException w:name="Medium Grid 3 Accent 5" w:semiHidden="0" w:uiPriority="69" w:unhideWhenUsed="0"/>
-    <w:lsdException w:name="Dark List Accent 5" w:semiHidden="0" w:uiPriority="70" w:unhideWhenUsed="0"/>
-    <w:lsdException w:name="Colorful Shading Accent 5" w:semiHidden="0" w:uiPriority="71" w:unhideWhenUsed="0"/>
-    <w:lsdException w:name="Colorful List Accent 5" w:semiHidden="0" w:uiPriority="72" w:unhideWhenUsed="0"/>
-    <w:lsdException w:name="Colorful Grid Accent 5" w:semiHidden="0" w:uiPriority="73" w:unhideWhenUsed="0"/>
-    <w:lsdException w:name="Light Shading Accent 6" w:semiHidden="0" w:uiPriority="60" w:unhideWhenUsed="0"/>
-    <w:lsdException w:name="Light List Accent 6" w:semiHidden="0" w:uiPriority="61" w:unhideWhenUsed="0"/>
-    <w:lsdException w:name="Light Grid Accent 6" w:semiHidden="0" w:uiPriority="62" w:unhideWhenUsed="0"/>
-    <w:lsdException w:name="Medium Shading 1 Accent 6" w:semiHidden="0" w:uiPriority="63" w:unhideWhenUsed="0"/>
-    <w:lsdException w:name="Medium Shading 2 Accent 6" w:semiHidden="0" w:uiPriority="64" w:unhideWhenUsed="0"/>
-    <w:lsdException w:name="Medium List 1 Accent 6" w:semiHidden="0" w:uiPriority="65" w:unhideWhenUsed="0"/>
-    <w:lsdException w:name="Medium List 2 Accent 6" w:semiHidden="0" w:uiPriority="66" w:unhideWhenUsed="0"/>
-    <w:lsdException w:name="Medium Grid 1 Accent 6" w:semiHidden="0" w:uiPriority="67" w:unhideWhenUsed="0"/>
-    <w:lsdException w:name="Medium Grid 2 Accent 6" w:semiHidden="0" w:uiPriority="68" w:unhideWhenUsed="0"/>
-    <w:lsdException w:name="Medium Grid 3 Accent 6" w:semiHidden="0" w:uiPriority="69" w:unhideWhenUsed="0"/>
-    <w:lsdException w:name="Dark List Accent 6" w:semiHidden="0" w:uiPriority="70" w:unhideWhenUsed="0"/>
-    <w:lsdException w:name="Colorful Shading Accent 6" w:semiHidden="0" w:uiPriority="71" w:unhideWhenUsed="0"/>
-    <w:lsdException w:name="Colorful List Accent 6" w:semiHidden="0" w:uiPriority="72" w:unhideWhenUsed="0"/>
-    <w:lsdException w:name="Colorful Grid Accent 6" w:semiHidden="0" w:uiPriority="73" w:unhideWhenUsed="0"/>
-    <w:lsdException w:name="Subtle Emphasis" w:semiHidden="0" w:uiPriority="19" w:unhideWhenUsed="0" w:qFormat="1"/>
-    <w:lsdException w:name="Intense Emphasis" w:semiHidden="0" w:uiPriority="21" w:unhideWhenUsed="0" w:qFormat="1"/>
-    <w:lsdException w:name="Subtle Reference" w:semiHidden="0" w:uiPriority="31" w:unhideWhenUsed="0" w:qFormat="1"/>
-    <w:lsdException w:name="Intense Reference" w:semiHidden="0" w:uiPriority="32" w:unhideWhenUsed="0" w:qFormat="1"/>
-    <w:lsdException w:name="Book Title" w:semiHidden="0" w:uiPriority="33" w:unhideWhenUsed="0" w:qFormat="1"/>
-    <w:lsdException w:name="Bibliography" w:uiPriority="37"/>
-    <w:lsdException w:name="TOC Heading" w:uiPriority="39" w:qFormat="1"/>
+  <w:latentStyles w:defLockedState="0" w:defUIPriority="99" w:defSemiHidden="0" w:defUnhideWhenUsed="0" w:defQFormat="0" w:count="371">
+    <w:lsdException w:name="Normal" w:uiPriority="0" w:qFormat="1"/>
+    <w:lsdException w:name="heading 1" w:uiPriority="9" w:qFormat="1"/>
+    <w:lsdException w:name="heading 2" w:semiHidden="1" w:uiPriority="9" w:unhideWhenUsed="1" w:qFormat="1"/>
+    <w:lsdException w:name="heading 3" w:semiHidden="1" w:uiPriority="9" w:unhideWhenUsed="1" w:qFormat="1"/>
+    <w:lsdException w:name="heading 4" w:semiHidden="1" w:uiPriority="9" w:unhideWhenUsed="1" w:qFormat="1"/>
+    <w:lsdException w:name="heading 5" w:semiHidden="1" w:uiPriority="9" w:unhideWhenUsed="1" w:qFormat="1"/>
+    <w:lsdException w:name="heading 6" w:semiHidden="1" w:uiPriority="9" w:unhideWhenUsed="1" w:qFormat="1"/>
+    <w:lsdException w:name="heading 7" w:semiHidden="1" w:uiPriority="9" w:unhideWhenUsed="1" w:qFormat="1"/>
+    <w:lsdException w:name="heading 8" w:semiHidden="1" w:uiPriority="9" w:unhideWhenUsed="1" w:qFormat="1"/>
+    <w:lsdException w:name="heading 9" w:semiHidden="1" w:uiPriority="9" w:unhideWhenUsed="1" w:qFormat="1"/>
+    <w:lsdException w:name="index 1" w:semiHidden="1" w:unhideWhenUsed="1"/>
+    <w:lsdException w:name="index 2" w:semiHidden="1" w:unhideWhenUsed="1"/>
+    <w:lsdException w:name="index 3" w:semiHidden="1" w:unhideWhenUsed="1"/>
+    <w:lsdException w:name="index 4" w:semiHidden="1" w:unhideWhenUsed="1"/>
+    <w:lsdException w:name="index 5" w:semiHidden="1" w:unhideWhenUsed="1"/>
+    <w:lsdException w:name="index 6" w:semiHidden="1" w:unhideWhenUsed="1"/>
+    <w:lsdException w:name="index 7" w:semiHidden="1" w:unhideWhenUsed="1"/>
+    <w:lsdException w:name="index 8" w:semiHidden="1" w:unhideWhenUsed="1"/>
+    <w:lsdException w:name="index 9" w:semiHidden="1" w:unhideWhenUsed="1"/>
+    <w:lsdException w:name="toc 1" w:semiHidden="1" w:uiPriority="39" w:unhideWhenUsed="1"/>
+    <w:lsdException w:name="toc 2" w:semiHidden="1" w:uiPriority="39" w:unhideWhenUsed="1"/>
+    <w:lsdException w:name="toc 3" w:semiHidden="1" w:uiPriority="39" w:unhideWhenUsed="1"/>
+    <w:lsdException w:name="toc 4" w:semiHidden="1" w:uiPriority="39" w:unhideWhenUsed="1"/>
+    <w:lsdException w:name="toc 5" w:semiHidden="1" w:uiPriority="39" w:unhideWhenUsed="1"/>
+    <w:lsdException w:name="toc 6" w:semiHidden="1" w:uiPriority="39" w:unhideWhenUsed="1"/>
+    <w:lsdException w:name="toc 7" w:semiHidden="1" w:uiPriority="39" w:unhideWhenUsed="1"/>
+    <w:lsdException w:name="toc 8" w:semiHidden="1" w:uiPriority="39" w:unhideWhenUsed="1"/>
+    <w:lsdException w:name="toc 9" w:semiHidden="1" w:uiPriority="39" w:unhideWhenUsed="1"/>
+    <w:lsdException w:name="Normal Indent" w:semiHidden="1" w:unhideWhenUsed="1"/>
+    <w:lsdException w:name="footnote text" w:semiHidden="1" w:unhideWhenUsed="1"/>
+    <w:lsdException w:name="annotation text" w:semiHidden="1" w:unhideWhenUsed="1"/>
+    <w:lsdException w:name="header" w:semiHidden="1" w:unhideWhenUsed="1"/>
+    <w:lsdException w:name="footer" w:semiHidden="1" w:unhideWhenUsed="1"/>
+    <w:lsdException w:name="index heading" w:semiHidden="1" w:unhideWhenUsed="1"/>
+    <w:lsdException w:name="caption" w:semiHidden="1" w:uiPriority="35" w:unhideWhenUsed="1" w:qFormat="1"/>
+    <w:lsdException w:name="table of figures" w:semiHidden="1" w:unhideWhenUsed="1"/>
+    <w:lsdException w:name="envelope address" w:semiHidden="1" w:unhideWhenUsed="1"/>
+    <w:lsdException w:name="envelope return" w:semiHidden="1" w:unhideWhenUsed="1"/>
+    <w:lsdException w:name="footnote reference" w:semiHidden="1" w:unhideWhenUsed="1"/>
+    <w:lsdException w:name="annotation reference" w:semiHidden="1" w:unhideWhenUsed="1"/>
+    <w:lsdException w:name="line number" w:semiHidden="1" w:unhideWhenUsed="1"/>
+    <w:lsdException w:name="page number" w:semiHidden="1" w:unhideWhenUsed="1"/>
+    <w:lsdException w:name="endnote reference" w:semiHidden="1" w:unhideWhenUsed="1"/>
+    <w:lsdException w:name="endnote text" w:semiHidden="1" w:unhideWhenUsed="1"/>
+    <w:lsdException w:name="table of authorities" w:semiHidden="1" w:unhideWhenUsed="1"/>
+    <w:lsdException w:name="macro" w:semiHidden="1" w:unhideWhenUsed="1"/>
+    <w:lsdException w:name="toa heading" w:semiHidden="1" w:unhideWhenUsed="1"/>
+    <w:lsdException w:name="List" w:semiHidden="1" w:unhideWhenUsed="1"/>
+    <w:lsdException w:name="List Bullet" w:semiHidden="1" w:unhideWhenUsed="1"/>
+    <w:lsdException w:name="List Number" w:semiHidden="1" w:unhideWhenUsed="1"/>
+    <w:lsdException w:name="List 2" w:semiHidden="1" w:unhideWhenUsed="1"/>
+    <w:lsdException w:name="List 3" w:semiHidden="1" w:unhideWhenUsed="1"/>
+    <w:lsdException w:name="List 4" w:semiHidden="1" w:unhideWhenUsed="1"/>
+    <w:lsdException w:name="List 5" w:semiHidden="1" w:unhideWhenUsed="1"/>
+    <w:lsdException w:name="List Bullet 2" w:semiHidden="1" w:unhideWhenUsed="1"/>
+    <w:lsdException w:name="List Bullet 3" w:semiHidden="1" w:unhideWhenUsed="1"/>
+    <w:lsdException w:name="List Bullet 4" w:semiHidden="1" w:unhideWhenUsed="1"/>
+    <w:lsdException w:name="List Bullet 5" w:semiHidden="1" w:unhideWhenUsed="1"/>
+    <w:lsdException w:name="List Number 2" w:semiHidden="1" w:unhideWhenUsed="1"/>
+    <w:lsdException w:name="List Number 3" w:semiHidden="1" w:unhideWhenUsed="1"/>
+    <w:lsdException w:name="List Number 4" w:semiHidden="1" w:unhideWhenUsed="1"/>
+    <w:lsdException w:name="List Number 5" w:semiHidden="1" w:unhideWhenUsed="1"/>
+    <w:lsdException w:name="Title" w:uiPriority="10" w:qFormat="1"/>
+    <w:lsdException w:name="Closing" w:semiHidden="1" w:unhideWhenUsed="1"/>
+    <w:lsdException w:name="Signature" w:semiHidden="1" w:unhideWhenUsed="1"/>
+    <w:lsdException w:name="Default Paragraph Font" w:semiHidden="1" w:uiPriority="1" w:unhideWhenUsed="1"/>
+    <w:lsdException w:name="Body Text" w:semiHidden="1" w:unhideWhenUsed="1"/>
+    <w:lsdException w:name="Body Text Indent" w:semiHidden="1" w:unhideWhenUsed="1"/>
+    <w:lsdException w:name="List Continue" w:semiHidden="1" w:unhideWhenUsed="1"/>
+    <w:lsdException w:name="List Continue 2" w:semiHidden="1" w:unhideWhenUsed="1"/>
+    <w:lsdException w:name="List Continue 3" w:semiHidden="1" w:unhideWhenUsed="1"/>
+    <w:lsdException w:name="List Continue 4" w:semiHidden="1" w:unhideWhenUsed="1"/>
+    <w:lsdException w:name="List Continue 5" w:semiHidden="1" w:unhideWhenUsed="1"/>
+    <w:lsdException w:name="Message Header" w:semiHidden="1" w:unhideWhenUsed="1"/>
+    <w:lsdException w:name="Subtitle" w:uiPriority="11" w:qFormat="1"/>
+    <w:lsdException w:name="Salutation" w:semiHidden="1" w:unhideWhenUsed="1"/>
+    <w:lsdException w:name="Date" w:semiHidden="1" w:unhideWhenUsed="1"/>
+    <w:lsdException w:name="Body Text First Indent" w:semiHidden="1" w:unhideWhenUsed="1"/>
+    <w:lsdException w:name="Body Text First Indent 2" w:semiHidden="1" w:unhideWhenUsed="1"/>
+    <w:lsdException w:name="Note Heading" w:semiHidden="1" w:unhideWhenUsed="1"/>
+    <w:lsdException w:name="Body Text 2" w:semiHidden="1" w:unhideWhenUsed="1"/>
+    <w:lsdException w:name="Body Text 3" w:semiHidden="1" w:unhideWhenUsed="1"/>
+    <w:lsdException w:name="Body Text Indent 2" w:semiHidden="1" w:unhideWhenUsed="1"/>
+    <w:lsdException w:name="Body Text Indent 3" w:semiHidden="1" w:unhideWhenUsed="1"/>
+    <w:lsdException w:name="Block Text" w:semiHidden="1" w:unhideWhenUsed="1"/>
+    <w:lsdException w:name="Hyperlink" w:semiHidden="1" w:unhideWhenUsed="1"/>
+    <w:lsdException w:name="FollowedHyperlink" w:semiHidden="1" w:unhideWhenUsed="1"/>
+    <w:lsdException w:name="Strong" w:uiPriority="22" w:qFormat="1"/>
+    <w:lsdException w:name="Emphasis" w:uiPriority="20" w:qFormat="1"/>
+    <w:lsdException w:name="Document Map" w:semiHidden="1" w:unhideWhenUsed="1"/>
+    <w:lsdException w:name="Plain Text" w:semiHidden="1" w:unhideWhenUsed="1"/>
+    <w:lsdException w:name="E-mail Signature" w:semiHidden="1" w:unhideWhenUsed="1"/>
+    <w:lsdException w:name="HTML Top of Form" w:semiHidden="1" w:unhideWhenUsed="1"/>
+    <w:lsdException w:name="HTML Bottom of Form" w:semiHidden="1" w:unhideWhenUsed="1"/>
+    <w:lsdException w:name="Normal (Web)" w:semiHidden="1" w:unhideWhenUsed="1"/>
+    <w:lsdException w:name="HTML Acronym" w:semiHidden="1" w:unhideWhenUsed="1"/>
+    <w:lsdException w:name="HTML Address" w:semiHidden="1" w:unhideWhenUsed="1"/>
+    <w:lsdException w:name="HTML Cite" w:semiHidden="1" w:unhideWhenUsed="1"/>
+    <w:lsdException w:name="HTML Code" w:semiHidden="1" w:unhideWhenUsed="1"/>
+    <w:lsdException w:name="HTML Definition" w:semiHidden="1" w:unhideWhenUsed="1"/>
+    <w:lsdException w:name="HTML Keyboard" w:semiHidden="1" w:unhideWhenUsed="1"/>
+    <w:lsdException w:name="HTML Preformatted" w:semiHidden="1" w:unhideWhenUsed="1"/>
+    <w:lsdException w:name="HTML Sample" w:semiHidden="1" w:unhideWhenUsed="1"/>
+    <w:lsdException w:name="HTML Typewriter" w:semiHidden="1" w:unhideWhenUsed="1"/>
+    <w:lsdException w:name="HTML Variable" w:semiHidden="1" w:unhideWhenUsed="1"/>
+    <w:lsdException w:name="Normal Table" w:semiHidden="1" w:unhideWhenUsed="1"/>
+    <w:lsdException w:name="annotation subject" w:semiHidden="1" w:unhideWhenUsed="1"/>
+    <w:lsdException w:name="No List" w:semiHidden="1" w:unhideWhenUsed="1"/>
+    <w:lsdException w:name="Outline List 1" w:semiHidden="1" w:unhideWhenUsed="1"/>
+    <w:lsdException w:name="Outline List 2" w:semiHidden="1" w:unhideWhenUsed="1"/>
+    <w:lsdException w:name="Outline List 3" w:semiHidden="1" w:unhideWhenUsed="1"/>
+    <w:lsdException w:name="Table Simple 1" w:semiHidden="1" w:unhideWhenUsed="1"/>
+    <w:lsdException w:name="Table Simple 2" w:semiHidden="1" w:unhideWhenUsed="1"/>
+    <w:lsdException w:name="Table Simple 3" w:semiHidden="1" w:unhideWhenUsed="1"/>
+    <w:lsdException w:name="Table Classic 1" w:semiHidden="1" w:unhideWhenUsed="1"/>
+    <w:lsdException w:name="Table Classic 2" w:semiHidden="1" w:unhideWhenUsed="1"/>
+    <w:lsdException w:name="Table Classic 3" w:semiHidden="1" w:unhideWhenUsed="1"/>
+    <w:lsdException w:name="Table Classic 4" w:semiHidden="1" w:unhideWhenUsed="1"/>
+    <w:lsdException w:name="Table Colorful 1" w:semiHidden="1" w:unhideWhenUsed="1"/>
+    <w:lsdException w:name="Table Colorful 2" w:semiHidden="1" w:unhideWhenUsed="1"/>
+    <w:lsdException w:name="Table Colorful 3" w:semiHidden="1" w:unhideWhenUsed="1"/>
+    <w:lsdException w:name="Table Columns 1" w:semiHidden="1" w:unhideWhenUsed="1"/>
+    <w:lsdException w:name="Table Columns 2" w:semiHidden="1" w:unhideWhenUsed="1"/>
+    <w:lsdException w:name="Table Columns 3" w:semiHidden="1" w:unhideWhenUsed="1"/>
+    <w:lsdException w:name="Table Columns 4" w:semiHidden="1" w:unhideWhenUsed="1"/>
+    <w:lsdException w:name="Table Columns 5" w:semiHidden="1" w:unhideWhenUsed="1"/>
+    <w:lsdException w:name="Table Grid 1" w:semiHidden="1" w:unhideWhenUsed="1"/>
+    <w:lsdException w:name="Table Grid 2" w:semiHidden="1" w:unhideWhenUsed="1"/>
+    <w:lsdException w:name="Table Grid 3" w:semiHidden="1" w:unhideWhenUsed="1"/>
+    <w:lsdException w:name="Table Grid 4" w:semiHidden="1" w:unhideWhenUsed="1"/>
+    <w:lsdException w:name="Table Grid 5" w:semiHidden="1" w:unhideWhenUsed="1"/>
+    <w:lsdException w:name="Table Grid 6" w:semiHidden="1" w:unhideWhenUsed="1"/>
+    <w:lsdException w:name="Table Grid 7" w:semiHidden="1" w:unhideWhenUsed="1"/>
+    <w:lsdException w:name="Table Grid 8" w:semiHidden="1" w:unhideWhenUsed="1"/>
+    <w:lsdException w:name="Table List 1" w:semiHidden="1" w:unhideWhenUsed="1"/>
+    <w:lsdException w:name="Table List 2" w:semiHidden="1" w:unhideWhenUsed="1"/>
+    <w:lsdException w:name="Table List 3" w:semiHidden="1" w:unhideWhenUsed="1"/>
+    <w:lsdException w:name="Table List 4" w:semiHidden="1" w:unhideWhenUsed="1"/>
+    <w:lsdException w:name="Table List 5" w:semiHidden="1" w:unhideWhenUsed="1"/>
+    <w:lsdException w:name="Table List 6" w:semiHidden="1" w:unhideWhenUsed="1"/>
+    <w:lsdException w:name="Table List 7" w:semiHidden="1" w:unhideWhenUsed="1"/>
+    <w:lsdException w:name="Table List 8" w:semiHidden="1" w:unhideWhenUsed="1"/>
+    <w:lsdException w:name="Table 3D effects 1" w:semiHidden="1" w:unhideWhenUsed="1"/>
+    <w:lsdException w:name="Table 3D effects 2" w:semiHidden="1" w:unhideWhenUsed="1"/>
+    <w:lsdException w:name="Table 3D effects 3" w:semiHidden="1" w:unhideWhenUsed="1"/>
+    <w:lsdException w:name="Table Contemporary" w:semiHidden="1" w:unhideWhenUsed="1"/>
+    <w:lsdException w:name="Table Elegant" w:semiHidden="1" w:unhideWhenUsed="1"/>
+    <w:lsdException w:name="Table Professional" w:semiHidden="1" w:unhideWhenUsed="1"/>
+    <w:lsdException w:name="Table Subtle 1" w:semiHidden="1" w:unhideWhenUsed="1"/>
+    <w:lsdException w:name="Table Subtle 2" w:semiHidden="1" w:unhideWhenUsed="1"/>
+    <w:lsdException w:name="Table Web 1" w:semiHidden="1" w:unhideWhenUsed="1"/>
+    <w:lsdException w:name="Table Web 2" w:semiHidden="1" w:unhideWhenUsed="1"/>
+    <w:lsdException w:name="Table Web 3" w:semiHidden="1" w:unhideWhenUsed="1"/>
+    <w:lsdException w:name="Balloon Text" w:semiHidden="1" w:unhideWhenUsed="1"/>
+    <w:lsdException w:name="Table Grid" w:uiPriority="39"/>
+    <w:lsdException w:name="Table Theme" w:semiHidden="1" w:unhideWhenUsed="1"/>
+    <w:lsdException w:name="Placeholder Text" w:semiHidden="1"/>
+    <w:lsdException w:name="No Spacing" w:uiPriority="1" w:qFormat="1"/>
+    <w:lsdException w:name="Light Shading" w:uiPriority="60"/>
+    <w:lsdException w:name="Light List" w:uiPriority="61"/>
+    <w:lsdException w:name="Light Grid" w:uiPriority="62"/>
+    <w:lsdException w:name="Medium Shading 1" w:uiPriority="63"/>
+    <w:lsdException w:name="Medium Shading 2" w:uiPriority="64"/>
+    <w:lsdException w:name="Medium List 1" w:uiPriority="65"/>
+    <w:lsdException w:name="Medium List 2" w:uiPriority="66"/>
+    <w:lsdException w:name="Medium Grid 1" w:uiPriority="67"/>
+    <w:lsdException w:name="Medium Grid 2" w:uiPriority="68"/>
+    <w:lsdException w:name="Medium Grid 3" w:uiPriority="69"/>
+    <w:lsdException w:name="Dark List" w:uiPriority="70"/>
+    <w:lsdException w:name="Colorful Shading" w:uiPriority="71"/>
+    <w:lsdException w:name="Colorful List" w:uiPriority="72"/>
+    <w:lsdException w:name="Colorful Grid" w:uiPriority="73"/>
+    <w:lsdException w:name="Light Shading Accent 1" w:uiPriority="60"/>
+    <w:lsdException w:name="Light List Accent 1" w:uiPriority="61"/>
+    <w:lsdException w:name="Light Grid Accent 1" w:uiPriority="62"/>
+    <w:lsdException w:name="Medium Shading 1 Accent 1" w:uiPriority="63"/>
+    <w:lsdException w:name="Medium Shading 2 Accent 1" w:uiPriority="64"/>
+    <w:lsdException w:name="Medium List 1 Accent 1" w:uiPriority="65"/>
+    <w:lsdException w:name="Revision" w:semiHidden="1"/>
+    <w:lsdException w:name="List Paragraph" w:uiPriority="34" w:qFormat="1"/>
+    <w:lsdException w:name="Quote" w:uiPriority="29" w:qFormat="1"/>
+    <w:lsdException w:name="Intense Quote" w:uiPriority="30" w:qFormat="1"/>
+    <w:lsdException w:name="Medium List 2 Accent 1" w:uiPriority="66"/>
+    <w:lsdException w:name="Medium Grid 1 Accent 1" w:uiPriority="67"/>
+    <w:lsdException w:name="Medium Grid 2 Accent 1" w:uiPriority="68"/>
+    <w:lsdException w:name="Medium Grid 3 Accent 1" w:uiPriority="69"/>
+    <w:lsdException w:name="Dark List Accent 1" w:uiPriority="70"/>
+    <w:lsdException w:name="Colorful Shading Accent 1" w:uiPriority="71"/>
+    <w:lsdException w:name="Colorful List Accent 1" w:uiPriority="72"/>
+    <w:lsdException w:name="Colorful Grid Accent 1" w:uiPriority="73"/>
+    <w:lsdException w:name="Light Shading Accent 2" w:uiPriority="60"/>
+    <w:lsdException w:name="Light List Accent 2" w:uiPriority="61"/>
+    <w:lsdException w:name="Light Grid Accent 2" w:uiPriority="62"/>
+    <w:lsdException w:name="Medium Shading 1 Accent 2" w:uiPriority="63"/>
+    <w:lsdException w:name="Medium Shading 2 Accent 2" w:uiPriority="64"/>
+    <w:lsdException w:name="Medium List 1 Accent 2" w:uiPriority="65"/>
+    <w:lsdException w:name="Medium List 2 Accent 2" w:uiPriority="66"/>
+    <w:lsdException w:name="Medium Grid 1 Accent 2" w:uiPriority="67"/>
+    <w:lsdException w:name="Medium Grid 2 Accent 2" w:uiPriority="68"/>
+    <w:lsdException w:name="Medium Grid 3 Accent 2" w:uiPriority="69"/>
+    <w:lsdException w:name="Dark List Accent 2" w:uiPriority="70"/>
+    <w:lsdException w:name="Colorful Shading Accent 2" w:uiPriority="71"/>
+    <w:lsdException w:name="Colorful List Accent 2" w:uiPriority="72"/>
+    <w:lsdException w:name="Colorful Grid Accent 2" w:uiPriority="73"/>
+    <w:lsdException w:name="Light Shading Accent 3" w:uiPriority="60"/>
+    <w:lsdException w:name="Light List Accent 3" w:uiPriority="61"/>
+    <w:lsdException w:name="Light Grid Accent 3" w:uiPriority="62"/>
+    <w:lsdException w:name="Medium Shading 1 Accent 3" w:uiPriority="63"/>
+    <w:lsdException w:name="Medium Shading 2 Accent 3" w:uiPriority="64"/>
+    <w:lsdException w:name="Medium List 1 Accent 3" w:uiPriority="65"/>
+    <w:lsdException w:name="Medium List 2 Accent 3" w:uiPriority="66"/>
+    <w:lsdException w:name="Medium Grid 1 Accent 3" w:uiPriority="67"/>
+    <w:lsdException w:name="Medium Grid 2 Accent 3" w:uiPriority="68"/>
+    <w:lsdException w:name="Medium Grid 3 Accent 3" w:uiPriority="69"/>
+    <w:lsdException w:name="Dark List Accent 3" w:uiPriority="70"/>
+    <w:lsdException w:name="Colorful Shading Accent 3" w:uiPriority="71"/>
+    <w:lsdException w:name="Colorful List Accent 3" w:uiPriority="72"/>
+    <w:lsdException w:name="Colorful Grid Accent 3" w:uiPriority="73"/>
+    <w:lsdException w:name="Light Shading Accent 4" w:uiPriority="60"/>
+    <w:lsdException w:name="Light List Accent 4" w:uiPriority="61"/>
+    <w:lsdException w:name="Light Grid Accent 4" w:uiPriority="62"/>
+    <w:lsdException w:name="Medium Shading 1 Accent 4" w:uiPriority="63"/>
+    <w:lsdException w:name="Medium Shading 2 Accent 4" w:uiPriority="64"/>
+    <w:lsdException w:name="Medium List 1 Accent 4" w:uiPriority="65"/>
+    <w:lsdException w:name="Medium List 2 Accent 4" w:uiPriority="66"/>
+    <w:lsdException w:name="Medium Grid 1 Accent 4" w:uiPriority="67"/>
+    <w:lsdException w:name="Medium Grid 2 Accent 4" w:uiPriority="68"/>
+    <w:lsdException w:name="Medium Grid 3 Accent 4" w:uiPriority="69"/>
+    <w:lsdException w:name="Dark List Accent 4" w:uiPriority="70"/>
+    <w:lsdException w:name="Colorful Shading Accent 4" w:uiPriority="71"/>
+    <w:lsdException w:name="Colorful List Accent 4" w:uiPriority="72"/>
+    <w:lsdException w:name="Colorful Grid Accent 4" w:uiPriority="73"/>
+    <w:lsdException w:name="Light Shading Accent 5" w:uiPriority="60"/>
+    <w:lsdException w:name="Light List Accent 5" w:uiPriority="61"/>
+    <w:lsdException w:name="Light Grid Accent 5" w:uiPriority="62"/>
+    <w:lsdException w:name="Medium Shading 1 Accent 5" w:uiPriority="63"/>
+    <w:lsdException w:name="Medium Shading 2 Accent 5" w:uiPriority="64"/>
+    <w:lsdException w:name="Medium List 1 Accent 5" w:uiPriority="65"/>
+    <w:lsdException w:name="Medium List 2 Accent 5" w:uiPriority="66"/>
+    <w:lsdException w:name="Medium Grid 1 Accent 5" w:uiPriority="67"/>
+    <w:lsdException w:name="Medium Grid 2 Accent 5" w:uiPriority="68"/>
+    <w:lsdException w:name="Medium Grid 3 Accent 5" w:uiPriority="69"/>
+    <w:lsdException w:name="Dark List Accent 5" w:uiPriority="70"/>
+    <w:lsdException w:name="Colorful Shading Accent 5" w:uiPriority="71"/>
+    <w:lsdException w:name="Colorful List Accent 5" w:uiPriority="72"/>
+    <w:lsdException w:name="Colorful Grid Accent 5" w:uiPriority="73"/>
+    <w:lsdException w:name="Light Shading Accent 6" w:uiPriority="60"/>
+    <w:lsdException w:name="Light List Accent 6" w:uiPriority="61"/>
+    <w:lsdException w:name="Light Grid Accent 6" w:uiPriority="62"/>
+    <w:lsdException w:name="Medium Shading 1 Accent 6" w:uiPriority="63"/>
+    <w:lsdException w:name="Medium Shading 2 Accent 6" w:uiPriority="64"/>
+    <w:lsdException w:name="Medium List 1 Accent 6" w:uiPriority="65"/>
+    <w:lsdException w:name="Medium List 2 Accent 6" w:uiPriority="66"/>
+    <w:lsdException w:name="Medium Grid 1 Accent 6" w:uiPriority="67"/>
+    <w:lsdException w:name="Medium Grid 2 Accent 6" w:uiPriority="68"/>
+    <w:lsdException w:name="Medium Grid 3 Accent 6" w:uiPriority="69"/>
+    <w:lsdException w:name="Dark List Accent 6" w:uiPriority="70"/>
+    <w:lsdException w:name="Colorful Shading Accent 6" w:uiPriority="71"/>
+    <w:lsdException w:name="Colorful List Accent 6" w:uiPriority="72"/>
+    <w:lsdException w:name="Colorful Grid Accent 6" w:uiPriority="73"/>
+    <w:lsdException w:name="Subtle Emphasis" w:uiPriority="19" w:qFormat="1"/>
+    <w:lsdException w:name="Intense Emphasis" w:uiPriority="21" w:qFormat="1"/>
+    <w:lsdException w:name="Subtle Reference" w:uiPriority="31" w:qFormat="1"/>
+    <w:lsdException w:name="Intense Reference" w:uiPriority="32" w:qFormat="1"/>
+    <w:lsdException w:name="Book Title" w:uiPriority="33" w:qFormat="1"/>
+    <w:lsdException w:name="Bibliography" w:semiHidden="1" w:uiPriority="37" w:unhideWhenUsed="1"/>
+    <w:lsdException w:name="TOC Heading" w:semiHidden="1" w:uiPriority="39" w:unhideWhenUsed="1" w:qFormat="1"/>
+    <w:lsdException w:name="Plain Table 1" w:uiPriority="41"/>
+    <w:lsdException w:name="Plain Table 2" w:uiPriority="42"/>
+    <w:lsdException w:name="Plain Table 3" w:uiPriority="43"/>
+    <w:lsdException w:name="Plain Table 4" w:uiPriority="44"/>
+    <w:lsdException w:name="Plain Table 5" w:uiPriority="45"/>
+    <w:lsdException w:name="Grid Table Light" w:uiPriority="40"/>
+    <w:lsdException w:name="Grid Table 1 Light" w:uiPriority="46"/>
+    <w:lsdException w:name="Grid Table 2" w:uiPriority="47"/>
+    <w:lsdException w:name="Grid Table 3" w:uiPriority="48"/>
+    <w:lsdException w:name="Grid Table 4" w:uiPriority="49"/>
+    <w:lsdException w:name="Grid Table 5 Dark" w:uiPriority="50"/>
+    <w:lsdException w:name="Grid Table 6 Colorful" w:uiPriority="51"/>
+    <w:lsdException w:name="Grid Table 7 Colorful" w:uiPriority="52"/>
+    <w:lsdException w:name="Grid Table 1 Light Accent 1" w:uiPriority="46"/>
+    <w:lsdException w:name="Grid Table 2 Accent 1" w:uiPriority="47"/>
+    <w:lsdException w:name="Grid Table 3 Accent 1" w:uiPriority="48"/>
+    <w:lsdException w:name="Grid Table 4 Accent 1" w:uiPriority="49"/>
+    <w:lsdException w:name="Grid Table 5 Dark Accent 1" w:uiPriority="50"/>
+    <w:lsdException w:name="Grid Table 6 Colorful Accent 1" w:uiPriority="51"/>
+    <w:lsdException w:name="Grid Table 7 Colorful Accent 1" w:uiPriority="52"/>
+    <w:lsdException w:name="Grid Table 1 Light Accent 2" w:uiPriority="46"/>
+    <w:lsdException w:name="Grid Table 2 Accent 2" w:uiPriority="47"/>
+    <w:lsdException w:name="Grid Table 3 Accent 2" w:uiPriority="48"/>
+    <w:lsdException w:name="Grid Table 4 Accent 2" w:uiPriority="49"/>
+    <w:lsdException w:name="Grid Table 5 Dark Accent 2" w:uiPriority="50"/>
+    <w:lsdException w:name="Grid Table 6 Colorful Accent 2" w:uiPriority="51"/>
+    <w:lsdException w:name="Grid Table 7 Colorful Accent 2" w:uiPriority="52"/>
+    <w:lsdException w:name="Grid Table 1 Light Accent 3" w:uiPriority="46"/>
+    <w:lsdException w:name="Grid Table 2 Accent 3" w:uiPriority="47"/>
+    <w:lsdException w:name="Grid Table 3 Accent 3" w:uiPriority="48"/>
+    <w:lsdException w:name="Grid Table 4 Accent 3" w:uiPriority="49"/>
+    <w:lsdException w:name="Grid Table 5 Dark Accent 3" w:uiPriority="50"/>
+    <w:lsdException w:name="Grid Table 6 Colorful Accent 3" w:uiPriority="51"/>
+    <w:lsdException w:name="Grid Table 7 Colorful Accent 3" w:uiPriority="52"/>
+    <w:lsdException w:name="Grid Table 1 Light Accent 4" w:uiPriority="46"/>
+    <w:lsdException w:name="Grid Table 2 Accent 4" w:uiPriority="47"/>
+    <w:lsdException w:name="Grid Table 3 Accent 4" w:uiPriority="48"/>
+    <w:lsdException w:name="Grid Table 4 Accent 4" w:uiPriority="49"/>
+    <w:lsdException w:name="Grid Table 5 Dark Accent 4" w:uiPriority="50"/>
+    <w:lsdException w:name="Grid Table 6 Colorful Accent 4" w:uiPriority="51"/>
+    <w:lsdException w:name="Grid Table 7 Colorful Accent 4" w:uiPriority="52"/>
+    <w:lsdException w:name="Grid Table 1 Light Accent 5" w:uiPriority="46"/>
+    <w:lsdException w:name="Grid Table 2 Accent 5" w:uiPriority="47"/>
+    <w:lsdException w:name="Grid Table 3 Accent 5" w:uiPriority="48"/>
+    <w:lsdException w:name="Grid Table 4 Accent 5" w:uiPriority="49"/>
+    <w:lsdException w:name="Grid Table 5 Dark Accent 5" w:uiPriority="50"/>
+    <w:lsdException w:name="Grid Table 6 Colorful Accent 5" w:uiPriority="51"/>
+    <w:lsdException w:name="Grid Table 7 Colorful Accent 5" w:uiPriority="52"/>
+    <w:lsdException w:name="Grid Table 1 Light Accent 6" w:uiPriority="46"/>
+    <w:lsdException w:name="Grid Table 2 Accent 6" w:uiPriority="47"/>
+    <w:lsdException w:name="Grid Table 3 Accent 6" w:uiPriority="48"/>
+    <w:lsdException w:name="Grid Table 4 Accent 6" w:uiPriority="49"/>
+    <w:lsdException w:name="Grid Table 5 Dark Accent 6" w:uiPriority="50"/>
+    <w:lsdException w:name="Grid Table 6 Colorful Accent 6" w:uiPriority="51"/>
+    <w:lsdException w:name="Grid Table 7 Colorful Accent 6" w:uiPriority="52"/>
+    <w:lsdException w:name="List Table 1 Light" w:uiPriority="46"/>
+    <w:lsdException w:name="List Table 2" w:uiPriority="47"/>
+    <w:lsdException w:name="List Table 3" w:uiPriority="48"/>
+    <w:lsdException w:name="List Table 4" w:uiPriority="49"/>
+    <w:lsdException w:name="List Table 5 Dark" w:uiPriority="50"/>
+    <w:lsdException w:name="List Table 6 Colorful" w:uiPriority="51"/>
+    <w:lsdException w:name="List Table 7 Colorful" w:uiPriority="52"/>
+    <w:lsdException w:name="List Table 1 Light Accent 1" w:uiPriority="46"/>
+    <w:lsdException w:name="List Table 2 Accent 1" w:uiPriority="47"/>
+    <w:lsdException w:name="List Table 3 Accent 1" w:uiPriority="48"/>
+    <w:lsdException w:name="List Table 4 Accent 1" w:uiPriority="49"/>
+    <w:lsdException w:name="List Table 5 Dark Accent 1" w:uiPriority="50"/>
+    <w:lsdException w:name="List Table 6 Colorful Accent 1" w:uiPriority="51"/>
+    <w:lsdException w:name="List Table 7 Colorful Accent 1" w:uiPriority="52"/>
+    <w:lsdException w:name="List Table 1 Light Accent 2" w:uiPriority="46"/>
+    <w:lsdException w:name="List Table 2 Accent 2" w:uiPriority="47"/>
+    <w:lsdException w:name="List Table 3 Accent 2" w:uiPriority="48"/>
+    <w:lsdException w:name="List Table 4 Accent 2" w:uiPriority="49"/>
+    <w:lsdException w:name="List Table 5 Dark Accent 2" w:uiPriority="50"/>
+    <w:lsdException w:name="List Table 6 Colorful Accent 2" w:uiPriority="51"/>
+    <w:lsdException w:name="List Table 7 Colorful Accent 2" w:uiPriority="52"/>
+    <w:lsdException w:name="List Table 1 Light Accent 3" w:uiPriority="46"/>
+    <w:lsdException w:name="List Table 2 Accent 3" w:uiPriority="47"/>
+    <w:lsdException w:name="List Table 3 Accent 3" w:uiPriority="48"/>
+    <w:lsdException w:name="List Table 4 Accent 3" w:uiPriority="49"/>
+    <w:lsdException w:name="List Table 5 Dark Accent 3" w:uiPriority="50"/>
+    <w:lsdException w:name="List Table 6 Colorful Accent 3" w:uiPriority="51"/>
+    <w:lsdException w:name="List Table 7 Colorful Accent 3" w:uiPriority="52"/>
+    <w:lsdException w:name="List Table 1 Light Accent 4" w:uiPriority="46"/>
+    <w:lsdException w:name="List Table 2 Accent 4" w:uiPriority="47"/>
+    <w:lsdException w:name="List Table 3 Accent 4" w:uiPriority="48"/>
+    <w:lsdException w:name="List Table 4 Accent 4" w:uiPriority="49"/>
+    <w:lsdException w:name="List Table 5 Dark Accent 4" w:uiPriority="50"/>
+    <w:lsdException w:name="List Table 6 Colorful Accent 4" w:uiPriority="51"/>
+    <w:lsdException w:name="List Table 7 Colorful Accent 4" w:uiPriority="52"/>
+    <w:lsdException w:name="List Table 1 Light Accent 5" w:uiPriority="46"/>
+    <w:lsdException w:name="List Table 2 Accent 5" w:uiPriority="47"/>
+    <w:lsdException w:name="List Table 3 Accent 5" w:uiPriority="48"/>
+    <w:lsdException w:name="List Table 4 Accent 5" w:uiPriority="49"/>
+    <w:lsdException w:name="List Table 5 Dark Accent 5" w:uiPriority="50"/>
+    <w:lsdException w:name="List Table 6 Colorful Accent 5" w:uiPriority="51"/>
+    <w:lsdException w:name="List Table 7 Colorful Accent 5" w:uiPriority="52"/>
+    <w:lsdException w:name="List Table 1 Light Accent 6" w:uiPriority="46"/>
+    <w:lsdException w:name="List Table 2 Accent 6" w:uiPriority="47"/>
+    <w:lsdException w:name="List Table 3 Accent 6" w:uiPriority="48"/>
+    <w:lsdException w:name="List Table 4 Accent 6" w:uiPriority="49"/>
+    <w:lsdException w:name="List Table 5 Dark Accent 6" w:uiPriority="50"/>
+    <w:lsdException w:name="List Table 6 Colorful Accent 6" w:uiPriority="51"/>
+    <w:lsdException w:name="List Table 7 Colorful Accent 6" w:uiPriority="52"/>
   </w:latentStyles>
   <w:style w:type="paragraph" w:default="1" w:styleId="Normal">
     <w:name w:val="Normal"/>
@@ -23534,7 +23316,7 @@
   <a:extraClrSchemeLst/>
   <a:extLst>
     <a:ext uri="{05A4C25C-085E-4340-85A3-A5531E510DB2}">
-      <thm15:themeFamily xmlns:thm15="http://schemas.microsoft.com/office/thememl/2012/main" xmlns="" name="Office Theme" id="{62F939B6-93AF-4DB8-9C6B-D6C7DFDC589F}" vid="{4A3C46E8-61CC-4603-A589-7422A47A8E4A}"/>
+      <thm15:themeFamily xmlns:thm15="http://schemas.microsoft.com/office/thememl/2012/main" name="Office Theme" id="{62F939B6-93AF-4DB8-9C6B-D6C7DFDC589F}" vid="{4A3C46E8-61CC-4603-A589-7422A47A8E4A}"/>
     </a:ext>
   </a:extLst>
 </a:theme>
@@ -23545,7 +23327,7 @@
 </file>
 
 <file path=customXml/itemProps1.xml><?xml version="1.0" encoding="utf-8"?>
-<ds:datastoreItem xmlns:ds="http://schemas.openxmlformats.org/officeDocument/2006/customXml" ds:itemID="{32E4A7ED-667F-41FE-B245-C190EC1F94D2}">
+<ds:datastoreItem xmlns:ds="http://schemas.openxmlformats.org/officeDocument/2006/customXml" ds:itemID="{86DE43E2-EB51-4203-BE24-33AC26966F6F}">
   <ds:schemaRefs>
     <ds:schemaRef ds:uri="http://schemas.openxmlformats.org/officeDocument/2006/bibliography"/>
   </ds:schemaRefs>

</xml_diff>

<commit_message>
Correction of errors from sources of relation + addition of a description + addition of the variable Cr_small to define the threshold a too low value for Cr
</commit_message>
<xml_diff>
--- a/Information/script for equations.docx
+++ b/Information/script for equations.docx
@@ -1,6 +1,6 @@
 
 <file path=word/document.xml><?xml version="1.0" encoding="utf-8"?>
-<w:document xmlns:wpc="http://schemas.microsoft.com/office/word/2010/wordprocessingCanvas" xmlns:mc="http://schemas.openxmlformats.org/markup-compatibility/2006" xmlns:o="urn:schemas-microsoft-com:office:office" xmlns:r="http://schemas.openxmlformats.org/officeDocument/2006/relationships" xmlns:m="http://schemas.openxmlformats.org/officeDocument/2006/math" xmlns:v="urn:schemas-microsoft-com:vml" xmlns:wp14="http://schemas.microsoft.com/office/word/2010/wordprocessingDrawing" xmlns:wp="http://schemas.openxmlformats.org/drawingml/2006/wordprocessingDrawing" xmlns:w10="urn:schemas-microsoft-com:office:word" xmlns:w="http://schemas.openxmlformats.org/wordprocessingml/2006/main" xmlns:w14="http://schemas.microsoft.com/office/word/2010/wordml" xmlns:w15="http://schemas.microsoft.com/office/word/2012/wordml" xmlns:wpg="http://schemas.microsoft.com/office/word/2010/wordprocessingGroup" xmlns:wpi="http://schemas.microsoft.com/office/word/2010/wordprocessingInk" xmlns:wne="http://schemas.microsoft.com/office/word/2006/wordml" xmlns:wps="http://schemas.microsoft.com/office/word/2010/wordprocessingShape" mc:Ignorable="w14 w15 wp14">
+<w:document xmlns:wpc="http://schemas.microsoft.com/office/word/2010/wordprocessingCanvas" xmlns:mc="http://schemas.openxmlformats.org/markup-compatibility/2006" xmlns:o="urn:schemas-microsoft-com:office:office" xmlns:r="http://schemas.openxmlformats.org/officeDocument/2006/relationships" xmlns:m="http://schemas.openxmlformats.org/officeDocument/2006/math" xmlns:v="urn:schemas-microsoft-com:vml" xmlns:wp14="http://schemas.microsoft.com/office/word/2010/wordprocessingDrawing" xmlns:wp="http://schemas.openxmlformats.org/drawingml/2006/wordprocessingDrawing" xmlns:w10="urn:schemas-microsoft-com:office:word" xmlns:w="http://schemas.openxmlformats.org/wordprocessingml/2006/main" xmlns:w14="http://schemas.microsoft.com/office/word/2010/wordml" xmlns:wpg="http://schemas.microsoft.com/office/word/2010/wordprocessingGroup" xmlns:wpi="http://schemas.microsoft.com/office/word/2010/wordprocessingInk" xmlns:wne="http://schemas.microsoft.com/office/word/2006/wordml" xmlns:wps="http://schemas.microsoft.com/office/word/2010/wordprocessingShape" mc:Ignorable="w14 wp14">
   <w:body>
     <w:sdt>
       <w:sdtPr>
@@ -8919,7 +8919,13 @@
             <w:rPr>
               <w:rFonts w:ascii="Cambria Math" w:eastAsiaTheme="minorEastAsia" w:hAnsi="Cambria Math"/>
             </w:rPr>
-            <m:t>dx= Biot×</m:t>
+            <m:t>dx= B</m:t>
+          </m:r>
+          <m:r>
+            <w:rPr>
+              <w:rFonts w:ascii="Cambria Math" w:eastAsiaTheme="minorEastAsia" w:hAnsi="Cambria Math"/>
+            </w:rPr>
+            <m:t>iot×</m:t>
           </m:r>
           <m:f>
             <m:fPr>
@@ -10483,22 +10489,40 @@
           <w:rFonts w:eastAsiaTheme="minorEastAsia"/>
         </w:rPr>
       </w:pPr>
-      <w:bookmarkStart w:id="22" w:name="_Toc41656111"/>
       <w:proofErr w:type="spellStart"/>
+      <w:proofErr w:type="gramStart"/>
       <w:r>
         <w:rPr>
           <w:rFonts w:eastAsiaTheme="minorEastAsia"/>
         </w:rPr>
-        <w:t>NTU_</w:t>
+        <w:t>crossCurrent</w:t>
+      </w:r>
+      <w:proofErr w:type="spellEnd"/>
+      <w:r>
+        <w:rPr>
+          <w:rFonts w:eastAsiaTheme="minorEastAsia"/>
+        </w:rPr>
+        <w:t>(</w:t>
+      </w:r>
+      <w:proofErr w:type="gramEnd"/>
+      <w:r>
+        <w:rPr>
+          <w:rFonts w:eastAsiaTheme="minorEastAsia"/>
+        </w:rPr>
+        <w:t>both fluid</w:t>
       </w:r>
       <w:r>
         <w:rPr>
           <w:rFonts w:eastAsiaTheme="minorEastAsia"/>
         </w:rPr>
-        <w:t>counterCurrent</w:t>
+        <w:t>s</w:t>
       </w:r>
-      <w:bookmarkEnd w:id="22"/>
-      <w:proofErr w:type="spellEnd"/>
+      <w:r>
+        <w:rPr>
+          <w:rFonts w:eastAsiaTheme="minorEastAsia"/>
+        </w:rPr>
+        <w:t xml:space="preserve"> unmixed)</w:t>
+      </w:r>
     </w:p>
     <w:p>
       <w:pPr>
@@ -10519,39 +10543,7 @@
             <w:rPr>
               <w:rFonts w:ascii="Cambria Math" w:eastAsiaTheme="minorEastAsia" w:hAnsi="Cambria Math"/>
             </w:rPr>
-            <m:t>NTU=</m:t>
-          </m:r>
-          <m:f>
-            <m:fPr>
-              <m:ctrlPr>
-                <w:rPr>
-                  <w:rFonts w:ascii="Cambria Math" w:eastAsiaTheme="minorEastAsia" w:hAnsi="Cambria Math"/>
-                  <w:i/>
-                </w:rPr>
-              </m:ctrlPr>
-            </m:fPr>
-            <m:num>
-              <m:r>
-                <w:rPr>
-                  <w:rFonts w:ascii="Cambria Math" w:eastAsiaTheme="minorEastAsia" w:hAnsi="Cambria Math"/>
-                </w:rPr>
-                <m:t>1</m:t>
-              </m:r>
-            </m:num>
-            <m:den>
-              <m:r>
-                <w:rPr>
-                  <w:rFonts w:ascii="Cambria Math" w:eastAsiaTheme="minorEastAsia" w:hAnsi="Cambria Math"/>
-                </w:rPr>
-                <m:t>1-Cr</m:t>
-              </m:r>
-            </m:den>
-          </m:f>
-          <m:r>
-            <w:rPr>
-              <w:rFonts w:ascii="Cambria Math" w:eastAsiaTheme="minorEastAsia" w:hAnsi="Cambria Math"/>
-            </w:rPr>
-            <m:t>×</m:t>
+            <m:t>γ=</m:t>
           </m:r>
           <m:r>
             <m:rPr>
@@ -10560,7 +10552,71 @@
             <w:rPr>
               <w:rFonts w:ascii="Cambria Math" w:eastAsiaTheme="minorEastAsia" w:hAnsi="Cambria Math"/>
             </w:rPr>
-            <m:t>ln⁡</m:t>
+            <m:t>exp⁡</m:t>
+          </m:r>
+          <m:r>
+            <w:rPr>
+              <w:rFonts w:ascii="Cambria Math" w:eastAsiaTheme="minorEastAsia" w:hAnsi="Cambria Math"/>
+            </w:rPr>
+            <m:t>(-Cr×</m:t>
+          </m:r>
+          <m:sSup>
+            <m:sSupPr>
+              <m:ctrlPr>
+                <w:rPr>
+                  <w:rFonts w:ascii="Cambria Math" w:eastAsiaTheme="minorEastAsia" w:hAnsi="Cambria Math"/>
+                  <w:i/>
+                </w:rPr>
+              </m:ctrlPr>
+            </m:sSupPr>
+            <m:e>
+              <m:r>
+                <w:rPr>
+                  <w:rFonts w:ascii="Cambria Math" w:eastAsiaTheme="minorEastAsia" w:hAnsi="Cambria Math"/>
+                </w:rPr>
+                <m:t>NTU</m:t>
+              </m:r>
+            </m:e>
+            <m:sup>
+              <m:r>
+                <w:rPr>
+                  <w:rFonts w:ascii="Cambria Math" w:eastAsiaTheme="minorEastAsia" w:hAnsi="Cambria Math"/>
+                </w:rPr>
+                <m:t>0.78</m:t>
+              </m:r>
+            </m:sup>
+          </m:sSup>
+          <m:r>
+            <w:rPr>
+              <w:rFonts w:ascii="Cambria Math" w:eastAsiaTheme="minorEastAsia" w:hAnsi="Cambria Math"/>
+            </w:rPr>
+            <m:t>)</m:t>
+          </m:r>
+        </m:oMath>
+      </m:oMathPara>
+    </w:p>
+    <w:p>
+      <w:pPr>
+        <w:rPr>
+          <w:rFonts w:eastAsiaTheme="minorEastAsia"/>
+        </w:rPr>
+      </w:pPr>
+      <m:oMathPara>
+        <m:oMath>
+          <m:r>
+            <w:rPr>
+              <w:rFonts w:ascii="Cambria Math" w:eastAsiaTheme="minorEastAsia" w:hAnsi="Cambria Math"/>
+            </w:rPr>
+            <m:t>Eff=1-</m:t>
+          </m:r>
+          <m:r>
+            <m:rPr>
+              <m:sty m:val="p"/>
+            </m:rPr>
+            <w:rPr>
+              <w:rFonts w:ascii="Cambria Math" w:eastAsiaTheme="minorEastAsia" w:hAnsi="Cambria Math"/>
+            </w:rPr>
+            <m:t>exp⁡</m:t>
           </m:r>
           <m:d>
             <m:dPr>
@@ -10572,6 +10628,38 @@
               </m:ctrlPr>
             </m:dPr>
             <m:e>
+              <m:sSup>
+                <m:sSupPr>
+                  <m:ctrlPr>
+                    <w:rPr>
+                      <w:rFonts w:ascii="Cambria Math" w:eastAsiaTheme="minorEastAsia" w:hAnsi="Cambria Math"/>
+                      <w:i/>
+                    </w:rPr>
+                  </m:ctrlPr>
+                </m:sSupPr>
+                <m:e>
+                  <m:r>
+                    <w:rPr>
+                      <w:rFonts w:ascii="Cambria Math" w:eastAsiaTheme="minorEastAsia" w:hAnsi="Cambria Math"/>
+                    </w:rPr>
+                    <m:t>NTU</m:t>
+                  </m:r>
+                </m:e>
+                <m:sup>
+                  <m:r>
+                    <w:rPr>
+                      <w:rFonts w:ascii="Cambria Math" w:eastAsiaTheme="minorEastAsia" w:hAnsi="Cambria Math"/>
+                    </w:rPr>
+                    <m:t>0.22</m:t>
+                  </m:r>
+                </m:sup>
+              </m:sSup>
+              <m:r>
+                <w:rPr>
+                  <w:rFonts w:ascii="Cambria Math" w:eastAsiaTheme="minorEastAsia" w:hAnsi="Cambria Math"/>
+                </w:rPr>
+                <m:t>×</m:t>
+              </m:r>
               <m:f>
                 <m:fPr>
                   <m:ctrlPr>
@@ -10586,7 +10674,7 @@
                     <w:rPr>
                       <w:rFonts w:ascii="Cambria Math" w:eastAsiaTheme="minorEastAsia" w:hAnsi="Cambria Math"/>
                     </w:rPr>
-                    <m:t>1-Eff×Cr</m:t>
+                    <m:t>γ</m:t>
                   </m:r>
                 </m:num>
                 <m:den>
@@ -10594,227 +10682,7 @@
                     <w:rPr>
                       <w:rFonts w:ascii="Cambria Math" w:eastAsiaTheme="minorEastAsia" w:hAnsi="Cambria Math"/>
                     </w:rPr>
-                    <m:t>1-</m:t>
-                  </m:r>
-                  <m:r>
-                    <m:rPr>
-                      <m:sty m:val="p"/>
-                    </m:rPr>
-                    <w:rPr>
-                      <w:rFonts w:ascii="Cambria Math" w:eastAsiaTheme="minorEastAsia" w:hAnsi="Cambria Math"/>
-                    </w:rPr>
-                    <m:t>min</m:t>
-                  </m:r>
-                  <m:r>
-                    <w:rPr>
-                      <w:rFonts w:ascii="Cambria Math" w:eastAsiaTheme="minorEastAsia" w:hAnsi="Cambria Math"/>
-                    </w:rPr>
-                    <m:t>(Eff,0.999)</m:t>
-                  </m:r>
-                </m:den>
-              </m:f>
-            </m:e>
-          </m:d>
-          <m:r>
-            <w:rPr>
-              <w:rFonts w:ascii="Cambria Math" w:eastAsiaTheme="minorEastAsia" w:hAnsi="Cambria Math"/>
-            </w:rPr>
-            <m:t xml:space="preserve"> For Cr≤0.98</m:t>
-          </m:r>
-        </m:oMath>
-      </m:oMathPara>
-    </w:p>
-    <w:p>
-      <w:pPr>
-        <w:rPr>
-          <w:rFonts w:eastAsiaTheme="minorEastAsia"/>
-        </w:rPr>
-      </w:pPr>
-      <m:oMathPara>
-        <m:oMath>
-          <m:r>
-            <w:rPr>
-              <w:rFonts w:ascii="Cambria Math" w:eastAsiaTheme="minorEastAsia" w:hAnsi="Cambria Math"/>
-            </w:rPr>
-            <m:t>NTU(Cr=1)=</m:t>
-          </m:r>
-          <m:f>
-            <m:fPr>
-              <m:ctrlPr>
-                <w:rPr>
-                  <w:rFonts w:ascii="Cambria Math" w:eastAsiaTheme="minorEastAsia" w:hAnsi="Cambria Math"/>
-                  <w:i/>
-                </w:rPr>
-              </m:ctrlPr>
-            </m:fPr>
-            <m:num>
-              <m:r>
-                <w:rPr>
-                  <w:rFonts w:ascii="Cambria Math" w:eastAsiaTheme="minorEastAsia" w:hAnsi="Cambria Math"/>
-                </w:rPr>
-                <m:t>Eff</m:t>
-              </m:r>
-            </m:num>
-            <m:den>
-              <m:r>
-                <w:rPr>
-                  <w:rFonts w:ascii="Cambria Math" w:eastAsiaTheme="minorEastAsia" w:hAnsi="Cambria Math"/>
-                </w:rPr>
-                <m:t>1-</m:t>
-              </m:r>
-              <m:r>
-                <m:rPr>
-                  <m:sty m:val="p"/>
-                </m:rPr>
-                <w:rPr>
-                  <w:rFonts w:ascii="Cambria Math" w:eastAsiaTheme="minorEastAsia" w:hAnsi="Cambria Math"/>
-                </w:rPr>
-                <m:t>min</m:t>
-              </m:r>
-              <m:r>
-                <w:rPr>
-                  <w:rFonts w:ascii="Cambria Math" w:eastAsiaTheme="minorEastAsia" w:hAnsi="Cambria Math"/>
-                </w:rPr>
-                <m:t>(Eff,0.999)</m:t>
-              </m:r>
-            </m:den>
-          </m:f>
-          <m:r>
-            <w:rPr>
-              <w:rFonts w:ascii="Cambria Math" w:eastAsiaTheme="minorEastAsia" w:hAnsi="Cambria Math"/>
-            </w:rPr>
-            <m:t xml:space="preserve"> For Cr≥0.99</m:t>
-          </m:r>
-        </m:oMath>
-      </m:oMathPara>
-    </w:p>
-    <w:p>
-      <w:pPr>
-        <w:rPr>
-          <w:rFonts w:eastAsiaTheme="minorEastAsia"/>
-        </w:rPr>
-      </w:pPr>
-      <m:oMathPara>
-        <m:oMath>
-          <m:r>
-            <w:rPr>
-              <w:rFonts w:ascii="Cambria Math" w:eastAsiaTheme="minorEastAsia" w:hAnsi="Cambria Math"/>
-            </w:rPr>
-            <m:t>Eff=polynomial interpolation(NTU, NTU(Cr=1)) For 0.98&lt;Cr&lt;0.99</m:t>
-          </m:r>
-        </m:oMath>
-      </m:oMathPara>
-    </w:p>
-    <w:p>
-      <w:pPr>
-        <w:rPr>
-          <w:rFonts w:eastAsiaTheme="minorEastAsia"/>
-        </w:rPr>
-      </w:pPr>
-    </w:p>
-    <w:p>
-      <w:pPr>
-        <w:pStyle w:val="Titre3"/>
-        <w:rPr>
-          <w:rFonts w:eastAsiaTheme="minorEastAsia"/>
-        </w:rPr>
-      </w:pPr>
-      <w:proofErr w:type="spellStart"/>
-      <w:r>
-        <w:rPr>
-          <w:rFonts w:eastAsiaTheme="minorEastAsia"/>
-        </w:rPr>
-        <w:t>NTU_counterCurrent</w:t>
-      </w:r>
-      <w:proofErr w:type="spellEnd"/>
-    </w:p>
-    <w:p>
-      <w:pPr>
-        <w:rPr>
-          <w:rFonts w:eastAsiaTheme="minorEastAsia"/>
-        </w:rPr>
-      </w:pPr>
-    </w:p>
-    <w:p>
-      <w:pPr>
-        <w:rPr>
-          <w:rFonts w:eastAsiaTheme="minorEastAsia"/>
-        </w:rPr>
-      </w:pPr>
-      <m:oMathPara>
-        <m:oMath>
-          <m:r>
-            <w:rPr>
-              <w:rFonts w:ascii="Cambria Math" w:eastAsiaTheme="minorEastAsia" w:hAnsi="Cambria Math"/>
-            </w:rPr>
-            <m:t>NTU=</m:t>
-          </m:r>
-          <m:r>
-            <w:rPr>
-              <w:rFonts w:ascii="Cambria Math" w:eastAsiaTheme="minorEastAsia" w:hAnsi="Cambria Math"/>
-            </w:rPr>
-            <m:t>-</m:t>
-          </m:r>
-          <m:r>
-            <m:rPr>
-              <m:sty m:val="p"/>
-            </m:rPr>
-            <w:rPr>
-              <w:rFonts w:ascii="Cambria Math" w:eastAsiaTheme="minorEastAsia" w:hAnsi="Cambria Math"/>
-            </w:rPr>
-            <m:t>ln⁡</m:t>
-          </m:r>
-          <m:d>
-            <m:dPr>
-              <m:ctrlPr>
-                <w:rPr>
-                  <w:rFonts w:ascii="Cambria Math" w:eastAsiaTheme="minorEastAsia" w:hAnsi="Cambria Math"/>
-                  <w:i/>
-                </w:rPr>
-              </m:ctrlPr>
-            </m:dPr>
-            <m:e>
-              <m:f>
-                <m:fPr>
-                  <m:ctrlPr>
-                    <w:rPr>
-                      <w:rFonts w:ascii="Cambria Math" w:eastAsiaTheme="minorEastAsia" w:hAnsi="Cambria Math"/>
-                      <w:i/>
-                    </w:rPr>
-                  </m:ctrlPr>
-                </m:fPr>
-                <m:num>
-                  <m:r>
-                    <w:rPr>
-                      <w:rFonts w:ascii="Cambria Math" w:eastAsiaTheme="minorEastAsia" w:hAnsi="Cambria Math"/>
-                    </w:rPr>
-                    <m:t>1-Eff×</m:t>
-                  </m:r>
-                  <m:r>
-                    <w:rPr>
-                      <w:rFonts w:ascii="Cambria Math" w:eastAsiaTheme="minorEastAsia" w:hAnsi="Cambria Math"/>
-                    </w:rPr>
-                    <m:t>(1+Eff)</m:t>
-                  </m:r>
-                </m:num>
-                <m:den>
-                  <m:r>
-                    <w:rPr>
-                      <w:rFonts w:ascii="Cambria Math" w:eastAsiaTheme="minorEastAsia" w:hAnsi="Cambria Math"/>
-                    </w:rPr>
-                    <m:t>1</m:t>
-                  </m:r>
-                  <m:r>
-                    <w:rPr>
-                      <w:rFonts w:ascii="Cambria Math" w:eastAsiaTheme="minorEastAsia" w:hAnsi="Cambria Math"/>
-                    </w:rPr>
-                    <m:t>+</m:t>
-                  </m:r>
-                  <m:r>
-                    <w:rPr>
-                      <w:rFonts w:ascii="Cambria Math" w:eastAsiaTheme="minorEastAsia" w:hAnsi="Cambria Math"/>
-                    </w:rPr>
-                    <m:t>Eff</m:t>
+                    <m:t>Cr</m:t>
                   </m:r>
                 </m:den>
               </m:f>
@@ -10829,8 +10697,711 @@
           <w:rFonts w:eastAsiaTheme="minorEastAsia"/>
         </w:rPr>
       </w:pPr>
-      <w:bookmarkStart w:id="23" w:name="_GoBack"/>
+    </w:p>
+    <w:p>
+      <w:pPr>
+        <w:pStyle w:val="Titre3"/>
+        <w:rPr>
+          <w:rFonts w:eastAsiaTheme="minorEastAsia"/>
+        </w:rPr>
+      </w:pPr>
+      <w:proofErr w:type="spellStart"/>
+      <w:proofErr w:type="gramStart"/>
+      <w:r>
+        <w:rPr>
+          <w:rFonts w:eastAsiaTheme="minorEastAsia"/>
+        </w:rPr>
+        <w:t>crossCurrent</w:t>
+      </w:r>
+      <w:proofErr w:type="spellEnd"/>
+      <w:r>
+        <w:rPr>
+          <w:rFonts w:eastAsiaTheme="minorEastAsia"/>
+        </w:rPr>
+        <w:t>(</w:t>
+      </w:r>
+      <w:proofErr w:type="gramEnd"/>
+      <w:r>
+        <w:rPr>
+          <w:rFonts w:eastAsiaTheme="minorEastAsia"/>
+        </w:rPr>
+        <w:t>one</w:t>
+      </w:r>
+      <w:r>
+        <w:rPr>
+          <w:rFonts w:eastAsiaTheme="minorEastAsia"/>
+        </w:rPr>
+        <w:t xml:space="preserve"> fluid unmixed</w:t>
+      </w:r>
+      <w:r>
+        <w:rPr>
+          <w:rFonts w:eastAsiaTheme="minorEastAsia"/>
+        </w:rPr>
+        <w:t xml:space="preserve"> the other mixed</w:t>
+      </w:r>
+      <w:r>
+        <w:rPr>
+          <w:rFonts w:eastAsiaTheme="minorEastAsia"/>
+        </w:rPr>
+        <w:t>)</w:t>
+      </w:r>
+    </w:p>
+    <w:p>
+      <w:pPr>
+        <w:rPr>
+          <w:rFonts w:eastAsiaTheme="minorEastAsia"/>
+        </w:rPr>
+      </w:pPr>
+    </w:p>
+    <w:p>
+      <w:pPr>
+        <w:pStyle w:val="Paragraphedeliste"/>
+        <w:numPr>
+          <w:ilvl w:val="0"/>
+          <w:numId w:val="23"/>
+        </w:numPr>
+        <w:ind w:left="2835"/>
+        <w:rPr>
+          <w:rFonts w:eastAsiaTheme="minorEastAsia"/>
+        </w:rPr>
+      </w:pPr>
+      <w:r>
+        <w:rPr>
+          <w:rFonts w:eastAsiaTheme="minorEastAsia"/>
+        </w:rPr>
+        <w:t xml:space="preserve">Qc_max (Mixed), Qc_min (Unmixed) </w:t>
+      </w:r>
+    </w:p>
+    <w:p>
+      <w:pPr>
+        <w:rPr>
+          <w:rFonts w:eastAsiaTheme="minorEastAsia"/>
+        </w:rPr>
+      </w:pPr>
+      <m:oMathPara>
+        <m:oMath>
+          <m:r>
+            <w:rPr>
+              <w:rFonts w:ascii="Cambria Math" w:eastAsiaTheme="minorEastAsia" w:hAnsi="Cambria Math"/>
+            </w:rPr>
+            <m:t>γ=</m:t>
+          </m:r>
+          <m:r>
+            <w:rPr>
+              <w:rFonts w:ascii="Cambria Math" w:eastAsiaTheme="minorEastAsia" w:hAnsi="Cambria Math"/>
+            </w:rPr>
+            <m:t>1-</m:t>
+          </m:r>
+          <m:r>
+            <m:rPr>
+              <m:sty m:val="p"/>
+            </m:rPr>
+            <w:rPr>
+              <w:rFonts w:ascii="Cambria Math" w:eastAsiaTheme="minorEastAsia" w:hAnsi="Cambria Math"/>
+            </w:rPr>
+            <m:t>exp⁡</m:t>
+          </m:r>
+          <m:r>
+            <w:rPr>
+              <w:rFonts w:ascii="Cambria Math" w:eastAsiaTheme="minorEastAsia" w:hAnsi="Cambria Math"/>
+            </w:rPr>
+            <m:t>(-</m:t>
+          </m:r>
+          <m:r>
+            <w:rPr>
+              <w:rFonts w:ascii="Cambria Math" w:eastAsiaTheme="minorEastAsia" w:hAnsi="Cambria Math"/>
+            </w:rPr>
+            <m:t>NTU</m:t>
+          </m:r>
+          <m:r>
+            <w:rPr>
+              <w:rFonts w:ascii="Cambria Math" w:eastAsiaTheme="minorEastAsia" w:hAnsi="Cambria Math"/>
+            </w:rPr>
+            <m:t>)</m:t>
+          </m:r>
+        </m:oMath>
+      </m:oMathPara>
+    </w:p>
+    <w:p>
+      <w:pPr>
+        <w:rPr>
+          <w:rFonts w:eastAsiaTheme="minorEastAsia"/>
+        </w:rPr>
+      </w:pPr>
+      <m:oMathPara>
+        <m:oMath>
+          <m:r>
+            <w:rPr>
+              <w:rFonts w:ascii="Cambria Math" w:eastAsiaTheme="minorEastAsia" w:hAnsi="Cambria Math"/>
+            </w:rPr>
+            <m:t>E</m:t>
+          </m:r>
+          <m:r>
+            <w:rPr>
+              <w:rFonts w:ascii="Cambria Math" w:eastAsiaTheme="minorEastAsia" w:hAnsi="Cambria Math"/>
+            </w:rPr>
+            <m:t>ff=</m:t>
+          </m:r>
+          <m:f>
+            <m:fPr>
+              <m:ctrlPr>
+                <w:rPr>
+                  <w:rFonts w:ascii="Cambria Math" w:eastAsiaTheme="minorEastAsia" w:hAnsi="Cambria Math"/>
+                  <w:i/>
+                </w:rPr>
+              </m:ctrlPr>
+            </m:fPr>
+            <m:num>
+              <m:r>
+                <w:rPr>
+                  <w:rFonts w:ascii="Cambria Math" w:eastAsiaTheme="minorEastAsia" w:hAnsi="Cambria Math"/>
+                </w:rPr>
+                <m:t>1-</m:t>
+              </m:r>
+              <m:r>
+                <m:rPr>
+                  <m:sty m:val="p"/>
+                </m:rPr>
+                <w:rPr>
+                  <w:rFonts w:ascii="Cambria Math" w:eastAsiaTheme="minorEastAsia" w:hAnsi="Cambria Math"/>
+                </w:rPr>
+                <m:t>exp⁡</m:t>
+              </m:r>
+              <m:d>
+                <m:dPr>
+                  <m:ctrlPr>
+                    <w:rPr>
+                      <w:rFonts w:ascii="Cambria Math" w:eastAsiaTheme="minorEastAsia" w:hAnsi="Cambria Math"/>
+                      <w:i/>
+                    </w:rPr>
+                  </m:ctrlPr>
+                </m:dPr>
+                <m:e>
+                  <m:r>
+                    <w:rPr>
+                      <w:rFonts w:ascii="Cambria Math" w:eastAsiaTheme="minorEastAsia" w:hAnsi="Cambria Math"/>
+                    </w:rPr>
+                    <m:t>Cr×</m:t>
+                  </m:r>
+                  <m:r>
+                    <w:rPr>
+                      <w:rFonts w:ascii="Cambria Math" w:eastAsiaTheme="minorEastAsia" w:hAnsi="Cambria Math"/>
+                    </w:rPr>
+                    <m:t>γ</m:t>
+                  </m:r>
+                </m:e>
+              </m:d>
+            </m:num>
+            <m:den>
+              <m:r>
+                <w:rPr>
+                  <w:rFonts w:ascii="Cambria Math" w:eastAsiaTheme="minorEastAsia" w:hAnsi="Cambria Math"/>
+                </w:rPr>
+                <m:t>Cr</m:t>
+              </m:r>
+            </m:den>
+          </m:f>
+        </m:oMath>
+      </m:oMathPara>
+    </w:p>
+    <w:p>
+      <w:pPr>
+        <w:rPr>
+          <w:rFonts w:eastAsiaTheme="minorEastAsia"/>
+        </w:rPr>
+      </w:pPr>
+    </w:p>
+    <w:p>
+      <w:pPr>
+        <w:rPr>
+          <w:rFonts w:eastAsiaTheme="minorEastAsia"/>
+        </w:rPr>
+      </w:pPr>
+    </w:p>
+    <w:p>
+      <w:pPr>
+        <w:pStyle w:val="Paragraphedeliste"/>
+        <w:numPr>
+          <w:ilvl w:val="0"/>
+          <w:numId w:val="23"/>
+        </w:numPr>
+        <w:ind w:left="2835"/>
+        <w:rPr>
+          <w:rFonts w:eastAsiaTheme="minorEastAsia"/>
+        </w:rPr>
+      </w:pPr>
+      <w:r>
+        <w:rPr>
+          <w:rFonts w:eastAsiaTheme="minorEastAsia"/>
+        </w:rPr>
+        <w:lastRenderedPageBreak/>
+        <w:t>Qc_max (Unmixed), Qc_min (M</w:t>
+      </w:r>
+      <w:r>
+        <w:rPr>
+          <w:rFonts w:eastAsiaTheme="minorEastAsia"/>
+        </w:rPr>
+        <w:t xml:space="preserve">ixed) </w:t>
+      </w:r>
+      <w:bookmarkStart w:id="22" w:name="_GoBack"/>
+      <w:bookmarkEnd w:id="22"/>
+    </w:p>
+    <w:p>
+      <w:pPr>
+        <w:rPr>
+          <w:rFonts w:eastAsiaTheme="minorEastAsia"/>
+        </w:rPr>
+      </w:pPr>
+      <m:oMathPara>
+        <m:oMath>
+          <m:r>
+            <w:rPr>
+              <w:rFonts w:ascii="Cambria Math" w:eastAsiaTheme="minorEastAsia" w:hAnsi="Cambria Math"/>
+            </w:rPr>
+            <m:t>γ=1-</m:t>
+          </m:r>
+          <m:r>
+            <m:rPr>
+              <m:sty m:val="p"/>
+            </m:rPr>
+            <w:rPr>
+              <w:rFonts w:ascii="Cambria Math" w:eastAsiaTheme="minorEastAsia" w:hAnsi="Cambria Math"/>
+            </w:rPr>
+            <m:t>exp⁡</m:t>
+          </m:r>
+          <m:r>
+            <w:rPr>
+              <w:rFonts w:ascii="Cambria Math" w:eastAsiaTheme="minorEastAsia" w:hAnsi="Cambria Math"/>
+            </w:rPr>
+            <m:t>(-NTU</m:t>
+          </m:r>
+          <m:r>
+            <w:rPr>
+              <w:rFonts w:ascii="Cambria Math" w:eastAsiaTheme="minorEastAsia" w:hAnsi="Cambria Math"/>
+            </w:rPr>
+            <m:t>×Cr</m:t>
+          </m:r>
+          <m:r>
+            <w:rPr>
+              <w:rFonts w:ascii="Cambria Math" w:eastAsiaTheme="minorEastAsia" w:hAnsi="Cambria Math"/>
+            </w:rPr>
+            <m:t>)</m:t>
+          </m:r>
+        </m:oMath>
+      </m:oMathPara>
+    </w:p>
+    <w:p>
+      <w:pPr>
+        <w:rPr>
+          <w:rFonts w:eastAsiaTheme="minorEastAsia"/>
+        </w:rPr>
+      </w:pPr>
+      <m:oMathPara>
+        <m:oMath>
+          <m:r>
+            <w:rPr>
+              <w:rFonts w:ascii="Cambria Math" w:eastAsiaTheme="minorEastAsia" w:hAnsi="Cambria Math"/>
+            </w:rPr>
+            <m:t>E</m:t>
+          </m:r>
+          <m:r>
+            <w:rPr>
+              <w:rFonts w:ascii="Cambria Math" w:eastAsiaTheme="minorEastAsia" w:hAnsi="Cambria Math"/>
+            </w:rPr>
+            <m:t>ff=1-</m:t>
+          </m:r>
+          <m:r>
+            <m:rPr>
+              <m:sty m:val="p"/>
+            </m:rPr>
+            <w:rPr>
+              <w:rFonts w:ascii="Cambria Math" w:eastAsiaTheme="minorEastAsia" w:hAnsi="Cambria Math"/>
+            </w:rPr>
+            <m:t>exp⁡</m:t>
+          </m:r>
+          <m:d>
+            <m:dPr>
+              <m:ctrlPr>
+                <w:rPr>
+                  <w:rFonts w:ascii="Cambria Math" w:eastAsiaTheme="minorEastAsia" w:hAnsi="Cambria Math"/>
+                  <w:i/>
+                </w:rPr>
+              </m:ctrlPr>
+            </m:dPr>
+            <m:e>
+              <m:f>
+                <m:fPr>
+                  <m:ctrlPr>
+                    <w:rPr>
+                      <w:rFonts w:ascii="Cambria Math" w:eastAsiaTheme="minorEastAsia" w:hAnsi="Cambria Math"/>
+                      <w:i/>
+                    </w:rPr>
+                  </m:ctrlPr>
+                </m:fPr>
+                <m:num>
+                  <m:r>
+                    <w:rPr>
+                      <w:rFonts w:ascii="Cambria Math" w:eastAsiaTheme="minorEastAsia" w:hAnsi="Cambria Math"/>
+                    </w:rPr>
+                    <m:t>-γ</m:t>
+                  </m:r>
+                </m:num>
+                <m:den>
+                  <m:r>
+                    <w:rPr>
+                      <w:rFonts w:ascii="Cambria Math" w:eastAsiaTheme="minorEastAsia" w:hAnsi="Cambria Math"/>
+                    </w:rPr>
+                    <m:t>Cr</m:t>
+                  </m:r>
+                </m:den>
+              </m:f>
+            </m:e>
+          </m:d>
+        </m:oMath>
+      </m:oMathPara>
+    </w:p>
+    <w:p>
+      <w:pPr>
+        <w:rPr>
+          <w:rFonts w:eastAsiaTheme="minorEastAsia"/>
+        </w:rPr>
+      </w:pPr>
+    </w:p>
+    <w:p>
+      <w:pPr>
+        <w:pStyle w:val="Titre3"/>
+        <w:rPr>
+          <w:rFonts w:eastAsiaTheme="minorEastAsia"/>
+        </w:rPr>
+      </w:pPr>
+      <w:bookmarkStart w:id="23" w:name="_Toc41656111"/>
+      <w:proofErr w:type="spellStart"/>
+      <w:r>
+        <w:rPr>
+          <w:rFonts w:eastAsiaTheme="minorEastAsia"/>
+        </w:rPr>
+        <w:t>NTU_</w:t>
+      </w:r>
+      <w:r>
+        <w:rPr>
+          <w:rFonts w:eastAsiaTheme="minorEastAsia"/>
+        </w:rPr>
+        <w:t>counterCurrent</w:t>
+      </w:r>
       <w:bookmarkEnd w:id="23"/>
+      <w:proofErr w:type="spellEnd"/>
+    </w:p>
+    <w:p>
+      <w:pPr>
+        <w:rPr>
+          <w:rFonts w:eastAsiaTheme="minorEastAsia"/>
+        </w:rPr>
+      </w:pPr>
+    </w:p>
+    <w:p>
+      <w:pPr>
+        <w:rPr>
+          <w:rFonts w:eastAsiaTheme="minorEastAsia"/>
+        </w:rPr>
+      </w:pPr>
+      <m:oMathPara>
+        <m:oMath>
+          <m:r>
+            <w:rPr>
+              <w:rFonts w:ascii="Cambria Math" w:eastAsiaTheme="minorEastAsia" w:hAnsi="Cambria Math"/>
+            </w:rPr>
+            <m:t>NTU=</m:t>
+          </m:r>
+          <m:f>
+            <m:fPr>
+              <m:ctrlPr>
+                <w:rPr>
+                  <w:rFonts w:ascii="Cambria Math" w:eastAsiaTheme="minorEastAsia" w:hAnsi="Cambria Math"/>
+                  <w:i/>
+                </w:rPr>
+              </m:ctrlPr>
+            </m:fPr>
+            <m:num>
+              <m:r>
+                <w:rPr>
+                  <w:rFonts w:ascii="Cambria Math" w:eastAsiaTheme="minorEastAsia" w:hAnsi="Cambria Math"/>
+                </w:rPr>
+                <m:t>1</m:t>
+              </m:r>
+            </m:num>
+            <m:den>
+              <m:r>
+                <w:rPr>
+                  <w:rFonts w:ascii="Cambria Math" w:eastAsiaTheme="minorEastAsia" w:hAnsi="Cambria Math"/>
+                </w:rPr>
+                <m:t>1-Cr</m:t>
+              </m:r>
+            </m:den>
+          </m:f>
+          <m:r>
+            <w:rPr>
+              <w:rFonts w:ascii="Cambria Math" w:eastAsiaTheme="minorEastAsia" w:hAnsi="Cambria Math"/>
+            </w:rPr>
+            <m:t>×</m:t>
+          </m:r>
+          <m:r>
+            <m:rPr>
+              <m:sty m:val="p"/>
+            </m:rPr>
+            <w:rPr>
+              <w:rFonts w:ascii="Cambria Math" w:eastAsiaTheme="minorEastAsia" w:hAnsi="Cambria Math"/>
+            </w:rPr>
+            <m:t>ln⁡</m:t>
+          </m:r>
+          <m:d>
+            <m:dPr>
+              <m:ctrlPr>
+                <w:rPr>
+                  <w:rFonts w:ascii="Cambria Math" w:eastAsiaTheme="minorEastAsia" w:hAnsi="Cambria Math"/>
+                  <w:i/>
+                </w:rPr>
+              </m:ctrlPr>
+            </m:dPr>
+            <m:e>
+              <m:f>
+                <m:fPr>
+                  <m:ctrlPr>
+                    <w:rPr>
+                      <w:rFonts w:ascii="Cambria Math" w:eastAsiaTheme="minorEastAsia" w:hAnsi="Cambria Math"/>
+                      <w:i/>
+                    </w:rPr>
+                  </m:ctrlPr>
+                </m:fPr>
+                <m:num>
+                  <m:r>
+                    <w:rPr>
+                      <w:rFonts w:ascii="Cambria Math" w:eastAsiaTheme="minorEastAsia" w:hAnsi="Cambria Math"/>
+                    </w:rPr>
+                    <m:t>1-Eff×Cr</m:t>
+                  </m:r>
+                </m:num>
+                <m:den>
+                  <m:r>
+                    <w:rPr>
+                      <w:rFonts w:ascii="Cambria Math" w:eastAsiaTheme="minorEastAsia" w:hAnsi="Cambria Math"/>
+                    </w:rPr>
+                    <m:t>1-</m:t>
+                  </m:r>
+                  <m:r>
+                    <m:rPr>
+                      <m:sty m:val="p"/>
+                    </m:rPr>
+                    <w:rPr>
+                      <w:rFonts w:ascii="Cambria Math" w:eastAsiaTheme="minorEastAsia" w:hAnsi="Cambria Math"/>
+                    </w:rPr>
+                    <m:t>min</m:t>
+                  </m:r>
+                  <m:r>
+                    <w:rPr>
+                      <w:rFonts w:ascii="Cambria Math" w:eastAsiaTheme="minorEastAsia" w:hAnsi="Cambria Math"/>
+                    </w:rPr>
+                    <m:t>(E</m:t>
+                  </m:r>
+                  <m:r>
+                    <w:rPr>
+                      <w:rFonts w:ascii="Cambria Math" w:eastAsiaTheme="minorEastAsia" w:hAnsi="Cambria Math"/>
+                    </w:rPr>
+                    <m:t>ff,0.999)</m:t>
+                  </m:r>
+                </m:den>
+              </m:f>
+            </m:e>
+          </m:d>
+          <m:r>
+            <w:rPr>
+              <w:rFonts w:ascii="Cambria Math" w:eastAsiaTheme="minorEastAsia" w:hAnsi="Cambria Math"/>
+            </w:rPr>
+            <m:t xml:space="preserve"> For Cr≤0.98</m:t>
+          </m:r>
+        </m:oMath>
+      </m:oMathPara>
+    </w:p>
+    <w:p>
+      <w:pPr>
+        <w:rPr>
+          <w:rFonts w:eastAsiaTheme="minorEastAsia"/>
+        </w:rPr>
+      </w:pPr>
+      <m:oMathPara>
+        <m:oMath>
+          <m:r>
+            <w:rPr>
+              <w:rFonts w:ascii="Cambria Math" w:eastAsiaTheme="minorEastAsia" w:hAnsi="Cambria Math"/>
+            </w:rPr>
+            <m:t>NTU(Cr=1)=</m:t>
+          </m:r>
+          <m:f>
+            <m:fPr>
+              <m:ctrlPr>
+                <w:rPr>
+                  <w:rFonts w:ascii="Cambria Math" w:eastAsiaTheme="minorEastAsia" w:hAnsi="Cambria Math"/>
+                  <w:i/>
+                </w:rPr>
+              </m:ctrlPr>
+            </m:fPr>
+            <m:num>
+              <m:r>
+                <w:rPr>
+                  <w:rFonts w:ascii="Cambria Math" w:eastAsiaTheme="minorEastAsia" w:hAnsi="Cambria Math"/>
+                </w:rPr>
+                <m:t>Eff</m:t>
+              </m:r>
+            </m:num>
+            <m:den>
+              <m:r>
+                <w:rPr>
+                  <w:rFonts w:ascii="Cambria Math" w:eastAsiaTheme="minorEastAsia" w:hAnsi="Cambria Math"/>
+                </w:rPr>
+                <m:t>1-</m:t>
+              </m:r>
+              <m:r>
+                <m:rPr>
+                  <m:sty m:val="p"/>
+                </m:rPr>
+                <w:rPr>
+                  <w:rFonts w:ascii="Cambria Math" w:eastAsiaTheme="minorEastAsia" w:hAnsi="Cambria Math"/>
+                </w:rPr>
+                <m:t>min</m:t>
+              </m:r>
+              <m:r>
+                <w:rPr>
+                  <w:rFonts w:ascii="Cambria Math" w:eastAsiaTheme="minorEastAsia" w:hAnsi="Cambria Math"/>
+                </w:rPr>
+                <m:t>(Eff,0.999)</m:t>
+              </m:r>
+            </m:den>
+          </m:f>
+          <m:r>
+            <w:rPr>
+              <w:rFonts w:ascii="Cambria Math" w:eastAsiaTheme="minorEastAsia" w:hAnsi="Cambria Math"/>
+            </w:rPr>
+            <m:t xml:space="preserve"> For Cr≥0.99</m:t>
+          </m:r>
+        </m:oMath>
+      </m:oMathPara>
+    </w:p>
+    <w:p>
+      <w:pPr>
+        <w:rPr>
+          <w:rFonts w:eastAsiaTheme="minorEastAsia"/>
+        </w:rPr>
+      </w:pPr>
+      <m:oMathPara>
+        <m:oMath>
+          <m:r>
+            <w:rPr>
+              <w:rFonts w:ascii="Cambria Math" w:eastAsiaTheme="minorEastAsia" w:hAnsi="Cambria Math"/>
+            </w:rPr>
+            <m:t>Eff=polynomial interpolation(NTU, NTU(Cr=1)) For 0.98&lt;Cr&lt;0.99</m:t>
+          </m:r>
+        </m:oMath>
+      </m:oMathPara>
+    </w:p>
+    <w:p>
+      <w:pPr>
+        <w:rPr>
+          <w:rFonts w:eastAsiaTheme="minorEastAsia"/>
+        </w:rPr>
+      </w:pPr>
+    </w:p>
+    <w:p>
+      <w:pPr>
+        <w:pStyle w:val="Titre3"/>
+        <w:rPr>
+          <w:rFonts w:eastAsiaTheme="minorEastAsia"/>
+        </w:rPr>
+      </w:pPr>
+      <w:proofErr w:type="spellStart"/>
+      <w:r>
+        <w:rPr>
+          <w:rFonts w:eastAsiaTheme="minorEastAsia"/>
+        </w:rPr>
+        <w:t>NTU_counterCurrent</w:t>
+      </w:r>
+      <w:proofErr w:type="spellEnd"/>
+    </w:p>
+    <w:p>
+      <w:pPr>
+        <w:rPr>
+          <w:rFonts w:eastAsiaTheme="minorEastAsia"/>
+        </w:rPr>
+      </w:pPr>
+    </w:p>
+    <w:p>
+      <w:pPr>
+        <w:rPr>
+          <w:rFonts w:eastAsiaTheme="minorEastAsia"/>
+        </w:rPr>
+      </w:pPr>
+      <m:oMathPara>
+        <m:oMath>
+          <m:r>
+            <w:rPr>
+              <w:rFonts w:ascii="Cambria Math" w:eastAsiaTheme="minorEastAsia" w:hAnsi="Cambria Math"/>
+            </w:rPr>
+            <m:t>NTU=-</m:t>
+          </m:r>
+          <m:r>
+            <m:rPr>
+              <m:sty m:val="p"/>
+            </m:rPr>
+            <w:rPr>
+              <w:rFonts w:ascii="Cambria Math" w:eastAsiaTheme="minorEastAsia" w:hAnsi="Cambria Math"/>
+            </w:rPr>
+            <m:t>ln⁡</m:t>
+          </m:r>
+          <m:d>
+            <m:dPr>
+              <m:ctrlPr>
+                <w:rPr>
+                  <w:rFonts w:ascii="Cambria Math" w:eastAsiaTheme="minorEastAsia" w:hAnsi="Cambria Math"/>
+                  <w:i/>
+                </w:rPr>
+              </m:ctrlPr>
+            </m:dPr>
+            <m:e>
+              <m:f>
+                <m:fPr>
+                  <m:ctrlPr>
+                    <w:rPr>
+                      <w:rFonts w:ascii="Cambria Math" w:eastAsiaTheme="minorEastAsia" w:hAnsi="Cambria Math"/>
+                      <w:i/>
+                    </w:rPr>
+                  </m:ctrlPr>
+                </m:fPr>
+                <m:num>
+                  <m:r>
+                    <w:rPr>
+                      <w:rFonts w:ascii="Cambria Math" w:eastAsiaTheme="minorEastAsia" w:hAnsi="Cambria Math"/>
+                    </w:rPr>
+                    <m:t>1-Eff×(1+Eff)</m:t>
+                  </m:r>
+                </m:num>
+                <m:den>
+                  <m:r>
+                    <w:rPr>
+                      <w:rFonts w:ascii="Cambria Math" w:eastAsiaTheme="minorEastAsia" w:hAnsi="Cambria Math"/>
+                    </w:rPr>
+                    <m:t>1+Eff</m:t>
+                  </m:r>
+                </m:den>
+              </m:f>
+            </m:e>
+          </m:d>
+        </m:oMath>
+      </m:oMathPara>
+    </w:p>
+    <w:p>
+      <w:pPr>
+        <w:rPr>
+          <w:rFonts w:eastAsiaTheme="minorEastAsia"/>
+        </w:rPr>
+      </w:pPr>
     </w:p>
     <w:p>
       <w:pPr>
@@ -12396,7 +12967,13 @@
             <w:rPr>
               <w:rFonts w:ascii="Cambria Math" w:eastAsiaTheme="minorEastAsia" w:hAnsi="Cambria Math"/>
             </w:rPr>
-            <m:t>Q_flow_buoyancy=m_flow_buoyancy×</m:t>
+            <m:t>Q_flow_buoyancy=m_flow_buoy</m:t>
+          </m:r>
+          <m:r>
+            <w:rPr>
+              <w:rFonts w:ascii="Cambria Math" w:eastAsiaTheme="minorEastAsia" w:hAnsi="Cambria Math"/>
+            </w:rPr>
+            <m:t>ancy×</m:t>
           </m:r>
           <m:d>
             <m:dPr>
@@ -15602,7 +16179,13 @@
                 <w:rPr>
                   <w:rFonts w:ascii="Cambria Math" w:eastAsiaTheme="minorEastAsia" w:hAnsi="Cambria Math"/>
                 </w:rPr>
-                <m:t>ground gas node</m:t>
+                <m:t>ground gas n</m:t>
+              </m:r>
+              <m:r>
+                <w:rPr>
+                  <w:rFonts w:ascii="Cambria Math" w:eastAsiaTheme="minorEastAsia" w:hAnsi="Cambria Math"/>
+                </w:rPr>
+                <m:t>ode</m:t>
               </m:r>
             </m:sub>
           </m:sSub>
@@ -15893,7 +16476,16 @@
               <w:rFonts w:ascii="Cambria Math" w:eastAsiaTheme="minorEastAsia" w:hAnsi="Cambria Math"/>
             </w:rPr>
             <w:lastRenderedPageBreak/>
-            <m:t>mXi_flow[i]</m:t>
+            <m:t>mXi_flo</m:t>
+          </m:r>
+          <m:r>
+            <m:rPr>
+              <m:sty m:val="bi"/>
+            </m:rPr>
+            <w:rPr>
+              <w:rFonts w:ascii="Cambria Math" w:eastAsiaTheme="minorEastAsia" w:hAnsi="Cambria Math"/>
+            </w:rPr>
+            <m:t>w[i]</m:t>
           </m:r>
           <m:r>
             <w:rPr>
@@ -16075,7 +16667,13 @@
                     <w:rPr>
                       <w:rFonts w:ascii="Cambria Math" w:eastAsiaTheme="minorEastAsia" w:hAnsi="Cambria Math"/>
                     </w:rPr>
-                    <m:t>fluidPort.m_flow×actualStream(fluidPort.h_outflow)</m:t>
+                    <m:t>flui</m:t>
+                  </m:r>
+                  <m:r>
+                    <w:rPr>
+                      <w:rFonts w:ascii="Cambria Math" w:eastAsiaTheme="minorEastAsia" w:hAnsi="Cambria Math"/>
+                    </w:rPr>
+                    <m:t>dPort.m_flow×actualStream(fluidPort.h_outflow)</m:t>
                   </m:r>
                 </m:e>
               </m:d>
@@ -20836,7 +21434,14 @@
               <w:rFonts w:ascii="Cambria Math" w:hAnsi="Cambria Math"/>
               <w:sz w:val="18"/>
             </w:rPr>
-            <m:t>for i=N+1</m:t>
+            <m:t>f</m:t>
+          </m:r>
+          <m:r>
+            <w:rPr>
+              <w:rFonts w:ascii="Cambria Math" w:hAnsi="Cambria Math"/>
+              <w:sz w:val="18"/>
+            </w:rPr>
+            <m:t>or i=N+1</m:t>
           </m:r>
         </m:oMath>
       </m:oMathPara>
@@ -21429,8 +22034,8 @@
 </file>
 
 <file path=word/numbering.xml><?xml version="1.0" encoding="utf-8"?>
-<w:numbering xmlns:wpc="http://schemas.microsoft.com/office/word/2010/wordprocessingCanvas" xmlns:mc="http://schemas.openxmlformats.org/markup-compatibility/2006" xmlns:o="urn:schemas-microsoft-com:office:office" xmlns:r="http://schemas.openxmlformats.org/officeDocument/2006/relationships" xmlns:m="http://schemas.openxmlformats.org/officeDocument/2006/math" xmlns:v="urn:schemas-microsoft-com:vml" xmlns:wp14="http://schemas.microsoft.com/office/word/2010/wordprocessingDrawing" xmlns:wp="http://schemas.openxmlformats.org/drawingml/2006/wordprocessingDrawing" xmlns:w10="urn:schemas-microsoft-com:office:word" xmlns:w="http://schemas.openxmlformats.org/wordprocessingml/2006/main" xmlns:w14="http://schemas.microsoft.com/office/word/2010/wordml" xmlns:w15="http://schemas.microsoft.com/office/word/2012/wordml" xmlns:wpg="http://schemas.microsoft.com/office/word/2010/wordprocessingGroup" xmlns:wpi="http://schemas.microsoft.com/office/word/2010/wordprocessingInk" xmlns:wne="http://schemas.microsoft.com/office/word/2006/wordml" xmlns:wps="http://schemas.microsoft.com/office/word/2010/wordprocessingShape" mc:Ignorable="w14 w15 wp14">
-  <w:abstractNum w:abstractNumId="0" w15:restartNumberingAfterBreak="0">
+<w:numbering xmlns:wpc="http://schemas.microsoft.com/office/word/2010/wordprocessingCanvas" xmlns:mc="http://schemas.openxmlformats.org/markup-compatibility/2006" xmlns:o="urn:schemas-microsoft-com:office:office" xmlns:r="http://schemas.openxmlformats.org/officeDocument/2006/relationships" xmlns:m="http://schemas.openxmlformats.org/officeDocument/2006/math" xmlns:v="urn:schemas-microsoft-com:vml" xmlns:wp14="http://schemas.microsoft.com/office/word/2010/wordprocessingDrawing" xmlns:wp="http://schemas.openxmlformats.org/drawingml/2006/wordprocessingDrawing" xmlns:w10="urn:schemas-microsoft-com:office:word" xmlns:w="http://schemas.openxmlformats.org/wordprocessingml/2006/main" xmlns:w14="http://schemas.microsoft.com/office/word/2010/wordml" xmlns:wpg="http://schemas.microsoft.com/office/word/2010/wordprocessingGroup" xmlns:wpi="http://schemas.microsoft.com/office/word/2010/wordprocessingInk" xmlns:wne="http://schemas.microsoft.com/office/word/2006/wordml" xmlns:wps="http://schemas.microsoft.com/office/word/2010/wordprocessingShape" mc:Ignorable="w14 wp14">
+  <w:abstractNum w:abstractNumId="0">
     <w:nsid w:val="06D54705"/>
     <w:multiLevelType w:val="hybridMultilevel"/>
     <w:tmpl w:val="82603C3A"/>
@@ -21516,7 +22121,120 @@
       </w:pPr>
     </w:lvl>
   </w:abstractNum>
-  <w:abstractNum w:abstractNumId="1" w15:restartNumberingAfterBreak="0">
+  <w:abstractNum w:abstractNumId="1">
+    <w:nsid w:val="099E2445"/>
+    <w:multiLevelType w:val="hybridMultilevel"/>
+    <w:tmpl w:val="64904D4E"/>
+    <w:lvl w:ilvl="0" w:tplc="0809000B">
+      <w:start w:val="1"/>
+      <w:numFmt w:val="bullet"/>
+      <w:lvlText w:val=""/>
+      <w:lvlJc w:val="left"/>
+      <w:pPr>
+        <w:ind w:left="720" w:hanging="360"/>
+      </w:pPr>
+      <w:rPr>
+        <w:rFonts w:ascii="Wingdings" w:hAnsi="Wingdings" w:hint="default"/>
+      </w:rPr>
+    </w:lvl>
+    <w:lvl w:ilvl="1" w:tplc="08090003" w:tentative="1">
+      <w:start w:val="1"/>
+      <w:numFmt w:val="bullet"/>
+      <w:lvlText w:val="o"/>
+      <w:lvlJc w:val="left"/>
+      <w:pPr>
+        <w:ind w:left="1440" w:hanging="360"/>
+      </w:pPr>
+      <w:rPr>
+        <w:rFonts w:ascii="Courier New" w:hAnsi="Courier New" w:cs="Courier New" w:hint="default"/>
+      </w:rPr>
+    </w:lvl>
+    <w:lvl w:ilvl="2" w:tplc="08090005" w:tentative="1">
+      <w:start w:val="1"/>
+      <w:numFmt w:val="bullet"/>
+      <w:lvlText w:val=""/>
+      <w:lvlJc w:val="left"/>
+      <w:pPr>
+        <w:ind w:left="2160" w:hanging="360"/>
+      </w:pPr>
+      <w:rPr>
+        <w:rFonts w:ascii="Wingdings" w:hAnsi="Wingdings" w:hint="default"/>
+      </w:rPr>
+    </w:lvl>
+    <w:lvl w:ilvl="3" w:tplc="08090001" w:tentative="1">
+      <w:start w:val="1"/>
+      <w:numFmt w:val="bullet"/>
+      <w:lvlText w:val=""/>
+      <w:lvlJc w:val="left"/>
+      <w:pPr>
+        <w:ind w:left="2880" w:hanging="360"/>
+      </w:pPr>
+      <w:rPr>
+        <w:rFonts w:ascii="Symbol" w:hAnsi="Symbol" w:hint="default"/>
+      </w:rPr>
+    </w:lvl>
+    <w:lvl w:ilvl="4" w:tplc="08090003" w:tentative="1">
+      <w:start w:val="1"/>
+      <w:numFmt w:val="bullet"/>
+      <w:lvlText w:val="o"/>
+      <w:lvlJc w:val="left"/>
+      <w:pPr>
+        <w:ind w:left="3600" w:hanging="360"/>
+      </w:pPr>
+      <w:rPr>
+        <w:rFonts w:ascii="Courier New" w:hAnsi="Courier New" w:cs="Courier New" w:hint="default"/>
+      </w:rPr>
+    </w:lvl>
+    <w:lvl w:ilvl="5" w:tplc="08090005" w:tentative="1">
+      <w:start w:val="1"/>
+      <w:numFmt w:val="bullet"/>
+      <w:lvlText w:val=""/>
+      <w:lvlJc w:val="left"/>
+      <w:pPr>
+        <w:ind w:left="4320" w:hanging="360"/>
+      </w:pPr>
+      <w:rPr>
+        <w:rFonts w:ascii="Wingdings" w:hAnsi="Wingdings" w:hint="default"/>
+      </w:rPr>
+    </w:lvl>
+    <w:lvl w:ilvl="6" w:tplc="08090001" w:tentative="1">
+      <w:start w:val="1"/>
+      <w:numFmt w:val="bullet"/>
+      <w:lvlText w:val=""/>
+      <w:lvlJc w:val="left"/>
+      <w:pPr>
+        <w:ind w:left="5040" w:hanging="360"/>
+      </w:pPr>
+      <w:rPr>
+        <w:rFonts w:ascii="Symbol" w:hAnsi="Symbol" w:hint="default"/>
+      </w:rPr>
+    </w:lvl>
+    <w:lvl w:ilvl="7" w:tplc="08090003" w:tentative="1">
+      <w:start w:val="1"/>
+      <w:numFmt w:val="bullet"/>
+      <w:lvlText w:val="o"/>
+      <w:lvlJc w:val="left"/>
+      <w:pPr>
+        <w:ind w:left="5760" w:hanging="360"/>
+      </w:pPr>
+      <w:rPr>
+        <w:rFonts w:ascii="Courier New" w:hAnsi="Courier New" w:cs="Courier New" w:hint="default"/>
+      </w:rPr>
+    </w:lvl>
+    <w:lvl w:ilvl="8" w:tplc="08090005" w:tentative="1">
+      <w:start w:val="1"/>
+      <w:numFmt w:val="bullet"/>
+      <w:lvlText w:val=""/>
+      <w:lvlJc w:val="left"/>
+      <w:pPr>
+        <w:ind w:left="6480" w:hanging="360"/>
+      </w:pPr>
+      <w:rPr>
+        <w:rFonts w:ascii="Wingdings" w:hAnsi="Wingdings" w:hint="default"/>
+      </w:rPr>
+    </w:lvl>
+  </w:abstractNum>
+  <w:abstractNum w:abstractNumId="2">
     <w:nsid w:val="0C276DFE"/>
     <w:multiLevelType w:val="multilevel"/>
     <w:tmpl w:val="08090027"/>
@@ -21615,10 +22333,10 @@
     <w:abstractNumId w:val="0"/>
   </w:num>
   <w:num w:numId="2">
-    <w:abstractNumId w:val="1"/>
+    <w:abstractNumId w:val="2"/>
   </w:num>
   <w:num w:numId="3">
-    <w:abstractNumId w:val="1"/>
+    <w:abstractNumId w:val="2"/>
     <w:lvlOverride w:ilvl="0">
       <w:startOverride w:val="1"/>
     </w:lvlOverride>
@@ -21648,7 +22366,7 @@
     </w:lvlOverride>
   </w:num>
   <w:num w:numId="4">
-    <w:abstractNumId w:val="1"/>
+    <w:abstractNumId w:val="2"/>
     <w:lvlOverride w:ilvl="0">
       <w:startOverride w:val="1"/>
     </w:lvlOverride>
@@ -21678,7 +22396,7 @@
     </w:lvlOverride>
   </w:num>
   <w:num w:numId="5">
-    <w:abstractNumId w:val="1"/>
+    <w:abstractNumId w:val="2"/>
     <w:lvlOverride w:ilvl="0">
       <w:startOverride w:val="1"/>
     </w:lvlOverride>
@@ -21708,7 +22426,7 @@
     </w:lvlOverride>
   </w:num>
   <w:num w:numId="6">
-    <w:abstractNumId w:val="1"/>
+    <w:abstractNumId w:val="2"/>
     <w:lvlOverride w:ilvl="0">
       <w:startOverride w:val="1"/>
     </w:lvlOverride>
@@ -21738,7 +22456,7 @@
     </w:lvlOverride>
   </w:num>
   <w:num w:numId="7">
-    <w:abstractNumId w:val="1"/>
+    <w:abstractNumId w:val="2"/>
     <w:lvlOverride w:ilvl="0">
       <w:startOverride w:val="1"/>
     </w:lvlOverride>
@@ -21768,7 +22486,7 @@
     </w:lvlOverride>
   </w:num>
   <w:num w:numId="8">
-    <w:abstractNumId w:val="1"/>
+    <w:abstractNumId w:val="2"/>
     <w:lvlOverride w:ilvl="0">
       <w:startOverride w:val="1"/>
     </w:lvlOverride>
@@ -21798,7 +22516,7 @@
     </w:lvlOverride>
   </w:num>
   <w:num w:numId="9">
-    <w:abstractNumId w:val="1"/>
+    <w:abstractNumId w:val="2"/>
     <w:lvlOverride w:ilvl="0">
       <w:startOverride w:val="1"/>
     </w:lvlOverride>
@@ -21828,7 +22546,7 @@
     </w:lvlOverride>
   </w:num>
   <w:num w:numId="10">
-    <w:abstractNumId w:val="1"/>
+    <w:abstractNumId w:val="2"/>
     <w:lvlOverride w:ilvl="0">
       <w:startOverride w:val="1"/>
     </w:lvlOverride>
@@ -21858,7 +22576,7 @@
     </w:lvlOverride>
   </w:num>
   <w:num w:numId="11">
-    <w:abstractNumId w:val="1"/>
+    <w:abstractNumId w:val="2"/>
     <w:lvlOverride w:ilvl="0">
       <w:startOverride w:val="1"/>
     </w:lvlOverride>
@@ -21888,7 +22606,7 @@
     </w:lvlOverride>
   </w:num>
   <w:num w:numId="12">
-    <w:abstractNumId w:val="1"/>
+    <w:abstractNumId w:val="2"/>
     <w:lvlOverride w:ilvl="0">
       <w:startOverride w:val="1"/>
     </w:lvlOverride>
@@ -21918,7 +22636,7 @@
     </w:lvlOverride>
   </w:num>
   <w:num w:numId="13">
-    <w:abstractNumId w:val="1"/>
+    <w:abstractNumId w:val="2"/>
     <w:lvlOverride w:ilvl="0">
       <w:startOverride w:val="1"/>
     </w:lvlOverride>
@@ -21948,7 +22666,7 @@
     </w:lvlOverride>
   </w:num>
   <w:num w:numId="14">
-    <w:abstractNumId w:val="1"/>
+    <w:abstractNumId w:val="2"/>
     <w:lvlOverride w:ilvl="0">
       <w:startOverride w:val="1"/>
     </w:lvlOverride>
@@ -21978,7 +22696,7 @@
     </w:lvlOverride>
   </w:num>
   <w:num w:numId="15">
-    <w:abstractNumId w:val="1"/>
+    <w:abstractNumId w:val="2"/>
     <w:lvlOverride w:ilvl="0">
       <w:startOverride w:val="1"/>
     </w:lvlOverride>
@@ -22008,7 +22726,7 @@
     </w:lvlOverride>
   </w:num>
   <w:num w:numId="16">
-    <w:abstractNumId w:val="1"/>
+    <w:abstractNumId w:val="2"/>
     <w:lvlOverride w:ilvl="0">
       <w:startOverride w:val="1"/>
     </w:lvlOverride>
@@ -22038,7 +22756,7 @@
     </w:lvlOverride>
   </w:num>
   <w:num w:numId="17">
-    <w:abstractNumId w:val="1"/>
+    <w:abstractNumId w:val="2"/>
     <w:lvlOverride w:ilvl="0">
       <w:startOverride w:val="1"/>
     </w:lvlOverride>
@@ -22068,7 +22786,7 @@
     </w:lvlOverride>
   </w:num>
   <w:num w:numId="18">
-    <w:abstractNumId w:val="1"/>
+    <w:abstractNumId w:val="2"/>
     <w:lvlOverride w:ilvl="0">
       <w:startOverride w:val="1"/>
     </w:lvlOverride>
@@ -22098,7 +22816,7 @@
     </w:lvlOverride>
   </w:num>
   <w:num w:numId="19">
-    <w:abstractNumId w:val="1"/>
+    <w:abstractNumId w:val="2"/>
     <w:lvlOverride w:ilvl="0">
       <w:startOverride w:val="1"/>
     </w:lvlOverride>
@@ -22128,7 +22846,7 @@
     </w:lvlOverride>
   </w:num>
   <w:num w:numId="20">
-    <w:abstractNumId w:val="1"/>
+    <w:abstractNumId w:val="2"/>
     <w:lvlOverride w:ilvl="0">
       <w:startOverride w:val="1"/>
     </w:lvlOverride>
@@ -22157,11 +22875,74 @@
       <w:startOverride w:val="1"/>
     </w:lvlOverride>
   </w:num>
+  <w:num w:numId="21">
+    <w:abstractNumId w:val="2"/>
+    <w:lvlOverride w:ilvl="0">
+      <w:startOverride w:val="1"/>
+    </w:lvlOverride>
+    <w:lvlOverride w:ilvl="1">
+      <w:startOverride w:val="1"/>
+    </w:lvlOverride>
+    <w:lvlOverride w:ilvl="2">
+      <w:startOverride w:val="1"/>
+    </w:lvlOverride>
+    <w:lvlOverride w:ilvl="3">
+      <w:startOverride w:val="1"/>
+    </w:lvlOverride>
+    <w:lvlOverride w:ilvl="4">
+      <w:startOverride w:val="1"/>
+    </w:lvlOverride>
+    <w:lvlOverride w:ilvl="5">
+      <w:startOverride w:val="1"/>
+    </w:lvlOverride>
+    <w:lvlOverride w:ilvl="6">
+      <w:startOverride w:val="1"/>
+    </w:lvlOverride>
+    <w:lvlOverride w:ilvl="7">
+      <w:startOverride w:val="1"/>
+    </w:lvlOverride>
+    <w:lvlOverride w:ilvl="8">
+      <w:startOverride w:val="1"/>
+    </w:lvlOverride>
+  </w:num>
+  <w:num w:numId="22">
+    <w:abstractNumId w:val="2"/>
+    <w:lvlOverride w:ilvl="0">
+      <w:startOverride w:val="1"/>
+    </w:lvlOverride>
+    <w:lvlOverride w:ilvl="1">
+      <w:startOverride w:val="1"/>
+    </w:lvlOverride>
+    <w:lvlOverride w:ilvl="2">
+      <w:startOverride w:val="1"/>
+    </w:lvlOverride>
+    <w:lvlOverride w:ilvl="3">
+      <w:startOverride w:val="1"/>
+    </w:lvlOverride>
+    <w:lvlOverride w:ilvl="4">
+      <w:startOverride w:val="1"/>
+    </w:lvlOverride>
+    <w:lvlOverride w:ilvl="5">
+      <w:startOverride w:val="1"/>
+    </w:lvlOverride>
+    <w:lvlOverride w:ilvl="6">
+      <w:startOverride w:val="1"/>
+    </w:lvlOverride>
+    <w:lvlOverride w:ilvl="7">
+      <w:startOverride w:val="1"/>
+    </w:lvlOverride>
+    <w:lvlOverride w:ilvl="8">
+      <w:startOverride w:val="1"/>
+    </w:lvlOverride>
+  </w:num>
+  <w:num w:numId="23">
+    <w:abstractNumId w:val="1"/>
+  </w:num>
 </w:numbering>
 </file>
 
 <file path=word/styles.xml><?xml version="1.0" encoding="utf-8"?>
-<w:styles xmlns:mc="http://schemas.openxmlformats.org/markup-compatibility/2006" xmlns:r="http://schemas.openxmlformats.org/officeDocument/2006/relationships" xmlns:w="http://schemas.openxmlformats.org/wordprocessingml/2006/main" xmlns:w14="http://schemas.microsoft.com/office/word/2010/wordml" xmlns:w15="http://schemas.microsoft.com/office/word/2012/wordml" mc:Ignorable="w14 w15">
+<w:styles xmlns:mc="http://schemas.openxmlformats.org/markup-compatibility/2006" xmlns:r="http://schemas.openxmlformats.org/officeDocument/2006/relationships" xmlns:w="http://schemas.openxmlformats.org/wordprocessingml/2006/main" xmlns:w14="http://schemas.microsoft.com/office/word/2010/wordml" mc:Ignorable="w14">
   <w:docDefaults>
     <w:rPrDefault>
       <w:rPr>
@@ -22177,378 +22958,144 @@
       </w:pPr>
     </w:pPrDefault>
   </w:docDefaults>
-  <w:latentStyles w:defLockedState="0" w:defUIPriority="99" w:defSemiHidden="0" w:defUnhideWhenUsed="0" w:defQFormat="0" w:count="371">
-    <w:lsdException w:name="Normal" w:uiPriority="0" w:qFormat="1"/>
-    <w:lsdException w:name="heading 1" w:uiPriority="9" w:qFormat="1"/>
-    <w:lsdException w:name="heading 2" w:semiHidden="1" w:uiPriority="9" w:unhideWhenUsed="1" w:qFormat="1"/>
-    <w:lsdException w:name="heading 3" w:semiHidden="1" w:uiPriority="9" w:unhideWhenUsed="1" w:qFormat="1"/>
-    <w:lsdException w:name="heading 4" w:semiHidden="1" w:uiPriority="9" w:unhideWhenUsed="1" w:qFormat="1"/>
-    <w:lsdException w:name="heading 5" w:semiHidden="1" w:uiPriority="9" w:unhideWhenUsed="1" w:qFormat="1"/>
-    <w:lsdException w:name="heading 6" w:semiHidden="1" w:uiPriority="9" w:unhideWhenUsed="1" w:qFormat="1"/>
-    <w:lsdException w:name="heading 7" w:semiHidden="1" w:uiPriority="9" w:unhideWhenUsed="1" w:qFormat="1"/>
-    <w:lsdException w:name="heading 8" w:semiHidden="1" w:uiPriority="9" w:unhideWhenUsed="1" w:qFormat="1"/>
-    <w:lsdException w:name="heading 9" w:semiHidden="1" w:uiPriority="9" w:unhideWhenUsed="1" w:qFormat="1"/>
-    <w:lsdException w:name="index 1" w:semiHidden="1" w:unhideWhenUsed="1"/>
-    <w:lsdException w:name="index 2" w:semiHidden="1" w:unhideWhenUsed="1"/>
-    <w:lsdException w:name="index 3" w:semiHidden="1" w:unhideWhenUsed="1"/>
-    <w:lsdException w:name="index 4" w:semiHidden="1" w:unhideWhenUsed="1"/>
-    <w:lsdException w:name="index 5" w:semiHidden="1" w:unhideWhenUsed="1"/>
-    <w:lsdException w:name="index 6" w:semiHidden="1" w:unhideWhenUsed="1"/>
-    <w:lsdException w:name="index 7" w:semiHidden="1" w:unhideWhenUsed="1"/>
-    <w:lsdException w:name="index 8" w:semiHidden="1" w:unhideWhenUsed="1"/>
-    <w:lsdException w:name="index 9" w:semiHidden="1" w:unhideWhenUsed="1"/>
-    <w:lsdException w:name="toc 1" w:semiHidden="1" w:uiPriority="39" w:unhideWhenUsed="1"/>
-    <w:lsdException w:name="toc 2" w:semiHidden="1" w:uiPriority="39" w:unhideWhenUsed="1"/>
-    <w:lsdException w:name="toc 3" w:semiHidden="1" w:uiPriority="39" w:unhideWhenUsed="1"/>
-    <w:lsdException w:name="toc 4" w:semiHidden="1" w:uiPriority="39" w:unhideWhenUsed="1"/>
-    <w:lsdException w:name="toc 5" w:semiHidden="1" w:uiPriority="39" w:unhideWhenUsed="1"/>
-    <w:lsdException w:name="toc 6" w:semiHidden="1" w:uiPriority="39" w:unhideWhenUsed="1"/>
-    <w:lsdException w:name="toc 7" w:semiHidden="1" w:uiPriority="39" w:unhideWhenUsed="1"/>
-    <w:lsdException w:name="toc 8" w:semiHidden="1" w:uiPriority="39" w:unhideWhenUsed="1"/>
-    <w:lsdException w:name="toc 9" w:semiHidden="1" w:uiPriority="39" w:unhideWhenUsed="1"/>
-    <w:lsdException w:name="Normal Indent" w:semiHidden="1" w:unhideWhenUsed="1"/>
-    <w:lsdException w:name="footnote text" w:semiHidden="1" w:unhideWhenUsed="1"/>
-    <w:lsdException w:name="annotation text" w:semiHidden="1" w:unhideWhenUsed="1"/>
-    <w:lsdException w:name="header" w:semiHidden="1" w:unhideWhenUsed="1"/>
-    <w:lsdException w:name="footer" w:semiHidden="1" w:unhideWhenUsed="1"/>
-    <w:lsdException w:name="index heading" w:semiHidden="1" w:unhideWhenUsed="1"/>
-    <w:lsdException w:name="caption" w:semiHidden="1" w:uiPriority="35" w:unhideWhenUsed="1" w:qFormat="1"/>
-    <w:lsdException w:name="table of figures" w:semiHidden="1" w:unhideWhenUsed="1"/>
-    <w:lsdException w:name="envelope address" w:semiHidden="1" w:unhideWhenUsed="1"/>
-    <w:lsdException w:name="envelope return" w:semiHidden="1" w:unhideWhenUsed="1"/>
-    <w:lsdException w:name="footnote reference" w:semiHidden="1" w:unhideWhenUsed="1"/>
-    <w:lsdException w:name="annotation reference" w:semiHidden="1" w:unhideWhenUsed="1"/>
-    <w:lsdException w:name="line number" w:semiHidden="1" w:unhideWhenUsed="1"/>
-    <w:lsdException w:name="page number" w:semiHidden="1" w:unhideWhenUsed="1"/>
-    <w:lsdException w:name="endnote reference" w:semiHidden="1" w:unhideWhenUsed="1"/>
-    <w:lsdException w:name="endnote text" w:semiHidden="1" w:unhideWhenUsed="1"/>
-    <w:lsdException w:name="table of authorities" w:semiHidden="1" w:unhideWhenUsed="1"/>
-    <w:lsdException w:name="macro" w:semiHidden="1" w:unhideWhenUsed="1"/>
-    <w:lsdException w:name="toa heading" w:semiHidden="1" w:unhideWhenUsed="1"/>
-    <w:lsdException w:name="List" w:semiHidden="1" w:unhideWhenUsed="1"/>
-    <w:lsdException w:name="List Bullet" w:semiHidden="1" w:unhideWhenUsed="1"/>
-    <w:lsdException w:name="List Number" w:semiHidden="1" w:unhideWhenUsed="1"/>
-    <w:lsdException w:name="List 2" w:semiHidden="1" w:unhideWhenUsed="1"/>
-    <w:lsdException w:name="List 3" w:semiHidden="1" w:unhideWhenUsed="1"/>
-    <w:lsdException w:name="List 4" w:semiHidden="1" w:unhideWhenUsed="1"/>
-    <w:lsdException w:name="List 5" w:semiHidden="1" w:unhideWhenUsed="1"/>
-    <w:lsdException w:name="List Bullet 2" w:semiHidden="1" w:unhideWhenUsed="1"/>
-    <w:lsdException w:name="List Bullet 3" w:semiHidden="1" w:unhideWhenUsed="1"/>
-    <w:lsdException w:name="List Bullet 4" w:semiHidden="1" w:unhideWhenUsed="1"/>
-    <w:lsdException w:name="List Bullet 5" w:semiHidden="1" w:unhideWhenUsed="1"/>
-    <w:lsdException w:name="List Number 2" w:semiHidden="1" w:unhideWhenUsed="1"/>
-    <w:lsdException w:name="List Number 3" w:semiHidden="1" w:unhideWhenUsed="1"/>
-    <w:lsdException w:name="List Number 4" w:semiHidden="1" w:unhideWhenUsed="1"/>
-    <w:lsdException w:name="List Number 5" w:semiHidden="1" w:unhideWhenUsed="1"/>
-    <w:lsdException w:name="Title" w:uiPriority="10" w:qFormat="1"/>
-    <w:lsdException w:name="Closing" w:semiHidden="1" w:unhideWhenUsed="1"/>
-    <w:lsdException w:name="Signature" w:semiHidden="1" w:unhideWhenUsed="1"/>
-    <w:lsdException w:name="Default Paragraph Font" w:semiHidden="1" w:uiPriority="1" w:unhideWhenUsed="1"/>
-    <w:lsdException w:name="Body Text" w:semiHidden="1" w:unhideWhenUsed="1"/>
-    <w:lsdException w:name="Body Text Indent" w:semiHidden="1" w:unhideWhenUsed="1"/>
-    <w:lsdException w:name="List Continue" w:semiHidden="1" w:unhideWhenUsed="1"/>
-    <w:lsdException w:name="List Continue 2" w:semiHidden="1" w:unhideWhenUsed="1"/>
-    <w:lsdException w:name="List Continue 3" w:semiHidden="1" w:unhideWhenUsed="1"/>
-    <w:lsdException w:name="List Continue 4" w:semiHidden="1" w:unhideWhenUsed="1"/>
-    <w:lsdException w:name="List Continue 5" w:semiHidden="1" w:unhideWhenUsed="1"/>
-    <w:lsdException w:name="Message Header" w:semiHidden="1" w:unhideWhenUsed="1"/>
-    <w:lsdException w:name="Subtitle" w:uiPriority="11" w:qFormat="1"/>
-    <w:lsdException w:name="Salutation" w:semiHidden="1" w:unhideWhenUsed="1"/>
-    <w:lsdException w:name="Date" w:semiHidden="1" w:unhideWhenUsed="1"/>
-    <w:lsdException w:name="Body Text First Indent" w:semiHidden="1" w:unhideWhenUsed="1"/>
-    <w:lsdException w:name="Body Text First Indent 2" w:semiHidden="1" w:unhideWhenUsed="1"/>
-    <w:lsdException w:name="Note Heading" w:semiHidden="1" w:unhideWhenUsed="1"/>
-    <w:lsdException w:name="Body Text 2" w:semiHidden="1" w:unhideWhenUsed="1"/>
-    <w:lsdException w:name="Body Text 3" w:semiHidden="1" w:unhideWhenUsed="1"/>
-    <w:lsdException w:name="Body Text Indent 2" w:semiHidden="1" w:unhideWhenUsed="1"/>
-    <w:lsdException w:name="Body Text Indent 3" w:semiHidden="1" w:unhideWhenUsed="1"/>
-    <w:lsdException w:name="Block Text" w:semiHidden="1" w:unhideWhenUsed="1"/>
-    <w:lsdException w:name="Hyperlink" w:semiHidden="1" w:unhideWhenUsed="1"/>
-    <w:lsdException w:name="FollowedHyperlink" w:semiHidden="1" w:unhideWhenUsed="1"/>
-    <w:lsdException w:name="Strong" w:uiPriority="22" w:qFormat="1"/>
-    <w:lsdException w:name="Emphasis" w:uiPriority="20" w:qFormat="1"/>
-    <w:lsdException w:name="Document Map" w:semiHidden="1" w:unhideWhenUsed="1"/>
-    <w:lsdException w:name="Plain Text" w:semiHidden="1" w:unhideWhenUsed="1"/>
-    <w:lsdException w:name="E-mail Signature" w:semiHidden="1" w:unhideWhenUsed="1"/>
-    <w:lsdException w:name="HTML Top of Form" w:semiHidden="1" w:unhideWhenUsed="1"/>
-    <w:lsdException w:name="HTML Bottom of Form" w:semiHidden="1" w:unhideWhenUsed="1"/>
-    <w:lsdException w:name="Normal (Web)" w:semiHidden="1" w:unhideWhenUsed="1"/>
-    <w:lsdException w:name="HTML Acronym" w:semiHidden="1" w:unhideWhenUsed="1"/>
-    <w:lsdException w:name="HTML Address" w:semiHidden="1" w:unhideWhenUsed="1"/>
-    <w:lsdException w:name="HTML Cite" w:semiHidden="1" w:unhideWhenUsed="1"/>
-    <w:lsdException w:name="HTML Code" w:semiHidden="1" w:unhideWhenUsed="1"/>
-    <w:lsdException w:name="HTML Definition" w:semiHidden="1" w:unhideWhenUsed="1"/>
-    <w:lsdException w:name="HTML Keyboard" w:semiHidden="1" w:unhideWhenUsed="1"/>
-    <w:lsdException w:name="HTML Preformatted" w:semiHidden="1" w:unhideWhenUsed="1"/>
-    <w:lsdException w:name="HTML Sample" w:semiHidden="1" w:unhideWhenUsed="1"/>
-    <w:lsdException w:name="HTML Typewriter" w:semiHidden="1" w:unhideWhenUsed="1"/>
-    <w:lsdException w:name="HTML Variable" w:semiHidden="1" w:unhideWhenUsed="1"/>
-    <w:lsdException w:name="Normal Table" w:semiHidden="1" w:unhideWhenUsed="1"/>
-    <w:lsdException w:name="annotation subject" w:semiHidden="1" w:unhideWhenUsed="1"/>
-    <w:lsdException w:name="No List" w:semiHidden="1" w:unhideWhenUsed="1"/>
-    <w:lsdException w:name="Outline List 1" w:semiHidden="1" w:unhideWhenUsed="1"/>
-    <w:lsdException w:name="Outline List 2" w:semiHidden="1" w:unhideWhenUsed="1"/>
-    <w:lsdException w:name="Outline List 3" w:semiHidden="1" w:unhideWhenUsed="1"/>
-    <w:lsdException w:name="Table Simple 1" w:semiHidden="1" w:unhideWhenUsed="1"/>
-    <w:lsdException w:name="Table Simple 2" w:semiHidden="1" w:unhideWhenUsed="1"/>
-    <w:lsdException w:name="Table Simple 3" w:semiHidden="1" w:unhideWhenUsed="1"/>
-    <w:lsdException w:name="Table Classic 1" w:semiHidden="1" w:unhideWhenUsed="1"/>
-    <w:lsdException w:name="Table Classic 2" w:semiHidden="1" w:unhideWhenUsed="1"/>
-    <w:lsdException w:name="Table Classic 3" w:semiHidden="1" w:unhideWhenUsed="1"/>
-    <w:lsdException w:name="Table Classic 4" w:semiHidden="1" w:unhideWhenUsed="1"/>
-    <w:lsdException w:name="Table Colorful 1" w:semiHidden="1" w:unhideWhenUsed="1"/>
-    <w:lsdException w:name="Table Colorful 2" w:semiHidden="1" w:unhideWhenUsed="1"/>
-    <w:lsdException w:name="Table Colorful 3" w:semiHidden="1" w:unhideWhenUsed="1"/>
-    <w:lsdException w:name="Table Columns 1" w:semiHidden="1" w:unhideWhenUsed="1"/>
-    <w:lsdException w:name="Table Columns 2" w:semiHidden="1" w:unhideWhenUsed="1"/>
-    <w:lsdException w:name="Table Columns 3" w:semiHidden="1" w:unhideWhenUsed="1"/>
-    <w:lsdException w:name="Table Columns 4" w:semiHidden="1" w:unhideWhenUsed="1"/>
-    <w:lsdException w:name="Table Columns 5" w:semiHidden="1" w:unhideWhenUsed="1"/>
-    <w:lsdException w:name="Table Grid 1" w:semiHidden="1" w:unhideWhenUsed="1"/>
-    <w:lsdException w:name="Table Grid 2" w:semiHidden="1" w:unhideWhenUsed="1"/>
-    <w:lsdException w:name="Table Grid 3" w:semiHidden="1" w:unhideWhenUsed="1"/>
-    <w:lsdException w:name="Table Grid 4" w:semiHidden="1" w:unhideWhenUsed="1"/>
-    <w:lsdException w:name="Table Grid 5" w:semiHidden="1" w:unhideWhenUsed="1"/>
-    <w:lsdException w:name="Table Grid 6" w:semiHidden="1" w:unhideWhenUsed="1"/>
-    <w:lsdException w:name="Table Grid 7" w:semiHidden="1" w:unhideWhenUsed="1"/>
-    <w:lsdException w:name="Table Grid 8" w:semiHidden="1" w:unhideWhenUsed="1"/>
-    <w:lsdException w:name="Table List 1" w:semiHidden="1" w:unhideWhenUsed="1"/>
-    <w:lsdException w:name="Table List 2" w:semiHidden="1" w:unhideWhenUsed="1"/>
-    <w:lsdException w:name="Table List 3" w:semiHidden="1" w:unhideWhenUsed="1"/>
-    <w:lsdException w:name="Table List 4" w:semiHidden="1" w:unhideWhenUsed="1"/>
-    <w:lsdException w:name="Table List 5" w:semiHidden="1" w:unhideWhenUsed="1"/>
-    <w:lsdException w:name="Table List 6" w:semiHidden="1" w:unhideWhenUsed="1"/>
-    <w:lsdException w:name="Table List 7" w:semiHidden="1" w:unhideWhenUsed="1"/>
-    <w:lsdException w:name="Table List 8" w:semiHidden="1" w:unhideWhenUsed="1"/>
-    <w:lsdException w:name="Table 3D effects 1" w:semiHidden="1" w:unhideWhenUsed="1"/>
-    <w:lsdException w:name="Table 3D effects 2" w:semiHidden="1" w:unhideWhenUsed="1"/>
-    <w:lsdException w:name="Table 3D effects 3" w:semiHidden="1" w:unhideWhenUsed="1"/>
-    <w:lsdException w:name="Table Contemporary" w:semiHidden="1" w:unhideWhenUsed="1"/>
-    <w:lsdException w:name="Table Elegant" w:semiHidden="1" w:unhideWhenUsed="1"/>
-    <w:lsdException w:name="Table Professional" w:semiHidden="1" w:unhideWhenUsed="1"/>
-    <w:lsdException w:name="Table Subtle 1" w:semiHidden="1" w:unhideWhenUsed="1"/>
-    <w:lsdException w:name="Table Subtle 2" w:semiHidden="1" w:unhideWhenUsed="1"/>
-    <w:lsdException w:name="Table Web 1" w:semiHidden="1" w:unhideWhenUsed="1"/>
-    <w:lsdException w:name="Table Web 2" w:semiHidden="1" w:unhideWhenUsed="1"/>
-    <w:lsdException w:name="Table Web 3" w:semiHidden="1" w:unhideWhenUsed="1"/>
-    <w:lsdException w:name="Balloon Text" w:semiHidden="1" w:unhideWhenUsed="1"/>
-    <w:lsdException w:name="Table Grid" w:uiPriority="39"/>
-    <w:lsdException w:name="Table Theme" w:semiHidden="1" w:unhideWhenUsed="1"/>
-    <w:lsdException w:name="Placeholder Text" w:semiHidden="1"/>
-    <w:lsdException w:name="No Spacing" w:uiPriority="1" w:qFormat="1"/>
-    <w:lsdException w:name="Light Shading" w:uiPriority="60"/>
-    <w:lsdException w:name="Light List" w:uiPriority="61"/>
-    <w:lsdException w:name="Light Grid" w:uiPriority="62"/>
-    <w:lsdException w:name="Medium Shading 1" w:uiPriority="63"/>
-    <w:lsdException w:name="Medium Shading 2" w:uiPriority="64"/>
-    <w:lsdException w:name="Medium List 1" w:uiPriority="65"/>
-    <w:lsdException w:name="Medium List 2" w:uiPriority="66"/>
-    <w:lsdException w:name="Medium Grid 1" w:uiPriority="67"/>
-    <w:lsdException w:name="Medium Grid 2" w:uiPriority="68"/>
-    <w:lsdException w:name="Medium Grid 3" w:uiPriority="69"/>
-    <w:lsdException w:name="Dark List" w:uiPriority="70"/>
-    <w:lsdException w:name="Colorful Shading" w:uiPriority="71"/>
-    <w:lsdException w:name="Colorful List" w:uiPriority="72"/>
-    <w:lsdException w:name="Colorful Grid" w:uiPriority="73"/>
-    <w:lsdException w:name="Light Shading Accent 1" w:uiPriority="60"/>
-    <w:lsdException w:name="Light List Accent 1" w:uiPriority="61"/>
-    <w:lsdException w:name="Light Grid Accent 1" w:uiPriority="62"/>
-    <w:lsdException w:name="Medium Shading 1 Accent 1" w:uiPriority="63"/>
-    <w:lsdException w:name="Medium Shading 2 Accent 1" w:uiPriority="64"/>
-    <w:lsdException w:name="Medium List 1 Accent 1" w:uiPriority="65"/>
-    <w:lsdException w:name="Revision" w:semiHidden="1"/>
-    <w:lsdException w:name="List Paragraph" w:uiPriority="34" w:qFormat="1"/>
-    <w:lsdException w:name="Quote" w:uiPriority="29" w:qFormat="1"/>
-    <w:lsdException w:name="Intense Quote" w:uiPriority="30" w:qFormat="1"/>
-    <w:lsdException w:name="Medium List 2 Accent 1" w:uiPriority="66"/>
-    <w:lsdException w:name="Medium Grid 1 Accent 1" w:uiPriority="67"/>
-    <w:lsdException w:name="Medium Grid 2 Accent 1" w:uiPriority="68"/>
-    <w:lsdException w:name="Medium Grid 3 Accent 1" w:uiPriority="69"/>
-    <w:lsdException w:name="Dark List Accent 1" w:uiPriority="70"/>
-    <w:lsdException w:name="Colorful Shading Accent 1" w:uiPriority="71"/>
-    <w:lsdException w:name="Colorful List Accent 1" w:uiPriority="72"/>
-    <w:lsdException w:name="Colorful Grid Accent 1" w:uiPriority="73"/>
-    <w:lsdException w:name="Light Shading Accent 2" w:uiPriority="60"/>
-    <w:lsdException w:name="Light List Accent 2" w:uiPriority="61"/>
-    <w:lsdException w:name="Light Grid Accent 2" w:uiPriority="62"/>
-    <w:lsdException w:name="Medium Shading 1 Accent 2" w:uiPriority="63"/>
-    <w:lsdException w:name="Medium Shading 2 Accent 2" w:uiPriority="64"/>
-    <w:lsdException w:name="Medium List 1 Accent 2" w:uiPriority="65"/>
-    <w:lsdException w:name="Medium List 2 Accent 2" w:uiPriority="66"/>
-    <w:lsdException w:name="Medium Grid 1 Accent 2" w:uiPriority="67"/>
-    <w:lsdException w:name="Medium Grid 2 Accent 2" w:uiPriority="68"/>
-    <w:lsdException w:name="Medium Grid 3 Accent 2" w:uiPriority="69"/>
-    <w:lsdException w:name="Dark List Accent 2" w:uiPriority="70"/>
-    <w:lsdException w:name="Colorful Shading Accent 2" w:uiPriority="71"/>
-    <w:lsdException w:name="Colorful List Accent 2" w:uiPriority="72"/>
-    <w:lsdException w:name="Colorful Grid Accent 2" w:uiPriority="73"/>
-    <w:lsdException w:name="Light Shading Accent 3" w:uiPriority="60"/>
-    <w:lsdException w:name="Light List Accent 3" w:uiPriority="61"/>
-    <w:lsdException w:name="Light Grid Accent 3" w:uiPriority="62"/>
-    <w:lsdException w:name="Medium Shading 1 Accent 3" w:uiPriority="63"/>
-    <w:lsdException w:name="Medium Shading 2 Accent 3" w:uiPriority="64"/>
-    <w:lsdException w:name="Medium List 1 Accent 3" w:uiPriority="65"/>
-    <w:lsdException w:name="Medium List 2 Accent 3" w:uiPriority="66"/>
-    <w:lsdException w:name="Medium Grid 1 Accent 3" w:uiPriority="67"/>
-    <w:lsdException w:name="Medium Grid 2 Accent 3" w:uiPriority="68"/>
-    <w:lsdException w:name="Medium Grid 3 Accent 3" w:uiPriority="69"/>
-    <w:lsdException w:name="Dark List Accent 3" w:uiPriority="70"/>
-    <w:lsdException w:name="Colorful Shading Accent 3" w:uiPriority="71"/>
-    <w:lsdException w:name="Colorful List Accent 3" w:uiPriority="72"/>
-    <w:lsdException w:name="Colorful Grid Accent 3" w:uiPriority="73"/>
-    <w:lsdException w:name="Light Shading Accent 4" w:uiPriority="60"/>
-    <w:lsdException w:name="Light List Accent 4" w:uiPriority="61"/>
-    <w:lsdException w:name="Light Grid Accent 4" w:uiPriority="62"/>
-    <w:lsdException w:name="Medium Shading 1 Accent 4" w:uiPriority="63"/>
-    <w:lsdException w:name="Medium Shading 2 Accent 4" w:uiPriority="64"/>
-    <w:lsdException w:name="Medium List 1 Accent 4" w:uiPriority="65"/>
-    <w:lsdException w:name="Medium List 2 Accent 4" w:uiPriority="66"/>
-    <w:lsdException w:name="Medium Grid 1 Accent 4" w:uiPriority="67"/>
-    <w:lsdException w:name="Medium Grid 2 Accent 4" w:uiPriority="68"/>
-    <w:lsdException w:name="Medium Grid 3 Accent 4" w:uiPriority="69"/>
-    <w:lsdException w:name="Dark List Accent 4" w:uiPriority="70"/>
-    <w:lsdException w:name="Colorful Shading Accent 4" w:uiPriority="71"/>
-    <w:lsdException w:name="Colorful List Accent 4" w:uiPriority="72"/>
-    <w:lsdException w:name="Colorful Grid Accent 4" w:uiPriority="73"/>
-    <w:lsdException w:name="Light Shading Accent 5" w:uiPriority="60"/>
-    <w:lsdException w:name="Light List Accent 5" w:uiPriority="61"/>
-    <w:lsdException w:name="Light Grid Accent 5" w:uiPriority="62"/>
-    <w:lsdException w:name="Medium Shading 1 Accent 5" w:uiPriority="63"/>
-    <w:lsdException w:name="Medium Shading 2 Accent 5" w:uiPriority="64"/>
-    <w:lsdException w:name="Medium List 1 Accent 5" w:uiPriority="65"/>
-    <w:lsdException w:name="Medium List 2 Accent 5" w:uiPriority="66"/>
-    <w:lsdException w:name="Medium Grid 1 Accent 5" w:uiPriority="67"/>
-    <w:lsdException w:name="Medium Grid 2 Accent 5" w:uiPriority="68"/>
-    <w:lsdException w:name="Medium Grid 3 Accent 5" w:uiPriority="69"/>
-    <w:lsdException w:name="Dark List Accent 5" w:uiPriority="70"/>
-    <w:lsdException w:name="Colorful Shading Accent 5" w:uiPriority="71"/>
-    <w:lsdException w:name="Colorful List Accent 5" w:uiPriority="72"/>
-    <w:lsdException w:name="Colorful Grid Accent 5" w:uiPriority="73"/>
-    <w:lsdException w:name="Light Shading Accent 6" w:uiPriority="60"/>
-    <w:lsdException w:name="Light List Accent 6" w:uiPriority="61"/>
-    <w:lsdException w:name="Light Grid Accent 6" w:uiPriority="62"/>
-    <w:lsdException w:name="Medium Shading 1 Accent 6" w:uiPriority="63"/>
-    <w:lsdException w:name="Medium Shading 2 Accent 6" w:uiPriority="64"/>
-    <w:lsdException w:name="Medium List 1 Accent 6" w:uiPriority="65"/>
-    <w:lsdException w:name="Medium List 2 Accent 6" w:uiPriority="66"/>
-    <w:lsdException w:name="Medium Grid 1 Accent 6" w:uiPriority="67"/>
-    <w:lsdException w:name="Medium Grid 2 Accent 6" w:uiPriority="68"/>
-    <w:lsdException w:name="Medium Grid 3 Accent 6" w:uiPriority="69"/>
-    <w:lsdException w:name="Dark List Accent 6" w:uiPriority="70"/>
-    <w:lsdException w:name="Colorful Shading Accent 6" w:uiPriority="71"/>
-    <w:lsdException w:name="Colorful List Accent 6" w:uiPriority="72"/>
-    <w:lsdException w:name="Colorful Grid Accent 6" w:uiPriority="73"/>
-    <w:lsdException w:name="Subtle Emphasis" w:uiPriority="19" w:qFormat="1"/>
-    <w:lsdException w:name="Intense Emphasis" w:uiPriority="21" w:qFormat="1"/>
-    <w:lsdException w:name="Subtle Reference" w:uiPriority="31" w:qFormat="1"/>
-    <w:lsdException w:name="Intense Reference" w:uiPriority="32" w:qFormat="1"/>
-    <w:lsdException w:name="Book Title" w:uiPriority="33" w:qFormat="1"/>
-    <w:lsdException w:name="Bibliography" w:semiHidden="1" w:uiPriority="37" w:unhideWhenUsed="1"/>
-    <w:lsdException w:name="TOC Heading" w:semiHidden="1" w:uiPriority="39" w:unhideWhenUsed="1" w:qFormat="1"/>
-    <w:lsdException w:name="Plain Table 1" w:uiPriority="41"/>
-    <w:lsdException w:name="Plain Table 2" w:uiPriority="42"/>
-    <w:lsdException w:name="Plain Table 3" w:uiPriority="43"/>
-    <w:lsdException w:name="Plain Table 4" w:uiPriority="44"/>
-    <w:lsdException w:name="Plain Table 5" w:uiPriority="45"/>
-    <w:lsdException w:name="Grid Table Light" w:uiPriority="40"/>
-    <w:lsdException w:name="Grid Table 1 Light" w:uiPriority="46"/>
-    <w:lsdException w:name="Grid Table 2" w:uiPriority="47"/>
-    <w:lsdException w:name="Grid Table 3" w:uiPriority="48"/>
-    <w:lsdException w:name="Grid Table 4" w:uiPriority="49"/>
-    <w:lsdException w:name="Grid Table 5 Dark" w:uiPriority="50"/>
-    <w:lsdException w:name="Grid Table 6 Colorful" w:uiPriority="51"/>
-    <w:lsdException w:name="Grid Table 7 Colorful" w:uiPriority="52"/>
-    <w:lsdException w:name="Grid Table 1 Light Accent 1" w:uiPriority="46"/>
-    <w:lsdException w:name="Grid Table 2 Accent 1" w:uiPriority="47"/>
-    <w:lsdException w:name="Grid Table 3 Accent 1" w:uiPriority="48"/>
-    <w:lsdException w:name="Grid Table 4 Accent 1" w:uiPriority="49"/>
-    <w:lsdException w:name="Grid Table 5 Dark Accent 1" w:uiPriority="50"/>
-    <w:lsdException w:name="Grid Table 6 Colorful Accent 1" w:uiPriority="51"/>
-    <w:lsdException w:name="Grid Table 7 Colorful Accent 1" w:uiPriority="52"/>
-    <w:lsdException w:name="Grid Table 1 Light Accent 2" w:uiPriority="46"/>
-    <w:lsdException w:name="Grid Table 2 Accent 2" w:uiPriority="47"/>
-    <w:lsdException w:name="Grid Table 3 Accent 2" w:uiPriority="48"/>
-    <w:lsdException w:name="Grid Table 4 Accent 2" w:uiPriority="49"/>
-    <w:lsdException w:name="Grid Table 5 Dark Accent 2" w:uiPriority="50"/>
-    <w:lsdException w:name="Grid Table 6 Colorful Accent 2" w:uiPriority="51"/>
-    <w:lsdException w:name="Grid Table 7 Colorful Accent 2" w:uiPriority="52"/>
-    <w:lsdException w:name="Grid Table 1 Light Accent 3" w:uiPriority="46"/>
-    <w:lsdException w:name="Grid Table 2 Accent 3" w:uiPriority="47"/>
-    <w:lsdException w:name="Grid Table 3 Accent 3" w:uiPriority="48"/>
-    <w:lsdException w:name="Grid Table 4 Accent 3" w:uiPriority="49"/>
-    <w:lsdException w:name="Grid Table 5 Dark Accent 3" w:uiPriority="50"/>
-    <w:lsdException w:name="Grid Table 6 Colorful Accent 3" w:uiPriority="51"/>
-    <w:lsdException w:name="Grid Table 7 Colorful Accent 3" w:uiPriority="52"/>
-    <w:lsdException w:name="Grid Table 1 Light Accent 4" w:uiPriority="46"/>
-    <w:lsdException w:name="Grid Table 2 Accent 4" w:uiPriority="47"/>
-    <w:lsdException w:name="Grid Table 3 Accent 4" w:uiPriority="48"/>
-    <w:lsdException w:name="Grid Table 4 Accent 4" w:uiPriority="49"/>
-    <w:lsdException w:name="Grid Table 5 Dark Accent 4" w:uiPriority="50"/>
-    <w:lsdException w:name="Grid Table 6 Colorful Accent 4" w:uiPriority="51"/>
-    <w:lsdException w:name="Grid Table 7 Colorful Accent 4" w:uiPriority="52"/>
-    <w:lsdException w:name="Grid Table 1 Light Accent 5" w:uiPriority="46"/>
-    <w:lsdException w:name="Grid Table 2 Accent 5" w:uiPriority="47"/>
-    <w:lsdException w:name="Grid Table 3 Accent 5" w:uiPriority="48"/>
-    <w:lsdException w:name="Grid Table 4 Accent 5" w:uiPriority="49"/>
-    <w:lsdException w:name="Grid Table 5 Dark Accent 5" w:uiPriority="50"/>
-    <w:lsdException w:name="Grid Table 6 Colorful Accent 5" w:uiPriority="51"/>
-    <w:lsdException w:name="Grid Table 7 Colorful Accent 5" w:uiPriority="52"/>
-    <w:lsdException w:name="Grid Table 1 Light Accent 6" w:uiPriority="46"/>
-    <w:lsdException w:name="Grid Table 2 Accent 6" w:uiPriority="47"/>
-    <w:lsdException w:name="Grid Table 3 Accent 6" w:uiPriority="48"/>
-    <w:lsdException w:name="Grid Table 4 Accent 6" w:uiPriority="49"/>
-    <w:lsdException w:name="Grid Table 5 Dark Accent 6" w:uiPriority="50"/>
-    <w:lsdException w:name="Grid Table 6 Colorful Accent 6" w:uiPriority="51"/>
-    <w:lsdException w:name="Grid Table 7 Colorful Accent 6" w:uiPriority="52"/>
-    <w:lsdException w:name="List Table 1 Light" w:uiPriority="46"/>
-    <w:lsdException w:name="List Table 2" w:uiPriority="47"/>
-    <w:lsdException w:name="List Table 3" w:uiPriority="48"/>
-    <w:lsdException w:name="List Table 4" w:uiPriority="49"/>
-    <w:lsdException w:name="List Table 5 Dark" w:uiPriority="50"/>
-    <w:lsdException w:name="List Table 6 Colorful" w:uiPriority="51"/>
-    <w:lsdException w:name="List Table 7 Colorful" w:uiPriority="52"/>
-    <w:lsdException w:name="List Table 1 Light Accent 1" w:uiPriority="46"/>
-    <w:lsdException w:name="List Table 2 Accent 1" w:uiPriority="47"/>
-    <w:lsdException w:name="List Table 3 Accent 1" w:uiPriority="48"/>
-    <w:lsdException w:name="List Table 4 Accent 1" w:uiPriority="49"/>
-    <w:lsdException w:name="List Table 5 Dark Accent 1" w:uiPriority="50"/>
-    <w:lsdException w:name="List Table 6 Colorful Accent 1" w:uiPriority="51"/>
-    <w:lsdException w:name="List Table 7 Colorful Accent 1" w:uiPriority="52"/>
-    <w:lsdException w:name="List Table 1 Light Accent 2" w:uiPriority="46"/>
-    <w:lsdException w:name="List Table 2 Accent 2" w:uiPriority="47"/>
-    <w:lsdException w:name="List Table 3 Accent 2" w:uiPriority="48"/>
-    <w:lsdException w:name="List Table 4 Accent 2" w:uiPriority="49"/>
-    <w:lsdException w:name="List Table 5 Dark Accent 2" w:uiPriority="50"/>
-    <w:lsdException w:name="List Table 6 Colorful Accent 2" w:uiPriority="51"/>
-    <w:lsdException w:name="List Table 7 Colorful Accent 2" w:uiPriority="52"/>
-    <w:lsdException w:name="List Table 1 Light Accent 3" w:uiPriority="46"/>
-    <w:lsdException w:name="List Table 2 Accent 3" w:uiPriority="47"/>
-    <w:lsdException w:name="List Table 3 Accent 3" w:uiPriority="48"/>
-    <w:lsdException w:name="List Table 4 Accent 3" w:uiPriority="49"/>
-    <w:lsdException w:name="List Table 5 Dark Accent 3" w:uiPriority="50"/>
-    <w:lsdException w:name="List Table 6 Colorful Accent 3" w:uiPriority="51"/>
-    <w:lsdException w:name="List Table 7 Colorful Accent 3" w:uiPriority="52"/>
-    <w:lsdException w:name="List Table 1 Light Accent 4" w:uiPriority="46"/>
-    <w:lsdException w:name="List Table 2 Accent 4" w:uiPriority="47"/>
-    <w:lsdException w:name="List Table 3 Accent 4" w:uiPriority="48"/>
-    <w:lsdException w:name="List Table 4 Accent 4" w:uiPriority="49"/>
-    <w:lsdException w:name="List Table 5 Dark Accent 4" w:uiPriority="50"/>
-    <w:lsdException w:name="List Table 6 Colorful Accent 4" w:uiPriority="51"/>
-    <w:lsdException w:name="List Table 7 Colorful Accent 4" w:uiPriority="52"/>
-    <w:lsdException w:name="List Table 1 Light Accent 5" w:uiPriority="46"/>
-    <w:lsdException w:name="List Table 2 Accent 5" w:uiPriority="47"/>
-    <w:lsdException w:name="List Table 3 Accent 5" w:uiPriority="48"/>
-    <w:lsdException w:name="List Table 4 Accent 5" w:uiPriority="49"/>
-    <w:lsdException w:name="List Table 5 Dark Accent 5" w:uiPriority="50"/>
-    <w:lsdException w:name="List Table 6 Colorful Accent 5" w:uiPriority="51"/>
-    <w:lsdException w:name="List Table 7 Colorful Accent 5" w:uiPriority="52"/>
-    <w:lsdException w:name="List Table 1 Light Accent 6" w:uiPriority="46"/>
-    <w:lsdException w:name="List Table 2 Accent 6" w:uiPriority="47"/>
-    <w:lsdException w:name="List Table 3 Accent 6" w:uiPriority="48"/>
-    <w:lsdException w:name="List Table 4 Accent 6" w:uiPriority="49"/>
-    <w:lsdException w:name="List Table 5 Dark Accent 6" w:uiPriority="50"/>
-    <w:lsdException w:name="List Table 6 Colorful Accent 6" w:uiPriority="51"/>
-    <w:lsdException w:name="List Table 7 Colorful Accent 6" w:uiPriority="52"/>
+  <w:latentStyles w:defLockedState="0" w:defUIPriority="99" w:defSemiHidden="1" w:defUnhideWhenUsed="1" w:defQFormat="0" w:count="267">
+    <w:lsdException w:name="Normal" w:semiHidden="0" w:uiPriority="0" w:unhideWhenUsed="0" w:qFormat="1"/>
+    <w:lsdException w:name="heading 1" w:semiHidden="0" w:uiPriority="9" w:unhideWhenUsed="0" w:qFormat="1"/>
+    <w:lsdException w:name="heading 2" w:uiPriority="9" w:qFormat="1"/>
+    <w:lsdException w:name="heading 3" w:uiPriority="9" w:qFormat="1"/>
+    <w:lsdException w:name="heading 4" w:uiPriority="9" w:qFormat="1"/>
+    <w:lsdException w:name="heading 5" w:uiPriority="9" w:qFormat="1"/>
+    <w:lsdException w:name="heading 6" w:uiPriority="9" w:qFormat="1"/>
+    <w:lsdException w:name="heading 7" w:uiPriority="9" w:qFormat="1"/>
+    <w:lsdException w:name="heading 8" w:uiPriority="9" w:qFormat="1"/>
+    <w:lsdException w:name="heading 9" w:uiPriority="9" w:qFormat="1"/>
+    <w:lsdException w:name="toc 1" w:uiPriority="39"/>
+    <w:lsdException w:name="toc 2" w:uiPriority="39"/>
+    <w:lsdException w:name="toc 3" w:uiPriority="39"/>
+    <w:lsdException w:name="toc 4" w:uiPriority="39"/>
+    <w:lsdException w:name="toc 5" w:uiPriority="39"/>
+    <w:lsdException w:name="toc 6" w:uiPriority="39"/>
+    <w:lsdException w:name="toc 7" w:uiPriority="39"/>
+    <w:lsdException w:name="toc 8" w:uiPriority="39"/>
+    <w:lsdException w:name="toc 9" w:uiPriority="39"/>
+    <w:lsdException w:name="caption" w:uiPriority="35" w:qFormat="1"/>
+    <w:lsdException w:name="Title" w:semiHidden="0" w:uiPriority="10" w:unhideWhenUsed="0" w:qFormat="1"/>
+    <w:lsdException w:name="Default Paragraph Font" w:uiPriority="1"/>
+    <w:lsdException w:name="Subtitle" w:semiHidden="0" w:uiPriority="11" w:unhideWhenUsed="0" w:qFormat="1"/>
+    <w:lsdException w:name="Strong" w:semiHidden="0" w:uiPriority="22" w:unhideWhenUsed="0" w:qFormat="1"/>
+    <w:lsdException w:name="Emphasis" w:semiHidden="0" w:uiPriority="20" w:unhideWhenUsed="0" w:qFormat="1"/>
+    <w:lsdException w:name="Table Grid" w:semiHidden="0" w:uiPriority="39" w:unhideWhenUsed="0"/>
+    <w:lsdException w:name="Placeholder Text" w:unhideWhenUsed="0"/>
+    <w:lsdException w:name="No Spacing" w:semiHidden="0" w:uiPriority="1" w:unhideWhenUsed="0" w:qFormat="1"/>
+    <w:lsdException w:name="Light Shading" w:semiHidden="0" w:uiPriority="60" w:unhideWhenUsed="0"/>
+    <w:lsdException w:name="Light List" w:semiHidden="0" w:uiPriority="61" w:unhideWhenUsed="0"/>
+    <w:lsdException w:name="Light Grid" w:semiHidden="0" w:uiPriority="62" w:unhideWhenUsed="0"/>
+    <w:lsdException w:name="Medium Shading 1" w:semiHidden="0" w:uiPriority="63" w:unhideWhenUsed="0"/>
+    <w:lsdException w:name="Medium Shading 2" w:semiHidden="0" w:uiPriority="64" w:unhideWhenUsed="0"/>
+    <w:lsdException w:name="Medium List 1" w:semiHidden="0" w:uiPriority="65" w:unhideWhenUsed="0"/>
+    <w:lsdException w:name="Medium List 2" w:semiHidden="0" w:uiPriority="66" w:unhideWhenUsed="0"/>
+    <w:lsdException w:name="Medium Grid 1" w:semiHidden="0" w:uiPriority="67" w:unhideWhenUsed="0"/>
+    <w:lsdException w:name="Medium Grid 2" w:semiHidden="0" w:uiPriority="68" w:unhideWhenUsed="0"/>
+    <w:lsdException w:name="Medium Grid 3" w:semiHidden="0" w:uiPriority="69" w:unhideWhenUsed="0"/>
+    <w:lsdException w:name="Dark List" w:semiHidden="0" w:uiPriority="70" w:unhideWhenUsed="0"/>
+    <w:lsdException w:name="Colorful Shading" w:semiHidden="0" w:uiPriority="71" w:unhideWhenUsed="0"/>
+    <w:lsdException w:name="Colorful List" w:semiHidden="0" w:uiPriority="72" w:unhideWhenUsed="0"/>
+    <w:lsdException w:name="Colorful Grid" w:semiHidden="0" w:uiPriority="73" w:unhideWhenUsed="0"/>
+    <w:lsdException w:name="Light Shading Accent 1" w:semiHidden="0" w:uiPriority="60" w:unhideWhenUsed="0"/>
+    <w:lsdException w:name="Light List Accent 1" w:semiHidden="0" w:uiPriority="61" w:unhideWhenUsed="0"/>
+    <w:lsdException w:name="Light Grid Accent 1" w:semiHidden="0" w:uiPriority="62" w:unhideWhenUsed="0"/>
+    <w:lsdException w:name="Medium Shading 1 Accent 1" w:semiHidden="0" w:uiPriority="63" w:unhideWhenUsed="0"/>
+    <w:lsdException w:name="Medium Shading 2 Accent 1" w:semiHidden="0" w:uiPriority="64" w:unhideWhenUsed="0"/>
+    <w:lsdException w:name="Medium List 1 Accent 1" w:semiHidden="0" w:uiPriority="65" w:unhideWhenUsed="0"/>
+    <w:lsdException w:name="Revision" w:unhideWhenUsed="0"/>
+    <w:lsdException w:name="List Paragraph" w:semiHidden="0" w:uiPriority="34" w:unhideWhenUsed="0" w:qFormat="1"/>
+    <w:lsdException w:name="Quote" w:semiHidden="0" w:uiPriority="29" w:unhideWhenUsed="0" w:qFormat="1"/>
+    <w:lsdException w:name="Intense Quote" w:semiHidden="0" w:uiPriority="30" w:unhideWhenUsed="0" w:qFormat="1"/>
+    <w:lsdException w:name="Medium List 2 Accent 1" w:semiHidden="0" w:uiPriority="66" w:unhideWhenUsed="0"/>
+    <w:lsdException w:name="Medium Grid 1 Accent 1" w:semiHidden="0" w:uiPriority="67" w:unhideWhenUsed="0"/>
+    <w:lsdException w:name="Medium Grid 2 Accent 1" w:semiHidden="0" w:uiPriority="68" w:unhideWhenUsed="0"/>
+    <w:lsdException w:name="Medium Grid 3 Accent 1" w:semiHidden="0" w:uiPriority="69" w:unhideWhenUsed="0"/>
+    <w:lsdException w:name="Dark List Accent 1" w:semiHidden="0" w:uiPriority="70" w:unhideWhenUsed="0"/>
+    <w:lsdException w:name="Colorful Shading Accent 1" w:semiHidden="0" w:uiPriority="71" w:unhideWhenUsed="0"/>
+    <w:lsdException w:name="Colorful List Accent 1" w:semiHidden="0" w:uiPriority="72" w:unhideWhenUsed="0"/>
+    <w:lsdException w:name="Colorful Grid Accent 1" w:semiHidden="0" w:uiPriority="73" w:unhideWhenUsed="0"/>
+    <w:lsdException w:name="Light Shading Accent 2" w:semiHidden="0" w:uiPriority="60" w:unhideWhenUsed="0"/>
+    <w:lsdException w:name="Light List Accent 2" w:semiHidden="0" w:uiPriority="61" w:unhideWhenUsed="0"/>
+    <w:lsdException w:name="Light Grid Accent 2" w:semiHidden="0" w:uiPriority="62" w:unhideWhenUsed="0"/>
+    <w:lsdException w:name="Medium Shading 1 Accent 2" w:semiHidden="0" w:uiPriority="63" w:unhideWhenUsed="0"/>
+    <w:lsdException w:name="Medium Shading 2 Accent 2" w:semiHidden="0" w:uiPriority="64" w:unhideWhenUsed="0"/>
+    <w:lsdException w:name="Medium List 1 Accent 2" w:semiHidden="0" w:uiPriority="65" w:unhideWhenUsed="0"/>
+    <w:lsdException w:name="Medium List 2 Accent 2" w:semiHidden="0" w:uiPriority="66" w:unhideWhenUsed="0"/>
+    <w:lsdException w:name="Medium Grid 1 Accent 2" w:semiHidden="0" w:uiPriority="67" w:unhideWhenUsed="0"/>
+    <w:lsdException w:name="Medium Grid 2 Accent 2" w:semiHidden="0" w:uiPriority="68" w:unhideWhenUsed="0"/>
+    <w:lsdException w:name="Medium Grid 3 Accent 2" w:semiHidden="0" w:uiPriority="69" w:unhideWhenUsed="0"/>
+    <w:lsdException w:name="Dark List Accent 2" w:semiHidden="0" w:uiPriority="70" w:unhideWhenUsed="0"/>
+    <w:lsdException w:name="Colorful Shading Accent 2" w:semiHidden="0" w:uiPriority="71" w:unhideWhenUsed="0"/>
+    <w:lsdException w:name="Colorful List Accent 2" w:semiHidden="0" w:uiPriority="72" w:unhideWhenUsed="0"/>
+    <w:lsdException w:name="Colorful Grid Accent 2" w:semiHidden="0" w:uiPriority="73" w:unhideWhenUsed="0"/>
+    <w:lsdException w:name="Light Shading Accent 3" w:semiHidden="0" w:uiPriority="60" w:unhideWhenUsed="0"/>
+    <w:lsdException w:name="Light List Accent 3" w:semiHidden="0" w:uiPriority="61" w:unhideWhenUsed="0"/>
+    <w:lsdException w:name="Light Grid Accent 3" w:semiHidden="0" w:uiPriority="62" w:unhideWhenUsed="0"/>
+    <w:lsdException w:name="Medium Shading 1 Accent 3" w:semiHidden="0" w:uiPriority="63" w:unhideWhenUsed="0"/>
+    <w:lsdException w:name="Medium Shading 2 Accent 3" w:semiHidden="0" w:uiPriority="64" w:unhideWhenUsed="0"/>
+    <w:lsdException w:name="Medium List 1 Accent 3" w:semiHidden="0" w:uiPriority="65" w:unhideWhenUsed="0"/>
+    <w:lsdException w:name="Medium List 2 Accent 3" w:semiHidden="0" w:uiPriority="66" w:unhideWhenUsed="0"/>
+    <w:lsdException w:name="Medium Grid 1 Accent 3" w:semiHidden="0" w:uiPriority="67" w:unhideWhenUsed="0"/>
+    <w:lsdException w:name="Medium Grid 2 Accent 3" w:semiHidden="0" w:uiPriority="68" w:unhideWhenUsed="0"/>
+    <w:lsdException w:name="Medium Grid 3 Accent 3" w:semiHidden="0" w:uiPriority="69" w:unhideWhenUsed="0"/>
+    <w:lsdException w:name="Dark List Accent 3" w:semiHidden="0" w:uiPriority="70" w:unhideWhenUsed="0"/>
+    <w:lsdException w:name="Colorful Shading Accent 3" w:semiHidden="0" w:uiPriority="71" w:unhideWhenUsed="0"/>
+    <w:lsdException w:name="Colorful List Accent 3" w:semiHidden="0" w:uiPriority="72" w:unhideWhenUsed="0"/>
+    <w:lsdException w:name="Colorful Grid Accent 3" w:semiHidden="0" w:uiPriority="73" w:unhideWhenUsed="0"/>
+    <w:lsdException w:name="Light Shading Accent 4" w:semiHidden="0" w:uiPriority="60" w:unhideWhenUsed="0"/>
+    <w:lsdException w:name="Light List Accent 4" w:semiHidden="0" w:uiPriority="61" w:unhideWhenUsed="0"/>
+    <w:lsdException w:name="Light Grid Accent 4" w:semiHidden="0" w:uiPriority="62" w:unhideWhenUsed="0"/>
+    <w:lsdException w:name="Medium Shading 1 Accent 4" w:semiHidden="0" w:uiPriority="63" w:unhideWhenUsed="0"/>
+    <w:lsdException w:name="Medium Shading 2 Accent 4" w:semiHidden="0" w:uiPriority="64" w:unhideWhenUsed="0"/>
+    <w:lsdException w:name="Medium List 1 Accent 4" w:semiHidden="0" w:uiPriority="65" w:unhideWhenUsed="0"/>
+    <w:lsdException w:name="Medium List 2 Accent 4" w:semiHidden="0" w:uiPriority="66" w:unhideWhenUsed="0"/>
+    <w:lsdException w:name="Medium Grid 1 Accent 4" w:semiHidden="0" w:uiPriority="67" w:unhideWhenUsed="0"/>
+    <w:lsdException w:name="Medium Grid 2 Accent 4" w:semiHidden="0" w:uiPriority="68" w:unhideWhenUsed="0"/>
+    <w:lsdException w:name="Medium Grid 3 Accent 4" w:semiHidden="0" w:uiPriority="69" w:unhideWhenUsed="0"/>
+    <w:lsdException w:name="Dark List Accent 4" w:semiHidden="0" w:uiPriority="70" w:unhideWhenUsed="0"/>
+    <w:lsdException w:name="Colorful Shading Accent 4" w:semiHidden="0" w:uiPriority="71" w:unhideWhenUsed="0"/>
+    <w:lsdException w:name="Colorful List Accent 4" w:semiHidden="0" w:uiPriority="72" w:unhideWhenUsed="0"/>
+    <w:lsdException w:name="Colorful Grid Accent 4" w:semiHidden="0" w:uiPriority="73" w:unhideWhenUsed="0"/>
+    <w:lsdException w:name="Light Shading Accent 5" w:semiHidden="0" w:uiPriority="60" w:unhideWhenUsed="0"/>
+    <w:lsdException w:name="Light List Accent 5" w:semiHidden="0" w:uiPriority="61" w:unhideWhenUsed="0"/>
+    <w:lsdException w:name="Light Grid Accent 5" w:semiHidden="0" w:uiPriority="62" w:unhideWhenUsed="0"/>
+    <w:lsdException w:name="Medium Shading 1 Accent 5" w:semiHidden="0" w:uiPriority="63" w:unhideWhenUsed="0"/>
+    <w:lsdException w:name="Medium Shading 2 Accent 5" w:semiHidden="0" w:uiPriority="64" w:unhideWhenUsed="0"/>
+    <w:lsdException w:name="Medium List 1 Accent 5" w:semiHidden="0" w:uiPriority="65" w:unhideWhenUsed="0"/>
+    <w:lsdException w:name="Medium List 2 Accent 5" w:semiHidden="0" w:uiPriority="66" w:unhideWhenUsed="0"/>
+    <w:lsdException w:name="Medium Grid 1 Accent 5" w:semiHidden="0" w:uiPriority="67" w:unhideWhenUsed="0"/>
+    <w:lsdException w:name="Medium Grid 2 Accent 5" w:semiHidden="0" w:uiPriority="68" w:unhideWhenUsed="0"/>
+    <w:lsdException w:name="Medium Grid 3 Accent 5" w:semiHidden="0" w:uiPriority="69" w:unhideWhenUsed="0"/>
+    <w:lsdException w:name="Dark List Accent 5" w:semiHidden="0" w:uiPriority="70" w:unhideWhenUsed="0"/>
+    <w:lsdException w:name="Colorful Shading Accent 5" w:semiHidden="0" w:uiPriority="71" w:unhideWhenUsed="0"/>
+    <w:lsdException w:name="Colorful List Accent 5" w:semiHidden="0" w:uiPriority="72" w:unhideWhenUsed="0"/>
+    <w:lsdException w:name="Colorful Grid Accent 5" w:semiHidden="0" w:uiPriority="73" w:unhideWhenUsed="0"/>
+    <w:lsdException w:name="Light Shading Accent 6" w:semiHidden="0" w:uiPriority="60" w:unhideWhenUsed="0"/>
+    <w:lsdException w:name="Light List Accent 6" w:semiHidden="0" w:uiPriority="61" w:unhideWhenUsed="0"/>
+    <w:lsdException w:name="Light Grid Accent 6" w:semiHidden="0" w:uiPriority="62" w:unhideWhenUsed="0"/>
+    <w:lsdException w:name="Medium Shading 1 Accent 6" w:semiHidden="0" w:uiPriority="63" w:unhideWhenUsed="0"/>
+    <w:lsdException w:name="Medium Shading 2 Accent 6" w:semiHidden="0" w:uiPriority="64" w:unhideWhenUsed="0"/>
+    <w:lsdException w:name="Medium List 1 Accent 6" w:semiHidden="0" w:uiPriority="65" w:unhideWhenUsed="0"/>
+    <w:lsdException w:name="Medium List 2 Accent 6" w:semiHidden="0" w:uiPriority="66" w:unhideWhenUsed="0"/>
+    <w:lsdException w:name="Medium Grid 1 Accent 6" w:semiHidden="0" w:uiPriority="67" w:unhideWhenUsed="0"/>
+    <w:lsdException w:name="Medium Grid 2 Accent 6" w:semiHidden="0" w:uiPriority="68" w:unhideWhenUsed="0"/>
+    <w:lsdException w:name="Medium Grid 3 Accent 6" w:semiHidden="0" w:uiPriority="69" w:unhideWhenUsed="0"/>
+    <w:lsdException w:name="Dark List Accent 6" w:semiHidden="0" w:uiPriority="70" w:unhideWhenUsed="0"/>
+    <w:lsdException w:name="Colorful Shading Accent 6" w:semiHidden="0" w:uiPriority="71" w:unhideWhenUsed="0"/>
+    <w:lsdException w:name="Colorful List Accent 6" w:semiHidden="0" w:uiPriority="72" w:unhideWhenUsed="0"/>
+    <w:lsdException w:name="Colorful Grid Accent 6" w:semiHidden="0" w:uiPriority="73" w:unhideWhenUsed="0"/>
+    <w:lsdException w:name="Subtle Emphasis" w:semiHidden="0" w:uiPriority="19" w:unhideWhenUsed="0" w:qFormat="1"/>
+    <w:lsdException w:name="Intense Emphasis" w:semiHidden="0" w:uiPriority="21" w:unhideWhenUsed="0" w:qFormat="1"/>
+    <w:lsdException w:name="Subtle Reference" w:semiHidden="0" w:uiPriority="31" w:unhideWhenUsed="0" w:qFormat="1"/>
+    <w:lsdException w:name="Intense Reference" w:semiHidden="0" w:uiPriority="32" w:unhideWhenUsed="0" w:qFormat="1"/>
+    <w:lsdException w:name="Book Title" w:semiHidden="0" w:uiPriority="33" w:unhideWhenUsed="0" w:qFormat="1"/>
+    <w:lsdException w:name="Bibliography" w:uiPriority="37"/>
+    <w:lsdException w:name="TOC Heading" w:uiPriority="39" w:qFormat="1"/>
   </w:latentStyles>
   <w:style w:type="paragraph" w:default="1" w:styleId="Normal">
     <w:name w:val="Normal"/>
@@ -23058,6 +23605,695 @@
       <w:u w:val="single"/>
     </w:rPr>
   </w:style>
+  <w:style w:type="paragraph" w:styleId="Paragraphedeliste">
+    <w:name w:val="List Paragraph"/>
+    <w:basedOn w:val="Normal"/>
+    <w:uiPriority w:val="34"/>
+    <w:qFormat/>
+    <w:rsid w:val="008C2CE8"/>
+    <w:pPr>
+      <w:ind w:left="720"/>
+      <w:contextualSpacing/>
+    </w:pPr>
+  </w:style>
+</w:styles>
+</file>
+
+<file path=word/stylesWithEffects.xml><?xml version="1.0" encoding="utf-8"?>
+<w:styles xmlns:wpc="http://schemas.microsoft.com/office/word/2010/wordprocessingCanvas" xmlns:mc="http://schemas.openxmlformats.org/markup-compatibility/2006" xmlns:o="urn:schemas-microsoft-com:office:office" xmlns:r="http://schemas.openxmlformats.org/officeDocument/2006/relationships" xmlns:m="http://schemas.openxmlformats.org/officeDocument/2006/math" xmlns:v="urn:schemas-microsoft-com:vml" xmlns:wp14="http://schemas.microsoft.com/office/word/2010/wordprocessingDrawing" xmlns:wp="http://schemas.openxmlformats.org/drawingml/2006/wordprocessingDrawing" xmlns:w10="urn:schemas-microsoft-com:office:word" xmlns:w="http://schemas.openxmlformats.org/wordprocessingml/2006/main" xmlns:w14="http://schemas.microsoft.com/office/word/2010/wordml" xmlns:wpg="http://schemas.microsoft.com/office/word/2010/wordprocessingGroup" xmlns:wpi="http://schemas.microsoft.com/office/word/2010/wordprocessingInk" xmlns:wne="http://schemas.microsoft.com/office/word/2006/wordml" xmlns:wps="http://schemas.microsoft.com/office/word/2010/wordprocessingShape" mc:Ignorable="w14 wp14">
+  <w:docDefaults>
+    <w:rPrDefault>
+      <w:rPr>
+        <w:rFonts w:asciiTheme="minorHAnsi" w:eastAsiaTheme="minorHAnsi" w:hAnsiTheme="minorHAnsi" w:cstheme="minorBidi"/>
+        <w:sz w:val="22"/>
+        <w:szCs w:val="22"/>
+        <w:lang w:val="en-GB" w:eastAsia="en-US" w:bidi="ar-SA"/>
+      </w:rPr>
+    </w:rPrDefault>
+    <w:pPrDefault>
+      <w:pPr>
+        <w:spacing w:after="160" w:line="259" w:lineRule="auto"/>
+      </w:pPr>
+    </w:pPrDefault>
+  </w:docDefaults>
+  <w:latentStyles w:defLockedState="0" w:defUIPriority="99" w:defSemiHidden="1" w:defUnhideWhenUsed="1" w:defQFormat="0" w:count="267">
+    <w:lsdException w:name="Normal" w:semiHidden="0" w:uiPriority="0" w:unhideWhenUsed="0" w:qFormat="1"/>
+    <w:lsdException w:name="heading 1" w:semiHidden="0" w:uiPriority="9" w:unhideWhenUsed="0" w:qFormat="1"/>
+    <w:lsdException w:name="heading 2" w:uiPriority="9" w:qFormat="1"/>
+    <w:lsdException w:name="heading 3" w:uiPriority="9" w:qFormat="1"/>
+    <w:lsdException w:name="heading 4" w:uiPriority="9" w:qFormat="1"/>
+    <w:lsdException w:name="heading 5" w:uiPriority="9" w:qFormat="1"/>
+    <w:lsdException w:name="heading 6" w:uiPriority="9" w:qFormat="1"/>
+    <w:lsdException w:name="heading 7" w:uiPriority="9" w:qFormat="1"/>
+    <w:lsdException w:name="heading 8" w:uiPriority="9" w:qFormat="1"/>
+    <w:lsdException w:name="heading 9" w:uiPriority="9" w:qFormat="1"/>
+    <w:lsdException w:name="toc 1" w:uiPriority="39"/>
+    <w:lsdException w:name="toc 2" w:uiPriority="39"/>
+    <w:lsdException w:name="toc 3" w:uiPriority="39"/>
+    <w:lsdException w:name="toc 4" w:uiPriority="39"/>
+    <w:lsdException w:name="toc 5" w:uiPriority="39"/>
+    <w:lsdException w:name="toc 6" w:uiPriority="39"/>
+    <w:lsdException w:name="toc 7" w:uiPriority="39"/>
+    <w:lsdException w:name="toc 8" w:uiPriority="39"/>
+    <w:lsdException w:name="toc 9" w:uiPriority="39"/>
+    <w:lsdException w:name="caption" w:uiPriority="35" w:qFormat="1"/>
+    <w:lsdException w:name="Title" w:semiHidden="0" w:uiPriority="10" w:unhideWhenUsed="0" w:qFormat="1"/>
+    <w:lsdException w:name="Default Paragraph Font" w:uiPriority="1"/>
+    <w:lsdException w:name="Subtitle" w:semiHidden="0" w:uiPriority="11" w:unhideWhenUsed="0" w:qFormat="1"/>
+    <w:lsdException w:name="Strong" w:semiHidden="0" w:uiPriority="22" w:unhideWhenUsed="0" w:qFormat="1"/>
+    <w:lsdException w:name="Emphasis" w:semiHidden="0" w:uiPriority="20" w:unhideWhenUsed="0" w:qFormat="1"/>
+    <w:lsdException w:name="Table Grid" w:semiHidden="0" w:uiPriority="39" w:unhideWhenUsed="0"/>
+    <w:lsdException w:name="Placeholder Text" w:unhideWhenUsed="0"/>
+    <w:lsdException w:name="No Spacing" w:semiHidden="0" w:uiPriority="1" w:unhideWhenUsed="0" w:qFormat="1"/>
+    <w:lsdException w:name="Light Shading" w:semiHidden="0" w:uiPriority="60" w:unhideWhenUsed="0"/>
+    <w:lsdException w:name="Light List" w:semiHidden="0" w:uiPriority="61" w:unhideWhenUsed="0"/>
+    <w:lsdException w:name="Light Grid" w:semiHidden="0" w:uiPriority="62" w:unhideWhenUsed="0"/>
+    <w:lsdException w:name="Medium Shading 1" w:semiHidden="0" w:uiPriority="63" w:unhideWhenUsed="0"/>
+    <w:lsdException w:name="Medium Shading 2" w:semiHidden="0" w:uiPriority="64" w:unhideWhenUsed="0"/>
+    <w:lsdException w:name="Medium List 1" w:semiHidden="0" w:uiPriority="65" w:unhideWhenUsed="0"/>
+    <w:lsdException w:name="Medium List 2" w:semiHidden="0" w:uiPriority="66" w:unhideWhenUsed="0"/>
+    <w:lsdException w:name="Medium Grid 1" w:semiHidden="0" w:uiPriority="67" w:unhideWhenUsed="0"/>
+    <w:lsdException w:name="Medium Grid 2" w:semiHidden="0" w:uiPriority="68" w:unhideWhenUsed="0"/>
+    <w:lsdException w:name="Medium Grid 3" w:semiHidden="0" w:uiPriority="69" w:unhideWhenUsed="0"/>
+    <w:lsdException w:name="Dark List" w:semiHidden="0" w:uiPriority="70" w:unhideWhenUsed="0"/>
+    <w:lsdException w:name="Colorful Shading" w:semiHidden="0" w:uiPriority="71" w:unhideWhenUsed="0"/>
+    <w:lsdException w:name="Colorful List" w:semiHidden="0" w:uiPriority="72" w:unhideWhenUsed="0"/>
+    <w:lsdException w:name="Colorful Grid" w:semiHidden="0" w:uiPriority="73" w:unhideWhenUsed="0"/>
+    <w:lsdException w:name="Light Shading Accent 1" w:semiHidden="0" w:uiPriority="60" w:unhideWhenUsed="0"/>
+    <w:lsdException w:name="Light List Accent 1" w:semiHidden="0" w:uiPriority="61" w:unhideWhenUsed="0"/>
+    <w:lsdException w:name="Light Grid Accent 1" w:semiHidden="0" w:uiPriority="62" w:unhideWhenUsed="0"/>
+    <w:lsdException w:name="Medium Shading 1 Accent 1" w:semiHidden="0" w:uiPriority="63" w:unhideWhenUsed="0"/>
+    <w:lsdException w:name="Medium Shading 2 Accent 1" w:semiHidden="0" w:uiPriority="64" w:unhideWhenUsed="0"/>
+    <w:lsdException w:name="Medium List 1 Accent 1" w:semiHidden="0" w:uiPriority="65" w:unhideWhenUsed="0"/>
+    <w:lsdException w:name="Revision" w:unhideWhenUsed="0"/>
+    <w:lsdException w:name="List Paragraph" w:semiHidden="0" w:uiPriority="34" w:unhideWhenUsed="0" w:qFormat="1"/>
+    <w:lsdException w:name="Quote" w:semiHidden="0" w:uiPriority="29" w:unhideWhenUsed="0" w:qFormat="1"/>
+    <w:lsdException w:name="Intense Quote" w:semiHidden="0" w:uiPriority="30" w:unhideWhenUsed="0" w:qFormat="1"/>
+    <w:lsdException w:name="Medium List 2 Accent 1" w:semiHidden="0" w:uiPriority="66" w:unhideWhenUsed="0"/>
+    <w:lsdException w:name="Medium Grid 1 Accent 1" w:semiHidden="0" w:uiPriority="67" w:unhideWhenUsed="0"/>
+    <w:lsdException w:name="Medium Grid 2 Accent 1" w:semiHidden="0" w:uiPriority="68" w:unhideWhenUsed="0"/>
+    <w:lsdException w:name="Medium Grid 3 Accent 1" w:semiHidden="0" w:uiPriority="69" w:unhideWhenUsed="0"/>
+    <w:lsdException w:name="Dark List Accent 1" w:semiHidden="0" w:uiPriority="70" w:unhideWhenUsed="0"/>
+    <w:lsdException w:name="Colorful Shading Accent 1" w:semiHidden="0" w:uiPriority="71" w:unhideWhenUsed="0"/>
+    <w:lsdException w:name="Colorful List Accent 1" w:semiHidden="0" w:uiPriority="72" w:unhideWhenUsed="0"/>
+    <w:lsdException w:name="Colorful Grid Accent 1" w:semiHidden="0" w:uiPriority="73" w:unhideWhenUsed="0"/>
+    <w:lsdException w:name="Light Shading Accent 2" w:semiHidden="0" w:uiPriority="60" w:unhideWhenUsed="0"/>
+    <w:lsdException w:name="Light List Accent 2" w:semiHidden="0" w:uiPriority="61" w:unhideWhenUsed="0"/>
+    <w:lsdException w:name="Light Grid Accent 2" w:semiHidden="0" w:uiPriority="62" w:unhideWhenUsed="0"/>
+    <w:lsdException w:name="Medium Shading 1 Accent 2" w:semiHidden="0" w:uiPriority="63" w:unhideWhenUsed="0"/>
+    <w:lsdException w:name="Medium Shading 2 Accent 2" w:semiHidden="0" w:uiPriority="64" w:unhideWhenUsed="0"/>
+    <w:lsdException w:name="Medium List 1 Accent 2" w:semiHidden="0" w:uiPriority="65" w:unhideWhenUsed="0"/>
+    <w:lsdException w:name="Medium List 2 Accent 2" w:semiHidden="0" w:uiPriority="66" w:unhideWhenUsed="0"/>
+    <w:lsdException w:name="Medium Grid 1 Accent 2" w:semiHidden="0" w:uiPriority="67" w:unhideWhenUsed="0"/>
+    <w:lsdException w:name="Medium Grid 2 Accent 2" w:semiHidden="0" w:uiPriority="68" w:unhideWhenUsed="0"/>
+    <w:lsdException w:name="Medium Grid 3 Accent 2" w:semiHidden="0" w:uiPriority="69" w:unhideWhenUsed="0"/>
+    <w:lsdException w:name="Dark List Accent 2" w:semiHidden="0" w:uiPriority="70" w:unhideWhenUsed="0"/>
+    <w:lsdException w:name="Colorful Shading Accent 2" w:semiHidden="0" w:uiPriority="71" w:unhideWhenUsed="0"/>
+    <w:lsdException w:name="Colorful List Accent 2" w:semiHidden="0" w:uiPriority="72" w:unhideWhenUsed="0"/>
+    <w:lsdException w:name="Colorful Grid Accent 2" w:semiHidden="0" w:uiPriority="73" w:unhideWhenUsed="0"/>
+    <w:lsdException w:name="Light Shading Accent 3" w:semiHidden="0" w:uiPriority="60" w:unhideWhenUsed="0"/>
+    <w:lsdException w:name="Light List Accent 3" w:semiHidden="0" w:uiPriority="61" w:unhideWhenUsed="0"/>
+    <w:lsdException w:name="Light Grid Accent 3" w:semiHidden="0" w:uiPriority="62" w:unhideWhenUsed="0"/>
+    <w:lsdException w:name="Medium Shading 1 Accent 3" w:semiHidden="0" w:uiPriority="63" w:unhideWhenUsed="0"/>
+    <w:lsdException w:name="Medium Shading 2 Accent 3" w:semiHidden="0" w:uiPriority="64" w:unhideWhenUsed="0"/>
+    <w:lsdException w:name="Medium List 1 Accent 3" w:semiHidden="0" w:uiPriority="65" w:unhideWhenUsed="0"/>
+    <w:lsdException w:name="Medium List 2 Accent 3" w:semiHidden="0" w:uiPriority="66" w:unhideWhenUsed="0"/>
+    <w:lsdException w:name="Medium Grid 1 Accent 3" w:semiHidden="0" w:uiPriority="67" w:unhideWhenUsed="0"/>
+    <w:lsdException w:name="Medium Grid 2 Accent 3" w:semiHidden="0" w:uiPriority="68" w:unhideWhenUsed="0"/>
+    <w:lsdException w:name="Medium Grid 3 Accent 3" w:semiHidden="0" w:uiPriority="69" w:unhideWhenUsed="0"/>
+    <w:lsdException w:name="Dark List Accent 3" w:semiHidden="0" w:uiPriority="70" w:unhideWhenUsed="0"/>
+    <w:lsdException w:name="Colorful Shading Accent 3" w:semiHidden="0" w:uiPriority="71" w:unhideWhenUsed="0"/>
+    <w:lsdException w:name="Colorful List Accent 3" w:semiHidden="0" w:uiPriority="72" w:unhideWhenUsed="0"/>
+    <w:lsdException w:name="Colorful Grid Accent 3" w:semiHidden="0" w:uiPriority="73" w:unhideWhenUsed="0"/>
+    <w:lsdException w:name="Light Shading Accent 4" w:semiHidden="0" w:uiPriority="60" w:unhideWhenUsed="0"/>
+    <w:lsdException w:name="Light List Accent 4" w:semiHidden="0" w:uiPriority="61" w:unhideWhenUsed="0"/>
+    <w:lsdException w:name="Light Grid Accent 4" w:semiHidden="0" w:uiPriority="62" w:unhideWhenUsed="0"/>
+    <w:lsdException w:name="Medium Shading 1 Accent 4" w:semiHidden="0" w:uiPriority="63" w:unhideWhenUsed="0"/>
+    <w:lsdException w:name="Medium Shading 2 Accent 4" w:semiHidden="0" w:uiPriority="64" w:unhideWhenUsed="0"/>
+    <w:lsdException w:name="Medium List 1 Accent 4" w:semiHidden="0" w:uiPriority="65" w:unhideWhenUsed="0"/>
+    <w:lsdException w:name="Medium List 2 Accent 4" w:semiHidden="0" w:uiPriority="66" w:unhideWhenUsed="0"/>
+    <w:lsdException w:name="Medium Grid 1 Accent 4" w:semiHidden="0" w:uiPriority="67" w:unhideWhenUsed="0"/>
+    <w:lsdException w:name="Medium Grid 2 Accent 4" w:semiHidden="0" w:uiPriority="68" w:unhideWhenUsed="0"/>
+    <w:lsdException w:name="Medium Grid 3 Accent 4" w:semiHidden="0" w:uiPriority="69" w:unhideWhenUsed="0"/>
+    <w:lsdException w:name="Dark List Accent 4" w:semiHidden="0" w:uiPriority="70" w:unhideWhenUsed="0"/>
+    <w:lsdException w:name="Colorful Shading Accent 4" w:semiHidden="0" w:uiPriority="71" w:unhideWhenUsed="0"/>
+    <w:lsdException w:name="Colorful List Accent 4" w:semiHidden="0" w:uiPriority="72" w:unhideWhenUsed="0"/>
+    <w:lsdException w:name="Colorful Grid Accent 4" w:semiHidden="0" w:uiPriority="73" w:unhideWhenUsed="0"/>
+    <w:lsdException w:name="Light Shading Accent 5" w:semiHidden="0" w:uiPriority="60" w:unhideWhenUsed="0"/>
+    <w:lsdException w:name="Light List Accent 5" w:semiHidden="0" w:uiPriority="61" w:unhideWhenUsed="0"/>
+    <w:lsdException w:name="Light Grid Accent 5" w:semiHidden="0" w:uiPriority="62" w:unhideWhenUsed="0"/>
+    <w:lsdException w:name="Medium Shading 1 Accent 5" w:semiHidden="0" w:uiPriority="63" w:unhideWhenUsed="0"/>
+    <w:lsdException w:name="Medium Shading 2 Accent 5" w:semiHidden="0" w:uiPriority="64" w:unhideWhenUsed="0"/>
+    <w:lsdException w:name="Medium List 1 Accent 5" w:semiHidden="0" w:uiPriority="65" w:unhideWhenUsed="0"/>
+    <w:lsdException w:name="Medium List 2 Accent 5" w:semiHidden="0" w:uiPriority="66" w:unhideWhenUsed="0"/>
+    <w:lsdException w:name="Medium Grid 1 Accent 5" w:semiHidden="0" w:uiPriority="67" w:unhideWhenUsed="0"/>
+    <w:lsdException w:name="Medium Grid 2 Accent 5" w:semiHidden="0" w:uiPriority="68" w:unhideWhenUsed="0"/>
+    <w:lsdException w:name="Medium Grid 3 Accent 5" w:semiHidden="0" w:uiPriority="69" w:unhideWhenUsed="0"/>
+    <w:lsdException w:name="Dark List Accent 5" w:semiHidden="0" w:uiPriority="70" w:unhideWhenUsed="0"/>
+    <w:lsdException w:name="Colorful Shading Accent 5" w:semiHidden="0" w:uiPriority="71" w:unhideWhenUsed="0"/>
+    <w:lsdException w:name="Colorful List Accent 5" w:semiHidden="0" w:uiPriority="72" w:unhideWhenUsed="0"/>
+    <w:lsdException w:name="Colorful Grid Accent 5" w:semiHidden="0" w:uiPriority="73" w:unhideWhenUsed="0"/>
+    <w:lsdException w:name="Light Shading Accent 6" w:semiHidden="0" w:uiPriority="60" w:unhideWhenUsed="0"/>
+    <w:lsdException w:name="Light List Accent 6" w:semiHidden="0" w:uiPriority="61" w:unhideWhenUsed="0"/>
+    <w:lsdException w:name="Light Grid Accent 6" w:semiHidden="0" w:uiPriority="62" w:unhideWhenUsed="0"/>
+    <w:lsdException w:name="Medium Shading 1 Accent 6" w:semiHidden="0" w:uiPriority="63" w:unhideWhenUsed="0"/>
+    <w:lsdException w:name="Medium Shading 2 Accent 6" w:semiHidden="0" w:uiPriority="64" w:unhideWhenUsed="0"/>
+    <w:lsdException w:name="Medium List 1 Accent 6" w:semiHidden="0" w:uiPriority="65" w:unhideWhenUsed="0"/>
+    <w:lsdException w:name="Medium List 2 Accent 6" w:semiHidden="0" w:uiPriority="66" w:unhideWhenUsed="0"/>
+    <w:lsdException w:name="Medium Grid 1 Accent 6" w:semiHidden="0" w:uiPriority="67" w:unhideWhenUsed="0"/>
+    <w:lsdException w:name="Medium Grid 2 Accent 6" w:semiHidden="0" w:uiPriority="68" w:unhideWhenUsed="0"/>
+    <w:lsdException w:name="Medium Grid 3 Accent 6" w:semiHidden="0" w:uiPriority="69" w:unhideWhenUsed="0"/>
+    <w:lsdException w:name="Dark List Accent 6" w:semiHidden="0" w:uiPriority="70" w:unhideWhenUsed="0"/>
+    <w:lsdException w:name="Colorful Shading Accent 6" w:semiHidden="0" w:uiPriority="71" w:unhideWhenUsed="0"/>
+    <w:lsdException w:name="Colorful List Accent 6" w:semiHidden="0" w:uiPriority="72" w:unhideWhenUsed="0"/>
+    <w:lsdException w:name="Colorful Grid Accent 6" w:semiHidden="0" w:uiPriority="73" w:unhideWhenUsed="0"/>
+    <w:lsdException w:name="Subtle Emphasis" w:semiHidden="0" w:uiPriority="19" w:unhideWhenUsed="0" w:qFormat="1"/>
+    <w:lsdException w:name="Intense Emphasis" w:semiHidden="0" w:uiPriority="21" w:unhideWhenUsed="0" w:qFormat="1"/>
+    <w:lsdException w:name="Subtle Reference" w:semiHidden="0" w:uiPriority="31" w:unhideWhenUsed="0" w:qFormat="1"/>
+    <w:lsdException w:name="Intense Reference" w:semiHidden="0" w:uiPriority="32" w:unhideWhenUsed="0" w:qFormat="1"/>
+    <w:lsdException w:name="Book Title" w:semiHidden="0" w:uiPriority="33" w:unhideWhenUsed="0" w:qFormat="1"/>
+    <w:lsdException w:name="Bibliography" w:uiPriority="37"/>
+    <w:lsdException w:name="TOC Heading" w:uiPriority="39" w:qFormat="1"/>
+  </w:latentStyles>
+  <w:style w:type="paragraph" w:default="1" w:styleId="Normal">
+    <w:name w:val="Normal"/>
+    <w:qFormat/>
+  </w:style>
+  <w:style w:type="paragraph" w:styleId="Titre1">
+    <w:name w:val="heading 1"/>
+    <w:basedOn w:val="Normal"/>
+    <w:next w:val="Normal"/>
+    <w:link w:val="Titre1Car"/>
+    <w:uiPriority w:val="9"/>
+    <w:qFormat/>
+    <w:rsid w:val="005127FF"/>
+    <w:pPr>
+      <w:keepNext/>
+      <w:keepLines/>
+      <w:numPr>
+        <w:numId w:val="2"/>
+      </w:numPr>
+      <w:spacing w:before="480" w:after="0"/>
+      <w:outlineLvl w:val="0"/>
+    </w:pPr>
+    <w:rPr>
+      <w:rFonts w:asciiTheme="majorHAnsi" w:eastAsiaTheme="majorEastAsia" w:hAnsiTheme="majorHAnsi" w:cstheme="majorBidi"/>
+      <w:b/>
+      <w:bCs/>
+      <w:color w:val="2E74B5" w:themeColor="accent1" w:themeShade="BF"/>
+      <w:sz w:val="28"/>
+      <w:szCs w:val="28"/>
+    </w:rPr>
+  </w:style>
+  <w:style w:type="paragraph" w:styleId="Titre2">
+    <w:name w:val="heading 2"/>
+    <w:basedOn w:val="Normal"/>
+    <w:next w:val="Normal"/>
+    <w:link w:val="Titre2Car"/>
+    <w:uiPriority w:val="9"/>
+    <w:unhideWhenUsed/>
+    <w:qFormat/>
+    <w:rsid w:val="005127FF"/>
+    <w:pPr>
+      <w:keepNext/>
+      <w:keepLines/>
+      <w:numPr>
+        <w:ilvl w:val="1"/>
+        <w:numId w:val="2"/>
+      </w:numPr>
+      <w:spacing w:before="200" w:after="0"/>
+      <w:outlineLvl w:val="1"/>
+    </w:pPr>
+    <w:rPr>
+      <w:rFonts w:asciiTheme="majorHAnsi" w:eastAsiaTheme="majorEastAsia" w:hAnsiTheme="majorHAnsi" w:cstheme="majorBidi"/>
+      <w:b/>
+      <w:bCs/>
+      <w:color w:val="5B9BD5" w:themeColor="accent1"/>
+      <w:sz w:val="26"/>
+      <w:szCs w:val="26"/>
+    </w:rPr>
+  </w:style>
+  <w:style w:type="paragraph" w:styleId="Titre3">
+    <w:name w:val="heading 3"/>
+    <w:basedOn w:val="Normal"/>
+    <w:next w:val="Normal"/>
+    <w:link w:val="Titre3Car"/>
+    <w:uiPriority w:val="9"/>
+    <w:unhideWhenUsed/>
+    <w:qFormat/>
+    <w:rsid w:val="005127FF"/>
+    <w:pPr>
+      <w:keepNext/>
+      <w:keepLines/>
+      <w:numPr>
+        <w:ilvl w:val="2"/>
+        <w:numId w:val="2"/>
+      </w:numPr>
+      <w:spacing w:before="200" w:after="0"/>
+      <w:outlineLvl w:val="2"/>
+    </w:pPr>
+    <w:rPr>
+      <w:rFonts w:asciiTheme="majorHAnsi" w:eastAsiaTheme="majorEastAsia" w:hAnsiTheme="majorHAnsi" w:cstheme="majorBidi"/>
+      <w:b/>
+      <w:bCs/>
+      <w:color w:val="5B9BD5" w:themeColor="accent1"/>
+    </w:rPr>
+  </w:style>
+  <w:style w:type="paragraph" w:styleId="Titre4">
+    <w:name w:val="heading 4"/>
+    <w:basedOn w:val="Normal"/>
+    <w:next w:val="Normal"/>
+    <w:link w:val="Titre4Car"/>
+    <w:uiPriority w:val="9"/>
+    <w:unhideWhenUsed/>
+    <w:qFormat/>
+    <w:rsid w:val="005127FF"/>
+    <w:pPr>
+      <w:keepNext/>
+      <w:keepLines/>
+      <w:numPr>
+        <w:ilvl w:val="3"/>
+        <w:numId w:val="2"/>
+      </w:numPr>
+      <w:spacing w:before="200" w:after="0"/>
+      <w:outlineLvl w:val="3"/>
+    </w:pPr>
+    <w:rPr>
+      <w:rFonts w:asciiTheme="majorHAnsi" w:eastAsiaTheme="majorEastAsia" w:hAnsiTheme="majorHAnsi" w:cstheme="majorBidi"/>
+      <w:b/>
+      <w:bCs/>
+      <w:i/>
+      <w:iCs/>
+      <w:color w:val="5B9BD5" w:themeColor="accent1"/>
+    </w:rPr>
+  </w:style>
+  <w:style w:type="paragraph" w:styleId="Titre5">
+    <w:name w:val="heading 5"/>
+    <w:basedOn w:val="Normal"/>
+    <w:next w:val="Normal"/>
+    <w:link w:val="Titre5Car"/>
+    <w:uiPriority w:val="9"/>
+    <w:semiHidden/>
+    <w:unhideWhenUsed/>
+    <w:qFormat/>
+    <w:rsid w:val="005127FF"/>
+    <w:pPr>
+      <w:keepNext/>
+      <w:keepLines/>
+      <w:numPr>
+        <w:ilvl w:val="4"/>
+        <w:numId w:val="2"/>
+      </w:numPr>
+      <w:spacing w:before="200" w:after="0"/>
+      <w:outlineLvl w:val="4"/>
+    </w:pPr>
+    <w:rPr>
+      <w:rFonts w:asciiTheme="majorHAnsi" w:eastAsiaTheme="majorEastAsia" w:hAnsiTheme="majorHAnsi" w:cstheme="majorBidi"/>
+      <w:color w:val="1F4D78" w:themeColor="accent1" w:themeShade="7F"/>
+    </w:rPr>
+  </w:style>
+  <w:style w:type="paragraph" w:styleId="Titre6">
+    <w:name w:val="heading 6"/>
+    <w:basedOn w:val="Normal"/>
+    <w:next w:val="Normal"/>
+    <w:link w:val="Titre6Car"/>
+    <w:uiPriority w:val="9"/>
+    <w:semiHidden/>
+    <w:unhideWhenUsed/>
+    <w:qFormat/>
+    <w:rsid w:val="005127FF"/>
+    <w:pPr>
+      <w:keepNext/>
+      <w:keepLines/>
+      <w:numPr>
+        <w:ilvl w:val="5"/>
+        <w:numId w:val="2"/>
+      </w:numPr>
+      <w:spacing w:before="200" w:after="0"/>
+      <w:outlineLvl w:val="5"/>
+    </w:pPr>
+    <w:rPr>
+      <w:rFonts w:asciiTheme="majorHAnsi" w:eastAsiaTheme="majorEastAsia" w:hAnsiTheme="majorHAnsi" w:cstheme="majorBidi"/>
+      <w:i/>
+      <w:iCs/>
+      <w:color w:val="1F4D78" w:themeColor="accent1" w:themeShade="7F"/>
+    </w:rPr>
+  </w:style>
+  <w:style w:type="paragraph" w:styleId="Titre7">
+    <w:name w:val="heading 7"/>
+    <w:basedOn w:val="Normal"/>
+    <w:next w:val="Normal"/>
+    <w:link w:val="Titre7Car"/>
+    <w:uiPriority w:val="9"/>
+    <w:semiHidden/>
+    <w:unhideWhenUsed/>
+    <w:qFormat/>
+    <w:rsid w:val="005127FF"/>
+    <w:pPr>
+      <w:keepNext/>
+      <w:keepLines/>
+      <w:numPr>
+        <w:ilvl w:val="6"/>
+        <w:numId w:val="2"/>
+      </w:numPr>
+      <w:spacing w:before="200" w:after="0"/>
+      <w:outlineLvl w:val="6"/>
+    </w:pPr>
+    <w:rPr>
+      <w:rFonts w:asciiTheme="majorHAnsi" w:eastAsiaTheme="majorEastAsia" w:hAnsiTheme="majorHAnsi" w:cstheme="majorBidi"/>
+      <w:i/>
+      <w:iCs/>
+      <w:color w:val="404040" w:themeColor="text1" w:themeTint="BF"/>
+    </w:rPr>
+  </w:style>
+  <w:style w:type="paragraph" w:styleId="Titre8">
+    <w:name w:val="heading 8"/>
+    <w:basedOn w:val="Normal"/>
+    <w:next w:val="Normal"/>
+    <w:link w:val="Titre8Car"/>
+    <w:uiPriority w:val="9"/>
+    <w:semiHidden/>
+    <w:unhideWhenUsed/>
+    <w:qFormat/>
+    <w:rsid w:val="005127FF"/>
+    <w:pPr>
+      <w:keepNext/>
+      <w:keepLines/>
+      <w:numPr>
+        <w:ilvl w:val="7"/>
+        <w:numId w:val="2"/>
+      </w:numPr>
+      <w:spacing w:before="200" w:after="0"/>
+      <w:outlineLvl w:val="7"/>
+    </w:pPr>
+    <w:rPr>
+      <w:rFonts w:asciiTheme="majorHAnsi" w:eastAsiaTheme="majorEastAsia" w:hAnsiTheme="majorHAnsi" w:cstheme="majorBidi"/>
+      <w:color w:val="404040" w:themeColor="text1" w:themeTint="BF"/>
+      <w:sz w:val="20"/>
+      <w:szCs w:val="20"/>
+    </w:rPr>
+  </w:style>
+  <w:style w:type="paragraph" w:styleId="Titre9">
+    <w:name w:val="heading 9"/>
+    <w:basedOn w:val="Normal"/>
+    <w:next w:val="Normal"/>
+    <w:link w:val="Titre9Car"/>
+    <w:uiPriority w:val="9"/>
+    <w:semiHidden/>
+    <w:unhideWhenUsed/>
+    <w:qFormat/>
+    <w:rsid w:val="005127FF"/>
+    <w:pPr>
+      <w:keepNext/>
+      <w:keepLines/>
+      <w:numPr>
+        <w:ilvl w:val="8"/>
+        <w:numId w:val="2"/>
+      </w:numPr>
+      <w:spacing w:before="200" w:after="0"/>
+      <w:outlineLvl w:val="8"/>
+    </w:pPr>
+    <w:rPr>
+      <w:rFonts w:asciiTheme="majorHAnsi" w:eastAsiaTheme="majorEastAsia" w:hAnsiTheme="majorHAnsi" w:cstheme="majorBidi"/>
+      <w:i/>
+      <w:iCs/>
+      <w:color w:val="404040" w:themeColor="text1" w:themeTint="BF"/>
+      <w:sz w:val="20"/>
+      <w:szCs w:val="20"/>
+    </w:rPr>
+  </w:style>
+  <w:style w:type="character" w:default="1" w:styleId="Policepardfaut">
+    <w:name w:val="Default Paragraph Font"/>
+    <w:uiPriority w:val="1"/>
+    <w:semiHidden/>
+    <w:unhideWhenUsed/>
+  </w:style>
+  <w:style w:type="table" w:default="1" w:styleId="TableauNormal">
+    <w:name w:val="Normal Table"/>
+    <w:uiPriority w:val="99"/>
+    <w:semiHidden/>
+    <w:unhideWhenUsed/>
+    <w:tblPr>
+      <w:tblInd w:w="0" w:type="dxa"/>
+      <w:tblCellMar>
+        <w:top w:w="0" w:type="dxa"/>
+        <w:left w:w="108" w:type="dxa"/>
+        <w:bottom w:w="0" w:type="dxa"/>
+        <w:right w:w="108" w:type="dxa"/>
+      </w:tblCellMar>
+    </w:tblPr>
+  </w:style>
+  <w:style w:type="numbering" w:default="1" w:styleId="Aucuneliste">
+    <w:name w:val="No List"/>
+    <w:uiPriority w:val="99"/>
+    <w:semiHidden/>
+    <w:unhideWhenUsed/>
+  </w:style>
+  <w:style w:type="character" w:styleId="Textedelespacerserv">
+    <w:name w:val="Placeholder Text"/>
+    <w:basedOn w:val="Policepardfaut"/>
+    <w:uiPriority w:val="99"/>
+    <w:semiHidden/>
+    <w:rsid w:val="00270677"/>
+    <w:rPr>
+      <w:color w:val="808080"/>
+    </w:rPr>
+  </w:style>
+  <w:style w:type="paragraph" w:styleId="Textedebulles">
+    <w:name w:val="Balloon Text"/>
+    <w:basedOn w:val="Normal"/>
+    <w:link w:val="TextedebullesCar"/>
+    <w:uiPriority w:val="99"/>
+    <w:semiHidden/>
+    <w:unhideWhenUsed/>
+    <w:rsid w:val="005F2D7B"/>
+    <w:pPr>
+      <w:spacing w:after="0" w:line="240" w:lineRule="auto"/>
+    </w:pPr>
+    <w:rPr>
+      <w:rFonts w:ascii="Tahoma" w:hAnsi="Tahoma" w:cs="Tahoma"/>
+      <w:sz w:val="16"/>
+      <w:szCs w:val="16"/>
+    </w:rPr>
+  </w:style>
+  <w:style w:type="character" w:customStyle="1" w:styleId="TextedebullesCar">
+    <w:name w:val="Texte de bulles Car"/>
+    <w:basedOn w:val="Policepardfaut"/>
+    <w:link w:val="Textedebulles"/>
+    <w:uiPriority w:val="99"/>
+    <w:semiHidden/>
+    <w:rsid w:val="005F2D7B"/>
+    <w:rPr>
+      <w:rFonts w:ascii="Tahoma" w:hAnsi="Tahoma" w:cs="Tahoma"/>
+      <w:sz w:val="16"/>
+      <w:szCs w:val="16"/>
+    </w:rPr>
+  </w:style>
+  <w:style w:type="character" w:customStyle="1" w:styleId="Titre1Car">
+    <w:name w:val="Titre 1 Car"/>
+    <w:basedOn w:val="Policepardfaut"/>
+    <w:link w:val="Titre1"/>
+    <w:uiPriority w:val="9"/>
+    <w:rsid w:val="005127FF"/>
+    <w:rPr>
+      <w:rFonts w:asciiTheme="majorHAnsi" w:eastAsiaTheme="majorEastAsia" w:hAnsiTheme="majorHAnsi" w:cstheme="majorBidi"/>
+      <w:b/>
+      <w:bCs/>
+      <w:color w:val="2E74B5" w:themeColor="accent1" w:themeShade="BF"/>
+      <w:sz w:val="28"/>
+      <w:szCs w:val="28"/>
+    </w:rPr>
+  </w:style>
+  <w:style w:type="paragraph" w:styleId="En-ttedetabledesmatires">
+    <w:name w:val="TOC Heading"/>
+    <w:basedOn w:val="Titre1"/>
+    <w:next w:val="Normal"/>
+    <w:uiPriority w:val="39"/>
+    <w:semiHidden/>
+    <w:unhideWhenUsed/>
+    <w:qFormat/>
+    <w:rsid w:val="005127FF"/>
+    <w:pPr>
+      <w:spacing w:line="276" w:lineRule="auto"/>
+      <w:outlineLvl w:val="9"/>
+    </w:pPr>
+    <w:rPr>
+      <w:lang w:eastAsia="en-GB"/>
+    </w:rPr>
+  </w:style>
+  <w:style w:type="character" w:customStyle="1" w:styleId="Titre2Car">
+    <w:name w:val="Titre 2 Car"/>
+    <w:basedOn w:val="Policepardfaut"/>
+    <w:link w:val="Titre2"/>
+    <w:uiPriority w:val="9"/>
+    <w:rsid w:val="005127FF"/>
+    <w:rPr>
+      <w:rFonts w:asciiTheme="majorHAnsi" w:eastAsiaTheme="majorEastAsia" w:hAnsiTheme="majorHAnsi" w:cstheme="majorBidi"/>
+      <w:b/>
+      <w:bCs/>
+      <w:color w:val="5B9BD5" w:themeColor="accent1"/>
+      <w:sz w:val="26"/>
+      <w:szCs w:val="26"/>
+    </w:rPr>
+  </w:style>
+  <w:style w:type="character" w:customStyle="1" w:styleId="Titre3Car">
+    <w:name w:val="Titre 3 Car"/>
+    <w:basedOn w:val="Policepardfaut"/>
+    <w:link w:val="Titre3"/>
+    <w:uiPriority w:val="9"/>
+    <w:rsid w:val="005127FF"/>
+    <w:rPr>
+      <w:rFonts w:asciiTheme="majorHAnsi" w:eastAsiaTheme="majorEastAsia" w:hAnsiTheme="majorHAnsi" w:cstheme="majorBidi"/>
+      <w:b/>
+      <w:bCs/>
+      <w:color w:val="5B9BD5" w:themeColor="accent1"/>
+    </w:rPr>
+  </w:style>
+  <w:style w:type="character" w:customStyle="1" w:styleId="Titre4Car">
+    <w:name w:val="Titre 4 Car"/>
+    <w:basedOn w:val="Policepardfaut"/>
+    <w:link w:val="Titre4"/>
+    <w:uiPriority w:val="9"/>
+    <w:rsid w:val="005127FF"/>
+    <w:rPr>
+      <w:rFonts w:asciiTheme="majorHAnsi" w:eastAsiaTheme="majorEastAsia" w:hAnsiTheme="majorHAnsi" w:cstheme="majorBidi"/>
+      <w:b/>
+      <w:bCs/>
+      <w:i/>
+      <w:iCs/>
+      <w:color w:val="5B9BD5" w:themeColor="accent1"/>
+    </w:rPr>
+  </w:style>
+  <w:style w:type="character" w:customStyle="1" w:styleId="Titre5Car">
+    <w:name w:val="Titre 5 Car"/>
+    <w:basedOn w:val="Policepardfaut"/>
+    <w:link w:val="Titre5"/>
+    <w:uiPriority w:val="9"/>
+    <w:semiHidden/>
+    <w:rsid w:val="005127FF"/>
+    <w:rPr>
+      <w:rFonts w:asciiTheme="majorHAnsi" w:eastAsiaTheme="majorEastAsia" w:hAnsiTheme="majorHAnsi" w:cstheme="majorBidi"/>
+      <w:color w:val="1F4D78" w:themeColor="accent1" w:themeShade="7F"/>
+    </w:rPr>
+  </w:style>
+  <w:style w:type="character" w:customStyle="1" w:styleId="Titre6Car">
+    <w:name w:val="Titre 6 Car"/>
+    <w:basedOn w:val="Policepardfaut"/>
+    <w:link w:val="Titre6"/>
+    <w:uiPriority w:val="9"/>
+    <w:semiHidden/>
+    <w:rsid w:val="005127FF"/>
+    <w:rPr>
+      <w:rFonts w:asciiTheme="majorHAnsi" w:eastAsiaTheme="majorEastAsia" w:hAnsiTheme="majorHAnsi" w:cstheme="majorBidi"/>
+      <w:i/>
+      <w:iCs/>
+      <w:color w:val="1F4D78" w:themeColor="accent1" w:themeShade="7F"/>
+    </w:rPr>
+  </w:style>
+  <w:style w:type="character" w:customStyle="1" w:styleId="Titre7Car">
+    <w:name w:val="Titre 7 Car"/>
+    <w:basedOn w:val="Policepardfaut"/>
+    <w:link w:val="Titre7"/>
+    <w:uiPriority w:val="9"/>
+    <w:semiHidden/>
+    <w:rsid w:val="005127FF"/>
+    <w:rPr>
+      <w:rFonts w:asciiTheme="majorHAnsi" w:eastAsiaTheme="majorEastAsia" w:hAnsiTheme="majorHAnsi" w:cstheme="majorBidi"/>
+      <w:i/>
+      <w:iCs/>
+      <w:color w:val="404040" w:themeColor="text1" w:themeTint="BF"/>
+    </w:rPr>
+  </w:style>
+  <w:style w:type="character" w:customStyle="1" w:styleId="Titre8Car">
+    <w:name w:val="Titre 8 Car"/>
+    <w:basedOn w:val="Policepardfaut"/>
+    <w:link w:val="Titre8"/>
+    <w:uiPriority w:val="9"/>
+    <w:semiHidden/>
+    <w:rsid w:val="005127FF"/>
+    <w:rPr>
+      <w:rFonts w:asciiTheme="majorHAnsi" w:eastAsiaTheme="majorEastAsia" w:hAnsiTheme="majorHAnsi" w:cstheme="majorBidi"/>
+      <w:color w:val="404040" w:themeColor="text1" w:themeTint="BF"/>
+      <w:sz w:val="20"/>
+      <w:szCs w:val="20"/>
+    </w:rPr>
+  </w:style>
+  <w:style w:type="character" w:customStyle="1" w:styleId="Titre9Car">
+    <w:name w:val="Titre 9 Car"/>
+    <w:basedOn w:val="Policepardfaut"/>
+    <w:link w:val="Titre9"/>
+    <w:uiPriority w:val="9"/>
+    <w:semiHidden/>
+    <w:rsid w:val="005127FF"/>
+    <w:rPr>
+      <w:rFonts w:asciiTheme="majorHAnsi" w:eastAsiaTheme="majorEastAsia" w:hAnsiTheme="majorHAnsi" w:cstheme="majorBidi"/>
+      <w:i/>
+      <w:iCs/>
+      <w:color w:val="404040" w:themeColor="text1" w:themeTint="BF"/>
+      <w:sz w:val="20"/>
+      <w:szCs w:val="20"/>
+    </w:rPr>
+  </w:style>
+  <w:style w:type="paragraph" w:styleId="TM1">
+    <w:name w:val="toc 1"/>
+    <w:basedOn w:val="Normal"/>
+    <w:next w:val="Normal"/>
+    <w:autoRedefine/>
+    <w:uiPriority w:val="39"/>
+    <w:unhideWhenUsed/>
+    <w:rsid w:val="00A161BB"/>
+    <w:pPr>
+      <w:spacing w:after="100"/>
+    </w:pPr>
+  </w:style>
+  <w:style w:type="paragraph" w:styleId="TM2">
+    <w:name w:val="toc 2"/>
+    <w:basedOn w:val="Normal"/>
+    <w:next w:val="Normal"/>
+    <w:autoRedefine/>
+    <w:uiPriority w:val="39"/>
+    <w:unhideWhenUsed/>
+    <w:rsid w:val="00A161BB"/>
+    <w:pPr>
+      <w:spacing w:after="100"/>
+      <w:ind w:left="220"/>
+    </w:pPr>
+  </w:style>
+  <w:style w:type="paragraph" w:styleId="TM3">
+    <w:name w:val="toc 3"/>
+    <w:basedOn w:val="Normal"/>
+    <w:next w:val="Normal"/>
+    <w:autoRedefine/>
+    <w:uiPriority w:val="39"/>
+    <w:unhideWhenUsed/>
+    <w:rsid w:val="00A161BB"/>
+    <w:pPr>
+      <w:spacing w:after="100"/>
+      <w:ind w:left="440"/>
+    </w:pPr>
+  </w:style>
+  <w:style w:type="character" w:styleId="Lienhypertexte">
+    <w:name w:val="Hyperlink"/>
+    <w:basedOn w:val="Policepardfaut"/>
+    <w:uiPriority w:val="99"/>
+    <w:unhideWhenUsed/>
+    <w:rsid w:val="00A161BB"/>
+    <w:rPr>
+      <w:color w:val="0563C1" w:themeColor="hyperlink"/>
+      <w:u w:val="single"/>
+    </w:rPr>
+  </w:style>
+  <w:style w:type="paragraph" w:styleId="Paragraphedeliste">
+    <w:name w:val="List Paragraph"/>
+    <w:basedOn w:val="Normal"/>
+    <w:uiPriority w:val="34"/>
+    <w:qFormat/>
+    <w:rsid w:val="008C2CE8"/>
+    <w:pPr>
+      <w:ind w:left="720"/>
+      <w:contextualSpacing/>
+    </w:pPr>
+  </w:style>
 </w:styles>
 </file>
 
@@ -23316,7 +24552,7 @@
   <a:extraClrSchemeLst/>
   <a:extLst>
     <a:ext uri="{05A4C25C-085E-4340-85A3-A5531E510DB2}">
-      <thm15:themeFamily xmlns:thm15="http://schemas.microsoft.com/office/thememl/2012/main" name="Office Theme" id="{62F939B6-93AF-4DB8-9C6B-D6C7DFDC589F}" vid="{4A3C46E8-61CC-4603-A589-7422A47A8E4A}"/>
+      <thm15:themeFamily xmlns:thm15="http://schemas.microsoft.com/office/thememl/2012/main" xmlns="" name="Office Theme" id="{62F939B6-93AF-4DB8-9C6B-D6C7DFDC589F}" vid="{4A3C46E8-61CC-4603-A589-7422A47A8E4A}"/>
     </a:ext>
   </a:extLst>
 </a:theme>
@@ -23327,7 +24563,7 @@
 </file>
 
 <file path=customXml/itemProps1.xml><?xml version="1.0" encoding="utf-8"?>
-<ds:datastoreItem xmlns:ds="http://schemas.openxmlformats.org/officeDocument/2006/customXml" ds:itemID="{86DE43E2-EB51-4203-BE24-33AC26966F6F}">
+<ds:datastoreItem xmlns:ds="http://schemas.openxmlformats.org/officeDocument/2006/customXml" ds:itemID="{D18B32E6-A02E-4C13-96C4-46F7E79E4E15}">
   <ds:schemaRefs>
     <ds:schemaRef ds:uri="http://schemas.openxmlformats.org/officeDocument/2006/bibliography"/>
   </ds:schemaRefs>

</xml_diff>

<commit_message>
Correction of mistakes in the relations
</commit_message>
<xml_diff>
--- a/Information/script for equations.docx
+++ b/Information/script for equations.docx
@@ -1,6 +1,6 @@
 
 <file path=word/document.xml><?xml version="1.0" encoding="utf-8"?>
-<w:document xmlns:wpc="http://schemas.microsoft.com/office/word/2010/wordprocessingCanvas" xmlns:mc="http://schemas.openxmlformats.org/markup-compatibility/2006" xmlns:o="urn:schemas-microsoft-com:office:office" xmlns:r="http://schemas.openxmlformats.org/officeDocument/2006/relationships" xmlns:m="http://schemas.openxmlformats.org/officeDocument/2006/math" xmlns:v="urn:schemas-microsoft-com:vml" xmlns:wp14="http://schemas.microsoft.com/office/word/2010/wordprocessingDrawing" xmlns:wp="http://schemas.openxmlformats.org/drawingml/2006/wordprocessingDrawing" xmlns:w10="urn:schemas-microsoft-com:office:word" xmlns:w="http://schemas.openxmlformats.org/wordprocessingml/2006/main" xmlns:w14="http://schemas.microsoft.com/office/word/2010/wordml" xmlns:wpg="http://schemas.microsoft.com/office/word/2010/wordprocessingGroup" xmlns:wpi="http://schemas.microsoft.com/office/word/2010/wordprocessingInk" xmlns:wne="http://schemas.microsoft.com/office/word/2006/wordml" xmlns:wps="http://schemas.microsoft.com/office/word/2010/wordprocessingShape" mc:Ignorable="w14 wp14">
+<w:document xmlns:wpc="http://schemas.microsoft.com/office/word/2010/wordprocessingCanvas" xmlns:mc="http://schemas.openxmlformats.org/markup-compatibility/2006" xmlns:o="urn:schemas-microsoft-com:office:office" xmlns:r="http://schemas.openxmlformats.org/officeDocument/2006/relationships" xmlns:m="http://schemas.openxmlformats.org/officeDocument/2006/math" xmlns:v="urn:schemas-microsoft-com:vml" xmlns:wp14="http://schemas.microsoft.com/office/word/2010/wordprocessingDrawing" xmlns:wp="http://schemas.openxmlformats.org/drawingml/2006/wordprocessingDrawing" xmlns:w10="urn:schemas-microsoft-com:office:word" xmlns:w="http://schemas.openxmlformats.org/wordprocessingml/2006/main" xmlns:w14="http://schemas.microsoft.com/office/word/2010/wordml" xmlns:w15="http://schemas.microsoft.com/office/word/2012/wordml" xmlns:wpg="http://schemas.microsoft.com/office/word/2010/wordprocessingGroup" xmlns:wpi="http://schemas.microsoft.com/office/word/2010/wordprocessingInk" xmlns:wne="http://schemas.microsoft.com/office/word/2006/wordml" xmlns:wps="http://schemas.microsoft.com/office/word/2010/wordprocessingShape" mc:Ignorable="w14 w15 wp14">
   <w:body>
     <w:sdt>
       <w:sdtPr>
@@ -19,6 +19,7 @@
           <w:docPartUnique/>
         </w:docPartObj>
       </w:sdtPr>
+      <w:sdtEndPr/>
       <w:sdtContent>
         <w:p>
           <w:pPr>
@@ -8919,13 +8920,7 @@
             <w:rPr>
               <w:rFonts w:ascii="Cambria Math" w:eastAsiaTheme="minorEastAsia" w:hAnsi="Cambria Math"/>
             </w:rPr>
-            <m:t>dx= B</m:t>
-          </m:r>
-          <m:r>
-            <w:rPr>
-              <w:rFonts w:ascii="Cambria Math" w:eastAsiaTheme="minorEastAsia" w:hAnsi="Cambria Math"/>
-            </w:rPr>
-            <m:t>iot×</m:t>
+            <m:t>dx= Biot×</m:t>
           </m:r>
           <m:f>
             <m:fPr>
@@ -10784,13 +10779,7 @@
             <w:rPr>
               <w:rFonts w:ascii="Cambria Math" w:eastAsiaTheme="minorEastAsia" w:hAnsi="Cambria Math"/>
             </w:rPr>
-            <m:t>γ=</m:t>
-          </m:r>
-          <m:r>
-            <w:rPr>
-              <w:rFonts w:ascii="Cambria Math" w:eastAsiaTheme="minorEastAsia" w:hAnsi="Cambria Math"/>
-            </w:rPr>
-            <m:t>1-</m:t>
+            <m:t>γ=1-</m:t>
           </m:r>
           <m:r>
             <m:rPr>
@@ -10805,19 +10794,7 @@
             <w:rPr>
               <w:rFonts w:ascii="Cambria Math" w:eastAsiaTheme="minorEastAsia" w:hAnsi="Cambria Math"/>
             </w:rPr>
-            <m:t>(-</m:t>
-          </m:r>
-          <m:r>
-            <w:rPr>
-              <w:rFonts w:ascii="Cambria Math" w:eastAsiaTheme="minorEastAsia" w:hAnsi="Cambria Math"/>
-            </w:rPr>
-            <m:t>NTU</m:t>
-          </m:r>
-          <m:r>
-            <w:rPr>
-              <w:rFonts w:ascii="Cambria Math" w:eastAsiaTheme="minorEastAsia" w:hAnsi="Cambria Math"/>
-            </w:rPr>
-            <m:t>)</m:t>
+            <m:t>(-NTU)</m:t>
           </m:r>
         </m:oMath>
       </m:oMathPara>
@@ -10834,13 +10811,7 @@
             <w:rPr>
               <w:rFonts w:ascii="Cambria Math" w:eastAsiaTheme="minorEastAsia" w:hAnsi="Cambria Math"/>
             </w:rPr>
-            <m:t>E</m:t>
-          </m:r>
-          <m:r>
-            <w:rPr>
-              <w:rFonts w:ascii="Cambria Math" w:eastAsiaTheme="minorEastAsia" w:hAnsi="Cambria Math"/>
-            </w:rPr>
-            <m:t>ff=</m:t>
+            <m:t>Eff=</m:t>
           </m:r>
           <m:f>
             <m:fPr>
@@ -10881,13 +10852,7 @@
                     <w:rPr>
                       <w:rFonts w:ascii="Cambria Math" w:eastAsiaTheme="minorEastAsia" w:hAnsi="Cambria Math"/>
                     </w:rPr>
-                    <m:t>Cr×</m:t>
-                  </m:r>
-                  <m:r>
-                    <w:rPr>
-                      <w:rFonts w:ascii="Cambria Math" w:eastAsiaTheme="minorEastAsia" w:hAnsi="Cambria Math"/>
-                    </w:rPr>
-                    <m:t>γ</m:t>
+                    <m:t>Cr×γ</m:t>
                   </m:r>
                 </m:e>
               </m:d>
@@ -10935,16 +10900,8 @@
           <w:rFonts w:eastAsiaTheme="minorEastAsia"/>
         </w:rPr>
         <w:lastRenderedPageBreak/>
-        <w:t>Qc_max (Unmixed), Qc_min (M</w:t>
+        <w:t xml:space="preserve">Qc_max (Unmixed), Qc_min (Mixed) </w:t>
       </w:r>
-      <w:r>
-        <w:rPr>
-          <w:rFonts w:eastAsiaTheme="minorEastAsia"/>
-        </w:rPr>
-        <w:t xml:space="preserve">ixed) </w:t>
-      </w:r>
-      <w:bookmarkStart w:id="22" w:name="_GoBack"/>
-      <w:bookmarkEnd w:id="22"/>
     </w:p>
     <w:p>
       <w:pPr>
@@ -10973,19 +10930,7 @@
             <w:rPr>
               <w:rFonts w:ascii="Cambria Math" w:eastAsiaTheme="minorEastAsia" w:hAnsi="Cambria Math"/>
             </w:rPr>
-            <m:t>(-NTU</m:t>
-          </m:r>
-          <m:r>
-            <w:rPr>
-              <w:rFonts w:ascii="Cambria Math" w:eastAsiaTheme="minorEastAsia" w:hAnsi="Cambria Math"/>
-            </w:rPr>
-            <m:t>×Cr</m:t>
-          </m:r>
-          <m:r>
-            <w:rPr>
-              <w:rFonts w:ascii="Cambria Math" w:eastAsiaTheme="minorEastAsia" w:hAnsi="Cambria Math"/>
-            </w:rPr>
-            <m:t>)</m:t>
+            <m:t>(-NTU×Cr)</m:t>
           </m:r>
         </m:oMath>
       </m:oMathPara>
@@ -11002,13 +10947,7 @@
             <w:rPr>
               <w:rFonts w:ascii="Cambria Math" w:eastAsiaTheme="minorEastAsia" w:hAnsi="Cambria Math"/>
             </w:rPr>
-            <m:t>E</m:t>
-          </m:r>
-          <m:r>
-            <w:rPr>
-              <w:rFonts w:ascii="Cambria Math" w:eastAsiaTheme="minorEastAsia" w:hAnsi="Cambria Math"/>
-            </w:rPr>
-            <m:t>ff=1-</m:t>
+            <m:t>Eff=1-</m:t>
           </m:r>
           <m:r>
             <m:rPr>
@@ -11074,7 +11013,7 @@
           <w:rFonts w:eastAsiaTheme="minorEastAsia"/>
         </w:rPr>
       </w:pPr>
-      <w:bookmarkStart w:id="23" w:name="_Toc41656111"/>
+      <w:bookmarkStart w:id="22" w:name="_Toc41656111"/>
       <w:proofErr w:type="spellStart"/>
       <w:r>
         <w:rPr>
@@ -11088,7 +11027,7 @@
         </w:rPr>
         <w:t>counterCurrent</w:t>
       </w:r>
-      <w:bookmarkEnd w:id="23"/>
+      <w:bookmarkEnd w:id="22"/>
       <w:proofErr w:type="spellEnd"/>
     </w:p>
     <w:p>
@@ -11134,7 +11073,13 @@
                 <w:rPr>
                   <w:rFonts w:ascii="Cambria Math" w:eastAsiaTheme="minorEastAsia" w:hAnsi="Cambria Math"/>
                 </w:rPr>
-                <m:t>1-Cr</m:t>
+                <m:t>Cr</m:t>
+              </m:r>
+              <m:r>
+                <w:rPr>
+                  <w:rFonts w:ascii="Cambria Math" w:eastAsiaTheme="minorEastAsia" w:hAnsi="Cambria Math"/>
+                </w:rPr>
+                <m:t>-1</m:t>
               </m:r>
             </m:den>
           </m:f>
@@ -11174,10 +11119,43 @@
                 </m:fPr>
                 <m:num>
                   <m:r>
+                    <m:rPr>
+                      <m:sty m:val="p"/>
+                    </m:rPr>
                     <w:rPr>
                       <w:rFonts w:ascii="Cambria Math" w:eastAsiaTheme="minorEastAsia" w:hAnsi="Cambria Math"/>
                     </w:rPr>
-                    <m:t>1-Eff×Cr</m:t>
+                    <m:t>min</m:t>
+                  </m:r>
+                  <m:d>
+                    <m:dPr>
+                      <m:ctrlPr>
+                        <w:rPr>
+                          <w:rFonts w:ascii="Cambria Math" w:eastAsiaTheme="minorEastAsia" w:hAnsi="Cambria Math"/>
+                          <w:i/>
+                        </w:rPr>
+                      </m:ctrlPr>
+                    </m:dPr>
+                    <m:e>
+                      <m:r>
+                        <w:rPr>
+                          <w:rFonts w:ascii="Cambria Math" w:eastAsiaTheme="minorEastAsia" w:hAnsi="Cambria Math"/>
+                        </w:rPr>
+                        <m:t>Eff,0.999</m:t>
+                      </m:r>
+                    </m:e>
+                  </m:d>
+                  <m:r>
+                    <w:rPr>
+                      <w:rFonts w:ascii="Cambria Math" w:eastAsiaTheme="minorEastAsia" w:hAnsi="Cambria Math"/>
+                    </w:rPr>
+                    <m:t>-</m:t>
+                  </m:r>
+                  <m:r>
+                    <w:rPr>
+                      <w:rFonts w:ascii="Cambria Math" w:eastAsiaTheme="minorEastAsia" w:hAnsi="Cambria Math"/>
+                    </w:rPr>
+                    <m:t>1</m:t>
                   </m:r>
                 </m:num>
                 <m:den>
@@ -11185,28 +11163,13 @@
                     <w:rPr>
                       <w:rFonts w:ascii="Cambria Math" w:eastAsiaTheme="minorEastAsia" w:hAnsi="Cambria Math"/>
                     </w:rPr>
-                    <m:t>1-</m:t>
+                    <m:t>Eff×Cr</m:t>
                   </m:r>
                   <m:r>
-                    <m:rPr>
-                      <m:sty m:val="p"/>
-                    </m:rPr>
                     <w:rPr>
                       <w:rFonts w:ascii="Cambria Math" w:eastAsiaTheme="minorEastAsia" w:hAnsi="Cambria Math"/>
                     </w:rPr>
-                    <m:t>min</m:t>
-                  </m:r>
-                  <m:r>
-                    <w:rPr>
-                      <w:rFonts w:ascii="Cambria Math" w:eastAsiaTheme="minorEastAsia" w:hAnsi="Cambria Math"/>
-                    </w:rPr>
-                    <m:t>(E</m:t>
-                  </m:r>
-                  <m:r>
-                    <w:rPr>
-                      <w:rFonts w:ascii="Cambria Math" w:eastAsiaTheme="minorEastAsia" w:hAnsi="Cambria Math"/>
-                    </w:rPr>
-                    <m:t>ff,0.999)</m:t>
+                    <m:t>-1</m:t>
                   </m:r>
                 </m:den>
               </m:f>
@@ -11344,7 +11307,7 @@
             <w:rPr>
               <w:rFonts w:ascii="Cambria Math" w:eastAsiaTheme="minorEastAsia" w:hAnsi="Cambria Math"/>
             </w:rPr>
-            <m:t>NTU=-</m:t>
+            <m:t>NTU=</m:t>
           </m:r>
           <m:r>
             <m:rPr>
@@ -11353,46 +11316,74 @@
             <w:rPr>
               <w:rFonts w:ascii="Cambria Math" w:eastAsiaTheme="minorEastAsia" w:hAnsi="Cambria Math"/>
             </w:rPr>
-            <m:t>ln⁡</m:t>
-          </m:r>
-          <m:d>
-            <m:dPr>
-              <m:ctrlPr>
-                <w:rPr>
-                  <w:rFonts w:ascii="Cambria Math" w:eastAsiaTheme="minorEastAsia" w:hAnsi="Cambria Math"/>
-                  <w:i/>
-                </w:rPr>
-              </m:ctrlPr>
-            </m:dPr>
-            <m:e>
-              <m:f>
-                <m:fPr>
+            <m:t>⁡</m:t>
+          </m:r>
+          <m:f>
+            <m:fPr>
+              <m:ctrlPr>
+                <w:rPr>
+                  <w:rFonts w:ascii="Cambria Math" w:eastAsiaTheme="minorEastAsia" w:hAnsi="Cambria Math"/>
+                </w:rPr>
+              </m:ctrlPr>
+            </m:fPr>
+            <m:num>
+              <m:r>
+                <w:rPr>
+                  <w:rFonts w:ascii="Cambria Math" w:eastAsiaTheme="minorEastAsia" w:hAnsi="Cambria Math"/>
+                </w:rPr>
+                <m:t>-</m:t>
+              </m:r>
+              <m:r>
+                <m:rPr>
+                  <m:sty m:val="p"/>
+                </m:rPr>
+                <w:rPr>
+                  <w:rFonts w:ascii="Cambria Math" w:eastAsiaTheme="minorEastAsia" w:hAnsi="Cambria Math"/>
+                </w:rPr>
+                <m:t>ln</m:t>
+              </m:r>
+              <m:d>
+                <m:dPr>
                   <m:ctrlPr>
                     <w:rPr>
                       <w:rFonts w:ascii="Cambria Math" w:eastAsiaTheme="minorEastAsia" w:hAnsi="Cambria Math"/>
-                      <w:i/>
                     </w:rPr>
                   </m:ctrlPr>
-                </m:fPr>
-                <m:num>
+                </m:dPr>
+                <m:e>
                   <m:r>
                     <w:rPr>
                       <w:rFonts w:ascii="Cambria Math" w:eastAsiaTheme="minorEastAsia" w:hAnsi="Cambria Math"/>
                     </w:rPr>
-                    <m:t>1-Eff×(1+Eff)</m:t>
+                    <m:t>1-Eff×(1+Cr)</m:t>
                   </m:r>
-                </m:num>
-                <m:den>
-                  <m:r>
-                    <w:rPr>
-                      <w:rFonts w:ascii="Cambria Math" w:eastAsiaTheme="minorEastAsia" w:hAnsi="Cambria Math"/>
-                    </w:rPr>
-                    <m:t>1+Eff</m:t>
-                  </m:r>
-                </m:den>
-              </m:f>
-            </m:e>
-          </m:d>
+                </m:e>
+              </m:d>
+            </m:num>
+            <m:den>
+              <m:r>
+                <w:rPr>
+                  <w:rFonts w:ascii="Cambria Math" w:eastAsiaTheme="minorEastAsia" w:hAnsi="Cambria Math"/>
+                </w:rPr>
+                <m:t>1+</m:t>
+              </m:r>
+              <m:r>
+                <w:rPr>
+                  <w:rFonts w:ascii="Cambria Math" w:eastAsiaTheme="minorEastAsia" w:hAnsi="Cambria Math"/>
+                </w:rPr>
+                <m:t>Cr</m:t>
+              </m:r>
+            </m:den>
+          </m:f>
+          <m:r>
+            <m:rPr>
+              <m:sty m:val="p"/>
+            </m:rPr>
+            <w:rPr>
+              <w:rFonts w:ascii="Cambria Math" w:eastAsiaTheme="minorEastAsia" w:hAnsi="Cambria Math"/>
+            </w:rPr>
+            <m:t>⁡</m:t>
+          </m:r>
         </m:oMath>
       </m:oMathPara>
     </w:p>
@@ -11415,6 +11406,8 @@
         </w:rPr>
         <w:br w:type="page"/>
       </w:r>
+      <w:bookmarkStart w:id="23" w:name="_GoBack"/>
+      <w:bookmarkEnd w:id="23"/>
     </w:p>
     <w:p>
       <w:pPr>
@@ -12967,13 +12960,7 @@
             <w:rPr>
               <w:rFonts w:ascii="Cambria Math" w:eastAsiaTheme="minorEastAsia" w:hAnsi="Cambria Math"/>
             </w:rPr>
-            <m:t>Q_flow_buoyancy=m_flow_buoy</m:t>
-          </m:r>
-          <m:r>
-            <w:rPr>
-              <w:rFonts w:ascii="Cambria Math" w:eastAsiaTheme="minorEastAsia" w:hAnsi="Cambria Math"/>
-            </w:rPr>
-            <m:t>ancy×</m:t>
+            <m:t>Q_flow_buoyancy=m_flow_buoyancy×</m:t>
           </m:r>
           <m:d>
             <m:dPr>
@@ -16179,13 +16166,7 @@
                 <w:rPr>
                   <w:rFonts w:ascii="Cambria Math" w:eastAsiaTheme="minorEastAsia" w:hAnsi="Cambria Math"/>
                 </w:rPr>
-                <m:t>ground gas n</m:t>
-              </m:r>
-              <m:r>
-                <w:rPr>
-                  <w:rFonts w:ascii="Cambria Math" w:eastAsiaTheme="minorEastAsia" w:hAnsi="Cambria Math"/>
-                </w:rPr>
-                <m:t>ode</m:t>
+                <m:t>ground gas node</m:t>
               </m:r>
             </m:sub>
           </m:sSub>
@@ -16476,16 +16457,7 @@
               <w:rFonts w:ascii="Cambria Math" w:eastAsiaTheme="minorEastAsia" w:hAnsi="Cambria Math"/>
             </w:rPr>
             <w:lastRenderedPageBreak/>
-            <m:t>mXi_flo</m:t>
-          </m:r>
-          <m:r>
-            <m:rPr>
-              <m:sty m:val="bi"/>
-            </m:rPr>
-            <w:rPr>
-              <w:rFonts w:ascii="Cambria Math" w:eastAsiaTheme="minorEastAsia" w:hAnsi="Cambria Math"/>
-            </w:rPr>
-            <m:t>w[i]</m:t>
+            <m:t>mXi_flow[i]</m:t>
           </m:r>
           <m:r>
             <w:rPr>
@@ -16667,13 +16639,7 @@
                     <w:rPr>
                       <w:rFonts w:ascii="Cambria Math" w:eastAsiaTheme="minorEastAsia" w:hAnsi="Cambria Math"/>
                     </w:rPr>
-                    <m:t>flui</m:t>
-                  </m:r>
-                  <m:r>
-                    <w:rPr>
-                      <w:rFonts w:ascii="Cambria Math" w:eastAsiaTheme="minorEastAsia" w:hAnsi="Cambria Math"/>
-                    </w:rPr>
-                    <m:t>dPort.m_flow×actualStream(fluidPort.h_outflow)</m:t>
+                    <m:t>fluidPort.m_flow×actualStream(fluidPort.h_outflow)</m:t>
                   </m:r>
                 </m:e>
               </m:d>
@@ -21434,14 +21400,7 @@
               <w:rFonts w:ascii="Cambria Math" w:hAnsi="Cambria Math"/>
               <w:sz w:val="18"/>
             </w:rPr>
-            <m:t>f</m:t>
-          </m:r>
-          <m:r>
-            <w:rPr>
-              <w:rFonts w:ascii="Cambria Math" w:hAnsi="Cambria Math"/>
-              <w:sz w:val="18"/>
-            </w:rPr>
-            <m:t>or i=N+1</m:t>
+            <m:t>for i=N+1</m:t>
           </m:r>
         </m:oMath>
       </m:oMathPara>
@@ -22034,8 +21993,8 @@
 </file>
 
 <file path=word/numbering.xml><?xml version="1.0" encoding="utf-8"?>
-<w:numbering xmlns:wpc="http://schemas.microsoft.com/office/word/2010/wordprocessingCanvas" xmlns:mc="http://schemas.openxmlformats.org/markup-compatibility/2006" xmlns:o="urn:schemas-microsoft-com:office:office" xmlns:r="http://schemas.openxmlformats.org/officeDocument/2006/relationships" xmlns:m="http://schemas.openxmlformats.org/officeDocument/2006/math" xmlns:v="urn:schemas-microsoft-com:vml" xmlns:wp14="http://schemas.microsoft.com/office/word/2010/wordprocessingDrawing" xmlns:wp="http://schemas.openxmlformats.org/drawingml/2006/wordprocessingDrawing" xmlns:w10="urn:schemas-microsoft-com:office:word" xmlns:w="http://schemas.openxmlformats.org/wordprocessingml/2006/main" xmlns:w14="http://schemas.microsoft.com/office/word/2010/wordml" xmlns:wpg="http://schemas.microsoft.com/office/word/2010/wordprocessingGroup" xmlns:wpi="http://schemas.microsoft.com/office/word/2010/wordprocessingInk" xmlns:wne="http://schemas.microsoft.com/office/word/2006/wordml" xmlns:wps="http://schemas.microsoft.com/office/word/2010/wordprocessingShape" mc:Ignorable="w14 wp14">
-  <w:abstractNum w:abstractNumId="0">
+<w:numbering xmlns:wpc="http://schemas.microsoft.com/office/word/2010/wordprocessingCanvas" xmlns:mc="http://schemas.openxmlformats.org/markup-compatibility/2006" xmlns:o="urn:schemas-microsoft-com:office:office" xmlns:r="http://schemas.openxmlformats.org/officeDocument/2006/relationships" xmlns:m="http://schemas.openxmlformats.org/officeDocument/2006/math" xmlns:v="urn:schemas-microsoft-com:vml" xmlns:wp14="http://schemas.microsoft.com/office/word/2010/wordprocessingDrawing" xmlns:wp="http://schemas.openxmlformats.org/drawingml/2006/wordprocessingDrawing" xmlns:w10="urn:schemas-microsoft-com:office:word" xmlns:w="http://schemas.openxmlformats.org/wordprocessingml/2006/main" xmlns:w14="http://schemas.microsoft.com/office/word/2010/wordml" xmlns:w15="http://schemas.microsoft.com/office/word/2012/wordml" xmlns:wpg="http://schemas.microsoft.com/office/word/2010/wordprocessingGroup" xmlns:wpi="http://schemas.microsoft.com/office/word/2010/wordprocessingInk" xmlns:wne="http://schemas.microsoft.com/office/word/2006/wordml" xmlns:wps="http://schemas.microsoft.com/office/word/2010/wordprocessingShape" mc:Ignorable="w14 w15 wp14">
+  <w:abstractNum w:abstractNumId="0" w15:restartNumberingAfterBreak="0">
     <w:nsid w:val="06D54705"/>
     <w:multiLevelType w:val="hybridMultilevel"/>
     <w:tmpl w:val="82603C3A"/>
@@ -22121,7 +22080,7 @@
       </w:pPr>
     </w:lvl>
   </w:abstractNum>
-  <w:abstractNum w:abstractNumId="1">
+  <w:abstractNum w:abstractNumId="1" w15:restartNumberingAfterBreak="0">
     <w:nsid w:val="099E2445"/>
     <w:multiLevelType w:val="hybridMultilevel"/>
     <w:tmpl w:val="64904D4E"/>
@@ -22234,7 +22193,7 @@
       </w:rPr>
     </w:lvl>
   </w:abstractNum>
-  <w:abstractNum w:abstractNumId="2">
+  <w:abstractNum w:abstractNumId="2" w15:restartNumberingAfterBreak="0">
     <w:nsid w:val="0C276DFE"/>
     <w:multiLevelType w:val="multilevel"/>
     <w:tmpl w:val="08090027"/>
@@ -22942,7 +22901,7 @@
 </file>
 
 <file path=word/styles.xml><?xml version="1.0" encoding="utf-8"?>
-<w:styles xmlns:mc="http://schemas.openxmlformats.org/markup-compatibility/2006" xmlns:r="http://schemas.openxmlformats.org/officeDocument/2006/relationships" xmlns:w="http://schemas.openxmlformats.org/wordprocessingml/2006/main" xmlns:w14="http://schemas.microsoft.com/office/word/2010/wordml" mc:Ignorable="w14">
+<w:styles xmlns:mc="http://schemas.openxmlformats.org/markup-compatibility/2006" xmlns:r="http://schemas.openxmlformats.org/officeDocument/2006/relationships" xmlns:w="http://schemas.openxmlformats.org/wordprocessingml/2006/main" xmlns:w14="http://schemas.microsoft.com/office/word/2010/wordml" xmlns:w15="http://schemas.microsoft.com/office/word/2012/wordml" mc:Ignorable="w14 w15">
   <w:docDefaults>
     <w:rPrDefault>
       <w:rPr>
@@ -22958,822 +22917,378 @@
       </w:pPr>
     </w:pPrDefault>
   </w:docDefaults>
-  <w:latentStyles w:defLockedState="0" w:defUIPriority="99" w:defSemiHidden="1" w:defUnhideWhenUsed="1" w:defQFormat="0" w:count="267">
-    <w:lsdException w:name="Normal" w:semiHidden="0" w:uiPriority="0" w:unhideWhenUsed="0" w:qFormat="1"/>
-    <w:lsdException w:name="heading 1" w:semiHidden="0" w:uiPriority="9" w:unhideWhenUsed="0" w:qFormat="1"/>
-    <w:lsdException w:name="heading 2" w:uiPriority="9" w:qFormat="1"/>
-    <w:lsdException w:name="heading 3" w:uiPriority="9" w:qFormat="1"/>
-    <w:lsdException w:name="heading 4" w:uiPriority="9" w:qFormat="1"/>
-    <w:lsdException w:name="heading 5" w:uiPriority="9" w:qFormat="1"/>
-    <w:lsdException w:name="heading 6" w:uiPriority="9" w:qFormat="1"/>
-    <w:lsdException w:name="heading 7" w:uiPriority="9" w:qFormat="1"/>
-    <w:lsdException w:name="heading 8" w:uiPriority="9" w:qFormat="1"/>
-    <w:lsdException w:name="heading 9" w:uiPriority="9" w:qFormat="1"/>
-    <w:lsdException w:name="toc 1" w:uiPriority="39"/>
-    <w:lsdException w:name="toc 2" w:uiPriority="39"/>
-    <w:lsdException w:name="toc 3" w:uiPriority="39"/>
-    <w:lsdException w:name="toc 4" w:uiPriority="39"/>
-    <w:lsdException w:name="toc 5" w:uiPriority="39"/>
-    <w:lsdException w:name="toc 6" w:uiPriority="39"/>
-    <w:lsdException w:name="toc 7" w:uiPriority="39"/>
-    <w:lsdException w:name="toc 8" w:uiPriority="39"/>
-    <w:lsdException w:name="toc 9" w:uiPriority="39"/>
-    <w:lsdException w:name="caption" w:uiPriority="35" w:qFormat="1"/>
-    <w:lsdException w:name="Title" w:semiHidden="0" w:uiPriority="10" w:unhideWhenUsed="0" w:qFormat="1"/>
-    <w:lsdException w:name="Default Paragraph Font" w:uiPriority="1"/>
-    <w:lsdException w:name="Subtitle" w:semiHidden="0" w:uiPriority="11" w:unhideWhenUsed="0" w:qFormat="1"/>
-    <w:lsdException w:name="Strong" w:semiHidden="0" w:uiPriority="22" w:unhideWhenUsed="0" w:qFormat="1"/>
-    <w:lsdException w:name="Emphasis" w:semiHidden="0" w:uiPriority="20" w:unhideWhenUsed="0" w:qFormat="1"/>
-    <w:lsdException w:name="Table Grid" w:semiHidden="0" w:uiPriority="39" w:unhideWhenUsed="0"/>
-    <w:lsdException w:name="Placeholder Text" w:unhideWhenUsed="0"/>
-    <w:lsdException w:name="No Spacing" w:semiHidden="0" w:uiPriority="1" w:unhideWhenUsed="0" w:qFormat="1"/>
-    <w:lsdException w:name="Light Shading" w:semiHidden="0" w:uiPriority="60" w:unhideWhenUsed="0"/>
-    <w:lsdException w:name="Light List" w:semiHidden="0" w:uiPriority="61" w:unhideWhenUsed="0"/>
-    <w:lsdException w:name="Light Grid" w:semiHidden="0" w:uiPriority="62" w:unhideWhenUsed="0"/>
-    <w:lsdException w:name="Medium Shading 1" w:semiHidden="0" w:uiPriority="63" w:unhideWhenUsed="0"/>
-    <w:lsdException w:name="Medium Shading 2" w:semiHidden="0" w:uiPriority="64" w:unhideWhenUsed="0"/>
-    <w:lsdException w:name="Medium List 1" w:semiHidden="0" w:uiPriority="65" w:unhideWhenUsed="0"/>
-    <w:lsdException w:name="Medium List 2" w:semiHidden="0" w:uiPriority="66" w:unhideWhenUsed="0"/>
-    <w:lsdException w:name="Medium Grid 1" w:semiHidden="0" w:uiPriority="67" w:unhideWhenUsed="0"/>
-    <w:lsdException w:name="Medium Grid 2" w:semiHidden="0" w:uiPriority="68" w:unhideWhenUsed="0"/>
-    <w:lsdException w:name="Medium Grid 3" w:semiHidden="0" w:uiPriority="69" w:unhideWhenUsed="0"/>
-    <w:lsdException w:name="Dark List" w:semiHidden="0" w:uiPriority="70" w:unhideWhenUsed="0"/>
-    <w:lsdException w:name="Colorful Shading" w:semiHidden="0" w:uiPriority="71" w:unhideWhenUsed="0"/>
-    <w:lsdException w:name="Colorful List" w:semiHidden="0" w:uiPriority="72" w:unhideWhenUsed="0"/>
-    <w:lsdException w:name="Colorful Grid" w:semiHidden="0" w:uiPriority="73" w:unhideWhenUsed="0"/>
-    <w:lsdException w:name="Light Shading Accent 1" w:semiHidden="0" w:uiPriority="60" w:unhideWhenUsed="0"/>
-    <w:lsdException w:name="Light List Accent 1" w:semiHidden="0" w:uiPriority="61" w:unhideWhenUsed="0"/>
-    <w:lsdException w:name="Light Grid Accent 1" w:semiHidden="0" w:uiPriority="62" w:unhideWhenUsed="0"/>
-    <w:lsdException w:name="Medium Shading 1 Accent 1" w:semiHidden="0" w:uiPriority="63" w:unhideWhenUsed="0"/>
-    <w:lsdException w:name="Medium Shading 2 Accent 1" w:semiHidden="0" w:uiPriority="64" w:unhideWhenUsed="0"/>
-    <w:lsdException w:name="Medium List 1 Accent 1" w:semiHidden="0" w:uiPriority="65" w:unhideWhenUsed="0"/>
-    <w:lsdException w:name="Revision" w:unhideWhenUsed="0"/>
-    <w:lsdException w:name="List Paragraph" w:semiHidden="0" w:uiPriority="34" w:unhideWhenUsed="0" w:qFormat="1"/>
-    <w:lsdException w:name="Quote" w:semiHidden="0" w:uiPriority="29" w:unhideWhenUsed="0" w:qFormat="1"/>
-    <w:lsdException w:name="Intense Quote" w:semiHidden="0" w:uiPriority="30" w:unhideWhenUsed="0" w:qFormat="1"/>
-    <w:lsdException w:name="Medium List 2 Accent 1" w:semiHidden="0" w:uiPriority="66" w:unhideWhenUsed="0"/>
-    <w:lsdException w:name="Medium Grid 1 Accent 1" w:semiHidden="0" w:uiPriority="67" w:unhideWhenUsed="0"/>
-    <w:lsdException w:name="Medium Grid 2 Accent 1" w:semiHidden="0" w:uiPriority="68" w:unhideWhenUsed="0"/>
-    <w:lsdException w:name="Medium Grid 3 Accent 1" w:semiHidden="0" w:uiPriority="69" w:unhideWhenUsed="0"/>
-    <w:lsdException w:name="Dark List Accent 1" w:semiHidden="0" w:uiPriority="70" w:unhideWhenUsed="0"/>
-    <w:lsdException w:name="Colorful Shading Accent 1" w:semiHidden="0" w:uiPriority="71" w:unhideWhenUsed="0"/>
-    <w:lsdException w:name="Colorful List Accent 1" w:semiHidden="0" w:uiPriority="72" w:unhideWhenUsed="0"/>
-    <w:lsdException w:name="Colorful Grid Accent 1" w:semiHidden="0" w:uiPriority="73" w:unhideWhenUsed="0"/>
-    <w:lsdException w:name="Light Shading Accent 2" w:semiHidden="0" w:uiPriority="60" w:unhideWhenUsed="0"/>
-    <w:lsdException w:name="Light List Accent 2" w:semiHidden="0" w:uiPriority="61" w:unhideWhenUsed="0"/>
-    <w:lsdException w:name="Light Grid Accent 2" w:semiHidden="0" w:uiPriority="62" w:unhideWhenUsed="0"/>
-    <w:lsdException w:name="Medium Shading 1 Accent 2" w:semiHidden="0" w:uiPriority="63" w:unhideWhenUsed="0"/>
-    <w:lsdException w:name="Medium Shading 2 Accent 2" w:semiHidden="0" w:uiPriority="64" w:unhideWhenUsed="0"/>
-    <w:lsdException w:name="Medium List 1 Accent 2" w:semiHidden="0" w:uiPriority="65" w:unhideWhenUsed="0"/>
-    <w:lsdException w:name="Medium List 2 Accent 2" w:semiHidden="0" w:uiPriority="66" w:unhideWhenUsed="0"/>
-    <w:lsdException w:name="Medium Grid 1 Accent 2" w:semiHidden="0" w:uiPriority="67" w:unhideWhenUsed="0"/>
-    <w:lsdException w:name="Medium Grid 2 Accent 2" w:semiHidden="0" w:uiPriority="68" w:unhideWhenUsed="0"/>
-    <w:lsdException w:name="Medium Grid 3 Accent 2" w:semiHidden="0" w:uiPriority="69" w:unhideWhenUsed="0"/>
-    <w:lsdException w:name="Dark List Accent 2" w:semiHidden="0" w:uiPriority="70" w:unhideWhenUsed="0"/>
-    <w:lsdException w:name="Colorful Shading Accent 2" w:semiHidden="0" w:uiPriority="71" w:unhideWhenUsed="0"/>
-    <w:lsdException w:name="Colorful List Accent 2" w:semiHidden="0" w:uiPriority="72" w:unhideWhenUsed="0"/>
-    <w:lsdException w:name="Colorful Grid Accent 2" w:semiHidden="0" w:uiPriority="73" w:unhideWhenUsed="0"/>
-    <w:lsdException w:name="Light Shading Accent 3" w:semiHidden="0" w:uiPriority="60" w:unhideWhenUsed="0"/>
-    <w:lsdException w:name="Light List Accent 3" w:semiHidden="0" w:uiPriority="61" w:unhideWhenUsed="0"/>
-    <w:lsdException w:name="Light Grid Accent 3" w:semiHidden="0" w:uiPriority="62" w:unhideWhenUsed="0"/>
-    <w:lsdException w:name="Medium Shading 1 Accent 3" w:semiHidden="0" w:uiPriority="63" w:unhideWhenUsed="0"/>
-    <w:lsdException w:name="Medium Shading 2 Accent 3" w:semiHidden="0" w:uiPriority="64" w:unhideWhenUsed="0"/>
-    <w:lsdException w:name="Medium List 1 Accent 3" w:semiHidden="0" w:uiPriority="65" w:unhideWhenUsed="0"/>
-    <w:lsdException w:name="Medium List 2 Accent 3" w:semiHidden="0" w:uiPriority="66" w:unhideWhenUsed="0"/>
-    <w:lsdException w:name="Medium Grid 1 Accent 3" w:semiHidden="0" w:uiPriority="67" w:unhideWhenUsed="0"/>
-    <w:lsdException w:name="Medium Grid 2 Accent 3" w:semiHidden="0" w:uiPriority="68" w:unhideWhenUsed="0"/>
-    <w:lsdException w:name="Medium Grid 3 Accent 3" w:semiHidden="0" w:uiPriority="69" w:unhideWhenUsed="0"/>
-    <w:lsdException w:name="Dark List Accent 3" w:semiHidden="0" w:uiPriority="70" w:unhideWhenUsed="0"/>
-    <w:lsdException w:name="Colorful Shading Accent 3" w:semiHidden="0" w:uiPriority="71" w:unhideWhenUsed="0"/>
-    <w:lsdException w:name="Colorful List Accent 3" w:semiHidden="0" w:uiPriority="72" w:unhideWhenUsed="0"/>
-    <w:lsdException w:name="Colorful Grid Accent 3" w:semiHidden="0" w:uiPriority="73" w:unhideWhenUsed="0"/>
-    <w:lsdException w:name="Light Shading Accent 4" w:semiHidden="0" w:uiPriority="60" w:unhideWhenUsed="0"/>
-    <w:lsdException w:name="Light List Accent 4" w:semiHidden="0" w:uiPriority="61" w:unhideWhenUsed="0"/>
-    <w:lsdException w:name="Light Grid Accent 4" w:semiHidden="0" w:uiPriority="62" w:unhideWhenUsed="0"/>
-    <w:lsdException w:name="Medium Shading 1 Accent 4" w:semiHidden="0" w:uiPriority="63" w:unhideWhenUsed="0"/>
-    <w:lsdException w:name="Medium Shading 2 Accent 4" w:semiHidden="0" w:uiPriority="64" w:unhideWhenUsed="0"/>
-    <w:lsdException w:name="Medium List 1 Accent 4" w:semiHidden="0" w:uiPriority="65" w:unhideWhenUsed="0"/>
-    <w:lsdException w:name="Medium List 2 Accent 4" w:semiHidden="0" w:uiPriority="66" w:unhideWhenUsed="0"/>
-    <w:lsdException w:name="Medium Grid 1 Accent 4" w:semiHidden="0" w:uiPriority="67" w:unhideWhenUsed="0"/>
-    <w:lsdException w:name="Medium Grid 2 Accent 4" w:semiHidden="0" w:uiPriority="68" w:unhideWhenUsed="0"/>
-    <w:lsdException w:name="Medium Grid 3 Accent 4" w:semiHidden="0" w:uiPriority="69" w:unhideWhenUsed="0"/>
-    <w:lsdException w:name="Dark List Accent 4" w:semiHidden="0" w:uiPriority="70" w:unhideWhenUsed="0"/>
-    <w:lsdException w:name="Colorful Shading Accent 4" w:semiHidden="0" w:uiPriority="71" w:unhideWhenUsed="0"/>
-    <w:lsdException w:name="Colorful List Accent 4" w:semiHidden="0" w:uiPriority="72" w:unhideWhenUsed="0"/>
-    <w:lsdException w:name="Colorful Grid Accent 4" w:semiHidden="0" w:uiPriority="73" w:unhideWhenUsed="0"/>
-    <w:lsdException w:name="Light Shading Accent 5" w:semiHidden="0" w:uiPriority="60" w:unhideWhenUsed="0"/>
-    <w:lsdException w:name="Light List Accent 5" w:semiHidden="0" w:uiPriority="61" w:unhideWhenUsed="0"/>
-    <w:lsdException w:name="Light Grid Accent 5" w:semiHidden="0" w:uiPriority="62" w:unhideWhenUsed="0"/>
-    <w:lsdException w:name="Medium Shading 1 Accent 5" w:semiHidden="0" w:uiPriority="63" w:unhideWhenUsed="0"/>
-    <w:lsdException w:name="Medium Shading 2 Accent 5" w:semiHidden="0" w:uiPriority="64" w:unhideWhenUsed="0"/>
-    <w:lsdException w:name="Medium List 1 Accent 5" w:semiHidden="0" w:uiPriority="65" w:unhideWhenUsed="0"/>
-    <w:lsdException w:name="Medium List 2 Accent 5" w:semiHidden="0" w:uiPriority="66" w:unhideWhenUsed="0"/>
-    <w:lsdException w:name="Medium Grid 1 Accent 5" w:semiHidden="0" w:uiPriority="67" w:unhideWhenUsed="0"/>
-    <w:lsdException w:name="Medium Grid 2 Accent 5" w:semiHidden="0" w:uiPriority="68" w:unhideWhenUsed="0"/>
-    <w:lsdException w:name="Medium Grid 3 Accent 5" w:semiHidden="0" w:uiPriority="69" w:unhideWhenUsed="0"/>
-    <w:lsdException w:name="Dark List Accent 5" w:semiHidden="0" w:uiPriority="70" w:unhideWhenUsed="0"/>
-    <w:lsdException w:name="Colorful Shading Accent 5" w:semiHidden="0" w:uiPriority="71" w:unhideWhenUsed="0"/>
-    <w:lsdException w:name="Colorful List Accent 5" w:semiHidden="0" w:uiPriority="72" w:unhideWhenUsed="0"/>
-    <w:lsdException w:name="Colorful Grid Accent 5" w:semiHidden="0" w:uiPriority="73" w:unhideWhenUsed="0"/>
-    <w:lsdException w:name="Light Shading Accent 6" w:semiHidden="0" w:uiPriority="60" w:unhideWhenUsed="0"/>
-    <w:lsdException w:name="Light List Accent 6" w:semiHidden="0" w:uiPriority="61" w:unhideWhenUsed="0"/>
-    <w:lsdException w:name="Light Grid Accent 6" w:semiHidden="0" w:uiPriority="62" w:unhideWhenUsed="0"/>
-    <w:lsdException w:name="Medium Shading 1 Accent 6" w:semiHidden="0" w:uiPriority="63" w:unhideWhenUsed="0"/>
-    <w:lsdException w:name="Medium Shading 2 Accent 6" w:semiHidden="0" w:uiPriority="64" w:unhideWhenUsed="0"/>
-    <w:lsdException w:name="Medium List 1 Accent 6" w:semiHidden="0" w:uiPriority="65" w:unhideWhenUsed="0"/>
-    <w:lsdException w:name="Medium List 2 Accent 6" w:semiHidden="0" w:uiPriority="66" w:unhideWhenUsed="0"/>
-    <w:lsdException w:name="Medium Grid 1 Accent 6" w:semiHidden="0" w:uiPriority="67" w:unhideWhenUsed="0"/>
-    <w:lsdException w:name="Medium Grid 2 Accent 6" w:semiHidden="0" w:uiPriority="68" w:unhideWhenUsed="0"/>
-    <w:lsdException w:name="Medium Grid 3 Accent 6" w:semiHidden="0" w:uiPriority="69" w:unhideWhenUsed="0"/>
-    <w:lsdException w:name="Dark List Accent 6" w:semiHidden="0" w:uiPriority="70" w:unhideWhenUsed="0"/>
-    <w:lsdException w:name="Colorful Shading Accent 6" w:semiHidden="0" w:uiPriority="71" w:unhideWhenUsed="0"/>
-    <w:lsdException w:name="Colorful List Accent 6" w:semiHidden="0" w:uiPriority="72" w:unhideWhenUsed="0"/>
-    <w:lsdException w:name="Colorful Grid Accent 6" w:semiHidden="0" w:uiPriority="73" w:unhideWhenUsed="0"/>
-    <w:lsdException w:name="Subtle Emphasis" w:semiHidden="0" w:uiPriority="19" w:unhideWhenUsed="0" w:qFormat="1"/>
-    <w:lsdException w:name="Intense Emphasis" w:semiHidden="0" w:uiPriority="21" w:unhideWhenUsed="0" w:qFormat="1"/>
-    <w:lsdException w:name="Subtle Reference" w:semiHidden="0" w:uiPriority="31" w:unhideWhenUsed="0" w:qFormat="1"/>
-    <w:lsdException w:name="Intense Reference" w:semiHidden="0" w:uiPriority="32" w:unhideWhenUsed="0" w:qFormat="1"/>
-    <w:lsdException w:name="Book Title" w:semiHidden="0" w:uiPriority="33" w:unhideWhenUsed="0" w:qFormat="1"/>
-    <w:lsdException w:name="Bibliography" w:uiPriority="37"/>
-    <w:lsdException w:name="TOC Heading" w:uiPriority="39" w:qFormat="1"/>
-  </w:latentStyles>
-  <w:style w:type="paragraph" w:default="1" w:styleId="Normal">
-    <w:name w:val="Normal"/>
-    <w:qFormat/>
-  </w:style>
-  <w:style w:type="paragraph" w:styleId="Titre1">
-    <w:name w:val="heading 1"/>
-    <w:basedOn w:val="Normal"/>
-    <w:next w:val="Normal"/>
-    <w:link w:val="Titre1Car"/>
-    <w:uiPriority w:val="9"/>
-    <w:qFormat/>
-    <w:rsid w:val="005127FF"/>
-    <w:pPr>
-      <w:keepNext/>
-      <w:keepLines/>
-      <w:numPr>
-        <w:numId w:val="2"/>
-      </w:numPr>
-      <w:spacing w:before="480" w:after="0"/>
-      <w:outlineLvl w:val="0"/>
-    </w:pPr>
-    <w:rPr>
-      <w:rFonts w:asciiTheme="majorHAnsi" w:eastAsiaTheme="majorEastAsia" w:hAnsiTheme="majorHAnsi" w:cstheme="majorBidi"/>
-      <w:b/>
-      <w:bCs/>
-      <w:color w:val="2E74B5" w:themeColor="accent1" w:themeShade="BF"/>
-      <w:sz w:val="28"/>
-      <w:szCs w:val="28"/>
-    </w:rPr>
-  </w:style>
-  <w:style w:type="paragraph" w:styleId="Titre2">
-    <w:name w:val="heading 2"/>
-    <w:basedOn w:val="Normal"/>
-    <w:next w:val="Normal"/>
-    <w:link w:val="Titre2Car"/>
-    <w:uiPriority w:val="9"/>
-    <w:unhideWhenUsed/>
-    <w:qFormat/>
-    <w:rsid w:val="005127FF"/>
-    <w:pPr>
-      <w:keepNext/>
-      <w:keepLines/>
-      <w:numPr>
-        <w:ilvl w:val="1"/>
-        <w:numId w:val="2"/>
-      </w:numPr>
-      <w:spacing w:before="200" w:after="0"/>
-      <w:outlineLvl w:val="1"/>
-    </w:pPr>
-    <w:rPr>
-      <w:rFonts w:asciiTheme="majorHAnsi" w:eastAsiaTheme="majorEastAsia" w:hAnsiTheme="majorHAnsi" w:cstheme="majorBidi"/>
-      <w:b/>
-      <w:bCs/>
-      <w:color w:val="5B9BD5" w:themeColor="accent1"/>
-      <w:sz w:val="26"/>
-      <w:szCs w:val="26"/>
-    </w:rPr>
-  </w:style>
-  <w:style w:type="paragraph" w:styleId="Titre3">
-    <w:name w:val="heading 3"/>
-    <w:basedOn w:val="Normal"/>
-    <w:next w:val="Normal"/>
-    <w:link w:val="Titre3Car"/>
-    <w:uiPriority w:val="9"/>
-    <w:unhideWhenUsed/>
-    <w:qFormat/>
-    <w:rsid w:val="005127FF"/>
-    <w:pPr>
-      <w:keepNext/>
-      <w:keepLines/>
-      <w:numPr>
-        <w:ilvl w:val="2"/>
-        <w:numId w:val="2"/>
-      </w:numPr>
-      <w:spacing w:before="200" w:after="0"/>
-      <w:outlineLvl w:val="2"/>
-    </w:pPr>
-    <w:rPr>
-      <w:rFonts w:asciiTheme="majorHAnsi" w:eastAsiaTheme="majorEastAsia" w:hAnsiTheme="majorHAnsi" w:cstheme="majorBidi"/>
-      <w:b/>
-      <w:bCs/>
-      <w:color w:val="5B9BD5" w:themeColor="accent1"/>
-    </w:rPr>
-  </w:style>
-  <w:style w:type="paragraph" w:styleId="Titre4">
-    <w:name w:val="heading 4"/>
-    <w:basedOn w:val="Normal"/>
-    <w:next w:val="Normal"/>
-    <w:link w:val="Titre4Car"/>
-    <w:uiPriority w:val="9"/>
-    <w:unhideWhenUsed/>
-    <w:qFormat/>
-    <w:rsid w:val="005127FF"/>
-    <w:pPr>
-      <w:keepNext/>
-      <w:keepLines/>
-      <w:numPr>
-        <w:ilvl w:val="3"/>
-        <w:numId w:val="2"/>
-      </w:numPr>
-      <w:spacing w:before="200" w:after="0"/>
-      <w:outlineLvl w:val="3"/>
-    </w:pPr>
-    <w:rPr>
-      <w:rFonts w:asciiTheme="majorHAnsi" w:eastAsiaTheme="majorEastAsia" w:hAnsiTheme="majorHAnsi" w:cstheme="majorBidi"/>
-      <w:b/>
-      <w:bCs/>
-      <w:i/>
-      <w:iCs/>
-      <w:color w:val="5B9BD5" w:themeColor="accent1"/>
-    </w:rPr>
-  </w:style>
-  <w:style w:type="paragraph" w:styleId="Titre5">
-    <w:name w:val="heading 5"/>
-    <w:basedOn w:val="Normal"/>
-    <w:next w:val="Normal"/>
-    <w:link w:val="Titre5Car"/>
-    <w:uiPriority w:val="9"/>
-    <w:semiHidden/>
-    <w:unhideWhenUsed/>
-    <w:qFormat/>
-    <w:rsid w:val="005127FF"/>
-    <w:pPr>
-      <w:keepNext/>
-      <w:keepLines/>
-      <w:numPr>
-        <w:ilvl w:val="4"/>
-        <w:numId w:val="2"/>
-      </w:numPr>
-      <w:spacing w:before="200" w:after="0"/>
-      <w:outlineLvl w:val="4"/>
-    </w:pPr>
-    <w:rPr>
-      <w:rFonts w:asciiTheme="majorHAnsi" w:eastAsiaTheme="majorEastAsia" w:hAnsiTheme="majorHAnsi" w:cstheme="majorBidi"/>
-      <w:color w:val="1F4D78" w:themeColor="accent1" w:themeShade="7F"/>
-    </w:rPr>
-  </w:style>
-  <w:style w:type="paragraph" w:styleId="Titre6">
-    <w:name w:val="heading 6"/>
-    <w:basedOn w:val="Normal"/>
-    <w:next w:val="Normal"/>
-    <w:link w:val="Titre6Car"/>
-    <w:uiPriority w:val="9"/>
-    <w:semiHidden/>
-    <w:unhideWhenUsed/>
-    <w:qFormat/>
-    <w:rsid w:val="005127FF"/>
-    <w:pPr>
-      <w:keepNext/>
-      <w:keepLines/>
-      <w:numPr>
-        <w:ilvl w:val="5"/>
-        <w:numId w:val="2"/>
-      </w:numPr>
-      <w:spacing w:before="200" w:after="0"/>
-      <w:outlineLvl w:val="5"/>
-    </w:pPr>
-    <w:rPr>
-      <w:rFonts w:asciiTheme="majorHAnsi" w:eastAsiaTheme="majorEastAsia" w:hAnsiTheme="majorHAnsi" w:cstheme="majorBidi"/>
-      <w:i/>
-      <w:iCs/>
-      <w:color w:val="1F4D78" w:themeColor="accent1" w:themeShade="7F"/>
-    </w:rPr>
-  </w:style>
-  <w:style w:type="paragraph" w:styleId="Titre7">
-    <w:name w:val="heading 7"/>
-    <w:basedOn w:val="Normal"/>
-    <w:next w:val="Normal"/>
-    <w:link w:val="Titre7Car"/>
-    <w:uiPriority w:val="9"/>
-    <w:semiHidden/>
-    <w:unhideWhenUsed/>
-    <w:qFormat/>
-    <w:rsid w:val="005127FF"/>
-    <w:pPr>
-      <w:keepNext/>
-      <w:keepLines/>
-      <w:numPr>
-        <w:ilvl w:val="6"/>
-        <w:numId w:val="2"/>
-      </w:numPr>
-      <w:spacing w:before="200" w:after="0"/>
-      <w:outlineLvl w:val="6"/>
-    </w:pPr>
-    <w:rPr>
-      <w:rFonts w:asciiTheme="majorHAnsi" w:eastAsiaTheme="majorEastAsia" w:hAnsiTheme="majorHAnsi" w:cstheme="majorBidi"/>
-      <w:i/>
-      <w:iCs/>
-      <w:color w:val="404040" w:themeColor="text1" w:themeTint="BF"/>
-    </w:rPr>
-  </w:style>
-  <w:style w:type="paragraph" w:styleId="Titre8">
-    <w:name w:val="heading 8"/>
-    <w:basedOn w:val="Normal"/>
-    <w:next w:val="Normal"/>
-    <w:link w:val="Titre8Car"/>
-    <w:uiPriority w:val="9"/>
-    <w:semiHidden/>
-    <w:unhideWhenUsed/>
-    <w:qFormat/>
-    <w:rsid w:val="005127FF"/>
-    <w:pPr>
-      <w:keepNext/>
-      <w:keepLines/>
-      <w:numPr>
-        <w:ilvl w:val="7"/>
-        <w:numId w:val="2"/>
-      </w:numPr>
-      <w:spacing w:before="200" w:after="0"/>
-      <w:outlineLvl w:val="7"/>
-    </w:pPr>
-    <w:rPr>
-      <w:rFonts w:asciiTheme="majorHAnsi" w:eastAsiaTheme="majorEastAsia" w:hAnsiTheme="majorHAnsi" w:cstheme="majorBidi"/>
-      <w:color w:val="404040" w:themeColor="text1" w:themeTint="BF"/>
-      <w:sz w:val="20"/>
-      <w:szCs w:val="20"/>
-    </w:rPr>
-  </w:style>
-  <w:style w:type="paragraph" w:styleId="Titre9">
-    <w:name w:val="heading 9"/>
-    <w:basedOn w:val="Normal"/>
-    <w:next w:val="Normal"/>
-    <w:link w:val="Titre9Car"/>
-    <w:uiPriority w:val="9"/>
-    <w:semiHidden/>
-    <w:unhideWhenUsed/>
-    <w:qFormat/>
-    <w:rsid w:val="005127FF"/>
-    <w:pPr>
-      <w:keepNext/>
-      <w:keepLines/>
-      <w:numPr>
-        <w:ilvl w:val="8"/>
-        <w:numId w:val="2"/>
-      </w:numPr>
-      <w:spacing w:before="200" w:after="0"/>
-      <w:outlineLvl w:val="8"/>
-    </w:pPr>
-    <w:rPr>
-      <w:rFonts w:asciiTheme="majorHAnsi" w:eastAsiaTheme="majorEastAsia" w:hAnsiTheme="majorHAnsi" w:cstheme="majorBidi"/>
-      <w:i/>
-      <w:iCs/>
-      <w:color w:val="404040" w:themeColor="text1" w:themeTint="BF"/>
-      <w:sz w:val="20"/>
-      <w:szCs w:val="20"/>
-    </w:rPr>
-  </w:style>
-  <w:style w:type="character" w:default="1" w:styleId="Policepardfaut">
-    <w:name w:val="Default Paragraph Font"/>
-    <w:uiPriority w:val="1"/>
-    <w:semiHidden/>
-    <w:unhideWhenUsed/>
-  </w:style>
-  <w:style w:type="table" w:default="1" w:styleId="TableauNormal">
-    <w:name w:val="Normal Table"/>
-    <w:uiPriority w:val="99"/>
-    <w:semiHidden/>
-    <w:unhideWhenUsed/>
-    <w:tblPr>
-      <w:tblInd w:w="0" w:type="dxa"/>
-      <w:tblCellMar>
-        <w:top w:w="0" w:type="dxa"/>
-        <w:left w:w="108" w:type="dxa"/>
-        <w:bottom w:w="0" w:type="dxa"/>
-        <w:right w:w="108" w:type="dxa"/>
-      </w:tblCellMar>
-    </w:tblPr>
-  </w:style>
-  <w:style w:type="numbering" w:default="1" w:styleId="Aucuneliste">
-    <w:name w:val="No List"/>
-    <w:uiPriority w:val="99"/>
-    <w:semiHidden/>
-    <w:unhideWhenUsed/>
-  </w:style>
-  <w:style w:type="character" w:styleId="Textedelespacerserv">
-    <w:name w:val="Placeholder Text"/>
-    <w:basedOn w:val="Policepardfaut"/>
-    <w:uiPriority w:val="99"/>
-    <w:semiHidden/>
-    <w:rsid w:val="00270677"/>
-    <w:rPr>
-      <w:color w:val="808080"/>
-    </w:rPr>
-  </w:style>
-  <w:style w:type="paragraph" w:styleId="Textedebulles">
-    <w:name w:val="Balloon Text"/>
-    <w:basedOn w:val="Normal"/>
-    <w:link w:val="TextedebullesCar"/>
-    <w:uiPriority w:val="99"/>
-    <w:semiHidden/>
-    <w:unhideWhenUsed/>
-    <w:rsid w:val="005F2D7B"/>
-    <w:pPr>
-      <w:spacing w:after="0" w:line="240" w:lineRule="auto"/>
-    </w:pPr>
-    <w:rPr>
-      <w:rFonts w:ascii="Tahoma" w:hAnsi="Tahoma" w:cs="Tahoma"/>
-      <w:sz w:val="16"/>
-      <w:szCs w:val="16"/>
-    </w:rPr>
-  </w:style>
-  <w:style w:type="character" w:customStyle="1" w:styleId="TextedebullesCar">
-    <w:name w:val="Texte de bulles Car"/>
-    <w:basedOn w:val="Policepardfaut"/>
-    <w:link w:val="Textedebulles"/>
-    <w:uiPriority w:val="99"/>
-    <w:semiHidden/>
-    <w:rsid w:val="005F2D7B"/>
-    <w:rPr>
-      <w:rFonts w:ascii="Tahoma" w:hAnsi="Tahoma" w:cs="Tahoma"/>
-      <w:sz w:val="16"/>
-      <w:szCs w:val="16"/>
-    </w:rPr>
-  </w:style>
-  <w:style w:type="character" w:customStyle="1" w:styleId="Titre1Car">
-    <w:name w:val="Titre 1 Car"/>
-    <w:basedOn w:val="Policepardfaut"/>
-    <w:link w:val="Titre1"/>
-    <w:uiPriority w:val="9"/>
-    <w:rsid w:val="005127FF"/>
-    <w:rPr>
-      <w:rFonts w:asciiTheme="majorHAnsi" w:eastAsiaTheme="majorEastAsia" w:hAnsiTheme="majorHAnsi" w:cstheme="majorBidi"/>
-      <w:b/>
-      <w:bCs/>
-      <w:color w:val="2E74B5" w:themeColor="accent1" w:themeShade="BF"/>
-      <w:sz w:val="28"/>
-      <w:szCs w:val="28"/>
-    </w:rPr>
-  </w:style>
-  <w:style w:type="paragraph" w:styleId="En-ttedetabledesmatires">
-    <w:name w:val="TOC Heading"/>
-    <w:basedOn w:val="Titre1"/>
-    <w:next w:val="Normal"/>
-    <w:uiPriority w:val="39"/>
-    <w:semiHidden/>
-    <w:unhideWhenUsed/>
-    <w:qFormat/>
-    <w:rsid w:val="005127FF"/>
-    <w:pPr>
-      <w:spacing w:line="276" w:lineRule="auto"/>
-      <w:outlineLvl w:val="9"/>
-    </w:pPr>
-    <w:rPr>
-      <w:lang w:eastAsia="en-GB"/>
-    </w:rPr>
-  </w:style>
-  <w:style w:type="character" w:customStyle="1" w:styleId="Titre2Car">
-    <w:name w:val="Titre 2 Car"/>
-    <w:basedOn w:val="Policepardfaut"/>
-    <w:link w:val="Titre2"/>
-    <w:uiPriority w:val="9"/>
-    <w:rsid w:val="005127FF"/>
-    <w:rPr>
-      <w:rFonts w:asciiTheme="majorHAnsi" w:eastAsiaTheme="majorEastAsia" w:hAnsiTheme="majorHAnsi" w:cstheme="majorBidi"/>
-      <w:b/>
-      <w:bCs/>
-      <w:color w:val="5B9BD5" w:themeColor="accent1"/>
-      <w:sz w:val="26"/>
-      <w:szCs w:val="26"/>
-    </w:rPr>
-  </w:style>
-  <w:style w:type="character" w:customStyle="1" w:styleId="Titre3Car">
-    <w:name w:val="Titre 3 Car"/>
-    <w:basedOn w:val="Policepardfaut"/>
-    <w:link w:val="Titre3"/>
-    <w:uiPriority w:val="9"/>
-    <w:rsid w:val="005127FF"/>
-    <w:rPr>
-      <w:rFonts w:asciiTheme="majorHAnsi" w:eastAsiaTheme="majorEastAsia" w:hAnsiTheme="majorHAnsi" w:cstheme="majorBidi"/>
-      <w:b/>
-      <w:bCs/>
-      <w:color w:val="5B9BD5" w:themeColor="accent1"/>
-    </w:rPr>
-  </w:style>
-  <w:style w:type="character" w:customStyle="1" w:styleId="Titre4Car">
-    <w:name w:val="Titre 4 Car"/>
-    <w:basedOn w:val="Policepardfaut"/>
-    <w:link w:val="Titre4"/>
-    <w:uiPriority w:val="9"/>
-    <w:rsid w:val="005127FF"/>
-    <w:rPr>
-      <w:rFonts w:asciiTheme="majorHAnsi" w:eastAsiaTheme="majorEastAsia" w:hAnsiTheme="majorHAnsi" w:cstheme="majorBidi"/>
-      <w:b/>
-      <w:bCs/>
-      <w:i/>
-      <w:iCs/>
-      <w:color w:val="5B9BD5" w:themeColor="accent1"/>
-    </w:rPr>
-  </w:style>
-  <w:style w:type="character" w:customStyle="1" w:styleId="Titre5Car">
-    <w:name w:val="Titre 5 Car"/>
-    <w:basedOn w:val="Policepardfaut"/>
-    <w:link w:val="Titre5"/>
-    <w:uiPriority w:val="9"/>
-    <w:semiHidden/>
-    <w:rsid w:val="005127FF"/>
-    <w:rPr>
-      <w:rFonts w:asciiTheme="majorHAnsi" w:eastAsiaTheme="majorEastAsia" w:hAnsiTheme="majorHAnsi" w:cstheme="majorBidi"/>
-      <w:color w:val="1F4D78" w:themeColor="accent1" w:themeShade="7F"/>
-    </w:rPr>
-  </w:style>
-  <w:style w:type="character" w:customStyle="1" w:styleId="Titre6Car">
-    <w:name w:val="Titre 6 Car"/>
-    <w:basedOn w:val="Policepardfaut"/>
-    <w:link w:val="Titre6"/>
-    <w:uiPriority w:val="9"/>
-    <w:semiHidden/>
-    <w:rsid w:val="005127FF"/>
-    <w:rPr>
-      <w:rFonts w:asciiTheme="majorHAnsi" w:eastAsiaTheme="majorEastAsia" w:hAnsiTheme="majorHAnsi" w:cstheme="majorBidi"/>
-      <w:i/>
-      <w:iCs/>
-      <w:color w:val="1F4D78" w:themeColor="accent1" w:themeShade="7F"/>
-    </w:rPr>
-  </w:style>
-  <w:style w:type="character" w:customStyle="1" w:styleId="Titre7Car">
-    <w:name w:val="Titre 7 Car"/>
-    <w:basedOn w:val="Policepardfaut"/>
-    <w:link w:val="Titre7"/>
-    <w:uiPriority w:val="9"/>
-    <w:semiHidden/>
-    <w:rsid w:val="005127FF"/>
-    <w:rPr>
-      <w:rFonts w:asciiTheme="majorHAnsi" w:eastAsiaTheme="majorEastAsia" w:hAnsiTheme="majorHAnsi" w:cstheme="majorBidi"/>
-      <w:i/>
-      <w:iCs/>
-      <w:color w:val="404040" w:themeColor="text1" w:themeTint="BF"/>
-    </w:rPr>
-  </w:style>
-  <w:style w:type="character" w:customStyle="1" w:styleId="Titre8Car">
-    <w:name w:val="Titre 8 Car"/>
-    <w:basedOn w:val="Policepardfaut"/>
-    <w:link w:val="Titre8"/>
-    <w:uiPriority w:val="9"/>
-    <w:semiHidden/>
-    <w:rsid w:val="005127FF"/>
-    <w:rPr>
-      <w:rFonts w:asciiTheme="majorHAnsi" w:eastAsiaTheme="majorEastAsia" w:hAnsiTheme="majorHAnsi" w:cstheme="majorBidi"/>
-      <w:color w:val="404040" w:themeColor="text1" w:themeTint="BF"/>
-      <w:sz w:val="20"/>
-      <w:szCs w:val="20"/>
-    </w:rPr>
-  </w:style>
-  <w:style w:type="character" w:customStyle="1" w:styleId="Titre9Car">
-    <w:name w:val="Titre 9 Car"/>
-    <w:basedOn w:val="Policepardfaut"/>
-    <w:link w:val="Titre9"/>
-    <w:uiPriority w:val="9"/>
-    <w:semiHidden/>
-    <w:rsid w:val="005127FF"/>
-    <w:rPr>
-      <w:rFonts w:asciiTheme="majorHAnsi" w:eastAsiaTheme="majorEastAsia" w:hAnsiTheme="majorHAnsi" w:cstheme="majorBidi"/>
-      <w:i/>
-      <w:iCs/>
-      <w:color w:val="404040" w:themeColor="text1" w:themeTint="BF"/>
-      <w:sz w:val="20"/>
-      <w:szCs w:val="20"/>
-    </w:rPr>
-  </w:style>
-  <w:style w:type="paragraph" w:styleId="TM1">
-    <w:name w:val="toc 1"/>
-    <w:basedOn w:val="Normal"/>
-    <w:next w:val="Normal"/>
-    <w:autoRedefine/>
-    <w:uiPriority w:val="39"/>
-    <w:unhideWhenUsed/>
-    <w:rsid w:val="00A161BB"/>
-    <w:pPr>
-      <w:spacing w:after="100"/>
-    </w:pPr>
-  </w:style>
-  <w:style w:type="paragraph" w:styleId="TM2">
-    <w:name w:val="toc 2"/>
-    <w:basedOn w:val="Normal"/>
-    <w:next w:val="Normal"/>
-    <w:autoRedefine/>
-    <w:uiPriority w:val="39"/>
-    <w:unhideWhenUsed/>
-    <w:rsid w:val="00A161BB"/>
-    <w:pPr>
-      <w:spacing w:after="100"/>
-      <w:ind w:left="220"/>
-    </w:pPr>
-  </w:style>
-  <w:style w:type="paragraph" w:styleId="TM3">
-    <w:name w:val="toc 3"/>
-    <w:basedOn w:val="Normal"/>
-    <w:next w:val="Normal"/>
-    <w:autoRedefine/>
-    <w:uiPriority w:val="39"/>
-    <w:unhideWhenUsed/>
-    <w:rsid w:val="00A161BB"/>
-    <w:pPr>
-      <w:spacing w:after="100"/>
-      <w:ind w:left="440"/>
-    </w:pPr>
-  </w:style>
-  <w:style w:type="character" w:styleId="Lienhypertexte">
-    <w:name w:val="Hyperlink"/>
-    <w:basedOn w:val="Policepardfaut"/>
-    <w:uiPriority w:val="99"/>
-    <w:unhideWhenUsed/>
-    <w:rsid w:val="00A161BB"/>
-    <w:rPr>
-      <w:color w:val="0563C1" w:themeColor="hyperlink"/>
-      <w:u w:val="single"/>
-    </w:rPr>
-  </w:style>
-  <w:style w:type="paragraph" w:styleId="Paragraphedeliste">
-    <w:name w:val="List Paragraph"/>
-    <w:basedOn w:val="Normal"/>
-    <w:uiPriority w:val="34"/>
-    <w:qFormat/>
-    <w:rsid w:val="008C2CE8"/>
-    <w:pPr>
-      <w:ind w:left="720"/>
-      <w:contextualSpacing/>
-    </w:pPr>
-  </w:style>
-</w:styles>
-</file>
-
-<file path=word/stylesWithEffects.xml><?xml version="1.0" encoding="utf-8"?>
-<w:styles xmlns:wpc="http://schemas.microsoft.com/office/word/2010/wordprocessingCanvas" xmlns:mc="http://schemas.openxmlformats.org/markup-compatibility/2006" xmlns:o="urn:schemas-microsoft-com:office:office" xmlns:r="http://schemas.openxmlformats.org/officeDocument/2006/relationships" xmlns:m="http://schemas.openxmlformats.org/officeDocument/2006/math" xmlns:v="urn:schemas-microsoft-com:vml" xmlns:wp14="http://schemas.microsoft.com/office/word/2010/wordprocessingDrawing" xmlns:wp="http://schemas.openxmlformats.org/drawingml/2006/wordprocessingDrawing" xmlns:w10="urn:schemas-microsoft-com:office:word" xmlns:w="http://schemas.openxmlformats.org/wordprocessingml/2006/main" xmlns:w14="http://schemas.microsoft.com/office/word/2010/wordml" xmlns:wpg="http://schemas.microsoft.com/office/word/2010/wordprocessingGroup" xmlns:wpi="http://schemas.microsoft.com/office/word/2010/wordprocessingInk" xmlns:wne="http://schemas.microsoft.com/office/word/2006/wordml" xmlns:wps="http://schemas.microsoft.com/office/word/2010/wordprocessingShape" mc:Ignorable="w14 wp14">
-  <w:docDefaults>
-    <w:rPrDefault>
-      <w:rPr>
-        <w:rFonts w:asciiTheme="minorHAnsi" w:eastAsiaTheme="minorHAnsi" w:hAnsiTheme="minorHAnsi" w:cstheme="minorBidi"/>
-        <w:sz w:val="22"/>
-        <w:szCs w:val="22"/>
-        <w:lang w:val="en-GB" w:eastAsia="en-US" w:bidi="ar-SA"/>
-      </w:rPr>
-    </w:rPrDefault>
-    <w:pPrDefault>
-      <w:pPr>
-        <w:spacing w:after="160" w:line="259" w:lineRule="auto"/>
-      </w:pPr>
-    </w:pPrDefault>
-  </w:docDefaults>
-  <w:latentStyles w:defLockedState="0" w:defUIPriority="99" w:defSemiHidden="1" w:defUnhideWhenUsed="1" w:defQFormat="0" w:count="267">
-    <w:lsdException w:name="Normal" w:semiHidden="0" w:uiPriority="0" w:unhideWhenUsed="0" w:qFormat="1"/>
-    <w:lsdException w:name="heading 1" w:semiHidden="0" w:uiPriority="9" w:unhideWhenUsed="0" w:qFormat="1"/>
-    <w:lsdException w:name="heading 2" w:uiPriority="9" w:qFormat="1"/>
-    <w:lsdException w:name="heading 3" w:uiPriority="9" w:qFormat="1"/>
-    <w:lsdException w:name="heading 4" w:uiPriority="9" w:qFormat="1"/>
-    <w:lsdException w:name="heading 5" w:uiPriority="9" w:qFormat="1"/>
-    <w:lsdException w:name="heading 6" w:uiPriority="9" w:qFormat="1"/>
-    <w:lsdException w:name="heading 7" w:uiPriority="9" w:qFormat="1"/>
-    <w:lsdException w:name="heading 8" w:uiPriority="9" w:qFormat="1"/>
-    <w:lsdException w:name="heading 9" w:uiPriority="9" w:qFormat="1"/>
-    <w:lsdException w:name="toc 1" w:uiPriority="39"/>
-    <w:lsdException w:name="toc 2" w:uiPriority="39"/>
-    <w:lsdException w:name="toc 3" w:uiPriority="39"/>
-    <w:lsdException w:name="toc 4" w:uiPriority="39"/>
-    <w:lsdException w:name="toc 5" w:uiPriority="39"/>
-    <w:lsdException w:name="toc 6" w:uiPriority="39"/>
-    <w:lsdException w:name="toc 7" w:uiPriority="39"/>
-    <w:lsdException w:name="toc 8" w:uiPriority="39"/>
-    <w:lsdException w:name="toc 9" w:uiPriority="39"/>
-    <w:lsdException w:name="caption" w:uiPriority="35" w:qFormat="1"/>
-    <w:lsdException w:name="Title" w:semiHidden="0" w:uiPriority="10" w:unhideWhenUsed="0" w:qFormat="1"/>
-    <w:lsdException w:name="Default Paragraph Font" w:uiPriority="1"/>
-    <w:lsdException w:name="Subtitle" w:semiHidden="0" w:uiPriority="11" w:unhideWhenUsed="0" w:qFormat="1"/>
-    <w:lsdException w:name="Strong" w:semiHidden="0" w:uiPriority="22" w:unhideWhenUsed="0" w:qFormat="1"/>
-    <w:lsdException w:name="Emphasis" w:semiHidden="0" w:uiPriority="20" w:unhideWhenUsed="0" w:qFormat="1"/>
-    <w:lsdException w:name="Table Grid" w:semiHidden="0" w:uiPriority="39" w:unhideWhenUsed="0"/>
-    <w:lsdException w:name="Placeholder Text" w:unhideWhenUsed="0"/>
-    <w:lsdException w:name="No Spacing" w:semiHidden="0" w:uiPriority="1" w:unhideWhenUsed="0" w:qFormat="1"/>
-    <w:lsdException w:name="Light Shading" w:semiHidden="0" w:uiPriority="60" w:unhideWhenUsed="0"/>
-    <w:lsdException w:name="Light List" w:semiHidden="0" w:uiPriority="61" w:unhideWhenUsed="0"/>
-    <w:lsdException w:name="Light Grid" w:semiHidden="0" w:uiPriority="62" w:unhideWhenUsed="0"/>
-    <w:lsdException w:name="Medium Shading 1" w:semiHidden="0" w:uiPriority="63" w:unhideWhenUsed="0"/>
-    <w:lsdException w:name="Medium Shading 2" w:semiHidden="0" w:uiPriority="64" w:unhideWhenUsed="0"/>
-    <w:lsdException w:name="Medium List 1" w:semiHidden="0" w:uiPriority="65" w:unhideWhenUsed="0"/>
-    <w:lsdException w:name="Medium List 2" w:semiHidden="0" w:uiPriority="66" w:unhideWhenUsed="0"/>
-    <w:lsdException w:name="Medium Grid 1" w:semiHidden="0" w:uiPriority="67" w:unhideWhenUsed="0"/>
-    <w:lsdException w:name="Medium Grid 2" w:semiHidden="0" w:uiPriority="68" w:unhideWhenUsed="0"/>
-    <w:lsdException w:name="Medium Grid 3" w:semiHidden="0" w:uiPriority="69" w:unhideWhenUsed="0"/>
-    <w:lsdException w:name="Dark List" w:semiHidden="0" w:uiPriority="70" w:unhideWhenUsed="0"/>
-    <w:lsdException w:name="Colorful Shading" w:semiHidden="0" w:uiPriority="71" w:unhideWhenUsed="0"/>
-    <w:lsdException w:name="Colorful List" w:semiHidden="0" w:uiPriority="72" w:unhideWhenUsed="0"/>
-    <w:lsdException w:name="Colorful Grid" w:semiHidden="0" w:uiPriority="73" w:unhideWhenUsed="0"/>
-    <w:lsdException w:name="Light Shading Accent 1" w:semiHidden="0" w:uiPriority="60" w:unhideWhenUsed="0"/>
-    <w:lsdException w:name="Light List Accent 1" w:semiHidden="0" w:uiPriority="61" w:unhideWhenUsed="0"/>
-    <w:lsdException w:name="Light Grid Accent 1" w:semiHidden="0" w:uiPriority="62" w:unhideWhenUsed="0"/>
-    <w:lsdException w:name="Medium Shading 1 Accent 1" w:semiHidden="0" w:uiPriority="63" w:unhideWhenUsed="0"/>
-    <w:lsdException w:name="Medium Shading 2 Accent 1" w:semiHidden="0" w:uiPriority="64" w:unhideWhenUsed="0"/>
-    <w:lsdException w:name="Medium List 1 Accent 1" w:semiHidden="0" w:uiPriority="65" w:unhideWhenUsed="0"/>
-    <w:lsdException w:name="Revision" w:unhideWhenUsed="0"/>
-    <w:lsdException w:name="List Paragraph" w:semiHidden="0" w:uiPriority="34" w:unhideWhenUsed="0" w:qFormat="1"/>
-    <w:lsdException w:name="Quote" w:semiHidden="0" w:uiPriority="29" w:unhideWhenUsed="0" w:qFormat="1"/>
-    <w:lsdException w:name="Intense Quote" w:semiHidden="0" w:uiPriority="30" w:unhideWhenUsed="0" w:qFormat="1"/>
-    <w:lsdException w:name="Medium List 2 Accent 1" w:semiHidden="0" w:uiPriority="66" w:unhideWhenUsed="0"/>
-    <w:lsdException w:name="Medium Grid 1 Accent 1" w:semiHidden="0" w:uiPriority="67" w:unhideWhenUsed="0"/>
-    <w:lsdException w:name="Medium Grid 2 Accent 1" w:semiHidden="0" w:uiPriority="68" w:unhideWhenUsed="0"/>
-    <w:lsdException w:name="Medium Grid 3 Accent 1" w:semiHidden="0" w:uiPriority="69" w:unhideWhenUsed="0"/>
-    <w:lsdException w:name="Dark List Accent 1" w:semiHidden="0" w:uiPriority="70" w:unhideWhenUsed="0"/>
-    <w:lsdException w:name="Colorful Shading Accent 1" w:semiHidden="0" w:uiPriority="71" w:unhideWhenUsed="0"/>
-    <w:lsdException w:name="Colorful List Accent 1" w:semiHidden="0" w:uiPriority="72" w:unhideWhenUsed="0"/>
-    <w:lsdException w:name="Colorful Grid Accent 1" w:semiHidden="0" w:uiPriority="73" w:unhideWhenUsed="0"/>
-    <w:lsdException w:name="Light Shading Accent 2" w:semiHidden="0" w:uiPriority="60" w:unhideWhenUsed="0"/>
-    <w:lsdException w:name="Light List Accent 2" w:semiHidden="0" w:uiPriority="61" w:unhideWhenUsed="0"/>
-    <w:lsdException w:name="Light Grid Accent 2" w:semiHidden="0" w:uiPriority="62" w:unhideWhenUsed="0"/>
-    <w:lsdException w:name="Medium Shading 1 Accent 2" w:semiHidden="0" w:uiPriority="63" w:unhideWhenUsed="0"/>
-    <w:lsdException w:name="Medium Shading 2 Accent 2" w:semiHidden="0" w:uiPriority="64" w:unhideWhenUsed="0"/>
-    <w:lsdException w:name="Medium List 1 Accent 2" w:semiHidden="0" w:uiPriority="65" w:unhideWhenUsed="0"/>
-    <w:lsdException w:name="Medium List 2 Accent 2" w:semiHidden="0" w:uiPriority="66" w:unhideWhenUsed="0"/>
-    <w:lsdException w:name="Medium Grid 1 Accent 2" w:semiHidden="0" w:uiPriority="67" w:unhideWhenUsed="0"/>
-    <w:lsdException w:name="Medium Grid 2 Accent 2" w:semiHidden="0" w:uiPriority="68" w:unhideWhenUsed="0"/>
-    <w:lsdException w:name="Medium Grid 3 Accent 2" w:semiHidden="0" w:uiPriority="69" w:unhideWhenUsed="0"/>
-    <w:lsdException w:name="Dark List Accent 2" w:semiHidden="0" w:uiPriority="70" w:unhideWhenUsed="0"/>
-    <w:lsdException w:name="Colorful Shading Accent 2" w:semiHidden="0" w:uiPriority="71" w:unhideWhenUsed="0"/>
-    <w:lsdException w:name="Colorful List Accent 2" w:semiHidden="0" w:uiPriority="72" w:unhideWhenUsed="0"/>
-    <w:lsdException w:name="Colorful Grid Accent 2" w:semiHidden="0" w:uiPriority="73" w:unhideWhenUsed="0"/>
-    <w:lsdException w:name="Light Shading Accent 3" w:semiHidden="0" w:uiPriority="60" w:unhideWhenUsed="0"/>
-    <w:lsdException w:name="Light List Accent 3" w:semiHidden="0" w:uiPriority="61" w:unhideWhenUsed="0"/>
-    <w:lsdException w:name="Light Grid Accent 3" w:semiHidden="0" w:uiPriority="62" w:unhideWhenUsed="0"/>
-    <w:lsdException w:name="Medium Shading 1 Accent 3" w:semiHidden="0" w:uiPriority="63" w:unhideWhenUsed="0"/>
-    <w:lsdException w:name="Medium Shading 2 Accent 3" w:semiHidden="0" w:uiPriority="64" w:unhideWhenUsed="0"/>
-    <w:lsdException w:name="Medium List 1 Accent 3" w:semiHidden="0" w:uiPriority="65" w:unhideWhenUsed="0"/>
-    <w:lsdException w:name="Medium List 2 Accent 3" w:semiHidden="0" w:uiPriority="66" w:unhideWhenUsed="0"/>
-    <w:lsdException w:name="Medium Grid 1 Accent 3" w:semiHidden="0" w:uiPriority="67" w:unhideWhenUsed="0"/>
-    <w:lsdException w:name="Medium Grid 2 Accent 3" w:semiHidden="0" w:uiPriority="68" w:unhideWhenUsed="0"/>
-    <w:lsdException w:name="Medium Grid 3 Accent 3" w:semiHidden="0" w:uiPriority="69" w:unhideWhenUsed="0"/>
-    <w:lsdException w:name="Dark List Accent 3" w:semiHidden="0" w:uiPriority="70" w:unhideWhenUsed="0"/>
-    <w:lsdException w:name="Colorful Shading Accent 3" w:semiHidden="0" w:uiPriority="71" w:unhideWhenUsed="0"/>
-    <w:lsdException w:name="Colorful List Accent 3" w:semiHidden="0" w:uiPriority="72" w:unhideWhenUsed="0"/>
-    <w:lsdException w:name="Colorful Grid Accent 3" w:semiHidden="0" w:uiPriority="73" w:unhideWhenUsed="0"/>
-    <w:lsdException w:name="Light Shading Accent 4" w:semiHidden="0" w:uiPriority="60" w:unhideWhenUsed="0"/>
-    <w:lsdException w:name="Light List Accent 4" w:semiHidden="0" w:uiPriority="61" w:unhideWhenUsed="0"/>
-    <w:lsdException w:name="Light Grid Accent 4" w:semiHidden="0" w:uiPriority="62" w:unhideWhenUsed="0"/>
-    <w:lsdException w:name="Medium Shading 1 Accent 4" w:semiHidden="0" w:uiPriority="63" w:unhideWhenUsed="0"/>
-    <w:lsdException w:name="Medium Shading 2 Accent 4" w:semiHidden="0" w:uiPriority="64" w:unhideWhenUsed="0"/>
-    <w:lsdException w:name="Medium List 1 Accent 4" w:semiHidden="0" w:uiPriority="65" w:unhideWhenUsed="0"/>
-    <w:lsdException w:name="Medium List 2 Accent 4" w:semiHidden="0" w:uiPriority="66" w:unhideWhenUsed="0"/>
-    <w:lsdException w:name="Medium Grid 1 Accent 4" w:semiHidden="0" w:uiPriority="67" w:unhideWhenUsed="0"/>
-    <w:lsdException w:name="Medium Grid 2 Accent 4" w:semiHidden="0" w:uiPriority="68" w:unhideWhenUsed="0"/>
-    <w:lsdException w:name="Medium Grid 3 Accent 4" w:semiHidden="0" w:uiPriority="69" w:unhideWhenUsed="0"/>
-    <w:lsdException w:name="Dark List Accent 4" w:semiHidden="0" w:uiPriority="70" w:unhideWhenUsed="0"/>
-    <w:lsdException w:name="Colorful Shading Accent 4" w:semiHidden="0" w:uiPriority="71" w:unhideWhenUsed="0"/>
-    <w:lsdException w:name="Colorful List Accent 4" w:semiHidden="0" w:uiPriority="72" w:unhideWhenUsed="0"/>
-    <w:lsdException w:name="Colorful Grid Accent 4" w:semiHidden="0" w:uiPriority="73" w:unhideWhenUsed="0"/>
-    <w:lsdException w:name="Light Shading Accent 5" w:semiHidden="0" w:uiPriority="60" w:unhideWhenUsed="0"/>
-    <w:lsdException w:name="Light List Accent 5" w:semiHidden="0" w:uiPriority="61" w:unhideWhenUsed="0"/>
-    <w:lsdException w:name="Light Grid Accent 5" w:semiHidden="0" w:uiPriority="62" w:unhideWhenUsed="0"/>
-    <w:lsdException w:name="Medium Shading 1 Accent 5" w:semiHidden="0" w:uiPriority="63" w:unhideWhenUsed="0"/>
-    <w:lsdException w:name="Medium Shading 2 Accent 5" w:semiHidden="0" w:uiPriority="64" w:unhideWhenUsed="0"/>
-    <w:lsdException w:name="Medium List 1 Accent 5" w:semiHidden="0" w:uiPriority="65" w:unhideWhenUsed="0"/>
-    <w:lsdException w:name="Medium List 2 Accent 5" w:semiHidden="0" w:uiPriority="66" w:unhideWhenUsed="0"/>
-    <w:lsdException w:name="Medium Grid 1 Accent 5" w:semiHidden="0" w:uiPriority="67" w:unhideWhenUsed="0"/>
-    <w:lsdException w:name="Medium Grid 2 Accent 5" w:semiHidden="0" w:uiPriority="68" w:unhideWhenUsed="0"/>
-    <w:lsdException w:name="Medium Grid 3 Accent 5" w:semiHidden="0" w:uiPriority="69" w:unhideWhenUsed="0"/>
-    <w:lsdException w:name="Dark List Accent 5" w:semiHidden="0" w:uiPriority="70" w:unhideWhenUsed="0"/>
-    <w:lsdException w:name="Colorful Shading Accent 5" w:semiHidden="0" w:uiPriority="71" w:unhideWhenUsed="0"/>
-    <w:lsdException w:name="Colorful List Accent 5" w:semiHidden="0" w:uiPriority="72" w:unhideWhenUsed="0"/>
-    <w:lsdException w:name="Colorful Grid Accent 5" w:semiHidden="0" w:uiPriority="73" w:unhideWhenUsed="0"/>
-    <w:lsdException w:name="Light Shading Accent 6" w:semiHidden="0" w:uiPriority="60" w:unhideWhenUsed="0"/>
-    <w:lsdException w:name="Light List Accent 6" w:semiHidden="0" w:uiPriority="61" w:unhideWhenUsed="0"/>
-    <w:lsdException w:name="Light Grid Accent 6" w:semiHidden="0" w:uiPriority="62" w:unhideWhenUsed="0"/>
-    <w:lsdException w:name="Medium Shading 1 Accent 6" w:semiHidden="0" w:uiPriority="63" w:unhideWhenUsed="0"/>
-    <w:lsdException w:name="Medium Shading 2 Accent 6" w:semiHidden="0" w:uiPriority="64" w:unhideWhenUsed="0"/>
-    <w:lsdException w:name="Medium List 1 Accent 6" w:semiHidden="0" w:uiPriority="65" w:unhideWhenUsed="0"/>
-    <w:lsdException w:name="Medium List 2 Accent 6" w:semiHidden="0" w:uiPriority="66" w:unhideWhenUsed="0"/>
-    <w:lsdException w:name="Medium Grid 1 Accent 6" w:semiHidden="0" w:uiPriority="67" w:unhideWhenUsed="0"/>
-    <w:lsdException w:name="Medium Grid 2 Accent 6" w:semiHidden="0" w:uiPriority="68" w:unhideWhenUsed="0"/>
-    <w:lsdException w:name="Medium Grid 3 Accent 6" w:semiHidden="0" w:uiPriority="69" w:unhideWhenUsed="0"/>
-    <w:lsdException w:name="Dark List Accent 6" w:semiHidden="0" w:uiPriority="70" w:unhideWhenUsed="0"/>
-    <w:lsdException w:name="Colorful Shading Accent 6" w:semiHidden="0" w:uiPriority="71" w:unhideWhenUsed="0"/>
-    <w:lsdException w:name="Colorful List Accent 6" w:semiHidden="0" w:uiPriority="72" w:unhideWhenUsed="0"/>
-    <w:lsdException w:name="Colorful Grid Accent 6" w:semiHidden="0" w:uiPriority="73" w:unhideWhenUsed="0"/>
-    <w:lsdException w:name="Subtle Emphasis" w:semiHidden="0" w:uiPriority="19" w:unhideWhenUsed="0" w:qFormat="1"/>
-    <w:lsdException w:name="Intense Emphasis" w:semiHidden="0" w:uiPriority="21" w:unhideWhenUsed="0" w:qFormat="1"/>
-    <w:lsdException w:name="Subtle Reference" w:semiHidden="0" w:uiPriority="31" w:unhideWhenUsed="0" w:qFormat="1"/>
-    <w:lsdException w:name="Intense Reference" w:semiHidden="0" w:uiPriority="32" w:unhideWhenUsed="0" w:qFormat="1"/>
-    <w:lsdException w:name="Book Title" w:semiHidden="0" w:uiPriority="33" w:unhideWhenUsed="0" w:qFormat="1"/>
-    <w:lsdException w:name="Bibliography" w:uiPriority="37"/>
-    <w:lsdException w:name="TOC Heading" w:uiPriority="39" w:qFormat="1"/>
+  <w:latentStyles w:defLockedState="0" w:defUIPriority="99" w:defSemiHidden="0" w:defUnhideWhenUsed="0" w:defQFormat="0" w:count="371">
+    <w:lsdException w:name="Normal" w:uiPriority="0" w:qFormat="1"/>
+    <w:lsdException w:name="heading 1" w:uiPriority="9" w:qFormat="1"/>
+    <w:lsdException w:name="heading 2" w:semiHidden="1" w:uiPriority="9" w:unhideWhenUsed="1" w:qFormat="1"/>
+    <w:lsdException w:name="heading 3" w:semiHidden="1" w:uiPriority="9" w:unhideWhenUsed="1" w:qFormat="1"/>
+    <w:lsdException w:name="heading 4" w:semiHidden="1" w:uiPriority="9" w:unhideWhenUsed="1" w:qFormat="1"/>
+    <w:lsdException w:name="heading 5" w:semiHidden="1" w:uiPriority="9" w:unhideWhenUsed="1" w:qFormat="1"/>
+    <w:lsdException w:name="heading 6" w:semiHidden="1" w:uiPriority="9" w:unhideWhenUsed="1" w:qFormat="1"/>
+    <w:lsdException w:name="heading 7" w:semiHidden="1" w:uiPriority="9" w:unhideWhenUsed="1" w:qFormat="1"/>
+    <w:lsdException w:name="heading 8" w:semiHidden="1" w:uiPriority="9" w:unhideWhenUsed="1" w:qFormat="1"/>
+    <w:lsdException w:name="heading 9" w:semiHidden="1" w:uiPriority="9" w:unhideWhenUsed="1" w:qFormat="1"/>
+    <w:lsdException w:name="index 1" w:semiHidden="1" w:unhideWhenUsed="1"/>
+    <w:lsdException w:name="index 2" w:semiHidden="1" w:unhideWhenUsed="1"/>
+    <w:lsdException w:name="index 3" w:semiHidden="1" w:unhideWhenUsed="1"/>
+    <w:lsdException w:name="index 4" w:semiHidden="1" w:unhideWhenUsed="1"/>
+    <w:lsdException w:name="index 5" w:semiHidden="1" w:unhideWhenUsed="1"/>
+    <w:lsdException w:name="index 6" w:semiHidden="1" w:unhideWhenUsed="1"/>
+    <w:lsdException w:name="index 7" w:semiHidden="1" w:unhideWhenUsed="1"/>
+    <w:lsdException w:name="index 8" w:semiHidden="1" w:unhideWhenUsed="1"/>
+    <w:lsdException w:name="index 9" w:semiHidden="1" w:unhideWhenUsed="1"/>
+    <w:lsdException w:name="toc 1" w:semiHidden="1" w:uiPriority="39" w:unhideWhenUsed="1"/>
+    <w:lsdException w:name="toc 2" w:semiHidden="1" w:uiPriority="39" w:unhideWhenUsed="1"/>
+    <w:lsdException w:name="toc 3" w:semiHidden="1" w:uiPriority="39" w:unhideWhenUsed="1"/>
+    <w:lsdException w:name="toc 4" w:semiHidden="1" w:uiPriority="39" w:unhideWhenUsed="1"/>
+    <w:lsdException w:name="toc 5" w:semiHidden="1" w:uiPriority="39" w:unhideWhenUsed="1"/>
+    <w:lsdException w:name="toc 6" w:semiHidden="1" w:uiPriority="39" w:unhideWhenUsed="1"/>
+    <w:lsdException w:name="toc 7" w:semiHidden="1" w:uiPriority="39" w:unhideWhenUsed="1"/>
+    <w:lsdException w:name="toc 8" w:semiHidden="1" w:uiPriority="39" w:unhideWhenUsed="1"/>
+    <w:lsdException w:name="toc 9" w:semiHidden="1" w:uiPriority="39" w:unhideWhenUsed="1"/>
+    <w:lsdException w:name="Normal Indent" w:semiHidden="1" w:unhideWhenUsed="1"/>
+    <w:lsdException w:name="footnote text" w:semiHidden="1" w:unhideWhenUsed="1"/>
+    <w:lsdException w:name="annotation text" w:semiHidden="1" w:unhideWhenUsed="1"/>
+    <w:lsdException w:name="header" w:semiHidden="1" w:unhideWhenUsed="1"/>
+    <w:lsdException w:name="footer" w:semiHidden="1" w:unhideWhenUsed="1"/>
+    <w:lsdException w:name="index heading" w:semiHidden="1" w:unhideWhenUsed="1"/>
+    <w:lsdException w:name="caption" w:semiHidden="1" w:uiPriority="35" w:unhideWhenUsed="1" w:qFormat="1"/>
+    <w:lsdException w:name="table of figures" w:semiHidden="1" w:unhideWhenUsed="1"/>
+    <w:lsdException w:name="envelope address" w:semiHidden="1" w:unhideWhenUsed="1"/>
+    <w:lsdException w:name="envelope return" w:semiHidden="1" w:unhideWhenUsed="1"/>
+    <w:lsdException w:name="footnote reference" w:semiHidden="1" w:unhideWhenUsed="1"/>
+    <w:lsdException w:name="annotation reference" w:semiHidden="1" w:unhideWhenUsed="1"/>
+    <w:lsdException w:name="line number" w:semiHidden="1" w:unhideWhenUsed="1"/>
+    <w:lsdException w:name="page number" w:semiHidden="1" w:unhideWhenUsed="1"/>
+    <w:lsdException w:name="endnote reference" w:semiHidden="1" w:unhideWhenUsed="1"/>
+    <w:lsdException w:name="endnote text" w:semiHidden="1" w:unhideWhenUsed="1"/>
+    <w:lsdException w:name="table of authorities" w:semiHidden="1" w:unhideWhenUsed="1"/>
+    <w:lsdException w:name="macro" w:semiHidden="1" w:unhideWhenUsed="1"/>
+    <w:lsdException w:name="toa heading" w:semiHidden="1" w:unhideWhenUsed="1"/>
+    <w:lsdException w:name="List" w:semiHidden="1" w:unhideWhenUsed="1"/>
+    <w:lsdException w:name="List Bullet" w:semiHidden="1" w:unhideWhenUsed="1"/>
+    <w:lsdException w:name="List Number" w:semiHidden="1" w:unhideWhenUsed="1"/>
+    <w:lsdException w:name="List 2" w:semiHidden="1" w:unhideWhenUsed="1"/>
+    <w:lsdException w:name="List 3" w:semiHidden="1" w:unhideWhenUsed="1"/>
+    <w:lsdException w:name="List 4" w:semiHidden="1" w:unhideWhenUsed="1"/>
+    <w:lsdException w:name="List 5" w:semiHidden="1" w:unhideWhenUsed="1"/>
+    <w:lsdException w:name="List Bullet 2" w:semiHidden="1" w:unhideWhenUsed="1"/>
+    <w:lsdException w:name="List Bullet 3" w:semiHidden="1" w:unhideWhenUsed="1"/>
+    <w:lsdException w:name="List Bullet 4" w:semiHidden="1" w:unhideWhenUsed="1"/>
+    <w:lsdException w:name="List Bullet 5" w:semiHidden="1" w:unhideWhenUsed="1"/>
+    <w:lsdException w:name="List Number 2" w:semiHidden="1" w:unhideWhenUsed="1"/>
+    <w:lsdException w:name="List Number 3" w:semiHidden="1" w:unhideWhenUsed="1"/>
+    <w:lsdException w:name="List Number 4" w:semiHidden="1" w:unhideWhenUsed="1"/>
+    <w:lsdException w:name="List Number 5" w:semiHidden="1" w:unhideWhenUsed="1"/>
+    <w:lsdException w:name="Title" w:uiPriority="10" w:qFormat="1"/>
+    <w:lsdException w:name="Closing" w:semiHidden="1" w:unhideWhenUsed="1"/>
+    <w:lsdException w:name="Signature" w:semiHidden="1" w:unhideWhenUsed="1"/>
+    <w:lsdException w:name="Default Paragraph Font" w:semiHidden="1" w:uiPriority="1" w:unhideWhenUsed="1"/>
+    <w:lsdException w:name="Body Text" w:semiHidden="1" w:unhideWhenUsed="1"/>
+    <w:lsdException w:name="Body Text Indent" w:semiHidden="1" w:unhideWhenUsed="1"/>
+    <w:lsdException w:name="List Continue" w:semiHidden="1" w:unhideWhenUsed="1"/>
+    <w:lsdException w:name="List Continue 2" w:semiHidden="1" w:unhideWhenUsed="1"/>
+    <w:lsdException w:name="List Continue 3" w:semiHidden="1" w:unhideWhenUsed="1"/>
+    <w:lsdException w:name="List Continue 4" w:semiHidden="1" w:unhideWhenUsed="1"/>
+    <w:lsdException w:name="List Continue 5" w:semiHidden="1" w:unhideWhenUsed="1"/>
+    <w:lsdException w:name="Message Header" w:semiHidden="1" w:unhideWhenUsed="1"/>
+    <w:lsdException w:name="Subtitle" w:uiPriority="11" w:qFormat="1"/>
+    <w:lsdException w:name="Salutation" w:semiHidden="1" w:unhideWhenUsed="1"/>
+    <w:lsdException w:name="Date" w:semiHidden="1" w:unhideWhenUsed="1"/>
+    <w:lsdException w:name="Body Text First Indent" w:semiHidden="1" w:unhideWhenUsed="1"/>
+    <w:lsdException w:name="Body Text First Indent 2" w:semiHidden="1" w:unhideWhenUsed="1"/>
+    <w:lsdException w:name="Note Heading" w:semiHidden="1" w:unhideWhenUsed="1"/>
+    <w:lsdException w:name="Body Text 2" w:semiHidden="1" w:unhideWhenUsed="1"/>
+    <w:lsdException w:name="Body Text 3" w:semiHidden="1" w:unhideWhenUsed="1"/>
+    <w:lsdException w:name="Body Text Indent 2" w:semiHidden="1" w:unhideWhenUsed="1"/>
+    <w:lsdException w:name="Body Text Indent 3" w:semiHidden="1" w:unhideWhenUsed="1"/>
+    <w:lsdException w:name="Block Text" w:semiHidden="1" w:unhideWhenUsed="1"/>
+    <w:lsdException w:name="Hyperlink" w:semiHidden="1" w:unhideWhenUsed="1"/>
+    <w:lsdException w:name="FollowedHyperlink" w:semiHidden="1" w:unhideWhenUsed="1"/>
+    <w:lsdException w:name="Strong" w:uiPriority="22" w:qFormat="1"/>
+    <w:lsdException w:name="Emphasis" w:uiPriority="20" w:qFormat="1"/>
+    <w:lsdException w:name="Document Map" w:semiHidden="1" w:unhideWhenUsed="1"/>
+    <w:lsdException w:name="Plain Text" w:semiHidden="1" w:unhideWhenUsed="1"/>
+    <w:lsdException w:name="E-mail Signature" w:semiHidden="1" w:unhideWhenUsed="1"/>
+    <w:lsdException w:name="HTML Top of Form" w:semiHidden="1" w:unhideWhenUsed="1"/>
+    <w:lsdException w:name="HTML Bottom of Form" w:semiHidden="1" w:unhideWhenUsed="1"/>
+    <w:lsdException w:name="Normal (Web)" w:semiHidden="1" w:unhideWhenUsed="1"/>
+    <w:lsdException w:name="HTML Acronym" w:semiHidden="1" w:unhideWhenUsed="1"/>
+    <w:lsdException w:name="HTML Address" w:semiHidden="1" w:unhideWhenUsed="1"/>
+    <w:lsdException w:name="HTML Cite" w:semiHidden="1" w:unhideWhenUsed="1"/>
+    <w:lsdException w:name="HTML Code" w:semiHidden="1" w:unhideWhenUsed="1"/>
+    <w:lsdException w:name="HTML Definition" w:semiHidden="1" w:unhideWhenUsed="1"/>
+    <w:lsdException w:name="HTML Keyboard" w:semiHidden="1" w:unhideWhenUsed="1"/>
+    <w:lsdException w:name="HTML Preformatted" w:semiHidden="1" w:unhideWhenUsed="1"/>
+    <w:lsdException w:name="HTML Sample" w:semiHidden="1" w:unhideWhenUsed="1"/>
+    <w:lsdException w:name="HTML Typewriter" w:semiHidden="1" w:unhideWhenUsed="1"/>
+    <w:lsdException w:name="HTML Variable" w:semiHidden="1" w:unhideWhenUsed="1"/>
+    <w:lsdException w:name="Normal Table" w:semiHidden="1" w:unhideWhenUsed="1"/>
+    <w:lsdException w:name="annotation subject" w:semiHidden="1" w:unhideWhenUsed="1"/>
+    <w:lsdException w:name="No List" w:semiHidden="1" w:unhideWhenUsed="1"/>
+    <w:lsdException w:name="Outline List 1" w:semiHidden="1" w:unhideWhenUsed="1"/>
+    <w:lsdException w:name="Outline List 2" w:semiHidden="1" w:unhideWhenUsed="1"/>
+    <w:lsdException w:name="Outline List 3" w:semiHidden="1" w:unhideWhenUsed="1"/>
+    <w:lsdException w:name="Table Simple 1" w:semiHidden="1" w:unhideWhenUsed="1"/>
+    <w:lsdException w:name="Table Simple 2" w:semiHidden="1" w:unhideWhenUsed="1"/>
+    <w:lsdException w:name="Table Simple 3" w:semiHidden="1" w:unhideWhenUsed="1"/>
+    <w:lsdException w:name="Table Classic 1" w:semiHidden="1" w:unhideWhenUsed="1"/>
+    <w:lsdException w:name="Table Classic 2" w:semiHidden="1" w:unhideWhenUsed="1"/>
+    <w:lsdException w:name="Table Classic 3" w:semiHidden="1" w:unhideWhenUsed="1"/>
+    <w:lsdException w:name="Table Classic 4" w:semiHidden="1" w:unhideWhenUsed="1"/>
+    <w:lsdException w:name="Table Colorful 1" w:semiHidden="1" w:unhideWhenUsed="1"/>
+    <w:lsdException w:name="Table Colorful 2" w:semiHidden="1" w:unhideWhenUsed="1"/>
+    <w:lsdException w:name="Table Colorful 3" w:semiHidden="1" w:unhideWhenUsed="1"/>
+    <w:lsdException w:name="Table Columns 1" w:semiHidden="1" w:unhideWhenUsed="1"/>
+    <w:lsdException w:name="Table Columns 2" w:semiHidden="1" w:unhideWhenUsed="1"/>
+    <w:lsdException w:name="Table Columns 3" w:semiHidden="1" w:unhideWhenUsed="1"/>
+    <w:lsdException w:name="Table Columns 4" w:semiHidden="1" w:unhideWhenUsed="1"/>
+    <w:lsdException w:name="Table Columns 5" w:semiHidden="1" w:unhideWhenUsed="1"/>
+    <w:lsdException w:name="Table Grid 1" w:semiHidden="1" w:unhideWhenUsed="1"/>
+    <w:lsdException w:name="Table Grid 2" w:semiHidden="1" w:unhideWhenUsed="1"/>
+    <w:lsdException w:name="Table Grid 3" w:semiHidden="1" w:unhideWhenUsed="1"/>
+    <w:lsdException w:name="Table Grid 4" w:semiHidden="1" w:unhideWhenUsed="1"/>
+    <w:lsdException w:name="Table Grid 5" w:semiHidden="1" w:unhideWhenUsed="1"/>
+    <w:lsdException w:name="Table Grid 6" w:semiHidden="1" w:unhideWhenUsed="1"/>
+    <w:lsdException w:name="Table Grid 7" w:semiHidden="1" w:unhideWhenUsed="1"/>
+    <w:lsdException w:name="Table Grid 8" w:semiHidden="1" w:unhideWhenUsed="1"/>
+    <w:lsdException w:name="Table List 1" w:semiHidden="1" w:unhideWhenUsed="1"/>
+    <w:lsdException w:name="Table List 2" w:semiHidden="1" w:unhideWhenUsed="1"/>
+    <w:lsdException w:name="Table List 3" w:semiHidden="1" w:unhideWhenUsed="1"/>
+    <w:lsdException w:name="Table List 4" w:semiHidden="1" w:unhideWhenUsed="1"/>
+    <w:lsdException w:name="Table List 5" w:semiHidden="1" w:unhideWhenUsed="1"/>
+    <w:lsdException w:name="Table List 6" w:semiHidden="1" w:unhideWhenUsed="1"/>
+    <w:lsdException w:name="Table List 7" w:semiHidden="1" w:unhideWhenUsed="1"/>
+    <w:lsdException w:name="Table List 8" w:semiHidden="1" w:unhideWhenUsed="1"/>
+    <w:lsdException w:name="Table 3D effects 1" w:semiHidden="1" w:unhideWhenUsed="1"/>
+    <w:lsdException w:name="Table 3D effects 2" w:semiHidden="1" w:unhideWhenUsed="1"/>
+    <w:lsdException w:name="Table 3D effects 3" w:semiHidden="1" w:unhideWhenUsed="1"/>
+    <w:lsdException w:name="Table Contemporary" w:semiHidden="1" w:unhideWhenUsed="1"/>
+    <w:lsdException w:name="Table Elegant" w:semiHidden="1" w:unhideWhenUsed="1"/>
+    <w:lsdException w:name="Table Professional" w:semiHidden="1" w:unhideWhenUsed="1"/>
+    <w:lsdException w:name="Table Subtle 1" w:semiHidden="1" w:unhideWhenUsed="1"/>
+    <w:lsdException w:name="Table Subtle 2" w:semiHidden="1" w:unhideWhenUsed="1"/>
+    <w:lsdException w:name="Table Web 1" w:semiHidden="1" w:unhideWhenUsed="1"/>
+    <w:lsdException w:name="Table Web 2" w:semiHidden="1" w:unhideWhenUsed="1"/>
+    <w:lsdException w:name="Table Web 3" w:semiHidden="1" w:unhideWhenUsed="1"/>
+    <w:lsdException w:name="Balloon Text" w:semiHidden="1" w:unhideWhenUsed="1"/>
+    <w:lsdException w:name="Table Grid" w:uiPriority="39"/>
+    <w:lsdException w:name="Table Theme" w:semiHidden="1" w:unhideWhenUsed="1"/>
+    <w:lsdException w:name="Placeholder Text" w:semiHidden="1"/>
+    <w:lsdException w:name="No Spacing" w:uiPriority="1" w:qFormat="1"/>
+    <w:lsdException w:name="Light Shading" w:uiPriority="60"/>
+    <w:lsdException w:name="Light List" w:uiPriority="61"/>
+    <w:lsdException w:name="Light Grid" w:uiPriority="62"/>
+    <w:lsdException w:name="Medium Shading 1" w:uiPriority="63"/>
+    <w:lsdException w:name="Medium Shading 2" w:uiPriority="64"/>
+    <w:lsdException w:name="Medium List 1" w:uiPriority="65"/>
+    <w:lsdException w:name="Medium List 2" w:uiPriority="66"/>
+    <w:lsdException w:name="Medium Grid 1" w:uiPriority="67"/>
+    <w:lsdException w:name="Medium Grid 2" w:uiPriority="68"/>
+    <w:lsdException w:name="Medium Grid 3" w:uiPriority="69"/>
+    <w:lsdException w:name="Dark List" w:uiPriority="70"/>
+    <w:lsdException w:name="Colorful Shading" w:uiPriority="71"/>
+    <w:lsdException w:name="Colorful List" w:uiPriority="72"/>
+    <w:lsdException w:name="Colorful Grid" w:uiPriority="73"/>
+    <w:lsdException w:name="Light Shading Accent 1" w:uiPriority="60"/>
+    <w:lsdException w:name="Light List Accent 1" w:uiPriority="61"/>
+    <w:lsdException w:name="Light Grid Accent 1" w:uiPriority="62"/>
+    <w:lsdException w:name="Medium Shading 1 Accent 1" w:uiPriority="63"/>
+    <w:lsdException w:name="Medium Shading 2 Accent 1" w:uiPriority="64"/>
+    <w:lsdException w:name="Medium List 1 Accent 1" w:uiPriority="65"/>
+    <w:lsdException w:name="Revision" w:semiHidden="1"/>
+    <w:lsdException w:name="List Paragraph" w:uiPriority="34" w:qFormat="1"/>
+    <w:lsdException w:name="Quote" w:uiPriority="29" w:qFormat="1"/>
+    <w:lsdException w:name="Intense Quote" w:uiPriority="30" w:qFormat="1"/>
+    <w:lsdException w:name="Medium List 2 Accent 1" w:uiPriority="66"/>
+    <w:lsdException w:name="Medium Grid 1 Accent 1" w:uiPriority="67"/>
+    <w:lsdException w:name="Medium Grid 2 Accent 1" w:uiPriority="68"/>
+    <w:lsdException w:name="Medium Grid 3 Accent 1" w:uiPriority="69"/>
+    <w:lsdException w:name="Dark List Accent 1" w:uiPriority="70"/>
+    <w:lsdException w:name="Colorful Shading Accent 1" w:uiPriority="71"/>
+    <w:lsdException w:name="Colorful List Accent 1" w:uiPriority="72"/>
+    <w:lsdException w:name="Colorful Grid Accent 1" w:uiPriority="73"/>
+    <w:lsdException w:name="Light Shading Accent 2" w:uiPriority="60"/>
+    <w:lsdException w:name="Light List Accent 2" w:uiPriority="61"/>
+    <w:lsdException w:name="Light Grid Accent 2" w:uiPriority="62"/>
+    <w:lsdException w:name="Medium Shading 1 Accent 2" w:uiPriority="63"/>
+    <w:lsdException w:name="Medium Shading 2 Accent 2" w:uiPriority="64"/>
+    <w:lsdException w:name="Medium List 1 Accent 2" w:uiPriority="65"/>
+    <w:lsdException w:name="Medium List 2 Accent 2" w:uiPriority="66"/>
+    <w:lsdException w:name="Medium Grid 1 Accent 2" w:uiPriority="67"/>
+    <w:lsdException w:name="Medium Grid 2 Accent 2" w:uiPriority="68"/>
+    <w:lsdException w:name="Medium Grid 3 Accent 2" w:uiPriority="69"/>
+    <w:lsdException w:name="Dark List Accent 2" w:uiPriority="70"/>
+    <w:lsdException w:name="Colorful Shading Accent 2" w:uiPriority="71"/>
+    <w:lsdException w:name="Colorful List Accent 2" w:uiPriority="72"/>
+    <w:lsdException w:name="Colorful Grid Accent 2" w:uiPriority="73"/>
+    <w:lsdException w:name="Light Shading Accent 3" w:uiPriority="60"/>
+    <w:lsdException w:name="Light List Accent 3" w:uiPriority="61"/>
+    <w:lsdException w:name="Light Grid Accent 3" w:uiPriority="62"/>
+    <w:lsdException w:name="Medium Shading 1 Accent 3" w:uiPriority="63"/>
+    <w:lsdException w:name="Medium Shading 2 Accent 3" w:uiPriority="64"/>
+    <w:lsdException w:name="Medium List 1 Accent 3" w:uiPriority="65"/>
+    <w:lsdException w:name="Medium List 2 Accent 3" w:uiPriority="66"/>
+    <w:lsdException w:name="Medium Grid 1 Accent 3" w:uiPriority="67"/>
+    <w:lsdException w:name="Medium Grid 2 Accent 3" w:uiPriority="68"/>
+    <w:lsdException w:name="Medium Grid 3 Accent 3" w:uiPriority="69"/>
+    <w:lsdException w:name="Dark List Accent 3" w:uiPriority="70"/>
+    <w:lsdException w:name="Colorful Shading Accent 3" w:uiPriority="71"/>
+    <w:lsdException w:name="Colorful List Accent 3" w:uiPriority="72"/>
+    <w:lsdException w:name="Colorful Grid Accent 3" w:uiPriority="73"/>
+    <w:lsdException w:name="Light Shading Accent 4" w:uiPriority="60"/>
+    <w:lsdException w:name="Light List Accent 4" w:uiPriority="61"/>
+    <w:lsdException w:name="Light Grid Accent 4" w:uiPriority="62"/>
+    <w:lsdException w:name="Medium Shading 1 Accent 4" w:uiPriority="63"/>
+    <w:lsdException w:name="Medium Shading 2 Accent 4" w:uiPriority="64"/>
+    <w:lsdException w:name="Medium List 1 Accent 4" w:uiPriority="65"/>
+    <w:lsdException w:name="Medium List 2 Accent 4" w:uiPriority="66"/>
+    <w:lsdException w:name="Medium Grid 1 Accent 4" w:uiPriority="67"/>
+    <w:lsdException w:name="Medium Grid 2 Accent 4" w:uiPriority="68"/>
+    <w:lsdException w:name="Medium Grid 3 Accent 4" w:uiPriority="69"/>
+    <w:lsdException w:name="Dark List Accent 4" w:uiPriority="70"/>
+    <w:lsdException w:name="Colorful Shading Accent 4" w:uiPriority="71"/>
+    <w:lsdException w:name="Colorful List Accent 4" w:uiPriority="72"/>
+    <w:lsdException w:name="Colorful Grid Accent 4" w:uiPriority="73"/>
+    <w:lsdException w:name="Light Shading Accent 5" w:uiPriority="60"/>
+    <w:lsdException w:name="Light List Accent 5" w:uiPriority="61"/>
+    <w:lsdException w:name="Light Grid Accent 5" w:uiPriority="62"/>
+    <w:lsdException w:name="Medium Shading 1 Accent 5" w:uiPriority="63"/>
+    <w:lsdException w:name="Medium Shading 2 Accent 5" w:uiPriority="64"/>
+    <w:lsdException w:name="Medium List 1 Accent 5" w:uiPriority="65"/>
+    <w:lsdException w:name="Medium List 2 Accent 5" w:uiPriority="66"/>
+    <w:lsdException w:name="Medium Grid 1 Accent 5" w:uiPriority="67"/>
+    <w:lsdException w:name="Medium Grid 2 Accent 5" w:uiPriority="68"/>
+    <w:lsdException w:name="Medium Grid 3 Accent 5" w:uiPriority="69"/>
+    <w:lsdException w:name="Dark List Accent 5" w:uiPriority="70"/>
+    <w:lsdException w:name="Colorful Shading Accent 5" w:uiPriority="71"/>
+    <w:lsdException w:name="Colorful List Accent 5" w:uiPriority="72"/>
+    <w:lsdException w:name="Colorful Grid Accent 5" w:uiPriority="73"/>
+    <w:lsdException w:name="Light Shading Accent 6" w:uiPriority="60"/>
+    <w:lsdException w:name="Light List Accent 6" w:uiPriority="61"/>
+    <w:lsdException w:name="Light Grid Accent 6" w:uiPriority="62"/>
+    <w:lsdException w:name="Medium Shading 1 Accent 6" w:uiPriority="63"/>
+    <w:lsdException w:name="Medium Shading 2 Accent 6" w:uiPriority="64"/>
+    <w:lsdException w:name="Medium List 1 Accent 6" w:uiPriority="65"/>
+    <w:lsdException w:name="Medium List 2 Accent 6" w:uiPriority="66"/>
+    <w:lsdException w:name="Medium Grid 1 Accent 6" w:uiPriority="67"/>
+    <w:lsdException w:name="Medium Grid 2 Accent 6" w:uiPriority="68"/>
+    <w:lsdException w:name="Medium Grid 3 Accent 6" w:uiPriority="69"/>
+    <w:lsdException w:name="Dark List Accent 6" w:uiPriority="70"/>
+    <w:lsdException w:name="Colorful Shading Accent 6" w:uiPriority="71"/>
+    <w:lsdException w:name="Colorful List Accent 6" w:uiPriority="72"/>
+    <w:lsdException w:name="Colorful Grid Accent 6" w:uiPriority="73"/>
+    <w:lsdException w:name="Subtle Emphasis" w:uiPriority="19" w:qFormat="1"/>
+    <w:lsdException w:name="Intense Emphasis" w:uiPriority="21" w:qFormat="1"/>
+    <w:lsdException w:name="Subtle Reference" w:uiPriority="31" w:qFormat="1"/>
+    <w:lsdException w:name="Intense Reference" w:uiPriority="32" w:qFormat="1"/>
+    <w:lsdException w:name="Book Title" w:uiPriority="33" w:qFormat="1"/>
+    <w:lsdException w:name="Bibliography" w:semiHidden="1" w:uiPriority="37" w:unhideWhenUsed="1"/>
+    <w:lsdException w:name="TOC Heading" w:semiHidden="1" w:uiPriority="39" w:unhideWhenUsed="1" w:qFormat="1"/>
+    <w:lsdException w:name="Plain Table 1" w:uiPriority="41"/>
+    <w:lsdException w:name="Plain Table 2" w:uiPriority="42"/>
+    <w:lsdException w:name="Plain Table 3" w:uiPriority="43"/>
+    <w:lsdException w:name="Plain Table 4" w:uiPriority="44"/>
+    <w:lsdException w:name="Plain Table 5" w:uiPriority="45"/>
+    <w:lsdException w:name="Grid Table Light" w:uiPriority="40"/>
+    <w:lsdException w:name="Grid Table 1 Light" w:uiPriority="46"/>
+    <w:lsdException w:name="Grid Table 2" w:uiPriority="47"/>
+    <w:lsdException w:name="Grid Table 3" w:uiPriority="48"/>
+    <w:lsdException w:name="Grid Table 4" w:uiPriority="49"/>
+    <w:lsdException w:name="Grid Table 5 Dark" w:uiPriority="50"/>
+    <w:lsdException w:name="Grid Table 6 Colorful" w:uiPriority="51"/>
+    <w:lsdException w:name="Grid Table 7 Colorful" w:uiPriority="52"/>
+    <w:lsdException w:name="Grid Table 1 Light Accent 1" w:uiPriority="46"/>
+    <w:lsdException w:name="Grid Table 2 Accent 1" w:uiPriority="47"/>
+    <w:lsdException w:name="Grid Table 3 Accent 1" w:uiPriority="48"/>
+    <w:lsdException w:name="Grid Table 4 Accent 1" w:uiPriority="49"/>
+    <w:lsdException w:name="Grid Table 5 Dark Accent 1" w:uiPriority="50"/>
+    <w:lsdException w:name="Grid Table 6 Colorful Accent 1" w:uiPriority="51"/>
+    <w:lsdException w:name="Grid Table 7 Colorful Accent 1" w:uiPriority="52"/>
+    <w:lsdException w:name="Grid Table 1 Light Accent 2" w:uiPriority="46"/>
+    <w:lsdException w:name="Grid Table 2 Accent 2" w:uiPriority="47"/>
+    <w:lsdException w:name="Grid Table 3 Accent 2" w:uiPriority="48"/>
+    <w:lsdException w:name="Grid Table 4 Accent 2" w:uiPriority="49"/>
+    <w:lsdException w:name="Grid Table 5 Dark Accent 2" w:uiPriority="50"/>
+    <w:lsdException w:name="Grid Table 6 Colorful Accent 2" w:uiPriority="51"/>
+    <w:lsdException w:name="Grid Table 7 Colorful Accent 2" w:uiPriority="52"/>
+    <w:lsdException w:name="Grid Table 1 Light Accent 3" w:uiPriority="46"/>
+    <w:lsdException w:name="Grid Table 2 Accent 3" w:uiPriority="47"/>
+    <w:lsdException w:name="Grid Table 3 Accent 3" w:uiPriority="48"/>
+    <w:lsdException w:name="Grid Table 4 Accent 3" w:uiPriority="49"/>
+    <w:lsdException w:name="Grid Table 5 Dark Accent 3" w:uiPriority="50"/>
+    <w:lsdException w:name="Grid Table 6 Colorful Accent 3" w:uiPriority="51"/>
+    <w:lsdException w:name="Grid Table 7 Colorful Accent 3" w:uiPriority="52"/>
+    <w:lsdException w:name="Grid Table 1 Light Accent 4" w:uiPriority="46"/>
+    <w:lsdException w:name="Grid Table 2 Accent 4" w:uiPriority="47"/>
+    <w:lsdException w:name="Grid Table 3 Accent 4" w:uiPriority="48"/>
+    <w:lsdException w:name="Grid Table 4 Accent 4" w:uiPriority="49"/>
+    <w:lsdException w:name="Grid Table 5 Dark Accent 4" w:uiPriority="50"/>
+    <w:lsdException w:name="Grid Table 6 Colorful Accent 4" w:uiPriority="51"/>
+    <w:lsdException w:name="Grid Table 7 Colorful Accent 4" w:uiPriority="52"/>
+    <w:lsdException w:name="Grid Table 1 Light Accent 5" w:uiPriority="46"/>
+    <w:lsdException w:name="Grid Table 2 Accent 5" w:uiPriority="47"/>
+    <w:lsdException w:name="Grid Table 3 Accent 5" w:uiPriority="48"/>
+    <w:lsdException w:name="Grid Table 4 Accent 5" w:uiPriority="49"/>
+    <w:lsdException w:name="Grid Table 5 Dark Accent 5" w:uiPriority="50"/>
+    <w:lsdException w:name="Grid Table 6 Colorful Accent 5" w:uiPriority="51"/>
+    <w:lsdException w:name="Grid Table 7 Colorful Accent 5" w:uiPriority="52"/>
+    <w:lsdException w:name="Grid Table 1 Light Accent 6" w:uiPriority="46"/>
+    <w:lsdException w:name="Grid Table 2 Accent 6" w:uiPriority="47"/>
+    <w:lsdException w:name="Grid Table 3 Accent 6" w:uiPriority="48"/>
+    <w:lsdException w:name="Grid Table 4 Accent 6" w:uiPriority="49"/>
+    <w:lsdException w:name="Grid Table 5 Dark Accent 6" w:uiPriority="50"/>
+    <w:lsdException w:name="Grid Table 6 Colorful Accent 6" w:uiPriority="51"/>
+    <w:lsdException w:name="Grid Table 7 Colorful Accent 6" w:uiPriority="52"/>
+    <w:lsdException w:name="List Table 1 Light" w:uiPriority="46"/>
+    <w:lsdException w:name="List Table 2" w:uiPriority="47"/>
+    <w:lsdException w:name="List Table 3" w:uiPriority="48"/>
+    <w:lsdException w:name="List Table 4" w:uiPriority="49"/>
+    <w:lsdException w:name="List Table 5 Dark" w:uiPriority="50"/>
+    <w:lsdException w:name="List Table 6 Colorful" w:uiPriority="51"/>
+    <w:lsdException w:name="List Table 7 Colorful" w:uiPriority="52"/>
+    <w:lsdException w:name="List Table 1 Light Accent 1" w:uiPriority="46"/>
+    <w:lsdException w:name="List Table 2 Accent 1" w:uiPriority="47"/>
+    <w:lsdException w:name="List Table 3 Accent 1" w:uiPriority="48"/>
+    <w:lsdException w:name="List Table 4 Accent 1" w:uiPriority="49"/>
+    <w:lsdException w:name="List Table 5 Dark Accent 1" w:uiPriority="50"/>
+    <w:lsdException w:name="List Table 6 Colorful Accent 1" w:uiPriority="51"/>
+    <w:lsdException w:name="List Table 7 Colorful Accent 1" w:uiPriority="52"/>
+    <w:lsdException w:name="List Table 1 Light Accent 2" w:uiPriority="46"/>
+    <w:lsdException w:name="List Table 2 Accent 2" w:uiPriority="47"/>
+    <w:lsdException w:name="List Table 3 Accent 2" w:uiPriority="48"/>
+    <w:lsdException w:name="List Table 4 Accent 2" w:uiPriority="49"/>
+    <w:lsdException w:name="List Table 5 Dark Accent 2" w:uiPriority="50"/>
+    <w:lsdException w:name="List Table 6 Colorful Accent 2" w:uiPriority="51"/>
+    <w:lsdException w:name="List Table 7 Colorful Accent 2" w:uiPriority="52"/>
+    <w:lsdException w:name="List Table 1 Light Accent 3" w:uiPriority="46"/>
+    <w:lsdException w:name="List Table 2 Accent 3" w:uiPriority="47"/>
+    <w:lsdException w:name="List Table 3 Accent 3" w:uiPriority="48"/>
+    <w:lsdException w:name="List Table 4 Accent 3" w:uiPriority="49"/>
+    <w:lsdException w:name="List Table 5 Dark Accent 3" w:uiPriority="50"/>
+    <w:lsdException w:name="List Table 6 Colorful Accent 3" w:uiPriority="51"/>
+    <w:lsdException w:name="List Table 7 Colorful Accent 3" w:uiPriority="52"/>
+    <w:lsdException w:name="List Table 1 Light Accent 4" w:uiPriority="46"/>
+    <w:lsdException w:name="List Table 2 Accent 4" w:uiPriority="47"/>
+    <w:lsdException w:name="List Table 3 Accent 4" w:uiPriority="48"/>
+    <w:lsdException w:name="List Table 4 Accent 4" w:uiPriority="49"/>
+    <w:lsdException w:name="List Table 5 Dark Accent 4" w:uiPriority="50"/>
+    <w:lsdException w:name="List Table 6 Colorful Accent 4" w:uiPriority="51"/>
+    <w:lsdException w:name="List Table 7 Colorful Accent 4" w:uiPriority="52"/>
+    <w:lsdException w:name="List Table 1 Light Accent 5" w:uiPriority="46"/>
+    <w:lsdException w:name="List Table 2 Accent 5" w:uiPriority="47"/>
+    <w:lsdException w:name="List Table 3 Accent 5" w:uiPriority="48"/>
+    <w:lsdException w:name="List Table 4 Accent 5" w:uiPriority="49"/>
+    <w:lsdException w:name="List Table 5 Dark Accent 5" w:uiPriority="50"/>
+    <w:lsdException w:name="List Table 6 Colorful Accent 5" w:uiPriority="51"/>
+    <w:lsdException w:name="List Table 7 Colorful Accent 5" w:uiPriority="52"/>
+    <w:lsdException w:name="List Table 1 Light Accent 6" w:uiPriority="46"/>
+    <w:lsdException w:name="List Table 2 Accent 6" w:uiPriority="47"/>
+    <w:lsdException w:name="List Table 3 Accent 6" w:uiPriority="48"/>
+    <w:lsdException w:name="List Table 4 Accent 6" w:uiPriority="49"/>
+    <w:lsdException w:name="List Table 5 Dark Accent 6" w:uiPriority="50"/>
+    <w:lsdException w:name="List Table 6 Colorful Accent 6" w:uiPriority="51"/>
+    <w:lsdException w:name="List Table 7 Colorful Accent 6" w:uiPriority="52"/>
   </w:latentStyles>
   <w:style w:type="paragraph" w:default="1" w:styleId="Normal">
     <w:name w:val="Normal"/>
@@ -24552,7 +24067,7 @@
   <a:extraClrSchemeLst/>
   <a:extLst>
     <a:ext uri="{05A4C25C-085E-4340-85A3-A5531E510DB2}">
-      <thm15:themeFamily xmlns:thm15="http://schemas.microsoft.com/office/thememl/2012/main" xmlns="" name="Office Theme" id="{62F939B6-93AF-4DB8-9C6B-D6C7DFDC589F}" vid="{4A3C46E8-61CC-4603-A589-7422A47A8E4A}"/>
+      <thm15:themeFamily xmlns:thm15="http://schemas.microsoft.com/office/thememl/2012/main" name="Office Theme" id="{62F939B6-93AF-4DB8-9C6B-D6C7DFDC589F}" vid="{4A3C46E8-61CC-4603-A589-7422A47A8E4A}"/>
     </a:ext>
   </a:extLst>
 </a:theme>
@@ -24563,7 +24078,7 @@
 </file>
 
 <file path=customXml/itemProps1.xml><?xml version="1.0" encoding="utf-8"?>
-<ds:datastoreItem xmlns:ds="http://schemas.openxmlformats.org/officeDocument/2006/customXml" ds:itemID="{D18B32E6-A02E-4C13-96C4-46F7E79E4E15}">
+<ds:datastoreItem xmlns:ds="http://schemas.openxmlformats.org/officeDocument/2006/customXml" ds:itemID="{1A94D697-A12A-4697-8980-8810A664780D}">
   <ds:schemaRefs>
     <ds:schemaRef ds:uri="http://schemas.openxmlformats.org/officeDocument/2006/bibliography"/>
   </ds:schemaRefs>

</xml_diff>

<commit_message>
Addition of the WallLeaks module in the Buildings package
</commit_message>
<xml_diff>
--- a/Information/script for equations.docx
+++ b/Information/script for equations.docx
@@ -19,7 +19,6 @@
           <w:docPartUnique/>
         </w:docPartObj>
       </w:sdtPr>
-      <w:sdtEndPr/>
       <w:sdtContent>
         <w:p>
           <w:pPr>
@@ -11073,13 +11072,7 @@
                 <w:rPr>
                   <w:rFonts w:ascii="Cambria Math" w:eastAsiaTheme="minorEastAsia" w:hAnsi="Cambria Math"/>
                 </w:rPr>
-                <m:t>Cr</m:t>
-              </m:r>
-              <m:r>
-                <w:rPr>
-                  <w:rFonts w:ascii="Cambria Math" w:eastAsiaTheme="minorEastAsia" w:hAnsi="Cambria Math"/>
-                </w:rPr>
-                <m:t>-1</m:t>
+                <m:t>Cr-1</m:t>
               </m:r>
             </m:den>
           </m:f>
@@ -11149,13 +11142,7 @@
                     <w:rPr>
                       <w:rFonts w:ascii="Cambria Math" w:eastAsiaTheme="minorEastAsia" w:hAnsi="Cambria Math"/>
                     </w:rPr>
-                    <m:t>-</m:t>
-                  </m:r>
-                  <m:r>
-                    <w:rPr>
-                      <w:rFonts w:ascii="Cambria Math" w:eastAsiaTheme="minorEastAsia" w:hAnsi="Cambria Math"/>
-                    </w:rPr>
-                    <m:t>1</m:t>
+                    <m:t>-1</m:t>
                   </m:r>
                 </m:num>
                 <m:den>
@@ -11163,13 +11150,7 @@
                     <w:rPr>
                       <w:rFonts w:ascii="Cambria Math" w:eastAsiaTheme="minorEastAsia" w:hAnsi="Cambria Math"/>
                     </w:rPr>
-                    <m:t>Eff×Cr</m:t>
-                  </m:r>
-                  <m:r>
-                    <w:rPr>
-                      <w:rFonts w:ascii="Cambria Math" w:eastAsiaTheme="minorEastAsia" w:hAnsi="Cambria Math"/>
-                    </w:rPr>
-                    <m:t>-1</m:t>
+                    <m:t>Eff×Cr-1</m:t>
                   </m:r>
                 </m:den>
               </m:f>
@@ -11365,13 +11346,7 @@
                 <w:rPr>
                   <w:rFonts w:ascii="Cambria Math" w:eastAsiaTheme="minorEastAsia" w:hAnsi="Cambria Math"/>
                 </w:rPr>
-                <m:t>1+</m:t>
-              </m:r>
-              <m:r>
-                <w:rPr>
-                  <w:rFonts w:ascii="Cambria Math" w:eastAsiaTheme="minorEastAsia" w:hAnsi="Cambria Math"/>
-                </w:rPr>
-                <m:t>Cr</m:t>
+                <m:t>1+Cr</m:t>
               </m:r>
             </m:den>
           </m:f>
@@ -11406,8 +11381,6 @@
         </w:rPr>
         <w:br w:type="page"/>
       </w:r>
-      <w:bookmarkStart w:id="23" w:name="_GoBack"/>
-      <w:bookmarkEnd w:id="23"/>
     </w:p>
     <w:p>
       <w:pPr>
@@ -11417,7 +11390,7 @@
           <w:lang w:val="fr-FR"/>
         </w:rPr>
       </w:pPr>
-      <w:bookmarkStart w:id="24" w:name="_Toc41656112"/>
+      <w:bookmarkStart w:id="23" w:name="_Toc41656112"/>
       <w:proofErr w:type="spellStart"/>
       <w:r>
         <w:rPr>
@@ -11427,7 +11400,7 @@
         <w:lastRenderedPageBreak/>
         <w:t>FluidDynamics</w:t>
       </w:r>
-      <w:bookmarkEnd w:id="24"/>
+      <w:bookmarkEnd w:id="23"/>
       <w:proofErr w:type="spellEnd"/>
     </w:p>
     <w:p>
@@ -11444,14 +11417,14 @@
           <w:lang w:val="fr-FR"/>
         </w:rPr>
       </w:pPr>
-      <w:bookmarkStart w:id="25" w:name="_Toc41656113"/>
+      <w:bookmarkStart w:id="24" w:name="_Toc41656113"/>
       <w:r>
         <w:rPr>
           <w:lang w:val="fr-FR"/>
         </w:rPr>
         <w:t>Components</w:t>
       </w:r>
-      <w:bookmarkEnd w:id="25"/>
+      <w:bookmarkEnd w:id="24"/>
     </w:p>
     <w:p>
       <w:pPr>
@@ -11467,7 +11440,7 @@
           <w:lang w:val="fr-FR"/>
         </w:rPr>
       </w:pPr>
-      <w:bookmarkStart w:id="26" w:name="_Toc41656114"/>
+      <w:bookmarkStart w:id="25" w:name="_Toc41656114"/>
       <w:proofErr w:type="spellStart"/>
       <w:r>
         <w:rPr>
@@ -11475,7 +11448,7 @@
         </w:rPr>
         <w:t>PartialPump</w:t>
       </w:r>
-      <w:bookmarkEnd w:id="26"/>
+      <w:bookmarkEnd w:id="25"/>
       <w:proofErr w:type="spellEnd"/>
     </w:p>
     <w:p>
@@ -11633,7 +11606,7 @@
           <w:lang w:val="fr-FR"/>
         </w:rPr>
       </w:pPr>
-      <w:bookmarkStart w:id="27" w:name="_Toc41656115"/>
+      <w:bookmarkStart w:id="26" w:name="_Toc41656115"/>
       <w:proofErr w:type="spellStart"/>
       <w:r>
         <w:rPr>
@@ -11641,7 +11614,7 @@
         </w:rPr>
         <w:t>SimpleOpening</w:t>
       </w:r>
-      <w:bookmarkEnd w:id="27"/>
+      <w:bookmarkEnd w:id="26"/>
       <w:proofErr w:type="spellEnd"/>
     </w:p>
     <w:p>
@@ -11809,7 +11782,7 @@
           <w:rFonts w:asciiTheme="minorHAnsi" w:eastAsiaTheme="minorEastAsia" w:hAnsiTheme="minorHAnsi" w:cstheme="minorBidi"/>
         </w:rPr>
       </w:pPr>
-      <w:bookmarkStart w:id="28" w:name="_Toc41656116"/>
+      <w:bookmarkStart w:id="27" w:name="_Toc41656116"/>
       <w:proofErr w:type="spellStart"/>
       <w:r>
         <w:rPr>
@@ -11817,7 +11790,7 @@
         </w:rPr>
         <w:t>StaticPipe</w:t>
       </w:r>
-      <w:bookmarkEnd w:id="28"/>
+      <w:bookmarkEnd w:id="27"/>
       <w:proofErr w:type="spellEnd"/>
     </w:p>
     <w:p/>
@@ -11969,7 +11942,7 @@
           <w:lang w:val="fr-FR"/>
         </w:rPr>
       </w:pPr>
-      <w:bookmarkStart w:id="29" w:name="_Toc41656117"/>
+      <w:bookmarkStart w:id="28" w:name="_Toc41656117"/>
       <w:proofErr w:type="spellStart"/>
       <w:r>
         <w:rPr>
@@ -11977,7 +11950,7 @@
         </w:rPr>
         <w:t>VerticalOpening</w:t>
       </w:r>
-      <w:bookmarkEnd w:id="29"/>
+      <w:bookmarkEnd w:id="28"/>
       <w:proofErr w:type="spellEnd"/>
     </w:p>
     <w:p>
@@ -12415,7 +12388,7 @@
           <w:lang w:val="fr-FR"/>
         </w:rPr>
       </w:pPr>
-      <w:bookmarkStart w:id="30" w:name="_Toc41656118"/>
+      <w:bookmarkStart w:id="29" w:name="_Toc41656118"/>
       <w:proofErr w:type="spellStart"/>
       <w:r>
         <w:rPr>
@@ -12424,7 +12397,7 @@
         <w:lastRenderedPageBreak/>
         <w:t>HorizontalOpening</w:t>
       </w:r>
-      <w:bookmarkEnd w:id="30"/>
+      <w:bookmarkEnd w:id="29"/>
       <w:proofErr w:type="spellEnd"/>
     </w:p>
     <w:p>
@@ -14337,6 +14310,297 @@
     <w:p>
       <w:pPr>
         <w:rPr>
+          <w:rFonts w:eastAsiaTheme="minorEastAsia"/>
+        </w:rPr>
+      </w:pPr>
+    </w:p>
+    <w:p>
+      <w:pPr>
+        <w:pStyle w:val="Titre3"/>
+        <w:rPr>
+          <w:rFonts w:eastAsiaTheme="minorEastAsia"/>
+        </w:rPr>
+      </w:pPr>
+      <w:proofErr w:type="spellStart"/>
+      <w:r>
+        <w:rPr>
+          <w:rFonts w:eastAsiaTheme="minorEastAsia"/>
+        </w:rPr>
+        <w:t>WallLeaks</w:t>
+      </w:r>
+      <w:proofErr w:type="spellEnd"/>
+    </w:p>
+    <w:p/>
+    <w:p>
+      <w:pPr>
+        <w:rPr>
+          <w:rFonts w:eastAsiaTheme="minorEastAsia"/>
+        </w:rPr>
+      </w:pPr>
+      <m:oMathPara>
+        <m:oMath>
+          <m:r>
+            <w:rPr>
+              <w:rFonts w:ascii="Cambria Math" w:hAnsi="Cambria Math"/>
+            </w:rPr>
+            <m:t>∆p=</m:t>
+          </m:r>
+          <m:f>
+            <m:fPr>
+              <m:ctrlPr>
+                <w:rPr>
+                  <w:rFonts w:ascii="Cambria Math" w:hAnsi="Cambria Math"/>
+                  <w:i/>
+                </w:rPr>
+              </m:ctrlPr>
+            </m:fPr>
+            <m:num>
+              <m:r>
+                <w:rPr>
+                  <w:rFonts w:ascii="Cambria Math" w:hAnsi="Cambria Math"/>
+                </w:rPr>
+                <m:t>1</m:t>
+              </m:r>
+            </m:num>
+            <m:den>
+              <m:r>
+                <w:rPr>
+                  <w:rFonts w:ascii="Cambria Math" w:hAnsi="Cambria Math"/>
+                </w:rPr>
+                <m:t>2</m:t>
+              </m:r>
+            </m:den>
+          </m:f>
+          <m:r>
+            <w:rPr>
+              <w:rFonts w:ascii="Cambria Math" w:hAnsi="Cambria Math"/>
+            </w:rPr>
+            <m:t>×ksi×</m:t>
+          </m:r>
+          <m:r>
+            <w:rPr>
+              <w:rFonts w:ascii="Cambria Math" w:hAnsi="Cambria Math"/>
+            </w:rPr>
+            <m:t>ρ×</m:t>
+          </m:r>
+          <m:sSup>
+            <m:sSupPr>
+              <m:ctrlPr>
+                <w:rPr>
+                  <w:rFonts w:ascii="Cambria Math" w:hAnsi="Cambria Math"/>
+                  <w:i/>
+                </w:rPr>
+              </m:ctrlPr>
+            </m:sSupPr>
+            <m:e>
+              <m:r>
+                <w:rPr>
+                  <w:rFonts w:ascii="Cambria Math" w:hAnsi="Cambria Math"/>
+                </w:rPr>
+                <m:t>Vel</m:t>
+              </m:r>
+            </m:e>
+            <m:sup>
+              <m:r>
+                <m:rPr>
+                  <m:sty m:val="p"/>
+                </m:rPr>
+                <w:rPr>
+                  <w:rFonts w:ascii="Cambria Math" w:hAnsi="Cambria Math"/>
+                  <w:color w:val="000000"/>
+                  <w:sz w:val="24"/>
+                  <w:szCs w:val="24"/>
+                </w:rPr>
+                <m:t>leakExponent</m:t>
+              </m:r>
+            </m:sup>
+          </m:sSup>
+        </m:oMath>
+      </m:oMathPara>
+    </w:p>
+    <w:p>
+      <w:pPr>
+        <w:rPr>
+          <w:rFonts w:eastAsiaTheme="minorEastAsia"/>
+        </w:rPr>
+      </w:pPr>
+      <w:bookmarkStart w:id="30" w:name="_GoBack"/>
+      <w:bookmarkEnd w:id="30"/>
+    </w:p>
+    <w:p>
+      <m:oMathPara>
+        <m:oMath>
+          <m:r>
+            <w:rPr>
+              <w:rFonts w:ascii="Cambria Math" w:eastAsiaTheme="minorEastAsia" w:hAnsi="Cambria Math"/>
+            </w:rPr>
+            <m:t>m_flow</m:t>
+          </m:r>
+          <m:r>
+            <w:rPr>
+              <w:rFonts w:ascii="Cambria Math" w:hAnsi="Cambria Math"/>
+            </w:rPr>
+            <m:t>=ρ×</m:t>
+          </m:r>
+          <m:r>
+            <w:rPr>
+              <w:rFonts w:ascii="Cambria Math" w:hAnsi="Cambria Math"/>
+            </w:rPr>
+            <m:t>A×Vel</m:t>
+          </m:r>
+          <m:r>
+            <w:rPr>
+              <w:rFonts w:ascii="Cambria Math" w:eastAsiaTheme="minorEastAsia" w:hAnsi="Cambria Math"/>
+            </w:rPr>
+            <m:t>=</m:t>
+          </m:r>
+          <m:r>
+            <w:rPr>
+              <w:rFonts w:ascii="Cambria Math" w:eastAsiaTheme="minorEastAsia" w:hAnsi="Cambria Math"/>
+            </w:rPr>
+            <m:t>A×</m:t>
+          </m:r>
+          <m:sSup>
+            <m:sSupPr>
+              <m:ctrlPr>
+                <w:rPr>
+                  <w:rFonts w:ascii="Cambria Math" w:hAnsi="Cambria Math"/>
+                  <w:i/>
+                </w:rPr>
+              </m:ctrlPr>
+            </m:sSupPr>
+            <m:e>
+              <m:r>
+                <w:rPr>
+                  <w:rFonts w:ascii="Cambria Math" w:hAnsi="Cambria Math"/>
+                </w:rPr>
+                <m:t>ρ</m:t>
+              </m:r>
+            </m:e>
+            <m:sup>
+              <m:r>
+                <w:rPr>
+                  <w:rFonts w:ascii="Cambria Math" w:hAnsi="Cambria Math"/>
+                </w:rPr>
+                <m:t>1-</m:t>
+              </m:r>
+              <m:r>
+                <m:rPr>
+                  <m:sty m:val="p"/>
+                </m:rPr>
+                <w:rPr>
+                  <w:rFonts w:ascii="Cambria Math" w:hAnsi="Cambria Math"/>
+                  <w:color w:val="000000"/>
+                  <w:sz w:val="24"/>
+                  <w:szCs w:val="24"/>
+                </w:rPr>
+                <m:t>leakExponent</m:t>
+              </m:r>
+            </m:sup>
+          </m:sSup>
+          <m:r>
+            <w:rPr>
+              <w:rFonts w:ascii="Cambria Math" w:hAnsi="Cambria Math"/>
+            </w:rPr>
+            <m:t>×</m:t>
+          </m:r>
+          <m:sSup>
+            <m:sSupPr>
+              <m:ctrlPr>
+                <w:rPr>
+                  <w:rFonts w:ascii="Cambria Math" w:hAnsi="Cambria Math"/>
+                  <w:i/>
+                </w:rPr>
+              </m:ctrlPr>
+            </m:sSupPr>
+            <m:e>
+              <m:d>
+                <m:dPr>
+                  <m:ctrlPr>
+                    <w:rPr>
+                      <w:rFonts w:ascii="Cambria Math" w:hAnsi="Cambria Math"/>
+                      <w:i/>
+                    </w:rPr>
+                  </m:ctrlPr>
+                </m:dPr>
+                <m:e>
+                  <m:f>
+                    <m:fPr>
+                      <m:ctrlPr>
+                        <w:rPr>
+                          <w:rFonts w:ascii="Cambria Math" w:hAnsi="Cambria Math"/>
+                          <w:i/>
+                        </w:rPr>
+                      </m:ctrlPr>
+                    </m:fPr>
+                    <m:num>
+                      <m:r>
+                        <w:rPr>
+                          <w:rFonts w:ascii="Cambria Math" w:hAnsi="Cambria Math"/>
+                        </w:rPr>
+                        <m:t>2×</m:t>
+                      </m:r>
+                      <m:r>
+                        <w:rPr>
+                          <w:rFonts w:ascii="Cambria Math" w:hAnsi="Cambria Math"/>
+                        </w:rPr>
+                        <m:t>∆p</m:t>
+                      </m:r>
+                    </m:num>
+                    <m:den>
+                      <m:r>
+                        <w:rPr>
+                          <w:rFonts w:ascii="Cambria Math" w:hAnsi="Cambria Math"/>
+                        </w:rPr>
+                        <m:t>ksi</m:t>
+                      </m:r>
+                    </m:den>
+                  </m:f>
+                </m:e>
+              </m:d>
+            </m:e>
+            <m:sup>
+              <m:f>
+                <m:fPr>
+                  <m:type m:val="skw"/>
+                  <m:ctrlPr>
+                    <w:rPr>
+                      <w:rFonts w:ascii="Cambria Math" w:hAnsi="Cambria Math"/>
+                      <w:i/>
+                    </w:rPr>
+                  </m:ctrlPr>
+                </m:fPr>
+                <m:num>
+                  <m:r>
+                    <w:rPr>
+                      <w:rFonts w:ascii="Cambria Math" w:hAnsi="Cambria Math"/>
+                    </w:rPr>
+                    <m:t>1</m:t>
+                  </m:r>
+                </m:num>
+                <m:den>
+                  <m:r>
+                    <m:rPr>
+                      <m:sty m:val="p"/>
+                    </m:rPr>
+                    <w:rPr>
+                      <w:rFonts w:ascii="Cambria Math" w:hAnsi="Cambria Math"/>
+                      <w:color w:val="000000"/>
+                      <w:sz w:val="24"/>
+                      <w:szCs w:val="24"/>
+                    </w:rPr>
+                    <m:t>leakExponent</m:t>
+                  </m:r>
+                </m:den>
+              </m:f>
+            </m:sup>
+          </m:sSup>
+        </m:oMath>
+      </m:oMathPara>
+    </w:p>
+    <w:p>
+      <w:pPr>
+        <w:rPr>
           <w:lang w:val="fr-FR"/>
         </w:rPr>
       </w:pPr>
@@ -15189,7 +15453,6 @@
             <w:rPr>
               <w:rFonts w:ascii="Cambria Math" w:eastAsiaTheme="minorEastAsia" w:hAnsi="Cambria Math"/>
             </w:rPr>
-            <w:lastRenderedPageBreak/>
             <m:t>mXi=m×medium.Xi</m:t>
           </m:r>
         </m:oMath>
@@ -16456,7 +16719,6 @@
             <w:rPr>
               <w:rFonts w:ascii="Cambria Math" w:eastAsiaTheme="minorEastAsia" w:hAnsi="Cambria Math"/>
             </w:rPr>
-            <w:lastRenderedPageBreak/>
             <m:t>mXi_flow[i]</m:t>
           </m:r>
           <m:r>
@@ -17417,7 +17679,6 @@
         <w:rPr>
           <w:rFonts w:eastAsiaTheme="minorEastAsia"/>
         </w:rPr>
-        <w:lastRenderedPageBreak/>
         <w:t>rootsPolyorder3</w:t>
       </w:r>
       <w:bookmarkEnd w:id="38"/>
@@ -19293,7 +19554,6 @@
             <w:rPr>
               <w:rFonts w:ascii="Cambria Math" w:eastAsiaTheme="minorEastAsia" w:hAnsi="Cambria Math"/>
             </w:rPr>
-            <w:lastRenderedPageBreak/>
             <m:t>x1=x2=</m:t>
           </m:r>
           <m:f>
@@ -24078,7 +24338,7 @@
 </file>
 
 <file path=customXml/itemProps1.xml><?xml version="1.0" encoding="utf-8"?>
-<ds:datastoreItem xmlns:ds="http://schemas.openxmlformats.org/officeDocument/2006/customXml" ds:itemID="{1A94D697-A12A-4697-8980-8810A664780D}">
+<ds:datastoreItem xmlns:ds="http://schemas.openxmlformats.org/officeDocument/2006/customXml" ds:itemID="{5F0A84CA-1A8F-4CB8-A81E-13CE122CA5A9}">
   <ds:schemaRefs>
     <ds:schemaRef ds:uri="http://schemas.openxmlformats.org/officeDocument/2006/bibliography"/>
   </ds:schemaRefs>

</xml_diff>

<commit_message>
Addition of the equation in the doc where all equations are written
</commit_message>
<xml_diff>
--- a/Information/script for equations.docx
+++ b/Information/script for equations.docx
@@ -14129,6 +14129,7 @@
           <w:rFonts w:eastAsiaTheme="minorEastAsia"/>
         </w:rPr>
       </w:pPr>
+      <w:bookmarkStart w:id="30" w:name="_GoBack"/>
       <m:oMathPara>
         <m:oMath>
           <m:r>
@@ -14224,6 +14225,7 @@
         </m:oMath>
       </m:oMathPara>
     </w:p>
+    <w:bookmarkEnd w:id="30"/>
     <w:p>
       <w:pPr>
         <w:rPr>
@@ -14424,8 +14426,6 @@
           <w:rFonts w:eastAsiaTheme="minorEastAsia"/>
         </w:rPr>
       </w:pPr>
-      <w:bookmarkStart w:id="30" w:name="_GoBack"/>
-      <w:bookmarkEnd w:id="30"/>
     </w:p>
     <w:p>
       <m:oMathPara>
@@ -14434,31 +14434,25 @@
             <w:rPr>
               <w:rFonts w:ascii="Cambria Math" w:eastAsiaTheme="minorEastAsia" w:hAnsi="Cambria Math"/>
             </w:rPr>
-            <m:t>m_flow</m:t>
-          </m:r>
-          <m:r>
-            <w:rPr>
-              <w:rFonts w:ascii="Cambria Math" w:hAnsi="Cambria Math"/>
-            </w:rPr>
-            <m:t>=ρ×</m:t>
-          </m:r>
-          <m:r>
-            <w:rPr>
-              <w:rFonts w:ascii="Cambria Math" w:hAnsi="Cambria Math"/>
-            </w:rPr>
-            <m:t>A×Vel</m:t>
-          </m:r>
-          <m:r>
-            <w:rPr>
-              <w:rFonts w:ascii="Cambria Math" w:eastAsiaTheme="minorEastAsia" w:hAnsi="Cambria Math"/>
-            </w:rPr>
-            <m:t>=</m:t>
+            <m:t>m_flow=</m:t>
           </m:r>
           <m:r>
             <w:rPr>
               <w:rFonts w:ascii="Cambria Math" w:eastAsiaTheme="minorEastAsia" w:hAnsi="Cambria Math"/>
             </w:rPr>
             <m:t>A×</m:t>
+          </m:r>
+          <m:r>
+            <w:rPr>
+              <w:rFonts w:ascii="Cambria Math" w:eastAsiaTheme="minorEastAsia" w:hAnsi="Cambria Math"/>
+            </w:rPr>
+            <m:t>leakSurfaceRatio</m:t>
+          </m:r>
+          <m:r>
+            <w:rPr>
+              <w:rFonts w:ascii="Cambria Math" w:eastAsiaTheme="minorEastAsia" w:hAnsi="Cambria Math"/>
+            </w:rPr>
+            <m:t>×</m:t>
           </m:r>
           <m:sSup>
             <m:sSupPr>
@@ -14482,20 +14476,52 @@
                 <w:rPr>
                   <w:rFonts w:ascii="Cambria Math" w:hAnsi="Cambria Math"/>
                 </w:rPr>
-                <m:t>1-</m:t>
-              </m:r>
-              <m:r>
-                <m:rPr>
-                  <m:sty m:val="p"/>
-                </m:rPr>
-                <w:rPr>
-                  <w:rFonts w:ascii="Cambria Math" w:hAnsi="Cambria Math"/>
-                  <w:color w:val="000000"/>
-                  <w:sz w:val="24"/>
-                  <w:szCs w:val="24"/>
-                </w:rPr>
-                <m:t>leakExponent</m:t>
-              </m:r>
+                <m:t>1</m:t>
+              </m:r>
+              <m:r>
+                <w:rPr>
+                  <w:rFonts w:ascii="Cambria Math" w:hAnsi="Cambria Math"/>
+                </w:rPr>
+                <m:t xml:space="preserve"> </m:t>
+              </m:r>
+              <m:r>
+                <w:rPr>
+                  <w:rFonts w:ascii="Cambria Math" w:hAnsi="Cambria Math"/>
+                </w:rPr>
+                <m:t>-</m:t>
+              </m:r>
+              <m:r>
+                <w:rPr>
+                  <w:rFonts w:ascii="Cambria Math" w:hAnsi="Cambria Math"/>
+                </w:rPr>
+                <m:t xml:space="preserve"> </m:t>
+              </m:r>
+              <m:f>
+                <m:fPr>
+                  <m:ctrlPr>
+                    <w:rPr>
+                      <w:rFonts w:ascii="Cambria Math" w:hAnsi="Cambria Math"/>
+                      <w:i/>
+                    </w:rPr>
+                  </m:ctrlPr>
+                </m:fPr>
+                <m:num>
+                  <m:r>
+                    <w:rPr>
+                      <w:rFonts w:ascii="Cambria Math" w:hAnsi="Cambria Math"/>
+                    </w:rPr>
+                    <m:t>1</m:t>
+                  </m:r>
+                </m:num>
+                <m:den>
+                  <m:r>
+                    <w:rPr>
+                      <w:rFonts w:ascii="Cambria Math" w:hAnsi="Cambria Math"/>
+                    </w:rPr>
+                    <m:t>leakExponent</m:t>
+                  </m:r>
+                </m:den>
+              </m:f>
             </m:sup>
           </m:sSup>
           <m:r>
@@ -24338,7 +24364,7 @@
 </file>
 
 <file path=customXml/itemProps1.xml><?xml version="1.0" encoding="utf-8"?>
-<ds:datastoreItem xmlns:ds="http://schemas.openxmlformats.org/officeDocument/2006/customXml" ds:itemID="{5F0A84CA-1A8F-4CB8-A81E-13CE122CA5A9}">
+<ds:datastoreItem xmlns:ds="http://schemas.openxmlformats.org/officeDocument/2006/customXml" ds:itemID="{62EF5267-F172-48BB-AF38-820B3DC1D2C0}">
   <ds:schemaRefs>
     <ds:schemaRef ds:uri="http://schemas.openxmlformats.org/officeDocument/2006/bibliography"/>
   </ds:schemaRefs>

</xml_diff>

<commit_message>
Modification of the description following the change to a inertial opening
</commit_message>
<xml_diff>
--- a/Information/script for equations.docx
+++ b/Information/script for equations.docx
@@ -11636,7 +11636,39 @@
             <w:rPr>
               <w:rFonts w:ascii="Cambria Math" w:eastAsiaTheme="minorEastAsia" w:hAnsi="Cambria Math"/>
             </w:rPr>
-            <m:t>dp=</m:t>
+            <m:t>d</m:t>
+          </m:r>
+          <m:sSub>
+            <m:sSubPr>
+              <m:ctrlPr>
+                <w:rPr>
+                  <w:rFonts w:ascii="Cambria Math" w:eastAsiaTheme="minorEastAsia" w:hAnsi="Cambria Math"/>
+                  <w:i/>
+                </w:rPr>
+              </m:ctrlPr>
+            </m:sSubPr>
+            <m:e>
+              <m:r>
+                <w:rPr>
+                  <w:rFonts w:ascii="Cambria Math" w:eastAsiaTheme="minorEastAsia" w:hAnsi="Cambria Math"/>
+                </w:rPr>
+                <m:t>p</m:t>
+              </m:r>
+            </m:e>
+            <m:sub>
+              <m:r>
+                <w:rPr>
+                  <w:rFonts w:ascii="Cambria Math" w:eastAsiaTheme="minorEastAsia" w:hAnsi="Cambria Math"/>
+                </w:rPr>
+                <m:t>friction</m:t>
+              </m:r>
+            </m:sub>
+          </m:sSub>
+          <m:r>
+            <w:rPr>
+              <w:rFonts w:ascii="Cambria Math" w:eastAsiaTheme="minorEastAsia" w:hAnsi="Cambria Math"/>
+            </w:rPr>
+            <m:t>=</m:t>
           </m:r>
           <m:f>
             <m:fPr>
@@ -11711,7 +11743,13 @@
             <w:rPr>
               <w:rFonts w:ascii="Cambria Math" w:eastAsiaTheme="minorEastAsia" w:hAnsi="Cambria Math"/>
             </w:rPr>
-            <m:t>m_flow=d×</m:t>
+            <m:t>NotionalLength</m:t>
+          </m:r>
+          <m:r>
+            <w:rPr>
+              <w:rFonts w:ascii="Cambria Math" w:eastAsiaTheme="minorEastAsia" w:hAnsi="Cambria Math"/>
+            </w:rPr>
+            <m:t>×</m:t>
           </m:r>
           <m:sSub>
             <m:sSubPr>
@@ -11727,7 +11765,7 @@
                 <w:rPr>
                   <w:rFonts w:ascii="Cambria Math" w:eastAsiaTheme="minorEastAsia" w:hAnsi="Cambria Math"/>
                 </w:rPr>
-                <m:t>A</m:t>
+                <m:t>d</m:t>
               </m:r>
             </m:e>
             <m:sub>
@@ -11735,7 +11773,7 @@
                 <w:rPr>
                   <w:rFonts w:ascii="Cambria Math" w:eastAsiaTheme="minorEastAsia" w:hAnsi="Cambria Math"/>
                 </w:rPr>
-                <m:t>flow</m:t>
+                <m:t>upstream</m:t>
               </m:r>
             </m:sub>
           </m:sSub>
@@ -11743,28 +11781,128 @@
             <w:rPr>
               <w:rFonts w:ascii="Cambria Math" w:eastAsiaTheme="minorEastAsia" w:hAnsi="Cambria Math"/>
             </w:rPr>
-            <m:t>×Vel=A×Cd×</m:t>
-          </m:r>
-          <m:rad>
-            <m:radPr>
-              <m:degHide m:val="1"/>
-              <m:ctrlPr>
-                <w:rPr>
-                  <w:rFonts w:ascii="Cambria Math" w:eastAsiaTheme="minorEastAsia" w:hAnsi="Cambria Math"/>
-                  <w:i/>
-                </w:rPr>
-              </m:ctrlPr>
-            </m:radPr>
-            <m:deg/>
+            <m:t>×</m:t>
+          </m:r>
+          <m:f>
+            <m:fPr>
+              <m:ctrlPr>
+                <w:rPr>
+                  <w:rFonts w:ascii="Cambria Math" w:eastAsiaTheme="minorEastAsia" w:hAnsi="Cambria Math"/>
+                  <w:i/>
+                </w:rPr>
+              </m:ctrlPr>
+            </m:fPr>
+            <m:num>
+              <m:r>
+                <w:rPr>
+                  <w:rFonts w:ascii="Cambria Math" w:hAnsi="Cambria Math"/>
+                </w:rPr>
+                <m:t>dVel</m:t>
+              </m:r>
+            </m:num>
+            <m:den>
+              <m:r>
+                <w:rPr>
+                  <w:rFonts w:ascii="Cambria Math" w:hAnsi="Cambria Math"/>
+                </w:rPr>
+                <m:t>dt</m:t>
+              </m:r>
+            </m:den>
+          </m:f>
+          <m:r>
+            <w:rPr>
+              <w:rFonts w:ascii="Cambria Math" w:eastAsiaTheme="minorEastAsia" w:hAnsi="Cambria Math"/>
+            </w:rPr>
+            <m:t>=</m:t>
+          </m:r>
+          <m:r>
+            <w:rPr>
+              <w:rFonts w:ascii="Cambria Math" w:eastAsiaTheme="minorEastAsia" w:hAnsi="Cambria Math"/>
+            </w:rPr>
+            <m:t>dp-d</m:t>
+          </m:r>
+          <m:sSub>
+            <m:sSubPr>
+              <m:ctrlPr>
+                <w:rPr>
+                  <w:rFonts w:ascii="Cambria Math" w:eastAsiaTheme="minorEastAsia" w:hAnsi="Cambria Math"/>
+                  <w:i/>
+                </w:rPr>
+              </m:ctrlPr>
+            </m:sSubPr>
             <m:e>
               <m:r>
                 <w:rPr>
                   <w:rFonts w:ascii="Cambria Math" w:eastAsiaTheme="minorEastAsia" w:hAnsi="Cambria Math"/>
                 </w:rPr>
-                <m:t>2×dp×d</m:t>
+                <m:t>p</m:t>
               </m:r>
             </m:e>
-          </m:rad>
+            <m:sub>
+              <m:r>
+                <w:rPr>
+                  <w:rFonts w:ascii="Cambria Math" w:eastAsiaTheme="minorEastAsia" w:hAnsi="Cambria Math"/>
+                </w:rPr>
+                <m:t>friction</m:t>
+              </m:r>
+            </m:sub>
+          </m:sSub>
+        </m:oMath>
+      </m:oMathPara>
+    </w:p>
+    <w:p>
+      <w:pPr>
+        <w:rPr>
+          <w:rFonts w:eastAsiaTheme="minorEastAsia"/>
+        </w:rPr>
+      </w:pPr>
+    </w:p>
+    <w:p>
+      <w:pPr>
+        <w:rPr>
+          <w:rFonts w:eastAsiaTheme="minorEastAsia"/>
+        </w:rPr>
+      </w:pPr>
+      <m:oMathPara>
+        <m:oMath>
+          <m:r>
+            <w:rPr>
+              <w:rFonts w:ascii="Cambria Math" w:eastAsiaTheme="minorEastAsia" w:hAnsi="Cambria Math"/>
+            </w:rPr>
+            <m:t>m_flow=</m:t>
+          </m:r>
+          <m:sSub>
+            <m:sSubPr>
+              <m:ctrlPr>
+                <w:rPr>
+                  <w:rFonts w:ascii="Cambria Math" w:eastAsiaTheme="minorEastAsia" w:hAnsi="Cambria Math"/>
+                  <w:i/>
+                </w:rPr>
+              </m:ctrlPr>
+            </m:sSubPr>
+            <m:e>
+              <m:r>
+                <w:rPr>
+                  <w:rFonts w:ascii="Cambria Math" w:eastAsiaTheme="minorEastAsia" w:hAnsi="Cambria Math"/>
+                </w:rPr>
+                <m:t>d</m:t>
+              </m:r>
+            </m:e>
+            <m:sub>
+              <m:r>
+                <w:rPr>
+                  <w:rFonts w:ascii="Cambria Math" w:eastAsiaTheme="minorEastAsia" w:hAnsi="Cambria Math"/>
+                </w:rPr>
+                <m:t>upstream</m:t>
+              </m:r>
+            </m:sub>
+          </m:sSub>
+          <m:r>
+            <w:rPr>
+              <w:rFonts w:ascii="Cambria Math" w:eastAsiaTheme="minorEastAsia" w:hAnsi="Cambria Math"/>
+            </w:rPr>
+            <m:t>×Cd×A×Vel</m:t>
+          </m:r>
         </m:oMath>
       </m:oMathPara>
     </w:p>
@@ -12206,11 +12344,37 @@
       </w:pPr>
       <m:oMathPara>
         <m:oMath>
-          <m:r>
-            <w:rPr>
-              <w:rFonts w:ascii="Cambria Math" w:eastAsiaTheme="minorEastAsia" w:hAnsi="Cambria Math"/>
-            </w:rPr>
-            <m:t>dp_i=</m:t>
+          <m:sSub>
+            <m:sSubPr>
+              <m:ctrlPr>
+                <w:rPr>
+                  <w:rFonts w:ascii="Cambria Math" w:eastAsiaTheme="minorEastAsia" w:hAnsi="Cambria Math"/>
+                  <w:i/>
+                </w:rPr>
+              </m:ctrlPr>
+            </m:sSubPr>
+            <m:e>
+              <m:r>
+                <w:rPr>
+                  <w:rFonts w:ascii="Cambria Math" w:eastAsiaTheme="minorEastAsia" w:hAnsi="Cambria Math"/>
+                </w:rPr>
+                <m:t>dp_i</m:t>
+              </m:r>
+            </m:e>
+            <m:sub>
+              <m:r>
+                <w:rPr>
+                  <w:rFonts w:ascii="Cambria Math" w:eastAsiaTheme="minorEastAsia" w:hAnsi="Cambria Math"/>
+                </w:rPr>
+                <m:t>friction</m:t>
+              </m:r>
+            </m:sub>
+          </m:sSub>
+          <m:r>
+            <w:rPr>
+              <w:rFonts w:ascii="Cambria Math" w:eastAsiaTheme="minorEastAsia" w:hAnsi="Cambria Math"/>
+            </w:rPr>
+            <m:t>=</m:t>
           </m:r>
           <m:f>
             <m:fPr>
@@ -12279,13 +12443,29 @@
           <w:rFonts w:eastAsiaTheme="minorEastAsia"/>
         </w:rPr>
       </w:pPr>
+    </w:p>
+    <w:p>
+      <w:pPr>
+        <w:rPr>
+          <w:rFonts w:eastAsiaTheme="minorEastAsia"/>
+        </w:rPr>
+      </w:pPr>
+      <w:bookmarkStart w:id="29" w:name="_GoBack"/>
+      <w:bookmarkEnd w:id="29"/>
       <m:oMathPara>
         <m:oMath>
           <m:r>
             <w:rPr>
               <w:rFonts w:ascii="Cambria Math" w:eastAsiaTheme="minorEastAsia" w:hAnsi="Cambria Math"/>
             </w:rPr>
-            <m:t>m_flow_i=d×</m:t>
+            <w:lastRenderedPageBreak/>
+            <m:t>NotionalLength</m:t>
+          </m:r>
+          <m:r>
+            <w:rPr>
+              <w:rFonts w:ascii="Cambria Math" w:eastAsiaTheme="minorEastAsia" w:hAnsi="Cambria Math"/>
+            </w:rPr>
+            <m:t>×</m:t>
           </m:r>
           <m:sSub>
             <m:sSubPr>
@@ -12301,7 +12481,7 @@
                 <w:rPr>
                   <w:rFonts w:ascii="Cambria Math" w:eastAsiaTheme="minorEastAsia" w:hAnsi="Cambria Math"/>
                 </w:rPr>
-                <m:t>A</m:t>
+                <m:t>d</m:t>
               </m:r>
             </m:e>
             <m:sub>
@@ -12309,7 +12489,7 @@
                 <w:rPr>
                   <w:rFonts w:ascii="Cambria Math" w:eastAsiaTheme="minorEastAsia" w:hAnsi="Cambria Math"/>
                 </w:rPr>
-                <m:t>flow</m:t>
+                <m:t>upstream</m:t>
               </m:r>
             </m:sub>
           </m:sSub>
@@ -12317,7 +12497,7 @@
             <w:rPr>
               <w:rFonts w:ascii="Cambria Math" w:eastAsiaTheme="minorEastAsia" w:hAnsi="Cambria Math"/>
             </w:rPr>
-            <m:t>×Vel_i=</m:t>
+            <m:t>×</m:t>
           </m:r>
           <m:f>
             <m:fPr>
@@ -12331,17 +12511,23 @@
             <m:num>
               <m:r>
                 <w:rPr>
-                  <w:rFonts w:ascii="Cambria Math" w:eastAsiaTheme="minorEastAsia" w:hAnsi="Cambria Math"/>
-                </w:rPr>
-                <m:t>A</m:t>
+                  <w:rFonts w:ascii="Cambria Math" w:hAnsi="Cambria Math"/>
+                </w:rPr>
+                <m:t>dVel</m:t>
+              </m:r>
+              <m:r>
+                <w:rPr>
+                  <w:rFonts w:ascii="Cambria Math" w:hAnsi="Cambria Math"/>
+                </w:rPr>
+                <m:t>_i</m:t>
               </m:r>
             </m:num>
             <m:den>
               <m:r>
                 <w:rPr>
-                  <w:rFonts w:ascii="Cambria Math" w:eastAsiaTheme="minorEastAsia" w:hAnsi="Cambria Math"/>
-                </w:rPr>
-                <m:t>N</m:t>
+                  <w:rFonts w:ascii="Cambria Math" w:hAnsi="Cambria Math"/>
+                </w:rPr>
+                <m:t>dt</m:t>
               </m:r>
             </m:den>
           </m:f>
@@ -12349,34 +12535,222 @@
             <w:rPr>
               <w:rFonts w:ascii="Cambria Math" w:eastAsiaTheme="minorEastAsia" w:hAnsi="Cambria Math"/>
             </w:rPr>
-            <m:t>×Cd×</m:t>
-          </m:r>
-          <m:rad>
-            <m:radPr>
-              <m:degHide m:val="1"/>
-              <m:ctrlPr>
-                <w:rPr>
-                  <w:rFonts w:ascii="Cambria Math" w:eastAsiaTheme="minorEastAsia" w:hAnsi="Cambria Math"/>
-                  <w:i/>
-                </w:rPr>
-              </m:ctrlPr>
-            </m:radPr>
-            <m:deg/>
+            <m:t>=dp</m:t>
+          </m:r>
+          <m:r>
+            <w:rPr>
+              <w:rFonts w:ascii="Cambria Math" w:eastAsiaTheme="minorEastAsia" w:hAnsi="Cambria Math"/>
+            </w:rPr>
+            <m:t>_i</m:t>
+          </m:r>
+          <m:r>
+            <w:rPr>
+              <w:rFonts w:ascii="Cambria Math" w:eastAsiaTheme="minorEastAsia" w:hAnsi="Cambria Math"/>
+            </w:rPr>
+            <m:t>-d</m:t>
+          </m:r>
+          <m:sSub>
+            <m:sSubPr>
+              <m:ctrlPr>
+                <w:rPr>
+                  <w:rFonts w:ascii="Cambria Math" w:eastAsiaTheme="minorEastAsia" w:hAnsi="Cambria Math"/>
+                  <w:i/>
+                </w:rPr>
+              </m:ctrlPr>
+            </m:sSubPr>
             <m:e>
               <m:r>
                 <w:rPr>
                   <w:rFonts w:ascii="Cambria Math" w:eastAsiaTheme="minorEastAsia" w:hAnsi="Cambria Math"/>
                 </w:rPr>
-                <m:t>2×dp_i×d</m:t>
+                <m:t>p</m:t>
+              </m:r>
+              <m:r>
+                <w:rPr>
+                  <w:rFonts w:ascii="Cambria Math" w:eastAsiaTheme="minorEastAsia" w:hAnsi="Cambria Math"/>
+                </w:rPr>
+                <m:t>_i</m:t>
               </m:r>
             </m:e>
-          </m:rad>
+            <m:sub>
+              <m:r>
+                <w:rPr>
+                  <w:rFonts w:ascii="Cambria Math" w:eastAsiaTheme="minorEastAsia" w:hAnsi="Cambria Math"/>
+                </w:rPr>
+                <m:t>friction</m:t>
+              </m:r>
+            </m:sub>
+          </m:sSub>
         </m:oMath>
       </m:oMathPara>
     </w:p>
     <w:p>
       <w:pPr>
         <w:rPr>
+          <w:rFonts w:eastAsiaTheme="minorEastAsia"/>
+        </w:rPr>
+      </w:pPr>
+    </w:p>
+    <w:p>
+      <w:pPr>
+        <w:rPr>
+          <w:rFonts w:eastAsiaTheme="minorEastAsia"/>
+        </w:rPr>
+      </w:pPr>
+      <m:oMathPara>
+        <m:oMath>
+          <m:r>
+            <w:rPr>
+              <w:rFonts w:ascii="Cambria Math" w:eastAsiaTheme="minorEastAsia" w:hAnsi="Cambria Math"/>
+            </w:rPr>
+            <m:t>m_flow_i=</m:t>
+          </m:r>
+          <m:sSub>
+            <m:sSubPr>
+              <m:ctrlPr>
+                <w:rPr>
+                  <w:rFonts w:ascii="Cambria Math" w:eastAsiaTheme="minorEastAsia" w:hAnsi="Cambria Math"/>
+                  <w:i/>
+                </w:rPr>
+              </m:ctrlPr>
+            </m:sSubPr>
+            <m:e>
+              <m:r>
+                <w:rPr>
+                  <w:rFonts w:ascii="Cambria Math" w:eastAsiaTheme="minorEastAsia" w:hAnsi="Cambria Math"/>
+                </w:rPr>
+                <m:t>d</m:t>
+              </m:r>
+            </m:e>
+            <m:sub>
+              <m:r>
+                <w:rPr>
+                  <w:rFonts w:ascii="Cambria Math" w:eastAsiaTheme="minorEastAsia" w:hAnsi="Cambria Math"/>
+                </w:rPr>
+                <m:t>upstream</m:t>
+              </m:r>
+            </m:sub>
+          </m:sSub>
+          <m:r>
+            <w:rPr>
+              <w:rFonts w:ascii="Cambria Math" w:eastAsiaTheme="minorEastAsia" w:hAnsi="Cambria Math"/>
+            </w:rPr>
+            <m:t>×</m:t>
+          </m:r>
+          <m:sSub>
+            <m:sSubPr>
+              <m:ctrlPr>
+                <w:rPr>
+                  <w:rFonts w:ascii="Cambria Math" w:eastAsiaTheme="minorEastAsia" w:hAnsi="Cambria Math"/>
+                  <w:i/>
+                </w:rPr>
+              </m:ctrlPr>
+            </m:sSubPr>
+            <m:e>
+              <m:r>
+                <w:rPr>
+                  <w:rFonts w:ascii="Cambria Math" w:eastAsiaTheme="minorEastAsia" w:hAnsi="Cambria Math"/>
+                </w:rPr>
+                <m:t>A</m:t>
+              </m:r>
+            </m:e>
+            <m:sub>
+              <m:r>
+                <w:rPr>
+                  <w:rFonts w:ascii="Cambria Math" w:eastAsiaTheme="minorEastAsia" w:hAnsi="Cambria Math"/>
+                </w:rPr>
+                <m:t>flow</m:t>
+              </m:r>
+            </m:sub>
+          </m:sSub>
+          <m:r>
+            <w:rPr>
+              <w:rFonts w:ascii="Cambria Math" w:eastAsiaTheme="minorEastAsia" w:hAnsi="Cambria Math"/>
+            </w:rPr>
+            <m:t>×Vel_i=</m:t>
+          </m:r>
+          <m:sSub>
+            <m:sSubPr>
+              <m:ctrlPr>
+                <w:rPr>
+                  <w:rFonts w:ascii="Cambria Math" w:eastAsiaTheme="minorEastAsia" w:hAnsi="Cambria Math"/>
+                  <w:i/>
+                </w:rPr>
+              </m:ctrlPr>
+            </m:sSubPr>
+            <m:e>
+              <m:r>
+                <w:rPr>
+                  <w:rFonts w:ascii="Cambria Math" w:eastAsiaTheme="minorEastAsia" w:hAnsi="Cambria Math"/>
+                </w:rPr>
+                <m:t>d</m:t>
+              </m:r>
+            </m:e>
+            <m:sub>
+              <m:r>
+                <w:rPr>
+                  <w:rFonts w:ascii="Cambria Math" w:eastAsiaTheme="minorEastAsia" w:hAnsi="Cambria Math"/>
+                </w:rPr>
+                <m:t>upstream</m:t>
+              </m:r>
+            </m:sub>
+          </m:sSub>
+          <m:r>
+            <w:rPr>
+              <w:rFonts w:ascii="Cambria Math" w:eastAsiaTheme="minorEastAsia" w:hAnsi="Cambria Math"/>
+            </w:rPr>
+            <m:t>×</m:t>
+          </m:r>
+          <m:r>
+            <w:rPr>
+              <w:rFonts w:ascii="Cambria Math" w:eastAsiaTheme="minorEastAsia" w:hAnsi="Cambria Math"/>
+            </w:rPr>
+            <m:t>Cd</m:t>
+          </m:r>
+          <m:r>
+            <w:rPr>
+              <w:rFonts w:ascii="Cambria Math" w:eastAsiaTheme="minorEastAsia" w:hAnsi="Cambria Math"/>
+            </w:rPr>
+            <m:t>×</m:t>
+          </m:r>
+          <m:f>
+            <m:fPr>
+              <m:ctrlPr>
+                <w:rPr>
+                  <w:rFonts w:ascii="Cambria Math" w:eastAsiaTheme="minorEastAsia" w:hAnsi="Cambria Math"/>
+                  <w:i/>
+                </w:rPr>
+              </m:ctrlPr>
+            </m:fPr>
+            <m:num>
+              <m:r>
+                <w:rPr>
+                  <w:rFonts w:ascii="Cambria Math" w:eastAsiaTheme="minorEastAsia" w:hAnsi="Cambria Math"/>
+                </w:rPr>
+                <m:t>A</m:t>
+              </m:r>
+            </m:num>
+            <m:den>
+              <m:r>
+                <w:rPr>
+                  <w:rFonts w:ascii="Cambria Math" w:eastAsiaTheme="minorEastAsia" w:hAnsi="Cambria Math"/>
+                </w:rPr>
+                <m:t>N</m:t>
+              </m:r>
+            </m:den>
+          </m:f>
+          <m:r>
+            <w:rPr>
+              <w:rFonts w:ascii="Cambria Math" w:eastAsiaTheme="minorEastAsia" w:hAnsi="Cambria Math"/>
+            </w:rPr>
+            <m:t>×Vel_i</m:t>
+          </m:r>
+        </m:oMath>
+      </m:oMathPara>
+    </w:p>
+    <w:p>
+      <w:pPr>
+        <w:rPr>
           <w:lang w:val="fr-FR"/>
         </w:rPr>
       </w:pPr>
@@ -12388,16 +12762,15 @@
           <w:lang w:val="fr-FR"/>
         </w:rPr>
       </w:pPr>
-      <w:bookmarkStart w:id="29" w:name="_Toc41656118"/>
+      <w:bookmarkStart w:id="30" w:name="_Toc41656118"/>
       <w:proofErr w:type="spellStart"/>
       <w:r>
         <w:rPr>
           <w:lang w:val="fr-FR"/>
         </w:rPr>
-        <w:lastRenderedPageBreak/>
         <w:t>HorizontalOpening</w:t>
       </w:r>
-      <w:bookmarkEnd w:id="29"/>
+      <w:bookmarkEnd w:id="30"/>
       <w:proofErr w:type="spellEnd"/>
     </w:p>
     <w:p>
@@ -13725,6 +14098,7 @@
             <w:rPr>
               <w:rFonts w:ascii="Cambria Math" w:hAnsi="Cambria Math"/>
             </w:rPr>
+            <w:lastRenderedPageBreak/>
             <m:t>Vel= -</m:t>
           </m:r>
           <m:f>
@@ -14129,7 +14503,6 @@
           <w:rFonts w:eastAsiaTheme="minorEastAsia"/>
         </w:rPr>
       </w:pPr>
-      <w:bookmarkStart w:id="30" w:name="_GoBack"/>
       <m:oMathPara>
         <m:oMath>
           <m:r>
@@ -14225,7 +14598,6 @@
         </m:oMath>
       </m:oMathPara>
     </w:p>
-    <w:bookmarkEnd w:id="30"/>
     <w:p>
       <w:pPr>
         <w:rPr>
@@ -14377,13 +14749,7 @@
             <w:rPr>
               <w:rFonts w:ascii="Cambria Math" w:hAnsi="Cambria Math"/>
             </w:rPr>
-            <m:t>×ksi×</m:t>
-          </m:r>
-          <m:r>
-            <w:rPr>
-              <w:rFonts w:ascii="Cambria Math" w:hAnsi="Cambria Math"/>
-            </w:rPr>
-            <m:t>ρ×</m:t>
+            <m:t>×ksi×ρ×</m:t>
           </m:r>
           <m:sSup>
             <m:sSupPr>
@@ -14434,25 +14800,7 @@
             <w:rPr>
               <w:rFonts w:ascii="Cambria Math" w:eastAsiaTheme="minorEastAsia" w:hAnsi="Cambria Math"/>
             </w:rPr>
-            <m:t>m_flow=</m:t>
-          </m:r>
-          <m:r>
-            <w:rPr>
-              <w:rFonts w:ascii="Cambria Math" w:eastAsiaTheme="minorEastAsia" w:hAnsi="Cambria Math"/>
-            </w:rPr>
-            <m:t>A×</m:t>
-          </m:r>
-          <m:r>
-            <w:rPr>
-              <w:rFonts w:ascii="Cambria Math" w:eastAsiaTheme="minorEastAsia" w:hAnsi="Cambria Math"/>
-            </w:rPr>
-            <m:t>leakSurfaceRatio</m:t>
-          </m:r>
-          <m:r>
-            <w:rPr>
-              <w:rFonts w:ascii="Cambria Math" w:eastAsiaTheme="minorEastAsia" w:hAnsi="Cambria Math"/>
-            </w:rPr>
-            <m:t>×</m:t>
+            <m:t>m_flow=A×leakSurfaceRatio×</m:t>
           </m:r>
           <m:sSup>
             <m:sSupPr>
@@ -14476,25 +14824,7 @@
                 <w:rPr>
                   <w:rFonts w:ascii="Cambria Math" w:hAnsi="Cambria Math"/>
                 </w:rPr>
-                <m:t>1</m:t>
-              </m:r>
-              <m:r>
-                <w:rPr>
-                  <w:rFonts w:ascii="Cambria Math" w:hAnsi="Cambria Math"/>
-                </w:rPr>
-                <m:t xml:space="preserve"> </m:t>
-              </m:r>
-              <m:r>
-                <w:rPr>
-                  <w:rFonts w:ascii="Cambria Math" w:hAnsi="Cambria Math"/>
-                </w:rPr>
-                <m:t>-</m:t>
-              </m:r>
-              <m:r>
-                <w:rPr>
-                  <w:rFonts w:ascii="Cambria Math" w:hAnsi="Cambria Math"/>
-                </w:rPr>
-                <m:t xml:space="preserve"> </m:t>
+                <m:t xml:space="preserve">1 - </m:t>
               </m:r>
               <m:f>
                 <m:fPr>
@@ -14564,13 +14894,7 @@
                         <w:rPr>
                           <w:rFonts w:ascii="Cambria Math" w:hAnsi="Cambria Math"/>
                         </w:rPr>
-                        <m:t>2×</m:t>
-                      </m:r>
-                      <m:r>
-                        <w:rPr>
-                          <w:rFonts w:ascii="Cambria Math" w:hAnsi="Cambria Math"/>
-                        </w:rPr>
-                        <m:t>∆p</m:t>
+                        <m:t>2×∆p</m:t>
                       </m:r>
                     </m:num>
                     <m:den>
@@ -15030,6 +15354,7 @@
             <w:rPr>
               <w:rFonts w:ascii="Cambria Math" w:hAnsi="Cambria Math"/>
             </w:rPr>
+            <w:lastRenderedPageBreak/>
             <m:t xml:space="preserve">m_flow= </m:t>
           </m:r>
           <m:sSub>
@@ -16324,6 +16649,7 @@
             <w:rPr>
               <w:rFonts w:ascii="Cambria Math" w:eastAsiaTheme="minorEastAsia" w:hAnsi="Cambria Math"/>
             </w:rPr>
+            <w:lastRenderedPageBreak/>
             <m:t xml:space="preserve">m_flow= </m:t>
           </m:r>
           <m:sSub>
@@ -24364,7 +24690,7 @@
 </file>
 
 <file path=customXml/itemProps1.xml><?xml version="1.0" encoding="utf-8"?>
-<ds:datastoreItem xmlns:ds="http://schemas.openxmlformats.org/officeDocument/2006/customXml" ds:itemID="{62EF5267-F172-48BB-AF38-820B3DC1D2C0}">
+<ds:datastoreItem xmlns:ds="http://schemas.openxmlformats.org/officeDocument/2006/customXml" ds:itemID="{A5FC20F5-A70D-4CBE-B4DA-3F2228D2EA32}">
   <ds:schemaRefs>
     <ds:schemaRef ds:uri="http://schemas.openxmlformats.org/officeDocument/2006/bibliography"/>
   </ds:schemaRefs>

</xml_diff>

<commit_message>
Update the HTML description following code modifications
</commit_message>
<xml_diff>
--- a/Information/script for equations.docx
+++ b/Information/script for equations.docx
@@ -1,6 +1,6 @@
 
 <file path=word/document.xml><?xml version="1.0" encoding="utf-8"?>
-<w:document xmlns:wpc="http://schemas.microsoft.com/office/word/2010/wordprocessingCanvas" xmlns:mc="http://schemas.openxmlformats.org/markup-compatibility/2006" xmlns:o="urn:schemas-microsoft-com:office:office" xmlns:r="http://schemas.openxmlformats.org/officeDocument/2006/relationships" xmlns:m="http://schemas.openxmlformats.org/officeDocument/2006/math" xmlns:v="urn:schemas-microsoft-com:vml" xmlns:wp14="http://schemas.microsoft.com/office/word/2010/wordprocessingDrawing" xmlns:wp="http://schemas.openxmlformats.org/drawingml/2006/wordprocessingDrawing" xmlns:w10="urn:schemas-microsoft-com:office:word" xmlns:w="http://schemas.openxmlformats.org/wordprocessingml/2006/main" xmlns:w14="http://schemas.microsoft.com/office/word/2010/wordml" xmlns:w15="http://schemas.microsoft.com/office/word/2012/wordml" xmlns:wpg="http://schemas.microsoft.com/office/word/2010/wordprocessingGroup" xmlns:wpi="http://schemas.microsoft.com/office/word/2010/wordprocessingInk" xmlns:wne="http://schemas.microsoft.com/office/word/2006/wordml" xmlns:wps="http://schemas.microsoft.com/office/word/2010/wordprocessingShape" mc:Ignorable="w14 w15 wp14">
+<w:document xmlns:wpc="http://schemas.microsoft.com/office/word/2010/wordprocessingCanvas" xmlns:cx="http://schemas.microsoft.com/office/drawing/2014/chartex" xmlns:cx1="http://schemas.microsoft.com/office/drawing/2015/9/8/chartex" xmlns:cx2="http://schemas.microsoft.com/office/drawing/2015/10/21/chartex" xmlns:cx3="http://schemas.microsoft.com/office/drawing/2016/5/9/chartex" xmlns:cx4="http://schemas.microsoft.com/office/drawing/2016/5/10/chartex" xmlns:cx5="http://schemas.microsoft.com/office/drawing/2016/5/11/chartex" xmlns:cx6="http://schemas.microsoft.com/office/drawing/2016/5/12/chartex" xmlns:cx7="http://schemas.microsoft.com/office/drawing/2016/5/13/chartex" xmlns:cx8="http://schemas.microsoft.com/office/drawing/2016/5/14/chartex" xmlns:mc="http://schemas.openxmlformats.org/markup-compatibility/2006" xmlns:aink="http://schemas.microsoft.com/office/drawing/2016/ink" xmlns:am3d="http://schemas.microsoft.com/office/drawing/2017/model3d" xmlns:o="urn:schemas-microsoft-com:office:office" xmlns:r="http://schemas.openxmlformats.org/officeDocument/2006/relationships" xmlns:m="http://schemas.openxmlformats.org/officeDocument/2006/math" xmlns:v="urn:schemas-microsoft-com:vml" xmlns:wp14="http://schemas.microsoft.com/office/word/2010/wordprocessingDrawing" xmlns:wp="http://schemas.openxmlformats.org/drawingml/2006/wordprocessingDrawing" xmlns:w10="urn:schemas-microsoft-com:office:word" xmlns:w="http://schemas.openxmlformats.org/wordprocessingml/2006/main" xmlns:w14="http://schemas.microsoft.com/office/word/2010/wordml" xmlns:w15="http://schemas.microsoft.com/office/word/2012/wordml" xmlns:w16cex="http://schemas.microsoft.com/office/word/2018/wordml/cex" xmlns:w16cid="http://schemas.microsoft.com/office/word/2016/wordml/cid" xmlns:w16="http://schemas.microsoft.com/office/word/2018/wordml" xmlns:w16sdtdh="http://schemas.microsoft.com/office/word/2020/wordml/sdtdatahash" xmlns:w16se="http://schemas.microsoft.com/office/word/2015/wordml/symex" xmlns:wpg="http://schemas.microsoft.com/office/word/2010/wordprocessingGroup" xmlns:wpi="http://schemas.microsoft.com/office/word/2010/wordprocessingInk" xmlns:wne="http://schemas.microsoft.com/office/word/2006/wordml" xmlns:wps="http://schemas.microsoft.com/office/word/2010/wordprocessingShape" mc:Ignorable="w14 w15 w16se w16cid w16 w16cex w16sdtdh wp14">
   <w:body>
     <w:sdt>
       <w:sdtPr>
@@ -19,6 +19,7 @@
           <w:docPartUnique/>
         </w:docPartObj>
       </w:sdtPr>
+      <w:sdtEndPr/>
       <w:sdtContent>
         <w:p>
           <w:pPr>
@@ -7737,7 +7738,6 @@
       </w:pPr>
       <w:bookmarkStart w:id="17" w:name="_Toc41656106"/>
       <w:proofErr w:type="spellStart"/>
-      <w:proofErr w:type="gramStart"/>
       <w:r>
         <w:rPr>
           <w:rFonts w:eastAsiaTheme="minorEastAsia"/>
@@ -7746,7 +7746,6 @@
       </w:r>
       <w:bookmarkEnd w:id="17"/>
       <w:proofErr w:type="spellEnd"/>
-      <w:proofErr w:type="gramEnd"/>
     </w:p>
     <w:p>
       <w:pPr>
@@ -7882,7 +7881,6 @@
       </w:pPr>
       <w:bookmarkStart w:id="18" w:name="_Toc41656107"/>
       <w:proofErr w:type="spellStart"/>
-      <w:proofErr w:type="gramStart"/>
       <w:r>
         <w:rPr>
           <w:rFonts w:eastAsiaTheme="minorEastAsia"/>
@@ -7891,7 +7889,6 @@
       </w:r>
       <w:bookmarkEnd w:id="18"/>
       <w:proofErr w:type="spellEnd"/>
-      <w:proofErr w:type="gramEnd"/>
     </w:p>
     <w:p>
       <w:pPr>
@@ -8896,7 +8893,6 @@
       </w:pPr>
       <w:bookmarkStart w:id="19" w:name="_Toc41656108"/>
       <w:proofErr w:type="spellStart"/>
-      <w:proofErr w:type="gramStart"/>
       <w:r>
         <w:rPr>
           <w:rFonts w:eastAsiaTheme="minorEastAsia"/>
@@ -8905,7 +8901,6 @@
       </w:r>
       <w:bookmarkEnd w:id="19"/>
       <w:proofErr w:type="spellEnd"/>
-      <w:proofErr w:type="gramEnd"/>
     </w:p>
     <w:p>
       <w:pPr>
@@ -9144,7 +9139,6 @@
       </w:pPr>
       <w:bookmarkStart w:id="20" w:name="_Toc41656109"/>
       <w:proofErr w:type="spellStart"/>
-      <w:proofErr w:type="gramStart"/>
       <w:r>
         <w:rPr>
           <w:rFonts w:eastAsiaTheme="minorEastAsia"/>
@@ -9153,7 +9147,6 @@
       </w:r>
       <w:bookmarkEnd w:id="20"/>
       <w:proofErr w:type="spellEnd"/>
-      <w:proofErr w:type="gramEnd"/>
     </w:p>
     <w:p>
       <w:pPr>
@@ -10204,7 +10197,6 @@
       </w:pPr>
       <w:bookmarkStart w:id="21" w:name="_Toc41656110"/>
       <w:proofErr w:type="spellStart"/>
-      <w:proofErr w:type="gramStart"/>
       <w:r>
         <w:rPr>
           <w:rFonts w:eastAsiaTheme="minorEastAsia"/>
@@ -10213,7 +10205,6 @@
       </w:r>
       <w:bookmarkEnd w:id="21"/>
       <w:proofErr w:type="spellEnd"/>
-      <w:proofErr w:type="gramEnd"/>
     </w:p>
     <w:p>
       <w:pPr>
@@ -10382,7 +10373,6 @@
         </w:rPr>
       </w:pPr>
       <w:proofErr w:type="spellStart"/>
-      <w:proofErr w:type="gramStart"/>
       <w:r>
         <w:rPr>
           <w:rFonts w:eastAsiaTheme="minorEastAsia"/>
@@ -10396,7 +10386,6 @@
         <w:t>Current</w:t>
       </w:r>
       <w:proofErr w:type="spellEnd"/>
-      <w:proofErr w:type="gramEnd"/>
     </w:p>
     <w:p>
       <w:pPr>
@@ -10484,7 +10473,6 @@
         </w:rPr>
       </w:pPr>
       <w:proofErr w:type="spellStart"/>
-      <w:proofErr w:type="gramStart"/>
       <w:r>
         <w:rPr>
           <w:rFonts w:eastAsiaTheme="minorEastAsia"/>
@@ -10496,14 +10484,7 @@
         <w:rPr>
           <w:rFonts w:eastAsiaTheme="minorEastAsia"/>
         </w:rPr>
-        <w:t>(</w:t>
-      </w:r>
-      <w:proofErr w:type="gramEnd"/>
-      <w:r>
-        <w:rPr>
-          <w:rFonts w:eastAsiaTheme="minorEastAsia"/>
-        </w:rPr>
-        <w:t>both fluid</w:t>
+        <w:t>(both fluid</w:t>
       </w:r>
       <w:r>
         <w:rPr>
@@ -10700,7 +10681,6 @@
         </w:rPr>
       </w:pPr>
       <w:proofErr w:type="spellStart"/>
-      <w:proofErr w:type="gramStart"/>
       <w:r>
         <w:rPr>
           <w:rFonts w:eastAsiaTheme="minorEastAsia"/>
@@ -10714,7 +10694,6 @@
         </w:rPr>
         <w:t>(</w:t>
       </w:r>
-      <w:proofErr w:type="gramEnd"/>
       <w:r>
         <w:rPr>
           <w:rFonts w:eastAsiaTheme="minorEastAsia"/>
@@ -11595,7 +11574,7 @@
     <w:p>
       <w:pPr>
         <w:rPr>
-          <w:lang w:val="fr-FR"/>
+          <w:rFonts w:eastAsiaTheme="minorEastAsia"/>
         </w:rPr>
       </w:pPr>
     </w:p>
@@ -11603,332 +11582,18 @@
       <w:pPr>
         <w:pStyle w:val="Titre3"/>
         <w:rPr>
-          <w:lang w:val="fr-FR"/>
-        </w:rPr>
-      </w:pPr>
-      <w:bookmarkStart w:id="26" w:name="_Toc41656115"/>
+          <w:rFonts w:asciiTheme="minorHAnsi" w:eastAsiaTheme="minorEastAsia" w:hAnsiTheme="minorHAnsi" w:cstheme="minorBidi"/>
+        </w:rPr>
+      </w:pPr>
+      <w:bookmarkStart w:id="26" w:name="_Toc41656116"/>
       <w:proofErr w:type="spellStart"/>
       <w:r>
         <w:rPr>
-          <w:lang w:val="fr-FR"/>
-        </w:rPr>
-        <w:t>SimpleOpening</w:t>
+          <w:rFonts w:eastAsiaTheme="minorEastAsia"/>
+        </w:rPr>
+        <w:t>StaticPipe</w:t>
       </w:r>
       <w:bookmarkEnd w:id="26"/>
-      <w:proofErr w:type="spellEnd"/>
-    </w:p>
-    <w:p>
-      <w:pPr>
-        <w:rPr>
-          <w:lang w:val="fr-FR"/>
-        </w:rPr>
-      </w:pPr>
-    </w:p>
-    <w:p>
-      <w:pPr>
-        <w:rPr>
-          <w:rFonts w:eastAsiaTheme="minorEastAsia"/>
-        </w:rPr>
-      </w:pPr>
-      <m:oMathPara>
-        <m:oMath>
-          <m:r>
-            <w:rPr>
-              <w:rFonts w:ascii="Cambria Math" w:eastAsiaTheme="minorEastAsia" w:hAnsi="Cambria Math"/>
-            </w:rPr>
-            <m:t>d</m:t>
-          </m:r>
-          <m:sSub>
-            <m:sSubPr>
-              <m:ctrlPr>
-                <w:rPr>
-                  <w:rFonts w:ascii="Cambria Math" w:eastAsiaTheme="minorEastAsia" w:hAnsi="Cambria Math"/>
-                  <w:i/>
-                </w:rPr>
-              </m:ctrlPr>
-            </m:sSubPr>
-            <m:e>
-              <m:r>
-                <w:rPr>
-                  <w:rFonts w:ascii="Cambria Math" w:eastAsiaTheme="minorEastAsia" w:hAnsi="Cambria Math"/>
-                </w:rPr>
-                <m:t>p</m:t>
-              </m:r>
-            </m:e>
-            <m:sub>
-              <m:r>
-                <w:rPr>
-                  <w:rFonts w:ascii="Cambria Math" w:eastAsiaTheme="minorEastAsia" w:hAnsi="Cambria Math"/>
-                </w:rPr>
-                <m:t>friction</m:t>
-              </m:r>
-            </m:sub>
-          </m:sSub>
-          <m:r>
-            <w:rPr>
-              <w:rFonts w:ascii="Cambria Math" w:eastAsiaTheme="minorEastAsia" w:hAnsi="Cambria Math"/>
-            </w:rPr>
-            <m:t>=</m:t>
-          </m:r>
-          <m:f>
-            <m:fPr>
-              <m:ctrlPr>
-                <w:rPr>
-                  <w:rFonts w:ascii="Cambria Math" w:eastAsiaTheme="minorEastAsia" w:hAnsi="Cambria Math"/>
-                  <w:i/>
-                </w:rPr>
-              </m:ctrlPr>
-            </m:fPr>
-            <m:num>
-              <m:r>
-                <w:rPr>
-                  <w:rFonts w:ascii="Cambria Math" w:eastAsiaTheme="minorEastAsia" w:hAnsi="Cambria Math"/>
-                </w:rPr>
-                <m:t>1</m:t>
-              </m:r>
-            </m:num>
-            <m:den>
-              <m:r>
-                <w:rPr>
-                  <w:rFonts w:ascii="Cambria Math" w:eastAsiaTheme="minorEastAsia" w:hAnsi="Cambria Math"/>
-                </w:rPr>
-                <m:t>2</m:t>
-              </m:r>
-            </m:den>
-          </m:f>
-          <m:r>
-            <w:rPr>
-              <w:rFonts w:ascii="Cambria Math" w:eastAsiaTheme="minorEastAsia" w:hAnsi="Cambria Math"/>
-            </w:rPr>
-            <m:t>×d×</m:t>
-          </m:r>
-          <m:sSup>
-            <m:sSupPr>
-              <m:ctrlPr>
-                <w:rPr>
-                  <w:rFonts w:ascii="Cambria Math" w:eastAsiaTheme="minorEastAsia" w:hAnsi="Cambria Math"/>
-                  <w:i/>
-                </w:rPr>
-              </m:ctrlPr>
-            </m:sSupPr>
-            <m:e>
-              <m:r>
-                <w:rPr>
-                  <w:rFonts w:ascii="Cambria Math" w:eastAsiaTheme="minorEastAsia" w:hAnsi="Cambria Math"/>
-                </w:rPr>
-                <m:t>Vel</m:t>
-              </m:r>
-            </m:e>
-            <m:sup>
-              <m:r>
-                <w:rPr>
-                  <w:rFonts w:ascii="Cambria Math" w:eastAsiaTheme="minorEastAsia" w:hAnsi="Cambria Math"/>
-                </w:rPr>
-                <m:t>2</m:t>
-              </m:r>
-            </m:sup>
-          </m:sSup>
-        </m:oMath>
-      </m:oMathPara>
-    </w:p>
-    <w:p>
-      <w:pPr>
-        <w:rPr>
-          <w:rFonts w:eastAsiaTheme="minorEastAsia"/>
-        </w:rPr>
-      </w:pPr>
-      <m:oMathPara>
-        <m:oMath>
-          <m:r>
-            <w:rPr>
-              <w:rFonts w:ascii="Cambria Math" w:eastAsiaTheme="minorEastAsia" w:hAnsi="Cambria Math"/>
-            </w:rPr>
-            <m:t>NotionalLength</m:t>
-          </m:r>
-          <m:r>
-            <w:rPr>
-              <w:rFonts w:ascii="Cambria Math" w:eastAsiaTheme="minorEastAsia" w:hAnsi="Cambria Math"/>
-            </w:rPr>
-            <m:t>×</m:t>
-          </m:r>
-          <m:sSub>
-            <m:sSubPr>
-              <m:ctrlPr>
-                <w:rPr>
-                  <w:rFonts w:ascii="Cambria Math" w:eastAsiaTheme="minorEastAsia" w:hAnsi="Cambria Math"/>
-                  <w:i/>
-                </w:rPr>
-              </m:ctrlPr>
-            </m:sSubPr>
-            <m:e>
-              <m:r>
-                <w:rPr>
-                  <w:rFonts w:ascii="Cambria Math" w:eastAsiaTheme="minorEastAsia" w:hAnsi="Cambria Math"/>
-                </w:rPr>
-                <m:t>d</m:t>
-              </m:r>
-            </m:e>
-            <m:sub>
-              <m:r>
-                <w:rPr>
-                  <w:rFonts w:ascii="Cambria Math" w:eastAsiaTheme="minorEastAsia" w:hAnsi="Cambria Math"/>
-                </w:rPr>
-                <m:t>upstream</m:t>
-              </m:r>
-            </m:sub>
-          </m:sSub>
-          <m:r>
-            <w:rPr>
-              <w:rFonts w:ascii="Cambria Math" w:eastAsiaTheme="minorEastAsia" w:hAnsi="Cambria Math"/>
-            </w:rPr>
-            <m:t>×</m:t>
-          </m:r>
-          <m:f>
-            <m:fPr>
-              <m:ctrlPr>
-                <w:rPr>
-                  <w:rFonts w:ascii="Cambria Math" w:eastAsiaTheme="minorEastAsia" w:hAnsi="Cambria Math"/>
-                  <w:i/>
-                </w:rPr>
-              </m:ctrlPr>
-            </m:fPr>
-            <m:num>
-              <m:r>
-                <w:rPr>
-                  <w:rFonts w:ascii="Cambria Math" w:hAnsi="Cambria Math"/>
-                </w:rPr>
-                <m:t>dVel</m:t>
-              </m:r>
-            </m:num>
-            <m:den>
-              <m:r>
-                <w:rPr>
-                  <w:rFonts w:ascii="Cambria Math" w:hAnsi="Cambria Math"/>
-                </w:rPr>
-                <m:t>dt</m:t>
-              </m:r>
-            </m:den>
-          </m:f>
-          <m:r>
-            <w:rPr>
-              <w:rFonts w:ascii="Cambria Math" w:eastAsiaTheme="minorEastAsia" w:hAnsi="Cambria Math"/>
-            </w:rPr>
-            <m:t>=</m:t>
-          </m:r>
-          <m:r>
-            <w:rPr>
-              <w:rFonts w:ascii="Cambria Math" w:eastAsiaTheme="minorEastAsia" w:hAnsi="Cambria Math"/>
-            </w:rPr>
-            <m:t>dp-d</m:t>
-          </m:r>
-          <m:sSub>
-            <m:sSubPr>
-              <m:ctrlPr>
-                <w:rPr>
-                  <w:rFonts w:ascii="Cambria Math" w:eastAsiaTheme="minorEastAsia" w:hAnsi="Cambria Math"/>
-                  <w:i/>
-                </w:rPr>
-              </m:ctrlPr>
-            </m:sSubPr>
-            <m:e>
-              <m:r>
-                <w:rPr>
-                  <w:rFonts w:ascii="Cambria Math" w:eastAsiaTheme="minorEastAsia" w:hAnsi="Cambria Math"/>
-                </w:rPr>
-                <m:t>p</m:t>
-              </m:r>
-            </m:e>
-            <m:sub>
-              <m:r>
-                <w:rPr>
-                  <w:rFonts w:ascii="Cambria Math" w:eastAsiaTheme="minorEastAsia" w:hAnsi="Cambria Math"/>
-                </w:rPr>
-                <m:t>friction</m:t>
-              </m:r>
-            </m:sub>
-          </m:sSub>
-        </m:oMath>
-      </m:oMathPara>
-    </w:p>
-    <w:p>
-      <w:pPr>
-        <w:rPr>
-          <w:rFonts w:eastAsiaTheme="minorEastAsia"/>
-        </w:rPr>
-      </w:pPr>
-    </w:p>
-    <w:p>
-      <w:pPr>
-        <w:rPr>
-          <w:rFonts w:eastAsiaTheme="minorEastAsia"/>
-        </w:rPr>
-      </w:pPr>
-      <m:oMathPara>
-        <m:oMath>
-          <m:r>
-            <w:rPr>
-              <w:rFonts w:ascii="Cambria Math" w:eastAsiaTheme="minorEastAsia" w:hAnsi="Cambria Math"/>
-            </w:rPr>
-            <m:t>m_flow=</m:t>
-          </m:r>
-          <m:sSub>
-            <m:sSubPr>
-              <m:ctrlPr>
-                <w:rPr>
-                  <w:rFonts w:ascii="Cambria Math" w:eastAsiaTheme="minorEastAsia" w:hAnsi="Cambria Math"/>
-                  <w:i/>
-                </w:rPr>
-              </m:ctrlPr>
-            </m:sSubPr>
-            <m:e>
-              <m:r>
-                <w:rPr>
-                  <w:rFonts w:ascii="Cambria Math" w:eastAsiaTheme="minorEastAsia" w:hAnsi="Cambria Math"/>
-                </w:rPr>
-                <m:t>d</m:t>
-              </m:r>
-            </m:e>
-            <m:sub>
-              <m:r>
-                <w:rPr>
-                  <w:rFonts w:ascii="Cambria Math" w:eastAsiaTheme="minorEastAsia" w:hAnsi="Cambria Math"/>
-                </w:rPr>
-                <m:t>upstream</m:t>
-              </m:r>
-            </m:sub>
-          </m:sSub>
-          <m:r>
-            <w:rPr>
-              <w:rFonts w:ascii="Cambria Math" w:eastAsiaTheme="minorEastAsia" w:hAnsi="Cambria Math"/>
-            </w:rPr>
-            <m:t>×Cd×A×Vel</m:t>
-          </m:r>
-        </m:oMath>
-      </m:oMathPara>
-    </w:p>
-    <w:p>
-      <w:pPr>
-        <w:rPr>
-          <w:rFonts w:eastAsiaTheme="minorEastAsia"/>
-        </w:rPr>
-      </w:pPr>
-    </w:p>
-    <w:p>
-      <w:pPr>
-        <w:pStyle w:val="Titre3"/>
-        <w:rPr>
-          <w:rFonts w:asciiTheme="minorHAnsi" w:eastAsiaTheme="minorEastAsia" w:hAnsiTheme="minorHAnsi" w:cstheme="minorBidi"/>
-        </w:rPr>
-      </w:pPr>
-      <w:bookmarkStart w:id="27" w:name="_Toc41656116"/>
-      <w:proofErr w:type="spellStart"/>
-      <w:r>
-        <w:rPr>
-          <w:rFonts w:eastAsiaTheme="minorEastAsia"/>
-        </w:rPr>
-        <w:t>StaticPipe</w:t>
-      </w:r>
-      <w:bookmarkEnd w:id="27"/>
       <w:proofErr w:type="spellEnd"/>
     </w:p>
     <w:p/>
@@ -12080,28 +11745,511 @@
           <w:lang w:val="fr-FR"/>
         </w:rPr>
       </w:pPr>
-      <w:bookmarkStart w:id="28" w:name="_Toc41656117"/>
+      <w:bookmarkStart w:id="27" w:name="_Toc41656117"/>
       <w:proofErr w:type="spellStart"/>
       <w:r>
         <w:rPr>
           <w:lang w:val="fr-FR"/>
         </w:rPr>
-        <w:t>VerticalOpening</w:t>
+        <w:t>Opening</w:t>
       </w:r>
-      <w:bookmarkEnd w:id="28"/>
+      <w:bookmarkEnd w:id="27"/>
       <w:proofErr w:type="spellEnd"/>
     </w:p>
     <w:p>
       <w:pPr>
         <w:rPr>
+          <w:rFonts w:eastAsiaTheme="minorEastAsia"/>
+        </w:rPr>
+      </w:pPr>
+    </w:p>
+    <w:p>
+      <w:pPr>
+        <w:rPr>
+          <w:rFonts w:eastAsiaTheme="minorEastAsia"/>
+        </w:rPr>
+      </w:pPr>
+      <m:oMathPara>
+        <m:oMathParaPr>
+          <m:jc m:val="center"/>
+        </m:oMathParaPr>
+        <m:oMath>
+          <m:m>
+            <m:mPr>
+              <m:mcs>
+                <m:mc>
+                  <m:mcPr>
+                    <m:count m:val="1"/>
+                    <m:mcJc m:val="center"/>
+                  </m:mcPr>
+                </m:mc>
+              </m:mcs>
+              <m:ctrlPr>
+                <w:rPr>
+                  <w:rFonts w:ascii="Cambria Math" w:eastAsiaTheme="minorEastAsia" w:hAnsi="Cambria Math"/>
+                  <w:i/>
+                </w:rPr>
+              </m:ctrlPr>
+            </m:mPr>
+            <m:mr>
+              <m:e>
+                <m:sSub>
+                  <m:sSubPr>
+                    <m:ctrlPr>
+                      <w:rPr>
+                        <w:rFonts w:ascii="Cambria Math" w:eastAsiaTheme="minorEastAsia" w:hAnsi="Cambria Math"/>
+                        <w:i/>
+                      </w:rPr>
+                    </m:ctrlPr>
+                  </m:sSubPr>
+                  <m:e>
+                    <m:r>
+                      <w:rPr>
+                        <w:rFonts w:ascii="Cambria Math" w:eastAsiaTheme="minorEastAsia" w:hAnsi="Cambria Math"/>
+                      </w:rPr>
+                      <m:t>p</m:t>
+                    </m:r>
+                  </m:e>
+                  <m:sub>
+                    <m:r>
+                      <w:rPr>
+                        <w:rFonts w:ascii="Cambria Math" w:eastAsiaTheme="minorEastAsia" w:hAnsi="Cambria Math"/>
+                      </w:rPr>
+                      <m:t>a</m:t>
+                    </m:r>
+                  </m:sub>
+                </m:sSub>
+                <m:r>
+                  <w:rPr>
+                    <w:rFonts w:ascii="Cambria Math" w:eastAsiaTheme="minorEastAsia" w:hAnsi="Cambria Math"/>
+                  </w:rPr>
+                  <m:t>=</m:t>
+                </m:r>
+                <m:sSub>
+                  <m:sSubPr>
+                    <m:ctrlPr>
+                      <w:rPr>
+                        <w:rFonts w:ascii="Cambria Math" w:eastAsiaTheme="minorEastAsia" w:hAnsi="Cambria Math"/>
+                        <w:i/>
+                      </w:rPr>
+                    </m:ctrlPr>
+                  </m:sSubPr>
+                  <m:e>
+                    <m:r>
+                      <w:rPr>
+                        <w:rFonts w:ascii="Cambria Math" w:eastAsiaTheme="minorEastAsia" w:hAnsi="Cambria Math"/>
+                      </w:rPr>
+                      <m:t>p</m:t>
+                    </m:r>
+                  </m:e>
+                  <m:sub>
+                    <m:r>
+                      <w:rPr>
+                        <w:rFonts w:ascii="Cambria Math" w:eastAsiaTheme="minorEastAsia" w:hAnsi="Cambria Math"/>
+                      </w:rPr>
+                      <m:t>port_a</m:t>
+                    </m:r>
+                  </m:sub>
+                </m:sSub>
+                <m:r>
+                  <w:rPr>
+                    <w:rFonts w:ascii="Cambria Math" w:eastAsiaTheme="minorEastAsia" w:hAnsi="Cambria Math"/>
+                  </w:rPr>
+                  <m:t>+</m:t>
+                </m:r>
+                <m:sSub>
+                  <m:sSubPr>
+                    <m:ctrlPr>
+                      <w:rPr>
+                        <w:rFonts w:ascii="Cambria Math" w:eastAsiaTheme="minorEastAsia" w:hAnsi="Cambria Math"/>
+                        <w:i/>
+                      </w:rPr>
+                    </m:ctrlPr>
+                  </m:sSubPr>
+                  <m:e>
+                    <m:r>
+                      <w:rPr>
+                        <w:rFonts w:ascii="Cambria Math" w:eastAsiaTheme="minorEastAsia" w:hAnsi="Cambria Math"/>
+                      </w:rPr>
+                      <m:t>d</m:t>
+                    </m:r>
+                  </m:e>
+                  <m:sub>
+                    <m:r>
+                      <w:rPr>
+                        <w:rFonts w:ascii="Cambria Math" w:eastAsiaTheme="minorEastAsia" w:hAnsi="Cambria Math"/>
+                      </w:rPr>
+                      <m:t>port_a</m:t>
+                    </m:r>
+                  </m:sub>
+                </m:sSub>
+                <m:r>
+                  <w:rPr>
+                    <w:rFonts w:ascii="Cambria Math" w:eastAsiaTheme="minorEastAsia" w:hAnsi="Cambria Math"/>
+                  </w:rPr>
+                  <m:t>×g×</m:t>
+                </m:r>
+                <m:d>
+                  <m:dPr>
+                    <m:ctrlPr>
+                      <w:rPr>
+                        <w:rFonts w:ascii="Cambria Math" w:eastAsiaTheme="minorEastAsia" w:hAnsi="Cambria Math"/>
+                        <w:i/>
+                      </w:rPr>
+                    </m:ctrlPr>
+                  </m:dPr>
+                  <m:e>
+                    <m:r>
+                      <w:rPr>
+                        <w:rFonts w:ascii="Cambria Math" w:eastAsiaTheme="minorEastAsia" w:hAnsi="Cambria Math"/>
+                      </w:rPr>
+                      <m:t>al</m:t>
+                    </m:r>
+                    <m:sSub>
+                      <m:sSubPr>
+                        <m:ctrlPr>
+                          <w:rPr>
+                            <w:rFonts w:ascii="Cambria Math" w:eastAsiaTheme="minorEastAsia" w:hAnsi="Cambria Math"/>
+                            <w:i/>
+                          </w:rPr>
+                        </m:ctrlPr>
+                      </m:sSubPr>
+                      <m:e>
+                        <m:r>
+                          <w:rPr>
+                            <w:rFonts w:ascii="Cambria Math" w:eastAsiaTheme="minorEastAsia" w:hAnsi="Cambria Math"/>
+                          </w:rPr>
+                          <m:t>t</m:t>
+                        </m:r>
+                      </m:e>
+                      <m:sub>
+                        <m:r>
+                          <w:rPr>
+                            <w:rFonts w:ascii="Cambria Math" w:eastAsiaTheme="minorEastAsia" w:hAnsi="Cambria Math"/>
+                          </w:rPr>
+                          <m:t>por</m:t>
+                        </m:r>
+                        <m:r>
+                          <w:rPr>
+                            <w:rFonts w:ascii="Cambria Math" w:eastAsiaTheme="minorEastAsia" w:hAnsi="Cambria Math"/>
+                          </w:rPr>
+                          <m:t>t_b</m:t>
+                        </m:r>
+                      </m:sub>
+                    </m:sSub>
+                    <m:r>
+                      <w:rPr>
+                        <w:rFonts w:ascii="Cambria Math" w:eastAsiaTheme="minorEastAsia" w:hAnsi="Cambria Math"/>
+                      </w:rPr>
+                      <m:t>-</m:t>
+                    </m:r>
+                    <m:sSub>
+                      <m:sSubPr>
+                        <m:ctrlPr>
+                          <w:rPr>
+                            <w:rFonts w:ascii="Cambria Math" w:eastAsiaTheme="minorEastAsia" w:hAnsi="Cambria Math"/>
+                            <w:i/>
+                          </w:rPr>
+                        </m:ctrlPr>
+                      </m:sSubPr>
+                      <m:e>
+                        <m:r>
+                          <w:rPr>
+                            <w:rFonts w:ascii="Cambria Math" w:eastAsiaTheme="minorEastAsia" w:hAnsi="Cambria Math"/>
+                          </w:rPr>
+                          <m:t>alt</m:t>
+                        </m:r>
+                      </m:e>
+                      <m:sub>
+                        <m:r>
+                          <w:rPr>
+                            <w:rFonts w:ascii="Cambria Math" w:eastAsiaTheme="minorEastAsia" w:hAnsi="Cambria Math"/>
+                          </w:rPr>
+                          <m:t>opening</m:t>
+                        </m:r>
+                      </m:sub>
+                    </m:sSub>
+                  </m:e>
+                </m:d>
+              </m:e>
+            </m:mr>
+            <m:mr>
+              <m:e>
+                <m:sSub>
+                  <m:sSubPr>
+                    <m:ctrlPr>
+                      <w:rPr>
+                        <w:rFonts w:ascii="Cambria Math" w:eastAsiaTheme="minorEastAsia" w:hAnsi="Cambria Math"/>
+                        <w:i/>
+                      </w:rPr>
+                    </m:ctrlPr>
+                  </m:sSubPr>
+                  <m:e>
+                    <m:r>
+                      <w:rPr>
+                        <w:rFonts w:ascii="Cambria Math" w:eastAsiaTheme="minorEastAsia" w:hAnsi="Cambria Math"/>
+                      </w:rPr>
+                      <m:t>p</m:t>
+                    </m:r>
+                  </m:e>
+                  <m:sub>
+                    <m:r>
+                      <w:rPr>
+                        <w:rFonts w:ascii="Cambria Math" w:eastAsiaTheme="minorEastAsia" w:hAnsi="Cambria Math"/>
+                      </w:rPr>
+                      <m:t>b</m:t>
+                    </m:r>
+                  </m:sub>
+                </m:sSub>
+                <m:r>
+                  <w:rPr>
+                    <w:rFonts w:ascii="Cambria Math" w:eastAsiaTheme="minorEastAsia" w:hAnsi="Cambria Math"/>
+                  </w:rPr>
+                  <m:t>=</m:t>
+                </m:r>
+                <m:sSub>
+                  <m:sSubPr>
+                    <m:ctrlPr>
+                      <w:rPr>
+                        <w:rFonts w:ascii="Cambria Math" w:eastAsiaTheme="minorEastAsia" w:hAnsi="Cambria Math"/>
+                        <w:i/>
+                      </w:rPr>
+                    </m:ctrlPr>
+                  </m:sSubPr>
+                  <m:e>
+                    <m:r>
+                      <w:rPr>
+                        <w:rFonts w:ascii="Cambria Math" w:eastAsiaTheme="minorEastAsia" w:hAnsi="Cambria Math"/>
+                      </w:rPr>
+                      <m:t>p</m:t>
+                    </m:r>
+                  </m:e>
+                  <m:sub>
+                    <m:r>
+                      <w:rPr>
+                        <w:rFonts w:ascii="Cambria Math" w:eastAsiaTheme="minorEastAsia" w:hAnsi="Cambria Math"/>
+                      </w:rPr>
+                      <m:t>port_</m:t>
+                    </m:r>
+                    <m:r>
+                      <w:rPr>
+                        <w:rFonts w:ascii="Cambria Math" w:eastAsiaTheme="minorEastAsia" w:hAnsi="Cambria Math"/>
+                      </w:rPr>
+                      <m:t>b</m:t>
+                    </m:r>
+                  </m:sub>
+                </m:sSub>
+                <m:r>
+                  <w:rPr>
+                    <w:rFonts w:ascii="Cambria Math" w:eastAsiaTheme="minorEastAsia" w:hAnsi="Cambria Math"/>
+                  </w:rPr>
+                  <m:t>+</m:t>
+                </m:r>
+                <m:sSub>
+                  <m:sSubPr>
+                    <m:ctrlPr>
+                      <w:rPr>
+                        <w:rFonts w:ascii="Cambria Math" w:eastAsiaTheme="minorEastAsia" w:hAnsi="Cambria Math"/>
+                        <w:i/>
+                      </w:rPr>
+                    </m:ctrlPr>
+                  </m:sSubPr>
+                  <m:e>
+                    <m:r>
+                      <w:rPr>
+                        <w:rFonts w:ascii="Cambria Math" w:eastAsiaTheme="minorEastAsia" w:hAnsi="Cambria Math"/>
+                      </w:rPr>
+                      <m:t>d</m:t>
+                    </m:r>
+                  </m:e>
+                  <m:sub>
+                    <m:r>
+                      <w:rPr>
+                        <w:rFonts w:ascii="Cambria Math" w:eastAsiaTheme="minorEastAsia" w:hAnsi="Cambria Math"/>
+                      </w:rPr>
+                      <m:t>port_</m:t>
+                    </m:r>
+                    <m:r>
+                      <w:rPr>
+                        <w:rFonts w:ascii="Cambria Math" w:eastAsiaTheme="minorEastAsia" w:hAnsi="Cambria Math"/>
+                      </w:rPr>
+                      <m:t>b</m:t>
+                    </m:r>
+                  </m:sub>
+                </m:sSub>
+                <m:r>
+                  <w:rPr>
+                    <w:rFonts w:ascii="Cambria Math" w:eastAsiaTheme="minorEastAsia" w:hAnsi="Cambria Math"/>
+                  </w:rPr>
+                  <m:t>×g×</m:t>
+                </m:r>
+                <m:d>
+                  <m:dPr>
+                    <m:ctrlPr>
+                      <w:rPr>
+                        <w:rFonts w:ascii="Cambria Math" w:eastAsiaTheme="minorEastAsia" w:hAnsi="Cambria Math"/>
+                        <w:i/>
+                      </w:rPr>
+                    </m:ctrlPr>
+                  </m:dPr>
+                  <m:e>
+                    <m:r>
+                      <w:rPr>
+                        <w:rFonts w:ascii="Cambria Math" w:eastAsiaTheme="minorEastAsia" w:hAnsi="Cambria Math"/>
+                      </w:rPr>
+                      <m:t>al</m:t>
+                    </m:r>
+                    <m:sSub>
+                      <m:sSubPr>
+                        <m:ctrlPr>
+                          <w:rPr>
+                            <w:rFonts w:ascii="Cambria Math" w:eastAsiaTheme="minorEastAsia" w:hAnsi="Cambria Math"/>
+                            <w:i/>
+                          </w:rPr>
+                        </m:ctrlPr>
+                      </m:sSubPr>
+                      <m:e>
+                        <m:r>
+                          <w:rPr>
+                            <w:rFonts w:ascii="Cambria Math" w:eastAsiaTheme="minorEastAsia" w:hAnsi="Cambria Math"/>
+                          </w:rPr>
+                          <m:t>t</m:t>
+                        </m:r>
+                      </m:e>
+                      <m:sub>
+                        <m:r>
+                          <w:rPr>
+                            <w:rFonts w:ascii="Cambria Math" w:eastAsiaTheme="minorEastAsia" w:hAnsi="Cambria Math"/>
+                          </w:rPr>
+                          <m:t>por</m:t>
+                        </m:r>
+                        <m:r>
+                          <w:rPr>
+                            <w:rFonts w:ascii="Cambria Math" w:eastAsiaTheme="minorEastAsia" w:hAnsi="Cambria Math"/>
+                          </w:rPr>
+                          <m:t>t_b</m:t>
+                        </m:r>
+                      </m:sub>
+                    </m:sSub>
+                    <m:r>
+                      <w:rPr>
+                        <w:rFonts w:ascii="Cambria Math" w:eastAsiaTheme="minorEastAsia" w:hAnsi="Cambria Math"/>
+                      </w:rPr>
+                      <m:t>-</m:t>
+                    </m:r>
+                    <m:sSub>
+                      <m:sSubPr>
+                        <m:ctrlPr>
+                          <w:rPr>
+                            <w:rFonts w:ascii="Cambria Math" w:eastAsiaTheme="minorEastAsia" w:hAnsi="Cambria Math"/>
+                            <w:i/>
+                          </w:rPr>
+                        </m:ctrlPr>
+                      </m:sSubPr>
+                      <m:e>
+                        <m:r>
+                          <w:rPr>
+                            <w:rFonts w:ascii="Cambria Math" w:eastAsiaTheme="minorEastAsia" w:hAnsi="Cambria Math"/>
+                          </w:rPr>
+                          <m:t>alt</m:t>
+                        </m:r>
+                      </m:e>
+                      <m:sub>
+                        <m:r>
+                          <w:rPr>
+                            <w:rFonts w:ascii="Cambria Math" w:eastAsiaTheme="minorEastAsia" w:hAnsi="Cambria Math"/>
+                          </w:rPr>
+                          <m:t>opening</m:t>
+                        </m:r>
+                      </m:sub>
+                    </m:sSub>
+                  </m:e>
+                </m:d>
+              </m:e>
+            </m:mr>
+            <m:mr>
+              <m:e>
+                <m:r>
+                  <w:rPr>
+                    <w:rFonts w:ascii="Cambria Math" w:eastAsiaTheme="minorEastAsia" w:hAnsi="Cambria Math"/>
+                  </w:rPr>
+                  <m:t>dp=</m:t>
+                </m:r>
+                <m:sSub>
+                  <m:sSubPr>
+                    <m:ctrlPr>
+                      <w:rPr>
+                        <w:rFonts w:ascii="Cambria Math" w:eastAsiaTheme="minorEastAsia" w:hAnsi="Cambria Math"/>
+                        <w:i/>
+                      </w:rPr>
+                    </m:ctrlPr>
+                  </m:sSubPr>
+                  <m:e>
+                    <m:r>
+                      <w:rPr>
+                        <w:rFonts w:ascii="Cambria Math" w:eastAsiaTheme="minorEastAsia" w:hAnsi="Cambria Math"/>
+                      </w:rPr>
+                      <m:t>p</m:t>
+                    </m:r>
+                  </m:e>
+                  <m:sub>
+                    <m:r>
+                      <w:rPr>
+                        <w:rFonts w:ascii="Cambria Math" w:eastAsiaTheme="minorEastAsia" w:hAnsi="Cambria Math"/>
+                      </w:rPr>
+                      <m:t>a</m:t>
+                    </m:r>
+                  </m:sub>
+                </m:sSub>
+                <m:r>
+                  <w:rPr>
+                    <w:rFonts w:ascii="Cambria Math" w:eastAsiaTheme="minorEastAsia" w:hAnsi="Cambria Math"/>
+                  </w:rPr>
+                  <m:t>-</m:t>
+                </m:r>
+                <m:sSub>
+                  <m:sSubPr>
+                    <m:ctrlPr>
+                      <w:rPr>
+                        <w:rFonts w:ascii="Cambria Math" w:eastAsiaTheme="minorEastAsia" w:hAnsi="Cambria Math"/>
+                        <w:i/>
+                      </w:rPr>
+                    </m:ctrlPr>
+                  </m:sSubPr>
+                  <m:e>
+                    <m:r>
+                      <w:rPr>
+                        <w:rFonts w:ascii="Cambria Math" w:eastAsiaTheme="minorEastAsia" w:hAnsi="Cambria Math"/>
+                      </w:rPr>
+                      <m:t>p</m:t>
+                    </m:r>
+                  </m:e>
+                  <m:sub>
+                    <m:r>
+                      <w:rPr>
+                        <w:rFonts w:ascii="Cambria Math" w:eastAsiaTheme="minorEastAsia" w:hAnsi="Cambria Math"/>
+                      </w:rPr>
+                      <m:t>b</m:t>
+                    </m:r>
+                  </m:sub>
+                </m:sSub>
+              </m:e>
+            </m:mr>
+          </m:m>
+        </m:oMath>
+      </m:oMathPara>
+    </w:p>
+    <w:p>
+      <w:pPr>
+        <w:rPr>
+          <w:rFonts w:eastAsiaTheme="minorEastAsia"/>
+        </w:rPr>
+      </w:pPr>
+    </w:p>
+    <w:p>
+      <w:pPr>
+        <w:rPr>
           <w:lang w:val="fr-FR"/>
-        </w:rPr>
-      </w:pPr>
-    </w:p>
-    <w:p>
-      <w:pPr>
-        <w:rPr>
-          <w:rFonts w:eastAsiaTheme="minorEastAsia"/>
         </w:rPr>
       </w:pPr>
       <m:oMathPara>
@@ -12110,43 +12258,6 @@
             <w:rPr>
               <w:rFonts w:ascii="Cambria Math" w:eastAsiaTheme="minorEastAsia" w:hAnsi="Cambria Math"/>
             </w:rPr>
-            <m:t>H_fluidStream=H×</m:t>
-          </m:r>
-          <m:rad>
-            <m:radPr>
-              <m:degHide m:val="1"/>
-              <m:ctrlPr>
-                <w:rPr>
-                  <w:rFonts w:ascii="Cambria Math" w:eastAsiaTheme="minorEastAsia" w:hAnsi="Cambria Math"/>
-                  <w:i/>
-                </w:rPr>
-              </m:ctrlPr>
-            </m:radPr>
-            <m:deg/>
-            <m:e>
-              <m:r>
-                <w:rPr>
-                  <w:rFonts w:ascii="Cambria Math" w:eastAsiaTheme="minorEastAsia" w:hAnsi="Cambria Math"/>
-                </w:rPr>
-                <m:t>Cd</m:t>
-              </m:r>
-            </m:e>
-          </m:rad>
-        </m:oMath>
-      </m:oMathPara>
-    </w:p>
-    <w:p>
-      <w:pPr>
-        <w:rPr>
-          <w:lang w:val="fr-FR"/>
-        </w:rPr>
-      </w:pPr>
-      <m:oMathPara>
-        <m:oMath>
-          <m:r>
-            <w:rPr>
-              <w:rFonts w:ascii="Cambria Math" w:eastAsiaTheme="minorEastAsia" w:hAnsi="Cambria Math"/>
-            </w:rPr>
             <m:t>dp_i[i]=dp+g×</m:t>
           </m:r>
           <m:d>
@@ -12163,7 +12274,13 @@
                 <w:rPr>
                   <w:rFonts w:ascii="Cambria Math" w:eastAsiaTheme="minorEastAsia" w:hAnsi="Cambria Math"/>
                 </w:rPr>
-                <m:t>H_fluidStream×</m:t>
+                <m:t>H</m:t>
+              </m:r>
+              <m:r>
+                <w:rPr>
+                  <w:rFonts w:ascii="Cambria Math" w:eastAsiaTheme="minorEastAsia" w:hAnsi="Cambria Math"/>
+                </w:rPr>
+                <m:t>×</m:t>
               </m:r>
               <m:d>
                 <m:dPr>
@@ -12360,6 +12477,12 @@
                 </w:rPr>
                 <m:t>dp_i</m:t>
               </m:r>
+              <m:r>
+                <w:rPr>
+                  <w:rFonts w:ascii="Cambria Math" w:eastAsiaTheme="minorEastAsia" w:hAnsi="Cambria Math"/>
+                </w:rPr>
+                <m:t xml:space="preserve"> </m:t>
+              </m:r>
             </m:e>
             <m:sub>
               <m:r>
@@ -12422,8 +12545,34 @@
                 <w:rPr>
                   <w:rFonts w:ascii="Cambria Math" w:eastAsiaTheme="minorEastAsia" w:hAnsi="Cambria Math"/>
                 </w:rPr>
-                <m:t>Vel_i</m:t>
-              </m:r>
+                <m:t>Ve</m:t>
+              </m:r>
+              <m:sSub>
+                <m:sSubPr>
+                  <m:ctrlPr>
+                    <w:rPr>
+                      <w:rFonts w:ascii="Cambria Math" w:eastAsiaTheme="minorEastAsia" w:hAnsi="Cambria Math"/>
+                      <w:i/>
+                    </w:rPr>
+                  </m:ctrlPr>
+                </m:sSubPr>
+                <m:e>
+                  <m:r>
+                    <w:rPr>
+                      <w:rFonts w:ascii="Cambria Math" w:eastAsiaTheme="minorEastAsia" w:hAnsi="Cambria Math"/>
+                    </w:rPr>
+                    <m:t>l</m:t>
+                  </m:r>
+                </m:e>
+                <m:sub>
+                  <m:r>
+                    <w:rPr>
+                      <w:rFonts w:ascii="Cambria Math" w:eastAsiaTheme="minorEastAsia" w:hAnsi="Cambria Math"/>
+                    </w:rPr>
+                    <m:t>i</m:t>
+                  </m:r>
+                </m:sub>
+              </m:sSub>
             </m:e>
             <m:sup>
               <m:r>
@@ -12450,22 +12599,13 @@
           <w:rFonts w:eastAsiaTheme="minorEastAsia"/>
         </w:rPr>
       </w:pPr>
-      <w:bookmarkStart w:id="29" w:name="_GoBack"/>
-      <w:bookmarkEnd w:id="29"/>
       <m:oMathPara>
         <m:oMath>
           <m:r>
             <w:rPr>
               <w:rFonts w:ascii="Cambria Math" w:eastAsiaTheme="minorEastAsia" w:hAnsi="Cambria Math"/>
             </w:rPr>
-            <w:lastRenderedPageBreak/>
-            <m:t>NotionalLength</m:t>
-          </m:r>
-          <m:r>
-            <w:rPr>
-              <w:rFonts w:ascii="Cambria Math" w:eastAsiaTheme="minorEastAsia" w:hAnsi="Cambria Math"/>
-            </w:rPr>
-            <m:t>×</m:t>
+            <m:t>NotionalLength×</m:t>
           </m:r>
           <m:sSub>
             <m:sSubPr>
@@ -12513,13 +12653,7 @@
                 <w:rPr>
                   <w:rFonts w:ascii="Cambria Math" w:hAnsi="Cambria Math"/>
                 </w:rPr>
-                <m:t>dVel</m:t>
-              </m:r>
-              <m:r>
-                <w:rPr>
-                  <w:rFonts w:ascii="Cambria Math" w:hAnsi="Cambria Math"/>
-                </w:rPr>
-                <m:t>_i</m:t>
+                <m:t>dVel_i</m:t>
               </m:r>
             </m:num>
             <m:den>
@@ -12535,19 +12669,7 @@
             <w:rPr>
               <w:rFonts w:ascii="Cambria Math" w:eastAsiaTheme="minorEastAsia" w:hAnsi="Cambria Math"/>
             </w:rPr>
-            <m:t>=dp</m:t>
-          </m:r>
-          <m:r>
-            <w:rPr>
-              <w:rFonts w:ascii="Cambria Math" w:eastAsiaTheme="minorEastAsia" w:hAnsi="Cambria Math"/>
-            </w:rPr>
-            <m:t>_i</m:t>
-          </m:r>
-          <m:r>
-            <w:rPr>
-              <w:rFonts w:ascii="Cambria Math" w:eastAsiaTheme="minorEastAsia" w:hAnsi="Cambria Math"/>
-            </w:rPr>
-            <m:t>-d</m:t>
+            <m:t>=dp_i-d</m:t>
           </m:r>
           <m:sSub>
             <m:sSubPr>
@@ -12563,13 +12685,7 @@
                 <w:rPr>
                   <w:rFonts w:ascii="Cambria Math" w:eastAsiaTheme="minorEastAsia" w:hAnsi="Cambria Math"/>
                 </w:rPr>
-                <m:t>p</m:t>
-              </m:r>
-              <m:r>
-                <w:rPr>
-                  <w:rFonts w:ascii="Cambria Math" w:eastAsiaTheme="minorEastAsia" w:hAnsi="Cambria Math"/>
-                </w:rPr>
-                <m:t>_i</m:t>
+                <m:t>p_i</m:t>
               </m:r>
             </m:e>
             <m:sub>
@@ -12599,12 +12715,6 @@
       </w:pPr>
       <m:oMathPara>
         <m:oMath>
-          <m:r>
-            <w:rPr>
-              <w:rFonts w:ascii="Cambria Math" w:eastAsiaTheme="minorEastAsia" w:hAnsi="Cambria Math"/>
-            </w:rPr>
-            <m:t>m_flow_i=</m:t>
-          </m:r>
           <m:sSub>
             <m:sSubPr>
               <m:ctrlPr>
@@ -12619,7 +12729,7 @@
                 <w:rPr>
                   <w:rFonts w:ascii="Cambria Math" w:eastAsiaTheme="minorEastAsia" w:hAnsi="Cambria Math"/>
                 </w:rPr>
-                <m:t>d</m:t>
+                <m:t>C</m:t>
               </m:r>
             </m:e>
             <m:sub>
@@ -12627,7 +12737,7 @@
                 <w:rPr>
                   <w:rFonts w:ascii="Cambria Math" w:eastAsiaTheme="minorEastAsia" w:hAnsi="Cambria Math"/>
                 </w:rPr>
-                <m:t>upstream</m:t>
+                <m:t>c</m:t>
               </m:r>
             </m:sub>
           </m:sSub>
@@ -12635,8 +12745,52 @@
             <w:rPr>
               <w:rFonts w:ascii="Cambria Math" w:eastAsiaTheme="minorEastAsia" w:hAnsi="Cambria Math"/>
             </w:rPr>
-            <m:t>×</m:t>
-          </m:r>
+            <m:t>=</m:t>
+          </m:r>
+          <m:f>
+            <m:fPr>
+              <m:ctrlPr>
+                <w:rPr>
+                  <w:rFonts w:ascii="Cambria Math" w:eastAsiaTheme="minorEastAsia" w:hAnsi="Cambria Math"/>
+                  <w:i/>
+                </w:rPr>
+              </m:ctrlPr>
+            </m:fPr>
+            <m:num>
+              <m:r>
+                <w:rPr>
+                  <w:rFonts w:ascii="Cambria Math" w:eastAsiaTheme="minorEastAsia" w:hAnsi="Cambria Math"/>
+                </w:rPr>
+                <m:t>Area of the jet (vena contracta)</m:t>
+              </m:r>
+            </m:num>
+            <m:den>
+              <m:r>
+                <w:rPr>
+                  <w:rFonts w:ascii="Cambria Math" w:eastAsiaTheme="minorEastAsia" w:hAnsi="Cambria Math"/>
+                </w:rPr>
+                <m:t>Area of the orifice</m:t>
+              </m:r>
+            </m:den>
+          </m:f>
+        </m:oMath>
+      </m:oMathPara>
+    </w:p>
+    <w:p>
+      <w:pPr>
+        <w:rPr>
+          <w:rFonts w:eastAsiaTheme="minorEastAsia"/>
+        </w:rPr>
+      </w:pPr>
+    </w:p>
+    <w:p>
+      <w:pPr>
+        <w:rPr>
+          <w:rFonts w:eastAsiaTheme="minorEastAsia"/>
+        </w:rPr>
+      </w:pPr>
+      <m:oMathPara>
+        <m:oMath>
           <m:sSub>
             <m:sSubPr>
               <m:ctrlPr>
@@ -12651,7 +12805,7 @@
                 <w:rPr>
                   <w:rFonts w:ascii="Cambria Math" w:eastAsiaTheme="minorEastAsia" w:hAnsi="Cambria Math"/>
                 </w:rPr>
-                <m:t>A</m:t>
+                <m:t>C</m:t>
               </m:r>
             </m:e>
             <m:sub>
@@ -12659,7 +12813,7 @@
                 <w:rPr>
                   <w:rFonts w:ascii="Cambria Math" w:eastAsiaTheme="minorEastAsia" w:hAnsi="Cambria Math"/>
                 </w:rPr>
-                <m:t>flow</m:t>
+                <m:t>v</m:t>
               </m:r>
             </m:sub>
           </m:sSub>
@@ -12667,8 +12821,52 @@
             <w:rPr>
               <w:rFonts w:ascii="Cambria Math" w:eastAsiaTheme="minorEastAsia" w:hAnsi="Cambria Math"/>
             </w:rPr>
-            <m:t>×Vel_i=</m:t>
-          </m:r>
+            <m:t>=</m:t>
+          </m:r>
+          <m:f>
+            <m:fPr>
+              <m:ctrlPr>
+                <w:rPr>
+                  <w:rFonts w:ascii="Cambria Math" w:eastAsiaTheme="minorEastAsia" w:hAnsi="Cambria Math"/>
+                  <w:i/>
+                </w:rPr>
+              </m:ctrlPr>
+            </m:fPr>
+            <m:num>
+              <m:r>
+                <w:rPr>
+                  <w:rFonts w:ascii="Cambria Math" w:eastAsiaTheme="minorEastAsia" w:hAnsi="Cambria Math"/>
+                </w:rPr>
+                <m:t>mean velocity of the jet</m:t>
+              </m:r>
+            </m:num>
+            <m:den>
+              <m:r>
+                <w:rPr>
+                  <w:rFonts w:ascii="Cambria Math" w:eastAsiaTheme="minorEastAsia" w:hAnsi="Cambria Math"/>
+                </w:rPr>
+                <m:t>theoretical velocity</m:t>
+              </m:r>
+            </m:den>
+          </m:f>
+        </m:oMath>
+      </m:oMathPara>
+    </w:p>
+    <w:p>
+      <w:pPr>
+        <w:rPr>
+          <w:rFonts w:eastAsiaTheme="minorEastAsia"/>
+        </w:rPr>
+      </w:pPr>
+    </w:p>
+    <w:p>
+      <w:pPr>
+        <w:rPr>
+          <w:rFonts w:eastAsiaTheme="minorEastAsia"/>
+        </w:rPr>
+      </w:pPr>
+      <m:oMathPara>
+        <m:oMath>
           <m:sSub>
             <m:sSubPr>
               <m:ctrlPr>
@@ -12683,7 +12881,7 @@
                 <w:rPr>
                   <w:rFonts w:ascii="Cambria Math" w:eastAsiaTheme="minorEastAsia" w:hAnsi="Cambria Math"/>
                 </w:rPr>
-                <m:t>d</m:t>
+                <m:t>C</m:t>
               </m:r>
             </m:e>
             <m:sub>
@@ -12691,7 +12889,7 @@
                 <w:rPr>
                   <w:rFonts w:ascii="Cambria Math" w:eastAsiaTheme="minorEastAsia" w:hAnsi="Cambria Math"/>
                 </w:rPr>
-                <m:t>upstream</m:t>
+                <m:t>d</m:t>
               </m:r>
             </m:sub>
           </m:sSub>
@@ -12699,19 +12897,7 @@
             <w:rPr>
               <w:rFonts w:ascii="Cambria Math" w:eastAsiaTheme="minorEastAsia" w:hAnsi="Cambria Math"/>
             </w:rPr>
-            <m:t>×</m:t>
-          </m:r>
-          <m:r>
-            <w:rPr>
-              <w:rFonts w:ascii="Cambria Math" w:eastAsiaTheme="minorEastAsia" w:hAnsi="Cambria Math"/>
-            </w:rPr>
-            <m:t>Cd</m:t>
-          </m:r>
-          <m:r>
-            <w:rPr>
-              <w:rFonts w:ascii="Cambria Math" w:eastAsiaTheme="minorEastAsia" w:hAnsi="Cambria Math"/>
-            </w:rPr>
-            <m:t>×</m:t>
+            <m:t>=</m:t>
           </m:r>
           <m:f>
             <m:fPr>
@@ -12727,7 +12913,7 @@
                 <w:rPr>
                   <w:rFonts w:ascii="Cambria Math" w:eastAsiaTheme="minorEastAsia" w:hAnsi="Cambria Math"/>
                 </w:rPr>
-                <m:t>A</m:t>
+                <m:t>volume flow rate of the jet</m:t>
               </m:r>
             </m:num>
             <m:den>
@@ -12735,7 +12921,13 @@
                 <w:rPr>
                   <w:rFonts w:ascii="Cambria Math" w:eastAsiaTheme="minorEastAsia" w:hAnsi="Cambria Math"/>
                 </w:rPr>
-                <m:t>N</m:t>
+                <m:t>theoretical v</m:t>
+              </m:r>
+              <m:r>
+                <w:rPr>
+                  <w:rFonts w:ascii="Cambria Math" w:eastAsiaTheme="minorEastAsia" w:hAnsi="Cambria Math"/>
+                </w:rPr>
+                <m:t>olume flow rate</m:t>
               </m:r>
             </m:den>
           </m:f>
@@ -12743,14 +12935,510 @@
             <w:rPr>
               <w:rFonts w:ascii="Cambria Math" w:eastAsiaTheme="minorEastAsia" w:hAnsi="Cambria Math"/>
             </w:rPr>
-            <m:t>×Vel_i</m:t>
-          </m:r>
+            <m:t>=</m:t>
+          </m:r>
+          <m:sSub>
+            <m:sSubPr>
+              <m:ctrlPr>
+                <w:rPr>
+                  <w:rFonts w:ascii="Cambria Math" w:eastAsiaTheme="minorEastAsia" w:hAnsi="Cambria Math"/>
+                  <w:i/>
+                </w:rPr>
+              </m:ctrlPr>
+            </m:sSubPr>
+            <m:e>
+              <m:r>
+                <w:rPr>
+                  <w:rFonts w:ascii="Cambria Math" w:eastAsiaTheme="minorEastAsia" w:hAnsi="Cambria Math"/>
+                </w:rPr>
+                <m:t>C</m:t>
+              </m:r>
+            </m:e>
+            <m:sub>
+              <m:r>
+                <w:rPr>
+                  <w:rFonts w:ascii="Cambria Math" w:eastAsiaTheme="minorEastAsia" w:hAnsi="Cambria Math"/>
+                </w:rPr>
+                <m:t>c</m:t>
+              </m:r>
+            </m:sub>
+          </m:sSub>
+          <m:r>
+            <w:rPr>
+              <w:rFonts w:ascii="Cambria Math" w:eastAsiaTheme="minorEastAsia" w:hAnsi="Cambria Math"/>
+            </w:rPr>
+            <m:t>×</m:t>
+          </m:r>
+          <m:sSub>
+            <m:sSubPr>
+              <m:ctrlPr>
+                <w:rPr>
+                  <w:rFonts w:ascii="Cambria Math" w:eastAsiaTheme="minorEastAsia" w:hAnsi="Cambria Math"/>
+                  <w:i/>
+                </w:rPr>
+              </m:ctrlPr>
+            </m:sSubPr>
+            <m:e>
+              <m:r>
+                <w:rPr>
+                  <w:rFonts w:ascii="Cambria Math" w:eastAsiaTheme="minorEastAsia" w:hAnsi="Cambria Math"/>
+                </w:rPr>
+                <m:t>C</m:t>
+              </m:r>
+            </m:e>
+            <m:sub>
+              <m:r>
+                <w:rPr>
+                  <w:rFonts w:ascii="Cambria Math" w:eastAsiaTheme="minorEastAsia" w:hAnsi="Cambria Math"/>
+                </w:rPr>
+                <m:t>v</m:t>
+              </m:r>
+            </m:sub>
+          </m:sSub>
         </m:oMath>
       </m:oMathPara>
     </w:p>
     <w:p>
       <w:pPr>
         <w:rPr>
+          <w:rFonts w:eastAsiaTheme="minorEastAsia"/>
+        </w:rPr>
+      </w:pPr>
+    </w:p>
+    <w:p>
+      <w:pPr>
+        <w:rPr>
+          <w:rFonts w:eastAsiaTheme="minorEastAsia"/>
+        </w:rPr>
+      </w:pPr>
+      <m:oMathPara>
+        <m:oMath>
+          <m:m>
+            <m:mPr>
+              <m:mcs>
+                <m:mc>
+                  <m:mcPr>
+                    <m:count m:val="1"/>
+                    <m:mcJc m:val="center"/>
+                  </m:mcPr>
+                </m:mc>
+              </m:mcs>
+              <m:ctrlPr>
+                <w:rPr>
+                  <w:rFonts w:ascii="Cambria Math" w:eastAsiaTheme="minorEastAsia" w:hAnsi="Cambria Math"/>
+                  <w:i/>
+                </w:rPr>
+              </m:ctrlPr>
+            </m:mPr>
+            <m:mr>
+              <m:e>
+                <m:sSub>
+                  <m:sSubPr>
+                    <m:ctrlPr>
+                      <w:rPr>
+                        <w:rFonts w:ascii="Cambria Math" w:eastAsiaTheme="minorEastAsia" w:hAnsi="Cambria Math"/>
+                        <w:i/>
+                      </w:rPr>
+                    </m:ctrlPr>
+                  </m:sSubPr>
+                  <m:e>
+                    <m:r>
+                      <w:rPr>
+                        <w:rFonts w:ascii="Cambria Math" w:eastAsiaTheme="minorEastAsia" w:hAnsi="Cambria Math"/>
+                      </w:rPr>
+                      <m:t>C</m:t>
+                    </m:r>
+                  </m:e>
+                  <m:sub>
+                    <m:r>
+                      <w:rPr>
+                        <w:rFonts w:ascii="Cambria Math" w:eastAsiaTheme="minorEastAsia" w:hAnsi="Cambria Math"/>
+                      </w:rPr>
+                      <m:t>c</m:t>
+                    </m:r>
+                  </m:sub>
+                </m:sSub>
+                <m:r>
+                  <w:rPr>
+                    <w:rFonts w:ascii="Cambria Math" w:eastAsiaTheme="minorEastAsia" w:hAnsi="Cambria Math"/>
+                  </w:rPr>
+                  <m:t>=</m:t>
+                </m:r>
+                <m:f>
+                  <m:fPr>
+                    <m:ctrlPr>
+                      <w:rPr>
+                        <w:rFonts w:ascii="Cambria Math" w:eastAsiaTheme="minorEastAsia" w:hAnsi="Cambria Math"/>
+                        <w:i/>
+                      </w:rPr>
+                    </m:ctrlPr>
+                  </m:fPr>
+                  <m:num>
+                    <m:r>
+                      <w:rPr>
+                        <w:rFonts w:ascii="Cambria Math" w:eastAsiaTheme="minorEastAsia" w:hAnsi="Cambria Math"/>
+                      </w:rPr>
+                      <m:t>Area of the jet (vena contracta)</m:t>
+                    </m:r>
+                  </m:num>
+                  <m:den>
+                    <m:r>
+                      <w:rPr>
+                        <w:rFonts w:ascii="Cambria Math" w:eastAsiaTheme="minorEastAsia" w:hAnsi="Cambria Math"/>
+                      </w:rPr>
+                      <m:t>Area of the orifice</m:t>
+                    </m:r>
+                  </m:den>
+                </m:f>
+              </m:e>
+            </m:mr>
+            <m:mr>
+              <m:e>
+                <m:sSub>
+                  <m:sSubPr>
+                    <m:ctrlPr>
+                      <w:rPr>
+                        <w:rFonts w:ascii="Cambria Math" w:eastAsiaTheme="minorEastAsia" w:hAnsi="Cambria Math"/>
+                        <w:i/>
+                      </w:rPr>
+                    </m:ctrlPr>
+                  </m:sSubPr>
+                  <m:e>
+                    <m:r>
+                      <w:rPr>
+                        <w:rFonts w:ascii="Cambria Math" w:eastAsiaTheme="minorEastAsia" w:hAnsi="Cambria Math"/>
+                      </w:rPr>
+                      <m:t>C</m:t>
+                    </m:r>
+                  </m:e>
+                  <m:sub>
+                    <m:r>
+                      <w:rPr>
+                        <w:rFonts w:ascii="Cambria Math" w:eastAsiaTheme="minorEastAsia" w:hAnsi="Cambria Math"/>
+                      </w:rPr>
+                      <m:t>v</m:t>
+                    </m:r>
+                  </m:sub>
+                </m:sSub>
+                <m:r>
+                  <w:rPr>
+                    <w:rFonts w:ascii="Cambria Math" w:eastAsiaTheme="minorEastAsia" w:hAnsi="Cambria Math"/>
+                  </w:rPr>
+                  <m:t>=</m:t>
+                </m:r>
+                <m:f>
+                  <m:fPr>
+                    <m:ctrlPr>
+                      <w:rPr>
+                        <w:rFonts w:ascii="Cambria Math" w:eastAsiaTheme="minorEastAsia" w:hAnsi="Cambria Math"/>
+                        <w:i/>
+                      </w:rPr>
+                    </m:ctrlPr>
+                  </m:fPr>
+                  <m:num>
+                    <m:r>
+                      <w:rPr>
+                        <w:rFonts w:ascii="Cambria Math" w:eastAsiaTheme="minorEastAsia" w:hAnsi="Cambria Math"/>
+                      </w:rPr>
+                      <m:t>mean velocity of the jet</m:t>
+                    </m:r>
+                  </m:num>
+                  <m:den>
+                    <m:r>
+                      <w:rPr>
+                        <w:rFonts w:ascii="Cambria Math" w:eastAsiaTheme="minorEastAsia" w:hAnsi="Cambria Math"/>
+                      </w:rPr>
+                      <m:t>theoretical velocity</m:t>
+                    </m:r>
+                  </m:den>
+                </m:f>
+              </m:e>
+            </m:mr>
+            <m:mr>
+              <m:e>
+                <m:sSub>
+                  <m:sSubPr>
+                    <m:ctrlPr>
+                      <w:rPr>
+                        <w:rFonts w:ascii="Cambria Math" w:eastAsiaTheme="minorEastAsia" w:hAnsi="Cambria Math"/>
+                        <w:i/>
+                      </w:rPr>
+                    </m:ctrlPr>
+                  </m:sSubPr>
+                  <m:e>
+                    <m:r>
+                      <w:rPr>
+                        <w:rFonts w:ascii="Cambria Math" w:eastAsiaTheme="minorEastAsia" w:hAnsi="Cambria Math"/>
+                      </w:rPr>
+                      <m:t>C</m:t>
+                    </m:r>
+                  </m:e>
+                  <m:sub>
+                    <m:r>
+                      <w:rPr>
+                        <w:rFonts w:ascii="Cambria Math" w:eastAsiaTheme="minorEastAsia" w:hAnsi="Cambria Math"/>
+                      </w:rPr>
+                      <m:t>d</m:t>
+                    </m:r>
+                  </m:sub>
+                </m:sSub>
+                <m:r>
+                  <w:rPr>
+                    <w:rFonts w:ascii="Cambria Math" w:eastAsiaTheme="minorEastAsia" w:hAnsi="Cambria Math"/>
+                  </w:rPr>
+                  <m:t>=</m:t>
+                </m:r>
+                <m:f>
+                  <m:fPr>
+                    <m:ctrlPr>
+                      <w:rPr>
+                        <w:rFonts w:ascii="Cambria Math" w:eastAsiaTheme="minorEastAsia" w:hAnsi="Cambria Math"/>
+                        <w:i/>
+                      </w:rPr>
+                    </m:ctrlPr>
+                  </m:fPr>
+                  <m:num>
+                    <m:r>
+                      <w:rPr>
+                        <w:rFonts w:ascii="Cambria Math" w:eastAsiaTheme="minorEastAsia" w:hAnsi="Cambria Math"/>
+                      </w:rPr>
+                      <m:t>volume flow rate of the jet</m:t>
+                    </m:r>
+                  </m:num>
+                  <m:den>
+                    <m:r>
+                      <w:rPr>
+                        <w:rFonts w:ascii="Cambria Math" w:eastAsiaTheme="minorEastAsia" w:hAnsi="Cambria Math"/>
+                      </w:rPr>
+                      <m:t>theoretical volume flow rate</m:t>
+                    </m:r>
+                  </m:den>
+                </m:f>
+                <m:r>
+                  <w:rPr>
+                    <w:rFonts w:ascii="Cambria Math" w:eastAsiaTheme="minorEastAsia" w:hAnsi="Cambria Math"/>
+                  </w:rPr>
+                  <m:t>=</m:t>
+                </m:r>
+                <m:sSub>
+                  <m:sSubPr>
+                    <m:ctrlPr>
+                      <w:rPr>
+                        <w:rFonts w:ascii="Cambria Math" w:eastAsiaTheme="minorEastAsia" w:hAnsi="Cambria Math"/>
+                        <w:i/>
+                      </w:rPr>
+                    </m:ctrlPr>
+                  </m:sSubPr>
+                  <m:e>
+                    <m:r>
+                      <w:rPr>
+                        <w:rFonts w:ascii="Cambria Math" w:eastAsiaTheme="minorEastAsia" w:hAnsi="Cambria Math"/>
+                      </w:rPr>
+                      <m:t>C</m:t>
+                    </m:r>
+                  </m:e>
+                  <m:sub>
+                    <m:r>
+                      <w:rPr>
+                        <w:rFonts w:ascii="Cambria Math" w:eastAsiaTheme="minorEastAsia" w:hAnsi="Cambria Math"/>
+                      </w:rPr>
+                      <m:t>c</m:t>
+                    </m:r>
+                  </m:sub>
+                </m:sSub>
+                <m:r>
+                  <w:rPr>
+                    <w:rFonts w:ascii="Cambria Math" w:eastAsiaTheme="minorEastAsia" w:hAnsi="Cambria Math"/>
+                  </w:rPr>
+                  <m:t>×</m:t>
+                </m:r>
+                <m:sSub>
+                  <m:sSubPr>
+                    <m:ctrlPr>
+                      <w:rPr>
+                        <w:rFonts w:ascii="Cambria Math" w:eastAsiaTheme="minorEastAsia" w:hAnsi="Cambria Math"/>
+                        <w:i/>
+                      </w:rPr>
+                    </m:ctrlPr>
+                  </m:sSubPr>
+                  <m:e>
+                    <m:r>
+                      <w:rPr>
+                        <w:rFonts w:ascii="Cambria Math" w:eastAsiaTheme="minorEastAsia" w:hAnsi="Cambria Math"/>
+                      </w:rPr>
+                      <m:t>C</m:t>
+                    </m:r>
+                  </m:e>
+                  <m:sub>
+                    <m:r>
+                      <w:rPr>
+                        <w:rFonts w:ascii="Cambria Math" w:eastAsiaTheme="minorEastAsia" w:hAnsi="Cambria Math"/>
+                      </w:rPr>
+                      <m:t>v</m:t>
+                    </m:r>
+                  </m:sub>
+                </m:sSub>
+              </m:e>
+            </m:mr>
+          </m:m>
+        </m:oMath>
+      </m:oMathPara>
+    </w:p>
+    <w:p>
+      <w:pPr>
+        <w:rPr>
+          <w:rFonts w:eastAsiaTheme="minorEastAsia"/>
+        </w:rPr>
+      </w:pPr>
+    </w:p>
+    <w:p>
+      <w:pPr>
+        <w:rPr>
+          <w:rFonts w:eastAsiaTheme="minorEastAsia"/>
+        </w:rPr>
+      </w:pPr>
+      <m:oMathPara>
+        <m:oMath>
+          <m:r>
+            <w:rPr>
+              <w:rFonts w:ascii="Cambria Math" w:eastAsiaTheme="minorEastAsia" w:hAnsi="Cambria Math"/>
+            </w:rPr>
+            <m:t>m_flow_i=</m:t>
+          </m:r>
+          <m:sSub>
+            <m:sSubPr>
+              <m:ctrlPr>
+                <w:rPr>
+                  <w:rFonts w:ascii="Cambria Math" w:eastAsiaTheme="minorEastAsia" w:hAnsi="Cambria Math"/>
+                  <w:i/>
+                </w:rPr>
+              </m:ctrlPr>
+            </m:sSubPr>
+            <m:e>
+              <m:r>
+                <w:rPr>
+                  <w:rFonts w:ascii="Cambria Math" w:eastAsiaTheme="minorEastAsia" w:hAnsi="Cambria Math"/>
+                </w:rPr>
+                <m:t>d</m:t>
+              </m:r>
+            </m:e>
+            <m:sub>
+              <m:r>
+                <w:rPr>
+                  <w:rFonts w:ascii="Cambria Math" w:eastAsiaTheme="minorEastAsia" w:hAnsi="Cambria Math"/>
+                </w:rPr>
+                <m:t>upstream</m:t>
+              </m:r>
+            </m:sub>
+          </m:sSub>
+          <m:r>
+            <w:rPr>
+              <w:rFonts w:ascii="Cambria Math" w:eastAsiaTheme="minorEastAsia" w:hAnsi="Cambria Math"/>
+            </w:rPr>
+            <m:t>×</m:t>
+          </m:r>
+          <m:sSub>
+            <m:sSubPr>
+              <m:ctrlPr>
+                <w:rPr>
+                  <w:rFonts w:ascii="Cambria Math" w:eastAsiaTheme="minorEastAsia" w:hAnsi="Cambria Math"/>
+                  <w:i/>
+                </w:rPr>
+              </m:ctrlPr>
+            </m:sSubPr>
+            <m:e>
+              <m:r>
+                <w:rPr>
+                  <w:rFonts w:ascii="Cambria Math" w:eastAsiaTheme="minorEastAsia" w:hAnsi="Cambria Math"/>
+                </w:rPr>
+                <m:t>A</m:t>
+              </m:r>
+            </m:e>
+            <m:sub>
+              <m:r>
+                <w:rPr>
+                  <w:rFonts w:ascii="Cambria Math" w:eastAsiaTheme="minorEastAsia" w:hAnsi="Cambria Math"/>
+                </w:rPr>
+                <m:t>flow</m:t>
+              </m:r>
+            </m:sub>
+          </m:sSub>
+          <m:r>
+            <w:rPr>
+              <w:rFonts w:ascii="Cambria Math" w:eastAsiaTheme="minorEastAsia" w:hAnsi="Cambria Math"/>
+            </w:rPr>
+            <m:t>×Vel_i=</m:t>
+          </m:r>
+          <m:sSub>
+            <m:sSubPr>
+              <m:ctrlPr>
+                <w:rPr>
+                  <w:rFonts w:ascii="Cambria Math" w:eastAsiaTheme="minorEastAsia" w:hAnsi="Cambria Math"/>
+                  <w:i/>
+                </w:rPr>
+              </m:ctrlPr>
+            </m:sSubPr>
+            <m:e>
+              <m:r>
+                <w:rPr>
+                  <w:rFonts w:ascii="Cambria Math" w:eastAsiaTheme="minorEastAsia" w:hAnsi="Cambria Math"/>
+                </w:rPr>
+                <m:t>d</m:t>
+              </m:r>
+            </m:e>
+            <m:sub>
+              <m:r>
+                <w:rPr>
+                  <w:rFonts w:ascii="Cambria Math" w:eastAsiaTheme="minorEastAsia" w:hAnsi="Cambria Math"/>
+                </w:rPr>
+                <m:t>upstream</m:t>
+              </m:r>
+            </m:sub>
+          </m:sSub>
+          <m:r>
+            <w:rPr>
+              <w:rFonts w:ascii="Cambria Math" w:eastAsiaTheme="minorEastAsia" w:hAnsi="Cambria Math"/>
+            </w:rPr>
+            <m:t>×Cd×</m:t>
+          </m:r>
+          <m:f>
+            <m:fPr>
+              <m:ctrlPr>
+                <w:rPr>
+                  <w:rFonts w:ascii="Cambria Math" w:eastAsiaTheme="minorEastAsia" w:hAnsi="Cambria Math"/>
+                  <w:i/>
+                </w:rPr>
+              </m:ctrlPr>
+            </m:fPr>
+            <m:num>
+              <m:r>
+                <w:rPr>
+                  <w:rFonts w:ascii="Cambria Math" w:eastAsiaTheme="minorEastAsia" w:hAnsi="Cambria Math"/>
+                </w:rPr>
+                <m:t>A</m:t>
+              </m:r>
+            </m:num>
+            <m:den>
+              <m:r>
+                <w:rPr>
+                  <w:rFonts w:ascii="Cambria Math" w:eastAsiaTheme="minorEastAsia" w:hAnsi="Cambria Math"/>
+                </w:rPr>
+                <m:t>N</m:t>
+              </m:r>
+            </m:den>
+          </m:f>
+          <m:r>
+            <w:rPr>
+              <w:rFonts w:ascii="Cambria Math" w:eastAsiaTheme="minorEastAsia" w:hAnsi="Cambria Math"/>
+            </w:rPr>
+            <m:t>×Vel_i</m:t>
+          </m:r>
+        </m:oMath>
+      </m:oMathPara>
+    </w:p>
+    <w:p>
+      <w:pPr>
+        <w:rPr>
           <w:lang w:val="fr-FR"/>
         </w:rPr>
       </w:pPr>
@@ -12762,7 +13450,7 @@
           <w:lang w:val="fr-FR"/>
         </w:rPr>
       </w:pPr>
-      <w:bookmarkStart w:id="30" w:name="_Toc41656118"/>
+      <w:bookmarkStart w:id="28" w:name="_Toc41656118"/>
       <w:proofErr w:type="spellStart"/>
       <w:r>
         <w:rPr>
@@ -12770,13 +13458,13 @@
         </w:rPr>
         <w:t>HorizontalOpening</w:t>
       </w:r>
-      <w:bookmarkEnd w:id="30"/>
+      <w:bookmarkEnd w:id="28"/>
       <w:proofErr w:type="spellEnd"/>
     </w:p>
     <w:p>
       <w:pPr>
         <w:rPr>
-          <w:lang w:val="fr-FR"/>
+          <w:rFonts w:eastAsiaTheme="minorEastAsia"/>
         </w:rPr>
       </w:pPr>
     </w:p>
@@ -12792,477 +13480,18 @@
             <w:rPr>
               <w:rFonts w:ascii="Cambria Math" w:eastAsiaTheme="minorEastAsia" w:hAnsi="Cambria Math"/>
             </w:rPr>
-            <m:t>p_up =</m:t>
-          </m:r>
-          <m:sSub>
-            <m:sSubPr>
-              <m:ctrlPr>
-                <w:rPr>
-                  <w:rFonts w:ascii="Cambria Math" w:eastAsiaTheme="minorEastAsia" w:hAnsi="Cambria Math"/>
-                  <w:i/>
-                </w:rPr>
-              </m:ctrlPr>
-            </m:sSubPr>
+            <m:t>dp_i[i]=dp+g×</m:t>
+          </m:r>
+          <m:d>
+            <m:dPr>
+              <m:ctrlPr>
+                <w:rPr>
+                  <w:rFonts w:ascii="Cambria Math" w:eastAsiaTheme="minorEastAsia" w:hAnsi="Cambria Math"/>
+                  <w:i/>
+                </w:rPr>
+              </m:ctrlPr>
+            </m:dPr>
             <m:e>
-              <m:r>
-                <w:rPr>
-                  <w:rFonts w:ascii="Cambria Math" w:eastAsiaTheme="minorEastAsia" w:hAnsi="Cambria Math"/>
-                </w:rPr>
-                <m:t>p</m:t>
-              </m:r>
-            </m:e>
-            <m:sub>
-              <m:r>
-                <w:rPr>
-                  <w:rFonts w:ascii="Cambria Math" w:eastAsiaTheme="minorEastAsia" w:hAnsi="Cambria Math"/>
-                </w:rPr>
-                <m:t>port_a</m:t>
-              </m:r>
-            </m:sub>
-          </m:sSub>
-          <m:r>
-            <w:rPr>
-              <w:rFonts w:ascii="Cambria Math" w:eastAsiaTheme="minorEastAsia" w:hAnsi="Cambria Math"/>
-            </w:rPr>
-            <m:t>+</m:t>
-          </m:r>
-          <m:sSub>
-            <m:sSubPr>
-              <m:ctrlPr>
-                <w:rPr>
-                  <w:rFonts w:ascii="Cambria Math" w:eastAsiaTheme="minorEastAsia" w:hAnsi="Cambria Math"/>
-                  <w:i/>
-                </w:rPr>
-              </m:ctrlPr>
-            </m:sSubPr>
-            <m:e>
-              <m:r>
-                <w:rPr>
-                  <w:rFonts w:ascii="Cambria Math" w:eastAsiaTheme="minorEastAsia" w:hAnsi="Cambria Math"/>
-                </w:rPr>
-                <m:t>d</m:t>
-              </m:r>
-            </m:e>
-            <m:sub>
-              <m:r>
-                <w:rPr>
-                  <w:rFonts w:ascii="Cambria Math" w:eastAsiaTheme="minorEastAsia" w:hAnsi="Cambria Math"/>
-                </w:rPr>
-                <m:t>port_a</m:t>
-              </m:r>
-            </m:sub>
-          </m:sSub>
-          <m:r>
-            <w:rPr>
-              <w:rFonts w:ascii="Cambria Math" w:eastAsiaTheme="minorEastAsia" w:hAnsi="Cambria Math"/>
-            </w:rPr>
-            <m:t>×g×L_up</m:t>
-          </m:r>
-        </m:oMath>
-      </m:oMathPara>
-    </w:p>
-    <w:p>
-      <w:pPr>
-        <w:rPr>
-          <w:rFonts w:eastAsiaTheme="minorEastAsia"/>
-        </w:rPr>
-      </w:pPr>
-      <m:oMathPara>
-        <m:oMath>
-          <m:r>
-            <w:rPr>
-              <w:rFonts w:ascii="Cambria Math" w:eastAsiaTheme="minorEastAsia" w:hAnsi="Cambria Math"/>
-            </w:rPr>
-            <m:t>p_down =</m:t>
-          </m:r>
-          <m:sSub>
-            <m:sSubPr>
-              <m:ctrlPr>
-                <w:rPr>
-                  <w:rFonts w:ascii="Cambria Math" w:eastAsiaTheme="minorEastAsia" w:hAnsi="Cambria Math"/>
-                  <w:i/>
-                </w:rPr>
-              </m:ctrlPr>
-            </m:sSubPr>
-            <m:e>
-              <m:r>
-                <w:rPr>
-                  <w:rFonts w:ascii="Cambria Math" w:eastAsiaTheme="minorEastAsia" w:hAnsi="Cambria Math"/>
-                </w:rPr>
-                <m:t>p</m:t>
-              </m:r>
-            </m:e>
-            <m:sub>
-              <m:r>
-                <w:rPr>
-                  <w:rFonts w:ascii="Cambria Math" w:eastAsiaTheme="minorEastAsia" w:hAnsi="Cambria Math"/>
-                </w:rPr>
-                <m:t>port_b</m:t>
-              </m:r>
-            </m:sub>
-          </m:sSub>
-          <m:r>
-            <w:rPr>
-              <w:rFonts w:ascii="Cambria Math" w:eastAsiaTheme="minorEastAsia" w:hAnsi="Cambria Math"/>
-            </w:rPr>
-            <m:t>-</m:t>
-          </m:r>
-          <m:sSub>
-            <m:sSubPr>
-              <m:ctrlPr>
-                <w:rPr>
-                  <w:rFonts w:ascii="Cambria Math" w:eastAsiaTheme="minorEastAsia" w:hAnsi="Cambria Math"/>
-                  <w:i/>
-                </w:rPr>
-              </m:ctrlPr>
-            </m:sSubPr>
-            <m:e>
-              <m:r>
-                <w:rPr>
-                  <w:rFonts w:ascii="Cambria Math" w:eastAsiaTheme="minorEastAsia" w:hAnsi="Cambria Math"/>
-                </w:rPr>
-                <m:t>d</m:t>
-              </m:r>
-            </m:e>
-            <m:sub>
-              <m:r>
-                <w:rPr>
-                  <w:rFonts w:ascii="Cambria Math" w:eastAsiaTheme="minorEastAsia" w:hAnsi="Cambria Math"/>
-                </w:rPr>
-                <m:t>port_b</m:t>
-              </m:r>
-            </m:sub>
-          </m:sSub>
-          <m:r>
-            <w:rPr>
-              <w:rFonts w:ascii="Cambria Math" w:eastAsiaTheme="minorEastAsia" w:hAnsi="Cambria Math"/>
-            </w:rPr>
-            <m:t>×g×L_down</m:t>
-          </m:r>
-        </m:oMath>
-      </m:oMathPara>
-    </w:p>
-    <w:p>
-      <w:pPr>
-        <w:rPr>
-          <w:rFonts w:eastAsiaTheme="minorEastAsia"/>
-        </w:rPr>
-      </w:pPr>
-      <m:oMathPara>
-        <m:oMath>
-          <m:r>
-            <w:rPr>
-              <w:rFonts w:ascii="Cambria Math" w:eastAsiaTheme="minorEastAsia" w:hAnsi="Cambria Math"/>
-            </w:rPr>
-            <m:t>dp =p_up-p_down</m:t>
-          </m:r>
-        </m:oMath>
-      </m:oMathPara>
-    </w:p>
-    <w:p>
-      <w:pPr>
-        <w:rPr>
-          <w:rFonts w:eastAsiaTheme="minorEastAsia"/>
-        </w:rPr>
-      </w:pPr>
-      <m:oMathPara>
-        <m:oMath>
-          <m:r>
-            <w:rPr>
-              <w:rFonts w:ascii="Cambria Math" w:eastAsiaTheme="minorEastAsia" w:hAnsi="Cambria Math"/>
-            </w:rPr>
-            <m:t>dp=</m:t>
-          </m:r>
-          <m:f>
-            <m:fPr>
-              <m:ctrlPr>
-                <w:rPr>
-                  <w:rFonts w:ascii="Cambria Math" w:eastAsiaTheme="minorEastAsia" w:hAnsi="Cambria Math"/>
-                  <w:i/>
-                </w:rPr>
-              </m:ctrlPr>
-            </m:fPr>
-            <m:num>
-              <m:r>
-                <w:rPr>
-                  <w:rFonts w:ascii="Cambria Math" w:eastAsiaTheme="minorEastAsia" w:hAnsi="Cambria Math"/>
-                </w:rPr>
-                <m:t>1</m:t>
-              </m:r>
-            </m:num>
-            <m:den>
-              <m:r>
-                <w:rPr>
-                  <w:rFonts w:ascii="Cambria Math" w:eastAsiaTheme="minorEastAsia" w:hAnsi="Cambria Math"/>
-                </w:rPr>
-                <m:t>2</m:t>
-              </m:r>
-            </m:den>
-          </m:f>
-          <m:r>
-            <w:rPr>
-              <w:rFonts w:ascii="Cambria Math" w:eastAsiaTheme="minorEastAsia" w:hAnsi="Cambria Math"/>
-            </w:rPr>
-            <m:t>×d×</m:t>
-          </m:r>
-          <m:sSup>
-            <m:sSupPr>
-              <m:ctrlPr>
-                <w:rPr>
-                  <w:rFonts w:ascii="Cambria Math" w:eastAsiaTheme="minorEastAsia" w:hAnsi="Cambria Math"/>
-                  <w:i/>
-                </w:rPr>
-              </m:ctrlPr>
-            </m:sSupPr>
-            <m:e>
-              <m:r>
-                <w:rPr>
-                  <w:rFonts w:ascii="Cambria Math" w:eastAsiaTheme="minorEastAsia" w:hAnsi="Cambria Math"/>
-                </w:rPr>
-                <m:t>Vel</m:t>
-              </m:r>
-            </m:e>
-            <m:sup>
-              <m:r>
-                <w:rPr>
-                  <w:rFonts w:ascii="Cambria Math" w:eastAsiaTheme="minorEastAsia" w:hAnsi="Cambria Math"/>
-                </w:rPr>
-                <m:t>2</m:t>
-              </m:r>
-            </m:sup>
-          </m:sSup>
-        </m:oMath>
-      </m:oMathPara>
-    </w:p>
-    <w:p>
-      <w:pPr>
-        <w:rPr>
-          <w:rFonts w:eastAsiaTheme="minorEastAsia"/>
-        </w:rPr>
-      </w:pPr>
-      <m:oMathPara>
-        <m:oMath>
-          <m:r>
-            <w:rPr>
-              <w:rFonts w:ascii="Cambria Math" w:eastAsiaTheme="minorEastAsia" w:hAnsi="Cambria Math"/>
-            </w:rPr>
-            <m:t>m_flow=d×</m:t>
-          </m:r>
-          <m:sSub>
-            <m:sSubPr>
-              <m:ctrlPr>
-                <w:rPr>
-                  <w:rFonts w:ascii="Cambria Math" w:eastAsiaTheme="minorEastAsia" w:hAnsi="Cambria Math"/>
-                  <w:i/>
-                </w:rPr>
-              </m:ctrlPr>
-            </m:sSubPr>
-            <m:e>
-              <m:r>
-                <w:rPr>
-                  <w:rFonts w:ascii="Cambria Math" w:eastAsiaTheme="minorEastAsia" w:hAnsi="Cambria Math"/>
-                </w:rPr>
-                <m:t>A</m:t>
-              </m:r>
-            </m:e>
-            <m:sub>
-              <m:r>
-                <w:rPr>
-                  <w:rFonts w:ascii="Cambria Math" w:eastAsiaTheme="minorEastAsia" w:hAnsi="Cambria Math"/>
-                </w:rPr>
-                <m:t>flow</m:t>
-              </m:r>
-            </m:sub>
-          </m:sSub>
-          <m:r>
-            <w:rPr>
-              <w:rFonts w:ascii="Cambria Math" w:eastAsiaTheme="minorEastAsia" w:hAnsi="Cambria Math"/>
-            </w:rPr>
-            <m:t>×Vel=A×Cd×</m:t>
-          </m:r>
-          <m:rad>
-            <m:radPr>
-              <m:degHide m:val="1"/>
-              <m:ctrlPr>
-                <w:rPr>
-                  <w:rFonts w:ascii="Cambria Math" w:eastAsiaTheme="minorEastAsia" w:hAnsi="Cambria Math"/>
-                  <w:i/>
-                </w:rPr>
-              </m:ctrlPr>
-            </m:radPr>
-            <m:deg/>
-            <m:e>
-              <m:r>
-                <w:rPr>
-                  <w:rFonts w:ascii="Cambria Math" w:eastAsiaTheme="minorEastAsia" w:hAnsi="Cambria Math"/>
-                </w:rPr>
-                <m:t>2×dp×d</m:t>
-              </m:r>
-            </m:e>
-          </m:rad>
-        </m:oMath>
-      </m:oMathPara>
-    </w:p>
-    <w:p>
-      <w:pPr>
-        <w:rPr>
-          <w:rFonts w:eastAsiaTheme="minorEastAsia"/>
-        </w:rPr>
-      </w:pPr>
-      <m:oMathPara>
-        <m:oMath>
-          <m:r>
-            <w:rPr>
-              <w:rFonts w:ascii="Cambria Math" w:eastAsiaTheme="minorEastAsia" w:hAnsi="Cambria Math"/>
-            </w:rPr>
-            <m:t>dp_buoyancy=g×L_up×</m:t>
-          </m:r>
-          <m:r>
-            <m:rPr>
-              <m:sty m:val="p"/>
-            </m:rPr>
-            <w:rPr>
-              <w:rFonts w:ascii="Cambria Math" w:eastAsiaTheme="minorEastAsia" w:hAnsi="Cambria Math"/>
-            </w:rPr>
-            <m:t>max⁡</m:t>
-          </m:r>
-          <m:r>
-            <w:rPr>
-              <w:rFonts w:ascii="Cambria Math" w:eastAsiaTheme="minorEastAsia" w:hAnsi="Cambria Math"/>
-            </w:rPr>
-            <m:t>(</m:t>
-          </m:r>
-          <m:sSub>
-            <m:sSubPr>
-              <m:ctrlPr>
-                <w:rPr>
-                  <w:rFonts w:ascii="Cambria Math" w:eastAsiaTheme="minorEastAsia" w:hAnsi="Cambria Math"/>
-                  <w:i/>
-                </w:rPr>
-              </m:ctrlPr>
-            </m:sSubPr>
-            <m:e>
-              <m:r>
-                <w:rPr>
-                  <w:rFonts w:ascii="Cambria Math" w:eastAsiaTheme="minorEastAsia" w:hAnsi="Cambria Math"/>
-                </w:rPr>
-                <m:t>d</m:t>
-              </m:r>
-            </m:e>
-            <m:sub>
-              <m:r>
-                <w:rPr>
-                  <w:rFonts w:ascii="Cambria Math" w:eastAsiaTheme="minorEastAsia" w:hAnsi="Cambria Math"/>
-                </w:rPr>
-                <m:t>port_a</m:t>
-              </m:r>
-            </m:sub>
-          </m:sSub>
-          <m:r>
-            <w:rPr>
-              <w:rFonts w:ascii="Cambria Math" w:eastAsiaTheme="minorEastAsia" w:hAnsi="Cambria Math"/>
-            </w:rPr>
-            <m:t>-</m:t>
-          </m:r>
-          <m:sSub>
-            <m:sSubPr>
-              <m:ctrlPr>
-                <w:rPr>
-                  <w:rFonts w:ascii="Cambria Math" w:eastAsiaTheme="minorEastAsia" w:hAnsi="Cambria Math"/>
-                  <w:i/>
-                </w:rPr>
-              </m:ctrlPr>
-            </m:sSubPr>
-            <m:e>
-              <m:r>
-                <w:rPr>
-                  <w:rFonts w:ascii="Cambria Math" w:eastAsiaTheme="minorEastAsia" w:hAnsi="Cambria Math"/>
-                </w:rPr>
-                <m:t>d</m:t>
-              </m:r>
-            </m:e>
-            <m:sub>
-              <m:r>
-                <w:rPr>
-                  <w:rFonts w:ascii="Cambria Math" w:eastAsiaTheme="minorEastAsia" w:hAnsi="Cambria Math"/>
-                </w:rPr>
-                <m:t>port_b</m:t>
-              </m:r>
-            </m:sub>
-          </m:sSub>
-          <m:r>
-            <w:rPr>
-              <w:rFonts w:ascii="Cambria Math" w:eastAsiaTheme="minorEastAsia" w:hAnsi="Cambria Math"/>
-            </w:rPr>
-            <m:t>, 0)</m:t>
-          </m:r>
-        </m:oMath>
-      </m:oMathPara>
-    </w:p>
-    <w:p>
-      <w:pPr>
-        <w:rPr>
-          <w:rFonts w:eastAsiaTheme="minorEastAsia"/>
-        </w:rPr>
-      </w:pPr>
-      <m:oMathPara>
-        <m:oMath>
-          <m:r>
-            <w:rPr>
-              <w:rFonts w:ascii="Cambria Math" w:eastAsiaTheme="minorEastAsia" w:hAnsi="Cambria Math"/>
-            </w:rPr>
-            <m:t>m_flow_buoyancy=</m:t>
-          </m:r>
-          <m:f>
-            <m:fPr>
-              <m:ctrlPr>
-                <w:rPr>
-                  <w:rFonts w:ascii="Cambria Math" w:eastAsiaTheme="minorEastAsia" w:hAnsi="Cambria Math"/>
-                  <w:i/>
-                </w:rPr>
-              </m:ctrlPr>
-            </m:fPr>
-            <m:num>
-              <m:r>
-                <w:rPr>
-                  <w:rFonts w:ascii="Cambria Math" w:eastAsiaTheme="minorEastAsia" w:hAnsi="Cambria Math"/>
-                </w:rPr>
-                <m:t>A</m:t>
-              </m:r>
-            </m:num>
-            <m:den>
-              <m:r>
-                <w:rPr>
-                  <w:rFonts w:ascii="Cambria Math" w:eastAsiaTheme="minorEastAsia" w:hAnsi="Cambria Math"/>
-                </w:rPr>
-                <m:t>2</m:t>
-              </m:r>
-            </m:den>
-          </m:f>
-          <m:r>
-            <w:rPr>
-              <w:rFonts w:ascii="Cambria Math" w:eastAsiaTheme="minorEastAsia" w:hAnsi="Cambria Math"/>
-            </w:rPr>
-            <m:t>×Cd×</m:t>
-          </m:r>
-          <m:rad>
-            <m:radPr>
-              <m:degHide m:val="1"/>
-              <m:ctrlPr>
-                <w:rPr>
-                  <w:rFonts w:ascii="Cambria Math" w:eastAsiaTheme="minorEastAsia" w:hAnsi="Cambria Math"/>
-                  <w:i/>
-                </w:rPr>
-              </m:ctrlPr>
-            </m:radPr>
-            <m:deg/>
-            <m:e>
-              <m:r>
-                <w:rPr>
-                  <w:rFonts w:ascii="Cambria Math" w:eastAsiaTheme="minorEastAsia" w:hAnsi="Cambria Math"/>
-                </w:rPr>
-                <m:t>2×dp_buoyancy×</m:t>
-              </m:r>
               <m:sSub>
                 <m:sSubPr>
                   <m:ctrlPr>
@@ -13277,7 +13506,7 @@
                     <w:rPr>
                       <w:rFonts w:ascii="Cambria Math" w:eastAsiaTheme="minorEastAsia" w:hAnsi="Cambria Math"/>
                     </w:rPr>
-                    <m:t>d</m:t>
+                    <m:t>D</m:t>
                   </m:r>
                 </m:e>
                 <m:sub>
@@ -13285,47 +13514,184 @@
                     <w:rPr>
                       <w:rFonts w:ascii="Cambria Math" w:eastAsiaTheme="minorEastAsia" w:hAnsi="Cambria Math"/>
                     </w:rPr>
-                    <m:t>port_a</m:t>
+                    <m:t>h</m:t>
                   </m:r>
                 </m:sub>
               </m:sSub>
-            </m:e>
-          </m:rad>
-        </m:oMath>
-      </m:oMathPara>
-    </w:p>
-    <w:p>
-      <w:pPr>
-        <w:rPr>
-          <w:rFonts w:eastAsiaTheme="minorEastAsia"/>
-        </w:rPr>
-      </w:pPr>
-      <m:oMathPara>
-        <m:oMath>
-          <m:r>
-            <w:rPr>
-              <w:rFonts w:ascii="Cambria Math" w:eastAsiaTheme="minorEastAsia" w:hAnsi="Cambria Math"/>
-            </w:rPr>
-            <m:t>Q_flow_buoyancy=m_flow_buoyancy×</m:t>
-          </m:r>
-          <m:d>
-            <m:dPr>
-              <m:ctrlPr>
-                <w:rPr>
-                  <w:rFonts w:ascii="Cambria Math" w:eastAsiaTheme="minorEastAsia" w:hAnsi="Cambria Math"/>
-                  <w:i/>
-                </w:rPr>
-              </m:ctrlPr>
-            </m:dPr>
-            <m:e>
-              <m:r>
-                <w:rPr>
-                  <w:rFonts w:ascii="Cambria Math" w:eastAsiaTheme="minorEastAsia" w:hAnsi="Cambria Math"/>
-                </w:rPr>
-                <m:t>h_b-h_a</m:t>
-              </m:r>
+              <m:r>
+                <w:rPr>
+                  <w:rFonts w:ascii="Cambria Math" w:eastAsiaTheme="minorEastAsia" w:hAnsi="Cambria Math"/>
+                </w:rPr>
+                <m:t>×</m:t>
+              </m:r>
+              <m:d>
+                <m:dPr>
+                  <m:ctrlPr>
+                    <w:rPr>
+                      <w:rFonts w:ascii="Cambria Math" w:eastAsiaTheme="minorEastAsia" w:hAnsi="Cambria Math"/>
+                      <w:i/>
+                    </w:rPr>
+                  </m:ctrlPr>
+                </m:dPr>
+                <m:e>
+                  <m:f>
+                    <m:fPr>
+                      <m:ctrlPr>
+                        <w:rPr>
+                          <w:rFonts w:ascii="Cambria Math" w:eastAsiaTheme="minorEastAsia" w:hAnsi="Cambria Math"/>
+                          <w:i/>
+                        </w:rPr>
+                      </m:ctrlPr>
+                    </m:fPr>
+                    <m:num>
+                      <m:r>
+                        <w:rPr>
+                          <w:rFonts w:ascii="Cambria Math" w:eastAsiaTheme="minorEastAsia" w:hAnsi="Cambria Math"/>
+                        </w:rPr>
+                        <m:t>1</m:t>
+                      </m:r>
+                    </m:num>
+                    <m:den>
+                      <m:r>
+                        <w:rPr>
+                          <w:rFonts w:ascii="Cambria Math" w:eastAsiaTheme="minorEastAsia" w:hAnsi="Cambria Math"/>
+                        </w:rPr>
+                        <m:t>2</m:t>
+                      </m:r>
+                    </m:den>
+                  </m:f>
+                  <m:r>
+                    <w:rPr>
+                      <w:rFonts w:ascii="Cambria Math" w:eastAsiaTheme="minorEastAsia" w:hAnsi="Cambria Math"/>
+                    </w:rPr>
+                    <m:t>-</m:t>
+                  </m:r>
+                  <m:f>
+                    <m:fPr>
+                      <m:ctrlPr>
+                        <w:rPr>
+                          <w:rFonts w:ascii="Cambria Math" w:eastAsiaTheme="minorEastAsia" w:hAnsi="Cambria Math"/>
+                          <w:i/>
+                        </w:rPr>
+                      </m:ctrlPr>
+                    </m:fPr>
+                    <m:num>
+                      <m:r>
+                        <w:rPr>
+                          <w:rFonts w:ascii="Cambria Math" w:eastAsiaTheme="minorEastAsia" w:hAnsi="Cambria Math"/>
+                        </w:rPr>
+                        <m:t>i-</m:t>
+                      </m:r>
+                      <m:f>
+                        <m:fPr>
+                          <m:ctrlPr>
+                            <w:rPr>
+                              <w:rFonts w:ascii="Cambria Math" w:eastAsiaTheme="minorEastAsia" w:hAnsi="Cambria Math"/>
+                              <w:i/>
+                            </w:rPr>
+                          </m:ctrlPr>
+                        </m:fPr>
+                        <m:num>
+                          <m:r>
+                            <w:rPr>
+                              <w:rFonts w:ascii="Cambria Math" w:eastAsiaTheme="minorEastAsia" w:hAnsi="Cambria Math"/>
+                            </w:rPr>
+                            <m:t>1</m:t>
+                          </m:r>
+                        </m:num>
+                        <m:den>
+                          <m:r>
+                            <w:rPr>
+                              <w:rFonts w:ascii="Cambria Math" w:eastAsiaTheme="minorEastAsia" w:hAnsi="Cambria Math"/>
+                            </w:rPr>
+                            <m:t>2</m:t>
+                          </m:r>
+                        </m:den>
+                      </m:f>
+                    </m:num>
+                    <m:den>
+                      <m:r>
+                        <w:rPr>
+                          <w:rFonts w:ascii="Cambria Math" w:eastAsiaTheme="minorEastAsia" w:hAnsi="Cambria Math"/>
+                        </w:rPr>
+                        <m:t>N</m:t>
+                      </m:r>
+                    </m:den>
+                  </m:f>
+                </m:e>
+              </m:d>
             </m:e>
           </m:d>
+          <m:r>
+            <w:rPr>
+              <w:rFonts w:ascii="Cambria Math" w:eastAsiaTheme="minorEastAsia" w:hAnsi="Cambria Math"/>
+            </w:rPr>
+            <m:t>×(</m:t>
+          </m:r>
+          <m:sSub>
+            <m:sSubPr>
+              <m:ctrlPr>
+                <w:rPr>
+                  <w:rFonts w:ascii="Cambria Math" w:eastAsiaTheme="minorEastAsia" w:hAnsi="Cambria Math"/>
+                  <w:i/>
+                </w:rPr>
+              </m:ctrlPr>
+            </m:sSubPr>
+            <m:e>
+              <m:r>
+                <w:rPr>
+                  <w:rFonts w:ascii="Cambria Math" w:eastAsiaTheme="minorEastAsia" w:hAnsi="Cambria Math"/>
+                </w:rPr>
+                <m:t>d</m:t>
+              </m:r>
+            </m:e>
+            <m:sub>
+              <m:r>
+                <w:rPr>
+                  <w:rFonts w:ascii="Cambria Math" w:eastAsiaTheme="minorEastAsia" w:hAnsi="Cambria Math"/>
+                </w:rPr>
+                <m:t>port_a</m:t>
+              </m:r>
+            </m:sub>
+          </m:sSub>
+          <m:r>
+            <w:rPr>
+              <w:rFonts w:ascii="Cambria Math" w:eastAsiaTheme="minorEastAsia" w:hAnsi="Cambria Math"/>
+            </w:rPr>
+            <m:t>-</m:t>
+          </m:r>
+          <m:sSub>
+            <m:sSubPr>
+              <m:ctrlPr>
+                <w:rPr>
+                  <w:rFonts w:ascii="Cambria Math" w:eastAsiaTheme="minorEastAsia" w:hAnsi="Cambria Math"/>
+                  <w:i/>
+                </w:rPr>
+              </m:ctrlPr>
+            </m:sSubPr>
+            <m:e>
+              <m:r>
+                <w:rPr>
+                  <w:rFonts w:ascii="Cambria Math" w:eastAsiaTheme="minorEastAsia" w:hAnsi="Cambria Math"/>
+                </w:rPr>
+                <m:t>d</m:t>
+              </m:r>
+            </m:e>
+            <m:sub>
+              <m:r>
+                <w:rPr>
+                  <w:rFonts w:ascii="Cambria Math" w:eastAsiaTheme="minorEastAsia" w:hAnsi="Cambria Math"/>
+                </w:rPr>
+                <m:t>port_b</m:t>
+              </m:r>
+            </m:sub>
+          </m:sSub>
+          <m:r>
+            <w:rPr>
+              <w:rFonts w:ascii="Cambria Math" w:eastAsiaTheme="minorEastAsia" w:hAnsi="Cambria Math"/>
+            </w:rPr>
+            <m:t>)</m:t>
+          </m:r>
         </m:oMath>
       </m:oMathPara>
     </w:p>
@@ -14075,6 +14441,7 @@
         <w:rPr>
           <w:lang w:val="fr-FR"/>
         </w:rPr>
+        <w:lastRenderedPageBreak/>
         <w:t>Filters</w:t>
       </w:r>
       <w:proofErr w:type="spellEnd"/>
@@ -14098,7 +14465,6 @@
             <w:rPr>
               <w:rFonts w:ascii="Cambria Math" w:hAnsi="Cambria Math"/>
             </w:rPr>
-            <w:lastRenderedPageBreak/>
             <m:t>Vel= -</m:t>
           </m:r>
           <m:f>
@@ -14962,7 +15328,7 @@
           <w:lang w:val="fr-FR"/>
         </w:rPr>
       </w:pPr>
-      <w:bookmarkStart w:id="31" w:name="_Toc41656119"/>
+      <w:bookmarkStart w:id="29" w:name="_Toc41656119"/>
       <w:proofErr w:type="spellStart"/>
       <w:r>
         <w:rPr>
@@ -14970,7 +15336,7 @@
         </w:rPr>
         <w:t>BasesClasses</w:t>
       </w:r>
-      <w:bookmarkEnd w:id="31"/>
+      <w:bookmarkEnd w:id="29"/>
       <w:proofErr w:type="spellEnd"/>
     </w:p>
     <w:p>
@@ -14987,7 +15353,7 @@
           <w:rFonts w:eastAsiaTheme="minorEastAsia"/>
         </w:rPr>
       </w:pPr>
-      <w:bookmarkStart w:id="32" w:name="_Toc41656120"/>
+      <w:bookmarkStart w:id="30" w:name="_Toc41656120"/>
       <w:proofErr w:type="spellStart"/>
       <w:r>
         <w:rPr>
@@ -14995,7 +15361,7 @@
         </w:rPr>
         <w:t>AeraulicConvection</w:t>
       </w:r>
-      <w:bookmarkEnd w:id="32"/>
+      <w:bookmarkEnd w:id="30"/>
       <w:proofErr w:type="spellEnd"/>
     </w:p>
     <w:p/>
@@ -15249,11 +15615,12 @@
           <w:rFonts w:eastAsiaTheme="minorEastAsia"/>
         </w:rPr>
       </w:pPr>
-      <w:bookmarkStart w:id="33" w:name="_Toc41656121"/>
+      <w:bookmarkStart w:id="31" w:name="_Toc41656121"/>
       <w:r>
         <w:rPr>
           <w:rFonts w:eastAsiaTheme="minorEastAsia"/>
         </w:rPr>
+        <w:lastRenderedPageBreak/>
         <w:t>Con</w:t>
       </w:r>
       <w:r>
@@ -15262,7 +15629,7 @@
         </w:rPr>
         <w:t>densation</w:t>
       </w:r>
-      <w:bookmarkEnd w:id="33"/>
+      <w:bookmarkEnd w:id="31"/>
     </w:p>
     <w:p/>
     <w:p>
@@ -15354,7 +15721,6 @@
             <w:rPr>
               <w:rFonts w:ascii="Cambria Math" w:hAnsi="Cambria Math"/>
             </w:rPr>
-            <w:lastRenderedPageBreak/>
             <m:t xml:space="preserve">m_flow= </m:t>
           </m:r>
           <m:sSub>
@@ -15471,7 +15837,7 @@
           <w:rFonts w:eastAsiaTheme="minorEastAsia"/>
         </w:rPr>
       </w:pPr>
-      <w:bookmarkStart w:id="34" w:name="_Toc41656122"/>
+      <w:bookmarkStart w:id="32" w:name="_Toc41656122"/>
       <w:proofErr w:type="spellStart"/>
       <w:r>
         <w:rPr>
@@ -15479,7 +15845,7 @@
         </w:rPr>
         <w:t>MolecularDiffusion</w:t>
       </w:r>
-      <w:bookmarkEnd w:id="34"/>
+      <w:bookmarkEnd w:id="32"/>
       <w:proofErr w:type="spellEnd"/>
     </w:p>
     <w:p/>
@@ -15751,7 +16117,7 @@
           <w:rFonts w:eastAsiaTheme="minorEastAsia"/>
         </w:rPr>
       </w:pPr>
-      <w:bookmarkStart w:id="35" w:name="_Toc41656123"/>
+      <w:bookmarkStart w:id="33" w:name="_Toc41656123"/>
       <w:proofErr w:type="spellStart"/>
       <w:r>
         <w:rPr>
@@ -15759,7 +16125,7 @@
         </w:rPr>
         <w:t>GasNode</w:t>
       </w:r>
-      <w:bookmarkEnd w:id="35"/>
+      <w:bookmarkEnd w:id="33"/>
       <w:proofErr w:type="spellEnd"/>
     </w:p>
     <w:p/>
@@ -15966,12 +16332,12 @@
       <w:pPr>
         <w:pStyle w:val="Titre3"/>
       </w:pPr>
-      <w:bookmarkStart w:id="36" w:name="_Toc41656124"/>
+      <w:bookmarkStart w:id="34" w:name="_Toc41656124"/>
       <w:proofErr w:type="spellStart"/>
       <w:r>
         <w:t>FogModel</w:t>
       </w:r>
-      <w:bookmarkEnd w:id="36"/>
+      <w:bookmarkEnd w:id="34"/>
       <w:proofErr w:type="spellEnd"/>
     </w:p>
     <w:p/>
@@ -16455,6 +16821,7 @@
             <w:rPr>
               <w:rFonts w:ascii="Cambria Math" w:eastAsiaTheme="minorEastAsia" w:hAnsi="Cambria Math"/>
             </w:rPr>
+            <w:lastRenderedPageBreak/>
             <m:t xml:space="preserve">Π=  </m:t>
           </m:r>
           <m:sSub>
@@ -16649,7 +17016,6 @@
             <w:rPr>
               <w:rFonts w:ascii="Cambria Math" w:eastAsiaTheme="minorEastAsia" w:hAnsi="Cambria Math"/>
             </w:rPr>
-            <w:lastRenderedPageBreak/>
             <m:t xml:space="preserve">m_flow= </m:t>
           </m:r>
           <m:sSub>
@@ -17837,6 +18203,7 @@
             <w:rPr>
               <w:rFonts w:ascii="Cambria Math" w:eastAsiaTheme="minorEastAsia" w:hAnsi="Cambria Math"/>
             </w:rPr>
+            <w:lastRenderedPageBreak/>
             <m:t xml:space="preserve">m_flow= </m:t>
           </m:r>
           <m:sSub>
@@ -18006,11 +18373,11 @@
       <w:pPr>
         <w:pStyle w:val="Titre2"/>
       </w:pPr>
-      <w:bookmarkStart w:id="37" w:name="_Toc41656125"/>
+      <w:bookmarkStart w:id="35" w:name="_Toc41656125"/>
       <w:r>
         <w:t>Functions</w:t>
       </w:r>
-      <w:bookmarkEnd w:id="37"/>
+      <w:bookmarkEnd w:id="35"/>
     </w:p>
     <w:p>
       <w:pPr>
@@ -18026,14 +18393,14 @@
           <w:rFonts w:eastAsiaTheme="minorEastAsia"/>
         </w:rPr>
       </w:pPr>
-      <w:bookmarkStart w:id="38" w:name="_Toc41656126"/>
+      <w:bookmarkStart w:id="36" w:name="_Toc41656126"/>
       <w:r>
         <w:rPr>
           <w:rFonts w:eastAsiaTheme="minorEastAsia"/>
         </w:rPr>
         <w:t>rootsPolyorder3</w:t>
       </w:r>
-      <w:bookmarkEnd w:id="38"/>
+      <w:bookmarkEnd w:id="36"/>
     </w:p>
     <w:p/>
     <w:p>
@@ -19163,6 +19530,7 @@
             <w:rPr>
               <w:rFonts w:ascii="Cambria Math" w:eastAsiaTheme="minorEastAsia" w:hAnsi="Cambria Math"/>
             </w:rPr>
+            <w:lastRenderedPageBreak/>
             <m:t>x3=2×</m:t>
           </m:r>
           <m:rad>
@@ -19779,19 +20147,11 @@
           <w:rFonts w:eastAsiaTheme="minorEastAsia"/>
         </w:rPr>
       </w:pPr>
-      <w:proofErr w:type="gramStart"/>
       <w:r>
         <w:rPr>
           <w:rFonts w:eastAsiaTheme="minorEastAsia"/>
         </w:rPr>
-        <w:t>discriminant</w:t>
-      </w:r>
-      <w:proofErr w:type="gramEnd"/>
-      <w:r>
-        <w:rPr>
-          <w:rFonts w:eastAsiaTheme="minorEastAsia"/>
-        </w:rPr>
-        <w:t xml:space="preserve"> 2</w:t>
+        <w:t>discriminant 2</w:t>
       </w:r>
       <w:r>
         <w:rPr>
@@ -20151,7 +20511,7 @@
           <w:lang w:val="fr-FR"/>
         </w:rPr>
       </w:pPr>
-      <w:bookmarkStart w:id="39" w:name="_Toc41656127"/>
+      <w:bookmarkStart w:id="37" w:name="_Toc41656127"/>
       <w:r>
         <w:rPr>
           <w:rFonts w:eastAsiaTheme="minorEastAsia"/>
@@ -20160,7 +20520,7 @@
         <w:lastRenderedPageBreak/>
         <w:t>PDE</w:t>
       </w:r>
-      <w:bookmarkEnd w:id="39"/>
+      <w:bookmarkEnd w:id="37"/>
     </w:p>
     <w:p>
       <w:pPr>
@@ -20176,7 +20536,7 @@
           <w:lang w:val="fr-FR"/>
         </w:rPr>
       </w:pPr>
-      <w:bookmarkStart w:id="40" w:name="_Toc41656128"/>
+      <w:bookmarkStart w:id="38" w:name="_Toc41656128"/>
       <w:proofErr w:type="spellStart"/>
       <w:r>
         <w:rPr>
@@ -20184,18 +20544,18 @@
         </w:rPr>
         <w:t>ThermalDiffusion</w:t>
       </w:r>
-      <w:bookmarkEnd w:id="40"/>
+      <w:bookmarkEnd w:id="38"/>
       <w:proofErr w:type="spellEnd"/>
     </w:p>
     <w:p>
       <w:pPr>
         <w:pStyle w:val="Titre3"/>
       </w:pPr>
-      <w:bookmarkStart w:id="41" w:name="_Toc41656129"/>
+      <w:bookmarkStart w:id="39" w:name="_Toc41656129"/>
       <w:r>
         <w:t>Second order central</w:t>
       </w:r>
-      <w:bookmarkEnd w:id="41"/>
+      <w:bookmarkEnd w:id="39"/>
     </w:p>
     <w:p>
       <w:pPr>
@@ -22604,8 +22964,58 @@
 </w:document>
 </file>
 
+<file path=word/endnotes.xml><?xml version="1.0" encoding="utf-8"?>
+<w:endnotes xmlns:wpc="http://schemas.microsoft.com/office/word/2010/wordprocessingCanvas" xmlns:cx="http://schemas.microsoft.com/office/drawing/2014/chartex" xmlns:cx1="http://schemas.microsoft.com/office/drawing/2015/9/8/chartex" xmlns:cx2="http://schemas.microsoft.com/office/drawing/2015/10/21/chartex" xmlns:cx3="http://schemas.microsoft.com/office/drawing/2016/5/9/chartex" xmlns:cx4="http://schemas.microsoft.com/office/drawing/2016/5/10/chartex" xmlns:cx5="http://schemas.microsoft.com/office/drawing/2016/5/11/chartex" xmlns:cx6="http://schemas.microsoft.com/office/drawing/2016/5/12/chartex" xmlns:cx7="http://schemas.microsoft.com/office/drawing/2016/5/13/chartex" xmlns:cx8="http://schemas.microsoft.com/office/drawing/2016/5/14/chartex" xmlns:mc="http://schemas.openxmlformats.org/markup-compatibility/2006" xmlns:aink="http://schemas.microsoft.com/office/drawing/2016/ink" xmlns:am3d="http://schemas.microsoft.com/office/drawing/2017/model3d" xmlns:o="urn:schemas-microsoft-com:office:office" xmlns:r="http://schemas.openxmlformats.org/officeDocument/2006/relationships" xmlns:m="http://schemas.openxmlformats.org/officeDocument/2006/math" xmlns:v="urn:schemas-microsoft-com:vml" xmlns:wp14="http://schemas.microsoft.com/office/word/2010/wordprocessingDrawing" xmlns:wp="http://schemas.openxmlformats.org/drawingml/2006/wordprocessingDrawing" xmlns:w10="urn:schemas-microsoft-com:office:word" xmlns:w="http://schemas.openxmlformats.org/wordprocessingml/2006/main" xmlns:w14="http://schemas.microsoft.com/office/word/2010/wordml" xmlns:w15="http://schemas.microsoft.com/office/word/2012/wordml" xmlns:w16cex="http://schemas.microsoft.com/office/word/2018/wordml/cex" xmlns:w16cid="http://schemas.microsoft.com/office/word/2016/wordml/cid" xmlns:w16="http://schemas.microsoft.com/office/word/2018/wordml" xmlns:w16sdtdh="http://schemas.microsoft.com/office/word/2020/wordml/sdtdatahash" xmlns:w16se="http://schemas.microsoft.com/office/word/2015/wordml/symex" xmlns:wpg="http://schemas.microsoft.com/office/word/2010/wordprocessingGroup" xmlns:wpi="http://schemas.microsoft.com/office/word/2010/wordprocessingInk" xmlns:wne="http://schemas.microsoft.com/office/word/2006/wordml" xmlns:wps="http://schemas.microsoft.com/office/word/2010/wordprocessingShape" mc:Ignorable="w14 w15 w16se w16cid w16 w16cex w16sdtdh wp14">
+  <w:endnote w:type="separator" w:id="-1">
+    <w:p>
+      <w:pPr>
+        <w:spacing w:after="0" w:line="240" w:lineRule="auto"/>
+      </w:pPr>
+      <w:r>
+        <w:separator/>
+      </w:r>
+    </w:p>
+  </w:endnote>
+  <w:endnote w:type="continuationSeparator" w:id="0">
+    <w:p>
+      <w:pPr>
+        <w:spacing w:after="0" w:line="240" w:lineRule="auto"/>
+      </w:pPr>
+      <w:r>
+        <w:continuationSeparator/>
+      </w:r>
+    </w:p>
+  </w:endnote>
+</w:endnotes>
+</file>
+
+<file path=word/footnotes.xml><?xml version="1.0" encoding="utf-8"?>
+<w:footnotes xmlns:wpc="http://schemas.microsoft.com/office/word/2010/wordprocessingCanvas" xmlns:cx="http://schemas.microsoft.com/office/drawing/2014/chartex" xmlns:cx1="http://schemas.microsoft.com/office/drawing/2015/9/8/chartex" xmlns:cx2="http://schemas.microsoft.com/office/drawing/2015/10/21/chartex" xmlns:cx3="http://schemas.microsoft.com/office/drawing/2016/5/9/chartex" xmlns:cx4="http://schemas.microsoft.com/office/drawing/2016/5/10/chartex" xmlns:cx5="http://schemas.microsoft.com/office/drawing/2016/5/11/chartex" xmlns:cx6="http://schemas.microsoft.com/office/drawing/2016/5/12/chartex" xmlns:cx7="http://schemas.microsoft.com/office/drawing/2016/5/13/chartex" xmlns:cx8="http://schemas.microsoft.com/office/drawing/2016/5/14/chartex" xmlns:mc="http://schemas.openxmlformats.org/markup-compatibility/2006" xmlns:aink="http://schemas.microsoft.com/office/drawing/2016/ink" xmlns:am3d="http://schemas.microsoft.com/office/drawing/2017/model3d" xmlns:o="urn:schemas-microsoft-com:office:office" xmlns:r="http://schemas.openxmlformats.org/officeDocument/2006/relationships" xmlns:m="http://schemas.openxmlformats.org/officeDocument/2006/math" xmlns:v="urn:schemas-microsoft-com:vml" xmlns:wp14="http://schemas.microsoft.com/office/word/2010/wordprocessingDrawing" xmlns:wp="http://schemas.openxmlformats.org/drawingml/2006/wordprocessingDrawing" xmlns:w10="urn:schemas-microsoft-com:office:word" xmlns:w="http://schemas.openxmlformats.org/wordprocessingml/2006/main" xmlns:w14="http://schemas.microsoft.com/office/word/2010/wordml" xmlns:w15="http://schemas.microsoft.com/office/word/2012/wordml" xmlns:w16cex="http://schemas.microsoft.com/office/word/2018/wordml/cex" xmlns:w16cid="http://schemas.microsoft.com/office/word/2016/wordml/cid" xmlns:w16="http://schemas.microsoft.com/office/word/2018/wordml" xmlns:w16sdtdh="http://schemas.microsoft.com/office/word/2020/wordml/sdtdatahash" xmlns:w16se="http://schemas.microsoft.com/office/word/2015/wordml/symex" xmlns:wpg="http://schemas.microsoft.com/office/word/2010/wordprocessingGroup" xmlns:wpi="http://schemas.microsoft.com/office/word/2010/wordprocessingInk" xmlns:wne="http://schemas.microsoft.com/office/word/2006/wordml" xmlns:wps="http://schemas.microsoft.com/office/word/2010/wordprocessingShape" mc:Ignorable="w14 w15 w16se w16cid w16 w16cex w16sdtdh wp14">
+  <w:footnote w:type="separator" w:id="-1">
+    <w:p>
+      <w:pPr>
+        <w:spacing w:after="0" w:line="240" w:lineRule="auto"/>
+      </w:pPr>
+      <w:r>
+        <w:separator/>
+      </w:r>
+    </w:p>
+  </w:footnote>
+  <w:footnote w:type="continuationSeparator" w:id="0">
+    <w:p>
+      <w:pPr>
+        <w:spacing w:after="0" w:line="240" w:lineRule="auto"/>
+      </w:pPr>
+      <w:r>
+        <w:continuationSeparator/>
+      </w:r>
+    </w:p>
+  </w:footnote>
+</w:footnotes>
+</file>
+
 <file path=word/numbering.xml><?xml version="1.0" encoding="utf-8"?>
-<w:numbering xmlns:wpc="http://schemas.microsoft.com/office/word/2010/wordprocessingCanvas" xmlns:mc="http://schemas.openxmlformats.org/markup-compatibility/2006" xmlns:o="urn:schemas-microsoft-com:office:office" xmlns:r="http://schemas.openxmlformats.org/officeDocument/2006/relationships" xmlns:m="http://schemas.openxmlformats.org/officeDocument/2006/math" xmlns:v="urn:schemas-microsoft-com:vml" xmlns:wp14="http://schemas.microsoft.com/office/word/2010/wordprocessingDrawing" xmlns:wp="http://schemas.openxmlformats.org/drawingml/2006/wordprocessingDrawing" xmlns:w10="urn:schemas-microsoft-com:office:word" xmlns:w="http://schemas.openxmlformats.org/wordprocessingml/2006/main" xmlns:w14="http://schemas.microsoft.com/office/word/2010/wordml" xmlns:w15="http://schemas.microsoft.com/office/word/2012/wordml" xmlns:wpg="http://schemas.microsoft.com/office/word/2010/wordprocessingGroup" xmlns:wpi="http://schemas.microsoft.com/office/word/2010/wordprocessingInk" xmlns:wne="http://schemas.microsoft.com/office/word/2006/wordml" xmlns:wps="http://schemas.microsoft.com/office/word/2010/wordprocessingShape" mc:Ignorable="w14 w15 wp14">
+<w:numbering xmlns:wpc="http://schemas.microsoft.com/office/word/2010/wordprocessingCanvas" xmlns:cx="http://schemas.microsoft.com/office/drawing/2014/chartex" xmlns:cx1="http://schemas.microsoft.com/office/drawing/2015/9/8/chartex" xmlns:cx2="http://schemas.microsoft.com/office/drawing/2015/10/21/chartex" xmlns:cx3="http://schemas.microsoft.com/office/drawing/2016/5/9/chartex" xmlns:cx4="http://schemas.microsoft.com/office/drawing/2016/5/10/chartex" xmlns:cx5="http://schemas.microsoft.com/office/drawing/2016/5/11/chartex" xmlns:cx6="http://schemas.microsoft.com/office/drawing/2016/5/12/chartex" xmlns:cx7="http://schemas.microsoft.com/office/drawing/2016/5/13/chartex" xmlns:cx8="http://schemas.microsoft.com/office/drawing/2016/5/14/chartex" xmlns:mc="http://schemas.openxmlformats.org/markup-compatibility/2006" xmlns:aink="http://schemas.microsoft.com/office/drawing/2016/ink" xmlns:am3d="http://schemas.microsoft.com/office/drawing/2017/model3d" xmlns:o="urn:schemas-microsoft-com:office:office" xmlns:r="http://schemas.openxmlformats.org/officeDocument/2006/relationships" xmlns:m="http://schemas.openxmlformats.org/officeDocument/2006/math" xmlns:v="urn:schemas-microsoft-com:vml" xmlns:wp14="http://schemas.microsoft.com/office/word/2010/wordprocessingDrawing" xmlns:wp="http://schemas.openxmlformats.org/drawingml/2006/wordprocessingDrawing" xmlns:w10="urn:schemas-microsoft-com:office:word" xmlns:w="http://schemas.openxmlformats.org/wordprocessingml/2006/main" xmlns:w14="http://schemas.microsoft.com/office/word/2010/wordml" xmlns:w15="http://schemas.microsoft.com/office/word/2012/wordml" xmlns:w16cex="http://schemas.microsoft.com/office/word/2018/wordml/cex" xmlns:w16cid="http://schemas.microsoft.com/office/word/2016/wordml/cid" xmlns:w16="http://schemas.microsoft.com/office/word/2018/wordml" xmlns:w16sdtdh="http://schemas.microsoft.com/office/word/2020/wordml/sdtdatahash" xmlns:w16se="http://schemas.microsoft.com/office/word/2015/wordml/symex" xmlns:wpg="http://schemas.microsoft.com/office/word/2010/wordprocessingGroup" xmlns:wpi="http://schemas.microsoft.com/office/word/2010/wordprocessingInk" xmlns:wne="http://schemas.microsoft.com/office/word/2006/wordml" xmlns:wps="http://schemas.microsoft.com/office/word/2010/wordprocessingShape" mc:Ignorable="w14 w15 w16se w16cid w16 w16cex w16sdtdh wp14">
   <w:abstractNum w:abstractNumId="0" w15:restartNumberingAfterBreak="0">
     <w:nsid w:val="06D54705"/>
     <w:multiLevelType w:val="hybridMultilevel"/>
@@ -23513,7 +23923,7 @@
 </file>
 
 <file path=word/styles.xml><?xml version="1.0" encoding="utf-8"?>
-<w:styles xmlns:mc="http://schemas.openxmlformats.org/markup-compatibility/2006" xmlns:r="http://schemas.openxmlformats.org/officeDocument/2006/relationships" xmlns:w="http://schemas.openxmlformats.org/wordprocessingml/2006/main" xmlns:w14="http://schemas.microsoft.com/office/word/2010/wordml" xmlns:w15="http://schemas.microsoft.com/office/word/2012/wordml" mc:Ignorable="w14 w15">
+<w:styles xmlns:mc="http://schemas.openxmlformats.org/markup-compatibility/2006" xmlns:r="http://schemas.openxmlformats.org/officeDocument/2006/relationships" xmlns:w="http://schemas.openxmlformats.org/wordprocessingml/2006/main" xmlns:w14="http://schemas.microsoft.com/office/word/2010/wordml" xmlns:w15="http://schemas.microsoft.com/office/word/2012/wordml" xmlns:w16cex="http://schemas.microsoft.com/office/word/2018/wordml/cex" xmlns:w16cid="http://schemas.microsoft.com/office/word/2016/wordml/cid" xmlns:w16="http://schemas.microsoft.com/office/word/2018/wordml" xmlns:w16sdtdh="http://schemas.microsoft.com/office/word/2020/wordml/sdtdatahash" xmlns:w16se="http://schemas.microsoft.com/office/word/2015/wordml/symex" mc:Ignorable="w14 w15 w16se w16cid w16 w16cex w16sdtdh">
   <w:docDefaults>
     <w:rPrDefault>
       <w:rPr>
@@ -23529,7 +23939,7 @@
       </w:pPr>
     </w:pPrDefault>
   </w:docDefaults>
-  <w:latentStyles w:defLockedState="0" w:defUIPriority="99" w:defSemiHidden="0" w:defUnhideWhenUsed="0" w:defQFormat="0" w:count="371">
+  <w:latentStyles w:defLockedState="0" w:defUIPriority="99" w:defSemiHidden="0" w:defUnhideWhenUsed="0" w:defQFormat="0" w:count="376">
     <w:lsdException w:name="Normal" w:uiPriority="0" w:qFormat="1"/>
     <w:lsdException w:name="heading 1" w:uiPriority="9" w:qFormat="1"/>
     <w:lsdException w:name="heading 2" w:semiHidden="1" w:uiPriority="9" w:unhideWhenUsed="1" w:qFormat="1"/>
@@ -23635,7 +24045,6 @@
     <w:lsdException w:name="HTML Sample" w:semiHidden="1" w:unhideWhenUsed="1"/>
     <w:lsdException w:name="HTML Typewriter" w:semiHidden="1" w:unhideWhenUsed="1"/>
     <w:lsdException w:name="HTML Variable" w:semiHidden="1" w:unhideWhenUsed="1"/>
-    <w:lsdException w:name="Normal Table" w:semiHidden="1" w:unhideWhenUsed="1"/>
     <w:lsdException w:name="annotation subject" w:semiHidden="1" w:unhideWhenUsed="1"/>
     <w:lsdException w:name="No List" w:semiHidden="1" w:unhideWhenUsed="1"/>
     <w:lsdException w:name="Outline List 1" w:semiHidden="1" w:unhideWhenUsed="1"/>
@@ -23678,11 +24087,8 @@
     <w:lsdException w:name="Table Contemporary" w:semiHidden="1" w:unhideWhenUsed="1"/>
     <w:lsdException w:name="Table Elegant" w:semiHidden="1" w:unhideWhenUsed="1"/>
     <w:lsdException w:name="Table Professional" w:semiHidden="1" w:unhideWhenUsed="1"/>
-    <w:lsdException w:name="Table Subtle 1" w:semiHidden="1" w:unhideWhenUsed="1"/>
     <w:lsdException w:name="Table Subtle 2" w:semiHidden="1" w:unhideWhenUsed="1"/>
     <w:lsdException w:name="Table Web 1" w:semiHidden="1" w:unhideWhenUsed="1"/>
-    <w:lsdException w:name="Table Web 2" w:semiHidden="1" w:unhideWhenUsed="1"/>
-    <w:lsdException w:name="Table Web 3" w:semiHidden="1" w:unhideWhenUsed="1"/>
     <w:lsdException w:name="Balloon Text" w:semiHidden="1" w:unhideWhenUsed="1"/>
     <w:lsdException w:name="Table Grid" w:uiPriority="39"/>
     <w:lsdException w:name="Table Theme" w:semiHidden="1" w:unhideWhenUsed="1"/>
@@ -23901,6 +24307,11 @@
     <w:lsdException w:name="List Table 5 Dark Accent 6" w:uiPriority="50"/>
     <w:lsdException w:name="List Table 6 Colorful Accent 6" w:uiPriority="51"/>
     <w:lsdException w:name="List Table 7 Colorful Accent 6" w:uiPriority="52"/>
+    <w:lsdException w:name="Mention" w:semiHidden="1" w:unhideWhenUsed="1"/>
+    <w:lsdException w:name="Smart Hyperlink" w:semiHidden="1" w:unhideWhenUsed="1"/>
+    <w:lsdException w:name="Hashtag" w:semiHidden="1" w:unhideWhenUsed="1"/>
+    <w:lsdException w:name="Unresolved Mention" w:semiHidden="1" w:unhideWhenUsed="1"/>
+    <w:lsdException w:name="Smart Link" w:semiHidden="1" w:unhideWhenUsed="1"/>
   </w:latentStyles>
   <w:style w:type="paragraph" w:default="1" w:styleId="Normal">
     <w:name w:val="Normal"/>

</xml_diff>